<commit_message>
Atualiza o Manual de Uso para a versao 2.1
Documenta 4 funcionalidades entregues desde a v2.0: registro vivo de
riscos no TAP (tabela com status/responsavel/revisao), sugestoes de
riscos recorrentes a partir dos entraves das atas, sinalizacao
automatica de risco de atraso no Relatorio de Situacao e prioridade
leve (P0/P1/P2) das atividades da EAP.

Co-Authored-By: Claude Sonnet 5 <noreply@anthropic.com>
</commit_message>
<xml_diff>
--- a/Manual de Uso - Ferramenta de Gestao de Projetos.docx
+++ b/Manual de Uso - Ferramenta de Gestao de Projetos.docx
@@ -1,6 +1,6 @@
 
 <file path=word/document.xml><?xml version="1.0" encoding="utf-8"?>
-<w:document xmlns:wpc="http://schemas.microsoft.com/office/word/2010/wordprocessingCanvas" xmlns:cx="http://schemas.microsoft.com/office/drawing/2014/chartex" xmlns:cx1="http://schemas.microsoft.com/office/drawing/2015/9/8/chartex" xmlns:cx2="http://schemas.microsoft.com/office/drawing/2015/10/21/chartex" xmlns:cx3="http://schemas.microsoft.com/office/drawing/2016/5/9/chartex" xmlns:cx4="http://schemas.microsoft.com/office/drawing/2016/5/10/chartex" xmlns:cx5="http://schemas.microsoft.com/office/drawing/2016/5/11/chartex" xmlns:cx6="http://schemas.microsoft.com/office/drawing/2016/5/12/chartex" xmlns:cx7="http://schemas.microsoft.com/office/drawing/2016/5/13/chartex" xmlns:cx8="http://schemas.microsoft.com/office/drawing/2016/5/14/chartex" xmlns:mc="http://schemas.openxmlformats.org/markup-compatibility/2006" xmlns:aink="http://schemas.microsoft.com/office/drawing/2016/ink" xmlns:am3d="http://schemas.microsoft.com/office/drawing/2017/model3d" xmlns:o="urn:schemas-microsoft-com:office:office" xmlns:oel="http://schemas.microsoft.com/office/2019/extlst" xmlns:r="http://schemas.openxmlformats.org/officeDocument/2006/relationships" xmlns:m="http://schemas.openxmlformats.org/officeDocument/2006/math" xmlns:v="urn:schemas-microsoft-com:vml" xmlns:wp14="http://schemas.microsoft.com/office/word/2010/wordprocessingDrawing" xmlns:wp="http://schemas.openxmlformats.org/drawingml/2006/wordprocessingDrawing" xmlns:w10="urn:schemas-microsoft-com:office:word" xmlns:w="http://schemas.openxmlformats.org/wordprocessingml/2006/main" xmlns:w14="http://schemas.microsoft.com/office/word/2010/wordml" xmlns:w15="http://schemas.microsoft.com/office/word/2012/wordml" xmlns:w16cex="http://schemas.microsoft.com/office/word/2018/wordml/cex" xmlns:w16cid="http://schemas.microsoft.com/office/word/2016/wordml/cid" xmlns:w16="http://schemas.microsoft.com/office/word/2018/wordml" xmlns:w16du="http://schemas.microsoft.com/office/word/2023/wordml/word16du" xmlns:w16sdtdh="http://schemas.microsoft.com/office/word/2020/wordml/sdtdatahash" xmlns:w16sdtfl="http://schemas.microsoft.com/office/word/2024/wordml/sdtformatlock" xmlns:w16se="http://schemas.microsoft.com/office/word/2015/wordml/symex" xmlns:wpg="http://schemas.microsoft.com/office/word/2010/wordprocessingGroup" xmlns:wpi="http://schemas.microsoft.com/office/word/2010/wordprocessingInk" xmlns:wne="http://schemas.microsoft.com/office/word/2006/wordml" xmlns:wps="http://schemas.microsoft.com/office/word/2010/wordprocessingShape" mc:Ignorable="w14 w15 w16se w16cid w16 w16cex w16sdtdh w16sdtfl w16du wp14">
+<w:document xmlns:wpc="http://schemas.microsoft.com/office/word/2010/wordprocessingCanvas" xmlns:cx="http://schemas.microsoft.com/office/drawing/2014/chartex" xmlns:cx1="http://schemas.microsoft.com/office/drawing/2015/9/8/chartex" xmlns:cx2="http://schemas.microsoft.com/office/drawing/2015/10/21/chartex" xmlns:cx3="http://schemas.microsoft.com/office/drawing/2016/5/9/chartex" xmlns:cx4="http://schemas.microsoft.com/office/drawing/2016/5/10/chartex" xmlns:cx5="http://schemas.microsoft.com/office/drawing/2016/5/11/chartex" xmlns:cx6="http://schemas.microsoft.com/office/drawing/2016/5/12/chartex" xmlns:cx7="http://schemas.microsoft.com/office/drawing/2016/5/13/chartex" xmlns:cx8="http://schemas.microsoft.com/office/drawing/2016/5/14/chartex" xmlns:mc="http://schemas.openxmlformats.org/markup-compatibility/2006" xmlns:aink="http://schemas.microsoft.com/office/drawing/2016/ink" xmlns:am3d="http://schemas.microsoft.com/office/drawing/2017/model3d" xmlns:o="urn:schemas-microsoft-com:office:office" xmlns:oel="http://schemas.microsoft.com/office/2019/extlst" xmlns:r="http://schemas.openxmlformats.org/officeDocument/2006/relationships" xmlns:m="http://schemas.openxmlformats.org/officeDocument/2006/math" xmlns:v="urn:schemas-microsoft-com:vml" xmlns:wp14="http://schemas.microsoft.com/office/word/2010/wordprocessingDrawing" xmlns:wp="http://schemas.openxmlformats.org/drawingml/2006/wordprocessingDrawing" xmlns:w10="urn:schemas-microsoft-com:office:word" xmlns:w="http://schemas.openxmlformats.org/wordprocessingml/2006/main" xmlns:w14="http://schemas.microsoft.com/office/word/2010/wordml" xmlns:w15="http://schemas.microsoft.com/office/word/2012/wordml" xmlns:w16cei="http://schemas.microsoft.com/office/word/2026/wordml/cei" xmlns:w16cex="http://schemas.microsoft.com/office/word/2018/wordml/cex" xmlns:w16cid="http://schemas.microsoft.com/office/word/2016/wordml/cid" xmlns:w16="http://schemas.microsoft.com/office/word/2018/wordml" xmlns:w16du="http://schemas.microsoft.com/office/word/2023/wordml/word16du" xmlns:w16sdtdh="http://schemas.microsoft.com/office/word/2020/wordml/sdtdatahash" xmlns:w16sdtfl="http://schemas.microsoft.com/office/word/2024/wordml/sdtformatlock" xmlns:w16se="http://schemas.microsoft.com/office/word/2015/wordml/symex" xmlns:wpg="http://schemas.microsoft.com/office/word/2010/wordprocessingGroup" xmlns:wpi="http://schemas.microsoft.com/office/word/2010/wordprocessingInk" xmlns:wne="http://schemas.microsoft.com/office/word/2006/wordml" xmlns:wps="http://schemas.microsoft.com/office/word/2010/wordprocessingShape" mc:Ignorable="w14 w15 w16se w16cid w16 w16cex w16sdtdh w16sdtfl w16du wp14">
   <w:body>
     <w:p>
       <w:pPr>
@@ -129,7 +129,7 @@
           <w:color w:val="6A6A70"/>
           <w:sz w:val="22"/>
         </w:rPr>
-        <w:t>Versao 2.0 - 28 de julho de 2026 (substitui a versao 1.0 de 15/07/2026)</w:t>
+        <w:t>Versao 2.1 - 29 de julho de 2026 (substitui a versao 2.0 de 28/07/2026)</w:t>
       </w:r>
     </w:p>
     <w:p>
@@ -229,7 +229,7 @@
         <w:rPr>
           <w:noProof/>
         </w:rPr>
-        <w:instrText xml:space="preserve"> PAGEREF _Toc236124963 \h </w:instrText>
+        <w:instrText xml:space="preserve"> PAGEREF _Toc236221941 \h </w:instrText>
       </w:r>
       <w:r>
         <w:rPr>
@@ -290,7 +290,7 @@
         <w:rPr>
           <w:noProof/>
         </w:rPr>
-        <w:instrText xml:space="preserve"> PAGEREF _Toc236124964 \h </w:instrText>
+        <w:instrText xml:space="preserve"> PAGEREF _Toc236221942 \h </w:instrText>
       </w:r>
       <w:r>
         <w:rPr>
@@ -351,7 +351,7 @@
         <w:rPr>
           <w:noProof/>
         </w:rPr>
-        <w:instrText xml:space="preserve"> PAGEREF _Toc236124965 \h </w:instrText>
+        <w:instrText xml:space="preserve"> PAGEREF _Toc236221943 \h </w:instrText>
       </w:r>
       <w:r>
         <w:rPr>
@@ -412,7 +412,7 @@
         <w:rPr>
           <w:noProof/>
         </w:rPr>
-        <w:instrText xml:space="preserve"> PAGEREF _Toc236124966 \h </w:instrText>
+        <w:instrText xml:space="preserve"> PAGEREF _Toc236221944 \h </w:instrText>
       </w:r>
       <w:r>
         <w:rPr>
@@ -473,7 +473,7 @@
         <w:rPr>
           <w:noProof/>
         </w:rPr>
-        <w:instrText xml:space="preserve"> PAGEREF _Toc236124967 \h </w:instrText>
+        <w:instrText xml:space="preserve"> PAGEREF _Toc236221945 \h </w:instrText>
       </w:r>
       <w:r>
         <w:rPr>
@@ -490,7 +490,7 @@
         <w:rPr>
           <w:noProof/>
         </w:rPr>
-        <w:t>6</w:t>
+        <w:t>5</w:t>
       </w:r>
       <w:r>
         <w:rPr>
@@ -534,7 +534,7 @@
         <w:rPr>
           <w:noProof/>
         </w:rPr>
-        <w:instrText xml:space="preserve"> PAGEREF _Toc236124968 \h </w:instrText>
+        <w:instrText xml:space="preserve"> PAGEREF _Toc236221946 \h </w:instrText>
       </w:r>
       <w:r>
         <w:rPr>
@@ -551,7 +551,7 @@
         <w:rPr>
           <w:noProof/>
         </w:rPr>
-        <w:t>8</w:t>
+        <w:t>7</w:t>
       </w:r>
       <w:r>
         <w:rPr>
@@ -595,7 +595,7 @@
         <w:rPr>
           <w:noProof/>
         </w:rPr>
-        <w:instrText xml:space="preserve"> PAGEREF _Toc236124969 \h </w:instrText>
+        <w:instrText xml:space="preserve"> PAGEREF _Toc236221947 \h </w:instrText>
       </w:r>
       <w:r>
         <w:rPr>
@@ -612,7 +612,7 @@
         <w:rPr>
           <w:noProof/>
         </w:rPr>
-        <w:t>8</w:t>
+        <w:t>7</w:t>
       </w:r>
       <w:r>
         <w:rPr>
@@ -656,7 +656,7 @@
         <w:rPr>
           <w:noProof/>
         </w:rPr>
-        <w:instrText xml:space="preserve"> PAGEREF _Toc236124970 \h </w:instrText>
+        <w:instrText xml:space="preserve"> PAGEREF _Toc236221948 \h </w:instrText>
       </w:r>
       <w:r>
         <w:rPr>
@@ -673,7 +673,7 @@
         <w:rPr>
           <w:noProof/>
         </w:rPr>
-        <w:t>8</w:t>
+        <w:t>7</w:t>
       </w:r>
       <w:r>
         <w:rPr>
@@ -717,7 +717,7 @@
         <w:rPr>
           <w:noProof/>
         </w:rPr>
-        <w:instrText xml:space="preserve"> PAGEREF _Toc236124971 \h </w:instrText>
+        <w:instrText xml:space="preserve"> PAGEREF _Toc236221949 \h </w:instrText>
       </w:r>
       <w:r>
         <w:rPr>
@@ -734,7 +734,7 @@
         <w:rPr>
           <w:noProof/>
         </w:rPr>
-        <w:t>8</w:t>
+        <w:t>7</w:t>
       </w:r>
       <w:r>
         <w:rPr>
@@ -778,7 +778,7 @@
         <w:rPr>
           <w:noProof/>
         </w:rPr>
-        <w:instrText xml:space="preserve"> PAGEREF _Toc236124972 \h </w:instrText>
+        <w:instrText xml:space="preserve"> PAGEREF _Toc236221950 \h </w:instrText>
       </w:r>
       <w:r>
         <w:rPr>
@@ -795,7 +795,7 @@
         <w:rPr>
           <w:noProof/>
         </w:rPr>
-        <w:t>9</w:t>
+        <w:t>8</w:t>
       </w:r>
       <w:r>
         <w:rPr>
@@ -839,7 +839,7 @@
         <w:rPr>
           <w:noProof/>
         </w:rPr>
-        <w:instrText xml:space="preserve"> PAGEREF _Toc236124973 \h </w:instrText>
+        <w:instrText xml:space="preserve"> PAGEREF _Toc236221951 \h </w:instrText>
       </w:r>
       <w:r>
         <w:rPr>
@@ -856,7 +856,7 @@
         <w:rPr>
           <w:noProof/>
         </w:rPr>
-        <w:t>10</w:t>
+        <w:t>8</w:t>
       </w:r>
       <w:r>
         <w:rPr>
@@ -900,7 +900,7 @@
         <w:rPr>
           <w:noProof/>
         </w:rPr>
-        <w:instrText xml:space="preserve"> PAGEREF _Toc236124974 \h </w:instrText>
+        <w:instrText xml:space="preserve"> PAGEREF _Toc236221952 \h </w:instrText>
       </w:r>
       <w:r>
         <w:rPr>
@@ -917,7 +917,7 @@
         <w:rPr>
           <w:noProof/>
         </w:rPr>
-        <w:t>11</w:t>
+        <w:t>8</w:t>
       </w:r>
       <w:r>
         <w:rPr>
@@ -961,7 +961,7 @@
         <w:rPr>
           <w:noProof/>
         </w:rPr>
-        <w:instrText xml:space="preserve"> PAGEREF _Toc236124975 \h </w:instrText>
+        <w:instrText xml:space="preserve"> PAGEREF _Toc236221953 \h </w:instrText>
       </w:r>
       <w:r>
         <w:rPr>
@@ -978,7 +978,7 @@
         <w:rPr>
           <w:noProof/>
         </w:rPr>
-        <w:t>13</w:t>
+        <w:t>9</w:t>
       </w:r>
       <w:r>
         <w:rPr>
@@ -1022,7 +1022,7 @@
         <w:rPr>
           <w:noProof/>
         </w:rPr>
-        <w:instrText xml:space="preserve"> PAGEREF _Toc236124976 \h </w:instrText>
+        <w:instrText xml:space="preserve"> PAGEREF _Toc236221954 \h </w:instrText>
       </w:r>
       <w:r>
         <w:rPr>
@@ -1039,7 +1039,7 @@
         <w:rPr>
           <w:noProof/>
         </w:rPr>
-        <w:t>15</w:t>
+        <w:t>10</w:t>
       </w:r>
       <w:r>
         <w:rPr>
@@ -1083,7 +1083,7 @@
         <w:rPr>
           <w:noProof/>
         </w:rPr>
-        <w:instrText xml:space="preserve"> PAGEREF _Toc236124977 \h </w:instrText>
+        <w:instrText xml:space="preserve"> PAGEREF _Toc236221955 \h </w:instrText>
       </w:r>
       <w:r>
         <w:rPr>
@@ -1100,7 +1100,7 @@
         <w:rPr>
           <w:noProof/>
         </w:rPr>
-        <w:t>15</w:t>
+        <w:t>10</w:t>
       </w:r>
       <w:r>
         <w:rPr>
@@ -1144,7 +1144,7 @@
         <w:rPr>
           <w:noProof/>
         </w:rPr>
-        <w:instrText xml:space="preserve"> PAGEREF _Toc236124978 \h </w:instrText>
+        <w:instrText xml:space="preserve"> PAGEREF _Toc236221956 \h </w:instrText>
       </w:r>
       <w:r>
         <w:rPr>
@@ -1161,7 +1161,7 @@
         <w:rPr>
           <w:noProof/>
         </w:rPr>
-        <w:t>17</w:t>
+        <w:t>11</w:t>
       </w:r>
       <w:r>
         <w:rPr>
@@ -1205,7 +1205,7 @@
         <w:rPr>
           <w:noProof/>
         </w:rPr>
-        <w:instrText xml:space="preserve"> PAGEREF _Toc236124979 \h </w:instrText>
+        <w:instrText xml:space="preserve"> PAGEREF _Toc236221957 \h </w:instrText>
       </w:r>
       <w:r>
         <w:rPr>
@@ -1222,7 +1222,7 @@
         <w:rPr>
           <w:noProof/>
         </w:rPr>
-        <w:t>20</w:t>
+        <w:t>11</w:t>
       </w:r>
       <w:r>
         <w:rPr>
@@ -1266,7 +1266,7 @@
         <w:rPr>
           <w:noProof/>
         </w:rPr>
-        <w:instrText xml:space="preserve"> PAGEREF _Toc236124980 \h </w:instrText>
+        <w:instrText xml:space="preserve"> PAGEREF _Toc236221958 \h </w:instrText>
       </w:r>
       <w:r>
         <w:rPr>
@@ -1283,7 +1283,7 @@
         <w:rPr>
           <w:noProof/>
         </w:rPr>
-        <w:t>22</w:t>
+        <w:t>13</w:t>
       </w:r>
       <w:r>
         <w:rPr>
@@ -1327,7 +1327,7 @@
         <w:rPr>
           <w:noProof/>
         </w:rPr>
-        <w:instrText xml:space="preserve"> PAGEREF _Toc236124981 \h </w:instrText>
+        <w:instrText xml:space="preserve"> PAGEREF _Toc236221959 \h </w:instrText>
       </w:r>
       <w:r>
         <w:rPr>
@@ -1344,7 +1344,7 @@
         <w:rPr>
           <w:noProof/>
         </w:rPr>
-        <w:t>24</w:t>
+        <w:t>13</w:t>
       </w:r>
       <w:r>
         <w:rPr>
@@ -1388,7 +1388,7 @@
         <w:rPr>
           <w:noProof/>
         </w:rPr>
-        <w:instrText xml:space="preserve"> PAGEREF _Toc236124982 \h </w:instrText>
+        <w:instrText xml:space="preserve"> PAGEREF _Toc236221960 \h </w:instrText>
       </w:r>
       <w:r>
         <w:rPr>
@@ -1405,7 +1405,7 @@
         <w:rPr>
           <w:noProof/>
         </w:rPr>
-        <w:t>26</w:t>
+        <w:t>14</w:t>
       </w:r>
       <w:r>
         <w:rPr>
@@ -1449,7 +1449,7 @@
         <w:rPr>
           <w:noProof/>
         </w:rPr>
-        <w:instrText xml:space="preserve"> PAGEREF _Toc236124983 \h </w:instrText>
+        <w:instrText xml:space="preserve"> PAGEREF _Toc236221961 \h </w:instrText>
       </w:r>
       <w:r>
         <w:rPr>
@@ -1466,7 +1466,7 @@
         <w:rPr>
           <w:noProof/>
         </w:rPr>
-        <w:t>28</w:t>
+        <w:t>14</w:t>
       </w:r>
       <w:r>
         <w:rPr>
@@ -1510,7 +1510,7 @@
         <w:rPr>
           <w:noProof/>
         </w:rPr>
-        <w:instrText xml:space="preserve"> PAGEREF _Toc236124984 \h </w:instrText>
+        <w:instrText xml:space="preserve"> PAGEREF _Toc236221962 \h </w:instrText>
       </w:r>
       <w:r>
         <w:rPr>
@@ -1527,7 +1527,7 @@
         <w:rPr>
           <w:noProof/>
         </w:rPr>
-        <w:t>30</w:t>
+        <w:t>15</w:t>
       </w:r>
       <w:r>
         <w:rPr>
@@ -1571,7 +1571,7 @@
         <w:rPr>
           <w:noProof/>
         </w:rPr>
-        <w:instrText xml:space="preserve"> PAGEREF _Toc236124985 \h </w:instrText>
+        <w:instrText xml:space="preserve"> PAGEREF _Toc236221963 \h </w:instrText>
       </w:r>
       <w:r>
         <w:rPr>
@@ -1588,7 +1588,7 @@
         <w:rPr>
           <w:noProof/>
         </w:rPr>
-        <w:t>32</w:t>
+        <w:t>15</w:t>
       </w:r>
       <w:r>
         <w:rPr>
@@ -1632,7 +1632,7 @@
         <w:rPr>
           <w:noProof/>
         </w:rPr>
-        <w:instrText xml:space="preserve"> PAGEREF _Toc236124986 \h </w:instrText>
+        <w:instrText xml:space="preserve"> PAGEREF _Toc236221964 \h </w:instrText>
       </w:r>
       <w:r>
         <w:rPr>
@@ -1649,7 +1649,7 @@
         <w:rPr>
           <w:noProof/>
         </w:rPr>
-        <w:t>34</w:t>
+        <w:t>15</w:t>
       </w:r>
       <w:r>
         <w:rPr>
@@ -1693,7 +1693,7 @@
         <w:rPr>
           <w:noProof/>
         </w:rPr>
-        <w:instrText xml:space="preserve"> PAGEREF _Toc236124987 \h </w:instrText>
+        <w:instrText xml:space="preserve"> PAGEREF _Toc236221965 \h </w:instrText>
       </w:r>
       <w:r>
         <w:rPr>
@@ -1710,7 +1710,7 @@
         <w:rPr>
           <w:noProof/>
         </w:rPr>
-        <w:t>36</w:t>
+        <w:t>16</w:t>
       </w:r>
       <w:r>
         <w:rPr>
@@ -1754,7 +1754,7 @@
         <w:rPr>
           <w:noProof/>
         </w:rPr>
-        <w:instrText xml:space="preserve"> PAGEREF _Toc236124988 \h </w:instrText>
+        <w:instrText xml:space="preserve"> PAGEREF _Toc236221966 \h </w:instrText>
       </w:r>
       <w:r>
         <w:rPr>
@@ -1771,7 +1771,7 @@
         <w:rPr>
           <w:noProof/>
         </w:rPr>
-        <w:t>36</w:t>
+        <w:t>16</w:t>
       </w:r>
       <w:r>
         <w:rPr>
@@ -1816,7 +1816,7 @@
         <w:rPr>
           <w:noProof/>
         </w:rPr>
-        <w:instrText xml:space="preserve"> PAGEREF _Toc236124989 \h </w:instrText>
+        <w:instrText xml:space="preserve"> PAGEREF _Toc236221967 \h </w:instrText>
       </w:r>
       <w:r>
         <w:rPr>
@@ -1833,7 +1833,7 @@
         <w:rPr>
           <w:noProof/>
         </w:rPr>
-        <w:t>39</w:t>
+        <w:t>16</w:t>
       </w:r>
       <w:r>
         <w:rPr>
@@ -1877,7 +1877,7 @@
         <w:rPr>
           <w:noProof/>
         </w:rPr>
-        <w:instrText xml:space="preserve"> PAGEREF _Toc236124990 \h </w:instrText>
+        <w:instrText xml:space="preserve"> PAGEREF _Toc236221968 \h </w:instrText>
       </w:r>
       <w:r>
         <w:rPr>
@@ -1894,7 +1894,7 @@
         <w:rPr>
           <w:noProof/>
         </w:rPr>
-        <w:t>41</w:t>
+        <w:t>18</w:t>
       </w:r>
       <w:r>
         <w:rPr>
@@ -1938,7 +1938,7 @@
         <w:rPr>
           <w:noProof/>
         </w:rPr>
-        <w:instrText xml:space="preserve"> PAGEREF _Toc236124991 \h </w:instrText>
+        <w:instrText xml:space="preserve"> PAGEREF _Toc236221969 \h </w:instrText>
       </w:r>
       <w:r>
         <w:rPr>
@@ -1955,7 +1955,7 @@
         <w:rPr>
           <w:noProof/>
         </w:rPr>
-        <w:t>41</w:t>
+        <w:t>18</w:t>
       </w:r>
       <w:r>
         <w:rPr>
@@ -1999,7 +1999,7 @@
         <w:rPr>
           <w:noProof/>
         </w:rPr>
-        <w:instrText xml:space="preserve"> PAGEREF _Toc236124992 \h </w:instrText>
+        <w:instrText xml:space="preserve"> PAGEREF _Toc236221970 \h </w:instrText>
       </w:r>
       <w:r>
         <w:rPr>
@@ -2016,7 +2016,7 @@
         <w:rPr>
           <w:noProof/>
         </w:rPr>
-        <w:t>42</w:t>
+        <w:t>18</w:t>
       </w:r>
       <w:r>
         <w:rPr>
@@ -2060,7 +2060,7 @@
         <w:rPr>
           <w:noProof/>
         </w:rPr>
-        <w:instrText xml:space="preserve"> PAGEREF _Toc236124993 \h </w:instrText>
+        <w:instrText xml:space="preserve"> PAGEREF _Toc236221971 \h </w:instrText>
       </w:r>
       <w:r>
         <w:rPr>
@@ -2077,7 +2077,7 @@
         <w:rPr>
           <w:noProof/>
         </w:rPr>
-        <w:t>42</w:t>
+        <w:t>18</w:t>
       </w:r>
       <w:r>
         <w:rPr>
@@ -2121,7 +2121,7 @@
         <w:rPr>
           <w:noProof/>
         </w:rPr>
-        <w:instrText xml:space="preserve"> PAGEREF _Toc236124994 \h </w:instrText>
+        <w:instrText xml:space="preserve"> PAGEREF _Toc236221972 \h </w:instrText>
       </w:r>
       <w:r>
         <w:rPr>
@@ -2138,7 +2138,7 @@
         <w:rPr>
           <w:noProof/>
         </w:rPr>
-        <w:t>45</w:t>
+        <w:t>19</w:t>
       </w:r>
       <w:r>
         <w:rPr>
@@ -2182,7 +2182,7 @@
         <w:rPr>
           <w:noProof/>
         </w:rPr>
-        <w:instrText xml:space="preserve"> PAGEREF _Toc236124995 \h </w:instrText>
+        <w:instrText xml:space="preserve"> PAGEREF _Toc236221973 \h </w:instrText>
       </w:r>
       <w:r>
         <w:rPr>
@@ -2199,7 +2199,7 @@
         <w:rPr>
           <w:noProof/>
         </w:rPr>
-        <w:t>45</w:t>
+        <w:t>19</w:t>
       </w:r>
       <w:r>
         <w:rPr>
@@ -2243,7 +2243,7 @@
         <w:rPr>
           <w:noProof/>
         </w:rPr>
-        <w:instrText xml:space="preserve"> PAGEREF _Toc236124996 \h </w:instrText>
+        <w:instrText xml:space="preserve"> PAGEREF _Toc236221974 \h </w:instrText>
       </w:r>
       <w:r>
         <w:rPr>
@@ -2260,7 +2260,7 @@
         <w:rPr>
           <w:noProof/>
         </w:rPr>
-        <w:t>45</w:t>
+        <w:t>19</w:t>
       </w:r>
       <w:r>
         <w:rPr>
@@ -2304,7 +2304,7 @@
         <w:rPr>
           <w:noProof/>
         </w:rPr>
-        <w:instrText xml:space="preserve"> PAGEREF _Toc236124997 \h </w:instrText>
+        <w:instrText xml:space="preserve"> PAGEREF _Toc236221975 \h </w:instrText>
       </w:r>
       <w:r>
         <w:rPr>
@@ -2321,7 +2321,7 @@
         <w:rPr>
           <w:noProof/>
         </w:rPr>
-        <w:t>46</w:t>
+        <w:t>19</w:t>
       </w:r>
       <w:r>
         <w:rPr>
@@ -2365,7 +2365,7 @@
         <w:rPr>
           <w:noProof/>
         </w:rPr>
-        <w:instrText xml:space="preserve"> PAGEREF _Toc236124998 \h </w:instrText>
+        <w:instrText xml:space="preserve"> PAGEREF _Toc236221976 \h </w:instrText>
       </w:r>
       <w:r>
         <w:rPr>
@@ -2382,7 +2382,7 @@
         <w:rPr>
           <w:noProof/>
         </w:rPr>
-        <w:t>48</w:t>
+        <w:t>20</w:t>
       </w:r>
       <w:r>
         <w:rPr>
@@ -2426,7 +2426,7 @@
         <w:rPr>
           <w:noProof/>
         </w:rPr>
-        <w:instrText xml:space="preserve"> PAGEREF _Toc236124999 \h </w:instrText>
+        <w:instrText xml:space="preserve"> PAGEREF _Toc236221977 \h </w:instrText>
       </w:r>
       <w:r>
         <w:rPr>
@@ -2443,7 +2443,7 @@
         <w:rPr>
           <w:noProof/>
         </w:rPr>
-        <w:t>49</w:t>
+        <w:t>21</w:t>
       </w:r>
       <w:r>
         <w:rPr>
@@ -2502,7 +2502,7 @@
           <w:sz w:val="34"/>
         </w:rPr>
       </w:pPr>
-      <w:bookmarkStart w:id="0" w:name="_Toc236124963"/>
+      <w:bookmarkStart w:id="0" w:name="_Toc236221941"/>
       <w:r>
         <w:rPr>
           <w:rFonts w:ascii="Montserrat" w:hAnsi="Montserrat"/>
@@ -2526,7 +2526,7 @@
           <w:sz w:val="27"/>
         </w:rPr>
       </w:pPr>
-      <w:bookmarkStart w:id="1" w:name="_Toc236124964"/>
+      <w:bookmarkStart w:id="1" w:name="_Toc236221942"/>
       <w:r>
         <w:rPr>
           <w:rFonts w:ascii="Montserrat" w:hAnsi="Montserrat"/>
@@ -2589,6 +2589,24 @@
           <w:color w:val="1A1A1A"/>
           <w:sz w:val="22"/>
         </w:rPr>
+        <w:t>Esta e a versao 2.1 do manual. Em relacao a versao 2.0 (28/07/2026), foram adicionadas as secoes sobre o registro vivo de riscos e as sugestoes de riscos recorrentes no TAP (Passo 3), a sinalizacao automatica de risco de atraso no Relatorio de Situacao (secao 4.1) e a prioridade leve (P0/P1/P2) das atividades da EAP (Passo 5).</w:t>
+      </w:r>
+    </w:p>
+    <w:p>
+      <w:pPr>
+        <w:spacing w:line="280" w:lineRule="auto"/>
+        <w:rPr>
+          <w:rFonts w:ascii="Montserrat" w:hAnsi="Montserrat"/>
+          <w:color w:val="1A1A1A"/>
+          <w:sz w:val="22"/>
+        </w:rPr>
+      </w:pPr>
+      <w:r>
+        <w:rPr>
+          <w:rFonts w:ascii="Montserrat" w:hAnsi="Montserrat"/>
+          <w:color w:val="1A1A1A"/>
+          <w:sz w:val="22"/>
+        </w:rPr>
         <w:t>O manual nao substitui as Diretrizes para a Gestao de Projetos da UNIALFA (documento institucional que define o framework D01 a D07) nem o documento Regras de Acesso e Permissoes (que detalha cada regra de controle de acesso); ele e o guia operacional de como usar cada ferramenta na pratica.</w:t>
       </w:r>
     </w:p>
@@ -2603,7 +2621,7 @@
           <w:sz w:val="27"/>
         </w:rPr>
       </w:pPr>
-      <w:bookmarkStart w:id="2" w:name="_Toc236124965"/>
+      <w:bookmarkStart w:id="2" w:name="_Toc236221943"/>
       <w:r>
         <w:rPr>
           <w:rFonts w:ascii="Montserrat" w:hAnsi="Montserrat"/>
@@ -2738,84 +2756,8 @@
           <w:color w:val="1A1A1A"/>
           <w:sz w:val="22"/>
         </w:rPr>
+        <w:lastRenderedPageBreak/>
         <w:t>O Mapa de Diretrizes (pagina inicial) apresenta visualmente as 7 diretrizes (D01 a D07) e mostra, para cada etapa do processo, quais ferramentas usar. E o ponto de partida recomendado para quem quer entender o processo antes de preencher os formularios - e a unica pagina, junto com o Validador de Projetos, que nao exige login.</w:t>
-      </w:r>
-    </w:p>
-    <w:p>
-      <w:pPr>
-        <w:spacing w:before="120" w:after="40"/>
-        <w:jc w:val="center"/>
-      </w:pPr>
-      <w:r>
-        <w:rPr>
-          <w:noProof/>
-        </w:rPr>
-        <w:lastRenderedPageBreak/>
-        <w:drawing>
-          <wp:inline distT="0" distB="0" distL="0" distR="0" wp14:anchorId="5E5AEEC7" wp14:editId="2F0E30D0">
-            <wp:extent cx="5303520" cy="4792851"/>
-            <wp:effectExtent l="19050" t="19050" r="11430" b="27305"/>
-            <wp:docPr id="1653274855" name="Imagem 1"/>
-            <wp:cNvGraphicFramePr/>
-            <a:graphic xmlns:a="http://schemas.openxmlformats.org/drawingml/2006/main">
-              <a:graphicData uri="http://schemas.openxmlformats.org/drawingml/2006/picture">
-                <pic:pic xmlns:pic="http://schemas.openxmlformats.org/drawingml/2006/picture">
-                  <pic:nvPicPr>
-                    <pic:cNvPr id="1653274855" name=""/>
-                    <pic:cNvPicPr/>
-                  </pic:nvPicPr>
-                  <pic:blipFill>
-                    <a:blip r:embed="rId7">
-                      <a:extLst>
-                        <a:ext uri="{28A0092B-C50C-407E-A947-70E740481C1C}">
-                          <a14:useLocalDpi xmlns:a14="http://schemas.microsoft.com/office/drawing/2010/main" val="0"/>
-                        </a:ext>
-                      </a:extLst>
-                    </a:blip>
-                    <a:stretch>
-                      <a:fillRect/>
-                    </a:stretch>
-                  </pic:blipFill>
-                  <pic:spPr>
-                    <a:xfrm>
-                      <a:off x="0" y="0"/>
-                      <a:ext cx="5303520" cy="4792851"/>
-                    </a:xfrm>
-                    <a:prstGeom prst="rect">
-                      <a:avLst/>
-                    </a:prstGeom>
-                    <a:ln w="9525">
-                      <a:solidFill>
-                        <a:srgbClr val="D1D5DB"/>
-                      </a:solidFill>
-                    </a:ln>
-                  </pic:spPr>
-                </pic:pic>
-              </a:graphicData>
-            </a:graphic>
-          </wp:inline>
-        </w:drawing>
-      </w:r>
-    </w:p>
-    <w:p>
-      <w:pPr>
-        <w:spacing w:before="120" w:after="280"/>
-        <w:jc w:val="center"/>
-        <w:rPr>
-          <w:rFonts w:ascii="Montserrat" w:hAnsi="Montserrat"/>
-          <w:i/>
-          <w:color w:val="6A6A70"/>
-          <w:sz w:val="19"/>
-        </w:rPr>
-      </w:pPr>
-      <w:r>
-        <w:rPr>
-          <w:rFonts w:ascii="Montserrat" w:hAnsi="Montserrat"/>
-          <w:i/>
-          <w:color w:val="6A6A70"/>
-          <w:sz w:val="19"/>
-        </w:rPr>
-        <w:t>Mapa de diretrizes - pagina inicial. Nao exige login.</w:t>
       </w:r>
     </w:p>
     <w:p>
@@ -2829,7 +2771,7 @@
           <w:sz w:val="27"/>
         </w:rPr>
       </w:pPr>
-      <w:bookmarkStart w:id="3" w:name="_Toc236124966"/>
+      <w:bookmarkStart w:id="3" w:name="_Toc236221944"/>
       <w:r>
         <w:rPr>
           <w:rFonts w:ascii="Montserrat" w:hAnsi="Montserrat"/>
@@ -2857,83 +2799,6 @@
           <w:sz w:val="22"/>
         </w:rPr>
         <w:t>Todos os 12 formularios de registro e a pagina de Administracao exigem login antes de carregar ou salvar qualquer dado. Ao abrir qualquer um deles sem sessao ativa, aparece a tela de entrada:</w:t>
-      </w:r>
-    </w:p>
-    <w:p>
-      <w:pPr>
-        <w:spacing w:before="120" w:after="40"/>
-        <w:jc w:val="center"/>
-      </w:pPr>
-      <w:r>
-        <w:rPr>
-          <w:noProof/>
-        </w:rPr>
-        <w:lastRenderedPageBreak/>
-        <w:drawing>
-          <wp:inline distT="0" distB="0" distL="0" distR="0" wp14:anchorId="39638622" wp14:editId="0CC90591">
-            <wp:extent cx="4206240" cy="3801227"/>
-            <wp:effectExtent l="19050" t="19050" r="22860" b="27940"/>
-            <wp:docPr id="1434154055" name="Imagem 2"/>
-            <wp:cNvGraphicFramePr/>
-            <a:graphic xmlns:a="http://schemas.openxmlformats.org/drawingml/2006/main">
-              <a:graphicData uri="http://schemas.openxmlformats.org/drawingml/2006/picture">
-                <pic:pic xmlns:pic="http://schemas.openxmlformats.org/drawingml/2006/picture">
-                  <pic:nvPicPr>
-                    <pic:cNvPr id="1434154055" name=""/>
-                    <pic:cNvPicPr/>
-                  </pic:nvPicPr>
-                  <pic:blipFill>
-                    <a:blip r:embed="rId8" cstate="print">
-                      <a:extLst>
-                        <a:ext uri="{28A0092B-C50C-407E-A947-70E740481C1C}">
-                          <a14:useLocalDpi xmlns:a14="http://schemas.microsoft.com/office/drawing/2010/main" val="0"/>
-                        </a:ext>
-                      </a:extLst>
-                    </a:blip>
-                    <a:stretch>
-                      <a:fillRect/>
-                    </a:stretch>
-                  </pic:blipFill>
-                  <pic:spPr>
-                    <a:xfrm>
-                      <a:off x="0" y="0"/>
-                      <a:ext cx="4206240" cy="3801227"/>
-                    </a:xfrm>
-                    <a:prstGeom prst="rect">
-                      <a:avLst/>
-                    </a:prstGeom>
-                    <a:ln w="9525">
-                      <a:solidFill>
-                        <a:srgbClr val="D1D5DB"/>
-                      </a:solidFill>
-                    </a:ln>
-                  </pic:spPr>
-                </pic:pic>
-              </a:graphicData>
-            </a:graphic>
-          </wp:inline>
-        </w:drawing>
-      </w:r>
-    </w:p>
-    <w:p>
-      <w:pPr>
-        <w:spacing w:before="120" w:after="280"/>
-        <w:jc w:val="center"/>
-        <w:rPr>
-          <w:rFonts w:ascii="Montserrat" w:hAnsi="Montserrat"/>
-          <w:i/>
-          <w:color w:val="6A6A70"/>
-          <w:sz w:val="19"/>
-        </w:rPr>
-      </w:pPr>
-      <w:r>
-        <w:rPr>
-          <w:rFonts w:ascii="Montserrat" w:hAnsi="Montserrat"/>
-          <w:i/>
-          <w:color w:val="6A6A70"/>
-          <w:sz w:val="19"/>
-        </w:rPr>
-        <w:t>Tela de login, exibida ao abrir qualquer formulario sem sessao ativa.</w:t>
       </w:r>
     </w:p>
     <w:p>
@@ -3052,7 +2917,7 @@
           <w:sz w:val="27"/>
         </w:rPr>
       </w:pPr>
-      <w:bookmarkStart w:id="4" w:name="_Toc236124967"/>
+      <w:bookmarkStart w:id="4" w:name="_Toc236221945"/>
       <w:r>
         <w:rPr>
           <w:rFonts w:ascii="Montserrat" w:hAnsi="Montserrat"/>
@@ -3134,7 +2999,6 @@
                 <w:color w:val="FFFFFF"/>
                 <w:sz w:val="19"/>
               </w:rPr>
-              <w:lastRenderedPageBreak/>
               <w:t>Passo</w:t>
             </w:r>
           </w:p>
@@ -3603,6 +3467,7 @@
                 <w:color w:val="1A1A1A"/>
                 <w:sz w:val="19"/>
               </w:rPr>
+              <w:lastRenderedPageBreak/>
               <w:t>5</w:t>
             </w:r>
           </w:p>
@@ -4291,7 +4156,7 @@
           <w:sz w:val="34"/>
         </w:rPr>
       </w:pPr>
-      <w:bookmarkStart w:id="5" w:name="_Toc236124968"/>
+      <w:bookmarkStart w:id="5" w:name="_Toc236221946"/>
       <w:r>
         <w:rPr>
           <w:rFonts w:ascii="Montserrat" w:hAnsi="Montserrat"/>
@@ -4315,7 +4180,7 @@
           <w:sz w:val="27"/>
         </w:rPr>
       </w:pPr>
-      <w:bookmarkStart w:id="6" w:name="_Toc236124969"/>
+      <w:bookmarkStart w:id="6" w:name="_Toc236221947"/>
       <w:r>
         <w:rPr>
           <w:rFonts w:ascii="Montserrat" w:hAnsi="Montserrat"/>
@@ -4356,7 +4221,7 @@
           <w:sz w:val="27"/>
         </w:rPr>
       </w:pPr>
-      <w:bookmarkStart w:id="7" w:name="_Toc236124970"/>
+      <w:bookmarkStart w:id="7" w:name="_Toc236221948"/>
       <w:r>
         <w:rPr>
           <w:rFonts w:ascii="Montserrat" w:hAnsi="Montserrat"/>
@@ -4475,7 +4340,7 @@
           <w:sz w:val="27"/>
         </w:rPr>
       </w:pPr>
-      <w:bookmarkStart w:id="8" w:name="_Toc236124971"/>
+      <w:bookmarkStart w:id="8" w:name="_Toc236221949"/>
       <w:r>
         <w:rPr>
           <w:rFonts w:ascii="Montserrat" w:hAnsi="Montserrat"/>
@@ -5088,7 +4953,7 @@
           <w:sz w:val="27"/>
         </w:rPr>
       </w:pPr>
-      <w:bookmarkStart w:id="9" w:name="_Toc236124972"/>
+      <w:bookmarkStart w:id="9" w:name="_Toc236221950"/>
       <w:r>
         <w:rPr>
           <w:rFonts w:ascii="Montserrat" w:hAnsi="Montserrat"/>
@@ -5168,83 +5033,6 @@
     </w:p>
     <w:p>
       <w:pPr>
-        <w:spacing w:before="120" w:after="40"/>
-        <w:jc w:val="center"/>
-      </w:pPr>
-      <w:r>
-        <w:rPr>
-          <w:noProof/>
-        </w:rPr>
-        <w:lastRenderedPageBreak/>
-        <w:drawing>
-          <wp:inline distT="0" distB="0" distL="0" distR="0" wp14:anchorId="32C7DA85" wp14:editId="3AD86FA7">
-            <wp:extent cx="4937760" cy="4462310"/>
-            <wp:effectExtent l="19050" t="19050" r="15240" b="14605"/>
-            <wp:docPr id="126846986" name="Imagem 3"/>
-            <wp:cNvGraphicFramePr/>
-            <a:graphic xmlns:a="http://schemas.openxmlformats.org/drawingml/2006/main">
-              <a:graphicData uri="http://schemas.openxmlformats.org/drawingml/2006/picture">
-                <pic:pic xmlns:pic="http://schemas.openxmlformats.org/drawingml/2006/picture">
-                  <pic:nvPicPr>
-                    <pic:cNvPr id="126846986" name=""/>
-                    <pic:cNvPicPr/>
-                  </pic:nvPicPr>
-                  <pic:blipFill>
-                    <a:blip r:embed="rId9">
-                      <a:extLst>
-                        <a:ext uri="{28A0092B-C50C-407E-A947-70E740481C1C}">
-                          <a14:useLocalDpi xmlns:a14="http://schemas.microsoft.com/office/drawing/2010/main" val="0"/>
-                        </a:ext>
-                      </a:extLst>
-                    </a:blip>
-                    <a:stretch>
-                      <a:fillRect/>
-                    </a:stretch>
-                  </pic:blipFill>
-                  <pic:spPr>
-                    <a:xfrm>
-                      <a:off x="0" y="0"/>
-                      <a:ext cx="4937760" cy="4462310"/>
-                    </a:xfrm>
-                    <a:prstGeom prst="rect">
-                      <a:avLst/>
-                    </a:prstGeom>
-                    <a:ln w="9525">
-                      <a:solidFill>
-                        <a:srgbClr val="D1D5DB"/>
-                      </a:solidFill>
-                    </a:ln>
-                  </pic:spPr>
-                </pic:pic>
-              </a:graphicData>
-            </a:graphic>
-          </wp:inline>
-        </w:drawing>
-      </w:r>
-    </w:p>
-    <w:p>
-      <w:pPr>
-        <w:spacing w:before="120" w:after="280"/>
-        <w:jc w:val="center"/>
-        <w:rPr>
-          <w:rFonts w:ascii="Montserrat" w:hAnsi="Montserrat"/>
-          <w:i/>
-          <w:color w:val="6A6A70"/>
-          <w:sz w:val="19"/>
-        </w:rPr>
-      </w:pPr>
-      <w:r>
-        <w:rPr>
-          <w:rFonts w:ascii="Montserrat" w:hAnsi="Montserrat"/>
-          <w:i/>
-          <w:color w:val="6A6A70"/>
-          <w:sz w:val="19"/>
-        </w:rPr>
-        <w:t>Detalhe de uma Solicitacao de Demanda - o campo Status, no rodape, so pode ser alterado pelo Admin (Gate 1).</w:t>
-      </w:r>
-    </w:p>
-    <w:p>
-      <w:pPr>
         <w:pStyle w:val="Ttulo2"/>
         <w:spacing w:before="320" w:after="120"/>
         <w:rPr>
@@ -5254,7 +5042,7 @@
           <w:sz w:val="27"/>
         </w:rPr>
       </w:pPr>
-      <w:bookmarkStart w:id="10" w:name="_Toc236124973"/>
+      <w:bookmarkStart w:id="10" w:name="_Toc236221951"/>
       <w:r>
         <w:rPr>
           <w:rFonts w:ascii="Montserrat" w:hAnsi="Montserrat"/>
@@ -5282,83 +5070,6 @@
           <w:sz w:val="22"/>
         </w:rPr>
         <w:t>Sete dos doze formularios exigem vincular o registro a um Projeto vinculado (um projeto ja Aprovado no Gate 1): Canvas, TAP, Planejamento e Desenvolvimento, EAP, SMP, TEP e RLA. Nesses formularios, apenas quem faz parte da equipe daquele projeto - ou um Admin - pode criar ou editar um registro vinculado a ele.</w:t>
-      </w:r>
-    </w:p>
-    <w:p>
-      <w:pPr>
-        <w:spacing w:before="120" w:after="40"/>
-        <w:jc w:val="center"/>
-      </w:pPr>
-      <w:r>
-        <w:rPr>
-          <w:noProof/>
-        </w:rPr>
-        <w:lastRenderedPageBreak/>
-        <w:drawing>
-          <wp:inline distT="0" distB="0" distL="0" distR="0" wp14:anchorId="2C5F3BBF" wp14:editId="52943EBE">
-            <wp:extent cx="5120640" cy="4627581"/>
-            <wp:effectExtent l="19050" t="19050" r="22860" b="20955"/>
-            <wp:docPr id="1660150050" name="Imagem 4"/>
-            <wp:cNvGraphicFramePr/>
-            <a:graphic xmlns:a="http://schemas.openxmlformats.org/drawingml/2006/main">
-              <a:graphicData uri="http://schemas.openxmlformats.org/drawingml/2006/picture">
-                <pic:pic xmlns:pic="http://schemas.openxmlformats.org/drawingml/2006/picture">
-                  <pic:nvPicPr>
-                    <pic:cNvPr id="1660150050" name=""/>
-                    <pic:cNvPicPr/>
-                  </pic:nvPicPr>
-                  <pic:blipFill>
-                    <a:blip r:embed="rId10">
-                      <a:extLst>
-                        <a:ext uri="{28A0092B-C50C-407E-A947-70E740481C1C}">
-                          <a14:useLocalDpi xmlns:a14="http://schemas.microsoft.com/office/drawing/2010/main" val="0"/>
-                        </a:ext>
-                      </a:extLst>
-                    </a:blip>
-                    <a:stretch>
-                      <a:fillRect/>
-                    </a:stretch>
-                  </pic:blipFill>
-                  <pic:spPr>
-                    <a:xfrm>
-                      <a:off x="0" y="0"/>
-                      <a:ext cx="5120640" cy="4627581"/>
-                    </a:xfrm>
-                    <a:prstGeom prst="rect">
-                      <a:avLst/>
-                    </a:prstGeom>
-                    <a:ln w="9525">
-                      <a:solidFill>
-                        <a:srgbClr val="D1D5DB"/>
-                      </a:solidFill>
-                    </a:ln>
-                  </pic:spPr>
-                </pic:pic>
-              </a:graphicData>
-            </a:graphic>
-          </wp:inline>
-        </w:drawing>
-      </w:r>
-    </w:p>
-    <w:p>
-      <w:pPr>
-        <w:spacing w:before="120" w:after="280"/>
-        <w:jc w:val="center"/>
-        <w:rPr>
-          <w:rFonts w:ascii="Montserrat" w:hAnsi="Montserrat"/>
-          <w:i/>
-          <w:color w:val="6A6A70"/>
-          <w:sz w:val="19"/>
-        </w:rPr>
-      </w:pPr>
-      <w:r>
-        <w:rPr>
-          <w:rFonts w:ascii="Montserrat" w:hAnsi="Montserrat"/>
-          <w:i/>
-          <w:color w:val="6A6A70"/>
-          <w:sz w:val="19"/>
-        </w:rPr>
-        <w:t>TAP com um projeto vinculado selecionado: unidade, gerente e status sao preenchidos automaticamente a partir do projeto.</w:t>
       </w:r>
     </w:p>
     <w:p>
@@ -5441,7 +5152,7 @@
           <w:sz w:val="27"/>
         </w:rPr>
       </w:pPr>
-      <w:bookmarkStart w:id="11" w:name="_Toc236124974"/>
+      <w:bookmarkStart w:id="11" w:name="_Toc236221952"/>
       <w:r>
         <w:rPr>
           <w:rFonts w:ascii="Montserrat" w:hAnsi="Montserrat"/>
@@ -5468,161 +5179,16 @@
           <w:color w:val="1A1A1A"/>
           <w:sz w:val="22"/>
         </w:rPr>
-        <w:t>Dois formularios podem, opcionalmente, ser abertos por um Admin para aceitar registros sem login: Solicitacao de Demanda e Ata de Reuniao. Cada um tem um interruptor independente em Administracao &gt; Configuracoes (secao 6) - podem estar ligados, desligados ou so um dos dois.</w:t>
-      </w:r>
-    </w:p>
-    <w:p>
-      <w:pPr>
-        <w:spacing w:before="120" w:after="40"/>
-        <w:jc w:val="center"/>
-      </w:pPr>
-      <w:r>
-        <w:rPr>
-          <w:noProof/>
+        <w:t xml:space="preserve">Dois formularios podem, opcionalmente, ser abertos por um Admin para aceitar registros sem login: Solicitacao de Demanda e Ata de Reuniao. Cada um tem </w:t>
+      </w:r>
+      <w:r>
+        <w:rPr>
+          <w:rFonts w:ascii="Montserrat" w:hAnsi="Montserrat"/>
+          <w:color w:val="1A1A1A"/>
+          <w:sz w:val="22"/>
         </w:rPr>
         <w:lastRenderedPageBreak/>
-        <w:drawing>
-          <wp:inline distT="0" distB="0" distL="0" distR="0" wp14:anchorId="40AAC319" wp14:editId="4DBAA7ED">
-            <wp:extent cx="4206240" cy="3801227"/>
-            <wp:effectExtent l="19050" t="19050" r="22860" b="27940"/>
-            <wp:docPr id="432445048" name="Imagem 5"/>
-            <wp:cNvGraphicFramePr/>
-            <a:graphic xmlns:a="http://schemas.openxmlformats.org/drawingml/2006/main">
-              <a:graphicData uri="http://schemas.openxmlformats.org/drawingml/2006/picture">
-                <pic:pic xmlns:pic="http://schemas.openxmlformats.org/drawingml/2006/picture">
-                  <pic:nvPicPr>
-                    <pic:cNvPr id="432445048" name=""/>
-                    <pic:cNvPicPr/>
-                  </pic:nvPicPr>
-                  <pic:blipFill>
-                    <a:blip r:embed="rId11" cstate="print">
-                      <a:extLst>
-                        <a:ext uri="{28A0092B-C50C-407E-A947-70E740481C1C}">
-                          <a14:useLocalDpi xmlns:a14="http://schemas.microsoft.com/office/drawing/2010/main" val="0"/>
-                        </a:ext>
-                      </a:extLst>
-                    </a:blip>
-                    <a:stretch>
-                      <a:fillRect/>
-                    </a:stretch>
-                  </pic:blipFill>
-                  <pic:spPr>
-                    <a:xfrm>
-                      <a:off x="0" y="0"/>
-                      <a:ext cx="4206240" cy="3801227"/>
-                    </a:xfrm>
-                    <a:prstGeom prst="rect">
-                      <a:avLst/>
-                    </a:prstGeom>
-                    <a:ln w="9525">
-                      <a:solidFill>
-                        <a:srgbClr val="D1D5DB"/>
-                      </a:solidFill>
-                    </a:ln>
-                  </pic:spPr>
-                </pic:pic>
-              </a:graphicData>
-            </a:graphic>
-          </wp:inline>
-        </w:drawing>
-      </w:r>
-    </w:p>
-    <w:p>
-      <w:pPr>
-        <w:spacing w:before="120" w:after="280"/>
-        <w:jc w:val="center"/>
-        <w:rPr>
-          <w:rFonts w:ascii="Montserrat" w:hAnsi="Montserrat"/>
-          <w:i/>
-          <w:color w:val="6A6A70"/>
-          <w:sz w:val="19"/>
-        </w:rPr>
-      </w:pPr>
-      <w:r>
-        <w:rPr>
-          <w:rFonts w:ascii="Montserrat" w:hAnsi="Montserrat"/>
-          <w:i/>
-          <w:color w:val="6A6A70"/>
-          <w:sz w:val="19"/>
-        </w:rPr>
-        <w:t>Quando a opcao esta ativa, a tela de login ganha um terceiro caminho: Continuar sem login.</w:t>
-      </w:r>
-    </w:p>
-    <w:p>
-      <w:pPr>
-        <w:spacing w:before="120" w:after="40"/>
-        <w:jc w:val="center"/>
-      </w:pPr>
-      <w:r>
-        <w:rPr>
-          <w:noProof/>
-        </w:rPr>
-        <w:lastRenderedPageBreak/>
-        <w:drawing>
-          <wp:inline distT="0" distB="0" distL="0" distR="0" wp14:anchorId="1BAD12C2" wp14:editId="191174CD">
-            <wp:extent cx="4206240" cy="3801227"/>
-            <wp:effectExtent l="19050" t="19050" r="22860" b="27940"/>
-            <wp:docPr id="433544214" name="Imagem 6"/>
-            <wp:cNvGraphicFramePr/>
-            <a:graphic xmlns:a="http://schemas.openxmlformats.org/drawingml/2006/main">
-              <a:graphicData uri="http://schemas.openxmlformats.org/drawingml/2006/picture">
-                <pic:pic xmlns:pic="http://schemas.openxmlformats.org/drawingml/2006/picture">
-                  <pic:nvPicPr>
-                    <pic:cNvPr id="433544214" name=""/>
-                    <pic:cNvPicPr/>
-                  </pic:nvPicPr>
-                  <pic:blipFill>
-                    <a:blip r:embed="rId12" cstate="print">
-                      <a:extLst>
-                        <a:ext uri="{28A0092B-C50C-407E-A947-70E740481C1C}">
-                          <a14:useLocalDpi xmlns:a14="http://schemas.microsoft.com/office/drawing/2010/main" val="0"/>
-                        </a:ext>
-                      </a:extLst>
-                    </a:blip>
-                    <a:stretch>
-                      <a:fillRect/>
-                    </a:stretch>
-                  </pic:blipFill>
-                  <pic:spPr>
-                    <a:xfrm>
-                      <a:off x="0" y="0"/>
-                      <a:ext cx="4206240" cy="3801227"/>
-                    </a:xfrm>
-                    <a:prstGeom prst="rect">
-                      <a:avLst/>
-                    </a:prstGeom>
-                    <a:ln w="9525">
-                      <a:solidFill>
-                        <a:srgbClr val="D1D5DB"/>
-                      </a:solidFill>
-                    </a:ln>
-                  </pic:spPr>
-                </pic:pic>
-              </a:graphicData>
-            </a:graphic>
-          </wp:inline>
-        </w:drawing>
-      </w:r>
-    </w:p>
-    <w:p>
-      <w:pPr>
-        <w:spacing w:before="120" w:after="280"/>
-        <w:jc w:val="center"/>
-        <w:rPr>
-          <w:rFonts w:ascii="Montserrat" w:hAnsi="Montserrat"/>
-          <w:i/>
-          <w:color w:val="6A6A70"/>
-          <w:sz w:val="19"/>
-        </w:rPr>
-      </w:pPr>
-      <w:r>
-        <w:rPr>
-          <w:rFonts w:ascii="Montserrat" w:hAnsi="Montserrat"/>
-          <w:i/>
-          <w:color w:val="6A6A70"/>
-          <w:sz w:val="19"/>
-        </w:rPr>
-        <w:t>A pessoa sem login informa apenas nome completo e e-mail para registrar.</w:t>
+        <w:t>um interruptor independente em Administracao &gt; Configuracoes (secao 6) - podem estar ligados, desligados ou so um dos dois.</w:t>
       </w:r>
     </w:p>
     <w:p>
@@ -5684,7 +5250,7 @@
           <w:sz w:val="27"/>
         </w:rPr>
       </w:pPr>
-      <w:bookmarkStart w:id="12" w:name="_Toc236124975"/>
+      <w:bookmarkStart w:id="12" w:name="_Toc236221953"/>
       <w:r>
         <w:rPr>
           <w:rFonts w:ascii="Montserrat" w:hAnsi="Montserrat"/>
@@ -5729,16 +5295,7 @@
           <w:color w:val="1A1A1A"/>
           <w:sz w:val="22"/>
         </w:rPr>
-        <w:t xml:space="preserve">Cada formulario ainda grava seus registros de forma independente - nao existe herenca automatica de informacoes entre eles. Ao preencher o TAP logo depois do Canvas, por exemplo, e preciso informar novamente o nome do projeto, a unidade e o gerente (ou selecionar o mesmo Projeto vinculado, quando o formulario tiver esse campo). Preencha os dados de identificacao da mesma </w:t>
-      </w:r>
-      <w:r>
-        <w:rPr>
-          <w:rFonts w:ascii="Montserrat" w:hAnsi="Montserrat"/>
-          <w:color w:val="1A1A1A"/>
-          <w:sz w:val="22"/>
-        </w:rPr>
-        <w:lastRenderedPageBreak/>
-        <w:t>forma em todos os formularios de um mesmo projeto, para manter a rastreabilidade entre eles.</w:t>
+        <w:t>Cada formulario ainda grava seus registros de forma independente - nao existe herenca automatica de informacoes entre eles. Ao preencher o TAP logo depois do Canvas, por exemplo, e preciso informar novamente o nome do projeto, a unidade e o gerente (ou selecionar o mesmo Projeto vinculado, quando o formulario tiver esse campo). Preencha os dados de identificacao da mesma forma em todos os formularios de um mesmo projeto, para manter a rastreabilidade entre eles.</w:t>
       </w:r>
     </w:p>
     <w:p>
@@ -5756,7 +5313,7 @@
           <w:sz w:val="34"/>
         </w:rPr>
       </w:pPr>
-      <w:bookmarkStart w:id="13" w:name="_Toc236124976"/>
+      <w:bookmarkStart w:id="13" w:name="_Toc236221954"/>
       <w:r>
         <w:rPr>
           <w:rFonts w:ascii="Montserrat" w:hAnsi="Montserrat"/>
@@ -5798,7 +5355,7 @@
           <w:sz w:val="27"/>
         </w:rPr>
       </w:pPr>
-      <w:bookmarkStart w:id="14" w:name="_Toc236124977"/>
+      <w:bookmarkStart w:id="14" w:name="_Toc236221955"/>
       <w:r>
         <w:rPr>
           <w:rFonts w:ascii="Montserrat" w:hAnsi="Montserrat"/>
@@ -6715,160 +6272,6 @@
     </w:p>
     <w:p>
       <w:pPr>
-        <w:spacing w:before="120" w:after="40"/>
-        <w:jc w:val="center"/>
-      </w:pPr>
-      <w:r>
-        <w:rPr>
-          <w:noProof/>
-        </w:rPr>
-        <w:lastRenderedPageBreak/>
-        <w:drawing>
-          <wp:inline distT="0" distB="0" distL="0" distR="0" wp14:anchorId="0254DE31" wp14:editId="3BD33429">
-            <wp:extent cx="5120640" cy="4627581"/>
-            <wp:effectExtent l="19050" t="19050" r="22860" b="20955"/>
-            <wp:docPr id="1478426815" name="Imagem 7"/>
-            <wp:cNvGraphicFramePr/>
-            <a:graphic xmlns:a="http://schemas.openxmlformats.org/drawingml/2006/main">
-              <a:graphicData uri="http://schemas.openxmlformats.org/drawingml/2006/picture">
-                <pic:pic xmlns:pic="http://schemas.openxmlformats.org/drawingml/2006/picture">
-                  <pic:nvPicPr>
-                    <pic:cNvPr id="1478426815" name=""/>
-                    <pic:cNvPicPr/>
-                  </pic:nvPicPr>
-                  <pic:blipFill>
-                    <a:blip r:embed="rId13">
-                      <a:extLst>
-                        <a:ext uri="{28A0092B-C50C-407E-A947-70E740481C1C}">
-                          <a14:useLocalDpi xmlns:a14="http://schemas.microsoft.com/office/drawing/2010/main" val="0"/>
-                        </a:ext>
-                      </a:extLst>
-                    </a:blip>
-                    <a:stretch>
-                      <a:fillRect/>
-                    </a:stretch>
-                  </pic:blipFill>
-                  <pic:spPr>
-                    <a:xfrm>
-                      <a:off x="0" y="0"/>
-                      <a:ext cx="5120640" cy="4627581"/>
-                    </a:xfrm>
-                    <a:prstGeom prst="rect">
-                      <a:avLst/>
-                    </a:prstGeom>
-                    <a:ln w="9525">
-                      <a:solidFill>
-                        <a:srgbClr val="D1D5DB"/>
-                      </a:solidFill>
-                    </a:ln>
-                  </pic:spPr>
-                </pic:pic>
-              </a:graphicData>
-            </a:graphic>
-          </wp:inline>
-        </w:drawing>
-      </w:r>
-    </w:p>
-    <w:p>
-      <w:pPr>
-        <w:spacing w:before="120" w:after="280"/>
-        <w:jc w:val="center"/>
-        <w:rPr>
-          <w:rFonts w:ascii="Montserrat" w:hAnsi="Montserrat"/>
-          <w:i/>
-          <w:color w:val="6A6A70"/>
-          <w:sz w:val="19"/>
-        </w:rPr>
-      </w:pPr>
-      <w:r>
-        <w:rPr>
-          <w:rFonts w:ascii="Montserrat" w:hAnsi="Montserrat"/>
-          <w:i/>
-          <w:color w:val="6A6A70"/>
-          <w:sz w:val="19"/>
-        </w:rPr>
-        <w:t>Tela de novo registro da Solicitacao de Demanda.</w:t>
-      </w:r>
-    </w:p>
-    <w:p>
-      <w:pPr>
-        <w:spacing w:before="120" w:after="40"/>
-        <w:jc w:val="center"/>
-      </w:pPr>
-      <w:r>
-        <w:rPr>
-          <w:noProof/>
-        </w:rPr>
-        <w:lastRenderedPageBreak/>
-        <w:drawing>
-          <wp:inline distT="0" distB="0" distL="0" distR="0" wp14:anchorId="60C37622" wp14:editId="4E42DB0A">
-            <wp:extent cx="5120640" cy="4627581"/>
-            <wp:effectExtent l="19050" t="19050" r="22860" b="20955"/>
-            <wp:docPr id="482422709" name="Imagem 8"/>
-            <wp:cNvGraphicFramePr/>
-            <a:graphic xmlns:a="http://schemas.openxmlformats.org/drawingml/2006/main">
-              <a:graphicData uri="http://schemas.openxmlformats.org/drawingml/2006/picture">
-                <pic:pic xmlns:pic="http://schemas.openxmlformats.org/drawingml/2006/picture">
-                  <pic:nvPicPr>
-                    <pic:cNvPr id="482422709" name=""/>
-                    <pic:cNvPicPr/>
-                  </pic:nvPicPr>
-                  <pic:blipFill>
-                    <a:blip r:embed="rId14">
-                      <a:extLst>
-                        <a:ext uri="{28A0092B-C50C-407E-A947-70E740481C1C}">
-                          <a14:useLocalDpi xmlns:a14="http://schemas.microsoft.com/office/drawing/2010/main" val="0"/>
-                        </a:ext>
-                      </a:extLst>
-                    </a:blip>
-                    <a:stretch>
-                      <a:fillRect/>
-                    </a:stretch>
-                  </pic:blipFill>
-                  <pic:spPr>
-                    <a:xfrm>
-                      <a:off x="0" y="0"/>
-                      <a:ext cx="5120640" cy="4627581"/>
-                    </a:xfrm>
-                    <a:prstGeom prst="rect">
-                      <a:avLst/>
-                    </a:prstGeom>
-                    <a:ln w="9525">
-                      <a:solidFill>
-                        <a:srgbClr val="D1D5DB"/>
-                      </a:solidFill>
-                    </a:ln>
-                  </pic:spPr>
-                </pic:pic>
-              </a:graphicData>
-            </a:graphic>
-          </wp:inline>
-        </w:drawing>
-      </w:r>
-    </w:p>
-    <w:p>
-      <w:pPr>
-        <w:spacing w:before="120" w:after="280"/>
-        <w:jc w:val="center"/>
-        <w:rPr>
-          <w:rFonts w:ascii="Montserrat" w:hAnsi="Montserrat"/>
-          <w:i/>
-          <w:color w:val="6A6A70"/>
-          <w:sz w:val="19"/>
-        </w:rPr>
-      </w:pPr>
-      <w:r>
-        <w:rPr>
-          <w:rFonts w:ascii="Montserrat" w:hAnsi="Montserrat"/>
-          <w:i/>
-          <w:color w:val="6A6A70"/>
-          <w:sz w:val="19"/>
-        </w:rPr>
-        <w:t>Demandas cadastradas, com protocolo, projeto, prazo e status.</w:t>
-      </w:r>
-    </w:p>
-    <w:p>
-      <w:pPr>
         <w:spacing w:before="160" w:after="200"/>
         <w:ind w:left="283"/>
         <w:rPr>
@@ -6931,6 +6334,7 @@
           <w:color w:val="6A6A70"/>
           <w:sz w:val="21"/>
         </w:rPr>
+        <w:lastRenderedPageBreak/>
         <w:t>E neste ponto que ocorre o Gate 1 - Triagem: so um Admin pode mudar o status para Aprovada ou Reprovada (secao 2.4). So avance para o Passo 2 depois que o status estiver Aprovada.</w:t>
       </w:r>
     </w:p>
@@ -6945,7 +6349,7 @@
           <w:sz w:val="27"/>
         </w:rPr>
       </w:pPr>
-      <w:bookmarkStart w:id="15" w:name="_Toc236124978"/>
+      <w:bookmarkStart w:id="15" w:name="_Toc236221956"/>
       <w:r>
         <w:rPr>
           <w:rFonts w:ascii="Montserrat" w:hAnsi="Montserrat"/>
@@ -6972,16 +6376,7 @@
           <w:color w:val="1A1A1A"/>
           <w:sz w:val="22"/>
         </w:rPr>
-        <w:t xml:space="preserve">Quando usar: assim que a demanda for aprovada. O Canvas e o primeiro documento estruturado do projeto - reune, em uma unica tela, a motivacao, o </w:t>
-      </w:r>
-      <w:r>
-        <w:rPr>
-          <w:rFonts w:ascii="Montserrat" w:hAnsi="Montserrat"/>
-          <w:color w:val="1A1A1A"/>
-          <w:sz w:val="22"/>
-        </w:rPr>
-        <w:lastRenderedPageBreak/>
-        <w:t>produto, os parceiros, as entregas, os riscos e os custos. Exige selecionar um Projeto vinculado ja Aprovado no Gate 1, e so membros da equipe daquele projeto (ou Admin) podem registrar (secao 2.5).</w:t>
+        <w:t>Quando usar: assim que a demanda for aprovada. O Canvas e o primeiro documento estruturado do projeto - reune, em uma unica tela, a motivacao, o produto, os parceiros, as entregas, os riscos e os custos. Exige selecionar um Projeto vinculado ja Aprovado no Gate 1, e so membros da equipe daquele projeto (ou Admin) podem registrar (secao 2.5).</w:t>
       </w:r>
     </w:p>
     <w:tbl>
@@ -7871,160 +7266,6 @@
     </w:p>
     <w:p>
       <w:pPr>
-        <w:spacing w:before="120" w:after="40"/>
-        <w:jc w:val="center"/>
-      </w:pPr>
-      <w:r>
-        <w:rPr>
-          <w:noProof/>
-        </w:rPr>
-        <w:lastRenderedPageBreak/>
-        <w:drawing>
-          <wp:inline distT="0" distB="0" distL="0" distR="0" wp14:anchorId="0ABB8165" wp14:editId="5B3F86B6">
-            <wp:extent cx="5120640" cy="4627581"/>
-            <wp:effectExtent l="19050" t="19050" r="22860" b="20955"/>
-            <wp:docPr id="1795397067" name="Imagem 9"/>
-            <wp:cNvGraphicFramePr/>
-            <a:graphic xmlns:a="http://schemas.openxmlformats.org/drawingml/2006/main">
-              <a:graphicData uri="http://schemas.openxmlformats.org/drawingml/2006/picture">
-                <pic:pic xmlns:pic="http://schemas.openxmlformats.org/drawingml/2006/picture">
-                  <pic:nvPicPr>
-                    <pic:cNvPr id="1795397067" name=""/>
-                    <pic:cNvPicPr/>
-                  </pic:nvPicPr>
-                  <pic:blipFill>
-                    <a:blip r:embed="rId15">
-                      <a:extLst>
-                        <a:ext uri="{28A0092B-C50C-407E-A947-70E740481C1C}">
-                          <a14:useLocalDpi xmlns:a14="http://schemas.microsoft.com/office/drawing/2010/main" val="0"/>
-                        </a:ext>
-                      </a:extLst>
-                    </a:blip>
-                    <a:stretch>
-                      <a:fillRect/>
-                    </a:stretch>
-                  </pic:blipFill>
-                  <pic:spPr>
-                    <a:xfrm>
-                      <a:off x="0" y="0"/>
-                      <a:ext cx="5120640" cy="4627581"/>
-                    </a:xfrm>
-                    <a:prstGeom prst="rect">
-                      <a:avLst/>
-                    </a:prstGeom>
-                    <a:ln w="9525">
-                      <a:solidFill>
-                        <a:srgbClr val="D1D5DB"/>
-                      </a:solidFill>
-                    </a:ln>
-                  </pic:spPr>
-                </pic:pic>
-              </a:graphicData>
-            </a:graphic>
-          </wp:inline>
-        </w:drawing>
-      </w:r>
-    </w:p>
-    <w:p>
-      <w:pPr>
-        <w:spacing w:before="120" w:after="280"/>
-        <w:jc w:val="center"/>
-        <w:rPr>
-          <w:rFonts w:ascii="Montserrat" w:hAnsi="Montserrat"/>
-          <w:i/>
-          <w:color w:val="6A6A70"/>
-          <w:sz w:val="19"/>
-        </w:rPr>
-      </w:pPr>
-      <w:r>
-        <w:rPr>
-          <w:rFonts w:ascii="Montserrat" w:hAnsi="Montserrat"/>
-          <w:i/>
-          <w:color w:val="6A6A70"/>
-          <w:sz w:val="19"/>
-        </w:rPr>
-        <w:t>Tela de novo Canvas, com o seletor de Projeto vinculado no topo.</w:t>
-      </w:r>
-    </w:p>
-    <w:p>
-      <w:pPr>
-        <w:spacing w:before="120" w:after="40"/>
-        <w:jc w:val="center"/>
-      </w:pPr>
-      <w:r>
-        <w:rPr>
-          <w:noProof/>
-        </w:rPr>
-        <w:lastRenderedPageBreak/>
-        <w:drawing>
-          <wp:inline distT="0" distB="0" distL="0" distR="0" wp14:anchorId="5BC7A59F" wp14:editId="16002E37">
-            <wp:extent cx="5120640" cy="4627581"/>
-            <wp:effectExtent l="19050" t="19050" r="22860" b="20955"/>
-            <wp:docPr id="161230939" name="Imagem 10"/>
-            <wp:cNvGraphicFramePr/>
-            <a:graphic xmlns:a="http://schemas.openxmlformats.org/drawingml/2006/main">
-              <a:graphicData uri="http://schemas.openxmlformats.org/drawingml/2006/picture">
-                <pic:pic xmlns:pic="http://schemas.openxmlformats.org/drawingml/2006/picture">
-                  <pic:nvPicPr>
-                    <pic:cNvPr id="161230939" name=""/>
-                    <pic:cNvPicPr/>
-                  </pic:nvPicPr>
-                  <pic:blipFill>
-                    <a:blip r:embed="rId16">
-                      <a:extLst>
-                        <a:ext uri="{28A0092B-C50C-407E-A947-70E740481C1C}">
-                          <a14:useLocalDpi xmlns:a14="http://schemas.microsoft.com/office/drawing/2010/main" val="0"/>
-                        </a:ext>
-                      </a:extLst>
-                    </a:blip>
-                    <a:stretch>
-                      <a:fillRect/>
-                    </a:stretch>
-                  </pic:blipFill>
-                  <pic:spPr>
-                    <a:xfrm>
-                      <a:off x="0" y="0"/>
-                      <a:ext cx="5120640" cy="4627581"/>
-                    </a:xfrm>
-                    <a:prstGeom prst="rect">
-                      <a:avLst/>
-                    </a:prstGeom>
-                    <a:ln w="9525">
-                      <a:solidFill>
-                        <a:srgbClr val="D1D5DB"/>
-                      </a:solidFill>
-                    </a:ln>
-                  </pic:spPr>
-                </pic:pic>
-              </a:graphicData>
-            </a:graphic>
-          </wp:inline>
-        </w:drawing>
-      </w:r>
-    </w:p>
-    <w:p>
-      <w:pPr>
-        <w:spacing w:before="120" w:after="280"/>
-        <w:jc w:val="center"/>
-        <w:rPr>
-          <w:rFonts w:ascii="Montserrat" w:hAnsi="Montserrat"/>
-          <w:i/>
-          <w:color w:val="6A6A70"/>
-          <w:sz w:val="19"/>
-        </w:rPr>
-      </w:pPr>
-      <w:r>
-        <w:rPr>
-          <w:rFonts w:ascii="Montserrat" w:hAnsi="Montserrat"/>
-          <w:i/>
-          <w:color w:val="6A6A70"/>
-          <w:sz w:val="19"/>
-        </w:rPr>
-        <w:t>Canvas cadastrados.</w:t>
-      </w:r>
-    </w:p>
-    <w:p>
-      <w:pPr>
         <w:spacing w:line="280" w:lineRule="auto"/>
         <w:rPr>
           <w:rFonts w:ascii="Montserrat" w:hAnsi="Montserrat"/>
@@ -8052,7 +7293,7 @@
           <w:sz w:val="27"/>
         </w:rPr>
       </w:pPr>
-      <w:bookmarkStart w:id="16" w:name="_Toc236124979"/>
+      <w:bookmarkStart w:id="16" w:name="_Toc236221957"/>
       <w:r>
         <w:rPr>
           <w:rFonts w:ascii="Montserrat" w:hAnsi="Montserrat"/>
@@ -8134,6 +7375,7 @@
                 <w:color w:val="FFFFFF"/>
                 <w:sz w:val="19"/>
               </w:rPr>
+              <w:lastRenderedPageBreak/>
               <w:t>Campo</w:t>
             </w:r>
           </w:p>
@@ -8294,7 +7536,6 @@
                 <w:color w:val="1A1A1A"/>
                 <w:sz w:val="19"/>
               </w:rPr>
-              <w:lastRenderedPageBreak/>
               <w:t>Alinhamento estrategico / Programa vinculado</w:t>
             </w:r>
           </w:p>
@@ -8603,7 +7844,7 @@
                 <w:color w:val="1A1A1A"/>
                 <w:sz w:val="19"/>
               </w:rPr>
-              <w:t>Premissas / Restricoes / Criterios / Riscos</w:t>
+              <w:t>Premissas / Restricoes / Criterios</w:t>
             </w:r>
           </w:p>
         </w:tc>
@@ -8680,7 +7921,7 @@
                 <w:color w:val="1A1A1A"/>
                 <w:sz w:val="19"/>
               </w:rPr>
-              <w:t>Cronograma de entregas macro (tabela)</w:t>
+              <w:t>Registro de riscos (tabela)</w:t>
             </w:r>
           </w:p>
         </w:tc>
@@ -8726,7 +7967,7 @@
                 <w:color w:val="1A1A1A"/>
                 <w:sz w:val="19"/>
               </w:rPr>
-              <w:t>Marco, responsavel, inicio e termino previstos, custo</w:t>
+              <w:t>Registro vivo: risco, status, responsavel e data da ultima revisao</w:t>
             </w:r>
           </w:p>
         </w:tc>
@@ -8757,7 +7998,7 @@
                 <w:color w:val="1A1A1A"/>
                 <w:sz w:val="19"/>
               </w:rPr>
-              <w:t>Custo total estimado (tabela)</w:t>
+              <w:t>Cronograma de entregas macro (tabela)</w:t>
             </w:r>
           </w:p>
         </w:tc>
@@ -8803,7 +8044,7 @@
                 <w:color w:val="1A1A1A"/>
                 <w:sz w:val="19"/>
               </w:rPr>
-              <w:t>Soma automatica a medida que as linhas sao preenchidas</w:t>
+              <w:t>Marco, responsavel, inicio e termino previstos, custo</w:t>
             </w:r>
           </w:p>
         </w:tc>
@@ -8834,7 +8075,7 @@
                 <w:color w:val="1A1A1A"/>
                 <w:sz w:val="19"/>
               </w:rPr>
-              <w:t>Partes interessadas e Equipe (tabelas)</w:t>
+              <w:t>Custo total estimado (tabela)</w:t>
             </w:r>
           </w:p>
         </w:tc>
@@ -8880,7 +8121,7 @@
                 <w:color w:val="1A1A1A"/>
                 <w:sz w:val="19"/>
               </w:rPr>
-              <w:t>Nome e unidade de cada pessoa</w:t>
+              <w:t>Soma automatica a medida que as linhas sao preenchidas</w:t>
             </w:r>
           </w:p>
         </w:tc>
@@ -8911,6 +8152,83 @@
                 <w:color w:val="1A1A1A"/>
                 <w:sz w:val="19"/>
               </w:rPr>
+              <w:t>Partes interessadas e Equipe (tabelas)</w:t>
+            </w:r>
+          </w:p>
+        </w:tc>
+        <w:tc>
+          <w:tcPr>
+            <w:tcW w:w="907" w:type="dxa"/>
+          </w:tcPr>
+          <w:p>
+            <w:pPr>
+              <w:spacing w:line="280" w:lineRule="auto"/>
+              <w:rPr>
+                <w:rFonts w:ascii="Montserrat" w:hAnsi="Montserrat"/>
+                <w:color w:val="1A1A1A"/>
+                <w:sz w:val="19"/>
+              </w:rPr>
+            </w:pPr>
+            <w:r>
+              <w:rPr>
+                <w:rFonts w:ascii="Montserrat" w:hAnsi="Montserrat"/>
+                <w:color w:val="1A1A1A"/>
+                <w:sz w:val="19"/>
+              </w:rPr>
+              <w:t>Nao</w:t>
+            </w:r>
+          </w:p>
+        </w:tc>
+        <w:tc>
+          <w:tcPr>
+            <w:tcW w:w="4989" w:type="dxa"/>
+          </w:tcPr>
+          <w:p>
+            <w:pPr>
+              <w:spacing w:line="280" w:lineRule="auto"/>
+              <w:rPr>
+                <w:rFonts w:ascii="Montserrat" w:hAnsi="Montserrat"/>
+                <w:color w:val="1A1A1A"/>
+                <w:sz w:val="19"/>
+              </w:rPr>
+            </w:pPr>
+            <w:r>
+              <w:rPr>
+                <w:rFonts w:ascii="Montserrat" w:hAnsi="Montserrat"/>
+                <w:color w:val="1A1A1A"/>
+                <w:sz w:val="19"/>
+              </w:rPr>
+              <w:t>Nome e unidade de cada pessoa</w:t>
+            </w:r>
+          </w:p>
+        </w:tc>
+      </w:tr>
+      <w:tr>
+        <w:tblPrEx>
+          <w:tblCellMar>
+            <w:top w:w="0" w:type="dxa"/>
+            <w:bottom w:w="0" w:type="dxa"/>
+          </w:tblCellMar>
+        </w:tblPrEx>
+        <w:tc>
+          <w:tcPr>
+            <w:tcW w:w="3175" w:type="dxa"/>
+          </w:tcPr>
+          <w:p>
+            <w:pPr>
+              <w:spacing w:line="280" w:lineRule="auto"/>
+              <w:rPr>
+                <w:rFonts w:ascii="Montserrat" w:hAnsi="Montserrat"/>
+                <w:color w:val="1A1A1A"/>
+                <w:sz w:val="19"/>
+              </w:rPr>
+            </w:pPr>
+            <w:r>
+              <w:rPr>
+                <w:rFonts w:ascii="Montserrat" w:hAnsi="Montserrat"/>
+                <w:color w:val="1A1A1A"/>
+                <w:sz w:val="19"/>
+              </w:rPr>
               <w:t>Indicadores de resultado (tabela)</w:t>
             </w:r>
           </w:p>
@@ -8970,79 +8288,47 @@
     </w:p>
     <w:p>
       <w:pPr>
-        <w:spacing w:before="120" w:after="40"/>
-        <w:jc w:val="center"/>
-      </w:pPr>
-      <w:r>
-        <w:rPr>
-          <w:noProof/>
+        <w:spacing w:line="280" w:lineRule="auto"/>
+        <w:rPr>
+          <w:rFonts w:ascii="Montserrat" w:hAnsi="Montserrat"/>
+          <w:color w:val="1A1A1A"/>
+          <w:sz w:val="22"/>
+        </w:rPr>
+      </w:pPr>
+      <w:r>
+        <w:rPr>
+          <w:rFonts w:ascii="Montserrat" w:hAnsi="Montserrat"/>
+          <w:color w:val="1A1A1A"/>
+          <w:sz w:val="22"/>
+        </w:rPr>
+        <w:t>Registro de riscos (secao 9 do formulario): diferente dos demais campos do TAP, o registro de riscos e vivo - pode ser reaberto e atualizado a qualquer momento do projeto pelo botao Editar dados, sem se limitar ao preenchimento inicial. Cada linha da tabela tem Risco, Status (Aberto, Monitorando, Mitigado, Materializado ou Encerrado, exibido como selo colorido), Responsavel e Ultima revisao (data).</w:t>
+      </w:r>
+    </w:p>
+    <w:p>
+      <w:pPr>
+        <w:spacing w:line="280" w:lineRule="auto"/>
+        <w:rPr>
+          <w:rFonts w:ascii="Montserrat" w:hAnsi="Montserrat"/>
+          <w:color w:val="1A1A1A"/>
+          <w:sz w:val="22"/>
+        </w:rPr>
+      </w:pPr>
+      <w:r>
+        <w:rPr>
+          <w:rFonts w:ascii="Montserrat" w:hAnsi="Montserrat"/>
+          <w:color w:val="1A1A1A"/>
+          <w:sz w:val="22"/>
+        </w:rPr>
+        <w:t xml:space="preserve">Sugestoes de riscos recorrentes: ao selecionar um Projeto vinculado, o formulario analisa automaticamente o campo Entraves de todas as Atas de Reuniao ja registradas para aquele projeto e destaca, logo abaixo da tabela de riscos, qualquer entrave que se repita em 2 ou mais atas diferentes - com a contagem de atas e um botao + Adicionar ao registro que insere a sugestao direto na tabela (status Aberto, revisao com a data de hoje). E uma regra automatica de comparacao de texto, sem chamar nenhuma IA - ela so aproveita </w:t>
+      </w:r>
+      <w:r>
+        <w:rPr>
+          <w:rFonts w:ascii="Montserrat" w:hAnsi="Montserrat"/>
+          <w:color w:val="1A1A1A"/>
+          <w:sz w:val="22"/>
         </w:rPr>
         <w:lastRenderedPageBreak/>
-        <w:drawing>
-          <wp:inline distT="0" distB="0" distL="0" distR="0" wp14:anchorId="2AD8B5C0" wp14:editId="026F7C65">
-            <wp:extent cx="5120640" cy="4627581"/>
-            <wp:effectExtent l="19050" t="19050" r="22860" b="20955"/>
-            <wp:docPr id="560368232" name="Imagem 11"/>
-            <wp:cNvGraphicFramePr/>
-            <a:graphic xmlns:a="http://schemas.openxmlformats.org/drawingml/2006/main">
-              <a:graphicData uri="http://schemas.openxmlformats.org/drawingml/2006/picture">
-                <pic:pic xmlns:pic="http://schemas.openxmlformats.org/drawingml/2006/picture">
-                  <pic:nvPicPr>
-                    <pic:cNvPr id="560368232" name=""/>
-                    <pic:cNvPicPr/>
-                  </pic:nvPicPr>
-                  <pic:blipFill>
-                    <a:blip r:embed="rId17">
-                      <a:extLst>
-                        <a:ext uri="{28A0092B-C50C-407E-A947-70E740481C1C}">
-                          <a14:useLocalDpi xmlns:a14="http://schemas.microsoft.com/office/drawing/2010/main" val="0"/>
-                        </a:ext>
-                      </a:extLst>
-                    </a:blip>
-                    <a:stretch>
-                      <a:fillRect/>
-                    </a:stretch>
-                  </pic:blipFill>
-                  <pic:spPr>
-                    <a:xfrm>
-                      <a:off x="0" y="0"/>
-                      <a:ext cx="5120640" cy="4627581"/>
-                    </a:xfrm>
-                    <a:prstGeom prst="rect">
-                      <a:avLst/>
-                    </a:prstGeom>
-                    <a:ln w="9525">
-                      <a:solidFill>
-                        <a:srgbClr val="D1D5DB"/>
-                      </a:solidFill>
-                    </a:ln>
-                  </pic:spPr>
-                </pic:pic>
-              </a:graphicData>
-            </a:graphic>
-          </wp:inline>
-        </w:drawing>
-      </w:r>
-    </w:p>
-    <w:p>
-      <w:pPr>
-        <w:spacing w:before="120" w:after="280"/>
-        <w:jc w:val="center"/>
-        <w:rPr>
-          <w:rFonts w:ascii="Montserrat" w:hAnsi="Montserrat"/>
-          <w:i/>
-          <w:color w:val="6A6A70"/>
-          <w:sz w:val="19"/>
-        </w:rPr>
-      </w:pPr>
-      <w:r>
-        <w:rPr>
-          <w:rFonts w:ascii="Montserrat" w:hAnsi="Montserrat"/>
-          <w:i/>
-          <w:color w:val="6A6A70"/>
-          <w:sz w:val="19"/>
-        </w:rPr>
-        <w:t>TAPs cadastrados.</w:t>
+        <w:t>entraves ja registrados nas atas, inclusive os que tiverem sido transcritos com o Preencher com Read AI (Passo 6).</w:t>
       </w:r>
     </w:p>
     <w:p>
@@ -9074,7 +8360,7 @@
           <w:sz w:val="27"/>
         </w:rPr>
       </w:pPr>
-      <w:bookmarkStart w:id="17" w:name="_Toc236124980"/>
+      <w:bookmarkStart w:id="17" w:name="_Toc236221958"/>
       <w:r>
         <w:rPr>
           <w:rFonts w:ascii="Montserrat" w:hAnsi="Montserrat"/>
@@ -9320,7 +8606,6 @@
                 <w:color w:val="1A1A1A"/>
                 <w:sz w:val="19"/>
               </w:rPr>
-              <w:lastRenderedPageBreak/>
               <w:t>3. Cronograma</w:t>
             </w:r>
           </w:p>
@@ -9627,159 +8912,6 @@
     </w:p>
     <w:p>
       <w:pPr>
-        <w:spacing w:before="120" w:after="40"/>
-        <w:jc w:val="center"/>
-      </w:pPr>
-      <w:r>
-        <w:rPr>
-          <w:noProof/>
-        </w:rPr>
-        <w:drawing>
-          <wp:inline distT="0" distB="0" distL="0" distR="0" wp14:anchorId="4D984674" wp14:editId="7DCA589A">
-            <wp:extent cx="5120640" cy="4627581"/>
-            <wp:effectExtent l="19050" t="19050" r="22860" b="20955"/>
-            <wp:docPr id="1090602362" name="Imagem 12"/>
-            <wp:cNvGraphicFramePr/>
-            <a:graphic xmlns:a="http://schemas.openxmlformats.org/drawingml/2006/main">
-              <a:graphicData uri="http://schemas.openxmlformats.org/drawingml/2006/picture">
-                <pic:pic xmlns:pic="http://schemas.openxmlformats.org/drawingml/2006/picture">
-                  <pic:nvPicPr>
-                    <pic:cNvPr id="1090602362" name=""/>
-                    <pic:cNvPicPr/>
-                  </pic:nvPicPr>
-                  <pic:blipFill>
-                    <a:blip r:embed="rId18">
-                      <a:extLst>
-                        <a:ext uri="{28A0092B-C50C-407E-A947-70E740481C1C}">
-                          <a14:useLocalDpi xmlns:a14="http://schemas.microsoft.com/office/drawing/2010/main" val="0"/>
-                        </a:ext>
-                      </a:extLst>
-                    </a:blip>
-                    <a:stretch>
-                      <a:fillRect/>
-                    </a:stretch>
-                  </pic:blipFill>
-                  <pic:spPr>
-                    <a:xfrm>
-                      <a:off x="0" y="0"/>
-                      <a:ext cx="5120640" cy="4627581"/>
-                    </a:xfrm>
-                    <a:prstGeom prst="rect">
-                      <a:avLst/>
-                    </a:prstGeom>
-                    <a:ln w="9525">
-                      <a:solidFill>
-                        <a:srgbClr val="D1D5DB"/>
-                      </a:solidFill>
-                    </a:ln>
-                  </pic:spPr>
-                </pic:pic>
-              </a:graphicData>
-            </a:graphic>
-          </wp:inline>
-        </w:drawing>
-      </w:r>
-    </w:p>
-    <w:p>
-      <w:pPr>
-        <w:spacing w:before="120" w:after="280"/>
-        <w:jc w:val="center"/>
-        <w:rPr>
-          <w:rFonts w:ascii="Montserrat" w:hAnsi="Montserrat"/>
-          <w:i/>
-          <w:color w:val="6A6A70"/>
-          <w:sz w:val="19"/>
-        </w:rPr>
-      </w:pPr>
-      <w:r>
-        <w:rPr>
-          <w:rFonts w:ascii="Montserrat" w:hAnsi="Montserrat"/>
-          <w:i/>
-          <w:color w:val="6A6A70"/>
-          <w:sz w:val="19"/>
-        </w:rPr>
-        <w:t>Capa de identificacao do dossie, com a barra das 8 abas no rodape visivel.</w:t>
-      </w:r>
-    </w:p>
-    <w:p>
-      <w:pPr>
-        <w:spacing w:before="120" w:after="40"/>
-        <w:jc w:val="center"/>
-      </w:pPr>
-      <w:r>
-        <w:rPr>
-          <w:noProof/>
-        </w:rPr>
-        <w:lastRenderedPageBreak/>
-        <w:drawing>
-          <wp:inline distT="0" distB="0" distL="0" distR="0" wp14:anchorId="36780F09" wp14:editId="6A829946">
-            <wp:extent cx="5120640" cy="4627581"/>
-            <wp:effectExtent l="19050" t="19050" r="22860" b="20955"/>
-            <wp:docPr id="317543154" name="Imagem 13"/>
-            <wp:cNvGraphicFramePr/>
-            <a:graphic xmlns:a="http://schemas.openxmlformats.org/drawingml/2006/main">
-              <a:graphicData uri="http://schemas.openxmlformats.org/drawingml/2006/picture">
-                <pic:pic xmlns:pic="http://schemas.openxmlformats.org/drawingml/2006/picture">
-                  <pic:nvPicPr>
-                    <pic:cNvPr id="317543154" name=""/>
-                    <pic:cNvPicPr/>
-                  </pic:nvPicPr>
-                  <pic:blipFill>
-                    <a:blip r:embed="rId19">
-                      <a:extLst>
-                        <a:ext uri="{28A0092B-C50C-407E-A947-70E740481C1C}">
-                          <a14:useLocalDpi xmlns:a14="http://schemas.microsoft.com/office/drawing/2010/main" val="0"/>
-                        </a:ext>
-                      </a:extLst>
-                    </a:blip>
-                    <a:stretch>
-                      <a:fillRect/>
-                    </a:stretch>
-                  </pic:blipFill>
-                  <pic:spPr>
-                    <a:xfrm>
-                      <a:off x="0" y="0"/>
-                      <a:ext cx="5120640" cy="4627581"/>
-                    </a:xfrm>
-                    <a:prstGeom prst="rect">
-                      <a:avLst/>
-                    </a:prstGeom>
-                    <a:ln w="9525">
-                      <a:solidFill>
-                        <a:srgbClr val="D1D5DB"/>
-                      </a:solidFill>
-                    </a:ln>
-                  </pic:spPr>
-                </pic:pic>
-              </a:graphicData>
-            </a:graphic>
-          </wp:inline>
-        </w:drawing>
-      </w:r>
-    </w:p>
-    <w:p>
-      <w:pPr>
-        <w:spacing w:before="120" w:after="280"/>
-        <w:jc w:val="center"/>
-        <w:rPr>
-          <w:rFonts w:ascii="Montserrat" w:hAnsi="Montserrat"/>
-          <w:i/>
-          <w:color w:val="6A6A70"/>
-          <w:sz w:val="19"/>
-        </w:rPr>
-      </w:pPr>
-      <w:r>
-        <w:rPr>
-          <w:rFonts w:ascii="Montserrat" w:hAnsi="Montserrat"/>
-          <w:i/>
-          <w:color w:val="6A6A70"/>
-          <w:sz w:val="19"/>
-        </w:rPr>
-        <w:t>Projetos cadastrados (estado vazio, antes do primeiro dossie ser salvo).</w:t>
-      </w:r>
-    </w:p>
-    <w:p>
-      <w:pPr>
         <w:spacing w:line="280" w:lineRule="auto"/>
         <w:rPr>
           <w:rFonts w:ascii="Montserrat" w:hAnsi="Montserrat"/>
@@ -9807,7 +8939,7 @@
           <w:sz w:val="27"/>
         </w:rPr>
       </w:pPr>
-      <w:bookmarkStart w:id="18" w:name="_Toc236124981"/>
+      <w:bookmarkStart w:id="18" w:name="_Toc236221959"/>
       <w:r>
         <w:rPr>
           <w:rFonts w:ascii="Montserrat" w:hAnsi="Montserrat"/>
@@ -9835,160 +8967,6 @@
           <w:sz w:val="22"/>
         </w:rPr>
         <w:t>Quando usar: em paralelo ao planejamento, para decompor visualmente o escopo em pacotes de trabalho.</w:t>
-      </w:r>
-    </w:p>
-    <w:p>
-      <w:pPr>
-        <w:spacing w:before="120" w:after="40"/>
-        <w:jc w:val="center"/>
-      </w:pPr>
-      <w:r>
-        <w:rPr>
-          <w:noProof/>
-        </w:rPr>
-        <w:lastRenderedPageBreak/>
-        <w:drawing>
-          <wp:inline distT="0" distB="0" distL="0" distR="0" wp14:anchorId="6C43F812" wp14:editId="1AF1703A">
-            <wp:extent cx="5120640" cy="4627581"/>
-            <wp:effectExtent l="19050" t="19050" r="22860" b="20955"/>
-            <wp:docPr id="397943409" name="Imagem 14"/>
-            <wp:cNvGraphicFramePr/>
-            <a:graphic xmlns:a="http://schemas.openxmlformats.org/drawingml/2006/main">
-              <a:graphicData uri="http://schemas.openxmlformats.org/drawingml/2006/picture">
-                <pic:pic xmlns:pic="http://schemas.openxmlformats.org/drawingml/2006/picture">
-                  <pic:nvPicPr>
-                    <pic:cNvPr id="397943409" name=""/>
-                    <pic:cNvPicPr/>
-                  </pic:nvPicPr>
-                  <pic:blipFill>
-                    <a:blip r:embed="rId20">
-                      <a:extLst>
-                        <a:ext uri="{28A0092B-C50C-407E-A947-70E740481C1C}">
-                          <a14:useLocalDpi xmlns:a14="http://schemas.microsoft.com/office/drawing/2010/main" val="0"/>
-                        </a:ext>
-                      </a:extLst>
-                    </a:blip>
-                    <a:stretch>
-                      <a:fillRect/>
-                    </a:stretch>
-                  </pic:blipFill>
-                  <pic:spPr>
-                    <a:xfrm>
-                      <a:off x="0" y="0"/>
-                      <a:ext cx="5120640" cy="4627581"/>
-                    </a:xfrm>
-                    <a:prstGeom prst="rect">
-                      <a:avLst/>
-                    </a:prstGeom>
-                    <a:ln w="9525">
-                      <a:solidFill>
-                        <a:srgbClr val="D1D5DB"/>
-                      </a:solidFill>
-                    </a:ln>
-                  </pic:spPr>
-                </pic:pic>
-              </a:graphicData>
-            </a:graphic>
-          </wp:inline>
-        </w:drawing>
-      </w:r>
-    </w:p>
-    <w:p>
-      <w:pPr>
-        <w:spacing w:before="120" w:after="280"/>
-        <w:jc w:val="center"/>
-        <w:rPr>
-          <w:rFonts w:ascii="Montserrat" w:hAnsi="Montserrat"/>
-          <w:i/>
-          <w:color w:val="6A6A70"/>
-          <w:sz w:val="19"/>
-        </w:rPr>
-      </w:pPr>
-      <w:r>
-        <w:rPr>
-          <w:rFonts w:ascii="Montserrat" w:hAnsi="Montserrat"/>
-          <w:i/>
-          <w:color w:val="6A6A70"/>
-          <w:sz w:val="19"/>
-        </w:rPr>
-        <w:t>Construtor hierarquico de 3 niveis: Pacote de trabalho, Entrega e Atividade.</w:t>
-      </w:r>
-    </w:p>
-    <w:p>
-      <w:pPr>
-        <w:spacing w:before="120" w:after="40"/>
-        <w:jc w:val="center"/>
-      </w:pPr>
-      <w:r>
-        <w:rPr>
-          <w:noProof/>
-        </w:rPr>
-        <w:lastRenderedPageBreak/>
-        <w:drawing>
-          <wp:inline distT="0" distB="0" distL="0" distR="0" wp14:anchorId="64256465" wp14:editId="768424E7">
-            <wp:extent cx="5120640" cy="4627581"/>
-            <wp:effectExtent l="19050" t="19050" r="22860" b="20955"/>
-            <wp:docPr id="1622820253" name="Imagem 15"/>
-            <wp:cNvGraphicFramePr/>
-            <a:graphic xmlns:a="http://schemas.openxmlformats.org/drawingml/2006/main">
-              <a:graphicData uri="http://schemas.openxmlformats.org/drawingml/2006/picture">
-                <pic:pic xmlns:pic="http://schemas.openxmlformats.org/drawingml/2006/picture">
-                  <pic:nvPicPr>
-                    <pic:cNvPr id="1622820253" name=""/>
-                    <pic:cNvPicPr/>
-                  </pic:nvPicPr>
-                  <pic:blipFill>
-                    <a:blip r:embed="rId21">
-                      <a:extLst>
-                        <a:ext uri="{28A0092B-C50C-407E-A947-70E740481C1C}">
-                          <a14:useLocalDpi xmlns:a14="http://schemas.microsoft.com/office/drawing/2010/main" val="0"/>
-                        </a:ext>
-                      </a:extLst>
-                    </a:blip>
-                    <a:stretch>
-                      <a:fillRect/>
-                    </a:stretch>
-                  </pic:blipFill>
-                  <pic:spPr>
-                    <a:xfrm>
-                      <a:off x="0" y="0"/>
-                      <a:ext cx="5120640" cy="4627581"/>
-                    </a:xfrm>
-                    <a:prstGeom prst="rect">
-                      <a:avLst/>
-                    </a:prstGeom>
-                    <a:ln w="9525">
-                      <a:solidFill>
-                        <a:srgbClr val="D1D5DB"/>
-                      </a:solidFill>
-                    </a:ln>
-                  </pic:spPr>
-                </pic:pic>
-              </a:graphicData>
-            </a:graphic>
-          </wp:inline>
-        </w:drawing>
-      </w:r>
-    </w:p>
-    <w:p>
-      <w:pPr>
-        <w:spacing w:before="120" w:after="280"/>
-        <w:jc w:val="center"/>
-        <w:rPr>
-          <w:rFonts w:ascii="Montserrat" w:hAnsi="Montserrat"/>
-          <w:i/>
-          <w:color w:val="6A6A70"/>
-          <w:sz w:val="19"/>
-        </w:rPr>
-      </w:pPr>
-      <w:r>
-        <w:rPr>
-          <w:rFonts w:ascii="Montserrat" w:hAnsi="Montserrat"/>
-          <w:i/>
-          <w:color w:val="6A6A70"/>
-          <w:sz w:val="19"/>
-        </w:rPr>
-        <w:t>EAPs cadastradas (estado vazio).</w:t>
       </w:r>
     </w:p>
     <w:p>
@@ -10036,6 +9014,7 @@
           <w:color w:val="1A1A1A"/>
           <w:sz w:val="22"/>
         </w:rPr>
+        <w:lastRenderedPageBreak/>
         <w:t>Use o construtor hierarquico de 3 niveis: + Adicionar pacote de trabalho, depois + Adicionar entrega dentro do pacote, depois + Atividade dentro da entrega.</w:t>
       </w:r>
     </w:p>
@@ -10065,6 +9044,30 @@
     </w:p>
     <w:p>
       <w:pPr>
+        <w:pStyle w:val="PargrafodaLista"/>
+        <w:numPr>
+          <w:ilvl w:val="0"/>
+          <w:numId w:val="8"/>
+        </w:numPr>
+        <w:spacing w:after="80" w:line="260" w:lineRule="auto"/>
+        <w:ind w:left="700"/>
+        <w:rPr>
+          <w:rFonts w:ascii="Montserrat" w:hAnsi="Montserrat"/>
+          <w:color w:val="1A1A1A"/>
+          <w:sz w:val="22"/>
+        </w:rPr>
+      </w:pPr>
+      <w:r>
+        <w:rPr>
+          <w:rFonts w:ascii="Montserrat" w:hAnsi="Montserrat"/>
+          <w:color w:val="1A1A1A"/>
+          <w:sz w:val="22"/>
+        </w:rPr>
+        <w:t>Cada Atividade (nivel 3) pode receber, de forma opcional, uma prioridade: P0 - Critica, P1 - Alta ou P2 - Normal (ou nenhuma), exibida como selo colorido no construtor, na Visualizar arvore e no painel de detalhes. Serve para repriorizar o trabalho no dia a dia sem precisar abrir uma SMP - Solicitacao de Mudanca de Projeto (Passo 7). EAPs que ja existiam sem prioridade definida continuam funcionando normalmente.</w:t>
+      </w:r>
+    </w:p>
+    <w:p>
+      <w:pPr>
         <w:spacing w:line="280" w:lineRule="auto"/>
         <w:rPr>
           <w:rFonts w:ascii="Montserrat" w:hAnsi="Montserrat"/>
@@ -10092,7 +9095,7 @@
           <w:sz w:val="27"/>
         </w:rPr>
       </w:pPr>
-      <w:bookmarkStart w:id="19" w:name="_Toc236124982"/>
+      <w:bookmarkStart w:id="19" w:name="_Toc236221960"/>
       <w:r>
         <w:rPr>
           <w:rFonts w:ascii="Montserrat" w:hAnsi="Montserrat"/>
@@ -10120,160 +9123,6 @@
           <w:sz w:val="22"/>
         </w:rPr>
         <w:t>Quando usar: a qualquer momento do projeto, para registrar formalmente qualquer reuniao - nao faz parte da esteira sequencial, fica sempre disponivel. Pode ser preenchida com login normal ou, se a opcao estiver ativa, sem login (ver secao 2.6).</w:t>
-      </w:r>
-    </w:p>
-    <w:p>
-      <w:pPr>
-        <w:spacing w:before="120" w:after="40"/>
-        <w:jc w:val="center"/>
-      </w:pPr>
-      <w:r>
-        <w:rPr>
-          <w:noProof/>
-        </w:rPr>
-        <w:lastRenderedPageBreak/>
-        <w:drawing>
-          <wp:inline distT="0" distB="0" distL="0" distR="0" wp14:anchorId="6D22F3F3" wp14:editId="212579AA">
-            <wp:extent cx="5120640" cy="4627581"/>
-            <wp:effectExtent l="19050" t="19050" r="22860" b="20955"/>
-            <wp:docPr id="1678330984" name="Imagem 16"/>
-            <wp:cNvGraphicFramePr/>
-            <a:graphic xmlns:a="http://schemas.openxmlformats.org/drawingml/2006/main">
-              <a:graphicData uri="http://schemas.openxmlformats.org/drawingml/2006/picture">
-                <pic:pic xmlns:pic="http://schemas.openxmlformats.org/drawingml/2006/picture">
-                  <pic:nvPicPr>
-                    <pic:cNvPr id="1678330984" name=""/>
-                    <pic:cNvPicPr/>
-                  </pic:nvPicPr>
-                  <pic:blipFill>
-                    <a:blip r:embed="rId22">
-                      <a:extLst>
-                        <a:ext uri="{28A0092B-C50C-407E-A947-70E740481C1C}">
-                          <a14:useLocalDpi xmlns:a14="http://schemas.microsoft.com/office/drawing/2010/main" val="0"/>
-                        </a:ext>
-                      </a:extLst>
-                    </a:blip>
-                    <a:stretch>
-                      <a:fillRect/>
-                    </a:stretch>
-                  </pic:blipFill>
-                  <pic:spPr>
-                    <a:xfrm>
-                      <a:off x="0" y="0"/>
-                      <a:ext cx="5120640" cy="4627581"/>
-                    </a:xfrm>
-                    <a:prstGeom prst="rect">
-                      <a:avLst/>
-                    </a:prstGeom>
-                    <a:ln w="9525">
-                      <a:solidFill>
-                        <a:srgbClr val="D1D5DB"/>
-                      </a:solidFill>
-                    </a:ln>
-                  </pic:spPr>
-                </pic:pic>
-              </a:graphicData>
-            </a:graphic>
-          </wp:inline>
-        </w:drawing>
-      </w:r>
-    </w:p>
-    <w:p>
-      <w:pPr>
-        <w:spacing w:before="120" w:after="280"/>
-        <w:jc w:val="center"/>
-        <w:rPr>
-          <w:rFonts w:ascii="Montserrat" w:hAnsi="Montserrat"/>
-          <w:i/>
-          <w:color w:val="6A6A70"/>
-          <w:sz w:val="19"/>
-        </w:rPr>
-      </w:pPr>
-      <w:r>
-        <w:rPr>
-          <w:rFonts w:ascii="Montserrat" w:hAnsi="Montserrat"/>
-          <w:i/>
-          <w:color w:val="6A6A70"/>
-          <w:sz w:val="19"/>
-        </w:rPr>
-        <w:t>Tela de nova ata, com o painel Preencher com Read AI para preenchimento automatico a partir de uma reuniao gravada.</w:t>
-      </w:r>
-    </w:p>
-    <w:p>
-      <w:pPr>
-        <w:spacing w:before="120" w:after="40"/>
-        <w:jc w:val="center"/>
-      </w:pPr>
-      <w:r>
-        <w:rPr>
-          <w:noProof/>
-        </w:rPr>
-        <w:lastRenderedPageBreak/>
-        <w:drawing>
-          <wp:inline distT="0" distB="0" distL="0" distR="0" wp14:anchorId="6EE050F3" wp14:editId="5761B550">
-            <wp:extent cx="5120640" cy="4627581"/>
-            <wp:effectExtent l="19050" t="19050" r="22860" b="20955"/>
-            <wp:docPr id="1097625616" name="Imagem 17"/>
-            <wp:cNvGraphicFramePr/>
-            <a:graphic xmlns:a="http://schemas.openxmlformats.org/drawingml/2006/main">
-              <a:graphicData uri="http://schemas.openxmlformats.org/drawingml/2006/picture">
-                <pic:pic xmlns:pic="http://schemas.openxmlformats.org/drawingml/2006/picture">
-                  <pic:nvPicPr>
-                    <pic:cNvPr id="1097625616" name=""/>
-                    <pic:cNvPicPr/>
-                  </pic:nvPicPr>
-                  <pic:blipFill>
-                    <a:blip r:embed="rId23">
-                      <a:extLst>
-                        <a:ext uri="{28A0092B-C50C-407E-A947-70E740481C1C}">
-                          <a14:useLocalDpi xmlns:a14="http://schemas.microsoft.com/office/drawing/2010/main" val="0"/>
-                        </a:ext>
-                      </a:extLst>
-                    </a:blip>
-                    <a:stretch>
-                      <a:fillRect/>
-                    </a:stretch>
-                  </pic:blipFill>
-                  <pic:spPr>
-                    <a:xfrm>
-                      <a:off x="0" y="0"/>
-                      <a:ext cx="5120640" cy="4627581"/>
-                    </a:xfrm>
-                    <a:prstGeom prst="rect">
-                      <a:avLst/>
-                    </a:prstGeom>
-                    <a:ln w="9525">
-                      <a:solidFill>
-                        <a:srgbClr val="D1D5DB"/>
-                      </a:solidFill>
-                    </a:ln>
-                  </pic:spPr>
-                </pic:pic>
-              </a:graphicData>
-            </a:graphic>
-          </wp:inline>
-        </w:drawing>
-      </w:r>
-    </w:p>
-    <w:p>
-      <w:pPr>
-        <w:spacing w:before="120" w:after="280"/>
-        <w:jc w:val="center"/>
-        <w:rPr>
-          <w:rFonts w:ascii="Montserrat" w:hAnsi="Montserrat"/>
-          <w:i/>
-          <w:color w:val="6A6A70"/>
-          <w:sz w:val="19"/>
-        </w:rPr>
-      </w:pPr>
-      <w:r>
-        <w:rPr>
-          <w:rFonts w:ascii="Montserrat" w:hAnsi="Montserrat"/>
-          <w:i/>
-          <w:color w:val="6A6A70"/>
-          <w:sz w:val="19"/>
-        </w:rPr>
-        <w:t>Atas cadastradas (estado vazio).</w:t>
       </w:r>
     </w:p>
     <w:p>
@@ -10353,7 +9202,7 @@
           <w:sz w:val="27"/>
         </w:rPr>
       </w:pPr>
-      <w:bookmarkStart w:id="20" w:name="_Toc236124983"/>
+      <w:bookmarkStart w:id="20" w:name="_Toc236221961"/>
       <w:r>
         <w:rPr>
           <w:rFonts w:ascii="Montserrat" w:hAnsi="Montserrat"/>
@@ -10381,160 +9230,6 @@
           <w:sz w:val="22"/>
         </w:rPr>
         <w:t>Quando usar: sempre que for necessario alterar escopo, cronograma, custo ou qualidade de um projeto ja em andamento. Nenhuma mudanca deve ser feita sem passar por este formulario.</w:t>
-      </w:r>
-    </w:p>
-    <w:p>
-      <w:pPr>
-        <w:spacing w:before="120" w:after="40"/>
-        <w:jc w:val="center"/>
-      </w:pPr>
-      <w:r>
-        <w:rPr>
-          <w:noProof/>
-        </w:rPr>
-        <w:lastRenderedPageBreak/>
-        <w:drawing>
-          <wp:inline distT="0" distB="0" distL="0" distR="0" wp14:anchorId="6CA26C52" wp14:editId="785DD336">
-            <wp:extent cx="5120640" cy="4627581"/>
-            <wp:effectExtent l="19050" t="19050" r="22860" b="20955"/>
-            <wp:docPr id="690539187" name="Imagem 18"/>
-            <wp:cNvGraphicFramePr/>
-            <a:graphic xmlns:a="http://schemas.openxmlformats.org/drawingml/2006/main">
-              <a:graphicData uri="http://schemas.openxmlformats.org/drawingml/2006/picture">
-                <pic:pic xmlns:pic="http://schemas.openxmlformats.org/drawingml/2006/picture">
-                  <pic:nvPicPr>
-                    <pic:cNvPr id="690539187" name=""/>
-                    <pic:cNvPicPr/>
-                  </pic:nvPicPr>
-                  <pic:blipFill>
-                    <a:blip r:embed="rId24">
-                      <a:extLst>
-                        <a:ext uri="{28A0092B-C50C-407E-A947-70E740481C1C}">
-                          <a14:useLocalDpi xmlns:a14="http://schemas.microsoft.com/office/drawing/2010/main" val="0"/>
-                        </a:ext>
-                      </a:extLst>
-                    </a:blip>
-                    <a:stretch>
-                      <a:fillRect/>
-                    </a:stretch>
-                  </pic:blipFill>
-                  <pic:spPr>
-                    <a:xfrm>
-                      <a:off x="0" y="0"/>
-                      <a:ext cx="5120640" cy="4627581"/>
-                    </a:xfrm>
-                    <a:prstGeom prst="rect">
-                      <a:avLst/>
-                    </a:prstGeom>
-                    <a:ln w="9525">
-                      <a:solidFill>
-                        <a:srgbClr val="D1D5DB"/>
-                      </a:solidFill>
-                    </a:ln>
-                  </pic:spPr>
-                </pic:pic>
-              </a:graphicData>
-            </a:graphic>
-          </wp:inline>
-        </w:drawing>
-      </w:r>
-    </w:p>
-    <w:p>
-      <w:pPr>
-        <w:spacing w:before="120" w:after="280"/>
-        <w:jc w:val="center"/>
-        <w:rPr>
-          <w:rFonts w:ascii="Montserrat" w:hAnsi="Montserrat"/>
-          <w:i/>
-          <w:color w:val="6A6A70"/>
-          <w:sz w:val="19"/>
-        </w:rPr>
-      </w:pPr>
-      <w:r>
-        <w:rPr>
-          <w:rFonts w:ascii="Montserrat" w:hAnsi="Montserrat"/>
-          <w:i/>
-          <w:color w:val="6A6A70"/>
-          <w:sz w:val="19"/>
-        </w:rPr>
-        <w:t>Tela de nova SMP.</w:t>
-      </w:r>
-    </w:p>
-    <w:p>
-      <w:pPr>
-        <w:spacing w:before="120" w:after="40"/>
-        <w:jc w:val="center"/>
-      </w:pPr>
-      <w:r>
-        <w:rPr>
-          <w:noProof/>
-        </w:rPr>
-        <w:lastRenderedPageBreak/>
-        <w:drawing>
-          <wp:inline distT="0" distB="0" distL="0" distR="0" wp14:anchorId="35C504F0" wp14:editId="79E58B4B">
-            <wp:extent cx="5120640" cy="4627581"/>
-            <wp:effectExtent l="19050" t="19050" r="22860" b="20955"/>
-            <wp:docPr id="1116946119" name="Imagem 19"/>
-            <wp:cNvGraphicFramePr/>
-            <a:graphic xmlns:a="http://schemas.openxmlformats.org/drawingml/2006/main">
-              <a:graphicData uri="http://schemas.openxmlformats.org/drawingml/2006/picture">
-                <pic:pic xmlns:pic="http://schemas.openxmlformats.org/drawingml/2006/picture">
-                  <pic:nvPicPr>
-                    <pic:cNvPr id="1116946119" name=""/>
-                    <pic:cNvPicPr/>
-                  </pic:nvPicPr>
-                  <pic:blipFill>
-                    <a:blip r:embed="rId25">
-                      <a:extLst>
-                        <a:ext uri="{28A0092B-C50C-407E-A947-70E740481C1C}">
-                          <a14:useLocalDpi xmlns:a14="http://schemas.microsoft.com/office/drawing/2010/main" val="0"/>
-                        </a:ext>
-                      </a:extLst>
-                    </a:blip>
-                    <a:stretch>
-                      <a:fillRect/>
-                    </a:stretch>
-                  </pic:blipFill>
-                  <pic:spPr>
-                    <a:xfrm>
-                      <a:off x="0" y="0"/>
-                      <a:ext cx="5120640" cy="4627581"/>
-                    </a:xfrm>
-                    <a:prstGeom prst="rect">
-                      <a:avLst/>
-                    </a:prstGeom>
-                    <a:ln w="9525">
-                      <a:solidFill>
-                        <a:srgbClr val="D1D5DB"/>
-                      </a:solidFill>
-                    </a:ln>
-                  </pic:spPr>
-                </pic:pic>
-              </a:graphicData>
-            </a:graphic>
-          </wp:inline>
-        </w:drawing>
-      </w:r>
-    </w:p>
-    <w:p>
-      <w:pPr>
-        <w:spacing w:before="120" w:after="280"/>
-        <w:jc w:val="center"/>
-        <w:rPr>
-          <w:rFonts w:ascii="Montserrat" w:hAnsi="Montserrat"/>
-          <w:i/>
-          <w:color w:val="6A6A70"/>
-          <w:sz w:val="19"/>
-        </w:rPr>
-      </w:pPr>
-      <w:r>
-        <w:rPr>
-          <w:rFonts w:ascii="Montserrat" w:hAnsi="Montserrat"/>
-          <w:i/>
-          <w:color w:val="6A6A70"/>
-          <w:sz w:val="19"/>
-        </w:rPr>
-        <w:t>SMPs cadastradas (estado vazio).</w:t>
       </w:r>
     </w:p>
     <w:p>
@@ -10638,7 +9333,7 @@
           <w:sz w:val="27"/>
         </w:rPr>
       </w:pPr>
-      <w:bookmarkStart w:id="21" w:name="_Toc236124984"/>
+      <w:bookmarkStart w:id="21" w:name="_Toc236221962"/>
       <w:r>
         <w:rPr>
           <w:rFonts w:ascii="Montserrat" w:hAnsi="Montserrat"/>
@@ -10646,6 +9341,7 @@
           <w:color w:val="B91D2E"/>
           <w:sz w:val="27"/>
         </w:rPr>
+        <w:lastRenderedPageBreak/>
         <w:t>Passo 8 - TEP, Termo de Encerramento de Projeto (FORALF00341)</w:t>
       </w:r>
       <w:bookmarkEnd w:id="21"/>
@@ -10666,160 +9362,6 @@
           <w:sz w:val="22"/>
         </w:rPr>
         <w:t>Quando usar: ao encerrar o projeto, seja por conclusao, paralisacao ou cancelamento.</w:t>
-      </w:r>
-    </w:p>
-    <w:p>
-      <w:pPr>
-        <w:spacing w:before="120" w:after="40"/>
-        <w:jc w:val="center"/>
-      </w:pPr>
-      <w:r>
-        <w:rPr>
-          <w:noProof/>
-        </w:rPr>
-        <w:lastRenderedPageBreak/>
-        <w:drawing>
-          <wp:inline distT="0" distB="0" distL="0" distR="0" wp14:anchorId="131E76CC" wp14:editId="03CAB36F">
-            <wp:extent cx="5120640" cy="4627581"/>
-            <wp:effectExtent l="19050" t="19050" r="22860" b="20955"/>
-            <wp:docPr id="2101497466" name="Imagem 20"/>
-            <wp:cNvGraphicFramePr/>
-            <a:graphic xmlns:a="http://schemas.openxmlformats.org/drawingml/2006/main">
-              <a:graphicData uri="http://schemas.openxmlformats.org/drawingml/2006/picture">
-                <pic:pic xmlns:pic="http://schemas.openxmlformats.org/drawingml/2006/picture">
-                  <pic:nvPicPr>
-                    <pic:cNvPr id="2101497466" name=""/>
-                    <pic:cNvPicPr/>
-                  </pic:nvPicPr>
-                  <pic:blipFill>
-                    <a:blip r:embed="rId26">
-                      <a:extLst>
-                        <a:ext uri="{28A0092B-C50C-407E-A947-70E740481C1C}">
-                          <a14:useLocalDpi xmlns:a14="http://schemas.microsoft.com/office/drawing/2010/main" val="0"/>
-                        </a:ext>
-                      </a:extLst>
-                    </a:blip>
-                    <a:stretch>
-                      <a:fillRect/>
-                    </a:stretch>
-                  </pic:blipFill>
-                  <pic:spPr>
-                    <a:xfrm>
-                      <a:off x="0" y="0"/>
-                      <a:ext cx="5120640" cy="4627581"/>
-                    </a:xfrm>
-                    <a:prstGeom prst="rect">
-                      <a:avLst/>
-                    </a:prstGeom>
-                    <a:ln w="9525">
-                      <a:solidFill>
-                        <a:srgbClr val="D1D5DB"/>
-                      </a:solidFill>
-                    </a:ln>
-                  </pic:spPr>
-                </pic:pic>
-              </a:graphicData>
-            </a:graphic>
-          </wp:inline>
-        </w:drawing>
-      </w:r>
-    </w:p>
-    <w:p>
-      <w:pPr>
-        <w:spacing w:before="120" w:after="280"/>
-        <w:jc w:val="center"/>
-        <w:rPr>
-          <w:rFonts w:ascii="Montserrat" w:hAnsi="Montserrat"/>
-          <w:i/>
-          <w:color w:val="6A6A70"/>
-          <w:sz w:val="19"/>
-        </w:rPr>
-      </w:pPr>
-      <w:r>
-        <w:rPr>
-          <w:rFonts w:ascii="Montserrat" w:hAnsi="Montserrat"/>
-          <w:i/>
-          <w:color w:val="6A6A70"/>
-          <w:sz w:val="19"/>
-        </w:rPr>
-        <w:t>Tela de novo TEP.</w:t>
-      </w:r>
-    </w:p>
-    <w:p>
-      <w:pPr>
-        <w:spacing w:before="120" w:after="40"/>
-        <w:jc w:val="center"/>
-      </w:pPr>
-      <w:r>
-        <w:rPr>
-          <w:noProof/>
-        </w:rPr>
-        <w:lastRenderedPageBreak/>
-        <w:drawing>
-          <wp:inline distT="0" distB="0" distL="0" distR="0" wp14:anchorId="59F4A929" wp14:editId="5A106E0E">
-            <wp:extent cx="5120640" cy="4627581"/>
-            <wp:effectExtent l="19050" t="19050" r="22860" b="20955"/>
-            <wp:docPr id="30003502" name="Imagem 21"/>
-            <wp:cNvGraphicFramePr/>
-            <a:graphic xmlns:a="http://schemas.openxmlformats.org/drawingml/2006/main">
-              <a:graphicData uri="http://schemas.openxmlformats.org/drawingml/2006/picture">
-                <pic:pic xmlns:pic="http://schemas.openxmlformats.org/drawingml/2006/picture">
-                  <pic:nvPicPr>
-                    <pic:cNvPr id="30003502" name=""/>
-                    <pic:cNvPicPr/>
-                  </pic:nvPicPr>
-                  <pic:blipFill>
-                    <a:blip r:embed="rId27">
-                      <a:extLst>
-                        <a:ext uri="{28A0092B-C50C-407E-A947-70E740481C1C}">
-                          <a14:useLocalDpi xmlns:a14="http://schemas.microsoft.com/office/drawing/2010/main" val="0"/>
-                        </a:ext>
-                      </a:extLst>
-                    </a:blip>
-                    <a:stretch>
-                      <a:fillRect/>
-                    </a:stretch>
-                  </pic:blipFill>
-                  <pic:spPr>
-                    <a:xfrm>
-                      <a:off x="0" y="0"/>
-                      <a:ext cx="5120640" cy="4627581"/>
-                    </a:xfrm>
-                    <a:prstGeom prst="rect">
-                      <a:avLst/>
-                    </a:prstGeom>
-                    <a:ln w="9525">
-                      <a:solidFill>
-                        <a:srgbClr val="D1D5DB"/>
-                      </a:solidFill>
-                    </a:ln>
-                  </pic:spPr>
-                </pic:pic>
-              </a:graphicData>
-            </a:graphic>
-          </wp:inline>
-        </w:drawing>
-      </w:r>
-    </w:p>
-    <w:p>
-      <w:pPr>
-        <w:spacing w:before="120" w:after="280"/>
-        <w:jc w:val="center"/>
-        <w:rPr>
-          <w:rFonts w:ascii="Montserrat" w:hAnsi="Montserrat"/>
-          <w:i/>
-          <w:color w:val="6A6A70"/>
-          <w:sz w:val="19"/>
-        </w:rPr>
-      </w:pPr>
-      <w:r>
-        <w:rPr>
-          <w:rFonts w:ascii="Montserrat" w:hAnsi="Montserrat"/>
-          <w:i/>
-          <w:color w:val="6A6A70"/>
-          <w:sz w:val="19"/>
-        </w:rPr>
-        <w:t>TEPs cadastrados (estado vazio).</w:t>
       </w:r>
     </w:p>
     <w:p>
@@ -10923,7 +9465,7 @@
           <w:sz w:val="27"/>
         </w:rPr>
       </w:pPr>
-      <w:bookmarkStart w:id="22" w:name="_Toc236124985"/>
+      <w:bookmarkStart w:id="22" w:name="_Toc236221963"/>
       <w:r>
         <w:rPr>
           <w:rFonts w:ascii="Montserrat" w:hAnsi="Montserrat"/>
@@ -10951,160 +9493,6 @@
           <w:sz w:val="22"/>
         </w:rPr>
         <w:t>Quando usar: junto com o TEP, ao final do projeto (ou tambem em pontos intermediarios), para capturar o aprendizado organizacional.</w:t>
-      </w:r>
-    </w:p>
-    <w:p>
-      <w:pPr>
-        <w:spacing w:before="120" w:after="40"/>
-        <w:jc w:val="center"/>
-      </w:pPr>
-      <w:r>
-        <w:rPr>
-          <w:noProof/>
-        </w:rPr>
-        <w:lastRenderedPageBreak/>
-        <w:drawing>
-          <wp:inline distT="0" distB="0" distL="0" distR="0" wp14:anchorId="782E27BD" wp14:editId="0D7CE79F">
-            <wp:extent cx="5120640" cy="4627581"/>
-            <wp:effectExtent l="19050" t="19050" r="22860" b="20955"/>
-            <wp:docPr id="2011615721" name="Imagem 22"/>
-            <wp:cNvGraphicFramePr/>
-            <a:graphic xmlns:a="http://schemas.openxmlformats.org/drawingml/2006/main">
-              <a:graphicData uri="http://schemas.openxmlformats.org/drawingml/2006/picture">
-                <pic:pic xmlns:pic="http://schemas.openxmlformats.org/drawingml/2006/picture">
-                  <pic:nvPicPr>
-                    <pic:cNvPr id="2011615721" name=""/>
-                    <pic:cNvPicPr/>
-                  </pic:nvPicPr>
-                  <pic:blipFill>
-                    <a:blip r:embed="rId28">
-                      <a:extLst>
-                        <a:ext uri="{28A0092B-C50C-407E-A947-70E740481C1C}">
-                          <a14:useLocalDpi xmlns:a14="http://schemas.microsoft.com/office/drawing/2010/main" val="0"/>
-                        </a:ext>
-                      </a:extLst>
-                    </a:blip>
-                    <a:stretch>
-                      <a:fillRect/>
-                    </a:stretch>
-                  </pic:blipFill>
-                  <pic:spPr>
-                    <a:xfrm>
-                      <a:off x="0" y="0"/>
-                      <a:ext cx="5120640" cy="4627581"/>
-                    </a:xfrm>
-                    <a:prstGeom prst="rect">
-                      <a:avLst/>
-                    </a:prstGeom>
-                    <a:ln w="9525">
-                      <a:solidFill>
-                        <a:srgbClr val="D1D5DB"/>
-                      </a:solidFill>
-                    </a:ln>
-                  </pic:spPr>
-                </pic:pic>
-              </a:graphicData>
-            </a:graphic>
-          </wp:inline>
-        </w:drawing>
-      </w:r>
-    </w:p>
-    <w:p>
-      <w:pPr>
-        <w:spacing w:before="120" w:after="280"/>
-        <w:jc w:val="center"/>
-        <w:rPr>
-          <w:rFonts w:ascii="Montserrat" w:hAnsi="Montserrat"/>
-          <w:i/>
-          <w:color w:val="6A6A70"/>
-          <w:sz w:val="19"/>
-        </w:rPr>
-      </w:pPr>
-      <w:r>
-        <w:rPr>
-          <w:rFonts w:ascii="Montserrat" w:hAnsi="Montserrat"/>
-          <w:i/>
-          <w:color w:val="6A6A70"/>
-          <w:sz w:val="19"/>
-        </w:rPr>
-        <w:t>Tela de novo RLA.</w:t>
-      </w:r>
-    </w:p>
-    <w:p>
-      <w:pPr>
-        <w:spacing w:before="120" w:after="40"/>
-        <w:jc w:val="center"/>
-      </w:pPr>
-      <w:r>
-        <w:rPr>
-          <w:noProof/>
-        </w:rPr>
-        <w:lastRenderedPageBreak/>
-        <w:drawing>
-          <wp:inline distT="0" distB="0" distL="0" distR="0" wp14:anchorId="548105A3" wp14:editId="44BA397E">
-            <wp:extent cx="5120640" cy="4627581"/>
-            <wp:effectExtent l="19050" t="19050" r="22860" b="20955"/>
-            <wp:docPr id="1304353528" name="Imagem 23"/>
-            <wp:cNvGraphicFramePr/>
-            <a:graphic xmlns:a="http://schemas.openxmlformats.org/drawingml/2006/main">
-              <a:graphicData uri="http://schemas.openxmlformats.org/drawingml/2006/picture">
-                <pic:pic xmlns:pic="http://schemas.openxmlformats.org/drawingml/2006/picture">
-                  <pic:nvPicPr>
-                    <pic:cNvPr id="1304353528" name=""/>
-                    <pic:cNvPicPr/>
-                  </pic:nvPicPr>
-                  <pic:blipFill>
-                    <a:blip r:embed="rId29">
-                      <a:extLst>
-                        <a:ext uri="{28A0092B-C50C-407E-A947-70E740481C1C}">
-                          <a14:useLocalDpi xmlns:a14="http://schemas.microsoft.com/office/drawing/2010/main" val="0"/>
-                        </a:ext>
-                      </a:extLst>
-                    </a:blip>
-                    <a:stretch>
-                      <a:fillRect/>
-                    </a:stretch>
-                  </pic:blipFill>
-                  <pic:spPr>
-                    <a:xfrm>
-                      <a:off x="0" y="0"/>
-                      <a:ext cx="5120640" cy="4627581"/>
-                    </a:xfrm>
-                    <a:prstGeom prst="rect">
-                      <a:avLst/>
-                    </a:prstGeom>
-                    <a:ln w="9525">
-                      <a:solidFill>
-                        <a:srgbClr val="D1D5DB"/>
-                      </a:solidFill>
-                    </a:ln>
-                  </pic:spPr>
-                </pic:pic>
-              </a:graphicData>
-            </a:graphic>
-          </wp:inline>
-        </w:drawing>
-      </w:r>
-    </w:p>
-    <w:p>
-      <w:pPr>
-        <w:spacing w:before="120" w:after="280"/>
-        <w:jc w:val="center"/>
-        <w:rPr>
-          <w:rFonts w:ascii="Montserrat" w:hAnsi="Montserrat"/>
-          <w:i/>
-          <w:color w:val="6A6A70"/>
-          <w:sz w:val="19"/>
-        </w:rPr>
-      </w:pPr>
-      <w:r>
-        <w:rPr>
-          <w:rFonts w:ascii="Montserrat" w:hAnsi="Montserrat"/>
-          <w:i/>
-          <w:color w:val="6A6A70"/>
-          <w:sz w:val="19"/>
-        </w:rPr>
-        <w:t>RLAs cadastrados (estado vazio).</w:t>
       </w:r>
     </w:p>
     <w:p>
@@ -11184,7 +9572,7 @@
           <w:sz w:val="27"/>
         </w:rPr>
       </w:pPr>
-      <w:bookmarkStart w:id="23" w:name="_Toc236124986"/>
+      <w:bookmarkStart w:id="23" w:name="_Toc236221964"/>
       <w:r>
         <w:rPr>
           <w:rFonts w:ascii="Montserrat" w:hAnsi="Montserrat"/>
@@ -11212,83 +9600,6 @@
           <w:sz w:val="22"/>
         </w:rPr>
         <w:t>Quando usar: para planejar o que sera comunicado, a quem e em qual momento do projeto. Diferente da versao 1.0 deste manual, este artefato ja tem uma ferramenta eletronica propria, organizada como uma tabela de referencia (tipo de comunicacao x o que comunicar), com abas Painel (visualizacao) e Editar dados.</w:t>
-      </w:r>
-    </w:p>
-    <w:p>
-      <w:pPr>
-        <w:spacing w:before="120" w:after="40"/>
-        <w:jc w:val="center"/>
-      </w:pPr>
-      <w:r>
-        <w:rPr>
-          <w:noProof/>
-        </w:rPr>
-        <w:lastRenderedPageBreak/>
-        <w:drawing>
-          <wp:inline distT="0" distB="0" distL="0" distR="0" wp14:anchorId="292BCAE8" wp14:editId="641B9A8E">
-            <wp:extent cx="5120640" cy="4627581"/>
-            <wp:effectExtent l="19050" t="19050" r="22860" b="20955"/>
-            <wp:docPr id="1688620093" name="Imagem 24"/>
-            <wp:cNvGraphicFramePr/>
-            <a:graphic xmlns:a="http://schemas.openxmlformats.org/drawingml/2006/main">
-              <a:graphicData uri="http://schemas.openxmlformats.org/drawingml/2006/picture">
-                <pic:pic xmlns:pic="http://schemas.openxmlformats.org/drawingml/2006/picture">
-                  <pic:nvPicPr>
-                    <pic:cNvPr id="1688620093" name=""/>
-                    <pic:cNvPicPr/>
-                  </pic:nvPicPr>
-                  <pic:blipFill>
-                    <a:blip r:embed="rId30">
-                      <a:extLst>
-                        <a:ext uri="{28A0092B-C50C-407E-A947-70E740481C1C}">
-                          <a14:useLocalDpi xmlns:a14="http://schemas.microsoft.com/office/drawing/2010/main" val="0"/>
-                        </a:ext>
-                      </a:extLst>
-                    </a:blip>
-                    <a:stretch>
-                      <a:fillRect/>
-                    </a:stretch>
-                  </pic:blipFill>
-                  <pic:spPr>
-                    <a:xfrm>
-                      <a:off x="0" y="0"/>
-                      <a:ext cx="5120640" cy="4627581"/>
-                    </a:xfrm>
-                    <a:prstGeom prst="rect">
-                      <a:avLst/>
-                    </a:prstGeom>
-                    <a:ln w="9525">
-                      <a:solidFill>
-                        <a:srgbClr val="D1D5DB"/>
-                      </a:solidFill>
-                    </a:ln>
-                  </pic:spPr>
-                </pic:pic>
-              </a:graphicData>
-            </a:graphic>
-          </wp:inline>
-        </w:drawing>
-      </w:r>
-    </w:p>
-    <w:p>
-      <w:pPr>
-        <w:spacing w:before="120" w:after="280"/>
-        <w:jc w:val="center"/>
-        <w:rPr>
-          <w:rFonts w:ascii="Montserrat" w:hAnsi="Montserrat"/>
-          <w:i/>
-          <w:color w:val="6A6A70"/>
-          <w:sz w:val="19"/>
-        </w:rPr>
-      </w:pPr>
-      <w:r>
-        <w:rPr>
-          <w:rFonts w:ascii="Montserrat" w:hAnsi="Montserrat"/>
-          <w:i/>
-          <w:color w:val="6A6A70"/>
-          <w:sz w:val="19"/>
-        </w:rPr>
-        <w:t>Painel do Plano de Comunicacao: cada linha da tabela e um tipo de comunicacao do projeto e o que deve ser comunicado nele.</w:t>
       </w:r>
     </w:p>
     <w:p>
@@ -11324,7 +9635,7 @@
           <w:sz w:val="34"/>
         </w:rPr>
       </w:pPr>
-      <w:bookmarkStart w:id="24" w:name="_Toc236124987"/>
+      <w:bookmarkStart w:id="24" w:name="_Toc236221965"/>
       <w:r>
         <w:rPr>
           <w:rFonts w:ascii="Montserrat" w:hAnsi="Montserrat"/>
@@ -11366,7 +9677,7 @@
           <w:sz w:val="27"/>
         </w:rPr>
       </w:pPr>
-      <w:bookmarkStart w:id="25" w:name="_Toc236124988"/>
+      <w:bookmarkStart w:id="25" w:name="_Toc236221966"/>
       <w:r>
         <w:rPr>
           <w:rFonts w:ascii="Montserrat" w:hAnsi="Montserrat"/>
@@ -11394,236 +9705,6 @@
           <w:sz w:val="22"/>
         </w:rPr>
         <w:t>Visao consolidada de todos os projetos do portfolio: status, percentual de execucao, marcos e pontos de atencao. Tem tres abas: Painel, Editar dados e Importar Project.</w:t>
-      </w:r>
-    </w:p>
-    <w:p>
-      <w:pPr>
-        <w:spacing w:before="120" w:after="40"/>
-        <w:jc w:val="center"/>
-      </w:pPr>
-      <w:r>
-        <w:rPr>
-          <w:noProof/>
-        </w:rPr>
-        <w:drawing>
-          <wp:inline distT="0" distB="0" distL="0" distR="0" wp14:anchorId="3A6D336D" wp14:editId="4DCCDE86">
-            <wp:extent cx="5120640" cy="4627581"/>
-            <wp:effectExtent l="19050" t="19050" r="22860" b="20955"/>
-            <wp:docPr id="279460271" name="Imagem 25"/>
-            <wp:cNvGraphicFramePr/>
-            <a:graphic xmlns:a="http://schemas.openxmlformats.org/drawingml/2006/main">
-              <a:graphicData uri="http://schemas.openxmlformats.org/drawingml/2006/picture">
-                <pic:pic xmlns:pic="http://schemas.openxmlformats.org/drawingml/2006/picture">
-                  <pic:nvPicPr>
-                    <pic:cNvPr id="279460271" name=""/>
-                    <pic:cNvPicPr/>
-                  </pic:nvPicPr>
-                  <pic:blipFill>
-                    <a:blip r:embed="rId31">
-                      <a:extLst>
-                        <a:ext uri="{28A0092B-C50C-407E-A947-70E740481C1C}">
-                          <a14:useLocalDpi xmlns:a14="http://schemas.microsoft.com/office/drawing/2010/main" val="0"/>
-                        </a:ext>
-                      </a:extLst>
-                    </a:blip>
-                    <a:stretch>
-                      <a:fillRect/>
-                    </a:stretch>
-                  </pic:blipFill>
-                  <pic:spPr>
-                    <a:xfrm>
-                      <a:off x="0" y="0"/>
-                      <a:ext cx="5120640" cy="4627581"/>
-                    </a:xfrm>
-                    <a:prstGeom prst="rect">
-                      <a:avLst/>
-                    </a:prstGeom>
-                    <a:ln w="9525">
-                      <a:solidFill>
-                        <a:srgbClr val="D1D5DB"/>
-                      </a:solidFill>
-                    </a:ln>
-                  </pic:spPr>
-                </pic:pic>
-              </a:graphicData>
-            </a:graphic>
-          </wp:inline>
-        </w:drawing>
-      </w:r>
-    </w:p>
-    <w:p>
-      <w:pPr>
-        <w:spacing w:before="120" w:after="280"/>
-        <w:jc w:val="center"/>
-        <w:rPr>
-          <w:rFonts w:ascii="Montserrat" w:hAnsi="Montserrat"/>
-          <w:i/>
-          <w:color w:val="6A6A70"/>
-          <w:sz w:val="19"/>
-        </w:rPr>
-      </w:pPr>
-      <w:r>
-        <w:rPr>
-          <w:rFonts w:ascii="Montserrat" w:hAnsi="Montserrat"/>
-          <w:i/>
-          <w:color w:val="6A6A70"/>
-          <w:sz w:val="19"/>
-        </w:rPr>
-        <w:t>Painel do Relatorio de Situacao (estado vazio, antes do primeiro preenchimento).</w:t>
-      </w:r>
-    </w:p>
-    <w:p>
-      <w:pPr>
-        <w:spacing w:before="120" w:after="40"/>
-        <w:jc w:val="center"/>
-      </w:pPr>
-      <w:r>
-        <w:rPr>
-          <w:noProof/>
-        </w:rPr>
-        <w:lastRenderedPageBreak/>
-        <w:drawing>
-          <wp:inline distT="0" distB="0" distL="0" distR="0" wp14:anchorId="21FB2A16" wp14:editId="123253A2">
-            <wp:extent cx="5120640" cy="4627581"/>
-            <wp:effectExtent l="19050" t="19050" r="22860" b="20955"/>
-            <wp:docPr id="1299181495" name="Imagem 26"/>
-            <wp:cNvGraphicFramePr/>
-            <a:graphic xmlns:a="http://schemas.openxmlformats.org/drawingml/2006/main">
-              <a:graphicData uri="http://schemas.openxmlformats.org/drawingml/2006/picture">
-                <pic:pic xmlns:pic="http://schemas.openxmlformats.org/drawingml/2006/picture">
-                  <pic:nvPicPr>
-                    <pic:cNvPr id="1299181495" name=""/>
-                    <pic:cNvPicPr/>
-                  </pic:nvPicPr>
-                  <pic:blipFill>
-                    <a:blip r:embed="rId32">
-                      <a:extLst>
-                        <a:ext uri="{28A0092B-C50C-407E-A947-70E740481C1C}">
-                          <a14:useLocalDpi xmlns:a14="http://schemas.microsoft.com/office/drawing/2010/main" val="0"/>
-                        </a:ext>
-                      </a:extLst>
-                    </a:blip>
-                    <a:stretch>
-                      <a:fillRect/>
-                    </a:stretch>
-                  </pic:blipFill>
-                  <pic:spPr>
-                    <a:xfrm>
-                      <a:off x="0" y="0"/>
-                      <a:ext cx="5120640" cy="4627581"/>
-                    </a:xfrm>
-                    <a:prstGeom prst="rect">
-                      <a:avLst/>
-                    </a:prstGeom>
-                    <a:ln w="9525">
-                      <a:solidFill>
-                        <a:srgbClr val="D1D5DB"/>
-                      </a:solidFill>
-                    </a:ln>
-                  </pic:spPr>
-                </pic:pic>
-              </a:graphicData>
-            </a:graphic>
-          </wp:inline>
-        </w:drawing>
-      </w:r>
-    </w:p>
-    <w:p>
-      <w:pPr>
-        <w:spacing w:before="120" w:after="280"/>
-        <w:jc w:val="center"/>
-        <w:rPr>
-          <w:rFonts w:ascii="Montserrat" w:hAnsi="Montserrat"/>
-          <w:i/>
-          <w:color w:val="6A6A70"/>
-          <w:sz w:val="19"/>
-        </w:rPr>
-      </w:pPr>
-      <w:r>
-        <w:rPr>
-          <w:rFonts w:ascii="Montserrat" w:hAnsi="Montserrat"/>
-          <w:i/>
-          <w:color w:val="6A6A70"/>
-          <w:sz w:val="19"/>
-        </w:rPr>
-        <w:t>Aba Editar dados: cabecalho do relatorio e botao para adicionar projetos/marcos.</w:t>
-      </w:r>
-    </w:p>
-    <w:p>
-      <w:pPr>
-        <w:spacing w:before="120" w:after="40"/>
-        <w:jc w:val="center"/>
-      </w:pPr>
-      <w:r>
-        <w:rPr>
-          <w:noProof/>
-        </w:rPr>
-        <w:lastRenderedPageBreak/>
-        <w:drawing>
-          <wp:inline distT="0" distB="0" distL="0" distR="0" wp14:anchorId="3EECB727" wp14:editId="724F99FF">
-            <wp:extent cx="5120640" cy="4627581"/>
-            <wp:effectExtent l="19050" t="19050" r="22860" b="20955"/>
-            <wp:docPr id="323980967" name="Imagem 27"/>
-            <wp:cNvGraphicFramePr/>
-            <a:graphic xmlns:a="http://schemas.openxmlformats.org/drawingml/2006/main">
-              <a:graphicData uri="http://schemas.openxmlformats.org/drawingml/2006/picture">
-                <pic:pic xmlns:pic="http://schemas.openxmlformats.org/drawingml/2006/picture">
-                  <pic:nvPicPr>
-                    <pic:cNvPr id="323980967" name=""/>
-                    <pic:cNvPicPr/>
-                  </pic:nvPicPr>
-                  <pic:blipFill>
-                    <a:blip r:embed="rId33">
-                      <a:extLst>
-                        <a:ext uri="{28A0092B-C50C-407E-A947-70E740481C1C}">
-                          <a14:useLocalDpi xmlns:a14="http://schemas.microsoft.com/office/drawing/2010/main" val="0"/>
-                        </a:ext>
-                      </a:extLst>
-                    </a:blip>
-                    <a:stretch>
-                      <a:fillRect/>
-                    </a:stretch>
-                  </pic:blipFill>
-                  <pic:spPr>
-                    <a:xfrm>
-                      <a:off x="0" y="0"/>
-                      <a:ext cx="5120640" cy="4627581"/>
-                    </a:xfrm>
-                    <a:prstGeom prst="rect">
-                      <a:avLst/>
-                    </a:prstGeom>
-                    <a:ln w="9525">
-                      <a:solidFill>
-                        <a:srgbClr val="D1D5DB"/>
-                      </a:solidFill>
-                    </a:ln>
-                  </pic:spPr>
-                </pic:pic>
-              </a:graphicData>
-            </a:graphic>
-          </wp:inline>
-        </w:drawing>
-      </w:r>
-    </w:p>
-    <w:p>
-      <w:pPr>
-        <w:spacing w:before="120" w:after="280"/>
-        <w:jc w:val="center"/>
-        <w:rPr>
-          <w:rFonts w:ascii="Montserrat" w:hAnsi="Montserrat"/>
-          <w:i/>
-          <w:color w:val="6A6A70"/>
-          <w:sz w:val="19"/>
-        </w:rPr>
-      </w:pPr>
-      <w:r>
-        <w:rPr>
-          <w:rFonts w:ascii="Montserrat" w:hAnsi="Montserrat"/>
-          <w:i/>
-          <w:color w:val="6A6A70"/>
-          <w:sz w:val="19"/>
-        </w:rPr>
-        <w:t>Aba Importar Project: arraste uma exportacao do MS Project (Excel ou CSV) para preencher em lote.</w:t>
       </w:r>
     </w:p>
     <w:p>
@@ -11740,6 +9821,27 @@
           <w:color w:val="6A6A70"/>
           <w:sz w:val="21"/>
         </w:rPr>
+        <w:t>Sinalizacao automatica: a tabela de projetos do Painel ganhou a coluna Sinalizacao e o quadro de indicadores ganhou o card Em risco de atraso. E um calculo automatico, independente do campo Status manual: compara o % Execucao informado com o % que seria esperado pelo tempo ja decorrido entre o Inicio previsto e o Termino previsto do projeto. Se a defasagem for de 15 pontos percentuais ou mais, aparece Risco de atraso; se o Termino previsto ja passou e o projeto nao esta em 100%, aparece Prazo vencido. Projetos Concluido, Cancelado ou Paralisado ficam fora desse calculo. O resultado tambem sai no CSV exportado.</w:t>
+      </w:r>
+    </w:p>
+    <w:p>
+      <w:pPr>
+        <w:spacing w:before="160" w:after="200"/>
+        <w:ind w:left="283"/>
+        <w:rPr>
+          <w:rFonts w:ascii="Montserrat" w:hAnsi="Montserrat"/>
+          <w:i/>
+          <w:color w:val="6A6A70"/>
+          <w:sz w:val="21"/>
+        </w:rPr>
+      </w:pPr>
+      <w:r>
+        <w:rPr>
+          <w:rFonts w:ascii="Montserrat" w:hAnsi="Montserrat"/>
+          <w:i/>
+          <w:color w:val="6A6A70"/>
+          <w:sz w:val="21"/>
+        </w:rPr>
         <w:t>Este relatorio nao tem aprovacao/status formal - e uma ferramenta viva de acompanhamento, atualizada sempre que a situacao dos projetos mudar.</w:t>
       </w:r>
     </w:p>
@@ -11754,7 +9856,7 @@
           <w:sz w:val="27"/>
         </w:rPr>
       </w:pPr>
-      <w:bookmarkStart w:id="26" w:name="_Toc236124989"/>
+      <w:bookmarkStart w:id="26" w:name="_Toc236221967"/>
       <w:r>
         <w:rPr>
           <w:rFonts w:ascii="Montserrat" w:hAnsi="Montserrat"/>
@@ -11762,7 +9864,6 @@
           <w:color w:val="B91D2E"/>
           <w:sz w:val="27"/>
         </w:rPr>
-        <w:lastRenderedPageBreak/>
         <w:t>4.2 Relatorio de Entregas e Beneficios (FORALF12)</w:t>
       </w:r>
       <w:bookmarkEnd w:id="26"/>
@@ -11783,159 +9884,6 @@
           <w:sz w:val="22"/>
         </w:rPr>
         <w:t>O relatorio mais importante do ponto de vista de governanca: e sobre ele que ocorre o Gate 2 - Pactuacao, quando o Dono do Negocio assume formalmente, perante a Alta Gestao, o compromisso de que todo o trabalho planejado sera executado.</w:t>
-      </w:r>
-    </w:p>
-    <w:p>
-      <w:pPr>
-        <w:spacing w:before="120" w:after="40"/>
-        <w:jc w:val="center"/>
-      </w:pPr>
-      <w:r>
-        <w:rPr>
-          <w:noProof/>
-        </w:rPr>
-        <w:drawing>
-          <wp:inline distT="0" distB="0" distL="0" distR="0" wp14:anchorId="09E56ED1" wp14:editId="68FB85EC">
-            <wp:extent cx="5120640" cy="4627581"/>
-            <wp:effectExtent l="19050" t="19050" r="22860" b="20955"/>
-            <wp:docPr id="197968439" name="Imagem 28"/>
-            <wp:cNvGraphicFramePr/>
-            <a:graphic xmlns:a="http://schemas.openxmlformats.org/drawingml/2006/main">
-              <a:graphicData uri="http://schemas.openxmlformats.org/drawingml/2006/picture">
-                <pic:pic xmlns:pic="http://schemas.openxmlformats.org/drawingml/2006/picture">
-                  <pic:nvPicPr>
-                    <pic:cNvPr id="197968439" name=""/>
-                    <pic:cNvPicPr/>
-                  </pic:nvPicPr>
-                  <pic:blipFill>
-                    <a:blip r:embed="rId34">
-                      <a:extLst>
-                        <a:ext uri="{28A0092B-C50C-407E-A947-70E740481C1C}">
-                          <a14:useLocalDpi xmlns:a14="http://schemas.microsoft.com/office/drawing/2010/main" val="0"/>
-                        </a:ext>
-                      </a:extLst>
-                    </a:blip>
-                    <a:stretch>
-                      <a:fillRect/>
-                    </a:stretch>
-                  </pic:blipFill>
-                  <pic:spPr>
-                    <a:xfrm>
-                      <a:off x="0" y="0"/>
-                      <a:ext cx="5120640" cy="4627581"/>
-                    </a:xfrm>
-                    <a:prstGeom prst="rect">
-                      <a:avLst/>
-                    </a:prstGeom>
-                    <a:ln w="9525">
-                      <a:solidFill>
-                        <a:srgbClr val="D1D5DB"/>
-                      </a:solidFill>
-                    </a:ln>
-                  </pic:spPr>
-                </pic:pic>
-              </a:graphicData>
-            </a:graphic>
-          </wp:inline>
-        </w:drawing>
-      </w:r>
-    </w:p>
-    <w:p>
-      <w:pPr>
-        <w:spacing w:before="120" w:after="280"/>
-        <w:jc w:val="center"/>
-        <w:rPr>
-          <w:rFonts w:ascii="Montserrat" w:hAnsi="Montserrat"/>
-          <w:i/>
-          <w:color w:val="6A6A70"/>
-          <w:sz w:val="19"/>
-        </w:rPr>
-      </w:pPr>
-      <w:r>
-        <w:rPr>
-          <w:rFonts w:ascii="Montserrat" w:hAnsi="Montserrat"/>
-          <w:i/>
-          <w:color w:val="6A6A70"/>
-          <w:sz w:val="19"/>
-        </w:rPr>
-        <w:t>Painel do Relatorio de Entregas e Beneficios (estado vazio).</w:t>
-      </w:r>
-    </w:p>
-    <w:p>
-      <w:pPr>
-        <w:spacing w:before="120" w:after="40"/>
-        <w:jc w:val="center"/>
-      </w:pPr>
-      <w:r>
-        <w:rPr>
-          <w:noProof/>
-        </w:rPr>
-        <w:lastRenderedPageBreak/>
-        <w:drawing>
-          <wp:inline distT="0" distB="0" distL="0" distR="0" wp14:anchorId="3A5CD328" wp14:editId="69B9EABB">
-            <wp:extent cx="5120640" cy="4627581"/>
-            <wp:effectExtent l="19050" t="19050" r="22860" b="20955"/>
-            <wp:docPr id="936971836" name="Imagem 29"/>
-            <wp:cNvGraphicFramePr/>
-            <a:graphic xmlns:a="http://schemas.openxmlformats.org/drawingml/2006/main">
-              <a:graphicData uri="http://schemas.openxmlformats.org/drawingml/2006/picture">
-                <pic:pic xmlns:pic="http://schemas.openxmlformats.org/drawingml/2006/picture">
-                  <pic:nvPicPr>
-                    <pic:cNvPr id="936971836" name=""/>
-                    <pic:cNvPicPr/>
-                  </pic:nvPicPr>
-                  <pic:blipFill>
-                    <a:blip r:embed="rId35">
-                      <a:extLst>
-                        <a:ext uri="{28A0092B-C50C-407E-A947-70E740481C1C}">
-                          <a14:useLocalDpi xmlns:a14="http://schemas.microsoft.com/office/drawing/2010/main" val="0"/>
-                        </a:ext>
-                      </a:extLst>
-                    </a:blip>
-                    <a:stretch>
-                      <a:fillRect/>
-                    </a:stretch>
-                  </pic:blipFill>
-                  <pic:spPr>
-                    <a:xfrm>
-                      <a:off x="0" y="0"/>
-                      <a:ext cx="5120640" cy="4627581"/>
-                    </a:xfrm>
-                    <a:prstGeom prst="rect">
-                      <a:avLst/>
-                    </a:prstGeom>
-                    <a:ln w="9525">
-                      <a:solidFill>
-                        <a:srgbClr val="D1D5DB"/>
-                      </a:solidFill>
-                    </a:ln>
-                  </pic:spPr>
-                </pic:pic>
-              </a:graphicData>
-            </a:graphic>
-          </wp:inline>
-        </w:drawing>
-      </w:r>
-    </w:p>
-    <w:p>
-      <w:pPr>
-        <w:spacing w:before="120" w:after="280"/>
-        <w:jc w:val="center"/>
-        <w:rPr>
-          <w:rFonts w:ascii="Montserrat" w:hAnsi="Montserrat"/>
-          <w:i/>
-          <w:color w:val="6A6A70"/>
-          <w:sz w:val="19"/>
-        </w:rPr>
-      </w:pPr>
-      <w:r>
-        <w:rPr>
-          <w:rFonts w:ascii="Montserrat" w:hAnsi="Montserrat"/>
-          <w:i/>
-          <w:color w:val="6A6A70"/>
-          <w:sz w:val="19"/>
-        </w:rPr>
-        <w:t>Aba Editar dados: Ficha do Programa, o primeiro bloco a preencher.</w:t>
       </w:r>
     </w:p>
     <w:p>
@@ -11983,6 +9931,7 @@
           <w:color w:val="1A1A1A"/>
           <w:sz w:val="22"/>
         </w:rPr>
+        <w:lastRenderedPageBreak/>
         <w:t>Cadastre indicadores e valores estimados do programa, depois cada projeto vinculado (com suas proprias entregas, indicadores e valores).</w:t>
       </w:r>
     </w:p>
@@ -12046,7 +9995,7 @@
           <w:sz w:val="34"/>
         </w:rPr>
       </w:pPr>
-      <w:bookmarkStart w:id="27" w:name="_Toc236124990"/>
+      <w:bookmarkStart w:id="27" w:name="_Toc236221968"/>
       <w:r>
         <w:rPr>
           <w:rFonts w:ascii="Montserrat" w:hAnsi="Montserrat"/>
@@ -12106,7 +10055,7 @@
           <w:sz w:val="27"/>
         </w:rPr>
       </w:pPr>
-      <w:bookmarkStart w:id="28" w:name="_Toc236124991"/>
+      <w:bookmarkStart w:id="28" w:name="_Toc236221969"/>
       <w:r>
         <w:rPr>
           <w:rFonts w:ascii="Montserrat" w:hAnsi="Montserrat"/>
@@ -12138,83 +10087,6 @@
     </w:p>
     <w:p>
       <w:pPr>
-        <w:spacing w:before="120" w:after="40"/>
-        <w:jc w:val="center"/>
-      </w:pPr>
-      <w:r>
-        <w:rPr>
-          <w:noProof/>
-        </w:rPr>
-        <w:drawing>
-          <wp:inline distT="0" distB="0" distL="0" distR="0" wp14:anchorId="5ECC7005" wp14:editId="6E2323B3">
-            <wp:extent cx="5303520" cy="4792851"/>
-            <wp:effectExtent l="19050" t="19050" r="11430" b="27305"/>
-            <wp:docPr id="1025694745" name="Imagem 30"/>
-            <wp:cNvGraphicFramePr/>
-            <a:graphic xmlns:a="http://schemas.openxmlformats.org/drawingml/2006/main">
-              <a:graphicData uri="http://schemas.openxmlformats.org/drawingml/2006/picture">
-                <pic:pic xmlns:pic="http://schemas.openxmlformats.org/drawingml/2006/picture">
-                  <pic:nvPicPr>
-                    <pic:cNvPr id="1025694745" name=""/>
-                    <pic:cNvPicPr/>
-                  </pic:nvPicPr>
-                  <pic:blipFill>
-                    <a:blip r:embed="rId36">
-                      <a:extLst>
-                        <a:ext uri="{28A0092B-C50C-407E-A947-70E740481C1C}">
-                          <a14:useLocalDpi xmlns:a14="http://schemas.microsoft.com/office/drawing/2010/main" val="0"/>
-                        </a:ext>
-                      </a:extLst>
-                    </a:blip>
-                    <a:stretch>
-                      <a:fillRect/>
-                    </a:stretch>
-                  </pic:blipFill>
-                  <pic:spPr>
-                    <a:xfrm>
-                      <a:off x="0" y="0"/>
-                      <a:ext cx="5303520" cy="4792851"/>
-                    </a:xfrm>
-                    <a:prstGeom prst="rect">
-                      <a:avLst/>
-                    </a:prstGeom>
-                    <a:ln w="9525">
-                      <a:solidFill>
-                        <a:srgbClr val="D1D5DB"/>
-                      </a:solidFill>
-                    </a:ln>
-                  </pic:spPr>
-                </pic:pic>
-              </a:graphicData>
-            </a:graphic>
-          </wp:inline>
-        </w:drawing>
-      </w:r>
-    </w:p>
-    <w:p>
-      <w:pPr>
-        <w:spacing w:before="120" w:after="280"/>
-        <w:jc w:val="center"/>
-        <w:rPr>
-          <w:rFonts w:ascii="Montserrat" w:hAnsi="Montserrat"/>
-          <w:i/>
-          <w:color w:val="6A6A70"/>
-          <w:sz w:val="19"/>
-        </w:rPr>
-      </w:pPr>
-      <w:r>
-        <w:rPr>
-          <w:rFonts w:ascii="Montserrat" w:hAnsi="Montserrat"/>
-          <w:i/>
-          <w:color w:val="6A6A70"/>
-          <w:sz w:val="19"/>
-        </w:rPr>
-        <w:lastRenderedPageBreak/>
-        <w:t>Quadro de conexoes com o fator F1 selecionado - o painel a direita mostra os beneficios que ele habilita.</w:t>
-      </w:r>
-    </w:p>
-    <w:p>
-      <w:pPr>
         <w:pStyle w:val="Ttulo2"/>
         <w:spacing w:before="320" w:after="120"/>
         <w:rPr>
@@ -12224,7 +10096,7 @@
           <w:sz w:val="27"/>
         </w:rPr>
       </w:pPr>
-      <w:bookmarkStart w:id="29" w:name="_Toc236124992"/>
+      <w:bookmarkStart w:id="29" w:name="_Toc236221970"/>
       <w:r>
         <w:rPr>
           <w:rFonts w:ascii="Montserrat" w:hAnsi="Montserrat"/>
@@ -12256,82 +10128,6 @@
     </w:p>
     <w:p>
       <w:pPr>
-        <w:spacing w:before="120" w:after="40"/>
-        <w:jc w:val="center"/>
-      </w:pPr>
-      <w:r>
-        <w:rPr>
-          <w:noProof/>
-        </w:rPr>
-        <w:drawing>
-          <wp:inline distT="0" distB="0" distL="0" distR="0" wp14:anchorId="75BD2A88" wp14:editId="1693DA81">
-            <wp:extent cx="5303520" cy="4792851"/>
-            <wp:effectExtent l="19050" t="19050" r="11430" b="27305"/>
-            <wp:docPr id="1661766705" name="Imagem 31"/>
-            <wp:cNvGraphicFramePr/>
-            <a:graphic xmlns:a="http://schemas.openxmlformats.org/drawingml/2006/main">
-              <a:graphicData uri="http://schemas.openxmlformats.org/drawingml/2006/picture">
-                <pic:pic xmlns:pic="http://schemas.openxmlformats.org/drawingml/2006/picture">
-                  <pic:nvPicPr>
-                    <pic:cNvPr id="1661766705" name=""/>
-                    <pic:cNvPicPr/>
-                  </pic:nvPicPr>
-                  <pic:blipFill>
-                    <a:blip r:embed="rId37">
-                      <a:extLst>
-                        <a:ext uri="{28A0092B-C50C-407E-A947-70E740481C1C}">
-                          <a14:useLocalDpi xmlns:a14="http://schemas.microsoft.com/office/drawing/2010/main" val="0"/>
-                        </a:ext>
-                      </a:extLst>
-                    </a:blip>
-                    <a:stretch>
-                      <a:fillRect/>
-                    </a:stretch>
-                  </pic:blipFill>
-                  <pic:spPr>
-                    <a:xfrm>
-                      <a:off x="0" y="0"/>
-                      <a:ext cx="5303520" cy="4792851"/>
-                    </a:xfrm>
-                    <a:prstGeom prst="rect">
-                      <a:avLst/>
-                    </a:prstGeom>
-                    <a:ln w="9525">
-                      <a:solidFill>
-                        <a:srgbClr val="D1D5DB"/>
-                      </a:solidFill>
-                    </a:ln>
-                  </pic:spPr>
-                </pic:pic>
-              </a:graphicData>
-            </a:graphic>
-          </wp:inline>
-        </w:drawing>
-      </w:r>
-    </w:p>
-    <w:p>
-      <w:pPr>
-        <w:spacing w:before="120" w:after="280"/>
-        <w:jc w:val="center"/>
-        <w:rPr>
-          <w:rFonts w:ascii="Montserrat" w:hAnsi="Montserrat"/>
-          <w:i/>
-          <w:color w:val="6A6A70"/>
-          <w:sz w:val="19"/>
-        </w:rPr>
-      </w:pPr>
-      <w:r>
-        <w:rPr>
-          <w:rFonts w:ascii="Montserrat" w:hAnsi="Montserrat"/>
-          <w:i/>
-          <w:color w:val="6A6A70"/>
-          <w:sz w:val="19"/>
-        </w:rPr>
-        <w:t>Simulador de fatores x beneficios. Abaixo dele, o aviso de login para quem quiser vincular a um projeto.</w:t>
-      </w:r>
-    </w:p>
-    <w:p>
-      <w:pPr>
         <w:pStyle w:val="Ttulo2"/>
         <w:spacing w:before="320" w:after="120"/>
         <w:rPr>
@@ -12341,7 +10137,7 @@
           <w:sz w:val="27"/>
         </w:rPr>
       </w:pPr>
-      <w:bookmarkStart w:id="30" w:name="_Toc236124993"/>
+      <w:bookmarkStart w:id="30" w:name="_Toc236221971"/>
       <w:r>
         <w:rPr>
           <w:rFonts w:ascii="Montserrat" w:hAnsi="Montserrat"/>
@@ -12369,160 +10165,6 @@
           <w:sz w:val="22"/>
         </w:rPr>
         <w:t>Responda a oito perguntas do semaforo de decisao, uma de cada vez. Ao final, o painel devolve um veredito com a regra aplicada.</w:t>
-      </w:r>
-    </w:p>
-    <w:p>
-      <w:pPr>
-        <w:spacing w:before="120" w:after="40"/>
-        <w:jc w:val="center"/>
-      </w:pPr>
-      <w:r>
-        <w:rPr>
-          <w:noProof/>
-        </w:rPr>
-        <w:lastRenderedPageBreak/>
-        <w:drawing>
-          <wp:inline distT="0" distB="0" distL="0" distR="0" wp14:anchorId="6069C8A2" wp14:editId="6B2B8D93">
-            <wp:extent cx="5303520" cy="4792851"/>
-            <wp:effectExtent l="19050" t="19050" r="11430" b="27305"/>
-            <wp:docPr id="1513741605" name="Imagem 32"/>
-            <wp:cNvGraphicFramePr/>
-            <a:graphic xmlns:a="http://schemas.openxmlformats.org/drawingml/2006/main">
-              <a:graphicData uri="http://schemas.openxmlformats.org/drawingml/2006/picture">
-                <pic:pic xmlns:pic="http://schemas.openxmlformats.org/drawingml/2006/picture">
-                  <pic:nvPicPr>
-                    <pic:cNvPr id="1513741605" name=""/>
-                    <pic:cNvPicPr/>
-                  </pic:nvPicPr>
-                  <pic:blipFill>
-                    <a:blip r:embed="rId38">
-                      <a:extLst>
-                        <a:ext uri="{28A0092B-C50C-407E-A947-70E740481C1C}">
-                          <a14:useLocalDpi xmlns:a14="http://schemas.microsoft.com/office/drawing/2010/main" val="0"/>
-                        </a:ext>
-                      </a:extLst>
-                    </a:blip>
-                    <a:stretch>
-                      <a:fillRect/>
-                    </a:stretch>
-                  </pic:blipFill>
-                  <pic:spPr>
-                    <a:xfrm>
-                      <a:off x="0" y="0"/>
-                      <a:ext cx="5303520" cy="4792851"/>
-                    </a:xfrm>
-                    <a:prstGeom prst="rect">
-                      <a:avLst/>
-                    </a:prstGeom>
-                    <a:ln w="9525">
-                      <a:solidFill>
-                        <a:srgbClr val="D1D5DB"/>
-                      </a:solidFill>
-                    </a:ln>
-                  </pic:spPr>
-                </pic:pic>
-              </a:graphicData>
-            </a:graphic>
-          </wp:inline>
-        </w:drawing>
-      </w:r>
-    </w:p>
-    <w:p>
-      <w:pPr>
-        <w:spacing w:before="120" w:after="280"/>
-        <w:jc w:val="center"/>
-        <w:rPr>
-          <w:rFonts w:ascii="Montserrat" w:hAnsi="Montserrat"/>
-          <w:i/>
-          <w:color w:val="6A6A70"/>
-          <w:sz w:val="19"/>
-        </w:rPr>
-      </w:pPr>
-      <w:r>
-        <w:rPr>
-          <w:rFonts w:ascii="Montserrat" w:hAnsi="Montserrat"/>
-          <w:i/>
-          <w:color w:val="6A6A70"/>
-          <w:sz w:val="19"/>
-        </w:rPr>
-        <w:t>Primeira pergunta do assistente de decisao.</w:t>
-      </w:r>
-    </w:p>
-    <w:p>
-      <w:pPr>
-        <w:spacing w:before="120" w:after="40"/>
-        <w:jc w:val="center"/>
-      </w:pPr>
-      <w:r>
-        <w:rPr>
-          <w:noProof/>
-        </w:rPr>
-        <w:lastRenderedPageBreak/>
-        <w:drawing>
-          <wp:inline distT="0" distB="0" distL="0" distR="0" wp14:anchorId="3A89225C" wp14:editId="2DFFE277">
-            <wp:extent cx="5303520" cy="4792851"/>
-            <wp:effectExtent l="19050" t="19050" r="11430" b="27305"/>
-            <wp:docPr id="696292894" name="Imagem 33"/>
-            <wp:cNvGraphicFramePr/>
-            <a:graphic xmlns:a="http://schemas.openxmlformats.org/drawingml/2006/main">
-              <a:graphicData uri="http://schemas.openxmlformats.org/drawingml/2006/picture">
-                <pic:pic xmlns:pic="http://schemas.openxmlformats.org/drawingml/2006/picture">
-                  <pic:nvPicPr>
-                    <pic:cNvPr id="696292894" name=""/>
-                    <pic:cNvPicPr/>
-                  </pic:nvPicPr>
-                  <pic:blipFill>
-                    <a:blip r:embed="rId39">
-                      <a:extLst>
-                        <a:ext uri="{28A0092B-C50C-407E-A947-70E740481C1C}">
-                          <a14:useLocalDpi xmlns:a14="http://schemas.microsoft.com/office/drawing/2010/main" val="0"/>
-                        </a:ext>
-                      </a:extLst>
-                    </a:blip>
-                    <a:stretch>
-                      <a:fillRect/>
-                    </a:stretch>
-                  </pic:blipFill>
-                  <pic:spPr>
-                    <a:xfrm>
-                      <a:off x="0" y="0"/>
-                      <a:ext cx="5303520" cy="4792851"/>
-                    </a:xfrm>
-                    <a:prstGeom prst="rect">
-                      <a:avLst/>
-                    </a:prstGeom>
-                    <a:ln w="9525">
-                      <a:solidFill>
-                        <a:srgbClr val="D1D5DB"/>
-                      </a:solidFill>
-                    </a:ln>
-                  </pic:spPr>
-                </pic:pic>
-              </a:graphicData>
-            </a:graphic>
-          </wp:inline>
-        </w:drawing>
-      </w:r>
-    </w:p>
-    <w:p>
-      <w:pPr>
-        <w:spacing w:before="120" w:after="280"/>
-        <w:jc w:val="center"/>
-        <w:rPr>
-          <w:rFonts w:ascii="Montserrat" w:hAnsi="Montserrat"/>
-          <w:i/>
-          <w:color w:val="6A6A70"/>
-          <w:sz w:val="19"/>
-        </w:rPr>
-      </w:pPr>
-      <w:r>
-        <w:rPr>
-          <w:rFonts w:ascii="Montserrat" w:hAnsi="Montserrat"/>
-          <w:i/>
-          <w:color w:val="6A6A70"/>
-          <w:sz w:val="19"/>
-        </w:rPr>
-        <w:t>Veredito final, com o placar de respostas verdes/amarelas/vermelhas.</w:t>
       </w:r>
     </w:p>
     <w:p>
@@ -12561,7 +10203,7 @@
           <w:sz w:val="34"/>
         </w:rPr>
       </w:pPr>
-      <w:bookmarkStart w:id="31" w:name="_Toc236124994"/>
+      <w:bookmarkStart w:id="31" w:name="_Toc236221972"/>
       <w:r>
         <w:rPr>
           <w:rFonts w:ascii="Montserrat" w:hAnsi="Montserrat"/>
@@ -12603,7 +10245,7 @@
           <w:sz w:val="27"/>
         </w:rPr>
       </w:pPr>
-      <w:bookmarkStart w:id="32" w:name="_Toc236124995"/>
+      <w:bookmarkStart w:id="32" w:name="_Toc236221973"/>
       <w:r>
         <w:rPr>
           <w:rFonts w:ascii="Montserrat" w:hAnsi="Montserrat"/>
@@ -12635,82 +10277,6 @@
     </w:p>
     <w:p>
       <w:pPr>
-        <w:spacing w:before="120" w:after="40"/>
-        <w:jc w:val="center"/>
-      </w:pPr>
-      <w:r>
-        <w:rPr>
-          <w:noProof/>
-        </w:rPr>
-        <w:drawing>
-          <wp:inline distT="0" distB="0" distL="0" distR="0" wp14:anchorId="2D29D884" wp14:editId="766BE977">
-            <wp:extent cx="5303520" cy="4792851"/>
-            <wp:effectExtent l="19050" t="19050" r="11430" b="27305"/>
-            <wp:docPr id="2024420395" name="Imagem 34"/>
-            <wp:cNvGraphicFramePr/>
-            <a:graphic xmlns:a="http://schemas.openxmlformats.org/drawingml/2006/main">
-              <a:graphicData uri="http://schemas.openxmlformats.org/drawingml/2006/picture">
-                <pic:pic xmlns:pic="http://schemas.openxmlformats.org/drawingml/2006/picture">
-                  <pic:nvPicPr>
-                    <pic:cNvPr id="2024420395" name=""/>
-                    <pic:cNvPicPr/>
-                  </pic:nvPicPr>
-                  <pic:blipFill>
-                    <a:blip r:embed="rId40">
-                      <a:extLst>
-                        <a:ext uri="{28A0092B-C50C-407E-A947-70E740481C1C}">
-                          <a14:useLocalDpi xmlns:a14="http://schemas.microsoft.com/office/drawing/2010/main" val="0"/>
-                        </a:ext>
-                      </a:extLst>
-                    </a:blip>
-                    <a:stretch>
-                      <a:fillRect/>
-                    </a:stretch>
-                  </pic:blipFill>
-                  <pic:spPr>
-                    <a:xfrm>
-                      <a:off x="0" y="0"/>
-                      <a:ext cx="5303520" cy="4792851"/>
-                    </a:xfrm>
-                    <a:prstGeom prst="rect">
-                      <a:avLst/>
-                    </a:prstGeom>
-                    <a:ln w="9525">
-                      <a:solidFill>
-                        <a:srgbClr val="D1D5DB"/>
-                      </a:solidFill>
-                    </a:ln>
-                  </pic:spPr>
-                </pic:pic>
-              </a:graphicData>
-            </a:graphic>
-          </wp:inline>
-        </w:drawing>
-      </w:r>
-    </w:p>
-    <w:p>
-      <w:pPr>
-        <w:spacing w:before="120" w:after="280"/>
-        <w:jc w:val="center"/>
-        <w:rPr>
-          <w:rFonts w:ascii="Montserrat" w:hAnsi="Montserrat"/>
-          <w:i/>
-          <w:color w:val="6A6A70"/>
-          <w:sz w:val="19"/>
-        </w:rPr>
-      </w:pPr>
-      <w:r>
-        <w:rPr>
-          <w:rFonts w:ascii="Montserrat" w:hAnsi="Montserrat"/>
-          <w:i/>
-          <w:color w:val="6A6A70"/>
-          <w:sz w:val="19"/>
-        </w:rPr>
-        <w:t>Aba Usuarios: papel atual e seletor de alteracao de papel por usuario.</w:t>
-      </w:r>
-    </w:p>
-    <w:p>
-      <w:pPr>
         <w:pStyle w:val="Ttulo2"/>
         <w:spacing w:before="320" w:after="120"/>
         <w:rPr>
@@ -12720,7 +10286,7 @@
           <w:sz w:val="27"/>
         </w:rPr>
       </w:pPr>
-      <w:bookmarkStart w:id="33" w:name="_Toc236124996"/>
+      <w:bookmarkStart w:id="33" w:name="_Toc236221974"/>
       <w:r>
         <w:rPr>
           <w:rFonts w:ascii="Montserrat" w:hAnsi="Montserrat"/>
@@ -12752,83 +10318,6 @@
     </w:p>
     <w:p>
       <w:pPr>
-        <w:spacing w:before="120" w:after="40"/>
-        <w:jc w:val="center"/>
-      </w:pPr>
-      <w:r>
-        <w:rPr>
-          <w:noProof/>
-        </w:rPr>
-        <w:lastRenderedPageBreak/>
-        <w:drawing>
-          <wp:inline distT="0" distB="0" distL="0" distR="0" wp14:anchorId="7DFF797F" wp14:editId="3E7CA977">
-            <wp:extent cx="5303520" cy="4792851"/>
-            <wp:effectExtent l="19050" t="19050" r="11430" b="27305"/>
-            <wp:docPr id="1485206414" name="Imagem 35"/>
-            <wp:cNvGraphicFramePr/>
-            <a:graphic xmlns:a="http://schemas.openxmlformats.org/drawingml/2006/main">
-              <a:graphicData uri="http://schemas.openxmlformats.org/drawingml/2006/picture">
-                <pic:pic xmlns:pic="http://schemas.openxmlformats.org/drawingml/2006/picture">
-                  <pic:nvPicPr>
-                    <pic:cNvPr id="1485206414" name=""/>
-                    <pic:cNvPicPr/>
-                  </pic:nvPicPr>
-                  <pic:blipFill>
-                    <a:blip r:embed="rId41">
-                      <a:extLst>
-                        <a:ext uri="{28A0092B-C50C-407E-A947-70E740481C1C}">
-                          <a14:useLocalDpi xmlns:a14="http://schemas.microsoft.com/office/drawing/2010/main" val="0"/>
-                        </a:ext>
-                      </a:extLst>
-                    </a:blip>
-                    <a:stretch>
-                      <a:fillRect/>
-                    </a:stretch>
-                  </pic:blipFill>
-                  <pic:spPr>
-                    <a:xfrm>
-                      <a:off x="0" y="0"/>
-                      <a:ext cx="5303520" cy="4792851"/>
-                    </a:xfrm>
-                    <a:prstGeom prst="rect">
-                      <a:avLst/>
-                    </a:prstGeom>
-                    <a:ln w="9525">
-                      <a:solidFill>
-                        <a:srgbClr val="D1D5DB"/>
-                      </a:solidFill>
-                    </a:ln>
-                  </pic:spPr>
-                </pic:pic>
-              </a:graphicData>
-            </a:graphic>
-          </wp:inline>
-        </w:drawing>
-      </w:r>
-    </w:p>
-    <w:p>
-      <w:pPr>
-        <w:spacing w:before="120" w:after="280"/>
-        <w:jc w:val="center"/>
-        <w:rPr>
-          <w:rFonts w:ascii="Montserrat" w:hAnsi="Montserrat"/>
-          <w:i/>
-          <w:color w:val="6A6A70"/>
-          <w:sz w:val="19"/>
-        </w:rPr>
-      </w:pPr>
-      <w:r>
-        <w:rPr>
-          <w:rFonts w:ascii="Montserrat" w:hAnsi="Montserrat"/>
-          <w:i/>
-          <w:color w:val="6A6A70"/>
-          <w:sz w:val="19"/>
-        </w:rPr>
-        <w:t>Aba Equipes, com um projeto selecionado e um membro ja cadastrado.</w:t>
-      </w:r>
-    </w:p>
-    <w:p>
-      <w:pPr>
         <w:pStyle w:val="Ttulo2"/>
         <w:spacing w:before="320" w:after="120"/>
         <w:rPr>
@@ -12838,7 +10327,7 @@
           <w:sz w:val="27"/>
         </w:rPr>
       </w:pPr>
-      <w:bookmarkStart w:id="34" w:name="_Toc236124997"/>
+      <w:bookmarkStart w:id="34" w:name="_Toc236221975"/>
       <w:r>
         <w:rPr>
           <w:rFonts w:ascii="Montserrat" w:hAnsi="Montserrat"/>
@@ -12866,83 +10355,6 @@
           <w:sz w:val="22"/>
         </w:rPr>
         <w:t>Controla os dois interruptores de acesso sem login (Solicitacao de Demanda e Ata de Reuniao), descritos na secao 2.6.</w:t>
-      </w:r>
-    </w:p>
-    <w:p>
-      <w:pPr>
-        <w:spacing w:before="120" w:after="40"/>
-        <w:jc w:val="center"/>
-      </w:pPr>
-      <w:r>
-        <w:rPr>
-          <w:noProof/>
-        </w:rPr>
-        <w:lastRenderedPageBreak/>
-        <w:drawing>
-          <wp:inline distT="0" distB="0" distL="0" distR="0" wp14:anchorId="32A83701" wp14:editId="0146517B">
-            <wp:extent cx="5303520" cy="4792851"/>
-            <wp:effectExtent l="19050" t="19050" r="11430" b="27305"/>
-            <wp:docPr id="702694968" name="Imagem 36"/>
-            <wp:cNvGraphicFramePr/>
-            <a:graphic xmlns:a="http://schemas.openxmlformats.org/drawingml/2006/main">
-              <a:graphicData uri="http://schemas.openxmlformats.org/drawingml/2006/picture">
-                <pic:pic xmlns:pic="http://schemas.openxmlformats.org/drawingml/2006/picture">
-                  <pic:nvPicPr>
-                    <pic:cNvPr id="702694968" name=""/>
-                    <pic:cNvPicPr/>
-                  </pic:nvPicPr>
-                  <pic:blipFill>
-                    <a:blip r:embed="rId42">
-                      <a:extLst>
-                        <a:ext uri="{28A0092B-C50C-407E-A947-70E740481C1C}">
-                          <a14:useLocalDpi xmlns:a14="http://schemas.microsoft.com/office/drawing/2010/main" val="0"/>
-                        </a:ext>
-                      </a:extLst>
-                    </a:blip>
-                    <a:stretch>
-                      <a:fillRect/>
-                    </a:stretch>
-                  </pic:blipFill>
-                  <pic:spPr>
-                    <a:xfrm>
-                      <a:off x="0" y="0"/>
-                      <a:ext cx="5303520" cy="4792851"/>
-                    </a:xfrm>
-                    <a:prstGeom prst="rect">
-                      <a:avLst/>
-                    </a:prstGeom>
-                    <a:ln w="9525">
-                      <a:solidFill>
-                        <a:srgbClr val="D1D5DB"/>
-                      </a:solidFill>
-                    </a:ln>
-                  </pic:spPr>
-                </pic:pic>
-              </a:graphicData>
-            </a:graphic>
-          </wp:inline>
-        </w:drawing>
-      </w:r>
-    </w:p>
-    <w:p>
-      <w:pPr>
-        <w:spacing w:before="120" w:after="280"/>
-        <w:jc w:val="center"/>
-        <w:rPr>
-          <w:rFonts w:ascii="Montserrat" w:hAnsi="Montserrat"/>
-          <w:i/>
-          <w:color w:val="6A6A70"/>
-          <w:sz w:val="19"/>
-        </w:rPr>
-      </w:pPr>
-      <w:r>
-        <w:rPr>
-          <w:rFonts w:ascii="Montserrat" w:hAnsi="Montserrat"/>
-          <w:i/>
-          <w:color w:val="6A6A70"/>
-          <w:sz w:val="19"/>
-        </w:rPr>
-        <w:t>Aba Configuracoes: os dois interruptores de acesso sem login, hoje desativados.</w:t>
       </w:r>
     </w:p>
     <w:p>
@@ -12960,7 +10372,7 @@
           <w:sz w:val="34"/>
         </w:rPr>
       </w:pPr>
-      <w:bookmarkStart w:id="35" w:name="_Toc236124998"/>
+      <w:bookmarkStart w:id="35" w:name="_Toc236221976"/>
       <w:r>
         <w:rPr>
           <w:rFonts w:ascii="Montserrat" w:hAnsi="Montserrat"/>
@@ -13204,7 +10616,7 @@
           <w:sz w:val="34"/>
         </w:rPr>
       </w:pPr>
-      <w:bookmarkStart w:id="36" w:name="_Toc236124999"/>
+      <w:bookmarkStart w:id="36" w:name="_Toc236221977"/>
       <w:r>
         <w:rPr>
           <w:rFonts w:ascii="Montserrat" w:hAnsi="Montserrat"/>
@@ -14946,12 +12358,12 @@
       </w:pPr>
     </w:p>
     <w:sectPr>
-      <w:headerReference w:type="even" r:id="rId43"/>
-      <w:headerReference w:type="default" r:id="rId44"/>
-      <w:footerReference w:type="even" r:id="rId45"/>
-      <w:footerReference w:type="default" r:id="rId46"/>
-      <w:headerReference w:type="first" r:id="rId47"/>
-      <w:footerReference w:type="first" r:id="rId48"/>
+      <w:headerReference w:type="even" r:id="rId7"/>
+      <w:headerReference w:type="default" r:id="rId8"/>
+      <w:footerReference w:type="even" r:id="rId9"/>
+      <w:footerReference w:type="default" r:id="rId10"/>
+      <w:headerReference w:type="first" r:id="rId11"/>
+      <w:footerReference w:type="first" r:id="rId12"/>
       <w:pgSz w:w="12240" w:h="15840"/>
       <w:pgMar w:top="1417" w:right="1701" w:bottom="1417" w:left="1701" w:header="708" w:footer="708" w:gutter="0"/>
       <w:cols w:space="708"/>
@@ -14962,7 +12374,7 @@
 </file>
 
 <file path=word/endnotes.xml><?xml version="1.0" encoding="utf-8"?>
-<w:endnotes xmlns:wpc="http://schemas.microsoft.com/office/word/2010/wordprocessingCanvas" xmlns:cx="http://schemas.microsoft.com/office/drawing/2014/chartex" xmlns:cx1="http://schemas.microsoft.com/office/drawing/2015/9/8/chartex" xmlns:cx2="http://schemas.microsoft.com/office/drawing/2015/10/21/chartex" xmlns:cx3="http://schemas.microsoft.com/office/drawing/2016/5/9/chartex" xmlns:cx4="http://schemas.microsoft.com/office/drawing/2016/5/10/chartex" xmlns:cx5="http://schemas.microsoft.com/office/drawing/2016/5/11/chartex" xmlns:cx6="http://schemas.microsoft.com/office/drawing/2016/5/12/chartex" xmlns:cx7="http://schemas.microsoft.com/office/drawing/2016/5/13/chartex" xmlns:cx8="http://schemas.microsoft.com/office/drawing/2016/5/14/chartex" xmlns:mc="http://schemas.openxmlformats.org/markup-compatibility/2006" xmlns:aink="http://schemas.microsoft.com/office/drawing/2016/ink" xmlns:am3d="http://schemas.microsoft.com/office/drawing/2017/model3d" xmlns:o="urn:schemas-microsoft-com:office:office" xmlns:oel="http://schemas.microsoft.com/office/2019/extlst" xmlns:r="http://schemas.openxmlformats.org/officeDocument/2006/relationships" xmlns:m="http://schemas.openxmlformats.org/officeDocument/2006/math" xmlns:v="urn:schemas-microsoft-com:vml" xmlns:wp14="http://schemas.microsoft.com/office/word/2010/wordprocessingDrawing" xmlns:wp="http://schemas.openxmlformats.org/drawingml/2006/wordprocessingDrawing" xmlns:w10="urn:schemas-microsoft-com:office:word" xmlns:w="http://schemas.openxmlformats.org/wordprocessingml/2006/main" xmlns:w14="http://schemas.microsoft.com/office/word/2010/wordml" xmlns:w15="http://schemas.microsoft.com/office/word/2012/wordml" xmlns:w16cex="http://schemas.microsoft.com/office/word/2018/wordml/cex" xmlns:w16cid="http://schemas.microsoft.com/office/word/2016/wordml/cid" xmlns:w16="http://schemas.microsoft.com/office/word/2018/wordml" xmlns:w16du="http://schemas.microsoft.com/office/word/2023/wordml/word16du" xmlns:w16sdtdh="http://schemas.microsoft.com/office/word/2020/wordml/sdtdatahash" xmlns:w16sdtfl="http://schemas.microsoft.com/office/word/2024/wordml/sdtformatlock" xmlns:w16se="http://schemas.microsoft.com/office/word/2015/wordml/symex" xmlns:wpg="http://schemas.microsoft.com/office/word/2010/wordprocessingGroup" xmlns:wpi="http://schemas.microsoft.com/office/word/2010/wordprocessingInk" xmlns:wne="http://schemas.microsoft.com/office/word/2006/wordml" xmlns:wps="http://schemas.microsoft.com/office/word/2010/wordprocessingShape" mc:Ignorable="w14 w15 w16se w16cid w16 w16cex w16sdtdh w16sdtfl w16du wp14">
+<w:endnotes xmlns:wpc="http://schemas.microsoft.com/office/word/2010/wordprocessingCanvas" xmlns:cx="http://schemas.microsoft.com/office/drawing/2014/chartex" xmlns:cx1="http://schemas.microsoft.com/office/drawing/2015/9/8/chartex" xmlns:cx2="http://schemas.microsoft.com/office/drawing/2015/10/21/chartex" xmlns:cx3="http://schemas.microsoft.com/office/drawing/2016/5/9/chartex" xmlns:cx4="http://schemas.microsoft.com/office/drawing/2016/5/10/chartex" xmlns:cx5="http://schemas.microsoft.com/office/drawing/2016/5/11/chartex" xmlns:cx6="http://schemas.microsoft.com/office/drawing/2016/5/12/chartex" xmlns:cx7="http://schemas.microsoft.com/office/drawing/2016/5/13/chartex" xmlns:cx8="http://schemas.microsoft.com/office/drawing/2016/5/14/chartex" xmlns:mc="http://schemas.openxmlformats.org/markup-compatibility/2006" xmlns:aink="http://schemas.microsoft.com/office/drawing/2016/ink" xmlns:am3d="http://schemas.microsoft.com/office/drawing/2017/model3d" xmlns:o="urn:schemas-microsoft-com:office:office" xmlns:oel="http://schemas.microsoft.com/office/2019/extlst" xmlns:r="http://schemas.openxmlformats.org/officeDocument/2006/relationships" xmlns:m="http://schemas.openxmlformats.org/officeDocument/2006/math" xmlns:v="urn:schemas-microsoft-com:vml" xmlns:wp14="http://schemas.microsoft.com/office/word/2010/wordprocessingDrawing" xmlns:wp="http://schemas.openxmlformats.org/drawingml/2006/wordprocessingDrawing" xmlns:w10="urn:schemas-microsoft-com:office:word" xmlns:w="http://schemas.openxmlformats.org/wordprocessingml/2006/main" xmlns:w14="http://schemas.microsoft.com/office/word/2010/wordml" xmlns:w15="http://schemas.microsoft.com/office/word/2012/wordml" xmlns:w16cei="http://schemas.microsoft.com/office/word/2026/wordml/cei" xmlns:w16cex="http://schemas.microsoft.com/office/word/2018/wordml/cex" xmlns:w16cid="http://schemas.microsoft.com/office/word/2016/wordml/cid" xmlns:w16="http://schemas.microsoft.com/office/word/2018/wordml" xmlns:w16du="http://schemas.microsoft.com/office/word/2023/wordml/word16du" xmlns:w16sdtdh="http://schemas.microsoft.com/office/word/2020/wordml/sdtdatahash" xmlns:w16sdtfl="http://schemas.microsoft.com/office/word/2024/wordml/sdtformatlock" xmlns:w16se="http://schemas.microsoft.com/office/word/2015/wordml/symex" xmlns:wpg="http://schemas.microsoft.com/office/word/2010/wordprocessingGroup" xmlns:wpi="http://schemas.microsoft.com/office/word/2010/wordprocessingInk" xmlns:wne="http://schemas.microsoft.com/office/word/2006/wordml" xmlns:wps="http://schemas.microsoft.com/office/word/2010/wordprocessingShape" mc:Ignorable="w14 w15 w16se w16cid w16 w16cex w16sdtdh w16sdtfl w16du wp14">
   <w:endnote w:type="separator" w:id="-1">
     <w:p>
       <w:pPr>
@@ -14987,7 +12399,7 @@
 </file>
 
 <file path=word/footer1.xml><?xml version="1.0" encoding="utf-8"?>
-<w:ftr xmlns:wpc="http://schemas.microsoft.com/office/word/2010/wordprocessingCanvas" xmlns:cx="http://schemas.microsoft.com/office/drawing/2014/chartex" xmlns:cx1="http://schemas.microsoft.com/office/drawing/2015/9/8/chartex" xmlns:cx2="http://schemas.microsoft.com/office/drawing/2015/10/21/chartex" xmlns:cx3="http://schemas.microsoft.com/office/drawing/2016/5/9/chartex" xmlns:cx4="http://schemas.microsoft.com/office/drawing/2016/5/10/chartex" xmlns:cx5="http://schemas.microsoft.com/office/drawing/2016/5/11/chartex" xmlns:cx6="http://schemas.microsoft.com/office/drawing/2016/5/12/chartex" xmlns:cx7="http://schemas.microsoft.com/office/drawing/2016/5/13/chartex" xmlns:cx8="http://schemas.microsoft.com/office/drawing/2016/5/14/chartex" xmlns:mc="http://schemas.openxmlformats.org/markup-compatibility/2006" xmlns:aink="http://schemas.microsoft.com/office/drawing/2016/ink" xmlns:am3d="http://schemas.microsoft.com/office/drawing/2017/model3d" xmlns:o="urn:schemas-microsoft-com:office:office" xmlns:oel="http://schemas.microsoft.com/office/2019/extlst" xmlns:r="http://schemas.openxmlformats.org/officeDocument/2006/relationships" xmlns:m="http://schemas.openxmlformats.org/officeDocument/2006/math" xmlns:v="urn:schemas-microsoft-com:vml" xmlns:wp14="http://schemas.microsoft.com/office/word/2010/wordprocessingDrawing" xmlns:wp="http://schemas.openxmlformats.org/drawingml/2006/wordprocessingDrawing" xmlns:w10="urn:schemas-microsoft-com:office:word" xmlns:w="http://schemas.openxmlformats.org/wordprocessingml/2006/main" xmlns:w14="http://schemas.microsoft.com/office/word/2010/wordml" xmlns:w15="http://schemas.microsoft.com/office/word/2012/wordml" xmlns:w16cex="http://schemas.microsoft.com/office/word/2018/wordml/cex" xmlns:w16cid="http://schemas.microsoft.com/office/word/2016/wordml/cid" xmlns:w16="http://schemas.microsoft.com/office/word/2018/wordml" xmlns:w16du="http://schemas.microsoft.com/office/word/2023/wordml/word16du" xmlns:w16sdtdh="http://schemas.microsoft.com/office/word/2020/wordml/sdtdatahash" xmlns:w16sdtfl="http://schemas.microsoft.com/office/word/2024/wordml/sdtformatlock" xmlns:w16se="http://schemas.microsoft.com/office/word/2015/wordml/symex" xmlns:wpg="http://schemas.microsoft.com/office/word/2010/wordprocessingGroup" xmlns:wpi="http://schemas.microsoft.com/office/word/2010/wordprocessingInk" xmlns:wne="http://schemas.microsoft.com/office/word/2006/wordml" xmlns:wps="http://schemas.microsoft.com/office/word/2010/wordprocessingShape" mc:Ignorable="w14 w15 w16se w16cid w16 w16cex w16sdtdh w16sdtfl w16du wp14">
+<w:ftr xmlns:wpc="http://schemas.microsoft.com/office/word/2010/wordprocessingCanvas" xmlns:cx="http://schemas.microsoft.com/office/drawing/2014/chartex" xmlns:cx1="http://schemas.microsoft.com/office/drawing/2015/9/8/chartex" xmlns:cx2="http://schemas.microsoft.com/office/drawing/2015/10/21/chartex" xmlns:cx3="http://schemas.microsoft.com/office/drawing/2016/5/9/chartex" xmlns:cx4="http://schemas.microsoft.com/office/drawing/2016/5/10/chartex" xmlns:cx5="http://schemas.microsoft.com/office/drawing/2016/5/11/chartex" xmlns:cx6="http://schemas.microsoft.com/office/drawing/2016/5/12/chartex" xmlns:cx7="http://schemas.microsoft.com/office/drawing/2016/5/13/chartex" xmlns:cx8="http://schemas.microsoft.com/office/drawing/2016/5/14/chartex" xmlns:mc="http://schemas.openxmlformats.org/markup-compatibility/2006" xmlns:aink="http://schemas.microsoft.com/office/drawing/2016/ink" xmlns:am3d="http://schemas.microsoft.com/office/drawing/2017/model3d" xmlns:o="urn:schemas-microsoft-com:office:office" xmlns:oel="http://schemas.microsoft.com/office/2019/extlst" xmlns:r="http://schemas.openxmlformats.org/officeDocument/2006/relationships" xmlns:m="http://schemas.openxmlformats.org/officeDocument/2006/math" xmlns:v="urn:schemas-microsoft-com:vml" xmlns:wp14="http://schemas.microsoft.com/office/word/2010/wordprocessingDrawing" xmlns:wp="http://schemas.openxmlformats.org/drawingml/2006/wordprocessingDrawing" xmlns:w10="urn:schemas-microsoft-com:office:word" xmlns:w="http://schemas.openxmlformats.org/wordprocessingml/2006/main" xmlns:w14="http://schemas.microsoft.com/office/word/2010/wordml" xmlns:w15="http://schemas.microsoft.com/office/word/2012/wordml" xmlns:w16cei="http://schemas.microsoft.com/office/word/2026/wordml/cei" xmlns:w16cex="http://schemas.microsoft.com/office/word/2018/wordml/cex" xmlns:w16cid="http://schemas.microsoft.com/office/word/2016/wordml/cid" xmlns:w16="http://schemas.microsoft.com/office/word/2018/wordml" xmlns:w16du="http://schemas.microsoft.com/office/word/2023/wordml/word16du" xmlns:w16sdtdh="http://schemas.microsoft.com/office/word/2020/wordml/sdtdatahash" xmlns:w16sdtfl="http://schemas.microsoft.com/office/word/2024/wordml/sdtformatlock" xmlns:w16se="http://schemas.microsoft.com/office/word/2015/wordml/symex" xmlns:wpg="http://schemas.microsoft.com/office/word/2010/wordprocessingGroup" xmlns:wpi="http://schemas.microsoft.com/office/word/2010/wordprocessingInk" xmlns:wne="http://schemas.microsoft.com/office/word/2006/wordml" xmlns:wps="http://schemas.microsoft.com/office/word/2010/wordprocessingShape" mc:Ignorable="w14 w15 w16se w16cid w16 w16cex w16sdtdh w16sdtfl w16du wp14">
   <w:p>
     <w:pPr>
       <w:pStyle w:val="Rodap"/>
@@ -14997,7 +12409,7 @@
 </file>
 
 <file path=word/footer2.xml><?xml version="1.0" encoding="utf-8"?>
-<w:ftr xmlns:wpc="http://schemas.microsoft.com/office/word/2010/wordprocessingCanvas" xmlns:cx="http://schemas.microsoft.com/office/drawing/2014/chartex" xmlns:cx1="http://schemas.microsoft.com/office/drawing/2015/9/8/chartex" xmlns:cx2="http://schemas.microsoft.com/office/drawing/2015/10/21/chartex" xmlns:cx3="http://schemas.microsoft.com/office/drawing/2016/5/9/chartex" xmlns:cx4="http://schemas.microsoft.com/office/drawing/2016/5/10/chartex" xmlns:cx5="http://schemas.microsoft.com/office/drawing/2016/5/11/chartex" xmlns:cx6="http://schemas.microsoft.com/office/drawing/2016/5/12/chartex" xmlns:cx7="http://schemas.microsoft.com/office/drawing/2016/5/13/chartex" xmlns:cx8="http://schemas.microsoft.com/office/drawing/2016/5/14/chartex" xmlns:mc="http://schemas.openxmlformats.org/markup-compatibility/2006" xmlns:aink="http://schemas.microsoft.com/office/drawing/2016/ink" xmlns:am3d="http://schemas.microsoft.com/office/drawing/2017/model3d" xmlns:o="urn:schemas-microsoft-com:office:office" xmlns:oel="http://schemas.microsoft.com/office/2019/extlst" xmlns:r="http://schemas.openxmlformats.org/officeDocument/2006/relationships" xmlns:m="http://schemas.openxmlformats.org/officeDocument/2006/math" xmlns:v="urn:schemas-microsoft-com:vml" xmlns:wp14="http://schemas.microsoft.com/office/word/2010/wordprocessingDrawing" xmlns:wp="http://schemas.openxmlformats.org/drawingml/2006/wordprocessingDrawing" xmlns:w10="urn:schemas-microsoft-com:office:word" xmlns:w="http://schemas.openxmlformats.org/wordprocessingml/2006/main" xmlns:w14="http://schemas.microsoft.com/office/word/2010/wordml" xmlns:w15="http://schemas.microsoft.com/office/word/2012/wordml" xmlns:w16cex="http://schemas.microsoft.com/office/word/2018/wordml/cex" xmlns:w16cid="http://schemas.microsoft.com/office/word/2016/wordml/cid" xmlns:w16="http://schemas.microsoft.com/office/word/2018/wordml" xmlns:w16du="http://schemas.microsoft.com/office/word/2023/wordml/word16du" xmlns:w16sdtdh="http://schemas.microsoft.com/office/word/2020/wordml/sdtdatahash" xmlns:w16sdtfl="http://schemas.microsoft.com/office/word/2024/wordml/sdtformatlock" xmlns:w16se="http://schemas.microsoft.com/office/word/2015/wordml/symex" xmlns:wpg="http://schemas.microsoft.com/office/word/2010/wordprocessingGroup" xmlns:wpi="http://schemas.microsoft.com/office/word/2010/wordprocessingInk" xmlns:wne="http://schemas.microsoft.com/office/word/2006/wordml" xmlns:wps="http://schemas.microsoft.com/office/word/2010/wordprocessingShape" mc:Ignorable="w14 w15 w16se w16cid w16 w16cex w16sdtdh w16sdtfl w16du wp14">
+<w:ftr xmlns:wpc="http://schemas.microsoft.com/office/word/2010/wordprocessingCanvas" xmlns:cx="http://schemas.microsoft.com/office/drawing/2014/chartex" xmlns:cx1="http://schemas.microsoft.com/office/drawing/2015/9/8/chartex" xmlns:cx2="http://schemas.microsoft.com/office/drawing/2015/10/21/chartex" xmlns:cx3="http://schemas.microsoft.com/office/drawing/2016/5/9/chartex" xmlns:cx4="http://schemas.microsoft.com/office/drawing/2016/5/10/chartex" xmlns:cx5="http://schemas.microsoft.com/office/drawing/2016/5/11/chartex" xmlns:cx6="http://schemas.microsoft.com/office/drawing/2016/5/12/chartex" xmlns:cx7="http://schemas.microsoft.com/office/drawing/2016/5/13/chartex" xmlns:cx8="http://schemas.microsoft.com/office/drawing/2016/5/14/chartex" xmlns:mc="http://schemas.openxmlformats.org/markup-compatibility/2006" xmlns:aink="http://schemas.microsoft.com/office/drawing/2016/ink" xmlns:am3d="http://schemas.microsoft.com/office/drawing/2017/model3d" xmlns:o="urn:schemas-microsoft-com:office:office" xmlns:oel="http://schemas.microsoft.com/office/2019/extlst" xmlns:r="http://schemas.openxmlformats.org/officeDocument/2006/relationships" xmlns:m="http://schemas.openxmlformats.org/officeDocument/2006/math" xmlns:v="urn:schemas-microsoft-com:vml" xmlns:wp14="http://schemas.microsoft.com/office/word/2010/wordprocessingDrawing" xmlns:wp="http://schemas.openxmlformats.org/drawingml/2006/wordprocessingDrawing" xmlns:w10="urn:schemas-microsoft-com:office:word" xmlns:w="http://schemas.openxmlformats.org/wordprocessingml/2006/main" xmlns:w14="http://schemas.microsoft.com/office/word/2010/wordml" xmlns:w15="http://schemas.microsoft.com/office/word/2012/wordml" xmlns:w16cei="http://schemas.microsoft.com/office/word/2026/wordml/cei" xmlns:w16cex="http://schemas.microsoft.com/office/word/2018/wordml/cex" xmlns:w16cid="http://schemas.microsoft.com/office/word/2016/wordml/cid" xmlns:w16="http://schemas.microsoft.com/office/word/2018/wordml" xmlns:w16du="http://schemas.microsoft.com/office/word/2023/wordml/word16du" xmlns:w16sdtdh="http://schemas.microsoft.com/office/word/2020/wordml/sdtdatahash" xmlns:w16sdtfl="http://schemas.microsoft.com/office/word/2024/wordml/sdtformatlock" xmlns:w16se="http://schemas.microsoft.com/office/word/2015/wordml/symex" xmlns:wpg="http://schemas.microsoft.com/office/word/2010/wordprocessingGroup" xmlns:wpi="http://schemas.microsoft.com/office/word/2010/wordprocessingInk" xmlns:wne="http://schemas.microsoft.com/office/word/2006/wordml" xmlns:wps="http://schemas.microsoft.com/office/word/2010/wordprocessingShape" mc:Ignorable="w14 w15 w16se w16cid w16 w16cex w16sdtdh w16sdtfl w16du wp14">
   <w:p>
     <w:pPr>
       <w:pStyle w:val="Rodap"/>
@@ -15043,7 +12455,7 @@
 </file>
 
 <file path=word/footer3.xml><?xml version="1.0" encoding="utf-8"?>
-<w:ftr xmlns:wpc="http://schemas.microsoft.com/office/word/2010/wordprocessingCanvas" xmlns:cx="http://schemas.microsoft.com/office/drawing/2014/chartex" xmlns:cx1="http://schemas.microsoft.com/office/drawing/2015/9/8/chartex" xmlns:cx2="http://schemas.microsoft.com/office/drawing/2015/10/21/chartex" xmlns:cx3="http://schemas.microsoft.com/office/drawing/2016/5/9/chartex" xmlns:cx4="http://schemas.microsoft.com/office/drawing/2016/5/10/chartex" xmlns:cx5="http://schemas.microsoft.com/office/drawing/2016/5/11/chartex" xmlns:cx6="http://schemas.microsoft.com/office/drawing/2016/5/12/chartex" xmlns:cx7="http://schemas.microsoft.com/office/drawing/2016/5/13/chartex" xmlns:cx8="http://schemas.microsoft.com/office/drawing/2016/5/14/chartex" xmlns:mc="http://schemas.openxmlformats.org/markup-compatibility/2006" xmlns:aink="http://schemas.microsoft.com/office/drawing/2016/ink" xmlns:am3d="http://schemas.microsoft.com/office/drawing/2017/model3d" xmlns:o="urn:schemas-microsoft-com:office:office" xmlns:oel="http://schemas.microsoft.com/office/2019/extlst" xmlns:r="http://schemas.openxmlformats.org/officeDocument/2006/relationships" xmlns:m="http://schemas.openxmlformats.org/officeDocument/2006/math" xmlns:v="urn:schemas-microsoft-com:vml" xmlns:wp14="http://schemas.microsoft.com/office/word/2010/wordprocessingDrawing" xmlns:wp="http://schemas.openxmlformats.org/drawingml/2006/wordprocessingDrawing" xmlns:w10="urn:schemas-microsoft-com:office:word" xmlns:w="http://schemas.openxmlformats.org/wordprocessingml/2006/main" xmlns:w14="http://schemas.microsoft.com/office/word/2010/wordml" xmlns:w15="http://schemas.microsoft.com/office/word/2012/wordml" xmlns:w16cex="http://schemas.microsoft.com/office/word/2018/wordml/cex" xmlns:w16cid="http://schemas.microsoft.com/office/word/2016/wordml/cid" xmlns:w16="http://schemas.microsoft.com/office/word/2018/wordml" xmlns:w16du="http://schemas.microsoft.com/office/word/2023/wordml/word16du" xmlns:w16sdtdh="http://schemas.microsoft.com/office/word/2020/wordml/sdtdatahash" xmlns:w16sdtfl="http://schemas.microsoft.com/office/word/2024/wordml/sdtformatlock" xmlns:w16se="http://schemas.microsoft.com/office/word/2015/wordml/symex" xmlns:wpg="http://schemas.microsoft.com/office/word/2010/wordprocessingGroup" xmlns:wpi="http://schemas.microsoft.com/office/word/2010/wordprocessingInk" xmlns:wne="http://schemas.microsoft.com/office/word/2006/wordml" xmlns:wps="http://schemas.microsoft.com/office/word/2010/wordprocessingShape" mc:Ignorable="w14 w15 w16se w16cid w16 w16cex w16sdtdh w16sdtfl w16du wp14">
+<w:ftr xmlns:wpc="http://schemas.microsoft.com/office/word/2010/wordprocessingCanvas" xmlns:cx="http://schemas.microsoft.com/office/drawing/2014/chartex" xmlns:cx1="http://schemas.microsoft.com/office/drawing/2015/9/8/chartex" xmlns:cx2="http://schemas.microsoft.com/office/drawing/2015/10/21/chartex" xmlns:cx3="http://schemas.microsoft.com/office/drawing/2016/5/9/chartex" xmlns:cx4="http://schemas.microsoft.com/office/drawing/2016/5/10/chartex" xmlns:cx5="http://schemas.microsoft.com/office/drawing/2016/5/11/chartex" xmlns:cx6="http://schemas.microsoft.com/office/drawing/2016/5/12/chartex" xmlns:cx7="http://schemas.microsoft.com/office/drawing/2016/5/13/chartex" xmlns:cx8="http://schemas.microsoft.com/office/drawing/2016/5/14/chartex" xmlns:mc="http://schemas.openxmlformats.org/markup-compatibility/2006" xmlns:aink="http://schemas.microsoft.com/office/drawing/2016/ink" xmlns:am3d="http://schemas.microsoft.com/office/drawing/2017/model3d" xmlns:o="urn:schemas-microsoft-com:office:office" xmlns:oel="http://schemas.microsoft.com/office/2019/extlst" xmlns:r="http://schemas.openxmlformats.org/officeDocument/2006/relationships" xmlns:m="http://schemas.openxmlformats.org/officeDocument/2006/math" xmlns:v="urn:schemas-microsoft-com:vml" xmlns:wp14="http://schemas.microsoft.com/office/word/2010/wordprocessingDrawing" xmlns:wp="http://schemas.openxmlformats.org/drawingml/2006/wordprocessingDrawing" xmlns:w10="urn:schemas-microsoft-com:office:word" xmlns:w="http://schemas.openxmlformats.org/wordprocessingml/2006/main" xmlns:w14="http://schemas.microsoft.com/office/word/2010/wordml" xmlns:w15="http://schemas.microsoft.com/office/word/2012/wordml" xmlns:w16cei="http://schemas.microsoft.com/office/word/2026/wordml/cei" xmlns:w16cex="http://schemas.microsoft.com/office/word/2018/wordml/cex" xmlns:w16cid="http://schemas.microsoft.com/office/word/2016/wordml/cid" xmlns:w16="http://schemas.microsoft.com/office/word/2018/wordml" xmlns:w16du="http://schemas.microsoft.com/office/word/2023/wordml/word16du" xmlns:w16sdtdh="http://schemas.microsoft.com/office/word/2020/wordml/sdtdatahash" xmlns:w16sdtfl="http://schemas.microsoft.com/office/word/2024/wordml/sdtformatlock" xmlns:w16se="http://schemas.microsoft.com/office/word/2015/wordml/symex" xmlns:wpg="http://schemas.microsoft.com/office/word/2010/wordprocessingGroup" xmlns:wpi="http://schemas.microsoft.com/office/word/2010/wordprocessingInk" xmlns:wne="http://schemas.microsoft.com/office/word/2006/wordml" xmlns:wps="http://schemas.microsoft.com/office/word/2010/wordprocessingShape" mc:Ignorable="w14 w15 w16se w16cid w16 w16cex w16sdtdh w16sdtfl w16du wp14">
   <w:p>
     <w:pPr>
       <w:pStyle w:val="Rodap"/>
@@ -15053,7 +12465,7 @@
 </file>
 
 <file path=word/footnotes.xml><?xml version="1.0" encoding="utf-8"?>
-<w:footnotes xmlns:wpc="http://schemas.microsoft.com/office/word/2010/wordprocessingCanvas" xmlns:cx="http://schemas.microsoft.com/office/drawing/2014/chartex" xmlns:cx1="http://schemas.microsoft.com/office/drawing/2015/9/8/chartex" xmlns:cx2="http://schemas.microsoft.com/office/drawing/2015/10/21/chartex" xmlns:cx3="http://schemas.microsoft.com/office/drawing/2016/5/9/chartex" xmlns:cx4="http://schemas.microsoft.com/office/drawing/2016/5/10/chartex" xmlns:cx5="http://schemas.microsoft.com/office/drawing/2016/5/11/chartex" xmlns:cx6="http://schemas.microsoft.com/office/drawing/2016/5/12/chartex" xmlns:cx7="http://schemas.microsoft.com/office/drawing/2016/5/13/chartex" xmlns:cx8="http://schemas.microsoft.com/office/drawing/2016/5/14/chartex" xmlns:mc="http://schemas.openxmlformats.org/markup-compatibility/2006" xmlns:aink="http://schemas.microsoft.com/office/drawing/2016/ink" xmlns:am3d="http://schemas.microsoft.com/office/drawing/2017/model3d" xmlns:o="urn:schemas-microsoft-com:office:office" xmlns:oel="http://schemas.microsoft.com/office/2019/extlst" xmlns:r="http://schemas.openxmlformats.org/officeDocument/2006/relationships" xmlns:m="http://schemas.openxmlformats.org/officeDocument/2006/math" xmlns:v="urn:schemas-microsoft-com:vml" xmlns:wp14="http://schemas.microsoft.com/office/word/2010/wordprocessingDrawing" xmlns:wp="http://schemas.openxmlformats.org/drawingml/2006/wordprocessingDrawing" xmlns:w10="urn:schemas-microsoft-com:office:word" xmlns:w="http://schemas.openxmlformats.org/wordprocessingml/2006/main" xmlns:w14="http://schemas.microsoft.com/office/word/2010/wordml" xmlns:w15="http://schemas.microsoft.com/office/word/2012/wordml" xmlns:w16cex="http://schemas.microsoft.com/office/word/2018/wordml/cex" xmlns:w16cid="http://schemas.microsoft.com/office/word/2016/wordml/cid" xmlns:w16="http://schemas.microsoft.com/office/word/2018/wordml" xmlns:w16du="http://schemas.microsoft.com/office/word/2023/wordml/word16du" xmlns:w16sdtdh="http://schemas.microsoft.com/office/word/2020/wordml/sdtdatahash" xmlns:w16sdtfl="http://schemas.microsoft.com/office/word/2024/wordml/sdtformatlock" xmlns:w16se="http://schemas.microsoft.com/office/word/2015/wordml/symex" xmlns:wpg="http://schemas.microsoft.com/office/word/2010/wordprocessingGroup" xmlns:wpi="http://schemas.microsoft.com/office/word/2010/wordprocessingInk" xmlns:wne="http://schemas.microsoft.com/office/word/2006/wordml" xmlns:wps="http://schemas.microsoft.com/office/word/2010/wordprocessingShape" mc:Ignorable="w14 w15 w16se w16cid w16 w16cex w16sdtdh w16sdtfl w16du wp14">
+<w:footnotes xmlns:wpc="http://schemas.microsoft.com/office/word/2010/wordprocessingCanvas" xmlns:cx="http://schemas.microsoft.com/office/drawing/2014/chartex" xmlns:cx1="http://schemas.microsoft.com/office/drawing/2015/9/8/chartex" xmlns:cx2="http://schemas.microsoft.com/office/drawing/2015/10/21/chartex" xmlns:cx3="http://schemas.microsoft.com/office/drawing/2016/5/9/chartex" xmlns:cx4="http://schemas.microsoft.com/office/drawing/2016/5/10/chartex" xmlns:cx5="http://schemas.microsoft.com/office/drawing/2016/5/11/chartex" xmlns:cx6="http://schemas.microsoft.com/office/drawing/2016/5/12/chartex" xmlns:cx7="http://schemas.microsoft.com/office/drawing/2016/5/13/chartex" xmlns:cx8="http://schemas.microsoft.com/office/drawing/2016/5/14/chartex" xmlns:mc="http://schemas.openxmlformats.org/markup-compatibility/2006" xmlns:aink="http://schemas.microsoft.com/office/drawing/2016/ink" xmlns:am3d="http://schemas.microsoft.com/office/drawing/2017/model3d" xmlns:o="urn:schemas-microsoft-com:office:office" xmlns:oel="http://schemas.microsoft.com/office/2019/extlst" xmlns:r="http://schemas.openxmlformats.org/officeDocument/2006/relationships" xmlns:m="http://schemas.openxmlformats.org/officeDocument/2006/math" xmlns:v="urn:schemas-microsoft-com:vml" xmlns:wp14="http://schemas.microsoft.com/office/word/2010/wordprocessingDrawing" xmlns:wp="http://schemas.openxmlformats.org/drawingml/2006/wordprocessingDrawing" xmlns:w10="urn:schemas-microsoft-com:office:word" xmlns:w="http://schemas.openxmlformats.org/wordprocessingml/2006/main" xmlns:w14="http://schemas.microsoft.com/office/word/2010/wordml" xmlns:w15="http://schemas.microsoft.com/office/word/2012/wordml" xmlns:w16cei="http://schemas.microsoft.com/office/word/2026/wordml/cei" xmlns:w16cex="http://schemas.microsoft.com/office/word/2018/wordml/cex" xmlns:w16cid="http://schemas.microsoft.com/office/word/2016/wordml/cid" xmlns:w16="http://schemas.microsoft.com/office/word/2018/wordml" xmlns:w16du="http://schemas.microsoft.com/office/word/2023/wordml/word16du" xmlns:w16sdtdh="http://schemas.microsoft.com/office/word/2020/wordml/sdtdatahash" xmlns:w16sdtfl="http://schemas.microsoft.com/office/word/2024/wordml/sdtformatlock" xmlns:w16se="http://schemas.microsoft.com/office/word/2015/wordml/symex" xmlns:wpg="http://schemas.microsoft.com/office/word/2010/wordprocessingGroup" xmlns:wpi="http://schemas.microsoft.com/office/word/2010/wordprocessingInk" xmlns:wne="http://schemas.microsoft.com/office/word/2006/wordml" xmlns:wps="http://schemas.microsoft.com/office/word/2010/wordprocessingShape" mc:Ignorable="w14 w15 w16se w16cid w16 w16cex w16sdtdh w16sdtfl w16du wp14">
   <w:footnote w:type="separator" w:id="-1">
     <w:p>
       <w:pPr>
@@ -15078,7 +12490,7 @@
 </file>
 
 <file path=word/header1.xml><?xml version="1.0" encoding="utf-8"?>
-<w:hdr xmlns:wpc="http://schemas.microsoft.com/office/word/2010/wordprocessingCanvas" xmlns:cx="http://schemas.microsoft.com/office/drawing/2014/chartex" xmlns:cx1="http://schemas.microsoft.com/office/drawing/2015/9/8/chartex" xmlns:cx2="http://schemas.microsoft.com/office/drawing/2015/10/21/chartex" xmlns:cx3="http://schemas.microsoft.com/office/drawing/2016/5/9/chartex" xmlns:cx4="http://schemas.microsoft.com/office/drawing/2016/5/10/chartex" xmlns:cx5="http://schemas.microsoft.com/office/drawing/2016/5/11/chartex" xmlns:cx6="http://schemas.microsoft.com/office/drawing/2016/5/12/chartex" xmlns:cx7="http://schemas.microsoft.com/office/drawing/2016/5/13/chartex" xmlns:cx8="http://schemas.microsoft.com/office/drawing/2016/5/14/chartex" xmlns:mc="http://schemas.openxmlformats.org/markup-compatibility/2006" xmlns:aink="http://schemas.microsoft.com/office/drawing/2016/ink" xmlns:am3d="http://schemas.microsoft.com/office/drawing/2017/model3d" xmlns:o="urn:schemas-microsoft-com:office:office" xmlns:oel="http://schemas.microsoft.com/office/2019/extlst" xmlns:r="http://schemas.openxmlformats.org/officeDocument/2006/relationships" xmlns:m="http://schemas.openxmlformats.org/officeDocument/2006/math" xmlns:v="urn:schemas-microsoft-com:vml" xmlns:wp14="http://schemas.microsoft.com/office/word/2010/wordprocessingDrawing" xmlns:wp="http://schemas.openxmlformats.org/drawingml/2006/wordprocessingDrawing" xmlns:w10="urn:schemas-microsoft-com:office:word" xmlns:w="http://schemas.openxmlformats.org/wordprocessingml/2006/main" xmlns:w14="http://schemas.microsoft.com/office/word/2010/wordml" xmlns:w15="http://schemas.microsoft.com/office/word/2012/wordml" xmlns:w16cex="http://schemas.microsoft.com/office/word/2018/wordml/cex" xmlns:w16cid="http://schemas.microsoft.com/office/word/2016/wordml/cid" xmlns:w16="http://schemas.microsoft.com/office/word/2018/wordml" xmlns:w16du="http://schemas.microsoft.com/office/word/2023/wordml/word16du" xmlns:w16sdtdh="http://schemas.microsoft.com/office/word/2020/wordml/sdtdatahash" xmlns:w16sdtfl="http://schemas.microsoft.com/office/word/2024/wordml/sdtformatlock" xmlns:w16se="http://schemas.microsoft.com/office/word/2015/wordml/symex" xmlns:wpg="http://schemas.microsoft.com/office/word/2010/wordprocessingGroup" xmlns:wpi="http://schemas.microsoft.com/office/word/2010/wordprocessingInk" xmlns:wne="http://schemas.microsoft.com/office/word/2006/wordml" xmlns:wps="http://schemas.microsoft.com/office/word/2010/wordprocessingShape" mc:Ignorable="w14 w15 w16se w16cid w16 w16cex w16sdtdh w16sdtfl w16du wp14">
+<w:hdr xmlns:wpc="http://schemas.microsoft.com/office/word/2010/wordprocessingCanvas" xmlns:cx="http://schemas.microsoft.com/office/drawing/2014/chartex" xmlns:cx1="http://schemas.microsoft.com/office/drawing/2015/9/8/chartex" xmlns:cx2="http://schemas.microsoft.com/office/drawing/2015/10/21/chartex" xmlns:cx3="http://schemas.microsoft.com/office/drawing/2016/5/9/chartex" xmlns:cx4="http://schemas.microsoft.com/office/drawing/2016/5/10/chartex" xmlns:cx5="http://schemas.microsoft.com/office/drawing/2016/5/11/chartex" xmlns:cx6="http://schemas.microsoft.com/office/drawing/2016/5/12/chartex" xmlns:cx7="http://schemas.microsoft.com/office/drawing/2016/5/13/chartex" xmlns:cx8="http://schemas.microsoft.com/office/drawing/2016/5/14/chartex" xmlns:mc="http://schemas.openxmlformats.org/markup-compatibility/2006" xmlns:aink="http://schemas.microsoft.com/office/drawing/2016/ink" xmlns:am3d="http://schemas.microsoft.com/office/drawing/2017/model3d" xmlns:o="urn:schemas-microsoft-com:office:office" xmlns:oel="http://schemas.microsoft.com/office/2019/extlst" xmlns:r="http://schemas.openxmlformats.org/officeDocument/2006/relationships" xmlns:m="http://schemas.openxmlformats.org/officeDocument/2006/math" xmlns:v="urn:schemas-microsoft-com:vml" xmlns:wp14="http://schemas.microsoft.com/office/word/2010/wordprocessingDrawing" xmlns:wp="http://schemas.openxmlformats.org/drawingml/2006/wordprocessingDrawing" xmlns:w10="urn:schemas-microsoft-com:office:word" xmlns:w="http://schemas.openxmlformats.org/wordprocessingml/2006/main" xmlns:w14="http://schemas.microsoft.com/office/word/2010/wordml" xmlns:w15="http://schemas.microsoft.com/office/word/2012/wordml" xmlns:w16cei="http://schemas.microsoft.com/office/word/2026/wordml/cei" xmlns:w16cex="http://schemas.microsoft.com/office/word/2018/wordml/cex" xmlns:w16cid="http://schemas.microsoft.com/office/word/2016/wordml/cid" xmlns:w16="http://schemas.microsoft.com/office/word/2018/wordml" xmlns:w16du="http://schemas.microsoft.com/office/word/2023/wordml/word16du" xmlns:w16sdtdh="http://schemas.microsoft.com/office/word/2020/wordml/sdtdatahash" xmlns:w16sdtfl="http://schemas.microsoft.com/office/word/2024/wordml/sdtformatlock" xmlns:w16se="http://schemas.microsoft.com/office/word/2015/wordml/symex" xmlns:wpg="http://schemas.microsoft.com/office/word/2010/wordprocessingGroup" xmlns:wpi="http://schemas.microsoft.com/office/word/2010/wordprocessingInk" xmlns:wne="http://schemas.microsoft.com/office/word/2006/wordml" xmlns:wps="http://schemas.microsoft.com/office/word/2010/wordprocessingShape" mc:Ignorable="w14 w15 w16se w16cid w16 w16cex w16sdtdh w16sdtfl w16du wp14">
   <w:p>
     <w:pPr>
       <w:pStyle w:val="Cabealho"/>
@@ -15088,7 +12500,7 @@
 </file>
 
 <file path=word/header2.xml><?xml version="1.0" encoding="utf-8"?>
-<w:hdr xmlns:wpc="http://schemas.microsoft.com/office/word/2010/wordprocessingCanvas" xmlns:cx="http://schemas.microsoft.com/office/drawing/2014/chartex" xmlns:cx1="http://schemas.microsoft.com/office/drawing/2015/9/8/chartex" xmlns:cx2="http://schemas.microsoft.com/office/drawing/2015/10/21/chartex" xmlns:cx3="http://schemas.microsoft.com/office/drawing/2016/5/9/chartex" xmlns:cx4="http://schemas.microsoft.com/office/drawing/2016/5/10/chartex" xmlns:cx5="http://schemas.microsoft.com/office/drawing/2016/5/11/chartex" xmlns:cx6="http://schemas.microsoft.com/office/drawing/2016/5/12/chartex" xmlns:cx7="http://schemas.microsoft.com/office/drawing/2016/5/13/chartex" xmlns:cx8="http://schemas.microsoft.com/office/drawing/2016/5/14/chartex" xmlns:mc="http://schemas.openxmlformats.org/markup-compatibility/2006" xmlns:aink="http://schemas.microsoft.com/office/drawing/2016/ink" xmlns:am3d="http://schemas.microsoft.com/office/drawing/2017/model3d" xmlns:o="urn:schemas-microsoft-com:office:office" xmlns:oel="http://schemas.microsoft.com/office/2019/extlst" xmlns:r="http://schemas.openxmlformats.org/officeDocument/2006/relationships" xmlns:m="http://schemas.openxmlformats.org/officeDocument/2006/math" xmlns:v="urn:schemas-microsoft-com:vml" xmlns:wp14="http://schemas.microsoft.com/office/word/2010/wordprocessingDrawing" xmlns:wp="http://schemas.openxmlformats.org/drawingml/2006/wordprocessingDrawing" xmlns:w10="urn:schemas-microsoft-com:office:word" xmlns:w="http://schemas.openxmlformats.org/wordprocessingml/2006/main" xmlns:w14="http://schemas.microsoft.com/office/word/2010/wordml" xmlns:w15="http://schemas.microsoft.com/office/word/2012/wordml" xmlns:w16cex="http://schemas.microsoft.com/office/word/2018/wordml/cex" xmlns:w16cid="http://schemas.microsoft.com/office/word/2016/wordml/cid" xmlns:w16="http://schemas.microsoft.com/office/word/2018/wordml" xmlns:w16du="http://schemas.microsoft.com/office/word/2023/wordml/word16du" xmlns:w16sdtdh="http://schemas.microsoft.com/office/word/2020/wordml/sdtdatahash" xmlns:w16sdtfl="http://schemas.microsoft.com/office/word/2024/wordml/sdtformatlock" xmlns:w16se="http://schemas.microsoft.com/office/word/2015/wordml/symex" xmlns:wpg="http://schemas.microsoft.com/office/word/2010/wordprocessingGroup" xmlns:wpi="http://schemas.microsoft.com/office/word/2010/wordprocessingInk" xmlns:wne="http://schemas.microsoft.com/office/word/2006/wordml" xmlns:wps="http://schemas.microsoft.com/office/word/2010/wordprocessingShape" mc:Ignorable="w14 w15 w16se w16cid w16 w16cex w16sdtdh w16sdtfl w16du wp14">
+<w:hdr xmlns:wpc="http://schemas.microsoft.com/office/word/2010/wordprocessingCanvas" xmlns:cx="http://schemas.microsoft.com/office/drawing/2014/chartex" xmlns:cx1="http://schemas.microsoft.com/office/drawing/2015/9/8/chartex" xmlns:cx2="http://schemas.microsoft.com/office/drawing/2015/10/21/chartex" xmlns:cx3="http://schemas.microsoft.com/office/drawing/2016/5/9/chartex" xmlns:cx4="http://schemas.microsoft.com/office/drawing/2016/5/10/chartex" xmlns:cx5="http://schemas.microsoft.com/office/drawing/2016/5/11/chartex" xmlns:cx6="http://schemas.microsoft.com/office/drawing/2016/5/12/chartex" xmlns:cx7="http://schemas.microsoft.com/office/drawing/2016/5/13/chartex" xmlns:cx8="http://schemas.microsoft.com/office/drawing/2016/5/14/chartex" xmlns:mc="http://schemas.openxmlformats.org/markup-compatibility/2006" xmlns:aink="http://schemas.microsoft.com/office/drawing/2016/ink" xmlns:am3d="http://schemas.microsoft.com/office/drawing/2017/model3d" xmlns:o="urn:schemas-microsoft-com:office:office" xmlns:oel="http://schemas.microsoft.com/office/2019/extlst" xmlns:r="http://schemas.openxmlformats.org/officeDocument/2006/relationships" xmlns:m="http://schemas.openxmlformats.org/officeDocument/2006/math" xmlns:v="urn:schemas-microsoft-com:vml" xmlns:wp14="http://schemas.microsoft.com/office/word/2010/wordprocessingDrawing" xmlns:wp="http://schemas.openxmlformats.org/drawingml/2006/wordprocessingDrawing" xmlns:w10="urn:schemas-microsoft-com:office:word" xmlns:w="http://schemas.openxmlformats.org/wordprocessingml/2006/main" xmlns:w14="http://schemas.microsoft.com/office/word/2010/wordml" xmlns:w15="http://schemas.microsoft.com/office/word/2012/wordml" xmlns:w16cei="http://schemas.microsoft.com/office/word/2026/wordml/cei" xmlns:w16cex="http://schemas.microsoft.com/office/word/2018/wordml/cex" xmlns:w16cid="http://schemas.microsoft.com/office/word/2016/wordml/cid" xmlns:w16="http://schemas.microsoft.com/office/word/2018/wordml" xmlns:w16du="http://schemas.microsoft.com/office/word/2023/wordml/word16du" xmlns:w16sdtdh="http://schemas.microsoft.com/office/word/2020/wordml/sdtdatahash" xmlns:w16sdtfl="http://schemas.microsoft.com/office/word/2024/wordml/sdtformatlock" xmlns:w16se="http://schemas.microsoft.com/office/word/2015/wordml/symex" xmlns:wpg="http://schemas.microsoft.com/office/word/2010/wordprocessingGroup" xmlns:wpi="http://schemas.microsoft.com/office/word/2010/wordprocessingInk" xmlns:wne="http://schemas.microsoft.com/office/word/2006/wordml" xmlns:wps="http://schemas.microsoft.com/office/word/2010/wordprocessingShape" mc:Ignorable="w14 w15 w16se w16cid w16 w16cex w16sdtdh w16sdtfl w16du wp14">
   <w:p>
     <w:pPr>
       <w:pStyle w:val="Cabealho"/>
@@ -15098,7 +12510,7 @@
 </file>
 
 <file path=word/header3.xml><?xml version="1.0" encoding="utf-8"?>
-<w:hdr xmlns:wpc="http://schemas.microsoft.com/office/word/2010/wordprocessingCanvas" xmlns:cx="http://schemas.microsoft.com/office/drawing/2014/chartex" xmlns:cx1="http://schemas.microsoft.com/office/drawing/2015/9/8/chartex" xmlns:cx2="http://schemas.microsoft.com/office/drawing/2015/10/21/chartex" xmlns:cx3="http://schemas.microsoft.com/office/drawing/2016/5/9/chartex" xmlns:cx4="http://schemas.microsoft.com/office/drawing/2016/5/10/chartex" xmlns:cx5="http://schemas.microsoft.com/office/drawing/2016/5/11/chartex" xmlns:cx6="http://schemas.microsoft.com/office/drawing/2016/5/12/chartex" xmlns:cx7="http://schemas.microsoft.com/office/drawing/2016/5/13/chartex" xmlns:cx8="http://schemas.microsoft.com/office/drawing/2016/5/14/chartex" xmlns:mc="http://schemas.openxmlformats.org/markup-compatibility/2006" xmlns:aink="http://schemas.microsoft.com/office/drawing/2016/ink" xmlns:am3d="http://schemas.microsoft.com/office/drawing/2017/model3d" xmlns:o="urn:schemas-microsoft-com:office:office" xmlns:oel="http://schemas.microsoft.com/office/2019/extlst" xmlns:r="http://schemas.openxmlformats.org/officeDocument/2006/relationships" xmlns:m="http://schemas.openxmlformats.org/officeDocument/2006/math" xmlns:v="urn:schemas-microsoft-com:vml" xmlns:wp14="http://schemas.microsoft.com/office/word/2010/wordprocessingDrawing" xmlns:wp="http://schemas.openxmlformats.org/drawingml/2006/wordprocessingDrawing" xmlns:w10="urn:schemas-microsoft-com:office:word" xmlns:w="http://schemas.openxmlformats.org/wordprocessingml/2006/main" xmlns:w14="http://schemas.microsoft.com/office/word/2010/wordml" xmlns:w15="http://schemas.microsoft.com/office/word/2012/wordml" xmlns:w16cex="http://schemas.microsoft.com/office/word/2018/wordml/cex" xmlns:w16cid="http://schemas.microsoft.com/office/word/2016/wordml/cid" xmlns:w16="http://schemas.microsoft.com/office/word/2018/wordml" xmlns:w16du="http://schemas.microsoft.com/office/word/2023/wordml/word16du" xmlns:w16sdtdh="http://schemas.microsoft.com/office/word/2020/wordml/sdtdatahash" xmlns:w16sdtfl="http://schemas.microsoft.com/office/word/2024/wordml/sdtformatlock" xmlns:w16se="http://schemas.microsoft.com/office/word/2015/wordml/symex" xmlns:wpg="http://schemas.microsoft.com/office/word/2010/wordprocessingGroup" xmlns:wpi="http://schemas.microsoft.com/office/word/2010/wordprocessingInk" xmlns:wne="http://schemas.microsoft.com/office/word/2006/wordml" xmlns:wps="http://schemas.microsoft.com/office/word/2010/wordprocessingShape" mc:Ignorable="w14 w15 w16se w16cid w16 w16cex w16sdtdh w16sdtfl w16du wp14">
+<w:hdr xmlns:wpc="http://schemas.microsoft.com/office/word/2010/wordprocessingCanvas" xmlns:cx="http://schemas.microsoft.com/office/drawing/2014/chartex" xmlns:cx1="http://schemas.microsoft.com/office/drawing/2015/9/8/chartex" xmlns:cx2="http://schemas.microsoft.com/office/drawing/2015/10/21/chartex" xmlns:cx3="http://schemas.microsoft.com/office/drawing/2016/5/9/chartex" xmlns:cx4="http://schemas.microsoft.com/office/drawing/2016/5/10/chartex" xmlns:cx5="http://schemas.microsoft.com/office/drawing/2016/5/11/chartex" xmlns:cx6="http://schemas.microsoft.com/office/drawing/2016/5/12/chartex" xmlns:cx7="http://schemas.microsoft.com/office/drawing/2016/5/13/chartex" xmlns:cx8="http://schemas.microsoft.com/office/drawing/2016/5/14/chartex" xmlns:mc="http://schemas.openxmlformats.org/markup-compatibility/2006" xmlns:aink="http://schemas.microsoft.com/office/drawing/2016/ink" xmlns:am3d="http://schemas.microsoft.com/office/drawing/2017/model3d" xmlns:o="urn:schemas-microsoft-com:office:office" xmlns:oel="http://schemas.microsoft.com/office/2019/extlst" xmlns:r="http://schemas.openxmlformats.org/officeDocument/2006/relationships" xmlns:m="http://schemas.openxmlformats.org/officeDocument/2006/math" xmlns:v="urn:schemas-microsoft-com:vml" xmlns:wp14="http://schemas.microsoft.com/office/word/2010/wordprocessingDrawing" xmlns:wp="http://schemas.openxmlformats.org/drawingml/2006/wordprocessingDrawing" xmlns:w10="urn:schemas-microsoft-com:office:word" xmlns:w="http://schemas.openxmlformats.org/wordprocessingml/2006/main" xmlns:w14="http://schemas.microsoft.com/office/word/2010/wordml" xmlns:w15="http://schemas.microsoft.com/office/word/2012/wordml" xmlns:w16cei="http://schemas.microsoft.com/office/word/2026/wordml/cei" xmlns:w16cex="http://schemas.microsoft.com/office/word/2018/wordml/cex" xmlns:w16cid="http://schemas.microsoft.com/office/word/2016/wordml/cid" xmlns:w16="http://schemas.microsoft.com/office/word/2018/wordml" xmlns:w16du="http://schemas.microsoft.com/office/word/2023/wordml/word16du" xmlns:w16sdtdh="http://schemas.microsoft.com/office/word/2020/wordml/sdtdatahash" xmlns:w16sdtfl="http://schemas.microsoft.com/office/word/2024/wordml/sdtformatlock" xmlns:w16se="http://schemas.microsoft.com/office/word/2015/wordml/symex" xmlns:wpg="http://schemas.microsoft.com/office/word/2010/wordprocessingGroup" xmlns:wpi="http://schemas.microsoft.com/office/word/2010/wordprocessingInk" xmlns:wne="http://schemas.microsoft.com/office/word/2006/wordml" xmlns:wps="http://schemas.microsoft.com/office/word/2010/wordprocessingShape" mc:Ignorable="w14 w15 w16se w16cid w16 w16cex w16sdtdh w16sdtfl w16du wp14">
   <w:p>
     <w:pPr>
       <w:pStyle w:val="Cabealho"/>
@@ -15108,9 +12520,9 @@
 </file>
 
 <file path=word/numbering.xml><?xml version="1.0" encoding="utf-8"?>
-<w:numbering xmlns:wpc="http://schemas.microsoft.com/office/word/2010/wordprocessingCanvas" xmlns:cx="http://schemas.microsoft.com/office/drawing/2014/chartex" xmlns:cx1="http://schemas.microsoft.com/office/drawing/2015/9/8/chartex" xmlns:cx2="http://schemas.microsoft.com/office/drawing/2015/10/21/chartex" xmlns:cx3="http://schemas.microsoft.com/office/drawing/2016/5/9/chartex" xmlns:cx4="http://schemas.microsoft.com/office/drawing/2016/5/10/chartex" xmlns:cx5="http://schemas.microsoft.com/office/drawing/2016/5/11/chartex" xmlns:cx6="http://schemas.microsoft.com/office/drawing/2016/5/12/chartex" xmlns:cx7="http://schemas.microsoft.com/office/drawing/2016/5/13/chartex" xmlns:cx8="http://schemas.microsoft.com/office/drawing/2016/5/14/chartex" xmlns:mc="http://schemas.openxmlformats.org/markup-compatibility/2006" xmlns:aink="http://schemas.microsoft.com/office/drawing/2016/ink" xmlns:am3d="http://schemas.microsoft.com/office/drawing/2017/model3d" xmlns:o="urn:schemas-microsoft-com:office:office" xmlns:oel="http://schemas.microsoft.com/office/2019/extlst" xmlns:r="http://schemas.openxmlformats.org/officeDocument/2006/relationships" xmlns:m="http://schemas.openxmlformats.org/officeDocument/2006/math" xmlns:v="urn:schemas-microsoft-com:vml" xmlns:wp14="http://schemas.microsoft.com/office/word/2010/wordprocessingDrawing" xmlns:wp="http://schemas.openxmlformats.org/drawingml/2006/wordprocessingDrawing" xmlns:w10="urn:schemas-microsoft-com:office:word" xmlns:w="http://schemas.openxmlformats.org/wordprocessingml/2006/main" xmlns:w14="http://schemas.microsoft.com/office/word/2010/wordml" xmlns:w15="http://schemas.microsoft.com/office/word/2012/wordml" xmlns:w16cex="http://schemas.microsoft.com/office/word/2018/wordml/cex" xmlns:w16cid="http://schemas.microsoft.com/office/word/2016/wordml/cid" xmlns:w16="http://schemas.microsoft.com/office/word/2018/wordml" xmlns:w16du="http://schemas.microsoft.com/office/word/2023/wordml/word16du" xmlns:w16sdtdh="http://schemas.microsoft.com/office/word/2020/wordml/sdtdatahash" xmlns:w16sdtfl="http://schemas.microsoft.com/office/word/2024/wordml/sdtformatlock" xmlns:w16se="http://schemas.microsoft.com/office/word/2015/wordml/symex" xmlns:wpg="http://schemas.microsoft.com/office/word/2010/wordprocessingGroup" xmlns:wpi="http://schemas.microsoft.com/office/word/2010/wordprocessingInk" xmlns:wne="http://schemas.microsoft.com/office/word/2006/wordml" xmlns:wps="http://schemas.microsoft.com/office/word/2010/wordprocessingShape" mc:Ignorable="w14 w15 w16se w16cid w16 w16cex w16sdtdh w16sdtfl w16du wp14">
+<w:numbering xmlns:wpc="http://schemas.microsoft.com/office/word/2010/wordprocessingCanvas" xmlns:cx="http://schemas.microsoft.com/office/drawing/2014/chartex" xmlns:cx1="http://schemas.microsoft.com/office/drawing/2015/9/8/chartex" xmlns:cx2="http://schemas.microsoft.com/office/drawing/2015/10/21/chartex" xmlns:cx3="http://schemas.microsoft.com/office/drawing/2016/5/9/chartex" xmlns:cx4="http://schemas.microsoft.com/office/drawing/2016/5/10/chartex" xmlns:cx5="http://schemas.microsoft.com/office/drawing/2016/5/11/chartex" xmlns:cx6="http://schemas.microsoft.com/office/drawing/2016/5/12/chartex" xmlns:cx7="http://schemas.microsoft.com/office/drawing/2016/5/13/chartex" xmlns:cx8="http://schemas.microsoft.com/office/drawing/2016/5/14/chartex" xmlns:mc="http://schemas.openxmlformats.org/markup-compatibility/2006" xmlns:aink="http://schemas.microsoft.com/office/drawing/2016/ink" xmlns:am3d="http://schemas.microsoft.com/office/drawing/2017/model3d" xmlns:o="urn:schemas-microsoft-com:office:office" xmlns:oel="http://schemas.microsoft.com/office/2019/extlst" xmlns:r="http://schemas.openxmlformats.org/officeDocument/2006/relationships" xmlns:m="http://schemas.openxmlformats.org/officeDocument/2006/math" xmlns:v="urn:schemas-microsoft-com:vml" xmlns:wp14="http://schemas.microsoft.com/office/word/2010/wordprocessingDrawing" xmlns:wp="http://schemas.openxmlformats.org/drawingml/2006/wordprocessingDrawing" xmlns:w10="urn:schemas-microsoft-com:office:word" xmlns:w="http://schemas.openxmlformats.org/wordprocessingml/2006/main" xmlns:w14="http://schemas.microsoft.com/office/word/2010/wordml" xmlns:w15="http://schemas.microsoft.com/office/word/2012/wordml" xmlns:w16cei="http://schemas.microsoft.com/office/word/2026/wordml/cei" xmlns:w16cex="http://schemas.microsoft.com/office/word/2018/wordml/cex" xmlns:w16cid="http://schemas.microsoft.com/office/word/2016/wordml/cid" xmlns:w16="http://schemas.microsoft.com/office/word/2018/wordml" xmlns:w16du="http://schemas.microsoft.com/office/word/2023/wordml/word16du" xmlns:w16sdtdh="http://schemas.microsoft.com/office/word/2020/wordml/sdtdatahash" xmlns:w16sdtfl="http://schemas.microsoft.com/office/word/2024/wordml/sdtformatlock" xmlns:w16se="http://schemas.microsoft.com/office/word/2015/wordml/symex" xmlns:wpg="http://schemas.microsoft.com/office/word/2010/wordprocessingGroup" xmlns:wpi="http://schemas.microsoft.com/office/word/2010/wordprocessingInk" xmlns:wne="http://schemas.microsoft.com/office/word/2006/wordml" xmlns:wps="http://schemas.microsoft.com/office/word/2010/wordprocessingShape" mc:Ignorable="w14 w15 w16se w16cid w16 w16cex w16sdtdh w16sdtfl w16du wp14">
   <w:abstractNum w:abstractNumId="0" w15:restartNumberingAfterBreak="0">
-    <w:nsid w:val="048B0990"/>
+    <w:nsid w:val="08A85195"/>
     <w:multiLevelType w:val="singleLevel"/>
     <w:tmpl w:val="04160001"/>
     <w:lvl w:ilvl="0">
@@ -15127,7 +12539,7 @@
     </w:lvl>
   </w:abstractNum>
   <w:abstractNum w:abstractNumId="1" w15:restartNumberingAfterBreak="0">
-    <w:nsid w:val="0A952818"/>
+    <w:nsid w:val="0B6C69C5"/>
     <w:multiLevelType w:val="singleLevel"/>
     <w:tmpl w:val="04160001"/>
     <w:lvl w:ilvl="0">
@@ -15144,7 +12556,7 @@
     </w:lvl>
   </w:abstractNum>
   <w:abstractNum w:abstractNumId="2" w15:restartNumberingAfterBreak="0">
-    <w:nsid w:val="0D7F79A0"/>
+    <w:nsid w:val="14302725"/>
     <w:multiLevelType w:val="singleLevel"/>
     <w:tmpl w:val="04160001"/>
     <w:lvl w:ilvl="0">
@@ -15161,7 +12573,7 @@
     </w:lvl>
   </w:abstractNum>
   <w:abstractNum w:abstractNumId="3" w15:restartNumberingAfterBreak="0">
-    <w:nsid w:val="210863AB"/>
+    <w:nsid w:val="29EE486D"/>
     <w:multiLevelType w:val="singleLevel"/>
     <w:tmpl w:val="04160001"/>
     <w:lvl w:ilvl="0">
@@ -15178,7 +12590,7 @@
     </w:lvl>
   </w:abstractNum>
   <w:abstractNum w:abstractNumId="4" w15:restartNumberingAfterBreak="0">
-    <w:nsid w:val="2BC14612"/>
+    <w:nsid w:val="2E9D7C69"/>
     <w:multiLevelType w:val="singleLevel"/>
     <w:tmpl w:val="04160001"/>
     <w:lvl w:ilvl="0">
@@ -15195,7 +12607,7 @@
     </w:lvl>
   </w:abstractNum>
   <w:abstractNum w:abstractNumId="5" w15:restartNumberingAfterBreak="0">
-    <w:nsid w:val="2D5B40DF"/>
+    <w:nsid w:val="35106ED8"/>
     <w:multiLevelType w:val="singleLevel"/>
     <w:tmpl w:val="04160001"/>
     <w:lvl w:ilvl="0">
@@ -15212,7 +12624,7 @@
     </w:lvl>
   </w:abstractNum>
   <w:abstractNum w:abstractNumId="6" w15:restartNumberingAfterBreak="0">
-    <w:nsid w:val="2F4F2BBA"/>
+    <w:nsid w:val="4F443243"/>
     <w:multiLevelType w:val="singleLevel"/>
     <w:tmpl w:val="04160001"/>
     <w:lvl w:ilvl="0">
@@ -15229,7 +12641,7 @@
     </w:lvl>
   </w:abstractNum>
   <w:abstractNum w:abstractNumId="7" w15:restartNumberingAfterBreak="0">
-    <w:nsid w:val="315E24F1"/>
+    <w:nsid w:val="51753937"/>
     <w:multiLevelType w:val="singleLevel"/>
     <w:tmpl w:val="04160001"/>
     <w:lvl w:ilvl="0">
@@ -15246,7 +12658,7 @@
     </w:lvl>
   </w:abstractNum>
   <w:abstractNum w:abstractNumId="8" w15:restartNumberingAfterBreak="0">
-    <w:nsid w:val="3B515F8C"/>
+    <w:nsid w:val="57110083"/>
     <w:multiLevelType w:val="singleLevel"/>
     <w:tmpl w:val="04160001"/>
     <w:lvl w:ilvl="0">
@@ -15263,7 +12675,7 @@
     </w:lvl>
   </w:abstractNum>
   <w:abstractNum w:abstractNumId="9" w15:restartNumberingAfterBreak="0">
-    <w:nsid w:val="417D1581"/>
+    <w:nsid w:val="5BC273B0"/>
     <w:multiLevelType w:val="singleLevel"/>
     <w:tmpl w:val="04160001"/>
     <w:lvl w:ilvl="0">
@@ -15280,7 +12692,7 @@
     </w:lvl>
   </w:abstractNum>
   <w:abstractNum w:abstractNumId="10" w15:restartNumberingAfterBreak="0">
-    <w:nsid w:val="438E63FD"/>
+    <w:nsid w:val="5BF04DBC"/>
     <w:multiLevelType w:val="singleLevel"/>
     <w:tmpl w:val="04160001"/>
     <w:lvl w:ilvl="0">
@@ -15297,7 +12709,7 @@
     </w:lvl>
   </w:abstractNum>
   <w:abstractNum w:abstractNumId="11" w15:restartNumberingAfterBreak="0">
-    <w:nsid w:val="44220D27"/>
+    <w:nsid w:val="66800ED6"/>
     <w:multiLevelType w:val="singleLevel"/>
     <w:tmpl w:val="04160001"/>
     <w:lvl w:ilvl="0">
@@ -15314,7 +12726,7 @@
     </w:lvl>
   </w:abstractNum>
   <w:abstractNum w:abstractNumId="12" w15:restartNumberingAfterBreak="0">
-    <w:nsid w:val="4E3620B7"/>
+    <w:nsid w:val="70F35B09"/>
     <w:multiLevelType w:val="singleLevel"/>
     <w:tmpl w:val="04160001"/>
     <w:lvl w:ilvl="0">
@@ -15331,7 +12743,7 @@
     </w:lvl>
   </w:abstractNum>
   <w:abstractNum w:abstractNumId="13" w15:restartNumberingAfterBreak="0">
-    <w:nsid w:val="61CD34F8"/>
+    <w:nsid w:val="7D8B1433"/>
     <w:multiLevelType w:val="singleLevel"/>
     <w:tmpl w:val="04160001"/>
     <w:lvl w:ilvl="0">
@@ -15347,47 +12759,47 @@
       </w:rPr>
     </w:lvl>
   </w:abstractNum>
-  <w:num w:numId="1" w16cid:durableId="896433774">
+  <w:num w:numId="1" w16cid:durableId="794370497">
+    <w:abstractNumId w:val="3"/>
+  </w:num>
+  <w:num w:numId="2" w16cid:durableId="1976180146">
+    <w:abstractNumId w:val="12"/>
+  </w:num>
+  <w:num w:numId="3" w16cid:durableId="527763970">
+    <w:abstractNumId w:val="4"/>
+  </w:num>
+  <w:num w:numId="4" w16cid:durableId="786005892">
+    <w:abstractNumId w:val="7"/>
+  </w:num>
+  <w:num w:numId="5" w16cid:durableId="334575484">
+    <w:abstractNumId w:val="9"/>
+  </w:num>
+  <w:num w:numId="6" w16cid:durableId="122770267">
+    <w:abstractNumId w:val="1"/>
+  </w:num>
+  <w:num w:numId="7" w16cid:durableId="2067491939">
+    <w:abstractNumId w:val="11"/>
+  </w:num>
+  <w:num w:numId="8" w16cid:durableId="658919684">
+    <w:abstractNumId w:val="10"/>
+  </w:num>
+  <w:num w:numId="9" w16cid:durableId="1228036615">
+    <w:abstractNumId w:val="13"/>
+  </w:num>
+  <w:num w:numId="10" w16cid:durableId="2116290044">
+    <w:abstractNumId w:val="6"/>
+  </w:num>
+  <w:num w:numId="11" w16cid:durableId="449475265">
+    <w:abstractNumId w:val="5"/>
+  </w:num>
+  <w:num w:numId="12" w16cid:durableId="349183878">
+    <w:abstractNumId w:val="0"/>
+  </w:num>
+  <w:num w:numId="13" w16cid:durableId="988050670">
     <w:abstractNumId w:val="2"/>
   </w:num>
-  <w:num w:numId="2" w16cid:durableId="280310914">
-    <w:abstractNumId w:val="5"/>
-  </w:num>
-  <w:num w:numId="3" w16cid:durableId="2130270128">
+  <w:num w:numId="14" w16cid:durableId="1807894881">
     <w:abstractNumId w:val="8"/>
-  </w:num>
-  <w:num w:numId="4" w16cid:durableId="856651518">
-    <w:abstractNumId w:val="7"/>
-  </w:num>
-  <w:num w:numId="5" w16cid:durableId="120078737">
-    <w:abstractNumId w:val="3"/>
-  </w:num>
-  <w:num w:numId="6" w16cid:durableId="1333221457">
-    <w:abstractNumId w:val="13"/>
-  </w:num>
-  <w:num w:numId="7" w16cid:durableId="1532651042">
-    <w:abstractNumId w:val="0"/>
-  </w:num>
-  <w:num w:numId="8" w16cid:durableId="81149132">
-    <w:abstractNumId w:val="6"/>
-  </w:num>
-  <w:num w:numId="9" w16cid:durableId="1639841896">
-    <w:abstractNumId w:val="11"/>
-  </w:num>
-  <w:num w:numId="10" w16cid:durableId="7610637">
-    <w:abstractNumId w:val="4"/>
-  </w:num>
-  <w:num w:numId="11" w16cid:durableId="148863716">
-    <w:abstractNumId w:val="10"/>
-  </w:num>
-  <w:num w:numId="12" w16cid:durableId="1612282309">
-    <w:abstractNumId w:val="12"/>
-  </w:num>
-  <w:num w:numId="13" w16cid:durableId="1622884209">
-    <w:abstractNumId w:val="1"/>
-  </w:num>
-  <w:num w:numId="14" w16cid:durableId="1484931564">
-    <w:abstractNumId w:val="9"/>
   </w:num>
 </w:numbering>
 </file>
@@ -15800,7 +13212,7 @@
     <w:link w:val="Ttulo1Char"/>
     <w:uiPriority w:val="9"/>
     <w:qFormat/>
-    <w:rsid w:val="00B379E3"/>
+    <w:rsid w:val="00B26FBA"/>
     <w:pPr>
       <w:keepNext/>
       <w:keepLines/>
@@ -15822,7 +13234,7 @@
     <w:uiPriority w:val="9"/>
     <w:unhideWhenUsed/>
     <w:qFormat/>
-    <w:rsid w:val="00B379E3"/>
+    <w:rsid w:val="00B26FBA"/>
     <w:pPr>
       <w:keepNext/>
       <w:keepLines/>
@@ -15845,7 +13257,7 @@
     <w:semiHidden/>
     <w:unhideWhenUsed/>
     <w:qFormat/>
-    <w:rsid w:val="00B379E3"/>
+    <w:rsid w:val="00B26FBA"/>
     <w:pPr>
       <w:keepNext/>
       <w:keepLines/>
@@ -15868,7 +13280,7 @@
     <w:semiHidden/>
     <w:unhideWhenUsed/>
     <w:qFormat/>
-    <w:rsid w:val="00B379E3"/>
+    <w:rsid w:val="00B26FBA"/>
     <w:pPr>
       <w:keepNext/>
       <w:keepLines/>
@@ -15891,7 +13303,7 @@
     <w:semiHidden/>
     <w:unhideWhenUsed/>
     <w:qFormat/>
-    <w:rsid w:val="00B379E3"/>
+    <w:rsid w:val="00B26FBA"/>
     <w:pPr>
       <w:keepNext/>
       <w:keepLines/>
@@ -15912,7 +13324,7 @@
     <w:semiHidden/>
     <w:unhideWhenUsed/>
     <w:qFormat/>
-    <w:rsid w:val="00B379E3"/>
+    <w:rsid w:val="00B26FBA"/>
     <w:pPr>
       <w:keepNext/>
       <w:keepLines/>
@@ -15935,7 +13347,7 @@
     <w:semiHidden/>
     <w:unhideWhenUsed/>
     <w:qFormat/>
-    <w:rsid w:val="00B379E3"/>
+    <w:rsid w:val="00B26FBA"/>
     <w:pPr>
       <w:keepNext/>
       <w:keepLines/>
@@ -15956,7 +13368,7 @@
     <w:semiHidden/>
     <w:unhideWhenUsed/>
     <w:qFormat/>
-    <w:rsid w:val="00B379E3"/>
+    <w:rsid w:val="00B26FBA"/>
     <w:pPr>
       <w:keepNext/>
       <w:keepLines/>
@@ -15979,7 +13391,7 @@
     <w:semiHidden/>
     <w:unhideWhenUsed/>
     <w:qFormat/>
-    <w:rsid w:val="00B379E3"/>
+    <w:rsid w:val="00B26FBA"/>
     <w:pPr>
       <w:keepNext/>
       <w:keepLines/>
@@ -16023,7 +13435,7 @@
     <w:basedOn w:val="Fontepargpadro"/>
     <w:link w:val="Ttulo1"/>
     <w:uiPriority w:val="9"/>
-    <w:rsid w:val="00B379E3"/>
+    <w:rsid w:val="00B26FBA"/>
     <w:rPr>
       <w:rFonts w:asciiTheme="majorHAnsi" w:eastAsiaTheme="majorEastAsia" w:hAnsiTheme="majorHAnsi" w:cstheme="majorBidi"/>
       <w:color w:val="0F4761" w:themeColor="accent1" w:themeShade="BF"/>
@@ -16036,7 +13448,7 @@
     <w:basedOn w:val="Fontepargpadro"/>
     <w:link w:val="Ttulo2"/>
     <w:uiPriority w:val="9"/>
-    <w:rsid w:val="00B379E3"/>
+    <w:rsid w:val="00B26FBA"/>
     <w:rPr>
       <w:rFonts w:asciiTheme="majorHAnsi" w:eastAsiaTheme="majorEastAsia" w:hAnsiTheme="majorHAnsi" w:cstheme="majorBidi"/>
       <w:color w:val="0F4761" w:themeColor="accent1" w:themeShade="BF"/>
@@ -16050,7 +13462,7 @@
     <w:link w:val="Ttulo3"/>
     <w:uiPriority w:val="9"/>
     <w:semiHidden/>
-    <w:rsid w:val="00B379E3"/>
+    <w:rsid w:val="00B26FBA"/>
     <w:rPr>
       <w:rFonts w:eastAsiaTheme="majorEastAsia" w:cstheme="majorBidi"/>
       <w:color w:val="0F4761" w:themeColor="accent1" w:themeShade="BF"/>
@@ -16064,7 +13476,7 @@
     <w:link w:val="Ttulo4"/>
     <w:uiPriority w:val="9"/>
     <w:semiHidden/>
-    <w:rsid w:val="00B379E3"/>
+    <w:rsid w:val="00B26FBA"/>
     <w:rPr>
       <w:rFonts w:eastAsiaTheme="majorEastAsia" w:cstheme="majorBidi"/>
       <w:i/>
@@ -16078,7 +13490,7 @@
     <w:link w:val="Ttulo5"/>
     <w:uiPriority w:val="9"/>
     <w:semiHidden/>
-    <w:rsid w:val="00B379E3"/>
+    <w:rsid w:val="00B26FBA"/>
     <w:rPr>
       <w:rFonts w:eastAsiaTheme="majorEastAsia" w:cstheme="majorBidi"/>
       <w:color w:val="0F4761" w:themeColor="accent1" w:themeShade="BF"/>
@@ -16090,7 +13502,7 @@
     <w:link w:val="Ttulo6"/>
     <w:uiPriority w:val="9"/>
     <w:semiHidden/>
-    <w:rsid w:val="00B379E3"/>
+    <w:rsid w:val="00B26FBA"/>
     <w:rPr>
       <w:rFonts w:eastAsiaTheme="majorEastAsia" w:cstheme="majorBidi"/>
       <w:i/>
@@ -16104,7 +13516,7 @@
     <w:link w:val="Ttulo7"/>
     <w:uiPriority w:val="9"/>
     <w:semiHidden/>
-    <w:rsid w:val="00B379E3"/>
+    <w:rsid w:val="00B26FBA"/>
     <w:rPr>
       <w:rFonts w:eastAsiaTheme="majorEastAsia" w:cstheme="majorBidi"/>
       <w:color w:val="595959" w:themeColor="text1" w:themeTint="A6"/>
@@ -16116,7 +13528,7 @@
     <w:link w:val="Ttulo8"/>
     <w:uiPriority w:val="9"/>
     <w:semiHidden/>
-    <w:rsid w:val="00B379E3"/>
+    <w:rsid w:val="00B26FBA"/>
     <w:rPr>
       <w:rFonts w:eastAsiaTheme="majorEastAsia" w:cstheme="majorBidi"/>
       <w:i/>
@@ -16130,7 +13542,7 @@
     <w:link w:val="Ttulo9"/>
     <w:uiPriority w:val="9"/>
     <w:semiHidden/>
-    <w:rsid w:val="00B379E3"/>
+    <w:rsid w:val="00B26FBA"/>
     <w:rPr>
       <w:rFonts w:eastAsiaTheme="majorEastAsia" w:cstheme="majorBidi"/>
       <w:color w:val="272727" w:themeColor="text1" w:themeTint="D8"/>
@@ -16143,7 +13555,7 @@
     <w:link w:val="TtuloChar"/>
     <w:uiPriority w:val="10"/>
     <w:qFormat/>
-    <w:rsid w:val="00B379E3"/>
+    <w:rsid w:val="00B26FBA"/>
     <w:pPr>
       <w:spacing w:after="80" w:line="240" w:lineRule="auto"/>
       <w:contextualSpacing/>
@@ -16161,7 +13573,7 @@
     <w:basedOn w:val="Fontepargpadro"/>
     <w:link w:val="Ttulo"/>
     <w:uiPriority w:val="10"/>
-    <w:rsid w:val="00B379E3"/>
+    <w:rsid w:val="00B26FBA"/>
     <w:rPr>
       <w:rFonts w:asciiTheme="majorHAnsi" w:eastAsiaTheme="majorEastAsia" w:hAnsiTheme="majorHAnsi" w:cstheme="majorBidi"/>
       <w:spacing w:val="-10"/>
@@ -16177,7 +13589,7 @@
     <w:link w:val="SubttuloChar"/>
     <w:uiPriority w:val="11"/>
     <w:qFormat/>
-    <w:rsid w:val="00B379E3"/>
+    <w:rsid w:val="00B26FBA"/>
     <w:pPr>
       <w:numPr>
         <w:ilvl w:val="1"/>
@@ -16196,7 +13608,7 @@
     <w:basedOn w:val="Fontepargpadro"/>
     <w:link w:val="Subttulo"/>
     <w:uiPriority w:val="11"/>
-    <w:rsid w:val="00B379E3"/>
+    <w:rsid w:val="00B26FBA"/>
     <w:rPr>
       <w:rFonts w:eastAsiaTheme="majorEastAsia" w:cstheme="majorBidi"/>
       <w:color w:val="595959" w:themeColor="text1" w:themeTint="A6"/>
@@ -16212,7 +13624,7 @@
     <w:link w:val="CitaoChar"/>
     <w:uiPriority w:val="29"/>
     <w:qFormat/>
-    <w:rsid w:val="00B379E3"/>
+    <w:rsid w:val="00B26FBA"/>
     <w:pPr>
       <w:spacing w:before="160"/>
       <w:jc w:val="center"/>
@@ -16228,7 +13640,7 @@
     <w:basedOn w:val="Fontepargpadro"/>
     <w:link w:val="Citao"/>
     <w:uiPriority w:val="29"/>
-    <w:rsid w:val="00B379E3"/>
+    <w:rsid w:val="00B26FBA"/>
     <w:rPr>
       <w:i/>
       <w:iCs/>
@@ -16240,7 +13652,7 @@
     <w:basedOn w:val="Normal"/>
     <w:uiPriority w:val="34"/>
     <w:qFormat/>
-    <w:rsid w:val="00B379E3"/>
+    <w:rsid w:val="00B26FBA"/>
     <w:pPr>
       <w:ind w:left="720"/>
       <w:contextualSpacing/>
@@ -16251,7 +13663,7 @@
     <w:basedOn w:val="Fontepargpadro"/>
     <w:uiPriority w:val="21"/>
     <w:qFormat/>
-    <w:rsid w:val="00B379E3"/>
+    <w:rsid w:val="00B26FBA"/>
     <w:rPr>
       <w:i/>
       <w:iCs/>
@@ -16265,7 +13677,7 @@
     <w:link w:val="CitaoIntensaChar"/>
     <w:uiPriority w:val="30"/>
     <w:qFormat/>
-    <w:rsid w:val="00B379E3"/>
+    <w:rsid w:val="00B26FBA"/>
     <w:pPr>
       <w:pBdr>
         <w:top w:val="single" w:sz="4" w:space="10" w:color="0F4761" w:themeColor="accent1" w:themeShade="BF"/>
@@ -16286,7 +13698,7 @@
     <w:basedOn w:val="Fontepargpadro"/>
     <w:link w:val="CitaoIntensa"/>
     <w:uiPriority w:val="30"/>
-    <w:rsid w:val="00B379E3"/>
+    <w:rsid w:val="00B26FBA"/>
     <w:rPr>
       <w:i/>
       <w:iCs/>
@@ -16298,7 +13710,7 @@
     <w:basedOn w:val="Fontepargpadro"/>
     <w:uiPriority w:val="32"/>
     <w:qFormat/>
-    <w:rsid w:val="00B379E3"/>
+    <w:rsid w:val="00B26FBA"/>
     <w:rPr>
       <w:b/>
       <w:bCs/>
@@ -16313,7 +13725,7 @@
     <w:link w:val="CabealhoChar"/>
     <w:uiPriority w:val="99"/>
     <w:unhideWhenUsed/>
-    <w:rsid w:val="00B379E3"/>
+    <w:rsid w:val="00B26FBA"/>
     <w:pPr>
       <w:tabs>
         <w:tab w:val="center" w:pos="4252"/>
@@ -16327,7 +13739,7 @@
     <w:basedOn w:val="Fontepargpadro"/>
     <w:link w:val="Cabealho"/>
     <w:uiPriority w:val="99"/>
-    <w:rsid w:val="00B379E3"/>
+    <w:rsid w:val="00B26FBA"/>
   </w:style>
   <w:style w:type="paragraph" w:styleId="Rodap">
     <w:name w:val="footer"/>
@@ -16335,7 +13747,7 @@
     <w:link w:val="RodapChar"/>
     <w:uiPriority w:val="99"/>
     <w:unhideWhenUsed/>
-    <w:rsid w:val="00B379E3"/>
+    <w:rsid w:val="00B26FBA"/>
     <w:pPr>
       <w:tabs>
         <w:tab w:val="center" w:pos="4252"/>
@@ -16349,7 +13761,7 @@
     <w:basedOn w:val="Fontepargpadro"/>
     <w:link w:val="Rodap"/>
     <w:uiPriority w:val="99"/>
-    <w:rsid w:val="00B379E3"/>
+    <w:rsid w:val="00B26FBA"/>
   </w:style>
   <w:style w:type="paragraph" w:styleId="Sumrio1">
     <w:name w:val="toc 1"/>
@@ -16358,7 +13770,7 @@
     <w:autoRedefine/>
     <w:uiPriority w:val="39"/>
     <w:unhideWhenUsed/>
-    <w:rsid w:val="00B379E3"/>
+    <w:rsid w:val="00B26FBA"/>
     <w:pPr>
       <w:spacing w:after="100"/>
     </w:pPr>
@@ -16370,7 +13782,7 @@
     <w:autoRedefine/>
     <w:uiPriority w:val="39"/>
     <w:unhideWhenUsed/>
-    <w:rsid w:val="00B379E3"/>
+    <w:rsid w:val="00B26FBA"/>
     <w:pPr>
       <w:spacing w:after="100"/>
       <w:ind w:left="240"/>

</xml_diff>

<commit_message>
Adiciona Gate 2 (Pactuacao) ao Relatorio de Entregas e Beneficios
Replica o padrao do Gate 1 (Solicitacao de Demanda): status
Pendente de pactuacao/Pactuado controlado apenas pelo Admin, com
data e aprovador preenchidos automaticamente e trava de edicao de
todo o relatorio enquanto pactuado. Atualiza Regras de Acesso e
Manual de Uso (v2.2) para refletir a nova regra e o novo print.

Co-Authored-By: Claude Sonnet 5 <noreply@anthropic.com>
</commit_message>
<xml_diff>
--- a/Manual de Uso - Ferramenta de Gestao de Projetos.docx
+++ b/Manual de Uso - Ferramenta de Gestao de Projetos.docx
@@ -129,7 +129,7 @@
           <w:color w:val="6A6A70"/>
           <w:sz w:val="22"/>
         </w:rPr>
-        <w:t>Versao 2.1 - 29 de julho de 2026 (substitui a versao 2.0 de 28/07/2026)</w:t>
+        <w:t>Versao 2.2 - 29 de julho de 2026 (substitui a versao 2.1 de 29/07/2026)</w:t>
       </w:r>
     </w:p>
     <w:p>
@@ -229,7 +229,7 @@
         <w:rPr>
           <w:noProof/>
         </w:rPr>
-        <w:instrText xml:space="preserve"> PAGEREF _Toc236229013 \h </w:instrText>
+        <w:instrText xml:space="preserve"> PAGEREF _Toc236231984 \h </w:instrText>
       </w:r>
       <w:r>
         <w:rPr>
@@ -290,7 +290,7 @@
         <w:rPr>
           <w:noProof/>
         </w:rPr>
-        <w:instrText xml:space="preserve"> PAGEREF _Toc236229014 \h </w:instrText>
+        <w:instrText xml:space="preserve"> PAGEREF _Toc236231985 \h </w:instrText>
       </w:r>
       <w:r>
         <w:rPr>
@@ -351,7 +351,7 @@
         <w:rPr>
           <w:noProof/>
         </w:rPr>
-        <w:instrText xml:space="preserve"> PAGEREF _Toc236229015 \h </w:instrText>
+        <w:instrText xml:space="preserve"> PAGEREF _Toc236231986 \h </w:instrText>
       </w:r>
       <w:r>
         <w:rPr>
@@ -412,7 +412,7 @@
         <w:rPr>
           <w:noProof/>
         </w:rPr>
-        <w:instrText xml:space="preserve"> PAGEREF _Toc236229016 \h </w:instrText>
+        <w:instrText xml:space="preserve"> PAGEREF _Toc236231987 \h </w:instrText>
       </w:r>
       <w:r>
         <w:rPr>
@@ -429,7 +429,7 @@
         <w:rPr>
           <w:noProof/>
         </w:rPr>
-        <w:t>5</w:t>
+        <w:t>6</w:t>
       </w:r>
       <w:r>
         <w:rPr>
@@ -473,7 +473,7 @@
         <w:rPr>
           <w:noProof/>
         </w:rPr>
-        <w:instrText xml:space="preserve"> PAGEREF _Toc236229017 \h </w:instrText>
+        <w:instrText xml:space="preserve"> PAGEREF _Toc236231988 \h </w:instrText>
       </w:r>
       <w:r>
         <w:rPr>
@@ -490,7 +490,7 @@
         <w:rPr>
           <w:noProof/>
         </w:rPr>
-        <w:t>6</w:t>
+        <w:t>7</w:t>
       </w:r>
       <w:r>
         <w:rPr>
@@ -534,7 +534,7 @@
         <w:rPr>
           <w:noProof/>
         </w:rPr>
-        <w:instrText xml:space="preserve"> PAGEREF _Toc236229018 \h </w:instrText>
+        <w:instrText xml:space="preserve"> PAGEREF _Toc236231989 \h </w:instrText>
       </w:r>
       <w:r>
         <w:rPr>
@@ -595,7 +595,7 @@
         <w:rPr>
           <w:noProof/>
         </w:rPr>
-        <w:instrText xml:space="preserve"> PAGEREF _Toc236229019 \h </w:instrText>
+        <w:instrText xml:space="preserve"> PAGEREF _Toc236231990 \h </w:instrText>
       </w:r>
       <w:r>
         <w:rPr>
@@ -656,7 +656,7 @@
         <w:rPr>
           <w:noProof/>
         </w:rPr>
-        <w:instrText xml:space="preserve"> PAGEREF _Toc236229020 \h </w:instrText>
+        <w:instrText xml:space="preserve"> PAGEREF _Toc236231991 \h </w:instrText>
       </w:r>
       <w:r>
         <w:rPr>
@@ -717,7 +717,7 @@
         <w:rPr>
           <w:noProof/>
         </w:rPr>
-        <w:instrText xml:space="preserve"> PAGEREF _Toc236229021 \h </w:instrText>
+        <w:instrText xml:space="preserve"> PAGEREF _Toc236231992 \h </w:instrText>
       </w:r>
       <w:r>
         <w:rPr>
@@ -778,7 +778,7 @@
         <w:rPr>
           <w:noProof/>
         </w:rPr>
-        <w:instrText xml:space="preserve"> PAGEREF _Toc236229022 \h </w:instrText>
+        <w:instrText xml:space="preserve"> PAGEREF _Toc236231993 \h </w:instrText>
       </w:r>
       <w:r>
         <w:rPr>
@@ -839,7 +839,7 @@
         <w:rPr>
           <w:noProof/>
         </w:rPr>
-        <w:instrText xml:space="preserve"> PAGEREF _Toc236229023 \h </w:instrText>
+        <w:instrText xml:space="preserve"> PAGEREF _Toc236231994 \h </w:instrText>
       </w:r>
       <w:r>
         <w:rPr>
@@ -900,7 +900,7 @@
         <w:rPr>
           <w:noProof/>
         </w:rPr>
-        <w:instrText xml:space="preserve"> PAGEREF _Toc236229024 \h </w:instrText>
+        <w:instrText xml:space="preserve"> PAGEREF _Toc236231995 \h </w:instrText>
       </w:r>
       <w:r>
         <w:rPr>
@@ -961,7 +961,7 @@
         <w:rPr>
           <w:noProof/>
         </w:rPr>
-        <w:instrText xml:space="preserve"> PAGEREF _Toc236229025 \h </w:instrText>
+        <w:instrText xml:space="preserve"> PAGEREF _Toc236231996 \h </w:instrText>
       </w:r>
       <w:r>
         <w:rPr>
@@ -1022,7 +1022,7 @@
         <w:rPr>
           <w:noProof/>
         </w:rPr>
-        <w:instrText xml:space="preserve"> PAGEREF _Toc236229026 \h </w:instrText>
+        <w:instrText xml:space="preserve"> PAGEREF _Toc236231997 \h </w:instrText>
       </w:r>
       <w:r>
         <w:rPr>
@@ -1083,7 +1083,7 @@
         <w:rPr>
           <w:noProof/>
         </w:rPr>
-        <w:instrText xml:space="preserve"> PAGEREF _Toc236229027 \h </w:instrText>
+        <w:instrText xml:space="preserve"> PAGEREF _Toc236231998 \h </w:instrText>
       </w:r>
       <w:r>
         <w:rPr>
@@ -1144,7 +1144,7 @@
         <w:rPr>
           <w:noProof/>
         </w:rPr>
-        <w:instrText xml:space="preserve"> PAGEREF _Toc236229028 \h </w:instrText>
+        <w:instrText xml:space="preserve"> PAGEREF _Toc236231999 \h </w:instrText>
       </w:r>
       <w:r>
         <w:rPr>
@@ -1205,7 +1205,7 @@
         <w:rPr>
           <w:noProof/>
         </w:rPr>
-        <w:instrText xml:space="preserve"> PAGEREF _Toc236229029 \h </w:instrText>
+        <w:instrText xml:space="preserve"> PAGEREF _Toc236232000 \h </w:instrText>
       </w:r>
       <w:r>
         <w:rPr>
@@ -1266,7 +1266,7 @@
         <w:rPr>
           <w:noProof/>
         </w:rPr>
-        <w:instrText xml:space="preserve"> PAGEREF _Toc236229030 \h </w:instrText>
+        <w:instrText xml:space="preserve"> PAGEREF _Toc236232001 \h </w:instrText>
       </w:r>
       <w:r>
         <w:rPr>
@@ -1327,7 +1327,7 @@
         <w:rPr>
           <w:noProof/>
         </w:rPr>
-        <w:instrText xml:space="preserve"> PAGEREF _Toc236229031 \h </w:instrText>
+        <w:instrText xml:space="preserve"> PAGEREF _Toc236232002 \h </w:instrText>
       </w:r>
       <w:r>
         <w:rPr>
@@ -1388,7 +1388,7 @@
         <w:rPr>
           <w:noProof/>
         </w:rPr>
-        <w:instrText xml:space="preserve"> PAGEREF _Toc236229032 \h </w:instrText>
+        <w:instrText xml:space="preserve"> PAGEREF _Toc236232003 \h </w:instrText>
       </w:r>
       <w:r>
         <w:rPr>
@@ -1449,7 +1449,7 @@
         <w:rPr>
           <w:noProof/>
         </w:rPr>
-        <w:instrText xml:space="preserve"> PAGEREF _Toc236229033 \h </w:instrText>
+        <w:instrText xml:space="preserve"> PAGEREF _Toc236232004 \h </w:instrText>
       </w:r>
       <w:r>
         <w:rPr>
@@ -1510,7 +1510,7 @@
         <w:rPr>
           <w:noProof/>
         </w:rPr>
-        <w:instrText xml:space="preserve"> PAGEREF _Toc236229034 \h </w:instrText>
+        <w:instrText xml:space="preserve"> PAGEREF _Toc236232005 \h </w:instrText>
       </w:r>
       <w:r>
         <w:rPr>
@@ -1571,7 +1571,7 @@
         <w:rPr>
           <w:noProof/>
         </w:rPr>
-        <w:instrText xml:space="preserve"> PAGEREF _Toc236229035 \h </w:instrText>
+        <w:instrText xml:space="preserve"> PAGEREF _Toc236232006 \h </w:instrText>
       </w:r>
       <w:r>
         <w:rPr>
@@ -1632,7 +1632,7 @@
         <w:rPr>
           <w:noProof/>
         </w:rPr>
-        <w:instrText xml:space="preserve"> PAGEREF _Toc236229036 \h </w:instrText>
+        <w:instrText xml:space="preserve"> PAGEREF _Toc236232007 \h </w:instrText>
       </w:r>
       <w:r>
         <w:rPr>
@@ -1693,7 +1693,7 @@
         <w:rPr>
           <w:noProof/>
         </w:rPr>
-        <w:instrText xml:space="preserve"> PAGEREF _Toc236229037 \h </w:instrText>
+        <w:instrText xml:space="preserve"> PAGEREF _Toc236232008 \h </w:instrText>
       </w:r>
       <w:r>
         <w:rPr>
@@ -1754,7 +1754,7 @@
         <w:rPr>
           <w:noProof/>
         </w:rPr>
-        <w:instrText xml:space="preserve"> PAGEREF _Toc236229038 \h </w:instrText>
+        <w:instrText xml:space="preserve"> PAGEREF _Toc236232009 \h </w:instrText>
       </w:r>
       <w:r>
         <w:rPr>
@@ -1816,7 +1816,7 @@
         <w:rPr>
           <w:noProof/>
         </w:rPr>
-        <w:instrText xml:space="preserve"> PAGEREF _Toc236229039 \h </w:instrText>
+        <w:instrText xml:space="preserve"> PAGEREF _Toc236232010 \h </w:instrText>
       </w:r>
       <w:r>
         <w:rPr>
@@ -1877,7 +1877,7 @@
         <w:rPr>
           <w:noProof/>
         </w:rPr>
-        <w:instrText xml:space="preserve"> PAGEREF _Toc236229040 \h </w:instrText>
+        <w:instrText xml:space="preserve"> PAGEREF _Toc236232011 \h </w:instrText>
       </w:r>
       <w:r>
         <w:rPr>
@@ -1894,7 +1894,7 @@
         <w:rPr>
           <w:noProof/>
         </w:rPr>
-        <w:t>44</w:t>
+        <w:t>45</w:t>
       </w:r>
       <w:r>
         <w:rPr>
@@ -1938,7 +1938,7 @@
         <w:rPr>
           <w:noProof/>
         </w:rPr>
-        <w:instrText xml:space="preserve"> PAGEREF _Toc236229041 \h </w:instrText>
+        <w:instrText xml:space="preserve"> PAGEREF _Toc236232012 \h </w:instrText>
       </w:r>
       <w:r>
         <w:rPr>
@@ -1955,7 +1955,7 @@
         <w:rPr>
           <w:noProof/>
         </w:rPr>
-        <w:t>44</w:t>
+        <w:t>45</w:t>
       </w:r>
       <w:r>
         <w:rPr>
@@ -1999,7 +1999,7 @@
         <w:rPr>
           <w:noProof/>
         </w:rPr>
-        <w:instrText xml:space="preserve"> PAGEREF _Toc236229042 \h </w:instrText>
+        <w:instrText xml:space="preserve"> PAGEREF _Toc236232013 \h </w:instrText>
       </w:r>
       <w:r>
         <w:rPr>
@@ -2016,7 +2016,7 @@
         <w:rPr>
           <w:noProof/>
         </w:rPr>
-        <w:t>45</w:t>
+        <w:t>46</w:t>
       </w:r>
       <w:r>
         <w:rPr>
@@ -2060,7 +2060,7 @@
         <w:rPr>
           <w:noProof/>
         </w:rPr>
-        <w:instrText xml:space="preserve"> PAGEREF _Toc236229043 \h </w:instrText>
+        <w:instrText xml:space="preserve"> PAGEREF _Toc236232014 \h </w:instrText>
       </w:r>
       <w:r>
         <w:rPr>
@@ -2077,7 +2077,7 @@
         <w:rPr>
           <w:noProof/>
         </w:rPr>
-        <w:t>45</w:t>
+        <w:t>46</w:t>
       </w:r>
       <w:r>
         <w:rPr>
@@ -2121,7 +2121,7 @@
         <w:rPr>
           <w:noProof/>
         </w:rPr>
-        <w:instrText xml:space="preserve"> PAGEREF _Toc236229044 \h </w:instrText>
+        <w:instrText xml:space="preserve"> PAGEREF _Toc236232015 \h </w:instrText>
       </w:r>
       <w:r>
         <w:rPr>
@@ -2138,7 +2138,7 @@
         <w:rPr>
           <w:noProof/>
         </w:rPr>
-        <w:t>48</w:t>
+        <w:t>49</w:t>
       </w:r>
       <w:r>
         <w:rPr>
@@ -2182,7 +2182,7 @@
         <w:rPr>
           <w:noProof/>
         </w:rPr>
-        <w:instrText xml:space="preserve"> PAGEREF _Toc236229045 \h </w:instrText>
+        <w:instrText xml:space="preserve"> PAGEREF _Toc236232016 \h </w:instrText>
       </w:r>
       <w:r>
         <w:rPr>
@@ -2199,7 +2199,7 @@
         <w:rPr>
           <w:noProof/>
         </w:rPr>
-        <w:t>48</w:t>
+        <w:t>49</w:t>
       </w:r>
       <w:r>
         <w:rPr>
@@ -2243,7 +2243,7 @@
         <w:rPr>
           <w:noProof/>
         </w:rPr>
-        <w:instrText xml:space="preserve"> PAGEREF _Toc236229046 \h </w:instrText>
+        <w:instrText xml:space="preserve"> PAGEREF _Toc236232017 \h </w:instrText>
       </w:r>
       <w:r>
         <w:rPr>
@@ -2260,7 +2260,7 @@
         <w:rPr>
           <w:noProof/>
         </w:rPr>
-        <w:t>48</w:t>
+        <w:t>49</w:t>
       </w:r>
       <w:r>
         <w:rPr>
@@ -2304,7 +2304,7 @@
         <w:rPr>
           <w:noProof/>
         </w:rPr>
-        <w:instrText xml:space="preserve"> PAGEREF _Toc236229047 \h </w:instrText>
+        <w:instrText xml:space="preserve"> PAGEREF _Toc236232018 \h </w:instrText>
       </w:r>
       <w:r>
         <w:rPr>
@@ -2321,7 +2321,7 @@
         <w:rPr>
           <w:noProof/>
         </w:rPr>
-        <w:t>49</w:t>
+        <w:t>50</w:t>
       </w:r>
       <w:r>
         <w:rPr>
@@ -2365,7 +2365,7 @@
         <w:rPr>
           <w:noProof/>
         </w:rPr>
-        <w:instrText xml:space="preserve"> PAGEREF _Toc236229048 \h </w:instrText>
+        <w:instrText xml:space="preserve"> PAGEREF _Toc236232019 \h </w:instrText>
       </w:r>
       <w:r>
         <w:rPr>
@@ -2382,7 +2382,7 @@
         <w:rPr>
           <w:noProof/>
         </w:rPr>
-        <w:t>51</w:t>
+        <w:t>52</w:t>
       </w:r>
       <w:r>
         <w:rPr>
@@ -2426,7 +2426,7 @@
         <w:rPr>
           <w:noProof/>
         </w:rPr>
-        <w:instrText xml:space="preserve"> PAGEREF _Toc236229049 \h </w:instrText>
+        <w:instrText xml:space="preserve"> PAGEREF _Toc236232020 \h </w:instrText>
       </w:r>
       <w:r>
         <w:rPr>
@@ -2443,7 +2443,7 @@
         <w:rPr>
           <w:noProof/>
         </w:rPr>
-        <w:t>52</w:t>
+        <w:t>53</w:t>
       </w:r>
       <w:r>
         <w:rPr>
@@ -2502,7 +2502,7 @@
           <w:sz w:val="34"/>
         </w:rPr>
       </w:pPr>
-      <w:bookmarkStart w:id="0" w:name="_Toc236229013"/>
+      <w:bookmarkStart w:id="0" w:name="_Toc236231984"/>
       <w:r>
         <w:rPr>
           <w:rFonts w:ascii="Montserrat" w:hAnsi="Montserrat"/>
@@ -2526,7 +2526,7 @@
           <w:sz w:val="27"/>
         </w:rPr>
       </w:pPr>
-      <w:bookmarkStart w:id="1" w:name="_Toc236229014"/>
+      <w:bookmarkStart w:id="1" w:name="_Toc236231985"/>
       <w:r>
         <w:rPr>
           <w:rFonts w:ascii="Montserrat" w:hAnsi="Montserrat"/>
@@ -2607,6 +2607,24 @@
           <w:color w:val="1A1A1A"/>
           <w:sz w:val="22"/>
         </w:rPr>
+        <w:t>Esta e a versao 2.2 do manual. Em relacao a versao 2.1 (29/07/2026), foi adicionada a implementacao tecnica do Gate 2 - Pactuacao no Relatorio de Entregas e Beneficios (secao 4.2): status controlado pelo Admin, data e aprovador preenchidos automaticamente, e trava de edicao do relatorio enquanto pactuado.</w:t>
+      </w:r>
+    </w:p>
+    <w:p>
+      <w:pPr>
+        <w:spacing w:line="280" w:lineRule="auto"/>
+        <w:rPr>
+          <w:rFonts w:ascii="Montserrat" w:hAnsi="Montserrat"/>
+          <w:color w:val="1A1A1A"/>
+          <w:sz w:val="22"/>
+        </w:rPr>
+      </w:pPr>
+      <w:r>
+        <w:rPr>
+          <w:rFonts w:ascii="Montserrat" w:hAnsi="Montserrat"/>
+          <w:color w:val="1A1A1A"/>
+          <w:sz w:val="22"/>
+        </w:rPr>
         <w:t>O manual nao substitui as Diretrizes para a Gestao de Projetos da UNIALFA (documento institucional que define o framework D01 a D07) nem o documento Regras de Acesso e Permissoes (que detalha cada regra de controle de acesso); ele e o guia operacional de como usar cada ferramenta na pratica.</w:t>
       </w:r>
     </w:p>
@@ -2621,7 +2639,7 @@
           <w:sz w:val="27"/>
         </w:rPr>
       </w:pPr>
-      <w:bookmarkStart w:id="2" w:name="_Toc236229015"/>
+      <w:bookmarkStart w:id="2" w:name="_Toc236231986"/>
       <w:r>
         <w:rPr>
           <w:rFonts w:ascii="Montserrat" w:hAnsi="Montserrat"/>
@@ -2720,6 +2738,7 @@
           <w:color w:val="1A1A1A"/>
           <w:sz w:val="22"/>
         </w:rPr>
+        <w:lastRenderedPageBreak/>
         <w:t>1 pagina de Administracao, restrita a Admin, para gerenciar usuarios, equipes e configuracoes do sistema.</w:t>
       </w:r>
     </w:p>
@@ -2756,7 +2775,6 @@
           <w:color w:val="1A1A1A"/>
           <w:sz w:val="22"/>
         </w:rPr>
-        <w:lastRenderedPageBreak/>
         <w:t>O Mapa de Diretrizes (pagina inicial) apresenta visualmente as 7 diretrizes (D01 a D07) e mostra, para cada etapa do processo, quais ferramentas usar. E o ponto de partida recomendado para quem quer entender o processo antes de preencher os formularios - e a unica pagina, junto com o Validador de Projetos, que nao exige login.</w:t>
       </w:r>
     </w:p>
@@ -2770,16 +2788,16 @@
           <w:noProof/>
         </w:rPr>
         <w:drawing>
-          <wp:inline distT="0" distB="0" distL="0" distR="0" wp14:anchorId="7292A05B" wp14:editId="73B9E8CB">
+          <wp:inline distT="0" distB="0" distL="0" distR="0" wp14:anchorId="3B49FCC3" wp14:editId="2976B1DF">
             <wp:extent cx="5303520" cy="4792851"/>
             <wp:effectExtent l="19050" t="19050" r="11430" b="27305"/>
-            <wp:docPr id="45326835" name="Imagem 1"/>
+            <wp:docPr id="2135369940" name="Imagem 1"/>
             <wp:cNvGraphicFramePr/>
             <a:graphic xmlns:a="http://schemas.openxmlformats.org/drawingml/2006/main">
               <a:graphicData uri="http://schemas.openxmlformats.org/drawingml/2006/picture">
                 <pic:pic xmlns:pic="http://schemas.openxmlformats.org/drawingml/2006/picture">
                   <pic:nvPicPr>
-                    <pic:cNvPr id="45326835" name=""/>
+                    <pic:cNvPr id="2135369940" name=""/>
                     <pic:cNvPicPr/>
                   </pic:nvPicPr>
                   <pic:blipFill>
@@ -2847,7 +2865,7 @@
           <w:sz w:val="27"/>
         </w:rPr>
       </w:pPr>
-      <w:bookmarkStart w:id="3" w:name="_Toc236229016"/>
+      <w:bookmarkStart w:id="3" w:name="_Toc236231987"/>
       <w:r>
         <w:rPr>
           <w:rFonts w:ascii="Montserrat" w:hAnsi="Montserrat"/>
@@ -2855,6 +2873,7 @@
           <w:color w:val="B91D2E"/>
           <w:sz w:val="27"/>
         </w:rPr>
+        <w:lastRenderedPageBreak/>
         <w:t>1.3 Como acessar e fazer login</w:t>
       </w:r>
       <w:bookmarkEnd w:id="3"/>
@@ -2886,18 +2905,17 @@
         <w:rPr>
           <w:noProof/>
         </w:rPr>
-        <w:lastRenderedPageBreak/>
         <w:drawing>
-          <wp:inline distT="0" distB="0" distL="0" distR="0" wp14:anchorId="4E2C151E" wp14:editId="150E52F6">
+          <wp:inline distT="0" distB="0" distL="0" distR="0" wp14:anchorId="314216BF" wp14:editId="0FF7DC03">
             <wp:extent cx="4206240" cy="3801227"/>
             <wp:effectExtent l="19050" t="19050" r="22860" b="27940"/>
-            <wp:docPr id="1980839780" name="Imagem 2"/>
+            <wp:docPr id="2002344632" name="Imagem 2"/>
             <wp:cNvGraphicFramePr/>
             <a:graphic xmlns:a="http://schemas.openxmlformats.org/drawingml/2006/main">
               <a:graphicData uri="http://schemas.openxmlformats.org/drawingml/2006/picture">
                 <pic:pic xmlns:pic="http://schemas.openxmlformats.org/drawingml/2006/picture">
                   <pic:nvPicPr>
-                    <pic:cNvPr id="1980839780" name=""/>
+                    <pic:cNvPr id="2002344632" name=""/>
                     <pic:cNvPicPr/>
                   </pic:nvPicPr>
                   <pic:blipFill>
@@ -3070,7 +3088,7 @@
           <w:sz w:val="27"/>
         </w:rPr>
       </w:pPr>
-      <w:bookmarkStart w:id="4" w:name="_Toc236229017"/>
+      <w:bookmarkStart w:id="4" w:name="_Toc236231988"/>
       <w:r>
         <w:rPr>
           <w:rFonts w:ascii="Montserrat" w:hAnsi="Montserrat"/>
@@ -3078,6 +3096,7 @@
           <w:color w:val="B91D2E"/>
           <w:sz w:val="27"/>
         </w:rPr>
+        <w:lastRenderedPageBreak/>
         <w:t>1.4 Como a ferramenta se relaciona com as Diretrizes (D01-D07)</w:t>
       </w:r>
       <w:bookmarkEnd w:id="4"/>
@@ -3146,7 +3165,6 @@
                 <w:color w:val="FFFFFF"/>
                 <w:sz w:val="19"/>
               </w:rPr>
-              <w:lastRenderedPageBreak/>
               <w:t>Passo</w:t>
             </w:r>
           </w:p>
@@ -4219,7 +4237,7 @@
           <w:sz w:val="34"/>
         </w:rPr>
       </w:pPr>
-      <w:bookmarkStart w:id="5" w:name="_Toc236229018"/>
+      <w:bookmarkStart w:id="5" w:name="_Toc236231989"/>
       <w:r>
         <w:rPr>
           <w:rFonts w:ascii="Montserrat" w:hAnsi="Montserrat"/>
@@ -4243,7 +4261,7 @@
           <w:sz w:val="27"/>
         </w:rPr>
       </w:pPr>
-      <w:bookmarkStart w:id="6" w:name="_Toc236229019"/>
+      <w:bookmarkStart w:id="6" w:name="_Toc236231990"/>
       <w:r>
         <w:rPr>
           <w:rFonts w:ascii="Montserrat" w:hAnsi="Montserrat"/>
@@ -4284,7 +4302,7 @@
           <w:sz w:val="27"/>
         </w:rPr>
       </w:pPr>
-      <w:bookmarkStart w:id="7" w:name="_Toc236229020"/>
+      <w:bookmarkStart w:id="7" w:name="_Toc236231991"/>
       <w:r>
         <w:rPr>
           <w:rFonts w:ascii="Montserrat" w:hAnsi="Montserrat"/>
@@ -4403,7 +4421,7 @@
           <w:sz w:val="27"/>
         </w:rPr>
       </w:pPr>
-      <w:bookmarkStart w:id="8" w:name="_Toc236229021"/>
+      <w:bookmarkStart w:id="8" w:name="_Toc236231992"/>
       <w:r>
         <w:rPr>
           <w:rFonts w:ascii="Montserrat" w:hAnsi="Montserrat"/>
@@ -4974,7 +4992,7 @@
           <w:sz w:val="27"/>
         </w:rPr>
       </w:pPr>
-      <w:bookmarkStart w:id="9" w:name="_Toc236229022"/>
+      <w:bookmarkStart w:id="9" w:name="_Toc236231993"/>
       <w:r>
         <w:rPr>
           <w:rFonts w:ascii="Montserrat" w:hAnsi="Montserrat"/>
@@ -5063,16 +5081,16 @@
         </w:rPr>
         <w:lastRenderedPageBreak/>
         <w:drawing>
-          <wp:inline distT="0" distB="0" distL="0" distR="0" wp14:anchorId="056D10C2" wp14:editId="4F0D45CE">
+          <wp:inline distT="0" distB="0" distL="0" distR="0" wp14:anchorId="2029E7FE" wp14:editId="4A34E7AD">
             <wp:extent cx="4937760" cy="4462310"/>
             <wp:effectExtent l="19050" t="19050" r="15240" b="14605"/>
-            <wp:docPr id="589758966" name="Imagem 3"/>
+            <wp:docPr id="1473211511" name="Imagem 3"/>
             <wp:cNvGraphicFramePr/>
             <a:graphic xmlns:a="http://schemas.openxmlformats.org/drawingml/2006/main">
               <a:graphicData uri="http://schemas.openxmlformats.org/drawingml/2006/picture">
                 <pic:pic xmlns:pic="http://schemas.openxmlformats.org/drawingml/2006/picture">
                   <pic:nvPicPr>
-                    <pic:cNvPr id="589758966" name=""/>
+                    <pic:cNvPr id="1473211511" name=""/>
                     <pic:cNvPicPr/>
                   </pic:nvPicPr>
                   <pic:blipFill>
@@ -5140,7 +5158,7 @@
           <w:sz w:val="27"/>
         </w:rPr>
       </w:pPr>
-      <w:bookmarkStart w:id="10" w:name="_Toc236229023"/>
+      <w:bookmarkStart w:id="10" w:name="_Toc236231994"/>
       <w:r>
         <w:rPr>
           <w:rFonts w:ascii="Montserrat" w:hAnsi="Montserrat"/>
@@ -5181,16 +5199,16 @@
         </w:rPr>
         <w:lastRenderedPageBreak/>
         <w:drawing>
-          <wp:inline distT="0" distB="0" distL="0" distR="0" wp14:anchorId="1F2F064A" wp14:editId="0C4AF289">
+          <wp:inline distT="0" distB="0" distL="0" distR="0" wp14:anchorId="5660D523" wp14:editId="0F77A532">
             <wp:extent cx="5120640" cy="4627581"/>
             <wp:effectExtent l="19050" t="19050" r="22860" b="20955"/>
-            <wp:docPr id="17280499" name="Imagem 4"/>
+            <wp:docPr id="568530520" name="Imagem 4"/>
             <wp:cNvGraphicFramePr/>
             <a:graphic xmlns:a="http://schemas.openxmlformats.org/drawingml/2006/main">
               <a:graphicData uri="http://schemas.openxmlformats.org/drawingml/2006/picture">
                 <pic:pic xmlns:pic="http://schemas.openxmlformats.org/drawingml/2006/picture">
                   <pic:nvPicPr>
-                    <pic:cNvPr id="17280499" name=""/>
+                    <pic:cNvPr id="568530520" name=""/>
                     <pic:cNvPicPr/>
                   </pic:nvPicPr>
                   <pic:blipFill>
@@ -5327,7 +5345,7 @@
           <w:sz w:val="27"/>
         </w:rPr>
       </w:pPr>
-      <w:bookmarkStart w:id="11" w:name="_Toc236229024"/>
+      <w:bookmarkStart w:id="11" w:name="_Toc236231995"/>
       <w:r>
         <w:rPr>
           <w:rFonts w:ascii="Montserrat" w:hAnsi="Montserrat"/>
@@ -5368,16 +5386,16 @@
         </w:rPr>
         <w:lastRenderedPageBreak/>
         <w:drawing>
-          <wp:inline distT="0" distB="0" distL="0" distR="0" wp14:anchorId="47C516E4" wp14:editId="73FB919E">
+          <wp:inline distT="0" distB="0" distL="0" distR="0" wp14:anchorId="1A634F15" wp14:editId="1883B65D">
             <wp:extent cx="4206240" cy="3801227"/>
             <wp:effectExtent l="19050" t="19050" r="22860" b="27940"/>
-            <wp:docPr id="2098646374" name="Imagem 5"/>
+            <wp:docPr id="1286378137" name="Imagem 5"/>
             <wp:cNvGraphicFramePr/>
             <a:graphic xmlns:a="http://schemas.openxmlformats.org/drawingml/2006/main">
               <a:graphicData uri="http://schemas.openxmlformats.org/drawingml/2006/picture">
                 <pic:pic xmlns:pic="http://schemas.openxmlformats.org/drawingml/2006/picture">
                   <pic:nvPicPr>
-                    <pic:cNvPr id="2098646374" name=""/>
+                    <pic:cNvPr id="1286378137" name=""/>
                     <pic:cNvPicPr/>
                   </pic:nvPicPr>
                   <pic:blipFill>
@@ -5445,16 +5463,16 @@
         </w:rPr>
         <w:lastRenderedPageBreak/>
         <w:drawing>
-          <wp:inline distT="0" distB="0" distL="0" distR="0" wp14:anchorId="216D5215" wp14:editId="060B20F2">
+          <wp:inline distT="0" distB="0" distL="0" distR="0" wp14:anchorId="77E3CBE9" wp14:editId="215D6F4E">
             <wp:extent cx="4206240" cy="3801227"/>
             <wp:effectExtent l="19050" t="19050" r="22860" b="27940"/>
-            <wp:docPr id="48341697" name="Imagem 6"/>
+            <wp:docPr id="568072388" name="Imagem 6"/>
             <wp:cNvGraphicFramePr/>
             <a:graphic xmlns:a="http://schemas.openxmlformats.org/drawingml/2006/main">
               <a:graphicData uri="http://schemas.openxmlformats.org/drawingml/2006/picture">
                 <pic:pic xmlns:pic="http://schemas.openxmlformats.org/drawingml/2006/picture">
                   <pic:nvPicPr>
-                    <pic:cNvPr id="48341697" name=""/>
+                    <pic:cNvPr id="568072388" name=""/>
                     <pic:cNvPicPr/>
                   </pic:nvPicPr>
                   <pic:blipFill>
@@ -5570,7 +5588,7 @@
           <w:sz w:val="27"/>
         </w:rPr>
       </w:pPr>
-      <w:bookmarkStart w:id="12" w:name="_Toc236229025"/>
+      <w:bookmarkStart w:id="12" w:name="_Toc236231996"/>
       <w:r>
         <w:rPr>
           <w:rFonts w:ascii="Montserrat" w:hAnsi="Montserrat"/>
@@ -5642,7 +5660,7 @@
           <w:sz w:val="34"/>
         </w:rPr>
       </w:pPr>
-      <w:bookmarkStart w:id="13" w:name="_Toc236229026"/>
+      <w:bookmarkStart w:id="13" w:name="_Toc236231997"/>
       <w:r>
         <w:rPr>
           <w:rFonts w:ascii="Montserrat" w:hAnsi="Montserrat"/>
@@ -5684,7 +5702,7 @@
           <w:sz w:val="27"/>
         </w:rPr>
       </w:pPr>
-      <w:bookmarkStart w:id="14" w:name="_Toc236229027"/>
+      <w:bookmarkStart w:id="14" w:name="_Toc236231998"/>
       <w:r>
         <w:rPr>
           <w:rFonts w:ascii="Montserrat" w:hAnsi="Montserrat"/>
@@ -6544,16 +6562,16 @@
         </w:rPr>
         <w:lastRenderedPageBreak/>
         <w:drawing>
-          <wp:inline distT="0" distB="0" distL="0" distR="0" wp14:anchorId="5EA0EE99" wp14:editId="12269CF6">
+          <wp:inline distT="0" distB="0" distL="0" distR="0" wp14:anchorId="65D4E5D8" wp14:editId="6C14D01D">
             <wp:extent cx="5120640" cy="4627581"/>
             <wp:effectExtent l="19050" t="19050" r="22860" b="20955"/>
-            <wp:docPr id="58689624" name="Imagem 7"/>
+            <wp:docPr id="282985148" name="Imagem 7"/>
             <wp:cNvGraphicFramePr/>
             <a:graphic xmlns:a="http://schemas.openxmlformats.org/drawingml/2006/main">
               <a:graphicData uri="http://schemas.openxmlformats.org/drawingml/2006/picture">
                 <pic:pic xmlns:pic="http://schemas.openxmlformats.org/drawingml/2006/picture">
                   <pic:nvPicPr>
-                    <pic:cNvPr id="58689624" name=""/>
+                    <pic:cNvPr id="282985148" name=""/>
                     <pic:cNvPicPr/>
                   </pic:nvPicPr>
                   <pic:blipFill>
@@ -6621,16 +6639,16 @@
         </w:rPr>
         <w:lastRenderedPageBreak/>
         <w:drawing>
-          <wp:inline distT="0" distB="0" distL="0" distR="0" wp14:anchorId="3DDFA677" wp14:editId="16EBAB7A">
+          <wp:inline distT="0" distB="0" distL="0" distR="0" wp14:anchorId="67B2A0A5" wp14:editId="44A98F73">
             <wp:extent cx="5120640" cy="4627581"/>
             <wp:effectExtent l="19050" t="19050" r="22860" b="20955"/>
-            <wp:docPr id="1734873736" name="Imagem 8"/>
+            <wp:docPr id="831677579" name="Imagem 8"/>
             <wp:cNvGraphicFramePr/>
             <a:graphic xmlns:a="http://schemas.openxmlformats.org/drawingml/2006/main">
               <a:graphicData uri="http://schemas.openxmlformats.org/drawingml/2006/picture">
                 <pic:pic xmlns:pic="http://schemas.openxmlformats.org/drawingml/2006/picture">
                   <pic:nvPicPr>
-                    <pic:cNvPr id="1734873736" name=""/>
+                    <pic:cNvPr id="831677579" name=""/>
                     <pic:cNvPicPr/>
                   </pic:nvPicPr>
                   <pic:blipFill>
@@ -6765,7 +6783,7 @@
           <w:sz w:val="27"/>
         </w:rPr>
       </w:pPr>
-      <w:bookmarkStart w:id="15" w:name="_Toc236229028"/>
+      <w:bookmarkStart w:id="15" w:name="_Toc236231999"/>
       <w:r>
         <w:rPr>
           <w:rFonts w:ascii="Montserrat" w:hAnsi="Montserrat"/>
@@ -7634,16 +7652,16 @@
         </w:rPr>
         <w:lastRenderedPageBreak/>
         <w:drawing>
-          <wp:inline distT="0" distB="0" distL="0" distR="0" wp14:anchorId="6674F209" wp14:editId="08D4B250">
+          <wp:inline distT="0" distB="0" distL="0" distR="0" wp14:anchorId="2A267C38" wp14:editId="1F8B82F7">
             <wp:extent cx="5120640" cy="4627581"/>
             <wp:effectExtent l="19050" t="19050" r="22860" b="20955"/>
-            <wp:docPr id="1556600387" name="Imagem 9"/>
+            <wp:docPr id="966162971" name="Imagem 9"/>
             <wp:cNvGraphicFramePr/>
             <a:graphic xmlns:a="http://schemas.openxmlformats.org/drawingml/2006/main">
               <a:graphicData uri="http://schemas.openxmlformats.org/drawingml/2006/picture">
                 <pic:pic xmlns:pic="http://schemas.openxmlformats.org/drawingml/2006/picture">
                   <pic:nvPicPr>
-                    <pic:cNvPr id="1556600387" name=""/>
+                    <pic:cNvPr id="966162971" name=""/>
                     <pic:cNvPicPr/>
                   </pic:nvPicPr>
                   <pic:blipFill>
@@ -7711,16 +7729,16 @@
         </w:rPr>
         <w:lastRenderedPageBreak/>
         <w:drawing>
-          <wp:inline distT="0" distB="0" distL="0" distR="0" wp14:anchorId="228F51F7" wp14:editId="2B176C54">
+          <wp:inline distT="0" distB="0" distL="0" distR="0" wp14:anchorId="6C597EE2" wp14:editId="5581E14A">
             <wp:extent cx="5120640" cy="4627581"/>
             <wp:effectExtent l="19050" t="19050" r="22860" b="20955"/>
-            <wp:docPr id="564073986" name="Imagem 10"/>
+            <wp:docPr id="1887408564" name="Imagem 10"/>
             <wp:cNvGraphicFramePr/>
             <a:graphic xmlns:a="http://schemas.openxmlformats.org/drawingml/2006/main">
               <a:graphicData uri="http://schemas.openxmlformats.org/drawingml/2006/picture">
                 <pic:pic xmlns:pic="http://schemas.openxmlformats.org/drawingml/2006/picture">
                   <pic:nvPicPr>
-                    <pic:cNvPr id="564073986" name=""/>
+                    <pic:cNvPr id="1887408564" name=""/>
                     <pic:cNvPicPr/>
                   </pic:nvPicPr>
                   <pic:blipFill>
@@ -7806,7 +7824,7 @@
           <w:sz w:val="27"/>
         </w:rPr>
       </w:pPr>
-      <w:bookmarkStart w:id="16" w:name="_Toc236229029"/>
+      <w:bookmarkStart w:id="16" w:name="_Toc236232000"/>
       <w:r>
         <w:rPr>
           <w:rFonts w:ascii="Montserrat" w:hAnsi="Montserrat"/>
@@ -8774,16 +8792,16 @@
         </w:rPr>
         <w:lastRenderedPageBreak/>
         <w:drawing>
-          <wp:inline distT="0" distB="0" distL="0" distR="0" wp14:anchorId="1761D52E" wp14:editId="6B05846D">
+          <wp:inline distT="0" distB="0" distL="0" distR="0" wp14:anchorId="194F8342" wp14:editId="3B0CA772">
             <wp:extent cx="5120640" cy="3282818"/>
             <wp:effectExtent l="19050" t="19050" r="22860" b="13335"/>
-            <wp:docPr id="243080584" name="Imagem 11"/>
+            <wp:docPr id="225147307" name="Imagem 11"/>
             <wp:cNvGraphicFramePr/>
             <a:graphic xmlns:a="http://schemas.openxmlformats.org/drawingml/2006/main">
               <a:graphicData uri="http://schemas.openxmlformats.org/drawingml/2006/picture">
                 <pic:pic xmlns:pic="http://schemas.openxmlformats.org/drawingml/2006/picture">
                   <pic:nvPicPr>
-                    <pic:cNvPr id="243080584" name=""/>
+                    <pic:cNvPr id="225147307" name=""/>
                     <pic:cNvPicPr/>
                   </pic:nvPicPr>
                   <pic:blipFill>
@@ -8851,16 +8869,16 @@
         </w:rPr>
         <w:lastRenderedPageBreak/>
         <w:drawing>
-          <wp:inline distT="0" distB="0" distL="0" distR="0" wp14:anchorId="6AEE7CE2" wp14:editId="08D7A602">
+          <wp:inline distT="0" distB="0" distL="0" distR="0" wp14:anchorId="43058E8D" wp14:editId="5527C5A1">
             <wp:extent cx="5120640" cy="4627581"/>
             <wp:effectExtent l="19050" t="19050" r="22860" b="20955"/>
-            <wp:docPr id="785771813" name="Imagem 12"/>
+            <wp:docPr id="1823745358" name="Imagem 12"/>
             <wp:cNvGraphicFramePr/>
             <a:graphic xmlns:a="http://schemas.openxmlformats.org/drawingml/2006/main">
               <a:graphicData uri="http://schemas.openxmlformats.org/drawingml/2006/picture">
                 <pic:pic xmlns:pic="http://schemas.openxmlformats.org/drawingml/2006/picture">
                   <pic:nvPicPr>
-                    <pic:cNvPr id="785771813" name=""/>
+                    <pic:cNvPr id="1823745358" name=""/>
                     <pic:cNvPicPr/>
                   </pic:nvPicPr>
                   <pic:blipFill>
@@ -8946,7 +8964,7 @@
           <w:sz w:val="27"/>
         </w:rPr>
       </w:pPr>
-      <w:bookmarkStart w:id="17" w:name="_Toc236229030"/>
+      <w:bookmarkStart w:id="17" w:name="_Toc236232001"/>
       <w:r>
         <w:rPr>
           <w:rFonts w:ascii="Montserrat" w:hAnsi="Montserrat"/>
@@ -9453,16 +9471,16 @@
           <w:noProof/>
         </w:rPr>
         <w:drawing>
-          <wp:inline distT="0" distB="0" distL="0" distR="0" wp14:anchorId="5DB5F750" wp14:editId="2EAE0436">
+          <wp:inline distT="0" distB="0" distL="0" distR="0" wp14:anchorId="4E421FED" wp14:editId="23CB4ADE">
             <wp:extent cx="5120640" cy="4627581"/>
             <wp:effectExtent l="19050" t="19050" r="22860" b="20955"/>
-            <wp:docPr id="69058507" name="Imagem 13"/>
+            <wp:docPr id="1037232828" name="Imagem 13"/>
             <wp:cNvGraphicFramePr/>
             <a:graphic xmlns:a="http://schemas.openxmlformats.org/drawingml/2006/main">
               <a:graphicData uri="http://schemas.openxmlformats.org/drawingml/2006/picture">
                 <pic:pic xmlns:pic="http://schemas.openxmlformats.org/drawingml/2006/picture">
                   <pic:nvPicPr>
-                    <pic:cNvPr id="69058507" name=""/>
+                    <pic:cNvPr id="1037232828" name=""/>
                     <pic:cNvPicPr/>
                   </pic:nvPicPr>
                   <pic:blipFill>
@@ -9530,16 +9548,16 @@
         </w:rPr>
         <w:lastRenderedPageBreak/>
         <w:drawing>
-          <wp:inline distT="0" distB="0" distL="0" distR="0" wp14:anchorId="764C61C4" wp14:editId="4E0D594F">
+          <wp:inline distT="0" distB="0" distL="0" distR="0" wp14:anchorId="4242DE41" wp14:editId="7363917E">
             <wp:extent cx="5120640" cy="4627581"/>
             <wp:effectExtent l="19050" t="19050" r="22860" b="20955"/>
-            <wp:docPr id="1665032972" name="Imagem 14"/>
+            <wp:docPr id="1236935457" name="Imagem 14"/>
             <wp:cNvGraphicFramePr/>
             <a:graphic xmlns:a="http://schemas.openxmlformats.org/drawingml/2006/main">
               <a:graphicData uri="http://schemas.openxmlformats.org/drawingml/2006/picture">
                 <pic:pic xmlns:pic="http://schemas.openxmlformats.org/drawingml/2006/picture">
                   <pic:nvPicPr>
-                    <pic:cNvPr id="1665032972" name=""/>
+                    <pic:cNvPr id="1236935457" name=""/>
                     <pic:cNvPicPr/>
                   </pic:nvPicPr>
                   <pic:blipFill>
@@ -9625,7 +9643,7 @@
           <w:sz w:val="27"/>
         </w:rPr>
       </w:pPr>
-      <w:bookmarkStart w:id="18" w:name="_Toc236229031"/>
+      <w:bookmarkStart w:id="18" w:name="_Toc236232002"/>
       <w:r>
         <w:rPr>
           <w:rFonts w:ascii="Montserrat" w:hAnsi="Montserrat"/>
@@ -9666,16 +9684,16 @@
         </w:rPr>
         <w:lastRenderedPageBreak/>
         <w:drawing>
-          <wp:inline distT="0" distB="0" distL="0" distR="0" wp14:anchorId="68A06EB7" wp14:editId="426939E0">
+          <wp:inline distT="0" distB="0" distL="0" distR="0" wp14:anchorId="1D53C448" wp14:editId="38D10128">
             <wp:extent cx="5120640" cy="4627581"/>
             <wp:effectExtent l="19050" t="19050" r="22860" b="20955"/>
-            <wp:docPr id="1539972857" name="Imagem 15"/>
+            <wp:docPr id="1358825148" name="Imagem 15"/>
             <wp:cNvGraphicFramePr/>
             <a:graphic xmlns:a="http://schemas.openxmlformats.org/drawingml/2006/main">
               <a:graphicData uri="http://schemas.openxmlformats.org/drawingml/2006/picture">
                 <pic:pic xmlns:pic="http://schemas.openxmlformats.org/drawingml/2006/picture">
                   <pic:nvPicPr>
-                    <pic:cNvPr id="1539972857" name=""/>
+                    <pic:cNvPr id="1358825148" name=""/>
                     <pic:cNvPicPr/>
                   </pic:nvPicPr>
                   <pic:blipFill>
@@ -9743,16 +9761,16 @@
         </w:rPr>
         <w:lastRenderedPageBreak/>
         <w:drawing>
-          <wp:inline distT="0" distB="0" distL="0" distR="0" wp14:anchorId="18C86CC3" wp14:editId="6BF6A3C8">
+          <wp:inline distT="0" distB="0" distL="0" distR="0" wp14:anchorId="74183003" wp14:editId="13D855A6">
             <wp:extent cx="5120640" cy="4627581"/>
             <wp:effectExtent l="19050" t="19050" r="22860" b="20955"/>
-            <wp:docPr id="22562899" name="Imagem 16"/>
+            <wp:docPr id="1638507117" name="Imagem 16"/>
             <wp:cNvGraphicFramePr/>
             <a:graphic xmlns:a="http://schemas.openxmlformats.org/drawingml/2006/main">
               <a:graphicData uri="http://schemas.openxmlformats.org/drawingml/2006/picture">
                 <pic:pic xmlns:pic="http://schemas.openxmlformats.org/drawingml/2006/picture">
                   <pic:nvPicPr>
-                    <pic:cNvPr id="22562899" name=""/>
+                    <pic:cNvPr id="1638507117" name=""/>
                     <pic:cNvPicPr/>
                   </pic:nvPicPr>
                   <pic:blipFill>
@@ -9916,16 +9934,16 @@
         </w:rPr>
         <w:lastRenderedPageBreak/>
         <w:drawing>
-          <wp:inline distT="0" distB="0" distL="0" distR="0" wp14:anchorId="23FDA0F1" wp14:editId="0267CED3">
+          <wp:inline distT="0" distB="0" distL="0" distR="0" wp14:anchorId="4C725CB9" wp14:editId="7E9054C5">
             <wp:extent cx="5120640" cy="3282818"/>
             <wp:effectExtent l="19050" t="19050" r="22860" b="13335"/>
-            <wp:docPr id="1655988710" name="Imagem 17"/>
+            <wp:docPr id="927847853" name="Imagem 17"/>
             <wp:cNvGraphicFramePr/>
             <a:graphic xmlns:a="http://schemas.openxmlformats.org/drawingml/2006/main">
               <a:graphicData uri="http://schemas.openxmlformats.org/drawingml/2006/picture">
                 <pic:pic xmlns:pic="http://schemas.openxmlformats.org/drawingml/2006/picture">
                   <pic:nvPicPr>
-                    <pic:cNvPr id="1655988710" name=""/>
+                    <pic:cNvPr id="927847853" name=""/>
                     <pic:cNvPicPr/>
                   </pic:nvPicPr>
                   <pic:blipFill>
@@ -10011,7 +10029,7 @@
           <w:sz w:val="27"/>
         </w:rPr>
       </w:pPr>
-      <w:bookmarkStart w:id="19" w:name="_Toc236229032"/>
+      <w:bookmarkStart w:id="19" w:name="_Toc236232003"/>
       <w:r>
         <w:rPr>
           <w:rFonts w:ascii="Montserrat" w:hAnsi="Montserrat"/>
@@ -10052,16 +10070,16 @@
         </w:rPr>
         <w:lastRenderedPageBreak/>
         <w:drawing>
-          <wp:inline distT="0" distB="0" distL="0" distR="0" wp14:anchorId="4D89A363" wp14:editId="700446CD">
+          <wp:inline distT="0" distB="0" distL="0" distR="0" wp14:anchorId="7F80BC03" wp14:editId="0336BB32">
             <wp:extent cx="5120640" cy="4627581"/>
             <wp:effectExtent l="19050" t="19050" r="22860" b="20955"/>
-            <wp:docPr id="1221876762" name="Imagem 18"/>
+            <wp:docPr id="142335221" name="Imagem 18"/>
             <wp:cNvGraphicFramePr/>
             <a:graphic xmlns:a="http://schemas.openxmlformats.org/drawingml/2006/main">
               <a:graphicData uri="http://schemas.openxmlformats.org/drawingml/2006/picture">
                 <pic:pic xmlns:pic="http://schemas.openxmlformats.org/drawingml/2006/picture">
                   <pic:nvPicPr>
-                    <pic:cNvPr id="1221876762" name=""/>
+                    <pic:cNvPr id="142335221" name=""/>
                     <pic:cNvPicPr/>
                   </pic:nvPicPr>
                   <pic:blipFill>
@@ -10129,16 +10147,16 @@
         </w:rPr>
         <w:lastRenderedPageBreak/>
         <w:drawing>
-          <wp:inline distT="0" distB="0" distL="0" distR="0" wp14:anchorId="049704A7" wp14:editId="7C1E2625">
+          <wp:inline distT="0" distB="0" distL="0" distR="0" wp14:anchorId="3ABC88B7" wp14:editId="0B5019E4">
             <wp:extent cx="5120640" cy="4627581"/>
             <wp:effectExtent l="19050" t="19050" r="22860" b="20955"/>
-            <wp:docPr id="289391118" name="Imagem 19"/>
+            <wp:docPr id="873273800" name="Imagem 19"/>
             <wp:cNvGraphicFramePr/>
             <a:graphic xmlns:a="http://schemas.openxmlformats.org/drawingml/2006/main">
               <a:graphicData uri="http://schemas.openxmlformats.org/drawingml/2006/picture">
                 <pic:pic xmlns:pic="http://schemas.openxmlformats.org/drawingml/2006/picture">
                   <pic:nvPicPr>
-                    <pic:cNvPr id="289391118" name=""/>
+                    <pic:cNvPr id="873273800" name=""/>
                     <pic:cNvPicPr/>
                   </pic:nvPicPr>
                   <pic:blipFill>
@@ -10272,7 +10290,7 @@
           <w:sz w:val="27"/>
         </w:rPr>
       </w:pPr>
-      <w:bookmarkStart w:id="20" w:name="_Toc236229033"/>
+      <w:bookmarkStart w:id="20" w:name="_Toc236232004"/>
       <w:r>
         <w:rPr>
           <w:rFonts w:ascii="Montserrat" w:hAnsi="Montserrat"/>
@@ -10313,16 +10331,16 @@
         </w:rPr>
         <w:lastRenderedPageBreak/>
         <w:drawing>
-          <wp:inline distT="0" distB="0" distL="0" distR="0" wp14:anchorId="7FB25F4A" wp14:editId="5874F03A">
+          <wp:inline distT="0" distB="0" distL="0" distR="0" wp14:anchorId="430E5369" wp14:editId="6E589C12">
             <wp:extent cx="5120640" cy="4627581"/>
             <wp:effectExtent l="19050" t="19050" r="22860" b="20955"/>
-            <wp:docPr id="793590469" name="Imagem 20"/>
+            <wp:docPr id="1548285344" name="Imagem 20"/>
             <wp:cNvGraphicFramePr/>
             <a:graphic xmlns:a="http://schemas.openxmlformats.org/drawingml/2006/main">
               <a:graphicData uri="http://schemas.openxmlformats.org/drawingml/2006/picture">
                 <pic:pic xmlns:pic="http://schemas.openxmlformats.org/drawingml/2006/picture">
                   <pic:nvPicPr>
-                    <pic:cNvPr id="793590469" name=""/>
+                    <pic:cNvPr id="1548285344" name=""/>
                     <pic:cNvPicPr/>
                   </pic:nvPicPr>
                   <pic:blipFill>
@@ -10390,16 +10408,16 @@
         </w:rPr>
         <w:lastRenderedPageBreak/>
         <w:drawing>
-          <wp:inline distT="0" distB="0" distL="0" distR="0" wp14:anchorId="66B3ABF6" wp14:editId="3CB403D7">
+          <wp:inline distT="0" distB="0" distL="0" distR="0" wp14:anchorId="62C94FA1" wp14:editId="61180930">
             <wp:extent cx="5120640" cy="4627581"/>
             <wp:effectExtent l="19050" t="19050" r="22860" b="20955"/>
-            <wp:docPr id="270566194" name="Imagem 21"/>
+            <wp:docPr id="662929393" name="Imagem 21"/>
             <wp:cNvGraphicFramePr/>
             <a:graphic xmlns:a="http://schemas.openxmlformats.org/drawingml/2006/main">
               <a:graphicData uri="http://schemas.openxmlformats.org/drawingml/2006/picture">
                 <pic:pic xmlns:pic="http://schemas.openxmlformats.org/drawingml/2006/picture">
                   <pic:nvPicPr>
-                    <pic:cNvPr id="270566194" name=""/>
+                    <pic:cNvPr id="662929393" name=""/>
                     <pic:cNvPicPr/>
                   </pic:nvPicPr>
                   <pic:blipFill>
@@ -10557,7 +10575,7 @@
           <w:sz w:val="27"/>
         </w:rPr>
       </w:pPr>
-      <w:bookmarkStart w:id="21" w:name="_Toc236229034"/>
+      <w:bookmarkStart w:id="21" w:name="_Toc236232005"/>
       <w:r>
         <w:rPr>
           <w:rFonts w:ascii="Montserrat" w:hAnsi="Montserrat"/>
@@ -10598,16 +10616,16 @@
         </w:rPr>
         <w:lastRenderedPageBreak/>
         <w:drawing>
-          <wp:inline distT="0" distB="0" distL="0" distR="0" wp14:anchorId="4D77F51F" wp14:editId="2C16AE3C">
+          <wp:inline distT="0" distB="0" distL="0" distR="0" wp14:anchorId="36EF4335" wp14:editId="600291E6">
             <wp:extent cx="5120640" cy="4627581"/>
             <wp:effectExtent l="19050" t="19050" r="22860" b="20955"/>
-            <wp:docPr id="196341793" name="Imagem 22"/>
+            <wp:docPr id="898917334" name="Imagem 22"/>
             <wp:cNvGraphicFramePr/>
             <a:graphic xmlns:a="http://schemas.openxmlformats.org/drawingml/2006/main">
               <a:graphicData uri="http://schemas.openxmlformats.org/drawingml/2006/picture">
                 <pic:pic xmlns:pic="http://schemas.openxmlformats.org/drawingml/2006/picture">
                   <pic:nvPicPr>
-                    <pic:cNvPr id="196341793" name=""/>
+                    <pic:cNvPr id="898917334" name=""/>
                     <pic:cNvPicPr/>
                   </pic:nvPicPr>
                   <pic:blipFill>
@@ -10675,16 +10693,16 @@
         </w:rPr>
         <w:lastRenderedPageBreak/>
         <w:drawing>
-          <wp:inline distT="0" distB="0" distL="0" distR="0" wp14:anchorId="6449F285" wp14:editId="7F3C03B6">
+          <wp:inline distT="0" distB="0" distL="0" distR="0" wp14:anchorId="01145C14" wp14:editId="706C73EA">
             <wp:extent cx="5120640" cy="4627581"/>
             <wp:effectExtent l="19050" t="19050" r="22860" b="20955"/>
-            <wp:docPr id="1928153535" name="Imagem 23"/>
+            <wp:docPr id="240795" name="Imagem 23"/>
             <wp:cNvGraphicFramePr/>
             <a:graphic xmlns:a="http://schemas.openxmlformats.org/drawingml/2006/main">
               <a:graphicData uri="http://schemas.openxmlformats.org/drawingml/2006/picture">
                 <pic:pic xmlns:pic="http://schemas.openxmlformats.org/drawingml/2006/picture">
                   <pic:nvPicPr>
-                    <pic:cNvPr id="1928153535" name=""/>
+                    <pic:cNvPr id="240795" name=""/>
                     <pic:cNvPicPr/>
                   </pic:nvPicPr>
                   <pic:blipFill>
@@ -10842,7 +10860,7 @@
           <w:sz w:val="27"/>
         </w:rPr>
       </w:pPr>
-      <w:bookmarkStart w:id="22" w:name="_Toc236229035"/>
+      <w:bookmarkStart w:id="22" w:name="_Toc236232006"/>
       <w:r>
         <w:rPr>
           <w:rFonts w:ascii="Montserrat" w:hAnsi="Montserrat"/>
@@ -10883,16 +10901,16 @@
         </w:rPr>
         <w:lastRenderedPageBreak/>
         <w:drawing>
-          <wp:inline distT="0" distB="0" distL="0" distR="0" wp14:anchorId="12BF4C0C" wp14:editId="36452386">
+          <wp:inline distT="0" distB="0" distL="0" distR="0" wp14:anchorId="1445D879" wp14:editId="7DC72A64">
             <wp:extent cx="5120640" cy="4627581"/>
             <wp:effectExtent l="19050" t="19050" r="22860" b="20955"/>
-            <wp:docPr id="219693784" name="Imagem 24"/>
+            <wp:docPr id="1981243207" name="Imagem 24"/>
             <wp:cNvGraphicFramePr/>
             <a:graphic xmlns:a="http://schemas.openxmlformats.org/drawingml/2006/main">
               <a:graphicData uri="http://schemas.openxmlformats.org/drawingml/2006/picture">
                 <pic:pic xmlns:pic="http://schemas.openxmlformats.org/drawingml/2006/picture">
                   <pic:nvPicPr>
-                    <pic:cNvPr id="219693784" name=""/>
+                    <pic:cNvPr id="1981243207" name=""/>
                     <pic:cNvPicPr/>
                   </pic:nvPicPr>
                   <pic:blipFill>
@@ -10960,16 +10978,16 @@
         </w:rPr>
         <w:lastRenderedPageBreak/>
         <w:drawing>
-          <wp:inline distT="0" distB="0" distL="0" distR="0" wp14:anchorId="6FBA5835" wp14:editId="4C2241D3">
+          <wp:inline distT="0" distB="0" distL="0" distR="0" wp14:anchorId="7F3DCB2B" wp14:editId="4D7DECF7">
             <wp:extent cx="5120640" cy="4627581"/>
             <wp:effectExtent l="19050" t="19050" r="22860" b="20955"/>
-            <wp:docPr id="736960871" name="Imagem 25"/>
+            <wp:docPr id="1544407318" name="Imagem 25"/>
             <wp:cNvGraphicFramePr/>
             <a:graphic xmlns:a="http://schemas.openxmlformats.org/drawingml/2006/main">
               <a:graphicData uri="http://schemas.openxmlformats.org/drawingml/2006/picture">
                 <pic:pic xmlns:pic="http://schemas.openxmlformats.org/drawingml/2006/picture">
                   <pic:nvPicPr>
-                    <pic:cNvPr id="736960871" name=""/>
+                    <pic:cNvPr id="1544407318" name=""/>
                     <pic:cNvPicPr/>
                   </pic:nvPicPr>
                   <pic:blipFill>
@@ -11103,7 +11121,7 @@
           <w:sz w:val="27"/>
         </w:rPr>
       </w:pPr>
-      <w:bookmarkStart w:id="23" w:name="_Toc236229036"/>
+      <w:bookmarkStart w:id="23" w:name="_Toc236232007"/>
       <w:r>
         <w:rPr>
           <w:rFonts w:ascii="Montserrat" w:hAnsi="Montserrat"/>
@@ -11144,16 +11162,16 @@
         </w:rPr>
         <w:lastRenderedPageBreak/>
         <w:drawing>
-          <wp:inline distT="0" distB="0" distL="0" distR="0" wp14:anchorId="26C41E23" wp14:editId="70895EF6">
+          <wp:inline distT="0" distB="0" distL="0" distR="0" wp14:anchorId="7545E55A" wp14:editId="0BCB4C7C">
             <wp:extent cx="5120640" cy="4627581"/>
             <wp:effectExtent l="19050" t="19050" r="22860" b="20955"/>
-            <wp:docPr id="604440791" name="Imagem 26"/>
+            <wp:docPr id="543630965" name="Imagem 26"/>
             <wp:cNvGraphicFramePr/>
             <a:graphic xmlns:a="http://schemas.openxmlformats.org/drawingml/2006/main">
               <a:graphicData uri="http://schemas.openxmlformats.org/drawingml/2006/picture">
                 <pic:pic xmlns:pic="http://schemas.openxmlformats.org/drawingml/2006/picture">
                   <pic:nvPicPr>
-                    <pic:cNvPr id="604440791" name=""/>
+                    <pic:cNvPr id="543630965" name=""/>
                     <pic:cNvPicPr/>
                   </pic:nvPicPr>
                   <pic:blipFill>
@@ -11243,7 +11261,7 @@
           <w:sz w:val="34"/>
         </w:rPr>
       </w:pPr>
-      <w:bookmarkStart w:id="24" w:name="_Toc236229037"/>
+      <w:bookmarkStart w:id="24" w:name="_Toc236232008"/>
       <w:r>
         <w:rPr>
           <w:rFonts w:ascii="Montserrat" w:hAnsi="Montserrat"/>
@@ -11285,7 +11303,7 @@
           <w:sz w:val="27"/>
         </w:rPr>
       </w:pPr>
-      <w:bookmarkStart w:id="25" w:name="_Toc236229038"/>
+      <w:bookmarkStart w:id="25" w:name="_Toc236232009"/>
       <w:r>
         <w:rPr>
           <w:rFonts w:ascii="Montserrat" w:hAnsi="Montserrat"/>
@@ -11325,16 +11343,16 @@
           <w:noProof/>
         </w:rPr>
         <w:drawing>
-          <wp:inline distT="0" distB="0" distL="0" distR="0" wp14:anchorId="00149249" wp14:editId="552A6416">
+          <wp:inline distT="0" distB="0" distL="0" distR="0" wp14:anchorId="3A5C1709" wp14:editId="5572D77A">
             <wp:extent cx="5120640" cy="4627581"/>
             <wp:effectExtent l="19050" t="19050" r="22860" b="20955"/>
-            <wp:docPr id="1551347803" name="Imagem 27"/>
+            <wp:docPr id="316273961" name="Imagem 27"/>
             <wp:cNvGraphicFramePr/>
             <a:graphic xmlns:a="http://schemas.openxmlformats.org/drawingml/2006/main">
               <a:graphicData uri="http://schemas.openxmlformats.org/drawingml/2006/picture">
                 <pic:pic xmlns:pic="http://schemas.openxmlformats.org/drawingml/2006/picture">
                   <pic:nvPicPr>
-                    <pic:cNvPr id="1551347803" name=""/>
+                    <pic:cNvPr id="316273961" name=""/>
                     <pic:cNvPicPr/>
                   </pic:nvPicPr>
                   <pic:blipFill>
@@ -11402,16 +11420,16 @@
         </w:rPr>
         <w:lastRenderedPageBreak/>
         <w:drawing>
-          <wp:inline distT="0" distB="0" distL="0" distR="0" wp14:anchorId="50DCD66C" wp14:editId="6D534F67">
+          <wp:inline distT="0" distB="0" distL="0" distR="0" wp14:anchorId="59A53A7D" wp14:editId="2B41E242">
             <wp:extent cx="5120640" cy="4627581"/>
             <wp:effectExtent l="19050" t="19050" r="22860" b="20955"/>
-            <wp:docPr id="931027169" name="Imagem 28"/>
+            <wp:docPr id="1942001168" name="Imagem 28"/>
             <wp:cNvGraphicFramePr/>
             <a:graphic xmlns:a="http://schemas.openxmlformats.org/drawingml/2006/main">
               <a:graphicData uri="http://schemas.openxmlformats.org/drawingml/2006/picture">
                 <pic:pic xmlns:pic="http://schemas.openxmlformats.org/drawingml/2006/picture">
                   <pic:nvPicPr>
-                    <pic:cNvPr id="931027169" name=""/>
+                    <pic:cNvPr id="1942001168" name=""/>
                     <pic:cNvPicPr/>
                   </pic:nvPicPr>
                   <pic:blipFill>
@@ -11479,16 +11497,16 @@
         </w:rPr>
         <w:lastRenderedPageBreak/>
         <w:drawing>
-          <wp:inline distT="0" distB="0" distL="0" distR="0" wp14:anchorId="4C3C6256" wp14:editId="1A0850F6">
+          <wp:inline distT="0" distB="0" distL="0" distR="0" wp14:anchorId="4C882A65" wp14:editId="2049D460">
             <wp:extent cx="5120640" cy="4627581"/>
             <wp:effectExtent l="19050" t="19050" r="22860" b="20955"/>
-            <wp:docPr id="2062391480" name="Imagem 29"/>
+            <wp:docPr id="442747020" name="Imagem 29"/>
             <wp:cNvGraphicFramePr/>
             <a:graphic xmlns:a="http://schemas.openxmlformats.org/drawingml/2006/main">
               <a:graphicData uri="http://schemas.openxmlformats.org/drawingml/2006/picture">
                 <pic:pic xmlns:pic="http://schemas.openxmlformats.org/drawingml/2006/picture">
                   <pic:nvPicPr>
-                    <pic:cNvPr id="2062391480" name=""/>
+                    <pic:cNvPr id="442747020" name=""/>
                     <pic:cNvPicPr/>
                   </pic:nvPicPr>
                   <pic:blipFill>
@@ -11554,8 +11572,18 @@
         </w:numPr>
         <w:spacing w:after="80" w:line="260" w:lineRule="auto"/>
         <w:ind w:left="700"/>
-      </w:pPr>
-      <w:r>
+        <w:rPr>
+          <w:rFonts w:ascii="Montserrat" w:hAnsi="Montserrat"/>
+          <w:color w:val="1A1A1A"/>
+          <w:sz w:val="22"/>
+        </w:rPr>
+      </w:pPr>
+      <w:r>
+        <w:rPr>
+          <w:rFonts w:ascii="Montserrat" w:hAnsi="Montserrat"/>
+          <w:color w:val="1A1A1A"/>
+          <w:sz w:val="22"/>
+        </w:rPr>
         <w:t>Preencha o cabecalho (mes/ano de referencia, responsavel, previsao financeira, entregas planejadas).</w:t>
       </w:r>
     </w:p>
@@ -11672,16 +11700,16 @@
           <w:noProof/>
         </w:rPr>
         <w:drawing>
-          <wp:inline distT="0" distB="0" distL="0" distR="0" wp14:anchorId="377ADB6D" wp14:editId="7C2EA6E8">
+          <wp:inline distT="0" distB="0" distL="0" distR="0" wp14:anchorId="2FD5BDE6" wp14:editId="5947D3FB">
             <wp:extent cx="5120640" cy="3282818"/>
             <wp:effectExtent l="19050" t="19050" r="22860" b="13335"/>
-            <wp:docPr id="1069718818" name="Imagem 30"/>
+            <wp:docPr id="1758058106" name="Imagem 30"/>
             <wp:cNvGraphicFramePr/>
             <a:graphic xmlns:a="http://schemas.openxmlformats.org/drawingml/2006/main">
               <a:graphicData uri="http://schemas.openxmlformats.org/drawingml/2006/picture">
                 <pic:pic xmlns:pic="http://schemas.openxmlformats.org/drawingml/2006/picture">
                   <pic:nvPicPr>
-                    <pic:cNvPr id="1069718818" name=""/>
+                    <pic:cNvPr id="1758058106" name=""/>
                     <pic:cNvPicPr/>
                   </pic:nvPicPr>
                   <pic:blipFill>
@@ -11770,7 +11798,7 @@
           <w:sz w:val="27"/>
         </w:rPr>
       </w:pPr>
-      <w:bookmarkStart w:id="26" w:name="_Toc236229039"/>
+      <w:bookmarkStart w:id="26" w:name="_Toc236232010"/>
       <w:r>
         <w:rPr>
           <w:rFonts w:ascii="Montserrat" w:hAnsi="Montserrat"/>
@@ -11811,16 +11839,16 @@
         </w:rPr>
         <w:lastRenderedPageBreak/>
         <w:drawing>
-          <wp:inline distT="0" distB="0" distL="0" distR="0" wp14:anchorId="397D0536" wp14:editId="2C2BD9F4">
+          <wp:inline distT="0" distB="0" distL="0" distR="0" wp14:anchorId="38804A77" wp14:editId="08543890">
             <wp:extent cx="5120640" cy="4627581"/>
             <wp:effectExtent l="19050" t="19050" r="22860" b="20955"/>
-            <wp:docPr id="1356916765" name="Imagem 31"/>
+            <wp:docPr id="814729855" name="Imagem 31"/>
             <wp:cNvGraphicFramePr/>
             <a:graphic xmlns:a="http://schemas.openxmlformats.org/drawingml/2006/main">
               <a:graphicData uri="http://schemas.openxmlformats.org/drawingml/2006/picture">
                 <pic:pic xmlns:pic="http://schemas.openxmlformats.org/drawingml/2006/picture">
                   <pic:nvPicPr>
-                    <pic:cNvPr id="1356916765" name=""/>
+                    <pic:cNvPr id="814729855" name=""/>
                     <pic:cNvPicPr/>
                   </pic:nvPicPr>
                   <pic:blipFill>
@@ -11888,16 +11916,16 @@
         </w:rPr>
         <w:lastRenderedPageBreak/>
         <w:drawing>
-          <wp:inline distT="0" distB="0" distL="0" distR="0" wp14:anchorId="34872655" wp14:editId="391F4346">
+          <wp:inline distT="0" distB="0" distL="0" distR="0" wp14:anchorId="0C623835" wp14:editId="54471F26">
             <wp:extent cx="5120640" cy="4627581"/>
             <wp:effectExtent l="19050" t="19050" r="22860" b="20955"/>
-            <wp:docPr id="1822806245" name="Imagem 32"/>
+            <wp:docPr id="2135668506" name="Imagem 32"/>
             <wp:cNvGraphicFramePr/>
             <a:graphic xmlns:a="http://schemas.openxmlformats.org/drawingml/2006/main">
               <a:graphicData uri="http://schemas.openxmlformats.org/drawingml/2006/picture">
                 <pic:pic xmlns:pic="http://schemas.openxmlformats.org/drawingml/2006/picture">
                   <pic:nvPicPr>
-                    <pic:cNvPr id="1822806245" name=""/>
+                    <pic:cNvPr id="2135668506" name=""/>
                     <pic:cNvPicPr/>
                   </pic:nvPicPr>
                   <pic:blipFill>
@@ -12044,112 +12072,7 @@
           <w:color w:val="6A6A70"/>
           <w:sz w:val="21"/>
         </w:rPr>
-        <w:t>So depois do Gate 2 pactuado o projeto deve avancar para a execucao. Um projeto que comeca a ser executado sem essa pactuacao corre o risco de ser questionado ou desautorizado em momentos criticos.</w:t>
-      </w:r>
-    </w:p>
-    <w:p>
-      <w:pPr>
-        <w:pStyle w:val="Ttulo1"/>
-        <w:pageBreakBefore/>
-        <w:pBdr>
-          <w:bottom w:val="single" w:sz="4" w:space="0" w:color="E4E4E7"/>
-        </w:pBdr>
-        <w:spacing w:before="80" w:after="200"/>
-        <w:rPr>
-          <w:rFonts w:ascii="Montserrat" w:hAnsi="Montserrat"/>
-          <w:b/>
-          <w:color w:val="1A1A1A"/>
-          <w:sz w:val="34"/>
-        </w:rPr>
-      </w:pPr>
-      <w:bookmarkStart w:id="27" w:name="_Toc236229040"/>
-      <w:r>
-        <w:rPr>
-          <w:rFonts w:ascii="Montserrat" w:hAnsi="Montserrat"/>
-          <w:b/>
-          <w:color w:val="1A1A1A"/>
-          <w:sz w:val="34"/>
-        </w:rPr>
-        <w:lastRenderedPageBreak/>
-        <w:t>5. Validador de Projetos</w:t>
-      </w:r>
-      <w:bookmarkEnd w:id="27"/>
-    </w:p>
-    <w:p>
-      <w:pPr>
-        <w:spacing w:line="280" w:lineRule="auto"/>
-        <w:rPr>
-          <w:rFonts w:ascii="Montserrat" w:hAnsi="Montserrat"/>
-          <w:color w:val="1A1A1A"/>
-          <w:sz w:val="22"/>
-        </w:rPr>
-      </w:pPr>
-      <w:r>
-        <w:rPr>
-          <w:rFonts w:ascii="Montserrat" w:hAnsi="Montserrat"/>
-          <w:color w:val="1A1A1A"/>
-          <w:sz w:val="22"/>
-        </w:rPr>
-        <w:t>O Validador de Projetos e uma ferramenta de apoio a decisao sobre Fatores Criticos de Sucesso (FCS) e Beneficios em instituicoes de ensino. Diferente dos 12 formularios de registro, ele nao gera um artefato FORALF - e um painel de reflexao e diagnostico.</w:t>
-      </w:r>
-    </w:p>
-    <w:p>
-      <w:pPr>
-        <w:spacing w:line="280" w:lineRule="auto"/>
-        <w:rPr>
-          <w:rFonts w:ascii="Montserrat" w:hAnsi="Montserrat"/>
-          <w:color w:val="1A1A1A"/>
-          <w:sz w:val="22"/>
-        </w:rPr>
-      </w:pPr>
-      <w:r>
-        <w:rPr>
-          <w:rFonts w:ascii="Montserrat" w:hAnsi="Montserrat"/>
-          <w:color w:val="1A1A1A"/>
-          <w:sz w:val="22"/>
-        </w:rPr>
-        <w:t>E a unica ferramenta, alem do Mapa de Diretrizes, que nao exige login. Todo o conteudo funciona livremente; login so e pedido para vincular uma avaliacao a um projeto e salvar o veredito no historico daquele projeto (secao 2.6 do documento Regras de Acesso detalha esse caso).</w:t>
-      </w:r>
-    </w:p>
-    <w:p>
-      <w:pPr>
-        <w:pStyle w:val="Ttulo2"/>
-        <w:spacing w:before="320" w:after="120"/>
-        <w:rPr>
-          <w:rFonts w:ascii="Montserrat" w:hAnsi="Montserrat"/>
-          <w:b/>
-          <w:color w:val="B91D2E"/>
-          <w:sz w:val="27"/>
-        </w:rPr>
-      </w:pPr>
-      <w:bookmarkStart w:id="28" w:name="_Toc236229041"/>
-      <w:r>
-        <w:rPr>
-          <w:rFonts w:ascii="Montserrat" w:hAnsi="Montserrat"/>
-          <w:b/>
-          <w:color w:val="B91D2E"/>
-          <w:sz w:val="27"/>
-        </w:rPr>
-        <w:t>5.1 Quadro de conexoes</w:t>
-      </w:r>
-      <w:bookmarkEnd w:id="28"/>
-    </w:p>
-    <w:p>
-      <w:pPr>
-        <w:spacing w:line="280" w:lineRule="auto"/>
-        <w:rPr>
-          <w:rFonts w:ascii="Montserrat" w:hAnsi="Montserrat"/>
-          <w:color w:val="1A1A1A"/>
-          <w:sz w:val="22"/>
-        </w:rPr>
-      </w:pPr>
-      <w:r>
-        <w:rPr>
-          <w:rFonts w:ascii="Montserrat" w:hAnsi="Montserrat"/>
-          <w:color w:val="1A1A1A"/>
-          <w:sz w:val="22"/>
-        </w:rPr>
-        <w:t>Mostra a matriz analitica entre 7 fatores criticos de sucesso (F1-F7) e 5 dimensoes de beneficio (B1-B5). Clique em um fator ou dimensao para ver as conexoes.</w:t>
+        <w:t>Gate 2 - Pactuacao: no topo da aba Editar dados ha um cartao Gate 2 - Pactuacao com Status (Pendente de pactuacao / Pactuado), Data de pactuacao e Aprovador. Assim como o Gate 1 da Solicitacao de Demanda, so o Admin consegue alterar o Status - qualquer outro papel ve o controle travado com um aviso. Ao marcar Pactuado, a Data e o Aprovador sao preenchidos automaticamente (editaveis). Enquanto o status estiver Pactuado, todos os demais campos do relatorio ficam bloqueados para edicao, inclusive para o Admin, ate que o Gate 2 seja reaberto (status volte para Pendente de pactuacao).</w:t>
       </w:r>
     </w:p>
     <w:p>
@@ -12161,17 +12084,18 @@
         <w:rPr>
           <w:noProof/>
         </w:rPr>
+        <w:lastRenderedPageBreak/>
         <w:drawing>
-          <wp:inline distT="0" distB="0" distL="0" distR="0" wp14:anchorId="733F2D61" wp14:editId="2A2CA4CC">
-            <wp:extent cx="5303520" cy="4792851"/>
-            <wp:effectExtent l="19050" t="19050" r="11430" b="27305"/>
-            <wp:docPr id="1798356301" name="Imagem 33"/>
+          <wp:inline distT="0" distB="0" distL="0" distR="0" wp14:anchorId="2ADFA9C7" wp14:editId="68342817">
+            <wp:extent cx="5120640" cy="3282818"/>
+            <wp:effectExtent l="19050" t="19050" r="22860" b="13335"/>
+            <wp:docPr id="1835255267" name="Imagem 33"/>
             <wp:cNvGraphicFramePr/>
             <a:graphic xmlns:a="http://schemas.openxmlformats.org/drawingml/2006/main">
               <a:graphicData uri="http://schemas.openxmlformats.org/drawingml/2006/picture">
                 <pic:pic xmlns:pic="http://schemas.openxmlformats.org/drawingml/2006/picture">
                   <pic:nvPicPr>
-                    <pic:cNvPr id="1798356301" name=""/>
+                    <pic:cNvPr id="1835255267" name=""/>
                     <pic:cNvPicPr/>
                   </pic:nvPicPr>
                   <pic:blipFill>
@@ -12189,7 +12113,7 @@
                   <pic:spPr>
                     <a:xfrm>
                       <a:off x="0" y="0"/>
-                      <a:ext cx="5303520" cy="4792851"/>
+                      <a:ext cx="5120640" cy="3282818"/>
                     </a:xfrm>
                     <a:prstGeom prst="rect">
                       <a:avLst/>
@@ -12225,8 +12149,92 @@
           <w:color w:val="6A6A70"/>
           <w:sz w:val="19"/>
         </w:rPr>
+        <w:t>Cartao Gate 2 - Pactuacao preenchido, com o relatorio travado apos a pactuacao.</w:t>
+      </w:r>
+    </w:p>
+    <w:p>
+      <w:pPr>
+        <w:spacing w:before="160" w:after="200"/>
+        <w:ind w:left="283"/>
+        <w:rPr>
+          <w:rFonts w:ascii="Montserrat" w:hAnsi="Montserrat"/>
+          <w:i/>
+          <w:color w:val="6A6A70"/>
+          <w:sz w:val="21"/>
+        </w:rPr>
+      </w:pPr>
+      <w:r>
+        <w:rPr>
+          <w:rFonts w:ascii="Montserrat" w:hAnsi="Montserrat"/>
+          <w:i/>
+          <w:color w:val="6A6A70"/>
+          <w:sz w:val="21"/>
+        </w:rPr>
+        <w:t>So depois do Gate 2 pactuado o projeto deve avancar para a execucao. Um projeto que comeca a ser executado sem essa pactuacao corre o risco de ser questionado ou desautorizado em momentos criticos.</w:t>
+      </w:r>
+    </w:p>
+    <w:p>
+      <w:pPr>
+        <w:pStyle w:val="Ttulo1"/>
+        <w:pageBreakBefore/>
+        <w:pBdr>
+          <w:bottom w:val="single" w:sz="4" w:space="0" w:color="E4E4E7"/>
+        </w:pBdr>
+        <w:spacing w:before="80" w:after="200"/>
+        <w:rPr>
+          <w:rFonts w:ascii="Montserrat" w:hAnsi="Montserrat"/>
+          <w:b/>
+          <w:color w:val="1A1A1A"/>
+          <w:sz w:val="34"/>
+        </w:rPr>
+      </w:pPr>
+      <w:bookmarkStart w:id="27" w:name="_Toc236232011"/>
+      <w:r>
+        <w:rPr>
+          <w:rFonts w:ascii="Montserrat" w:hAnsi="Montserrat"/>
+          <w:b/>
+          <w:color w:val="1A1A1A"/>
+          <w:sz w:val="34"/>
+        </w:rPr>
         <w:lastRenderedPageBreak/>
-        <w:t>Quadro de conexoes com o fator F1 selecionado - o painel a direita mostra os beneficios que ele habilita.</w:t>
+        <w:t>5. Validador de Projetos</w:t>
+      </w:r>
+      <w:bookmarkEnd w:id="27"/>
+    </w:p>
+    <w:p>
+      <w:pPr>
+        <w:spacing w:line="280" w:lineRule="auto"/>
+        <w:rPr>
+          <w:rFonts w:ascii="Montserrat" w:hAnsi="Montserrat"/>
+          <w:color w:val="1A1A1A"/>
+          <w:sz w:val="22"/>
+        </w:rPr>
+      </w:pPr>
+      <w:r>
+        <w:rPr>
+          <w:rFonts w:ascii="Montserrat" w:hAnsi="Montserrat"/>
+          <w:color w:val="1A1A1A"/>
+          <w:sz w:val="22"/>
+        </w:rPr>
+        <w:t>O Validador de Projetos e uma ferramenta de apoio a decisao sobre Fatores Criticos de Sucesso (FCS) e Beneficios em instituicoes de ensino. Diferente dos 12 formularios de registro, ele nao gera um artefato FORALF - e um painel de reflexao e diagnostico.</w:t>
+      </w:r>
+    </w:p>
+    <w:p>
+      <w:pPr>
+        <w:spacing w:line="280" w:lineRule="auto"/>
+        <w:rPr>
+          <w:rFonts w:ascii="Montserrat" w:hAnsi="Montserrat"/>
+          <w:color w:val="1A1A1A"/>
+          <w:sz w:val="22"/>
+        </w:rPr>
+      </w:pPr>
+      <w:r>
+        <w:rPr>
+          <w:rFonts w:ascii="Montserrat" w:hAnsi="Montserrat"/>
+          <w:color w:val="1A1A1A"/>
+          <w:sz w:val="22"/>
+        </w:rPr>
+        <w:t>E a unica ferramenta, alem do Mapa de Diretrizes, que nao exige login. Todo o conteudo funciona livremente; login so e pedido para vincular uma avaliacao a um projeto e salvar o veredito no historico daquele projeto (secao 2.6 do documento Regras de Acesso detalha esse caso).</w:t>
       </w:r>
     </w:p>
     <w:p>
@@ -12240,7 +12248,7 @@
           <w:sz w:val="27"/>
         </w:rPr>
       </w:pPr>
-      <w:bookmarkStart w:id="29" w:name="_Toc236229042"/>
+      <w:bookmarkStart w:id="28" w:name="_Toc236232012"/>
       <w:r>
         <w:rPr>
           <w:rFonts w:ascii="Montserrat" w:hAnsi="Montserrat"/>
@@ -12248,9 +12256,9 @@
           <w:color w:val="B91D2E"/>
           <w:sz w:val="27"/>
         </w:rPr>
-        <w:t>5.2 Simulador - e se...?</w:t>
-      </w:r>
-      <w:bookmarkEnd w:id="29"/>
+        <w:t>5.1 Quadro de conexoes</w:t>
+      </w:r>
+      <w:bookmarkEnd w:id="28"/>
     </w:p>
     <w:p>
       <w:pPr>
@@ -12267,7 +12275,7 @@
           <w:color w:val="1A1A1A"/>
           <w:sz w:val="22"/>
         </w:rPr>
-        <w:t>Ajuste o quanto cada fator esta presente no seu projeto (0-100%) e veja o potencial estimado de cada dimensao de beneficio recalcular em tempo real.</w:t>
+        <w:t>Mostra a matriz analitica entre 7 fatores criticos de sucesso (F1-F7) e 5 dimensoes de beneficio (B1-B5). Clique em um fator ou dimensao para ver as conexoes.</w:t>
       </w:r>
     </w:p>
     <w:p>
@@ -12280,16 +12288,16 @@
           <w:noProof/>
         </w:rPr>
         <w:drawing>
-          <wp:inline distT="0" distB="0" distL="0" distR="0" wp14:anchorId="7C5C68A4" wp14:editId="577A254D">
+          <wp:inline distT="0" distB="0" distL="0" distR="0" wp14:anchorId="564E3770" wp14:editId="6FD9B248">
             <wp:extent cx="5303520" cy="4792851"/>
             <wp:effectExtent l="19050" t="19050" r="11430" b="27305"/>
-            <wp:docPr id="839013559" name="Imagem 34"/>
+            <wp:docPr id="370350928" name="Imagem 34"/>
             <wp:cNvGraphicFramePr/>
             <a:graphic xmlns:a="http://schemas.openxmlformats.org/drawingml/2006/main">
               <a:graphicData uri="http://schemas.openxmlformats.org/drawingml/2006/picture">
                 <pic:pic xmlns:pic="http://schemas.openxmlformats.org/drawingml/2006/picture">
                   <pic:nvPicPr>
-                    <pic:cNvPr id="839013559" name=""/>
+                    <pic:cNvPr id="370350928" name=""/>
                     <pic:cNvPicPr/>
                   </pic:nvPicPr>
                   <pic:blipFill>
@@ -12343,7 +12351,8 @@
           <w:color w:val="6A6A70"/>
           <w:sz w:val="19"/>
         </w:rPr>
-        <w:t>Simulador de fatores x beneficios. Abaixo dele, o aviso de login para quem quiser vincular a um projeto.</w:t>
+        <w:lastRenderedPageBreak/>
+        <w:t>Quadro de conexoes com o fator F1 selecionado - o painel a direita mostra os beneficios que ele habilita.</w:t>
       </w:r>
     </w:p>
     <w:p>
@@ -12357,7 +12366,7 @@
           <w:sz w:val="27"/>
         </w:rPr>
       </w:pPr>
-      <w:bookmarkStart w:id="30" w:name="_Toc236229043"/>
+      <w:bookmarkStart w:id="29" w:name="_Toc236232013"/>
       <w:r>
         <w:rPr>
           <w:rFonts w:ascii="Montserrat" w:hAnsi="Montserrat"/>
@@ -12365,9 +12374,9 @@
           <w:color w:val="B91D2E"/>
           <w:sz w:val="27"/>
         </w:rPr>
-        <w:t>5.3 Assistente de decisao em 8 perguntas</w:t>
-      </w:r>
-      <w:bookmarkEnd w:id="30"/>
+        <w:t>5.2 Simulador - e se...?</w:t>
+      </w:r>
+      <w:bookmarkEnd w:id="29"/>
     </w:p>
     <w:p>
       <w:pPr>
@@ -12384,7 +12393,7 @@
           <w:color w:val="1A1A1A"/>
           <w:sz w:val="22"/>
         </w:rPr>
-        <w:t>Responda a oito perguntas do semaforo de decisao, uma de cada vez. Ao final, o painel devolve um veredito com a regra aplicada.</w:t>
+        <w:t>Ajuste o quanto cada fator esta presente no seu projeto (0-100%) e veja o potencial estimado de cada dimensao de beneficio recalcular em tempo real.</w:t>
       </w:r>
     </w:p>
     <w:p>
@@ -12396,18 +12405,17 @@
         <w:rPr>
           <w:noProof/>
         </w:rPr>
-        <w:lastRenderedPageBreak/>
         <w:drawing>
-          <wp:inline distT="0" distB="0" distL="0" distR="0" wp14:anchorId="63BBECBA" wp14:editId="680B753B">
+          <wp:inline distT="0" distB="0" distL="0" distR="0" wp14:anchorId="5D27B858" wp14:editId="4936142D">
             <wp:extent cx="5303520" cy="4792851"/>
             <wp:effectExtent l="19050" t="19050" r="11430" b="27305"/>
-            <wp:docPr id="348928753" name="Imagem 35"/>
+            <wp:docPr id="1222796283" name="Imagem 35"/>
             <wp:cNvGraphicFramePr/>
             <a:graphic xmlns:a="http://schemas.openxmlformats.org/drawingml/2006/main">
               <a:graphicData uri="http://schemas.openxmlformats.org/drawingml/2006/picture">
                 <pic:pic xmlns:pic="http://schemas.openxmlformats.org/drawingml/2006/picture">
                   <pic:nvPicPr>
-                    <pic:cNvPr id="348928753" name=""/>
+                    <pic:cNvPr id="1222796283" name=""/>
                     <pic:cNvPicPr/>
                   </pic:nvPicPr>
                   <pic:blipFill>
@@ -12461,7 +12469,48 @@
           <w:color w:val="6A6A70"/>
           <w:sz w:val="19"/>
         </w:rPr>
-        <w:t>Primeira pergunta do assistente de decisao.</w:t>
+        <w:t>Simulador de fatores x beneficios. Abaixo dele, o aviso de login para quem quiser vincular a um projeto.</w:t>
+      </w:r>
+    </w:p>
+    <w:p>
+      <w:pPr>
+        <w:pStyle w:val="Ttulo2"/>
+        <w:spacing w:before="320" w:after="120"/>
+        <w:rPr>
+          <w:rFonts w:ascii="Montserrat" w:hAnsi="Montserrat"/>
+          <w:b/>
+          <w:color w:val="B91D2E"/>
+          <w:sz w:val="27"/>
+        </w:rPr>
+      </w:pPr>
+      <w:bookmarkStart w:id="30" w:name="_Toc236232014"/>
+      <w:r>
+        <w:rPr>
+          <w:rFonts w:ascii="Montserrat" w:hAnsi="Montserrat"/>
+          <w:b/>
+          <w:color w:val="B91D2E"/>
+          <w:sz w:val="27"/>
+        </w:rPr>
+        <w:t>5.3 Assistente de decisao em 8 perguntas</w:t>
+      </w:r>
+      <w:bookmarkEnd w:id="30"/>
+    </w:p>
+    <w:p>
+      <w:pPr>
+        <w:spacing w:line="280" w:lineRule="auto"/>
+        <w:rPr>
+          <w:rFonts w:ascii="Montserrat" w:hAnsi="Montserrat"/>
+          <w:color w:val="1A1A1A"/>
+          <w:sz w:val="22"/>
+        </w:rPr>
+      </w:pPr>
+      <w:r>
+        <w:rPr>
+          <w:rFonts w:ascii="Montserrat" w:hAnsi="Montserrat"/>
+          <w:color w:val="1A1A1A"/>
+          <w:sz w:val="22"/>
+        </w:rPr>
+        <w:t>Responda a oito perguntas do semaforo de decisao, uma de cada vez. Ao final, o painel devolve um veredito com a regra aplicada.</w:t>
       </w:r>
     </w:p>
     <w:p>
@@ -12475,16 +12524,16 @@
         </w:rPr>
         <w:lastRenderedPageBreak/>
         <w:drawing>
-          <wp:inline distT="0" distB="0" distL="0" distR="0" wp14:anchorId="4FA355AB" wp14:editId="1F650BF4">
+          <wp:inline distT="0" distB="0" distL="0" distR="0" wp14:anchorId="3D941B9D" wp14:editId="349DFB41">
             <wp:extent cx="5303520" cy="4792851"/>
             <wp:effectExtent l="19050" t="19050" r="11430" b="27305"/>
-            <wp:docPr id="1133472960" name="Imagem 36"/>
+            <wp:docPr id="470333512" name="Imagem 36"/>
             <wp:cNvGraphicFramePr/>
             <a:graphic xmlns:a="http://schemas.openxmlformats.org/drawingml/2006/main">
               <a:graphicData uri="http://schemas.openxmlformats.org/drawingml/2006/picture">
                 <pic:pic xmlns:pic="http://schemas.openxmlformats.org/drawingml/2006/picture">
                   <pic:nvPicPr>
-                    <pic:cNvPr id="1133472960" name=""/>
+                    <pic:cNvPr id="470333512" name=""/>
                     <pic:cNvPicPr/>
                   </pic:nvPicPr>
                   <pic:blipFill>
@@ -12538,115 +12587,7 @@
           <w:color w:val="6A6A70"/>
           <w:sz w:val="19"/>
         </w:rPr>
-        <w:t>Veredito final, com o placar de respostas verdes/amarelas/vermelhas.</w:t>
-      </w:r>
-    </w:p>
-    <w:p>
-      <w:pPr>
-        <w:spacing w:before="160" w:after="200"/>
-        <w:ind w:left="283"/>
-        <w:rPr>
-          <w:rFonts w:ascii="Montserrat" w:hAnsi="Montserrat"/>
-          <w:i/>
-          <w:color w:val="6A6A70"/>
-          <w:sz w:val="21"/>
-        </w:rPr>
-      </w:pPr>
-      <w:r>
-        <w:rPr>
-          <w:rFonts w:ascii="Montserrat" w:hAnsi="Montserrat"/>
-          <w:i/>
-          <w:color w:val="6A6A70"/>
-          <w:sz w:val="21"/>
-        </w:rPr>
-        <w:t>Regra aplicada: qualquer resposta vermelha leva a encerrar/repactuar; tres ou mais amarelas levam a replanejar; caso contrario, o veredito e concluir.</w:t>
-      </w:r>
-    </w:p>
-    <w:p>
-      <w:pPr>
-        <w:pStyle w:val="Ttulo1"/>
-        <w:pageBreakBefore/>
-        <w:pBdr>
-          <w:bottom w:val="single" w:sz="4" w:space="0" w:color="E4E4E7"/>
-        </w:pBdr>
-        <w:spacing w:before="80" w:after="200"/>
-        <w:rPr>
-          <w:rFonts w:ascii="Montserrat" w:hAnsi="Montserrat"/>
-          <w:b/>
-          <w:color w:val="1A1A1A"/>
-          <w:sz w:val="34"/>
-        </w:rPr>
-      </w:pPr>
-      <w:bookmarkStart w:id="31" w:name="_Toc236229044"/>
-      <w:r>
-        <w:rPr>
-          <w:rFonts w:ascii="Montserrat" w:hAnsi="Montserrat"/>
-          <w:b/>
-          <w:color w:val="1A1A1A"/>
-          <w:sz w:val="34"/>
-        </w:rPr>
-        <w:lastRenderedPageBreak/>
-        <w:t>6. Administracao do sistema</w:t>
-      </w:r>
-      <w:bookmarkEnd w:id="31"/>
-    </w:p>
-    <w:p>
-      <w:pPr>
-        <w:spacing w:line="280" w:lineRule="auto"/>
-        <w:rPr>
-          <w:rFonts w:ascii="Montserrat" w:hAnsi="Montserrat"/>
-          <w:color w:val="1A1A1A"/>
-          <w:sz w:val="22"/>
-        </w:rPr>
-      </w:pPr>
-      <w:r>
-        <w:rPr>
-          <w:rFonts w:ascii="Montserrat" w:hAnsi="Montserrat"/>
-          <w:color w:val="1A1A1A"/>
-          <w:sz w:val="22"/>
-        </w:rPr>
-        <w:t>Pagina restrita a usuarios com papel Admin (secao 2.3). Reune tres abas: Usuarios, Equipes e Configuracoes.</w:t>
-      </w:r>
-    </w:p>
-    <w:p>
-      <w:pPr>
-        <w:pStyle w:val="Ttulo2"/>
-        <w:spacing w:before="320" w:after="120"/>
-        <w:rPr>
-          <w:rFonts w:ascii="Montserrat" w:hAnsi="Montserrat"/>
-          <w:b/>
-          <w:color w:val="B91D2E"/>
-          <w:sz w:val="27"/>
-        </w:rPr>
-      </w:pPr>
-      <w:bookmarkStart w:id="32" w:name="_Toc236229045"/>
-      <w:r>
-        <w:rPr>
-          <w:rFonts w:ascii="Montserrat" w:hAnsi="Montserrat"/>
-          <w:b/>
-          <w:color w:val="B91D2E"/>
-          <w:sz w:val="27"/>
-        </w:rPr>
-        <w:t>6.1 Usuarios</w:t>
-      </w:r>
-      <w:bookmarkEnd w:id="32"/>
-    </w:p>
-    <w:p>
-      <w:pPr>
-        <w:spacing w:line="280" w:lineRule="auto"/>
-        <w:rPr>
-          <w:rFonts w:ascii="Montserrat" w:hAnsi="Montserrat"/>
-          <w:color w:val="1A1A1A"/>
-          <w:sz w:val="22"/>
-        </w:rPr>
-      </w:pPr>
-      <w:r>
-        <w:rPr>
-          <w:rFonts w:ascii="Montserrat" w:hAnsi="Montserrat"/>
-          <w:color w:val="1A1A1A"/>
-          <w:sz w:val="22"/>
-        </w:rPr>
-        <w:t>Lista todos os usuarios que ja fizeram login pelo menos uma vez, com o papel atual e um seletor para altera-lo.</w:t>
+        <w:t>Primeira pergunta do assistente de decisao.</w:t>
       </w:r>
     </w:p>
     <w:p>
@@ -12658,17 +12599,18 @@
         <w:rPr>
           <w:noProof/>
         </w:rPr>
+        <w:lastRenderedPageBreak/>
         <w:drawing>
-          <wp:inline distT="0" distB="0" distL="0" distR="0" wp14:anchorId="1CFA1DC1" wp14:editId="7DFBC8E5">
+          <wp:inline distT="0" distB="0" distL="0" distR="0" wp14:anchorId="21AD07A3" wp14:editId="7A92EB1E">
             <wp:extent cx="5303520" cy="4792851"/>
             <wp:effectExtent l="19050" t="19050" r="11430" b="27305"/>
-            <wp:docPr id="676666280" name="Imagem 37"/>
+            <wp:docPr id="818715976" name="Imagem 37"/>
             <wp:cNvGraphicFramePr/>
             <a:graphic xmlns:a="http://schemas.openxmlformats.org/drawingml/2006/main">
               <a:graphicData uri="http://schemas.openxmlformats.org/drawingml/2006/picture">
                 <pic:pic xmlns:pic="http://schemas.openxmlformats.org/drawingml/2006/picture">
                   <pic:nvPicPr>
-                    <pic:cNvPr id="676666280" name=""/>
+                    <pic:cNvPr id="818715976" name=""/>
                     <pic:cNvPicPr/>
                   </pic:nvPicPr>
                   <pic:blipFill>
@@ -12722,7 +12664,74 @@
           <w:color w:val="6A6A70"/>
           <w:sz w:val="19"/>
         </w:rPr>
-        <w:t>Aba Usuarios: papel atual e seletor de alteracao de papel por usuario.</w:t>
+        <w:t>Veredito final, com o placar de respostas verdes/amarelas/vermelhas.</w:t>
+      </w:r>
+    </w:p>
+    <w:p>
+      <w:pPr>
+        <w:spacing w:before="160" w:after="200"/>
+        <w:ind w:left="283"/>
+        <w:rPr>
+          <w:rFonts w:ascii="Montserrat" w:hAnsi="Montserrat"/>
+          <w:i/>
+          <w:color w:val="6A6A70"/>
+          <w:sz w:val="21"/>
+        </w:rPr>
+      </w:pPr>
+      <w:r>
+        <w:rPr>
+          <w:rFonts w:ascii="Montserrat" w:hAnsi="Montserrat"/>
+          <w:i/>
+          <w:color w:val="6A6A70"/>
+          <w:sz w:val="21"/>
+        </w:rPr>
+        <w:t>Regra aplicada: qualquer resposta vermelha leva a encerrar/repactuar; tres ou mais amarelas levam a replanejar; caso contrario, o veredito e concluir.</w:t>
+      </w:r>
+    </w:p>
+    <w:p>
+      <w:pPr>
+        <w:pStyle w:val="Ttulo1"/>
+        <w:pageBreakBefore/>
+        <w:pBdr>
+          <w:bottom w:val="single" w:sz="4" w:space="0" w:color="E4E4E7"/>
+        </w:pBdr>
+        <w:spacing w:before="80" w:after="200"/>
+        <w:rPr>
+          <w:rFonts w:ascii="Montserrat" w:hAnsi="Montserrat"/>
+          <w:b/>
+          <w:color w:val="1A1A1A"/>
+          <w:sz w:val="34"/>
+        </w:rPr>
+      </w:pPr>
+      <w:bookmarkStart w:id="31" w:name="_Toc236232015"/>
+      <w:r>
+        <w:rPr>
+          <w:rFonts w:ascii="Montserrat" w:hAnsi="Montserrat"/>
+          <w:b/>
+          <w:color w:val="1A1A1A"/>
+          <w:sz w:val="34"/>
+        </w:rPr>
+        <w:lastRenderedPageBreak/>
+        <w:t>6. Administracao do sistema</w:t>
+      </w:r>
+      <w:bookmarkEnd w:id="31"/>
+    </w:p>
+    <w:p>
+      <w:pPr>
+        <w:spacing w:line="280" w:lineRule="auto"/>
+        <w:rPr>
+          <w:rFonts w:ascii="Montserrat" w:hAnsi="Montserrat"/>
+          <w:color w:val="1A1A1A"/>
+          <w:sz w:val="22"/>
+        </w:rPr>
+      </w:pPr>
+      <w:r>
+        <w:rPr>
+          <w:rFonts w:ascii="Montserrat" w:hAnsi="Montserrat"/>
+          <w:color w:val="1A1A1A"/>
+          <w:sz w:val="22"/>
+        </w:rPr>
+        <w:t>Pagina restrita a usuarios com papel Admin (secao 2.3). Reune tres abas: Usuarios, Equipes e Configuracoes.</w:t>
       </w:r>
     </w:p>
     <w:p>
@@ -12736,7 +12745,7 @@
           <w:sz w:val="27"/>
         </w:rPr>
       </w:pPr>
-      <w:bookmarkStart w:id="33" w:name="_Toc236229046"/>
+      <w:bookmarkStart w:id="32" w:name="_Toc236232016"/>
       <w:r>
         <w:rPr>
           <w:rFonts w:ascii="Montserrat" w:hAnsi="Montserrat"/>
@@ -12744,9 +12753,9 @@
           <w:color w:val="B91D2E"/>
           <w:sz w:val="27"/>
         </w:rPr>
-        <w:t>6.2 Equipes</w:t>
-      </w:r>
-      <w:bookmarkEnd w:id="33"/>
+        <w:t>6.1 Usuarios</w:t>
+      </w:r>
+      <w:bookmarkEnd w:id="32"/>
     </w:p>
     <w:p>
       <w:pPr>
@@ -12763,7 +12772,7 @@
           <w:color w:val="1A1A1A"/>
           <w:sz w:val="22"/>
         </w:rPr>
-        <w:t>Define quem faz parte da equipe de cada projeto - a base da restricao por equipe descrita na secao 2.5. Selecione um projeto, escolha um papel e clique em + Adicionar a equipe.</w:t>
+        <w:t>Lista todos os usuarios que ja fizeram login pelo menos uma vez, com o papel atual e um seletor para altera-lo.</w:t>
       </w:r>
     </w:p>
     <w:p>
@@ -12775,18 +12784,17 @@
         <w:rPr>
           <w:noProof/>
         </w:rPr>
-        <w:lastRenderedPageBreak/>
         <w:drawing>
-          <wp:inline distT="0" distB="0" distL="0" distR="0" wp14:anchorId="1A6AF51F" wp14:editId="0EB5D165">
+          <wp:inline distT="0" distB="0" distL="0" distR="0" wp14:anchorId="12BCB010" wp14:editId="02CF9CF3">
             <wp:extent cx="5303520" cy="4792851"/>
             <wp:effectExtent l="19050" t="19050" r="11430" b="27305"/>
-            <wp:docPr id="952027756" name="Imagem 38"/>
+            <wp:docPr id="247206850" name="Imagem 38"/>
             <wp:cNvGraphicFramePr/>
             <a:graphic xmlns:a="http://schemas.openxmlformats.org/drawingml/2006/main">
               <a:graphicData uri="http://schemas.openxmlformats.org/drawingml/2006/picture">
                 <pic:pic xmlns:pic="http://schemas.openxmlformats.org/drawingml/2006/picture">
                   <pic:nvPicPr>
-                    <pic:cNvPr id="952027756" name=""/>
+                    <pic:cNvPr id="247206850" name=""/>
                     <pic:cNvPicPr/>
                   </pic:nvPicPr>
                   <pic:blipFill>
@@ -12840,7 +12848,7 @@
           <w:color w:val="6A6A70"/>
           <w:sz w:val="19"/>
         </w:rPr>
-        <w:t>Aba Equipes, com um projeto selecionado e um membro ja cadastrado.</w:t>
+        <w:t>Aba Usuarios: papel atual e seletor de alteracao de papel por usuario.</w:t>
       </w:r>
     </w:p>
     <w:p>
@@ -12854,7 +12862,7 @@
           <w:sz w:val="27"/>
         </w:rPr>
       </w:pPr>
-      <w:bookmarkStart w:id="34" w:name="_Toc236229047"/>
+      <w:bookmarkStart w:id="33" w:name="_Toc236232017"/>
       <w:r>
         <w:rPr>
           <w:rFonts w:ascii="Montserrat" w:hAnsi="Montserrat"/>
@@ -12862,9 +12870,9 @@
           <w:color w:val="B91D2E"/>
           <w:sz w:val="27"/>
         </w:rPr>
-        <w:t>6.3 Configuracoes</w:t>
-      </w:r>
-      <w:bookmarkEnd w:id="34"/>
+        <w:t>6.2 Equipes</w:t>
+      </w:r>
+      <w:bookmarkEnd w:id="33"/>
     </w:p>
     <w:p>
       <w:pPr>
@@ -12881,7 +12889,7 @@
           <w:color w:val="1A1A1A"/>
           <w:sz w:val="22"/>
         </w:rPr>
-        <w:t>Controla os dois interruptores de acesso sem login (Solicitacao de Demanda e Ata de Reuniao), descritos na secao 2.6.</w:t>
+        <w:t>Define quem faz parte da equipe de cada projeto - a base da restricao por equipe descrita na secao 2.5. Selecione um projeto, escolha um papel e clique em + Adicionar a equipe.</w:t>
       </w:r>
     </w:p>
     <w:p>
@@ -12895,16 +12903,16 @@
         </w:rPr>
         <w:lastRenderedPageBreak/>
         <w:drawing>
-          <wp:inline distT="0" distB="0" distL="0" distR="0" wp14:anchorId="1E8C8158" wp14:editId="50447DAA">
+          <wp:inline distT="0" distB="0" distL="0" distR="0" wp14:anchorId="07C86D90" wp14:editId="2990377D">
             <wp:extent cx="5303520" cy="4792851"/>
             <wp:effectExtent l="19050" t="19050" r="11430" b="27305"/>
-            <wp:docPr id="1177514186" name="Imagem 39"/>
+            <wp:docPr id="1464876489" name="Imagem 39"/>
             <wp:cNvGraphicFramePr/>
             <a:graphic xmlns:a="http://schemas.openxmlformats.org/drawingml/2006/main">
               <a:graphicData uri="http://schemas.openxmlformats.org/drawingml/2006/picture">
                 <pic:pic xmlns:pic="http://schemas.openxmlformats.org/drawingml/2006/picture">
                   <pic:nvPicPr>
-                    <pic:cNvPr id="1177514186" name=""/>
+                    <pic:cNvPr id="1464876489" name=""/>
                     <pic:cNvPicPr/>
                   </pic:nvPicPr>
                   <pic:blipFill>
@@ -12958,6 +12966,124 @@
           <w:color w:val="6A6A70"/>
           <w:sz w:val="19"/>
         </w:rPr>
+        <w:t>Aba Equipes, com um projeto selecionado e um membro ja cadastrado.</w:t>
+      </w:r>
+    </w:p>
+    <w:p>
+      <w:pPr>
+        <w:pStyle w:val="Ttulo2"/>
+        <w:spacing w:before="320" w:after="120"/>
+        <w:rPr>
+          <w:rFonts w:ascii="Montserrat" w:hAnsi="Montserrat"/>
+          <w:b/>
+          <w:color w:val="B91D2E"/>
+          <w:sz w:val="27"/>
+        </w:rPr>
+      </w:pPr>
+      <w:bookmarkStart w:id="34" w:name="_Toc236232018"/>
+      <w:r>
+        <w:rPr>
+          <w:rFonts w:ascii="Montserrat" w:hAnsi="Montserrat"/>
+          <w:b/>
+          <w:color w:val="B91D2E"/>
+          <w:sz w:val="27"/>
+        </w:rPr>
+        <w:t>6.3 Configuracoes</w:t>
+      </w:r>
+      <w:bookmarkEnd w:id="34"/>
+    </w:p>
+    <w:p>
+      <w:pPr>
+        <w:spacing w:line="280" w:lineRule="auto"/>
+        <w:rPr>
+          <w:rFonts w:ascii="Montserrat" w:hAnsi="Montserrat"/>
+          <w:color w:val="1A1A1A"/>
+          <w:sz w:val="22"/>
+        </w:rPr>
+      </w:pPr>
+      <w:r>
+        <w:rPr>
+          <w:rFonts w:ascii="Montserrat" w:hAnsi="Montserrat"/>
+          <w:color w:val="1A1A1A"/>
+          <w:sz w:val="22"/>
+        </w:rPr>
+        <w:t>Controla os dois interruptores de acesso sem login (Solicitacao de Demanda e Ata de Reuniao), descritos na secao 2.6.</w:t>
+      </w:r>
+    </w:p>
+    <w:p>
+      <w:pPr>
+        <w:spacing w:before="120" w:after="40"/>
+        <w:jc w:val="center"/>
+      </w:pPr>
+      <w:r>
+        <w:rPr>
+          <w:noProof/>
+        </w:rPr>
+        <w:lastRenderedPageBreak/>
+        <w:drawing>
+          <wp:inline distT="0" distB="0" distL="0" distR="0" wp14:anchorId="0C26F9B5" wp14:editId="77C646AF">
+            <wp:extent cx="5303520" cy="4792851"/>
+            <wp:effectExtent l="19050" t="19050" r="11430" b="27305"/>
+            <wp:docPr id="46568854" name="Imagem 40"/>
+            <wp:cNvGraphicFramePr/>
+            <a:graphic xmlns:a="http://schemas.openxmlformats.org/drawingml/2006/main">
+              <a:graphicData uri="http://schemas.openxmlformats.org/drawingml/2006/picture">
+                <pic:pic xmlns:pic="http://schemas.openxmlformats.org/drawingml/2006/picture">
+                  <pic:nvPicPr>
+                    <pic:cNvPr id="46568854" name=""/>
+                    <pic:cNvPicPr/>
+                  </pic:nvPicPr>
+                  <pic:blipFill>
+                    <a:blip r:embed="rId46">
+                      <a:extLst>
+                        <a:ext uri="{28A0092B-C50C-407E-A947-70E740481C1C}">
+                          <a14:useLocalDpi xmlns:a14="http://schemas.microsoft.com/office/drawing/2010/main" val="0"/>
+                        </a:ext>
+                      </a:extLst>
+                    </a:blip>
+                    <a:stretch>
+                      <a:fillRect/>
+                    </a:stretch>
+                  </pic:blipFill>
+                  <pic:spPr>
+                    <a:xfrm>
+                      <a:off x="0" y="0"/>
+                      <a:ext cx="5303520" cy="4792851"/>
+                    </a:xfrm>
+                    <a:prstGeom prst="rect">
+                      <a:avLst/>
+                    </a:prstGeom>
+                    <a:ln w="9525">
+                      <a:solidFill>
+                        <a:srgbClr val="D1D5DB"/>
+                      </a:solidFill>
+                    </a:ln>
+                  </pic:spPr>
+                </pic:pic>
+              </a:graphicData>
+            </a:graphic>
+          </wp:inline>
+        </w:drawing>
+      </w:r>
+    </w:p>
+    <w:p>
+      <w:pPr>
+        <w:spacing w:before="120" w:after="280"/>
+        <w:jc w:val="center"/>
+        <w:rPr>
+          <w:rFonts w:ascii="Montserrat" w:hAnsi="Montserrat"/>
+          <w:i/>
+          <w:color w:val="6A6A70"/>
+          <w:sz w:val="19"/>
+        </w:rPr>
+      </w:pPr>
+      <w:r>
+        <w:rPr>
+          <w:rFonts w:ascii="Montserrat" w:hAnsi="Montserrat"/>
+          <w:i/>
+          <w:color w:val="6A6A70"/>
+          <w:sz w:val="19"/>
+        </w:rPr>
         <w:t>Aba Configuracoes: os dois interruptores de acesso sem login, hoje desativados.</w:t>
       </w:r>
     </w:p>
@@ -12976,7 +13102,7 @@
           <w:sz w:val="34"/>
         </w:rPr>
       </w:pPr>
-      <w:bookmarkStart w:id="35" w:name="_Toc236229048"/>
+      <w:bookmarkStart w:id="35" w:name="_Toc236232019"/>
       <w:r>
         <w:rPr>
           <w:rFonts w:ascii="Montserrat" w:hAnsi="Montserrat"/>
@@ -13220,7 +13346,7 @@
           <w:sz w:val="34"/>
         </w:rPr>
       </w:pPr>
-      <w:bookmarkStart w:id="36" w:name="_Toc236229049"/>
+      <w:bookmarkStart w:id="36" w:name="_Toc236232020"/>
       <w:r>
         <w:rPr>
           <w:rFonts w:ascii="Montserrat" w:hAnsi="Montserrat"/>
@@ -14878,12 +15004,12 @@
       </w:pPr>
     </w:p>
     <w:sectPr>
-      <w:headerReference w:type="even" r:id="rId46"/>
-      <w:headerReference w:type="default" r:id="rId47"/>
-      <w:footerReference w:type="even" r:id="rId48"/>
-      <w:footerReference w:type="default" r:id="rId49"/>
-      <w:headerReference w:type="first" r:id="rId50"/>
-      <w:footerReference w:type="first" r:id="rId51"/>
+      <w:headerReference w:type="even" r:id="rId47"/>
+      <w:headerReference w:type="default" r:id="rId48"/>
+      <w:footerReference w:type="even" r:id="rId49"/>
+      <w:footerReference w:type="default" r:id="rId50"/>
+      <w:headerReference w:type="first" r:id="rId51"/>
+      <w:footerReference w:type="first" r:id="rId52"/>
       <w:pgSz w:w="12240" w:h="15840"/>
       <w:pgMar w:top="1417" w:right="1701" w:bottom="1417" w:left="1701" w:header="708" w:footer="708" w:gutter="0"/>
       <w:cols w:space="708"/>
@@ -15042,7 +15168,7 @@
 <file path=word/numbering.xml><?xml version="1.0" encoding="utf-8"?>
 <w:numbering xmlns:wpc="http://schemas.microsoft.com/office/word/2010/wordprocessingCanvas" xmlns:cx="http://schemas.microsoft.com/office/drawing/2014/chartex" xmlns:cx1="http://schemas.microsoft.com/office/drawing/2015/9/8/chartex" xmlns:cx2="http://schemas.microsoft.com/office/drawing/2015/10/21/chartex" xmlns:cx3="http://schemas.microsoft.com/office/drawing/2016/5/9/chartex" xmlns:cx4="http://schemas.microsoft.com/office/drawing/2016/5/10/chartex" xmlns:cx5="http://schemas.microsoft.com/office/drawing/2016/5/11/chartex" xmlns:cx6="http://schemas.microsoft.com/office/drawing/2016/5/12/chartex" xmlns:cx7="http://schemas.microsoft.com/office/drawing/2016/5/13/chartex" xmlns:cx8="http://schemas.microsoft.com/office/drawing/2016/5/14/chartex" xmlns:mc="http://schemas.openxmlformats.org/markup-compatibility/2006" xmlns:aink="http://schemas.microsoft.com/office/drawing/2016/ink" xmlns:am3d="http://schemas.microsoft.com/office/drawing/2017/model3d" xmlns:o="urn:schemas-microsoft-com:office:office" xmlns:oel="http://schemas.microsoft.com/office/2019/extlst" xmlns:r="http://schemas.openxmlformats.org/officeDocument/2006/relationships" xmlns:m="http://schemas.openxmlformats.org/officeDocument/2006/math" xmlns:v="urn:schemas-microsoft-com:vml" xmlns:wp14="http://schemas.microsoft.com/office/word/2010/wordprocessingDrawing" xmlns:wp="http://schemas.openxmlformats.org/drawingml/2006/wordprocessingDrawing" xmlns:w10="urn:schemas-microsoft-com:office:word" xmlns:w="http://schemas.openxmlformats.org/wordprocessingml/2006/main" xmlns:w14="http://schemas.microsoft.com/office/word/2010/wordml" xmlns:w15="http://schemas.microsoft.com/office/word/2012/wordml" xmlns:w16cei="http://schemas.microsoft.com/office/word/2026/wordml/cei" xmlns:w16cex="http://schemas.microsoft.com/office/word/2018/wordml/cex" xmlns:w16cid="http://schemas.microsoft.com/office/word/2016/wordml/cid" xmlns:w16="http://schemas.microsoft.com/office/word/2018/wordml" xmlns:w16du="http://schemas.microsoft.com/office/word/2023/wordml/word16du" xmlns:w16sdtdh="http://schemas.microsoft.com/office/word/2020/wordml/sdtdatahash" xmlns:w16sdtfl="http://schemas.microsoft.com/office/word/2024/wordml/sdtformatlock" xmlns:w16se="http://schemas.microsoft.com/office/word/2015/wordml/symex" xmlns:wpg="http://schemas.microsoft.com/office/word/2010/wordprocessingGroup" xmlns:wpi="http://schemas.microsoft.com/office/word/2010/wordprocessingInk" xmlns:wne="http://schemas.microsoft.com/office/word/2006/wordml" xmlns:wps="http://schemas.microsoft.com/office/word/2010/wordprocessingShape" mc:Ignorable="w14 w15 w16se w16cid w16 w16cex w16sdtdh w16sdtfl w16du wp14">
   <w:abstractNum w:abstractNumId="0" w15:restartNumberingAfterBreak="0">
-    <w:nsid w:val="041A0C0B"/>
+    <w:nsid w:val="1DB14427"/>
     <w:multiLevelType w:val="singleLevel"/>
     <w:tmpl w:val="04160001"/>
     <w:lvl w:ilvl="0">
@@ -15059,7 +15185,7 @@
     </w:lvl>
   </w:abstractNum>
   <w:abstractNum w:abstractNumId="1" w15:restartNumberingAfterBreak="0">
-    <w:nsid w:val="237F02B2"/>
+    <w:nsid w:val="1FD3230D"/>
     <w:multiLevelType w:val="singleLevel"/>
     <w:tmpl w:val="04160001"/>
     <w:lvl w:ilvl="0">
@@ -15076,7 +15202,7 @@
     </w:lvl>
   </w:abstractNum>
   <w:abstractNum w:abstractNumId="2" w15:restartNumberingAfterBreak="0">
-    <w:nsid w:val="295E2BE8"/>
+    <w:nsid w:val="2042398C"/>
     <w:multiLevelType w:val="singleLevel"/>
     <w:tmpl w:val="04160001"/>
     <w:lvl w:ilvl="0">
@@ -15093,7 +15219,7 @@
     </w:lvl>
   </w:abstractNum>
   <w:abstractNum w:abstractNumId="3" w15:restartNumberingAfterBreak="0">
-    <w:nsid w:val="2DF710D2"/>
+    <w:nsid w:val="2990269A"/>
     <w:multiLevelType w:val="singleLevel"/>
     <w:tmpl w:val="04160001"/>
     <w:lvl w:ilvl="0">
@@ -15110,7 +15236,7 @@
     </w:lvl>
   </w:abstractNum>
   <w:abstractNum w:abstractNumId="4" w15:restartNumberingAfterBreak="0">
-    <w:nsid w:val="35E07FE6"/>
+    <w:nsid w:val="3AB86C1C"/>
     <w:multiLevelType w:val="singleLevel"/>
     <w:tmpl w:val="04160001"/>
     <w:lvl w:ilvl="0">
@@ -15127,7 +15253,7 @@
     </w:lvl>
   </w:abstractNum>
   <w:abstractNum w:abstractNumId="5" w15:restartNumberingAfterBreak="0">
-    <w:nsid w:val="3A337331"/>
+    <w:nsid w:val="3E306D53"/>
     <w:multiLevelType w:val="singleLevel"/>
     <w:tmpl w:val="04160001"/>
     <w:lvl w:ilvl="0">
@@ -15144,7 +15270,7 @@
     </w:lvl>
   </w:abstractNum>
   <w:abstractNum w:abstractNumId="6" w15:restartNumberingAfterBreak="0">
-    <w:nsid w:val="3A9805EC"/>
+    <w:nsid w:val="460977A9"/>
     <w:multiLevelType w:val="singleLevel"/>
     <w:tmpl w:val="04160001"/>
     <w:lvl w:ilvl="0">
@@ -15161,7 +15287,7 @@
     </w:lvl>
   </w:abstractNum>
   <w:abstractNum w:abstractNumId="7" w15:restartNumberingAfterBreak="0">
-    <w:nsid w:val="3DA772C9"/>
+    <w:nsid w:val="53BD3CF4"/>
     <w:multiLevelType w:val="singleLevel"/>
     <w:tmpl w:val="04160001"/>
     <w:lvl w:ilvl="0">
@@ -15178,7 +15304,7 @@
     </w:lvl>
   </w:abstractNum>
   <w:abstractNum w:abstractNumId="8" w15:restartNumberingAfterBreak="0">
-    <w:nsid w:val="4921398F"/>
+    <w:nsid w:val="570062E3"/>
     <w:multiLevelType w:val="singleLevel"/>
     <w:tmpl w:val="04160001"/>
     <w:lvl w:ilvl="0">
@@ -15195,7 +15321,7 @@
     </w:lvl>
   </w:abstractNum>
   <w:abstractNum w:abstractNumId="9" w15:restartNumberingAfterBreak="0">
-    <w:nsid w:val="59A55CB5"/>
+    <w:nsid w:val="61AF51F1"/>
     <w:multiLevelType w:val="singleLevel"/>
     <w:tmpl w:val="04160001"/>
     <w:lvl w:ilvl="0">
@@ -15212,7 +15338,7 @@
     </w:lvl>
   </w:abstractNum>
   <w:abstractNum w:abstractNumId="10" w15:restartNumberingAfterBreak="0">
-    <w:nsid w:val="5CB26992"/>
+    <w:nsid w:val="62C6186A"/>
     <w:multiLevelType w:val="singleLevel"/>
     <w:tmpl w:val="04160001"/>
     <w:lvl w:ilvl="0">
@@ -15229,7 +15355,7 @@
     </w:lvl>
   </w:abstractNum>
   <w:abstractNum w:abstractNumId="11" w15:restartNumberingAfterBreak="0">
-    <w:nsid w:val="6BFF65D4"/>
+    <w:nsid w:val="669947E8"/>
     <w:multiLevelType w:val="singleLevel"/>
     <w:tmpl w:val="04160001"/>
     <w:lvl w:ilvl="0">
@@ -15246,7 +15372,7 @@
     </w:lvl>
   </w:abstractNum>
   <w:abstractNum w:abstractNumId="12" w15:restartNumberingAfterBreak="0">
-    <w:nsid w:val="6F6709DA"/>
+    <w:nsid w:val="6D0D57F7"/>
     <w:multiLevelType w:val="singleLevel"/>
     <w:tmpl w:val="04160001"/>
     <w:lvl w:ilvl="0">
@@ -15263,7 +15389,7 @@
     </w:lvl>
   </w:abstractNum>
   <w:abstractNum w:abstractNumId="13" w15:restartNumberingAfterBreak="0">
-    <w:nsid w:val="7DBC7655"/>
+    <w:nsid w:val="7F250BCF"/>
     <w:multiLevelType w:val="singleLevel"/>
     <w:tmpl w:val="04160001"/>
     <w:lvl w:ilvl="0">
@@ -15279,47 +15405,47 @@
       </w:rPr>
     </w:lvl>
   </w:abstractNum>
-  <w:num w:numId="1" w16cid:durableId="1472333525">
+  <w:num w:numId="1" w16cid:durableId="1879200256">
+    <w:abstractNumId w:val="13"/>
+  </w:num>
+  <w:num w:numId="2" w16cid:durableId="1854760785">
+    <w:abstractNumId w:val="12"/>
+  </w:num>
+  <w:num w:numId="3" w16cid:durableId="713964513">
+    <w:abstractNumId w:val="11"/>
+  </w:num>
+  <w:num w:numId="4" w16cid:durableId="1478379406">
     <w:abstractNumId w:val="6"/>
   </w:num>
-  <w:num w:numId="2" w16cid:durableId="758213226">
-    <w:abstractNumId w:val="4"/>
+  <w:num w:numId="5" w16cid:durableId="1257059505">
+    <w:abstractNumId w:val="3"/>
   </w:num>
-  <w:num w:numId="3" w16cid:durableId="1740396555">
+  <w:num w:numId="6" w16cid:durableId="1009792237">
+    <w:abstractNumId w:val="0"/>
+  </w:num>
+  <w:num w:numId="7" w16cid:durableId="1603957749">
+    <w:abstractNumId w:val="8"/>
+  </w:num>
+  <w:num w:numId="8" w16cid:durableId="2139105471">
     <w:abstractNumId w:val="10"/>
   </w:num>
-  <w:num w:numId="4" w16cid:durableId="786629190">
-    <w:abstractNumId w:val="11"/>
+  <w:num w:numId="9" w16cid:durableId="11225404">
+    <w:abstractNumId w:val="5"/>
   </w:num>
-  <w:num w:numId="5" w16cid:durableId="1195189949">
+  <w:num w:numId="10" w16cid:durableId="1614439679">
+    <w:abstractNumId w:val="7"/>
+  </w:num>
+  <w:num w:numId="11" w16cid:durableId="470710832">
     <w:abstractNumId w:val="9"/>
   </w:num>
-  <w:num w:numId="6" w16cid:durableId="477461853">
-    <w:abstractNumId w:val="7"/>
-  </w:num>
-  <w:num w:numId="7" w16cid:durableId="78645050">
-    <w:abstractNumId w:val="13"/>
-  </w:num>
-  <w:num w:numId="8" w16cid:durableId="820468843">
-    <w:abstractNumId w:val="5"/>
-  </w:num>
-  <w:num w:numId="9" w16cid:durableId="59795963">
-    <w:abstractNumId w:val="0"/>
-  </w:num>
-  <w:num w:numId="10" w16cid:durableId="221255992">
+  <w:num w:numId="12" w16cid:durableId="662125378">
     <w:abstractNumId w:val="1"/>
   </w:num>
-  <w:num w:numId="11" w16cid:durableId="444153914">
-    <w:abstractNumId w:val="3"/>
-  </w:num>
-  <w:num w:numId="12" w16cid:durableId="1265770432">
-    <w:abstractNumId w:val="8"/>
-  </w:num>
-  <w:num w:numId="13" w16cid:durableId="1197043383">
+  <w:num w:numId="13" w16cid:durableId="1921979877">
     <w:abstractNumId w:val="2"/>
   </w:num>
-  <w:num w:numId="14" w16cid:durableId="67459801">
-    <w:abstractNumId w:val="12"/>
+  <w:num w:numId="14" w16cid:durableId="1635017011">
+    <w:abstractNumId w:val="4"/>
   </w:num>
 </w:numbering>
 </file>
@@ -15732,7 +15858,7 @@
     <w:link w:val="Ttulo1Char"/>
     <w:uiPriority w:val="9"/>
     <w:qFormat/>
-    <w:rsid w:val="005D3D47"/>
+    <w:rsid w:val="00EB1602"/>
     <w:pPr>
       <w:keepNext/>
       <w:keepLines/>
@@ -15754,7 +15880,7 @@
     <w:uiPriority w:val="9"/>
     <w:unhideWhenUsed/>
     <w:qFormat/>
-    <w:rsid w:val="005D3D47"/>
+    <w:rsid w:val="00EB1602"/>
     <w:pPr>
       <w:keepNext/>
       <w:keepLines/>
@@ -15777,7 +15903,7 @@
     <w:semiHidden/>
     <w:unhideWhenUsed/>
     <w:qFormat/>
-    <w:rsid w:val="005D3D47"/>
+    <w:rsid w:val="00EB1602"/>
     <w:pPr>
       <w:keepNext/>
       <w:keepLines/>
@@ -15800,7 +15926,7 @@
     <w:semiHidden/>
     <w:unhideWhenUsed/>
     <w:qFormat/>
-    <w:rsid w:val="005D3D47"/>
+    <w:rsid w:val="00EB1602"/>
     <w:pPr>
       <w:keepNext/>
       <w:keepLines/>
@@ -15823,7 +15949,7 @@
     <w:semiHidden/>
     <w:unhideWhenUsed/>
     <w:qFormat/>
-    <w:rsid w:val="005D3D47"/>
+    <w:rsid w:val="00EB1602"/>
     <w:pPr>
       <w:keepNext/>
       <w:keepLines/>
@@ -15844,7 +15970,7 @@
     <w:semiHidden/>
     <w:unhideWhenUsed/>
     <w:qFormat/>
-    <w:rsid w:val="005D3D47"/>
+    <w:rsid w:val="00EB1602"/>
     <w:pPr>
       <w:keepNext/>
       <w:keepLines/>
@@ -15867,7 +15993,7 @@
     <w:semiHidden/>
     <w:unhideWhenUsed/>
     <w:qFormat/>
-    <w:rsid w:val="005D3D47"/>
+    <w:rsid w:val="00EB1602"/>
     <w:pPr>
       <w:keepNext/>
       <w:keepLines/>
@@ -15888,7 +16014,7 @@
     <w:semiHidden/>
     <w:unhideWhenUsed/>
     <w:qFormat/>
-    <w:rsid w:val="005D3D47"/>
+    <w:rsid w:val="00EB1602"/>
     <w:pPr>
       <w:keepNext/>
       <w:keepLines/>
@@ -15911,7 +16037,7 @@
     <w:semiHidden/>
     <w:unhideWhenUsed/>
     <w:qFormat/>
-    <w:rsid w:val="005D3D47"/>
+    <w:rsid w:val="00EB1602"/>
     <w:pPr>
       <w:keepNext/>
       <w:keepLines/>
@@ -15955,7 +16081,7 @@
     <w:basedOn w:val="Fontepargpadro"/>
     <w:link w:val="Ttulo1"/>
     <w:uiPriority w:val="9"/>
-    <w:rsid w:val="005D3D47"/>
+    <w:rsid w:val="00EB1602"/>
     <w:rPr>
       <w:rFonts w:asciiTheme="majorHAnsi" w:eastAsiaTheme="majorEastAsia" w:hAnsiTheme="majorHAnsi" w:cstheme="majorBidi"/>
       <w:color w:val="0F4761" w:themeColor="accent1" w:themeShade="BF"/>
@@ -15968,7 +16094,7 @@
     <w:basedOn w:val="Fontepargpadro"/>
     <w:link w:val="Ttulo2"/>
     <w:uiPriority w:val="9"/>
-    <w:rsid w:val="005D3D47"/>
+    <w:rsid w:val="00EB1602"/>
     <w:rPr>
       <w:rFonts w:asciiTheme="majorHAnsi" w:eastAsiaTheme="majorEastAsia" w:hAnsiTheme="majorHAnsi" w:cstheme="majorBidi"/>
       <w:color w:val="0F4761" w:themeColor="accent1" w:themeShade="BF"/>
@@ -15982,7 +16108,7 @@
     <w:link w:val="Ttulo3"/>
     <w:uiPriority w:val="9"/>
     <w:semiHidden/>
-    <w:rsid w:val="005D3D47"/>
+    <w:rsid w:val="00EB1602"/>
     <w:rPr>
       <w:rFonts w:eastAsiaTheme="majorEastAsia" w:cstheme="majorBidi"/>
       <w:color w:val="0F4761" w:themeColor="accent1" w:themeShade="BF"/>
@@ -15996,7 +16122,7 @@
     <w:link w:val="Ttulo4"/>
     <w:uiPriority w:val="9"/>
     <w:semiHidden/>
-    <w:rsid w:val="005D3D47"/>
+    <w:rsid w:val="00EB1602"/>
     <w:rPr>
       <w:rFonts w:eastAsiaTheme="majorEastAsia" w:cstheme="majorBidi"/>
       <w:i/>
@@ -16010,7 +16136,7 @@
     <w:link w:val="Ttulo5"/>
     <w:uiPriority w:val="9"/>
     <w:semiHidden/>
-    <w:rsid w:val="005D3D47"/>
+    <w:rsid w:val="00EB1602"/>
     <w:rPr>
       <w:rFonts w:eastAsiaTheme="majorEastAsia" w:cstheme="majorBidi"/>
       <w:color w:val="0F4761" w:themeColor="accent1" w:themeShade="BF"/>
@@ -16022,7 +16148,7 @@
     <w:link w:val="Ttulo6"/>
     <w:uiPriority w:val="9"/>
     <w:semiHidden/>
-    <w:rsid w:val="005D3D47"/>
+    <w:rsid w:val="00EB1602"/>
     <w:rPr>
       <w:rFonts w:eastAsiaTheme="majorEastAsia" w:cstheme="majorBidi"/>
       <w:i/>
@@ -16036,7 +16162,7 @@
     <w:link w:val="Ttulo7"/>
     <w:uiPriority w:val="9"/>
     <w:semiHidden/>
-    <w:rsid w:val="005D3D47"/>
+    <w:rsid w:val="00EB1602"/>
     <w:rPr>
       <w:rFonts w:eastAsiaTheme="majorEastAsia" w:cstheme="majorBidi"/>
       <w:color w:val="595959" w:themeColor="text1" w:themeTint="A6"/>
@@ -16048,7 +16174,7 @@
     <w:link w:val="Ttulo8"/>
     <w:uiPriority w:val="9"/>
     <w:semiHidden/>
-    <w:rsid w:val="005D3D47"/>
+    <w:rsid w:val="00EB1602"/>
     <w:rPr>
       <w:rFonts w:eastAsiaTheme="majorEastAsia" w:cstheme="majorBidi"/>
       <w:i/>
@@ -16062,7 +16188,7 @@
     <w:link w:val="Ttulo9"/>
     <w:uiPriority w:val="9"/>
     <w:semiHidden/>
-    <w:rsid w:val="005D3D47"/>
+    <w:rsid w:val="00EB1602"/>
     <w:rPr>
       <w:rFonts w:eastAsiaTheme="majorEastAsia" w:cstheme="majorBidi"/>
       <w:color w:val="272727" w:themeColor="text1" w:themeTint="D8"/>
@@ -16075,7 +16201,7 @@
     <w:link w:val="TtuloChar"/>
     <w:uiPriority w:val="10"/>
     <w:qFormat/>
-    <w:rsid w:val="005D3D47"/>
+    <w:rsid w:val="00EB1602"/>
     <w:pPr>
       <w:spacing w:after="80" w:line="240" w:lineRule="auto"/>
       <w:contextualSpacing/>
@@ -16093,7 +16219,7 @@
     <w:basedOn w:val="Fontepargpadro"/>
     <w:link w:val="Ttulo"/>
     <w:uiPriority w:val="10"/>
-    <w:rsid w:val="005D3D47"/>
+    <w:rsid w:val="00EB1602"/>
     <w:rPr>
       <w:rFonts w:asciiTheme="majorHAnsi" w:eastAsiaTheme="majorEastAsia" w:hAnsiTheme="majorHAnsi" w:cstheme="majorBidi"/>
       <w:spacing w:val="-10"/>
@@ -16109,7 +16235,7 @@
     <w:link w:val="SubttuloChar"/>
     <w:uiPriority w:val="11"/>
     <w:qFormat/>
-    <w:rsid w:val="005D3D47"/>
+    <w:rsid w:val="00EB1602"/>
     <w:pPr>
       <w:numPr>
         <w:ilvl w:val="1"/>
@@ -16128,7 +16254,7 @@
     <w:basedOn w:val="Fontepargpadro"/>
     <w:link w:val="Subttulo"/>
     <w:uiPriority w:val="11"/>
-    <w:rsid w:val="005D3D47"/>
+    <w:rsid w:val="00EB1602"/>
     <w:rPr>
       <w:rFonts w:eastAsiaTheme="majorEastAsia" w:cstheme="majorBidi"/>
       <w:color w:val="595959" w:themeColor="text1" w:themeTint="A6"/>
@@ -16144,7 +16270,7 @@
     <w:link w:val="CitaoChar"/>
     <w:uiPriority w:val="29"/>
     <w:qFormat/>
-    <w:rsid w:val="005D3D47"/>
+    <w:rsid w:val="00EB1602"/>
     <w:pPr>
       <w:spacing w:before="160"/>
       <w:jc w:val="center"/>
@@ -16160,7 +16286,7 @@
     <w:basedOn w:val="Fontepargpadro"/>
     <w:link w:val="Citao"/>
     <w:uiPriority w:val="29"/>
-    <w:rsid w:val="005D3D47"/>
+    <w:rsid w:val="00EB1602"/>
     <w:rPr>
       <w:i/>
       <w:iCs/>
@@ -16172,7 +16298,7 @@
     <w:basedOn w:val="Normal"/>
     <w:uiPriority w:val="34"/>
     <w:qFormat/>
-    <w:rsid w:val="005D3D47"/>
+    <w:rsid w:val="00EB1602"/>
     <w:pPr>
       <w:ind w:left="720"/>
       <w:contextualSpacing/>
@@ -16183,7 +16309,7 @@
     <w:basedOn w:val="Fontepargpadro"/>
     <w:uiPriority w:val="21"/>
     <w:qFormat/>
-    <w:rsid w:val="005D3D47"/>
+    <w:rsid w:val="00EB1602"/>
     <w:rPr>
       <w:i/>
       <w:iCs/>
@@ -16197,7 +16323,7 @@
     <w:link w:val="CitaoIntensaChar"/>
     <w:uiPriority w:val="30"/>
     <w:qFormat/>
-    <w:rsid w:val="005D3D47"/>
+    <w:rsid w:val="00EB1602"/>
     <w:pPr>
       <w:pBdr>
         <w:top w:val="single" w:sz="4" w:space="10" w:color="0F4761" w:themeColor="accent1" w:themeShade="BF"/>
@@ -16218,7 +16344,7 @@
     <w:basedOn w:val="Fontepargpadro"/>
     <w:link w:val="CitaoIntensa"/>
     <w:uiPriority w:val="30"/>
-    <w:rsid w:val="005D3D47"/>
+    <w:rsid w:val="00EB1602"/>
     <w:rPr>
       <w:i/>
       <w:iCs/>
@@ -16230,7 +16356,7 @@
     <w:basedOn w:val="Fontepargpadro"/>
     <w:uiPriority w:val="32"/>
     <w:qFormat/>
-    <w:rsid w:val="005D3D47"/>
+    <w:rsid w:val="00EB1602"/>
     <w:rPr>
       <w:b/>
       <w:bCs/>
@@ -16245,7 +16371,7 @@
     <w:link w:val="CabealhoChar"/>
     <w:uiPriority w:val="99"/>
     <w:unhideWhenUsed/>
-    <w:rsid w:val="005D3D47"/>
+    <w:rsid w:val="00EB1602"/>
     <w:pPr>
       <w:tabs>
         <w:tab w:val="center" w:pos="4252"/>
@@ -16259,7 +16385,7 @@
     <w:basedOn w:val="Fontepargpadro"/>
     <w:link w:val="Cabealho"/>
     <w:uiPriority w:val="99"/>
-    <w:rsid w:val="005D3D47"/>
+    <w:rsid w:val="00EB1602"/>
   </w:style>
   <w:style w:type="paragraph" w:styleId="Rodap">
     <w:name w:val="footer"/>
@@ -16267,7 +16393,7 @@
     <w:link w:val="RodapChar"/>
     <w:uiPriority w:val="99"/>
     <w:unhideWhenUsed/>
-    <w:rsid w:val="005D3D47"/>
+    <w:rsid w:val="00EB1602"/>
     <w:pPr>
       <w:tabs>
         <w:tab w:val="center" w:pos="4252"/>
@@ -16281,7 +16407,7 @@
     <w:basedOn w:val="Fontepargpadro"/>
     <w:link w:val="Rodap"/>
     <w:uiPriority w:val="99"/>
-    <w:rsid w:val="005D3D47"/>
+    <w:rsid w:val="00EB1602"/>
   </w:style>
   <w:style w:type="paragraph" w:styleId="Sumrio1">
     <w:name w:val="toc 1"/>
@@ -16290,7 +16416,7 @@
     <w:autoRedefine/>
     <w:uiPriority w:val="39"/>
     <w:unhideWhenUsed/>
-    <w:rsid w:val="005D3D47"/>
+    <w:rsid w:val="00EB1602"/>
     <w:pPr>
       <w:spacing w:after="100"/>
     </w:pPr>
@@ -16302,7 +16428,7 @@
     <w:autoRedefine/>
     <w:uiPriority w:val="39"/>
     <w:unhideWhenUsed/>
-    <w:rsid w:val="005D3D47"/>
+    <w:rsid w:val="00EB1602"/>
     <w:pPr>
       <w:spacing w:after="100"/>
       <w:ind w:left="240"/>

</xml_diff>

<commit_message>
Adiciona Gestao de Entraves e Encaminhamentos ao Relatorio de Situacao
Implementa as praticas D06.6/D06.7 das Diretrizes no formulario 11:
dois cartoes de registro (Entraves e Encaminhamentos), cada item com
Descricao, Responsavel, Prazo e Status (Aberto/Resolvido/Cancelado).
Listas independentes dos projetos cadastrados, exibidas lado a lado
no Painel e incluidas no CSV exportado. Atualiza o Manual de Uso
(v2.3) com a nova secao e print.

Co-Authored-By: Claude Sonnet 5 <noreply@anthropic.com>
</commit_message>
<xml_diff>
--- a/Manual de Uso - Ferramenta de Gestao de Projetos.docx
+++ b/Manual de Uso - Ferramenta de Gestao de Projetos.docx
@@ -129,7 +129,7 @@
           <w:color w:val="6A6A70"/>
           <w:sz w:val="22"/>
         </w:rPr>
-        <w:t>Versao 2.2 - 29 de julho de 2026 (substitui a versao 2.1 de 29/07/2026)</w:t>
+        <w:t>Versao 2.3 - 29 de julho de 2026 (substitui a versao 2.2 de 29/07/2026)</w:t>
       </w:r>
     </w:p>
     <w:p>
@@ -229,7 +229,7 @@
         <w:rPr>
           <w:noProof/>
         </w:rPr>
-        <w:instrText xml:space="preserve"> PAGEREF _Toc236231984 \h </w:instrText>
+        <w:instrText xml:space="preserve"> PAGEREF _Toc236233239 \h </w:instrText>
       </w:r>
       <w:r>
         <w:rPr>
@@ -290,7 +290,7 @@
         <w:rPr>
           <w:noProof/>
         </w:rPr>
-        <w:instrText xml:space="preserve"> PAGEREF _Toc236231985 \h </w:instrText>
+        <w:instrText xml:space="preserve"> PAGEREF _Toc236233240 \h </w:instrText>
       </w:r>
       <w:r>
         <w:rPr>
@@ -351,7 +351,7 @@
         <w:rPr>
           <w:noProof/>
         </w:rPr>
-        <w:instrText xml:space="preserve"> PAGEREF _Toc236231986 \h </w:instrText>
+        <w:instrText xml:space="preserve"> PAGEREF _Toc236233241 \h </w:instrText>
       </w:r>
       <w:r>
         <w:rPr>
@@ -412,7 +412,7 @@
         <w:rPr>
           <w:noProof/>
         </w:rPr>
-        <w:instrText xml:space="preserve"> PAGEREF _Toc236231987 \h </w:instrText>
+        <w:instrText xml:space="preserve"> PAGEREF _Toc236233242 \h </w:instrText>
       </w:r>
       <w:r>
         <w:rPr>
@@ -473,7 +473,7 @@
         <w:rPr>
           <w:noProof/>
         </w:rPr>
-        <w:instrText xml:space="preserve"> PAGEREF _Toc236231988 \h </w:instrText>
+        <w:instrText xml:space="preserve"> PAGEREF _Toc236233243 \h </w:instrText>
       </w:r>
       <w:r>
         <w:rPr>
@@ -534,7 +534,7 @@
         <w:rPr>
           <w:noProof/>
         </w:rPr>
-        <w:instrText xml:space="preserve"> PAGEREF _Toc236231989 \h </w:instrText>
+        <w:instrText xml:space="preserve"> PAGEREF _Toc236233244 \h </w:instrText>
       </w:r>
       <w:r>
         <w:rPr>
@@ -595,7 +595,7 @@
         <w:rPr>
           <w:noProof/>
         </w:rPr>
-        <w:instrText xml:space="preserve"> PAGEREF _Toc236231990 \h </w:instrText>
+        <w:instrText xml:space="preserve"> PAGEREF _Toc236233245 \h </w:instrText>
       </w:r>
       <w:r>
         <w:rPr>
@@ -656,7 +656,7 @@
         <w:rPr>
           <w:noProof/>
         </w:rPr>
-        <w:instrText xml:space="preserve"> PAGEREF _Toc236231991 \h </w:instrText>
+        <w:instrText xml:space="preserve"> PAGEREF _Toc236233246 \h </w:instrText>
       </w:r>
       <w:r>
         <w:rPr>
@@ -717,7 +717,7 @@
         <w:rPr>
           <w:noProof/>
         </w:rPr>
-        <w:instrText xml:space="preserve"> PAGEREF _Toc236231992 \h </w:instrText>
+        <w:instrText xml:space="preserve"> PAGEREF _Toc236233247 \h </w:instrText>
       </w:r>
       <w:r>
         <w:rPr>
@@ -778,7 +778,7 @@
         <w:rPr>
           <w:noProof/>
         </w:rPr>
-        <w:instrText xml:space="preserve"> PAGEREF _Toc236231993 \h </w:instrText>
+        <w:instrText xml:space="preserve"> PAGEREF _Toc236233248 \h </w:instrText>
       </w:r>
       <w:r>
         <w:rPr>
@@ -839,7 +839,7 @@
         <w:rPr>
           <w:noProof/>
         </w:rPr>
-        <w:instrText xml:space="preserve"> PAGEREF _Toc236231994 \h </w:instrText>
+        <w:instrText xml:space="preserve"> PAGEREF _Toc236233249 \h </w:instrText>
       </w:r>
       <w:r>
         <w:rPr>
@@ -900,7 +900,7 @@
         <w:rPr>
           <w:noProof/>
         </w:rPr>
-        <w:instrText xml:space="preserve"> PAGEREF _Toc236231995 \h </w:instrText>
+        <w:instrText xml:space="preserve"> PAGEREF _Toc236233250 \h </w:instrText>
       </w:r>
       <w:r>
         <w:rPr>
@@ -961,7 +961,7 @@
         <w:rPr>
           <w:noProof/>
         </w:rPr>
-        <w:instrText xml:space="preserve"> PAGEREF _Toc236231996 \h </w:instrText>
+        <w:instrText xml:space="preserve"> PAGEREF _Toc236233251 \h </w:instrText>
       </w:r>
       <w:r>
         <w:rPr>
@@ -1022,7 +1022,7 @@
         <w:rPr>
           <w:noProof/>
         </w:rPr>
-        <w:instrText xml:space="preserve"> PAGEREF _Toc236231997 \h </w:instrText>
+        <w:instrText xml:space="preserve"> PAGEREF _Toc236233252 \h </w:instrText>
       </w:r>
       <w:r>
         <w:rPr>
@@ -1083,7 +1083,7 @@
         <w:rPr>
           <w:noProof/>
         </w:rPr>
-        <w:instrText xml:space="preserve"> PAGEREF _Toc236231998 \h </w:instrText>
+        <w:instrText xml:space="preserve"> PAGEREF _Toc236233253 \h </w:instrText>
       </w:r>
       <w:r>
         <w:rPr>
@@ -1144,7 +1144,7 @@
         <w:rPr>
           <w:noProof/>
         </w:rPr>
-        <w:instrText xml:space="preserve"> PAGEREF _Toc236231999 \h </w:instrText>
+        <w:instrText xml:space="preserve"> PAGEREF _Toc236233254 \h </w:instrText>
       </w:r>
       <w:r>
         <w:rPr>
@@ -1205,7 +1205,7 @@
         <w:rPr>
           <w:noProof/>
         </w:rPr>
-        <w:instrText xml:space="preserve"> PAGEREF _Toc236232000 \h </w:instrText>
+        <w:instrText xml:space="preserve"> PAGEREF _Toc236233255 \h </w:instrText>
       </w:r>
       <w:r>
         <w:rPr>
@@ -1266,7 +1266,7 @@
         <w:rPr>
           <w:noProof/>
         </w:rPr>
-        <w:instrText xml:space="preserve"> PAGEREF _Toc236232001 \h </w:instrText>
+        <w:instrText xml:space="preserve"> PAGEREF _Toc236233256 \h </w:instrText>
       </w:r>
       <w:r>
         <w:rPr>
@@ -1327,7 +1327,7 @@
         <w:rPr>
           <w:noProof/>
         </w:rPr>
-        <w:instrText xml:space="preserve"> PAGEREF _Toc236232002 \h </w:instrText>
+        <w:instrText xml:space="preserve"> PAGEREF _Toc236233257 \h </w:instrText>
       </w:r>
       <w:r>
         <w:rPr>
@@ -1388,7 +1388,7 @@
         <w:rPr>
           <w:noProof/>
         </w:rPr>
-        <w:instrText xml:space="preserve"> PAGEREF _Toc236232003 \h </w:instrText>
+        <w:instrText xml:space="preserve"> PAGEREF _Toc236233258 \h </w:instrText>
       </w:r>
       <w:r>
         <w:rPr>
@@ -1449,7 +1449,7 @@
         <w:rPr>
           <w:noProof/>
         </w:rPr>
-        <w:instrText xml:space="preserve"> PAGEREF _Toc236232004 \h </w:instrText>
+        <w:instrText xml:space="preserve"> PAGEREF _Toc236233259 \h </w:instrText>
       </w:r>
       <w:r>
         <w:rPr>
@@ -1510,7 +1510,7 @@
         <w:rPr>
           <w:noProof/>
         </w:rPr>
-        <w:instrText xml:space="preserve"> PAGEREF _Toc236232005 \h </w:instrText>
+        <w:instrText xml:space="preserve"> PAGEREF _Toc236233260 \h </w:instrText>
       </w:r>
       <w:r>
         <w:rPr>
@@ -1571,7 +1571,7 @@
         <w:rPr>
           <w:noProof/>
         </w:rPr>
-        <w:instrText xml:space="preserve"> PAGEREF _Toc236232006 \h </w:instrText>
+        <w:instrText xml:space="preserve"> PAGEREF _Toc236233261 \h </w:instrText>
       </w:r>
       <w:r>
         <w:rPr>
@@ -1632,7 +1632,7 @@
         <w:rPr>
           <w:noProof/>
         </w:rPr>
-        <w:instrText xml:space="preserve"> PAGEREF _Toc236232007 \h </w:instrText>
+        <w:instrText xml:space="preserve"> PAGEREF _Toc236233262 \h </w:instrText>
       </w:r>
       <w:r>
         <w:rPr>
@@ -1693,7 +1693,7 @@
         <w:rPr>
           <w:noProof/>
         </w:rPr>
-        <w:instrText xml:space="preserve"> PAGEREF _Toc236232008 \h </w:instrText>
+        <w:instrText xml:space="preserve"> PAGEREF _Toc236233263 \h </w:instrText>
       </w:r>
       <w:r>
         <w:rPr>
@@ -1754,7 +1754,7 @@
         <w:rPr>
           <w:noProof/>
         </w:rPr>
-        <w:instrText xml:space="preserve"> PAGEREF _Toc236232009 \h </w:instrText>
+        <w:instrText xml:space="preserve"> PAGEREF _Toc236233264 \h </w:instrText>
       </w:r>
       <w:r>
         <w:rPr>
@@ -1816,7 +1816,7 @@
         <w:rPr>
           <w:noProof/>
         </w:rPr>
-        <w:instrText xml:space="preserve"> PAGEREF _Toc236232010 \h </w:instrText>
+        <w:instrText xml:space="preserve"> PAGEREF _Toc236233265 \h </w:instrText>
       </w:r>
       <w:r>
         <w:rPr>
@@ -1833,7 +1833,7 @@
         <w:rPr>
           <w:noProof/>
         </w:rPr>
-        <w:t>41</w:t>
+        <w:t>42</w:t>
       </w:r>
       <w:r>
         <w:rPr>
@@ -1877,7 +1877,7 @@
         <w:rPr>
           <w:noProof/>
         </w:rPr>
-        <w:instrText xml:space="preserve"> PAGEREF _Toc236232011 \h </w:instrText>
+        <w:instrText xml:space="preserve"> PAGEREF _Toc236233266 \h </w:instrText>
       </w:r>
       <w:r>
         <w:rPr>
@@ -1894,7 +1894,7 @@
         <w:rPr>
           <w:noProof/>
         </w:rPr>
-        <w:t>45</w:t>
+        <w:t>46</w:t>
       </w:r>
       <w:r>
         <w:rPr>
@@ -1938,7 +1938,7 @@
         <w:rPr>
           <w:noProof/>
         </w:rPr>
-        <w:instrText xml:space="preserve"> PAGEREF _Toc236232012 \h </w:instrText>
+        <w:instrText xml:space="preserve"> PAGEREF _Toc236233267 \h </w:instrText>
       </w:r>
       <w:r>
         <w:rPr>
@@ -1955,7 +1955,7 @@
         <w:rPr>
           <w:noProof/>
         </w:rPr>
-        <w:t>45</w:t>
+        <w:t>46</w:t>
       </w:r>
       <w:r>
         <w:rPr>
@@ -1999,7 +1999,7 @@
         <w:rPr>
           <w:noProof/>
         </w:rPr>
-        <w:instrText xml:space="preserve"> PAGEREF _Toc236232013 \h </w:instrText>
+        <w:instrText xml:space="preserve"> PAGEREF _Toc236233268 \h </w:instrText>
       </w:r>
       <w:r>
         <w:rPr>
@@ -2016,7 +2016,7 @@
         <w:rPr>
           <w:noProof/>
         </w:rPr>
-        <w:t>46</w:t>
+        <w:t>47</w:t>
       </w:r>
       <w:r>
         <w:rPr>
@@ -2060,7 +2060,7 @@
         <w:rPr>
           <w:noProof/>
         </w:rPr>
-        <w:instrText xml:space="preserve"> PAGEREF _Toc236232014 \h </w:instrText>
+        <w:instrText xml:space="preserve"> PAGEREF _Toc236233269 \h </w:instrText>
       </w:r>
       <w:r>
         <w:rPr>
@@ -2077,7 +2077,7 @@
         <w:rPr>
           <w:noProof/>
         </w:rPr>
-        <w:t>46</w:t>
+        <w:t>47</w:t>
       </w:r>
       <w:r>
         <w:rPr>
@@ -2121,7 +2121,7 @@
         <w:rPr>
           <w:noProof/>
         </w:rPr>
-        <w:instrText xml:space="preserve"> PAGEREF _Toc236232015 \h </w:instrText>
+        <w:instrText xml:space="preserve"> PAGEREF _Toc236233270 \h </w:instrText>
       </w:r>
       <w:r>
         <w:rPr>
@@ -2138,7 +2138,7 @@
         <w:rPr>
           <w:noProof/>
         </w:rPr>
-        <w:t>49</w:t>
+        <w:t>50</w:t>
       </w:r>
       <w:r>
         <w:rPr>
@@ -2182,7 +2182,7 @@
         <w:rPr>
           <w:noProof/>
         </w:rPr>
-        <w:instrText xml:space="preserve"> PAGEREF _Toc236232016 \h </w:instrText>
+        <w:instrText xml:space="preserve"> PAGEREF _Toc236233271 \h </w:instrText>
       </w:r>
       <w:r>
         <w:rPr>
@@ -2199,7 +2199,7 @@
         <w:rPr>
           <w:noProof/>
         </w:rPr>
-        <w:t>49</w:t>
+        <w:t>50</w:t>
       </w:r>
       <w:r>
         <w:rPr>
@@ -2243,7 +2243,7 @@
         <w:rPr>
           <w:noProof/>
         </w:rPr>
-        <w:instrText xml:space="preserve"> PAGEREF _Toc236232017 \h </w:instrText>
+        <w:instrText xml:space="preserve"> PAGEREF _Toc236233272 \h </w:instrText>
       </w:r>
       <w:r>
         <w:rPr>
@@ -2260,7 +2260,7 @@
         <w:rPr>
           <w:noProof/>
         </w:rPr>
-        <w:t>49</w:t>
+        <w:t>50</w:t>
       </w:r>
       <w:r>
         <w:rPr>
@@ -2304,7 +2304,7 @@
         <w:rPr>
           <w:noProof/>
         </w:rPr>
-        <w:instrText xml:space="preserve"> PAGEREF _Toc236232018 \h </w:instrText>
+        <w:instrText xml:space="preserve"> PAGEREF _Toc236233273 \h </w:instrText>
       </w:r>
       <w:r>
         <w:rPr>
@@ -2321,7 +2321,7 @@
         <w:rPr>
           <w:noProof/>
         </w:rPr>
-        <w:t>50</w:t>
+        <w:t>51</w:t>
       </w:r>
       <w:r>
         <w:rPr>
@@ -2365,7 +2365,7 @@
         <w:rPr>
           <w:noProof/>
         </w:rPr>
-        <w:instrText xml:space="preserve"> PAGEREF _Toc236232019 \h </w:instrText>
+        <w:instrText xml:space="preserve"> PAGEREF _Toc236233274 \h </w:instrText>
       </w:r>
       <w:r>
         <w:rPr>
@@ -2382,7 +2382,7 @@
         <w:rPr>
           <w:noProof/>
         </w:rPr>
-        <w:t>52</w:t>
+        <w:t>53</w:t>
       </w:r>
       <w:r>
         <w:rPr>
@@ -2426,7 +2426,7 @@
         <w:rPr>
           <w:noProof/>
         </w:rPr>
-        <w:instrText xml:space="preserve"> PAGEREF _Toc236232020 \h </w:instrText>
+        <w:instrText xml:space="preserve"> PAGEREF _Toc236233275 \h </w:instrText>
       </w:r>
       <w:r>
         <w:rPr>
@@ -2443,7 +2443,7 @@
         <w:rPr>
           <w:noProof/>
         </w:rPr>
-        <w:t>53</w:t>
+        <w:t>54</w:t>
       </w:r>
       <w:r>
         <w:rPr>
@@ -2502,7 +2502,7 @@
           <w:sz w:val="34"/>
         </w:rPr>
       </w:pPr>
-      <w:bookmarkStart w:id="0" w:name="_Toc236231984"/>
+      <w:bookmarkStart w:id="0" w:name="_Toc236233239"/>
       <w:r>
         <w:rPr>
           <w:rFonts w:ascii="Montserrat" w:hAnsi="Montserrat"/>
@@ -2526,7 +2526,7 @@
           <w:sz w:val="27"/>
         </w:rPr>
       </w:pPr>
-      <w:bookmarkStart w:id="1" w:name="_Toc236231985"/>
+      <w:bookmarkStart w:id="1" w:name="_Toc236233240"/>
       <w:r>
         <w:rPr>
           <w:rFonts w:ascii="Montserrat" w:hAnsi="Montserrat"/>
@@ -2625,6 +2625,24 @@
           <w:color w:val="1A1A1A"/>
           <w:sz w:val="22"/>
         </w:rPr>
+        <w:t>Esta e a versao 2.3 do manual. Em relacao a versao 2.2 (29/07/2026), foi adicionada a Gestao de Entraves e Encaminhamentos no Relatorio de Situacao (secao 4.1): dois cartoes de registro (Descricao, Responsavel, Prazo, Status Aberto/Resolvido/Cancelado), exibidos lado a lado no Painel e incluidos no CSV exportado.</w:t>
+      </w:r>
+    </w:p>
+    <w:p>
+      <w:pPr>
+        <w:spacing w:line="280" w:lineRule="auto"/>
+        <w:rPr>
+          <w:rFonts w:ascii="Montserrat" w:hAnsi="Montserrat"/>
+          <w:color w:val="1A1A1A"/>
+          <w:sz w:val="22"/>
+        </w:rPr>
+      </w:pPr>
+      <w:r>
+        <w:rPr>
+          <w:rFonts w:ascii="Montserrat" w:hAnsi="Montserrat"/>
+          <w:color w:val="1A1A1A"/>
+          <w:sz w:val="22"/>
+        </w:rPr>
         <w:t>O manual nao substitui as Diretrizes para a Gestao de Projetos da UNIALFA (documento institucional que define o framework D01 a D07) nem o documento Regras de Acesso e Permissoes (que detalha cada regra de controle de acesso); ele e o guia operacional de como usar cada ferramenta na pratica.</w:t>
       </w:r>
     </w:p>
@@ -2639,7 +2657,7 @@
           <w:sz w:val="27"/>
         </w:rPr>
       </w:pPr>
-      <w:bookmarkStart w:id="2" w:name="_Toc236231986"/>
+      <w:bookmarkStart w:id="2" w:name="_Toc236233241"/>
       <w:r>
         <w:rPr>
           <w:rFonts w:ascii="Montserrat" w:hAnsi="Montserrat"/>
@@ -2690,6 +2708,7 @@
           <w:color w:val="1A1A1A"/>
           <w:sz w:val="22"/>
         </w:rPr>
+        <w:lastRenderedPageBreak/>
         <w:t>12 formularios de registro (codigo FORALF), cada um correspondendo a um artefato institucional - da Solicitacao de Demanda ao Relatorio de Entregas e Beneficios.</w:t>
       </w:r>
     </w:p>
@@ -2738,7 +2757,6 @@
           <w:color w:val="1A1A1A"/>
           <w:sz w:val="22"/>
         </w:rPr>
-        <w:lastRenderedPageBreak/>
         <w:t>1 pagina de Administracao, restrita a Admin, para gerenciar usuarios, equipes e configuracoes do sistema.</w:t>
       </w:r>
     </w:p>
@@ -2788,16 +2806,16 @@
           <w:noProof/>
         </w:rPr>
         <w:drawing>
-          <wp:inline distT="0" distB="0" distL="0" distR="0" wp14:anchorId="3B49FCC3" wp14:editId="2976B1DF">
+          <wp:inline distT="0" distB="0" distL="0" distR="0" wp14:anchorId="2C8C49E1" wp14:editId="60B49E38">
             <wp:extent cx="5303520" cy="4792851"/>
             <wp:effectExtent l="19050" t="19050" r="11430" b="27305"/>
-            <wp:docPr id="2135369940" name="Imagem 1"/>
+            <wp:docPr id="834732800" name="Imagem 1"/>
             <wp:cNvGraphicFramePr/>
             <a:graphic xmlns:a="http://schemas.openxmlformats.org/drawingml/2006/main">
               <a:graphicData uri="http://schemas.openxmlformats.org/drawingml/2006/picture">
                 <pic:pic xmlns:pic="http://schemas.openxmlformats.org/drawingml/2006/picture">
                   <pic:nvPicPr>
-                    <pic:cNvPr id="2135369940" name=""/>
+                    <pic:cNvPr id="834732800" name=""/>
                     <pic:cNvPicPr/>
                   </pic:nvPicPr>
                   <pic:blipFill>
@@ -2865,7 +2883,7 @@
           <w:sz w:val="27"/>
         </w:rPr>
       </w:pPr>
-      <w:bookmarkStart w:id="3" w:name="_Toc236231987"/>
+      <w:bookmarkStart w:id="3" w:name="_Toc236233242"/>
       <w:r>
         <w:rPr>
           <w:rFonts w:ascii="Montserrat" w:hAnsi="Montserrat"/>
@@ -2906,16 +2924,16 @@
           <w:noProof/>
         </w:rPr>
         <w:drawing>
-          <wp:inline distT="0" distB="0" distL="0" distR="0" wp14:anchorId="314216BF" wp14:editId="0FF7DC03">
+          <wp:inline distT="0" distB="0" distL="0" distR="0" wp14:anchorId="088D9328" wp14:editId="3729A69B">
             <wp:extent cx="4206240" cy="3801227"/>
             <wp:effectExtent l="19050" t="19050" r="22860" b="27940"/>
-            <wp:docPr id="2002344632" name="Imagem 2"/>
+            <wp:docPr id="1325011674" name="Imagem 2"/>
             <wp:cNvGraphicFramePr/>
             <a:graphic xmlns:a="http://schemas.openxmlformats.org/drawingml/2006/main">
               <a:graphicData uri="http://schemas.openxmlformats.org/drawingml/2006/picture">
                 <pic:pic xmlns:pic="http://schemas.openxmlformats.org/drawingml/2006/picture">
                   <pic:nvPicPr>
-                    <pic:cNvPr id="2002344632" name=""/>
+                    <pic:cNvPr id="1325011674" name=""/>
                     <pic:cNvPicPr/>
                   </pic:nvPicPr>
                   <pic:blipFill>
@@ -3088,7 +3106,7 @@
           <w:sz w:val="27"/>
         </w:rPr>
       </w:pPr>
-      <w:bookmarkStart w:id="4" w:name="_Toc236231988"/>
+      <w:bookmarkStart w:id="4" w:name="_Toc236233243"/>
       <w:r>
         <w:rPr>
           <w:rFonts w:ascii="Montserrat" w:hAnsi="Montserrat"/>
@@ -4237,7 +4255,7 @@
           <w:sz w:val="34"/>
         </w:rPr>
       </w:pPr>
-      <w:bookmarkStart w:id="5" w:name="_Toc236231989"/>
+      <w:bookmarkStart w:id="5" w:name="_Toc236233244"/>
       <w:r>
         <w:rPr>
           <w:rFonts w:ascii="Montserrat" w:hAnsi="Montserrat"/>
@@ -4261,7 +4279,7 @@
           <w:sz w:val="27"/>
         </w:rPr>
       </w:pPr>
-      <w:bookmarkStart w:id="6" w:name="_Toc236231990"/>
+      <w:bookmarkStart w:id="6" w:name="_Toc236233245"/>
       <w:r>
         <w:rPr>
           <w:rFonts w:ascii="Montserrat" w:hAnsi="Montserrat"/>
@@ -4302,7 +4320,7 @@
           <w:sz w:val="27"/>
         </w:rPr>
       </w:pPr>
-      <w:bookmarkStart w:id="7" w:name="_Toc236231991"/>
+      <w:bookmarkStart w:id="7" w:name="_Toc236233246"/>
       <w:r>
         <w:rPr>
           <w:rFonts w:ascii="Montserrat" w:hAnsi="Montserrat"/>
@@ -4421,7 +4439,7 @@
           <w:sz w:val="27"/>
         </w:rPr>
       </w:pPr>
-      <w:bookmarkStart w:id="8" w:name="_Toc236231992"/>
+      <w:bookmarkStart w:id="8" w:name="_Toc236233247"/>
       <w:r>
         <w:rPr>
           <w:rFonts w:ascii="Montserrat" w:hAnsi="Montserrat"/>
@@ -4992,7 +5010,7 @@
           <w:sz w:val="27"/>
         </w:rPr>
       </w:pPr>
-      <w:bookmarkStart w:id="9" w:name="_Toc236231993"/>
+      <w:bookmarkStart w:id="9" w:name="_Toc236233248"/>
       <w:r>
         <w:rPr>
           <w:rFonts w:ascii="Montserrat" w:hAnsi="Montserrat"/>
@@ -5081,16 +5099,16 @@
         </w:rPr>
         <w:lastRenderedPageBreak/>
         <w:drawing>
-          <wp:inline distT="0" distB="0" distL="0" distR="0" wp14:anchorId="2029E7FE" wp14:editId="4A34E7AD">
+          <wp:inline distT="0" distB="0" distL="0" distR="0" wp14:anchorId="6F9068C0" wp14:editId="7C46C864">
             <wp:extent cx="4937760" cy="4462310"/>
             <wp:effectExtent l="19050" t="19050" r="15240" b="14605"/>
-            <wp:docPr id="1473211511" name="Imagem 3"/>
+            <wp:docPr id="261016704" name="Imagem 3"/>
             <wp:cNvGraphicFramePr/>
             <a:graphic xmlns:a="http://schemas.openxmlformats.org/drawingml/2006/main">
               <a:graphicData uri="http://schemas.openxmlformats.org/drawingml/2006/picture">
                 <pic:pic xmlns:pic="http://schemas.openxmlformats.org/drawingml/2006/picture">
                   <pic:nvPicPr>
-                    <pic:cNvPr id="1473211511" name=""/>
+                    <pic:cNvPr id="261016704" name=""/>
                     <pic:cNvPicPr/>
                   </pic:nvPicPr>
                   <pic:blipFill>
@@ -5158,7 +5176,7 @@
           <w:sz w:val="27"/>
         </w:rPr>
       </w:pPr>
-      <w:bookmarkStart w:id="10" w:name="_Toc236231994"/>
+      <w:bookmarkStart w:id="10" w:name="_Toc236233249"/>
       <w:r>
         <w:rPr>
           <w:rFonts w:ascii="Montserrat" w:hAnsi="Montserrat"/>
@@ -5199,16 +5217,16 @@
         </w:rPr>
         <w:lastRenderedPageBreak/>
         <w:drawing>
-          <wp:inline distT="0" distB="0" distL="0" distR="0" wp14:anchorId="5660D523" wp14:editId="0F77A532">
+          <wp:inline distT="0" distB="0" distL="0" distR="0" wp14:anchorId="71C45B39" wp14:editId="388B3F37">
             <wp:extent cx="5120640" cy="4627581"/>
             <wp:effectExtent l="19050" t="19050" r="22860" b="20955"/>
-            <wp:docPr id="568530520" name="Imagem 4"/>
+            <wp:docPr id="1654871238" name="Imagem 4"/>
             <wp:cNvGraphicFramePr/>
             <a:graphic xmlns:a="http://schemas.openxmlformats.org/drawingml/2006/main">
               <a:graphicData uri="http://schemas.openxmlformats.org/drawingml/2006/picture">
                 <pic:pic xmlns:pic="http://schemas.openxmlformats.org/drawingml/2006/picture">
                   <pic:nvPicPr>
-                    <pic:cNvPr id="568530520" name=""/>
+                    <pic:cNvPr id="1654871238" name=""/>
                     <pic:cNvPicPr/>
                   </pic:nvPicPr>
                   <pic:blipFill>
@@ -5345,7 +5363,7 @@
           <w:sz w:val="27"/>
         </w:rPr>
       </w:pPr>
-      <w:bookmarkStart w:id="11" w:name="_Toc236231995"/>
+      <w:bookmarkStart w:id="11" w:name="_Toc236233250"/>
       <w:r>
         <w:rPr>
           <w:rFonts w:ascii="Montserrat" w:hAnsi="Montserrat"/>
@@ -5386,16 +5404,16 @@
         </w:rPr>
         <w:lastRenderedPageBreak/>
         <w:drawing>
-          <wp:inline distT="0" distB="0" distL="0" distR="0" wp14:anchorId="1A634F15" wp14:editId="1883B65D">
+          <wp:inline distT="0" distB="0" distL="0" distR="0" wp14:anchorId="7BFCC2F4" wp14:editId="00BB9401">
             <wp:extent cx="4206240" cy="3801227"/>
             <wp:effectExtent l="19050" t="19050" r="22860" b="27940"/>
-            <wp:docPr id="1286378137" name="Imagem 5"/>
+            <wp:docPr id="528634705" name="Imagem 5"/>
             <wp:cNvGraphicFramePr/>
             <a:graphic xmlns:a="http://schemas.openxmlformats.org/drawingml/2006/main">
               <a:graphicData uri="http://schemas.openxmlformats.org/drawingml/2006/picture">
                 <pic:pic xmlns:pic="http://schemas.openxmlformats.org/drawingml/2006/picture">
                   <pic:nvPicPr>
-                    <pic:cNvPr id="1286378137" name=""/>
+                    <pic:cNvPr id="528634705" name=""/>
                     <pic:cNvPicPr/>
                   </pic:nvPicPr>
                   <pic:blipFill>
@@ -5463,16 +5481,16 @@
         </w:rPr>
         <w:lastRenderedPageBreak/>
         <w:drawing>
-          <wp:inline distT="0" distB="0" distL="0" distR="0" wp14:anchorId="77E3CBE9" wp14:editId="215D6F4E">
+          <wp:inline distT="0" distB="0" distL="0" distR="0" wp14:anchorId="4CC5B777" wp14:editId="1AFD4137">
             <wp:extent cx="4206240" cy="3801227"/>
             <wp:effectExtent l="19050" t="19050" r="22860" b="27940"/>
-            <wp:docPr id="568072388" name="Imagem 6"/>
+            <wp:docPr id="1471329029" name="Imagem 6"/>
             <wp:cNvGraphicFramePr/>
             <a:graphic xmlns:a="http://schemas.openxmlformats.org/drawingml/2006/main">
               <a:graphicData uri="http://schemas.openxmlformats.org/drawingml/2006/picture">
                 <pic:pic xmlns:pic="http://schemas.openxmlformats.org/drawingml/2006/picture">
                   <pic:nvPicPr>
-                    <pic:cNvPr id="568072388" name=""/>
+                    <pic:cNvPr id="1471329029" name=""/>
                     <pic:cNvPicPr/>
                   </pic:nvPicPr>
                   <pic:blipFill>
@@ -5588,7 +5606,7 @@
           <w:sz w:val="27"/>
         </w:rPr>
       </w:pPr>
-      <w:bookmarkStart w:id="12" w:name="_Toc236231996"/>
+      <w:bookmarkStart w:id="12" w:name="_Toc236233251"/>
       <w:r>
         <w:rPr>
           <w:rFonts w:ascii="Montserrat" w:hAnsi="Montserrat"/>
@@ -5660,7 +5678,7 @@
           <w:sz w:val="34"/>
         </w:rPr>
       </w:pPr>
-      <w:bookmarkStart w:id="13" w:name="_Toc236231997"/>
+      <w:bookmarkStart w:id="13" w:name="_Toc236233252"/>
       <w:r>
         <w:rPr>
           <w:rFonts w:ascii="Montserrat" w:hAnsi="Montserrat"/>
@@ -5702,7 +5720,7 @@
           <w:sz w:val="27"/>
         </w:rPr>
       </w:pPr>
-      <w:bookmarkStart w:id="14" w:name="_Toc236231998"/>
+      <w:bookmarkStart w:id="14" w:name="_Toc236233253"/>
       <w:r>
         <w:rPr>
           <w:rFonts w:ascii="Montserrat" w:hAnsi="Montserrat"/>
@@ -6562,16 +6580,16 @@
         </w:rPr>
         <w:lastRenderedPageBreak/>
         <w:drawing>
-          <wp:inline distT="0" distB="0" distL="0" distR="0" wp14:anchorId="65D4E5D8" wp14:editId="6C14D01D">
+          <wp:inline distT="0" distB="0" distL="0" distR="0" wp14:anchorId="5C147DD9" wp14:editId="2FB7A452">
             <wp:extent cx="5120640" cy="4627581"/>
             <wp:effectExtent l="19050" t="19050" r="22860" b="20955"/>
-            <wp:docPr id="282985148" name="Imagem 7"/>
+            <wp:docPr id="1899377672" name="Imagem 7"/>
             <wp:cNvGraphicFramePr/>
             <a:graphic xmlns:a="http://schemas.openxmlformats.org/drawingml/2006/main">
               <a:graphicData uri="http://schemas.openxmlformats.org/drawingml/2006/picture">
                 <pic:pic xmlns:pic="http://schemas.openxmlformats.org/drawingml/2006/picture">
                   <pic:nvPicPr>
-                    <pic:cNvPr id="282985148" name=""/>
+                    <pic:cNvPr id="1899377672" name=""/>
                     <pic:cNvPicPr/>
                   </pic:nvPicPr>
                   <pic:blipFill>
@@ -6639,16 +6657,16 @@
         </w:rPr>
         <w:lastRenderedPageBreak/>
         <w:drawing>
-          <wp:inline distT="0" distB="0" distL="0" distR="0" wp14:anchorId="67B2A0A5" wp14:editId="44A98F73">
+          <wp:inline distT="0" distB="0" distL="0" distR="0" wp14:anchorId="57C492C1" wp14:editId="5D03AEAA">
             <wp:extent cx="5120640" cy="4627581"/>
             <wp:effectExtent l="19050" t="19050" r="22860" b="20955"/>
-            <wp:docPr id="831677579" name="Imagem 8"/>
+            <wp:docPr id="1677446758" name="Imagem 8"/>
             <wp:cNvGraphicFramePr/>
             <a:graphic xmlns:a="http://schemas.openxmlformats.org/drawingml/2006/main">
               <a:graphicData uri="http://schemas.openxmlformats.org/drawingml/2006/picture">
                 <pic:pic xmlns:pic="http://schemas.openxmlformats.org/drawingml/2006/picture">
                   <pic:nvPicPr>
-                    <pic:cNvPr id="831677579" name=""/>
+                    <pic:cNvPr id="1677446758" name=""/>
                     <pic:cNvPicPr/>
                   </pic:nvPicPr>
                   <pic:blipFill>
@@ -6783,7 +6801,7 @@
           <w:sz w:val="27"/>
         </w:rPr>
       </w:pPr>
-      <w:bookmarkStart w:id="15" w:name="_Toc236231999"/>
+      <w:bookmarkStart w:id="15" w:name="_Toc236233254"/>
       <w:r>
         <w:rPr>
           <w:rFonts w:ascii="Montserrat" w:hAnsi="Montserrat"/>
@@ -7652,16 +7670,16 @@
         </w:rPr>
         <w:lastRenderedPageBreak/>
         <w:drawing>
-          <wp:inline distT="0" distB="0" distL="0" distR="0" wp14:anchorId="2A267C38" wp14:editId="1F8B82F7">
+          <wp:inline distT="0" distB="0" distL="0" distR="0" wp14:anchorId="5BF8057B" wp14:editId="1EBA040A">
             <wp:extent cx="5120640" cy="4627581"/>
             <wp:effectExtent l="19050" t="19050" r="22860" b="20955"/>
-            <wp:docPr id="966162971" name="Imagem 9"/>
+            <wp:docPr id="1639740510" name="Imagem 9"/>
             <wp:cNvGraphicFramePr/>
             <a:graphic xmlns:a="http://schemas.openxmlformats.org/drawingml/2006/main">
               <a:graphicData uri="http://schemas.openxmlformats.org/drawingml/2006/picture">
                 <pic:pic xmlns:pic="http://schemas.openxmlformats.org/drawingml/2006/picture">
                   <pic:nvPicPr>
-                    <pic:cNvPr id="966162971" name=""/>
+                    <pic:cNvPr id="1639740510" name=""/>
                     <pic:cNvPicPr/>
                   </pic:nvPicPr>
                   <pic:blipFill>
@@ -7729,16 +7747,16 @@
         </w:rPr>
         <w:lastRenderedPageBreak/>
         <w:drawing>
-          <wp:inline distT="0" distB="0" distL="0" distR="0" wp14:anchorId="6C597EE2" wp14:editId="5581E14A">
+          <wp:inline distT="0" distB="0" distL="0" distR="0" wp14:anchorId="073126EF" wp14:editId="03762A92">
             <wp:extent cx="5120640" cy="4627581"/>
             <wp:effectExtent l="19050" t="19050" r="22860" b="20955"/>
-            <wp:docPr id="1887408564" name="Imagem 10"/>
+            <wp:docPr id="887250361" name="Imagem 10"/>
             <wp:cNvGraphicFramePr/>
             <a:graphic xmlns:a="http://schemas.openxmlformats.org/drawingml/2006/main">
               <a:graphicData uri="http://schemas.openxmlformats.org/drawingml/2006/picture">
                 <pic:pic xmlns:pic="http://schemas.openxmlformats.org/drawingml/2006/picture">
                   <pic:nvPicPr>
-                    <pic:cNvPr id="1887408564" name=""/>
+                    <pic:cNvPr id="887250361" name=""/>
                     <pic:cNvPicPr/>
                   </pic:nvPicPr>
                   <pic:blipFill>
@@ -7824,7 +7842,7 @@
           <w:sz w:val="27"/>
         </w:rPr>
       </w:pPr>
-      <w:bookmarkStart w:id="16" w:name="_Toc236232000"/>
+      <w:bookmarkStart w:id="16" w:name="_Toc236233255"/>
       <w:r>
         <w:rPr>
           <w:rFonts w:ascii="Montserrat" w:hAnsi="Montserrat"/>
@@ -8792,16 +8810,16 @@
         </w:rPr>
         <w:lastRenderedPageBreak/>
         <w:drawing>
-          <wp:inline distT="0" distB="0" distL="0" distR="0" wp14:anchorId="194F8342" wp14:editId="3B0CA772">
+          <wp:inline distT="0" distB="0" distL="0" distR="0" wp14:anchorId="0CA2820B" wp14:editId="338F7FD4">
             <wp:extent cx="5120640" cy="3282818"/>
             <wp:effectExtent l="19050" t="19050" r="22860" b="13335"/>
-            <wp:docPr id="225147307" name="Imagem 11"/>
+            <wp:docPr id="1068116943" name="Imagem 11"/>
             <wp:cNvGraphicFramePr/>
             <a:graphic xmlns:a="http://schemas.openxmlformats.org/drawingml/2006/main">
               <a:graphicData uri="http://schemas.openxmlformats.org/drawingml/2006/picture">
                 <pic:pic xmlns:pic="http://schemas.openxmlformats.org/drawingml/2006/picture">
                   <pic:nvPicPr>
-                    <pic:cNvPr id="225147307" name=""/>
+                    <pic:cNvPr id="1068116943" name=""/>
                     <pic:cNvPicPr/>
                   </pic:nvPicPr>
                   <pic:blipFill>
@@ -8869,16 +8887,16 @@
         </w:rPr>
         <w:lastRenderedPageBreak/>
         <w:drawing>
-          <wp:inline distT="0" distB="0" distL="0" distR="0" wp14:anchorId="43058E8D" wp14:editId="5527C5A1">
+          <wp:inline distT="0" distB="0" distL="0" distR="0" wp14:anchorId="0670A91C" wp14:editId="10C4E88A">
             <wp:extent cx="5120640" cy="4627581"/>
             <wp:effectExtent l="19050" t="19050" r="22860" b="20955"/>
-            <wp:docPr id="1823745358" name="Imagem 12"/>
+            <wp:docPr id="2134006940" name="Imagem 12"/>
             <wp:cNvGraphicFramePr/>
             <a:graphic xmlns:a="http://schemas.openxmlformats.org/drawingml/2006/main">
               <a:graphicData uri="http://schemas.openxmlformats.org/drawingml/2006/picture">
                 <pic:pic xmlns:pic="http://schemas.openxmlformats.org/drawingml/2006/picture">
                   <pic:nvPicPr>
-                    <pic:cNvPr id="1823745358" name=""/>
+                    <pic:cNvPr id="2134006940" name=""/>
                     <pic:cNvPicPr/>
                   </pic:nvPicPr>
                   <pic:blipFill>
@@ -8964,7 +8982,7 @@
           <w:sz w:val="27"/>
         </w:rPr>
       </w:pPr>
-      <w:bookmarkStart w:id="17" w:name="_Toc236232001"/>
+      <w:bookmarkStart w:id="17" w:name="_Toc236233256"/>
       <w:r>
         <w:rPr>
           <w:rFonts w:ascii="Montserrat" w:hAnsi="Montserrat"/>
@@ -9471,16 +9489,16 @@
           <w:noProof/>
         </w:rPr>
         <w:drawing>
-          <wp:inline distT="0" distB="0" distL="0" distR="0" wp14:anchorId="4E421FED" wp14:editId="23CB4ADE">
+          <wp:inline distT="0" distB="0" distL="0" distR="0" wp14:anchorId="6E241E86" wp14:editId="4FF8A3C2">
             <wp:extent cx="5120640" cy="4627581"/>
             <wp:effectExtent l="19050" t="19050" r="22860" b="20955"/>
-            <wp:docPr id="1037232828" name="Imagem 13"/>
+            <wp:docPr id="476271731" name="Imagem 13"/>
             <wp:cNvGraphicFramePr/>
             <a:graphic xmlns:a="http://schemas.openxmlformats.org/drawingml/2006/main">
               <a:graphicData uri="http://schemas.openxmlformats.org/drawingml/2006/picture">
                 <pic:pic xmlns:pic="http://schemas.openxmlformats.org/drawingml/2006/picture">
                   <pic:nvPicPr>
-                    <pic:cNvPr id="1037232828" name=""/>
+                    <pic:cNvPr id="476271731" name=""/>
                     <pic:cNvPicPr/>
                   </pic:nvPicPr>
                   <pic:blipFill>
@@ -9548,16 +9566,16 @@
         </w:rPr>
         <w:lastRenderedPageBreak/>
         <w:drawing>
-          <wp:inline distT="0" distB="0" distL="0" distR="0" wp14:anchorId="4242DE41" wp14:editId="7363917E">
+          <wp:inline distT="0" distB="0" distL="0" distR="0" wp14:anchorId="42D90221" wp14:editId="6CACD736">
             <wp:extent cx="5120640" cy="4627581"/>
             <wp:effectExtent l="19050" t="19050" r="22860" b="20955"/>
-            <wp:docPr id="1236935457" name="Imagem 14"/>
+            <wp:docPr id="1117805146" name="Imagem 14"/>
             <wp:cNvGraphicFramePr/>
             <a:graphic xmlns:a="http://schemas.openxmlformats.org/drawingml/2006/main">
               <a:graphicData uri="http://schemas.openxmlformats.org/drawingml/2006/picture">
                 <pic:pic xmlns:pic="http://schemas.openxmlformats.org/drawingml/2006/picture">
                   <pic:nvPicPr>
-                    <pic:cNvPr id="1236935457" name=""/>
+                    <pic:cNvPr id="1117805146" name=""/>
                     <pic:cNvPicPr/>
                   </pic:nvPicPr>
                   <pic:blipFill>
@@ -9643,7 +9661,7 @@
           <w:sz w:val="27"/>
         </w:rPr>
       </w:pPr>
-      <w:bookmarkStart w:id="18" w:name="_Toc236232002"/>
+      <w:bookmarkStart w:id="18" w:name="_Toc236233257"/>
       <w:r>
         <w:rPr>
           <w:rFonts w:ascii="Montserrat" w:hAnsi="Montserrat"/>
@@ -9684,16 +9702,16 @@
         </w:rPr>
         <w:lastRenderedPageBreak/>
         <w:drawing>
-          <wp:inline distT="0" distB="0" distL="0" distR="0" wp14:anchorId="1D53C448" wp14:editId="38D10128">
+          <wp:inline distT="0" distB="0" distL="0" distR="0" wp14:anchorId="582C85DC" wp14:editId="4A452433">
             <wp:extent cx="5120640" cy="4627581"/>
             <wp:effectExtent l="19050" t="19050" r="22860" b="20955"/>
-            <wp:docPr id="1358825148" name="Imagem 15"/>
+            <wp:docPr id="1351387835" name="Imagem 15"/>
             <wp:cNvGraphicFramePr/>
             <a:graphic xmlns:a="http://schemas.openxmlformats.org/drawingml/2006/main">
               <a:graphicData uri="http://schemas.openxmlformats.org/drawingml/2006/picture">
                 <pic:pic xmlns:pic="http://schemas.openxmlformats.org/drawingml/2006/picture">
                   <pic:nvPicPr>
-                    <pic:cNvPr id="1358825148" name=""/>
+                    <pic:cNvPr id="1351387835" name=""/>
                     <pic:cNvPicPr/>
                   </pic:nvPicPr>
                   <pic:blipFill>
@@ -9761,16 +9779,16 @@
         </w:rPr>
         <w:lastRenderedPageBreak/>
         <w:drawing>
-          <wp:inline distT="0" distB="0" distL="0" distR="0" wp14:anchorId="74183003" wp14:editId="13D855A6">
+          <wp:inline distT="0" distB="0" distL="0" distR="0" wp14:anchorId="7FC80FE4" wp14:editId="6AE5629F">
             <wp:extent cx="5120640" cy="4627581"/>
             <wp:effectExtent l="19050" t="19050" r="22860" b="20955"/>
-            <wp:docPr id="1638507117" name="Imagem 16"/>
+            <wp:docPr id="1654598463" name="Imagem 16"/>
             <wp:cNvGraphicFramePr/>
             <a:graphic xmlns:a="http://schemas.openxmlformats.org/drawingml/2006/main">
               <a:graphicData uri="http://schemas.openxmlformats.org/drawingml/2006/picture">
                 <pic:pic xmlns:pic="http://schemas.openxmlformats.org/drawingml/2006/picture">
                   <pic:nvPicPr>
-                    <pic:cNvPr id="1638507117" name=""/>
+                    <pic:cNvPr id="1654598463" name=""/>
                     <pic:cNvPicPr/>
                   </pic:nvPicPr>
                   <pic:blipFill>
@@ -9934,16 +9952,16 @@
         </w:rPr>
         <w:lastRenderedPageBreak/>
         <w:drawing>
-          <wp:inline distT="0" distB="0" distL="0" distR="0" wp14:anchorId="4C725CB9" wp14:editId="7E9054C5">
+          <wp:inline distT="0" distB="0" distL="0" distR="0" wp14:anchorId="6F85C854" wp14:editId="00FA794C">
             <wp:extent cx="5120640" cy="3282818"/>
             <wp:effectExtent l="19050" t="19050" r="22860" b="13335"/>
-            <wp:docPr id="927847853" name="Imagem 17"/>
+            <wp:docPr id="1087239202" name="Imagem 17"/>
             <wp:cNvGraphicFramePr/>
             <a:graphic xmlns:a="http://schemas.openxmlformats.org/drawingml/2006/main">
               <a:graphicData uri="http://schemas.openxmlformats.org/drawingml/2006/picture">
                 <pic:pic xmlns:pic="http://schemas.openxmlformats.org/drawingml/2006/picture">
                   <pic:nvPicPr>
-                    <pic:cNvPr id="927847853" name=""/>
+                    <pic:cNvPr id="1087239202" name=""/>
                     <pic:cNvPicPr/>
                   </pic:nvPicPr>
                   <pic:blipFill>
@@ -10029,7 +10047,7 @@
           <w:sz w:val="27"/>
         </w:rPr>
       </w:pPr>
-      <w:bookmarkStart w:id="19" w:name="_Toc236232003"/>
+      <w:bookmarkStart w:id="19" w:name="_Toc236233258"/>
       <w:r>
         <w:rPr>
           <w:rFonts w:ascii="Montserrat" w:hAnsi="Montserrat"/>
@@ -10070,16 +10088,16 @@
         </w:rPr>
         <w:lastRenderedPageBreak/>
         <w:drawing>
-          <wp:inline distT="0" distB="0" distL="0" distR="0" wp14:anchorId="7F80BC03" wp14:editId="0336BB32">
+          <wp:inline distT="0" distB="0" distL="0" distR="0" wp14:anchorId="1AB30C35" wp14:editId="27F52847">
             <wp:extent cx="5120640" cy="4627581"/>
             <wp:effectExtent l="19050" t="19050" r="22860" b="20955"/>
-            <wp:docPr id="142335221" name="Imagem 18"/>
+            <wp:docPr id="352984908" name="Imagem 18"/>
             <wp:cNvGraphicFramePr/>
             <a:graphic xmlns:a="http://schemas.openxmlformats.org/drawingml/2006/main">
               <a:graphicData uri="http://schemas.openxmlformats.org/drawingml/2006/picture">
                 <pic:pic xmlns:pic="http://schemas.openxmlformats.org/drawingml/2006/picture">
                   <pic:nvPicPr>
-                    <pic:cNvPr id="142335221" name=""/>
+                    <pic:cNvPr id="352984908" name=""/>
                     <pic:cNvPicPr/>
                   </pic:nvPicPr>
                   <pic:blipFill>
@@ -10147,16 +10165,16 @@
         </w:rPr>
         <w:lastRenderedPageBreak/>
         <w:drawing>
-          <wp:inline distT="0" distB="0" distL="0" distR="0" wp14:anchorId="3ABC88B7" wp14:editId="0B5019E4">
+          <wp:inline distT="0" distB="0" distL="0" distR="0" wp14:anchorId="1967EE20" wp14:editId="2DF7D093">
             <wp:extent cx="5120640" cy="4627581"/>
             <wp:effectExtent l="19050" t="19050" r="22860" b="20955"/>
-            <wp:docPr id="873273800" name="Imagem 19"/>
+            <wp:docPr id="1932329052" name="Imagem 19"/>
             <wp:cNvGraphicFramePr/>
             <a:graphic xmlns:a="http://schemas.openxmlformats.org/drawingml/2006/main">
               <a:graphicData uri="http://schemas.openxmlformats.org/drawingml/2006/picture">
                 <pic:pic xmlns:pic="http://schemas.openxmlformats.org/drawingml/2006/picture">
                   <pic:nvPicPr>
-                    <pic:cNvPr id="873273800" name=""/>
+                    <pic:cNvPr id="1932329052" name=""/>
                     <pic:cNvPicPr/>
                   </pic:nvPicPr>
                   <pic:blipFill>
@@ -10290,7 +10308,7 @@
           <w:sz w:val="27"/>
         </w:rPr>
       </w:pPr>
-      <w:bookmarkStart w:id="20" w:name="_Toc236232004"/>
+      <w:bookmarkStart w:id="20" w:name="_Toc236233259"/>
       <w:r>
         <w:rPr>
           <w:rFonts w:ascii="Montserrat" w:hAnsi="Montserrat"/>
@@ -10331,16 +10349,16 @@
         </w:rPr>
         <w:lastRenderedPageBreak/>
         <w:drawing>
-          <wp:inline distT="0" distB="0" distL="0" distR="0" wp14:anchorId="430E5369" wp14:editId="6E589C12">
+          <wp:inline distT="0" distB="0" distL="0" distR="0" wp14:anchorId="79F41277" wp14:editId="4A6826C8">
             <wp:extent cx="5120640" cy="4627581"/>
             <wp:effectExtent l="19050" t="19050" r="22860" b="20955"/>
-            <wp:docPr id="1548285344" name="Imagem 20"/>
+            <wp:docPr id="290699144" name="Imagem 20"/>
             <wp:cNvGraphicFramePr/>
             <a:graphic xmlns:a="http://schemas.openxmlformats.org/drawingml/2006/main">
               <a:graphicData uri="http://schemas.openxmlformats.org/drawingml/2006/picture">
                 <pic:pic xmlns:pic="http://schemas.openxmlformats.org/drawingml/2006/picture">
                   <pic:nvPicPr>
-                    <pic:cNvPr id="1548285344" name=""/>
+                    <pic:cNvPr id="290699144" name=""/>
                     <pic:cNvPicPr/>
                   </pic:nvPicPr>
                   <pic:blipFill>
@@ -10408,16 +10426,16 @@
         </w:rPr>
         <w:lastRenderedPageBreak/>
         <w:drawing>
-          <wp:inline distT="0" distB="0" distL="0" distR="0" wp14:anchorId="62C94FA1" wp14:editId="61180930">
+          <wp:inline distT="0" distB="0" distL="0" distR="0" wp14:anchorId="5F02E9AC" wp14:editId="68980B11">
             <wp:extent cx="5120640" cy="4627581"/>
             <wp:effectExtent l="19050" t="19050" r="22860" b="20955"/>
-            <wp:docPr id="662929393" name="Imagem 21"/>
+            <wp:docPr id="1878092871" name="Imagem 21"/>
             <wp:cNvGraphicFramePr/>
             <a:graphic xmlns:a="http://schemas.openxmlformats.org/drawingml/2006/main">
               <a:graphicData uri="http://schemas.openxmlformats.org/drawingml/2006/picture">
                 <pic:pic xmlns:pic="http://schemas.openxmlformats.org/drawingml/2006/picture">
                   <pic:nvPicPr>
-                    <pic:cNvPr id="662929393" name=""/>
+                    <pic:cNvPr id="1878092871" name=""/>
                     <pic:cNvPicPr/>
                   </pic:nvPicPr>
                   <pic:blipFill>
@@ -10575,7 +10593,7 @@
           <w:sz w:val="27"/>
         </w:rPr>
       </w:pPr>
-      <w:bookmarkStart w:id="21" w:name="_Toc236232005"/>
+      <w:bookmarkStart w:id="21" w:name="_Toc236233260"/>
       <w:r>
         <w:rPr>
           <w:rFonts w:ascii="Montserrat" w:hAnsi="Montserrat"/>
@@ -10616,16 +10634,16 @@
         </w:rPr>
         <w:lastRenderedPageBreak/>
         <w:drawing>
-          <wp:inline distT="0" distB="0" distL="0" distR="0" wp14:anchorId="36EF4335" wp14:editId="600291E6">
+          <wp:inline distT="0" distB="0" distL="0" distR="0" wp14:anchorId="10ECD379" wp14:editId="16D7B9AF">
             <wp:extent cx="5120640" cy="4627581"/>
             <wp:effectExtent l="19050" t="19050" r="22860" b="20955"/>
-            <wp:docPr id="898917334" name="Imagem 22"/>
+            <wp:docPr id="1200362554" name="Imagem 22"/>
             <wp:cNvGraphicFramePr/>
             <a:graphic xmlns:a="http://schemas.openxmlformats.org/drawingml/2006/main">
               <a:graphicData uri="http://schemas.openxmlformats.org/drawingml/2006/picture">
                 <pic:pic xmlns:pic="http://schemas.openxmlformats.org/drawingml/2006/picture">
                   <pic:nvPicPr>
-                    <pic:cNvPr id="898917334" name=""/>
+                    <pic:cNvPr id="1200362554" name=""/>
                     <pic:cNvPicPr/>
                   </pic:nvPicPr>
                   <pic:blipFill>
@@ -10693,16 +10711,16 @@
         </w:rPr>
         <w:lastRenderedPageBreak/>
         <w:drawing>
-          <wp:inline distT="0" distB="0" distL="0" distR="0" wp14:anchorId="01145C14" wp14:editId="706C73EA">
+          <wp:inline distT="0" distB="0" distL="0" distR="0" wp14:anchorId="5FE20DC1" wp14:editId="1A16062A">
             <wp:extent cx="5120640" cy="4627581"/>
             <wp:effectExtent l="19050" t="19050" r="22860" b="20955"/>
-            <wp:docPr id="240795" name="Imagem 23"/>
+            <wp:docPr id="1654359640" name="Imagem 23"/>
             <wp:cNvGraphicFramePr/>
             <a:graphic xmlns:a="http://schemas.openxmlformats.org/drawingml/2006/main">
               <a:graphicData uri="http://schemas.openxmlformats.org/drawingml/2006/picture">
                 <pic:pic xmlns:pic="http://schemas.openxmlformats.org/drawingml/2006/picture">
                   <pic:nvPicPr>
-                    <pic:cNvPr id="240795" name=""/>
+                    <pic:cNvPr id="1654359640" name=""/>
                     <pic:cNvPicPr/>
                   </pic:nvPicPr>
                   <pic:blipFill>
@@ -10860,7 +10878,7 @@
           <w:sz w:val="27"/>
         </w:rPr>
       </w:pPr>
-      <w:bookmarkStart w:id="22" w:name="_Toc236232006"/>
+      <w:bookmarkStart w:id="22" w:name="_Toc236233261"/>
       <w:r>
         <w:rPr>
           <w:rFonts w:ascii="Montserrat" w:hAnsi="Montserrat"/>
@@ -10901,16 +10919,16 @@
         </w:rPr>
         <w:lastRenderedPageBreak/>
         <w:drawing>
-          <wp:inline distT="0" distB="0" distL="0" distR="0" wp14:anchorId="1445D879" wp14:editId="7DC72A64">
+          <wp:inline distT="0" distB="0" distL="0" distR="0" wp14:anchorId="2E6D3FEB" wp14:editId="7196DA40">
             <wp:extent cx="5120640" cy="4627581"/>
             <wp:effectExtent l="19050" t="19050" r="22860" b="20955"/>
-            <wp:docPr id="1981243207" name="Imagem 24"/>
+            <wp:docPr id="1603464968" name="Imagem 24"/>
             <wp:cNvGraphicFramePr/>
             <a:graphic xmlns:a="http://schemas.openxmlformats.org/drawingml/2006/main">
               <a:graphicData uri="http://schemas.openxmlformats.org/drawingml/2006/picture">
                 <pic:pic xmlns:pic="http://schemas.openxmlformats.org/drawingml/2006/picture">
                   <pic:nvPicPr>
-                    <pic:cNvPr id="1981243207" name=""/>
+                    <pic:cNvPr id="1603464968" name=""/>
                     <pic:cNvPicPr/>
                   </pic:nvPicPr>
                   <pic:blipFill>
@@ -10978,16 +10996,16 @@
         </w:rPr>
         <w:lastRenderedPageBreak/>
         <w:drawing>
-          <wp:inline distT="0" distB="0" distL="0" distR="0" wp14:anchorId="7F3DCB2B" wp14:editId="4D7DECF7">
+          <wp:inline distT="0" distB="0" distL="0" distR="0" wp14:anchorId="4C7C9BDD" wp14:editId="396A8FF4">
             <wp:extent cx="5120640" cy="4627581"/>
             <wp:effectExtent l="19050" t="19050" r="22860" b="20955"/>
-            <wp:docPr id="1544407318" name="Imagem 25"/>
+            <wp:docPr id="1836832443" name="Imagem 25"/>
             <wp:cNvGraphicFramePr/>
             <a:graphic xmlns:a="http://schemas.openxmlformats.org/drawingml/2006/main">
               <a:graphicData uri="http://schemas.openxmlformats.org/drawingml/2006/picture">
                 <pic:pic xmlns:pic="http://schemas.openxmlformats.org/drawingml/2006/picture">
                   <pic:nvPicPr>
-                    <pic:cNvPr id="1544407318" name=""/>
+                    <pic:cNvPr id="1836832443" name=""/>
                     <pic:cNvPicPr/>
                   </pic:nvPicPr>
                   <pic:blipFill>
@@ -11121,7 +11139,7 @@
           <w:sz w:val="27"/>
         </w:rPr>
       </w:pPr>
-      <w:bookmarkStart w:id="23" w:name="_Toc236232007"/>
+      <w:bookmarkStart w:id="23" w:name="_Toc236233262"/>
       <w:r>
         <w:rPr>
           <w:rFonts w:ascii="Montserrat" w:hAnsi="Montserrat"/>
@@ -11162,16 +11180,16 @@
         </w:rPr>
         <w:lastRenderedPageBreak/>
         <w:drawing>
-          <wp:inline distT="0" distB="0" distL="0" distR="0" wp14:anchorId="7545E55A" wp14:editId="0BCB4C7C">
+          <wp:inline distT="0" distB="0" distL="0" distR="0" wp14:anchorId="7C4B1D89" wp14:editId="26D8F34D">
             <wp:extent cx="5120640" cy="4627581"/>
             <wp:effectExtent l="19050" t="19050" r="22860" b="20955"/>
-            <wp:docPr id="543630965" name="Imagem 26"/>
+            <wp:docPr id="1941304434" name="Imagem 26"/>
             <wp:cNvGraphicFramePr/>
             <a:graphic xmlns:a="http://schemas.openxmlformats.org/drawingml/2006/main">
               <a:graphicData uri="http://schemas.openxmlformats.org/drawingml/2006/picture">
                 <pic:pic xmlns:pic="http://schemas.openxmlformats.org/drawingml/2006/picture">
                   <pic:nvPicPr>
-                    <pic:cNvPr id="543630965" name=""/>
+                    <pic:cNvPr id="1941304434" name=""/>
                     <pic:cNvPicPr/>
                   </pic:nvPicPr>
                   <pic:blipFill>
@@ -11261,7 +11279,7 @@
           <w:sz w:val="34"/>
         </w:rPr>
       </w:pPr>
-      <w:bookmarkStart w:id="24" w:name="_Toc236232008"/>
+      <w:bookmarkStart w:id="24" w:name="_Toc236233263"/>
       <w:r>
         <w:rPr>
           <w:rFonts w:ascii="Montserrat" w:hAnsi="Montserrat"/>
@@ -11303,7 +11321,7 @@
           <w:sz w:val="27"/>
         </w:rPr>
       </w:pPr>
-      <w:bookmarkStart w:id="25" w:name="_Toc236232009"/>
+      <w:bookmarkStart w:id="25" w:name="_Toc236233264"/>
       <w:r>
         <w:rPr>
           <w:rFonts w:ascii="Montserrat" w:hAnsi="Montserrat"/>
@@ -11343,16 +11361,16 @@
           <w:noProof/>
         </w:rPr>
         <w:drawing>
-          <wp:inline distT="0" distB="0" distL="0" distR="0" wp14:anchorId="3A5C1709" wp14:editId="5572D77A">
+          <wp:inline distT="0" distB="0" distL="0" distR="0" wp14:anchorId="4DC7B86B" wp14:editId="25847308">
             <wp:extent cx="5120640" cy="4627581"/>
             <wp:effectExtent l="19050" t="19050" r="22860" b="20955"/>
-            <wp:docPr id="316273961" name="Imagem 27"/>
+            <wp:docPr id="1152610005" name="Imagem 27"/>
             <wp:cNvGraphicFramePr/>
             <a:graphic xmlns:a="http://schemas.openxmlformats.org/drawingml/2006/main">
               <a:graphicData uri="http://schemas.openxmlformats.org/drawingml/2006/picture">
                 <pic:pic xmlns:pic="http://schemas.openxmlformats.org/drawingml/2006/picture">
                   <pic:nvPicPr>
-                    <pic:cNvPr id="316273961" name=""/>
+                    <pic:cNvPr id="1152610005" name=""/>
                     <pic:cNvPicPr/>
                   </pic:nvPicPr>
                   <pic:blipFill>
@@ -11420,16 +11438,16 @@
         </w:rPr>
         <w:lastRenderedPageBreak/>
         <w:drawing>
-          <wp:inline distT="0" distB="0" distL="0" distR="0" wp14:anchorId="59A53A7D" wp14:editId="2B41E242">
+          <wp:inline distT="0" distB="0" distL="0" distR="0" wp14:anchorId="48D2BF08" wp14:editId="4D340FD0">
             <wp:extent cx="5120640" cy="4627581"/>
             <wp:effectExtent l="19050" t="19050" r="22860" b="20955"/>
-            <wp:docPr id="1942001168" name="Imagem 28"/>
+            <wp:docPr id="1227188331" name="Imagem 28"/>
             <wp:cNvGraphicFramePr/>
             <a:graphic xmlns:a="http://schemas.openxmlformats.org/drawingml/2006/main">
               <a:graphicData uri="http://schemas.openxmlformats.org/drawingml/2006/picture">
                 <pic:pic xmlns:pic="http://schemas.openxmlformats.org/drawingml/2006/picture">
                   <pic:nvPicPr>
-                    <pic:cNvPr id="1942001168" name=""/>
+                    <pic:cNvPr id="1227188331" name=""/>
                     <pic:cNvPicPr/>
                   </pic:nvPicPr>
                   <pic:blipFill>
@@ -11497,16 +11515,16 @@
         </w:rPr>
         <w:lastRenderedPageBreak/>
         <w:drawing>
-          <wp:inline distT="0" distB="0" distL="0" distR="0" wp14:anchorId="4C882A65" wp14:editId="2049D460">
+          <wp:inline distT="0" distB="0" distL="0" distR="0" wp14:anchorId="4944BFF6" wp14:editId="28D55C66">
             <wp:extent cx="5120640" cy="4627581"/>
             <wp:effectExtent l="19050" t="19050" r="22860" b="20955"/>
-            <wp:docPr id="442747020" name="Imagem 29"/>
+            <wp:docPr id="673991570" name="Imagem 29"/>
             <wp:cNvGraphicFramePr/>
             <a:graphic xmlns:a="http://schemas.openxmlformats.org/drawingml/2006/main">
               <a:graphicData uri="http://schemas.openxmlformats.org/drawingml/2006/picture">
                 <pic:pic xmlns:pic="http://schemas.openxmlformats.org/drawingml/2006/picture">
                   <pic:nvPicPr>
-                    <pic:cNvPr id="442747020" name=""/>
+                    <pic:cNvPr id="673991570" name=""/>
                     <pic:cNvPicPr/>
                   </pic:nvPicPr>
                   <pic:blipFill>
@@ -11700,16 +11718,16 @@
           <w:noProof/>
         </w:rPr>
         <w:drawing>
-          <wp:inline distT="0" distB="0" distL="0" distR="0" wp14:anchorId="2FD5BDE6" wp14:editId="5947D3FB">
+          <wp:inline distT="0" distB="0" distL="0" distR="0" wp14:anchorId="6E18E288" wp14:editId="5BEBAC2E">
             <wp:extent cx="5120640" cy="3282818"/>
             <wp:effectExtent l="19050" t="19050" r="22860" b="13335"/>
-            <wp:docPr id="1758058106" name="Imagem 30"/>
+            <wp:docPr id="107937389" name="Imagem 30"/>
             <wp:cNvGraphicFramePr/>
             <a:graphic xmlns:a="http://schemas.openxmlformats.org/drawingml/2006/main">
               <a:graphicData uri="http://schemas.openxmlformats.org/drawingml/2006/picture">
                 <pic:pic xmlns:pic="http://schemas.openxmlformats.org/drawingml/2006/picture">
                   <pic:nvPicPr>
-                    <pic:cNvPr id="1758058106" name=""/>
+                    <pic:cNvPr id="107937389" name=""/>
                     <pic:cNvPicPr/>
                   </pic:nvPicPr>
                   <pic:blipFill>
@@ -11768,6 +11786,30 @@
     </w:p>
     <w:p>
       <w:pPr>
+        <w:pStyle w:val="PargrafodaLista"/>
+        <w:numPr>
+          <w:ilvl w:val="0"/>
+          <w:numId w:val="14"/>
+        </w:numPr>
+        <w:spacing w:after="80" w:line="260" w:lineRule="auto"/>
+        <w:ind w:left="700"/>
+        <w:rPr>
+          <w:rFonts w:ascii="Montserrat" w:hAnsi="Montserrat"/>
+          <w:color w:val="1A1A1A"/>
+          <w:sz w:val="22"/>
+        </w:rPr>
+      </w:pPr>
+      <w:r>
+        <w:rPr>
+          <w:rFonts w:ascii="Montserrat" w:hAnsi="Montserrat"/>
+          <w:color w:val="1A1A1A"/>
+          <w:sz w:val="22"/>
+        </w:rPr>
+        <w:t>Na aba Editar dados, alem dos projetos, ha dois cartoes independentes: Entraves e Encaminhamentos. Cada item tem Descricao, Responsavel, Prazo e Status (Aberto / Resolvido / Cancelado).</w:t>
+      </w:r>
+    </w:p>
+    <w:p>
+      <w:pPr>
         <w:spacing w:before="160" w:after="200"/>
         <w:ind w:left="283"/>
         <w:rPr>
@@ -11784,48 +11826,7 @@
           <w:color w:val="6A6A70"/>
           <w:sz w:val="21"/>
         </w:rPr>
-        <w:t>Este relatorio nao tem aprovacao/status formal - e uma ferramenta viva de acompanhamento, atualizada sempre que a situacao dos projetos mudar.</w:t>
-      </w:r>
-    </w:p>
-    <w:p>
-      <w:pPr>
-        <w:pStyle w:val="Ttulo2"/>
-        <w:spacing w:before="320" w:after="120"/>
-        <w:rPr>
-          <w:rFonts w:ascii="Montserrat" w:hAnsi="Montserrat"/>
-          <w:b/>
-          <w:color w:val="B91D2E"/>
-          <w:sz w:val="27"/>
-        </w:rPr>
-      </w:pPr>
-      <w:bookmarkStart w:id="26" w:name="_Toc236232010"/>
-      <w:r>
-        <w:rPr>
-          <w:rFonts w:ascii="Montserrat" w:hAnsi="Montserrat"/>
-          <w:b/>
-          <w:color w:val="B91D2E"/>
-          <w:sz w:val="27"/>
-        </w:rPr>
-        <w:t>4.2 Relatorio de Entregas e Beneficios (FORALF12)</w:t>
-      </w:r>
-      <w:bookmarkEnd w:id="26"/>
-    </w:p>
-    <w:p>
-      <w:pPr>
-        <w:spacing w:line="280" w:lineRule="auto"/>
-        <w:rPr>
-          <w:rFonts w:ascii="Montserrat" w:hAnsi="Montserrat"/>
-          <w:color w:val="1A1A1A"/>
-          <w:sz w:val="22"/>
-        </w:rPr>
-      </w:pPr>
-      <w:r>
-        <w:rPr>
-          <w:rFonts w:ascii="Montserrat" w:hAnsi="Montserrat"/>
-          <w:color w:val="1A1A1A"/>
-          <w:sz w:val="22"/>
-        </w:rPr>
-        <w:t>O relatorio mais importante do ponto de vista de governanca: e sobre ele que ocorre o Gate 2 - Pactuacao, quando o Dono do Negocio assume formalmente, perante a Alta Gestao, o compromisso de que todo o trabalho planejado sera executado.</w:t>
+        <w:t>Gestao de Entraves e Encaminhamentos: entraves sao bloqueios que impedem o avanco do portfolio (ex.: dependencia externa, aprovacao pendente); encaminhamentos sao os proximos passos e decisoes acordadas para desbloquear ou avancar o trabalho. Os dois sao listas simples, independentes dos projetos cadastrados - continuam visiveis no Painel mesmo que nenhum projeto tenha sido informado ainda. No Painel, aparecem lado a lado na secao Entraves e encaminhamentos, com o Status de cada item destacado por selo colorido, e tambem saem no CSV exportado.</w:t>
       </w:r>
     </w:p>
     <w:p>
@@ -11839,16 +11840,16 @@
         </w:rPr>
         <w:lastRenderedPageBreak/>
         <w:drawing>
-          <wp:inline distT="0" distB="0" distL="0" distR="0" wp14:anchorId="38804A77" wp14:editId="08543890">
-            <wp:extent cx="5120640" cy="4627581"/>
-            <wp:effectExtent l="19050" t="19050" r="22860" b="20955"/>
-            <wp:docPr id="814729855" name="Imagem 31"/>
+          <wp:inline distT="0" distB="0" distL="0" distR="0" wp14:anchorId="177A60C0" wp14:editId="403D8178">
+            <wp:extent cx="5120640" cy="1515102"/>
+            <wp:effectExtent l="19050" t="19050" r="22860" b="28575"/>
+            <wp:docPr id="484460581" name="Imagem 31"/>
             <wp:cNvGraphicFramePr/>
             <a:graphic xmlns:a="http://schemas.openxmlformats.org/drawingml/2006/main">
               <a:graphicData uri="http://schemas.openxmlformats.org/drawingml/2006/picture">
                 <pic:pic xmlns:pic="http://schemas.openxmlformats.org/drawingml/2006/picture">
                   <pic:nvPicPr>
-                    <pic:cNvPr id="814729855" name=""/>
+                    <pic:cNvPr id="484460581" name=""/>
                     <pic:cNvPicPr/>
                   </pic:nvPicPr>
                   <pic:blipFill>
@@ -11866,7 +11867,7 @@
                   <pic:spPr>
                     <a:xfrm>
                       <a:off x="0" y="0"/>
-                      <a:ext cx="5120640" cy="4627581"/>
+                      <a:ext cx="5120640" cy="1515102"/>
                     </a:xfrm>
                     <a:prstGeom prst="rect">
                       <a:avLst/>
@@ -11902,7 +11903,69 @@
           <w:color w:val="6A6A70"/>
           <w:sz w:val="19"/>
         </w:rPr>
-        <w:t>Painel do Relatorio de Entregas e Beneficios (estado vazio).</w:t>
+        <w:t>Secao Entraves e encaminhamentos no Painel, com itens Aberto e Resolvido lado a lado.</w:t>
+      </w:r>
+    </w:p>
+    <w:p>
+      <w:pPr>
+        <w:spacing w:before="160" w:after="200"/>
+        <w:ind w:left="283"/>
+        <w:rPr>
+          <w:rFonts w:ascii="Montserrat" w:hAnsi="Montserrat"/>
+          <w:i/>
+          <w:color w:val="6A6A70"/>
+          <w:sz w:val="21"/>
+        </w:rPr>
+      </w:pPr>
+      <w:r>
+        <w:rPr>
+          <w:rFonts w:ascii="Montserrat" w:hAnsi="Montserrat"/>
+          <w:i/>
+          <w:color w:val="6A6A70"/>
+          <w:sz w:val="21"/>
+        </w:rPr>
+        <w:t>Este relatorio nao tem aprovacao/status formal - e uma ferramenta viva de acompanhamento, atualizada sempre que a situacao dos projetos mudar.</w:t>
+      </w:r>
+    </w:p>
+    <w:p>
+      <w:pPr>
+        <w:pStyle w:val="Ttulo2"/>
+        <w:spacing w:before="320" w:after="120"/>
+        <w:rPr>
+          <w:rFonts w:ascii="Montserrat" w:hAnsi="Montserrat"/>
+          <w:b/>
+          <w:color w:val="B91D2E"/>
+          <w:sz w:val="27"/>
+        </w:rPr>
+      </w:pPr>
+      <w:bookmarkStart w:id="26" w:name="_Toc236233265"/>
+      <w:r>
+        <w:rPr>
+          <w:rFonts w:ascii="Montserrat" w:hAnsi="Montserrat"/>
+          <w:b/>
+          <w:color w:val="B91D2E"/>
+          <w:sz w:val="27"/>
+        </w:rPr>
+        <w:t>4.2 Relatorio de Entregas e Beneficios (FORALF12)</w:t>
+      </w:r>
+      <w:bookmarkEnd w:id="26"/>
+    </w:p>
+    <w:p>
+      <w:pPr>
+        <w:spacing w:line="280" w:lineRule="auto"/>
+        <w:rPr>
+          <w:rFonts w:ascii="Montserrat" w:hAnsi="Montserrat"/>
+          <w:color w:val="1A1A1A"/>
+          <w:sz w:val="22"/>
+        </w:rPr>
+      </w:pPr>
+      <w:r>
+        <w:rPr>
+          <w:rFonts w:ascii="Montserrat" w:hAnsi="Montserrat"/>
+          <w:color w:val="1A1A1A"/>
+          <w:sz w:val="22"/>
+        </w:rPr>
+        <w:t>O relatorio mais importante do ponto de vista de governanca: e sobre ele que ocorre o Gate 2 - Pactuacao, quando o Dono do Negocio assume formalmente, perante a Alta Gestao, o compromisso de que todo o trabalho planejado sera executado.</w:t>
       </w:r>
     </w:p>
     <w:p>
@@ -11916,16 +11979,16 @@
         </w:rPr>
         <w:lastRenderedPageBreak/>
         <w:drawing>
-          <wp:inline distT="0" distB="0" distL="0" distR="0" wp14:anchorId="0C623835" wp14:editId="54471F26">
+          <wp:inline distT="0" distB="0" distL="0" distR="0" wp14:anchorId="251E17B9" wp14:editId="6882DFCF">
             <wp:extent cx="5120640" cy="4627581"/>
             <wp:effectExtent l="19050" t="19050" r="22860" b="20955"/>
-            <wp:docPr id="2135668506" name="Imagem 32"/>
+            <wp:docPr id="592544162" name="Imagem 32"/>
             <wp:cNvGraphicFramePr/>
             <a:graphic xmlns:a="http://schemas.openxmlformats.org/drawingml/2006/main">
               <a:graphicData uri="http://schemas.openxmlformats.org/drawingml/2006/picture">
                 <pic:pic xmlns:pic="http://schemas.openxmlformats.org/drawingml/2006/picture">
                   <pic:nvPicPr>
-                    <pic:cNvPr id="2135668506" name=""/>
+                    <pic:cNvPr id="592544162" name=""/>
                     <pic:cNvPicPr/>
                   </pic:nvPicPr>
                   <pic:blipFill>
@@ -11979,6 +12042,83 @@
           <w:color w:val="6A6A70"/>
           <w:sz w:val="19"/>
         </w:rPr>
+        <w:t>Painel do Relatorio de Entregas e Beneficios (estado vazio).</w:t>
+      </w:r>
+    </w:p>
+    <w:p>
+      <w:pPr>
+        <w:spacing w:before="120" w:after="40"/>
+        <w:jc w:val="center"/>
+      </w:pPr>
+      <w:r>
+        <w:rPr>
+          <w:noProof/>
+        </w:rPr>
+        <w:lastRenderedPageBreak/>
+        <w:drawing>
+          <wp:inline distT="0" distB="0" distL="0" distR="0" wp14:anchorId="0A423951" wp14:editId="2B0D31D5">
+            <wp:extent cx="5120640" cy="4627581"/>
+            <wp:effectExtent l="19050" t="19050" r="22860" b="20955"/>
+            <wp:docPr id="1365162854" name="Imagem 33"/>
+            <wp:cNvGraphicFramePr/>
+            <a:graphic xmlns:a="http://schemas.openxmlformats.org/drawingml/2006/main">
+              <a:graphicData uri="http://schemas.openxmlformats.org/drawingml/2006/picture">
+                <pic:pic xmlns:pic="http://schemas.openxmlformats.org/drawingml/2006/picture">
+                  <pic:nvPicPr>
+                    <pic:cNvPr id="1365162854" name=""/>
+                    <pic:cNvPicPr/>
+                  </pic:nvPicPr>
+                  <pic:blipFill>
+                    <a:blip r:embed="rId39">
+                      <a:extLst>
+                        <a:ext uri="{28A0092B-C50C-407E-A947-70E740481C1C}">
+                          <a14:useLocalDpi xmlns:a14="http://schemas.microsoft.com/office/drawing/2010/main" val="0"/>
+                        </a:ext>
+                      </a:extLst>
+                    </a:blip>
+                    <a:stretch>
+                      <a:fillRect/>
+                    </a:stretch>
+                  </pic:blipFill>
+                  <pic:spPr>
+                    <a:xfrm>
+                      <a:off x="0" y="0"/>
+                      <a:ext cx="5120640" cy="4627581"/>
+                    </a:xfrm>
+                    <a:prstGeom prst="rect">
+                      <a:avLst/>
+                    </a:prstGeom>
+                    <a:ln w="9525">
+                      <a:solidFill>
+                        <a:srgbClr val="D1D5DB"/>
+                      </a:solidFill>
+                    </a:ln>
+                  </pic:spPr>
+                </pic:pic>
+              </a:graphicData>
+            </a:graphic>
+          </wp:inline>
+        </w:drawing>
+      </w:r>
+    </w:p>
+    <w:p>
+      <w:pPr>
+        <w:spacing w:before="120" w:after="280"/>
+        <w:jc w:val="center"/>
+        <w:rPr>
+          <w:rFonts w:ascii="Montserrat" w:hAnsi="Montserrat"/>
+          <w:i/>
+          <w:color w:val="6A6A70"/>
+          <w:sz w:val="19"/>
+        </w:rPr>
+      </w:pPr>
+      <w:r>
+        <w:rPr>
+          <w:rFonts w:ascii="Montserrat" w:hAnsi="Montserrat"/>
+          <w:i/>
+          <w:color w:val="6A6A70"/>
+          <w:sz w:val="19"/>
+        </w:rPr>
         <w:t>Aba Editar dados: Ficha do Programa, o primeiro bloco a preencher.</w:t>
       </w:r>
     </w:p>
@@ -12086,20 +12226,20 @@
         </w:rPr>
         <w:lastRenderedPageBreak/>
         <w:drawing>
-          <wp:inline distT="0" distB="0" distL="0" distR="0" wp14:anchorId="2ADFA9C7" wp14:editId="68342817">
+          <wp:inline distT="0" distB="0" distL="0" distR="0" wp14:anchorId="2BEA04F1" wp14:editId="3648DB04">
             <wp:extent cx="5120640" cy="3282818"/>
             <wp:effectExtent l="19050" t="19050" r="22860" b="13335"/>
-            <wp:docPr id="1835255267" name="Imagem 33"/>
+            <wp:docPr id="1098376221" name="Imagem 34"/>
             <wp:cNvGraphicFramePr/>
             <a:graphic xmlns:a="http://schemas.openxmlformats.org/drawingml/2006/main">
               <a:graphicData uri="http://schemas.openxmlformats.org/drawingml/2006/picture">
                 <pic:pic xmlns:pic="http://schemas.openxmlformats.org/drawingml/2006/picture">
                   <pic:nvPicPr>
-                    <pic:cNvPr id="1835255267" name=""/>
+                    <pic:cNvPr id="1098376221" name=""/>
                     <pic:cNvPicPr/>
                   </pic:nvPicPr>
                   <pic:blipFill>
-                    <a:blip r:embed="rId39">
+                    <a:blip r:embed="rId40">
                       <a:extLst>
                         <a:ext uri="{28A0092B-C50C-407E-A947-70E740481C1C}">
                           <a14:useLocalDpi xmlns:a14="http://schemas.microsoft.com/office/drawing/2010/main" val="0"/>
@@ -12188,7 +12328,7 @@
           <w:sz w:val="34"/>
         </w:rPr>
       </w:pPr>
-      <w:bookmarkStart w:id="27" w:name="_Toc236232011"/>
+      <w:bookmarkStart w:id="27" w:name="_Toc236233266"/>
       <w:r>
         <w:rPr>
           <w:rFonts w:ascii="Montserrat" w:hAnsi="Montserrat"/>
@@ -12248,7 +12388,7 @@
           <w:sz w:val="27"/>
         </w:rPr>
       </w:pPr>
-      <w:bookmarkStart w:id="28" w:name="_Toc236232012"/>
+      <w:bookmarkStart w:id="28" w:name="_Toc236233267"/>
       <w:r>
         <w:rPr>
           <w:rFonts w:ascii="Montserrat" w:hAnsi="Montserrat"/>
@@ -12288,134 +12428,16 @@
           <w:noProof/>
         </w:rPr>
         <w:drawing>
-          <wp:inline distT="0" distB="0" distL="0" distR="0" wp14:anchorId="564E3770" wp14:editId="6FD9B248">
+          <wp:inline distT="0" distB="0" distL="0" distR="0" wp14:anchorId="74011A2D" wp14:editId="711391FD">
             <wp:extent cx="5303520" cy="4792851"/>
             <wp:effectExtent l="19050" t="19050" r="11430" b="27305"/>
-            <wp:docPr id="370350928" name="Imagem 34"/>
+            <wp:docPr id="1004573956" name="Imagem 35"/>
             <wp:cNvGraphicFramePr/>
             <a:graphic xmlns:a="http://schemas.openxmlformats.org/drawingml/2006/main">
               <a:graphicData uri="http://schemas.openxmlformats.org/drawingml/2006/picture">
                 <pic:pic xmlns:pic="http://schemas.openxmlformats.org/drawingml/2006/picture">
                   <pic:nvPicPr>
-                    <pic:cNvPr id="370350928" name=""/>
-                    <pic:cNvPicPr/>
-                  </pic:nvPicPr>
-                  <pic:blipFill>
-                    <a:blip r:embed="rId40">
-                      <a:extLst>
-                        <a:ext uri="{28A0092B-C50C-407E-A947-70E740481C1C}">
-                          <a14:useLocalDpi xmlns:a14="http://schemas.microsoft.com/office/drawing/2010/main" val="0"/>
-                        </a:ext>
-                      </a:extLst>
-                    </a:blip>
-                    <a:stretch>
-                      <a:fillRect/>
-                    </a:stretch>
-                  </pic:blipFill>
-                  <pic:spPr>
-                    <a:xfrm>
-                      <a:off x="0" y="0"/>
-                      <a:ext cx="5303520" cy="4792851"/>
-                    </a:xfrm>
-                    <a:prstGeom prst="rect">
-                      <a:avLst/>
-                    </a:prstGeom>
-                    <a:ln w="9525">
-                      <a:solidFill>
-                        <a:srgbClr val="D1D5DB"/>
-                      </a:solidFill>
-                    </a:ln>
-                  </pic:spPr>
-                </pic:pic>
-              </a:graphicData>
-            </a:graphic>
-          </wp:inline>
-        </w:drawing>
-      </w:r>
-    </w:p>
-    <w:p>
-      <w:pPr>
-        <w:spacing w:before="120" w:after="280"/>
-        <w:jc w:val="center"/>
-        <w:rPr>
-          <w:rFonts w:ascii="Montserrat" w:hAnsi="Montserrat"/>
-          <w:i/>
-          <w:color w:val="6A6A70"/>
-          <w:sz w:val="19"/>
-        </w:rPr>
-      </w:pPr>
-      <w:r>
-        <w:rPr>
-          <w:rFonts w:ascii="Montserrat" w:hAnsi="Montserrat"/>
-          <w:i/>
-          <w:color w:val="6A6A70"/>
-          <w:sz w:val="19"/>
-        </w:rPr>
-        <w:lastRenderedPageBreak/>
-        <w:t>Quadro de conexoes com o fator F1 selecionado - o painel a direita mostra os beneficios que ele habilita.</w:t>
-      </w:r>
-    </w:p>
-    <w:p>
-      <w:pPr>
-        <w:pStyle w:val="Ttulo2"/>
-        <w:spacing w:before="320" w:after="120"/>
-        <w:rPr>
-          <w:rFonts w:ascii="Montserrat" w:hAnsi="Montserrat"/>
-          <w:b/>
-          <w:color w:val="B91D2E"/>
-          <w:sz w:val="27"/>
-        </w:rPr>
-      </w:pPr>
-      <w:bookmarkStart w:id="29" w:name="_Toc236232013"/>
-      <w:r>
-        <w:rPr>
-          <w:rFonts w:ascii="Montserrat" w:hAnsi="Montserrat"/>
-          <w:b/>
-          <w:color w:val="B91D2E"/>
-          <w:sz w:val="27"/>
-        </w:rPr>
-        <w:t>5.2 Simulador - e se...?</w:t>
-      </w:r>
-      <w:bookmarkEnd w:id="29"/>
-    </w:p>
-    <w:p>
-      <w:pPr>
-        <w:spacing w:line="280" w:lineRule="auto"/>
-        <w:rPr>
-          <w:rFonts w:ascii="Montserrat" w:hAnsi="Montserrat"/>
-          <w:color w:val="1A1A1A"/>
-          <w:sz w:val="22"/>
-        </w:rPr>
-      </w:pPr>
-      <w:r>
-        <w:rPr>
-          <w:rFonts w:ascii="Montserrat" w:hAnsi="Montserrat"/>
-          <w:color w:val="1A1A1A"/>
-          <w:sz w:val="22"/>
-        </w:rPr>
-        <w:t>Ajuste o quanto cada fator esta presente no seu projeto (0-100%) e veja o potencial estimado de cada dimensao de beneficio recalcular em tempo real.</w:t>
-      </w:r>
-    </w:p>
-    <w:p>
-      <w:pPr>
-        <w:spacing w:before="120" w:after="40"/>
-        <w:jc w:val="center"/>
-      </w:pPr>
-      <w:r>
-        <w:rPr>
-          <w:noProof/>
-        </w:rPr>
-        <w:drawing>
-          <wp:inline distT="0" distB="0" distL="0" distR="0" wp14:anchorId="5D27B858" wp14:editId="4936142D">
-            <wp:extent cx="5303520" cy="4792851"/>
-            <wp:effectExtent l="19050" t="19050" r="11430" b="27305"/>
-            <wp:docPr id="1222796283" name="Imagem 35"/>
-            <wp:cNvGraphicFramePr/>
-            <a:graphic xmlns:a="http://schemas.openxmlformats.org/drawingml/2006/main">
-              <a:graphicData uri="http://schemas.openxmlformats.org/drawingml/2006/picture">
-                <pic:pic xmlns:pic="http://schemas.openxmlformats.org/drawingml/2006/picture">
-                  <pic:nvPicPr>
-                    <pic:cNvPr id="1222796283" name=""/>
+                    <pic:cNvPr id="1004573956" name=""/>
                     <pic:cNvPicPr/>
                   </pic:nvPicPr>
                   <pic:blipFill>
@@ -12469,7 +12491,8 @@
           <w:color w:val="6A6A70"/>
           <w:sz w:val="19"/>
         </w:rPr>
-        <w:t>Simulador de fatores x beneficios. Abaixo dele, o aviso de login para quem quiser vincular a um projeto.</w:t>
+        <w:lastRenderedPageBreak/>
+        <w:t>Quadro de conexoes com o fator F1 selecionado - o painel a direita mostra os beneficios que ele habilita.</w:t>
       </w:r>
     </w:p>
     <w:p>
@@ -12483,7 +12506,7 @@
           <w:sz w:val="27"/>
         </w:rPr>
       </w:pPr>
-      <w:bookmarkStart w:id="30" w:name="_Toc236232014"/>
+      <w:bookmarkStart w:id="29" w:name="_Toc236233268"/>
       <w:r>
         <w:rPr>
           <w:rFonts w:ascii="Montserrat" w:hAnsi="Montserrat"/>
@@ -12491,9 +12514,9 @@
           <w:color w:val="B91D2E"/>
           <w:sz w:val="27"/>
         </w:rPr>
-        <w:t>5.3 Assistente de decisao em 8 perguntas</w:t>
-      </w:r>
-      <w:bookmarkEnd w:id="30"/>
+        <w:t>5.2 Simulador - e se...?</w:t>
+      </w:r>
+      <w:bookmarkEnd w:id="29"/>
     </w:p>
     <w:p>
       <w:pPr>
@@ -12510,7 +12533,7 @@
           <w:color w:val="1A1A1A"/>
           <w:sz w:val="22"/>
         </w:rPr>
-        <w:t>Responda a oito perguntas do semaforo de decisao, uma de cada vez. Ao final, o painel devolve um veredito com a regra aplicada.</w:t>
+        <w:t>Ajuste o quanto cada fator esta presente no seu projeto (0-100%) e veja o potencial estimado de cada dimensao de beneficio recalcular em tempo real.</w:t>
       </w:r>
     </w:p>
     <w:p>
@@ -12522,18 +12545,17 @@
         <w:rPr>
           <w:noProof/>
         </w:rPr>
-        <w:lastRenderedPageBreak/>
         <w:drawing>
-          <wp:inline distT="0" distB="0" distL="0" distR="0" wp14:anchorId="3D941B9D" wp14:editId="349DFB41">
+          <wp:inline distT="0" distB="0" distL="0" distR="0" wp14:anchorId="31B0EE7A" wp14:editId="2EFC1783">
             <wp:extent cx="5303520" cy="4792851"/>
             <wp:effectExtent l="19050" t="19050" r="11430" b="27305"/>
-            <wp:docPr id="470333512" name="Imagem 36"/>
+            <wp:docPr id="1382399245" name="Imagem 36"/>
             <wp:cNvGraphicFramePr/>
             <a:graphic xmlns:a="http://schemas.openxmlformats.org/drawingml/2006/main">
               <a:graphicData uri="http://schemas.openxmlformats.org/drawingml/2006/picture">
                 <pic:pic xmlns:pic="http://schemas.openxmlformats.org/drawingml/2006/picture">
                   <pic:nvPicPr>
-                    <pic:cNvPr id="470333512" name=""/>
+                    <pic:cNvPr id="1382399245" name=""/>
                     <pic:cNvPicPr/>
                   </pic:nvPicPr>
                   <pic:blipFill>
@@ -12587,7 +12609,48 @@
           <w:color w:val="6A6A70"/>
           <w:sz w:val="19"/>
         </w:rPr>
-        <w:t>Primeira pergunta do assistente de decisao.</w:t>
+        <w:t>Simulador de fatores x beneficios. Abaixo dele, o aviso de login para quem quiser vincular a um projeto.</w:t>
+      </w:r>
+    </w:p>
+    <w:p>
+      <w:pPr>
+        <w:pStyle w:val="Ttulo2"/>
+        <w:spacing w:before="320" w:after="120"/>
+        <w:rPr>
+          <w:rFonts w:ascii="Montserrat" w:hAnsi="Montserrat"/>
+          <w:b/>
+          <w:color w:val="B91D2E"/>
+          <w:sz w:val="27"/>
+        </w:rPr>
+      </w:pPr>
+      <w:bookmarkStart w:id="30" w:name="_Toc236233269"/>
+      <w:r>
+        <w:rPr>
+          <w:rFonts w:ascii="Montserrat" w:hAnsi="Montserrat"/>
+          <w:b/>
+          <w:color w:val="B91D2E"/>
+          <w:sz w:val="27"/>
+        </w:rPr>
+        <w:t>5.3 Assistente de decisao em 8 perguntas</w:t>
+      </w:r>
+      <w:bookmarkEnd w:id="30"/>
+    </w:p>
+    <w:p>
+      <w:pPr>
+        <w:spacing w:line="280" w:lineRule="auto"/>
+        <w:rPr>
+          <w:rFonts w:ascii="Montserrat" w:hAnsi="Montserrat"/>
+          <w:color w:val="1A1A1A"/>
+          <w:sz w:val="22"/>
+        </w:rPr>
+      </w:pPr>
+      <w:r>
+        <w:rPr>
+          <w:rFonts w:ascii="Montserrat" w:hAnsi="Montserrat"/>
+          <w:color w:val="1A1A1A"/>
+          <w:sz w:val="22"/>
+        </w:rPr>
+        <w:t>Responda a oito perguntas do semaforo de decisao, uma de cada vez. Ao final, o painel devolve um veredito com a regra aplicada.</w:t>
       </w:r>
     </w:p>
     <w:p>
@@ -12601,16 +12664,16 @@
         </w:rPr>
         <w:lastRenderedPageBreak/>
         <w:drawing>
-          <wp:inline distT="0" distB="0" distL="0" distR="0" wp14:anchorId="21AD07A3" wp14:editId="7A92EB1E">
+          <wp:inline distT="0" distB="0" distL="0" distR="0" wp14:anchorId="08394D94" wp14:editId="79A4A768">
             <wp:extent cx="5303520" cy="4792851"/>
             <wp:effectExtent l="19050" t="19050" r="11430" b="27305"/>
-            <wp:docPr id="818715976" name="Imagem 37"/>
+            <wp:docPr id="625860520" name="Imagem 37"/>
             <wp:cNvGraphicFramePr/>
             <a:graphic xmlns:a="http://schemas.openxmlformats.org/drawingml/2006/main">
               <a:graphicData uri="http://schemas.openxmlformats.org/drawingml/2006/picture">
                 <pic:pic xmlns:pic="http://schemas.openxmlformats.org/drawingml/2006/picture">
                   <pic:nvPicPr>
-                    <pic:cNvPr id="818715976" name=""/>
+                    <pic:cNvPr id="625860520" name=""/>
                     <pic:cNvPicPr/>
                   </pic:nvPicPr>
                   <pic:blipFill>
@@ -12664,115 +12727,7 @@
           <w:color w:val="6A6A70"/>
           <w:sz w:val="19"/>
         </w:rPr>
-        <w:t>Veredito final, com o placar de respostas verdes/amarelas/vermelhas.</w:t>
-      </w:r>
-    </w:p>
-    <w:p>
-      <w:pPr>
-        <w:spacing w:before="160" w:after="200"/>
-        <w:ind w:left="283"/>
-        <w:rPr>
-          <w:rFonts w:ascii="Montserrat" w:hAnsi="Montserrat"/>
-          <w:i/>
-          <w:color w:val="6A6A70"/>
-          <w:sz w:val="21"/>
-        </w:rPr>
-      </w:pPr>
-      <w:r>
-        <w:rPr>
-          <w:rFonts w:ascii="Montserrat" w:hAnsi="Montserrat"/>
-          <w:i/>
-          <w:color w:val="6A6A70"/>
-          <w:sz w:val="21"/>
-        </w:rPr>
-        <w:t>Regra aplicada: qualquer resposta vermelha leva a encerrar/repactuar; tres ou mais amarelas levam a replanejar; caso contrario, o veredito e concluir.</w:t>
-      </w:r>
-    </w:p>
-    <w:p>
-      <w:pPr>
-        <w:pStyle w:val="Ttulo1"/>
-        <w:pageBreakBefore/>
-        <w:pBdr>
-          <w:bottom w:val="single" w:sz="4" w:space="0" w:color="E4E4E7"/>
-        </w:pBdr>
-        <w:spacing w:before="80" w:after="200"/>
-        <w:rPr>
-          <w:rFonts w:ascii="Montserrat" w:hAnsi="Montserrat"/>
-          <w:b/>
-          <w:color w:val="1A1A1A"/>
-          <w:sz w:val="34"/>
-        </w:rPr>
-      </w:pPr>
-      <w:bookmarkStart w:id="31" w:name="_Toc236232015"/>
-      <w:r>
-        <w:rPr>
-          <w:rFonts w:ascii="Montserrat" w:hAnsi="Montserrat"/>
-          <w:b/>
-          <w:color w:val="1A1A1A"/>
-          <w:sz w:val="34"/>
-        </w:rPr>
-        <w:lastRenderedPageBreak/>
-        <w:t>6. Administracao do sistema</w:t>
-      </w:r>
-      <w:bookmarkEnd w:id="31"/>
-    </w:p>
-    <w:p>
-      <w:pPr>
-        <w:spacing w:line="280" w:lineRule="auto"/>
-        <w:rPr>
-          <w:rFonts w:ascii="Montserrat" w:hAnsi="Montserrat"/>
-          <w:color w:val="1A1A1A"/>
-          <w:sz w:val="22"/>
-        </w:rPr>
-      </w:pPr>
-      <w:r>
-        <w:rPr>
-          <w:rFonts w:ascii="Montserrat" w:hAnsi="Montserrat"/>
-          <w:color w:val="1A1A1A"/>
-          <w:sz w:val="22"/>
-        </w:rPr>
-        <w:t>Pagina restrita a usuarios com papel Admin (secao 2.3). Reune tres abas: Usuarios, Equipes e Configuracoes.</w:t>
-      </w:r>
-    </w:p>
-    <w:p>
-      <w:pPr>
-        <w:pStyle w:val="Ttulo2"/>
-        <w:spacing w:before="320" w:after="120"/>
-        <w:rPr>
-          <w:rFonts w:ascii="Montserrat" w:hAnsi="Montserrat"/>
-          <w:b/>
-          <w:color w:val="B91D2E"/>
-          <w:sz w:val="27"/>
-        </w:rPr>
-      </w:pPr>
-      <w:bookmarkStart w:id="32" w:name="_Toc236232016"/>
-      <w:r>
-        <w:rPr>
-          <w:rFonts w:ascii="Montserrat" w:hAnsi="Montserrat"/>
-          <w:b/>
-          <w:color w:val="B91D2E"/>
-          <w:sz w:val="27"/>
-        </w:rPr>
-        <w:t>6.1 Usuarios</w:t>
-      </w:r>
-      <w:bookmarkEnd w:id="32"/>
-    </w:p>
-    <w:p>
-      <w:pPr>
-        <w:spacing w:line="280" w:lineRule="auto"/>
-        <w:rPr>
-          <w:rFonts w:ascii="Montserrat" w:hAnsi="Montserrat"/>
-          <w:color w:val="1A1A1A"/>
-          <w:sz w:val="22"/>
-        </w:rPr>
-      </w:pPr>
-      <w:r>
-        <w:rPr>
-          <w:rFonts w:ascii="Montserrat" w:hAnsi="Montserrat"/>
-          <w:color w:val="1A1A1A"/>
-          <w:sz w:val="22"/>
-        </w:rPr>
-        <w:t>Lista todos os usuarios que ja fizeram login pelo menos uma vez, com o papel atual e um seletor para altera-lo.</w:t>
+        <w:t>Primeira pergunta do assistente de decisao.</w:t>
       </w:r>
     </w:p>
     <w:p>
@@ -12784,17 +12739,18 @@
         <w:rPr>
           <w:noProof/>
         </w:rPr>
+        <w:lastRenderedPageBreak/>
         <w:drawing>
-          <wp:inline distT="0" distB="0" distL="0" distR="0" wp14:anchorId="12BCB010" wp14:editId="02CF9CF3">
+          <wp:inline distT="0" distB="0" distL="0" distR="0" wp14:anchorId="145488D9" wp14:editId="7ABF0D69">
             <wp:extent cx="5303520" cy="4792851"/>
             <wp:effectExtent l="19050" t="19050" r="11430" b="27305"/>
-            <wp:docPr id="247206850" name="Imagem 38"/>
+            <wp:docPr id="655116651" name="Imagem 38"/>
             <wp:cNvGraphicFramePr/>
             <a:graphic xmlns:a="http://schemas.openxmlformats.org/drawingml/2006/main">
               <a:graphicData uri="http://schemas.openxmlformats.org/drawingml/2006/picture">
                 <pic:pic xmlns:pic="http://schemas.openxmlformats.org/drawingml/2006/picture">
                   <pic:nvPicPr>
-                    <pic:cNvPr id="247206850" name=""/>
+                    <pic:cNvPr id="655116651" name=""/>
                     <pic:cNvPicPr/>
                   </pic:nvPicPr>
                   <pic:blipFill>
@@ -12848,7 +12804,74 @@
           <w:color w:val="6A6A70"/>
           <w:sz w:val="19"/>
         </w:rPr>
-        <w:t>Aba Usuarios: papel atual e seletor de alteracao de papel por usuario.</w:t>
+        <w:t>Veredito final, com o placar de respostas verdes/amarelas/vermelhas.</w:t>
+      </w:r>
+    </w:p>
+    <w:p>
+      <w:pPr>
+        <w:spacing w:before="160" w:after="200"/>
+        <w:ind w:left="283"/>
+        <w:rPr>
+          <w:rFonts w:ascii="Montserrat" w:hAnsi="Montserrat"/>
+          <w:i/>
+          <w:color w:val="6A6A70"/>
+          <w:sz w:val="21"/>
+        </w:rPr>
+      </w:pPr>
+      <w:r>
+        <w:rPr>
+          <w:rFonts w:ascii="Montserrat" w:hAnsi="Montserrat"/>
+          <w:i/>
+          <w:color w:val="6A6A70"/>
+          <w:sz w:val="21"/>
+        </w:rPr>
+        <w:t>Regra aplicada: qualquer resposta vermelha leva a encerrar/repactuar; tres ou mais amarelas levam a replanejar; caso contrario, o veredito e concluir.</w:t>
+      </w:r>
+    </w:p>
+    <w:p>
+      <w:pPr>
+        <w:pStyle w:val="Ttulo1"/>
+        <w:pageBreakBefore/>
+        <w:pBdr>
+          <w:bottom w:val="single" w:sz="4" w:space="0" w:color="E4E4E7"/>
+        </w:pBdr>
+        <w:spacing w:before="80" w:after="200"/>
+        <w:rPr>
+          <w:rFonts w:ascii="Montserrat" w:hAnsi="Montserrat"/>
+          <w:b/>
+          <w:color w:val="1A1A1A"/>
+          <w:sz w:val="34"/>
+        </w:rPr>
+      </w:pPr>
+      <w:bookmarkStart w:id="31" w:name="_Toc236233270"/>
+      <w:r>
+        <w:rPr>
+          <w:rFonts w:ascii="Montserrat" w:hAnsi="Montserrat"/>
+          <w:b/>
+          <w:color w:val="1A1A1A"/>
+          <w:sz w:val="34"/>
+        </w:rPr>
+        <w:lastRenderedPageBreak/>
+        <w:t>6. Administracao do sistema</w:t>
+      </w:r>
+      <w:bookmarkEnd w:id="31"/>
+    </w:p>
+    <w:p>
+      <w:pPr>
+        <w:spacing w:line="280" w:lineRule="auto"/>
+        <w:rPr>
+          <w:rFonts w:ascii="Montserrat" w:hAnsi="Montserrat"/>
+          <w:color w:val="1A1A1A"/>
+          <w:sz w:val="22"/>
+        </w:rPr>
+      </w:pPr>
+      <w:r>
+        <w:rPr>
+          <w:rFonts w:ascii="Montserrat" w:hAnsi="Montserrat"/>
+          <w:color w:val="1A1A1A"/>
+          <w:sz w:val="22"/>
+        </w:rPr>
+        <w:t>Pagina restrita a usuarios com papel Admin (secao 2.3). Reune tres abas: Usuarios, Equipes e Configuracoes.</w:t>
       </w:r>
     </w:p>
     <w:p>
@@ -12862,7 +12885,7 @@
           <w:sz w:val="27"/>
         </w:rPr>
       </w:pPr>
-      <w:bookmarkStart w:id="33" w:name="_Toc236232017"/>
+      <w:bookmarkStart w:id="32" w:name="_Toc236233271"/>
       <w:r>
         <w:rPr>
           <w:rFonts w:ascii="Montserrat" w:hAnsi="Montserrat"/>
@@ -12870,9 +12893,9 @@
           <w:color w:val="B91D2E"/>
           <w:sz w:val="27"/>
         </w:rPr>
-        <w:t>6.2 Equipes</w:t>
-      </w:r>
-      <w:bookmarkEnd w:id="33"/>
+        <w:t>6.1 Usuarios</w:t>
+      </w:r>
+      <w:bookmarkEnd w:id="32"/>
     </w:p>
     <w:p>
       <w:pPr>
@@ -12889,7 +12912,7 @@
           <w:color w:val="1A1A1A"/>
           <w:sz w:val="22"/>
         </w:rPr>
-        <w:t>Define quem faz parte da equipe de cada projeto - a base da restricao por equipe descrita na secao 2.5. Selecione um projeto, escolha um papel e clique em + Adicionar a equipe.</w:t>
+        <w:t>Lista todos os usuarios que ja fizeram login pelo menos uma vez, com o papel atual e um seletor para altera-lo.</w:t>
       </w:r>
     </w:p>
     <w:p>
@@ -12901,18 +12924,17 @@
         <w:rPr>
           <w:noProof/>
         </w:rPr>
-        <w:lastRenderedPageBreak/>
         <w:drawing>
-          <wp:inline distT="0" distB="0" distL="0" distR="0" wp14:anchorId="07C86D90" wp14:editId="2990377D">
+          <wp:inline distT="0" distB="0" distL="0" distR="0" wp14:anchorId="787478FF" wp14:editId="6170DB9C">
             <wp:extent cx="5303520" cy="4792851"/>
             <wp:effectExtent l="19050" t="19050" r="11430" b="27305"/>
-            <wp:docPr id="1464876489" name="Imagem 39"/>
+            <wp:docPr id="262669720" name="Imagem 39"/>
             <wp:cNvGraphicFramePr/>
             <a:graphic xmlns:a="http://schemas.openxmlformats.org/drawingml/2006/main">
               <a:graphicData uri="http://schemas.openxmlformats.org/drawingml/2006/picture">
                 <pic:pic xmlns:pic="http://schemas.openxmlformats.org/drawingml/2006/picture">
                   <pic:nvPicPr>
-                    <pic:cNvPr id="1464876489" name=""/>
+                    <pic:cNvPr id="262669720" name=""/>
                     <pic:cNvPicPr/>
                   </pic:nvPicPr>
                   <pic:blipFill>
@@ -12966,7 +12988,7 @@
           <w:color w:val="6A6A70"/>
           <w:sz w:val="19"/>
         </w:rPr>
-        <w:t>Aba Equipes, com um projeto selecionado e um membro ja cadastrado.</w:t>
+        <w:t>Aba Usuarios: papel atual e seletor de alteracao de papel por usuario.</w:t>
       </w:r>
     </w:p>
     <w:p>
@@ -12980,7 +13002,7 @@
           <w:sz w:val="27"/>
         </w:rPr>
       </w:pPr>
-      <w:bookmarkStart w:id="34" w:name="_Toc236232018"/>
+      <w:bookmarkStart w:id="33" w:name="_Toc236233272"/>
       <w:r>
         <w:rPr>
           <w:rFonts w:ascii="Montserrat" w:hAnsi="Montserrat"/>
@@ -12988,9 +13010,9 @@
           <w:color w:val="B91D2E"/>
           <w:sz w:val="27"/>
         </w:rPr>
-        <w:t>6.3 Configuracoes</w:t>
-      </w:r>
-      <w:bookmarkEnd w:id="34"/>
+        <w:t>6.2 Equipes</w:t>
+      </w:r>
+      <w:bookmarkEnd w:id="33"/>
     </w:p>
     <w:p>
       <w:pPr>
@@ -13007,7 +13029,7 @@
           <w:color w:val="1A1A1A"/>
           <w:sz w:val="22"/>
         </w:rPr>
-        <w:t>Controla os dois interruptores de acesso sem login (Solicitacao de Demanda e Ata de Reuniao), descritos na secao 2.6.</w:t>
+        <w:t>Define quem faz parte da equipe de cada projeto - a base da restricao por equipe descrita na secao 2.5. Selecione um projeto, escolha um papel e clique em + Adicionar a equipe.</w:t>
       </w:r>
     </w:p>
     <w:p>
@@ -13021,16 +13043,16 @@
         </w:rPr>
         <w:lastRenderedPageBreak/>
         <w:drawing>
-          <wp:inline distT="0" distB="0" distL="0" distR="0" wp14:anchorId="0C26F9B5" wp14:editId="77C646AF">
+          <wp:inline distT="0" distB="0" distL="0" distR="0" wp14:anchorId="63D788D3" wp14:editId="00F5FAC8">
             <wp:extent cx="5303520" cy="4792851"/>
             <wp:effectExtent l="19050" t="19050" r="11430" b="27305"/>
-            <wp:docPr id="46568854" name="Imagem 40"/>
+            <wp:docPr id="559228622" name="Imagem 40"/>
             <wp:cNvGraphicFramePr/>
             <a:graphic xmlns:a="http://schemas.openxmlformats.org/drawingml/2006/main">
               <a:graphicData uri="http://schemas.openxmlformats.org/drawingml/2006/picture">
                 <pic:pic xmlns:pic="http://schemas.openxmlformats.org/drawingml/2006/picture">
                   <pic:nvPicPr>
-                    <pic:cNvPr id="46568854" name=""/>
+                    <pic:cNvPr id="559228622" name=""/>
                     <pic:cNvPicPr/>
                   </pic:nvPicPr>
                   <pic:blipFill>
@@ -13084,6 +13106,124 @@
           <w:color w:val="6A6A70"/>
           <w:sz w:val="19"/>
         </w:rPr>
+        <w:t>Aba Equipes, com um projeto selecionado e um membro ja cadastrado.</w:t>
+      </w:r>
+    </w:p>
+    <w:p>
+      <w:pPr>
+        <w:pStyle w:val="Ttulo2"/>
+        <w:spacing w:before="320" w:after="120"/>
+        <w:rPr>
+          <w:rFonts w:ascii="Montserrat" w:hAnsi="Montserrat"/>
+          <w:b/>
+          <w:color w:val="B91D2E"/>
+          <w:sz w:val="27"/>
+        </w:rPr>
+      </w:pPr>
+      <w:bookmarkStart w:id="34" w:name="_Toc236233273"/>
+      <w:r>
+        <w:rPr>
+          <w:rFonts w:ascii="Montserrat" w:hAnsi="Montserrat"/>
+          <w:b/>
+          <w:color w:val="B91D2E"/>
+          <w:sz w:val="27"/>
+        </w:rPr>
+        <w:t>6.3 Configuracoes</w:t>
+      </w:r>
+      <w:bookmarkEnd w:id="34"/>
+    </w:p>
+    <w:p>
+      <w:pPr>
+        <w:spacing w:line="280" w:lineRule="auto"/>
+        <w:rPr>
+          <w:rFonts w:ascii="Montserrat" w:hAnsi="Montserrat"/>
+          <w:color w:val="1A1A1A"/>
+          <w:sz w:val="22"/>
+        </w:rPr>
+      </w:pPr>
+      <w:r>
+        <w:rPr>
+          <w:rFonts w:ascii="Montserrat" w:hAnsi="Montserrat"/>
+          <w:color w:val="1A1A1A"/>
+          <w:sz w:val="22"/>
+        </w:rPr>
+        <w:t>Controla os dois interruptores de acesso sem login (Solicitacao de Demanda e Ata de Reuniao), descritos na secao 2.6.</w:t>
+      </w:r>
+    </w:p>
+    <w:p>
+      <w:pPr>
+        <w:spacing w:before="120" w:after="40"/>
+        <w:jc w:val="center"/>
+      </w:pPr>
+      <w:r>
+        <w:rPr>
+          <w:noProof/>
+        </w:rPr>
+        <w:lastRenderedPageBreak/>
+        <w:drawing>
+          <wp:inline distT="0" distB="0" distL="0" distR="0" wp14:anchorId="767985D8" wp14:editId="7C5463EF">
+            <wp:extent cx="5303520" cy="4792851"/>
+            <wp:effectExtent l="19050" t="19050" r="11430" b="27305"/>
+            <wp:docPr id="1571979548" name="Imagem 41"/>
+            <wp:cNvGraphicFramePr/>
+            <a:graphic xmlns:a="http://schemas.openxmlformats.org/drawingml/2006/main">
+              <a:graphicData uri="http://schemas.openxmlformats.org/drawingml/2006/picture">
+                <pic:pic xmlns:pic="http://schemas.openxmlformats.org/drawingml/2006/picture">
+                  <pic:nvPicPr>
+                    <pic:cNvPr id="1571979548" name=""/>
+                    <pic:cNvPicPr/>
+                  </pic:nvPicPr>
+                  <pic:blipFill>
+                    <a:blip r:embed="rId47">
+                      <a:extLst>
+                        <a:ext uri="{28A0092B-C50C-407E-A947-70E740481C1C}">
+                          <a14:useLocalDpi xmlns:a14="http://schemas.microsoft.com/office/drawing/2010/main" val="0"/>
+                        </a:ext>
+                      </a:extLst>
+                    </a:blip>
+                    <a:stretch>
+                      <a:fillRect/>
+                    </a:stretch>
+                  </pic:blipFill>
+                  <pic:spPr>
+                    <a:xfrm>
+                      <a:off x="0" y="0"/>
+                      <a:ext cx="5303520" cy="4792851"/>
+                    </a:xfrm>
+                    <a:prstGeom prst="rect">
+                      <a:avLst/>
+                    </a:prstGeom>
+                    <a:ln w="9525">
+                      <a:solidFill>
+                        <a:srgbClr val="D1D5DB"/>
+                      </a:solidFill>
+                    </a:ln>
+                  </pic:spPr>
+                </pic:pic>
+              </a:graphicData>
+            </a:graphic>
+          </wp:inline>
+        </w:drawing>
+      </w:r>
+    </w:p>
+    <w:p>
+      <w:pPr>
+        <w:spacing w:before="120" w:after="280"/>
+        <w:jc w:val="center"/>
+        <w:rPr>
+          <w:rFonts w:ascii="Montserrat" w:hAnsi="Montserrat"/>
+          <w:i/>
+          <w:color w:val="6A6A70"/>
+          <w:sz w:val="19"/>
+        </w:rPr>
+      </w:pPr>
+      <w:r>
+        <w:rPr>
+          <w:rFonts w:ascii="Montserrat" w:hAnsi="Montserrat"/>
+          <w:i/>
+          <w:color w:val="6A6A70"/>
+          <w:sz w:val="19"/>
+        </w:rPr>
         <w:t>Aba Configuracoes: os dois interruptores de acesso sem login, hoje desativados.</w:t>
       </w:r>
     </w:p>
@@ -13102,7 +13242,7 @@
           <w:sz w:val="34"/>
         </w:rPr>
       </w:pPr>
-      <w:bookmarkStart w:id="35" w:name="_Toc236232019"/>
+      <w:bookmarkStart w:id="35" w:name="_Toc236233274"/>
       <w:r>
         <w:rPr>
           <w:rFonts w:ascii="Montserrat" w:hAnsi="Montserrat"/>
@@ -13346,7 +13486,7 @@
           <w:sz w:val="34"/>
         </w:rPr>
       </w:pPr>
-      <w:bookmarkStart w:id="36" w:name="_Toc236232020"/>
+      <w:bookmarkStart w:id="36" w:name="_Toc236233275"/>
       <w:r>
         <w:rPr>
           <w:rFonts w:ascii="Montserrat" w:hAnsi="Montserrat"/>
@@ -15004,12 +15144,12 @@
       </w:pPr>
     </w:p>
     <w:sectPr>
-      <w:headerReference w:type="even" r:id="rId47"/>
-      <w:headerReference w:type="default" r:id="rId48"/>
-      <w:footerReference w:type="even" r:id="rId49"/>
-      <w:footerReference w:type="default" r:id="rId50"/>
-      <w:headerReference w:type="first" r:id="rId51"/>
-      <w:footerReference w:type="first" r:id="rId52"/>
+      <w:headerReference w:type="even" r:id="rId48"/>
+      <w:headerReference w:type="default" r:id="rId49"/>
+      <w:footerReference w:type="even" r:id="rId50"/>
+      <w:footerReference w:type="default" r:id="rId51"/>
+      <w:headerReference w:type="first" r:id="rId52"/>
+      <w:footerReference w:type="first" r:id="rId53"/>
       <w:pgSz w:w="12240" w:h="15840"/>
       <w:pgMar w:top="1417" w:right="1701" w:bottom="1417" w:left="1701" w:header="708" w:footer="708" w:gutter="0"/>
       <w:cols w:space="708"/>
@@ -15168,7 +15308,7 @@
 <file path=word/numbering.xml><?xml version="1.0" encoding="utf-8"?>
 <w:numbering xmlns:wpc="http://schemas.microsoft.com/office/word/2010/wordprocessingCanvas" xmlns:cx="http://schemas.microsoft.com/office/drawing/2014/chartex" xmlns:cx1="http://schemas.microsoft.com/office/drawing/2015/9/8/chartex" xmlns:cx2="http://schemas.microsoft.com/office/drawing/2015/10/21/chartex" xmlns:cx3="http://schemas.microsoft.com/office/drawing/2016/5/9/chartex" xmlns:cx4="http://schemas.microsoft.com/office/drawing/2016/5/10/chartex" xmlns:cx5="http://schemas.microsoft.com/office/drawing/2016/5/11/chartex" xmlns:cx6="http://schemas.microsoft.com/office/drawing/2016/5/12/chartex" xmlns:cx7="http://schemas.microsoft.com/office/drawing/2016/5/13/chartex" xmlns:cx8="http://schemas.microsoft.com/office/drawing/2016/5/14/chartex" xmlns:mc="http://schemas.openxmlformats.org/markup-compatibility/2006" xmlns:aink="http://schemas.microsoft.com/office/drawing/2016/ink" xmlns:am3d="http://schemas.microsoft.com/office/drawing/2017/model3d" xmlns:o="urn:schemas-microsoft-com:office:office" xmlns:oel="http://schemas.microsoft.com/office/2019/extlst" xmlns:r="http://schemas.openxmlformats.org/officeDocument/2006/relationships" xmlns:m="http://schemas.openxmlformats.org/officeDocument/2006/math" xmlns:v="urn:schemas-microsoft-com:vml" xmlns:wp14="http://schemas.microsoft.com/office/word/2010/wordprocessingDrawing" xmlns:wp="http://schemas.openxmlformats.org/drawingml/2006/wordprocessingDrawing" xmlns:w10="urn:schemas-microsoft-com:office:word" xmlns:w="http://schemas.openxmlformats.org/wordprocessingml/2006/main" xmlns:w14="http://schemas.microsoft.com/office/word/2010/wordml" xmlns:w15="http://schemas.microsoft.com/office/word/2012/wordml" xmlns:w16cei="http://schemas.microsoft.com/office/word/2026/wordml/cei" xmlns:w16cex="http://schemas.microsoft.com/office/word/2018/wordml/cex" xmlns:w16cid="http://schemas.microsoft.com/office/word/2016/wordml/cid" xmlns:w16="http://schemas.microsoft.com/office/word/2018/wordml" xmlns:w16du="http://schemas.microsoft.com/office/word/2023/wordml/word16du" xmlns:w16sdtdh="http://schemas.microsoft.com/office/word/2020/wordml/sdtdatahash" xmlns:w16sdtfl="http://schemas.microsoft.com/office/word/2024/wordml/sdtformatlock" xmlns:w16se="http://schemas.microsoft.com/office/word/2015/wordml/symex" xmlns:wpg="http://schemas.microsoft.com/office/word/2010/wordprocessingGroup" xmlns:wpi="http://schemas.microsoft.com/office/word/2010/wordprocessingInk" xmlns:wne="http://schemas.microsoft.com/office/word/2006/wordml" xmlns:wps="http://schemas.microsoft.com/office/word/2010/wordprocessingShape" mc:Ignorable="w14 w15 w16se w16cid w16 w16cex w16sdtdh w16sdtfl w16du wp14">
   <w:abstractNum w:abstractNumId="0" w15:restartNumberingAfterBreak="0">
-    <w:nsid w:val="1DB14427"/>
+    <w:nsid w:val="03F74DB1"/>
     <w:multiLevelType w:val="singleLevel"/>
     <w:tmpl w:val="04160001"/>
     <w:lvl w:ilvl="0">
@@ -15185,7 +15325,7 @@
     </w:lvl>
   </w:abstractNum>
   <w:abstractNum w:abstractNumId="1" w15:restartNumberingAfterBreak="0">
-    <w:nsid w:val="1FD3230D"/>
+    <w:nsid w:val="0E2272AD"/>
     <w:multiLevelType w:val="singleLevel"/>
     <w:tmpl w:val="04160001"/>
     <w:lvl w:ilvl="0">
@@ -15202,7 +15342,7 @@
     </w:lvl>
   </w:abstractNum>
   <w:abstractNum w:abstractNumId="2" w15:restartNumberingAfterBreak="0">
-    <w:nsid w:val="2042398C"/>
+    <w:nsid w:val="0FA149BE"/>
     <w:multiLevelType w:val="singleLevel"/>
     <w:tmpl w:val="04160001"/>
     <w:lvl w:ilvl="0">
@@ -15219,7 +15359,7 @@
     </w:lvl>
   </w:abstractNum>
   <w:abstractNum w:abstractNumId="3" w15:restartNumberingAfterBreak="0">
-    <w:nsid w:val="2990269A"/>
+    <w:nsid w:val="147B6B56"/>
     <w:multiLevelType w:val="singleLevel"/>
     <w:tmpl w:val="04160001"/>
     <w:lvl w:ilvl="0">
@@ -15236,7 +15376,7 @@
     </w:lvl>
   </w:abstractNum>
   <w:abstractNum w:abstractNumId="4" w15:restartNumberingAfterBreak="0">
-    <w:nsid w:val="3AB86C1C"/>
+    <w:nsid w:val="1ED8780F"/>
     <w:multiLevelType w:val="singleLevel"/>
     <w:tmpl w:val="04160001"/>
     <w:lvl w:ilvl="0">
@@ -15253,7 +15393,7 @@
     </w:lvl>
   </w:abstractNum>
   <w:abstractNum w:abstractNumId="5" w15:restartNumberingAfterBreak="0">
-    <w:nsid w:val="3E306D53"/>
+    <w:nsid w:val="224B575B"/>
     <w:multiLevelType w:val="singleLevel"/>
     <w:tmpl w:val="04160001"/>
     <w:lvl w:ilvl="0">
@@ -15270,7 +15410,7 @@
     </w:lvl>
   </w:abstractNum>
   <w:abstractNum w:abstractNumId="6" w15:restartNumberingAfterBreak="0">
-    <w:nsid w:val="460977A9"/>
+    <w:nsid w:val="25862CC8"/>
     <w:multiLevelType w:val="singleLevel"/>
     <w:tmpl w:val="04160001"/>
     <w:lvl w:ilvl="0">
@@ -15287,7 +15427,7 @@
     </w:lvl>
   </w:abstractNum>
   <w:abstractNum w:abstractNumId="7" w15:restartNumberingAfterBreak="0">
-    <w:nsid w:val="53BD3CF4"/>
+    <w:nsid w:val="364B09E0"/>
     <w:multiLevelType w:val="singleLevel"/>
     <w:tmpl w:val="04160001"/>
     <w:lvl w:ilvl="0">
@@ -15304,7 +15444,7 @@
     </w:lvl>
   </w:abstractNum>
   <w:abstractNum w:abstractNumId="8" w15:restartNumberingAfterBreak="0">
-    <w:nsid w:val="570062E3"/>
+    <w:nsid w:val="3D52370F"/>
     <w:multiLevelType w:val="singleLevel"/>
     <w:tmpl w:val="04160001"/>
     <w:lvl w:ilvl="0">
@@ -15321,7 +15461,7 @@
     </w:lvl>
   </w:abstractNum>
   <w:abstractNum w:abstractNumId="9" w15:restartNumberingAfterBreak="0">
-    <w:nsid w:val="61AF51F1"/>
+    <w:nsid w:val="3D8021C9"/>
     <w:multiLevelType w:val="singleLevel"/>
     <w:tmpl w:val="04160001"/>
     <w:lvl w:ilvl="0">
@@ -15338,7 +15478,7 @@
     </w:lvl>
   </w:abstractNum>
   <w:abstractNum w:abstractNumId="10" w15:restartNumberingAfterBreak="0">
-    <w:nsid w:val="62C6186A"/>
+    <w:nsid w:val="631F6E12"/>
     <w:multiLevelType w:val="singleLevel"/>
     <w:tmpl w:val="04160001"/>
     <w:lvl w:ilvl="0">
@@ -15355,7 +15495,7 @@
     </w:lvl>
   </w:abstractNum>
   <w:abstractNum w:abstractNumId="11" w15:restartNumberingAfterBreak="0">
-    <w:nsid w:val="669947E8"/>
+    <w:nsid w:val="7A6246DB"/>
     <w:multiLevelType w:val="singleLevel"/>
     <w:tmpl w:val="04160001"/>
     <w:lvl w:ilvl="0">
@@ -15372,7 +15512,7 @@
     </w:lvl>
   </w:abstractNum>
   <w:abstractNum w:abstractNumId="12" w15:restartNumberingAfterBreak="0">
-    <w:nsid w:val="6D0D57F7"/>
+    <w:nsid w:val="7AC353B8"/>
     <w:multiLevelType w:val="singleLevel"/>
     <w:tmpl w:val="04160001"/>
     <w:lvl w:ilvl="0">
@@ -15389,7 +15529,7 @@
     </w:lvl>
   </w:abstractNum>
   <w:abstractNum w:abstractNumId="13" w15:restartNumberingAfterBreak="0">
-    <w:nsid w:val="7F250BCF"/>
+    <w:nsid w:val="7D737B80"/>
     <w:multiLevelType w:val="singleLevel"/>
     <w:tmpl w:val="04160001"/>
     <w:lvl w:ilvl="0">
@@ -15405,47 +15545,47 @@
       </w:rPr>
     </w:lvl>
   </w:abstractNum>
-  <w:num w:numId="1" w16cid:durableId="1879200256">
+  <w:num w:numId="1" w16cid:durableId="1384602901">
+    <w:abstractNumId w:val="8"/>
+  </w:num>
+  <w:num w:numId="2" w16cid:durableId="1379083232">
+    <w:abstractNumId w:val="0"/>
+  </w:num>
+  <w:num w:numId="3" w16cid:durableId="19363555">
+    <w:abstractNumId w:val="9"/>
+  </w:num>
+  <w:num w:numId="4" w16cid:durableId="1829318755">
+    <w:abstractNumId w:val="12"/>
+  </w:num>
+  <w:num w:numId="5" w16cid:durableId="1020205458">
+    <w:abstractNumId w:val="5"/>
+  </w:num>
+  <w:num w:numId="6" w16cid:durableId="333458275">
+    <w:abstractNumId w:val="7"/>
+  </w:num>
+  <w:num w:numId="7" w16cid:durableId="2008559852">
     <w:abstractNumId w:val="13"/>
   </w:num>
-  <w:num w:numId="2" w16cid:durableId="1854760785">
-    <w:abstractNumId w:val="12"/>
+  <w:num w:numId="8" w16cid:durableId="1265648631">
+    <w:abstractNumId w:val="1"/>
   </w:num>
-  <w:num w:numId="3" w16cid:durableId="713964513">
-    <w:abstractNumId w:val="11"/>
+  <w:num w:numId="9" w16cid:durableId="1888951698">
+    <w:abstractNumId w:val="2"/>
   </w:num>
-  <w:num w:numId="4" w16cid:durableId="1478379406">
+  <w:num w:numId="10" w16cid:durableId="1837572872">
     <w:abstractNumId w:val="6"/>
   </w:num>
-  <w:num w:numId="5" w16cid:durableId="1257059505">
+  <w:num w:numId="11" w16cid:durableId="1983265886">
+    <w:abstractNumId w:val="4"/>
+  </w:num>
+  <w:num w:numId="12" w16cid:durableId="1423338890">
     <w:abstractNumId w:val="3"/>
   </w:num>
-  <w:num w:numId="6" w16cid:durableId="1009792237">
-    <w:abstractNumId w:val="0"/>
-  </w:num>
-  <w:num w:numId="7" w16cid:durableId="1603957749">
-    <w:abstractNumId w:val="8"/>
-  </w:num>
-  <w:num w:numId="8" w16cid:durableId="2139105471">
+  <w:num w:numId="13" w16cid:durableId="277487246">
     <w:abstractNumId w:val="10"/>
   </w:num>
-  <w:num w:numId="9" w16cid:durableId="11225404">
-    <w:abstractNumId w:val="5"/>
-  </w:num>
-  <w:num w:numId="10" w16cid:durableId="1614439679">
-    <w:abstractNumId w:val="7"/>
-  </w:num>
-  <w:num w:numId="11" w16cid:durableId="470710832">
-    <w:abstractNumId w:val="9"/>
-  </w:num>
-  <w:num w:numId="12" w16cid:durableId="662125378">
-    <w:abstractNumId w:val="1"/>
-  </w:num>
-  <w:num w:numId="13" w16cid:durableId="1921979877">
-    <w:abstractNumId w:val="2"/>
-  </w:num>
-  <w:num w:numId="14" w16cid:durableId="1635017011">
-    <w:abstractNumId w:val="4"/>
+  <w:num w:numId="14" w16cid:durableId="896890757">
+    <w:abstractNumId w:val="11"/>
   </w:num>
 </w:numbering>
 </file>
@@ -15858,7 +15998,7 @@
     <w:link w:val="Ttulo1Char"/>
     <w:uiPriority w:val="9"/>
     <w:qFormat/>
-    <w:rsid w:val="00EB1602"/>
+    <w:rsid w:val="0012142D"/>
     <w:pPr>
       <w:keepNext/>
       <w:keepLines/>
@@ -15880,7 +16020,7 @@
     <w:uiPriority w:val="9"/>
     <w:unhideWhenUsed/>
     <w:qFormat/>
-    <w:rsid w:val="00EB1602"/>
+    <w:rsid w:val="0012142D"/>
     <w:pPr>
       <w:keepNext/>
       <w:keepLines/>
@@ -15903,7 +16043,7 @@
     <w:semiHidden/>
     <w:unhideWhenUsed/>
     <w:qFormat/>
-    <w:rsid w:val="00EB1602"/>
+    <w:rsid w:val="0012142D"/>
     <w:pPr>
       <w:keepNext/>
       <w:keepLines/>
@@ -15926,7 +16066,7 @@
     <w:semiHidden/>
     <w:unhideWhenUsed/>
     <w:qFormat/>
-    <w:rsid w:val="00EB1602"/>
+    <w:rsid w:val="0012142D"/>
     <w:pPr>
       <w:keepNext/>
       <w:keepLines/>
@@ -15949,7 +16089,7 @@
     <w:semiHidden/>
     <w:unhideWhenUsed/>
     <w:qFormat/>
-    <w:rsid w:val="00EB1602"/>
+    <w:rsid w:val="0012142D"/>
     <w:pPr>
       <w:keepNext/>
       <w:keepLines/>
@@ -15970,7 +16110,7 @@
     <w:semiHidden/>
     <w:unhideWhenUsed/>
     <w:qFormat/>
-    <w:rsid w:val="00EB1602"/>
+    <w:rsid w:val="0012142D"/>
     <w:pPr>
       <w:keepNext/>
       <w:keepLines/>
@@ -15993,7 +16133,7 @@
     <w:semiHidden/>
     <w:unhideWhenUsed/>
     <w:qFormat/>
-    <w:rsid w:val="00EB1602"/>
+    <w:rsid w:val="0012142D"/>
     <w:pPr>
       <w:keepNext/>
       <w:keepLines/>
@@ -16014,7 +16154,7 @@
     <w:semiHidden/>
     <w:unhideWhenUsed/>
     <w:qFormat/>
-    <w:rsid w:val="00EB1602"/>
+    <w:rsid w:val="0012142D"/>
     <w:pPr>
       <w:keepNext/>
       <w:keepLines/>
@@ -16037,7 +16177,7 @@
     <w:semiHidden/>
     <w:unhideWhenUsed/>
     <w:qFormat/>
-    <w:rsid w:val="00EB1602"/>
+    <w:rsid w:val="0012142D"/>
     <w:pPr>
       <w:keepNext/>
       <w:keepLines/>
@@ -16081,7 +16221,7 @@
     <w:basedOn w:val="Fontepargpadro"/>
     <w:link w:val="Ttulo1"/>
     <w:uiPriority w:val="9"/>
-    <w:rsid w:val="00EB1602"/>
+    <w:rsid w:val="0012142D"/>
     <w:rPr>
       <w:rFonts w:asciiTheme="majorHAnsi" w:eastAsiaTheme="majorEastAsia" w:hAnsiTheme="majorHAnsi" w:cstheme="majorBidi"/>
       <w:color w:val="0F4761" w:themeColor="accent1" w:themeShade="BF"/>
@@ -16094,7 +16234,7 @@
     <w:basedOn w:val="Fontepargpadro"/>
     <w:link w:val="Ttulo2"/>
     <w:uiPriority w:val="9"/>
-    <w:rsid w:val="00EB1602"/>
+    <w:rsid w:val="0012142D"/>
     <w:rPr>
       <w:rFonts w:asciiTheme="majorHAnsi" w:eastAsiaTheme="majorEastAsia" w:hAnsiTheme="majorHAnsi" w:cstheme="majorBidi"/>
       <w:color w:val="0F4761" w:themeColor="accent1" w:themeShade="BF"/>
@@ -16108,7 +16248,7 @@
     <w:link w:val="Ttulo3"/>
     <w:uiPriority w:val="9"/>
     <w:semiHidden/>
-    <w:rsid w:val="00EB1602"/>
+    <w:rsid w:val="0012142D"/>
     <w:rPr>
       <w:rFonts w:eastAsiaTheme="majorEastAsia" w:cstheme="majorBidi"/>
       <w:color w:val="0F4761" w:themeColor="accent1" w:themeShade="BF"/>
@@ -16122,7 +16262,7 @@
     <w:link w:val="Ttulo4"/>
     <w:uiPriority w:val="9"/>
     <w:semiHidden/>
-    <w:rsid w:val="00EB1602"/>
+    <w:rsid w:val="0012142D"/>
     <w:rPr>
       <w:rFonts w:eastAsiaTheme="majorEastAsia" w:cstheme="majorBidi"/>
       <w:i/>
@@ -16136,7 +16276,7 @@
     <w:link w:val="Ttulo5"/>
     <w:uiPriority w:val="9"/>
     <w:semiHidden/>
-    <w:rsid w:val="00EB1602"/>
+    <w:rsid w:val="0012142D"/>
     <w:rPr>
       <w:rFonts w:eastAsiaTheme="majorEastAsia" w:cstheme="majorBidi"/>
       <w:color w:val="0F4761" w:themeColor="accent1" w:themeShade="BF"/>
@@ -16148,7 +16288,7 @@
     <w:link w:val="Ttulo6"/>
     <w:uiPriority w:val="9"/>
     <w:semiHidden/>
-    <w:rsid w:val="00EB1602"/>
+    <w:rsid w:val="0012142D"/>
     <w:rPr>
       <w:rFonts w:eastAsiaTheme="majorEastAsia" w:cstheme="majorBidi"/>
       <w:i/>
@@ -16162,7 +16302,7 @@
     <w:link w:val="Ttulo7"/>
     <w:uiPriority w:val="9"/>
     <w:semiHidden/>
-    <w:rsid w:val="00EB1602"/>
+    <w:rsid w:val="0012142D"/>
     <w:rPr>
       <w:rFonts w:eastAsiaTheme="majorEastAsia" w:cstheme="majorBidi"/>
       <w:color w:val="595959" w:themeColor="text1" w:themeTint="A6"/>
@@ -16174,7 +16314,7 @@
     <w:link w:val="Ttulo8"/>
     <w:uiPriority w:val="9"/>
     <w:semiHidden/>
-    <w:rsid w:val="00EB1602"/>
+    <w:rsid w:val="0012142D"/>
     <w:rPr>
       <w:rFonts w:eastAsiaTheme="majorEastAsia" w:cstheme="majorBidi"/>
       <w:i/>
@@ -16188,7 +16328,7 @@
     <w:link w:val="Ttulo9"/>
     <w:uiPriority w:val="9"/>
     <w:semiHidden/>
-    <w:rsid w:val="00EB1602"/>
+    <w:rsid w:val="0012142D"/>
     <w:rPr>
       <w:rFonts w:eastAsiaTheme="majorEastAsia" w:cstheme="majorBidi"/>
       <w:color w:val="272727" w:themeColor="text1" w:themeTint="D8"/>
@@ -16201,7 +16341,7 @@
     <w:link w:val="TtuloChar"/>
     <w:uiPriority w:val="10"/>
     <w:qFormat/>
-    <w:rsid w:val="00EB1602"/>
+    <w:rsid w:val="0012142D"/>
     <w:pPr>
       <w:spacing w:after="80" w:line="240" w:lineRule="auto"/>
       <w:contextualSpacing/>
@@ -16219,7 +16359,7 @@
     <w:basedOn w:val="Fontepargpadro"/>
     <w:link w:val="Ttulo"/>
     <w:uiPriority w:val="10"/>
-    <w:rsid w:val="00EB1602"/>
+    <w:rsid w:val="0012142D"/>
     <w:rPr>
       <w:rFonts w:asciiTheme="majorHAnsi" w:eastAsiaTheme="majorEastAsia" w:hAnsiTheme="majorHAnsi" w:cstheme="majorBidi"/>
       <w:spacing w:val="-10"/>
@@ -16235,7 +16375,7 @@
     <w:link w:val="SubttuloChar"/>
     <w:uiPriority w:val="11"/>
     <w:qFormat/>
-    <w:rsid w:val="00EB1602"/>
+    <w:rsid w:val="0012142D"/>
     <w:pPr>
       <w:numPr>
         <w:ilvl w:val="1"/>
@@ -16254,7 +16394,7 @@
     <w:basedOn w:val="Fontepargpadro"/>
     <w:link w:val="Subttulo"/>
     <w:uiPriority w:val="11"/>
-    <w:rsid w:val="00EB1602"/>
+    <w:rsid w:val="0012142D"/>
     <w:rPr>
       <w:rFonts w:eastAsiaTheme="majorEastAsia" w:cstheme="majorBidi"/>
       <w:color w:val="595959" w:themeColor="text1" w:themeTint="A6"/>
@@ -16270,7 +16410,7 @@
     <w:link w:val="CitaoChar"/>
     <w:uiPriority w:val="29"/>
     <w:qFormat/>
-    <w:rsid w:val="00EB1602"/>
+    <w:rsid w:val="0012142D"/>
     <w:pPr>
       <w:spacing w:before="160"/>
       <w:jc w:val="center"/>
@@ -16286,7 +16426,7 @@
     <w:basedOn w:val="Fontepargpadro"/>
     <w:link w:val="Citao"/>
     <w:uiPriority w:val="29"/>
-    <w:rsid w:val="00EB1602"/>
+    <w:rsid w:val="0012142D"/>
     <w:rPr>
       <w:i/>
       <w:iCs/>
@@ -16298,7 +16438,7 @@
     <w:basedOn w:val="Normal"/>
     <w:uiPriority w:val="34"/>
     <w:qFormat/>
-    <w:rsid w:val="00EB1602"/>
+    <w:rsid w:val="0012142D"/>
     <w:pPr>
       <w:ind w:left="720"/>
       <w:contextualSpacing/>
@@ -16309,7 +16449,7 @@
     <w:basedOn w:val="Fontepargpadro"/>
     <w:uiPriority w:val="21"/>
     <w:qFormat/>
-    <w:rsid w:val="00EB1602"/>
+    <w:rsid w:val="0012142D"/>
     <w:rPr>
       <w:i/>
       <w:iCs/>
@@ -16323,7 +16463,7 @@
     <w:link w:val="CitaoIntensaChar"/>
     <w:uiPriority w:val="30"/>
     <w:qFormat/>
-    <w:rsid w:val="00EB1602"/>
+    <w:rsid w:val="0012142D"/>
     <w:pPr>
       <w:pBdr>
         <w:top w:val="single" w:sz="4" w:space="10" w:color="0F4761" w:themeColor="accent1" w:themeShade="BF"/>
@@ -16344,7 +16484,7 @@
     <w:basedOn w:val="Fontepargpadro"/>
     <w:link w:val="CitaoIntensa"/>
     <w:uiPriority w:val="30"/>
-    <w:rsid w:val="00EB1602"/>
+    <w:rsid w:val="0012142D"/>
     <w:rPr>
       <w:i/>
       <w:iCs/>
@@ -16356,7 +16496,7 @@
     <w:basedOn w:val="Fontepargpadro"/>
     <w:uiPriority w:val="32"/>
     <w:qFormat/>
-    <w:rsid w:val="00EB1602"/>
+    <w:rsid w:val="0012142D"/>
     <w:rPr>
       <w:b/>
       <w:bCs/>
@@ -16371,7 +16511,7 @@
     <w:link w:val="CabealhoChar"/>
     <w:uiPriority w:val="99"/>
     <w:unhideWhenUsed/>
-    <w:rsid w:val="00EB1602"/>
+    <w:rsid w:val="0012142D"/>
     <w:pPr>
       <w:tabs>
         <w:tab w:val="center" w:pos="4252"/>
@@ -16385,7 +16525,7 @@
     <w:basedOn w:val="Fontepargpadro"/>
     <w:link w:val="Cabealho"/>
     <w:uiPriority w:val="99"/>
-    <w:rsid w:val="00EB1602"/>
+    <w:rsid w:val="0012142D"/>
   </w:style>
   <w:style w:type="paragraph" w:styleId="Rodap">
     <w:name w:val="footer"/>
@@ -16393,7 +16533,7 @@
     <w:link w:val="RodapChar"/>
     <w:uiPriority w:val="99"/>
     <w:unhideWhenUsed/>
-    <w:rsid w:val="00EB1602"/>
+    <w:rsid w:val="0012142D"/>
     <w:pPr>
       <w:tabs>
         <w:tab w:val="center" w:pos="4252"/>
@@ -16407,7 +16547,7 @@
     <w:basedOn w:val="Fontepargpadro"/>
     <w:link w:val="Rodap"/>
     <w:uiPriority w:val="99"/>
-    <w:rsid w:val="00EB1602"/>
+    <w:rsid w:val="0012142D"/>
   </w:style>
   <w:style w:type="paragraph" w:styleId="Sumrio1">
     <w:name w:val="toc 1"/>
@@ -16416,7 +16556,7 @@
     <w:autoRedefine/>
     <w:uiPriority w:val="39"/>
     <w:unhideWhenUsed/>
-    <w:rsid w:val="00EB1602"/>
+    <w:rsid w:val="0012142D"/>
     <w:pPr>
       <w:spacing w:after="100"/>
     </w:pPr>
@@ -16428,7 +16568,7 @@
     <w:autoRedefine/>
     <w:uiPriority w:val="39"/>
     <w:unhideWhenUsed/>
-    <w:rsid w:val="00EB1602"/>
+    <w:rsid w:val="0012142D"/>
     <w:pPr>
       <w:spacing w:after="100"/>
       <w:ind w:left="240"/>

</xml_diff>

<commit_message>
Propaga decisao da SMP para o historico do projeto vinculado
Sempre que a SMP e finalizada como Aprovada ou Nao aprovada (no
envio/edicao do formulario ou ao trocar o Status no drawer), o
evento passa a ser gravado automaticamente no historico
compartilhado do projeto (projeto_historico), visivel via "Ver
historico" em qualquer formulario com Projeto vinculado. Nao
altera o Status de Gate 1 (Aprovado/Reprovado). Atualiza o Manual
de Uso (v2.4, Passo 7) com a nova regra.

Co-Authored-By: Claude Sonnet 5 <noreply@anthropic.com>
</commit_message>
<xml_diff>
--- a/Manual de Uso - Ferramenta de Gestao de Projetos.docx
+++ b/Manual de Uso - Ferramenta de Gestao de Projetos.docx
@@ -129,7 +129,7 @@
           <w:color w:val="6A6A70"/>
           <w:sz w:val="22"/>
         </w:rPr>
-        <w:t>Versao 2.3 - 29 de julho de 2026 (substitui a versao 2.2 de 29/07/2026)</w:t>
+        <w:t>Versao 2.4 - 29 de julho de 2026 (substitui a versao 2.3 de 29/07/2026)</w:t>
       </w:r>
     </w:p>
     <w:p>
@@ -229,7 +229,7 @@
         <w:rPr>
           <w:noProof/>
         </w:rPr>
-        <w:instrText xml:space="preserve"> PAGEREF _Toc236233239 \h </w:instrText>
+        <w:instrText xml:space="preserve"> PAGEREF _Toc236234342 \h </w:instrText>
       </w:r>
       <w:r>
         <w:rPr>
@@ -290,7 +290,7 @@
         <w:rPr>
           <w:noProof/>
         </w:rPr>
-        <w:instrText xml:space="preserve"> PAGEREF _Toc236233240 \h </w:instrText>
+        <w:instrText xml:space="preserve"> PAGEREF _Toc236234343 \h </w:instrText>
       </w:r>
       <w:r>
         <w:rPr>
@@ -351,7 +351,7 @@
         <w:rPr>
           <w:noProof/>
         </w:rPr>
-        <w:instrText xml:space="preserve"> PAGEREF _Toc236233241 \h </w:instrText>
+        <w:instrText xml:space="preserve"> PAGEREF _Toc236234344 \h </w:instrText>
       </w:r>
       <w:r>
         <w:rPr>
@@ -368,7 +368,7 @@
         <w:rPr>
           <w:noProof/>
         </w:rPr>
-        <w:t>4</w:t>
+        <w:t>5</w:t>
       </w:r>
       <w:r>
         <w:rPr>
@@ -412,7 +412,7 @@
         <w:rPr>
           <w:noProof/>
         </w:rPr>
-        <w:instrText xml:space="preserve"> PAGEREF _Toc236233242 \h </w:instrText>
+        <w:instrText xml:space="preserve"> PAGEREF _Toc236234345 \h </w:instrText>
       </w:r>
       <w:r>
         <w:rPr>
@@ -473,7 +473,7 @@
         <w:rPr>
           <w:noProof/>
         </w:rPr>
-        <w:instrText xml:space="preserve"> PAGEREF _Toc236233243 \h </w:instrText>
+        <w:instrText xml:space="preserve"> PAGEREF _Toc236234346 \h </w:instrText>
       </w:r>
       <w:r>
         <w:rPr>
@@ -534,7 +534,7 @@
         <w:rPr>
           <w:noProof/>
         </w:rPr>
-        <w:instrText xml:space="preserve"> PAGEREF _Toc236233244 \h </w:instrText>
+        <w:instrText xml:space="preserve"> PAGEREF _Toc236234347 \h </w:instrText>
       </w:r>
       <w:r>
         <w:rPr>
@@ -551,7 +551,7 @@
         <w:rPr>
           <w:noProof/>
         </w:rPr>
-        <w:t>8</w:t>
+        <w:t>9</w:t>
       </w:r>
       <w:r>
         <w:rPr>
@@ -595,7 +595,7 @@
         <w:rPr>
           <w:noProof/>
         </w:rPr>
-        <w:instrText xml:space="preserve"> PAGEREF _Toc236233245 \h </w:instrText>
+        <w:instrText xml:space="preserve"> PAGEREF _Toc236234348 \h </w:instrText>
       </w:r>
       <w:r>
         <w:rPr>
@@ -612,7 +612,7 @@
         <w:rPr>
           <w:noProof/>
         </w:rPr>
-        <w:t>8</w:t>
+        <w:t>9</w:t>
       </w:r>
       <w:r>
         <w:rPr>
@@ -656,7 +656,7 @@
         <w:rPr>
           <w:noProof/>
         </w:rPr>
-        <w:instrText xml:space="preserve"> PAGEREF _Toc236233246 \h </w:instrText>
+        <w:instrText xml:space="preserve"> PAGEREF _Toc236234349 \h </w:instrText>
       </w:r>
       <w:r>
         <w:rPr>
@@ -673,7 +673,7 @@
         <w:rPr>
           <w:noProof/>
         </w:rPr>
-        <w:t>8</w:t>
+        <w:t>9</w:t>
       </w:r>
       <w:r>
         <w:rPr>
@@ -717,7 +717,7 @@
         <w:rPr>
           <w:noProof/>
         </w:rPr>
-        <w:instrText xml:space="preserve"> PAGEREF _Toc236233247 \h </w:instrText>
+        <w:instrText xml:space="preserve"> PAGEREF _Toc236234350 \h </w:instrText>
       </w:r>
       <w:r>
         <w:rPr>
@@ -734,7 +734,7 @@
         <w:rPr>
           <w:noProof/>
         </w:rPr>
-        <w:t>8</w:t>
+        <w:t>9</w:t>
       </w:r>
       <w:r>
         <w:rPr>
@@ -778,7 +778,7 @@
         <w:rPr>
           <w:noProof/>
         </w:rPr>
-        <w:instrText xml:space="preserve"> PAGEREF _Toc236233248 \h </w:instrText>
+        <w:instrText xml:space="preserve"> PAGEREF _Toc236234351 \h </w:instrText>
       </w:r>
       <w:r>
         <w:rPr>
@@ -795,7 +795,7 @@
         <w:rPr>
           <w:noProof/>
         </w:rPr>
-        <w:t>9</w:t>
+        <w:t>10</w:t>
       </w:r>
       <w:r>
         <w:rPr>
@@ -839,7 +839,7 @@
         <w:rPr>
           <w:noProof/>
         </w:rPr>
-        <w:instrText xml:space="preserve"> PAGEREF _Toc236233249 \h </w:instrText>
+        <w:instrText xml:space="preserve"> PAGEREF _Toc236234352 \h </w:instrText>
       </w:r>
       <w:r>
         <w:rPr>
@@ -856,7 +856,7 @@
         <w:rPr>
           <w:noProof/>
         </w:rPr>
-        <w:t>10</w:t>
+        <w:t>11</w:t>
       </w:r>
       <w:r>
         <w:rPr>
@@ -900,7 +900,7 @@
         <w:rPr>
           <w:noProof/>
         </w:rPr>
-        <w:instrText xml:space="preserve"> PAGEREF _Toc236233250 \h </w:instrText>
+        <w:instrText xml:space="preserve"> PAGEREF _Toc236234353 \h </w:instrText>
       </w:r>
       <w:r>
         <w:rPr>
@@ -917,7 +917,7 @@
         <w:rPr>
           <w:noProof/>
         </w:rPr>
-        <w:t>11</w:t>
+        <w:t>12</w:t>
       </w:r>
       <w:r>
         <w:rPr>
@@ -961,7 +961,7 @@
         <w:rPr>
           <w:noProof/>
         </w:rPr>
-        <w:instrText xml:space="preserve"> PAGEREF _Toc236233251 \h </w:instrText>
+        <w:instrText xml:space="preserve"> PAGEREF _Toc236234354 \h </w:instrText>
       </w:r>
       <w:r>
         <w:rPr>
@@ -978,7 +978,7 @@
         <w:rPr>
           <w:noProof/>
         </w:rPr>
-        <w:t>13</w:t>
+        <w:t>14</w:t>
       </w:r>
       <w:r>
         <w:rPr>
@@ -1022,7 +1022,7 @@
         <w:rPr>
           <w:noProof/>
         </w:rPr>
-        <w:instrText xml:space="preserve"> PAGEREF _Toc236233252 \h </w:instrText>
+        <w:instrText xml:space="preserve"> PAGEREF _Toc236234355 \h </w:instrText>
       </w:r>
       <w:r>
         <w:rPr>
@@ -1039,7 +1039,7 @@
         <w:rPr>
           <w:noProof/>
         </w:rPr>
-        <w:t>15</w:t>
+        <w:t>16</w:t>
       </w:r>
       <w:r>
         <w:rPr>
@@ -1083,7 +1083,7 @@
         <w:rPr>
           <w:noProof/>
         </w:rPr>
-        <w:instrText xml:space="preserve"> PAGEREF _Toc236233253 \h </w:instrText>
+        <w:instrText xml:space="preserve"> PAGEREF _Toc236234356 \h </w:instrText>
       </w:r>
       <w:r>
         <w:rPr>
@@ -1100,7 +1100,7 @@
         <w:rPr>
           <w:noProof/>
         </w:rPr>
-        <w:t>15</w:t>
+        <w:t>16</w:t>
       </w:r>
       <w:r>
         <w:rPr>
@@ -1144,7 +1144,7 @@
         <w:rPr>
           <w:noProof/>
         </w:rPr>
-        <w:instrText xml:space="preserve"> PAGEREF _Toc236233254 \h </w:instrText>
+        <w:instrText xml:space="preserve"> PAGEREF _Toc236234357 \h </w:instrText>
       </w:r>
       <w:r>
         <w:rPr>
@@ -1161,7 +1161,7 @@
         <w:rPr>
           <w:noProof/>
         </w:rPr>
-        <w:t>17</w:t>
+        <w:t>18</w:t>
       </w:r>
       <w:r>
         <w:rPr>
@@ -1205,7 +1205,7 @@
         <w:rPr>
           <w:noProof/>
         </w:rPr>
-        <w:instrText xml:space="preserve"> PAGEREF _Toc236233255 \h </w:instrText>
+        <w:instrText xml:space="preserve"> PAGEREF _Toc236234358 \h </w:instrText>
       </w:r>
       <w:r>
         <w:rPr>
@@ -1222,7 +1222,7 @@
         <w:rPr>
           <w:noProof/>
         </w:rPr>
-        <w:t>20</w:t>
+        <w:t>21</w:t>
       </w:r>
       <w:r>
         <w:rPr>
@@ -1266,7 +1266,7 @@
         <w:rPr>
           <w:noProof/>
         </w:rPr>
-        <w:instrText xml:space="preserve"> PAGEREF _Toc236233256 \h </w:instrText>
+        <w:instrText xml:space="preserve"> PAGEREF _Toc236234359 \h </w:instrText>
       </w:r>
       <w:r>
         <w:rPr>
@@ -1283,7 +1283,7 @@
         <w:rPr>
           <w:noProof/>
         </w:rPr>
-        <w:t>23</w:t>
+        <w:t>24</w:t>
       </w:r>
       <w:r>
         <w:rPr>
@@ -1327,7 +1327,7 @@
         <w:rPr>
           <w:noProof/>
         </w:rPr>
-        <w:instrText xml:space="preserve"> PAGEREF _Toc236233257 \h </w:instrText>
+        <w:instrText xml:space="preserve"> PAGEREF _Toc236234360 \h </w:instrText>
       </w:r>
       <w:r>
         <w:rPr>
@@ -1344,7 +1344,7 @@
         <w:rPr>
           <w:noProof/>
         </w:rPr>
-        <w:t>25</w:t>
+        <w:t>26</w:t>
       </w:r>
       <w:r>
         <w:rPr>
@@ -1388,7 +1388,7 @@
         <w:rPr>
           <w:noProof/>
         </w:rPr>
-        <w:instrText xml:space="preserve"> PAGEREF _Toc236233258 \h </w:instrText>
+        <w:instrText xml:space="preserve"> PAGEREF _Toc236234361 \h </w:instrText>
       </w:r>
       <w:r>
         <w:rPr>
@@ -1405,7 +1405,7 @@
         <w:rPr>
           <w:noProof/>
         </w:rPr>
-        <w:t>28</w:t>
+        <w:t>29</w:t>
       </w:r>
       <w:r>
         <w:rPr>
@@ -1449,7 +1449,7 @@
         <w:rPr>
           <w:noProof/>
         </w:rPr>
-        <w:instrText xml:space="preserve"> PAGEREF _Toc236233259 \h </w:instrText>
+        <w:instrText xml:space="preserve"> PAGEREF _Toc236234362 \h </w:instrText>
       </w:r>
       <w:r>
         <w:rPr>
@@ -1466,7 +1466,7 @@
         <w:rPr>
           <w:noProof/>
         </w:rPr>
-        <w:t>30</w:t>
+        <w:t>31</w:t>
       </w:r>
       <w:r>
         <w:rPr>
@@ -1510,7 +1510,7 @@
         <w:rPr>
           <w:noProof/>
         </w:rPr>
-        <w:instrText xml:space="preserve"> PAGEREF _Toc236233260 \h </w:instrText>
+        <w:instrText xml:space="preserve"> PAGEREF _Toc236234363 \h </w:instrText>
       </w:r>
       <w:r>
         <w:rPr>
@@ -1527,7 +1527,7 @@
         <w:rPr>
           <w:noProof/>
         </w:rPr>
-        <w:t>32</w:t>
+        <w:t>34</w:t>
       </w:r>
       <w:r>
         <w:rPr>
@@ -1571,7 +1571,7 @@
         <w:rPr>
           <w:noProof/>
         </w:rPr>
-        <w:instrText xml:space="preserve"> PAGEREF _Toc236233261 \h </w:instrText>
+        <w:instrText xml:space="preserve"> PAGEREF _Toc236234364 \h </w:instrText>
       </w:r>
       <w:r>
         <w:rPr>
@@ -1588,7 +1588,7 @@
         <w:rPr>
           <w:noProof/>
         </w:rPr>
-        <w:t>34</w:t>
+        <w:t>35</w:t>
       </w:r>
       <w:r>
         <w:rPr>
@@ -1632,7 +1632,7 @@
         <w:rPr>
           <w:noProof/>
         </w:rPr>
-        <w:instrText xml:space="preserve"> PAGEREF _Toc236233262 \h </w:instrText>
+        <w:instrText xml:space="preserve"> PAGEREF _Toc236234365 \h </w:instrText>
       </w:r>
       <w:r>
         <w:rPr>
@@ -1649,7 +1649,7 @@
         <w:rPr>
           <w:noProof/>
         </w:rPr>
-        <w:t>36</w:t>
+        <w:t>37</w:t>
       </w:r>
       <w:r>
         <w:rPr>
@@ -1693,7 +1693,7 @@
         <w:rPr>
           <w:noProof/>
         </w:rPr>
-        <w:instrText xml:space="preserve"> PAGEREF _Toc236233263 \h </w:instrText>
+        <w:instrText xml:space="preserve"> PAGEREF _Toc236234366 \h </w:instrText>
       </w:r>
       <w:r>
         <w:rPr>
@@ -1710,7 +1710,7 @@
         <w:rPr>
           <w:noProof/>
         </w:rPr>
-        <w:t>38</w:t>
+        <w:t>39</w:t>
       </w:r>
       <w:r>
         <w:rPr>
@@ -1754,7 +1754,7 @@
         <w:rPr>
           <w:noProof/>
         </w:rPr>
-        <w:instrText xml:space="preserve"> PAGEREF _Toc236233264 \h </w:instrText>
+        <w:instrText xml:space="preserve"> PAGEREF _Toc236234367 \h </w:instrText>
       </w:r>
       <w:r>
         <w:rPr>
@@ -1771,7 +1771,7 @@
         <w:rPr>
           <w:noProof/>
         </w:rPr>
-        <w:t>38</w:t>
+        <w:t>39</w:t>
       </w:r>
       <w:r>
         <w:rPr>
@@ -1816,7 +1816,7 @@
         <w:rPr>
           <w:noProof/>
         </w:rPr>
-        <w:instrText xml:space="preserve"> PAGEREF _Toc236233265 \h </w:instrText>
+        <w:instrText xml:space="preserve"> PAGEREF _Toc236234368 \h </w:instrText>
       </w:r>
       <w:r>
         <w:rPr>
@@ -1833,7 +1833,7 @@
         <w:rPr>
           <w:noProof/>
         </w:rPr>
-        <w:t>42</w:t>
+        <w:t>43</w:t>
       </w:r>
       <w:r>
         <w:rPr>
@@ -1877,7 +1877,7 @@
         <w:rPr>
           <w:noProof/>
         </w:rPr>
-        <w:instrText xml:space="preserve"> PAGEREF _Toc236233266 \h </w:instrText>
+        <w:instrText xml:space="preserve"> PAGEREF _Toc236234369 \h </w:instrText>
       </w:r>
       <w:r>
         <w:rPr>
@@ -1894,7 +1894,7 @@
         <w:rPr>
           <w:noProof/>
         </w:rPr>
-        <w:t>46</w:t>
+        <w:t>47</w:t>
       </w:r>
       <w:r>
         <w:rPr>
@@ -1938,7 +1938,7 @@
         <w:rPr>
           <w:noProof/>
         </w:rPr>
-        <w:instrText xml:space="preserve"> PAGEREF _Toc236233267 \h </w:instrText>
+        <w:instrText xml:space="preserve"> PAGEREF _Toc236234370 \h </w:instrText>
       </w:r>
       <w:r>
         <w:rPr>
@@ -1955,7 +1955,7 @@
         <w:rPr>
           <w:noProof/>
         </w:rPr>
-        <w:t>46</w:t>
+        <w:t>47</w:t>
       </w:r>
       <w:r>
         <w:rPr>
@@ -1999,7 +1999,7 @@
         <w:rPr>
           <w:noProof/>
         </w:rPr>
-        <w:instrText xml:space="preserve"> PAGEREF _Toc236233268 \h </w:instrText>
+        <w:instrText xml:space="preserve"> PAGEREF _Toc236234371 \h </w:instrText>
       </w:r>
       <w:r>
         <w:rPr>
@@ -2016,7 +2016,7 @@
         <w:rPr>
           <w:noProof/>
         </w:rPr>
-        <w:t>47</w:t>
+        <w:t>48</w:t>
       </w:r>
       <w:r>
         <w:rPr>
@@ -2060,7 +2060,7 @@
         <w:rPr>
           <w:noProof/>
         </w:rPr>
-        <w:instrText xml:space="preserve"> PAGEREF _Toc236233269 \h </w:instrText>
+        <w:instrText xml:space="preserve"> PAGEREF _Toc236234372 \h </w:instrText>
       </w:r>
       <w:r>
         <w:rPr>
@@ -2077,7 +2077,7 @@
         <w:rPr>
           <w:noProof/>
         </w:rPr>
-        <w:t>47</w:t>
+        <w:t>48</w:t>
       </w:r>
       <w:r>
         <w:rPr>
@@ -2121,7 +2121,7 @@
         <w:rPr>
           <w:noProof/>
         </w:rPr>
-        <w:instrText xml:space="preserve"> PAGEREF _Toc236233270 \h </w:instrText>
+        <w:instrText xml:space="preserve"> PAGEREF _Toc236234373 \h </w:instrText>
       </w:r>
       <w:r>
         <w:rPr>
@@ -2138,7 +2138,7 @@
         <w:rPr>
           <w:noProof/>
         </w:rPr>
-        <w:t>50</w:t>
+        <w:t>51</w:t>
       </w:r>
       <w:r>
         <w:rPr>
@@ -2182,7 +2182,7 @@
         <w:rPr>
           <w:noProof/>
         </w:rPr>
-        <w:instrText xml:space="preserve"> PAGEREF _Toc236233271 \h </w:instrText>
+        <w:instrText xml:space="preserve"> PAGEREF _Toc236234374 \h </w:instrText>
       </w:r>
       <w:r>
         <w:rPr>
@@ -2199,7 +2199,7 @@
         <w:rPr>
           <w:noProof/>
         </w:rPr>
-        <w:t>50</w:t>
+        <w:t>51</w:t>
       </w:r>
       <w:r>
         <w:rPr>
@@ -2243,7 +2243,7 @@
         <w:rPr>
           <w:noProof/>
         </w:rPr>
-        <w:instrText xml:space="preserve"> PAGEREF _Toc236233272 \h </w:instrText>
+        <w:instrText xml:space="preserve"> PAGEREF _Toc236234375 \h </w:instrText>
       </w:r>
       <w:r>
         <w:rPr>
@@ -2260,7 +2260,7 @@
         <w:rPr>
           <w:noProof/>
         </w:rPr>
-        <w:t>50</w:t>
+        <w:t>51</w:t>
       </w:r>
       <w:r>
         <w:rPr>
@@ -2304,7 +2304,7 @@
         <w:rPr>
           <w:noProof/>
         </w:rPr>
-        <w:instrText xml:space="preserve"> PAGEREF _Toc236233273 \h </w:instrText>
+        <w:instrText xml:space="preserve"> PAGEREF _Toc236234376 \h </w:instrText>
       </w:r>
       <w:r>
         <w:rPr>
@@ -2321,7 +2321,7 @@
         <w:rPr>
           <w:noProof/>
         </w:rPr>
-        <w:t>51</w:t>
+        <w:t>52</w:t>
       </w:r>
       <w:r>
         <w:rPr>
@@ -2365,7 +2365,7 @@
         <w:rPr>
           <w:noProof/>
         </w:rPr>
-        <w:instrText xml:space="preserve"> PAGEREF _Toc236233274 \h </w:instrText>
+        <w:instrText xml:space="preserve"> PAGEREF _Toc236234377 \h </w:instrText>
       </w:r>
       <w:r>
         <w:rPr>
@@ -2382,7 +2382,7 @@
         <w:rPr>
           <w:noProof/>
         </w:rPr>
-        <w:t>53</w:t>
+        <w:t>54</w:t>
       </w:r>
       <w:r>
         <w:rPr>
@@ -2426,7 +2426,7 @@
         <w:rPr>
           <w:noProof/>
         </w:rPr>
-        <w:instrText xml:space="preserve"> PAGEREF _Toc236233275 \h </w:instrText>
+        <w:instrText xml:space="preserve"> PAGEREF _Toc236234378 \h </w:instrText>
       </w:r>
       <w:r>
         <w:rPr>
@@ -2443,7 +2443,7 @@
         <w:rPr>
           <w:noProof/>
         </w:rPr>
-        <w:t>54</w:t>
+        <w:t>55</w:t>
       </w:r>
       <w:r>
         <w:rPr>
@@ -2502,7 +2502,7 @@
           <w:sz w:val="34"/>
         </w:rPr>
       </w:pPr>
-      <w:bookmarkStart w:id="0" w:name="_Toc236233239"/>
+      <w:bookmarkStart w:id="0" w:name="_Toc236234342"/>
       <w:r>
         <w:rPr>
           <w:rFonts w:ascii="Montserrat" w:hAnsi="Montserrat"/>
@@ -2526,7 +2526,7 @@
           <w:sz w:val="27"/>
         </w:rPr>
       </w:pPr>
-      <w:bookmarkStart w:id="1" w:name="_Toc236233240"/>
+      <w:bookmarkStart w:id="1" w:name="_Toc236234343"/>
       <w:r>
         <w:rPr>
           <w:rFonts w:ascii="Montserrat" w:hAnsi="Montserrat"/>
@@ -2643,7 +2643,34 @@
           <w:color w:val="1A1A1A"/>
           <w:sz w:val="22"/>
         </w:rPr>
-        <w:t>O manual nao substitui as Diretrizes para a Gestao de Projetos da UNIALFA (documento institucional que define o framework D01 a D07) nem o documento Regras de Acesso e Permissoes (que detalha cada regra de controle de acesso); ele e o guia operacional de como usar cada ferramenta na pratica.</w:t>
+        <w:t>Esta e a versao 2.4 do manual. Em relacao a versao 2.3 (29/07/2026), foi adicionada a propagacao automatica da decisao da SMP (Passo 7) para o historico compartilhado do projeto vinculado: toda vez que uma SMP e aprovada ou nao aprovada, o evento fica visivel em Ver historico em qualquer formulario ligado aquele projeto, sem alterar o Status de Gate 1.</w:t>
+      </w:r>
+    </w:p>
+    <w:p>
+      <w:pPr>
+        <w:spacing w:line="280" w:lineRule="auto"/>
+        <w:rPr>
+          <w:rFonts w:ascii="Montserrat" w:hAnsi="Montserrat"/>
+          <w:color w:val="1A1A1A"/>
+          <w:sz w:val="22"/>
+        </w:rPr>
+      </w:pPr>
+      <w:r>
+        <w:rPr>
+          <w:rFonts w:ascii="Montserrat" w:hAnsi="Montserrat"/>
+          <w:color w:val="1A1A1A"/>
+          <w:sz w:val="22"/>
+        </w:rPr>
+        <w:t xml:space="preserve">O manual nao substitui as Diretrizes para a Gestao de Projetos da UNIALFA (documento institucional que define o framework D01 a D07) nem o </w:t>
+      </w:r>
+      <w:r>
+        <w:rPr>
+          <w:rFonts w:ascii="Montserrat" w:hAnsi="Montserrat"/>
+          <w:color w:val="1A1A1A"/>
+          <w:sz w:val="22"/>
+        </w:rPr>
+        <w:lastRenderedPageBreak/>
+        <w:t>documento Regras de Acesso e Permissoes (que detalha cada regra de controle de acesso); ele e o guia operacional de como usar cada ferramenta na pratica.</w:t>
       </w:r>
     </w:p>
     <w:p>
@@ -2657,7 +2684,7 @@
           <w:sz w:val="27"/>
         </w:rPr>
       </w:pPr>
-      <w:bookmarkStart w:id="2" w:name="_Toc236233241"/>
+      <w:bookmarkStart w:id="2" w:name="_Toc236234344"/>
       <w:r>
         <w:rPr>
           <w:rFonts w:ascii="Montserrat" w:hAnsi="Montserrat"/>
@@ -2708,7 +2735,6 @@
           <w:color w:val="1A1A1A"/>
           <w:sz w:val="22"/>
         </w:rPr>
-        <w:lastRenderedPageBreak/>
         <w:t>12 formularios de registro (codigo FORALF), cada um correspondendo a um artefato institucional - da Solicitacao de Demanda ao Relatorio de Entregas e Beneficios.</w:t>
       </w:r>
     </w:p>
@@ -2805,17 +2831,18 @@
         <w:rPr>
           <w:noProof/>
         </w:rPr>
+        <w:lastRenderedPageBreak/>
         <w:drawing>
-          <wp:inline distT="0" distB="0" distL="0" distR="0" wp14:anchorId="2C8C49E1" wp14:editId="60B49E38">
+          <wp:inline distT="0" distB="0" distL="0" distR="0" wp14:anchorId="20A705BF" wp14:editId="5CC73A43">
             <wp:extent cx="5303520" cy="4792851"/>
             <wp:effectExtent l="19050" t="19050" r="11430" b="27305"/>
-            <wp:docPr id="834732800" name="Imagem 1"/>
+            <wp:docPr id="196699862" name="Imagem 1"/>
             <wp:cNvGraphicFramePr/>
             <a:graphic xmlns:a="http://schemas.openxmlformats.org/drawingml/2006/main">
               <a:graphicData uri="http://schemas.openxmlformats.org/drawingml/2006/picture">
                 <pic:pic xmlns:pic="http://schemas.openxmlformats.org/drawingml/2006/picture">
                   <pic:nvPicPr>
-                    <pic:cNvPr id="834732800" name=""/>
+                    <pic:cNvPr id="196699862" name=""/>
                     <pic:cNvPicPr/>
                   </pic:nvPicPr>
                   <pic:blipFill>
@@ -2883,7 +2910,7 @@
           <w:sz w:val="27"/>
         </w:rPr>
       </w:pPr>
-      <w:bookmarkStart w:id="3" w:name="_Toc236233242"/>
+      <w:bookmarkStart w:id="3" w:name="_Toc236234345"/>
       <w:r>
         <w:rPr>
           <w:rFonts w:ascii="Montserrat" w:hAnsi="Montserrat"/>
@@ -2891,7 +2918,6 @@
           <w:color w:val="B91D2E"/>
           <w:sz w:val="27"/>
         </w:rPr>
-        <w:lastRenderedPageBreak/>
         <w:t>1.3 Como acessar e fazer login</w:t>
       </w:r>
       <w:bookmarkEnd w:id="3"/>
@@ -2923,17 +2949,18 @@
         <w:rPr>
           <w:noProof/>
         </w:rPr>
+        <w:lastRenderedPageBreak/>
         <w:drawing>
-          <wp:inline distT="0" distB="0" distL="0" distR="0" wp14:anchorId="088D9328" wp14:editId="3729A69B">
+          <wp:inline distT="0" distB="0" distL="0" distR="0" wp14:anchorId="23112D45" wp14:editId="7CBA7D7A">
             <wp:extent cx="4206240" cy="3801227"/>
             <wp:effectExtent l="19050" t="19050" r="22860" b="27940"/>
-            <wp:docPr id="1325011674" name="Imagem 2"/>
+            <wp:docPr id="974828083" name="Imagem 2"/>
             <wp:cNvGraphicFramePr/>
             <a:graphic xmlns:a="http://schemas.openxmlformats.org/drawingml/2006/main">
               <a:graphicData uri="http://schemas.openxmlformats.org/drawingml/2006/picture">
                 <pic:pic xmlns:pic="http://schemas.openxmlformats.org/drawingml/2006/picture">
                   <pic:nvPicPr>
-                    <pic:cNvPr id="1325011674" name=""/>
+                    <pic:cNvPr id="974828083" name=""/>
                     <pic:cNvPicPr/>
                   </pic:nvPicPr>
                   <pic:blipFill>
@@ -3106,7 +3133,7 @@
           <w:sz w:val="27"/>
         </w:rPr>
       </w:pPr>
-      <w:bookmarkStart w:id="4" w:name="_Toc236233243"/>
+      <w:bookmarkStart w:id="4" w:name="_Toc236234346"/>
       <w:r>
         <w:rPr>
           <w:rFonts w:ascii="Montserrat" w:hAnsi="Montserrat"/>
@@ -3114,7 +3141,6 @@
           <w:color w:val="B91D2E"/>
           <w:sz w:val="27"/>
         </w:rPr>
-        <w:lastRenderedPageBreak/>
         <w:t>1.4 Como a ferramenta se relaciona com as Diretrizes (D01-D07)</w:t>
       </w:r>
       <w:bookmarkEnd w:id="4"/>
@@ -3183,6 +3209,7 @@
                 <w:color w:val="FFFFFF"/>
                 <w:sz w:val="19"/>
               </w:rPr>
+              <w:lastRenderedPageBreak/>
               <w:t>Passo</w:t>
             </w:r>
           </w:p>
@@ -4255,7 +4282,7 @@
           <w:sz w:val="34"/>
         </w:rPr>
       </w:pPr>
-      <w:bookmarkStart w:id="5" w:name="_Toc236233244"/>
+      <w:bookmarkStart w:id="5" w:name="_Toc236234347"/>
       <w:r>
         <w:rPr>
           <w:rFonts w:ascii="Montserrat" w:hAnsi="Montserrat"/>
@@ -4279,7 +4306,7 @@
           <w:sz w:val="27"/>
         </w:rPr>
       </w:pPr>
-      <w:bookmarkStart w:id="6" w:name="_Toc236233245"/>
+      <w:bookmarkStart w:id="6" w:name="_Toc236234348"/>
       <w:r>
         <w:rPr>
           <w:rFonts w:ascii="Montserrat" w:hAnsi="Montserrat"/>
@@ -4320,7 +4347,7 @@
           <w:sz w:val="27"/>
         </w:rPr>
       </w:pPr>
-      <w:bookmarkStart w:id="7" w:name="_Toc236233246"/>
+      <w:bookmarkStart w:id="7" w:name="_Toc236234349"/>
       <w:r>
         <w:rPr>
           <w:rFonts w:ascii="Montserrat" w:hAnsi="Montserrat"/>
@@ -4439,7 +4466,7 @@
           <w:sz w:val="27"/>
         </w:rPr>
       </w:pPr>
-      <w:bookmarkStart w:id="8" w:name="_Toc236233247"/>
+      <w:bookmarkStart w:id="8" w:name="_Toc236234350"/>
       <w:r>
         <w:rPr>
           <w:rFonts w:ascii="Montserrat" w:hAnsi="Montserrat"/>
@@ -5010,7 +5037,7 @@
           <w:sz w:val="27"/>
         </w:rPr>
       </w:pPr>
-      <w:bookmarkStart w:id="9" w:name="_Toc236233248"/>
+      <w:bookmarkStart w:id="9" w:name="_Toc236234351"/>
       <w:r>
         <w:rPr>
           <w:rFonts w:ascii="Montserrat" w:hAnsi="Montserrat"/>
@@ -5099,16 +5126,16 @@
         </w:rPr>
         <w:lastRenderedPageBreak/>
         <w:drawing>
-          <wp:inline distT="0" distB="0" distL="0" distR="0" wp14:anchorId="6F9068C0" wp14:editId="7C46C864">
+          <wp:inline distT="0" distB="0" distL="0" distR="0" wp14:anchorId="5751E767" wp14:editId="1BCB447B">
             <wp:extent cx="4937760" cy="4462310"/>
             <wp:effectExtent l="19050" t="19050" r="15240" b="14605"/>
-            <wp:docPr id="261016704" name="Imagem 3"/>
+            <wp:docPr id="699385858" name="Imagem 3"/>
             <wp:cNvGraphicFramePr/>
             <a:graphic xmlns:a="http://schemas.openxmlformats.org/drawingml/2006/main">
               <a:graphicData uri="http://schemas.openxmlformats.org/drawingml/2006/picture">
                 <pic:pic xmlns:pic="http://schemas.openxmlformats.org/drawingml/2006/picture">
                   <pic:nvPicPr>
-                    <pic:cNvPr id="261016704" name=""/>
+                    <pic:cNvPr id="699385858" name=""/>
                     <pic:cNvPicPr/>
                   </pic:nvPicPr>
                   <pic:blipFill>
@@ -5176,7 +5203,7 @@
           <w:sz w:val="27"/>
         </w:rPr>
       </w:pPr>
-      <w:bookmarkStart w:id="10" w:name="_Toc236233249"/>
+      <w:bookmarkStart w:id="10" w:name="_Toc236234352"/>
       <w:r>
         <w:rPr>
           <w:rFonts w:ascii="Montserrat" w:hAnsi="Montserrat"/>
@@ -5217,16 +5244,16 @@
         </w:rPr>
         <w:lastRenderedPageBreak/>
         <w:drawing>
-          <wp:inline distT="0" distB="0" distL="0" distR="0" wp14:anchorId="71C45B39" wp14:editId="388B3F37">
+          <wp:inline distT="0" distB="0" distL="0" distR="0" wp14:anchorId="60B76781" wp14:editId="67C0E6C3">
             <wp:extent cx="5120640" cy="4627581"/>
             <wp:effectExtent l="19050" t="19050" r="22860" b="20955"/>
-            <wp:docPr id="1654871238" name="Imagem 4"/>
+            <wp:docPr id="1471415970" name="Imagem 4"/>
             <wp:cNvGraphicFramePr/>
             <a:graphic xmlns:a="http://schemas.openxmlformats.org/drawingml/2006/main">
               <a:graphicData uri="http://schemas.openxmlformats.org/drawingml/2006/picture">
                 <pic:pic xmlns:pic="http://schemas.openxmlformats.org/drawingml/2006/picture">
                   <pic:nvPicPr>
-                    <pic:cNvPr id="1654871238" name=""/>
+                    <pic:cNvPr id="1471415970" name=""/>
                     <pic:cNvPicPr/>
                   </pic:nvPicPr>
                   <pic:blipFill>
@@ -5363,7 +5390,7 @@
           <w:sz w:val="27"/>
         </w:rPr>
       </w:pPr>
-      <w:bookmarkStart w:id="11" w:name="_Toc236233250"/>
+      <w:bookmarkStart w:id="11" w:name="_Toc236234353"/>
       <w:r>
         <w:rPr>
           <w:rFonts w:ascii="Montserrat" w:hAnsi="Montserrat"/>
@@ -5404,16 +5431,16 @@
         </w:rPr>
         <w:lastRenderedPageBreak/>
         <w:drawing>
-          <wp:inline distT="0" distB="0" distL="0" distR="0" wp14:anchorId="7BFCC2F4" wp14:editId="00BB9401">
+          <wp:inline distT="0" distB="0" distL="0" distR="0" wp14:anchorId="3E6737AA" wp14:editId="56A46B70">
             <wp:extent cx="4206240" cy="3801227"/>
             <wp:effectExtent l="19050" t="19050" r="22860" b="27940"/>
-            <wp:docPr id="528634705" name="Imagem 5"/>
+            <wp:docPr id="499811447" name="Imagem 5"/>
             <wp:cNvGraphicFramePr/>
             <a:graphic xmlns:a="http://schemas.openxmlformats.org/drawingml/2006/main">
               <a:graphicData uri="http://schemas.openxmlformats.org/drawingml/2006/picture">
                 <pic:pic xmlns:pic="http://schemas.openxmlformats.org/drawingml/2006/picture">
                   <pic:nvPicPr>
-                    <pic:cNvPr id="528634705" name=""/>
+                    <pic:cNvPr id="499811447" name=""/>
                     <pic:cNvPicPr/>
                   </pic:nvPicPr>
                   <pic:blipFill>
@@ -5481,16 +5508,16 @@
         </w:rPr>
         <w:lastRenderedPageBreak/>
         <w:drawing>
-          <wp:inline distT="0" distB="0" distL="0" distR="0" wp14:anchorId="4CC5B777" wp14:editId="1AFD4137">
+          <wp:inline distT="0" distB="0" distL="0" distR="0" wp14:anchorId="2CC00240" wp14:editId="013B2FC6">
             <wp:extent cx="4206240" cy="3801227"/>
             <wp:effectExtent l="19050" t="19050" r="22860" b="27940"/>
-            <wp:docPr id="1471329029" name="Imagem 6"/>
+            <wp:docPr id="693717627" name="Imagem 6"/>
             <wp:cNvGraphicFramePr/>
             <a:graphic xmlns:a="http://schemas.openxmlformats.org/drawingml/2006/main">
               <a:graphicData uri="http://schemas.openxmlformats.org/drawingml/2006/picture">
                 <pic:pic xmlns:pic="http://schemas.openxmlformats.org/drawingml/2006/picture">
                   <pic:nvPicPr>
-                    <pic:cNvPr id="1471329029" name=""/>
+                    <pic:cNvPr id="693717627" name=""/>
                     <pic:cNvPicPr/>
                   </pic:nvPicPr>
                   <pic:blipFill>
@@ -5606,7 +5633,7 @@
           <w:sz w:val="27"/>
         </w:rPr>
       </w:pPr>
-      <w:bookmarkStart w:id="12" w:name="_Toc236233251"/>
+      <w:bookmarkStart w:id="12" w:name="_Toc236234354"/>
       <w:r>
         <w:rPr>
           <w:rFonts w:ascii="Montserrat" w:hAnsi="Montserrat"/>
@@ -5678,7 +5705,7 @@
           <w:sz w:val="34"/>
         </w:rPr>
       </w:pPr>
-      <w:bookmarkStart w:id="13" w:name="_Toc236233252"/>
+      <w:bookmarkStart w:id="13" w:name="_Toc236234355"/>
       <w:r>
         <w:rPr>
           <w:rFonts w:ascii="Montserrat" w:hAnsi="Montserrat"/>
@@ -5720,7 +5747,7 @@
           <w:sz w:val="27"/>
         </w:rPr>
       </w:pPr>
-      <w:bookmarkStart w:id="14" w:name="_Toc236233253"/>
+      <w:bookmarkStart w:id="14" w:name="_Toc236234356"/>
       <w:r>
         <w:rPr>
           <w:rFonts w:ascii="Montserrat" w:hAnsi="Montserrat"/>
@@ -6580,16 +6607,16 @@
         </w:rPr>
         <w:lastRenderedPageBreak/>
         <w:drawing>
-          <wp:inline distT="0" distB="0" distL="0" distR="0" wp14:anchorId="5C147DD9" wp14:editId="2FB7A452">
+          <wp:inline distT="0" distB="0" distL="0" distR="0" wp14:anchorId="0AF89148" wp14:editId="7ED59324">
             <wp:extent cx="5120640" cy="4627581"/>
             <wp:effectExtent l="19050" t="19050" r="22860" b="20955"/>
-            <wp:docPr id="1899377672" name="Imagem 7"/>
+            <wp:docPr id="1514655428" name="Imagem 7"/>
             <wp:cNvGraphicFramePr/>
             <a:graphic xmlns:a="http://schemas.openxmlformats.org/drawingml/2006/main">
               <a:graphicData uri="http://schemas.openxmlformats.org/drawingml/2006/picture">
                 <pic:pic xmlns:pic="http://schemas.openxmlformats.org/drawingml/2006/picture">
                   <pic:nvPicPr>
-                    <pic:cNvPr id="1899377672" name=""/>
+                    <pic:cNvPr id="1514655428" name=""/>
                     <pic:cNvPicPr/>
                   </pic:nvPicPr>
                   <pic:blipFill>
@@ -6657,16 +6684,16 @@
         </w:rPr>
         <w:lastRenderedPageBreak/>
         <w:drawing>
-          <wp:inline distT="0" distB="0" distL="0" distR="0" wp14:anchorId="57C492C1" wp14:editId="5D03AEAA">
+          <wp:inline distT="0" distB="0" distL="0" distR="0" wp14:anchorId="658FBB29" wp14:editId="74632B4D">
             <wp:extent cx="5120640" cy="4627581"/>
             <wp:effectExtent l="19050" t="19050" r="22860" b="20955"/>
-            <wp:docPr id="1677446758" name="Imagem 8"/>
+            <wp:docPr id="449573472" name="Imagem 8"/>
             <wp:cNvGraphicFramePr/>
             <a:graphic xmlns:a="http://schemas.openxmlformats.org/drawingml/2006/main">
               <a:graphicData uri="http://schemas.openxmlformats.org/drawingml/2006/picture">
                 <pic:pic xmlns:pic="http://schemas.openxmlformats.org/drawingml/2006/picture">
                   <pic:nvPicPr>
-                    <pic:cNvPr id="1677446758" name=""/>
+                    <pic:cNvPr id="449573472" name=""/>
                     <pic:cNvPicPr/>
                   </pic:nvPicPr>
                   <pic:blipFill>
@@ -6801,7 +6828,7 @@
           <w:sz w:val="27"/>
         </w:rPr>
       </w:pPr>
-      <w:bookmarkStart w:id="15" w:name="_Toc236233254"/>
+      <w:bookmarkStart w:id="15" w:name="_Toc236234357"/>
       <w:r>
         <w:rPr>
           <w:rFonts w:ascii="Montserrat" w:hAnsi="Montserrat"/>
@@ -7670,16 +7697,16 @@
         </w:rPr>
         <w:lastRenderedPageBreak/>
         <w:drawing>
-          <wp:inline distT="0" distB="0" distL="0" distR="0" wp14:anchorId="5BF8057B" wp14:editId="1EBA040A">
+          <wp:inline distT="0" distB="0" distL="0" distR="0" wp14:anchorId="7BD77C33" wp14:editId="62A4788F">
             <wp:extent cx="5120640" cy="4627581"/>
             <wp:effectExtent l="19050" t="19050" r="22860" b="20955"/>
-            <wp:docPr id="1639740510" name="Imagem 9"/>
+            <wp:docPr id="589485759" name="Imagem 9"/>
             <wp:cNvGraphicFramePr/>
             <a:graphic xmlns:a="http://schemas.openxmlformats.org/drawingml/2006/main">
               <a:graphicData uri="http://schemas.openxmlformats.org/drawingml/2006/picture">
                 <pic:pic xmlns:pic="http://schemas.openxmlformats.org/drawingml/2006/picture">
                   <pic:nvPicPr>
-                    <pic:cNvPr id="1639740510" name=""/>
+                    <pic:cNvPr id="589485759" name=""/>
                     <pic:cNvPicPr/>
                   </pic:nvPicPr>
                   <pic:blipFill>
@@ -7747,16 +7774,16 @@
         </w:rPr>
         <w:lastRenderedPageBreak/>
         <w:drawing>
-          <wp:inline distT="0" distB="0" distL="0" distR="0" wp14:anchorId="073126EF" wp14:editId="03762A92">
+          <wp:inline distT="0" distB="0" distL="0" distR="0" wp14:anchorId="0F6DA0D5" wp14:editId="2D6C6665">
             <wp:extent cx="5120640" cy="4627581"/>
             <wp:effectExtent l="19050" t="19050" r="22860" b="20955"/>
-            <wp:docPr id="887250361" name="Imagem 10"/>
+            <wp:docPr id="1821018623" name="Imagem 10"/>
             <wp:cNvGraphicFramePr/>
             <a:graphic xmlns:a="http://schemas.openxmlformats.org/drawingml/2006/main">
               <a:graphicData uri="http://schemas.openxmlformats.org/drawingml/2006/picture">
                 <pic:pic xmlns:pic="http://schemas.openxmlformats.org/drawingml/2006/picture">
                   <pic:nvPicPr>
-                    <pic:cNvPr id="887250361" name=""/>
+                    <pic:cNvPr id="1821018623" name=""/>
                     <pic:cNvPicPr/>
                   </pic:nvPicPr>
                   <pic:blipFill>
@@ -7842,7 +7869,7 @@
           <w:sz w:val="27"/>
         </w:rPr>
       </w:pPr>
-      <w:bookmarkStart w:id="16" w:name="_Toc236233255"/>
+      <w:bookmarkStart w:id="16" w:name="_Toc236234358"/>
       <w:r>
         <w:rPr>
           <w:rFonts w:ascii="Montserrat" w:hAnsi="Montserrat"/>
@@ -8810,16 +8837,16 @@
         </w:rPr>
         <w:lastRenderedPageBreak/>
         <w:drawing>
-          <wp:inline distT="0" distB="0" distL="0" distR="0" wp14:anchorId="0CA2820B" wp14:editId="338F7FD4">
+          <wp:inline distT="0" distB="0" distL="0" distR="0" wp14:anchorId="39762697" wp14:editId="33C12579">
             <wp:extent cx="5120640" cy="3282818"/>
             <wp:effectExtent l="19050" t="19050" r="22860" b="13335"/>
-            <wp:docPr id="1068116943" name="Imagem 11"/>
+            <wp:docPr id="556733108" name="Imagem 11"/>
             <wp:cNvGraphicFramePr/>
             <a:graphic xmlns:a="http://schemas.openxmlformats.org/drawingml/2006/main">
               <a:graphicData uri="http://schemas.openxmlformats.org/drawingml/2006/picture">
                 <pic:pic xmlns:pic="http://schemas.openxmlformats.org/drawingml/2006/picture">
                   <pic:nvPicPr>
-                    <pic:cNvPr id="1068116943" name=""/>
+                    <pic:cNvPr id="556733108" name=""/>
                     <pic:cNvPicPr/>
                   </pic:nvPicPr>
                   <pic:blipFill>
@@ -8887,16 +8914,16 @@
         </w:rPr>
         <w:lastRenderedPageBreak/>
         <w:drawing>
-          <wp:inline distT="0" distB="0" distL="0" distR="0" wp14:anchorId="0670A91C" wp14:editId="10C4E88A">
+          <wp:inline distT="0" distB="0" distL="0" distR="0" wp14:anchorId="4232544A" wp14:editId="220C5A5E">
             <wp:extent cx="5120640" cy="4627581"/>
             <wp:effectExtent l="19050" t="19050" r="22860" b="20955"/>
-            <wp:docPr id="2134006940" name="Imagem 12"/>
+            <wp:docPr id="1242440832" name="Imagem 12"/>
             <wp:cNvGraphicFramePr/>
             <a:graphic xmlns:a="http://schemas.openxmlformats.org/drawingml/2006/main">
               <a:graphicData uri="http://schemas.openxmlformats.org/drawingml/2006/picture">
                 <pic:pic xmlns:pic="http://schemas.openxmlformats.org/drawingml/2006/picture">
                   <pic:nvPicPr>
-                    <pic:cNvPr id="2134006940" name=""/>
+                    <pic:cNvPr id="1242440832" name=""/>
                     <pic:cNvPicPr/>
                   </pic:nvPicPr>
                   <pic:blipFill>
@@ -8982,7 +9009,7 @@
           <w:sz w:val="27"/>
         </w:rPr>
       </w:pPr>
-      <w:bookmarkStart w:id="17" w:name="_Toc236233256"/>
+      <w:bookmarkStart w:id="17" w:name="_Toc236234359"/>
       <w:r>
         <w:rPr>
           <w:rFonts w:ascii="Montserrat" w:hAnsi="Montserrat"/>
@@ -9489,16 +9516,16 @@
           <w:noProof/>
         </w:rPr>
         <w:drawing>
-          <wp:inline distT="0" distB="0" distL="0" distR="0" wp14:anchorId="6E241E86" wp14:editId="4FF8A3C2">
+          <wp:inline distT="0" distB="0" distL="0" distR="0" wp14:anchorId="25D8D60C" wp14:editId="4D35F3FB">
             <wp:extent cx="5120640" cy="4627581"/>
             <wp:effectExtent l="19050" t="19050" r="22860" b="20955"/>
-            <wp:docPr id="476271731" name="Imagem 13"/>
+            <wp:docPr id="1754790727" name="Imagem 13"/>
             <wp:cNvGraphicFramePr/>
             <a:graphic xmlns:a="http://schemas.openxmlformats.org/drawingml/2006/main">
               <a:graphicData uri="http://schemas.openxmlformats.org/drawingml/2006/picture">
                 <pic:pic xmlns:pic="http://schemas.openxmlformats.org/drawingml/2006/picture">
                   <pic:nvPicPr>
-                    <pic:cNvPr id="476271731" name=""/>
+                    <pic:cNvPr id="1754790727" name=""/>
                     <pic:cNvPicPr/>
                   </pic:nvPicPr>
                   <pic:blipFill>
@@ -9566,16 +9593,16 @@
         </w:rPr>
         <w:lastRenderedPageBreak/>
         <w:drawing>
-          <wp:inline distT="0" distB="0" distL="0" distR="0" wp14:anchorId="42D90221" wp14:editId="6CACD736">
+          <wp:inline distT="0" distB="0" distL="0" distR="0" wp14:anchorId="3FDE3A09" wp14:editId="0E7589EE">
             <wp:extent cx="5120640" cy="4627581"/>
             <wp:effectExtent l="19050" t="19050" r="22860" b="20955"/>
-            <wp:docPr id="1117805146" name="Imagem 14"/>
+            <wp:docPr id="1720004882" name="Imagem 14"/>
             <wp:cNvGraphicFramePr/>
             <a:graphic xmlns:a="http://schemas.openxmlformats.org/drawingml/2006/main">
               <a:graphicData uri="http://schemas.openxmlformats.org/drawingml/2006/picture">
                 <pic:pic xmlns:pic="http://schemas.openxmlformats.org/drawingml/2006/picture">
                   <pic:nvPicPr>
-                    <pic:cNvPr id="1117805146" name=""/>
+                    <pic:cNvPr id="1720004882" name=""/>
                     <pic:cNvPicPr/>
                   </pic:nvPicPr>
                   <pic:blipFill>
@@ -9661,7 +9688,7 @@
           <w:sz w:val="27"/>
         </w:rPr>
       </w:pPr>
-      <w:bookmarkStart w:id="18" w:name="_Toc236233257"/>
+      <w:bookmarkStart w:id="18" w:name="_Toc236234360"/>
       <w:r>
         <w:rPr>
           <w:rFonts w:ascii="Montserrat" w:hAnsi="Montserrat"/>
@@ -9702,16 +9729,16 @@
         </w:rPr>
         <w:lastRenderedPageBreak/>
         <w:drawing>
-          <wp:inline distT="0" distB="0" distL="0" distR="0" wp14:anchorId="582C85DC" wp14:editId="4A452433">
+          <wp:inline distT="0" distB="0" distL="0" distR="0" wp14:anchorId="020DA25B" wp14:editId="44FADB5B">
             <wp:extent cx="5120640" cy="4627581"/>
             <wp:effectExtent l="19050" t="19050" r="22860" b="20955"/>
-            <wp:docPr id="1351387835" name="Imagem 15"/>
+            <wp:docPr id="1091178368" name="Imagem 15"/>
             <wp:cNvGraphicFramePr/>
             <a:graphic xmlns:a="http://schemas.openxmlformats.org/drawingml/2006/main">
               <a:graphicData uri="http://schemas.openxmlformats.org/drawingml/2006/picture">
                 <pic:pic xmlns:pic="http://schemas.openxmlformats.org/drawingml/2006/picture">
                   <pic:nvPicPr>
-                    <pic:cNvPr id="1351387835" name=""/>
+                    <pic:cNvPr id="1091178368" name=""/>
                     <pic:cNvPicPr/>
                   </pic:nvPicPr>
                   <pic:blipFill>
@@ -9779,16 +9806,16 @@
         </w:rPr>
         <w:lastRenderedPageBreak/>
         <w:drawing>
-          <wp:inline distT="0" distB="0" distL="0" distR="0" wp14:anchorId="7FC80FE4" wp14:editId="6AE5629F">
+          <wp:inline distT="0" distB="0" distL="0" distR="0" wp14:anchorId="2357476C" wp14:editId="0DE2023E">
             <wp:extent cx="5120640" cy="4627581"/>
             <wp:effectExtent l="19050" t="19050" r="22860" b="20955"/>
-            <wp:docPr id="1654598463" name="Imagem 16"/>
+            <wp:docPr id="1204582846" name="Imagem 16"/>
             <wp:cNvGraphicFramePr/>
             <a:graphic xmlns:a="http://schemas.openxmlformats.org/drawingml/2006/main">
               <a:graphicData uri="http://schemas.openxmlformats.org/drawingml/2006/picture">
                 <pic:pic xmlns:pic="http://schemas.openxmlformats.org/drawingml/2006/picture">
                   <pic:nvPicPr>
-                    <pic:cNvPr id="1654598463" name=""/>
+                    <pic:cNvPr id="1204582846" name=""/>
                     <pic:cNvPicPr/>
                   </pic:nvPicPr>
                   <pic:blipFill>
@@ -9952,16 +9979,16 @@
         </w:rPr>
         <w:lastRenderedPageBreak/>
         <w:drawing>
-          <wp:inline distT="0" distB="0" distL="0" distR="0" wp14:anchorId="6F85C854" wp14:editId="00FA794C">
+          <wp:inline distT="0" distB="0" distL="0" distR="0" wp14:anchorId="61D79CF4" wp14:editId="418E3ED6">
             <wp:extent cx="5120640" cy="3282818"/>
             <wp:effectExtent l="19050" t="19050" r="22860" b="13335"/>
-            <wp:docPr id="1087239202" name="Imagem 17"/>
+            <wp:docPr id="474533815" name="Imagem 17"/>
             <wp:cNvGraphicFramePr/>
             <a:graphic xmlns:a="http://schemas.openxmlformats.org/drawingml/2006/main">
               <a:graphicData uri="http://schemas.openxmlformats.org/drawingml/2006/picture">
                 <pic:pic xmlns:pic="http://schemas.openxmlformats.org/drawingml/2006/picture">
                   <pic:nvPicPr>
-                    <pic:cNvPr id="1087239202" name=""/>
+                    <pic:cNvPr id="474533815" name=""/>
                     <pic:cNvPicPr/>
                   </pic:nvPicPr>
                   <pic:blipFill>
@@ -10047,7 +10074,7 @@
           <w:sz w:val="27"/>
         </w:rPr>
       </w:pPr>
-      <w:bookmarkStart w:id="19" w:name="_Toc236233258"/>
+      <w:bookmarkStart w:id="19" w:name="_Toc236234361"/>
       <w:r>
         <w:rPr>
           <w:rFonts w:ascii="Montserrat" w:hAnsi="Montserrat"/>
@@ -10088,16 +10115,16 @@
         </w:rPr>
         <w:lastRenderedPageBreak/>
         <w:drawing>
-          <wp:inline distT="0" distB="0" distL="0" distR="0" wp14:anchorId="1AB30C35" wp14:editId="27F52847">
+          <wp:inline distT="0" distB="0" distL="0" distR="0" wp14:anchorId="01527CDB" wp14:editId="23727D49">
             <wp:extent cx="5120640" cy="4627581"/>
             <wp:effectExtent l="19050" t="19050" r="22860" b="20955"/>
-            <wp:docPr id="352984908" name="Imagem 18"/>
+            <wp:docPr id="1617801691" name="Imagem 18"/>
             <wp:cNvGraphicFramePr/>
             <a:graphic xmlns:a="http://schemas.openxmlformats.org/drawingml/2006/main">
               <a:graphicData uri="http://schemas.openxmlformats.org/drawingml/2006/picture">
                 <pic:pic xmlns:pic="http://schemas.openxmlformats.org/drawingml/2006/picture">
                   <pic:nvPicPr>
-                    <pic:cNvPr id="352984908" name=""/>
+                    <pic:cNvPr id="1617801691" name=""/>
                     <pic:cNvPicPr/>
                   </pic:nvPicPr>
                   <pic:blipFill>
@@ -10165,16 +10192,16 @@
         </w:rPr>
         <w:lastRenderedPageBreak/>
         <w:drawing>
-          <wp:inline distT="0" distB="0" distL="0" distR="0" wp14:anchorId="1967EE20" wp14:editId="2DF7D093">
+          <wp:inline distT="0" distB="0" distL="0" distR="0" wp14:anchorId="3208D389" wp14:editId="2C0D72AD">
             <wp:extent cx="5120640" cy="4627581"/>
             <wp:effectExtent l="19050" t="19050" r="22860" b="20955"/>
-            <wp:docPr id="1932329052" name="Imagem 19"/>
+            <wp:docPr id="1204394569" name="Imagem 19"/>
             <wp:cNvGraphicFramePr/>
             <a:graphic xmlns:a="http://schemas.openxmlformats.org/drawingml/2006/main">
               <a:graphicData uri="http://schemas.openxmlformats.org/drawingml/2006/picture">
                 <pic:pic xmlns:pic="http://schemas.openxmlformats.org/drawingml/2006/picture">
                   <pic:nvPicPr>
-                    <pic:cNvPr id="1932329052" name=""/>
+                    <pic:cNvPr id="1204394569" name=""/>
                     <pic:cNvPicPr/>
                   </pic:nvPicPr>
                   <pic:blipFill>
@@ -10308,7 +10335,7 @@
           <w:sz w:val="27"/>
         </w:rPr>
       </w:pPr>
-      <w:bookmarkStart w:id="20" w:name="_Toc236233259"/>
+      <w:bookmarkStart w:id="20" w:name="_Toc236234362"/>
       <w:r>
         <w:rPr>
           <w:rFonts w:ascii="Montserrat" w:hAnsi="Montserrat"/>
@@ -10349,16 +10376,16 @@
         </w:rPr>
         <w:lastRenderedPageBreak/>
         <w:drawing>
-          <wp:inline distT="0" distB="0" distL="0" distR="0" wp14:anchorId="79F41277" wp14:editId="4A6826C8">
+          <wp:inline distT="0" distB="0" distL="0" distR="0" wp14:anchorId="437CA44E" wp14:editId="6B85BE8E">
             <wp:extent cx="5120640" cy="4627581"/>
             <wp:effectExtent l="19050" t="19050" r="22860" b="20955"/>
-            <wp:docPr id="290699144" name="Imagem 20"/>
+            <wp:docPr id="191746143" name="Imagem 20"/>
             <wp:cNvGraphicFramePr/>
             <a:graphic xmlns:a="http://schemas.openxmlformats.org/drawingml/2006/main">
               <a:graphicData uri="http://schemas.openxmlformats.org/drawingml/2006/picture">
                 <pic:pic xmlns:pic="http://schemas.openxmlformats.org/drawingml/2006/picture">
                   <pic:nvPicPr>
-                    <pic:cNvPr id="290699144" name=""/>
+                    <pic:cNvPr id="191746143" name=""/>
                     <pic:cNvPicPr/>
                   </pic:nvPicPr>
                   <pic:blipFill>
@@ -10426,16 +10453,16 @@
         </w:rPr>
         <w:lastRenderedPageBreak/>
         <w:drawing>
-          <wp:inline distT="0" distB="0" distL="0" distR="0" wp14:anchorId="5F02E9AC" wp14:editId="68980B11">
+          <wp:inline distT="0" distB="0" distL="0" distR="0" wp14:anchorId="2B9A67CA" wp14:editId="5DFA9853">
             <wp:extent cx="5120640" cy="4627581"/>
             <wp:effectExtent l="19050" t="19050" r="22860" b="20955"/>
-            <wp:docPr id="1878092871" name="Imagem 21"/>
+            <wp:docPr id="1254119708" name="Imagem 21"/>
             <wp:cNvGraphicFramePr/>
             <a:graphic xmlns:a="http://schemas.openxmlformats.org/drawingml/2006/main">
               <a:graphicData uri="http://schemas.openxmlformats.org/drawingml/2006/picture">
                 <pic:pic xmlns:pic="http://schemas.openxmlformats.org/drawingml/2006/picture">
                   <pic:nvPicPr>
-                    <pic:cNvPr id="1878092871" name=""/>
+                    <pic:cNvPr id="1254119708" name=""/>
                     <pic:cNvPicPr/>
                   </pic:nvPicPr>
                   <pic:blipFill>
@@ -10584,6 +10611,37 @@
     </w:p>
     <w:p>
       <w:pPr>
+        <w:spacing w:before="160" w:after="200"/>
+        <w:ind w:left="283"/>
+        <w:rPr>
+          <w:rFonts w:ascii="Montserrat" w:hAnsi="Montserrat"/>
+          <w:i/>
+          <w:color w:val="6A6A70"/>
+          <w:sz w:val="21"/>
+        </w:rPr>
+      </w:pPr>
+      <w:r>
+        <w:rPr>
+          <w:rFonts w:ascii="Montserrat" w:hAnsi="Montserrat"/>
+          <w:i/>
+          <w:color w:val="6A6A70"/>
+          <w:sz w:val="21"/>
+        </w:rPr>
+        <w:t xml:space="preserve">Propagacao para o projeto vinculado: sempre que a decisao da SMP e finalizada como Aprovada ou Nao aprovada (seja ao registrar/editar a SMP ou ao trocar o Status na tela de detalhes), o sistema grava automaticamente um evento no historico compartilhado do projeto vinculado (o mesmo historico acessivel pelo botao Ver historico em qualquer formulario com Projeto vinculado - secao 2.5). Isso torna as decisoes de mudanca visiveis para quem estiver no </w:t>
+      </w:r>
+      <w:r>
+        <w:rPr>
+          <w:rFonts w:ascii="Montserrat" w:hAnsi="Montserrat"/>
+          <w:i/>
+          <w:color w:val="6A6A70"/>
+          <w:sz w:val="21"/>
+        </w:rPr>
+        <w:lastRenderedPageBreak/>
+        <w:t>Canvas, TAP, Planejamento, EAP, TEP ou RLA daquele projeto, sem precisar abrir a SMP. Essa propagacao apenas registra o evento no historico - ela nao altera o Status do projeto usado no Gate 1 (Aprovado/Reprovado).</w:t>
+      </w:r>
+    </w:p>
+    <w:p>
+      <w:pPr>
         <w:pStyle w:val="Ttulo2"/>
         <w:spacing w:before="320" w:after="120"/>
         <w:rPr>
@@ -10593,7 +10651,7 @@
           <w:sz w:val="27"/>
         </w:rPr>
       </w:pPr>
-      <w:bookmarkStart w:id="21" w:name="_Toc236233260"/>
+      <w:bookmarkStart w:id="21" w:name="_Toc236234363"/>
       <w:r>
         <w:rPr>
           <w:rFonts w:ascii="Montserrat" w:hAnsi="Montserrat"/>
@@ -10632,18 +10690,17 @@
         <w:rPr>
           <w:noProof/>
         </w:rPr>
-        <w:lastRenderedPageBreak/>
         <w:drawing>
-          <wp:inline distT="0" distB="0" distL="0" distR="0" wp14:anchorId="10ECD379" wp14:editId="16D7B9AF">
+          <wp:inline distT="0" distB="0" distL="0" distR="0" wp14:anchorId="305F69C0" wp14:editId="129035B3">
             <wp:extent cx="5120640" cy="4627581"/>
             <wp:effectExtent l="19050" t="19050" r="22860" b="20955"/>
-            <wp:docPr id="1200362554" name="Imagem 22"/>
+            <wp:docPr id="399914814" name="Imagem 22"/>
             <wp:cNvGraphicFramePr/>
             <a:graphic xmlns:a="http://schemas.openxmlformats.org/drawingml/2006/main">
               <a:graphicData uri="http://schemas.openxmlformats.org/drawingml/2006/picture">
                 <pic:pic xmlns:pic="http://schemas.openxmlformats.org/drawingml/2006/picture">
                   <pic:nvPicPr>
-                    <pic:cNvPr id="1200362554" name=""/>
+                    <pic:cNvPr id="399914814" name=""/>
                     <pic:cNvPicPr/>
                   </pic:nvPicPr>
                   <pic:blipFill>
@@ -10711,16 +10768,16 @@
         </w:rPr>
         <w:lastRenderedPageBreak/>
         <w:drawing>
-          <wp:inline distT="0" distB="0" distL="0" distR="0" wp14:anchorId="5FE20DC1" wp14:editId="1A16062A">
+          <wp:inline distT="0" distB="0" distL="0" distR="0" wp14:anchorId="3994D962" wp14:editId="7E211268">
             <wp:extent cx="5120640" cy="4627581"/>
             <wp:effectExtent l="19050" t="19050" r="22860" b="20955"/>
-            <wp:docPr id="1654359640" name="Imagem 23"/>
+            <wp:docPr id="815068688" name="Imagem 23"/>
             <wp:cNvGraphicFramePr/>
             <a:graphic xmlns:a="http://schemas.openxmlformats.org/drawingml/2006/main">
               <a:graphicData uri="http://schemas.openxmlformats.org/drawingml/2006/picture">
                 <pic:pic xmlns:pic="http://schemas.openxmlformats.org/drawingml/2006/picture">
                   <pic:nvPicPr>
-                    <pic:cNvPr id="1654359640" name=""/>
+                    <pic:cNvPr id="815068688" name=""/>
                     <pic:cNvPicPr/>
                   </pic:nvPicPr>
                   <pic:blipFill>
@@ -10878,7 +10935,7 @@
           <w:sz w:val="27"/>
         </w:rPr>
       </w:pPr>
-      <w:bookmarkStart w:id="22" w:name="_Toc236233261"/>
+      <w:bookmarkStart w:id="22" w:name="_Toc236234364"/>
       <w:r>
         <w:rPr>
           <w:rFonts w:ascii="Montserrat" w:hAnsi="Montserrat"/>
@@ -10919,16 +10976,16 @@
         </w:rPr>
         <w:lastRenderedPageBreak/>
         <w:drawing>
-          <wp:inline distT="0" distB="0" distL="0" distR="0" wp14:anchorId="2E6D3FEB" wp14:editId="7196DA40">
+          <wp:inline distT="0" distB="0" distL="0" distR="0" wp14:anchorId="00C9FAE5" wp14:editId="46F13F9A">
             <wp:extent cx="5120640" cy="4627581"/>
             <wp:effectExtent l="19050" t="19050" r="22860" b="20955"/>
-            <wp:docPr id="1603464968" name="Imagem 24"/>
+            <wp:docPr id="1161707618" name="Imagem 24"/>
             <wp:cNvGraphicFramePr/>
             <a:graphic xmlns:a="http://schemas.openxmlformats.org/drawingml/2006/main">
               <a:graphicData uri="http://schemas.openxmlformats.org/drawingml/2006/picture">
                 <pic:pic xmlns:pic="http://schemas.openxmlformats.org/drawingml/2006/picture">
                   <pic:nvPicPr>
-                    <pic:cNvPr id="1603464968" name=""/>
+                    <pic:cNvPr id="1161707618" name=""/>
                     <pic:cNvPicPr/>
                   </pic:nvPicPr>
                   <pic:blipFill>
@@ -10996,16 +11053,16 @@
         </w:rPr>
         <w:lastRenderedPageBreak/>
         <w:drawing>
-          <wp:inline distT="0" distB="0" distL="0" distR="0" wp14:anchorId="4C7C9BDD" wp14:editId="396A8FF4">
+          <wp:inline distT="0" distB="0" distL="0" distR="0" wp14:anchorId="573B9933" wp14:editId="29C88CEB">
             <wp:extent cx="5120640" cy="4627581"/>
             <wp:effectExtent l="19050" t="19050" r="22860" b="20955"/>
-            <wp:docPr id="1836832443" name="Imagem 25"/>
+            <wp:docPr id="440532634" name="Imagem 25"/>
             <wp:cNvGraphicFramePr/>
             <a:graphic xmlns:a="http://schemas.openxmlformats.org/drawingml/2006/main">
               <a:graphicData uri="http://schemas.openxmlformats.org/drawingml/2006/picture">
                 <pic:pic xmlns:pic="http://schemas.openxmlformats.org/drawingml/2006/picture">
                   <pic:nvPicPr>
-                    <pic:cNvPr id="1836832443" name=""/>
+                    <pic:cNvPr id="440532634" name=""/>
                     <pic:cNvPicPr/>
                   </pic:nvPicPr>
                   <pic:blipFill>
@@ -11139,7 +11196,7 @@
           <w:sz w:val="27"/>
         </w:rPr>
       </w:pPr>
-      <w:bookmarkStart w:id="23" w:name="_Toc236233262"/>
+      <w:bookmarkStart w:id="23" w:name="_Toc236234365"/>
       <w:r>
         <w:rPr>
           <w:rFonts w:ascii="Montserrat" w:hAnsi="Montserrat"/>
@@ -11180,16 +11237,16 @@
         </w:rPr>
         <w:lastRenderedPageBreak/>
         <w:drawing>
-          <wp:inline distT="0" distB="0" distL="0" distR="0" wp14:anchorId="7C4B1D89" wp14:editId="26D8F34D">
+          <wp:inline distT="0" distB="0" distL="0" distR="0" wp14:anchorId="2827B14E" wp14:editId="129E5CFE">
             <wp:extent cx="5120640" cy="4627581"/>
             <wp:effectExtent l="19050" t="19050" r="22860" b="20955"/>
-            <wp:docPr id="1941304434" name="Imagem 26"/>
+            <wp:docPr id="1703749440" name="Imagem 26"/>
             <wp:cNvGraphicFramePr/>
             <a:graphic xmlns:a="http://schemas.openxmlformats.org/drawingml/2006/main">
               <a:graphicData uri="http://schemas.openxmlformats.org/drawingml/2006/picture">
                 <pic:pic xmlns:pic="http://schemas.openxmlformats.org/drawingml/2006/picture">
                   <pic:nvPicPr>
-                    <pic:cNvPr id="1941304434" name=""/>
+                    <pic:cNvPr id="1703749440" name=""/>
                     <pic:cNvPicPr/>
                   </pic:nvPicPr>
                   <pic:blipFill>
@@ -11279,7 +11336,7 @@
           <w:sz w:val="34"/>
         </w:rPr>
       </w:pPr>
-      <w:bookmarkStart w:id="24" w:name="_Toc236233263"/>
+      <w:bookmarkStart w:id="24" w:name="_Toc236234366"/>
       <w:r>
         <w:rPr>
           <w:rFonts w:ascii="Montserrat" w:hAnsi="Montserrat"/>
@@ -11321,7 +11378,7 @@
           <w:sz w:val="27"/>
         </w:rPr>
       </w:pPr>
-      <w:bookmarkStart w:id="25" w:name="_Toc236233264"/>
+      <w:bookmarkStart w:id="25" w:name="_Toc236234367"/>
       <w:r>
         <w:rPr>
           <w:rFonts w:ascii="Montserrat" w:hAnsi="Montserrat"/>
@@ -11361,16 +11418,16 @@
           <w:noProof/>
         </w:rPr>
         <w:drawing>
-          <wp:inline distT="0" distB="0" distL="0" distR="0" wp14:anchorId="4DC7B86B" wp14:editId="25847308">
+          <wp:inline distT="0" distB="0" distL="0" distR="0" wp14:anchorId="79AE9943" wp14:editId="73122016">
             <wp:extent cx="5120640" cy="4627581"/>
             <wp:effectExtent l="19050" t="19050" r="22860" b="20955"/>
-            <wp:docPr id="1152610005" name="Imagem 27"/>
+            <wp:docPr id="434582681" name="Imagem 27"/>
             <wp:cNvGraphicFramePr/>
             <a:graphic xmlns:a="http://schemas.openxmlformats.org/drawingml/2006/main">
               <a:graphicData uri="http://schemas.openxmlformats.org/drawingml/2006/picture">
                 <pic:pic xmlns:pic="http://schemas.openxmlformats.org/drawingml/2006/picture">
                   <pic:nvPicPr>
-                    <pic:cNvPr id="1152610005" name=""/>
+                    <pic:cNvPr id="434582681" name=""/>
                     <pic:cNvPicPr/>
                   </pic:nvPicPr>
                   <pic:blipFill>
@@ -11438,16 +11495,16 @@
         </w:rPr>
         <w:lastRenderedPageBreak/>
         <w:drawing>
-          <wp:inline distT="0" distB="0" distL="0" distR="0" wp14:anchorId="48D2BF08" wp14:editId="4D340FD0">
+          <wp:inline distT="0" distB="0" distL="0" distR="0" wp14:anchorId="3379F2C3" wp14:editId="5892C9B2">
             <wp:extent cx="5120640" cy="4627581"/>
             <wp:effectExtent l="19050" t="19050" r="22860" b="20955"/>
-            <wp:docPr id="1227188331" name="Imagem 28"/>
+            <wp:docPr id="759491592" name="Imagem 28"/>
             <wp:cNvGraphicFramePr/>
             <a:graphic xmlns:a="http://schemas.openxmlformats.org/drawingml/2006/main">
               <a:graphicData uri="http://schemas.openxmlformats.org/drawingml/2006/picture">
                 <pic:pic xmlns:pic="http://schemas.openxmlformats.org/drawingml/2006/picture">
                   <pic:nvPicPr>
-                    <pic:cNvPr id="1227188331" name=""/>
+                    <pic:cNvPr id="759491592" name=""/>
                     <pic:cNvPicPr/>
                   </pic:nvPicPr>
                   <pic:blipFill>
@@ -11515,16 +11572,16 @@
         </w:rPr>
         <w:lastRenderedPageBreak/>
         <w:drawing>
-          <wp:inline distT="0" distB="0" distL="0" distR="0" wp14:anchorId="4944BFF6" wp14:editId="28D55C66">
+          <wp:inline distT="0" distB="0" distL="0" distR="0" wp14:anchorId="779B2B00" wp14:editId="73B3B777">
             <wp:extent cx="5120640" cy="4627581"/>
             <wp:effectExtent l="19050" t="19050" r="22860" b="20955"/>
-            <wp:docPr id="673991570" name="Imagem 29"/>
+            <wp:docPr id="1107552041" name="Imagem 29"/>
             <wp:cNvGraphicFramePr/>
             <a:graphic xmlns:a="http://schemas.openxmlformats.org/drawingml/2006/main">
               <a:graphicData uri="http://schemas.openxmlformats.org/drawingml/2006/picture">
                 <pic:pic xmlns:pic="http://schemas.openxmlformats.org/drawingml/2006/picture">
                   <pic:nvPicPr>
-                    <pic:cNvPr id="673991570" name=""/>
+                    <pic:cNvPr id="1107552041" name=""/>
                     <pic:cNvPicPr/>
                   </pic:nvPicPr>
                   <pic:blipFill>
@@ -11718,16 +11775,16 @@
           <w:noProof/>
         </w:rPr>
         <w:drawing>
-          <wp:inline distT="0" distB="0" distL="0" distR="0" wp14:anchorId="6E18E288" wp14:editId="5BEBAC2E">
+          <wp:inline distT="0" distB="0" distL="0" distR="0" wp14:anchorId="6FE47FFB" wp14:editId="203BC960">
             <wp:extent cx="5120640" cy="3282818"/>
             <wp:effectExtent l="19050" t="19050" r="22860" b="13335"/>
-            <wp:docPr id="107937389" name="Imagem 30"/>
+            <wp:docPr id="1287438783" name="Imagem 30"/>
             <wp:cNvGraphicFramePr/>
             <a:graphic xmlns:a="http://schemas.openxmlformats.org/drawingml/2006/main">
               <a:graphicData uri="http://schemas.openxmlformats.org/drawingml/2006/picture">
                 <pic:pic xmlns:pic="http://schemas.openxmlformats.org/drawingml/2006/picture">
                   <pic:nvPicPr>
-                    <pic:cNvPr id="107937389" name=""/>
+                    <pic:cNvPr id="1287438783" name=""/>
                     <pic:cNvPicPr/>
                   </pic:nvPicPr>
                   <pic:blipFill>
@@ -11840,16 +11897,16 @@
         </w:rPr>
         <w:lastRenderedPageBreak/>
         <w:drawing>
-          <wp:inline distT="0" distB="0" distL="0" distR="0" wp14:anchorId="177A60C0" wp14:editId="403D8178">
+          <wp:inline distT="0" distB="0" distL="0" distR="0" wp14:anchorId="130A9391" wp14:editId="4FCC4337">
             <wp:extent cx="5120640" cy="1515102"/>
             <wp:effectExtent l="19050" t="19050" r="22860" b="28575"/>
-            <wp:docPr id="484460581" name="Imagem 31"/>
+            <wp:docPr id="1347549668" name="Imagem 31"/>
             <wp:cNvGraphicFramePr/>
             <a:graphic xmlns:a="http://schemas.openxmlformats.org/drawingml/2006/main">
               <a:graphicData uri="http://schemas.openxmlformats.org/drawingml/2006/picture">
                 <pic:pic xmlns:pic="http://schemas.openxmlformats.org/drawingml/2006/picture">
                   <pic:nvPicPr>
-                    <pic:cNvPr id="484460581" name=""/>
+                    <pic:cNvPr id="1347549668" name=""/>
                     <pic:cNvPicPr/>
                   </pic:nvPicPr>
                   <pic:blipFill>
@@ -11938,7 +11995,7 @@
           <w:sz w:val="27"/>
         </w:rPr>
       </w:pPr>
-      <w:bookmarkStart w:id="26" w:name="_Toc236233265"/>
+      <w:bookmarkStart w:id="26" w:name="_Toc236234368"/>
       <w:r>
         <w:rPr>
           <w:rFonts w:ascii="Montserrat" w:hAnsi="Montserrat"/>
@@ -11979,16 +12036,16 @@
         </w:rPr>
         <w:lastRenderedPageBreak/>
         <w:drawing>
-          <wp:inline distT="0" distB="0" distL="0" distR="0" wp14:anchorId="251E17B9" wp14:editId="6882DFCF">
+          <wp:inline distT="0" distB="0" distL="0" distR="0" wp14:anchorId="706F8BAA" wp14:editId="0B802C70">
             <wp:extent cx="5120640" cy="4627581"/>
             <wp:effectExtent l="19050" t="19050" r="22860" b="20955"/>
-            <wp:docPr id="592544162" name="Imagem 32"/>
+            <wp:docPr id="396631022" name="Imagem 32"/>
             <wp:cNvGraphicFramePr/>
             <a:graphic xmlns:a="http://schemas.openxmlformats.org/drawingml/2006/main">
               <a:graphicData uri="http://schemas.openxmlformats.org/drawingml/2006/picture">
                 <pic:pic xmlns:pic="http://schemas.openxmlformats.org/drawingml/2006/picture">
                   <pic:nvPicPr>
-                    <pic:cNvPr id="592544162" name=""/>
+                    <pic:cNvPr id="396631022" name=""/>
                     <pic:cNvPicPr/>
                   </pic:nvPicPr>
                   <pic:blipFill>
@@ -12056,16 +12113,16 @@
         </w:rPr>
         <w:lastRenderedPageBreak/>
         <w:drawing>
-          <wp:inline distT="0" distB="0" distL="0" distR="0" wp14:anchorId="0A423951" wp14:editId="2B0D31D5">
+          <wp:inline distT="0" distB="0" distL="0" distR="0" wp14:anchorId="31D56FA3" wp14:editId="74133181">
             <wp:extent cx="5120640" cy="4627581"/>
             <wp:effectExtent l="19050" t="19050" r="22860" b="20955"/>
-            <wp:docPr id="1365162854" name="Imagem 33"/>
+            <wp:docPr id="951039801" name="Imagem 33"/>
             <wp:cNvGraphicFramePr/>
             <a:graphic xmlns:a="http://schemas.openxmlformats.org/drawingml/2006/main">
               <a:graphicData uri="http://schemas.openxmlformats.org/drawingml/2006/picture">
                 <pic:pic xmlns:pic="http://schemas.openxmlformats.org/drawingml/2006/picture">
                   <pic:nvPicPr>
-                    <pic:cNvPr id="1365162854" name=""/>
+                    <pic:cNvPr id="951039801" name=""/>
                     <pic:cNvPicPr/>
                   </pic:nvPicPr>
                   <pic:blipFill>
@@ -12226,16 +12283,16 @@
         </w:rPr>
         <w:lastRenderedPageBreak/>
         <w:drawing>
-          <wp:inline distT="0" distB="0" distL="0" distR="0" wp14:anchorId="2BEA04F1" wp14:editId="3648DB04">
+          <wp:inline distT="0" distB="0" distL="0" distR="0" wp14:anchorId="5936DF7A" wp14:editId="18F789AB">
             <wp:extent cx="5120640" cy="3282818"/>
             <wp:effectExtent l="19050" t="19050" r="22860" b="13335"/>
-            <wp:docPr id="1098376221" name="Imagem 34"/>
+            <wp:docPr id="1371507500" name="Imagem 34"/>
             <wp:cNvGraphicFramePr/>
             <a:graphic xmlns:a="http://schemas.openxmlformats.org/drawingml/2006/main">
               <a:graphicData uri="http://schemas.openxmlformats.org/drawingml/2006/picture">
                 <pic:pic xmlns:pic="http://schemas.openxmlformats.org/drawingml/2006/picture">
                   <pic:nvPicPr>
-                    <pic:cNvPr id="1098376221" name=""/>
+                    <pic:cNvPr id="1371507500" name=""/>
                     <pic:cNvPicPr/>
                   </pic:nvPicPr>
                   <pic:blipFill>
@@ -12328,7 +12385,7 @@
           <w:sz w:val="34"/>
         </w:rPr>
       </w:pPr>
-      <w:bookmarkStart w:id="27" w:name="_Toc236233266"/>
+      <w:bookmarkStart w:id="27" w:name="_Toc236234369"/>
       <w:r>
         <w:rPr>
           <w:rFonts w:ascii="Montserrat" w:hAnsi="Montserrat"/>
@@ -12388,7 +12445,7 @@
           <w:sz w:val="27"/>
         </w:rPr>
       </w:pPr>
-      <w:bookmarkStart w:id="28" w:name="_Toc236233267"/>
+      <w:bookmarkStart w:id="28" w:name="_Toc236234370"/>
       <w:r>
         <w:rPr>
           <w:rFonts w:ascii="Montserrat" w:hAnsi="Montserrat"/>
@@ -12428,16 +12485,16 @@
           <w:noProof/>
         </w:rPr>
         <w:drawing>
-          <wp:inline distT="0" distB="0" distL="0" distR="0" wp14:anchorId="74011A2D" wp14:editId="711391FD">
+          <wp:inline distT="0" distB="0" distL="0" distR="0" wp14:anchorId="14D44494" wp14:editId="19A12D4E">
             <wp:extent cx="5303520" cy="4792851"/>
             <wp:effectExtent l="19050" t="19050" r="11430" b="27305"/>
-            <wp:docPr id="1004573956" name="Imagem 35"/>
+            <wp:docPr id="528221885" name="Imagem 35"/>
             <wp:cNvGraphicFramePr/>
             <a:graphic xmlns:a="http://schemas.openxmlformats.org/drawingml/2006/main">
               <a:graphicData uri="http://schemas.openxmlformats.org/drawingml/2006/picture">
                 <pic:pic xmlns:pic="http://schemas.openxmlformats.org/drawingml/2006/picture">
                   <pic:nvPicPr>
-                    <pic:cNvPr id="1004573956" name=""/>
+                    <pic:cNvPr id="528221885" name=""/>
                     <pic:cNvPicPr/>
                   </pic:nvPicPr>
                   <pic:blipFill>
@@ -12506,7 +12563,7 @@
           <w:sz w:val="27"/>
         </w:rPr>
       </w:pPr>
-      <w:bookmarkStart w:id="29" w:name="_Toc236233268"/>
+      <w:bookmarkStart w:id="29" w:name="_Toc236234371"/>
       <w:r>
         <w:rPr>
           <w:rFonts w:ascii="Montserrat" w:hAnsi="Montserrat"/>
@@ -12546,16 +12603,16 @@
           <w:noProof/>
         </w:rPr>
         <w:drawing>
-          <wp:inline distT="0" distB="0" distL="0" distR="0" wp14:anchorId="31B0EE7A" wp14:editId="2EFC1783">
+          <wp:inline distT="0" distB="0" distL="0" distR="0" wp14:anchorId="4370C174" wp14:editId="195C0CD6">
             <wp:extent cx="5303520" cy="4792851"/>
             <wp:effectExtent l="19050" t="19050" r="11430" b="27305"/>
-            <wp:docPr id="1382399245" name="Imagem 36"/>
+            <wp:docPr id="842020047" name="Imagem 36"/>
             <wp:cNvGraphicFramePr/>
             <a:graphic xmlns:a="http://schemas.openxmlformats.org/drawingml/2006/main">
               <a:graphicData uri="http://schemas.openxmlformats.org/drawingml/2006/picture">
                 <pic:pic xmlns:pic="http://schemas.openxmlformats.org/drawingml/2006/picture">
                   <pic:nvPicPr>
-                    <pic:cNvPr id="1382399245" name=""/>
+                    <pic:cNvPr id="842020047" name=""/>
                     <pic:cNvPicPr/>
                   </pic:nvPicPr>
                   <pic:blipFill>
@@ -12623,7 +12680,7 @@
           <w:sz w:val="27"/>
         </w:rPr>
       </w:pPr>
-      <w:bookmarkStart w:id="30" w:name="_Toc236233269"/>
+      <w:bookmarkStart w:id="30" w:name="_Toc236234372"/>
       <w:r>
         <w:rPr>
           <w:rFonts w:ascii="Montserrat" w:hAnsi="Montserrat"/>
@@ -12664,16 +12721,16 @@
         </w:rPr>
         <w:lastRenderedPageBreak/>
         <w:drawing>
-          <wp:inline distT="0" distB="0" distL="0" distR="0" wp14:anchorId="08394D94" wp14:editId="79A4A768">
+          <wp:inline distT="0" distB="0" distL="0" distR="0" wp14:anchorId="50E995B1" wp14:editId="78FE7529">
             <wp:extent cx="5303520" cy="4792851"/>
             <wp:effectExtent l="19050" t="19050" r="11430" b="27305"/>
-            <wp:docPr id="625860520" name="Imagem 37"/>
+            <wp:docPr id="1543957808" name="Imagem 37"/>
             <wp:cNvGraphicFramePr/>
             <a:graphic xmlns:a="http://schemas.openxmlformats.org/drawingml/2006/main">
               <a:graphicData uri="http://schemas.openxmlformats.org/drawingml/2006/picture">
                 <pic:pic xmlns:pic="http://schemas.openxmlformats.org/drawingml/2006/picture">
                   <pic:nvPicPr>
-                    <pic:cNvPr id="625860520" name=""/>
+                    <pic:cNvPr id="1543957808" name=""/>
                     <pic:cNvPicPr/>
                   </pic:nvPicPr>
                   <pic:blipFill>
@@ -12741,16 +12798,16 @@
         </w:rPr>
         <w:lastRenderedPageBreak/>
         <w:drawing>
-          <wp:inline distT="0" distB="0" distL="0" distR="0" wp14:anchorId="145488D9" wp14:editId="7ABF0D69">
+          <wp:inline distT="0" distB="0" distL="0" distR="0" wp14:anchorId="6DC410E2" wp14:editId="72A6246E">
             <wp:extent cx="5303520" cy="4792851"/>
             <wp:effectExtent l="19050" t="19050" r="11430" b="27305"/>
-            <wp:docPr id="655116651" name="Imagem 38"/>
+            <wp:docPr id="1663763347" name="Imagem 38"/>
             <wp:cNvGraphicFramePr/>
             <a:graphic xmlns:a="http://schemas.openxmlformats.org/drawingml/2006/main">
               <a:graphicData uri="http://schemas.openxmlformats.org/drawingml/2006/picture">
                 <pic:pic xmlns:pic="http://schemas.openxmlformats.org/drawingml/2006/picture">
                   <pic:nvPicPr>
-                    <pic:cNvPr id="655116651" name=""/>
+                    <pic:cNvPr id="1663763347" name=""/>
                     <pic:cNvPicPr/>
                   </pic:nvPicPr>
                   <pic:blipFill>
@@ -12843,7 +12900,7 @@
           <w:sz w:val="34"/>
         </w:rPr>
       </w:pPr>
-      <w:bookmarkStart w:id="31" w:name="_Toc236233270"/>
+      <w:bookmarkStart w:id="31" w:name="_Toc236234373"/>
       <w:r>
         <w:rPr>
           <w:rFonts w:ascii="Montserrat" w:hAnsi="Montserrat"/>
@@ -12885,7 +12942,7 @@
           <w:sz w:val="27"/>
         </w:rPr>
       </w:pPr>
-      <w:bookmarkStart w:id="32" w:name="_Toc236233271"/>
+      <w:bookmarkStart w:id="32" w:name="_Toc236234374"/>
       <w:r>
         <w:rPr>
           <w:rFonts w:ascii="Montserrat" w:hAnsi="Montserrat"/>
@@ -12925,16 +12982,16 @@
           <w:noProof/>
         </w:rPr>
         <w:drawing>
-          <wp:inline distT="0" distB="0" distL="0" distR="0" wp14:anchorId="787478FF" wp14:editId="6170DB9C">
+          <wp:inline distT="0" distB="0" distL="0" distR="0" wp14:anchorId="4B195839" wp14:editId="3A8626A1">
             <wp:extent cx="5303520" cy="4792851"/>
             <wp:effectExtent l="19050" t="19050" r="11430" b="27305"/>
-            <wp:docPr id="262669720" name="Imagem 39"/>
+            <wp:docPr id="1462847511" name="Imagem 39"/>
             <wp:cNvGraphicFramePr/>
             <a:graphic xmlns:a="http://schemas.openxmlformats.org/drawingml/2006/main">
               <a:graphicData uri="http://schemas.openxmlformats.org/drawingml/2006/picture">
                 <pic:pic xmlns:pic="http://schemas.openxmlformats.org/drawingml/2006/picture">
                   <pic:nvPicPr>
-                    <pic:cNvPr id="262669720" name=""/>
+                    <pic:cNvPr id="1462847511" name=""/>
                     <pic:cNvPicPr/>
                   </pic:nvPicPr>
                   <pic:blipFill>
@@ -13002,7 +13059,7 @@
           <w:sz w:val="27"/>
         </w:rPr>
       </w:pPr>
-      <w:bookmarkStart w:id="33" w:name="_Toc236233272"/>
+      <w:bookmarkStart w:id="33" w:name="_Toc236234375"/>
       <w:r>
         <w:rPr>
           <w:rFonts w:ascii="Montserrat" w:hAnsi="Montserrat"/>
@@ -13043,16 +13100,16 @@
         </w:rPr>
         <w:lastRenderedPageBreak/>
         <w:drawing>
-          <wp:inline distT="0" distB="0" distL="0" distR="0" wp14:anchorId="63D788D3" wp14:editId="00F5FAC8">
+          <wp:inline distT="0" distB="0" distL="0" distR="0" wp14:anchorId="1EDFB4FA" wp14:editId="7C3A6947">
             <wp:extent cx="5303520" cy="4792851"/>
             <wp:effectExtent l="19050" t="19050" r="11430" b="27305"/>
-            <wp:docPr id="559228622" name="Imagem 40"/>
+            <wp:docPr id="123475843" name="Imagem 40"/>
             <wp:cNvGraphicFramePr/>
             <a:graphic xmlns:a="http://schemas.openxmlformats.org/drawingml/2006/main">
               <a:graphicData uri="http://schemas.openxmlformats.org/drawingml/2006/picture">
                 <pic:pic xmlns:pic="http://schemas.openxmlformats.org/drawingml/2006/picture">
                   <pic:nvPicPr>
-                    <pic:cNvPr id="559228622" name=""/>
+                    <pic:cNvPr id="123475843" name=""/>
                     <pic:cNvPicPr/>
                   </pic:nvPicPr>
                   <pic:blipFill>
@@ -13120,7 +13177,7 @@
           <w:sz w:val="27"/>
         </w:rPr>
       </w:pPr>
-      <w:bookmarkStart w:id="34" w:name="_Toc236233273"/>
+      <w:bookmarkStart w:id="34" w:name="_Toc236234376"/>
       <w:r>
         <w:rPr>
           <w:rFonts w:ascii="Montserrat" w:hAnsi="Montserrat"/>
@@ -13161,16 +13218,16 @@
         </w:rPr>
         <w:lastRenderedPageBreak/>
         <w:drawing>
-          <wp:inline distT="0" distB="0" distL="0" distR="0" wp14:anchorId="767985D8" wp14:editId="7C5463EF">
+          <wp:inline distT="0" distB="0" distL="0" distR="0" wp14:anchorId="134C1492" wp14:editId="1BEF6F7E">
             <wp:extent cx="5303520" cy="4792851"/>
             <wp:effectExtent l="19050" t="19050" r="11430" b="27305"/>
-            <wp:docPr id="1571979548" name="Imagem 41"/>
+            <wp:docPr id="583644536" name="Imagem 41"/>
             <wp:cNvGraphicFramePr/>
             <a:graphic xmlns:a="http://schemas.openxmlformats.org/drawingml/2006/main">
               <a:graphicData uri="http://schemas.openxmlformats.org/drawingml/2006/picture">
                 <pic:pic xmlns:pic="http://schemas.openxmlformats.org/drawingml/2006/picture">
                   <pic:nvPicPr>
-                    <pic:cNvPr id="1571979548" name=""/>
+                    <pic:cNvPr id="583644536" name=""/>
                     <pic:cNvPicPr/>
                   </pic:nvPicPr>
                   <pic:blipFill>
@@ -13242,7 +13299,7 @@
           <w:sz w:val="34"/>
         </w:rPr>
       </w:pPr>
-      <w:bookmarkStart w:id="35" w:name="_Toc236233274"/>
+      <w:bookmarkStart w:id="35" w:name="_Toc236234377"/>
       <w:r>
         <w:rPr>
           <w:rFonts w:ascii="Montserrat" w:hAnsi="Montserrat"/>
@@ -13486,7 +13543,7 @@
           <w:sz w:val="34"/>
         </w:rPr>
       </w:pPr>
-      <w:bookmarkStart w:id="36" w:name="_Toc236233275"/>
+      <w:bookmarkStart w:id="36" w:name="_Toc236234378"/>
       <w:r>
         <w:rPr>
           <w:rFonts w:ascii="Montserrat" w:hAnsi="Montserrat"/>
@@ -15308,7 +15365,7 @@
 <file path=word/numbering.xml><?xml version="1.0" encoding="utf-8"?>
 <w:numbering xmlns:wpc="http://schemas.microsoft.com/office/word/2010/wordprocessingCanvas" xmlns:cx="http://schemas.microsoft.com/office/drawing/2014/chartex" xmlns:cx1="http://schemas.microsoft.com/office/drawing/2015/9/8/chartex" xmlns:cx2="http://schemas.microsoft.com/office/drawing/2015/10/21/chartex" xmlns:cx3="http://schemas.microsoft.com/office/drawing/2016/5/9/chartex" xmlns:cx4="http://schemas.microsoft.com/office/drawing/2016/5/10/chartex" xmlns:cx5="http://schemas.microsoft.com/office/drawing/2016/5/11/chartex" xmlns:cx6="http://schemas.microsoft.com/office/drawing/2016/5/12/chartex" xmlns:cx7="http://schemas.microsoft.com/office/drawing/2016/5/13/chartex" xmlns:cx8="http://schemas.microsoft.com/office/drawing/2016/5/14/chartex" xmlns:mc="http://schemas.openxmlformats.org/markup-compatibility/2006" xmlns:aink="http://schemas.microsoft.com/office/drawing/2016/ink" xmlns:am3d="http://schemas.microsoft.com/office/drawing/2017/model3d" xmlns:o="urn:schemas-microsoft-com:office:office" xmlns:oel="http://schemas.microsoft.com/office/2019/extlst" xmlns:r="http://schemas.openxmlformats.org/officeDocument/2006/relationships" xmlns:m="http://schemas.openxmlformats.org/officeDocument/2006/math" xmlns:v="urn:schemas-microsoft-com:vml" xmlns:wp14="http://schemas.microsoft.com/office/word/2010/wordprocessingDrawing" xmlns:wp="http://schemas.openxmlformats.org/drawingml/2006/wordprocessingDrawing" xmlns:w10="urn:schemas-microsoft-com:office:word" xmlns:w="http://schemas.openxmlformats.org/wordprocessingml/2006/main" xmlns:w14="http://schemas.microsoft.com/office/word/2010/wordml" xmlns:w15="http://schemas.microsoft.com/office/word/2012/wordml" xmlns:w16cei="http://schemas.microsoft.com/office/word/2026/wordml/cei" xmlns:w16cex="http://schemas.microsoft.com/office/word/2018/wordml/cex" xmlns:w16cid="http://schemas.microsoft.com/office/word/2016/wordml/cid" xmlns:w16="http://schemas.microsoft.com/office/word/2018/wordml" xmlns:w16du="http://schemas.microsoft.com/office/word/2023/wordml/word16du" xmlns:w16sdtdh="http://schemas.microsoft.com/office/word/2020/wordml/sdtdatahash" xmlns:w16sdtfl="http://schemas.microsoft.com/office/word/2024/wordml/sdtformatlock" xmlns:w16se="http://schemas.microsoft.com/office/word/2015/wordml/symex" xmlns:wpg="http://schemas.microsoft.com/office/word/2010/wordprocessingGroup" xmlns:wpi="http://schemas.microsoft.com/office/word/2010/wordprocessingInk" xmlns:wne="http://schemas.microsoft.com/office/word/2006/wordml" xmlns:wps="http://schemas.microsoft.com/office/word/2010/wordprocessingShape" mc:Ignorable="w14 w15 w16se w16cid w16 w16cex w16sdtdh w16sdtfl w16du wp14">
   <w:abstractNum w:abstractNumId="0" w15:restartNumberingAfterBreak="0">
-    <w:nsid w:val="03F74DB1"/>
+    <w:nsid w:val="1EF97360"/>
     <w:multiLevelType w:val="singleLevel"/>
     <w:tmpl w:val="04160001"/>
     <w:lvl w:ilvl="0">
@@ -15325,7 +15382,7 @@
     </w:lvl>
   </w:abstractNum>
   <w:abstractNum w:abstractNumId="1" w15:restartNumberingAfterBreak="0">
-    <w:nsid w:val="0E2272AD"/>
+    <w:nsid w:val="1FDC6781"/>
     <w:multiLevelType w:val="singleLevel"/>
     <w:tmpl w:val="04160001"/>
     <w:lvl w:ilvl="0">
@@ -15342,7 +15399,7 @@
     </w:lvl>
   </w:abstractNum>
   <w:abstractNum w:abstractNumId="2" w15:restartNumberingAfterBreak="0">
-    <w:nsid w:val="0FA149BE"/>
+    <w:nsid w:val="28D52674"/>
     <w:multiLevelType w:val="singleLevel"/>
     <w:tmpl w:val="04160001"/>
     <w:lvl w:ilvl="0">
@@ -15359,7 +15416,7 @@
     </w:lvl>
   </w:abstractNum>
   <w:abstractNum w:abstractNumId="3" w15:restartNumberingAfterBreak="0">
-    <w:nsid w:val="147B6B56"/>
+    <w:nsid w:val="2E344AD4"/>
     <w:multiLevelType w:val="singleLevel"/>
     <w:tmpl w:val="04160001"/>
     <w:lvl w:ilvl="0">
@@ -15376,7 +15433,7 @@
     </w:lvl>
   </w:abstractNum>
   <w:abstractNum w:abstractNumId="4" w15:restartNumberingAfterBreak="0">
-    <w:nsid w:val="1ED8780F"/>
+    <w:nsid w:val="31054254"/>
     <w:multiLevelType w:val="singleLevel"/>
     <w:tmpl w:val="04160001"/>
     <w:lvl w:ilvl="0">
@@ -15393,7 +15450,7 @@
     </w:lvl>
   </w:abstractNum>
   <w:abstractNum w:abstractNumId="5" w15:restartNumberingAfterBreak="0">
-    <w:nsid w:val="224B575B"/>
+    <w:nsid w:val="36650CAF"/>
     <w:multiLevelType w:val="singleLevel"/>
     <w:tmpl w:val="04160001"/>
     <w:lvl w:ilvl="0">
@@ -15410,7 +15467,7 @@
     </w:lvl>
   </w:abstractNum>
   <w:abstractNum w:abstractNumId="6" w15:restartNumberingAfterBreak="0">
-    <w:nsid w:val="25862CC8"/>
+    <w:nsid w:val="374D3770"/>
     <w:multiLevelType w:val="singleLevel"/>
     <w:tmpl w:val="04160001"/>
     <w:lvl w:ilvl="0">
@@ -15427,7 +15484,7 @@
     </w:lvl>
   </w:abstractNum>
   <w:abstractNum w:abstractNumId="7" w15:restartNumberingAfterBreak="0">
-    <w:nsid w:val="364B09E0"/>
+    <w:nsid w:val="38F3705D"/>
     <w:multiLevelType w:val="singleLevel"/>
     <w:tmpl w:val="04160001"/>
     <w:lvl w:ilvl="0">
@@ -15444,7 +15501,7 @@
     </w:lvl>
   </w:abstractNum>
   <w:abstractNum w:abstractNumId="8" w15:restartNumberingAfterBreak="0">
-    <w:nsid w:val="3D52370F"/>
+    <w:nsid w:val="3D8E3560"/>
     <w:multiLevelType w:val="singleLevel"/>
     <w:tmpl w:val="04160001"/>
     <w:lvl w:ilvl="0">
@@ -15461,7 +15518,7 @@
     </w:lvl>
   </w:abstractNum>
   <w:abstractNum w:abstractNumId="9" w15:restartNumberingAfterBreak="0">
-    <w:nsid w:val="3D8021C9"/>
+    <w:nsid w:val="49A46208"/>
     <w:multiLevelType w:val="singleLevel"/>
     <w:tmpl w:val="04160001"/>
     <w:lvl w:ilvl="0">
@@ -15478,7 +15535,7 @@
     </w:lvl>
   </w:abstractNum>
   <w:abstractNum w:abstractNumId="10" w15:restartNumberingAfterBreak="0">
-    <w:nsid w:val="631F6E12"/>
+    <w:nsid w:val="61E026DA"/>
     <w:multiLevelType w:val="singleLevel"/>
     <w:tmpl w:val="04160001"/>
     <w:lvl w:ilvl="0">
@@ -15495,7 +15552,7 @@
     </w:lvl>
   </w:abstractNum>
   <w:abstractNum w:abstractNumId="11" w15:restartNumberingAfterBreak="0">
-    <w:nsid w:val="7A6246DB"/>
+    <w:nsid w:val="68B53111"/>
     <w:multiLevelType w:val="singleLevel"/>
     <w:tmpl w:val="04160001"/>
     <w:lvl w:ilvl="0">
@@ -15512,7 +15569,7 @@
     </w:lvl>
   </w:abstractNum>
   <w:abstractNum w:abstractNumId="12" w15:restartNumberingAfterBreak="0">
-    <w:nsid w:val="7AC353B8"/>
+    <w:nsid w:val="6D4D7877"/>
     <w:multiLevelType w:val="singleLevel"/>
     <w:tmpl w:val="04160001"/>
     <w:lvl w:ilvl="0">
@@ -15529,7 +15586,7 @@
     </w:lvl>
   </w:abstractNum>
   <w:abstractNum w:abstractNumId="13" w15:restartNumberingAfterBreak="0">
-    <w:nsid w:val="7D737B80"/>
+    <w:nsid w:val="764A38E5"/>
     <w:multiLevelType w:val="singleLevel"/>
     <w:tmpl w:val="04160001"/>
     <w:lvl w:ilvl="0">
@@ -15545,47 +15602,47 @@
       </w:rPr>
     </w:lvl>
   </w:abstractNum>
-  <w:num w:numId="1" w16cid:durableId="1384602901">
+  <w:num w:numId="1" w16cid:durableId="1104569275">
+    <w:abstractNumId w:val="6"/>
+  </w:num>
+  <w:num w:numId="2" w16cid:durableId="1015300766">
+    <w:abstractNumId w:val="10"/>
+  </w:num>
+  <w:num w:numId="3" w16cid:durableId="1417705944">
+    <w:abstractNumId w:val="1"/>
+  </w:num>
+  <w:num w:numId="4" w16cid:durableId="385762629">
     <w:abstractNumId w:val="8"/>
   </w:num>
-  <w:num w:numId="2" w16cid:durableId="1379083232">
-    <w:abstractNumId w:val="0"/>
+  <w:num w:numId="5" w16cid:durableId="1816490282">
+    <w:abstractNumId w:val="7"/>
   </w:num>
-  <w:num w:numId="3" w16cid:durableId="19363555">
+  <w:num w:numId="6" w16cid:durableId="1448084481">
     <w:abstractNumId w:val="9"/>
   </w:num>
-  <w:num w:numId="4" w16cid:durableId="1829318755">
+  <w:num w:numId="7" w16cid:durableId="934945831">
+    <w:abstractNumId w:val="3"/>
+  </w:num>
+  <w:num w:numId="8" w16cid:durableId="1396195199">
+    <w:abstractNumId w:val="4"/>
+  </w:num>
+  <w:num w:numId="9" w16cid:durableId="778137388">
+    <w:abstractNumId w:val="2"/>
+  </w:num>
+  <w:num w:numId="10" w16cid:durableId="828860247">
+    <w:abstractNumId w:val="5"/>
+  </w:num>
+  <w:num w:numId="11" w16cid:durableId="734933091">
+    <w:abstractNumId w:val="13"/>
+  </w:num>
+  <w:num w:numId="12" w16cid:durableId="2006085271">
+    <w:abstractNumId w:val="11"/>
+  </w:num>
+  <w:num w:numId="13" w16cid:durableId="1446345612">
     <w:abstractNumId w:val="12"/>
   </w:num>
-  <w:num w:numId="5" w16cid:durableId="1020205458">
-    <w:abstractNumId w:val="5"/>
-  </w:num>
-  <w:num w:numId="6" w16cid:durableId="333458275">
-    <w:abstractNumId w:val="7"/>
-  </w:num>
-  <w:num w:numId="7" w16cid:durableId="2008559852">
-    <w:abstractNumId w:val="13"/>
-  </w:num>
-  <w:num w:numId="8" w16cid:durableId="1265648631">
-    <w:abstractNumId w:val="1"/>
-  </w:num>
-  <w:num w:numId="9" w16cid:durableId="1888951698">
-    <w:abstractNumId w:val="2"/>
-  </w:num>
-  <w:num w:numId="10" w16cid:durableId="1837572872">
-    <w:abstractNumId w:val="6"/>
-  </w:num>
-  <w:num w:numId="11" w16cid:durableId="1983265886">
-    <w:abstractNumId w:val="4"/>
-  </w:num>
-  <w:num w:numId="12" w16cid:durableId="1423338890">
-    <w:abstractNumId w:val="3"/>
-  </w:num>
-  <w:num w:numId="13" w16cid:durableId="277487246">
-    <w:abstractNumId w:val="10"/>
-  </w:num>
-  <w:num w:numId="14" w16cid:durableId="896890757">
-    <w:abstractNumId w:val="11"/>
+  <w:num w:numId="14" w16cid:durableId="2138446416">
+    <w:abstractNumId w:val="0"/>
   </w:num>
 </w:numbering>
 </file>
@@ -15998,7 +16055,7 @@
     <w:link w:val="Ttulo1Char"/>
     <w:uiPriority w:val="9"/>
     <w:qFormat/>
-    <w:rsid w:val="0012142D"/>
+    <w:rsid w:val="00C610CC"/>
     <w:pPr>
       <w:keepNext/>
       <w:keepLines/>
@@ -16020,7 +16077,7 @@
     <w:uiPriority w:val="9"/>
     <w:unhideWhenUsed/>
     <w:qFormat/>
-    <w:rsid w:val="0012142D"/>
+    <w:rsid w:val="00C610CC"/>
     <w:pPr>
       <w:keepNext/>
       <w:keepLines/>
@@ -16043,7 +16100,7 @@
     <w:semiHidden/>
     <w:unhideWhenUsed/>
     <w:qFormat/>
-    <w:rsid w:val="0012142D"/>
+    <w:rsid w:val="00C610CC"/>
     <w:pPr>
       <w:keepNext/>
       <w:keepLines/>
@@ -16066,7 +16123,7 @@
     <w:semiHidden/>
     <w:unhideWhenUsed/>
     <w:qFormat/>
-    <w:rsid w:val="0012142D"/>
+    <w:rsid w:val="00C610CC"/>
     <w:pPr>
       <w:keepNext/>
       <w:keepLines/>
@@ -16089,7 +16146,7 @@
     <w:semiHidden/>
     <w:unhideWhenUsed/>
     <w:qFormat/>
-    <w:rsid w:val="0012142D"/>
+    <w:rsid w:val="00C610CC"/>
     <w:pPr>
       <w:keepNext/>
       <w:keepLines/>
@@ -16110,7 +16167,7 @@
     <w:semiHidden/>
     <w:unhideWhenUsed/>
     <w:qFormat/>
-    <w:rsid w:val="0012142D"/>
+    <w:rsid w:val="00C610CC"/>
     <w:pPr>
       <w:keepNext/>
       <w:keepLines/>
@@ -16133,7 +16190,7 @@
     <w:semiHidden/>
     <w:unhideWhenUsed/>
     <w:qFormat/>
-    <w:rsid w:val="0012142D"/>
+    <w:rsid w:val="00C610CC"/>
     <w:pPr>
       <w:keepNext/>
       <w:keepLines/>
@@ -16154,7 +16211,7 @@
     <w:semiHidden/>
     <w:unhideWhenUsed/>
     <w:qFormat/>
-    <w:rsid w:val="0012142D"/>
+    <w:rsid w:val="00C610CC"/>
     <w:pPr>
       <w:keepNext/>
       <w:keepLines/>
@@ -16177,7 +16234,7 @@
     <w:semiHidden/>
     <w:unhideWhenUsed/>
     <w:qFormat/>
-    <w:rsid w:val="0012142D"/>
+    <w:rsid w:val="00C610CC"/>
     <w:pPr>
       <w:keepNext/>
       <w:keepLines/>
@@ -16221,7 +16278,7 @@
     <w:basedOn w:val="Fontepargpadro"/>
     <w:link w:val="Ttulo1"/>
     <w:uiPriority w:val="9"/>
-    <w:rsid w:val="0012142D"/>
+    <w:rsid w:val="00C610CC"/>
     <w:rPr>
       <w:rFonts w:asciiTheme="majorHAnsi" w:eastAsiaTheme="majorEastAsia" w:hAnsiTheme="majorHAnsi" w:cstheme="majorBidi"/>
       <w:color w:val="0F4761" w:themeColor="accent1" w:themeShade="BF"/>
@@ -16234,7 +16291,7 @@
     <w:basedOn w:val="Fontepargpadro"/>
     <w:link w:val="Ttulo2"/>
     <w:uiPriority w:val="9"/>
-    <w:rsid w:val="0012142D"/>
+    <w:rsid w:val="00C610CC"/>
     <w:rPr>
       <w:rFonts w:asciiTheme="majorHAnsi" w:eastAsiaTheme="majorEastAsia" w:hAnsiTheme="majorHAnsi" w:cstheme="majorBidi"/>
       <w:color w:val="0F4761" w:themeColor="accent1" w:themeShade="BF"/>
@@ -16248,7 +16305,7 @@
     <w:link w:val="Ttulo3"/>
     <w:uiPriority w:val="9"/>
     <w:semiHidden/>
-    <w:rsid w:val="0012142D"/>
+    <w:rsid w:val="00C610CC"/>
     <w:rPr>
       <w:rFonts w:eastAsiaTheme="majorEastAsia" w:cstheme="majorBidi"/>
       <w:color w:val="0F4761" w:themeColor="accent1" w:themeShade="BF"/>
@@ -16262,7 +16319,7 @@
     <w:link w:val="Ttulo4"/>
     <w:uiPriority w:val="9"/>
     <w:semiHidden/>
-    <w:rsid w:val="0012142D"/>
+    <w:rsid w:val="00C610CC"/>
     <w:rPr>
       <w:rFonts w:eastAsiaTheme="majorEastAsia" w:cstheme="majorBidi"/>
       <w:i/>
@@ -16276,7 +16333,7 @@
     <w:link w:val="Ttulo5"/>
     <w:uiPriority w:val="9"/>
     <w:semiHidden/>
-    <w:rsid w:val="0012142D"/>
+    <w:rsid w:val="00C610CC"/>
     <w:rPr>
       <w:rFonts w:eastAsiaTheme="majorEastAsia" w:cstheme="majorBidi"/>
       <w:color w:val="0F4761" w:themeColor="accent1" w:themeShade="BF"/>
@@ -16288,7 +16345,7 @@
     <w:link w:val="Ttulo6"/>
     <w:uiPriority w:val="9"/>
     <w:semiHidden/>
-    <w:rsid w:val="0012142D"/>
+    <w:rsid w:val="00C610CC"/>
     <w:rPr>
       <w:rFonts w:eastAsiaTheme="majorEastAsia" w:cstheme="majorBidi"/>
       <w:i/>
@@ -16302,7 +16359,7 @@
     <w:link w:val="Ttulo7"/>
     <w:uiPriority w:val="9"/>
     <w:semiHidden/>
-    <w:rsid w:val="0012142D"/>
+    <w:rsid w:val="00C610CC"/>
     <w:rPr>
       <w:rFonts w:eastAsiaTheme="majorEastAsia" w:cstheme="majorBidi"/>
       <w:color w:val="595959" w:themeColor="text1" w:themeTint="A6"/>
@@ -16314,7 +16371,7 @@
     <w:link w:val="Ttulo8"/>
     <w:uiPriority w:val="9"/>
     <w:semiHidden/>
-    <w:rsid w:val="0012142D"/>
+    <w:rsid w:val="00C610CC"/>
     <w:rPr>
       <w:rFonts w:eastAsiaTheme="majorEastAsia" w:cstheme="majorBidi"/>
       <w:i/>
@@ -16328,7 +16385,7 @@
     <w:link w:val="Ttulo9"/>
     <w:uiPriority w:val="9"/>
     <w:semiHidden/>
-    <w:rsid w:val="0012142D"/>
+    <w:rsid w:val="00C610CC"/>
     <w:rPr>
       <w:rFonts w:eastAsiaTheme="majorEastAsia" w:cstheme="majorBidi"/>
       <w:color w:val="272727" w:themeColor="text1" w:themeTint="D8"/>
@@ -16341,7 +16398,7 @@
     <w:link w:val="TtuloChar"/>
     <w:uiPriority w:val="10"/>
     <w:qFormat/>
-    <w:rsid w:val="0012142D"/>
+    <w:rsid w:val="00C610CC"/>
     <w:pPr>
       <w:spacing w:after="80" w:line="240" w:lineRule="auto"/>
       <w:contextualSpacing/>
@@ -16359,7 +16416,7 @@
     <w:basedOn w:val="Fontepargpadro"/>
     <w:link w:val="Ttulo"/>
     <w:uiPriority w:val="10"/>
-    <w:rsid w:val="0012142D"/>
+    <w:rsid w:val="00C610CC"/>
     <w:rPr>
       <w:rFonts w:asciiTheme="majorHAnsi" w:eastAsiaTheme="majorEastAsia" w:hAnsiTheme="majorHAnsi" w:cstheme="majorBidi"/>
       <w:spacing w:val="-10"/>
@@ -16375,7 +16432,7 @@
     <w:link w:val="SubttuloChar"/>
     <w:uiPriority w:val="11"/>
     <w:qFormat/>
-    <w:rsid w:val="0012142D"/>
+    <w:rsid w:val="00C610CC"/>
     <w:pPr>
       <w:numPr>
         <w:ilvl w:val="1"/>
@@ -16394,7 +16451,7 @@
     <w:basedOn w:val="Fontepargpadro"/>
     <w:link w:val="Subttulo"/>
     <w:uiPriority w:val="11"/>
-    <w:rsid w:val="0012142D"/>
+    <w:rsid w:val="00C610CC"/>
     <w:rPr>
       <w:rFonts w:eastAsiaTheme="majorEastAsia" w:cstheme="majorBidi"/>
       <w:color w:val="595959" w:themeColor="text1" w:themeTint="A6"/>
@@ -16410,7 +16467,7 @@
     <w:link w:val="CitaoChar"/>
     <w:uiPriority w:val="29"/>
     <w:qFormat/>
-    <w:rsid w:val="0012142D"/>
+    <w:rsid w:val="00C610CC"/>
     <w:pPr>
       <w:spacing w:before="160"/>
       <w:jc w:val="center"/>
@@ -16426,7 +16483,7 @@
     <w:basedOn w:val="Fontepargpadro"/>
     <w:link w:val="Citao"/>
     <w:uiPriority w:val="29"/>
-    <w:rsid w:val="0012142D"/>
+    <w:rsid w:val="00C610CC"/>
     <w:rPr>
       <w:i/>
       <w:iCs/>
@@ -16438,7 +16495,7 @@
     <w:basedOn w:val="Normal"/>
     <w:uiPriority w:val="34"/>
     <w:qFormat/>
-    <w:rsid w:val="0012142D"/>
+    <w:rsid w:val="00C610CC"/>
     <w:pPr>
       <w:ind w:left="720"/>
       <w:contextualSpacing/>
@@ -16449,7 +16506,7 @@
     <w:basedOn w:val="Fontepargpadro"/>
     <w:uiPriority w:val="21"/>
     <w:qFormat/>
-    <w:rsid w:val="0012142D"/>
+    <w:rsid w:val="00C610CC"/>
     <w:rPr>
       <w:i/>
       <w:iCs/>
@@ -16463,7 +16520,7 @@
     <w:link w:val="CitaoIntensaChar"/>
     <w:uiPriority w:val="30"/>
     <w:qFormat/>
-    <w:rsid w:val="0012142D"/>
+    <w:rsid w:val="00C610CC"/>
     <w:pPr>
       <w:pBdr>
         <w:top w:val="single" w:sz="4" w:space="10" w:color="0F4761" w:themeColor="accent1" w:themeShade="BF"/>
@@ -16484,7 +16541,7 @@
     <w:basedOn w:val="Fontepargpadro"/>
     <w:link w:val="CitaoIntensa"/>
     <w:uiPriority w:val="30"/>
-    <w:rsid w:val="0012142D"/>
+    <w:rsid w:val="00C610CC"/>
     <w:rPr>
       <w:i/>
       <w:iCs/>
@@ -16496,7 +16553,7 @@
     <w:basedOn w:val="Fontepargpadro"/>
     <w:uiPriority w:val="32"/>
     <w:qFormat/>
-    <w:rsid w:val="0012142D"/>
+    <w:rsid w:val="00C610CC"/>
     <w:rPr>
       <w:b/>
       <w:bCs/>
@@ -16511,7 +16568,7 @@
     <w:link w:val="CabealhoChar"/>
     <w:uiPriority w:val="99"/>
     <w:unhideWhenUsed/>
-    <w:rsid w:val="0012142D"/>
+    <w:rsid w:val="00C610CC"/>
     <w:pPr>
       <w:tabs>
         <w:tab w:val="center" w:pos="4252"/>
@@ -16525,7 +16582,7 @@
     <w:basedOn w:val="Fontepargpadro"/>
     <w:link w:val="Cabealho"/>
     <w:uiPriority w:val="99"/>
-    <w:rsid w:val="0012142D"/>
+    <w:rsid w:val="00C610CC"/>
   </w:style>
   <w:style w:type="paragraph" w:styleId="Rodap">
     <w:name w:val="footer"/>
@@ -16533,7 +16590,7 @@
     <w:link w:val="RodapChar"/>
     <w:uiPriority w:val="99"/>
     <w:unhideWhenUsed/>
-    <w:rsid w:val="0012142D"/>
+    <w:rsid w:val="00C610CC"/>
     <w:pPr>
       <w:tabs>
         <w:tab w:val="center" w:pos="4252"/>
@@ -16547,7 +16604,7 @@
     <w:basedOn w:val="Fontepargpadro"/>
     <w:link w:val="Rodap"/>
     <w:uiPriority w:val="99"/>
-    <w:rsid w:val="0012142D"/>
+    <w:rsid w:val="00C610CC"/>
   </w:style>
   <w:style w:type="paragraph" w:styleId="Sumrio1">
     <w:name w:val="toc 1"/>
@@ -16556,7 +16613,7 @@
     <w:autoRedefine/>
     <w:uiPriority w:val="39"/>
     <w:unhideWhenUsed/>
-    <w:rsid w:val="0012142D"/>
+    <w:rsid w:val="00C610CC"/>
     <w:pPr>
       <w:spacing w:after="100"/>
     </w:pPr>
@@ -16568,7 +16625,7 @@
     <w:autoRedefine/>
     <w:uiPriority w:val="39"/>
     <w:unhideWhenUsed/>
-    <w:rsid w:val="0012142D"/>
+    <w:rsid w:val="00C610CC"/>
     <w:pPr>
       <w:spacing w:after="100"/>
       <w:ind w:left="240"/>

</xml_diff>

<commit_message>
Adiciona seletor de Projeto vinculado (Gate 1) aos formularios 11 e 12
Cada projeto listado no Relatorio de Situacao e cada projeto vinculado
no Relatorio de Entregas e Beneficios ganha um campo opcional
"Projeto vinculado (Gate 1)", usando o mesmo cadastro compartilhado
dos 7 formularios com restricao por equipe. A selecao preenche o nome
automaticamente e libera o "Ver historico" compartilhado - sem aplicar
a trava de equipe, mantendo o comportamento livre desses dois
formularios. Atualiza Regras de Acesso e Manual de Uso (v2.5) com a
nova regra e os prints.

Co-Authored-By: Claude Sonnet 5 <noreply@anthropic.com>
</commit_message>
<xml_diff>
--- a/Manual de Uso - Ferramenta de Gestao de Projetos.docx
+++ b/Manual de Uso - Ferramenta de Gestao de Projetos.docx
@@ -129,7 +129,7 @@
           <w:color w:val="6A6A70"/>
           <w:sz w:val="22"/>
         </w:rPr>
-        <w:t>Versao 2.4 - 29 de julho de 2026 (substitui a versao 2.3 de 29/07/2026)</w:t>
+        <w:t>Versao 2.5 - 29 de julho de 2026 (substitui a versao 2.4 de 29/07/2026)</w:t>
       </w:r>
     </w:p>
     <w:p>
@@ -229,7 +229,7 @@
         <w:rPr>
           <w:noProof/>
         </w:rPr>
-        <w:instrText xml:space="preserve"> PAGEREF _Toc236234342 \h </w:instrText>
+        <w:instrText xml:space="preserve"> PAGEREF _Toc236241935 \h </w:instrText>
       </w:r>
       <w:r>
         <w:rPr>
@@ -290,7 +290,7 @@
         <w:rPr>
           <w:noProof/>
         </w:rPr>
-        <w:instrText xml:space="preserve"> PAGEREF _Toc236234343 \h </w:instrText>
+        <w:instrText xml:space="preserve"> PAGEREF _Toc236241936 \h </w:instrText>
       </w:r>
       <w:r>
         <w:rPr>
@@ -351,7 +351,7 @@
         <w:rPr>
           <w:noProof/>
         </w:rPr>
-        <w:instrText xml:space="preserve"> PAGEREF _Toc236234344 \h </w:instrText>
+        <w:instrText xml:space="preserve"> PAGEREF _Toc236241937 \h </w:instrText>
       </w:r>
       <w:r>
         <w:rPr>
@@ -412,7 +412,7 @@
         <w:rPr>
           <w:noProof/>
         </w:rPr>
-        <w:instrText xml:space="preserve"> PAGEREF _Toc236234345 \h </w:instrText>
+        <w:instrText xml:space="preserve"> PAGEREF _Toc236241938 \h </w:instrText>
       </w:r>
       <w:r>
         <w:rPr>
@@ -473,7 +473,7 @@
         <w:rPr>
           <w:noProof/>
         </w:rPr>
-        <w:instrText xml:space="preserve"> PAGEREF _Toc236234346 \h </w:instrText>
+        <w:instrText xml:space="preserve"> PAGEREF _Toc236241939 \h </w:instrText>
       </w:r>
       <w:r>
         <w:rPr>
@@ -534,7 +534,7 @@
         <w:rPr>
           <w:noProof/>
         </w:rPr>
-        <w:instrText xml:space="preserve"> PAGEREF _Toc236234347 \h </w:instrText>
+        <w:instrText xml:space="preserve"> PAGEREF _Toc236241940 \h </w:instrText>
       </w:r>
       <w:r>
         <w:rPr>
@@ -595,7 +595,7 @@
         <w:rPr>
           <w:noProof/>
         </w:rPr>
-        <w:instrText xml:space="preserve"> PAGEREF _Toc236234348 \h </w:instrText>
+        <w:instrText xml:space="preserve"> PAGEREF _Toc236241941 \h </w:instrText>
       </w:r>
       <w:r>
         <w:rPr>
@@ -656,7 +656,7 @@
         <w:rPr>
           <w:noProof/>
         </w:rPr>
-        <w:instrText xml:space="preserve"> PAGEREF _Toc236234349 \h </w:instrText>
+        <w:instrText xml:space="preserve"> PAGEREF _Toc236241942 \h </w:instrText>
       </w:r>
       <w:r>
         <w:rPr>
@@ -717,7 +717,7 @@
         <w:rPr>
           <w:noProof/>
         </w:rPr>
-        <w:instrText xml:space="preserve"> PAGEREF _Toc236234350 \h </w:instrText>
+        <w:instrText xml:space="preserve"> PAGEREF _Toc236241943 \h </w:instrText>
       </w:r>
       <w:r>
         <w:rPr>
@@ -778,7 +778,7 @@
         <w:rPr>
           <w:noProof/>
         </w:rPr>
-        <w:instrText xml:space="preserve"> PAGEREF _Toc236234351 \h </w:instrText>
+        <w:instrText xml:space="preserve"> PAGEREF _Toc236241944 \h </w:instrText>
       </w:r>
       <w:r>
         <w:rPr>
@@ -839,7 +839,7 @@
         <w:rPr>
           <w:noProof/>
         </w:rPr>
-        <w:instrText xml:space="preserve"> PAGEREF _Toc236234352 \h </w:instrText>
+        <w:instrText xml:space="preserve"> PAGEREF _Toc236241945 \h </w:instrText>
       </w:r>
       <w:r>
         <w:rPr>
@@ -900,7 +900,7 @@
         <w:rPr>
           <w:noProof/>
         </w:rPr>
-        <w:instrText xml:space="preserve"> PAGEREF _Toc236234353 \h </w:instrText>
+        <w:instrText xml:space="preserve"> PAGEREF _Toc236241946 \h </w:instrText>
       </w:r>
       <w:r>
         <w:rPr>
@@ -917,7 +917,7 @@
         <w:rPr>
           <w:noProof/>
         </w:rPr>
-        <w:t>12</w:t>
+        <w:t>13</w:t>
       </w:r>
       <w:r>
         <w:rPr>
@@ -961,7 +961,7 @@
         <w:rPr>
           <w:noProof/>
         </w:rPr>
-        <w:instrText xml:space="preserve"> PAGEREF _Toc236234354 \h </w:instrText>
+        <w:instrText xml:space="preserve"> PAGEREF _Toc236241947 \h </w:instrText>
       </w:r>
       <w:r>
         <w:rPr>
@@ -1022,7 +1022,7 @@
         <w:rPr>
           <w:noProof/>
         </w:rPr>
-        <w:instrText xml:space="preserve"> PAGEREF _Toc236234355 \h </w:instrText>
+        <w:instrText xml:space="preserve"> PAGEREF _Toc236241948 \h </w:instrText>
       </w:r>
       <w:r>
         <w:rPr>
@@ -1083,7 +1083,7 @@
         <w:rPr>
           <w:noProof/>
         </w:rPr>
-        <w:instrText xml:space="preserve"> PAGEREF _Toc236234356 \h </w:instrText>
+        <w:instrText xml:space="preserve"> PAGEREF _Toc236241949 \h </w:instrText>
       </w:r>
       <w:r>
         <w:rPr>
@@ -1144,7 +1144,7 @@
         <w:rPr>
           <w:noProof/>
         </w:rPr>
-        <w:instrText xml:space="preserve"> PAGEREF _Toc236234357 \h </w:instrText>
+        <w:instrText xml:space="preserve"> PAGEREF _Toc236241950 \h </w:instrText>
       </w:r>
       <w:r>
         <w:rPr>
@@ -1205,7 +1205,7 @@
         <w:rPr>
           <w:noProof/>
         </w:rPr>
-        <w:instrText xml:space="preserve"> PAGEREF _Toc236234358 \h </w:instrText>
+        <w:instrText xml:space="preserve"> PAGEREF _Toc236241951 \h </w:instrText>
       </w:r>
       <w:r>
         <w:rPr>
@@ -1266,7 +1266,7 @@
         <w:rPr>
           <w:noProof/>
         </w:rPr>
-        <w:instrText xml:space="preserve"> PAGEREF _Toc236234359 \h </w:instrText>
+        <w:instrText xml:space="preserve"> PAGEREF _Toc236241952 \h </w:instrText>
       </w:r>
       <w:r>
         <w:rPr>
@@ -1327,7 +1327,7 @@
         <w:rPr>
           <w:noProof/>
         </w:rPr>
-        <w:instrText xml:space="preserve"> PAGEREF _Toc236234360 \h </w:instrText>
+        <w:instrText xml:space="preserve"> PAGEREF _Toc236241953 \h </w:instrText>
       </w:r>
       <w:r>
         <w:rPr>
@@ -1388,7 +1388,7 @@
         <w:rPr>
           <w:noProof/>
         </w:rPr>
-        <w:instrText xml:space="preserve"> PAGEREF _Toc236234361 \h </w:instrText>
+        <w:instrText xml:space="preserve"> PAGEREF _Toc236241954 \h </w:instrText>
       </w:r>
       <w:r>
         <w:rPr>
@@ -1449,7 +1449,7 @@
         <w:rPr>
           <w:noProof/>
         </w:rPr>
-        <w:instrText xml:space="preserve"> PAGEREF _Toc236234362 \h </w:instrText>
+        <w:instrText xml:space="preserve"> PAGEREF _Toc236241955 \h </w:instrText>
       </w:r>
       <w:r>
         <w:rPr>
@@ -1510,7 +1510,7 @@
         <w:rPr>
           <w:noProof/>
         </w:rPr>
-        <w:instrText xml:space="preserve"> PAGEREF _Toc236234363 \h </w:instrText>
+        <w:instrText xml:space="preserve"> PAGEREF _Toc236241956 \h </w:instrText>
       </w:r>
       <w:r>
         <w:rPr>
@@ -1571,7 +1571,7 @@
         <w:rPr>
           <w:noProof/>
         </w:rPr>
-        <w:instrText xml:space="preserve"> PAGEREF _Toc236234364 \h </w:instrText>
+        <w:instrText xml:space="preserve"> PAGEREF _Toc236241957 \h </w:instrText>
       </w:r>
       <w:r>
         <w:rPr>
@@ -1632,7 +1632,7 @@
         <w:rPr>
           <w:noProof/>
         </w:rPr>
-        <w:instrText xml:space="preserve"> PAGEREF _Toc236234365 \h </w:instrText>
+        <w:instrText xml:space="preserve"> PAGEREF _Toc236241958 \h </w:instrText>
       </w:r>
       <w:r>
         <w:rPr>
@@ -1693,7 +1693,7 @@
         <w:rPr>
           <w:noProof/>
         </w:rPr>
-        <w:instrText xml:space="preserve"> PAGEREF _Toc236234366 \h </w:instrText>
+        <w:instrText xml:space="preserve"> PAGEREF _Toc236241959 \h </w:instrText>
       </w:r>
       <w:r>
         <w:rPr>
@@ -1754,7 +1754,7 @@
         <w:rPr>
           <w:noProof/>
         </w:rPr>
-        <w:instrText xml:space="preserve"> PAGEREF _Toc236234367 \h </w:instrText>
+        <w:instrText xml:space="preserve"> PAGEREF _Toc236241960 \h </w:instrText>
       </w:r>
       <w:r>
         <w:rPr>
@@ -1816,7 +1816,7 @@
         <w:rPr>
           <w:noProof/>
         </w:rPr>
-        <w:instrText xml:space="preserve"> PAGEREF _Toc236234368 \h </w:instrText>
+        <w:instrText xml:space="preserve"> PAGEREF _Toc236241961 \h </w:instrText>
       </w:r>
       <w:r>
         <w:rPr>
@@ -1833,7 +1833,7 @@
         <w:rPr>
           <w:noProof/>
         </w:rPr>
-        <w:t>43</w:t>
+        <w:t>44</w:t>
       </w:r>
       <w:r>
         <w:rPr>
@@ -1877,7 +1877,7 @@
         <w:rPr>
           <w:noProof/>
         </w:rPr>
-        <w:instrText xml:space="preserve"> PAGEREF _Toc236234369 \h </w:instrText>
+        <w:instrText xml:space="preserve"> PAGEREF _Toc236241962 \h </w:instrText>
       </w:r>
       <w:r>
         <w:rPr>
@@ -1894,7 +1894,7 @@
         <w:rPr>
           <w:noProof/>
         </w:rPr>
-        <w:t>47</w:t>
+        <w:t>48</w:t>
       </w:r>
       <w:r>
         <w:rPr>
@@ -1938,7 +1938,7 @@
         <w:rPr>
           <w:noProof/>
         </w:rPr>
-        <w:instrText xml:space="preserve"> PAGEREF _Toc236234370 \h </w:instrText>
+        <w:instrText xml:space="preserve"> PAGEREF _Toc236241963 \h </w:instrText>
       </w:r>
       <w:r>
         <w:rPr>
@@ -1955,7 +1955,7 @@
         <w:rPr>
           <w:noProof/>
         </w:rPr>
-        <w:t>47</w:t>
+        <w:t>48</w:t>
       </w:r>
       <w:r>
         <w:rPr>
@@ -1999,7 +1999,7 @@
         <w:rPr>
           <w:noProof/>
         </w:rPr>
-        <w:instrText xml:space="preserve"> PAGEREF _Toc236234371 \h </w:instrText>
+        <w:instrText xml:space="preserve"> PAGEREF _Toc236241964 \h </w:instrText>
       </w:r>
       <w:r>
         <w:rPr>
@@ -2016,7 +2016,7 @@
         <w:rPr>
           <w:noProof/>
         </w:rPr>
-        <w:t>48</w:t>
+        <w:t>49</w:t>
       </w:r>
       <w:r>
         <w:rPr>
@@ -2060,7 +2060,7 @@
         <w:rPr>
           <w:noProof/>
         </w:rPr>
-        <w:instrText xml:space="preserve"> PAGEREF _Toc236234372 \h </w:instrText>
+        <w:instrText xml:space="preserve"> PAGEREF _Toc236241965 \h </w:instrText>
       </w:r>
       <w:r>
         <w:rPr>
@@ -2077,7 +2077,7 @@
         <w:rPr>
           <w:noProof/>
         </w:rPr>
-        <w:t>48</w:t>
+        <w:t>49</w:t>
       </w:r>
       <w:r>
         <w:rPr>
@@ -2121,7 +2121,7 @@
         <w:rPr>
           <w:noProof/>
         </w:rPr>
-        <w:instrText xml:space="preserve"> PAGEREF _Toc236234373 \h </w:instrText>
+        <w:instrText xml:space="preserve"> PAGEREF _Toc236241966 \h </w:instrText>
       </w:r>
       <w:r>
         <w:rPr>
@@ -2138,7 +2138,7 @@
         <w:rPr>
           <w:noProof/>
         </w:rPr>
-        <w:t>51</w:t>
+        <w:t>52</w:t>
       </w:r>
       <w:r>
         <w:rPr>
@@ -2182,7 +2182,7 @@
         <w:rPr>
           <w:noProof/>
         </w:rPr>
-        <w:instrText xml:space="preserve"> PAGEREF _Toc236234374 \h </w:instrText>
+        <w:instrText xml:space="preserve"> PAGEREF _Toc236241967 \h </w:instrText>
       </w:r>
       <w:r>
         <w:rPr>
@@ -2199,7 +2199,7 @@
         <w:rPr>
           <w:noProof/>
         </w:rPr>
-        <w:t>51</w:t>
+        <w:t>52</w:t>
       </w:r>
       <w:r>
         <w:rPr>
@@ -2243,7 +2243,7 @@
         <w:rPr>
           <w:noProof/>
         </w:rPr>
-        <w:instrText xml:space="preserve"> PAGEREF _Toc236234375 \h </w:instrText>
+        <w:instrText xml:space="preserve"> PAGEREF _Toc236241968 \h </w:instrText>
       </w:r>
       <w:r>
         <w:rPr>
@@ -2260,7 +2260,7 @@
         <w:rPr>
           <w:noProof/>
         </w:rPr>
-        <w:t>51</w:t>
+        <w:t>52</w:t>
       </w:r>
       <w:r>
         <w:rPr>
@@ -2304,7 +2304,7 @@
         <w:rPr>
           <w:noProof/>
         </w:rPr>
-        <w:instrText xml:space="preserve"> PAGEREF _Toc236234376 \h </w:instrText>
+        <w:instrText xml:space="preserve"> PAGEREF _Toc236241969 \h </w:instrText>
       </w:r>
       <w:r>
         <w:rPr>
@@ -2321,7 +2321,7 @@
         <w:rPr>
           <w:noProof/>
         </w:rPr>
-        <w:t>52</w:t>
+        <w:t>53</w:t>
       </w:r>
       <w:r>
         <w:rPr>
@@ -2365,7 +2365,7 @@
         <w:rPr>
           <w:noProof/>
         </w:rPr>
-        <w:instrText xml:space="preserve"> PAGEREF _Toc236234377 \h </w:instrText>
+        <w:instrText xml:space="preserve"> PAGEREF _Toc236241970 \h </w:instrText>
       </w:r>
       <w:r>
         <w:rPr>
@@ -2382,7 +2382,7 @@
         <w:rPr>
           <w:noProof/>
         </w:rPr>
-        <w:t>54</w:t>
+        <w:t>55</w:t>
       </w:r>
       <w:r>
         <w:rPr>
@@ -2426,7 +2426,7 @@
         <w:rPr>
           <w:noProof/>
         </w:rPr>
-        <w:instrText xml:space="preserve"> PAGEREF _Toc236234378 \h </w:instrText>
+        <w:instrText xml:space="preserve"> PAGEREF _Toc236241971 \h </w:instrText>
       </w:r>
       <w:r>
         <w:rPr>
@@ -2443,7 +2443,7 @@
         <w:rPr>
           <w:noProof/>
         </w:rPr>
-        <w:t>55</w:t>
+        <w:t>56</w:t>
       </w:r>
       <w:r>
         <w:rPr>
@@ -2502,7 +2502,7 @@
           <w:sz w:val="34"/>
         </w:rPr>
       </w:pPr>
-      <w:bookmarkStart w:id="0" w:name="_Toc236234342"/>
+      <w:bookmarkStart w:id="0" w:name="_Toc236241935"/>
       <w:r>
         <w:rPr>
           <w:rFonts w:ascii="Montserrat" w:hAnsi="Montserrat"/>
@@ -2526,7 +2526,7 @@
           <w:sz w:val="27"/>
         </w:rPr>
       </w:pPr>
-      <w:bookmarkStart w:id="1" w:name="_Toc236234343"/>
+      <w:bookmarkStart w:id="1" w:name="_Toc236241936"/>
       <w:r>
         <w:rPr>
           <w:rFonts w:ascii="Montserrat" w:hAnsi="Montserrat"/>
@@ -2661,7 +2661,7 @@
           <w:color w:val="1A1A1A"/>
           <w:sz w:val="22"/>
         </w:rPr>
-        <w:t xml:space="preserve">O manual nao substitui as Diretrizes para a Gestao de Projetos da UNIALFA (documento institucional que define o framework D01 a D07) nem o </w:t>
+        <w:t xml:space="preserve">Esta e a versao 2.5 do manual. Em relacao a versao 2.4 (29/07/2026), foi adicionado o campo opcional Projeto vinculado (Gate 1) a cada projeto listado no Relatorio de Situacao (secao 4.1) e no Relatorio de Entregas e Beneficios </w:t>
       </w:r>
       <w:r>
         <w:rPr>
@@ -2670,7 +2670,25 @@
           <w:sz w:val="22"/>
         </w:rPr>
         <w:lastRenderedPageBreak/>
-        <w:t>documento Regras de Acesso e Permissoes (que detalha cada regra de controle de acesso); ele e o guia operacional de como usar cada ferramenta na pratica.</w:t>
+        <w:t>(secao 4.2): a selecao preenche o nome automaticamente e libera o Ver historico compartilhado, sem aplicar a restricao por equipe usada nos outros 7 formularios vinculados.</w:t>
+      </w:r>
+    </w:p>
+    <w:p>
+      <w:pPr>
+        <w:spacing w:line="280" w:lineRule="auto"/>
+        <w:rPr>
+          <w:rFonts w:ascii="Montserrat" w:hAnsi="Montserrat"/>
+          <w:color w:val="1A1A1A"/>
+          <w:sz w:val="22"/>
+        </w:rPr>
+      </w:pPr>
+      <w:r>
+        <w:rPr>
+          <w:rFonts w:ascii="Montserrat" w:hAnsi="Montserrat"/>
+          <w:color w:val="1A1A1A"/>
+          <w:sz w:val="22"/>
+        </w:rPr>
+        <w:t>O manual nao substitui as Diretrizes para a Gestao de Projetos da UNIALFA (documento institucional que define o framework D01 a D07) nem o documento Regras de Acesso e Permissoes (que detalha cada regra de controle de acesso); ele e o guia operacional de como usar cada ferramenta na pratica.</w:t>
       </w:r>
     </w:p>
     <w:p>
@@ -2684,7 +2702,7 @@
           <w:sz w:val="27"/>
         </w:rPr>
       </w:pPr>
-      <w:bookmarkStart w:id="2" w:name="_Toc236234344"/>
+      <w:bookmarkStart w:id="2" w:name="_Toc236241937"/>
       <w:r>
         <w:rPr>
           <w:rFonts w:ascii="Montserrat" w:hAnsi="Montserrat"/>
@@ -2833,16 +2851,16 @@
         </w:rPr>
         <w:lastRenderedPageBreak/>
         <w:drawing>
-          <wp:inline distT="0" distB="0" distL="0" distR="0" wp14:anchorId="20A705BF" wp14:editId="5CC73A43">
+          <wp:inline distT="0" distB="0" distL="0" distR="0" wp14:anchorId="54C8E7B3" wp14:editId="353A7390">
             <wp:extent cx="5303520" cy="4792851"/>
             <wp:effectExtent l="19050" t="19050" r="11430" b="27305"/>
-            <wp:docPr id="196699862" name="Imagem 1"/>
+            <wp:docPr id="232394177" name="Imagem 1"/>
             <wp:cNvGraphicFramePr/>
             <a:graphic xmlns:a="http://schemas.openxmlformats.org/drawingml/2006/main">
               <a:graphicData uri="http://schemas.openxmlformats.org/drawingml/2006/picture">
                 <pic:pic xmlns:pic="http://schemas.openxmlformats.org/drawingml/2006/picture">
                   <pic:nvPicPr>
-                    <pic:cNvPr id="196699862" name=""/>
+                    <pic:cNvPr id="232394177" name=""/>
                     <pic:cNvPicPr/>
                   </pic:nvPicPr>
                   <pic:blipFill>
@@ -2910,7 +2928,7 @@
           <w:sz w:val="27"/>
         </w:rPr>
       </w:pPr>
-      <w:bookmarkStart w:id="3" w:name="_Toc236234345"/>
+      <w:bookmarkStart w:id="3" w:name="_Toc236241938"/>
       <w:r>
         <w:rPr>
           <w:rFonts w:ascii="Montserrat" w:hAnsi="Montserrat"/>
@@ -2951,16 +2969,16 @@
         </w:rPr>
         <w:lastRenderedPageBreak/>
         <w:drawing>
-          <wp:inline distT="0" distB="0" distL="0" distR="0" wp14:anchorId="23112D45" wp14:editId="7CBA7D7A">
+          <wp:inline distT="0" distB="0" distL="0" distR="0" wp14:anchorId="3D95D44B" wp14:editId="4F2EDE9A">
             <wp:extent cx="4206240" cy="3801227"/>
             <wp:effectExtent l="19050" t="19050" r="22860" b="27940"/>
-            <wp:docPr id="974828083" name="Imagem 2"/>
+            <wp:docPr id="1066308998" name="Imagem 2"/>
             <wp:cNvGraphicFramePr/>
             <a:graphic xmlns:a="http://schemas.openxmlformats.org/drawingml/2006/main">
               <a:graphicData uri="http://schemas.openxmlformats.org/drawingml/2006/picture">
                 <pic:pic xmlns:pic="http://schemas.openxmlformats.org/drawingml/2006/picture">
                   <pic:nvPicPr>
-                    <pic:cNvPr id="974828083" name=""/>
+                    <pic:cNvPr id="1066308998" name=""/>
                     <pic:cNvPicPr/>
                   </pic:nvPicPr>
                   <pic:blipFill>
@@ -3133,7 +3151,7 @@
           <w:sz w:val="27"/>
         </w:rPr>
       </w:pPr>
-      <w:bookmarkStart w:id="4" w:name="_Toc236234346"/>
+      <w:bookmarkStart w:id="4" w:name="_Toc236241939"/>
       <w:r>
         <w:rPr>
           <w:rFonts w:ascii="Montserrat" w:hAnsi="Montserrat"/>
@@ -4282,7 +4300,7 @@
           <w:sz w:val="34"/>
         </w:rPr>
       </w:pPr>
-      <w:bookmarkStart w:id="5" w:name="_Toc236234347"/>
+      <w:bookmarkStart w:id="5" w:name="_Toc236241940"/>
       <w:r>
         <w:rPr>
           <w:rFonts w:ascii="Montserrat" w:hAnsi="Montserrat"/>
@@ -4306,7 +4324,7 @@
           <w:sz w:val="27"/>
         </w:rPr>
       </w:pPr>
-      <w:bookmarkStart w:id="6" w:name="_Toc236234348"/>
+      <w:bookmarkStart w:id="6" w:name="_Toc236241941"/>
       <w:r>
         <w:rPr>
           <w:rFonts w:ascii="Montserrat" w:hAnsi="Montserrat"/>
@@ -4347,7 +4365,7 @@
           <w:sz w:val="27"/>
         </w:rPr>
       </w:pPr>
-      <w:bookmarkStart w:id="7" w:name="_Toc236234349"/>
+      <w:bookmarkStart w:id="7" w:name="_Toc236241942"/>
       <w:r>
         <w:rPr>
           <w:rFonts w:ascii="Montserrat" w:hAnsi="Montserrat"/>
@@ -4466,7 +4484,7 @@
           <w:sz w:val="27"/>
         </w:rPr>
       </w:pPr>
-      <w:bookmarkStart w:id="8" w:name="_Toc236234350"/>
+      <w:bookmarkStart w:id="8" w:name="_Toc236241943"/>
       <w:r>
         <w:rPr>
           <w:rFonts w:ascii="Montserrat" w:hAnsi="Montserrat"/>
@@ -5037,7 +5055,7 @@
           <w:sz w:val="27"/>
         </w:rPr>
       </w:pPr>
-      <w:bookmarkStart w:id="9" w:name="_Toc236234351"/>
+      <w:bookmarkStart w:id="9" w:name="_Toc236241944"/>
       <w:r>
         <w:rPr>
           <w:rFonts w:ascii="Montserrat" w:hAnsi="Montserrat"/>
@@ -5126,16 +5144,16 @@
         </w:rPr>
         <w:lastRenderedPageBreak/>
         <w:drawing>
-          <wp:inline distT="0" distB="0" distL="0" distR="0" wp14:anchorId="5751E767" wp14:editId="1BCB447B">
+          <wp:inline distT="0" distB="0" distL="0" distR="0" wp14:anchorId="29C7B09B" wp14:editId="747795A2">
             <wp:extent cx="4937760" cy="4462310"/>
             <wp:effectExtent l="19050" t="19050" r="15240" b="14605"/>
-            <wp:docPr id="699385858" name="Imagem 3"/>
+            <wp:docPr id="427616671" name="Imagem 3"/>
             <wp:cNvGraphicFramePr/>
             <a:graphic xmlns:a="http://schemas.openxmlformats.org/drawingml/2006/main">
               <a:graphicData uri="http://schemas.openxmlformats.org/drawingml/2006/picture">
                 <pic:pic xmlns:pic="http://schemas.openxmlformats.org/drawingml/2006/picture">
                   <pic:nvPicPr>
-                    <pic:cNvPr id="699385858" name=""/>
+                    <pic:cNvPr id="427616671" name=""/>
                     <pic:cNvPicPr/>
                   </pic:nvPicPr>
                   <pic:blipFill>
@@ -5203,7 +5221,7 @@
           <w:sz w:val="27"/>
         </w:rPr>
       </w:pPr>
-      <w:bookmarkStart w:id="10" w:name="_Toc236234352"/>
+      <w:bookmarkStart w:id="10" w:name="_Toc236241945"/>
       <w:r>
         <w:rPr>
           <w:rFonts w:ascii="Montserrat" w:hAnsi="Montserrat"/>
@@ -5244,16 +5262,16 @@
         </w:rPr>
         <w:lastRenderedPageBreak/>
         <w:drawing>
-          <wp:inline distT="0" distB="0" distL="0" distR="0" wp14:anchorId="60B76781" wp14:editId="67C0E6C3">
+          <wp:inline distT="0" distB="0" distL="0" distR="0" wp14:anchorId="2DAF0C73" wp14:editId="510DB9D2">
             <wp:extent cx="5120640" cy="4627581"/>
             <wp:effectExtent l="19050" t="19050" r="22860" b="20955"/>
-            <wp:docPr id="1471415970" name="Imagem 4"/>
+            <wp:docPr id="1093739729" name="Imagem 4"/>
             <wp:cNvGraphicFramePr/>
             <a:graphic xmlns:a="http://schemas.openxmlformats.org/drawingml/2006/main">
               <a:graphicData uri="http://schemas.openxmlformats.org/drawingml/2006/picture">
                 <pic:pic xmlns:pic="http://schemas.openxmlformats.org/drawingml/2006/picture">
                   <pic:nvPicPr>
-                    <pic:cNvPr id="1471415970" name=""/>
+                    <pic:cNvPr id="1093739729" name=""/>
                     <pic:cNvPicPr/>
                   </pic:nvPicPr>
                   <pic:blipFill>
@@ -5376,7 +5394,7 @@
           <w:color w:val="6A6A70"/>
           <w:sz w:val="21"/>
         </w:rPr>
-        <w:t>Os outros 5 formularios (Solicitacao de Demanda, Ata de Reuniao, Plano de Comunicacao, Relatorio de Situacao e Relatorio de Entregas) nao usam esse conceito - qualquer usuario autenticado pode criar/editar registros neles.</w:t>
+        <w:t>Os outros 5 formularios (Solicitacao de Demanda, Ata de Reuniao, Plano de Comunicacao, Relatorio de Situacao e Relatorio de Entregas) nao usam esse conceito de forma obrigatoria - qualquer usuario autenticado pode criar/editar registros neles, sem restricao por equipe. O Relatorio de Situacao e o Relatorio de Entregas ganharam, no entanto, um campo opcional Projeto vinculado (Gate 1) em cada projeto listado (secoes 4.1 e 4.2) - ele so serve para ligar aquele projeto ao historico compartilhado, sem aplicar a trava de equipe.</w:t>
       </w:r>
     </w:p>
     <w:p>
@@ -5390,7 +5408,7 @@
           <w:sz w:val="27"/>
         </w:rPr>
       </w:pPr>
-      <w:bookmarkStart w:id="11" w:name="_Toc236234353"/>
+      <w:bookmarkStart w:id="11" w:name="_Toc236241946"/>
       <w:r>
         <w:rPr>
           <w:rFonts w:ascii="Montserrat" w:hAnsi="Montserrat"/>
@@ -5398,6 +5416,7 @@
           <w:color w:val="B91D2E"/>
           <w:sz w:val="27"/>
         </w:rPr>
+        <w:lastRenderedPageBreak/>
         <w:t>2.6 Acesso sem login - Solicitacao de Demanda e Ata de Reuniao</w:t>
       </w:r>
       <w:bookmarkEnd w:id="11"/>
@@ -5429,18 +5448,17 @@
         <w:rPr>
           <w:noProof/>
         </w:rPr>
-        <w:lastRenderedPageBreak/>
         <w:drawing>
-          <wp:inline distT="0" distB="0" distL="0" distR="0" wp14:anchorId="3E6737AA" wp14:editId="56A46B70">
+          <wp:inline distT="0" distB="0" distL="0" distR="0" wp14:anchorId="7A89C6E5" wp14:editId="2C22D414">
             <wp:extent cx="4206240" cy="3801227"/>
             <wp:effectExtent l="19050" t="19050" r="22860" b="27940"/>
-            <wp:docPr id="499811447" name="Imagem 5"/>
+            <wp:docPr id="142365483" name="Imagem 5"/>
             <wp:cNvGraphicFramePr/>
             <a:graphic xmlns:a="http://schemas.openxmlformats.org/drawingml/2006/main">
               <a:graphicData uri="http://schemas.openxmlformats.org/drawingml/2006/picture">
                 <pic:pic xmlns:pic="http://schemas.openxmlformats.org/drawingml/2006/picture">
                   <pic:nvPicPr>
-                    <pic:cNvPr id="499811447" name=""/>
+                    <pic:cNvPr id="142365483" name=""/>
                     <pic:cNvPicPr/>
                   </pic:nvPicPr>
                   <pic:blipFill>
@@ -5508,16 +5526,16 @@
         </w:rPr>
         <w:lastRenderedPageBreak/>
         <w:drawing>
-          <wp:inline distT="0" distB="0" distL="0" distR="0" wp14:anchorId="2CC00240" wp14:editId="013B2FC6">
+          <wp:inline distT="0" distB="0" distL="0" distR="0" wp14:anchorId="4BE070B6" wp14:editId="7B7AABEE">
             <wp:extent cx="4206240" cy="3801227"/>
             <wp:effectExtent l="19050" t="19050" r="22860" b="27940"/>
-            <wp:docPr id="693717627" name="Imagem 6"/>
+            <wp:docPr id="1072576223" name="Imagem 6"/>
             <wp:cNvGraphicFramePr/>
             <a:graphic xmlns:a="http://schemas.openxmlformats.org/drawingml/2006/main">
               <a:graphicData uri="http://schemas.openxmlformats.org/drawingml/2006/picture">
                 <pic:pic xmlns:pic="http://schemas.openxmlformats.org/drawingml/2006/picture">
                   <pic:nvPicPr>
-                    <pic:cNvPr id="693717627" name=""/>
+                    <pic:cNvPr id="1072576223" name=""/>
                     <pic:cNvPicPr/>
                   </pic:nvPicPr>
                   <pic:blipFill>
@@ -5633,7 +5651,7 @@
           <w:sz w:val="27"/>
         </w:rPr>
       </w:pPr>
-      <w:bookmarkStart w:id="12" w:name="_Toc236234354"/>
+      <w:bookmarkStart w:id="12" w:name="_Toc236241947"/>
       <w:r>
         <w:rPr>
           <w:rFonts w:ascii="Montserrat" w:hAnsi="Montserrat"/>
@@ -5705,7 +5723,7 @@
           <w:sz w:val="34"/>
         </w:rPr>
       </w:pPr>
-      <w:bookmarkStart w:id="13" w:name="_Toc236234355"/>
+      <w:bookmarkStart w:id="13" w:name="_Toc236241948"/>
       <w:r>
         <w:rPr>
           <w:rFonts w:ascii="Montserrat" w:hAnsi="Montserrat"/>
@@ -5747,7 +5765,7 @@
           <w:sz w:val="27"/>
         </w:rPr>
       </w:pPr>
-      <w:bookmarkStart w:id="14" w:name="_Toc236234356"/>
+      <w:bookmarkStart w:id="14" w:name="_Toc236241949"/>
       <w:r>
         <w:rPr>
           <w:rFonts w:ascii="Montserrat" w:hAnsi="Montserrat"/>
@@ -6607,16 +6625,16 @@
         </w:rPr>
         <w:lastRenderedPageBreak/>
         <w:drawing>
-          <wp:inline distT="0" distB="0" distL="0" distR="0" wp14:anchorId="0AF89148" wp14:editId="7ED59324">
+          <wp:inline distT="0" distB="0" distL="0" distR="0" wp14:anchorId="7E5719A9" wp14:editId="12872843">
             <wp:extent cx="5120640" cy="4627581"/>
             <wp:effectExtent l="19050" t="19050" r="22860" b="20955"/>
-            <wp:docPr id="1514655428" name="Imagem 7"/>
+            <wp:docPr id="987414858" name="Imagem 7"/>
             <wp:cNvGraphicFramePr/>
             <a:graphic xmlns:a="http://schemas.openxmlformats.org/drawingml/2006/main">
               <a:graphicData uri="http://schemas.openxmlformats.org/drawingml/2006/picture">
                 <pic:pic xmlns:pic="http://schemas.openxmlformats.org/drawingml/2006/picture">
                   <pic:nvPicPr>
-                    <pic:cNvPr id="1514655428" name=""/>
+                    <pic:cNvPr id="987414858" name=""/>
                     <pic:cNvPicPr/>
                   </pic:nvPicPr>
                   <pic:blipFill>
@@ -6684,16 +6702,16 @@
         </w:rPr>
         <w:lastRenderedPageBreak/>
         <w:drawing>
-          <wp:inline distT="0" distB="0" distL="0" distR="0" wp14:anchorId="658FBB29" wp14:editId="74632B4D">
+          <wp:inline distT="0" distB="0" distL="0" distR="0" wp14:anchorId="45F5D2B6" wp14:editId="1BF8F8D4">
             <wp:extent cx="5120640" cy="4627581"/>
             <wp:effectExtent l="19050" t="19050" r="22860" b="20955"/>
-            <wp:docPr id="449573472" name="Imagem 8"/>
+            <wp:docPr id="1139516807" name="Imagem 8"/>
             <wp:cNvGraphicFramePr/>
             <a:graphic xmlns:a="http://schemas.openxmlformats.org/drawingml/2006/main">
               <a:graphicData uri="http://schemas.openxmlformats.org/drawingml/2006/picture">
                 <pic:pic xmlns:pic="http://schemas.openxmlformats.org/drawingml/2006/picture">
                   <pic:nvPicPr>
-                    <pic:cNvPr id="449573472" name=""/>
+                    <pic:cNvPr id="1139516807" name=""/>
                     <pic:cNvPicPr/>
                   </pic:nvPicPr>
                   <pic:blipFill>
@@ -6828,7 +6846,7 @@
           <w:sz w:val="27"/>
         </w:rPr>
       </w:pPr>
-      <w:bookmarkStart w:id="15" w:name="_Toc236234357"/>
+      <w:bookmarkStart w:id="15" w:name="_Toc236241950"/>
       <w:r>
         <w:rPr>
           <w:rFonts w:ascii="Montserrat" w:hAnsi="Montserrat"/>
@@ -7697,16 +7715,16 @@
         </w:rPr>
         <w:lastRenderedPageBreak/>
         <w:drawing>
-          <wp:inline distT="0" distB="0" distL="0" distR="0" wp14:anchorId="7BD77C33" wp14:editId="62A4788F">
+          <wp:inline distT="0" distB="0" distL="0" distR="0" wp14:anchorId="24114FBA" wp14:editId="1C09CCB3">
             <wp:extent cx="5120640" cy="4627581"/>
             <wp:effectExtent l="19050" t="19050" r="22860" b="20955"/>
-            <wp:docPr id="589485759" name="Imagem 9"/>
+            <wp:docPr id="1679377426" name="Imagem 9"/>
             <wp:cNvGraphicFramePr/>
             <a:graphic xmlns:a="http://schemas.openxmlformats.org/drawingml/2006/main">
               <a:graphicData uri="http://schemas.openxmlformats.org/drawingml/2006/picture">
                 <pic:pic xmlns:pic="http://schemas.openxmlformats.org/drawingml/2006/picture">
                   <pic:nvPicPr>
-                    <pic:cNvPr id="589485759" name=""/>
+                    <pic:cNvPr id="1679377426" name=""/>
                     <pic:cNvPicPr/>
                   </pic:nvPicPr>
                   <pic:blipFill>
@@ -7774,16 +7792,16 @@
         </w:rPr>
         <w:lastRenderedPageBreak/>
         <w:drawing>
-          <wp:inline distT="0" distB="0" distL="0" distR="0" wp14:anchorId="0F6DA0D5" wp14:editId="2D6C6665">
+          <wp:inline distT="0" distB="0" distL="0" distR="0" wp14:anchorId="114B1414" wp14:editId="313BFFAE">
             <wp:extent cx="5120640" cy="4627581"/>
             <wp:effectExtent l="19050" t="19050" r="22860" b="20955"/>
-            <wp:docPr id="1821018623" name="Imagem 10"/>
+            <wp:docPr id="144510346" name="Imagem 10"/>
             <wp:cNvGraphicFramePr/>
             <a:graphic xmlns:a="http://schemas.openxmlformats.org/drawingml/2006/main">
               <a:graphicData uri="http://schemas.openxmlformats.org/drawingml/2006/picture">
                 <pic:pic xmlns:pic="http://schemas.openxmlformats.org/drawingml/2006/picture">
                   <pic:nvPicPr>
-                    <pic:cNvPr id="1821018623" name=""/>
+                    <pic:cNvPr id="144510346" name=""/>
                     <pic:cNvPicPr/>
                   </pic:nvPicPr>
                   <pic:blipFill>
@@ -7869,7 +7887,7 @@
           <w:sz w:val="27"/>
         </w:rPr>
       </w:pPr>
-      <w:bookmarkStart w:id="16" w:name="_Toc236234358"/>
+      <w:bookmarkStart w:id="16" w:name="_Toc236241951"/>
       <w:r>
         <w:rPr>
           <w:rFonts w:ascii="Montserrat" w:hAnsi="Montserrat"/>
@@ -8837,16 +8855,16 @@
         </w:rPr>
         <w:lastRenderedPageBreak/>
         <w:drawing>
-          <wp:inline distT="0" distB="0" distL="0" distR="0" wp14:anchorId="39762697" wp14:editId="33C12579">
+          <wp:inline distT="0" distB="0" distL="0" distR="0" wp14:anchorId="1C7D2E5E" wp14:editId="61430A6D">
             <wp:extent cx="5120640" cy="3282818"/>
             <wp:effectExtent l="19050" t="19050" r="22860" b="13335"/>
-            <wp:docPr id="556733108" name="Imagem 11"/>
+            <wp:docPr id="1716675214" name="Imagem 11"/>
             <wp:cNvGraphicFramePr/>
             <a:graphic xmlns:a="http://schemas.openxmlformats.org/drawingml/2006/main">
               <a:graphicData uri="http://schemas.openxmlformats.org/drawingml/2006/picture">
                 <pic:pic xmlns:pic="http://schemas.openxmlformats.org/drawingml/2006/picture">
                   <pic:nvPicPr>
-                    <pic:cNvPr id="556733108" name=""/>
+                    <pic:cNvPr id="1716675214" name=""/>
                     <pic:cNvPicPr/>
                   </pic:nvPicPr>
                   <pic:blipFill>
@@ -8914,16 +8932,16 @@
         </w:rPr>
         <w:lastRenderedPageBreak/>
         <w:drawing>
-          <wp:inline distT="0" distB="0" distL="0" distR="0" wp14:anchorId="4232544A" wp14:editId="220C5A5E">
+          <wp:inline distT="0" distB="0" distL="0" distR="0" wp14:anchorId="4317ED69" wp14:editId="250CF99E">
             <wp:extent cx="5120640" cy="4627581"/>
             <wp:effectExtent l="19050" t="19050" r="22860" b="20955"/>
-            <wp:docPr id="1242440832" name="Imagem 12"/>
+            <wp:docPr id="1188022203" name="Imagem 12"/>
             <wp:cNvGraphicFramePr/>
             <a:graphic xmlns:a="http://schemas.openxmlformats.org/drawingml/2006/main">
               <a:graphicData uri="http://schemas.openxmlformats.org/drawingml/2006/picture">
                 <pic:pic xmlns:pic="http://schemas.openxmlformats.org/drawingml/2006/picture">
                   <pic:nvPicPr>
-                    <pic:cNvPr id="1242440832" name=""/>
+                    <pic:cNvPr id="1188022203" name=""/>
                     <pic:cNvPicPr/>
                   </pic:nvPicPr>
                   <pic:blipFill>
@@ -9009,7 +9027,7 @@
           <w:sz w:val="27"/>
         </w:rPr>
       </w:pPr>
-      <w:bookmarkStart w:id="17" w:name="_Toc236234359"/>
+      <w:bookmarkStart w:id="17" w:name="_Toc236241952"/>
       <w:r>
         <w:rPr>
           <w:rFonts w:ascii="Montserrat" w:hAnsi="Montserrat"/>
@@ -9516,16 +9534,16 @@
           <w:noProof/>
         </w:rPr>
         <w:drawing>
-          <wp:inline distT="0" distB="0" distL="0" distR="0" wp14:anchorId="25D8D60C" wp14:editId="4D35F3FB">
+          <wp:inline distT="0" distB="0" distL="0" distR="0" wp14:anchorId="4BD2F1D7" wp14:editId="681C0E29">
             <wp:extent cx="5120640" cy="4627581"/>
             <wp:effectExtent l="19050" t="19050" r="22860" b="20955"/>
-            <wp:docPr id="1754790727" name="Imagem 13"/>
+            <wp:docPr id="806954006" name="Imagem 13"/>
             <wp:cNvGraphicFramePr/>
             <a:graphic xmlns:a="http://schemas.openxmlformats.org/drawingml/2006/main">
               <a:graphicData uri="http://schemas.openxmlformats.org/drawingml/2006/picture">
                 <pic:pic xmlns:pic="http://schemas.openxmlformats.org/drawingml/2006/picture">
                   <pic:nvPicPr>
-                    <pic:cNvPr id="1754790727" name=""/>
+                    <pic:cNvPr id="806954006" name=""/>
                     <pic:cNvPicPr/>
                   </pic:nvPicPr>
                   <pic:blipFill>
@@ -9593,16 +9611,16 @@
         </w:rPr>
         <w:lastRenderedPageBreak/>
         <w:drawing>
-          <wp:inline distT="0" distB="0" distL="0" distR="0" wp14:anchorId="3FDE3A09" wp14:editId="0E7589EE">
+          <wp:inline distT="0" distB="0" distL="0" distR="0" wp14:anchorId="2C5C76B0" wp14:editId="1182DCEC">
             <wp:extent cx="5120640" cy="4627581"/>
             <wp:effectExtent l="19050" t="19050" r="22860" b="20955"/>
-            <wp:docPr id="1720004882" name="Imagem 14"/>
+            <wp:docPr id="1964614517" name="Imagem 14"/>
             <wp:cNvGraphicFramePr/>
             <a:graphic xmlns:a="http://schemas.openxmlformats.org/drawingml/2006/main">
               <a:graphicData uri="http://schemas.openxmlformats.org/drawingml/2006/picture">
                 <pic:pic xmlns:pic="http://schemas.openxmlformats.org/drawingml/2006/picture">
                   <pic:nvPicPr>
-                    <pic:cNvPr id="1720004882" name=""/>
+                    <pic:cNvPr id="1964614517" name=""/>
                     <pic:cNvPicPr/>
                   </pic:nvPicPr>
                   <pic:blipFill>
@@ -9688,7 +9706,7 @@
           <w:sz w:val="27"/>
         </w:rPr>
       </w:pPr>
-      <w:bookmarkStart w:id="18" w:name="_Toc236234360"/>
+      <w:bookmarkStart w:id="18" w:name="_Toc236241953"/>
       <w:r>
         <w:rPr>
           <w:rFonts w:ascii="Montserrat" w:hAnsi="Montserrat"/>
@@ -9729,16 +9747,16 @@
         </w:rPr>
         <w:lastRenderedPageBreak/>
         <w:drawing>
-          <wp:inline distT="0" distB="0" distL="0" distR="0" wp14:anchorId="020DA25B" wp14:editId="44FADB5B">
+          <wp:inline distT="0" distB="0" distL="0" distR="0" wp14:anchorId="20A09BC2" wp14:editId="5601D66E">
             <wp:extent cx="5120640" cy="4627581"/>
             <wp:effectExtent l="19050" t="19050" r="22860" b="20955"/>
-            <wp:docPr id="1091178368" name="Imagem 15"/>
+            <wp:docPr id="208426631" name="Imagem 15"/>
             <wp:cNvGraphicFramePr/>
             <a:graphic xmlns:a="http://schemas.openxmlformats.org/drawingml/2006/main">
               <a:graphicData uri="http://schemas.openxmlformats.org/drawingml/2006/picture">
                 <pic:pic xmlns:pic="http://schemas.openxmlformats.org/drawingml/2006/picture">
                   <pic:nvPicPr>
-                    <pic:cNvPr id="1091178368" name=""/>
+                    <pic:cNvPr id="208426631" name=""/>
                     <pic:cNvPicPr/>
                   </pic:nvPicPr>
                   <pic:blipFill>
@@ -9806,16 +9824,16 @@
         </w:rPr>
         <w:lastRenderedPageBreak/>
         <w:drawing>
-          <wp:inline distT="0" distB="0" distL="0" distR="0" wp14:anchorId="2357476C" wp14:editId="0DE2023E">
+          <wp:inline distT="0" distB="0" distL="0" distR="0" wp14:anchorId="16DBBA15" wp14:editId="2E5074D3">
             <wp:extent cx="5120640" cy="4627581"/>
             <wp:effectExtent l="19050" t="19050" r="22860" b="20955"/>
-            <wp:docPr id="1204582846" name="Imagem 16"/>
+            <wp:docPr id="1508234102" name="Imagem 16"/>
             <wp:cNvGraphicFramePr/>
             <a:graphic xmlns:a="http://schemas.openxmlformats.org/drawingml/2006/main">
               <a:graphicData uri="http://schemas.openxmlformats.org/drawingml/2006/picture">
                 <pic:pic xmlns:pic="http://schemas.openxmlformats.org/drawingml/2006/picture">
                   <pic:nvPicPr>
-                    <pic:cNvPr id="1204582846" name=""/>
+                    <pic:cNvPr id="1508234102" name=""/>
                     <pic:cNvPicPr/>
                   </pic:nvPicPr>
                   <pic:blipFill>
@@ -9979,16 +9997,16 @@
         </w:rPr>
         <w:lastRenderedPageBreak/>
         <w:drawing>
-          <wp:inline distT="0" distB="0" distL="0" distR="0" wp14:anchorId="61D79CF4" wp14:editId="418E3ED6">
+          <wp:inline distT="0" distB="0" distL="0" distR="0" wp14:anchorId="597D5BB0" wp14:editId="2AB8C2C3">
             <wp:extent cx="5120640" cy="3282818"/>
             <wp:effectExtent l="19050" t="19050" r="22860" b="13335"/>
-            <wp:docPr id="474533815" name="Imagem 17"/>
+            <wp:docPr id="390093117" name="Imagem 17"/>
             <wp:cNvGraphicFramePr/>
             <a:graphic xmlns:a="http://schemas.openxmlformats.org/drawingml/2006/main">
               <a:graphicData uri="http://schemas.openxmlformats.org/drawingml/2006/picture">
                 <pic:pic xmlns:pic="http://schemas.openxmlformats.org/drawingml/2006/picture">
                   <pic:nvPicPr>
-                    <pic:cNvPr id="474533815" name=""/>
+                    <pic:cNvPr id="390093117" name=""/>
                     <pic:cNvPicPr/>
                   </pic:nvPicPr>
                   <pic:blipFill>
@@ -10074,7 +10092,7 @@
           <w:sz w:val="27"/>
         </w:rPr>
       </w:pPr>
-      <w:bookmarkStart w:id="19" w:name="_Toc236234361"/>
+      <w:bookmarkStart w:id="19" w:name="_Toc236241954"/>
       <w:r>
         <w:rPr>
           <w:rFonts w:ascii="Montserrat" w:hAnsi="Montserrat"/>
@@ -10115,16 +10133,16 @@
         </w:rPr>
         <w:lastRenderedPageBreak/>
         <w:drawing>
-          <wp:inline distT="0" distB="0" distL="0" distR="0" wp14:anchorId="01527CDB" wp14:editId="23727D49">
+          <wp:inline distT="0" distB="0" distL="0" distR="0" wp14:anchorId="750EC475" wp14:editId="56A48D62">
             <wp:extent cx="5120640" cy="4627581"/>
             <wp:effectExtent l="19050" t="19050" r="22860" b="20955"/>
-            <wp:docPr id="1617801691" name="Imagem 18"/>
+            <wp:docPr id="1937951547" name="Imagem 18"/>
             <wp:cNvGraphicFramePr/>
             <a:graphic xmlns:a="http://schemas.openxmlformats.org/drawingml/2006/main">
               <a:graphicData uri="http://schemas.openxmlformats.org/drawingml/2006/picture">
                 <pic:pic xmlns:pic="http://schemas.openxmlformats.org/drawingml/2006/picture">
                   <pic:nvPicPr>
-                    <pic:cNvPr id="1617801691" name=""/>
+                    <pic:cNvPr id="1937951547" name=""/>
                     <pic:cNvPicPr/>
                   </pic:nvPicPr>
                   <pic:blipFill>
@@ -10192,16 +10210,16 @@
         </w:rPr>
         <w:lastRenderedPageBreak/>
         <w:drawing>
-          <wp:inline distT="0" distB="0" distL="0" distR="0" wp14:anchorId="3208D389" wp14:editId="2C0D72AD">
+          <wp:inline distT="0" distB="0" distL="0" distR="0" wp14:anchorId="6312B498" wp14:editId="26502D3B">
             <wp:extent cx="5120640" cy="4627581"/>
             <wp:effectExtent l="19050" t="19050" r="22860" b="20955"/>
-            <wp:docPr id="1204394569" name="Imagem 19"/>
+            <wp:docPr id="1747598786" name="Imagem 19"/>
             <wp:cNvGraphicFramePr/>
             <a:graphic xmlns:a="http://schemas.openxmlformats.org/drawingml/2006/main">
               <a:graphicData uri="http://schemas.openxmlformats.org/drawingml/2006/picture">
                 <pic:pic xmlns:pic="http://schemas.openxmlformats.org/drawingml/2006/picture">
                   <pic:nvPicPr>
-                    <pic:cNvPr id="1204394569" name=""/>
+                    <pic:cNvPr id="1747598786" name=""/>
                     <pic:cNvPicPr/>
                   </pic:nvPicPr>
                   <pic:blipFill>
@@ -10335,7 +10353,7 @@
           <w:sz w:val="27"/>
         </w:rPr>
       </w:pPr>
-      <w:bookmarkStart w:id="20" w:name="_Toc236234362"/>
+      <w:bookmarkStart w:id="20" w:name="_Toc236241955"/>
       <w:r>
         <w:rPr>
           <w:rFonts w:ascii="Montserrat" w:hAnsi="Montserrat"/>
@@ -10376,16 +10394,16 @@
         </w:rPr>
         <w:lastRenderedPageBreak/>
         <w:drawing>
-          <wp:inline distT="0" distB="0" distL="0" distR="0" wp14:anchorId="437CA44E" wp14:editId="6B85BE8E">
+          <wp:inline distT="0" distB="0" distL="0" distR="0" wp14:anchorId="1C5AFB64" wp14:editId="74F142C6">
             <wp:extent cx="5120640" cy="4627581"/>
             <wp:effectExtent l="19050" t="19050" r="22860" b="20955"/>
-            <wp:docPr id="191746143" name="Imagem 20"/>
+            <wp:docPr id="428316261" name="Imagem 20"/>
             <wp:cNvGraphicFramePr/>
             <a:graphic xmlns:a="http://schemas.openxmlformats.org/drawingml/2006/main">
               <a:graphicData uri="http://schemas.openxmlformats.org/drawingml/2006/picture">
                 <pic:pic xmlns:pic="http://schemas.openxmlformats.org/drawingml/2006/picture">
                   <pic:nvPicPr>
-                    <pic:cNvPr id="191746143" name=""/>
+                    <pic:cNvPr id="428316261" name=""/>
                     <pic:cNvPicPr/>
                   </pic:nvPicPr>
                   <pic:blipFill>
@@ -10453,16 +10471,16 @@
         </w:rPr>
         <w:lastRenderedPageBreak/>
         <w:drawing>
-          <wp:inline distT="0" distB="0" distL="0" distR="0" wp14:anchorId="2B9A67CA" wp14:editId="5DFA9853">
+          <wp:inline distT="0" distB="0" distL="0" distR="0" wp14:anchorId="3FF72F3E" wp14:editId="2C1A6E66">
             <wp:extent cx="5120640" cy="4627581"/>
             <wp:effectExtent l="19050" t="19050" r="22860" b="20955"/>
-            <wp:docPr id="1254119708" name="Imagem 21"/>
+            <wp:docPr id="971212441" name="Imagem 21"/>
             <wp:cNvGraphicFramePr/>
             <a:graphic xmlns:a="http://schemas.openxmlformats.org/drawingml/2006/main">
               <a:graphicData uri="http://schemas.openxmlformats.org/drawingml/2006/picture">
                 <pic:pic xmlns:pic="http://schemas.openxmlformats.org/drawingml/2006/picture">
                   <pic:nvPicPr>
-                    <pic:cNvPr id="1254119708" name=""/>
+                    <pic:cNvPr id="971212441" name=""/>
                     <pic:cNvPicPr/>
                   </pic:nvPicPr>
                   <pic:blipFill>
@@ -10651,7 +10669,7 @@
           <w:sz w:val="27"/>
         </w:rPr>
       </w:pPr>
-      <w:bookmarkStart w:id="21" w:name="_Toc236234363"/>
+      <w:bookmarkStart w:id="21" w:name="_Toc236241956"/>
       <w:r>
         <w:rPr>
           <w:rFonts w:ascii="Montserrat" w:hAnsi="Montserrat"/>
@@ -10691,16 +10709,16 @@
           <w:noProof/>
         </w:rPr>
         <w:drawing>
-          <wp:inline distT="0" distB="0" distL="0" distR="0" wp14:anchorId="305F69C0" wp14:editId="129035B3">
+          <wp:inline distT="0" distB="0" distL="0" distR="0" wp14:anchorId="04F3E2B3" wp14:editId="67BCCDB9">
             <wp:extent cx="5120640" cy="4627581"/>
             <wp:effectExtent l="19050" t="19050" r="22860" b="20955"/>
-            <wp:docPr id="399914814" name="Imagem 22"/>
+            <wp:docPr id="493384700" name="Imagem 22"/>
             <wp:cNvGraphicFramePr/>
             <a:graphic xmlns:a="http://schemas.openxmlformats.org/drawingml/2006/main">
               <a:graphicData uri="http://schemas.openxmlformats.org/drawingml/2006/picture">
                 <pic:pic xmlns:pic="http://schemas.openxmlformats.org/drawingml/2006/picture">
                   <pic:nvPicPr>
-                    <pic:cNvPr id="399914814" name=""/>
+                    <pic:cNvPr id="493384700" name=""/>
                     <pic:cNvPicPr/>
                   </pic:nvPicPr>
                   <pic:blipFill>
@@ -10768,16 +10786,16 @@
         </w:rPr>
         <w:lastRenderedPageBreak/>
         <w:drawing>
-          <wp:inline distT="0" distB="0" distL="0" distR="0" wp14:anchorId="3994D962" wp14:editId="7E211268">
+          <wp:inline distT="0" distB="0" distL="0" distR="0" wp14:anchorId="5BF7503F" wp14:editId="3A136485">
             <wp:extent cx="5120640" cy="4627581"/>
             <wp:effectExtent l="19050" t="19050" r="22860" b="20955"/>
-            <wp:docPr id="815068688" name="Imagem 23"/>
+            <wp:docPr id="973912404" name="Imagem 23"/>
             <wp:cNvGraphicFramePr/>
             <a:graphic xmlns:a="http://schemas.openxmlformats.org/drawingml/2006/main">
               <a:graphicData uri="http://schemas.openxmlformats.org/drawingml/2006/picture">
                 <pic:pic xmlns:pic="http://schemas.openxmlformats.org/drawingml/2006/picture">
                   <pic:nvPicPr>
-                    <pic:cNvPr id="815068688" name=""/>
+                    <pic:cNvPr id="973912404" name=""/>
                     <pic:cNvPicPr/>
                   </pic:nvPicPr>
                   <pic:blipFill>
@@ -10935,7 +10953,7 @@
           <w:sz w:val="27"/>
         </w:rPr>
       </w:pPr>
-      <w:bookmarkStart w:id="22" w:name="_Toc236234364"/>
+      <w:bookmarkStart w:id="22" w:name="_Toc236241957"/>
       <w:r>
         <w:rPr>
           <w:rFonts w:ascii="Montserrat" w:hAnsi="Montserrat"/>
@@ -10976,16 +10994,16 @@
         </w:rPr>
         <w:lastRenderedPageBreak/>
         <w:drawing>
-          <wp:inline distT="0" distB="0" distL="0" distR="0" wp14:anchorId="00C9FAE5" wp14:editId="46F13F9A">
+          <wp:inline distT="0" distB="0" distL="0" distR="0" wp14:anchorId="49DD1A7B" wp14:editId="249545E9">
             <wp:extent cx="5120640" cy="4627581"/>
             <wp:effectExtent l="19050" t="19050" r="22860" b="20955"/>
-            <wp:docPr id="1161707618" name="Imagem 24"/>
+            <wp:docPr id="249809402" name="Imagem 24"/>
             <wp:cNvGraphicFramePr/>
             <a:graphic xmlns:a="http://schemas.openxmlformats.org/drawingml/2006/main">
               <a:graphicData uri="http://schemas.openxmlformats.org/drawingml/2006/picture">
                 <pic:pic xmlns:pic="http://schemas.openxmlformats.org/drawingml/2006/picture">
                   <pic:nvPicPr>
-                    <pic:cNvPr id="1161707618" name=""/>
+                    <pic:cNvPr id="249809402" name=""/>
                     <pic:cNvPicPr/>
                   </pic:nvPicPr>
                   <pic:blipFill>
@@ -11053,16 +11071,16 @@
         </w:rPr>
         <w:lastRenderedPageBreak/>
         <w:drawing>
-          <wp:inline distT="0" distB="0" distL="0" distR="0" wp14:anchorId="573B9933" wp14:editId="29C88CEB">
+          <wp:inline distT="0" distB="0" distL="0" distR="0" wp14:anchorId="21ED5C55" wp14:editId="62C98CE7">
             <wp:extent cx="5120640" cy="4627581"/>
             <wp:effectExtent l="19050" t="19050" r="22860" b="20955"/>
-            <wp:docPr id="440532634" name="Imagem 25"/>
+            <wp:docPr id="1724456342" name="Imagem 25"/>
             <wp:cNvGraphicFramePr/>
             <a:graphic xmlns:a="http://schemas.openxmlformats.org/drawingml/2006/main">
               <a:graphicData uri="http://schemas.openxmlformats.org/drawingml/2006/picture">
                 <pic:pic xmlns:pic="http://schemas.openxmlformats.org/drawingml/2006/picture">
                   <pic:nvPicPr>
-                    <pic:cNvPr id="440532634" name=""/>
+                    <pic:cNvPr id="1724456342" name=""/>
                     <pic:cNvPicPr/>
                   </pic:nvPicPr>
                   <pic:blipFill>
@@ -11196,7 +11214,7 @@
           <w:sz w:val="27"/>
         </w:rPr>
       </w:pPr>
-      <w:bookmarkStart w:id="23" w:name="_Toc236234365"/>
+      <w:bookmarkStart w:id="23" w:name="_Toc236241958"/>
       <w:r>
         <w:rPr>
           <w:rFonts w:ascii="Montserrat" w:hAnsi="Montserrat"/>
@@ -11237,16 +11255,16 @@
         </w:rPr>
         <w:lastRenderedPageBreak/>
         <w:drawing>
-          <wp:inline distT="0" distB="0" distL="0" distR="0" wp14:anchorId="2827B14E" wp14:editId="129E5CFE">
+          <wp:inline distT="0" distB="0" distL="0" distR="0" wp14:anchorId="5D5DE40F" wp14:editId="6564F492">
             <wp:extent cx="5120640" cy="4627581"/>
             <wp:effectExtent l="19050" t="19050" r="22860" b="20955"/>
-            <wp:docPr id="1703749440" name="Imagem 26"/>
+            <wp:docPr id="490526014" name="Imagem 26"/>
             <wp:cNvGraphicFramePr/>
             <a:graphic xmlns:a="http://schemas.openxmlformats.org/drawingml/2006/main">
               <a:graphicData uri="http://schemas.openxmlformats.org/drawingml/2006/picture">
                 <pic:pic xmlns:pic="http://schemas.openxmlformats.org/drawingml/2006/picture">
                   <pic:nvPicPr>
-                    <pic:cNvPr id="1703749440" name=""/>
+                    <pic:cNvPr id="490526014" name=""/>
                     <pic:cNvPicPr/>
                   </pic:nvPicPr>
                   <pic:blipFill>
@@ -11336,7 +11354,7 @@
           <w:sz w:val="34"/>
         </w:rPr>
       </w:pPr>
-      <w:bookmarkStart w:id="24" w:name="_Toc236234366"/>
+      <w:bookmarkStart w:id="24" w:name="_Toc236241959"/>
       <w:r>
         <w:rPr>
           <w:rFonts w:ascii="Montserrat" w:hAnsi="Montserrat"/>
@@ -11378,7 +11396,7 @@
           <w:sz w:val="27"/>
         </w:rPr>
       </w:pPr>
-      <w:bookmarkStart w:id="25" w:name="_Toc236234367"/>
+      <w:bookmarkStart w:id="25" w:name="_Toc236241960"/>
       <w:r>
         <w:rPr>
           <w:rFonts w:ascii="Montserrat" w:hAnsi="Montserrat"/>
@@ -11418,16 +11436,16 @@
           <w:noProof/>
         </w:rPr>
         <w:drawing>
-          <wp:inline distT="0" distB="0" distL="0" distR="0" wp14:anchorId="79AE9943" wp14:editId="73122016">
+          <wp:inline distT="0" distB="0" distL="0" distR="0" wp14:anchorId="1C12EDBD" wp14:editId="250FEE21">
             <wp:extent cx="5120640" cy="4627581"/>
             <wp:effectExtent l="19050" t="19050" r="22860" b="20955"/>
-            <wp:docPr id="434582681" name="Imagem 27"/>
+            <wp:docPr id="995027399" name="Imagem 27"/>
             <wp:cNvGraphicFramePr/>
             <a:graphic xmlns:a="http://schemas.openxmlformats.org/drawingml/2006/main">
               <a:graphicData uri="http://schemas.openxmlformats.org/drawingml/2006/picture">
                 <pic:pic xmlns:pic="http://schemas.openxmlformats.org/drawingml/2006/picture">
                   <pic:nvPicPr>
-                    <pic:cNvPr id="434582681" name=""/>
+                    <pic:cNvPr id="995027399" name=""/>
                     <pic:cNvPicPr/>
                   </pic:nvPicPr>
                   <pic:blipFill>
@@ -11495,16 +11513,16 @@
         </w:rPr>
         <w:lastRenderedPageBreak/>
         <w:drawing>
-          <wp:inline distT="0" distB="0" distL="0" distR="0" wp14:anchorId="3379F2C3" wp14:editId="5892C9B2">
+          <wp:inline distT="0" distB="0" distL="0" distR="0" wp14:anchorId="20AD6874" wp14:editId="4C4BB0B4">
             <wp:extent cx="5120640" cy="4627581"/>
             <wp:effectExtent l="19050" t="19050" r="22860" b="20955"/>
-            <wp:docPr id="759491592" name="Imagem 28"/>
+            <wp:docPr id="203272163" name="Imagem 28"/>
             <wp:cNvGraphicFramePr/>
             <a:graphic xmlns:a="http://schemas.openxmlformats.org/drawingml/2006/main">
               <a:graphicData uri="http://schemas.openxmlformats.org/drawingml/2006/picture">
                 <pic:pic xmlns:pic="http://schemas.openxmlformats.org/drawingml/2006/picture">
                   <pic:nvPicPr>
-                    <pic:cNvPr id="759491592" name=""/>
+                    <pic:cNvPr id="203272163" name=""/>
                     <pic:cNvPicPr/>
                   </pic:nvPicPr>
                   <pic:blipFill>
@@ -11572,16 +11590,16 @@
         </w:rPr>
         <w:lastRenderedPageBreak/>
         <w:drawing>
-          <wp:inline distT="0" distB="0" distL="0" distR="0" wp14:anchorId="779B2B00" wp14:editId="73B3B777">
+          <wp:inline distT="0" distB="0" distL="0" distR="0" wp14:anchorId="57BD6525" wp14:editId="14E2CAEC">
             <wp:extent cx="5120640" cy="4627581"/>
             <wp:effectExtent l="19050" t="19050" r="22860" b="20955"/>
-            <wp:docPr id="1107552041" name="Imagem 29"/>
+            <wp:docPr id="858208818" name="Imagem 29"/>
             <wp:cNvGraphicFramePr/>
             <a:graphic xmlns:a="http://schemas.openxmlformats.org/drawingml/2006/main">
               <a:graphicData uri="http://schemas.openxmlformats.org/drawingml/2006/picture">
                 <pic:pic xmlns:pic="http://schemas.openxmlformats.org/drawingml/2006/picture">
                   <pic:nvPicPr>
-                    <pic:cNvPr id="1107552041" name=""/>
+                    <pic:cNvPr id="858208818" name=""/>
                     <pic:cNvPicPr/>
                   </pic:nvPicPr>
                   <pic:blipFill>
@@ -11688,54 +11706,6 @@
     </w:p>
     <w:p>
       <w:pPr>
-        <w:pStyle w:val="PargrafodaLista"/>
-        <w:numPr>
-          <w:ilvl w:val="0"/>
-          <w:numId w:val="13"/>
-        </w:numPr>
-        <w:spacing w:after="80" w:line="260" w:lineRule="auto"/>
-        <w:ind w:left="700"/>
-        <w:rPr>
-          <w:rFonts w:ascii="Montserrat" w:hAnsi="Montserrat"/>
-          <w:color w:val="1A1A1A"/>
-          <w:sz w:val="22"/>
-        </w:rPr>
-      </w:pPr>
-      <w:r>
-        <w:rPr>
-          <w:rFonts w:ascii="Montserrat" w:hAnsi="Montserrat"/>
-          <w:color w:val="1A1A1A"/>
-          <w:sz w:val="22"/>
-        </w:rPr>
-        <w:t>Alternativa mais rapida: use Importar Project - o sistema detecta automaticamente as colunas de nome, % concluido, inicio, termino e responsavel.</w:t>
-      </w:r>
-    </w:p>
-    <w:p>
-      <w:pPr>
-        <w:pStyle w:val="PargrafodaLista"/>
-        <w:numPr>
-          <w:ilvl w:val="0"/>
-          <w:numId w:val="13"/>
-        </w:numPr>
-        <w:spacing w:after="80" w:line="260" w:lineRule="auto"/>
-        <w:ind w:left="700"/>
-        <w:rPr>
-          <w:rFonts w:ascii="Montserrat" w:hAnsi="Montserrat"/>
-          <w:color w:val="1A1A1A"/>
-          <w:sz w:val="22"/>
-        </w:rPr>
-      </w:pPr>
-      <w:r>
-        <w:rPr>
-          <w:rFonts w:ascii="Montserrat" w:hAnsi="Montserrat"/>
-          <w:color w:val="1A1A1A"/>
-          <w:sz w:val="22"/>
-        </w:rPr>
-        <w:t>Clique em Salvar e ver painel. Use os botoes do rodape para Imprimir ou Exportar CSV.</w:t>
-      </w:r>
-    </w:p>
-    <w:p>
-      <w:pPr>
         <w:spacing w:before="160" w:after="200"/>
         <w:ind w:left="283"/>
         <w:rPr>
@@ -11752,17 +11722,7 @@
           <w:color w:val="6A6A70"/>
           <w:sz w:val="21"/>
         </w:rPr>
-        <w:t xml:space="preserve">Sinalizacao automatica: a tabela de projetos do Painel ganhou a coluna Sinalizacao e o quadro de indicadores ganhou o card Em risco de atraso. E um calculo automatico, independente do campo Status manual: compara o % Execucao informado com o % que seria esperado pelo tempo ja decorrido entre o Inicio previsto e o Termino previsto do projeto. Se a defasagem for de 15 pontos percentuais ou mais, aparece Risco de atraso; se o Termino previsto ja passou e </w:t>
-      </w:r>
-      <w:r>
-        <w:rPr>
-          <w:rFonts w:ascii="Montserrat" w:hAnsi="Montserrat"/>
-          <w:i/>
-          <w:color w:val="6A6A70"/>
-          <w:sz w:val="21"/>
-        </w:rPr>
-        <w:lastRenderedPageBreak/>
-        <w:t>o projeto nao esta em 100%, aparece Prazo vencido. Projetos Concluido, Cancelado ou Paralisado ficam fora desse calculo. O resultado tambem sai no CSV exportado.</w:t>
+        <w:t>Projeto vinculado (Gate 1) - opcional: cada linha de projeto pode, opcionalmente, ser associada a um Projeto ja Aprovado no Gate 1 (o mesmo cadastro compartilhado usado pelo Canvas, TAP, Planejamento, EAP, SMP, TEP e RLA - secao 2.5). Ao selecionar um projeto na lista, o campo Nome do projeto e preenchido automaticamente (se ainda estiver vazio) e aparece o botao Ver historico, que mostra as alteracoes desse projeto vindas de qualquer outro formulario vinculado a ele. Deixar em Nenhum mantem o comportamento anterior - o projeto do Relatorio de Situacao continua sendo texto livre, sem vinculo.</w:t>
       </w:r>
     </w:p>
     <w:p>
@@ -11774,21 +11734,168 @@
         <w:rPr>
           <w:noProof/>
         </w:rPr>
+        <w:lastRenderedPageBreak/>
         <w:drawing>
-          <wp:inline distT="0" distB="0" distL="0" distR="0" wp14:anchorId="6FE47FFB" wp14:editId="203BC960">
-            <wp:extent cx="5120640" cy="3282818"/>
-            <wp:effectExtent l="19050" t="19050" r="22860" b="13335"/>
-            <wp:docPr id="1287438783" name="Imagem 30"/>
+          <wp:inline distT="0" distB="0" distL="0" distR="0" wp14:anchorId="5EC5C7B8" wp14:editId="648EF885">
+            <wp:extent cx="5120640" cy="1715571"/>
+            <wp:effectExtent l="19050" t="19050" r="22860" b="18415"/>
+            <wp:docPr id="775377057" name="Imagem 30"/>
             <wp:cNvGraphicFramePr/>
             <a:graphic xmlns:a="http://schemas.openxmlformats.org/drawingml/2006/main">
               <a:graphicData uri="http://schemas.openxmlformats.org/drawingml/2006/picture">
                 <pic:pic xmlns:pic="http://schemas.openxmlformats.org/drawingml/2006/picture">
                   <pic:nvPicPr>
-                    <pic:cNvPr id="1287438783" name=""/>
+                    <pic:cNvPr id="775377057" name=""/>
                     <pic:cNvPicPr/>
                   </pic:nvPicPr>
                   <pic:blipFill>
                     <a:blip r:embed="rId36">
+                      <a:extLst>
+                        <a:ext uri="{28A0092B-C50C-407E-A947-70E740481C1C}">
+                          <a14:useLocalDpi xmlns:a14="http://schemas.microsoft.com/office/drawing/2010/main" val="0"/>
+                        </a:ext>
+                      </a:extLst>
+                    </a:blip>
+                    <a:stretch>
+                      <a:fillRect/>
+                    </a:stretch>
+                  </pic:blipFill>
+                  <pic:spPr>
+                    <a:xfrm>
+                      <a:off x="0" y="0"/>
+                      <a:ext cx="5120640" cy="1715571"/>
+                    </a:xfrm>
+                    <a:prstGeom prst="rect">
+                      <a:avLst/>
+                    </a:prstGeom>
+                    <a:ln w="9525">
+                      <a:solidFill>
+                        <a:srgbClr val="D1D5DB"/>
+                      </a:solidFill>
+                    </a:ln>
+                  </pic:spPr>
+                </pic:pic>
+              </a:graphicData>
+            </a:graphic>
+          </wp:inline>
+        </w:drawing>
+      </w:r>
+    </w:p>
+    <w:p>
+      <w:pPr>
+        <w:spacing w:before="120" w:after="280"/>
+        <w:jc w:val="center"/>
+        <w:rPr>
+          <w:rFonts w:ascii="Montserrat" w:hAnsi="Montserrat"/>
+          <w:i/>
+          <w:color w:val="6A6A70"/>
+          <w:sz w:val="19"/>
+        </w:rPr>
+      </w:pPr>
+      <w:r>
+        <w:rPr>
+          <w:rFonts w:ascii="Montserrat" w:hAnsi="Montserrat"/>
+          <w:i/>
+          <w:color w:val="6A6A70"/>
+          <w:sz w:val="19"/>
+        </w:rPr>
+        <w:t>Projeto vinculado selecionado, com o nome preenchido automaticamente e o historico compartilhado exibido.</w:t>
+      </w:r>
+    </w:p>
+    <w:p>
+      <w:pPr>
+        <w:pStyle w:val="PargrafodaLista"/>
+        <w:numPr>
+          <w:ilvl w:val="0"/>
+          <w:numId w:val="14"/>
+        </w:numPr>
+        <w:spacing w:after="80" w:line="260" w:lineRule="auto"/>
+        <w:ind w:left="700"/>
+        <w:rPr>
+          <w:rFonts w:ascii="Montserrat" w:hAnsi="Montserrat"/>
+          <w:color w:val="1A1A1A"/>
+          <w:sz w:val="22"/>
+        </w:rPr>
+      </w:pPr>
+      <w:r>
+        <w:rPr>
+          <w:rFonts w:ascii="Montserrat" w:hAnsi="Montserrat"/>
+          <w:color w:val="1A1A1A"/>
+          <w:sz w:val="22"/>
+        </w:rPr>
+        <w:t>Alternativa mais rapida: use Importar Project - o sistema detecta automaticamente as colunas de nome, % concluido, inicio, termino e responsavel.</w:t>
+      </w:r>
+    </w:p>
+    <w:p>
+      <w:pPr>
+        <w:pStyle w:val="PargrafodaLista"/>
+        <w:numPr>
+          <w:ilvl w:val="0"/>
+          <w:numId w:val="14"/>
+        </w:numPr>
+        <w:spacing w:after="80" w:line="260" w:lineRule="auto"/>
+        <w:ind w:left="700"/>
+        <w:rPr>
+          <w:rFonts w:ascii="Montserrat" w:hAnsi="Montserrat"/>
+          <w:color w:val="1A1A1A"/>
+          <w:sz w:val="22"/>
+        </w:rPr>
+      </w:pPr>
+      <w:r>
+        <w:rPr>
+          <w:rFonts w:ascii="Montserrat" w:hAnsi="Montserrat"/>
+          <w:color w:val="1A1A1A"/>
+          <w:sz w:val="22"/>
+        </w:rPr>
+        <w:t>Clique em Salvar e ver painel. Use os botoes do rodape para Imprimir ou Exportar CSV.</w:t>
+      </w:r>
+    </w:p>
+    <w:p>
+      <w:pPr>
+        <w:spacing w:before="160" w:after="200"/>
+        <w:ind w:left="283"/>
+        <w:rPr>
+          <w:rFonts w:ascii="Montserrat" w:hAnsi="Montserrat"/>
+          <w:i/>
+          <w:color w:val="6A6A70"/>
+          <w:sz w:val="21"/>
+        </w:rPr>
+      </w:pPr>
+      <w:r>
+        <w:rPr>
+          <w:rFonts w:ascii="Montserrat" w:hAnsi="Montserrat"/>
+          <w:i/>
+          <w:color w:val="6A6A70"/>
+          <w:sz w:val="21"/>
+        </w:rPr>
+        <w:t>Sinalizacao automatica: a tabela de projetos do Painel ganhou a coluna Sinalizacao e o quadro de indicadores ganhou o card Em risco de atraso. E um calculo automatico, independente do campo Status manual: compara o % Execucao informado com o % que seria esperado pelo tempo ja decorrido entre o Inicio previsto e o Termino previsto do projeto. Se a defasagem for de 15 pontos percentuais ou mais, aparece Risco de atraso; se o Termino previsto ja passou e o projeto nao esta em 100%, aparece Prazo vencido. Projetos Concluido, Cancelado ou Paralisado ficam fora desse calculo. O resultado tambem sai no CSV exportado.</w:t>
+      </w:r>
+    </w:p>
+    <w:p>
+      <w:pPr>
+        <w:spacing w:before="120" w:after="40"/>
+        <w:jc w:val="center"/>
+      </w:pPr>
+      <w:r>
+        <w:rPr>
+          <w:noProof/>
+        </w:rPr>
+        <w:lastRenderedPageBreak/>
+        <w:drawing>
+          <wp:inline distT="0" distB="0" distL="0" distR="0" wp14:anchorId="475AA1F9" wp14:editId="65025BD3">
+            <wp:extent cx="5120640" cy="3282818"/>
+            <wp:effectExtent l="19050" t="19050" r="22860" b="13335"/>
+            <wp:docPr id="1967560191" name="Imagem 31"/>
+            <wp:cNvGraphicFramePr/>
+            <a:graphic xmlns:a="http://schemas.openxmlformats.org/drawingml/2006/main">
+              <a:graphicData uri="http://schemas.openxmlformats.org/drawingml/2006/picture">
+                <pic:pic xmlns:pic="http://schemas.openxmlformats.org/drawingml/2006/picture">
+                  <pic:nvPicPr>
+                    <pic:cNvPr id="1967560191" name=""/>
+                    <pic:cNvPicPr/>
+                  </pic:nvPicPr>
+                  <pic:blipFill>
+                    <a:blip r:embed="rId37">
                       <a:extLst>
                         <a:ext uri="{28A0092B-C50C-407E-A947-70E740481C1C}">
                           <a14:useLocalDpi xmlns:a14="http://schemas.microsoft.com/office/drawing/2010/main" val="0"/>
@@ -11846,7 +11953,7 @@
         <w:pStyle w:val="PargrafodaLista"/>
         <w:numPr>
           <w:ilvl w:val="0"/>
-          <w:numId w:val="14"/>
+          <w:numId w:val="15"/>
         </w:numPr>
         <w:spacing w:after="80" w:line="260" w:lineRule="auto"/>
         <w:ind w:left="700"/>
@@ -11895,22 +12002,21 @@
         <w:rPr>
           <w:noProof/>
         </w:rPr>
-        <w:lastRenderedPageBreak/>
         <w:drawing>
-          <wp:inline distT="0" distB="0" distL="0" distR="0" wp14:anchorId="130A9391" wp14:editId="4FCC4337">
+          <wp:inline distT="0" distB="0" distL="0" distR="0" wp14:anchorId="1F603760" wp14:editId="56C98907">
             <wp:extent cx="5120640" cy="1515102"/>
             <wp:effectExtent l="19050" t="19050" r="22860" b="28575"/>
-            <wp:docPr id="1347549668" name="Imagem 31"/>
+            <wp:docPr id="1308611057" name="Imagem 32"/>
             <wp:cNvGraphicFramePr/>
             <a:graphic xmlns:a="http://schemas.openxmlformats.org/drawingml/2006/main">
               <a:graphicData uri="http://schemas.openxmlformats.org/drawingml/2006/picture">
                 <pic:pic xmlns:pic="http://schemas.openxmlformats.org/drawingml/2006/picture">
                   <pic:nvPicPr>
-                    <pic:cNvPr id="1347549668" name=""/>
+                    <pic:cNvPr id="1308611057" name=""/>
                     <pic:cNvPicPr/>
                   </pic:nvPicPr>
                   <pic:blipFill>
-                    <a:blip r:embed="rId37">
+                    <a:blip r:embed="rId38">
                       <a:extLst>
                         <a:ext uri="{28A0092B-C50C-407E-A947-70E740481C1C}">
                           <a14:useLocalDpi xmlns:a14="http://schemas.microsoft.com/office/drawing/2010/main" val="0"/>
@@ -11981,6 +12087,7 @@
           <w:color w:val="6A6A70"/>
           <w:sz w:val="21"/>
         </w:rPr>
+        <w:lastRenderedPageBreak/>
         <w:t>Este relatorio nao tem aprovacao/status formal - e uma ferramenta viva de acompanhamento, atualizada sempre que a situacao dos projetos mudar.</w:t>
       </w:r>
     </w:p>
@@ -11995,7 +12102,7 @@
           <w:sz w:val="27"/>
         </w:rPr>
       </w:pPr>
-      <w:bookmarkStart w:id="26" w:name="_Toc236234368"/>
+      <w:bookmarkStart w:id="26" w:name="_Toc236241961"/>
       <w:r>
         <w:rPr>
           <w:rFonts w:ascii="Montserrat" w:hAnsi="Montserrat"/>
@@ -12034,95 +12141,17 @@
         <w:rPr>
           <w:noProof/>
         </w:rPr>
-        <w:lastRenderedPageBreak/>
         <w:drawing>
-          <wp:inline distT="0" distB="0" distL="0" distR="0" wp14:anchorId="706F8BAA" wp14:editId="0B802C70">
+          <wp:inline distT="0" distB="0" distL="0" distR="0" wp14:anchorId="44678CCF" wp14:editId="52A6F53A">
             <wp:extent cx="5120640" cy="4627581"/>
             <wp:effectExtent l="19050" t="19050" r="22860" b="20955"/>
-            <wp:docPr id="396631022" name="Imagem 32"/>
+            <wp:docPr id="968929317" name="Imagem 33"/>
             <wp:cNvGraphicFramePr/>
             <a:graphic xmlns:a="http://schemas.openxmlformats.org/drawingml/2006/main">
               <a:graphicData uri="http://schemas.openxmlformats.org/drawingml/2006/picture">
                 <pic:pic xmlns:pic="http://schemas.openxmlformats.org/drawingml/2006/picture">
                   <pic:nvPicPr>
-                    <pic:cNvPr id="396631022" name=""/>
-                    <pic:cNvPicPr/>
-                  </pic:nvPicPr>
-                  <pic:blipFill>
-                    <a:blip r:embed="rId38">
-                      <a:extLst>
-                        <a:ext uri="{28A0092B-C50C-407E-A947-70E740481C1C}">
-                          <a14:useLocalDpi xmlns:a14="http://schemas.microsoft.com/office/drawing/2010/main" val="0"/>
-                        </a:ext>
-                      </a:extLst>
-                    </a:blip>
-                    <a:stretch>
-                      <a:fillRect/>
-                    </a:stretch>
-                  </pic:blipFill>
-                  <pic:spPr>
-                    <a:xfrm>
-                      <a:off x="0" y="0"/>
-                      <a:ext cx="5120640" cy="4627581"/>
-                    </a:xfrm>
-                    <a:prstGeom prst="rect">
-                      <a:avLst/>
-                    </a:prstGeom>
-                    <a:ln w="9525">
-                      <a:solidFill>
-                        <a:srgbClr val="D1D5DB"/>
-                      </a:solidFill>
-                    </a:ln>
-                  </pic:spPr>
-                </pic:pic>
-              </a:graphicData>
-            </a:graphic>
-          </wp:inline>
-        </w:drawing>
-      </w:r>
-    </w:p>
-    <w:p>
-      <w:pPr>
-        <w:spacing w:before="120" w:after="280"/>
-        <w:jc w:val="center"/>
-        <w:rPr>
-          <w:rFonts w:ascii="Montserrat" w:hAnsi="Montserrat"/>
-          <w:i/>
-          <w:color w:val="6A6A70"/>
-          <w:sz w:val="19"/>
-        </w:rPr>
-      </w:pPr>
-      <w:r>
-        <w:rPr>
-          <w:rFonts w:ascii="Montserrat" w:hAnsi="Montserrat"/>
-          <w:i/>
-          <w:color w:val="6A6A70"/>
-          <w:sz w:val="19"/>
-        </w:rPr>
-        <w:t>Painel do Relatorio de Entregas e Beneficios (estado vazio).</w:t>
-      </w:r>
-    </w:p>
-    <w:p>
-      <w:pPr>
-        <w:spacing w:before="120" w:after="40"/>
-        <w:jc w:val="center"/>
-      </w:pPr>
-      <w:r>
-        <w:rPr>
-          <w:noProof/>
-        </w:rPr>
-        <w:lastRenderedPageBreak/>
-        <w:drawing>
-          <wp:inline distT="0" distB="0" distL="0" distR="0" wp14:anchorId="31D56FA3" wp14:editId="74133181">
-            <wp:extent cx="5120640" cy="4627581"/>
-            <wp:effectExtent l="19050" t="19050" r="22860" b="20955"/>
-            <wp:docPr id="951039801" name="Imagem 33"/>
-            <wp:cNvGraphicFramePr/>
-            <a:graphic xmlns:a="http://schemas.openxmlformats.org/drawingml/2006/main">
-              <a:graphicData uri="http://schemas.openxmlformats.org/drawingml/2006/picture">
-                <pic:pic xmlns:pic="http://schemas.openxmlformats.org/drawingml/2006/picture">
-                  <pic:nvPicPr>
-                    <pic:cNvPr id="951039801" name=""/>
+                    <pic:cNvPr id="968929317" name=""/>
                     <pic:cNvPicPr/>
                   </pic:nvPicPr>
                   <pic:blipFill>
@@ -12176,100 +12205,7 @@
           <w:color w:val="6A6A70"/>
           <w:sz w:val="19"/>
         </w:rPr>
-        <w:t>Aba Editar dados: Ficha do Programa, o primeiro bloco a preencher.</w:t>
-      </w:r>
-    </w:p>
-    <w:p>
-      <w:pPr>
-        <w:pStyle w:val="PargrafodaLista"/>
-        <w:numPr>
-          <w:ilvl w:val="0"/>
-          <w:numId w:val="14"/>
-        </w:numPr>
-        <w:spacing w:after="80" w:line="260" w:lineRule="auto"/>
-        <w:ind w:left="700"/>
-        <w:rPr>
-          <w:rFonts w:ascii="Montserrat" w:hAnsi="Montserrat"/>
-          <w:color w:val="1A1A1A"/>
-          <w:sz w:val="22"/>
-        </w:rPr>
-      </w:pPr>
-      <w:r>
-        <w:rPr>
-          <w:rFonts w:ascii="Montserrat" w:hAnsi="Montserrat"/>
-          <w:color w:val="1A1A1A"/>
-          <w:sz w:val="22"/>
-        </w:rPr>
-        <w:t>Preencha a Ficha do Programa (codigo, nome, unidade, responsavel, justificativa, objetivo, alinhamento estrategico).</w:t>
-      </w:r>
-    </w:p>
-    <w:p>
-      <w:pPr>
-        <w:pStyle w:val="PargrafodaLista"/>
-        <w:numPr>
-          <w:ilvl w:val="0"/>
-          <w:numId w:val="14"/>
-        </w:numPr>
-        <w:spacing w:after="80" w:line="260" w:lineRule="auto"/>
-        <w:ind w:left="700"/>
-        <w:rPr>
-          <w:rFonts w:ascii="Montserrat" w:hAnsi="Montserrat"/>
-          <w:color w:val="1A1A1A"/>
-          <w:sz w:val="22"/>
-        </w:rPr>
-      </w:pPr>
-      <w:r>
-        <w:rPr>
-          <w:rFonts w:ascii="Montserrat" w:hAnsi="Montserrat"/>
-          <w:color w:val="1A1A1A"/>
-          <w:sz w:val="22"/>
-        </w:rPr>
-        <w:t>Cadastre indicadores e valores estimados do programa, depois cada projeto vinculado (com suas proprias entregas, indicadores e valores).</w:t>
-      </w:r>
-    </w:p>
-    <w:p>
-      <w:pPr>
-        <w:pStyle w:val="PargrafodaLista"/>
-        <w:numPr>
-          <w:ilvl w:val="0"/>
-          <w:numId w:val="14"/>
-        </w:numPr>
-        <w:spacing w:after="80" w:line="260" w:lineRule="auto"/>
-        <w:ind w:left="700"/>
-        <w:rPr>
-          <w:rFonts w:ascii="Montserrat" w:hAnsi="Montserrat"/>
-          <w:color w:val="1A1A1A"/>
-          <w:sz w:val="22"/>
-        </w:rPr>
-      </w:pPr>
-      <w:r>
-        <w:rPr>
-          <w:rFonts w:ascii="Montserrat" w:hAnsi="Montserrat"/>
-          <w:color w:val="1A1A1A"/>
-          <w:sz w:val="22"/>
-        </w:rPr>
-        <w:t>Clique em Salvar e ver painel. Imprima ou exporte para levar a reuniao de pactuacao.</w:t>
-      </w:r>
-    </w:p>
-    <w:p>
-      <w:pPr>
-        <w:spacing w:before="160" w:after="200"/>
-        <w:ind w:left="283"/>
-        <w:rPr>
-          <w:rFonts w:ascii="Montserrat" w:hAnsi="Montserrat"/>
-          <w:i/>
-          <w:color w:val="6A6A70"/>
-          <w:sz w:val="21"/>
-        </w:rPr>
-      </w:pPr>
-      <w:r>
-        <w:rPr>
-          <w:rFonts w:ascii="Montserrat" w:hAnsi="Montserrat"/>
-          <w:i/>
-          <w:color w:val="6A6A70"/>
-          <w:sz w:val="21"/>
-        </w:rPr>
-        <w:t>Gate 2 - Pactuacao: no topo da aba Editar dados ha um cartao Gate 2 - Pactuacao com Status (Pendente de pactuacao / Pactuado), Data de pactuacao e Aprovador. Assim como o Gate 1 da Solicitacao de Demanda, so o Admin consegue alterar o Status - qualquer outro papel ve o controle travado com um aviso. Ao marcar Pactuado, a Data e o Aprovador sao preenchidos automaticamente (editaveis). Enquanto o status estiver Pactuado, todos os demais campos do relatorio ficam bloqueados para edicao, inclusive para o Admin, ate que o Gate 2 seja reaberto (status volte para Pendente de pactuacao).</w:t>
+        <w:t>Painel do Relatorio de Entregas e Beneficios (estado vazio).</w:t>
       </w:r>
     </w:p>
     <w:p>
@@ -12283,20 +12219,287 @@
         </w:rPr>
         <w:lastRenderedPageBreak/>
         <w:drawing>
-          <wp:inline distT="0" distB="0" distL="0" distR="0" wp14:anchorId="5936DF7A" wp14:editId="18F789AB">
-            <wp:extent cx="5120640" cy="3282818"/>
-            <wp:effectExtent l="19050" t="19050" r="22860" b="13335"/>
-            <wp:docPr id="1371507500" name="Imagem 34"/>
+          <wp:inline distT="0" distB="0" distL="0" distR="0" wp14:anchorId="23A457F6" wp14:editId="4D82EAC3">
+            <wp:extent cx="5120640" cy="4627581"/>
+            <wp:effectExtent l="19050" t="19050" r="22860" b="20955"/>
+            <wp:docPr id="1351846968" name="Imagem 34"/>
             <wp:cNvGraphicFramePr/>
             <a:graphic xmlns:a="http://schemas.openxmlformats.org/drawingml/2006/main">
               <a:graphicData uri="http://schemas.openxmlformats.org/drawingml/2006/picture">
                 <pic:pic xmlns:pic="http://schemas.openxmlformats.org/drawingml/2006/picture">
                   <pic:nvPicPr>
-                    <pic:cNvPr id="1371507500" name=""/>
+                    <pic:cNvPr id="1351846968" name=""/>
                     <pic:cNvPicPr/>
                   </pic:nvPicPr>
                   <pic:blipFill>
                     <a:blip r:embed="rId40">
+                      <a:extLst>
+                        <a:ext uri="{28A0092B-C50C-407E-A947-70E740481C1C}">
+                          <a14:useLocalDpi xmlns:a14="http://schemas.microsoft.com/office/drawing/2010/main" val="0"/>
+                        </a:ext>
+                      </a:extLst>
+                    </a:blip>
+                    <a:stretch>
+                      <a:fillRect/>
+                    </a:stretch>
+                  </pic:blipFill>
+                  <pic:spPr>
+                    <a:xfrm>
+                      <a:off x="0" y="0"/>
+                      <a:ext cx="5120640" cy="4627581"/>
+                    </a:xfrm>
+                    <a:prstGeom prst="rect">
+                      <a:avLst/>
+                    </a:prstGeom>
+                    <a:ln w="9525">
+                      <a:solidFill>
+                        <a:srgbClr val="D1D5DB"/>
+                      </a:solidFill>
+                    </a:ln>
+                  </pic:spPr>
+                </pic:pic>
+              </a:graphicData>
+            </a:graphic>
+          </wp:inline>
+        </w:drawing>
+      </w:r>
+    </w:p>
+    <w:p>
+      <w:pPr>
+        <w:spacing w:before="120" w:after="280"/>
+        <w:jc w:val="center"/>
+        <w:rPr>
+          <w:rFonts w:ascii="Montserrat" w:hAnsi="Montserrat"/>
+          <w:i/>
+          <w:color w:val="6A6A70"/>
+          <w:sz w:val="19"/>
+        </w:rPr>
+      </w:pPr>
+      <w:r>
+        <w:rPr>
+          <w:rFonts w:ascii="Montserrat" w:hAnsi="Montserrat"/>
+          <w:i/>
+          <w:color w:val="6A6A70"/>
+          <w:sz w:val="19"/>
+        </w:rPr>
+        <w:t>Aba Editar dados: Ficha do Programa, o primeiro bloco a preencher.</w:t>
+      </w:r>
+    </w:p>
+    <w:p>
+      <w:pPr>
+        <w:pStyle w:val="PargrafodaLista"/>
+        <w:numPr>
+          <w:ilvl w:val="0"/>
+          <w:numId w:val="15"/>
+        </w:numPr>
+        <w:spacing w:after="80" w:line="260" w:lineRule="auto"/>
+        <w:ind w:left="700"/>
+        <w:rPr>
+          <w:rFonts w:ascii="Montserrat" w:hAnsi="Montserrat"/>
+          <w:color w:val="1A1A1A"/>
+          <w:sz w:val="22"/>
+        </w:rPr>
+      </w:pPr>
+      <w:r>
+        <w:rPr>
+          <w:rFonts w:ascii="Montserrat" w:hAnsi="Montserrat"/>
+          <w:color w:val="1A1A1A"/>
+          <w:sz w:val="22"/>
+        </w:rPr>
+        <w:t>Preencha a Ficha do Programa (codigo, nome, unidade, responsavel, justificativa, objetivo, alinhamento estrategico).</w:t>
+      </w:r>
+    </w:p>
+    <w:p>
+      <w:pPr>
+        <w:pStyle w:val="PargrafodaLista"/>
+        <w:numPr>
+          <w:ilvl w:val="0"/>
+          <w:numId w:val="15"/>
+        </w:numPr>
+        <w:spacing w:after="80" w:line="260" w:lineRule="auto"/>
+        <w:ind w:left="700"/>
+        <w:rPr>
+          <w:rFonts w:ascii="Montserrat" w:hAnsi="Montserrat"/>
+          <w:color w:val="1A1A1A"/>
+          <w:sz w:val="22"/>
+        </w:rPr>
+      </w:pPr>
+      <w:r>
+        <w:rPr>
+          <w:rFonts w:ascii="Montserrat" w:hAnsi="Montserrat"/>
+          <w:color w:val="1A1A1A"/>
+          <w:sz w:val="22"/>
+        </w:rPr>
+        <w:t>Cadastre indicadores e valores estimados do programa, depois cada projeto vinculado (com suas proprias entregas, indicadores e valores).</w:t>
+      </w:r>
+    </w:p>
+    <w:p>
+      <w:pPr>
+        <w:spacing w:before="160" w:after="200"/>
+        <w:ind w:left="283"/>
+        <w:rPr>
+          <w:rFonts w:ascii="Montserrat" w:hAnsi="Montserrat"/>
+          <w:i/>
+          <w:color w:val="6A6A70"/>
+          <w:sz w:val="21"/>
+        </w:rPr>
+      </w:pPr>
+      <w:r>
+        <w:rPr>
+          <w:rFonts w:ascii="Montserrat" w:hAnsi="Montserrat"/>
+          <w:i/>
+          <w:color w:val="6A6A70"/>
+          <w:sz w:val="21"/>
+        </w:rPr>
+        <w:t>Projeto vinculado (Gate 1) - opcional: assim como no Relatorio de Situacao (secao 4.1), cada projeto cadastrado aqui pode ser associado a um Projeto ja Aprovado no Gate 1. A selecao preenche automaticamente o Nome do projeto (se ainda estiver vazio) e libera o botao Ver historico, mostrando as alteracoes feitas nesse projeto em qualquer outro formulario vinculado a ele - incluindo decisoes de SMP (Passo 7).</w:t>
+      </w:r>
+    </w:p>
+    <w:p>
+      <w:pPr>
+        <w:spacing w:before="120" w:after="40"/>
+        <w:jc w:val="center"/>
+      </w:pPr>
+      <w:r>
+        <w:rPr>
+          <w:noProof/>
+        </w:rPr>
+        <w:lastRenderedPageBreak/>
+        <w:drawing>
+          <wp:inline distT="0" distB="0" distL="0" distR="0" wp14:anchorId="46569D35" wp14:editId="5D076349">
+            <wp:extent cx="5120640" cy="2144319"/>
+            <wp:effectExtent l="19050" t="19050" r="22860" b="27940"/>
+            <wp:docPr id="2014520920" name="Imagem 35"/>
+            <wp:cNvGraphicFramePr/>
+            <a:graphic xmlns:a="http://schemas.openxmlformats.org/drawingml/2006/main">
+              <a:graphicData uri="http://schemas.openxmlformats.org/drawingml/2006/picture">
+                <pic:pic xmlns:pic="http://schemas.openxmlformats.org/drawingml/2006/picture">
+                  <pic:nvPicPr>
+                    <pic:cNvPr id="2014520920" name=""/>
+                    <pic:cNvPicPr/>
+                  </pic:nvPicPr>
+                  <pic:blipFill>
+                    <a:blip r:embed="rId41">
+                      <a:extLst>
+                        <a:ext uri="{28A0092B-C50C-407E-A947-70E740481C1C}">
+                          <a14:useLocalDpi xmlns:a14="http://schemas.microsoft.com/office/drawing/2010/main" val="0"/>
+                        </a:ext>
+                      </a:extLst>
+                    </a:blip>
+                    <a:stretch>
+                      <a:fillRect/>
+                    </a:stretch>
+                  </pic:blipFill>
+                  <pic:spPr>
+                    <a:xfrm>
+                      <a:off x="0" y="0"/>
+                      <a:ext cx="5120640" cy="2144319"/>
+                    </a:xfrm>
+                    <a:prstGeom prst="rect">
+                      <a:avLst/>
+                    </a:prstGeom>
+                    <a:ln w="9525">
+                      <a:solidFill>
+                        <a:srgbClr val="D1D5DB"/>
+                      </a:solidFill>
+                    </a:ln>
+                  </pic:spPr>
+                </pic:pic>
+              </a:graphicData>
+            </a:graphic>
+          </wp:inline>
+        </w:drawing>
+      </w:r>
+    </w:p>
+    <w:p>
+      <w:pPr>
+        <w:spacing w:before="120" w:after="280"/>
+        <w:jc w:val="center"/>
+        <w:rPr>
+          <w:rFonts w:ascii="Montserrat" w:hAnsi="Montserrat"/>
+          <w:i/>
+          <w:color w:val="6A6A70"/>
+          <w:sz w:val="19"/>
+        </w:rPr>
+      </w:pPr>
+      <w:r>
+        <w:rPr>
+          <w:rFonts w:ascii="Montserrat" w:hAnsi="Montserrat"/>
+          <w:i/>
+          <w:color w:val="6A6A70"/>
+          <w:sz w:val="19"/>
+        </w:rPr>
+        <w:t>Projeto vinculado selecionado no Relatorio de Entregas, com nome e historico preenchidos.</w:t>
+      </w:r>
+    </w:p>
+    <w:p>
+      <w:pPr>
+        <w:pStyle w:val="PargrafodaLista"/>
+        <w:numPr>
+          <w:ilvl w:val="0"/>
+          <w:numId w:val="16"/>
+        </w:numPr>
+        <w:spacing w:after="80" w:line="260" w:lineRule="auto"/>
+        <w:ind w:left="700"/>
+        <w:rPr>
+          <w:rFonts w:ascii="Montserrat" w:hAnsi="Montserrat"/>
+          <w:color w:val="1A1A1A"/>
+          <w:sz w:val="22"/>
+        </w:rPr>
+      </w:pPr>
+      <w:r>
+        <w:rPr>
+          <w:rFonts w:ascii="Montserrat" w:hAnsi="Montserrat"/>
+          <w:color w:val="1A1A1A"/>
+          <w:sz w:val="22"/>
+        </w:rPr>
+        <w:t>Clique em Salvar e ver painel. Imprima ou exporte para levar a reuniao de pactuacao.</w:t>
+      </w:r>
+    </w:p>
+    <w:p>
+      <w:pPr>
+        <w:spacing w:before="160" w:after="200"/>
+        <w:ind w:left="283"/>
+        <w:rPr>
+          <w:rFonts w:ascii="Montserrat" w:hAnsi="Montserrat"/>
+          <w:i/>
+          <w:color w:val="6A6A70"/>
+          <w:sz w:val="21"/>
+        </w:rPr>
+      </w:pPr>
+      <w:r>
+        <w:rPr>
+          <w:rFonts w:ascii="Montserrat" w:hAnsi="Montserrat"/>
+          <w:i/>
+          <w:color w:val="6A6A70"/>
+          <w:sz w:val="21"/>
+        </w:rPr>
+        <w:t>Gate 2 - Pactuacao: no topo da aba Editar dados ha um cartao Gate 2 - Pactuacao com Status (Pendente de pactuacao / Pactuado), Data de pactuacao e Aprovador. Assim como o Gate 1 da Solicitacao de Demanda, so o Admin consegue alterar o Status - qualquer outro papel ve o controle travado com um aviso. Ao marcar Pactuado, a Data e o Aprovador sao preenchidos automaticamente (editaveis). Enquanto o status estiver Pactuado, todos os demais campos do relatorio ficam bloqueados para edicao, inclusive para o Admin, ate que o Gate 2 seja reaberto (status volte para Pendente de pactuacao).</w:t>
+      </w:r>
+    </w:p>
+    <w:p>
+      <w:pPr>
+        <w:spacing w:before="120" w:after="40"/>
+        <w:jc w:val="center"/>
+      </w:pPr>
+      <w:r>
+        <w:rPr>
+          <w:noProof/>
+        </w:rPr>
+        <w:drawing>
+          <wp:inline distT="0" distB="0" distL="0" distR="0" wp14:anchorId="75231EF7" wp14:editId="16FAAB12">
+            <wp:extent cx="5120640" cy="3282818"/>
+            <wp:effectExtent l="19050" t="19050" r="22860" b="13335"/>
+            <wp:docPr id="1635229769" name="Imagem 36"/>
+            <wp:cNvGraphicFramePr/>
+            <a:graphic xmlns:a="http://schemas.openxmlformats.org/drawingml/2006/main">
+              <a:graphicData uri="http://schemas.openxmlformats.org/drawingml/2006/picture">
+                <pic:pic xmlns:pic="http://schemas.openxmlformats.org/drawingml/2006/picture">
+                  <pic:nvPicPr>
+                    <pic:cNvPr id="1635229769" name=""/>
+                    <pic:cNvPicPr/>
+                  </pic:nvPicPr>
+                  <pic:blipFill>
+                    <a:blip r:embed="rId42">
                       <a:extLst>
                         <a:ext uri="{28A0092B-C50C-407E-A947-70E740481C1C}">
                           <a14:useLocalDpi xmlns:a14="http://schemas.microsoft.com/office/drawing/2010/main" val="0"/>
@@ -12346,6 +12549,7 @@
           <w:color w:val="6A6A70"/>
           <w:sz w:val="19"/>
         </w:rPr>
+        <w:lastRenderedPageBreak/>
         <w:t>Cartao Gate 2 - Pactuacao preenchido, com o relatorio travado apos a pactuacao.</w:t>
       </w:r>
     </w:p>
@@ -12385,7 +12589,7 @@
           <w:sz w:val="34"/>
         </w:rPr>
       </w:pPr>
-      <w:bookmarkStart w:id="27" w:name="_Toc236234369"/>
+      <w:bookmarkStart w:id="27" w:name="_Toc236241962"/>
       <w:r>
         <w:rPr>
           <w:rFonts w:ascii="Montserrat" w:hAnsi="Montserrat"/>
@@ -12445,7 +12649,7 @@
           <w:sz w:val="27"/>
         </w:rPr>
       </w:pPr>
-      <w:bookmarkStart w:id="28" w:name="_Toc236234370"/>
+      <w:bookmarkStart w:id="28" w:name="_Toc236241963"/>
       <w:r>
         <w:rPr>
           <w:rFonts w:ascii="Montserrat" w:hAnsi="Montserrat"/>
@@ -12485,252 +12689,16 @@
           <w:noProof/>
         </w:rPr>
         <w:drawing>
-          <wp:inline distT="0" distB="0" distL="0" distR="0" wp14:anchorId="14D44494" wp14:editId="19A12D4E">
+          <wp:inline distT="0" distB="0" distL="0" distR="0" wp14:anchorId="02E61A72" wp14:editId="3A40AA5E">
             <wp:extent cx="5303520" cy="4792851"/>
             <wp:effectExtent l="19050" t="19050" r="11430" b="27305"/>
-            <wp:docPr id="528221885" name="Imagem 35"/>
+            <wp:docPr id="1986985544" name="Imagem 37"/>
             <wp:cNvGraphicFramePr/>
             <a:graphic xmlns:a="http://schemas.openxmlformats.org/drawingml/2006/main">
               <a:graphicData uri="http://schemas.openxmlformats.org/drawingml/2006/picture">
                 <pic:pic xmlns:pic="http://schemas.openxmlformats.org/drawingml/2006/picture">
                   <pic:nvPicPr>
-                    <pic:cNvPr id="528221885" name=""/>
-                    <pic:cNvPicPr/>
-                  </pic:nvPicPr>
-                  <pic:blipFill>
-                    <a:blip r:embed="rId41">
-                      <a:extLst>
-                        <a:ext uri="{28A0092B-C50C-407E-A947-70E740481C1C}">
-                          <a14:useLocalDpi xmlns:a14="http://schemas.microsoft.com/office/drawing/2010/main" val="0"/>
-                        </a:ext>
-                      </a:extLst>
-                    </a:blip>
-                    <a:stretch>
-                      <a:fillRect/>
-                    </a:stretch>
-                  </pic:blipFill>
-                  <pic:spPr>
-                    <a:xfrm>
-                      <a:off x="0" y="0"/>
-                      <a:ext cx="5303520" cy="4792851"/>
-                    </a:xfrm>
-                    <a:prstGeom prst="rect">
-                      <a:avLst/>
-                    </a:prstGeom>
-                    <a:ln w="9525">
-                      <a:solidFill>
-                        <a:srgbClr val="D1D5DB"/>
-                      </a:solidFill>
-                    </a:ln>
-                  </pic:spPr>
-                </pic:pic>
-              </a:graphicData>
-            </a:graphic>
-          </wp:inline>
-        </w:drawing>
-      </w:r>
-    </w:p>
-    <w:p>
-      <w:pPr>
-        <w:spacing w:before="120" w:after="280"/>
-        <w:jc w:val="center"/>
-        <w:rPr>
-          <w:rFonts w:ascii="Montserrat" w:hAnsi="Montserrat"/>
-          <w:i/>
-          <w:color w:val="6A6A70"/>
-          <w:sz w:val="19"/>
-        </w:rPr>
-      </w:pPr>
-      <w:r>
-        <w:rPr>
-          <w:rFonts w:ascii="Montserrat" w:hAnsi="Montserrat"/>
-          <w:i/>
-          <w:color w:val="6A6A70"/>
-          <w:sz w:val="19"/>
-        </w:rPr>
-        <w:lastRenderedPageBreak/>
-        <w:t>Quadro de conexoes com o fator F1 selecionado - o painel a direita mostra os beneficios que ele habilita.</w:t>
-      </w:r>
-    </w:p>
-    <w:p>
-      <w:pPr>
-        <w:pStyle w:val="Ttulo2"/>
-        <w:spacing w:before="320" w:after="120"/>
-        <w:rPr>
-          <w:rFonts w:ascii="Montserrat" w:hAnsi="Montserrat"/>
-          <w:b/>
-          <w:color w:val="B91D2E"/>
-          <w:sz w:val="27"/>
-        </w:rPr>
-      </w:pPr>
-      <w:bookmarkStart w:id="29" w:name="_Toc236234371"/>
-      <w:r>
-        <w:rPr>
-          <w:rFonts w:ascii="Montserrat" w:hAnsi="Montserrat"/>
-          <w:b/>
-          <w:color w:val="B91D2E"/>
-          <w:sz w:val="27"/>
-        </w:rPr>
-        <w:t>5.2 Simulador - e se...?</w:t>
-      </w:r>
-      <w:bookmarkEnd w:id="29"/>
-    </w:p>
-    <w:p>
-      <w:pPr>
-        <w:spacing w:line="280" w:lineRule="auto"/>
-        <w:rPr>
-          <w:rFonts w:ascii="Montserrat" w:hAnsi="Montserrat"/>
-          <w:color w:val="1A1A1A"/>
-          <w:sz w:val="22"/>
-        </w:rPr>
-      </w:pPr>
-      <w:r>
-        <w:rPr>
-          <w:rFonts w:ascii="Montserrat" w:hAnsi="Montserrat"/>
-          <w:color w:val="1A1A1A"/>
-          <w:sz w:val="22"/>
-        </w:rPr>
-        <w:t>Ajuste o quanto cada fator esta presente no seu projeto (0-100%) e veja o potencial estimado de cada dimensao de beneficio recalcular em tempo real.</w:t>
-      </w:r>
-    </w:p>
-    <w:p>
-      <w:pPr>
-        <w:spacing w:before="120" w:after="40"/>
-        <w:jc w:val="center"/>
-      </w:pPr>
-      <w:r>
-        <w:rPr>
-          <w:noProof/>
-        </w:rPr>
-        <w:drawing>
-          <wp:inline distT="0" distB="0" distL="0" distR="0" wp14:anchorId="4370C174" wp14:editId="195C0CD6">
-            <wp:extent cx="5303520" cy="4792851"/>
-            <wp:effectExtent l="19050" t="19050" r="11430" b="27305"/>
-            <wp:docPr id="842020047" name="Imagem 36"/>
-            <wp:cNvGraphicFramePr/>
-            <a:graphic xmlns:a="http://schemas.openxmlformats.org/drawingml/2006/main">
-              <a:graphicData uri="http://schemas.openxmlformats.org/drawingml/2006/picture">
-                <pic:pic xmlns:pic="http://schemas.openxmlformats.org/drawingml/2006/picture">
-                  <pic:nvPicPr>
-                    <pic:cNvPr id="842020047" name=""/>
-                    <pic:cNvPicPr/>
-                  </pic:nvPicPr>
-                  <pic:blipFill>
-                    <a:blip r:embed="rId42">
-                      <a:extLst>
-                        <a:ext uri="{28A0092B-C50C-407E-A947-70E740481C1C}">
-                          <a14:useLocalDpi xmlns:a14="http://schemas.microsoft.com/office/drawing/2010/main" val="0"/>
-                        </a:ext>
-                      </a:extLst>
-                    </a:blip>
-                    <a:stretch>
-                      <a:fillRect/>
-                    </a:stretch>
-                  </pic:blipFill>
-                  <pic:spPr>
-                    <a:xfrm>
-                      <a:off x="0" y="0"/>
-                      <a:ext cx="5303520" cy="4792851"/>
-                    </a:xfrm>
-                    <a:prstGeom prst="rect">
-                      <a:avLst/>
-                    </a:prstGeom>
-                    <a:ln w="9525">
-                      <a:solidFill>
-                        <a:srgbClr val="D1D5DB"/>
-                      </a:solidFill>
-                    </a:ln>
-                  </pic:spPr>
-                </pic:pic>
-              </a:graphicData>
-            </a:graphic>
-          </wp:inline>
-        </w:drawing>
-      </w:r>
-    </w:p>
-    <w:p>
-      <w:pPr>
-        <w:spacing w:before="120" w:after="280"/>
-        <w:jc w:val="center"/>
-        <w:rPr>
-          <w:rFonts w:ascii="Montserrat" w:hAnsi="Montserrat"/>
-          <w:i/>
-          <w:color w:val="6A6A70"/>
-          <w:sz w:val="19"/>
-        </w:rPr>
-      </w:pPr>
-      <w:r>
-        <w:rPr>
-          <w:rFonts w:ascii="Montserrat" w:hAnsi="Montserrat"/>
-          <w:i/>
-          <w:color w:val="6A6A70"/>
-          <w:sz w:val="19"/>
-        </w:rPr>
-        <w:t>Simulador de fatores x beneficios. Abaixo dele, o aviso de login para quem quiser vincular a um projeto.</w:t>
-      </w:r>
-    </w:p>
-    <w:p>
-      <w:pPr>
-        <w:pStyle w:val="Ttulo2"/>
-        <w:spacing w:before="320" w:after="120"/>
-        <w:rPr>
-          <w:rFonts w:ascii="Montserrat" w:hAnsi="Montserrat"/>
-          <w:b/>
-          <w:color w:val="B91D2E"/>
-          <w:sz w:val="27"/>
-        </w:rPr>
-      </w:pPr>
-      <w:bookmarkStart w:id="30" w:name="_Toc236234372"/>
-      <w:r>
-        <w:rPr>
-          <w:rFonts w:ascii="Montserrat" w:hAnsi="Montserrat"/>
-          <w:b/>
-          <w:color w:val="B91D2E"/>
-          <w:sz w:val="27"/>
-        </w:rPr>
-        <w:t>5.3 Assistente de decisao em 8 perguntas</w:t>
-      </w:r>
-      <w:bookmarkEnd w:id="30"/>
-    </w:p>
-    <w:p>
-      <w:pPr>
-        <w:spacing w:line="280" w:lineRule="auto"/>
-        <w:rPr>
-          <w:rFonts w:ascii="Montserrat" w:hAnsi="Montserrat"/>
-          <w:color w:val="1A1A1A"/>
-          <w:sz w:val="22"/>
-        </w:rPr>
-      </w:pPr>
-      <w:r>
-        <w:rPr>
-          <w:rFonts w:ascii="Montserrat" w:hAnsi="Montserrat"/>
-          <w:color w:val="1A1A1A"/>
-          <w:sz w:val="22"/>
-        </w:rPr>
-        <w:t>Responda a oito perguntas do semaforo de decisao, uma de cada vez. Ao final, o painel devolve um veredito com a regra aplicada.</w:t>
-      </w:r>
-    </w:p>
-    <w:p>
-      <w:pPr>
-        <w:spacing w:before="120" w:after="40"/>
-        <w:jc w:val="center"/>
-      </w:pPr>
-      <w:r>
-        <w:rPr>
-          <w:noProof/>
-        </w:rPr>
-        <w:lastRenderedPageBreak/>
-        <w:drawing>
-          <wp:inline distT="0" distB="0" distL="0" distR="0" wp14:anchorId="50E995B1" wp14:editId="78FE7529">
-            <wp:extent cx="5303520" cy="4792851"/>
-            <wp:effectExtent l="19050" t="19050" r="11430" b="27305"/>
-            <wp:docPr id="1543957808" name="Imagem 37"/>
-            <wp:cNvGraphicFramePr/>
-            <a:graphic xmlns:a="http://schemas.openxmlformats.org/drawingml/2006/main">
-              <a:graphicData uri="http://schemas.openxmlformats.org/drawingml/2006/picture">
-                <pic:pic xmlns:pic="http://schemas.openxmlformats.org/drawingml/2006/picture">
-                  <pic:nvPicPr>
-                    <pic:cNvPr id="1543957808" name=""/>
+                    <pic:cNvPr id="1986985544" name=""/>
                     <pic:cNvPicPr/>
                   </pic:nvPicPr>
                   <pic:blipFill>
@@ -12784,7 +12752,49 @@
           <w:color w:val="6A6A70"/>
           <w:sz w:val="19"/>
         </w:rPr>
-        <w:t>Primeira pergunta do assistente de decisao.</w:t>
+        <w:lastRenderedPageBreak/>
+        <w:t>Quadro de conexoes com o fator F1 selecionado - o painel a direita mostra os beneficios que ele habilita.</w:t>
+      </w:r>
+    </w:p>
+    <w:p>
+      <w:pPr>
+        <w:pStyle w:val="Ttulo2"/>
+        <w:spacing w:before="320" w:after="120"/>
+        <w:rPr>
+          <w:rFonts w:ascii="Montserrat" w:hAnsi="Montserrat"/>
+          <w:b/>
+          <w:color w:val="B91D2E"/>
+          <w:sz w:val="27"/>
+        </w:rPr>
+      </w:pPr>
+      <w:bookmarkStart w:id="29" w:name="_Toc236241964"/>
+      <w:r>
+        <w:rPr>
+          <w:rFonts w:ascii="Montserrat" w:hAnsi="Montserrat"/>
+          <w:b/>
+          <w:color w:val="B91D2E"/>
+          <w:sz w:val="27"/>
+        </w:rPr>
+        <w:t>5.2 Simulador - e se...?</w:t>
+      </w:r>
+      <w:bookmarkEnd w:id="29"/>
+    </w:p>
+    <w:p>
+      <w:pPr>
+        <w:spacing w:line="280" w:lineRule="auto"/>
+        <w:rPr>
+          <w:rFonts w:ascii="Montserrat" w:hAnsi="Montserrat"/>
+          <w:color w:val="1A1A1A"/>
+          <w:sz w:val="22"/>
+        </w:rPr>
+      </w:pPr>
+      <w:r>
+        <w:rPr>
+          <w:rFonts w:ascii="Montserrat" w:hAnsi="Montserrat"/>
+          <w:color w:val="1A1A1A"/>
+          <w:sz w:val="22"/>
+        </w:rPr>
+        <w:t>Ajuste o quanto cada fator esta presente no seu projeto (0-100%) e veja o potencial estimado de cada dimensao de beneficio recalcular em tempo real.</w:t>
       </w:r>
     </w:p>
     <w:p>
@@ -12796,18 +12806,17 @@
         <w:rPr>
           <w:noProof/>
         </w:rPr>
-        <w:lastRenderedPageBreak/>
         <w:drawing>
-          <wp:inline distT="0" distB="0" distL="0" distR="0" wp14:anchorId="6DC410E2" wp14:editId="72A6246E">
+          <wp:inline distT="0" distB="0" distL="0" distR="0" wp14:anchorId="03AB73D1" wp14:editId="060E7237">
             <wp:extent cx="5303520" cy="4792851"/>
             <wp:effectExtent l="19050" t="19050" r="11430" b="27305"/>
-            <wp:docPr id="1663763347" name="Imagem 38"/>
+            <wp:docPr id="1726922309" name="Imagem 38"/>
             <wp:cNvGraphicFramePr/>
             <a:graphic xmlns:a="http://schemas.openxmlformats.org/drawingml/2006/main">
               <a:graphicData uri="http://schemas.openxmlformats.org/drawingml/2006/picture">
                 <pic:pic xmlns:pic="http://schemas.openxmlformats.org/drawingml/2006/picture">
                   <pic:nvPicPr>
-                    <pic:cNvPr id="1663763347" name=""/>
+                    <pic:cNvPr id="1726922309" name=""/>
                     <pic:cNvPicPr/>
                   </pic:nvPicPr>
                   <pic:blipFill>
@@ -12861,74 +12870,7 @@
           <w:color w:val="6A6A70"/>
           <w:sz w:val="19"/>
         </w:rPr>
-        <w:t>Veredito final, com o placar de respostas verdes/amarelas/vermelhas.</w:t>
-      </w:r>
-    </w:p>
-    <w:p>
-      <w:pPr>
-        <w:spacing w:before="160" w:after="200"/>
-        <w:ind w:left="283"/>
-        <w:rPr>
-          <w:rFonts w:ascii="Montserrat" w:hAnsi="Montserrat"/>
-          <w:i/>
-          <w:color w:val="6A6A70"/>
-          <w:sz w:val="21"/>
-        </w:rPr>
-      </w:pPr>
-      <w:r>
-        <w:rPr>
-          <w:rFonts w:ascii="Montserrat" w:hAnsi="Montserrat"/>
-          <w:i/>
-          <w:color w:val="6A6A70"/>
-          <w:sz w:val="21"/>
-        </w:rPr>
-        <w:t>Regra aplicada: qualquer resposta vermelha leva a encerrar/repactuar; tres ou mais amarelas levam a replanejar; caso contrario, o veredito e concluir.</w:t>
-      </w:r>
-    </w:p>
-    <w:p>
-      <w:pPr>
-        <w:pStyle w:val="Ttulo1"/>
-        <w:pageBreakBefore/>
-        <w:pBdr>
-          <w:bottom w:val="single" w:sz="4" w:space="0" w:color="E4E4E7"/>
-        </w:pBdr>
-        <w:spacing w:before="80" w:after="200"/>
-        <w:rPr>
-          <w:rFonts w:ascii="Montserrat" w:hAnsi="Montserrat"/>
-          <w:b/>
-          <w:color w:val="1A1A1A"/>
-          <w:sz w:val="34"/>
-        </w:rPr>
-      </w:pPr>
-      <w:bookmarkStart w:id="31" w:name="_Toc236234373"/>
-      <w:r>
-        <w:rPr>
-          <w:rFonts w:ascii="Montserrat" w:hAnsi="Montserrat"/>
-          <w:b/>
-          <w:color w:val="1A1A1A"/>
-          <w:sz w:val="34"/>
-        </w:rPr>
-        <w:lastRenderedPageBreak/>
-        <w:t>6. Administracao do sistema</w:t>
-      </w:r>
-      <w:bookmarkEnd w:id="31"/>
-    </w:p>
-    <w:p>
-      <w:pPr>
-        <w:spacing w:line="280" w:lineRule="auto"/>
-        <w:rPr>
-          <w:rFonts w:ascii="Montserrat" w:hAnsi="Montserrat"/>
-          <w:color w:val="1A1A1A"/>
-          <w:sz w:val="22"/>
-        </w:rPr>
-      </w:pPr>
-      <w:r>
-        <w:rPr>
-          <w:rFonts w:ascii="Montserrat" w:hAnsi="Montserrat"/>
-          <w:color w:val="1A1A1A"/>
-          <w:sz w:val="22"/>
-        </w:rPr>
-        <w:t>Pagina restrita a usuarios com papel Admin (secao 2.3). Reune tres abas: Usuarios, Equipes e Configuracoes.</w:t>
+        <w:t>Simulador de fatores x beneficios. Abaixo dele, o aviso de login para quem quiser vincular a um projeto.</w:t>
       </w:r>
     </w:p>
     <w:p>
@@ -12942,7 +12884,7 @@
           <w:sz w:val="27"/>
         </w:rPr>
       </w:pPr>
-      <w:bookmarkStart w:id="32" w:name="_Toc236234374"/>
+      <w:bookmarkStart w:id="30" w:name="_Toc236241965"/>
       <w:r>
         <w:rPr>
           <w:rFonts w:ascii="Montserrat" w:hAnsi="Montserrat"/>
@@ -12950,9 +12892,9 @@
           <w:color w:val="B91D2E"/>
           <w:sz w:val="27"/>
         </w:rPr>
-        <w:t>6.1 Usuarios</w:t>
-      </w:r>
-      <w:bookmarkEnd w:id="32"/>
+        <w:t>5.3 Assistente de decisao em 8 perguntas</w:t>
+      </w:r>
+      <w:bookmarkEnd w:id="30"/>
     </w:p>
     <w:p>
       <w:pPr>
@@ -12969,7 +12911,7 @@
           <w:color w:val="1A1A1A"/>
           <w:sz w:val="22"/>
         </w:rPr>
-        <w:t>Lista todos os usuarios que ja fizeram login pelo menos uma vez, com o papel atual e um seletor para altera-lo.</w:t>
+        <w:t>Responda a oito perguntas do semaforo de decisao, uma de cada vez. Ao final, o painel devolve um veredito com a regra aplicada.</w:t>
       </w:r>
     </w:p>
     <w:p>
@@ -12981,17 +12923,18 @@
         <w:rPr>
           <w:noProof/>
         </w:rPr>
+        <w:lastRenderedPageBreak/>
         <w:drawing>
-          <wp:inline distT="0" distB="0" distL="0" distR="0" wp14:anchorId="4B195839" wp14:editId="3A8626A1">
+          <wp:inline distT="0" distB="0" distL="0" distR="0" wp14:anchorId="3C6075CB" wp14:editId="7114D4F0">
             <wp:extent cx="5303520" cy="4792851"/>
             <wp:effectExtent l="19050" t="19050" r="11430" b="27305"/>
-            <wp:docPr id="1462847511" name="Imagem 39"/>
+            <wp:docPr id="922102290" name="Imagem 39"/>
             <wp:cNvGraphicFramePr/>
             <a:graphic xmlns:a="http://schemas.openxmlformats.org/drawingml/2006/main">
               <a:graphicData uri="http://schemas.openxmlformats.org/drawingml/2006/picture">
                 <pic:pic xmlns:pic="http://schemas.openxmlformats.org/drawingml/2006/picture">
                   <pic:nvPicPr>
-                    <pic:cNvPr id="1462847511" name=""/>
+                    <pic:cNvPr id="922102290" name=""/>
                     <pic:cNvPicPr/>
                   </pic:nvPicPr>
                   <pic:blipFill>
@@ -13045,48 +12988,7 @@
           <w:color w:val="6A6A70"/>
           <w:sz w:val="19"/>
         </w:rPr>
-        <w:t>Aba Usuarios: papel atual e seletor de alteracao de papel por usuario.</w:t>
-      </w:r>
-    </w:p>
-    <w:p>
-      <w:pPr>
-        <w:pStyle w:val="Ttulo2"/>
-        <w:spacing w:before="320" w:after="120"/>
-        <w:rPr>
-          <w:rFonts w:ascii="Montserrat" w:hAnsi="Montserrat"/>
-          <w:b/>
-          <w:color w:val="B91D2E"/>
-          <w:sz w:val="27"/>
-        </w:rPr>
-      </w:pPr>
-      <w:bookmarkStart w:id="33" w:name="_Toc236234375"/>
-      <w:r>
-        <w:rPr>
-          <w:rFonts w:ascii="Montserrat" w:hAnsi="Montserrat"/>
-          <w:b/>
-          <w:color w:val="B91D2E"/>
-          <w:sz w:val="27"/>
-        </w:rPr>
-        <w:t>6.2 Equipes</w:t>
-      </w:r>
-      <w:bookmarkEnd w:id="33"/>
-    </w:p>
-    <w:p>
-      <w:pPr>
-        <w:spacing w:line="280" w:lineRule="auto"/>
-        <w:rPr>
-          <w:rFonts w:ascii="Montserrat" w:hAnsi="Montserrat"/>
-          <w:color w:val="1A1A1A"/>
-          <w:sz w:val="22"/>
-        </w:rPr>
-      </w:pPr>
-      <w:r>
-        <w:rPr>
-          <w:rFonts w:ascii="Montserrat" w:hAnsi="Montserrat"/>
-          <w:color w:val="1A1A1A"/>
-          <w:sz w:val="22"/>
-        </w:rPr>
-        <w:t>Define quem faz parte da equipe de cada projeto - a base da restricao por equipe descrita na secao 2.5. Selecione um projeto, escolha um papel e clique em + Adicionar a equipe.</w:t>
+        <w:t>Primeira pergunta do assistente de decisao.</w:t>
       </w:r>
     </w:p>
     <w:p>
@@ -13100,16 +13002,16 @@
         </w:rPr>
         <w:lastRenderedPageBreak/>
         <w:drawing>
-          <wp:inline distT="0" distB="0" distL="0" distR="0" wp14:anchorId="1EDFB4FA" wp14:editId="7C3A6947">
+          <wp:inline distT="0" distB="0" distL="0" distR="0" wp14:anchorId="7F5F1736" wp14:editId="1F8D501A">
             <wp:extent cx="5303520" cy="4792851"/>
             <wp:effectExtent l="19050" t="19050" r="11430" b="27305"/>
-            <wp:docPr id="123475843" name="Imagem 40"/>
+            <wp:docPr id="2029586256" name="Imagem 40"/>
             <wp:cNvGraphicFramePr/>
             <a:graphic xmlns:a="http://schemas.openxmlformats.org/drawingml/2006/main">
               <a:graphicData uri="http://schemas.openxmlformats.org/drawingml/2006/picture">
                 <pic:pic xmlns:pic="http://schemas.openxmlformats.org/drawingml/2006/picture">
                   <pic:nvPicPr>
-                    <pic:cNvPr id="123475843" name=""/>
+                    <pic:cNvPr id="2029586256" name=""/>
                     <pic:cNvPicPr/>
                   </pic:nvPicPr>
                   <pic:blipFill>
@@ -13163,7 +13065,74 @@
           <w:color w:val="6A6A70"/>
           <w:sz w:val="19"/>
         </w:rPr>
-        <w:t>Aba Equipes, com um projeto selecionado e um membro ja cadastrado.</w:t>
+        <w:t>Veredito final, com o placar de respostas verdes/amarelas/vermelhas.</w:t>
+      </w:r>
+    </w:p>
+    <w:p>
+      <w:pPr>
+        <w:spacing w:before="160" w:after="200"/>
+        <w:ind w:left="283"/>
+        <w:rPr>
+          <w:rFonts w:ascii="Montserrat" w:hAnsi="Montserrat"/>
+          <w:i/>
+          <w:color w:val="6A6A70"/>
+          <w:sz w:val="21"/>
+        </w:rPr>
+      </w:pPr>
+      <w:r>
+        <w:rPr>
+          <w:rFonts w:ascii="Montserrat" w:hAnsi="Montserrat"/>
+          <w:i/>
+          <w:color w:val="6A6A70"/>
+          <w:sz w:val="21"/>
+        </w:rPr>
+        <w:t>Regra aplicada: qualquer resposta vermelha leva a encerrar/repactuar; tres ou mais amarelas levam a replanejar; caso contrario, o veredito e concluir.</w:t>
+      </w:r>
+    </w:p>
+    <w:p>
+      <w:pPr>
+        <w:pStyle w:val="Ttulo1"/>
+        <w:pageBreakBefore/>
+        <w:pBdr>
+          <w:bottom w:val="single" w:sz="4" w:space="0" w:color="E4E4E7"/>
+        </w:pBdr>
+        <w:spacing w:before="80" w:after="200"/>
+        <w:rPr>
+          <w:rFonts w:ascii="Montserrat" w:hAnsi="Montserrat"/>
+          <w:b/>
+          <w:color w:val="1A1A1A"/>
+          <w:sz w:val="34"/>
+        </w:rPr>
+      </w:pPr>
+      <w:bookmarkStart w:id="31" w:name="_Toc236241966"/>
+      <w:r>
+        <w:rPr>
+          <w:rFonts w:ascii="Montserrat" w:hAnsi="Montserrat"/>
+          <w:b/>
+          <w:color w:val="1A1A1A"/>
+          <w:sz w:val="34"/>
+        </w:rPr>
+        <w:lastRenderedPageBreak/>
+        <w:t>6. Administracao do sistema</w:t>
+      </w:r>
+      <w:bookmarkEnd w:id="31"/>
+    </w:p>
+    <w:p>
+      <w:pPr>
+        <w:spacing w:line="280" w:lineRule="auto"/>
+        <w:rPr>
+          <w:rFonts w:ascii="Montserrat" w:hAnsi="Montserrat"/>
+          <w:color w:val="1A1A1A"/>
+          <w:sz w:val="22"/>
+        </w:rPr>
+      </w:pPr>
+      <w:r>
+        <w:rPr>
+          <w:rFonts w:ascii="Montserrat" w:hAnsi="Montserrat"/>
+          <w:color w:val="1A1A1A"/>
+          <w:sz w:val="22"/>
+        </w:rPr>
+        <w:t>Pagina restrita a usuarios com papel Admin (secao 2.3). Reune tres abas: Usuarios, Equipes e Configuracoes.</w:t>
       </w:r>
     </w:p>
     <w:p>
@@ -13177,7 +13146,7 @@
           <w:sz w:val="27"/>
         </w:rPr>
       </w:pPr>
-      <w:bookmarkStart w:id="34" w:name="_Toc236234376"/>
+      <w:bookmarkStart w:id="32" w:name="_Toc236241967"/>
       <w:r>
         <w:rPr>
           <w:rFonts w:ascii="Montserrat" w:hAnsi="Montserrat"/>
@@ -13185,9 +13154,9 @@
           <w:color w:val="B91D2E"/>
           <w:sz w:val="27"/>
         </w:rPr>
-        <w:t>6.3 Configuracoes</w:t>
-      </w:r>
-      <w:bookmarkEnd w:id="34"/>
+        <w:t>6.1 Usuarios</w:t>
+      </w:r>
+      <w:bookmarkEnd w:id="32"/>
     </w:p>
     <w:p>
       <w:pPr>
@@ -13204,7 +13173,7 @@
           <w:color w:val="1A1A1A"/>
           <w:sz w:val="22"/>
         </w:rPr>
-        <w:t>Controla os dois interruptores de acesso sem login (Solicitacao de Demanda e Ata de Reuniao), descritos na secao 2.6.</w:t>
+        <w:t>Lista todos os usuarios que ja fizeram login pelo menos uma vez, com o papel atual e um seletor para altera-lo.</w:t>
       </w:r>
     </w:p>
     <w:p>
@@ -13216,18 +13185,17 @@
         <w:rPr>
           <w:noProof/>
         </w:rPr>
-        <w:lastRenderedPageBreak/>
         <w:drawing>
-          <wp:inline distT="0" distB="0" distL="0" distR="0" wp14:anchorId="134C1492" wp14:editId="1BEF6F7E">
+          <wp:inline distT="0" distB="0" distL="0" distR="0" wp14:anchorId="082D8F21" wp14:editId="4105375A">
             <wp:extent cx="5303520" cy="4792851"/>
             <wp:effectExtent l="19050" t="19050" r="11430" b="27305"/>
-            <wp:docPr id="583644536" name="Imagem 41"/>
+            <wp:docPr id="243739472" name="Imagem 41"/>
             <wp:cNvGraphicFramePr/>
             <a:graphic xmlns:a="http://schemas.openxmlformats.org/drawingml/2006/main">
               <a:graphicData uri="http://schemas.openxmlformats.org/drawingml/2006/picture">
                 <pic:pic xmlns:pic="http://schemas.openxmlformats.org/drawingml/2006/picture">
                   <pic:nvPicPr>
-                    <pic:cNvPr id="583644536" name=""/>
+                    <pic:cNvPr id="243739472" name=""/>
                     <pic:cNvPicPr/>
                   </pic:nvPicPr>
                   <pic:blipFill>
@@ -13281,6 +13249,242 @@
           <w:color w:val="6A6A70"/>
           <w:sz w:val="19"/>
         </w:rPr>
+        <w:t>Aba Usuarios: papel atual e seletor de alteracao de papel por usuario.</w:t>
+      </w:r>
+    </w:p>
+    <w:p>
+      <w:pPr>
+        <w:pStyle w:val="Ttulo2"/>
+        <w:spacing w:before="320" w:after="120"/>
+        <w:rPr>
+          <w:rFonts w:ascii="Montserrat" w:hAnsi="Montserrat"/>
+          <w:b/>
+          <w:color w:val="B91D2E"/>
+          <w:sz w:val="27"/>
+        </w:rPr>
+      </w:pPr>
+      <w:bookmarkStart w:id="33" w:name="_Toc236241968"/>
+      <w:r>
+        <w:rPr>
+          <w:rFonts w:ascii="Montserrat" w:hAnsi="Montserrat"/>
+          <w:b/>
+          <w:color w:val="B91D2E"/>
+          <w:sz w:val="27"/>
+        </w:rPr>
+        <w:t>6.2 Equipes</w:t>
+      </w:r>
+      <w:bookmarkEnd w:id="33"/>
+    </w:p>
+    <w:p>
+      <w:pPr>
+        <w:spacing w:line="280" w:lineRule="auto"/>
+        <w:rPr>
+          <w:rFonts w:ascii="Montserrat" w:hAnsi="Montserrat"/>
+          <w:color w:val="1A1A1A"/>
+          <w:sz w:val="22"/>
+        </w:rPr>
+      </w:pPr>
+      <w:r>
+        <w:rPr>
+          <w:rFonts w:ascii="Montserrat" w:hAnsi="Montserrat"/>
+          <w:color w:val="1A1A1A"/>
+          <w:sz w:val="22"/>
+        </w:rPr>
+        <w:t>Define quem faz parte da equipe de cada projeto - a base da restricao por equipe descrita na secao 2.5. Selecione um projeto, escolha um papel e clique em + Adicionar a equipe.</w:t>
+      </w:r>
+    </w:p>
+    <w:p>
+      <w:pPr>
+        <w:spacing w:before="120" w:after="40"/>
+        <w:jc w:val="center"/>
+      </w:pPr>
+      <w:r>
+        <w:rPr>
+          <w:noProof/>
+        </w:rPr>
+        <w:lastRenderedPageBreak/>
+        <w:drawing>
+          <wp:inline distT="0" distB="0" distL="0" distR="0" wp14:anchorId="7B3E5BD0" wp14:editId="1D429431">
+            <wp:extent cx="5303520" cy="4792851"/>
+            <wp:effectExtent l="19050" t="19050" r="11430" b="27305"/>
+            <wp:docPr id="821833289" name="Imagem 42"/>
+            <wp:cNvGraphicFramePr/>
+            <a:graphic xmlns:a="http://schemas.openxmlformats.org/drawingml/2006/main">
+              <a:graphicData uri="http://schemas.openxmlformats.org/drawingml/2006/picture">
+                <pic:pic xmlns:pic="http://schemas.openxmlformats.org/drawingml/2006/picture">
+                  <pic:nvPicPr>
+                    <pic:cNvPr id="821833289" name=""/>
+                    <pic:cNvPicPr/>
+                  </pic:nvPicPr>
+                  <pic:blipFill>
+                    <a:blip r:embed="rId48">
+                      <a:extLst>
+                        <a:ext uri="{28A0092B-C50C-407E-A947-70E740481C1C}">
+                          <a14:useLocalDpi xmlns:a14="http://schemas.microsoft.com/office/drawing/2010/main" val="0"/>
+                        </a:ext>
+                      </a:extLst>
+                    </a:blip>
+                    <a:stretch>
+                      <a:fillRect/>
+                    </a:stretch>
+                  </pic:blipFill>
+                  <pic:spPr>
+                    <a:xfrm>
+                      <a:off x="0" y="0"/>
+                      <a:ext cx="5303520" cy="4792851"/>
+                    </a:xfrm>
+                    <a:prstGeom prst="rect">
+                      <a:avLst/>
+                    </a:prstGeom>
+                    <a:ln w="9525">
+                      <a:solidFill>
+                        <a:srgbClr val="D1D5DB"/>
+                      </a:solidFill>
+                    </a:ln>
+                  </pic:spPr>
+                </pic:pic>
+              </a:graphicData>
+            </a:graphic>
+          </wp:inline>
+        </w:drawing>
+      </w:r>
+    </w:p>
+    <w:p>
+      <w:pPr>
+        <w:spacing w:before="120" w:after="280"/>
+        <w:jc w:val="center"/>
+        <w:rPr>
+          <w:rFonts w:ascii="Montserrat" w:hAnsi="Montserrat"/>
+          <w:i/>
+          <w:color w:val="6A6A70"/>
+          <w:sz w:val="19"/>
+        </w:rPr>
+      </w:pPr>
+      <w:r>
+        <w:rPr>
+          <w:rFonts w:ascii="Montserrat" w:hAnsi="Montserrat"/>
+          <w:i/>
+          <w:color w:val="6A6A70"/>
+          <w:sz w:val="19"/>
+        </w:rPr>
+        <w:t>Aba Equipes, com um projeto selecionado e um membro ja cadastrado.</w:t>
+      </w:r>
+    </w:p>
+    <w:p>
+      <w:pPr>
+        <w:pStyle w:val="Ttulo2"/>
+        <w:spacing w:before="320" w:after="120"/>
+        <w:rPr>
+          <w:rFonts w:ascii="Montserrat" w:hAnsi="Montserrat"/>
+          <w:b/>
+          <w:color w:val="B91D2E"/>
+          <w:sz w:val="27"/>
+        </w:rPr>
+      </w:pPr>
+      <w:bookmarkStart w:id="34" w:name="_Toc236241969"/>
+      <w:r>
+        <w:rPr>
+          <w:rFonts w:ascii="Montserrat" w:hAnsi="Montserrat"/>
+          <w:b/>
+          <w:color w:val="B91D2E"/>
+          <w:sz w:val="27"/>
+        </w:rPr>
+        <w:t>6.3 Configuracoes</w:t>
+      </w:r>
+      <w:bookmarkEnd w:id="34"/>
+    </w:p>
+    <w:p>
+      <w:pPr>
+        <w:spacing w:line="280" w:lineRule="auto"/>
+        <w:rPr>
+          <w:rFonts w:ascii="Montserrat" w:hAnsi="Montserrat"/>
+          <w:color w:val="1A1A1A"/>
+          <w:sz w:val="22"/>
+        </w:rPr>
+      </w:pPr>
+      <w:r>
+        <w:rPr>
+          <w:rFonts w:ascii="Montserrat" w:hAnsi="Montserrat"/>
+          <w:color w:val="1A1A1A"/>
+          <w:sz w:val="22"/>
+        </w:rPr>
+        <w:t>Controla os dois interruptores de acesso sem login (Solicitacao de Demanda e Ata de Reuniao), descritos na secao 2.6.</w:t>
+      </w:r>
+    </w:p>
+    <w:p>
+      <w:pPr>
+        <w:spacing w:before="120" w:after="40"/>
+        <w:jc w:val="center"/>
+      </w:pPr>
+      <w:r>
+        <w:rPr>
+          <w:noProof/>
+        </w:rPr>
+        <w:lastRenderedPageBreak/>
+        <w:drawing>
+          <wp:inline distT="0" distB="0" distL="0" distR="0" wp14:anchorId="53A9C517" wp14:editId="7A7C299A">
+            <wp:extent cx="5303520" cy="4792851"/>
+            <wp:effectExtent l="19050" t="19050" r="11430" b="27305"/>
+            <wp:docPr id="793675355" name="Imagem 43"/>
+            <wp:cNvGraphicFramePr/>
+            <a:graphic xmlns:a="http://schemas.openxmlformats.org/drawingml/2006/main">
+              <a:graphicData uri="http://schemas.openxmlformats.org/drawingml/2006/picture">
+                <pic:pic xmlns:pic="http://schemas.openxmlformats.org/drawingml/2006/picture">
+                  <pic:nvPicPr>
+                    <pic:cNvPr id="793675355" name=""/>
+                    <pic:cNvPicPr/>
+                  </pic:nvPicPr>
+                  <pic:blipFill>
+                    <a:blip r:embed="rId49">
+                      <a:extLst>
+                        <a:ext uri="{28A0092B-C50C-407E-A947-70E740481C1C}">
+                          <a14:useLocalDpi xmlns:a14="http://schemas.microsoft.com/office/drawing/2010/main" val="0"/>
+                        </a:ext>
+                      </a:extLst>
+                    </a:blip>
+                    <a:stretch>
+                      <a:fillRect/>
+                    </a:stretch>
+                  </pic:blipFill>
+                  <pic:spPr>
+                    <a:xfrm>
+                      <a:off x="0" y="0"/>
+                      <a:ext cx="5303520" cy="4792851"/>
+                    </a:xfrm>
+                    <a:prstGeom prst="rect">
+                      <a:avLst/>
+                    </a:prstGeom>
+                    <a:ln w="9525">
+                      <a:solidFill>
+                        <a:srgbClr val="D1D5DB"/>
+                      </a:solidFill>
+                    </a:ln>
+                  </pic:spPr>
+                </pic:pic>
+              </a:graphicData>
+            </a:graphic>
+          </wp:inline>
+        </w:drawing>
+      </w:r>
+    </w:p>
+    <w:p>
+      <w:pPr>
+        <w:spacing w:before="120" w:after="280"/>
+        <w:jc w:val="center"/>
+        <w:rPr>
+          <w:rFonts w:ascii="Montserrat" w:hAnsi="Montserrat"/>
+          <w:i/>
+          <w:color w:val="6A6A70"/>
+          <w:sz w:val="19"/>
+        </w:rPr>
+      </w:pPr>
+      <w:r>
+        <w:rPr>
+          <w:rFonts w:ascii="Montserrat" w:hAnsi="Montserrat"/>
+          <w:i/>
+          <w:color w:val="6A6A70"/>
+          <w:sz w:val="19"/>
+        </w:rPr>
         <w:t>Aba Configuracoes: os dois interruptores de acesso sem login, hoje desativados.</w:t>
       </w:r>
     </w:p>
@@ -13299,7 +13503,7 @@
           <w:sz w:val="34"/>
         </w:rPr>
       </w:pPr>
-      <w:bookmarkStart w:id="35" w:name="_Toc236234377"/>
+      <w:bookmarkStart w:id="35" w:name="_Toc236241970"/>
       <w:r>
         <w:rPr>
           <w:rFonts w:ascii="Montserrat" w:hAnsi="Montserrat"/>
@@ -13543,7 +13747,7 @@
           <w:sz w:val="34"/>
         </w:rPr>
       </w:pPr>
-      <w:bookmarkStart w:id="36" w:name="_Toc236234378"/>
+      <w:bookmarkStart w:id="36" w:name="_Toc236241971"/>
       <w:r>
         <w:rPr>
           <w:rFonts w:ascii="Montserrat" w:hAnsi="Montserrat"/>
@@ -15201,12 +15405,12 @@
       </w:pPr>
     </w:p>
     <w:sectPr>
-      <w:headerReference w:type="even" r:id="rId48"/>
-      <w:headerReference w:type="default" r:id="rId49"/>
-      <w:footerReference w:type="even" r:id="rId50"/>
-      <w:footerReference w:type="default" r:id="rId51"/>
-      <w:headerReference w:type="first" r:id="rId52"/>
-      <w:footerReference w:type="first" r:id="rId53"/>
+      <w:headerReference w:type="even" r:id="rId50"/>
+      <w:headerReference w:type="default" r:id="rId51"/>
+      <w:footerReference w:type="even" r:id="rId52"/>
+      <w:footerReference w:type="default" r:id="rId53"/>
+      <w:headerReference w:type="first" r:id="rId54"/>
+      <w:footerReference w:type="first" r:id="rId55"/>
       <w:pgSz w:w="12240" w:h="15840"/>
       <w:pgMar w:top="1417" w:right="1701" w:bottom="1417" w:left="1701" w:header="708" w:footer="708" w:gutter="0"/>
       <w:cols w:space="708"/>
@@ -15365,7 +15569,7 @@
 <file path=word/numbering.xml><?xml version="1.0" encoding="utf-8"?>
 <w:numbering xmlns:wpc="http://schemas.microsoft.com/office/word/2010/wordprocessingCanvas" xmlns:cx="http://schemas.microsoft.com/office/drawing/2014/chartex" xmlns:cx1="http://schemas.microsoft.com/office/drawing/2015/9/8/chartex" xmlns:cx2="http://schemas.microsoft.com/office/drawing/2015/10/21/chartex" xmlns:cx3="http://schemas.microsoft.com/office/drawing/2016/5/9/chartex" xmlns:cx4="http://schemas.microsoft.com/office/drawing/2016/5/10/chartex" xmlns:cx5="http://schemas.microsoft.com/office/drawing/2016/5/11/chartex" xmlns:cx6="http://schemas.microsoft.com/office/drawing/2016/5/12/chartex" xmlns:cx7="http://schemas.microsoft.com/office/drawing/2016/5/13/chartex" xmlns:cx8="http://schemas.microsoft.com/office/drawing/2016/5/14/chartex" xmlns:mc="http://schemas.openxmlformats.org/markup-compatibility/2006" xmlns:aink="http://schemas.microsoft.com/office/drawing/2016/ink" xmlns:am3d="http://schemas.microsoft.com/office/drawing/2017/model3d" xmlns:o="urn:schemas-microsoft-com:office:office" xmlns:oel="http://schemas.microsoft.com/office/2019/extlst" xmlns:r="http://schemas.openxmlformats.org/officeDocument/2006/relationships" xmlns:m="http://schemas.openxmlformats.org/officeDocument/2006/math" xmlns:v="urn:schemas-microsoft-com:vml" xmlns:wp14="http://schemas.microsoft.com/office/word/2010/wordprocessingDrawing" xmlns:wp="http://schemas.openxmlformats.org/drawingml/2006/wordprocessingDrawing" xmlns:w10="urn:schemas-microsoft-com:office:word" xmlns:w="http://schemas.openxmlformats.org/wordprocessingml/2006/main" xmlns:w14="http://schemas.microsoft.com/office/word/2010/wordml" xmlns:w15="http://schemas.microsoft.com/office/word/2012/wordml" xmlns:w16cei="http://schemas.microsoft.com/office/word/2026/wordml/cei" xmlns:w16cex="http://schemas.microsoft.com/office/word/2018/wordml/cex" xmlns:w16cid="http://schemas.microsoft.com/office/word/2016/wordml/cid" xmlns:w16="http://schemas.microsoft.com/office/word/2018/wordml" xmlns:w16du="http://schemas.microsoft.com/office/word/2023/wordml/word16du" xmlns:w16sdtdh="http://schemas.microsoft.com/office/word/2020/wordml/sdtdatahash" xmlns:w16sdtfl="http://schemas.microsoft.com/office/word/2024/wordml/sdtformatlock" xmlns:w16se="http://schemas.microsoft.com/office/word/2015/wordml/symex" xmlns:wpg="http://schemas.microsoft.com/office/word/2010/wordprocessingGroup" xmlns:wpi="http://schemas.microsoft.com/office/word/2010/wordprocessingInk" xmlns:wne="http://schemas.microsoft.com/office/word/2006/wordml" xmlns:wps="http://schemas.microsoft.com/office/word/2010/wordprocessingShape" mc:Ignorable="w14 w15 w16se w16cid w16 w16cex w16sdtdh w16sdtfl w16du wp14">
   <w:abstractNum w:abstractNumId="0" w15:restartNumberingAfterBreak="0">
-    <w:nsid w:val="1EF97360"/>
+    <w:nsid w:val="0A312ED9"/>
     <w:multiLevelType w:val="singleLevel"/>
     <w:tmpl w:val="04160001"/>
     <w:lvl w:ilvl="0">
@@ -15382,7 +15586,7 @@
     </w:lvl>
   </w:abstractNum>
   <w:abstractNum w:abstractNumId="1" w15:restartNumberingAfterBreak="0">
-    <w:nsid w:val="1FDC6781"/>
+    <w:nsid w:val="1BEB3757"/>
     <w:multiLevelType w:val="singleLevel"/>
     <w:tmpl w:val="04160001"/>
     <w:lvl w:ilvl="0">
@@ -15399,7 +15603,7 @@
     </w:lvl>
   </w:abstractNum>
   <w:abstractNum w:abstractNumId="2" w15:restartNumberingAfterBreak="0">
-    <w:nsid w:val="28D52674"/>
+    <w:nsid w:val="23C44920"/>
     <w:multiLevelType w:val="singleLevel"/>
     <w:tmpl w:val="04160001"/>
     <w:lvl w:ilvl="0">
@@ -15416,7 +15620,7 @@
     </w:lvl>
   </w:abstractNum>
   <w:abstractNum w:abstractNumId="3" w15:restartNumberingAfterBreak="0">
-    <w:nsid w:val="2E344AD4"/>
+    <w:nsid w:val="28034424"/>
     <w:multiLevelType w:val="singleLevel"/>
     <w:tmpl w:val="04160001"/>
     <w:lvl w:ilvl="0">
@@ -15433,7 +15637,7 @@
     </w:lvl>
   </w:abstractNum>
   <w:abstractNum w:abstractNumId="4" w15:restartNumberingAfterBreak="0">
-    <w:nsid w:val="31054254"/>
+    <w:nsid w:val="284C2D3F"/>
     <w:multiLevelType w:val="singleLevel"/>
     <w:tmpl w:val="04160001"/>
     <w:lvl w:ilvl="0">
@@ -15450,7 +15654,7 @@
     </w:lvl>
   </w:abstractNum>
   <w:abstractNum w:abstractNumId="5" w15:restartNumberingAfterBreak="0">
-    <w:nsid w:val="36650CAF"/>
+    <w:nsid w:val="311B1FA9"/>
     <w:multiLevelType w:val="singleLevel"/>
     <w:tmpl w:val="04160001"/>
     <w:lvl w:ilvl="0">
@@ -15467,7 +15671,7 @@
     </w:lvl>
   </w:abstractNum>
   <w:abstractNum w:abstractNumId="6" w15:restartNumberingAfterBreak="0">
-    <w:nsid w:val="374D3770"/>
+    <w:nsid w:val="34206EF4"/>
     <w:multiLevelType w:val="singleLevel"/>
     <w:tmpl w:val="04160001"/>
     <w:lvl w:ilvl="0">
@@ -15484,7 +15688,7 @@
     </w:lvl>
   </w:abstractNum>
   <w:abstractNum w:abstractNumId="7" w15:restartNumberingAfterBreak="0">
-    <w:nsid w:val="38F3705D"/>
+    <w:nsid w:val="481D3E97"/>
     <w:multiLevelType w:val="singleLevel"/>
     <w:tmpl w:val="04160001"/>
     <w:lvl w:ilvl="0">
@@ -15501,7 +15705,7 @@
     </w:lvl>
   </w:abstractNum>
   <w:abstractNum w:abstractNumId="8" w15:restartNumberingAfterBreak="0">
-    <w:nsid w:val="3D8E3560"/>
+    <w:nsid w:val="4FB81847"/>
     <w:multiLevelType w:val="singleLevel"/>
     <w:tmpl w:val="04160001"/>
     <w:lvl w:ilvl="0">
@@ -15518,7 +15722,7 @@
     </w:lvl>
   </w:abstractNum>
   <w:abstractNum w:abstractNumId="9" w15:restartNumberingAfterBreak="0">
-    <w:nsid w:val="49A46208"/>
+    <w:nsid w:val="5BDD736C"/>
     <w:multiLevelType w:val="singleLevel"/>
     <w:tmpl w:val="04160001"/>
     <w:lvl w:ilvl="0">
@@ -15535,7 +15739,7 @@
     </w:lvl>
   </w:abstractNum>
   <w:abstractNum w:abstractNumId="10" w15:restartNumberingAfterBreak="0">
-    <w:nsid w:val="61E026DA"/>
+    <w:nsid w:val="609F70EB"/>
     <w:multiLevelType w:val="singleLevel"/>
     <w:tmpl w:val="04160001"/>
     <w:lvl w:ilvl="0">
@@ -15552,7 +15756,7 @@
     </w:lvl>
   </w:abstractNum>
   <w:abstractNum w:abstractNumId="11" w15:restartNumberingAfterBreak="0">
-    <w:nsid w:val="68B53111"/>
+    <w:nsid w:val="65B22295"/>
     <w:multiLevelType w:val="singleLevel"/>
     <w:tmpl w:val="04160001"/>
     <w:lvl w:ilvl="0">
@@ -15569,7 +15773,7 @@
     </w:lvl>
   </w:abstractNum>
   <w:abstractNum w:abstractNumId="12" w15:restartNumberingAfterBreak="0">
-    <w:nsid w:val="6D4D7877"/>
+    <w:nsid w:val="75737FB7"/>
     <w:multiLevelType w:val="singleLevel"/>
     <w:tmpl w:val="04160001"/>
     <w:lvl w:ilvl="0">
@@ -15586,7 +15790,7 @@
     </w:lvl>
   </w:abstractNum>
   <w:abstractNum w:abstractNumId="13" w15:restartNumberingAfterBreak="0">
-    <w:nsid w:val="764A38E5"/>
+    <w:nsid w:val="76264F04"/>
     <w:multiLevelType w:val="singleLevel"/>
     <w:tmpl w:val="04160001"/>
     <w:lvl w:ilvl="0">
@@ -15602,47 +15806,87 @@
       </w:rPr>
     </w:lvl>
   </w:abstractNum>
-  <w:num w:numId="1" w16cid:durableId="1104569275">
+  <w:abstractNum w:abstractNumId="14" w15:restartNumberingAfterBreak="0">
+    <w:nsid w:val="7673776C"/>
+    <w:multiLevelType w:val="singleLevel"/>
+    <w:tmpl w:val="04160001"/>
+    <w:lvl w:ilvl="0">
+      <w:start w:val="1"/>
+      <w:numFmt w:val="bullet"/>
+      <w:lvlText w:val=""/>
+      <w:lvlJc w:val="left"/>
+      <w:pPr>
+        <w:ind w:left="720" w:hanging="360"/>
+      </w:pPr>
+      <w:rPr>
+        <w:rFonts w:ascii="Symbol" w:hAnsi="Symbol" w:hint="default"/>
+      </w:rPr>
+    </w:lvl>
+  </w:abstractNum>
+  <w:abstractNum w:abstractNumId="15" w15:restartNumberingAfterBreak="0">
+    <w:nsid w:val="76A86CCD"/>
+    <w:multiLevelType w:val="singleLevel"/>
+    <w:tmpl w:val="04160001"/>
+    <w:lvl w:ilvl="0">
+      <w:start w:val="1"/>
+      <w:numFmt w:val="bullet"/>
+      <w:lvlText w:val=""/>
+      <w:lvlJc w:val="left"/>
+      <w:pPr>
+        <w:ind w:left="720" w:hanging="360"/>
+      </w:pPr>
+      <w:rPr>
+        <w:rFonts w:ascii="Symbol" w:hAnsi="Symbol" w:hint="default"/>
+      </w:rPr>
+    </w:lvl>
+  </w:abstractNum>
+  <w:num w:numId="1" w16cid:durableId="1021324848">
+    <w:abstractNumId w:val="5"/>
+  </w:num>
+  <w:num w:numId="2" w16cid:durableId="64184217">
     <w:abstractNumId w:val="6"/>
   </w:num>
-  <w:num w:numId="2" w16cid:durableId="1015300766">
+  <w:num w:numId="3" w16cid:durableId="907376477">
+    <w:abstractNumId w:val="14"/>
+  </w:num>
+  <w:num w:numId="4" w16cid:durableId="5405484">
+    <w:abstractNumId w:val="3"/>
+  </w:num>
+  <w:num w:numId="5" w16cid:durableId="1987196864">
+    <w:abstractNumId w:val="12"/>
+  </w:num>
+  <w:num w:numId="6" w16cid:durableId="1535846418">
+    <w:abstractNumId w:val="13"/>
+  </w:num>
+  <w:num w:numId="7" w16cid:durableId="845679449">
+    <w:abstractNumId w:val="15"/>
+  </w:num>
+  <w:num w:numId="8" w16cid:durableId="503935204">
+    <w:abstractNumId w:val="2"/>
+  </w:num>
+  <w:num w:numId="9" w16cid:durableId="735395403">
+    <w:abstractNumId w:val="0"/>
+  </w:num>
+  <w:num w:numId="10" w16cid:durableId="460148075">
+    <w:abstractNumId w:val="8"/>
+  </w:num>
+  <w:num w:numId="11" w16cid:durableId="1878465960">
+    <w:abstractNumId w:val="9"/>
+  </w:num>
+  <w:num w:numId="12" w16cid:durableId="822038644">
+    <w:abstractNumId w:val="4"/>
+  </w:num>
+  <w:num w:numId="13" w16cid:durableId="1058361314">
     <w:abstractNumId w:val="10"/>
   </w:num>
-  <w:num w:numId="3" w16cid:durableId="1417705944">
+  <w:num w:numId="14" w16cid:durableId="1792747392">
     <w:abstractNumId w:val="1"/>
   </w:num>
-  <w:num w:numId="4" w16cid:durableId="385762629">
-    <w:abstractNumId w:val="8"/>
-  </w:num>
-  <w:num w:numId="5" w16cid:durableId="1816490282">
-    <w:abstractNumId w:val="7"/>
-  </w:num>
-  <w:num w:numId="6" w16cid:durableId="1448084481">
-    <w:abstractNumId w:val="9"/>
-  </w:num>
-  <w:num w:numId="7" w16cid:durableId="934945831">
-    <w:abstractNumId w:val="3"/>
-  </w:num>
-  <w:num w:numId="8" w16cid:durableId="1396195199">
-    <w:abstractNumId w:val="4"/>
-  </w:num>
-  <w:num w:numId="9" w16cid:durableId="778137388">
-    <w:abstractNumId w:val="2"/>
-  </w:num>
-  <w:num w:numId="10" w16cid:durableId="828860247">
-    <w:abstractNumId w:val="5"/>
-  </w:num>
-  <w:num w:numId="11" w16cid:durableId="734933091">
-    <w:abstractNumId w:val="13"/>
-  </w:num>
-  <w:num w:numId="12" w16cid:durableId="2006085271">
+  <w:num w:numId="15" w16cid:durableId="390352036">
     <w:abstractNumId w:val="11"/>
   </w:num>
-  <w:num w:numId="13" w16cid:durableId="1446345612">
-    <w:abstractNumId w:val="12"/>
-  </w:num>
-  <w:num w:numId="14" w16cid:durableId="2138446416">
-    <w:abstractNumId w:val="0"/>
+  <w:num w:numId="16" w16cid:durableId="1811290985">
+    <w:abstractNumId w:val="7"/>
   </w:num>
 </w:numbering>
 </file>
@@ -16055,7 +16299,7 @@
     <w:link w:val="Ttulo1Char"/>
     <w:uiPriority w:val="9"/>
     <w:qFormat/>
-    <w:rsid w:val="00C610CC"/>
+    <w:rsid w:val="00DD0CCC"/>
     <w:pPr>
       <w:keepNext/>
       <w:keepLines/>
@@ -16077,7 +16321,7 @@
     <w:uiPriority w:val="9"/>
     <w:unhideWhenUsed/>
     <w:qFormat/>
-    <w:rsid w:val="00C610CC"/>
+    <w:rsid w:val="00DD0CCC"/>
     <w:pPr>
       <w:keepNext/>
       <w:keepLines/>
@@ -16100,7 +16344,7 @@
     <w:semiHidden/>
     <w:unhideWhenUsed/>
     <w:qFormat/>
-    <w:rsid w:val="00C610CC"/>
+    <w:rsid w:val="00DD0CCC"/>
     <w:pPr>
       <w:keepNext/>
       <w:keepLines/>
@@ -16123,7 +16367,7 @@
     <w:semiHidden/>
     <w:unhideWhenUsed/>
     <w:qFormat/>
-    <w:rsid w:val="00C610CC"/>
+    <w:rsid w:val="00DD0CCC"/>
     <w:pPr>
       <w:keepNext/>
       <w:keepLines/>
@@ -16146,7 +16390,7 @@
     <w:semiHidden/>
     <w:unhideWhenUsed/>
     <w:qFormat/>
-    <w:rsid w:val="00C610CC"/>
+    <w:rsid w:val="00DD0CCC"/>
     <w:pPr>
       <w:keepNext/>
       <w:keepLines/>
@@ -16167,7 +16411,7 @@
     <w:semiHidden/>
     <w:unhideWhenUsed/>
     <w:qFormat/>
-    <w:rsid w:val="00C610CC"/>
+    <w:rsid w:val="00DD0CCC"/>
     <w:pPr>
       <w:keepNext/>
       <w:keepLines/>
@@ -16190,7 +16434,7 @@
     <w:semiHidden/>
     <w:unhideWhenUsed/>
     <w:qFormat/>
-    <w:rsid w:val="00C610CC"/>
+    <w:rsid w:val="00DD0CCC"/>
     <w:pPr>
       <w:keepNext/>
       <w:keepLines/>
@@ -16211,7 +16455,7 @@
     <w:semiHidden/>
     <w:unhideWhenUsed/>
     <w:qFormat/>
-    <w:rsid w:val="00C610CC"/>
+    <w:rsid w:val="00DD0CCC"/>
     <w:pPr>
       <w:keepNext/>
       <w:keepLines/>
@@ -16234,7 +16478,7 @@
     <w:semiHidden/>
     <w:unhideWhenUsed/>
     <w:qFormat/>
-    <w:rsid w:val="00C610CC"/>
+    <w:rsid w:val="00DD0CCC"/>
     <w:pPr>
       <w:keepNext/>
       <w:keepLines/>
@@ -16278,7 +16522,7 @@
     <w:basedOn w:val="Fontepargpadro"/>
     <w:link w:val="Ttulo1"/>
     <w:uiPriority w:val="9"/>
-    <w:rsid w:val="00C610CC"/>
+    <w:rsid w:val="00DD0CCC"/>
     <w:rPr>
       <w:rFonts w:asciiTheme="majorHAnsi" w:eastAsiaTheme="majorEastAsia" w:hAnsiTheme="majorHAnsi" w:cstheme="majorBidi"/>
       <w:color w:val="0F4761" w:themeColor="accent1" w:themeShade="BF"/>
@@ -16291,7 +16535,7 @@
     <w:basedOn w:val="Fontepargpadro"/>
     <w:link w:val="Ttulo2"/>
     <w:uiPriority w:val="9"/>
-    <w:rsid w:val="00C610CC"/>
+    <w:rsid w:val="00DD0CCC"/>
     <w:rPr>
       <w:rFonts w:asciiTheme="majorHAnsi" w:eastAsiaTheme="majorEastAsia" w:hAnsiTheme="majorHAnsi" w:cstheme="majorBidi"/>
       <w:color w:val="0F4761" w:themeColor="accent1" w:themeShade="BF"/>
@@ -16305,7 +16549,7 @@
     <w:link w:val="Ttulo3"/>
     <w:uiPriority w:val="9"/>
     <w:semiHidden/>
-    <w:rsid w:val="00C610CC"/>
+    <w:rsid w:val="00DD0CCC"/>
     <w:rPr>
       <w:rFonts w:eastAsiaTheme="majorEastAsia" w:cstheme="majorBidi"/>
       <w:color w:val="0F4761" w:themeColor="accent1" w:themeShade="BF"/>
@@ -16319,7 +16563,7 @@
     <w:link w:val="Ttulo4"/>
     <w:uiPriority w:val="9"/>
     <w:semiHidden/>
-    <w:rsid w:val="00C610CC"/>
+    <w:rsid w:val="00DD0CCC"/>
     <w:rPr>
       <w:rFonts w:eastAsiaTheme="majorEastAsia" w:cstheme="majorBidi"/>
       <w:i/>
@@ -16333,7 +16577,7 @@
     <w:link w:val="Ttulo5"/>
     <w:uiPriority w:val="9"/>
     <w:semiHidden/>
-    <w:rsid w:val="00C610CC"/>
+    <w:rsid w:val="00DD0CCC"/>
     <w:rPr>
       <w:rFonts w:eastAsiaTheme="majorEastAsia" w:cstheme="majorBidi"/>
       <w:color w:val="0F4761" w:themeColor="accent1" w:themeShade="BF"/>
@@ -16345,7 +16589,7 @@
     <w:link w:val="Ttulo6"/>
     <w:uiPriority w:val="9"/>
     <w:semiHidden/>
-    <w:rsid w:val="00C610CC"/>
+    <w:rsid w:val="00DD0CCC"/>
     <w:rPr>
       <w:rFonts w:eastAsiaTheme="majorEastAsia" w:cstheme="majorBidi"/>
       <w:i/>
@@ -16359,7 +16603,7 @@
     <w:link w:val="Ttulo7"/>
     <w:uiPriority w:val="9"/>
     <w:semiHidden/>
-    <w:rsid w:val="00C610CC"/>
+    <w:rsid w:val="00DD0CCC"/>
     <w:rPr>
       <w:rFonts w:eastAsiaTheme="majorEastAsia" w:cstheme="majorBidi"/>
       <w:color w:val="595959" w:themeColor="text1" w:themeTint="A6"/>
@@ -16371,7 +16615,7 @@
     <w:link w:val="Ttulo8"/>
     <w:uiPriority w:val="9"/>
     <w:semiHidden/>
-    <w:rsid w:val="00C610CC"/>
+    <w:rsid w:val="00DD0CCC"/>
     <w:rPr>
       <w:rFonts w:eastAsiaTheme="majorEastAsia" w:cstheme="majorBidi"/>
       <w:i/>
@@ -16385,7 +16629,7 @@
     <w:link w:val="Ttulo9"/>
     <w:uiPriority w:val="9"/>
     <w:semiHidden/>
-    <w:rsid w:val="00C610CC"/>
+    <w:rsid w:val="00DD0CCC"/>
     <w:rPr>
       <w:rFonts w:eastAsiaTheme="majorEastAsia" w:cstheme="majorBidi"/>
       <w:color w:val="272727" w:themeColor="text1" w:themeTint="D8"/>
@@ -16398,7 +16642,7 @@
     <w:link w:val="TtuloChar"/>
     <w:uiPriority w:val="10"/>
     <w:qFormat/>
-    <w:rsid w:val="00C610CC"/>
+    <w:rsid w:val="00DD0CCC"/>
     <w:pPr>
       <w:spacing w:after="80" w:line="240" w:lineRule="auto"/>
       <w:contextualSpacing/>
@@ -16416,7 +16660,7 @@
     <w:basedOn w:val="Fontepargpadro"/>
     <w:link w:val="Ttulo"/>
     <w:uiPriority w:val="10"/>
-    <w:rsid w:val="00C610CC"/>
+    <w:rsid w:val="00DD0CCC"/>
     <w:rPr>
       <w:rFonts w:asciiTheme="majorHAnsi" w:eastAsiaTheme="majorEastAsia" w:hAnsiTheme="majorHAnsi" w:cstheme="majorBidi"/>
       <w:spacing w:val="-10"/>
@@ -16432,7 +16676,7 @@
     <w:link w:val="SubttuloChar"/>
     <w:uiPriority w:val="11"/>
     <w:qFormat/>
-    <w:rsid w:val="00C610CC"/>
+    <w:rsid w:val="00DD0CCC"/>
     <w:pPr>
       <w:numPr>
         <w:ilvl w:val="1"/>
@@ -16451,7 +16695,7 @@
     <w:basedOn w:val="Fontepargpadro"/>
     <w:link w:val="Subttulo"/>
     <w:uiPriority w:val="11"/>
-    <w:rsid w:val="00C610CC"/>
+    <w:rsid w:val="00DD0CCC"/>
     <w:rPr>
       <w:rFonts w:eastAsiaTheme="majorEastAsia" w:cstheme="majorBidi"/>
       <w:color w:val="595959" w:themeColor="text1" w:themeTint="A6"/>
@@ -16467,7 +16711,7 @@
     <w:link w:val="CitaoChar"/>
     <w:uiPriority w:val="29"/>
     <w:qFormat/>
-    <w:rsid w:val="00C610CC"/>
+    <w:rsid w:val="00DD0CCC"/>
     <w:pPr>
       <w:spacing w:before="160"/>
       <w:jc w:val="center"/>
@@ -16483,7 +16727,7 @@
     <w:basedOn w:val="Fontepargpadro"/>
     <w:link w:val="Citao"/>
     <w:uiPriority w:val="29"/>
-    <w:rsid w:val="00C610CC"/>
+    <w:rsid w:val="00DD0CCC"/>
     <w:rPr>
       <w:i/>
       <w:iCs/>
@@ -16495,7 +16739,7 @@
     <w:basedOn w:val="Normal"/>
     <w:uiPriority w:val="34"/>
     <w:qFormat/>
-    <w:rsid w:val="00C610CC"/>
+    <w:rsid w:val="00DD0CCC"/>
     <w:pPr>
       <w:ind w:left="720"/>
       <w:contextualSpacing/>
@@ -16506,7 +16750,7 @@
     <w:basedOn w:val="Fontepargpadro"/>
     <w:uiPriority w:val="21"/>
     <w:qFormat/>
-    <w:rsid w:val="00C610CC"/>
+    <w:rsid w:val="00DD0CCC"/>
     <w:rPr>
       <w:i/>
       <w:iCs/>
@@ -16520,7 +16764,7 @@
     <w:link w:val="CitaoIntensaChar"/>
     <w:uiPriority w:val="30"/>
     <w:qFormat/>
-    <w:rsid w:val="00C610CC"/>
+    <w:rsid w:val="00DD0CCC"/>
     <w:pPr>
       <w:pBdr>
         <w:top w:val="single" w:sz="4" w:space="10" w:color="0F4761" w:themeColor="accent1" w:themeShade="BF"/>
@@ -16541,7 +16785,7 @@
     <w:basedOn w:val="Fontepargpadro"/>
     <w:link w:val="CitaoIntensa"/>
     <w:uiPriority w:val="30"/>
-    <w:rsid w:val="00C610CC"/>
+    <w:rsid w:val="00DD0CCC"/>
     <w:rPr>
       <w:i/>
       <w:iCs/>
@@ -16553,7 +16797,7 @@
     <w:basedOn w:val="Fontepargpadro"/>
     <w:uiPriority w:val="32"/>
     <w:qFormat/>
-    <w:rsid w:val="00C610CC"/>
+    <w:rsid w:val="00DD0CCC"/>
     <w:rPr>
       <w:b/>
       <w:bCs/>
@@ -16568,7 +16812,7 @@
     <w:link w:val="CabealhoChar"/>
     <w:uiPriority w:val="99"/>
     <w:unhideWhenUsed/>
-    <w:rsid w:val="00C610CC"/>
+    <w:rsid w:val="00DD0CCC"/>
     <w:pPr>
       <w:tabs>
         <w:tab w:val="center" w:pos="4252"/>
@@ -16582,7 +16826,7 @@
     <w:basedOn w:val="Fontepargpadro"/>
     <w:link w:val="Cabealho"/>
     <w:uiPriority w:val="99"/>
-    <w:rsid w:val="00C610CC"/>
+    <w:rsid w:val="00DD0CCC"/>
   </w:style>
   <w:style w:type="paragraph" w:styleId="Rodap">
     <w:name w:val="footer"/>
@@ -16590,7 +16834,7 @@
     <w:link w:val="RodapChar"/>
     <w:uiPriority w:val="99"/>
     <w:unhideWhenUsed/>
-    <w:rsid w:val="00C610CC"/>
+    <w:rsid w:val="00DD0CCC"/>
     <w:pPr>
       <w:tabs>
         <w:tab w:val="center" w:pos="4252"/>
@@ -16604,7 +16848,7 @@
     <w:basedOn w:val="Fontepargpadro"/>
     <w:link w:val="Rodap"/>
     <w:uiPriority w:val="99"/>
-    <w:rsid w:val="00C610CC"/>
+    <w:rsid w:val="00DD0CCC"/>
   </w:style>
   <w:style w:type="paragraph" w:styleId="Sumrio1">
     <w:name w:val="toc 1"/>
@@ -16613,7 +16857,7 @@
     <w:autoRedefine/>
     <w:uiPriority w:val="39"/>
     <w:unhideWhenUsed/>
-    <w:rsid w:val="00C610CC"/>
+    <w:rsid w:val="00DD0CCC"/>
     <w:pPr>
       <w:spacing w:after="100"/>
     </w:pPr>
@@ -16625,7 +16869,7 @@
     <w:autoRedefine/>
     <w:uiPriority w:val="39"/>
     <w:unhideWhenUsed/>
-    <w:rsid w:val="00C610CC"/>
+    <w:rsid w:val="00DD0CCC"/>
     <w:pPr>
       <w:spacing w:after="100"/>
       <w:ind w:left="240"/>

</xml_diff>

<commit_message>
Adiciona importacao de indicadores do TAP no Relatorio de Entregas
Quando um projeto tem um Projeto vinculado (Gate 1) selecionado, a
secao Indicadores do projeto ganha o botao "Importar do TAP", que
busca o(s) TAP(s) registrados para aquele mesmo projeto e traz os
indicadores de resultado ja preenchidos la (Valor inicial -> Valor
atual, Valor final -> Meta), evitando redigitacao. Indicadores com
o mesmo nome nao sao duplicados em cliques repetidos. Atualiza o
Manual de Uso (v2.6) com a nova secao e print.

Co-Authored-By: Claude Sonnet 5 <noreply@anthropic.com>
</commit_message>
<xml_diff>
--- a/Manual de Uso - Ferramenta de Gestao de Projetos.docx
+++ b/Manual de Uso - Ferramenta de Gestao de Projetos.docx
@@ -129,7 +129,7 @@
           <w:color w:val="6A6A70"/>
           <w:sz w:val="22"/>
         </w:rPr>
-        <w:t>Versao 2.5 - 29 de julho de 2026 (substitui a versao 2.4 de 29/07/2026)</w:t>
+        <w:t>Versao 2.6 - 30 de julho de 2026 (substitui a versao 2.5 de 29/07/2026)</w:t>
       </w:r>
     </w:p>
     <w:p>
@@ -229,7 +229,7 @@
         <w:rPr>
           <w:noProof/>
         </w:rPr>
-        <w:instrText xml:space="preserve"> PAGEREF _Toc236241935 \h </w:instrText>
+        <w:instrText xml:space="preserve"> PAGEREF _Toc236292932 \h </w:instrText>
       </w:r>
       <w:r>
         <w:rPr>
@@ -290,7 +290,7 @@
         <w:rPr>
           <w:noProof/>
         </w:rPr>
-        <w:instrText xml:space="preserve"> PAGEREF _Toc236241936 \h </w:instrText>
+        <w:instrText xml:space="preserve"> PAGEREF _Toc236292933 \h </w:instrText>
       </w:r>
       <w:r>
         <w:rPr>
@@ -351,7 +351,7 @@
         <w:rPr>
           <w:noProof/>
         </w:rPr>
-        <w:instrText xml:space="preserve"> PAGEREF _Toc236241937 \h </w:instrText>
+        <w:instrText xml:space="preserve"> PAGEREF _Toc236292934 \h </w:instrText>
       </w:r>
       <w:r>
         <w:rPr>
@@ -412,7 +412,7 @@
         <w:rPr>
           <w:noProof/>
         </w:rPr>
-        <w:instrText xml:space="preserve"> PAGEREF _Toc236241938 \h </w:instrText>
+        <w:instrText xml:space="preserve"> PAGEREF _Toc236292935 \h </w:instrText>
       </w:r>
       <w:r>
         <w:rPr>
@@ -473,7 +473,7 @@
         <w:rPr>
           <w:noProof/>
         </w:rPr>
-        <w:instrText xml:space="preserve"> PAGEREF _Toc236241939 \h </w:instrText>
+        <w:instrText xml:space="preserve"> PAGEREF _Toc236292936 \h </w:instrText>
       </w:r>
       <w:r>
         <w:rPr>
@@ -534,7 +534,7 @@
         <w:rPr>
           <w:noProof/>
         </w:rPr>
-        <w:instrText xml:space="preserve"> PAGEREF _Toc236241940 \h </w:instrText>
+        <w:instrText xml:space="preserve"> PAGEREF _Toc236292937 \h </w:instrText>
       </w:r>
       <w:r>
         <w:rPr>
@@ -595,7 +595,7 @@
         <w:rPr>
           <w:noProof/>
         </w:rPr>
-        <w:instrText xml:space="preserve"> PAGEREF _Toc236241941 \h </w:instrText>
+        <w:instrText xml:space="preserve"> PAGEREF _Toc236292938 \h </w:instrText>
       </w:r>
       <w:r>
         <w:rPr>
@@ -656,7 +656,7 @@
         <w:rPr>
           <w:noProof/>
         </w:rPr>
-        <w:instrText xml:space="preserve"> PAGEREF _Toc236241942 \h </w:instrText>
+        <w:instrText xml:space="preserve"> PAGEREF _Toc236292939 \h </w:instrText>
       </w:r>
       <w:r>
         <w:rPr>
@@ -717,7 +717,7 @@
         <w:rPr>
           <w:noProof/>
         </w:rPr>
-        <w:instrText xml:space="preserve"> PAGEREF _Toc236241943 \h </w:instrText>
+        <w:instrText xml:space="preserve"> PAGEREF _Toc236292940 \h </w:instrText>
       </w:r>
       <w:r>
         <w:rPr>
@@ -778,7 +778,7 @@
         <w:rPr>
           <w:noProof/>
         </w:rPr>
-        <w:instrText xml:space="preserve"> PAGEREF _Toc236241944 \h </w:instrText>
+        <w:instrText xml:space="preserve"> PAGEREF _Toc236292941 \h </w:instrText>
       </w:r>
       <w:r>
         <w:rPr>
@@ -839,7 +839,7 @@
         <w:rPr>
           <w:noProof/>
         </w:rPr>
-        <w:instrText xml:space="preserve"> PAGEREF _Toc236241945 \h </w:instrText>
+        <w:instrText xml:space="preserve"> PAGEREF _Toc236292942 \h </w:instrText>
       </w:r>
       <w:r>
         <w:rPr>
@@ -900,7 +900,7 @@
         <w:rPr>
           <w:noProof/>
         </w:rPr>
-        <w:instrText xml:space="preserve"> PAGEREF _Toc236241946 \h </w:instrText>
+        <w:instrText xml:space="preserve"> PAGEREF _Toc236292943 \h </w:instrText>
       </w:r>
       <w:r>
         <w:rPr>
@@ -961,7 +961,7 @@
         <w:rPr>
           <w:noProof/>
         </w:rPr>
-        <w:instrText xml:space="preserve"> PAGEREF _Toc236241947 \h </w:instrText>
+        <w:instrText xml:space="preserve"> PAGEREF _Toc236292944 \h </w:instrText>
       </w:r>
       <w:r>
         <w:rPr>
@@ -1022,7 +1022,7 @@
         <w:rPr>
           <w:noProof/>
         </w:rPr>
-        <w:instrText xml:space="preserve"> PAGEREF _Toc236241948 \h </w:instrText>
+        <w:instrText xml:space="preserve"> PAGEREF _Toc236292945 \h </w:instrText>
       </w:r>
       <w:r>
         <w:rPr>
@@ -1083,7 +1083,7 @@
         <w:rPr>
           <w:noProof/>
         </w:rPr>
-        <w:instrText xml:space="preserve"> PAGEREF _Toc236241949 \h </w:instrText>
+        <w:instrText xml:space="preserve"> PAGEREF _Toc236292946 \h </w:instrText>
       </w:r>
       <w:r>
         <w:rPr>
@@ -1144,7 +1144,7 @@
         <w:rPr>
           <w:noProof/>
         </w:rPr>
-        <w:instrText xml:space="preserve"> PAGEREF _Toc236241950 \h </w:instrText>
+        <w:instrText xml:space="preserve"> PAGEREF _Toc236292947 \h </w:instrText>
       </w:r>
       <w:r>
         <w:rPr>
@@ -1205,7 +1205,7 @@
         <w:rPr>
           <w:noProof/>
         </w:rPr>
-        <w:instrText xml:space="preserve"> PAGEREF _Toc236241951 \h </w:instrText>
+        <w:instrText xml:space="preserve"> PAGEREF _Toc236292948 \h </w:instrText>
       </w:r>
       <w:r>
         <w:rPr>
@@ -1266,7 +1266,7 @@
         <w:rPr>
           <w:noProof/>
         </w:rPr>
-        <w:instrText xml:space="preserve"> PAGEREF _Toc236241952 \h </w:instrText>
+        <w:instrText xml:space="preserve"> PAGEREF _Toc236292949 \h </w:instrText>
       </w:r>
       <w:r>
         <w:rPr>
@@ -1327,7 +1327,7 @@
         <w:rPr>
           <w:noProof/>
         </w:rPr>
-        <w:instrText xml:space="preserve"> PAGEREF _Toc236241953 \h </w:instrText>
+        <w:instrText xml:space="preserve"> PAGEREF _Toc236292950 \h </w:instrText>
       </w:r>
       <w:r>
         <w:rPr>
@@ -1388,7 +1388,7 @@
         <w:rPr>
           <w:noProof/>
         </w:rPr>
-        <w:instrText xml:space="preserve"> PAGEREF _Toc236241954 \h </w:instrText>
+        <w:instrText xml:space="preserve"> PAGEREF _Toc236292951 \h </w:instrText>
       </w:r>
       <w:r>
         <w:rPr>
@@ -1449,7 +1449,7 @@
         <w:rPr>
           <w:noProof/>
         </w:rPr>
-        <w:instrText xml:space="preserve"> PAGEREF _Toc236241955 \h </w:instrText>
+        <w:instrText xml:space="preserve"> PAGEREF _Toc236292952 \h </w:instrText>
       </w:r>
       <w:r>
         <w:rPr>
@@ -1510,7 +1510,7 @@
         <w:rPr>
           <w:noProof/>
         </w:rPr>
-        <w:instrText xml:space="preserve"> PAGEREF _Toc236241956 \h </w:instrText>
+        <w:instrText xml:space="preserve"> PAGEREF _Toc236292953 \h </w:instrText>
       </w:r>
       <w:r>
         <w:rPr>
@@ -1571,7 +1571,7 @@
         <w:rPr>
           <w:noProof/>
         </w:rPr>
-        <w:instrText xml:space="preserve"> PAGEREF _Toc236241957 \h </w:instrText>
+        <w:instrText xml:space="preserve"> PAGEREF _Toc236292954 \h </w:instrText>
       </w:r>
       <w:r>
         <w:rPr>
@@ -1632,7 +1632,7 @@
         <w:rPr>
           <w:noProof/>
         </w:rPr>
-        <w:instrText xml:space="preserve"> PAGEREF _Toc236241958 \h </w:instrText>
+        <w:instrText xml:space="preserve"> PAGEREF _Toc236292955 \h </w:instrText>
       </w:r>
       <w:r>
         <w:rPr>
@@ -1693,7 +1693,7 @@
         <w:rPr>
           <w:noProof/>
         </w:rPr>
-        <w:instrText xml:space="preserve"> PAGEREF _Toc236241959 \h </w:instrText>
+        <w:instrText xml:space="preserve"> PAGEREF _Toc236292956 \h </w:instrText>
       </w:r>
       <w:r>
         <w:rPr>
@@ -1754,7 +1754,7 @@
         <w:rPr>
           <w:noProof/>
         </w:rPr>
-        <w:instrText xml:space="preserve"> PAGEREF _Toc236241960 \h </w:instrText>
+        <w:instrText xml:space="preserve"> PAGEREF _Toc236292957 \h </w:instrText>
       </w:r>
       <w:r>
         <w:rPr>
@@ -1816,7 +1816,7 @@
         <w:rPr>
           <w:noProof/>
         </w:rPr>
-        <w:instrText xml:space="preserve"> PAGEREF _Toc236241961 \h </w:instrText>
+        <w:instrText xml:space="preserve"> PAGEREF _Toc236292958 \h </w:instrText>
       </w:r>
       <w:r>
         <w:rPr>
@@ -1877,7 +1877,7 @@
         <w:rPr>
           <w:noProof/>
         </w:rPr>
-        <w:instrText xml:space="preserve"> PAGEREF _Toc236241962 \h </w:instrText>
+        <w:instrText xml:space="preserve"> PAGEREF _Toc236292959 \h </w:instrText>
       </w:r>
       <w:r>
         <w:rPr>
@@ -1938,7 +1938,7 @@
         <w:rPr>
           <w:noProof/>
         </w:rPr>
-        <w:instrText xml:space="preserve"> PAGEREF _Toc236241963 \h </w:instrText>
+        <w:instrText xml:space="preserve"> PAGEREF _Toc236292960 \h </w:instrText>
       </w:r>
       <w:r>
         <w:rPr>
@@ -1999,7 +1999,7 @@
         <w:rPr>
           <w:noProof/>
         </w:rPr>
-        <w:instrText xml:space="preserve"> PAGEREF _Toc236241964 \h </w:instrText>
+        <w:instrText xml:space="preserve"> PAGEREF _Toc236292961 \h </w:instrText>
       </w:r>
       <w:r>
         <w:rPr>
@@ -2060,7 +2060,7 @@
         <w:rPr>
           <w:noProof/>
         </w:rPr>
-        <w:instrText xml:space="preserve"> PAGEREF _Toc236241965 \h </w:instrText>
+        <w:instrText xml:space="preserve"> PAGEREF _Toc236292962 \h </w:instrText>
       </w:r>
       <w:r>
         <w:rPr>
@@ -2121,7 +2121,7 @@
         <w:rPr>
           <w:noProof/>
         </w:rPr>
-        <w:instrText xml:space="preserve"> PAGEREF _Toc236241966 \h </w:instrText>
+        <w:instrText xml:space="preserve"> PAGEREF _Toc236292963 \h </w:instrText>
       </w:r>
       <w:r>
         <w:rPr>
@@ -2182,7 +2182,7 @@
         <w:rPr>
           <w:noProof/>
         </w:rPr>
-        <w:instrText xml:space="preserve"> PAGEREF _Toc236241967 \h </w:instrText>
+        <w:instrText xml:space="preserve"> PAGEREF _Toc236292964 \h </w:instrText>
       </w:r>
       <w:r>
         <w:rPr>
@@ -2243,7 +2243,7 @@
         <w:rPr>
           <w:noProof/>
         </w:rPr>
-        <w:instrText xml:space="preserve"> PAGEREF _Toc236241968 \h </w:instrText>
+        <w:instrText xml:space="preserve"> PAGEREF _Toc236292965 \h </w:instrText>
       </w:r>
       <w:r>
         <w:rPr>
@@ -2304,7 +2304,7 @@
         <w:rPr>
           <w:noProof/>
         </w:rPr>
-        <w:instrText xml:space="preserve"> PAGEREF _Toc236241969 \h </w:instrText>
+        <w:instrText xml:space="preserve"> PAGEREF _Toc236292966 \h </w:instrText>
       </w:r>
       <w:r>
         <w:rPr>
@@ -2365,7 +2365,7 @@
         <w:rPr>
           <w:noProof/>
         </w:rPr>
-        <w:instrText xml:space="preserve"> PAGEREF _Toc236241970 \h </w:instrText>
+        <w:instrText xml:space="preserve"> PAGEREF _Toc236292967 \h </w:instrText>
       </w:r>
       <w:r>
         <w:rPr>
@@ -2426,7 +2426,7 @@
         <w:rPr>
           <w:noProof/>
         </w:rPr>
-        <w:instrText xml:space="preserve"> PAGEREF _Toc236241971 \h </w:instrText>
+        <w:instrText xml:space="preserve"> PAGEREF _Toc236292968 \h </w:instrText>
       </w:r>
       <w:r>
         <w:rPr>
@@ -2502,7 +2502,7 @@
           <w:sz w:val="34"/>
         </w:rPr>
       </w:pPr>
-      <w:bookmarkStart w:id="0" w:name="_Toc236241935"/>
+      <w:bookmarkStart w:id="0" w:name="_Toc236292932"/>
       <w:r>
         <w:rPr>
           <w:rFonts w:ascii="Montserrat" w:hAnsi="Montserrat"/>
@@ -2526,7 +2526,7 @@
           <w:sz w:val="27"/>
         </w:rPr>
       </w:pPr>
-      <w:bookmarkStart w:id="1" w:name="_Toc236241936"/>
+      <w:bookmarkStart w:id="1" w:name="_Toc236292933"/>
       <w:r>
         <w:rPr>
           <w:rFonts w:ascii="Montserrat" w:hAnsi="Montserrat"/>
@@ -2688,6 +2688,24 @@
           <w:color w:val="1A1A1A"/>
           <w:sz w:val="22"/>
         </w:rPr>
+        <w:t>Esta e a versao 2.6 do manual. Em relacao a versao 2.5 (29/07/2026), foi adicionado o botao Importar do TAP na secao Indicadores do projeto do Relatorio de Entregas e Beneficios (secao 4.2): reaproveita os indicadores de resultado ja preenchidos no TAP do mesmo Projeto vinculado, evitando redigitacao, com protecao contra indicadores duplicados.</w:t>
+      </w:r>
+    </w:p>
+    <w:p>
+      <w:pPr>
+        <w:spacing w:line="280" w:lineRule="auto"/>
+        <w:rPr>
+          <w:rFonts w:ascii="Montserrat" w:hAnsi="Montserrat"/>
+          <w:color w:val="1A1A1A"/>
+          <w:sz w:val="22"/>
+        </w:rPr>
+      </w:pPr>
+      <w:r>
+        <w:rPr>
+          <w:rFonts w:ascii="Montserrat" w:hAnsi="Montserrat"/>
+          <w:color w:val="1A1A1A"/>
+          <w:sz w:val="22"/>
+        </w:rPr>
         <w:t>O manual nao substitui as Diretrizes para a Gestao de Projetos da UNIALFA (documento institucional que define o framework D01 a D07) nem o documento Regras de Acesso e Permissoes (que detalha cada regra de controle de acesso); ele e o guia operacional de como usar cada ferramenta na pratica.</w:t>
       </w:r>
     </w:p>
@@ -2702,7 +2720,7 @@
           <w:sz w:val="27"/>
         </w:rPr>
       </w:pPr>
-      <w:bookmarkStart w:id="2" w:name="_Toc236241937"/>
+      <w:bookmarkStart w:id="2" w:name="_Toc236292934"/>
       <w:r>
         <w:rPr>
           <w:rFonts w:ascii="Montserrat" w:hAnsi="Montserrat"/>
@@ -2851,16 +2869,16 @@
         </w:rPr>
         <w:lastRenderedPageBreak/>
         <w:drawing>
-          <wp:inline distT="0" distB="0" distL="0" distR="0" wp14:anchorId="54C8E7B3" wp14:editId="353A7390">
+          <wp:inline distT="0" distB="0" distL="0" distR="0" wp14:anchorId="544B3962" wp14:editId="0A46D0F9">
             <wp:extent cx="5303520" cy="4792851"/>
             <wp:effectExtent l="19050" t="19050" r="11430" b="27305"/>
-            <wp:docPr id="232394177" name="Imagem 1"/>
+            <wp:docPr id="1525126925" name="Imagem 1"/>
             <wp:cNvGraphicFramePr/>
             <a:graphic xmlns:a="http://schemas.openxmlformats.org/drawingml/2006/main">
               <a:graphicData uri="http://schemas.openxmlformats.org/drawingml/2006/picture">
                 <pic:pic xmlns:pic="http://schemas.openxmlformats.org/drawingml/2006/picture">
                   <pic:nvPicPr>
-                    <pic:cNvPr id="232394177" name=""/>
+                    <pic:cNvPr id="1525126925" name=""/>
                     <pic:cNvPicPr/>
                   </pic:nvPicPr>
                   <pic:blipFill>
@@ -2928,7 +2946,7 @@
           <w:sz w:val="27"/>
         </w:rPr>
       </w:pPr>
-      <w:bookmarkStart w:id="3" w:name="_Toc236241938"/>
+      <w:bookmarkStart w:id="3" w:name="_Toc236292935"/>
       <w:r>
         <w:rPr>
           <w:rFonts w:ascii="Montserrat" w:hAnsi="Montserrat"/>
@@ -2969,16 +2987,16 @@
         </w:rPr>
         <w:lastRenderedPageBreak/>
         <w:drawing>
-          <wp:inline distT="0" distB="0" distL="0" distR="0" wp14:anchorId="3D95D44B" wp14:editId="4F2EDE9A">
+          <wp:inline distT="0" distB="0" distL="0" distR="0" wp14:anchorId="6E1DE3ED" wp14:editId="55AD611B">
             <wp:extent cx="4206240" cy="3801227"/>
             <wp:effectExtent l="19050" t="19050" r="22860" b="27940"/>
-            <wp:docPr id="1066308998" name="Imagem 2"/>
+            <wp:docPr id="1859615183" name="Imagem 2"/>
             <wp:cNvGraphicFramePr/>
             <a:graphic xmlns:a="http://schemas.openxmlformats.org/drawingml/2006/main">
               <a:graphicData uri="http://schemas.openxmlformats.org/drawingml/2006/picture">
                 <pic:pic xmlns:pic="http://schemas.openxmlformats.org/drawingml/2006/picture">
                   <pic:nvPicPr>
-                    <pic:cNvPr id="1066308998" name=""/>
+                    <pic:cNvPr id="1859615183" name=""/>
                     <pic:cNvPicPr/>
                   </pic:nvPicPr>
                   <pic:blipFill>
@@ -3151,7 +3169,7 @@
           <w:sz w:val="27"/>
         </w:rPr>
       </w:pPr>
-      <w:bookmarkStart w:id="4" w:name="_Toc236241939"/>
+      <w:bookmarkStart w:id="4" w:name="_Toc236292936"/>
       <w:r>
         <w:rPr>
           <w:rFonts w:ascii="Montserrat" w:hAnsi="Montserrat"/>
@@ -4300,7 +4318,7 @@
           <w:sz w:val="34"/>
         </w:rPr>
       </w:pPr>
-      <w:bookmarkStart w:id="5" w:name="_Toc236241940"/>
+      <w:bookmarkStart w:id="5" w:name="_Toc236292937"/>
       <w:r>
         <w:rPr>
           <w:rFonts w:ascii="Montserrat" w:hAnsi="Montserrat"/>
@@ -4324,7 +4342,7 @@
           <w:sz w:val="27"/>
         </w:rPr>
       </w:pPr>
-      <w:bookmarkStart w:id="6" w:name="_Toc236241941"/>
+      <w:bookmarkStart w:id="6" w:name="_Toc236292938"/>
       <w:r>
         <w:rPr>
           <w:rFonts w:ascii="Montserrat" w:hAnsi="Montserrat"/>
@@ -4365,7 +4383,7 @@
           <w:sz w:val="27"/>
         </w:rPr>
       </w:pPr>
-      <w:bookmarkStart w:id="7" w:name="_Toc236241942"/>
+      <w:bookmarkStart w:id="7" w:name="_Toc236292939"/>
       <w:r>
         <w:rPr>
           <w:rFonts w:ascii="Montserrat" w:hAnsi="Montserrat"/>
@@ -4484,7 +4502,7 @@
           <w:sz w:val="27"/>
         </w:rPr>
       </w:pPr>
-      <w:bookmarkStart w:id="8" w:name="_Toc236241943"/>
+      <w:bookmarkStart w:id="8" w:name="_Toc236292940"/>
       <w:r>
         <w:rPr>
           <w:rFonts w:ascii="Montserrat" w:hAnsi="Montserrat"/>
@@ -5055,7 +5073,7 @@
           <w:sz w:val="27"/>
         </w:rPr>
       </w:pPr>
-      <w:bookmarkStart w:id="9" w:name="_Toc236241944"/>
+      <w:bookmarkStart w:id="9" w:name="_Toc236292941"/>
       <w:r>
         <w:rPr>
           <w:rFonts w:ascii="Montserrat" w:hAnsi="Montserrat"/>
@@ -5144,16 +5162,16 @@
         </w:rPr>
         <w:lastRenderedPageBreak/>
         <w:drawing>
-          <wp:inline distT="0" distB="0" distL="0" distR="0" wp14:anchorId="29C7B09B" wp14:editId="747795A2">
+          <wp:inline distT="0" distB="0" distL="0" distR="0" wp14:anchorId="5ADE9C69" wp14:editId="35D9162A">
             <wp:extent cx="4937760" cy="4462310"/>
             <wp:effectExtent l="19050" t="19050" r="15240" b="14605"/>
-            <wp:docPr id="427616671" name="Imagem 3"/>
+            <wp:docPr id="467560047" name="Imagem 3"/>
             <wp:cNvGraphicFramePr/>
             <a:graphic xmlns:a="http://schemas.openxmlformats.org/drawingml/2006/main">
               <a:graphicData uri="http://schemas.openxmlformats.org/drawingml/2006/picture">
                 <pic:pic xmlns:pic="http://schemas.openxmlformats.org/drawingml/2006/picture">
                   <pic:nvPicPr>
-                    <pic:cNvPr id="427616671" name=""/>
+                    <pic:cNvPr id="467560047" name=""/>
                     <pic:cNvPicPr/>
                   </pic:nvPicPr>
                   <pic:blipFill>
@@ -5221,7 +5239,7 @@
           <w:sz w:val="27"/>
         </w:rPr>
       </w:pPr>
-      <w:bookmarkStart w:id="10" w:name="_Toc236241945"/>
+      <w:bookmarkStart w:id="10" w:name="_Toc236292942"/>
       <w:r>
         <w:rPr>
           <w:rFonts w:ascii="Montserrat" w:hAnsi="Montserrat"/>
@@ -5262,16 +5280,16 @@
         </w:rPr>
         <w:lastRenderedPageBreak/>
         <w:drawing>
-          <wp:inline distT="0" distB="0" distL="0" distR="0" wp14:anchorId="2DAF0C73" wp14:editId="510DB9D2">
+          <wp:inline distT="0" distB="0" distL="0" distR="0" wp14:anchorId="0E6A1964" wp14:editId="21FFE4AF">
             <wp:extent cx="5120640" cy="4627581"/>
             <wp:effectExtent l="19050" t="19050" r="22860" b="20955"/>
-            <wp:docPr id="1093739729" name="Imagem 4"/>
+            <wp:docPr id="1669235274" name="Imagem 4"/>
             <wp:cNvGraphicFramePr/>
             <a:graphic xmlns:a="http://schemas.openxmlformats.org/drawingml/2006/main">
               <a:graphicData uri="http://schemas.openxmlformats.org/drawingml/2006/picture">
                 <pic:pic xmlns:pic="http://schemas.openxmlformats.org/drawingml/2006/picture">
                   <pic:nvPicPr>
-                    <pic:cNvPr id="1093739729" name=""/>
+                    <pic:cNvPr id="1669235274" name=""/>
                     <pic:cNvPicPr/>
                   </pic:nvPicPr>
                   <pic:blipFill>
@@ -5408,7 +5426,7 @@
           <w:sz w:val="27"/>
         </w:rPr>
       </w:pPr>
-      <w:bookmarkStart w:id="11" w:name="_Toc236241946"/>
+      <w:bookmarkStart w:id="11" w:name="_Toc236292943"/>
       <w:r>
         <w:rPr>
           <w:rFonts w:ascii="Montserrat" w:hAnsi="Montserrat"/>
@@ -5449,16 +5467,16 @@
           <w:noProof/>
         </w:rPr>
         <w:drawing>
-          <wp:inline distT="0" distB="0" distL="0" distR="0" wp14:anchorId="7A89C6E5" wp14:editId="2C22D414">
+          <wp:inline distT="0" distB="0" distL="0" distR="0" wp14:anchorId="1DA73227" wp14:editId="1DB8CD6C">
             <wp:extent cx="4206240" cy="3801227"/>
             <wp:effectExtent l="19050" t="19050" r="22860" b="27940"/>
-            <wp:docPr id="142365483" name="Imagem 5"/>
+            <wp:docPr id="174126964" name="Imagem 5"/>
             <wp:cNvGraphicFramePr/>
             <a:graphic xmlns:a="http://schemas.openxmlformats.org/drawingml/2006/main">
               <a:graphicData uri="http://schemas.openxmlformats.org/drawingml/2006/picture">
                 <pic:pic xmlns:pic="http://schemas.openxmlformats.org/drawingml/2006/picture">
                   <pic:nvPicPr>
-                    <pic:cNvPr id="142365483" name=""/>
+                    <pic:cNvPr id="174126964" name=""/>
                     <pic:cNvPicPr/>
                   </pic:nvPicPr>
                   <pic:blipFill>
@@ -5526,16 +5544,16 @@
         </w:rPr>
         <w:lastRenderedPageBreak/>
         <w:drawing>
-          <wp:inline distT="0" distB="0" distL="0" distR="0" wp14:anchorId="4BE070B6" wp14:editId="7B7AABEE">
+          <wp:inline distT="0" distB="0" distL="0" distR="0" wp14:anchorId="0BC50D1E" wp14:editId="6D92399A">
             <wp:extent cx="4206240" cy="3801227"/>
             <wp:effectExtent l="19050" t="19050" r="22860" b="27940"/>
-            <wp:docPr id="1072576223" name="Imagem 6"/>
+            <wp:docPr id="522880545" name="Imagem 6"/>
             <wp:cNvGraphicFramePr/>
             <a:graphic xmlns:a="http://schemas.openxmlformats.org/drawingml/2006/main">
               <a:graphicData uri="http://schemas.openxmlformats.org/drawingml/2006/picture">
                 <pic:pic xmlns:pic="http://schemas.openxmlformats.org/drawingml/2006/picture">
                   <pic:nvPicPr>
-                    <pic:cNvPr id="1072576223" name=""/>
+                    <pic:cNvPr id="522880545" name=""/>
                     <pic:cNvPicPr/>
                   </pic:nvPicPr>
                   <pic:blipFill>
@@ -5651,7 +5669,7 @@
           <w:sz w:val="27"/>
         </w:rPr>
       </w:pPr>
-      <w:bookmarkStart w:id="12" w:name="_Toc236241947"/>
+      <w:bookmarkStart w:id="12" w:name="_Toc236292944"/>
       <w:r>
         <w:rPr>
           <w:rFonts w:ascii="Montserrat" w:hAnsi="Montserrat"/>
@@ -5723,7 +5741,7 @@
           <w:sz w:val="34"/>
         </w:rPr>
       </w:pPr>
-      <w:bookmarkStart w:id="13" w:name="_Toc236241948"/>
+      <w:bookmarkStart w:id="13" w:name="_Toc236292945"/>
       <w:r>
         <w:rPr>
           <w:rFonts w:ascii="Montserrat" w:hAnsi="Montserrat"/>
@@ -5765,7 +5783,7 @@
           <w:sz w:val="27"/>
         </w:rPr>
       </w:pPr>
-      <w:bookmarkStart w:id="14" w:name="_Toc236241949"/>
+      <w:bookmarkStart w:id="14" w:name="_Toc236292946"/>
       <w:r>
         <w:rPr>
           <w:rFonts w:ascii="Montserrat" w:hAnsi="Montserrat"/>
@@ -6625,16 +6643,16 @@
         </w:rPr>
         <w:lastRenderedPageBreak/>
         <w:drawing>
-          <wp:inline distT="0" distB="0" distL="0" distR="0" wp14:anchorId="7E5719A9" wp14:editId="12872843">
+          <wp:inline distT="0" distB="0" distL="0" distR="0" wp14:anchorId="343BEDA1" wp14:editId="47DF8EA5">
             <wp:extent cx="5120640" cy="4627581"/>
             <wp:effectExtent l="19050" t="19050" r="22860" b="20955"/>
-            <wp:docPr id="987414858" name="Imagem 7"/>
+            <wp:docPr id="1172423798" name="Imagem 7"/>
             <wp:cNvGraphicFramePr/>
             <a:graphic xmlns:a="http://schemas.openxmlformats.org/drawingml/2006/main">
               <a:graphicData uri="http://schemas.openxmlformats.org/drawingml/2006/picture">
                 <pic:pic xmlns:pic="http://schemas.openxmlformats.org/drawingml/2006/picture">
                   <pic:nvPicPr>
-                    <pic:cNvPr id="987414858" name=""/>
+                    <pic:cNvPr id="1172423798" name=""/>
                     <pic:cNvPicPr/>
                   </pic:nvPicPr>
                   <pic:blipFill>
@@ -6702,16 +6720,16 @@
         </w:rPr>
         <w:lastRenderedPageBreak/>
         <w:drawing>
-          <wp:inline distT="0" distB="0" distL="0" distR="0" wp14:anchorId="45F5D2B6" wp14:editId="1BF8F8D4">
+          <wp:inline distT="0" distB="0" distL="0" distR="0" wp14:anchorId="021300F9" wp14:editId="01DD91D9">
             <wp:extent cx="5120640" cy="4627581"/>
             <wp:effectExtent l="19050" t="19050" r="22860" b="20955"/>
-            <wp:docPr id="1139516807" name="Imagem 8"/>
+            <wp:docPr id="1533216687" name="Imagem 8"/>
             <wp:cNvGraphicFramePr/>
             <a:graphic xmlns:a="http://schemas.openxmlformats.org/drawingml/2006/main">
               <a:graphicData uri="http://schemas.openxmlformats.org/drawingml/2006/picture">
                 <pic:pic xmlns:pic="http://schemas.openxmlformats.org/drawingml/2006/picture">
                   <pic:nvPicPr>
-                    <pic:cNvPr id="1139516807" name=""/>
+                    <pic:cNvPr id="1533216687" name=""/>
                     <pic:cNvPicPr/>
                   </pic:nvPicPr>
                   <pic:blipFill>
@@ -6846,7 +6864,7 @@
           <w:sz w:val="27"/>
         </w:rPr>
       </w:pPr>
-      <w:bookmarkStart w:id="15" w:name="_Toc236241950"/>
+      <w:bookmarkStart w:id="15" w:name="_Toc236292947"/>
       <w:r>
         <w:rPr>
           <w:rFonts w:ascii="Montserrat" w:hAnsi="Montserrat"/>
@@ -7715,16 +7733,16 @@
         </w:rPr>
         <w:lastRenderedPageBreak/>
         <w:drawing>
-          <wp:inline distT="0" distB="0" distL="0" distR="0" wp14:anchorId="24114FBA" wp14:editId="1C09CCB3">
+          <wp:inline distT="0" distB="0" distL="0" distR="0" wp14:anchorId="423E92A2" wp14:editId="0636B011">
             <wp:extent cx="5120640" cy="4627581"/>
             <wp:effectExtent l="19050" t="19050" r="22860" b="20955"/>
-            <wp:docPr id="1679377426" name="Imagem 9"/>
+            <wp:docPr id="327477435" name="Imagem 9"/>
             <wp:cNvGraphicFramePr/>
             <a:graphic xmlns:a="http://schemas.openxmlformats.org/drawingml/2006/main">
               <a:graphicData uri="http://schemas.openxmlformats.org/drawingml/2006/picture">
                 <pic:pic xmlns:pic="http://schemas.openxmlformats.org/drawingml/2006/picture">
                   <pic:nvPicPr>
-                    <pic:cNvPr id="1679377426" name=""/>
+                    <pic:cNvPr id="327477435" name=""/>
                     <pic:cNvPicPr/>
                   </pic:nvPicPr>
                   <pic:blipFill>
@@ -7792,16 +7810,16 @@
         </w:rPr>
         <w:lastRenderedPageBreak/>
         <w:drawing>
-          <wp:inline distT="0" distB="0" distL="0" distR="0" wp14:anchorId="114B1414" wp14:editId="313BFFAE">
+          <wp:inline distT="0" distB="0" distL="0" distR="0" wp14:anchorId="024188C8" wp14:editId="554EE833">
             <wp:extent cx="5120640" cy="4627581"/>
             <wp:effectExtent l="19050" t="19050" r="22860" b="20955"/>
-            <wp:docPr id="144510346" name="Imagem 10"/>
+            <wp:docPr id="1735823452" name="Imagem 10"/>
             <wp:cNvGraphicFramePr/>
             <a:graphic xmlns:a="http://schemas.openxmlformats.org/drawingml/2006/main">
               <a:graphicData uri="http://schemas.openxmlformats.org/drawingml/2006/picture">
                 <pic:pic xmlns:pic="http://schemas.openxmlformats.org/drawingml/2006/picture">
                   <pic:nvPicPr>
-                    <pic:cNvPr id="144510346" name=""/>
+                    <pic:cNvPr id="1735823452" name=""/>
                     <pic:cNvPicPr/>
                   </pic:nvPicPr>
                   <pic:blipFill>
@@ -7887,7 +7905,7 @@
           <w:sz w:val="27"/>
         </w:rPr>
       </w:pPr>
-      <w:bookmarkStart w:id="16" w:name="_Toc236241951"/>
+      <w:bookmarkStart w:id="16" w:name="_Toc236292948"/>
       <w:r>
         <w:rPr>
           <w:rFonts w:ascii="Montserrat" w:hAnsi="Montserrat"/>
@@ -8855,16 +8873,16 @@
         </w:rPr>
         <w:lastRenderedPageBreak/>
         <w:drawing>
-          <wp:inline distT="0" distB="0" distL="0" distR="0" wp14:anchorId="1C7D2E5E" wp14:editId="61430A6D">
+          <wp:inline distT="0" distB="0" distL="0" distR="0" wp14:anchorId="4B858CB9" wp14:editId="5FEE4671">
             <wp:extent cx="5120640" cy="3282818"/>
             <wp:effectExtent l="19050" t="19050" r="22860" b="13335"/>
-            <wp:docPr id="1716675214" name="Imagem 11"/>
+            <wp:docPr id="1134333660" name="Imagem 11"/>
             <wp:cNvGraphicFramePr/>
             <a:graphic xmlns:a="http://schemas.openxmlformats.org/drawingml/2006/main">
               <a:graphicData uri="http://schemas.openxmlformats.org/drawingml/2006/picture">
                 <pic:pic xmlns:pic="http://schemas.openxmlformats.org/drawingml/2006/picture">
                   <pic:nvPicPr>
-                    <pic:cNvPr id="1716675214" name=""/>
+                    <pic:cNvPr id="1134333660" name=""/>
                     <pic:cNvPicPr/>
                   </pic:nvPicPr>
                   <pic:blipFill>
@@ -8932,16 +8950,16 @@
         </w:rPr>
         <w:lastRenderedPageBreak/>
         <w:drawing>
-          <wp:inline distT="0" distB="0" distL="0" distR="0" wp14:anchorId="4317ED69" wp14:editId="250CF99E">
+          <wp:inline distT="0" distB="0" distL="0" distR="0" wp14:anchorId="1314E147" wp14:editId="72BEF26A">
             <wp:extent cx="5120640" cy="4627581"/>
             <wp:effectExtent l="19050" t="19050" r="22860" b="20955"/>
-            <wp:docPr id="1188022203" name="Imagem 12"/>
+            <wp:docPr id="595195255" name="Imagem 12"/>
             <wp:cNvGraphicFramePr/>
             <a:graphic xmlns:a="http://schemas.openxmlformats.org/drawingml/2006/main">
               <a:graphicData uri="http://schemas.openxmlformats.org/drawingml/2006/picture">
                 <pic:pic xmlns:pic="http://schemas.openxmlformats.org/drawingml/2006/picture">
                   <pic:nvPicPr>
-                    <pic:cNvPr id="1188022203" name=""/>
+                    <pic:cNvPr id="595195255" name=""/>
                     <pic:cNvPicPr/>
                   </pic:nvPicPr>
                   <pic:blipFill>
@@ -9027,7 +9045,7 @@
           <w:sz w:val="27"/>
         </w:rPr>
       </w:pPr>
-      <w:bookmarkStart w:id="17" w:name="_Toc236241952"/>
+      <w:bookmarkStart w:id="17" w:name="_Toc236292949"/>
       <w:r>
         <w:rPr>
           <w:rFonts w:ascii="Montserrat" w:hAnsi="Montserrat"/>
@@ -9534,16 +9552,16 @@
           <w:noProof/>
         </w:rPr>
         <w:drawing>
-          <wp:inline distT="0" distB="0" distL="0" distR="0" wp14:anchorId="4BD2F1D7" wp14:editId="681C0E29">
+          <wp:inline distT="0" distB="0" distL="0" distR="0" wp14:anchorId="3FD24B81" wp14:editId="7D88D31B">
             <wp:extent cx="5120640" cy="4627581"/>
             <wp:effectExtent l="19050" t="19050" r="22860" b="20955"/>
-            <wp:docPr id="806954006" name="Imagem 13"/>
+            <wp:docPr id="1649157723" name="Imagem 13"/>
             <wp:cNvGraphicFramePr/>
             <a:graphic xmlns:a="http://schemas.openxmlformats.org/drawingml/2006/main">
               <a:graphicData uri="http://schemas.openxmlformats.org/drawingml/2006/picture">
                 <pic:pic xmlns:pic="http://schemas.openxmlformats.org/drawingml/2006/picture">
                   <pic:nvPicPr>
-                    <pic:cNvPr id="806954006" name=""/>
+                    <pic:cNvPr id="1649157723" name=""/>
                     <pic:cNvPicPr/>
                   </pic:nvPicPr>
                   <pic:blipFill>
@@ -9611,16 +9629,16 @@
         </w:rPr>
         <w:lastRenderedPageBreak/>
         <w:drawing>
-          <wp:inline distT="0" distB="0" distL="0" distR="0" wp14:anchorId="2C5C76B0" wp14:editId="1182DCEC">
+          <wp:inline distT="0" distB="0" distL="0" distR="0" wp14:anchorId="064205D3" wp14:editId="177BE0A9">
             <wp:extent cx="5120640" cy="4627581"/>
             <wp:effectExtent l="19050" t="19050" r="22860" b="20955"/>
-            <wp:docPr id="1964614517" name="Imagem 14"/>
+            <wp:docPr id="2024014109" name="Imagem 14"/>
             <wp:cNvGraphicFramePr/>
             <a:graphic xmlns:a="http://schemas.openxmlformats.org/drawingml/2006/main">
               <a:graphicData uri="http://schemas.openxmlformats.org/drawingml/2006/picture">
                 <pic:pic xmlns:pic="http://schemas.openxmlformats.org/drawingml/2006/picture">
                   <pic:nvPicPr>
-                    <pic:cNvPr id="1964614517" name=""/>
+                    <pic:cNvPr id="2024014109" name=""/>
                     <pic:cNvPicPr/>
                   </pic:nvPicPr>
                   <pic:blipFill>
@@ -9706,7 +9724,7 @@
           <w:sz w:val="27"/>
         </w:rPr>
       </w:pPr>
-      <w:bookmarkStart w:id="18" w:name="_Toc236241953"/>
+      <w:bookmarkStart w:id="18" w:name="_Toc236292950"/>
       <w:r>
         <w:rPr>
           <w:rFonts w:ascii="Montserrat" w:hAnsi="Montserrat"/>
@@ -9747,16 +9765,16 @@
         </w:rPr>
         <w:lastRenderedPageBreak/>
         <w:drawing>
-          <wp:inline distT="0" distB="0" distL="0" distR="0" wp14:anchorId="20A09BC2" wp14:editId="5601D66E">
+          <wp:inline distT="0" distB="0" distL="0" distR="0" wp14:anchorId="4603FBCE" wp14:editId="7076E0D8">
             <wp:extent cx="5120640" cy="4627581"/>
             <wp:effectExtent l="19050" t="19050" r="22860" b="20955"/>
-            <wp:docPr id="208426631" name="Imagem 15"/>
+            <wp:docPr id="731656055" name="Imagem 15"/>
             <wp:cNvGraphicFramePr/>
             <a:graphic xmlns:a="http://schemas.openxmlformats.org/drawingml/2006/main">
               <a:graphicData uri="http://schemas.openxmlformats.org/drawingml/2006/picture">
                 <pic:pic xmlns:pic="http://schemas.openxmlformats.org/drawingml/2006/picture">
                   <pic:nvPicPr>
-                    <pic:cNvPr id="208426631" name=""/>
+                    <pic:cNvPr id="731656055" name=""/>
                     <pic:cNvPicPr/>
                   </pic:nvPicPr>
                   <pic:blipFill>
@@ -9824,16 +9842,16 @@
         </w:rPr>
         <w:lastRenderedPageBreak/>
         <w:drawing>
-          <wp:inline distT="0" distB="0" distL="0" distR="0" wp14:anchorId="16DBBA15" wp14:editId="2E5074D3">
+          <wp:inline distT="0" distB="0" distL="0" distR="0" wp14:anchorId="44A299D2" wp14:editId="11DE78C1">
             <wp:extent cx="5120640" cy="4627581"/>
             <wp:effectExtent l="19050" t="19050" r="22860" b="20955"/>
-            <wp:docPr id="1508234102" name="Imagem 16"/>
+            <wp:docPr id="853655702" name="Imagem 16"/>
             <wp:cNvGraphicFramePr/>
             <a:graphic xmlns:a="http://schemas.openxmlformats.org/drawingml/2006/main">
               <a:graphicData uri="http://schemas.openxmlformats.org/drawingml/2006/picture">
                 <pic:pic xmlns:pic="http://schemas.openxmlformats.org/drawingml/2006/picture">
                   <pic:nvPicPr>
-                    <pic:cNvPr id="1508234102" name=""/>
+                    <pic:cNvPr id="853655702" name=""/>
                     <pic:cNvPicPr/>
                   </pic:nvPicPr>
                   <pic:blipFill>
@@ -9997,16 +10015,16 @@
         </w:rPr>
         <w:lastRenderedPageBreak/>
         <w:drawing>
-          <wp:inline distT="0" distB="0" distL="0" distR="0" wp14:anchorId="597D5BB0" wp14:editId="2AB8C2C3">
+          <wp:inline distT="0" distB="0" distL="0" distR="0" wp14:anchorId="60A996FE" wp14:editId="2F51FDA8">
             <wp:extent cx="5120640" cy="3282818"/>
             <wp:effectExtent l="19050" t="19050" r="22860" b="13335"/>
-            <wp:docPr id="390093117" name="Imagem 17"/>
+            <wp:docPr id="1588888392" name="Imagem 17"/>
             <wp:cNvGraphicFramePr/>
             <a:graphic xmlns:a="http://schemas.openxmlformats.org/drawingml/2006/main">
               <a:graphicData uri="http://schemas.openxmlformats.org/drawingml/2006/picture">
                 <pic:pic xmlns:pic="http://schemas.openxmlformats.org/drawingml/2006/picture">
                   <pic:nvPicPr>
-                    <pic:cNvPr id="390093117" name=""/>
+                    <pic:cNvPr id="1588888392" name=""/>
                     <pic:cNvPicPr/>
                   </pic:nvPicPr>
                   <pic:blipFill>
@@ -10092,7 +10110,7 @@
           <w:sz w:val="27"/>
         </w:rPr>
       </w:pPr>
-      <w:bookmarkStart w:id="19" w:name="_Toc236241954"/>
+      <w:bookmarkStart w:id="19" w:name="_Toc236292951"/>
       <w:r>
         <w:rPr>
           <w:rFonts w:ascii="Montserrat" w:hAnsi="Montserrat"/>
@@ -10133,16 +10151,16 @@
         </w:rPr>
         <w:lastRenderedPageBreak/>
         <w:drawing>
-          <wp:inline distT="0" distB="0" distL="0" distR="0" wp14:anchorId="750EC475" wp14:editId="56A48D62">
+          <wp:inline distT="0" distB="0" distL="0" distR="0" wp14:anchorId="36D545A2" wp14:editId="7FCA7F0D">
             <wp:extent cx="5120640" cy="4627581"/>
             <wp:effectExtent l="19050" t="19050" r="22860" b="20955"/>
-            <wp:docPr id="1937951547" name="Imagem 18"/>
+            <wp:docPr id="1493527552" name="Imagem 18"/>
             <wp:cNvGraphicFramePr/>
             <a:graphic xmlns:a="http://schemas.openxmlformats.org/drawingml/2006/main">
               <a:graphicData uri="http://schemas.openxmlformats.org/drawingml/2006/picture">
                 <pic:pic xmlns:pic="http://schemas.openxmlformats.org/drawingml/2006/picture">
                   <pic:nvPicPr>
-                    <pic:cNvPr id="1937951547" name=""/>
+                    <pic:cNvPr id="1493527552" name=""/>
                     <pic:cNvPicPr/>
                   </pic:nvPicPr>
                   <pic:blipFill>
@@ -10210,16 +10228,16 @@
         </w:rPr>
         <w:lastRenderedPageBreak/>
         <w:drawing>
-          <wp:inline distT="0" distB="0" distL="0" distR="0" wp14:anchorId="6312B498" wp14:editId="26502D3B">
+          <wp:inline distT="0" distB="0" distL="0" distR="0" wp14:anchorId="3A4C3CFF" wp14:editId="09B874EB">
             <wp:extent cx="5120640" cy="4627581"/>
             <wp:effectExtent l="19050" t="19050" r="22860" b="20955"/>
-            <wp:docPr id="1747598786" name="Imagem 19"/>
+            <wp:docPr id="1723710172" name="Imagem 19"/>
             <wp:cNvGraphicFramePr/>
             <a:graphic xmlns:a="http://schemas.openxmlformats.org/drawingml/2006/main">
               <a:graphicData uri="http://schemas.openxmlformats.org/drawingml/2006/picture">
                 <pic:pic xmlns:pic="http://schemas.openxmlformats.org/drawingml/2006/picture">
                   <pic:nvPicPr>
-                    <pic:cNvPr id="1747598786" name=""/>
+                    <pic:cNvPr id="1723710172" name=""/>
                     <pic:cNvPicPr/>
                   </pic:nvPicPr>
                   <pic:blipFill>
@@ -10353,7 +10371,7 @@
           <w:sz w:val="27"/>
         </w:rPr>
       </w:pPr>
-      <w:bookmarkStart w:id="20" w:name="_Toc236241955"/>
+      <w:bookmarkStart w:id="20" w:name="_Toc236292952"/>
       <w:r>
         <w:rPr>
           <w:rFonts w:ascii="Montserrat" w:hAnsi="Montserrat"/>
@@ -10394,16 +10412,16 @@
         </w:rPr>
         <w:lastRenderedPageBreak/>
         <w:drawing>
-          <wp:inline distT="0" distB="0" distL="0" distR="0" wp14:anchorId="1C5AFB64" wp14:editId="74F142C6">
+          <wp:inline distT="0" distB="0" distL="0" distR="0" wp14:anchorId="7697CEE9" wp14:editId="4DBF12F4">
             <wp:extent cx="5120640" cy="4627581"/>
             <wp:effectExtent l="19050" t="19050" r="22860" b="20955"/>
-            <wp:docPr id="428316261" name="Imagem 20"/>
+            <wp:docPr id="1407880669" name="Imagem 20"/>
             <wp:cNvGraphicFramePr/>
             <a:graphic xmlns:a="http://schemas.openxmlformats.org/drawingml/2006/main">
               <a:graphicData uri="http://schemas.openxmlformats.org/drawingml/2006/picture">
                 <pic:pic xmlns:pic="http://schemas.openxmlformats.org/drawingml/2006/picture">
                   <pic:nvPicPr>
-                    <pic:cNvPr id="428316261" name=""/>
+                    <pic:cNvPr id="1407880669" name=""/>
                     <pic:cNvPicPr/>
                   </pic:nvPicPr>
                   <pic:blipFill>
@@ -10471,16 +10489,16 @@
         </w:rPr>
         <w:lastRenderedPageBreak/>
         <w:drawing>
-          <wp:inline distT="0" distB="0" distL="0" distR="0" wp14:anchorId="3FF72F3E" wp14:editId="2C1A6E66">
+          <wp:inline distT="0" distB="0" distL="0" distR="0" wp14:anchorId="053EE43E" wp14:editId="51A2844B">
             <wp:extent cx="5120640" cy="4627581"/>
             <wp:effectExtent l="19050" t="19050" r="22860" b="20955"/>
-            <wp:docPr id="971212441" name="Imagem 21"/>
+            <wp:docPr id="121856988" name="Imagem 21"/>
             <wp:cNvGraphicFramePr/>
             <a:graphic xmlns:a="http://schemas.openxmlformats.org/drawingml/2006/main">
               <a:graphicData uri="http://schemas.openxmlformats.org/drawingml/2006/picture">
                 <pic:pic xmlns:pic="http://schemas.openxmlformats.org/drawingml/2006/picture">
                   <pic:nvPicPr>
-                    <pic:cNvPr id="971212441" name=""/>
+                    <pic:cNvPr id="121856988" name=""/>
                     <pic:cNvPicPr/>
                   </pic:nvPicPr>
                   <pic:blipFill>
@@ -10669,7 +10687,7 @@
           <w:sz w:val="27"/>
         </w:rPr>
       </w:pPr>
-      <w:bookmarkStart w:id="21" w:name="_Toc236241956"/>
+      <w:bookmarkStart w:id="21" w:name="_Toc236292953"/>
       <w:r>
         <w:rPr>
           <w:rFonts w:ascii="Montserrat" w:hAnsi="Montserrat"/>
@@ -10709,16 +10727,16 @@
           <w:noProof/>
         </w:rPr>
         <w:drawing>
-          <wp:inline distT="0" distB="0" distL="0" distR="0" wp14:anchorId="04F3E2B3" wp14:editId="67BCCDB9">
+          <wp:inline distT="0" distB="0" distL="0" distR="0" wp14:anchorId="3802A170" wp14:editId="7C91BC19">
             <wp:extent cx="5120640" cy="4627581"/>
             <wp:effectExtent l="19050" t="19050" r="22860" b="20955"/>
-            <wp:docPr id="493384700" name="Imagem 22"/>
+            <wp:docPr id="563787468" name="Imagem 22"/>
             <wp:cNvGraphicFramePr/>
             <a:graphic xmlns:a="http://schemas.openxmlformats.org/drawingml/2006/main">
               <a:graphicData uri="http://schemas.openxmlformats.org/drawingml/2006/picture">
                 <pic:pic xmlns:pic="http://schemas.openxmlformats.org/drawingml/2006/picture">
                   <pic:nvPicPr>
-                    <pic:cNvPr id="493384700" name=""/>
+                    <pic:cNvPr id="563787468" name=""/>
                     <pic:cNvPicPr/>
                   </pic:nvPicPr>
                   <pic:blipFill>
@@ -10786,16 +10804,16 @@
         </w:rPr>
         <w:lastRenderedPageBreak/>
         <w:drawing>
-          <wp:inline distT="0" distB="0" distL="0" distR="0" wp14:anchorId="5BF7503F" wp14:editId="3A136485">
+          <wp:inline distT="0" distB="0" distL="0" distR="0" wp14:anchorId="47804551" wp14:editId="7947A450">
             <wp:extent cx="5120640" cy="4627581"/>
             <wp:effectExtent l="19050" t="19050" r="22860" b="20955"/>
-            <wp:docPr id="973912404" name="Imagem 23"/>
+            <wp:docPr id="1567283268" name="Imagem 23"/>
             <wp:cNvGraphicFramePr/>
             <a:graphic xmlns:a="http://schemas.openxmlformats.org/drawingml/2006/main">
               <a:graphicData uri="http://schemas.openxmlformats.org/drawingml/2006/picture">
                 <pic:pic xmlns:pic="http://schemas.openxmlformats.org/drawingml/2006/picture">
                   <pic:nvPicPr>
-                    <pic:cNvPr id="973912404" name=""/>
+                    <pic:cNvPr id="1567283268" name=""/>
                     <pic:cNvPicPr/>
                   </pic:nvPicPr>
                   <pic:blipFill>
@@ -10953,7 +10971,7 @@
           <w:sz w:val="27"/>
         </w:rPr>
       </w:pPr>
-      <w:bookmarkStart w:id="22" w:name="_Toc236241957"/>
+      <w:bookmarkStart w:id="22" w:name="_Toc236292954"/>
       <w:r>
         <w:rPr>
           <w:rFonts w:ascii="Montserrat" w:hAnsi="Montserrat"/>
@@ -10994,16 +11012,16 @@
         </w:rPr>
         <w:lastRenderedPageBreak/>
         <w:drawing>
-          <wp:inline distT="0" distB="0" distL="0" distR="0" wp14:anchorId="49DD1A7B" wp14:editId="249545E9">
+          <wp:inline distT="0" distB="0" distL="0" distR="0" wp14:anchorId="56C8C854" wp14:editId="3FE0D330">
             <wp:extent cx="5120640" cy="4627581"/>
             <wp:effectExtent l="19050" t="19050" r="22860" b="20955"/>
-            <wp:docPr id="249809402" name="Imagem 24"/>
+            <wp:docPr id="1575639080" name="Imagem 24"/>
             <wp:cNvGraphicFramePr/>
             <a:graphic xmlns:a="http://schemas.openxmlformats.org/drawingml/2006/main">
               <a:graphicData uri="http://schemas.openxmlformats.org/drawingml/2006/picture">
                 <pic:pic xmlns:pic="http://schemas.openxmlformats.org/drawingml/2006/picture">
                   <pic:nvPicPr>
-                    <pic:cNvPr id="249809402" name=""/>
+                    <pic:cNvPr id="1575639080" name=""/>
                     <pic:cNvPicPr/>
                   </pic:nvPicPr>
                   <pic:blipFill>
@@ -11071,16 +11089,16 @@
         </w:rPr>
         <w:lastRenderedPageBreak/>
         <w:drawing>
-          <wp:inline distT="0" distB="0" distL="0" distR="0" wp14:anchorId="21ED5C55" wp14:editId="62C98CE7">
+          <wp:inline distT="0" distB="0" distL="0" distR="0" wp14:anchorId="4923D57B" wp14:editId="49A6C1D5">
             <wp:extent cx="5120640" cy="4627581"/>
             <wp:effectExtent l="19050" t="19050" r="22860" b="20955"/>
-            <wp:docPr id="1724456342" name="Imagem 25"/>
+            <wp:docPr id="2043375615" name="Imagem 25"/>
             <wp:cNvGraphicFramePr/>
             <a:graphic xmlns:a="http://schemas.openxmlformats.org/drawingml/2006/main">
               <a:graphicData uri="http://schemas.openxmlformats.org/drawingml/2006/picture">
                 <pic:pic xmlns:pic="http://schemas.openxmlformats.org/drawingml/2006/picture">
                   <pic:nvPicPr>
-                    <pic:cNvPr id="1724456342" name=""/>
+                    <pic:cNvPr id="2043375615" name=""/>
                     <pic:cNvPicPr/>
                   </pic:nvPicPr>
                   <pic:blipFill>
@@ -11214,7 +11232,7 @@
           <w:sz w:val="27"/>
         </w:rPr>
       </w:pPr>
-      <w:bookmarkStart w:id="23" w:name="_Toc236241958"/>
+      <w:bookmarkStart w:id="23" w:name="_Toc236292955"/>
       <w:r>
         <w:rPr>
           <w:rFonts w:ascii="Montserrat" w:hAnsi="Montserrat"/>
@@ -11255,16 +11273,16 @@
         </w:rPr>
         <w:lastRenderedPageBreak/>
         <w:drawing>
-          <wp:inline distT="0" distB="0" distL="0" distR="0" wp14:anchorId="5D5DE40F" wp14:editId="6564F492">
+          <wp:inline distT="0" distB="0" distL="0" distR="0" wp14:anchorId="3556FCDB" wp14:editId="13BFC98D">
             <wp:extent cx="5120640" cy="4627581"/>
             <wp:effectExtent l="19050" t="19050" r="22860" b="20955"/>
-            <wp:docPr id="490526014" name="Imagem 26"/>
+            <wp:docPr id="1086533321" name="Imagem 26"/>
             <wp:cNvGraphicFramePr/>
             <a:graphic xmlns:a="http://schemas.openxmlformats.org/drawingml/2006/main">
               <a:graphicData uri="http://schemas.openxmlformats.org/drawingml/2006/picture">
                 <pic:pic xmlns:pic="http://schemas.openxmlformats.org/drawingml/2006/picture">
                   <pic:nvPicPr>
-                    <pic:cNvPr id="490526014" name=""/>
+                    <pic:cNvPr id="1086533321" name=""/>
                     <pic:cNvPicPr/>
                   </pic:nvPicPr>
                   <pic:blipFill>
@@ -11354,7 +11372,7 @@
           <w:sz w:val="34"/>
         </w:rPr>
       </w:pPr>
-      <w:bookmarkStart w:id="24" w:name="_Toc236241959"/>
+      <w:bookmarkStart w:id="24" w:name="_Toc236292956"/>
       <w:r>
         <w:rPr>
           <w:rFonts w:ascii="Montserrat" w:hAnsi="Montserrat"/>
@@ -11396,7 +11414,7 @@
           <w:sz w:val="27"/>
         </w:rPr>
       </w:pPr>
-      <w:bookmarkStart w:id="25" w:name="_Toc236241960"/>
+      <w:bookmarkStart w:id="25" w:name="_Toc236292957"/>
       <w:r>
         <w:rPr>
           <w:rFonts w:ascii="Montserrat" w:hAnsi="Montserrat"/>
@@ -11436,16 +11454,16 @@
           <w:noProof/>
         </w:rPr>
         <w:drawing>
-          <wp:inline distT="0" distB="0" distL="0" distR="0" wp14:anchorId="1C12EDBD" wp14:editId="250FEE21">
+          <wp:inline distT="0" distB="0" distL="0" distR="0" wp14:anchorId="09097BE5" wp14:editId="537818CD">
             <wp:extent cx="5120640" cy="4627581"/>
             <wp:effectExtent l="19050" t="19050" r="22860" b="20955"/>
-            <wp:docPr id="995027399" name="Imagem 27"/>
+            <wp:docPr id="1570260207" name="Imagem 27"/>
             <wp:cNvGraphicFramePr/>
             <a:graphic xmlns:a="http://schemas.openxmlformats.org/drawingml/2006/main">
               <a:graphicData uri="http://schemas.openxmlformats.org/drawingml/2006/picture">
                 <pic:pic xmlns:pic="http://schemas.openxmlformats.org/drawingml/2006/picture">
                   <pic:nvPicPr>
-                    <pic:cNvPr id="995027399" name=""/>
+                    <pic:cNvPr id="1570260207" name=""/>
                     <pic:cNvPicPr/>
                   </pic:nvPicPr>
                   <pic:blipFill>
@@ -11513,16 +11531,16 @@
         </w:rPr>
         <w:lastRenderedPageBreak/>
         <w:drawing>
-          <wp:inline distT="0" distB="0" distL="0" distR="0" wp14:anchorId="20AD6874" wp14:editId="4C4BB0B4">
+          <wp:inline distT="0" distB="0" distL="0" distR="0" wp14:anchorId="4E4D0879" wp14:editId="40F3BED2">
             <wp:extent cx="5120640" cy="4627581"/>
             <wp:effectExtent l="19050" t="19050" r="22860" b="20955"/>
-            <wp:docPr id="203272163" name="Imagem 28"/>
+            <wp:docPr id="1286846808" name="Imagem 28"/>
             <wp:cNvGraphicFramePr/>
             <a:graphic xmlns:a="http://schemas.openxmlformats.org/drawingml/2006/main">
               <a:graphicData uri="http://schemas.openxmlformats.org/drawingml/2006/picture">
                 <pic:pic xmlns:pic="http://schemas.openxmlformats.org/drawingml/2006/picture">
                   <pic:nvPicPr>
-                    <pic:cNvPr id="203272163" name=""/>
+                    <pic:cNvPr id="1286846808" name=""/>
                     <pic:cNvPicPr/>
                   </pic:nvPicPr>
                   <pic:blipFill>
@@ -11590,16 +11608,16 @@
         </w:rPr>
         <w:lastRenderedPageBreak/>
         <w:drawing>
-          <wp:inline distT="0" distB="0" distL="0" distR="0" wp14:anchorId="57BD6525" wp14:editId="14E2CAEC">
+          <wp:inline distT="0" distB="0" distL="0" distR="0" wp14:anchorId="3A151193" wp14:editId="5401EA10">
             <wp:extent cx="5120640" cy="4627581"/>
             <wp:effectExtent l="19050" t="19050" r="22860" b="20955"/>
-            <wp:docPr id="858208818" name="Imagem 29"/>
+            <wp:docPr id="129541045" name="Imagem 29"/>
             <wp:cNvGraphicFramePr/>
             <a:graphic xmlns:a="http://schemas.openxmlformats.org/drawingml/2006/main">
               <a:graphicData uri="http://schemas.openxmlformats.org/drawingml/2006/picture">
                 <pic:pic xmlns:pic="http://schemas.openxmlformats.org/drawingml/2006/picture">
                   <pic:nvPicPr>
-                    <pic:cNvPr id="858208818" name=""/>
+                    <pic:cNvPr id="129541045" name=""/>
                     <pic:cNvPicPr/>
                   </pic:nvPicPr>
                   <pic:blipFill>
@@ -11736,16 +11754,16 @@
         </w:rPr>
         <w:lastRenderedPageBreak/>
         <w:drawing>
-          <wp:inline distT="0" distB="0" distL="0" distR="0" wp14:anchorId="5EC5C7B8" wp14:editId="648EF885">
+          <wp:inline distT="0" distB="0" distL="0" distR="0" wp14:anchorId="0B2F744A" wp14:editId="4C33B84A">
             <wp:extent cx="5120640" cy="1715571"/>
             <wp:effectExtent l="19050" t="19050" r="22860" b="18415"/>
-            <wp:docPr id="775377057" name="Imagem 30"/>
+            <wp:docPr id="1984840935" name="Imagem 30"/>
             <wp:cNvGraphicFramePr/>
             <a:graphic xmlns:a="http://schemas.openxmlformats.org/drawingml/2006/main">
               <a:graphicData uri="http://schemas.openxmlformats.org/drawingml/2006/picture">
                 <pic:pic xmlns:pic="http://schemas.openxmlformats.org/drawingml/2006/picture">
                   <pic:nvPicPr>
-                    <pic:cNvPr id="775377057" name=""/>
+                    <pic:cNvPr id="1984840935" name=""/>
                     <pic:cNvPicPr/>
                   </pic:nvPicPr>
                   <pic:blipFill>
@@ -11882,16 +11900,16 @@
         </w:rPr>
         <w:lastRenderedPageBreak/>
         <w:drawing>
-          <wp:inline distT="0" distB="0" distL="0" distR="0" wp14:anchorId="475AA1F9" wp14:editId="65025BD3">
+          <wp:inline distT="0" distB="0" distL="0" distR="0" wp14:anchorId="2A5001FA" wp14:editId="1CFD14C5">
             <wp:extent cx="5120640" cy="3282818"/>
             <wp:effectExtent l="19050" t="19050" r="22860" b="13335"/>
-            <wp:docPr id="1967560191" name="Imagem 31"/>
+            <wp:docPr id="1766476040" name="Imagem 31"/>
             <wp:cNvGraphicFramePr/>
             <a:graphic xmlns:a="http://schemas.openxmlformats.org/drawingml/2006/main">
               <a:graphicData uri="http://schemas.openxmlformats.org/drawingml/2006/picture">
                 <pic:pic xmlns:pic="http://schemas.openxmlformats.org/drawingml/2006/picture">
                   <pic:nvPicPr>
-                    <pic:cNvPr id="1967560191" name=""/>
+                    <pic:cNvPr id="1766476040" name=""/>
                     <pic:cNvPicPr/>
                   </pic:nvPicPr>
                   <pic:blipFill>
@@ -12003,16 +12021,16 @@
           <w:noProof/>
         </w:rPr>
         <w:drawing>
-          <wp:inline distT="0" distB="0" distL="0" distR="0" wp14:anchorId="1F603760" wp14:editId="56C98907">
+          <wp:inline distT="0" distB="0" distL="0" distR="0" wp14:anchorId="645E1554" wp14:editId="64C56496">
             <wp:extent cx="5120640" cy="1515102"/>
             <wp:effectExtent l="19050" t="19050" r="22860" b="28575"/>
-            <wp:docPr id="1308611057" name="Imagem 32"/>
+            <wp:docPr id="1465122041" name="Imagem 32"/>
             <wp:cNvGraphicFramePr/>
             <a:graphic xmlns:a="http://schemas.openxmlformats.org/drawingml/2006/main">
               <a:graphicData uri="http://schemas.openxmlformats.org/drawingml/2006/picture">
                 <pic:pic xmlns:pic="http://schemas.openxmlformats.org/drawingml/2006/picture">
                   <pic:nvPicPr>
-                    <pic:cNvPr id="1308611057" name=""/>
+                    <pic:cNvPr id="1465122041" name=""/>
                     <pic:cNvPicPr/>
                   </pic:nvPicPr>
                   <pic:blipFill>
@@ -12102,7 +12120,7 @@
           <w:sz w:val="27"/>
         </w:rPr>
       </w:pPr>
-      <w:bookmarkStart w:id="26" w:name="_Toc236241961"/>
+      <w:bookmarkStart w:id="26" w:name="_Toc236292958"/>
       <w:r>
         <w:rPr>
           <w:rFonts w:ascii="Montserrat" w:hAnsi="Montserrat"/>
@@ -12142,16 +12160,16 @@
           <w:noProof/>
         </w:rPr>
         <w:drawing>
-          <wp:inline distT="0" distB="0" distL="0" distR="0" wp14:anchorId="44678CCF" wp14:editId="52A6F53A">
+          <wp:inline distT="0" distB="0" distL="0" distR="0" wp14:anchorId="28A96266" wp14:editId="1DB12A96">
             <wp:extent cx="5120640" cy="4627581"/>
             <wp:effectExtent l="19050" t="19050" r="22860" b="20955"/>
-            <wp:docPr id="968929317" name="Imagem 33"/>
+            <wp:docPr id="105791802" name="Imagem 33"/>
             <wp:cNvGraphicFramePr/>
             <a:graphic xmlns:a="http://schemas.openxmlformats.org/drawingml/2006/main">
               <a:graphicData uri="http://schemas.openxmlformats.org/drawingml/2006/picture">
                 <pic:pic xmlns:pic="http://schemas.openxmlformats.org/drawingml/2006/picture">
                   <pic:nvPicPr>
-                    <pic:cNvPr id="968929317" name=""/>
+                    <pic:cNvPr id="105791802" name=""/>
                     <pic:cNvPicPr/>
                   </pic:nvPicPr>
                   <pic:blipFill>
@@ -12219,16 +12237,16 @@
         </w:rPr>
         <w:lastRenderedPageBreak/>
         <w:drawing>
-          <wp:inline distT="0" distB="0" distL="0" distR="0" wp14:anchorId="23A457F6" wp14:editId="4D82EAC3">
+          <wp:inline distT="0" distB="0" distL="0" distR="0" wp14:anchorId="2B549901" wp14:editId="53BD6310">
             <wp:extent cx="5120640" cy="4627581"/>
             <wp:effectExtent l="19050" t="19050" r="22860" b="20955"/>
-            <wp:docPr id="1351846968" name="Imagem 34"/>
+            <wp:docPr id="2054547299" name="Imagem 34"/>
             <wp:cNvGraphicFramePr/>
             <a:graphic xmlns:a="http://schemas.openxmlformats.org/drawingml/2006/main">
               <a:graphicData uri="http://schemas.openxmlformats.org/drawingml/2006/picture">
                 <pic:pic xmlns:pic="http://schemas.openxmlformats.org/drawingml/2006/picture">
                   <pic:nvPicPr>
-                    <pic:cNvPr id="1351846968" name=""/>
+                    <pic:cNvPr id="2054547299" name=""/>
                     <pic:cNvPicPr/>
                   </pic:nvPicPr>
                   <pic:blipFill>
@@ -12365,16 +12383,16 @@
         </w:rPr>
         <w:lastRenderedPageBreak/>
         <w:drawing>
-          <wp:inline distT="0" distB="0" distL="0" distR="0" wp14:anchorId="46569D35" wp14:editId="5D076349">
+          <wp:inline distT="0" distB="0" distL="0" distR="0" wp14:anchorId="48748D1A" wp14:editId="706CAA72">
             <wp:extent cx="5120640" cy="2144319"/>
             <wp:effectExtent l="19050" t="19050" r="22860" b="27940"/>
-            <wp:docPr id="2014520920" name="Imagem 35"/>
+            <wp:docPr id="659380280" name="Imagem 35"/>
             <wp:cNvGraphicFramePr/>
             <a:graphic xmlns:a="http://schemas.openxmlformats.org/drawingml/2006/main">
               <a:graphicData uri="http://schemas.openxmlformats.org/drawingml/2006/picture">
                 <pic:pic xmlns:pic="http://schemas.openxmlformats.org/drawingml/2006/picture">
                   <pic:nvPicPr>
-                    <pic:cNvPr id="2014520920" name=""/>
+                    <pic:cNvPr id="659380280" name=""/>
                     <pic:cNvPicPr/>
                   </pic:nvPicPr>
                   <pic:blipFill>
@@ -12433,6 +12451,103 @@
     </w:p>
     <w:p>
       <w:pPr>
+        <w:spacing w:before="160" w:after="200"/>
+        <w:ind w:left="283"/>
+        <w:rPr>
+          <w:rFonts w:ascii="Montserrat" w:hAnsi="Montserrat"/>
+          <w:i/>
+          <w:color w:val="6A6A70"/>
+          <w:sz w:val="21"/>
+        </w:rPr>
+      </w:pPr>
+      <w:r>
+        <w:rPr>
+          <w:rFonts w:ascii="Montserrat" w:hAnsi="Montserrat"/>
+          <w:i/>
+          <w:color w:val="6A6A70"/>
+          <w:sz w:val="21"/>
+        </w:rPr>
+        <w:t>Importar indicadores do TAP: quando um Projeto vinculado e selecionado, a secao Indicadores do projeto ganha o botao Importar do TAP. Ele busca o(s) TAP(s) registrados para aquele mesmo projeto e traz os indicadores de resultado ja preenchidos la (secao 9 do TAP - Passo 3), evitando digitar tudo de novo: o Valor inicial do TAP vira o Valor atual aqui, e o Valor final vira a Meta. Indicadores com o mesmo nome que ja estiverem na lista nao sao duplicados - o botao pode ser clicado varias vezes com seguranca. Se nenhum TAP for encontrado para o projeto selecionado, aparece um aviso.</w:t>
+      </w:r>
+    </w:p>
+    <w:p>
+      <w:pPr>
+        <w:spacing w:before="120" w:after="40"/>
+        <w:jc w:val="center"/>
+      </w:pPr>
+      <w:r>
+        <w:rPr>
+          <w:noProof/>
+        </w:rPr>
+        <w:drawing>
+          <wp:inline distT="0" distB="0" distL="0" distR="0" wp14:anchorId="01E5F40D" wp14:editId="5E77F4BE">
+            <wp:extent cx="5120640" cy="1055647"/>
+            <wp:effectExtent l="19050" t="19050" r="22860" b="11430"/>
+            <wp:docPr id="788873508" name="Imagem 36"/>
+            <wp:cNvGraphicFramePr/>
+            <a:graphic xmlns:a="http://schemas.openxmlformats.org/drawingml/2006/main">
+              <a:graphicData uri="http://schemas.openxmlformats.org/drawingml/2006/picture">
+                <pic:pic xmlns:pic="http://schemas.openxmlformats.org/drawingml/2006/picture">
+                  <pic:nvPicPr>
+                    <pic:cNvPr id="788873508" name=""/>
+                    <pic:cNvPicPr/>
+                  </pic:nvPicPr>
+                  <pic:blipFill>
+                    <a:blip r:embed="rId42">
+                      <a:extLst>
+                        <a:ext uri="{28A0092B-C50C-407E-A947-70E740481C1C}">
+                          <a14:useLocalDpi xmlns:a14="http://schemas.microsoft.com/office/drawing/2010/main" val="0"/>
+                        </a:ext>
+                      </a:extLst>
+                    </a:blip>
+                    <a:stretch>
+                      <a:fillRect/>
+                    </a:stretch>
+                  </pic:blipFill>
+                  <pic:spPr>
+                    <a:xfrm>
+                      <a:off x="0" y="0"/>
+                      <a:ext cx="5120640" cy="1055647"/>
+                    </a:xfrm>
+                    <a:prstGeom prst="rect">
+                      <a:avLst/>
+                    </a:prstGeom>
+                    <a:ln w="9525">
+                      <a:solidFill>
+                        <a:srgbClr val="D1D5DB"/>
+                      </a:solidFill>
+                    </a:ln>
+                  </pic:spPr>
+                </pic:pic>
+              </a:graphicData>
+            </a:graphic>
+          </wp:inline>
+        </w:drawing>
+      </w:r>
+    </w:p>
+    <w:p>
+      <w:pPr>
+        <w:spacing w:before="120" w:after="280"/>
+        <w:jc w:val="center"/>
+        <w:rPr>
+          <w:rFonts w:ascii="Montserrat" w:hAnsi="Montserrat"/>
+          <w:i/>
+          <w:color w:val="6A6A70"/>
+          <w:sz w:val="19"/>
+        </w:rPr>
+      </w:pPr>
+      <w:r>
+        <w:rPr>
+          <w:rFonts w:ascii="Montserrat" w:hAnsi="Montserrat"/>
+          <w:i/>
+          <w:color w:val="6A6A70"/>
+          <w:sz w:val="19"/>
+        </w:rPr>
+        <w:t>Indicadores do projeto apos importar do TAP - Valor atual e Meta preenchidos automaticamente.</w:t>
+      </w:r>
+    </w:p>
+    <w:p>
+      <w:pPr>
         <w:pStyle w:val="PargrafodaLista"/>
         <w:numPr>
           <w:ilvl w:val="0"/>
@@ -12485,21 +12600,22 @@
         <w:rPr>
           <w:noProof/>
         </w:rPr>
+        <w:lastRenderedPageBreak/>
         <w:drawing>
-          <wp:inline distT="0" distB="0" distL="0" distR="0" wp14:anchorId="75231EF7" wp14:editId="16FAAB12">
+          <wp:inline distT="0" distB="0" distL="0" distR="0" wp14:anchorId="555E9D77" wp14:editId="7BBE471F">
             <wp:extent cx="5120640" cy="3282818"/>
             <wp:effectExtent l="19050" t="19050" r="22860" b="13335"/>
-            <wp:docPr id="1635229769" name="Imagem 36"/>
+            <wp:docPr id="2075338445" name="Imagem 37"/>
             <wp:cNvGraphicFramePr/>
             <a:graphic xmlns:a="http://schemas.openxmlformats.org/drawingml/2006/main">
               <a:graphicData uri="http://schemas.openxmlformats.org/drawingml/2006/picture">
                 <pic:pic xmlns:pic="http://schemas.openxmlformats.org/drawingml/2006/picture">
                   <pic:nvPicPr>
-                    <pic:cNvPr id="1635229769" name=""/>
+                    <pic:cNvPr id="2075338445" name=""/>
                     <pic:cNvPicPr/>
                   </pic:nvPicPr>
                   <pic:blipFill>
-                    <a:blip r:embed="rId42">
+                    <a:blip r:embed="rId43">
                       <a:extLst>
                         <a:ext uri="{28A0092B-C50C-407E-A947-70E740481C1C}">
                           <a14:useLocalDpi xmlns:a14="http://schemas.microsoft.com/office/drawing/2010/main" val="0"/>
@@ -12549,7 +12665,6 @@
           <w:color w:val="6A6A70"/>
           <w:sz w:val="19"/>
         </w:rPr>
-        <w:lastRenderedPageBreak/>
         <w:t>Cartao Gate 2 - Pactuacao preenchido, com o relatorio travado apos a pactuacao.</w:t>
       </w:r>
     </w:p>
@@ -12589,7 +12704,7 @@
           <w:sz w:val="34"/>
         </w:rPr>
       </w:pPr>
-      <w:bookmarkStart w:id="27" w:name="_Toc236241962"/>
+      <w:bookmarkStart w:id="27" w:name="_Toc236292959"/>
       <w:r>
         <w:rPr>
           <w:rFonts w:ascii="Montserrat" w:hAnsi="Montserrat"/>
@@ -12649,7 +12764,7 @@
           <w:sz w:val="27"/>
         </w:rPr>
       </w:pPr>
-      <w:bookmarkStart w:id="28" w:name="_Toc236241963"/>
+      <w:bookmarkStart w:id="28" w:name="_Toc236292960"/>
       <w:r>
         <w:rPr>
           <w:rFonts w:ascii="Montserrat" w:hAnsi="Montserrat"/>
@@ -12689,134 +12804,16 @@
           <w:noProof/>
         </w:rPr>
         <w:drawing>
-          <wp:inline distT="0" distB="0" distL="0" distR="0" wp14:anchorId="02E61A72" wp14:editId="3A40AA5E">
+          <wp:inline distT="0" distB="0" distL="0" distR="0" wp14:anchorId="68F089F8" wp14:editId="5CDEBEF4">
             <wp:extent cx="5303520" cy="4792851"/>
             <wp:effectExtent l="19050" t="19050" r="11430" b="27305"/>
-            <wp:docPr id="1986985544" name="Imagem 37"/>
+            <wp:docPr id="388351583" name="Imagem 38"/>
             <wp:cNvGraphicFramePr/>
             <a:graphic xmlns:a="http://schemas.openxmlformats.org/drawingml/2006/main">
               <a:graphicData uri="http://schemas.openxmlformats.org/drawingml/2006/picture">
                 <pic:pic xmlns:pic="http://schemas.openxmlformats.org/drawingml/2006/picture">
                   <pic:nvPicPr>
-                    <pic:cNvPr id="1986985544" name=""/>
-                    <pic:cNvPicPr/>
-                  </pic:nvPicPr>
-                  <pic:blipFill>
-                    <a:blip r:embed="rId43">
-                      <a:extLst>
-                        <a:ext uri="{28A0092B-C50C-407E-A947-70E740481C1C}">
-                          <a14:useLocalDpi xmlns:a14="http://schemas.microsoft.com/office/drawing/2010/main" val="0"/>
-                        </a:ext>
-                      </a:extLst>
-                    </a:blip>
-                    <a:stretch>
-                      <a:fillRect/>
-                    </a:stretch>
-                  </pic:blipFill>
-                  <pic:spPr>
-                    <a:xfrm>
-                      <a:off x="0" y="0"/>
-                      <a:ext cx="5303520" cy="4792851"/>
-                    </a:xfrm>
-                    <a:prstGeom prst="rect">
-                      <a:avLst/>
-                    </a:prstGeom>
-                    <a:ln w="9525">
-                      <a:solidFill>
-                        <a:srgbClr val="D1D5DB"/>
-                      </a:solidFill>
-                    </a:ln>
-                  </pic:spPr>
-                </pic:pic>
-              </a:graphicData>
-            </a:graphic>
-          </wp:inline>
-        </w:drawing>
-      </w:r>
-    </w:p>
-    <w:p>
-      <w:pPr>
-        <w:spacing w:before="120" w:after="280"/>
-        <w:jc w:val="center"/>
-        <w:rPr>
-          <w:rFonts w:ascii="Montserrat" w:hAnsi="Montserrat"/>
-          <w:i/>
-          <w:color w:val="6A6A70"/>
-          <w:sz w:val="19"/>
-        </w:rPr>
-      </w:pPr>
-      <w:r>
-        <w:rPr>
-          <w:rFonts w:ascii="Montserrat" w:hAnsi="Montserrat"/>
-          <w:i/>
-          <w:color w:val="6A6A70"/>
-          <w:sz w:val="19"/>
-        </w:rPr>
-        <w:lastRenderedPageBreak/>
-        <w:t>Quadro de conexoes com o fator F1 selecionado - o painel a direita mostra os beneficios que ele habilita.</w:t>
-      </w:r>
-    </w:p>
-    <w:p>
-      <w:pPr>
-        <w:pStyle w:val="Ttulo2"/>
-        <w:spacing w:before="320" w:after="120"/>
-        <w:rPr>
-          <w:rFonts w:ascii="Montserrat" w:hAnsi="Montserrat"/>
-          <w:b/>
-          <w:color w:val="B91D2E"/>
-          <w:sz w:val="27"/>
-        </w:rPr>
-      </w:pPr>
-      <w:bookmarkStart w:id="29" w:name="_Toc236241964"/>
-      <w:r>
-        <w:rPr>
-          <w:rFonts w:ascii="Montserrat" w:hAnsi="Montserrat"/>
-          <w:b/>
-          <w:color w:val="B91D2E"/>
-          <w:sz w:val="27"/>
-        </w:rPr>
-        <w:t>5.2 Simulador - e se...?</w:t>
-      </w:r>
-      <w:bookmarkEnd w:id="29"/>
-    </w:p>
-    <w:p>
-      <w:pPr>
-        <w:spacing w:line="280" w:lineRule="auto"/>
-        <w:rPr>
-          <w:rFonts w:ascii="Montserrat" w:hAnsi="Montserrat"/>
-          <w:color w:val="1A1A1A"/>
-          <w:sz w:val="22"/>
-        </w:rPr>
-      </w:pPr>
-      <w:r>
-        <w:rPr>
-          <w:rFonts w:ascii="Montserrat" w:hAnsi="Montserrat"/>
-          <w:color w:val="1A1A1A"/>
-          <w:sz w:val="22"/>
-        </w:rPr>
-        <w:t>Ajuste o quanto cada fator esta presente no seu projeto (0-100%) e veja o potencial estimado de cada dimensao de beneficio recalcular em tempo real.</w:t>
-      </w:r>
-    </w:p>
-    <w:p>
-      <w:pPr>
-        <w:spacing w:before="120" w:after="40"/>
-        <w:jc w:val="center"/>
-      </w:pPr>
-      <w:r>
-        <w:rPr>
-          <w:noProof/>
-        </w:rPr>
-        <w:drawing>
-          <wp:inline distT="0" distB="0" distL="0" distR="0" wp14:anchorId="03AB73D1" wp14:editId="060E7237">
-            <wp:extent cx="5303520" cy="4792851"/>
-            <wp:effectExtent l="19050" t="19050" r="11430" b="27305"/>
-            <wp:docPr id="1726922309" name="Imagem 38"/>
-            <wp:cNvGraphicFramePr/>
-            <a:graphic xmlns:a="http://schemas.openxmlformats.org/drawingml/2006/main">
-              <a:graphicData uri="http://schemas.openxmlformats.org/drawingml/2006/picture">
-                <pic:pic xmlns:pic="http://schemas.openxmlformats.org/drawingml/2006/picture">
-                  <pic:nvPicPr>
-                    <pic:cNvPr id="1726922309" name=""/>
+                    <pic:cNvPr id="388351583" name=""/>
                     <pic:cNvPicPr/>
                   </pic:nvPicPr>
                   <pic:blipFill>
@@ -12870,7 +12867,8 @@
           <w:color w:val="6A6A70"/>
           <w:sz w:val="19"/>
         </w:rPr>
-        <w:t>Simulador de fatores x beneficios. Abaixo dele, o aviso de login para quem quiser vincular a um projeto.</w:t>
+        <w:lastRenderedPageBreak/>
+        <w:t>Quadro de conexoes com o fator F1 selecionado - o painel a direita mostra os beneficios que ele habilita.</w:t>
       </w:r>
     </w:p>
     <w:p>
@@ -12884,7 +12882,7 @@
           <w:sz w:val="27"/>
         </w:rPr>
       </w:pPr>
-      <w:bookmarkStart w:id="30" w:name="_Toc236241965"/>
+      <w:bookmarkStart w:id="29" w:name="_Toc236292961"/>
       <w:r>
         <w:rPr>
           <w:rFonts w:ascii="Montserrat" w:hAnsi="Montserrat"/>
@@ -12892,9 +12890,9 @@
           <w:color w:val="B91D2E"/>
           <w:sz w:val="27"/>
         </w:rPr>
-        <w:t>5.3 Assistente de decisao em 8 perguntas</w:t>
-      </w:r>
-      <w:bookmarkEnd w:id="30"/>
+        <w:t>5.2 Simulador - e se...?</w:t>
+      </w:r>
+      <w:bookmarkEnd w:id="29"/>
     </w:p>
     <w:p>
       <w:pPr>
@@ -12911,7 +12909,7 @@
           <w:color w:val="1A1A1A"/>
           <w:sz w:val="22"/>
         </w:rPr>
-        <w:t>Responda a oito perguntas do semaforo de decisao, uma de cada vez. Ao final, o painel devolve um veredito com a regra aplicada.</w:t>
+        <w:t>Ajuste o quanto cada fator esta presente no seu projeto (0-100%) e veja o potencial estimado de cada dimensao de beneficio recalcular em tempo real.</w:t>
       </w:r>
     </w:p>
     <w:p>
@@ -12923,18 +12921,17 @@
         <w:rPr>
           <w:noProof/>
         </w:rPr>
-        <w:lastRenderedPageBreak/>
         <w:drawing>
-          <wp:inline distT="0" distB="0" distL="0" distR="0" wp14:anchorId="3C6075CB" wp14:editId="7114D4F0">
+          <wp:inline distT="0" distB="0" distL="0" distR="0" wp14:anchorId="3FEDCF22" wp14:editId="5376CEC4">
             <wp:extent cx="5303520" cy="4792851"/>
             <wp:effectExtent l="19050" t="19050" r="11430" b="27305"/>
-            <wp:docPr id="922102290" name="Imagem 39"/>
+            <wp:docPr id="1033624833" name="Imagem 39"/>
             <wp:cNvGraphicFramePr/>
             <a:graphic xmlns:a="http://schemas.openxmlformats.org/drawingml/2006/main">
               <a:graphicData uri="http://schemas.openxmlformats.org/drawingml/2006/picture">
                 <pic:pic xmlns:pic="http://schemas.openxmlformats.org/drawingml/2006/picture">
                   <pic:nvPicPr>
-                    <pic:cNvPr id="922102290" name=""/>
+                    <pic:cNvPr id="1033624833" name=""/>
                     <pic:cNvPicPr/>
                   </pic:nvPicPr>
                   <pic:blipFill>
@@ -12988,7 +12985,48 @@
           <w:color w:val="6A6A70"/>
           <w:sz w:val="19"/>
         </w:rPr>
-        <w:t>Primeira pergunta do assistente de decisao.</w:t>
+        <w:t>Simulador de fatores x beneficios. Abaixo dele, o aviso de login para quem quiser vincular a um projeto.</w:t>
+      </w:r>
+    </w:p>
+    <w:p>
+      <w:pPr>
+        <w:pStyle w:val="Ttulo2"/>
+        <w:spacing w:before="320" w:after="120"/>
+        <w:rPr>
+          <w:rFonts w:ascii="Montserrat" w:hAnsi="Montserrat"/>
+          <w:b/>
+          <w:color w:val="B91D2E"/>
+          <w:sz w:val="27"/>
+        </w:rPr>
+      </w:pPr>
+      <w:bookmarkStart w:id="30" w:name="_Toc236292962"/>
+      <w:r>
+        <w:rPr>
+          <w:rFonts w:ascii="Montserrat" w:hAnsi="Montserrat"/>
+          <w:b/>
+          <w:color w:val="B91D2E"/>
+          <w:sz w:val="27"/>
+        </w:rPr>
+        <w:t>5.3 Assistente de decisao em 8 perguntas</w:t>
+      </w:r>
+      <w:bookmarkEnd w:id="30"/>
+    </w:p>
+    <w:p>
+      <w:pPr>
+        <w:spacing w:line="280" w:lineRule="auto"/>
+        <w:rPr>
+          <w:rFonts w:ascii="Montserrat" w:hAnsi="Montserrat"/>
+          <w:color w:val="1A1A1A"/>
+          <w:sz w:val="22"/>
+        </w:rPr>
+      </w:pPr>
+      <w:r>
+        <w:rPr>
+          <w:rFonts w:ascii="Montserrat" w:hAnsi="Montserrat"/>
+          <w:color w:val="1A1A1A"/>
+          <w:sz w:val="22"/>
+        </w:rPr>
+        <w:t>Responda a oito perguntas do semaforo de decisao, uma de cada vez. Ao final, o painel devolve um veredito com a regra aplicada.</w:t>
       </w:r>
     </w:p>
     <w:p>
@@ -13002,16 +13040,16 @@
         </w:rPr>
         <w:lastRenderedPageBreak/>
         <w:drawing>
-          <wp:inline distT="0" distB="0" distL="0" distR="0" wp14:anchorId="7F5F1736" wp14:editId="1F8D501A">
+          <wp:inline distT="0" distB="0" distL="0" distR="0" wp14:anchorId="70CB412C" wp14:editId="58965576">
             <wp:extent cx="5303520" cy="4792851"/>
             <wp:effectExtent l="19050" t="19050" r="11430" b="27305"/>
-            <wp:docPr id="2029586256" name="Imagem 40"/>
+            <wp:docPr id="588523443" name="Imagem 40"/>
             <wp:cNvGraphicFramePr/>
             <a:graphic xmlns:a="http://schemas.openxmlformats.org/drawingml/2006/main">
               <a:graphicData uri="http://schemas.openxmlformats.org/drawingml/2006/picture">
                 <pic:pic xmlns:pic="http://schemas.openxmlformats.org/drawingml/2006/picture">
                   <pic:nvPicPr>
-                    <pic:cNvPr id="2029586256" name=""/>
+                    <pic:cNvPr id="588523443" name=""/>
                     <pic:cNvPicPr/>
                   </pic:nvPicPr>
                   <pic:blipFill>
@@ -13065,115 +13103,7 @@
           <w:color w:val="6A6A70"/>
           <w:sz w:val="19"/>
         </w:rPr>
-        <w:t>Veredito final, com o placar de respostas verdes/amarelas/vermelhas.</w:t>
-      </w:r>
-    </w:p>
-    <w:p>
-      <w:pPr>
-        <w:spacing w:before="160" w:after="200"/>
-        <w:ind w:left="283"/>
-        <w:rPr>
-          <w:rFonts w:ascii="Montserrat" w:hAnsi="Montserrat"/>
-          <w:i/>
-          <w:color w:val="6A6A70"/>
-          <w:sz w:val="21"/>
-        </w:rPr>
-      </w:pPr>
-      <w:r>
-        <w:rPr>
-          <w:rFonts w:ascii="Montserrat" w:hAnsi="Montserrat"/>
-          <w:i/>
-          <w:color w:val="6A6A70"/>
-          <w:sz w:val="21"/>
-        </w:rPr>
-        <w:t>Regra aplicada: qualquer resposta vermelha leva a encerrar/repactuar; tres ou mais amarelas levam a replanejar; caso contrario, o veredito e concluir.</w:t>
-      </w:r>
-    </w:p>
-    <w:p>
-      <w:pPr>
-        <w:pStyle w:val="Ttulo1"/>
-        <w:pageBreakBefore/>
-        <w:pBdr>
-          <w:bottom w:val="single" w:sz="4" w:space="0" w:color="E4E4E7"/>
-        </w:pBdr>
-        <w:spacing w:before="80" w:after="200"/>
-        <w:rPr>
-          <w:rFonts w:ascii="Montserrat" w:hAnsi="Montserrat"/>
-          <w:b/>
-          <w:color w:val="1A1A1A"/>
-          <w:sz w:val="34"/>
-        </w:rPr>
-      </w:pPr>
-      <w:bookmarkStart w:id="31" w:name="_Toc236241966"/>
-      <w:r>
-        <w:rPr>
-          <w:rFonts w:ascii="Montserrat" w:hAnsi="Montserrat"/>
-          <w:b/>
-          <w:color w:val="1A1A1A"/>
-          <w:sz w:val="34"/>
-        </w:rPr>
-        <w:lastRenderedPageBreak/>
-        <w:t>6. Administracao do sistema</w:t>
-      </w:r>
-      <w:bookmarkEnd w:id="31"/>
-    </w:p>
-    <w:p>
-      <w:pPr>
-        <w:spacing w:line="280" w:lineRule="auto"/>
-        <w:rPr>
-          <w:rFonts w:ascii="Montserrat" w:hAnsi="Montserrat"/>
-          <w:color w:val="1A1A1A"/>
-          <w:sz w:val="22"/>
-        </w:rPr>
-      </w:pPr>
-      <w:r>
-        <w:rPr>
-          <w:rFonts w:ascii="Montserrat" w:hAnsi="Montserrat"/>
-          <w:color w:val="1A1A1A"/>
-          <w:sz w:val="22"/>
-        </w:rPr>
-        <w:t>Pagina restrita a usuarios com papel Admin (secao 2.3). Reune tres abas: Usuarios, Equipes e Configuracoes.</w:t>
-      </w:r>
-    </w:p>
-    <w:p>
-      <w:pPr>
-        <w:pStyle w:val="Ttulo2"/>
-        <w:spacing w:before="320" w:after="120"/>
-        <w:rPr>
-          <w:rFonts w:ascii="Montserrat" w:hAnsi="Montserrat"/>
-          <w:b/>
-          <w:color w:val="B91D2E"/>
-          <w:sz w:val="27"/>
-        </w:rPr>
-      </w:pPr>
-      <w:bookmarkStart w:id="32" w:name="_Toc236241967"/>
-      <w:r>
-        <w:rPr>
-          <w:rFonts w:ascii="Montserrat" w:hAnsi="Montserrat"/>
-          <w:b/>
-          <w:color w:val="B91D2E"/>
-          <w:sz w:val="27"/>
-        </w:rPr>
-        <w:t>6.1 Usuarios</w:t>
-      </w:r>
-      <w:bookmarkEnd w:id="32"/>
-    </w:p>
-    <w:p>
-      <w:pPr>
-        <w:spacing w:line="280" w:lineRule="auto"/>
-        <w:rPr>
-          <w:rFonts w:ascii="Montserrat" w:hAnsi="Montserrat"/>
-          <w:color w:val="1A1A1A"/>
-          <w:sz w:val="22"/>
-        </w:rPr>
-      </w:pPr>
-      <w:r>
-        <w:rPr>
-          <w:rFonts w:ascii="Montserrat" w:hAnsi="Montserrat"/>
-          <w:color w:val="1A1A1A"/>
-          <w:sz w:val="22"/>
-        </w:rPr>
-        <w:t>Lista todos os usuarios que ja fizeram login pelo menos uma vez, com o papel atual e um seletor para altera-lo.</w:t>
+        <w:t>Primeira pergunta do assistente de decisao.</w:t>
       </w:r>
     </w:p>
     <w:p>
@@ -13185,17 +13115,18 @@
         <w:rPr>
           <w:noProof/>
         </w:rPr>
+        <w:lastRenderedPageBreak/>
         <w:drawing>
-          <wp:inline distT="0" distB="0" distL="0" distR="0" wp14:anchorId="082D8F21" wp14:editId="4105375A">
+          <wp:inline distT="0" distB="0" distL="0" distR="0" wp14:anchorId="435181A5" wp14:editId="5E4C5083">
             <wp:extent cx="5303520" cy="4792851"/>
             <wp:effectExtent l="19050" t="19050" r="11430" b="27305"/>
-            <wp:docPr id="243739472" name="Imagem 41"/>
+            <wp:docPr id="565763755" name="Imagem 41"/>
             <wp:cNvGraphicFramePr/>
             <a:graphic xmlns:a="http://schemas.openxmlformats.org/drawingml/2006/main">
               <a:graphicData uri="http://schemas.openxmlformats.org/drawingml/2006/picture">
                 <pic:pic xmlns:pic="http://schemas.openxmlformats.org/drawingml/2006/picture">
                   <pic:nvPicPr>
-                    <pic:cNvPr id="243739472" name=""/>
+                    <pic:cNvPr id="565763755" name=""/>
                     <pic:cNvPicPr/>
                   </pic:nvPicPr>
                   <pic:blipFill>
@@ -13249,7 +13180,74 @@
           <w:color w:val="6A6A70"/>
           <w:sz w:val="19"/>
         </w:rPr>
-        <w:t>Aba Usuarios: papel atual e seletor de alteracao de papel por usuario.</w:t>
+        <w:t>Veredito final, com o placar de respostas verdes/amarelas/vermelhas.</w:t>
+      </w:r>
+    </w:p>
+    <w:p>
+      <w:pPr>
+        <w:spacing w:before="160" w:after="200"/>
+        <w:ind w:left="283"/>
+        <w:rPr>
+          <w:rFonts w:ascii="Montserrat" w:hAnsi="Montserrat"/>
+          <w:i/>
+          <w:color w:val="6A6A70"/>
+          <w:sz w:val="21"/>
+        </w:rPr>
+      </w:pPr>
+      <w:r>
+        <w:rPr>
+          <w:rFonts w:ascii="Montserrat" w:hAnsi="Montserrat"/>
+          <w:i/>
+          <w:color w:val="6A6A70"/>
+          <w:sz w:val="21"/>
+        </w:rPr>
+        <w:t>Regra aplicada: qualquer resposta vermelha leva a encerrar/repactuar; tres ou mais amarelas levam a replanejar; caso contrario, o veredito e concluir.</w:t>
+      </w:r>
+    </w:p>
+    <w:p>
+      <w:pPr>
+        <w:pStyle w:val="Ttulo1"/>
+        <w:pageBreakBefore/>
+        <w:pBdr>
+          <w:bottom w:val="single" w:sz="4" w:space="0" w:color="E4E4E7"/>
+        </w:pBdr>
+        <w:spacing w:before="80" w:after="200"/>
+        <w:rPr>
+          <w:rFonts w:ascii="Montserrat" w:hAnsi="Montserrat"/>
+          <w:b/>
+          <w:color w:val="1A1A1A"/>
+          <w:sz w:val="34"/>
+        </w:rPr>
+      </w:pPr>
+      <w:bookmarkStart w:id="31" w:name="_Toc236292963"/>
+      <w:r>
+        <w:rPr>
+          <w:rFonts w:ascii="Montserrat" w:hAnsi="Montserrat"/>
+          <w:b/>
+          <w:color w:val="1A1A1A"/>
+          <w:sz w:val="34"/>
+        </w:rPr>
+        <w:lastRenderedPageBreak/>
+        <w:t>6. Administracao do sistema</w:t>
+      </w:r>
+      <w:bookmarkEnd w:id="31"/>
+    </w:p>
+    <w:p>
+      <w:pPr>
+        <w:spacing w:line="280" w:lineRule="auto"/>
+        <w:rPr>
+          <w:rFonts w:ascii="Montserrat" w:hAnsi="Montserrat"/>
+          <w:color w:val="1A1A1A"/>
+          <w:sz w:val="22"/>
+        </w:rPr>
+      </w:pPr>
+      <w:r>
+        <w:rPr>
+          <w:rFonts w:ascii="Montserrat" w:hAnsi="Montserrat"/>
+          <w:color w:val="1A1A1A"/>
+          <w:sz w:val="22"/>
+        </w:rPr>
+        <w:t>Pagina restrita a usuarios com papel Admin (secao 2.3). Reune tres abas: Usuarios, Equipes e Configuracoes.</w:t>
       </w:r>
     </w:p>
     <w:p>
@@ -13263,7 +13261,7 @@
           <w:sz w:val="27"/>
         </w:rPr>
       </w:pPr>
-      <w:bookmarkStart w:id="33" w:name="_Toc236241968"/>
+      <w:bookmarkStart w:id="32" w:name="_Toc236292964"/>
       <w:r>
         <w:rPr>
           <w:rFonts w:ascii="Montserrat" w:hAnsi="Montserrat"/>
@@ -13271,9 +13269,9 @@
           <w:color w:val="B91D2E"/>
           <w:sz w:val="27"/>
         </w:rPr>
-        <w:t>6.2 Equipes</w:t>
-      </w:r>
-      <w:bookmarkEnd w:id="33"/>
+        <w:t>6.1 Usuarios</w:t>
+      </w:r>
+      <w:bookmarkEnd w:id="32"/>
     </w:p>
     <w:p>
       <w:pPr>
@@ -13290,7 +13288,7 @@
           <w:color w:val="1A1A1A"/>
           <w:sz w:val="22"/>
         </w:rPr>
-        <w:t>Define quem faz parte da equipe de cada projeto - a base da restricao por equipe descrita na secao 2.5. Selecione um projeto, escolha um papel e clique em + Adicionar a equipe.</w:t>
+        <w:t>Lista todos os usuarios que ja fizeram login pelo menos uma vez, com o papel atual e um seletor para altera-lo.</w:t>
       </w:r>
     </w:p>
     <w:p>
@@ -13302,18 +13300,17 @@
         <w:rPr>
           <w:noProof/>
         </w:rPr>
-        <w:lastRenderedPageBreak/>
         <w:drawing>
-          <wp:inline distT="0" distB="0" distL="0" distR="0" wp14:anchorId="7B3E5BD0" wp14:editId="1D429431">
+          <wp:inline distT="0" distB="0" distL="0" distR="0" wp14:anchorId="6F92FBE9" wp14:editId="24F66F91">
             <wp:extent cx="5303520" cy="4792851"/>
             <wp:effectExtent l="19050" t="19050" r="11430" b="27305"/>
-            <wp:docPr id="821833289" name="Imagem 42"/>
+            <wp:docPr id="1704647471" name="Imagem 42"/>
             <wp:cNvGraphicFramePr/>
             <a:graphic xmlns:a="http://schemas.openxmlformats.org/drawingml/2006/main">
               <a:graphicData uri="http://schemas.openxmlformats.org/drawingml/2006/picture">
                 <pic:pic xmlns:pic="http://schemas.openxmlformats.org/drawingml/2006/picture">
                   <pic:nvPicPr>
-                    <pic:cNvPr id="821833289" name=""/>
+                    <pic:cNvPr id="1704647471" name=""/>
                     <pic:cNvPicPr/>
                   </pic:nvPicPr>
                   <pic:blipFill>
@@ -13367,7 +13364,7 @@
           <w:color w:val="6A6A70"/>
           <w:sz w:val="19"/>
         </w:rPr>
-        <w:t>Aba Equipes, com um projeto selecionado e um membro ja cadastrado.</w:t>
+        <w:t>Aba Usuarios: papel atual e seletor de alteracao de papel por usuario.</w:t>
       </w:r>
     </w:p>
     <w:p>
@@ -13381,7 +13378,7 @@
           <w:sz w:val="27"/>
         </w:rPr>
       </w:pPr>
-      <w:bookmarkStart w:id="34" w:name="_Toc236241969"/>
+      <w:bookmarkStart w:id="33" w:name="_Toc236292965"/>
       <w:r>
         <w:rPr>
           <w:rFonts w:ascii="Montserrat" w:hAnsi="Montserrat"/>
@@ -13389,9 +13386,9 @@
           <w:color w:val="B91D2E"/>
           <w:sz w:val="27"/>
         </w:rPr>
-        <w:t>6.3 Configuracoes</w:t>
-      </w:r>
-      <w:bookmarkEnd w:id="34"/>
+        <w:t>6.2 Equipes</w:t>
+      </w:r>
+      <w:bookmarkEnd w:id="33"/>
     </w:p>
     <w:p>
       <w:pPr>
@@ -13408,7 +13405,7 @@
           <w:color w:val="1A1A1A"/>
           <w:sz w:val="22"/>
         </w:rPr>
-        <w:t>Controla os dois interruptores de acesso sem login (Solicitacao de Demanda e Ata de Reuniao), descritos na secao 2.6.</w:t>
+        <w:t>Define quem faz parte da equipe de cada projeto - a base da restricao por equipe descrita na secao 2.5. Selecione um projeto, escolha um papel e clique em + Adicionar a equipe.</w:t>
       </w:r>
     </w:p>
     <w:p>
@@ -13422,16 +13419,16 @@
         </w:rPr>
         <w:lastRenderedPageBreak/>
         <w:drawing>
-          <wp:inline distT="0" distB="0" distL="0" distR="0" wp14:anchorId="53A9C517" wp14:editId="7A7C299A">
+          <wp:inline distT="0" distB="0" distL="0" distR="0" wp14:anchorId="0B0CA78F" wp14:editId="6EEACC5B">
             <wp:extent cx="5303520" cy="4792851"/>
             <wp:effectExtent l="19050" t="19050" r="11430" b="27305"/>
-            <wp:docPr id="793675355" name="Imagem 43"/>
+            <wp:docPr id="1324566855" name="Imagem 43"/>
             <wp:cNvGraphicFramePr/>
             <a:graphic xmlns:a="http://schemas.openxmlformats.org/drawingml/2006/main">
               <a:graphicData uri="http://schemas.openxmlformats.org/drawingml/2006/picture">
                 <pic:pic xmlns:pic="http://schemas.openxmlformats.org/drawingml/2006/picture">
                   <pic:nvPicPr>
-                    <pic:cNvPr id="793675355" name=""/>
+                    <pic:cNvPr id="1324566855" name=""/>
                     <pic:cNvPicPr/>
                   </pic:nvPicPr>
                   <pic:blipFill>
@@ -13485,6 +13482,124 @@
           <w:color w:val="6A6A70"/>
           <w:sz w:val="19"/>
         </w:rPr>
+        <w:t>Aba Equipes, com um projeto selecionado e um membro ja cadastrado.</w:t>
+      </w:r>
+    </w:p>
+    <w:p>
+      <w:pPr>
+        <w:pStyle w:val="Ttulo2"/>
+        <w:spacing w:before="320" w:after="120"/>
+        <w:rPr>
+          <w:rFonts w:ascii="Montserrat" w:hAnsi="Montserrat"/>
+          <w:b/>
+          <w:color w:val="B91D2E"/>
+          <w:sz w:val="27"/>
+        </w:rPr>
+      </w:pPr>
+      <w:bookmarkStart w:id="34" w:name="_Toc236292966"/>
+      <w:r>
+        <w:rPr>
+          <w:rFonts w:ascii="Montserrat" w:hAnsi="Montserrat"/>
+          <w:b/>
+          <w:color w:val="B91D2E"/>
+          <w:sz w:val="27"/>
+        </w:rPr>
+        <w:t>6.3 Configuracoes</w:t>
+      </w:r>
+      <w:bookmarkEnd w:id="34"/>
+    </w:p>
+    <w:p>
+      <w:pPr>
+        <w:spacing w:line="280" w:lineRule="auto"/>
+        <w:rPr>
+          <w:rFonts w:ascii="Montserrat" w:hAnsi="Montserrat"/>
+          <w:color w:val="1A1A1A"/>
+          <w:sz w:val="22"/>
+        </w:rPr>
+      </w:pPr>
+      <w:r>
+        <w:rPr>
+          <w:rFonts w:ascii="Montserrat" w:hAnsi="Montserrat"/>
+          <w:color w:val="1A1A1A"/>
+          <w:sz w:val="22"/>
+        </w:rPr>
+        <w:t>Controla os dois interruptores de acesso sem login (Solicitacao de Demanda e Ata de Reuniao), descritos na secao 2.6.</w:t>
+      </w:r>
+    </w:p>
+    <w:p>
+      <w:pPr>
+        <w:spacing w:before="120" w:after="40"/>
+        <w:jc w:val="center"/>
+      </w:pPr>
+      <w:r>
+        <w:rPr>
+          <w:noProof/>
+        </w:rPr>
+        <w:lastRenderedPageBreak/>
+        <w:drawing>
+          <wp:inline distT="0" distB="0" distL="0" distR="0" wp14:anchorId="1086738F" wp14:editId="3C6077B5">
+            <wp:extent cx="5303520" cy="4792851"/>
+            <wp:effectExtent l="19050" t="19050" r="11430" b="27305"/>
+            <wp:docPr id="2083797839" name="Imagem 44"/>
+            <wp:cNvGraphicFramePr/>
+            <a:graphic xmlns:a="http://schemas.openxmlformats.org/drawingml/2006/main">
+              <a:graphicData uri="http://schemas.openxmlformats.org/drawingml/2006/picture">
+                <pic:pic xmlns:pic="http://schemas.openxmlformats.org/drawingml/2006/picture">
+                  <pic:nvPicPr>
+                    <pic:cNvPr id="2083797839" name=""/>
+                    <pic:cNvPicPr/>
+                  </pic:nvPicPr>
+                  <pic:blipFill>
+                    <a:blip r:embed="rId50">
+                      <a:extLst>
+                        <a:ext uri="{28A0092B-C50C-407E-A947-70E740481C1C}">
+                          <a14:useLocalDpi xmlns:a14="http://schemas.microsoft.com/office/drawing/2010/main" val="0"/>
+                        </a:ext>
+                      </a:extLst>
+                    </a:blip>
+                    <a:stretch>
+                      <a:fillRect/>
+                    </a:stretch>
+                  </pic:blipFill>
+                  <pic:spPr>
+                    <a:xfrm>
+                      <a:off x="0" y="0"/>
+                      <a:ext cx="5303520" cy="4792851"/>
+                    </a:xfrm>
+                    <a:prstGeom prst="rect">
+                      <a:avLst/>
+                    </a:prstGeom>
+                    <a:ln w="9525">
+                      <a:solidFill>
+                        <a:srgbClr val="D1D5DB"/>
+                      </a:solidFill>
+                    </a:ln>
+                  </pic:spPr>
+                </pic:pic>
+              </a:graphicData>
+            </a:graphic>
+          </wp:inline>
+        </w:drawing>
+      </w:r>
+    </w:p>
+    <w:p>
+      <w:pPr>
+        <w:spacing w:before="120" w:after="280"/>
+        <w:jc w:val="center"/>
+        <w:rPr>
+          <w:rFonts w:ascii="Montserrat" w:hAnsi="Montserrat"/>
+          <w:i/>
+          <w:color w:val="6A6A70"/>
+          <w:sz w:val="19"/>
+        </w:rPr>
+      </w:pPr>
+      <w:r>
+        <w:rPr>
+          <w:rFonts w:ascii="Montserrat" w:hAnsi="Montserrat"/>
+          <w:i/>
+          <w:color w:val="6A6A70"/>
+          <w:sz w:val="19"/>
+        </w:rPr>
         <w:t>Aba Configuracoes: os dois interruptores de acesso sem login, hoje desativados.</w:t>
       </w:r>
     </w:p>
@@ -13503,7 +13618,7 @@
           <w:sz w:val="34"/>
         </w:rPr>
       </w:pPr>
-      <w:bookmarkStart w:id="35" w:name="_Toc236241970"/>
+      <w:bookmarkStart w:id="35" w:name="_Toc236292967"/>
       <w:r>
         <w:rPr>
           <w:rFonts w:ascii="Montserrat" w:hAnsi="Montserrat"/>
@@ -13747,7 +13862,7 @@
           <w:sz w:val="34"/>
         </w:rPr>
       </w:pPr>
-      <w:bookmarkStart w:id="36" w:name="_Toc236241971"/>
+      <w:bookmarkStart w:id="36" w:name="_Toc236292968"/>
       <w:r>
         <w:rPr>
           <w:rFonts w:ascii="Montserrat" w:hAnsi="Montserrat"/>
@@ -15405,12 +15520,12 @@
       </w:pPr>
     </w:p>
     <w:sectPr>
-      <w:headerReference w:type="even" r:id="rId50"/>
-      <w:headerReference w:type="default" r:id="rId51"/>
-      <w:footerReference w:type="even" r:id="rId52"/>
-      <w:footerReference w:type="default" r:id="rId53"/>
-      <w:headerReference w:type="first" r:id="rId54"/>
-      <w:footerReference w:type="first" r:id="rId55"/>
+      <w:headerReference w:type="even" r:id="rId51"/>
+      <w:headerReference w:type="default" r:id="rId52"/>
+      <w:footerReference w:type="even" r:id="rId53"/>
+      <w:footerReference w:type="default" r:id="rId54"/>
+      <w:headerReference w:type="first" r:id="rId55"/>
+      <w:footerReference w:type="first" r:id="rId56"/>
       <w:pgSz w:w="12240" w:h="15840"/>
       <w:pgMar w:top="1417" w:right="1701" w:bottom="1417" w:left="1701" w:header="708" w:footer="708" w:gutter="0"/>
       <w:cols w:space="708"/>
@@ -15569,7 +15684,7 @@
 <file path=word/numbering.xml><?xml version="1.0" encoding="utf-8"?>
 <w:numbering xmlns:wpc="http://schemas.microsoft.com/office/word/2010/wordprocessingCanvas" xmlns:cx="http://schemas.microsoft.com/office/drawing/2014/chartex" xmlns:cx1="http://schemas.microsoft.com/office/drawing/2015/9/8/chartex" xmlns:cx2="http://schemas.microsoft.com/office/drawing/2015/10/21/chartex" xmlns:cx3="http://schemas.microsoft.com/office/drawing/2016/5/9/chartex" xmlns:cx4="http://schemas.microsoft.com/office/drawing/2016/5/10/chartex" xmlns:cx5="http://schemas.microsoft.com/office/drawing/2016/5/11/chartex" xmlns:cx6="http://schemas.microsoft.com/office/drawing/2016/5/12/chartex" xmlns:cx7="http://schemas.microsoft.com/office/drawing/2016/5/13/chartex" xmlns:cx8="http://schemas.microsoft.com/office/drawing/2016/5/14/chartex" xmlns:mc="http://schemas.openxmlformats.org/markup-compatibility/2006" xmlns:aink="http://schemas.microsoft.com/office/drawing/2016/ink" xmlns:am3d="http://schemas.microsoft.com/office/drawing/2017/model3d" xmlns:o="urn:schemas-microsoft-com:office:office" xmlns:oel="http://schemas.microsoft.com/office/2019/extlst" xmlns:r="http://schemas.openxmlformats.org/officeDocument/2006/relationships" xmlns:m="http://schemas.openxmlformats.org/officeDocument/2006/math" xmlns:v="urn:schemas-microsoft-com:vml" xmlns:wp14="http://schemas.microsoft.com/office/word/2010/wordprocessingDrawing" xmlns:wp="http://schemas.openxmlformats.org/drawingml/2006/wordprocessingDrawing" xmlns:w10="urn:schemas-microsoft-com:office:word" xmlns:w="http://schemas.openxmlformats.org/wordprocessingml/2006/main" xmlns:w14="http://schemas.microsoft.com/office/word/2010/wordml" xmlns:w15="http://schemas.microsoft.com/office/word/2012/wordml" xmlns:w16cei="http://schemas.microsoft.com/office/word/2026/wordml/cei" xmlns:w16cex="http://schemas.microsoft.com/office/word/2018/wordml/cex" xmlns:w16cid="http://schemas.microsoft.com/office/word/2016/wordml/cid" xmlns:w16="http://schemas.microsoft.com/office/word/2018/wordml" xmlns:w16du="http://schemas.microsoft.com/office/word/2023/wordml/word16du" xmlns:w16sdtdh="http://schemas.microsoft.com/office/word/2020/wordml/sdtdatahash" xmlns:w16sdtfl="http://schemas.microsoft.com/office/word/2024/wordml/sdtformatlock" xmlns:w16se="http://schemas.microsoft.com/office/word/2015/wordml/symex" xmlns:wpg="http://schemas.microsoft.com/office/word/2010/wordprocessingGroup" xmlns:wpi="http://schemas.microsoft.com/office/word/2010/wordprocessingInk" xmlns:wne="http://schemas.microsoft.com/office/word/2006/wordml" xmlns:wps="http://schemas.microsoft.com/office/word/2010/wordprocessingShape" mc:Ignorable="w14 w15 w16se w16cid w16 w16cex w16sdtdh w16sdtfl w16du wp14">
   <w:abstractNum w:abstractNumId="0" w15:restartNumberingAfterBreak="0">
-    <w:nsid w:val="0A312ED9"/>
+    <w:nsid w:val="0F3641D7"/>
     <w:multiLevelType w:val="singleLevel"/>
     <w:tmpl w:val="04160001"/>
     <w:lvl w:ilvl="0">
@@ -15586,7 +15701,7 @@
     </w:lvl>
   </w:abstractNum>
   <w:abstractNum w:abstractNumId="1" w15:restartNumberingAfterBreak="0">
-    <w:nsid w:val="1BEB3757"/>
+    <w:nsid w:val="0FAA2424"/>
     <w:multiLevelType w:val="singleLevel"/>
     <w:tmpl w:val="04160001"/>
     <w:lvl w:ilvl="0">
@@ -15603,7 +15718,7 @@
     </w:lvl>
   </w:abstractNum>
   <w:abstractNum w:abstractNumId="2" w15:restartNumberingAfterBreak="0">
-    <w:nsid w:val="23C44920"/>
+    <w:nsid w:val="2142118E"/>
     <w:multiLevelType w:val="singleLevel"/>
     <w:tmpl w:val="04160001"/>
     <w:lvl w:ilvl="0">
@@ -15620,7 +15735,7 @@
     </w:lvl>
   </w:abstractNum>
   <w:abstractNum w:abstractNumId="3" w15:restartNumberingAfterBreak="0">
-    <w:nsid w:val="28034424"/>
+    <w:nsid w:val="271516BC"/>
     <w:multiLevelType w:val="singleLevel"/>
     <w:tmpl w:val="04160001"/>
     <w:lvl w:ilvl="0">
@@ -15637,7 +15752,7 @@
     </w:lvl>
   </w:abstractNum>
   <w:abstractNum w:abstractNumId="4" w15:restartNumberingAfterBreak="0">
-    <w:nsid w:val="284C2D3F"/>
+    <w:nsid w:val="31321684"/>
     <w:multiLevelType w:val="singleLevel"/>
     <w:tmpl w:val="04160001"/>
     <w:lvl w:ilvl="0">
@@ -15654,7 +15769,7 @@
     </w:lvl>
   </w:abstractNum>
   <w:abstractNum w:abstractNumId="5" w15:restartNumberingAfterBreak="0">
-    <w:nsid w:val="311B1FA9"/>
+    <w:nsid w:val="381123D2"/>
     <w:multiLevelType w:val="singleLevel"/>
     <w:tmpl w:val="04160001"/>
     <w:lvl w:ilvl="0">
@@ -15671,7 +15786,7 @@
     </w:lvl>
   </w:abstractNum>
   <w:abstractNum w:abstractNumId="6" w15:restartNumberingAfterBreak="0">
-    <w:nsid w:val="34206EF4"/>
+    <w:nsid w:val="3E492597"/>
     <w:multiLevelType w:val="singleLevel"/>
     <w:tmpl w:val="04160001"/>
     <w:lvl w:ilvl="0">
@@ -15688,7 +15803,7 @@
     </w:lvl>
   </w:abstractNum>
   <w:abstractNum w:abstractNumId="7" w15:restartNumberingAfterBreak="0">
-    <w:nsid w:val="481D3E97"/>
+    <w:nsid w:val="3F543D9D"/>
     <w:multiLevelType w:val="singleLevel"/>
     <w:tmpl w:val="04160001"/>
     <w:lvl w:ilvl="0">
@@ -15705,7 +15820,7 @@
     </w:lvl>
   </w:abstractNum>
   <w:abstractNum w:abstractNumId="8" w15:restartNumberingAfterBreak="0">
-    <w:nsid w:val="4FB81847"/>
+    <w:nsid w:val="57174DC4"/>
     <w:multiLevelType w:val="singleLevel"/>
     <w:tmpl w:val="04160001"/>
     <w:lvl w:ilvl="0">
@@ -15722,7 +15837,7 @@
     </w:lvl>
   </w:abstractNum>
   <w:abstractNum w:abstractNumId="9" w15:restartNumberingAfterBreak="0">
-    <w:nsid w:val="5BDD736C"/>
+    <w:nsid w:val="57C30ED1"/>
     <w:multiLevelType w:val="singleLevel"/>
     <w:tmpl w:val="04160001"/>
     <w:lvl w:ilvl="0">
@@ -15739,7 +15854,7 @@
     </w:lvl>
   </w:abstractNum>
   <w:abstractNum w:abstractNumId="10" w15:restartNumberingAfterBreak="0">
-    <w:nsid w:val="609F70EB"/>
+    <w:nsid w:val="5C085B11"/>
     <w:multiLevelType w:val="singleLevel"/>
     <w:tmpl w:val="04160001"/>
     <w:lvl w:ilvl="0">
@@ -15756,7 +15871,7 @@
     </w:lvl>
   </w:abstractNum>
   <w:abstractNum w:abstractNumId="11" w15:restartNumberingAfterBreak="0">
-    <w:nsid w:val="65B22295"/>
+    <w:nsid w:val="5FC319C2"/>
     <w:multiLevelType w:val="singleLevel"/>
     <w:tmpl w:val="04160001"/>
     <w:lvl w:ilvl="0">
@@ -15773,7 +15888,7 @@
     </w:lvl>
   </w:abstractNum>
   <w:abstractNum w:abstractNumId="12" w15:restartNumberingAfterBreak="0">
-    <w:nsid w:val="75737FB7"/>
+    <w:nsid w:val="7759707F"/>
     <w:multiLevelType w:val="singleLevel"/>
     <w:tmpl w:val="04160001"/>
     <w:lvl w:ilvl="0">
@@ -15790,7 +15905,7 @@
     </w:lvl>
   </w:abstractNum>
   <w:abstractNum w:abstractNumId="13" w15:restartNumberingAfterBreak="0">
-    <w:nsid w:val="76264F04"/>
+    <w:nsid w:val="79C01490"/>
     <w:multiLevelType w:val="singleLevel"/>
     <w:tmpl w:val="04160001"/>
     <w:lvl w:ilvl="0">
@@ -15807,7 +15922,7 @@
     </w:lvl>
   </w:abstractNum>
   <w:abstractNum w:abstractNumId="14" w15:restartNumberingAfterBreak="0">
-    <w:nsid w:val="7673776C"/>
+    <w:nsid w:val="7BA777B8"/>
     <w:multiLevelType w:val="singleLevel"/>
     <w:tmpl w:val="04160001"/>
     <w:lvl w:ilvl="0">
@@ -15824,7 +15939,7 @@
     </w:lvl>
   </w:abstractNum>
   <w:abstractNum w:abstractNumId="15" w15:restartNumberingAfterBreak="0">
-    <w:nsid w:val="76A86CCD"/>
+    <w:nsid w:val="7F5E06D5"/>
     <w:multiLevelType w:val="singleLevel"/>
     <w:tmpl w:val="04160001"/>
     <w:lvl w:ilvl="0">
@@ -15840,53 +15955,53 @@
       </w:rPr>
     </w:lvl>
   </w:abstractNum>
-  <w:num w:numId="1" w16cid:durableId="1021324848">
+  <w:num w:numId="1" w16cid:durableId="2017683231">
+    <w:abstractNumId w:val="10"/>
+  </w:num>
+  <w:num w:numId="2" w16cid:durableId="1322655171">
+    <w:abstractNumId w:val="12"/>
+  </w:num>
+  <w:num w:numId="3" w16cid:durableId="1283733731">
+    <w:abstractNumId w:val="2"/>
+  </w:num>
+  <w:num w:numId="4" w16cid:durableId="524826213">
+    <w:abstractNumId w:val="15"/>
+  </w:num>
+  <w:num w:numId="5" w16cid:durableId="147744239">
+    <w:abstractNumId w:val="9"/>
+  </w:num>
+  <w:num w:numId="6" w16cid:durableId="739519196">
+    <w:abstractNumId w:val="13"/>
+  </w:num>
+  <w:num w:numId="7" w16cid:durableId="191455541">
+    <w:abstractNumId w:val="14"/>
+  </w:num>
+  <w:num w:numId="8" w16cid:durableId="964579757">
+    <w:abstractNumId w:val="4"/>
+  </w:num>
+  <w:num w:numId="9" w16cid:durableId="531454342">
+    <w:abstractNumId w:val="6"/>
+  </w:num>
+  <w:num w:numId="10" w16cid:durableId="1673145950">
+    <w:abstractNumId w:val="0"/>
+  </w:num>
+  <w:num w:numId="11" w16cid:durableId="1238710536">
     <w:abstractNumId w:val="5"/>
   </w:num>
-  <w:num w:numId="2" w16cid:durableId="64184217">
-    <w:abstractNumId w:val="6"/>
+  <w:num w:numId="12" w16cid:durableId="1937707524">
+    <w:abstractNumId w:val="11"/>
   </w:num>
-  <w:num w:numId="3" w16cid:durableId="907376477">
-    <w:abstractNumId w:val="14"/>
-  </w:num>
-  <w:num w:numId="4" w16cid:durableId="5405484">
+  <w:num w:numId="13" w16cid:durableId="1261134932">
     <w:abstractNumId w:val="3"/>
   </w:num>
-  <w:num w:numId="5" w16cid:durableId="1987196864">
-    <w:abstractNumId w:val="12"/>
-  </w:num>
-  <w:num w:numId="6" w16cid:durableId="1535846418">
-    <w:abstractNumId w:val="13"/>
-  </w:num>
-  <w:num w:numId="7" w16cid:durableId="845679449">
-    <w:abstractNumId w:val="15"/>
-  </w:num>
-  <w:num w:numId="8" w16cid:durableId="503935204">
-    <w:abstractNumId w:val="2"/>
-  </w:num>
-  <w:num w:numId="9" w16cid:durableId="735395403">
-    <w:abstractNumId w:val="0"/>
-  </w:num>
-  <w:num w:numId="10" w16cid:durableId="460148075">
+  <w:num w:numId="14" w16cid:durableId="1108155992">
     <w:abstractNumId w:val="8"/>
   </w:num>
-  <w:num w:numId="11" w16cid:durableId="1878465960">
-    <w:abstractNumId w:val="9"/>
+  <w:num w:numId="15" w16cid:durableId="1927184043">
+    <w:abstractNumId w:val="7"/>
   </w:num>
-  <w:num w:numId="12" w16cid:durableId="822038644">
-    <w:abstractNumId w:val="4"/>
-  </w:num>
-  <w:num w:numId="13" w16cid:durableId="1058361314">
-    <w:abstractNumId w:val="10"/>
-  </w:num>
-  <w:num w:numId="14" w16cid:durableId="1792747392">
+  <w:num w:numId="16" w16cid:durableId="1688098948">
     <w:abstractNumId w:val="1"/>
-  </w:num>
-  <w:num w:numId="15" w16cid:durableId="390352036">
-    <w:abstractNumId w:val="11"/>
-  </w:num>
-  <w:num w:numId="16" w16cid:durableId="1811290985">
-    <w:abstractNumId w:val="7"/>
   </w:num>
 </w:numbering>
 </file>
@@ -16299,7 +16414,7 @@
     <w:link w:val="Ttulo1Char"/>
     <w:uiPriority w:val="9"/>
     <w:qFormat/>
-    <w:rsid w:val="00DD0CCC"/>
+    <w:rsid w:val="00CA3AFE"/>
     <w:pPr>
       <w:keepNext/>
       <w:keepLines/>
@@ -16321,7 +16436,7 @@
     <w:uiPriority w:val="9"/>
     <w:unhideWhenUsed/>
     <w:qFormat/>
-    <w:rsid w:val="00DD0CCC"/>
+    <w:rsid w:val="00CA3AFE"/>
     <w:pPr>
       <w:keepNext/>
       <w:keepLines/>
@@ -16344,7 +16459,7 @@
     <w:semiHidden/>
     <w:unhideWhenUsed/>
     <w:qFormat/>
-    <w:rsid w:val="00DD0CCC"/>
+    <w:rsid w:val="00CA3AFE"/>
     <w:pPr>
       <w:keepNext/>
       <w:keepLines/>
@@ -16367,7 +16482,7 @@
     <w:semiHidden/>
     <w:unhideWhenUsed/>
     <w:qFormat/>
-    <w:rsid w:val="00DD0CCC"/>
+    <w:rsid w:val="00CA3AFE"/>
     <w:pPr>
       <w:keepNext/>
       <w:keepLines/>
@@ -16390,7 +16505,7 @@
     <w:semiHidden/>
     <w:unhideWhenUsed/>
     <w:qFormat/>
-    <w:rsid w:val="00DD0CCC"/>
+    <w:rsid w:val="00CA3AFE"/>
     <w:pPr>
       <w:keepNext/>
       <w:keepLines/>
@@ -16411,7 +16526,7 @@
     <w:semiHidden/>
     <w:unhideWhenUsed/>
     <w:qFormat/>
-    <w:rsid w:val="00DD0CCC"/>
+    <w:rsid w:val="00CA3AFE"/>
     <w:pPr>
       <w:keepNext/>
       <w:keepLines/>
@@ -16434,7 +16549,7 @@
     <w:semiHidden/>
     <w:unhideWhenUsed/>
     <w:qFormat/>
-    <w:rsid w:val="00DD0CCC"/>
+    <w:rsid w:val="00CA3AFE"/>
     <w:pPr>
       <w:keepNext/>
       <w:keepLines/>
@@ -16455,7 +16570,7 @@
     <w:semiHidden/>
     <w:unhideWhenUsed/>
     <w:qFormat/>
-    <w:rsid w:val="00DD0CCC"/>
+    <w:rsid w:val="00CA3AFE"/>
     <w:pPr>
       <w:keepNext/>
       <w:keepLines/>
@@ -16478,7 +16593,7 @@
     <w:semiHidden/>
     <w:unhideWhenUsed/>
     <w:qFormat/>
-    <w:rsid w:val="00DD0CCC"/>
+    <w:rsid w:val="00CA3AFE"/>
     <w:pPr>
       <w:keepNext/>
       <w:keepLines/>
@@ -16522,7 +16637,7 @@
     <w:basedOn w:val="Fontepargpadro"/>
     <w:link w:val="Ttulo1"/>
     <w:uiPriority w:val="9"/>
-    <w:rsid w:val="00DD0CCC"/>
+    <w:rsid w:val="00CA3AFE"/>
     <w:rPr>
       <w:rFonts w:asciiTheme="majorHAnsi" w:eastAsiaTheme="majorEastAsia" w:hAnsiTheme="majorHAnsi" w:cstheme="majorBidi"/>
       <w:color w:val="0F4761" w:themeColor="accent1" w:themeShade="BF"/>
@@ -16535,7 +16650,7 @@
     <w:basedOn w:val="Fontepargpadro"/>
     <w:link w:val="Ttulo2"/>
     <w:uiPriority w:val="9"/>
-    <w:rsid w:val="00DD0CCC"/>
+    <w:rsid w:val="00CA3AFE"/>
     <w:rPr>
       <w:rFonts w:asciiTheme="majorHAnsi" w:eastAsiaTheme="majorEastAsia" w:hAnsiTheme="majorHAnsi" w:cstheme="majorBidi"/>
       <w:color w:val="0F4761" w:themeColor="accent1" w:themeShade="BF"/>
@@ -16549,7 +16664,7 @@
     <w:link w:val="Ttulo3"/>
     <w:uiPriority w:val="9"/>
     <w:semiHidden/>
-    <w:rsid w:val="00DD0CCC"/>
+    <w:rsid w:val="00CA3AFE"/>
     <w:rPr>
       <w:rFonts w:eastAsiaTheme="majorEastAsia" w:cstheme="majorBidi"/>
       <w:color w:val="0F4761" w:themeColor="accent1" w:themeShade="BF"/>
@@ -16563,7 +16678,7 @@
     <w:link w:val="Ttulo4"/>
     <w:uiPriority w:val="9"/>
     <w:semiHidden/>
-    <w:rsid w:val="00DD0CCC"/>
+    <w:rsid w:val="00CA3AFE"/>
     <w:rPr>
       <w:rFonts w:eastAsiaTheme="majorEastAsia" w:cstheme="majorBidi"/>
       <w:i/>
@@ -16577,7 +16692,7 @@
     <w:link w:val="Ttulo5"/>
     <w:uiPriority w:val="9"/>
     <w:semiHidden/>
-    <w:rsid w:val="00DD0CCC"/>
+    <w:rsid w:val="00CA3AFE"/>
     <w:rPr>
       <w:rFonts w:eastAsiaTheme="majorEastAsia" w:cstheme="majorBidi"/>
       <w:color w:val="0F4761" w:themeColor="accent1" w:themeShade="BF"/>
@@ -16589,7 +16704,7 @@
     <w:link w:val="Ttulo6"/>
     <w:uiPriority w:val="9"/>
     <w:semiHidden/>
-    <w:rsid w:val="00DD0CCC"/>
+    <w:rsid w:val="00CA3AFE"/>
     <w:rPr>
       <w:rFonts w:eastAsiaTheme="majorEastAsia" w:cstheme="majorBidi"/>
       <w:i/>
@@ -16603,7 +16718,7 @@
     <w:link w:val="Ttulo7"/>
     <w:uiPriority w:val="9"/>
     <w:semiHidden/>
-    <w:rsid w:val="00DD0CCC"/>
+    <w:rsid w:val="00CA3AFE"/>
     <w:rPr>
       <w:rFonts w:eastAsiaTheme="majorEastAsia" w:cstheme="majorBidi"/>
       <w:color w:val="595959" w:themeColor="text1" w:themeTint="A6"/>
@@ -16615,7 +16730,7 @@
     <w:link w:val="Ttulo8"/>
     <w:uiPriority w:val="9"/>
     <w:semiHidden/>
-    <w:rsid w:val="00DD0CCC"/>
+    <w:rsid w:val="00CA3AFE"/>
     <w:rPr>
       <w:rFonts w:eastAsiaTheme="majorEastAsia" w:cstheme="majorBidi"/>
       <w:i/>
@@ -16629,7 +16744,7 @@
     <w:link w:val="Ttulo9"/>
     <w:uiPriority w:val="9"/>
     <w:semiHidden/>
-    <w:rsid w:val="00DD0CCC"/>
+    <w:rsid w:val="00CA3AFE"/>
     <w:rPr>
       <w:rFonts w:eastAsiaTheme="majorEastAsia" w:cstheme="majorBidi"/>
       <w:color w:val="272727" w:themeColor="text1" w:themeTint="D8"/>
@@ -16642,7 +16757,7 @@
     <w:link w:val="TtuloChar"/>
     <w:uiPriority w:val="10"/>
     <w:qFormat/>
-    <w:rsid w:val="00DD0CCC"/>
+    <w:rsid w:val="00CA3AFE"/>
     <w:pPr>
       <w:spacing w:after="80" w:line="240" w:lineRule="auto"/>
       <w:contextualSpacing/>
@@ -16660,7 +16775,7 @@
     <w:basedOn w:val="Fontepargpadro"/>
     <w:link w:val="Ttulo"/>
     <w:uiPriority w:val="10"/>
-    <w:rsid w:val="00DD0CCC"/>
+    <w:rsid w:val="00CA3AFE"/>
     <w:rPr>
       <w:rFonts w:asciiTheme="majorHAnsi" w:eastAsiaTheme="majorEastAsia" w:hAnsiTheme="majorHAnsi" w:cstheme="majorBidi"/>
       <w:spacing w:val="-10"/>
@@ -16676,7 +16791,7 @@
     <w:link w:val="SubttuloChar"/>
     <w:uiPriority w:val="11"/>
     <w:qFormat/>
-    <w:rsid w:val="00DD0CCC"/>
+    <w:rsid w:val="00CA3AFE"/>
     <w:pPr>
       <w:numPr>
         <w:ilvl w:val="1"/>
@@ -16695,7 +16810,7 @@
     <w:basedOn w:val="Fontepargpadro"/>
     <w:link w:val="Subttulo"/>
     <w:uiPriority w:val="11"/>
-    <w:rsid w:val="00DD0CCC"/>
+    <w:rsid w:val="00CA3AFE"/>
     <w:rPr>
       <w:rFonts w:eastAsiaTheme="majorEastAsia" w:cstheme="majorBidi"/>
       <w:color w:val="595959" w:themeColor="text1" w:themeTint="A6"/>
@@ -16711,7 +16826,7 @@
     <w:link w:val="CitaoChar"/>
     <w:uiPriority w:val="29"/>
     <w:qFormat/>
-    <w:rsid w:val="00DD0CCC"/>
+    <w:rsid w:val="00CA3AFE"/>
     <w:pPr>
       <w:spacing w:before="160"/>
       <w:jc w:val="center"/>
@@ -16727,7 +16842,7 @@
     <w:basedOn w:val="Fontepargpadro"/>
     <w:link w:val="Citao"/>
     <w:uiPriority w:val="29"/>
-    <w:rsid w:val="00DD0CCC"/>
+    <w:rsid w:val="00CA3AFE"/>
     <w:rPr>
       <w:i/>
       <w:iCs/>
@@ -16739,7 +16854,7 @@
     <w:basedOn w:val="Normal"/>
     <w:uiPriority w:val="34"/>
     <w:qFormat/>
-    <w:rsid w:val="00DD0CCC"/>
+    <w:rsid w:val="00CA3AFE"/>
     <w:pPr>
       <w:ind w:left="720"/>
       <w:contextualSpacing/>
@@ -16750,7 +16865,7 @@
     <w:basedOn w:val="Fontepargpadro"/>
     <w:uiPriority w:val="21"/>
     <w:qFormat/>
-    <w:rsid w:val="00DD0CCC"/>
+    <w:rsid w:val="00CA3AFE"/>
     <w:rPr>
       <w:i/>
       <w:iCs/>
@@ -16764,7 +16879,7 @@
     <w:link w:val="CitaoIntensaChar"/>
     <w:uiPriority w:val="30"/>
     <w:qFormat/>
-    <w:rsid w:val="00DD0CCC"/>
+    <w:rsid w:val="00CA3AFE"/>
     <w:pPr>
       <w:pBdr>
         <w:top w:val="single" w:sz="4" w:space="10" w:color="0F4761" w:themeColor="accent1" w:themeShade="BF"/>
@@ -16785,7 +16900,7 @@
     <w:basedOn w:val="Fontepargpadro"/>
     <w:link w:val="CitaoIntensa"/>
     <w:uiPriority w:val="30"/>
-    <w:rsid w:val="00DD0CCC"/>
+    <w:rsid w:val="00CA3AFE"/>
     <w:rPr>
       <w:i/>
       <w:iCs/>
@@ -16797,7 +16912,7 @@
     <w:basedOn w:val="Fontepargpadro"/>
     <w:uiPriority w:val="32"/>
     <w:qFormat/>
-    <w:rsid w:val="00DD0CCC"/>
+    <w:rsid w:val="00CA3AFE"/>
     <w:rPr>
       <w:b/>
       <w:bCs/>
@@ -16812,7 +16927,7 @@
     <w:link w:val="CabealhoChar"/>
     <w:uiPriority w:val="99"/>
     <w:unhideWhenUsed/>
-    <w:rsid w:val="00DD0CCC"/>
+    <w:rsid w:val="00CA3AFE"/>
     <w:pPr>
       <w:tabs>
         <w:tab w:val="center" w:pos="4252"/>
@@ -16826,7 +16941,7 @@
     <w:basedOn w:val="Fontepargpadro"/>
     <w:link w:val="Cabealho"/>
     <w:uiPriority w:val="99"/>
-    <w:rsid w:val="00DD0CCC"/>
+    <w:rsid w:val="00CA3AFE"/>
   </w:style>
   <w:style w:type="paragraph" w:styleId="Rodap">
     <w:name w:val="footer"/>
@@ -16834,7 +16949,7 @@
     <w:link w:val="RodapChar"/>
     <w:uiPriority w:val="99"/>
     <w:unhideWhenUsed/>
-    <w:rsid w:val="00DD0CCC"/>
+    <w:rsid w:val="00CA3AFE"/>
     <w:pPr>
       <w:tabs>
         <w:tab w:val="center" w:pos="4252"/>
@@ -16848,7 +16963,7 @@
     <w:basedOn w:val="Fontepargpadro"/>
     <w:link w:val="Rodap"/>
     <w:uiPriority w:val="99"/>
-    <w:rsid w:val="00DD0CCC"/>
+    <w:rsid w:val="00CA3AFE"/>
   </w:style>
   <w:style w:type="paragraph" w:styleId="Sumrio1">
     <w:name w:val="toc 1"/>
@@ -16857,7 +16972,7 @@
     <w:autoRedefine/>
     <w:uiPriority w:val="39"/>
     <w:unhideWhenUsed/>
-    <w:rsid w:val="00DD0CCC"/>
+    <w:rsid w:val="00CA3AFE"/>
     <w:pPr>
       <w:spacing w:after="100"/>
     </w:pPr>
@@ -16869,7 +16984,7 @@
     <w:autoRedefine/>
     <w:uiPriority w:val="39"/>
     <w:unhideWhenUsed/>
-    <w:rsid w:val="00DD0CCC"/>
+    <w:rsid w:val="00CA3AFE"/>
     <w:pPr>
       <w:spacing w:after="100"/>
       <w:ind w:left="240"/>

</xml_diff>

<commit_message>
Adiciona versionamento historico aos Relatorios de Situacao e de Entregas
Cada "Salvar e ver painel" agora arquiva uma copia completa dos dados
do formulario, consultavel pelo botao "Historico de versoes" no Painel.
Versoes antigas sao exibidas em modo somente leitura, com aviso e trava
de edicao ate voltar a versao atual.

Atualiza o Manual de Uso para v2.7 com a documentacao da funcionalidade.

Co-Authored-By: Claude Sonnet 5 <noreply@anthropic.com>
</commit_message>
<xml_diff>
--- a/Manual de Uso - Ferramenta de Gestao de Projetos.docx
+++ b/Manual de Uso - Ferramenta de Gestao de Projetos.docx
@@ -129,7 +129,7 @@
           <w:color w:val="6A6A70"/>
           <w:sz w:val="22"/>
         </w:rPr>
-        <w:t>Versao 2.6 - 30 de julho de 2026 (substitui a versao 2.5 de 29/07/2026)</w:t>
+        <w:t>Versao 2.7 - 01 de agosto de 2026 (substitui a versao 2.6 de 30/07/2026)</w:t>
       </w:r>
     </w:p>
     <w:p>
@@ -229,7 +229,7 @@
         <w:rPr>
           <w:noProof/>
         </w:rPr>
-        <w:instrText xml:space="preserve"> PAGEREF _Toc236292932 \h </w:instrText>
+        <w:instrText xml:space="preserve"> PAGEREF _Toc236511097 \h </w:instrText>
       </w:r>
       <w:r>
         <w:rPr>
@@ -290,7 +290,7 @@
         <w:rPr>
           <w:noProof/>
         </w:rPr>
-        <w:instrText xml:space="preserve"> PAGEREF _Toc236292933 \h </w:instrText>
+        <w:instrText xml:space="preserve"> PAGEREF _Toc236511098 \h </w:instrText>
       </w:r>
       <w:r>
         <w:rPr>
@@ -351,7 +351,7 @@
         <w:rPr>
           <w:noProof/>
         </w:rPr>
-        <w:instrText xml:space="preserve"> PAGEREF _Toc236292934 \h </w:instrText>
+        <w:instrText xml:space="preserve"> PAGEREF _Toc236511099 \h </w:instrText>
       </w:r>
       <w:r>
         <w:rPr>
@@ -412,7 +412,7 @@
         <w:rPr>
           <w:noProof/>
         </w:rPr>
-        <w:instrText xml:space="preserve"> PAGEREF _Toc236292935 \h </w:instrText>
+        <w:instrText xml:space="preserve"> PAGEREF _Toc236511100 \h </w:instrText>
       </w:r>
       <w:r>
         <w:rPr>
@@ -473,7 +473,7 @@
         <w:rPr>
           <w:noProof/>
         </w:rPr>
-        <w:instrText xml:space="preserve"> PAGEREF _Toc236292936 \h </w:instrText>
+        <w:instrText xml:space="preserve"> PAGEREF _Toc236511101 \h </w:instrText>
       </w:r>
       <w:r>
         <w:rPr>
@@ -534,7 +534,7 @@
         <w:rPr>
           <w:noProof/>
         </w:rPr>
-        <w:instrText xml:space="preserve"> PAGEREF _Toc236292937 \h </w:instrText>
+        <w:instrText xml:space="preserve"> PAGEREF _Toc236511102 \h </w:instrText>
       </w:r>
       <w:r>
         <w:rPr>
@@ -595,7 +595,7 @@
         <w:rPr>
           <w:noProof/>
         </w:rPr>
-        <w:instrText xml:space="preserve"> PAGEREF _Toc236292938 \h </w:instrText>
+        <w:instrText xml:space="preserve"> PAGEREF _Toc236511103 \h </w:instrText>
       </w:r>
       <w:r>
         <w:rPr>
@@ -656,7 +656,7 @@
         <w:rPr>
           <w:noProof/>
         </w:rPr>
-        <w:instrText xml:space="preserve"> PAGEREF _Toc236292939 \h </w:instrText>
+        <w:instrText xml:space="preserve"> PAGEREF _Toc236511104 \h </w:instrText>
       </w:r>
       <w:r>
         <w:rPr>
@@ -717,7 +717,7 @@
         <w:rPr>
           <w:noProof/>
         </w:rPr>
-        <w:instrText xml:space="preserve"> PAGEREF _Toc236292940 \h </w:instrText>
+        <w:instrText xml:space="preserve"> PAGEREF _Toc236511105 \h </w:instrText>
       </w:r>
       <w:r>
         <w:rPr>
@@ -778,7 +778,7 @@
         <w:rPr>
           <w:noProof/>
         </w:rPr>
-        <w:instrText xml:space="preserve"> PAGEREF _Toc236292941 \h </w:instrText>
+        <w:instrText xml:space="preserve"> PAGEREF _Toc236511106 \h </w:instrText>
       </w:r>
       <w:r>
         <w:rPr>
@@ -839,7 +839,7 @@
         <w:rPr>
           <w:noProof/>
         </w:rPr>
-        <w:instrText xml:space="preserve"> PAGEREF _Toc236292942 \h </w:instrText>
+        <w:instrText xml:space="preserve"> PAGEREF _Toc236511107 \h </w:instrText>
       </w:r>
       <w:r>
         <w:rPr>
@@ -900,7 +900,7 @@
         <w:rPr>
           <w:noProof/>
         </w:rPr>
-        <w:instrText xml:space="preserve"> PAGEREF _Toc236292943 \h </w:instrText>
+        <w:instrText xml:space="preserve"> PAGEREF _Toc236511108 \h </w:instrText>
       </w:r>
       <w:r>
         <w:rPr>
@@ -961,7 +961,7 @@
         <w:rPr>
           <w:noProof/>
         </w:rPr>
-        <w:instrText xml:space="preserve"> PAGEREF _Toc236292944 \h </w:instrText>
+        <w:instrText xml:space="preserve"> PAGEREF _Toc236511109 \h </w:instrText>
       </w:r>
       <w:r>
         <w:rPr>
@@ -1022,7 +1022,7 @@
         <w:rPr>
           <w:noProof/>
         </w:rPr>
-        <w:instrText xml:space="preserve"> PAGEREF _Toc236292945 \h </w:instrText>
+        <w:instrText xml:space="preserve"> PAGEREF _Toc236511110 \h </w:instrText>
       </w:r>
       <w:r>
         <w:rPr>
@@ -1083,7 +1083,7 @@
         <w:rPr>
           <w:noProof/>
         </w:rPr>
-        <w:instrText xml:space="preserve"> PAGEREF _Toc236292946 \h </w:instrText>
+        <w:instrText xml:space="preserve"> PAGEREF _Toc236511111 \h </w:instrText>
       </w:r>
       <w:r>
         <w:rPr>
@@ -1144,7 +1144,7 @@
         <w:rPr>
           <w:noProof/>
         </w:rPr>
-        <w:instrText xml:space="preserve"> PAGEREF _Toc236292947 \h </w:instrText>
+        <w:instrText xml:space="preserve"> PAGEREF _Toc236511112 \h </w:instrText>
       </w:r>
       <w:r>
         <w:rPr>
@@ -1205,7 +1205,7 @@
         <w:rPr>
           <w:noProof/>
         </w:rPr>
-        <w:instrText xml:space="preserve"> PAGEREF _Toc236292948 \h </w:instrText>
+        <w:instrText xml:space="preserve"> PAGEREF _Toc236511113 \h </w:instrText>
       </w:r>
       <w:r>
         <w:rPr>
@@ -1266,7 +1266,7 @@
         <w:rPr>
           <w:noProof/>
         </w:rPr>
-        <w:instrText xml:space="preserve"> PAGEREF _Toc236292949 \h </w:instrText>
+        <w:instrText xml:space="preserve"> PAGEREF _Toc236511114 \h </w:instrText>
       </w:r>
       <w:r>
         <w:rPr>
@@ -1327,7 +1327,7 @@
         <w:rPr>
           <w:noProof/>
         </w:rPr>
-        <w:instrText xml:space="preserve"> PAGEREF _Toc236292950 \h </w:instrText>
+        <w:instrText xml:space="preserve"> PAGEREF _Toc236511115 \h </w:instrText>
       </w:r>
       <w:r>
         <w:rPr>
@@ -1388,7 +1388,7 @@
         <w:rPr>
           <w:noProof/>
         </w:rPr>
-        <w:instrText xml:space="preserve"> PAGEREF _Toc236292951 \h </w:instrText>
+        <w:instrText xml:space="preserve"> PAGEREF _Toc236511116 \h </w:instrText>
       </w:r>
       <w:r>
         <w:rPr>
@@ -1449,7 +1449,7 @@
         <w:rPr>
           <w:noProof/>
         </w:rPr>
-        <w:instrText xml:space="preserve"> PAGEREF _Toc236292952 \h </w:instrText>
+        <w:instrText xml:space="preserve"> PAGEREF _Toc236511117 \h </w:instrText>
       </w:r>
       <w:r>
         <w:rPr>
@@ -1510,7 +1510,7 @@
         <w:rPr>
           <w:noProof/>
         </w:rPr>
-        <w:instrText xml:space="preserve"> PAGEREF _Toc236292953 \h </w:instrText>
+        <w:instrText xml:space="preserve"> PAGEREF _Toc236511118 \h </w:instrText>
       </w:r>
       <w:r>
         <w:rPr>
@@ -1571,7 +1571,7 @@
         <w:rPr>
           <w:noProof/>
         </w:rPr>
-        <w:instrText xml:space="preserve"> PAGEREF _Toc236292954 \h </w:instrText>
+        <w:instrText xml:space="preserve"> PAGEREF _Toc236511119 \h </w:instrText>
       </w:r>
       <w:r>
         <w:rPr>
@@ -1632,7 +1632,7 @@
         <w:rPr>
           <w:noProof/>
         </w:rPr>
-        <w:instrText xml:space="preserve"> PAGEREF _Toc236292955 \h </w:instrText>
+        <w:instrText xml:space="preserve"> PAGEREF _Toc236511120 \h </w:instrText>
       </w:r>
       <w:r>
         <w:rPr>
@@ -1670,10 +1670,7 @@
       </w:pPr>
       <w:r>
         <w:rPr>
-          <w:rFonts w:ascii="Montserrat" w:hAnsi="Montserrat"/>
-          <w:b/>
-          <w:noProof/>
-          <w:color w:val="1A1A1A"/>
+          <w:noProof/>
         </w:rPr>
         <w:t>4. Gerando os relatorios finais</w:t>
       </w:r>
@@ -1693,7 +1690,7 @@
         <w:rPr>
           <w:noProof/>
         </w:rPr>
-        <w:instrText xml:space="preserve"> PAGEREF _Toc236292956 \h </w:instrText>
+        <w:instrText xml:space="preserve"> PAGEREF _Toc236511121 \h </w:instrText>
       </w:r>
       <w:r>
         <w:rPr>
@@ -1754,7 +1751,7 @@
         <w:rPr>
           <w:noProof/>
         </w:rPr>
-        <w:instrText xml:space="preserve"> PAGEREF _Toc236292957 \h </w:instrText>
+        <w:instrText xml:space="preserve"> PAGEREF _Toc236511122 \h </w:instrText>
       </w:r>
       <w:r>
         <w:rPr>
@@ -1816,7 +1813,7 @@
         <w:rPr>
           <w:noProof/>
         </w:rPr>
-        <w:instrText xml:space="preserve"> PAGEREF _Toc236292958 \h </w:instrText>
+        <w:instrText xml:space="preserve"> PAGEREF _Toc236511123 \h </w:instrText>
       </w:r>
       <w:r>
         <w:rPr>
@@ -1877,7 +1874,7 @@
         <w:rPr>
           <w:noProof/>
         </w:rPr>
-        <w:instrText xml:space="preserve"> PAGEREF _Toc236292959 \h </w:instrText>
+        <w:instrText xml:space="preserve"> PAGEREF _Toc236511124 \h </w:instrText>
       </w:r>
       <w:r>
         <w:rPr>
@@ -1894,7 +1891,7 @@
         <w:rPr>
           <w:noProof/>
         </w:rPr>
-        <w:t>48</w:t>
+        <w:t>50</w:t>
       </w:r>
       <w:r>
         <w:rPr>
@@ -1938,7 +1935,7 @@
         <w:rPr>
           <w:noProof/>
         </w:rPr>
-        <w:instrText xml:space="preserve"> PAGEREF _Toc236292960 \h </w:instrText>
+        <w:instrText xml:space="preserve"> PAGEREF _Toc236511125 \h </w:instrText>
       </w:r>
       <w:r>
         <w:rPr>
@@ -1955,7 +1952,7 @@
         <w:rPr>
           <w:noProof/>
         </w:rPr>
-        <w:t>48</w:t>
+        <w:t>50</w:t>
       </w:r>
       <w:r>
         <w:rPr>
@@ -1999,7 +1996,7 @@
         <w:rPr>
           <w:noProof/>
         </w:rPr>
-        <w:instrText xml:space="preserve"> PAGEREF _Toc236292961 \h </w:instrText>
+        <w:instrText xml:space="preserve"> PAGEREF _Toc236511126 \h </w:instrText>
       </w:r>
       <w:r>
         <w:rPr>
@@ -2016,7 +2013,7 @@
         <w:rPr>
           <w:noProof/>
         </w:rPr>
-        <w:t>49</w:t>
+        <w:t>51</w:t>
       </w:r>
       <w:r>
         <w:rPr>
@@ -2060,7 +2057,7 @@
         <w:rPr>
           <w:noProof/>
         </w:rPr>
-        <w:instrText xml:space="preserve"> PAGEREF _Toc236292962 \h </w:instrText>
+        <w:instrText xml:space="preserve"> PAGEREF _Toc236511127 \h </w:instrText>
       </w:r>
       <w:r>
         <w:rPr>
@@ -2077,7 +2074,7 @@
         <w:rPr>
           <w:noProof/>
         </w:rPr>
-        <w:t>49</w:t>
+        <w:t>51</w:t>
       </w:r>
       <w:r>
         <w:rPr>
@@ -2121,7 +2118,7 @@
         <w:rPr>
           <w:noProof/>
         </w:rPr>
-        <w:instrText xml:space="preserve"> PAGEREF _Toc236292963 \h </w:instrText>
+        <w:instrText xml:space="preserve"> PAGEREF _Toc236511128 \h </w:instrText>
       </w:r>
       <w:r>
         <w:rPr>
@@ -2138,7 +2135,7 @@
         <w:rPr>
           <w:noProof/>
         </w:rPr>
-        <w:t>52</w:t>
+        <w:t>54</w:t>
       </w:r>
       <w:r>
         <w:rPr>
@@ -2182,7 +2179,7 @@
         <w:rPr>
           <w:noProof/>
         </w:rPr>
-        <w:instrText xml:space="preserve"> PAGEREF _Toc236292964 \h </w:instrText>
+        <w:instrText xml:space="preserve"> PAGEREF _Toc236511129 \h </w:instrText>
       </w:r>
       <w:r>
         <w:rPr>
@@ -2199,7 +2196,7 @@
         <w:rPr>
           <w:noProof/>
         </w:rPr>
-        <w:t>52</w:t>
+        <w:t>54</w:t>
       </w:r>
       <w:r>
         <w:rPr>
@@ -2243,7 +2240,7 @@
         <w:rPr>
           <w:noProof/>
         </w:rPr>
-        <w:instrText xml:space="preserve"> PAGEREF _Toc236292965 \h </w:instrText>
+        <w:instrText xml:space="preserve"> PAGEREF _Toc236511130 \h </w:instrText>
       </w:r>
       <w:r>
         <w:rPr>
@@ -2260,7 +2257,7 @@
         <w:rPr>
           <w:noProof/>
         </w:rPr>
-        <w:t>52</w:t>
+        <w:t>54</w:t>
       </w:r>
       <w:r>
         <w:rPr>
@@ -2304,7 +2301,7 @@
         <w:rPr>
           <w:noProof/>
         </w:rPr>
-        <w:instrText xml:space="preserve"> PAGEREF _Toc236292966 \h </w:instrText>
+        <w:instrText xml:space="preserve"> PAGEREF _Toc236511131 \h </w:instrText>
       </w:r>
       <w:r>
         <w:rPr>
@@ -2321,7 +2318,7 @@
         <w:rPr>
           <w:noProof/>
         </w:rPr>
-        <w:t>53</w:t>
+        <w:t>55</w:t>
       </w:r>
       <w:r>
         <w:rPr>
@@ -2365,7 +2362,7 @@
         <w:rPr>
           <w:noProof/>
         </w:rPr>
-        <w:instrText xml:space="preserve"> PAGEREF _Toc236292967 \h </w:instrText>
+        <w:instrText xml:space="preserve"> PAGEREF _Toc236511132 \h </w:instrText>
       </w:r>
       <w:r>
         <w:rPr>
@@ -2382,7 +2379,7 @@
         <w:rPr>
           <w:noProof/>
         </w:rPr>
-        <w:t>55</w:t>
+        <w:t>57</w:t>
       </w:r>
       <w:r>
         <w:rPr>
@@ -2426,7 +2423,7 @@
         <w:rPr>
           <w:noProof/>
         </w:rPr>
-        <w:instrText xml:space="preserve"> PAGEREF _Toc236292968 \h </w:instrText>
+        <w:instrText xml:space="preserve"> PAGEREF _Toc236511133 \h </w:instrText>
       </w:r>
       <w:r>
         <w:rPr>
@@ -2443,7 +2440,7 @@
         <w:rPr>
           <w:noProof/>
         </w:rPr>
-        <w:t>56</w:t>
+        <w:t>58</w:t>
       </w:r>
       <w:r>
         <w:rPr>
@@ -2502,7 +2499,7 @@
           <w:sz w:val="34"/>
         </w:rPr>
       </w:pPr>
-      <w:bookmarkStart w:id="0" w:name="_Toc236292932"/>
+      <w:bookmarkStart w:id="0" w:name="_Toc236511097"/>
       <w:r>
         <w:rPr>
           <w:rFonts w:ascii="Montserrat" w:hAnsi="Montserrat"/>
@@ -2526,7 +2523,7 @@
           <w:sz w:val="27"/>
         </w:rPr>
       </w:pPr>
-      <w:bookmarkStart w:id="1" w:name="_Toc236292933"/>
+      <w:bookmarkStart w:id="1" w:name="_Toc236511098"/>
       <w:r>
         <w:rPr>
           <w:rFonts w:ascii="Montserrat" w:hAnsi="Montserrat"/>
@@ -2706,6 +2703,24 @@
           <w:color w:val="1A1A1A"/>
           <w:sz w:val="22"/>
         </w:rPr>
+        <w:t>Esta e a versao 2.7 do manual. Em relacao a versao 2.6 (30/07/2026), foi adicionado o versionamento historico ao Relatorio de Situacao (secao 4.1) e ao Relatorio de Entregas e Beneficios (secao 4.2): cada Salvar e ver painel arquiva uma copia completa dos dados, consultavel pelo botao Historico de versoes no rodape do Painel, com visualizacao somente leitura de versoes antigas e trava de edicao ate voltar a versao atual.</w:t>
+      </w:r>
+    </w:p>
+    <w:p>
+      <w:pPr>
+        <w:spacing w:line="280" w:lineRule="auto"/>
+        <w:rPr>
+          <w:rFonts w:ascii="Montserrat" w:hAnsi="Montserrat"/>
+          <w:color w:val="1A1A1A"/>
+          <w:sz w:val="22"/>
+        </w:rPr>
+      </w:pPr>
+      <w:r>
+        <w:rPr>
+          <w:rFonts w:ascii="Montserrat" w:hAnsi="Montserrat"/>
+          <w:color w:val="1A1A1A"/>
+          <w:sz w:val="22"/>
+        </w:rPr>
         <w:t>O manual nao substitui as Diretrizes para a Gestao de Projetos da UNIALFA (documento institucional que define o framework D01 a D07) nem o documento Regras de Acesso e Permissoes (que detalha cada regra de controle de acesso); ele e o guia operacional de como usar cada ferramenta na pratica.</w:t>
       </w:r>
     </w:p>
@@ -2720,7 +2735,7 @@
           <w:sz w:val="27"/>
         </w:rPr>
       </w:pPr>
-      <w:bookmarkStart w:id="2" w:name="_Toc236292934"/>
+      <w:bookmarkStart w:id="2" w:name="_Toc236511099"/>
       <w:r>
         <w:rPr>
           <w:rFonts w:ascii="Montserrat" w:hAnsi="Montserrat"/>
@@ -2869,16 +2884,16 @@
         </w:rPr>
         <w:lastRenderedPageBreak/>
         <w:drawing>
-          <wp:inline distT="0" distB="0" distL="0" distR="0" wp14:anchorId="544B3962" wp14:editId="0A46D0F9">
+          <wp:inline distT="0" distB="0" distL="0" distR="0" wp14:anchorId="70D6D41B" wp14:editId="6A117A6D">
             <wp:extent cx="5303520" cy="4792851"/>
             <wp:effectExtent l="19050" t="19050" r="11430" b="27305"/>
-            <wp:docPr id="1525126925" name="Imagem 1"/>
+            <wp:docPr id="2099678175" name="Imagem 1"/>
             <wp:cNvGraphicFramePr/>
             <a:graphic xmlns:a="http://schemas.openxmlformats.org/drawingml/2006/main">
               <a:graphicData uri="http://schemas.openxmlformats.org/drawingml/2006/picture">
                 <pic:pic xmlns:pic="http://schemas.openxmlformats.org/drawingml/2006/picture">
                   <pic:nvPicPr>
-                    <pic:cNvPr id="1525126925" name=""/>
+                    <pic:cNvPr id="2099678175" name=""/>
                     <pic:cNvPicPr/>
                   </pic:nvPicPr>
                   <pic:blipFill>
@@ -2946,7 +2961,7 @@
           <w:sz w:val="27"/>
         </w:rPr>
       </w:pPr>
-      <w:bookmarkStart w:id="3" w:name="_Toc236292935"/>
+      <w:bookmarkStart w:id="3" w:name="_Toc236511100"/>
       <w:r>
         <w:rPr>
           <w:rFonts w:ascii="Montserrat" w:hAnsi="Montserrat"/>
@@ -2987,16 +3002,16 @@
         </w:rPr>
         <w:lastRenderedPageBreak/>
         <w:drawing>
-          <wp:inline distT="0" distB="0" distL="0" distR="0" wp14:anchorId="6E1DE3ED" wp14:editId="55AD611B">
+          <wp:inline distT="0" distB="0" distL="0" distR="0" wp14:anchorId="67923563" wp14:editId="38562B6C">
             <wp:extent cx="4206240" cy="3801227"/>
             <wp:effectExtent l="19050" t="19050" r="22860" b="27940"/>
-            <wp:docPr id="1859615183" name="Imagem 2"/>
+            <wp:docPr id="1511548509" name="Imagem 2"/>
             <wp:cNvGraphicFramePr/>
             <a:graphic xmlns:a="http://schemas.openxmlformats.org/drawingml/2006/main">
               <a:graphicData uri="http://schemas.openxmlformats.org/drawingml/2006/picture">
                 <pic:pic xmlns:pic="http://schemas.openxmlformats.org/drawingml/2006/picture">
                   <pic:nvPicPr>
-                    <pic:cNvPr id="1859615183" name=""/>
+                    <pic:cNvPr id="1511548509" name=""/>
                     <pic:cNvPicPr/>
                   </pic:nvPicPr>
                   <pic:blipFill>
@@ -3169,7 +3184,7 @@
           <w:sz w:val="27"/>
         </w:rPr>
       </w:pPr>
-      <w:bookmarkStart w:id="4" w:name="_Toc236292936"/>
+      <w:bookmarkStart w:id="4" w:name="_Toc236511101"/>
       <w:r>
         <w:rPr>
           <w:rFonts w:ascii="Montserrat" w:hAnsi="Montserrat"/>
@@ -4318,7 +4333,7 @@
           <w:sz w:val="34"/>
         </w:rPr>
       </w:pPr>
-      <w:bookmarkStart w:id="5" w:name="_Toc236292937"/>
+      <w:bookmarkStart w:id="5" w:name="_Toc236511102"/>
       <w:r>
         <w:rPr>
           <w:rFonts w:ascii="Montserrat" w:hAnsi="Montserrat"/>
@@ -4342,7 +4357,7 @@
           <w:sz w:val="27"/>
         </w:rPr>
       </w:pPr>
-      <w:bookmarkStart w:id="6" w:name="_Toc236292938"/>
+      <w:bookmarkStart w:id="6" w:name="_Toc236511103"/>
       <w:r>
         <w:rPr>
           <w:rFonts w:ascii="Montserrat" w:hAnsi="Montserrat"/>
@@ -4383,7 +4398,7 @@
           <w:sz w:val="27"/>
         </w:rPr>
       </w:pPr>
-      <w:bookmarkStart w:id="7" w:name="_Toc236292939"/>
+      <w:bookmarkStart w:id="7" w:name="_Toc236511104"/>
       <w:r>
         <w:rPr>
           <w:rFonts w:ascii="Montserrat" w:hAnsi="Montserrat"/>
@@ -4502,7 +4517,7 @@
           <w:sz w:val="27"/>
         </w:rPr>
       </w:pPr>
-      <w:bookmarkStart w:id="8" w:name="_Toc236292940"/>
+      <w:bookmarkStart w:id="8" w:name="_Toc236511105"/>
       <w:r>
         <w:rPr>
           <w:rFonts w:ascii="Montserrat" w:hAnsi="Montserrat"/>
@@ -5073,7 +5088,7 @@
           <w:sz w:val="27"/>
         </w:rPr>
       </w:pPr>
-      <w:bookmarkStart w:id="9" w:name="_Toc236292941"/>
+      <w:bookmarkStart w:id="9" w:name="_Toc236511106"/>
       <w:r>
         <w:rPr>
           <w:rFonts w:ascii="Montserrat" w:hAnsi="Montserrat"/>
@@ -5162,16 +5177,16 @@
         </w:rPr>
         <w:lastRenderedPageBreak/>
         <w:drawing>
-          <wp:inline distT="0" distB="0" distL="0" distR="0" wp14:anchorId="5ADE9C69" wp14:editId="35D9162A">
+          <wp:inline distT="0" distB="0" distL="0" distR="0" wp14:anchorId="1667312D" wp14:editId="2EBACD6B">
             <wp:extent cx="4937760" cy="4462310"/>
             <wp:effectExtent l="19050" t="19050" r="15240" b="14605"/>
-            <wp:docPr id="467560047" name="Imagem 3"/>
+            <wp:docPr id="1230606325" name="Imagem 3"/>
             <wp:cNvGraphicFramePr/>
             <a:graphic xmlns:a="http://schemas.openxmlformats.org/drawingml/2006/main">
               <a:graphicData uri="http://schemas.openxmlformats.org/drawingml/2006/picture">
                 <pic:pic xmlns:pic="http://schemas.openxmlformats.org/drawingml/2006/picture">
                   <pic:nvPicPr>
-                    <pic:cNvPr id="467560047" name=""/>
+                    <pic:cNvPr id="1230606325" name=""/>
                     <pic:cNvPicPr/>
                   </pic:nvPicPr>
                   <pic:blipFill>
@@ -5239,7 +5254,7 @@
           <w:sz w:val="27"/>
         </w:rPr>
       </w:pPr>
-      <w:bookmarkStart w:id="10" w:name="_Toc236292942"/>
+      <w:bookmarkStart w:id="10" w:name="_Toc236511107"/>
       <w:r>
         <w:rPr>
           <w:rFonts w:ascii="Montserrat" w:hAnsi="Montserrat"/>
@@ -5280,16 +5295,16 @@
         </w:rPr>
         <w:lastRenderedPageBreak/>
         <w:drawing>
-          <wp:inline distT="0" distB="0" distL="0" distR="0" wp14:anchorId="0E6A1964" wp14:editId="21FFE4AF">
+          <wp:inline distT="0" distB="0" distL="0" distR="0" wp14:anchorId="0372AA51" wp14:editId="6ACD0E56">
             <wp:extent cx="5120640" cy="4627581"/>
             <wp:effectExtent l="19050" t="19050" r="22860" b="20955"/>
-            <wp:docPr id="1669235274" name="Imagem 4"/>
+            <wp:docPr id="1437198999" name="Imagem 4"/>
             <wp:cNvGraphicFramePr/>
             <a:graphic xmlns:a="http://schemas.openxmlformats.org/drawingml/2006/main">
               <a:graphicData uri="http://schemas.openxmlformats.org/drawingml/2006/picture">
                 <pic:pic xmlns:pic="http://schemas.openxmlformats.org/drawingml/2006/picture">
                   <pic:nvPicPr>
-                    <pic:cNvPr id="1669235274" name=""/>
+                    <pic:cNvPr id="1437198999" name=""/>
                     <pic:cNvPicPr/>
                   </pic:nvPicPr>
                   <pic:blipFill>
@@ -5426,7 +5441,7 @@
           <w:sz w:val="27"/>
         </w:rPr>
       </w:pPr>
-      <w:bookmarkStart w:id="11" w:name="_Toc236292943"/>
+      <w:bookmarkStart w:id="11" w:name="_Toc236511108"/>
       <w:r>
         <w:rPr>
           <w:rFonts w:ascii="Montserrat" w:hAnsi="Montserrat"/>
@@ -5467,16 +5482,16 @@
           <w:noProof/>
         </w:rPr>
         <w:drawing>
-          <wp:inline distT="0" distB="0" distL="0" distR="0" wp14:anchorId="1DA73227" wp14:editId="1DB8CD6C">
+          <wp:inline distT="0" distB="0" distL="0" distR="0" wp14:anchorId="78E834B3" wp14:editId="1BCA3B6B">
             <wp:extent cx="4206240" cy="3801227"/>
             <wp:effectExtent l="19050" t="19050" r="22860" b="27940"/>
-            <wp:docPr id="174126964" name="Imagem 5"/>
+            <wp:docPr id="1491991102" name="Imagem 5"/>
             <wp:cNvGraphicFramePr/>
             <a:graphic xmlns:a="http://schemas.openxmlformats.org/drawingml/2006/main">
               <a:graphicData uri="http://schemas.openxmlformats.org/drawingml/2006/picture">
                 <pic:pic xmlns:pic="http://schemas.openxmlformats.org/drawingml/2006/picture">
                   <pic:nvPicPr>
-                    <pic:cNvPr id="174126964" name=""/>
+                    <pic:cNvPr id="1491991102" name=""/>
                     <pic:cNvPicPr/>
                   </pic:nvPicPr>
                   <pic:blipFill>
@@ -5544,16 +5559,16 @@
         </w:rPr>
         <w:lastRenderedPageBreak/>
         <w:drawing>
-          <wp:inline distT="0" distB="0" distL="0" distR="0" wp14:anchorId="0BC50D1E" wp14:editId="6D92399A">
+          <wp:inline distT="0" distB="0" distL="0" distR="0" wp14:anchorId="7B791435" wp14:editId="39B2CF5F">
             <wp:extent cx="4206240" cy="3801227"/>
             <wp:effectExtent l="19050" t="19050" r="22860" b="27940"/>
-            <wp:docPr id="522880545" name="Imagem 6"/>
+            <wp:docPr id="530681054" name="Imagem 6"/>
             <wp:cNvGraphicFramePr/>
             <a:graphic xmlns:a="http://schemas.openxmlformats.org/drawingml/2006/main">
               <a:graphicData uri="http://schemas.openxmlformats.org/drawingml/2006/picture">
                 <pic:pic xmlns:pic="http://schemas.openxmlformats.org/drawingml/2006/picture">
                   <pic:nvPicPr>
-                    <pic:cNvPr id="522880545" name=""/>
+                    <pic:cNvPr id="530681054" name=""/>
                     <pic:cNvPicPr/>
                   </pic:nvPicPr>
                   <pic:blipFill>
@@ -5669,7 +5684,7 @@
           <w:sz w:val="27"/>
         </w:rPr>
       </w:pPr>
-      <w:bookmarkStart w:id="12" w:name="_Toc236292944"/>
+      <w:bookmarkStart w:id="12" w:name="_Toc236511109"/>
       <w:r>
         <w:rPr>
           <w:rFonts w:ascii="Montserrat" w:hAnsi="Montserrat"/>
@@ -5741,7 +5756,7 @@
           <w:sz w:val="34"/>
         </w:rPr>
       </w:pPr>
-      <w:bookmarkStart w:id="13" w:name="_Toc236292945"/>
+      <w:bookmarkStart w:id="13" w:name="_Toc236511110"/>
       <w:r>
         <w:rPr>
           <w:rFonts w:ascii="Montserrat" w:hAnsi="Montserrat"/>
@@ -5783,7 +5798,7 @@
           <w:sz w:val="27"/>
         </w:rPr>
       </w:pPr>
-      <w:bookmarkStart w:id="14" w:name="_Toc236292946"/>
+      <w:bookmarkStart w:id="14" w:name="_Toc236511111"/>
       <w:r>
         <w:rPr>
           <w:rFonts w:ascii="Montserrat" w:hAnsi="Montserrat"/>
@@ -6643,16 +6658,16 @@
         </w:rPr>
         <w:lastRenderedPageBreak/>
         <w:drawing>
-          <wp:inline distT="0" distB="0" distL="0" distR="0" wp14:anchorId="343BEDA1" wp14:editId="47DF8EA5">
+          <wp:inline distT="0" distB="0" distL="0" distR="0" wp14:anchorId="618DA915" wp14:editId="0D0052FA">
             <wp:extent cx="5120640" cy="4627581"/>
             <wp:effectExtent l="19050" t="19050" r="22860" b="20955"/>
-            <wp:docPr id="1172423798" name="Imagem 7"/>
+            <wp:docPr id="636608589" name="Imagem 7"/>
             <wp:cNvGraphicFramePr/>
             <a:graphic xmlns:a="http://schemas.openxmlformats.org/drawingml/2006/main">
               <a:graphicData uri="http://schemas.openxmlformats.org/drawingml/2006/picture">
                 <pic:pic xmlns:pic="http://schemas.openxmlformats.org/drawingml/2006/picture">
                   <pic:nvPicPr>
-                    <pic:cNvPr id="1172423798" name=""/>
+                    <pic:cNvPr id="636608589" name=""/>
                     <pic:cNvPicPr/>
                   </pic:nvPicPr>
                   <pic:blipFill>
@@ -6720,16 +6735,16 @@
         </w:rPr>
         <w:lastRenderedPageBreak/>
         <w:drawing>
-          <wp:inline distT="0" distB="0" distL="0" distR="0" wp14:anchorId="021300F9" wp14:editId="01DD91D9">
+          <wp:inline distT="0" distB="0" distL="0" distR="0" wp14:anchorId="41D7ECE0" wp14:editId="2062B453">
             <wp:extent cx="5120640" cy="4627581"/>
             <wp:effectExtent l="19050" t="19050" r="22860" b="20955"/>
-            <wp:docPr id="1533216687" name="Imagem 8"/>
+            <wp:docPr id="1978908522" name="Imagem 8"/>
             <wp:cNvGraphicFramePr/>
             <a:graphic xmlns:a="http://schemas.openxmlformats.org/drawingml/2006/main">
               <a:graphicData uri="http://schemas.openxmlformats.org/drawingml/2006/picture">
                 <pic:pic xmlns:pic="http://schemas.openxmlformats.org/drawingml/2006/picture">
                   <pic:nvPicPr>
-                    <pic:cNvPr id="1533216687" name=""/>
+                    <pic:cNvPr id="1978908522" name=""/>
                     <pic:cNvPicPr/>
                   </pic:nvPicPr>
                   <pic:blipFill>
@@ -6864,7 +6879,7 @@
           <w:sz w:val="27"/>
         </w:rPr>
       </w:pPr>
-      <w:bookmarkStart w:id="15" w:name="_Toc236292947"/>
+      <w:bookmarkStart w:id="15" w:name="_Toc236511112"/>
       <w:r>
         <w:rPr>
           <w:rFonts w:ascii="Montserrat" w:hAnsi="Montserrat"/>
@@ -7733,16 +7748,16 @@
         </w:rPr>
         <w:lastRenderedPageBreak/>
         <w:drawing>
-          <wp:inline distT="0" distB="0" distL="0" distR="0" wp14:anchorId="423E92A2" wp14:editId="0636B011">
+          <wp:inline distT="0" distB="0" distL="0" distR="0" wp14:anchorId="71FCA247" wp14:editId="055E2CAD">
             <wp:extent cx="5120640" cy="4627581"/>
             <wp:effectExtent l="19050" t="19050" r="22860" b="20955"/>
-            <wp:docPr id="327477435" name="Imagem 9"/>
+            <wp:docPr id="1312888058" name="Imagem 9"/>
             <wp:cNvGraphicFramePr/>
             <a:graphic xmlns:a="http://schemas.openxmlformats.org/drawingml/2006/main">
               <a:graphicData uri="http://schemas.openxmlformats.org/drawingml/2006/picture">
                 <pic:pic xmlns:pic="http://schemas.openxmlformats.org/drawingml/2006/picture">
                   <pic:nvPicPr>
-                    <pic:cNvPr id="327477435" name=""/>
+                    <pic:cNvPr id="1312888058" name=""/>
                     <pic:cNvPicPr/>
                   </pic:nvPicPr>
                   <pic:blipFill>
@@ -7810,16 +7825,16 @@
         </w:rPr>
         <w:lastRenderedPageBreak/>
         <w:drawing>
-          <wp:inline distT="0" distB="0" distL="0" distR="0" wp14:anchorId="024188C8" wp14:editId="554EE833">
+          <wp:inline distT="0" distB="0" distL="0" distR="0" wp14:anchorId="33646D38" wp14:editId="1F24D4D7">
             <wp:extent cx="5120640" cy="4627581"/>
             <wp:effectExtent l="19050" t="19050" r="22860" b="20955"/>
-            <wp:docPr id="1735823452" name="Imagem 10"/>
+            <wp:docPr id="1115990706" name="Imagem 10"/>
             <wp:cNvGraphicFramePr/>
             <a:graphic xmlns:a="http://schemas.openxmlformats.org/drawingml/2006/main">
               <a:graphicData uri="http://schemas.openxmlformats.org/drawingml/2006/picture">
                 <pic:pic xmlns:pic="http://schemas.openxmlformats.org/drawingml/2006/picture">
                   <pic:nvPicPr>
-                    <pic:cNvPr id="1735823452" name=""/>
+                    <pic:cNvPr id="1115990706" name=""/>
                     <pic:cNvPicPr/>
                   </pic:nvPicPr>
                   <pic:blipFill>
@@ -7905,7 +7920,7 @@
           <w:sz w:val="27"/>
         </w:rPr>
       </w:pPr>
-      <w:bookmarkStart w:id="16" w:name="_Toc236292948"/>
+      <w:bookmarkStart w:id="16" w:name="_Toc236511113"/>
       <w:r>
         <w:rPr>
           <w:rFonts w:ascii="Montserrat" w:hAnsi="Montserrat"/>
@@ -8873,16 +8888,16 @@
         </w:rPr>
         <w:lastRenderedPageBreak/>
         <w:drawing>
-          <wp:inline distT="0" distB="0" distL="0" distR="0" wp14:anchorId="4B858CB9" wp14:editId="5FEE4671">
+          <wp:inline distT="0" distB="0" distL="0" distR="0" wp14:anchorId="0D910258" wp14:editId="4E10AA7D">
             <wp:extent cx="5120640" cy="3282818"/>
             <wp:effectExtent l="19050" t="19050" r="22860" b="13335"/>
-            <wp:docPr id="1134333660" name="Imagem 11"/>
+            <wp:docPr id="368459567" name="Imagem 11"/>
             <wp:cNvGraphicFramePr/>
             <a:graphic xmlns:a="http://schemas.openxmlformats.org/drawingml/2006/main">
               <a:graphicData uri="http://schemas.openxmlformats.org/drawingml/2006/picture">
                 <pic:pic xmlns:pic="http://schemas.openxmlformats.org/drawingml/2006/picture">
                   <pic:nvPicPr>
-                    <pic:cNvPr id="1134333660" name=""/>
+                    <pic:cNvPr id="368459567" name=""/>
                     <pic:cNvPicPr/>
                   </pic:nvPicPr>
                   <pic:blipFill>
@@ -8950,16 +8965,16 @@
         </w:rPr>
         <w:lastRenderedPageBreak/>
         <w:drawing>
-          <wp:inline distT="0" distB="0" distL="0" distR="0" wp14:anchorId="1314E147" wp14:editId="72BEF26A">
+          <wp:inline distT="0" distB="0" distL="0" distR="0" wp14:anchorId="19311F6B" wp14:editId="00A9577C">
             <wp:extent cx="5120640" cy="4627581"/>
             <wp:effectExtent l="19050" t="19050" r="22860" b="20955"/>
-            <wp:docPr id="595195255" name="Imagem 12"/>
+            <wp:docPr id="1300422615" name="Imagem 12"/>
             <wp:cNvGraphicFramePr/>
             <a:graphic xmlns:a="http://schemas.openxmlformats.org/drawingml/2006/main">
               <a:graphicData uri="http://schemas.openxmlformats.org/drawingml/2006/picture">
                 <pic:pic xmlns:pic="http://schemas.openxmlformats.org/drawingml/2006/picture">
                   <pic:nvPicPr>
-                    <pic:cNvPr id="595195255" name=""/>
+                    <pic:cNvPr id="1300422615" name=""/>
                     <pic:cNvPicPr/>
                   </pic:nvPicPr>
                   <pic:blipFill>
@@ -9045,7 +9060,7 @@
           <w:sz w:val="27"/>
         </w:rPr>
       </w:pPr>
-      <w:bookmarkStart w:id="17" w:name="_Toc236292949"/>
+      <w:bookmarkStart w:id="17" w:name="_Toc236511114"/>
       <w:r>
         <w:rPr>
           <w:rFonts w:ascii="Montserrat" w:hAnsi="Montserrat"/>
@@ -9552,16 +9567,16 @@
           <w:noProof/>
         </w:rPr>
         <w:drawing>
-          <wp:inline distT="0" distB="0" distL="0" distR="0" wp14:anchorId="3FD24B81" wp14:editId="7D88D31B">
+          <wp:inline distT="0" distB="0" distL="0" distR="0" wp14:anchorId="7D7CE771" wp14:editId="39A27447">
             <wp:extent cx="5120640" cy="4627581"/>
             <wp:effectExtent l="19050" t="19050" r="22860" b="20955"/>
-            <wp:docPr id="1649157723" name="Imagem 13"/>
+            <wp:docPr id="997461225" name="Imagem 13"/>
             <wp:cNvGraphicFramePr/>
             <a:graphic xmlns:a="http://schemas.openxmlformats.org/drawingml/2006/main">
               <a:graphicData uri="http://schemas.openxmlformats.org/drawingml/2006/picture">
                 <pic:pic xmlns:pic="http://schemas.openxmlformats.org/drawingml/2006/picture">
                   <pic:nvPicPr>
-                    <pic:cNvPr id="1649157723" name=""/>
+                    <pic:cNvPr id="997461225" name=""/>
                     <pic:cNvPicPr/>
                   </pic:nvPicPr>
                   <pic:blipFill>
@@ -9629,16 +9644,16 @@
         </w:rPr>
         <w:lastRenderedPageBreak/>
         <w:drawing>
-          <wp:inline distT="0" distB="0" distL="0" distR="0" wp14:anchorId="064205D3" wp14:editId="177BE0A9">
+          <wp:inline distT="0" distB="0" distL="0" distR="0" wp14:anchorId="45C763EC" wp14:editId="32FB4D24">
             <wp:extent cx="5120640" cy="4627581"/>
             <wp:effectExtent l="19050" t="19050" r="22860" b="20955"/>
-            <wp:docPr id="2024014109" name="Imagem 14"/>
+            <wp:docPr id="1222134703" name="Imagem 14"/>
             <wp:cNvGraphicFramePr/>
             <a:graphic xmlns:a="http://schemas.openxmlformats.org/drawingml/2006/main">
               <a:graphicData uri="http://schemas.openxmlformats.org/drawingml/2006/picture">
                 <pic:pic xmlns:pic="http://schemas.openxmlformats.org/drawingml/2006/picture">
                   <pic:nvPicPr>
-                    <pic:cNvPr id="2024014109" name=""/>
+                    <pic:cNvPr id="1222134703" name=""/>
                     <pic:cNvPicPr/>
                   </pic:nvPicPr>
                   <pic:blipFill>
@@ -9724,7 +9739,7 @@
           <w:sz w:val="27"/>
         </w:rPr>
       </w:pPr>
-      <w:bookmarkStart w:id="18" w:name="_Toc236292950"/>
+      <w:bookmarkStart w:id="18" w:name="_Toc236511115"/>
       <w:r>
         <w:rPr>
           <w:rFonts w:ascii="Montserrat" w:hAnsi="Montserrat"/>
@@ -9765,16 +9780,16 @@
         </w:rPr>
         <w:lastRenderedPageBreak/>
         <w:drawing>
-          <wp:inline distT="0" distB="0" distL="0" distR="0" wp14:anchorId="4603FBCE" wp14:editId="7076E0D8">
+          <wp:inline distT="0" distB="0" distL="0" distR="0" wp14:anchorId="4889B943" wp14:editId="30376BCC">
             <wp:extent cx="5120640" cy="4627581"/>
             <wp:effectExtent l="19050" t="19050" r="22860" b="20955"/>
-            <wp:docPr id="731656055" name="Imagem 15"/>
+            <wp:docPr id="1247498815" name="Imagem 15"/>
             <wp:cNvGraphicFramePr/>
             <a:graphic xmlns:a="http://schemas.openxmlformats.org/drawingml/2006/main">
               <a:graphicData uri="http://schemas.openxmlformats.org/drawingml/2006/picture">
                 <pic:pic xmlns:pic="http://schemas.openxmlformats.org/drawingml/2006/picture">
                   <pic:nvPicPr>
-                    <pic:cNvPr id="731656055" name=""/>
+                    <pic:cNvPr id="1247498815" name=""/>
                     <pic:cNvPicPr/>
                   </pic:nvPicPr>
                   <pic:blipFill>
@@ -9842,16 +9857,16 @@
         </w:rPr>
         <w:lastRenderedPageBreak/>
         <w:drawing>
-          <wp:inline distT="0" distB="0" distL="0" distR="0" wp14:anchorId="44A299D2" wp14:editId="11DE78C1">
+          <wp:inline distT="0" distB="0" distL="0" distR="0" wp14:anchorId="4BC5FB6B" wp14:editId="7DB9BC68">
             <wp:extent cx="5120640" cy="4627581"/>
             <wp:effectExtent l="19050" t="19050" r="22860" b="20955"/>
-            <wp:docPr id="853655702" name="Imagem 16"/>
+            <wp:docPr id="1453063592" name="Imagem 16"/>
             <wp:cNvGraphicFramePr/>
             <a:graphic xmlns:a="http://schemas.openxmlformats.org/drawingml/2006/main">
               <a:graphicData uri="http://schemas.openxmlformats.org/drawingml/2006/picture">
                 <pic:pic xmlns:pic="http://schemas.openxmlformats.org/drawingml/2006/picture">
                   <pic:nvPicPr>
-                    <pic:cNvPr id="853655702" name=""/>
+                    <pic:cNvPr id="1453063592" name=""/>
                     <pic:cNvPicPr/>
                   </pic:nvPicPr>
                   <pic:blipFill>
@@ -10015,16 +10030,16 @@
         </w:rPr>
         <w:lastRenderedPageBreak/>
         <w:drawing>
-          <wp:inline distT="0" distB="0" distL="0" distR="0" wp14:anchorId="60A996FE" wp14:editId="2F51FDA8">
+          <wp:inline distT="0" distB="0" distL="0" distR="0" wp14:anchorId="628A03DD" wp14:editId="23D06EC9">
             <wp:extent cx="5120640" cy="3282818"/>
             <wp:effectExtent l="19050" t="19050" r="22860" b="13335"/>
-            <wp:docPr id="1588888392" name="Imagem 17"/>
+            <wp:docPr id="947166769" name="Imagem 17"/>
             <wp:cNvGraphicFramePr/>
             <a:graphic xmlns:a="http://schemas.openxmlformats.org/drawingml/2006/main">
               <a:graphicData uri="http://schemas.openxmlformats.org/drawingml/2006/picture">
                 <pic:pic xmlns:pic="http://schemas.openxmlformats.org/drawingml/2006/picture">
                   <pic:nvPicPr>
-                    <pic:cNvPr id="1588888392" name=""/>
+                    <pic:cNvPr id="947166769" name=""/>
                     <pic:cNvPicPr/>
                   </pic:nvPicPr>
                   <pic:blipFill>
@@ -10110,7 +10125,7 @@
           <w:sz w:val="27"/>
         </w:rPr>
       </w:pPr>
-      <w:bookmarkStart w:id="19" w:name="_Toc236292951"/>
+      <w:bookmarkStart w:id="19" w:name="_Toc236511116"/>
       <w:r>
         <w:rPr>
           <w:rFonts w:ascii="Montserrat" w:hAnsi="Montserrat"/>
@@ -10151,16 +10166,16 @@
         </w:rPr>
         <w:lastRenderedPageBreak/>
         <w:drawing>
-          <wp:inline distT="0" distB="0" distL="0" distR="0" wp14:anchorId="36D545A2" wp14:editId="7FCA7F0D">
+          <wp:inline distT="0" distB="0" distL="0" distR="0" wp14:anchorId="6386F95B" wp14:editId="1C883B75">
             <wp:extent cx="5120640" cy="4627581"/>
             <wp:effectExtent l="19050" t="19050" r="22860" b="20955"/>
-            <wp:docPr id="1493527552" name="Imagem 18"/>
+            <wp:docPr id="135312255" name="Imagem 18"/>
             <wp:cNvGraphicFramePr/>
             <a:graphic xmlns:a="http://schemas.openxmlformats.org/drawingml/2006/main">
               <a:graphicData uri="http://schemas.openxmlformats.org/drawingml/2006/picture">
                 <pic:pic xmlns:pic="http://schemas.openxmlformats.org/drawingml/2006/picture">
                   <pic:nvPicPr>
-                    <pic:cNvPr id="1493527552" name=""/>
+                    <pic:cNvPr id="135312255" name=""/>
                     <pic:cNvPicPr/>
                   </pic:nvPicPr>
                   <pic:blipFill>
@@ -10228,16 +10243,16 @@
         </w:rPr>
         <w:lastRenderedPageBreak/>
         <w:drawing>
-          <wp:inline distT="0" distB="0" distL="0" distR="0" wp14:anchorId="3A4C3CFF" wp14:editId="09B874EB">
+          <wp:inline distT="0" distB="0" distL="0" distR="0" wp14:anchorId="26A83E0F" wp14:editId="745B57D1">
             <wp:extent cx="5120640" cy="4627581"/>
             <wp:effectExtent l="19050" t="19050" r="22860" b="20955"/>
-            <wp:docPr id="1723710172" name="Imagem 19"/>
+            <wp:docPr id="53034778" name="Imagem 19"/>
             <wp:cNvGraphicFramePr/>
             <a:graphic xmlns:a="http://schemas.openxmlformats.org/drawingml/2006/main">
               <a:graphicData uri="http://schemas.openxmlformats.org/drawingml/2006/picture">
                 <pic:pic xmlns:pic="http://schemas.openxmlformats.org/drawingml/2006/picture">
                   <pic:nvPicPr>
-                    <pic:cNvPr id="1723710172" name=""/>
+                    <pic:cNvPr id="53034778" name=""/>
                     <pic:cNvPicPr/>
                   </pic:nvPicPr>
                   <pic:blipFill>
@@ -10371,7 +10386,7 @@
           <w:sz w:val="27"/>
         </w:rPr>
       </w:pPr>
-      <w:bookmarkStart w:id="20" w:name="_Toc236292952"/>
+      <w:bookmarkStart w:id="20" w:name="_Toc236511117"/>
       <w:r>
         <w:rPr>
           <w:rFonts w:ascii="Montserrat" w:hAnsi="Montserrat"/>
@@ -10412,16 +10427,16 @@
         </w:rPr>
         <w:lastRenderedPageBreak/>
         <w:drawing>
-          <wp:inline distT="0" distB="0" distL="0" distR="0" wp14:anchorId="7697CEE9" wp14:editId="4DBF12F4">
+          <wp:inline distT="0" distB="0" distL="0" distR="0" wp14:anchorId="121128F0" wp14:editId="65C575C8">
             <wp:extent cx="5120640" cy="4627581"/>
             <wp:effectExtent l="19050" t="19050" r="22860" b="20955"/>
-            <wp:docPr id="1407880669" name="Imagem 20"/>
+            <wp:docPr id="1448338968" name="Imagem 20"/>
             <wp:cNvGraphicFramePr/>
             <a:graphic xmlns:a="http://schemas.openxmlformats.org/drawingml/2006/main">
               <a:graphicData uri="http://schemas.openxmlformats.org/drawingml/2006/picture">
                 <pic:pic xmlns:pic="http://schemas.openxmlformats.org/drawingml/2006/picture">
                   <pic:nvPicPr>
-                    <pic:cNvPr id="1407880669" name=""/>
+                    <pic:cNvPr id="1448338968" name=""/>
                     <pic:cNvPicPr/>
                   </pic:nvPicPr>
                   <pic:blipFill>
@@ -10489,16 +10504,16 @@
         </w:rPr>
         <w:lastRenderedPageBreak/>
         <w:drawing>
-          <wp:inline distT="0" distB="0" distL="0" distR="0" wp14:anchorId="053EE43E" wp14:editId="51A2844B">
+          <wp:inline distT="0" distB="0" distL="0" distR="0" wp14:anchorId="0AF9F074" wp14:editId="5AD39CFE">
             <wp:extent cx="5120640" cy="4627581"/>
             <wp:effectExtent l="19050" t="19050" r="22860" b="20955"/>
-            <wp:docPr id="121856988" name="Imagem 21"/>
+            <wp:docPr id="1440783318" name="Imagem 21"/>
             <wp:cNvGraphicFramePr/>
             <a:graphic xmlns:a="http://schemas.openxmlformats.org/drawingml/2006/main">
               <a:graphicData uri="http://schemas.openxmlformats.org/drawingml/2006/picture">
                 <pic:pic xmlns:pic="http://schemas.openxmlformats.org/drawingml/2006/picture">
                   <pic:nvPicPr>
-                    <pic:cNvPr id="121856988" name=""/>
+                    <pic:cNvPr id="1440783318" name=""/>
                     <pic:cNvPicPr/>
                   </pic:nvPicPr>
                   <pic:blipFill>
@@ -10687,7 +10702,7 @@
           <w:sz w:val="27"/>
         </w:rPr>
       </w:pPr>
-      <w:bookmarkStart w:id="21" w:name="_Toc236292953"/>
+      <w:bookmarkStart w:id="21" w:name="_Toc236511118"/>
       <w:r>
         <w:rPr>
           <w:rFonts w:ascii="Montserrat" w:hAnsi="Montserrat"/>
@@ -10727,16 +10742,16 @@
           <w:noProof/>
         </w:rPr>
         <w:drawing>
-          <wp:inline distT="0" distB="0" distL="0" distR="0" wp14:anchorId="3802A170" wp14:editId="7C91BC19">
+          <wp:inline distT="0" distB="0" distL="0" distR="0" wp14:anchorId="786E8D24" wp14:editId="5F5CFBB8">
             <wp:extent cx="5120640" cy="4627581"/>
             <wp:effectExtent l="19050" t="19050" r="22860" b="20955"/>
-            <wp:docPr id="563787468" name="Imagem 22"/>
+            <wp:docPr id="1835121377" name="Imagem 22"/>
             <wp:cNvGraphicFramePr/>
             <a:graphic xmlns:a="http://schemas.openxmlformats.org/drawingml/2006/main">
               <a:graphicData uri="http://schemas.openxmlformats.org/drawingml/2006/picture">
                 <pic:pic xmlns:pic="http://schemas.openxmlformats.org/drawingml/2006/picture">
                   <pic:nvPicPr>
-                    <pic:cNvPr id="563787468" name=""/>
+                    <pic:cNvPr id="1835121377" name=""/>
                     <pic:cNvPicPr/>
                   </pic:nvPicPr>
                   <pic:blipFill>
@@ -10804,16 +10819,16 @@
         </w:rPr>
         <w:lastRenderedPageBreak/>
         <w:drawing>
-          <wp:inline distT="0" distB="0" distL="0" distR="0" wp14:anchorId="47804551" wp14:editId="7947A450">
+          <wp:inline distT="0" distB="0" distL="0" distR="0" wp14:anchorId="79701EE1" wp14:editId="071B174E">
             <wp:extent cx="5120640" cy="4627581"/>
             <wp:effectExtent l="19050" t="19050" r="22860" b="20955"/>
-            <wp:docPr id="1567283268" name="Imagem 23"/>
+            <wp:docPr id="1769195559" name="Imagem 23"/>
             <wp:cNvGraphicFramePr/>
             <a:graphic xmlns:a="http://schemas.openxmlformats.org/drawingml/2006/main">
               <a:graphicData uri="http://schemas.openxmlformats.org/drawingml/2006/picture">
                 <pic:pic xmlns:pic="http://schemas.openxmlformats.org/drawingml/2006/picture">
                   <pic:nvPicPr>
-                    <pic:cNvPr id="1567283268" name=""/>
+                    <pic:cNvPr id="1769195559" name=""/>
                     <pic:cNvPicPr/>
                   </pic:nvPicPr>
                   <pic:blipFill>
@@ -10971,7 +10986,7 @@
           <w:sz w:val="27"/>
         </w:rPr>
       </w:pPr>
-      <w:bookmarkStart w:id="22" w:name="_Toc236292954"/>
+      <w:bookmarkStart w:id="22" w:name="_Toc236511119"/>
       <w:r>
         <w:rPr>
           <w:rFonts w:ascii="Montserrat" w:hAnsi="Montserrat"/>
@@ -11012,16 +11027,16 @@
         </w:rPr>
         <w:lastRenderedPageBreak/>
         <w:drawing>
-          <wp:inline distT="0" distB="0" distL="0" distR="0" wp14:anchorId="56C8C854" wp14:editId="3FE0D330">
+          <wp:inline distT="0" distB="0" distL="0" distR="0" wp14:anchorId="3D53AC5A" wp14:editId="3706424F">
             <wp:extent cx="5120640" cy="4627581"/>
             <wp:effectExtent l="19050" t="19050" r="22860" b="20955"/>
-            <wp:docPr id="1575639080" name="Imagem 24"/>
+            <wp:docPr id="740126184" name="Imagem 24"/>
             <wp:cNvGraphicFramePr/>
             <a:graphic xmlns:a="http://schemas.openxmlformats.org/drawingml/2006/main">
               <a:graphicData uri="http://schemas.openxmlformats.org/drawingml/2006/picture">
                 <pic:pic xmlns:pic="http://schemas.openxmlformats.org/drawingml/2006/picture">
                   <pic:nvPicPr>
-                    <pic:cNvPr id="1575639080" name=""/>
+                    <pic:cNvPr id="740126184" name=""/>
                     <pic:cNvPicPr/>
                   </pic:nvPicPr>
                   <pic:blipFill>
@@ -11089,16 +11104,16 @@
         </w:rPr>
         <w:lastRenderedPageBreak/>
         <w:drawing>
-          <wp:inline distT="0" distB="0" distL="0" distR="0" wp14:anchorId="4923D57B" wp14:editId="49A6C1D5">
+          <wp:inline distT="0" distB="0" distL="0" distR="0" wp14:anchorId="5312EFF9" wp14:editId="427657CF">
             <wp:extent cx="5120640" cy="4627581"/>
             <wp:effectExtent l="19050" t="19050" r="22860" b="20955"/>
-            <wp:docPr id="2043375615" name="Imagem 25"/>
+            <wp:docPr id="559092173" name="Imagem 25"/>
             <wp:cNvGraphicFramePr/>
             <a:graphic xmlns:a="http://schemas.openxmlformats.org/drawingml/2006/main">
               <a:graphicData uri="http://schemas.openxmlformats.org/drawingml/2006/picture">
                 <pic:pic xmlns:pic="http://schemas.openxmlformats.org/drawingml/2006/picture">
                   <pic:nvPicPr>
-                    <pic:cNvPr id="2043375615" name=""/>
+                    <pic:cNvPr id="559092173" name=""/>
                     <pic:cNvPicPr/>
                   </pic:nvPicPr>
                   <pic:blipFill>
@@ -11232,7 +11247,7 @@
           <w:sz w:val="27"/>
         </w:rPr>
       </w:pPr>
-      <w:bookmarkStart w:id="23" w:name="_Toc236292955"/>
+      <w:bookmarkStart w:id="23" w:name="_Toc236511120"/>
       <w:r>
         <w:rPr>
           <w:rFonts w:ascii="Montserrat" w:hAnsi="Montserrat"/>
@@ -11273,16 +11288,16 @@
         </w:rPr>
         <w:lastRenderedPageBreak/>
         <w:drawing>
-          <wp:inline distT="0" distB="0" distL="0" distR="0" wp14:anchorId="3556FCDB" wp14:editId="13BFC98D">
+          <wp:inline distT="0" distB="0" distL="0" distR="0" wp14:anchorId="015C7230" wp14:editId="427E41F9">
             <wp:extent cx="5120640" cy="4627581"/>
             <wp:effectExtent l="19050" t="19050" r="22860" b="20955"/>
-            <wp:docPr id="1086533321" name="Imagem 26"/>
+            <wp:docPr id="1680865952" name="Imagem 26"/>
             <wp:cNvGraphicFramePr/>
             <a:graphic xmlns:a="http://schemas.openxmlformats.org/drawingml/2006/main">
               <a:graphicData uri="http://schemas.openxmlformats.org/drawingml/2006/picture">
                 <pic:pic xmlns:pic="http://schemas.openxmlformats.org/drawingml/2006/picture">
                   <pic:nvPicPr>
-                    <pic:cNvPr id="1086533321" name=""/>
+                    <pic:cNvPr id="1680865952" name=""/>
                     <pic:cNvPicPr/>
                   </pic:nvPicPr>
                   <pic:blipFill>
@@ -11365,21 +11380,9 @@
           <w:bottom w:val="single" w:sz="4" w:space="0" w:color="E4E4E7"/>
         </w:pBdr>
         <w:spacing w:before="80" w:after="200"/>
-        <w:rPr>
-          <w:rFonts w:ascii="Montserrat" w:hAnsi="Montserrat"/>
-          <w:b/>
-          <w:color w:val="1A1A1A"/>
-          <w:sz w:val="34"/>
-        </w:rPr>
-      </w:pPr>
-      <w:bookmarkStart w:id="24" w:name="_Toc236292956"/>
-      <w:r>
-        <w:rPr>
-          <w:rFonts w:ascii="Montserrat" w:hAnsi="Montserrat"/>
-          <w:b/>
-          <w:color w:val="1A1A1A"/>
-          <w:sz w:val="34"/>
-        </w:rPr>
+      </w:pPr>
+      <w:bookmarkStart w:id="24" w:name="_Toc236511121"/>
+      <w:r>
         <w:lastRenderedPageBreak/>
         <w:t>4. Gerando os relatorios finais</w:t>
       </w:r>
@@ -11414,7 +11417,7 @@
           <w:sz w:val="27"/>
         </w:rPr>
       </w:pPr>
-      <w:bookmarkStart w:id="25" w:name="_Toc236292957"/>
+      <w:bookmarkStart w:id="25" w:name="_Toc236511122"/>
       <w:r>
         <w:rPr>
           <w:rFonts w:ascii="Montserrat" w:hAnsi="Montserrat"/>
@@ -11454,16 +11457,16 @@
           <w:noProof/>
         </w:rPr>
         <w:drawing>
-          <wp:inline distT="0" distB="0" distL="0" distR="0" wp14:anchorId="09097BE5" wp14:editId="537818CD">
+          <wp:inline distT="0" distB="0" distL="0" distR="0" wp14:anchorId="100D8185" wp14:editId="1E6721D0">
             <wp:extent cx="5120640" cy="4627581"/>
             <wp:effectExtent l="19050" t="19050" r="22860" b="20955"/>
-            <wp:docPr id="1570260207" name="Imagem 27"/>
+            <wp:docPr id="328892465" name="Imagem 27"/>
             <wp:cNvGraphicFramePr/>
             <a:graphic xmlns:a="http://schemas.openxmlformats.org/drawingml/2006/main">
               <a:graphicData uri="http://schemas.openxmlformats.org/drawingml/2006/picture">
                 <pic:pic xmlns:pic="http://schemas.openxmlformats.org/drawingml/2006/picture">
                   <pic:nvPicPr>
-                    <pic:cNvPr id="1570260207" name=""/>
+                    <pic:cNvPr id="328892465" name=""/>
                     <pic:cNvPicPr/>
                   </pic:nvPicPr>
                   <pic:blipFill>
@@ -11531,16 +11534,16 @@
         </w:rPr>
         <w:lastRenderedPageBreak/>
         <w:drawing>
-          <wp:inline distT="0" distB="0" distL="0" distR="0" wp14:anchorId="4E4D0879" wp14:editId="40F3BED2">
+          <wp:inline distT="0" distB="0" distL="0" distR="0" wp14:anchorId="7EDD9662" wp14:editId="09A173C6">
             <wp:extent cx="5120640" cy="4627581"/>
             <wp:effectExtent l="19050" t="19050" r="22860" b="20955"/>
-            <wp:docPr id="1286846808" name="Imagem 28"/>
+            <wp:docPr id="786958400" name="Imagem 28"/>
             <wp:cNvGraphicFramePr/>
             <a:graphic xmlns:a="http://schemas.openxmlformats.org/drawingml/2006/main">
               <a:graphicData uri="http://schemas.openxmlformats.org/drawingml/2006/picture">
                 <pic:pic xmlns:pic="http://schemas.openxmlformats.org/drawingml/2006/picture">
                   <pic:nvPicPr>
-                    <pic:cNvPr id="1286846808" name=""/>
+                    <pic:cNvPr id="786958400" name=""/>
                     <pic:cNvPicPr/>
                   </pic:nvPicPr>
                   <pic:blipFill>
@@ -11608,16 +11611,16 @@
         </w:rPr>
         <w:lastRenderedPageBreak/>
         <w:drawing>
-          <wp:inline distT="0" distB="0" distL="0" distR="0" wp14:anchorId="3A151193" wp14:editId="5401EA10">
+          <wp:inline distT="0" distB="0" distL="0" distR="0" wp14:anchorId="736003CF" wp14:editId="79AFE39C">
             <wp:extent cx="5120640" cy="4627581"/>
             <wp:effectExtent l="19050" t="19050" r="22860" b="20955"/>
-            <wp:docPr id="129541045" name="Imagem 29"/>
+            <wp:docPr id="1303706007" name="Imagem 29"/>
             <wp:cNvGraphicFramePr/>
             <a:graphic xmlns:a="http://schemas.openxmlformats.org/drawingml/2006/main">
               <a:graphicData uri="http://schemas.openxmlformats.org/drawingml/2006/picture">
                 <pic:pic xmlns:pic="http://schemas.openxmlformats.org/drawingml/2006/picture">
                   <pic:nvPicPr>
-                    <pic:cNvPr id="129541045" name=""/>
+                    <pic:cNvPr id="1303706007" name=""/>
                     <pic:cNvPicPr/>
                   </pic:nvPicPr>
                   <pic:blipFill>
@@ -11754,16 +11757,16 @@
         </w:rPr>
         <w:lastRenderedPageBreak/>
         <w:drawing>
-          <wp:inline distT="0" distB="0" distL="0" distR="0" wp14:anchorId="0B2F744A" wp14:editId="4C33B84A">
+          <wp:inline distT="0" distB="0" distL="0" distR="0" wp14:anchorId="42A410E8" wp14:editId="7DB70BE7">
             <wp:extent cx="5120640" cy="1715571"/>
             <wp:effectExtent l="19050" t="19050" r="22860" b="18415"/>
-            <wp:docPr id="1984840935" name="Imagem 30"/>
+            <wp:docPr id="1732945975" name="Imagem 30"/>
             <wp:cNvGraphicFramePr/>
             <a:graphic xmlns:a="http://schemas.openxmlformats.org/drawingml/2006/main">
               <a:graphicData uri="http://schemas.openxmlformats.org/drawingml/2006/picture">
                 <pic:pic xmlns:pic="http://schemas.openxmlformats.org/drawingml/2006/picture">
                   <pic:nvPicPr>
-                    <pic:cNvPr id="1984840935" name=""/>
+                    <pic:cNvPr id="1732945975" name=""/>
                     <pic:cNvPicPr/>
                   </pic:nvPicPr>
                   <pic:blipFill>
@@ -11900,16 +11903,16 @@
         </w:rPr>
         <w:lastRenderedPageBreak/>
         <w:drawing>
-          <wp:inline distT="0" distB="0" distL="0" distR="0" wp14:anchorId="2A5001FA" wp14:editId="1CFD14C5">
+          <wp:inline distT="0" distB="0" distL="0" distR="0" wp14:anchorId="1F3F68AF" wp14:editId="5AFDCABF">
             <wp:extent cx="5120640" cy="3282818"/>
             <wp:effectExtent l="19050" t="19050" r="22860" b="13335"/>
-            <wp:docPr id="1766476040" name="Imagem 31"/>
+            <wp:docPr id="1191652161" name="Imagem 31"/>
             <wp:cNvGraphicFramePr/>
             <a:graphic xmlns:a="http://schemas.openxmlformats.org/drawingml/2006/main">
               <a:graphicData uri="http://schemas.openxmlformats.org/drawingml/2006/picture">
                 <pic:pic xmlns:pic="http://schemas.openxmlformats.org/drawingml/2006/picture">
                   <pic:nvPicPr>
-                    <pic:cNvPr id="1766476040" name=""/>
+                    <pic:cNvPr id="1191652161" name=""/>
                     <pic:cNvPicPr/>
                   </pic:nvPicPr>
                   <pic:blipFill>
@@ -12021,16 +12024,16 @@
           <w:noProof/>
         </w:rPr>
         <w:drawing>
-          <wp:inline distT="0" distB="0" distL="0" distR="0" wp14:anchorId="645E1554" wp14:editId="64C56496">
+          <wp:inline distT="0" distB="0" distL="0" distR="0" wp14:anchorId="04BE5741" wp14:editId="249F437E">
             <wp:extent cx="5120640" cy="1515102"/>
             <wp:effectExtent l="19050" t="19050" r="22860" b="28575"/>
-            <wp:docPr id="1465122041" name="Imagem 32"/>
+            <wp:docPr id="985594203" name="Imagem 32"/>
             <wp:cNvGraphicFramePr/>
             <a:graphic xmlns:a="http://schemas.openxmlformats.org/drawingml/2006/main">
               <a:graphicData uri="http://schemas.openxmlformats.org/drawingml/2006/picture">
                 <pic:pic xmlns:pic="http://schemas.openxmlformats.org/drawingml/2006/picture">
                   <pic:nvPicPr>
-                    <pic:cNvPr id="1465122041" name=""/>
+                    <pic:cNvPr id="985594203" name=""/>
                     <pic:cNvPicPr/>
                   </pic:nvPicPr>
                   <pic:blipFill>
@@ -12089,6 +12092,31 @@
     </w:p>
     <w:p>
       <w:pPr>
+        <w:pStyle w:val="PargrafodaLista"/>
+        <w:numPr>
+          <w:ilvl w:val="0"/>
+          <w:numId w:val="15"/>
+        </w:numPr>
+        <w:spacing w:after="80" w:line="260" w:lineRule="auto"/>
+        <w:ind w:left="700"/>
+        <w:rPr>
+          <w:rFonts w:ascii="Montserrat" w:hAnsi="Montserrat"/>
+          <w:color w:val="1A1A1A"/>
+          <w:sz w:val="22"/>
+        </w:rPr>
+      </w:pPr>
+      <w:r>
+        <w:rPr>
+          <w:rFonts w:ascii="Montserrat" w:hAnsi="Montserrat"/>
+          <w:color w:val="1A1A1A"/>
+          <w:sz w:val="22"/>
+        </w:rPr>
+        <w:lastRenderedPageBreak/>
+        <w:t>No rodape do Painel, o botao Historico de versoes mostra todas as vezes que este relatorio foi salvo, com data/hora e quem salvou.</w:t>
+      </w:r>
+    </w:p>
+    <w:p>
+      <w:pPr>
         <w:spacing w:before="160" w:after="200"/>
         <w:ind w:left="283"/>
         <w:rPr>
@@ -12105,49 +12133,7 @@
           <w:color w:val="6A6A70"/>
           <w:sz w:val="21"/>
         </w:rPr>
-        <w:lastRenderedPageBreak/>
-        <w:t>Este relatorio nao tem aprovacao/status formal - e uma ferramenta viva de acompanhamento, atualizada sempre que a situacao dos projetos mudar.</w:t>
-      </w:r>
-    </w:p>
-    <w:p>
-      <w:pPr>
-        <w:pStyle w:val="Ttulo2"/>
-        <w:spacing w:before="320" w:after="120"/>
-        <w:rPr>
-          <w:rFonts w:ascii="Montserrat" w:hAnsi="Montserrat"/>
-          <w:b/>
-          <w:color w:val="B91D2E"/>
-          <w:sz w:val="27"/>
-        </w:rPr>
-      </w:pPr>
-      <w:bookmarkStart w:id="26" w:name="_Toc236292958"/>
-      <w:r>
-        <w:rPr>
-          <w:rFonts w:ascii="Montserrat" w:hAnsi="Montserrat"/>
-          <w:b/>
-          <w:color w:val="B91D2E"/>
-          <w:sz w:val="27"/>
-        </w:rPr>
-        <w:t>4.2 Relatorio de Entregas e Beneficios (FORALF12)</w:t>
-      </w:r>
-      <w:bookmarkEnd w:id="26"/>
-    </w:p>
-    <w:p>
-      <w:pPr>
-        <w:spacing w:line="280" w:lineRule="auto"/>
-        <w:rPr>
-          <w:rFonts w:ascii="Montserrat" w:hAnsi="Montserrat"/>
-          <w:color w:val="1A1A1A"/>
-          <w:sz w:val="22"/>
-        </w:rPr>
-      </w:pPr>
-      <w:r>
-        <w:rPr>
-          <w:rFonts w:ascii="Montserrat" w:hAnsi="Montserrat"/>
-          <w:color w:val="1A1A1A"/>
-          <w:sz w:val="22"/>
-        </w:rPr>
-        <w:t>O relatorio mais importante do ponto de vista de governanca: e sobre ele que ocorre o Gate 2 - Pactuacao, quando o Dono do Negocio assume formalmente, perante a Alta Gestao, o compromisso de que todo o trabalho planejado sera executado.</w:t>
+        <w:t>Versionamento: toda vez que o relatorio e salvo (Salvar e ver painel), o sistema arquiva uma copia completa dos dados daquele momento, alem de atualizar a versao atual. Isso preserva as referencias mensais anteriores, que antes eram sobrescritas a cada novo salvamento. Ao clicar em Visualizar numa versao antiga, o Painel passa a mostrar aquele instantaneo, com um aviso amarelo no topo (Visualizando versao... - somente leitura) e um botao Voltar a versao atual. Enquanto uma versao antiga esta sendo visualizada, as abas Editar dados e Importar Project ficam bloqueadas - e preciso voltar a versao atual antes de editar.</w:t>
       </w:r>
     </w:p>
     <w:p>
@@ -12160,16 +12146,16 @@
           <w:noProof/>
         </w:rPr>
         <w:drawing>
-          <wp:inline distT="0" distB="0" distL="0" distR="0" wp14:anchorId="28A96266" wp14:editId="1DB12A96">
-            <wp:extent cx="5120640" cy="4627581"/>
-            <wp:effectExtent l="19050" t="19050" r="22860" b="20955"/>
-            <wp:docPr id="105791802" name="Imagem 33"/>
+          <wp:inline distT="0" distB="0" distL="0" distR="0" wp14:anchorId="379BA851" wp14:editId="4DFEEEE8">
+            <wp:extent cx="5120640" cy="1125174"/>
+            <wp:effectExtent l="19050" t="19050" r="22860" b="18415"/>
+            <wp:docPr id="308139623" name="Imagem 33"/>
             <wp:cNvGraphicFramePr/>
             <a:graphic xmlns:a="http://schemas.openxmlformats.org/drawingml/2006/main">
               <a:graphicData uri="http://schemas.openxmlformats.org/drawingml/2006/picture">
                 <pic:pic xmlns:pic="http://schemas.openxmlformats.org/drawingml/2006/picture">
                   <pic:nvPicPr>
-                    <pic:cNvPr id="105791802" name=""/>
+                    <pic:cNvPr id="308139623" name=""/>
                     <pic:cNvPicPr/>
                   </pic:nvPicPr>
                   <pic:blipFill>
@@ -12187,7 +12173,7 @@
                   <pic:spPr>
                     <a:xfrm>
                       <a:off x="0" y="0"/>
-                      <a:ext cx="5120640" cy="4627581"/>
+                      <a:ext cx="5120640" cy="1125174"/>
                     </a:xfrm>
                     <a:prstGeom prst="rect">
                       <a:avLst/>
@@ -12223,7 +12209,69 @@
           <w:color w:val="6A6A70"/>
           <w:sz w:val="19"/>
         </w:rPr>
-        <w:t>Painel do Relatorio de Entregas e Beneficios (estado vazio).</w:t>
+        <w:t>Aviso de versao historica (somente leitura), com o botao para voltar a versao atual.</w:t>
+      </w:r>
+    </w:p>
+    <w:p>
+      <w:pPr>
+        <w:spacing w:before="160" w:after="200"/>
+        <w:ind w:left="283"/>
+        <w:rPr>
+          <w:rFonts w:ascii="Montserrat" w:hAnsi="Montserrat"/>
+          <w:i/>
+          <w:color w:val="6A6A70"/>
+          <w:sz w:val="21"/>
+        </w:rPr>
+      </w:pPr>
+      <w:r>
+        <w:rPr>
+          <w:rFonts w:ascii="Montserrat" w:hAnsi="Montserrat"/>
+          <w:i/>
+          <w:color w:val="6A6A70"/>
+          <w:sz w:val="21"/>
+        </w:rPr>
+        <w:t>Este relatorio nao tem aprovacao/status formal - e uma ferramenta viva de acompanhamento, atualizada sempre que a situacao dos projetos mudar.</w:t>
+      </w:r>
+    </w:p>
+    <w:p>
+      <w:pPr>
+        <w:pStyle w:val="Ttulo2"/>
+        <w:spacing w:before="320" w:after="120"/>
+        <w:rPr>
+          <w:rFonts w:ascii="Montserrat" w:hAnsi="Montserrat"/>
+          <w:b/>
+          <w:color w:val="B91D2E"/>
+          <w:sz w:val="27"/>
+        </w:rPr>
+      </w:pPr>
+      <w:bookmarkStart w:id="26" w:name="_Toc236511123"/>
+      <w:r>
+        <w:rPr>
+          <w:rFonts w:ascii="Montserrat" w:hAnsi="Montserrat"/>
+          <w:b/>
+          <w:color w:val="B91D2E"/>
+          <w:sz w:val="27"/>
+        </w:rPr>
+        <w:t>4.2 Relatorio de Entregas e Beneficios (FORALF12)</w:t>
+      </w:r>
+      <w:bookmarkEnd w:id="26"/>
+    </w:p>
+    <w:p>
+      <w:pPr>
+        <w:spacing w:line="280" w:lineRule="auto"/>
+        <w:rPr>
+          <w:rFonts w:ascii="Montserrat" w:hAnsi="Montserrat"/>
+          <w:color w:val="1A1A1A"/>
+          <w:sz w:val="22"/>
+        </w:rPr>
+      </w:pPr>
+      <w:r>
+        <w:rPr>
+          <w:rFonts w:ascii="Montserrat" w:hAnsi="Montserrat"/>
+          <w:color w:val="1A1A1A"/>
+          <w:sz w:val="22"/>
+        </w:rPr>
+        <w:t>O relatorio mais importante do ponto de vista de governanca: e sobre ele que ocorre o Gate 2 - Pactuacao, quando o Dono do Negocio assume formalmente, perante a Alta Gestao, o compromisso de que todo o trabalho planejado sera executado.</w:t>
       </w:r>
     </w:p>
     <w:p>
@@ -12237,16 +12285,16 @@
         </w:rPr>
         <w:lastRenderedPageBreak/>
         <w:drawing>
-          <wp:inline distT="0" distB="0" distL="0" distR="0" wp14:anchorId="2B549901" wp14:editId="53BD6310">
+          <wp:inline distT="0" distB="0" distL="0" distR="0" wp14:anchorId="73F753AD" wp14:editId="030CF945">
             <wp:extent cx="5120640" cy="4627581"/>
             <wp:effectExtent l="19050" t="19050" r="22860" b="20955"/>
-            <wp:docPr id="2054547299" name="Imagem 34"/>
+            <wp:docPr id="921193366" name="Imagem 34"/>
             <wp:cNvGraphicFramePr/>
             <a:graphic xmlns:a="http://schemas.openxmlformats.org/drawingml/2006/main">
               <a:graphicData uri="http://schemas.openxmlformats.org/drawingml/2006/picture">
                 <pic:pic xmlns:pic="http://schemas.openxmlformats.org/drawingml/2006/picture">
                   <pic:nvPicPr>
-                    <pic:cNvPr id="2054547299" name=""/>
+                    <pic:cNvPr id="921193366" name=""/>
                     <pic:cNvPicPr/>
                   </pic:nvPicPr>
                   <pic:blipFill>
@@ -12300,6 +12348,83 @@
           <w:color w:val="6A6A70"/>
           <w:sz w:val="19"/>
         </w:rPr>
+        <w:t>Painel do Relatorio de Entregas e Beneficios (estado vazio).</w:t>
+      </w:r>
+    </w:p>
+    <w:p>
+      <w:pPr>
+        <w:spacing w:before="120" w:after="40"/>
+        <w:jc w:val="center"/>
+      </w:pPr>
+      <w:r>
+        <w:rPr>
+          <w:noProof/>
+        </w:rPr>
+        <w:lastRenderedPageBreak/>
+        <w:drawing>
+          <wp:inline distT="0" distB="0" distL="0" distR="0" wp14:anchorId="5FF01478" wp14:editId="089AE60E">
+            <wp:extent cx="5120640" cy="4627581"/>
+            <wp:effectExtent l="19050" t="19050" r="22860" b="20955"/>
+            <wp:docPr id="1757701604" name="Imagem 35"/>
+            <wp:cNvGraphicFramePr/>
+            <a:graphic xmlns:a="http://schemas.openxmlformats.org/drawingml/2006/main">
+              <a:graphicData uri="http://schemas.openxmlformats.org/drawingml/2006/picture">
+                <pic:pic xmlns:pic="http://schemas.openxmlformats.org/drawingml/2006/picture">
+                  <pic:nvPicPr>
+                    <pic:cNvPr id="1757701604" name=""/>
+                    <pic:cNvPicPr/>
+                  </pic:nvPicPr>
+                  <pic:blipFill>
+                    <a:blip r:embed="rId41">
+                      <a:extLst>
+                        <a:ext uri="{28A0092B-C50C-407E-A947-70E740481C1C}">
+                          <a14:useLocalDpi xmlns:a14="http://schemas.microsoft.com/office/drawing/2010/main" val="0"/>
+                        </a:ext>
+                      </a:extLst>
+                    </a:blip>
+                    <a:stretch>
+                      <a:fillRect/>
+                    </a:stretch>
+                  </pic:blipFill>
+                  <pic:spPr>
+                    <a:xfrm>
+                      <a:off x="0" y="0"/>
+                      <a:ext cx="5120640" cy="4627581"/>
+                    </a:xfrm>
+                    <a:prstGeom prst="rect">
+                      <a:avLst/>
+                    </a:prstGeom>
+                    <a:ln w="9525">
+                      <a:solidFill>
+                        <a:srgbClr val="D1D5DB"/>
+                      </a:solidFill>
+                    </a:ln>
+                  </pic:spPr>
+                </pic:pic>
+              </a:graphicData>
+            </a:graphic>
+          </wp:inline>
+        </w:drawing>
+      </w:r>
+    </w:p>
+    <w:p>
+      <w:pPr>
+        <w:spacing w:before="120" w:after="280"/>
+        <w:jc w:val="center"/>
+        <w:rPr>
+          <w:rFonts w:ascii="Montserrat" w:hAnsi="Montserrat"/>
+          <w:i/>
+          <w:color w:val="6A6A70"/>
+          <w:sz w:val="19"/>
+        </w:rPr>
+      </w:pPr>
+      <w:r>
+        <w:rPr>
+          <w:rFonts w:ascii="Montserrat" w:hAnsi="Montserrat"/>
+          <w:i/>
+          <w:color w:val="6A6A70"/>
+          <w:sz w:val="19"/>
+        </w:rPr>
         <w:t>Aba Editar dados: Ficha do Programa, o primeiro bloco a preencher.</w:t>
       </w:r>
     </w:p>
@@ -12383,20 +12508,20 @@
         </w:rPr>
         <w:lastRenderedPageBreak/>
         <w:drawing>
-          <wp:inline distT="0" distB="0" distL="0" distR="0" wp14:anchorId="48748D1A" wp14:editId="706CAA72">
+          <wp:inline distT="0" distB="0" distL="0" distR="0" wp14:anchorId="1B60A27A" wp14:editId="4C147EA1">
             <wp:extent cx="5120640" cy="2144319"/>
             <wp:effectExtent l="19050" t="19050" r="22860" b="27940"/>
-            <wp:docPr id="659380280" name="Imagem 35"/>
+            <wp:docPr id="1690166023" name="Imagem 36"/>
             <wp:cNvGraphicFramePr/>
             <a:graphic xmlns:a="http://schemas.openxmlformats.org/drawingml/2006/main">
               <a:graphicData uri="http://schemas.openxmlformats.org/drawingml/2006/picture">
                 <pic:pic xmlns:pic="http://schemas.openxmlformats.org/drawingml/2006/picture">
                   <pic:nvPicPr>
-                    <pic:cNvPr id="659380280" name=""/>
+                    <pic:cNvPr id="1690166023" name=""/>
                     <pic:cNvPicPr/>
                   </pic:nvPicPr>
                   <pic:blipFill>
-                    <a:blip r:embed="rId41">
+                    <a:blip r:embed="rId42">
                       <a:extLst>
                         <a:ext uri="{28A0092B-C50C-407E-A947-70E740481C1C}">
                           <a14:useLocalDpi xmlns:a14="http://schemas.microsoft.com/office/drawing/2010/main" val="0"/>
@@ -12480,20 +12605,20 @@
           <w:noProof/>
         </w:rPr>
         <w:drawing>
-          <wp:inline distT="0" distB="0" distL="0" distR="0" wp14:anchorId="01E5F40D" wp14:editId="5E77F4BE">
+          <wp:inline distT="0" distB="0" distL="0" distR="0" wp14:anchorId="045A2235" wp14:editId="571AF9F0">
             <wp:extent cx="5120640" cy="1055647"/>
             <wp:effectExtent l="19050" t="19050" r="22860" b="11430"/>
-            <wp:docPr id="788873508" name="Imagem 36"/>
+            <wp:docPr id="1750319268" name="Imagem 37"/>
             <wp:cNvGraphicFramePr/>
             <a:graphic xmlns:a="http://schemas.openxmlformats.org/drawingml/2006/main">
               <a:graphicData uri="http://schemas.openxmlformats.org/drawingml/2006/picture">
                 <pic:pic xmlns:pic="http://schemas.openxmlformats.org/drawingml/2006/picture">
                   <pic:nvPicPr>
-                    <pic:cNvPr id="788873508" name=""/>
+                    <pic:cNvPr id="1750319268" name=""/>
                     <pic:cNvPicPr/>
                   </pic:nvPicPr>
                   <pic:blipFill>
-                    <a:blip r:embed="rId42">
+                    <a:blip r:embed="rId43">
                       <a:extLst>
                         <a:ext uri="{28A0092B-C50C-407E-A947-70E740481C1C}">
                           <a14:useLocalDpi xmlns:a14="http://schemas.microsoft.com/office/drawing/2010/main" val="0"/>
@@ -12602,20 +12727,20 @@
         </w:rPr>
         <w:lastRenderedPageBreak/>
         <w:drawing>
-          <wp:inline distT="0" distB="0" distL="0" distR="0" wp14:anchorId="555E9D77" wp14:editId="7BBE471F">
+          <wp:inline distT="0" distB="0" distL="0" distR="0" wp14:anchorId="29CFC777" wp14:editId="4E2F8FD7">
             <wp:extent cx="5120640" cy="3282818"/>
             <wp:effectExtent l="19050" t="19050" r="22860" b="13335"/>
-            <wp:docPr id="2075338445" name="Imagem 37"/>
+            <wp:docPr id="616034951" name="Imagem 38"/>
             <wp:cNvGraphicFramePr/>
             <a:graphic xmlns:a="http://schemas.openxmlformats.org/drawingml/2006/main">
               <a:graphicData uri="http://schemas.openxmlformats.org/drawingml/2006/picture">
                 <pic:pic xmlns:pic="http://schemas.openxmlformats.org/drawingml/2006/picture">
                   <pic:nvPicPr>
-                    <pic:cNvPr id="2075338445" name=""/>
+                    <pic:cNvPr id="616034951" name=""/>
                     <pic:cNvPicPr/>
                   </pic:nvPicPr>
                   <pic:blipFill>
-                    <a:blip r:embed="rId43">
+                    <a:blip r:embed="rId44">
                       <a:extLst>
                         <a:ext uri="{28A0092B-C50C-407E-A947-70E740481C1C}">
                           <a14:useLocalDpi xmlns:a14="http://schemas.microsoft.com/office/drawing/2010/main" val="0"/>
@@ -12691,107 +12816,47 @@
     </w:p>
     <w:p>
       <w:pPr>
-        <w:pStyle w:val="Ttulo1"/>
-        <w:pageBreakBefore/>
-        <w:pBdr>
-          <w:bottom w:val="single" w:sz="4" w:space="0" w:color="E4E4E7"/>
-        </w:pBdr>
-        <w:spacing w:before="80" w:after="200"/>
-        <w:rPr>
-          <w:rFonts w:ascii="Montserrat" w:hAnsi="Montserrat"/>
-          <w:b/>
-          <w:color w:val="1A1A1A"/>
-          <w:sz w:val="34"/>
-        </w:rPr>
-      </w:pPr>
-      <w:bookmarkStart w:id="27" w:name="_Toc236292959"/>
-      <w:r>
-        <w:rPr>
-          <w:rFonts w:ascii="Montserrat" w:hAnsi="Montserrat"/>
-          <w:b/>
-          <w:color w:val="1A1A1A"/>
-          <w:sz w:val="34"/>
-        </w:rPr>
-        <w:lastRenderedPageBreak/>
-        <w:t>5. Validador de Projetos</w:t>
-      </w:r>
-      <w:bookmarkEnd w:id="27"/>
-    </w:p>
-    <w:p>
-      <w:pPr>
-        <w:spacing w:line="280" w:lineRule="auto"/>
-        <w:rPr>
-          <w:rFonts w:ascii="Montserrat" w:hAnsi="Montserrat"/>
-          <w:color w:val="1A1A1A"/>
-          <w:sz w:val="22"/>
-        </w:rPr>
-      </w:pPr>
-      <w:r>
-        <w:rPr>
-          <w:rFonts w:ascii="Montserrat" w:hAnsi="Montserrat"/>
-          <w:color w:val="1A1A1A"/>
-          <w:sz w:val="22"/>
-        </w:rPr>
-        <w:t>O Validador de Projetos e uma ferramenta de apoio a decisao sobre Fatores Criticos de Sucesso (FCS) e Beneficios em instituicoes de ensino. Diferente dos 12 formularios de registro, ele nao gera um artefato FORALF - e um painel de reflexao e diagnostico.</w:t>
-      </w:r>
-    </w:p>
-    <w:p>
-      <w:pPr>
-        <w:spacing w:line="280" w:lineRule="auto"/>
-        <w:rPr>
-          <w:rFonts w:ascii="Montserrat" w:hAnsi="Montserrat"/>
-          <w:color w:val="1A1A1A"/>
-          <w:sz w:val="22"/>
-        </w:rPr>
-      </w:pPr>
-      <w:r>
-        <w:rPr>
-          <w:rFonts w:ascii="Montserrat" w:hAnsi="Montserrat"/>
-          <w:color w:val="1A1A1A"/>
-          <w:sz w:val="22"/>
-        </w:rPr>
-        <w:t>E a unica ferramenta, alem do Mapa de Diretrizes, que nao exige login. Todo o conteudo funciona livremente; login so e pedido para vincular uma avaliacao a um projeto e salvar o veredito no historico daquele projeto (secao 2.6 do documento Regras de Acesso detalha esse caso).</w:t>
-      </w:r>
-    </w:p>
-    <w:p>
-      <w:pPr>
-        <w:pStyle w:val="Ttulo2"/>
-        <w:spacing w:before="320" w:after="120"/>
-        <w:rPr>
-          <w:rFonts w:ascii="Montserrat" w:hAnsi="Montserrat"/>
-          <w:b/>
-          <w:color w:val="B91D2E"/>
-          <w:sz w:val="27"/>
-        </w:rPr>
-      </w:pPr>
-      <w:bookmarkStart w:id="28" w:name="_Toc236292960"/>
-      <w:r>
-        <w:rPr>
-          <w:rFonts w:ascii="Montserrat" w:hAnsi="Montserrat"/>
-          <w:b/>
-          <w:color w:val="B91D2E"/>
-          <w:sz w:val="27"/>
-        </w:rPr>
-        <w:t>5.1 Quadro de conexoes</w:t>
-      </w:r>
-      <w:bookmarkEnd w:id="28"/>
-    </w:p>
-    <w:p>
-      <w:pPr>
-        <w:spacing w:line="280" w:lineRule="auto"/>
-        <w:rPr>
-          <w:rFonts w:ascii="Montserrat" w:hAnsi="Montserrat"/>
-          <w:color w:val="1A1A1A"/>
-          <w:sz w:val="22"/>
-        </w:rPr>
-      </w:pPr>
-      <w:r>
-        <w:rPr>
-          <w:rFonts w:ascii="Montserrat" w:hAnsi="Montserrat"/>
-          <w:color w:val="1A1A1A"/>
-          <w:sz w:val="22"/>
-        </w:rPr>
-        <w:t>Mostra a matriz analitica entre 7 fatores criticos de sucesso (F1-F7) e 5 dimensoes de beneficio (B1-B5). Clique em um fator ou dimensao para ver as conexoes.</w:t>
+        <w:pStyle w:val="PargrafodaLista"/>
+        <w:numPr>
+          <w:ilvl w:val="0"/>
+          <w:numId w:val="16"/>
+        </w:numPr>
+        <w:spacing w:after="80" w:line="260" w:lineRule="auto"/>
+        <w:ind w:left="700"/>
+        <w:rPr>
+          <w:rFonts w:ascii="Montserrat" w:hAnsi="Montserrat"/>
+          <w:color w:val="1A1A1A"/>
+          <w:sz w:val="22"/>
+        </w:rPr>
+      </w:pPr>
+      <w:r>
+        <w:rPr>
+          <w:rFonts w:ascii="Montserrat" w:hAnsi="Montserrat"/>
+          <w:color w:val="1A1A1A"/>
+          <w:sz w:val="22"/>
+        </w:rPr>
+        <w:t>No rodape do Painel, o botao Historico de versoes lista todas as vezes que este relatorio foi salvo.</w:t>
+      </w:r>
+    </w:p>
+    <w:p>
+      <w:pPr>
+        <w:spacing w:before="160" w:after="200"/>
+        <w:ind w:left="283"/>
+        <w:rPr>
+          <w:rFonts w:ascii="Montserrat" w:hAnsi="Montserrat"/>
+          <w:i/>
+          <w:color w:val="6A6A70"/>
+          <w:sz w:val="21"/>
+        </w:rPr>
+      </w:pPr>
+      <w:r>
+        <w:rPr>
+          <w:rFonts w:ascii="Montserrat" w:hAnsi="Montserrat"/>
+          <w:i/>
+          <w:color w:val="6A6A70"/>
+          <w:sz w:val="21"/>
+        </w:rPr>
+        <w:t>Versionamento: assim como no Relatorio de Situacao (secao 4.1), toda vez que este relatorio e salvo, uma copia completa fica arquivada com data/hora e quem salvou - util para reconstituir o programa como ele estava em uma pactuacao (Gate 2) anterior. Clicar em Visualizar numa versao antiga mostra o mesmo aviso de somente leitura e bloqueia a edicao ate voltar a versao atual.</w:t>
       </w:r>
     </w:p>
     <w:p>
@@ -12804,134 +12869,16 @@
           <w:noProof/>
         </w:rPr>
         <w:drawing>
-          <wp:inline distT="0" distB="0" distL="0" distR="0" wp14:anchorId="68F089F8" wp14:editId="5CDEBEF4">
-            <wp:extent cx="5303520" cy="4792851"/>
-            <wp:effectExtent l="19050" t="19050" r="11430" b="27305"/>
-            <wp:docPr id="388351583" name="Imagem 38"/>
+          <wp:inline distT="0" distB="0" distL="0" distR="0" wp14:anchorId="0763DD1D" wp14:editId="05856D00">
+            <wp:extent cx="5120640" cy="1978034"/>
+            <wp:effectExtent l="19050" t="19050" r="22860" b="22225"/>
+            <wp:docPr id="82539887" name="Imagem 39"/>
             <wp:cNvGraphicFramePr/>
             <a:graphic xmlns:a="http://schemas.openxmlformats.org/drawingml/2006/main">
               <a:graphicData uri="http://schemas.openxmlformats.org/drawingml/2006/picture">
                 <pic:pic xmlns:pic="http://schemas.openxmlformats.org/drawingml/2006/picture">
                   <pic:nvPicPr>
-                    <pic:cNvPr id="388351583" name=""/>
-                    <pic:cNvPicPr/>
-                  </pic:nvPicPr>
-                  <pic:blipFill>
-                    <a:blip r:embed="rId44">
-                      <a:extLst>
-                        <a:ext uri="{28A0092B-C50C-407E-A947-70E740481C1C}">
-                          <a14:useLocalDpi xmlns:a14="http://schemas.microsoft.com/office/drawing/2010/main" val="0"/>
-                        </a:ext>
-                      </a:extLst>
-                    </a:blip>
-                    <a:stretch>
-                      <a:fillRect/>
-                    </a:stretch>
-                  </pic:blipFill>
-                  <pic:spPr>
-                    <a:xfrm>
-                      <a:off x="0" y="0"/>
-                      <a:ext cx="5303520" cy="4792851"/>
-                    </a:xfrm>
-                    <a:prstGeom prst="rect">
-                      <a:avLst/>
-                    </a:prstGeom>
-                    <a:ln w="9525">
-                      <a:solidFill>
-                        <a:srgbClr val="D1D5DB"/>
-                      </a:solidFill>
-                    </a:ln>
-                  </pic:spPr>
-                </pic:pic>
-              </a:graphicData>
-            </a:graphic>
-          </wp:inline>
-        </w:drawing>
-      </w:r>
-    </w:p>
-    <w:p>
-      <w:pPr>
-        <w:spacing w:before="120" w:after="280"/>
-        <w:jc w:val="center"/>
-        <w:rPr>
-          <w:rFonts w:ascii="Montserrat" w:hAnsi="Montserrat"/>
-          <w:i/>
-          <w:color w:val="6A6A70"/>
-          <w:sz w:val="19"/>
-        </w:rPr>
-      </w:pPr>
-      <w:r>
-        <w:rPr>
-          <w:rFonts w:ascii="Montserrat" w:hAnsi="Montserrat"/>
-          <w:i/>
-          <w:color w:val="6A6A70"/>
-          <w:sz w:val="19"/>
-        </w:rPr>
-        <w:lastRenderedPageBreak/>
-        <w:t>Quadro de conexoes com o fator F1 selecionado - o painel a direita mostra os beneficios que ele habilita.</w:t>
-      </w:r>
-    </w:p>
-    <w:p>
-      <w:pPr>
-        <w:pStyle w:val="Ttulo2"/>
-        <w:spacing w:before="320" w:after="120"/>
-        <w:rPr>
-          <w:rFonts w:ascii="Montserrat" w:hAnsi="Montserrat"/>
-          <w:b/>
-          <w:color w:val="B91D2E"/>
-          <w:sz w:val="27"/>
-        </w:rPr>
-      </w:pPr>
-      <w:bookmarkStart w:id="29" w:name="_Toc236292961"/>
-      <w:r>
-        <w:rPr>
-          <w:rFonts w:ascii="Montserrat" w:hAnsi="Montserrat"/>
-          <w:b/>
-          <w:color w:val="B91D2E"/>
-          <w:sz w:val="27"/>
-        </w:rPr>
-        <w:t>5.2 Simulador - e se...?</w:t>
-      </w:r>
-      <w:bookmarkEnd w:id="29"/>
-    </w:p>
-    <w:p>
-      <w:pPr>
-        <w:spacing w:line="280" w:lineRule="auto"/>
-        <w:rPr>
-          <w:rFonts w:ascii="Montserrat" w:hAnsi="Montserrat"/>
-          <w:color w:val="1A1A1A"/>
-          <w:sz w:val="22"/>
-        </w:rPr>
-      </w:pPr>
-      <w:r>
-        <w:rPr>
-          <w:rFonts w:ascii="Montserrat" w:hAnsi="Montserrat"/>
-          <w:color w:val="1A1A1A"/>
-          <w:sz w:val="22"/>
-        </w:rPr>
-        <w:t>Ajuste o quanto cada fator esta presente no seu projeto (0-100%) e veja o potencial estimado de cada dimensao de beneficio recalcular em tempo real.</w:t>
-      </w:r>
-    </w:p>
-    <w:p>
-      <w:pPr>
-        <w:spacing w:before="120" w:after="40"/>
-        <w:jc w:val="center"/>
-      </w:pPr>
-      <w:r>
-        <w:rPr>
-          <w:noProof/>
-        </w:rPr>
-        <w:drawing>
-          <wp:inline distT="0" distB="0" distL="0" distR="0" wp14:anchorId="3FEDCF22" wp14:editId="5376CEC4">
-            <wp:extent cx="5303520" cy="4792851"/>
-            <wp:effectExtent l="19050" t="19050" r="11430" b="27305"/>
-            <wp:docPr id="1033624833" name="Imagem 39"/>
-            <wp:cNvGraphicFramePr/>
-            <a:graphic xmlns:a="http://schemas.openxmlformats.org/drawingml/2006/main">
-              <a:graphicData uri="http://schemas.openxmlformats.org/drawingml/2006/picture">
-                <pic:pic xmlns:pic="http://schemas.openxmlformats.org/drawingml/2006/picture">
-                  <pic:nvPicPr>
-                    <pic:cNvPr id="1033624833" name=""/>
+                    <pic:cNvPr id="82539887" name=""/>
                     <pic:cNvPicPr/>
                   </pic:nvPicPr>
                   <pic:blipFill>
@@ -12949,7 +12896,7 @@
                   <pic:spPr>
                     <a:xfrm>
                       <a:off x="0" y="0"/>
-                      <a:ext cx="5303520" cy="4792851"/>
+                      <a:ext cx="5120640" cy="1978034"/>
                     </a:xfrm>
                     <a:prstGeom prst="rect">
                       <a:avLst/>
@@ -12985,7 +12932,72 @@
           <w:color w:val="6A6A70"/>
           <w:sz w:val="19"/>
         </w:rPr>
-        <w:t>Simulador de fatores x beneficios. Abaixo dele, o aviso de login para quem quiser vincular a um projeto.</w:t>
+        <w:lastRenderedPageBreak/>
+        <w:t>Lista de versoes salvas do Relatorio de Entregas, com data, programa e quem salvou.</w:t>
+      </w:r>
+    </w:p>
+    <w:p>
+      <w:pPr>
+        <w:pStyle w:val="Ttulo1"/>
+        <w:pageBreakBefore/>
+        <w:pBdr>
+          <w:bottom w:val="single" w:sz="4" w:space="0" w:color="E4E4E7"/>
+        </w:pBdr>
+        <w:spacing w:before="80" w:after="200"/>
+        <w:rPr>
+          <w:rFonts w:ascii="Montserrat" w:hAnsi="Montserrat"/>
+          <w:b/>
+          <w:color w:val="1A1A1A"/>
+          <w:sz w:val="34"/>
+        </w:rPr>
+      </w:pPr>
+      <w:bookmarkStart w:id="27" w:name="_Toc236511124"/>
+      <w:r>
+        <w:rPr>
+          <w:rFonts w:ascii="Montserrat" w:hAnsi="Montserrat"/>
+          <w:b/>
+          <w:color w:val="1A1A1A"/>
+          <w:sz w:val="34"/>
+        </w:rPr>
+        <w:lastRenderedPageBreak/>
+        <w:t>5. Validador de Projetos</w:t>
+      </w:r>
+      <w:bookmarkEnd w:id="27"/>
+    </w:p>
+    <w:p>
+      <w:pPr>
+        <w:spacing w:line="280" w:lineRule="auto"/>
+        <w:rPr>
+          <w:rFonts w:ascii="Montserrat" w:hAnsi="Montserrat"/>
+          <w:color w:val="1A1A1A"/>
+          <w:sz w:val="22"/>
+        </w:rPr>
+      </w:pPr>
+      <w:r>
+        <w:rPr>
+          <w:rFonts w:ascii="Montserrat" w:hAnsi="Montserrat"/>
+          <w:color w:val="1A1A1A"/>
+          <w:sz w:val="22"/>
+        </w:rPr>
+        <w:t>O Validador de Projetos e uma ferramenta de apoio a decisao sobre Fatores Criticos de Sucesso (FCS) e Beneficios em instituicoes de ensino. Diferente dos 12 formularios de registro, ele nao gera um artefato FORALF - e um painel de reflexao e diagnostico.</w:t>
+      </w:r>
+    </w:p>
+    <w:p>
+      <w:pPr>
+        <w:spacing w:line="280" w:lineRule="auto"/>
+        <w:rPr>
+          <w:rFonts w:ascii="Montserrat" w:hAnsi="Montserrat"/>
+          <w:color w:val="1A1A1A"/>
+          <w:sz w:val="22"/>
+        </w:rPr>
+      </w:pPr>
+      <w:r>
+        <w:rPr>
+          <w:rFonts w:ascii="Montserrat" w:hAnsi="Montserrat"/>
+          <w:color w:val="1A1A1A"/>
+          <w:sz w:val="22"/>
+        </w:rPr>
+        <w:t>E a unica ferramenta, alem do Mapa de Diretrizes, que nao exige login. Todo o conteudo funciona livremente; login so e pedido para vincular uma avaliacao a um projeto e salvar o veredito no historico daquele projeto (secao 2.6 do documento Regras de Acesso detalha esse caso).</w:t>
       </w:r>
     </w:p>
     <w:p>
@@ -12999,7 +13011,7 @@
           <w:sz w:val="27"/>
         </w:rPr>
       </w:pPr>
-      <w:bookmarkStart w:id="30" w:name="_Toc236292962"/>
+      <w:bookmarkStart w:id="28" w:name="_Toc236511125"/>
       <w:r>
         <w:rPr>
           <w:rFonts w:ascii="Montserrat" w:hAnsi="Montserrat"/>
@@ -13007,9 +13019,9 @@
           <w:color w:val="B91D2E"/>
           <w:sz w:val="27"/>
         </w:rPr>
-        <w:t>5.3 Assistente de decisao em 8 perguntas</w:t>
-      </w:r>
-      <w:bookmarkEnd w:id="30"/>
+        <w:t>5.1 Quadro de conexoes</w:t>
+      </w:r>
+      <w:bookmarkEnd w:id="28"/>
     </w:p>
     <w:p>
       <w:pPr>
@@ -13026,7 +13038,7 @@
           <w:color w:val="1A1A1A"/>
           <w:sz w:val="22"/>
         </w:rPr>
-        <w:t>Responda a oito perguntas do semaforo de decisao, uma de cada vez. Ao final, o painel devolve um veredito com a regra aplicada.</w:t>
+        <w:t>Mostra a matriz analitica entre 7 fatores criticos de sucesso (F1-F7) e 5 dimensoes de beneficio (B1-B5). Clique em um fator ou dimensao para ver as conexoes.</w:t>
       </w:r>
     </w:p>
     <w:p>
@@ -13038,18 +13050,17 @@
         <w:rPr>
           <w:noProof/>
         </w:rPr>
-        <w:lastRenderedPageBreak/>
         <w:drawing>
-          <wp:inline distT="0" distB="0" distL="0" distR="0" wp14:anchorId="70CB412C" wp14:editId="58965576">
+          <wp:inline distT="0" distB="0" distL="0" distR="0" wp14:anchorId="50D6FB74" wp14:editId="3D28B67F">
             <wp:extent cx="5303520" cy="4792851"/>
             <wp:effectExtent l="19050" t="19050" r="11430" b="27305"/>
-            <wp:docPr id="588523443" name="Imagem 40"/>
+            <wp:docPr id="363052747" name="Imagem 40"/>
             <wp:cNvGraphicFramePr/>
             <a:graphic xmlns:a="http://schemas.openxmlformats.org/drawingml/2006/main">
               <a:graphicData uri="http://schemas.openxmlformats.org/drawingml/2006/picture">
                 <pic:pic xmlns:pic="http://schemas.openxmlformats.org/drawingml/2006/picture">
                   <pic:nvPicPr>
-                    <pic:cNvPr id="588523443" name=""/>
+                    <pic:cNvPr id="363052747" name=""/>
                     <pic:cNvPicPr/>
                   </pic:nvPicPr>
                   <pic:blipFill>
@@ -13103,7 +13114,49 @@
           <w:color w:val="6A6A70"/>
           <w:sz w:val="19"/>
         </w:rPr>
-        <w:t>Primeira pergunta do assistente de decisao.</w:t>
+        <w:lastRenderedPageBreak/>
+        <w:t>Quadro de conexoes com o fator F1 selecionado - o painel a direita mostra os beneficios que ele habilita.</w:t>
+      </w:r>
+    </w:p>
+    <w:p>
+      <w:pPr>
+        <w:pStyle w:val="Ttulo2"/>
+        <w:spacing w:before="320" w:after="120"/>
+        <w:rPr>
+          <w:rFonts w:ascii="Montserrat" w:hAnsi="Montserrat"/>
+          <w:b/>
+          <w:color w:val="B91D2E"/>
+          <w:sz w:val="27"/>
+        </w:rPr>
+      </w:pPr>
+      <w:bookmarkStart w:id="29" w:name="_Toc236511126"/>
+      <w:r>
+        <w:rPr>
+          <w:rFonts w:ascii="Montserrat" w:hAnsi="Montserrat"/>
+          <w:b/>
+          <w:color w:val="B91D2E"/>
+          <w:sz w:val="27"/>
+        </w:rPr>
+        <w:t>5.2 Simulador - e se...?</w:t>
+      </w:r>
+      <w:bookmarkEnd w:id="29"/>
+    </w:p>
+    <w:p>
+      <w:pPr>
+        <w:spacing w:line="280" w:lineRule="auto"/>
+        <w:rPr>
+          <w:rFonts w:ascii="Montserrat" w:hAnsi="Montserrat"/>
+          <w:color w:val="1A1A1A"/>
+          <w:sz w:val="22"/>
+        </w:rPr>
+      </w:pPr>
+      <w:r>
+        <w:rPr>
+          <w:rFonts w:ascii="Montserrat" w:hAnsi="Montserrat"/>
+          <w:color w:val="1A1A1A"/>
+          <w:sz w:val="22"/>
+        </w:rPr>
+        <w:t>Ajuste o quanto cada fator esta presente no seu projeto (0-100%) e veja o potencial estimado de cada dimensao de beneficio recalcular em tempo real.</w:t>
       </w:r>
     </w:p>
     <w:p>
@@ -13115,18 +13168,17 @@
         <w:rPr>
           <w:noProof/>
         </w:rPr>
-        <w:lastRenderedPageBreak/>
         <w:drawing>
-          <wp:inline distT="0" distB="0" distL="0" distR="0" wp14:anchorId="435181A5" wp14:editId="5E4C5083">
+          <wp:inline distT="0" distB="0" distL="0" distR="0" wp14:anchorId="7684348F" wp14:editId="0AAFDC45">
             <wp:extent cx="5303520" cy="4792851"/>
             <wp:effectExtent l="19050" t="19050" r="11430" b="27305"/>
-            <wp:docPr id="565763755" name="Imagem 41"/>
+            <wp:docPr id="1900262563" name="Imagem 41"/>
             <wp:cNvGraphicFramePr/>
             <a:graphic xmlns:a="http://schemas.openxmlformats.org/drawingml/2006/main">
               <a:graphicData uri="http://schemas.openxmlformats.org/drawingml/2006/picture">
                 <pic:pic xmlns:pic="http://schemas.openxmlformats.org/drawingml/2006/picture">
                   <pic:nvPicPr>
-                    <pic:cNvPr id="565763755" name=""/>
+                    <pic:cNvPr id="1900262563" name=""/>
                     <pic:cNvPicPr/>
                   </pic:nvPicPr>
                   <pic:blipFill>
@@ -13180,74 +13232,7 @@
           <w:color w:val="6A6A70"/>
           <w:sz w:val="19"/>
         </w:rPr>
-        <w:t>Veredito final, com o placar de respostas verdes/amarelas/vermelhas.</w:t>
-      </w:r>
-    </w:p>
-    <w:p>
-      <w:pPr>
-        <w:spacing w:before="160" w:after="200"/>
-        <w:ind w:left="283"/>
-        <w:rPr>
-          <w:rFonts w:ascii="Montserrat" w:hAnsi="Montserrat"/>
-          <w:i/>
-          <w:color w:val="6A6A70"/>
-          <w:sz w:val="21"/>
-        </w:rPr>
-      </w:pPr>
-      <w:r>
-        <w:rPr>
-          <w:rFonts w:ascii="Montserrat" w:hAnsi="Montserrat"/>
-          <w:i/>
-          <w:color w:val="6A6A70"/>
-          <w:sz w:val="21"/>
-        </w:rPr>
-        <w:t>Regra aplicada: qualquer resposta vermelha leva a encerrar/repactuar; tres ou mais amarelas levam a replanejar; caso contrario, o veredito e concluir.</w:t>
-      </w:r>
-    </w:p>
-    <w:p>
-      <w:pPr>
-        <w:pStyle w:val="Ttulo1"/>
-        <w:pageBreakBefore/>
-        <w:pBdr>
-          <w:bottom w:val="single" w:sz="4" w:space="0" w:color="E4E4E7"/>
-        </w:pBdr>
-        <w:spacing w:before="80" w:after="200"/>
-        <w:rPr>
-          <w:rFonts w:ascii="Montserrat" w:hAnsi="Montserrat"/>
-          <w:b/>
-          <w:color w:val="1A1A1A"/>
-          <w:sz w:val="34"/>
-        </w:rPr>
-      </w:pPr>
-      <w:bookmarkStart w:id="31" w:name="_Toc236292963"/>
-      <w:r>
-        <w:rPr>
-          <w:rFonts w:ascii="Montserrat" w:hAnsi="Montserrat"/>
-          <w:b/>
-          <w:color w:val="1A1A1A"/>
-          <w:sz w:val="34"/>
-        </w:rPr>
-        <w:lastRenderedPageBreak/>
-        <w:t>6. Administracao do sistema</w:t>
-      </w:r>
-      <w:bookmarkEnd w:id="31"/>
-    </w:p>
-    <w:p>
-      <w:pPr>
-        <w:spacing w:line="280" w:lineRule="auto"/>
-        <w:rPr>
-          <w:rFonts w:ascii="Montserrat" w:hAnsi="Montserrat"/>
-          <w:color w:val="1A1A1A"/>
-          <w:sz w:val="22"/>
-        </w:rPr>
-      </w:pPr>
-      <w:r>
-        <w:rPr>
-          <w:rFonts w:ascii="Montserrat" w:hAnsi="Montserrat"/>
-          <w:color w:val="1A1A1A"/>
-          <w:sz w:val="22"/>
-        </w:rPr>
-        <w:t>Pagina restrita a usuarios com papel Admin (secao 2.3). Reune tres abas: Usuarios, Equipes e Configuracoes.</w:t>
+        <w:t>Simulador de fatores x beneficios. Abaixo dele, o aviso de login para quem quiser vincular a um projeto.</w:t>
       </w:r>
     </w:p>
     <w:p>
@@ -13261,7 +13246,7 @@
           <w:sz w:val="27"/>
         </w:rPr>
       </w:pPr>
-      <w:bookmarkStart w:id="32" w:name="_Toc236292964"/>
+      <w:bookmarkStart w:id="30" w:name="_Toc236511127"/>
       <w:r>
         <w:rPr>
           <w:rFonts w:ascii="Montserrat" w:hAnsi="Montserrat"/>
@@ -13269,9 +13254,9 @@
           <w:color w:val="B91D2E"/>
           <w:sz w:val="27"/>
         </w:rPr>
-        <w:t>6.1 Usuarios</w:t>
-      </w:r>
-      <w:bookmarkEnd w:id="32"/>
+        <w:t>5.3 Assistente de decisao em 8 perguntas</w:t>
+      </w:r>
+      <w:bookmarkEnd w:id="30"/>
     </w:p>
     <w:p>
       <w:pPr>
@@ -13288,7 +13273,7 @@
           <w:color w:val="1A1A1A"/>
           <w:sz w:val="22"/>
         </w:rPr>
-        <w:t>Lista todos os usuarios que ja fizeram login pelo menos uma vez, com o papel atual e um seletor para altera-lo.</w:t>
+        <w:t>Responda a oito perguntas do semaforo de decisao, uma de cada vez. Ao final, o painel devolve um veredito com a regra aplicada.</w:t>
       </w:r>
     </w:p>
     <w:p>
@@ -13300,17 +13285,18 @@
         <w:rPr>
           <w:noProof/>
         </w:rPr>
+        <w:lastRenderedPageBreak/>
         <w:drawing>
-          <wp:inline distT="0" distB="0" distL="0" distR="0" wp14:anchorId="6F92FBE9" wp14:editId="24F66F91">
+          <wp:inline distT="0" distB="0" distL="0" distR="0" wp14:anchorId="478D08C7" wp14:editId="0B295757">
             <wp:extent cx="5303520" cy="4792851"/>
             <wp:effectExtent l="19050" t="19050" r="11430" b="27305"/>
-            <wp:docPr id="1704647471" name="Imagem 42"/>
+            <wp:docPr id="912074100" name="Imagem 42"/>
             <wp:cNvGraphicFramePr/>
             <a:graphic xmlns:a="http://schemas.openxmlformats.org/drawingml/2006/main">
               <a:graphicData uri="http://schemas.openxmlformats.org/drawingml/2006/picture">
                 <pic:pic xmlns:pic="http://schemas.openxmlformats.org/drawingml/2006/picture">
                   <pic:nvPicPr>
-                    <pic:cNvPr id="1704647471" name=""/>
+                    <pic:cNvPr id="912074100" name=""/>
                     <pic:cNvPicPr/>
                   </pic:nvPicPr>
                   <pic:blipFill>
@@ -13364,48 +13350,7 @@
           <w:color w:val="6A6A70"/>
           <w:sz w:val="19"/>
         </w:rPr>
-        <w:t>Aba Usuarios: papel atual e seletor de alteracao de papel por usuario.</w:t>
-      </w:r>
-    </w:p>
-    <w:p>
-      <w:pPr>
-        <w:pStyle w:val="Ttulo2"/>
-        <w:spacing w:before="320" w:after="120"/>
-        <w:rPr>
-          <w:rFonts w:ascii="Montserrat" w:hAnsi="Montserrat"/>
-          <w:b/>
-          <w:color w:val="B91D2E"/>
-          <w:sz w:val="27"/>
-        </w:rPr>
-      </w:pPr>
-      <w:bookmarkStart w:id="33" w:name="_Toc236292965"/>
-      <w:r>
-        <w:rPr>
-          <w:rFonts w:ascii="Montserrat" w:hAnsi="Montserrat"/>
-          <w:b/>
-          <w:color w:val="B91D2E"/>
-          <w:sz w:val="27"/>
-        </w:rPr>
-        <w:t>6.2 Equipes</w:t>
-      </w:r>
-      <w:bookmarkEnd w:id="33"/>
-    </w:p>
-    <w:p>
-      <w:pPr>
-        <w:spacing w:line="280" w:lineRule="auto"/>
-        <w:rPr>
-          <w:rFonts w:ascii="Montserrat" w:hAnsi="Montserrat"/>
-          <w:color w:val="1A1A1A"/>
-          <w:sz w:val="22"/>
-        </w:rPr>
-      </w:pPr>
-      <w:r>
-        <w:rPr>
-          <w:rFonts w:ascii="Montserrat" w:hAnsi="Montserrat"/>
-          <w:color w:val="1A1A1A"/>
-          <w:sz w:val="22"/>
-        </w:rPr>
-        <w:t>Define quem faz parte da equipe de cada projeto - a base da restricao por equipe descrita na secao 2.5. Selecione um projeto, escolha um papel e clique em + Adicionar a equipe.</w:t>
+        <w:t>Primeira pergunta do assistente de decisao.</w:t>
       </w:r>
     </w:p>
     <w:p>
@@ -13419,16 +13364,16 @@
         </w:rPr>
         <w:lastRenderedPageBreak/>
         <w:drawing>
-          <wp:inline distT="0" distB="0" distL="0" distR="0" wp14:anchorId="0B0CA78F" wp14:editId="6EEACC5B">
+          <wp:inline distT="0" distB="0" distL="0" distR="0" wp14:anchorId="19675495" wp14:editId="4FC567C9">
             <wp:extent cx="5303520" cy="4792851"/>
             <wp:effectExtent l="19050" t="19050" r="11430" b="27305"/>
-            <wp:docPr id="1324566855" name="Imagem 43"/>
+            <wp:docPr id="1753261299" name="Imagem 43"/>
             <wp:cNvGraphicFramePr/>
             <a:graphic xmlns:a="http://schemas.openxmlformats.org/drawingml/2006/main">
               <a:graphicData uri="http://schemas.openxmlformats.org/drawingml/2006/picture">
                 <pic:pic xmlns:pic="http://schemas.openxmlformats.org/drawingml/2006/picture">
                   <pic:nvPicPr>
-                    <pic:cNvPr id="1324566855" name=""/>
+                    <pic:cNvPr id="1753261299" name=""/>
                     <pic:cNvPicPr/>
                   </pic:nvPicPr>
                   <pic:blipFill>
@@ -13482,7 +13427,74 @@
           <w:color w:val="6A6A70"/>
           <w:sz w:val="19"/>
         </w:rPr>
-        <w:t>Aba Equipes, com um projeto selecionado e um membro ja cadastrado.</w:t>
+        <w:t>Veredito final, com o placar de respostas verdes/amarelas/vermelhas.</w:t>
+      </w:r>
+    </w:p>
+    <w:p>
+      <w:pPr>
+        <w:spacing w:before="160" w:after="200"/>
+        <w:ind w:left="283"/>
+        <w:rPr>
+          <w:rFonts w:ascii="Montserrat" w:hAnsi="Montserrat"/>
+          <w:i/>
+          <w:color w:val="6A6A70"/>
+          <w:sz w:val="21"/>
+        </w:rPr>
+      </w:pPr>
+      <w:r>
+        <w:rPr>
+          <w:rFonts w:ascii="Montserrat" w:hAnsi="Montserrat"/>
+          <w:i/>
+          <w:color w:val="6A6A70"/>
+          <w:sz w:val="21"/>
+        </w:rPr>
+        <w:t>Regra aplicada: qualquer resposta vermelha leva a encerrar/repactuar; tres ou mais amarelas levam a replanejar; caso contrario, o veredito e concluir.</w:t>
+      </w:r>
+    </w:p>
+    <w:p>
+      <w:pPr>
+        <w:pStyle w:val="Ttulo1"/>
+        <w:pageBreakBefore/>
+        <w:pBdr>
+          <w:bottom w:val="single" w:sz="4" w:space="0" w:color="E4E4E7"/>
+        </w:pBdr>
+        <w:spacing w:before="80" w:after="200"/>
+        <w:rPr>
+          <w:rFonts w:ascii="Montserrat" w:hAnsi="Montserrat"/>
+          <w:b/>
+          <w:color w:val="1A1A1A"/>
+          <w:sz w:val="34"/>
+        </w:rPr>
+      </w:pPr>
+      <w:bookmarkStart w:id="31" w:name="_Toc236511128"/>
+      <w:r>
+        <w:rPr>
+          <w:rFonts w:ascii="Montserrat" w:hAnsi="Montserrat"/>
+          <w:b/>
+          <w:color w:val="1A1A1A"/>
+          <w:sz w:val="34"/>
+        </w:rPr>
+        <w:lastRenderedPageBreak/>
+        <w:t>6. Administracao do sistema</w:t>
+      </w:r>
+      <w:bookmarkEnd w:id="31"/>
+    </w:p>
+    <w:p>
+      <w:pPr>
+        <w:spacing w:line="280" w:lineRule="auto"/>
+        <w:rPr>
+          <w:rFonts w:ascii="Montserrat" w:hAnsi="Montserrat"/>
+          <w:color w:val="1A1A1A"/>
+          <w:sz w:val="22"/>
+        </w:rPr>
+      </w:pPr>
+      <w:r>
+        <w:rPr>
+          <w:rFonts w:ascii="Montserrat" w:hAnsi="Montserrat"/>
+          <w:color w:val="1A1A1A"/>
+          <w:sz w:val="22"/>
+        </w:rPr>
+        <w:t>Pagina restrita a usuarios com papel Admin (secao 2.3). Reune tres abas: Usuarios, Equipes e Configuracoes.</w:t>
       </w:r>
     </w:p>
     <w:p>
@@ -13496,7 +13508,7 @@
           <w:sz w:val="27"/>
         </w:rPr>
       </w:pPr>
-      <w:bookmarkStart w:id="34" w:name="_Toc236292966"/>
+      <w:bookmarkStart w:id="32" w:name="_Toc236511129"/>
       <w:r>
         <w:rPr>
           <w:rFonts w:ascii="Montserrat" w:hAnsi="Montserrat"/>
@@ -13504,9 +13516,9 @@
           <w:color w:val="B91D2E"/>
           <w:sz w:val="27"/>
         </w:rPr>
-        <w:t>6.3 Configuracoes</w:t>
-      </w:r>
-      <w:bookmarkEnd w:id="34"/>
+        <w:t>6.1 Usuarios</w:t>
+      </w:r>
+      <w:bookmarkEnd w:id="32"/>
     </w:p>
     <w:p>
       <w:pPr>
@@ -13523,7 +13535,7 @@
           <w:color w:val="1A1A1A"/>
           <w:sz w:val="22"/>
         </w:rPr>
-        <w:t>Controla os dois interruptores de acesso sem login (Solicitacao de Demanda e Ata de Reuniao), descritos na secao 2.6.</w:t>
+        <w:t>Lista todos os usuarios que ja fizeram login pelo menos uma vez, com o papel atual e um seletor para altera-lo.</w:t>
       </w:r>
     </w:p>
     <w:p>
@@ -13535,18 +13547,17 @@
         <w:rPr>
           <w:noProof/>
         </w:rPr>
-        <w:lastRenderedPageBreak/>
         <w:drawing>
-          <wp:inline distT="0" distB="0" distL="0" distR="0" wp14:anchorId="1086738F" wp14:editId="3C6077B5">
+          <wp:inline distT="0" distB="0" distL="0" distR="0" wp14:anchorId="6C6002F8" wp14:editId="6EF65FC6">
             <wp:extent cx="5303520" cy="4792851"/>
             <wp:effectExtent l="19050" t="19050" r="11430" b="27305"/>
-            <wp:docPr id="2083797839" name="Imagem 44"/>
+            <wp:docPr id="1338903026" name="Imagem 44"/>
             <wp:cNvGraphicFramePr/>
             <a:graphic xmlns:a="http://schemas.openxmlformats.org/drawingml/2006/main">
               <a:graphicData uri="http://schemas.openxmlformats.org/drawingml/2006/picture">
                 <pic:pic xmlns:pic="http://schemas.openxmlformats.org/drawingml/2006/picture">
                   <pic:nvPicPr>
-                    <pic:cNvPr id="2083797839" name=""/>
+                    <pic:cNvPr id="1338903026" name=""/>
                     <pic:cNvPicPr/>
                   </pic:nvPicPr>
                   <pic:blipFill>
@@ -13600,6 +13611,242 @@
           <w:color w:val="6A6A70"/>
           <w:sz w:val="19"/>
         </w:rPr>
+        <w:t>Aba Usuarios: papel atual e seletor de alteracao de papel por usuario.</w:t>
+      </w:r>
+    </w:p>
+    <w:p>
+      <w:pPr>
+        <w:pStyle w:val="Ttulo2"/>
+        <w:spacing w:before="320" w:after="120"/>
+        <w:rPr>
+          <w:rFonts w:ascii="Montserrat" w:hAnsi="Montserrat"/>
+          <w:b/>
+          <w:color w:val="B91D2E"/>
+          <w:sz w:val="27"/>
+        </w:rPr>
+      </w:pPr>
+      <w:bookmarkStart w:id="33" w:name="_Toc236511130"/>
+      <w:r>
+        <w:rPr>
+          <w:rFonts w:ascii="Montserrat" w:hAnsi="Montserrat"/>
+          <w:b/>
+          <w:color w:val="B91D2E"/>
+          <w:sz w:val="27"/>
+        </w:rPr>
+        <w:t>6.2 Equipes</w:t>
+      </w:r>
+      <w:bookmarkEnd w:id="33"/>
+    </w:p>
+    <w:p>
+      <w:pPr>
+        <w:spacing w:line="280" w:lineRule="auto"/>
+        <w:rPr>
+          <w:rFonts w:ascii="Montserrat" w:hAnsi="Montserrat"/>
+          <w:color w:val="1A1A1A"/>
+          <w:sz w:val="22"/>
+        </w:rPr>
+      </w:pPr>
+      <w:r>
+        <w:rPr>
+          <w:rFonts w:ascii="Montserrat" w:hAnsi="Montserrat"/>
+          <w:color w:val="1A1A1A"/>
+          <w:sz w:val="22"/>
+        </w:rPr>
+        <w:t>Define quem faz parte da equipe de cada projeto - a base da restricao por equipe descrita na secao 2.5. Selecione um projeto, escolha um papel e clique em + Adicionar a equipe.</w:t>
+      </w:r>
+    </w:p>
+    <w:p>
+      <w:pPr>
+        <w:spacing w:before="120" w:after="40"/>
+        <w:jc w:val="center"/>
+      </w:pPr>
+      <w:r>
+        <w:rPr>
+          <w:noProof/>
+        </w:rPr>
+        <w:lastRenderedPageBreak/>
+        <w:drawing>
+          <wp:inline distT="0" distB="0" distL="0" distR="0" wp14:anchorId="7B01DCE8" wp14:editId="6AF06448">
+            <wp:extent cx="5303520" cy="4792851"/>
+            <wp:effectExtent l="19050" t="19050" r="11430" b="27305"/>
+            <wp:docPr id="330431392" name="Imagem 45"/>
+            <wp:cNvGraphicFramePr/>
+            <a:graphic xmlns:a="http://schemas.openxmlformats.org/drawingml/2006/main">
+              <a:graphicData uri="http://schemas.openxmlformats.org/drawingml/2006/picture">
+                <pic:pic xmlns:pic="http://schemas.openxmlformats.org/drawingml/2006/picture">
+                  <pic:nvPicPr>
+                    <pic:cNvPr id="330431392" name=""/>
+                    <pic:cNvPicPr/>
+                  </pic:nvPicPr>
+                  <pic:blipFill>
+                    <a:blip r:embed="rId51">
+                      <a:extLst>
+                        <a:ext uri="{28A0092B-C50C-407E-A947-70E740481C1C}">
+                          <a14:useLocalDpi xmlns:a14="http://schemas.microsoft.com/office/drawing/2010/main" val="0"/>
+                        </a:ext>
+                      </a:extLst>
+                    </a:blip>
+                    <a:stretch>
+                      <a:fillRect/>
+                    </a:stretch>
+                  </pic:blipFill>
+                  <pic:spPr>
+                    <a:xfrm>
+                      <a:off x="0" y="0"/>
+                      <a:ext cx="5303520" cy="4792851"/>
+                    </a:xfrm>
+                    <a:prstGeom prst="rect">
+                      <a:avLst/>
+                    </a:prstGeom>
+                    <a:ln w="9525">
+                      <a:solidFill>
+                        <a:srgbClr val="D1D5DB"/>
+                      </a:solidFill>
+                    </a:ln>
+                  </pic:spPr>
+                </pic:pic>
+              </a:graphicData>
+            </a:graphic>
+          </wp:inline>
+        </w:drawing>
+      </w:r>
+    </w:p>
+    <w:p>
+      <w:pPr>
+        <w:spacing w:before="120" w:after="280"/>
+        <w:jc w:val="center"/>
+        <w:rPr>
+          <w:rFonts w:ascii="Montserrat" w:hAnsi="Montserrat"/>
+          <w:i/>
+          <w:color w:val="6A6A70"/>
+          <w:sz w:val="19"/>
+        </w:rPr>
+      </w:pPr>
+      <w:r>
+        <w:rPr>
+          <w:rFonts w:ascii="Montserrat" w:hAnsi="Montserrat"/>
+          <w:i/>
+          <w:color w:val="6A6A70"/>
+          <w:sz w:val="19"/>
+        </w:rPr>
+        <w:t>Aba Equipes, com um projeto selecionado e um membro ja cadastrado.</w:t>
+      </w:r>
+    </w:p>
+    <w:p>
+      <w:pPr>
+        <w:pStyle w:val="Ttulo2"/>
+        <w:spacing w:before="320" w:after="120"/>
+        <w:rPr>
+          <w:rFonts w:ascii="Montserrat" w:hAnsi="Montserrat"/>
+          <w:b/>
+          <w:color w:val="B91D2E"/>
+          <w:sz w:val="27"/>
+        </w:rPr>
+      </w:pPr>
+      <w:bookmarkStart w:id="34" w:name="_Toc236511131"/>
+      <w:r>
+        <w:rPr>
+          <w:rFonts w:ascii="Montserrat" w:hAnsi="Montserrat"/>
+          <w:b/>
+          <w:color w:val="B91D2E"/>
+          <w:sz w:val="27"/>
+        </w:rPr>
+        <w:t>6.3 Configuracoes</w:t>
+      </w:r>
+      <w:bookmarkEnd w:id="34"/>
+    </w:p>
+    <w:p>
+      <w:pPr>
+        <w:spacing w:line="280" w:lineRule="auto"/>
+        <w:rPr>
+          <w:rFonts w:ascii="Montserrat" w:hAnsi="Montserrat"/>
+          <w:color w:val="1A1A1A"/>
+          <w:sz w:val="22"/>
+        </w:rPr>
+      </w:pPr>
+      <w:r>
+        <w:rPr>
+          <w:rFonts w:ascii="Montserrat" w:hAnsi="Montserrat"/>
+          <w:color w:val="1A1A1A"/>
+          <w:sz w:val="22"/>
+        </w:rPr>
+        <w:t>Controla os dois interruptores de acesso sem login (Solicitacao de Demanda e Ata de Reuniao), descritos na secao 2.6.</w:t>
+      </w:r>
+    </w:p>
+    <w:p>
+      <w:pPr>
+        <w:spacing w:before="120" w:after="40"/>
+        <w:jc w:val="center"/>
+      </w:pPr>
+      <w:r>
+        <w:rPr>
+          <w:noProof/>
+        </w:rPr>
+        <w:lastRenderedPageBreak/>
+        <w:drawing>
+          <wp:inline distT="0" distB="0" distL="0" distR="0" wp14:anchorId="3D7EC2AB" wp14:editId="58451934">
+            <wp:extent cx="5303520" cy="4792851"/>
+            <wp:effectExtent l="19050" t="19050" r="11430" b="27305"/>
+            <wp:docPr id="1537532181" name="Imagem 46"/>
+            <wp:cNvGraphicFramePr/>
+            <a:graphic xmlns:a="http://schemas.openxmlformats.org/drawingml/2006/main">
+              <a:graphicData uri="http://schemas.openxmlformats.org/drawingml/2006/picture">
+                <pic:pic xmlns:pic="http://schemas.openxmlformats.org/drawingml/2006/picture">
+                  <pic:nvPicPr>
+                    <pic:cNvPr id="1537532181" name=""/>
+                    <pic:cNvPicPr/>
+                  </pic:nvPicPr>
+                  <pic:blipFill>
+                    <a:blip r:embed="rId52">
+                      <a:extLst>
+                        <a:ext uri="{28A0092B-C50C-407E-A947-70E740481C1C}">
+                          <a14:useLocalDpi xmlns:a14="http://schemas.microsoft.com/office/drawing/2010/main" val="0"/>
+                        </a:ext>
+                      </a:extLst>
+                    </a:blip>
+                    <a:stretch>
+                      <a:fillRect/>
+                    </a:stretch>
+                  </pic:blipFill>
+                  <pic:spPr>
+                    <a:xfrm>
+                      <a:off x="0" y="0"/>
+                      <a:ext cx="5303520" cy="4792851"/>
+                    </a:xfrm>
+                    <a:prstGeom prst="rect">
+                      <a:avLst/>
+                    </a:prstGeom>
+                    <a:ln w="9525">
+                      <a:solidFill>
+                        <a:srgbClr val="D1D5DB"/>
+                      </a:solidFill>
+                    </a:ln>
+                  </pic:spPr>
+                </pic:pic>
+              </a:graphicData>
+            </a:graphic>
+          </wp:inline>
+        </w:drawing>
+      </w:r>
+    </w:p>
+    <w:p>
+      <w:pPr>
+        <w:spacing w:before="120" w:after="280"/>
+        <w:jc w:val="center"/>
+        <w:rPr>
+          <w:rFonts w:ascii="Montserrat" w:hAnsi="Montserrat"/>
+          <w:i/>
+          <w:color w:val="6A6A70"/>
+          <w:sz w:val="19"/>
+        </w:rPr>
+      </w:pPr>
+      <w:r>
+        <w:rPr>
+          <w:rFonts w:ascii="Montserrat" w:hAnsi="Montserrat"/>
+          <w:i/>
+          <w:color w:val="6A6A70"/>
+          <w:sz w:val="19"/>
+        </w:rPr>
         <w:t>Aba Configuracoes: os dois interruptores de acesso sem login, hoje desativados.</w:t>
       </w:r>
     </w:p>
@@ -13618,7 +13865,7 @@
           <w:sz w:val="34"/>
         </w:rPr>
       </w:pPr>
-      <w:bookmarkStart w:id="35" w:name="_Toc236292967"/>
+      <w:bookmarkStart w:id="35" w:name="_Toc236511132"/>
       <w:r>
         <w:rPr>
           <w:rFonts w:ascii="Montserrat" w:hAnsi="Montserrat"/>
@@ -13862,7 +14109,7 @@
           <w:sz w:val="34"/>
         </w:rPr>
       </w:pPr>
-      <w:bookmarkStart w:id="36" w:name="_Toc236292968"/>
+      <w:bookmarkStart w:id="36" w:name="_Toc236511133"/>
       <w:r>
         <w:rPr>
           <w:rFonts w:ascii="Montserrat" w:hAnsi="Montserrat"/>
@@ -15520,12 +15767,12 @@
       </w:pPr>
     </w:p>
     <w:sectPr>
-      <w:headerReference w:type="even" r:id="rId51"/>
-      <w:headerReference w:type="default" r:id="rId52"/>
-      <w:footerReference w:type="even" r:id="rId53"/>
-      <w:footerReference w:type="default" r:id="rId54"/>
-      <w:headerReference w:type="first" r:id="rId55"/>
-      <w:footerReference w:type="first" r:id="rId56"/>
+      <w:headerReference w:type="even" r:id="rId53"/>
+      <w:headerReference w:type="default" r:id="rId54"/>
+      <w:footerReference w:type="even" r:id="rId55"/>
+      <w:footerReference w:type="default" r:id="rId56"/>
+      <w:headerReference w:type="first" r:id="rId57"/>
+      <w:footerReference w:type="first" r:id="rId58"/>
       <w:pgSz w:w="12240" w:h="15840"/>
       <w:pgMar w:top="1417" w:right="1701" w:bottom="1417" w:left="1701" w:header="708" w:footer="708" w:gutter="0"/>
       <w:cols w:space="708"/>
@@ -15684,7 +15931,7 @@
 <file path=word/numbering.xml><?xml version="1.0" encoding="utf-8"?>
 <w:numbering xmlns:wpc="http://schemas.microsoft.com/office/word/2010/wordprocessingCanvas" xmlns:cx="http://schemas.microsoft.com/office/drawing/2014/chartex" xmlns:cx1="http://schemas.microsoft.com/office/drawing/2015/9/8/chartex" xmlns:cx2="http://schemas.microsoft.com/office/drawing/2015/10/21/chartex" xmlns:cx3="http://schemas.microsoft.com/office/drawing/2016/5/9/chartex" xmlns:cx4="http://schemas.microsoft.com/office/drawing/2016/5/10/chartex" xmlns:cx5="http://schemas.microsoft.com/office/drawing/2016/5/11/chartex" xmlns:cx6="http://schemas.microsoft.com/office/drawing/2016/5/12/chartex" xmlns:cx7="http://schemas.microsoft.com/office/drawing/2016/5/13/chartex" xmlns:cx8="http://schemas.microsoft.com/office/drawing/2016/5/14/chartex" xmlns:mc="http://schemas.openxmlformats.org/markup-compatibility/2006" xmlns:aink="http://schemas.microsoft.com/office/drawing/2016/ink" xmlns:am3d="http://schemas.microsoft.com/office/drawing/2017/model3d" xmlns:o="urn:schemas-microsoft-com:office:office" xmlns:oel="http://schemas.microsoft.com/office/2019/extlst" xmlns:r="http://schemas.openxmlformats.org/officeDocument/2006/relationships" xmlns:m="http://schemas.openxmlformats.org/officeDocument/2006/math" xmlns:v="urn:schemas-microsoft-com:vml" xmlns:wp14="http://schemas.microsoft.com/office/word/2010/wordprocessingDrawing" xmlns:wp="http://schemas.openxmlformats.org/drawingml/2006/wordprocessingDrawing" xmlns:w10="urn:schemas-microsoft-com:office:word" xmlns:w="http://schemas.openxmlformats.org/wordprocessingml/2006/main" xmlns:w14="http://schemas.microsoft.com/office/word/2010/wordml" xmlns:w15="http://schemas.microsoft.com/office/word/2012/wordml" xmlns:w16cei="http://schemas.microsoft.com/office/word/2026/wordml/cei" xmlns:w16cex="http://schemas.microsoft.com/office/word/2018/wordml/cex" xmlns:w16cid="http://schemas.microsoft.com/office/word/2016/wordml/cid" xmlns:w16="http://schemas.microsoft.com/office/word/2018/wordml" xmlns:w16du="http://schemas.microsoft.com/office/word/2023/wordml/word16du" xmlns:w16sdtdh="http://schemas.microsoft.com/office/word/2020/wordml/sdtdatahash" xmlns:w16sdtfl="http://schemas.microsoft.com/office/word/2024/wordml/sdtformatlock" xmlns:w16se="http://schemas.microsoft.com/office/word/2015/wordml/symex" xmlns:wpg="http://schemas.microsoft.com/office/word/2010/wordprocessingGroup" xmlns:wpi="http://schemas.microsoft.com/office/word/2010/wordprocessingInk" xmlns:wne="http://schemas.microsoft.com/office/word/2006/wordml" xmlns:wps="http://schemas.microsoft.com/office/word/2010/wordprocessingShape" mc:Ignorable="w14 w15 w16se w16cid w16 w16cex w16sdtdh w16sdtfl w16du wp14">
   <w:abstractNum w:abstractNumId="0" w15:restartNumberingAfterBreak="0">
-    <w:nsid w:val="0F3641D7"/>
+    <w:nsid w:val="08D349CD"/>
     <w:multiLevelType w:val="singleLevel"/>
     <w:tmpl w:val="04160001"/>
     <w:lvl w:ilvl="0">
@@ -15701,7 +15948,7 @@
     </w:lvl>
   </w:abstractNum>
   <w:abstractNum w:abstractNumId="1" w15:restartNumberingAfterBreak="0">
-    <w:nsid w:val="0FAA2424"/>
+    <w:nsid w:val="127D0BCB"/>
     <w:multiLevelType w:val="singleLevel"/>
     <w:tmpl w:val="04160001"/>
     <w:lvl w:ilvl="0">
@@ -15718,7 +15965,7 @@
     </w:lvl>
   </w:abstractNum>
   <w:abstractNum w:abstractNumId="2" w15:restartNumberingAfterBreak="0">
-    <w:nsid w:val="2142118E"/>
+    <w:nsid w:val="1C715332"/>
     <w:multiLevelType w:val="singleLevel"/>
     <w:tmpl w:val="04160001"/>
     <w:lvl w:ilvl="0">
@@ -15735,7 +15982,7 @@
     </w:lvl>
   </w:abstractNum>
   <w:abstractNum w:abstractNumId="3" w15:restartNumberingAfterBreak="0">
-    <w:nsid w:val="271516BC"/>
+    <w:nsid w:val="1F3432C5"/>
     <w:multiLevelType w:val="singleLevel"/>
     <w:tmpl w:val="04160001"/>
     <w:lvl w:ilvl="0">
@@ -15752,7 +15999,7 @@
     </w:lvl>
   </w:abstractNum>
   <w:abstractNum w:abstractNumId="4" w15:restartNumberingAfterBreak="0">
-    <w:nsid w:val="31321684"/>
+    <w:nsid w:val="283D53F2"/>
     <w:multiLevelType w:val="singleLevel"/>
     <w:tmpl w:val="04160001"/>
     <w:lvl w:ilvl="0">
@@ -15769,7 +16016,7 @@
     </w:lvl>
   </w:abstractNum>
   <w:abstractNum w:abstractNumId="5" w15:restartNumberingAfterBreak="0">
-    <w:nsid w:val="381123D2"/>
+    <w:nsid w:val="386952CC"/>
     <w:multiLevelType w:val="singleLevel"/>
     <w:tmpl w:val="04160001"/>
     <w:lvl w:ilvl="0">
@@ -15786,7 +16033,7 @@
     </w:lvl>
   </w:abstractNum>
   <w:abstractNum w:abstractNumId="6" w15:restartNumberingAfterBreak="0">
-    <w:nsid w:val="3E492597"/>
+    <w:nsid w:val="38E26C36"/>
     <w:multiLevelType w:val="singleLevel"/>
     <w:tmpl w:val="04160001"/>
     <w:lvl w:ilvl="0">
@@ -15803,7 +16050,7 @@
     </w:lvl>
   </w:abstractNum>
   <w:abstractNum w:abstractNumId="7" w15:restartNumberingAfterBreak="0">
-    <w:nsid w:val="3F543D9D"/>
+    <w:nsid w:val="43D87C18"/>
     <w:multiLevelType w:val="singleLevel"/>
     <w:tmpl w:val="04160001"/>
     <w:lvl w:ilvl="0">
@@ -15820,7 +16067,7 @@
     </w:lvl>
   </w:abstractNum>
   <w:abstractNum w:abstractNumId="8" w15:restartNumberingAfterBreak="0">
-    <w:nsid w:val="57174DC4"/>
+    <w:nsid w:val="46E626B8"/>
     <w:multiLevelType w:val="singleLevel"/>
     <w:tmpl w:val="04160001"/>
     <w:lvl w:ilvl="0">
@@ -15837,7 +16084,7 @@
     </w:lvl>
   </w:abstractNum>
   <w:abstractNum w:abstractNumId="9" w15:restartNumberingAfterBreak="0">
-    <w:nsid w:val="57C30ED1"/>
+    <w:nsid w:val="48343B13"/>
     <w:multiLevelType w:val="singleLevel"/>
     <w:tmpl w:val="04160001"/>
     <w:lvl w:ilvl="0">
@@ -15854,7 +16101,7 @@
     </w:lvl>
   </w:abstractNum>
   <w:abstractNum w:abstractNumId="10" w15:restartNumberingAfterBreak="0">
-    <w:nsid w:val="5C085B11"/>
+    <w:nsid w:val="4E1672E6"/>
     <w:multiLevelType w:val="singleLevel"/>
     <w:tmpl w:val="04160001"/>
     <w:lvl w:ilvl="0">
@@ -15871,7 +16118,7 @@
     </w:lvl>
   </w:abstractNum>
   <w:abstractNum w:abstractNumId="11" w15:restartNumberingAfterBreak="0">
-    <w:nsid w:val="5FC319C2"/>
+    <w:nsid w:val="5C6B37A9"/>
     <w:multiLevelType w:val="singleLevel"/>
     <w:tmpl w:val="04160001"/>
     <w:lvl w:ilvl="0">
@@ -15888,7 +16135,7 @@
     </w:lvl>
   </w:abstractNum>
   <w:abstractNum w:abstractNumId="12" w15:restartNumberingAfterBreak="0">
-    <w:nsid w:val="7759707F"/>
+    <w:nsid w:val="6BE756C0"/>
     <w:multiLevelType w:val="singleLevel"/>
     <w:tmpl w:val="04160001"/>
     <w:lvl w:ilvl="0">
@@ -15905,7 +16152,7 @@
     </w:lvl>
   </w:abstractNum>
   <w:abstractNum w:abstractNumId="13" w15:restartNumberingAfterBreak="0">
-    <w:nsid w:val="79C01490"/>
+    <w:nsid w:val="77136DC6"/>
     <w:multiLevelType w:val="singleLevel"/>
     <w:tmpl w:val="04160001"/>
     <w:lvl w:ilvl="0">
@@ -15922,7 +16169,7 @@
     </w:lvl>
   </w:abstractNum>
   <w:abstractNum w:abstractNumId="14" w15:restartNumberingAfterBreak="0">
-    <w:nsid w:val="7BA777B8"/>
+    <w:nsid w:val="78DD0166"/>
     <w:multiLevelType w:val="singleLevel"/>
     <w:tmpl w:val="04160001"/>
     <w:lvl w:ilvl="0">
@@ -15939,7 +16186,7 @@
     </w:lvl>
   </w:abstractNum>
   <w:abstractNum w:abstractNumId="15" w15:restartNumberingAfterBreak="0">
-    <w:nsid w:val="7F5E06D5"/>
+    <w:nsid w:val="799643C2"/>
     <w:multiLevelType w:val="singleLevel"/>
     <w:tmpl w:val="04160001"/>
     <w:lvl w:ilvl="0">
@@ -15955,53 +16202,53 @@
       </w:rPr>
     </w:lvl>
   </w:abstractNum>
-  <w:num w:numId="1" w16cid:durableId="2017683231">
+  <w:num w:numId="1" w16cid:durableId="603998475">
+    <w:abstractNumId w:val="12"/>
+  </w:num>
+  <w:num w:numId="2" w16cid:durableId="1885751955">
+    <w:abstractNumId w:val="3"/>
+  </w:num>
+  <w:num w:numId="3" w16cid:durableId="988749318">
+    <w:abstractNumId w:val="14"/>
+  </w:num>
+  <w:num w:numId="4" w16cid:durableId="1695614973">
+    <w:abstractNumId w:val="4"/>
+  </w:num>
+  <w:num w:numId="5" w16cid:durableId="828980209">
+    <w:abstractNumId w:val="11"/>
+  </w:num>
+  <w:num w:numId="6" w16cid:durableId="1893925379">
     <w:abstractNumId w:val="10"/>
   </w:num>
-  <w:num w:numId="2" w16cid:durableId="1322655171">
-    <w:abstractNumId w:val="12"/>
+  <w:num w:numId="7" w16cid:durableId="909659097">
+    <w:abstractNumId w:val="1"/>
   </w:num>
-  <w:num w:numId="3" w16cid:durableId="1283733731">
+  <w:num w:numId="8" w16cid:durableId="1252424605">
+    <w:abstractNumId w:val="0"/>
+  </w:num>
+  <w:num w:numId="9" w16cid:durableId="22902112">
+    <w:abstractNumId w:val="6"/>
+  </w:num>
+  <w:num w:numId="10" w16cid:durableId="1975523279">
     <w:abstractNumId w:val="2"/>
   </w:num>
-  <w:num w:numId="4" w16cid:durableId="524826213">
+  <w:num w:numId="11" w16cid:durableId="314458064">
+    <w:abstractNumId w:val="7"/>
+  </w:num>
+  <w:num w:numId="12" w16cid:durableId="888105281">
+    <w:abstractNumId w:val="5"/>
+  </w:num>
+  <w:num w:numId="13" w16cid:durableId="869994836">
+    <w:abstractNumId w:val="13"/>
+  </w:num>
+  <w:num w:numId="14" w16cid:durableId="1779330957">
+    <w:abstractNumId w:val="8"/>
+  </w:num>
+  <w:num w:numId="15" w16cid:durableId="757559593">
     <w:abstractNumId w:val="15"/>
   </w:num>
-  <w:num w:numId="5" w16cid:durableId="147744239">
+  <w:num w:numId="16" w16cid:durableId="567768740">
     <w:abstractNumId w:val="9"/>
-  </w:num>
-  <w:num w:numId="6" w16cid:durableId="739519196">
-    <w:abstractNumId w:val="13"/>
-  </w:num>
-  <w:num w:numId="7" w16cid:durableId="191455541">
-    <w:abstractNumId w:val="14"/>
-  </w:num>
-  <w:num w:numId="8" w16cid:durableId="964579757">
-    <w:abstractNumId w:val="4"/>
-  </w:num>
-  <w:num w:numId="9" w16cid:durableId="531454342">
-    <w:abstractNumId w:val="6"/>
-  </w:num>
-  <w:num w:numId="10" w16cid:durableId="1673145950">
-    <w:abstractNumId w:val="0"/>
-  </w:num>
-  <w:num w:numId="11" w16cid:durableId="1238710536">
-    <w:abstractNumId w:val="5"/>
-  </w:num>
-  <w:num w:numId="12" w16cid:durableId="1937707524">
-    <w:abstractNumId w:val="11"/>
-  </w:num>
-  <w:num w:numId="13" w16cid:durableId="1261134932">
-    <w:abstractNumId w:val="3"/>
-  </w:num>
-  <w:num w:numId="14" w16cid:durableId="1108155992">
-    <w:abstractNumId w:val="8"/>
-  </w:num>
-  <w:num w:numId="15" w16cid:durableId="1927184043">
-    <w:abstractNumId w:val="7"/>
-  </w:num>
-  <w:num w:numId="16" w16cid:durableId="1688098948">
-    <w:abstractNumId w:val="1"/>
   </w:num>
 </w:numbering>
 </file>
@@ -16414,7 +16661,7 @@
     <w:link w:val="Ttulo1Char"/>
     <w:uiPriority w:val="9"/>
     <w:qFormat/>
-    <w:rsid w:val="00CA3AFE"/>
+    <w:rsid w:val="00F852D0"/>
     <w:pPr>
       <w:keepNext/>
       <w:keepLines/>
@@ -16436,7 +16683,7 @@
     <w:uiPriority w:val="9"/>
     <w:unhideWhenUsed/>
     <w:qFormat/>
-    <w:rsid w:val="00CA3AFE"/>
+    <w:rsid w:val="00F852D0"/>
     <w:pPr>
       <w:keepNext/>
       <w:keepLines/>
@@ -16459,7 +16706,7 @@
     <w:semiHidden/>
     <w:unhideWhenUsed/>
     <w:qFormat/>
-    <w:rsid w:val="00CA3AFE"/>
+    <w:rsid w:val="00F852D0"/>
     <w:pPr>
       <w:keepNext/>
       <w:keepLines/>
@@ -16482,7 +16729,7 @@
     <w:semiHidden/>
     <w:unhideWhenUsed/>
     <w:qFormat/>
-    <w:rsid w:val="00CA3AFE"/>
+    <w:rsid w:val="00F852D0"/>
     <w:pPr>
       <w:keepNext/>
       <w:keepLines/>
@@ -16505,7 +16752,7 @@
     <w:semiHidden/>
     <w:unhideWhenUsed/>
     <w:qFormat/>
-    <w:rsid w:val="00CA3AFE"/>
+    <w:rsid w:val="00F852D0"/>
     <w:pPr>
       <w:keepNext/>
       <w:keepLines/>
@@ -16526,7 +16773,7 @@
     <w:semiHidden/>
     <w:unhideWhenUsed/>
     <w:qFormat/>
-    <w:rsid w:val="00CA3AFE"/>
+    <w:rsid w:val="00F852D0"/>
     <w:pPr>
       <w:keepNext/>
       <w:keepLines/>
@@ -16549,7 +16796,7 @@
     <w:semiHidden/>
     <w:unhideWhenUsed/>
     <w:qFormat/>
-    <w:rsid w:val="00CA3AFE"/>
+    <w:rsid w:val="00F852D0"/>
     <w:pPr>
       <w:keepNext/>
       <w:keepLines/>
@@ -16570,7 +16817,7 @@
     <w:semiHidden/>
     <w:unhideWhenUsed/>
     <w:qFormat/>
-    <w:rsid w:val="00CA3AFE"/>
+    <w:rsid w:val="00F852D0"/>
     <w:pPr>
       <w:keepNext/>
       <w:keepLines/>
@@ -16593,7 +16840,7 @@
     <w:semiHidden/>
     <w:unhideWhenUsed/>
     <w:qFormat/>
-    <w:rsid w:val="00CA3AFE"/>
+    <w:rsid w:val="00F852D0"/>
     <w:pPr>
       <w:keepNext/>
       <w:keepLines/>
@@ -16637,7 +16884,7 @@
     <w:basedOn w:val="Fontepargpadro"/>
     <w:link w:val="Ttulo1"/>
     <w:uiPriority w:val="9"/>
-    <w:rsid w:val="00CA3AFE"/>
+    <w:rsid w:val="00F852D0"/>
     <w:rPr>
       <w:rFonts w:asciiTheme="majorHAnsi" w:eastAsiaTheme="majorEastAsia" w:hAnsiTheme="majorHAnsi" w:cstheme="majorBidi"/>
       <w:color w:val="0F4761" w:themeColor="accent1" w:themeShade="BF"/>
@@ -16650,7 +16897,7 @@
     <w:basedOn w:val="Fontepargpadro"/>
     <w:link w:val="Ttulo2"/>
     <w:uiPriority w:val="9"/>
-    <w:rsid w:val="00CA3AFE"/>
+    <w:rsid w:val="00F852D0"/>
     <w:rPr>
       <w:rFonts w:asciiTheme="majorHAnsi" w:eastAsiaTheme="majorEastAsia" w:hAnsiTheme="majorHAnsi" w:cstheme="majorBidi"/>
       <w:color w:val="0F4761" w:themeColor="accent1" w:themeShade="BF"/>
@@ -16664,7 +16911,7 @@
     <w:link w:val="Ttulo3"/>
     <w:uiPriority w:val="9"/>
     <w:semiHidden/>
-    <w:rsid w:val="00CA3AFE"/>
+    <w:rsid w:val="00F852D0"/>
     <w:rPr>
       <w:rFonts w:eastAsiaTheme="majorEastAsia" w:cstheme="majorBidi"/>
       <w:color w:val="0F4761" w:themeColor="accent1" w:themeShade="BF"/>
@@ -16678,7 +16925,7 @@
     <w:link w:val="Ttulo4"/>
     <w:uiPriority w:val="9"/>
     <w:semiHidden/>
-    <w:rsid w:val="00CA3AFE"/>
+    <w:rsid w:val="00F852D0"/>
     <w:rPr>
       <w:rFonts w:eastAsiaTheme="majorEastAsia" w:cstheme="majorBidi"/>
       <w:i/>
@@ -16692,7 +16939,7 @@
     <w:link w:val="Ttulo5"/>
     <w:uiPriority w:val="9"/>
     <w:semiHidden/>
-    <w:rsid w:val="00CA3AFE"/>
+    <w:rsid w:val="00F852D0"/>
     <w:rPr>
       <w:rFonts w:eastAsiaTheme="majorEastAsia" w:cstheme="majorBidi"/>
       <w:color w:val="0F4761" w:themeColor="accent1" w:themeShade="BF"/>
@@ -16704,7 +16951,7 @@
     <w:link w:val="Ttulo6"/>
     <w:uiPriority w:val="9"/>
     <w:semiHidden/>
-    <w:rsid w:val="00CA3AFE"/>
+    <w:rsid w:val="00F852D0"/>
     <w:rPr>
       <w:rFonts w:eastAsiaTheme="majorEastAsia" w:cstheme="majorBidi"/>
       <w:i/>
@@ -16718,7 +16965,7 @@
     <w:link w:val="Ttulo7"/>
     <w:uiPriority w:val="9"/>
     <w:semiHidden/>
-    <w:rsid w:val="00CA3AFE"/>
+    <w:rsid w:val="00F852D0"/>
     <w:rPr>
       <w:rFonts w:eastAsiaTheme="majorEastAsia" w:cstheme="majorBidi"/>
       <w:color w:val="595959" w:themeColor="text1" w:themeTint="A6"/>
@@ -16730,7 +16977,7 @@
     <w:link w:val="Ttulo8"/>
     <w:uiPriority w:val="9"/>
     <w:semiHidden/>
-    <w:rsid w:val="00CA3AFE"/>
+    <w:rsid w:val="00F852D0"/>
     <w:rPr>
       <w:rFonts w:eastAsiaTheme="majorEastAsia" w:cstheme="majorBidi"/>
       <w:i/>
@@ -16744,7 +16991,7 @@
     <w:link w:val="Ttulo9"/>
     <w:uiPriority w:val="9"/>
     <w:semiHidden/>
-    <w:rsid w:val="00CA3AFE"/>
+    <w:rsid w:val="00F852D0"/>
     <w:rPr>
       <w:rFonts w:eastAsiaTheme="majorEastAsia" w:cstheme="majorBidi"/>
       <w:color w:val="272727" w:themeColor="text1" w:themeTint="D8"/>
@@ -16757,7 +17004,7 @@
     <w:link w:val="TtuloChar"/>
     <w:uiPriority w:val="10"/>
     <w:qFormat/>
-    <w:rsid w:val="00CA3AFE"/>
+    <w:rsid w:val="00F852D0"/>
     <w:pPr>
       <w:spacing w:after="80" w:line="240" w:lineRule="auto"/>
       <w:contextualSpacing/>
@@ -16775,7 +17022,7 @@
     <w:basedOn w:val="Fontepargpadro"/>
     <w:link w:val="Ttulo"/>
     <w:uiPriority w:val="10"/>
-    <w:rsid w:val="00CA3AFE"/>
+    <w:rsid w:val="00F852D0"/>
     <w:rPr>
       <w:rFonts w:asciiTheme="majorHAnsi" w:eastAsiaTheme="majorEastAsia" w:hAnsiTheme="majorHAnsi" w:cstheme="majorBidi"/>
       <w:spacing w:val="-10"/>
@@ -16791,7 +17038,7 @@
     <w:link w:val="SubttuloChar"/>
     <w:uiPriority w:val="11"/>
     <w:qFormat/>
-    <w:rsid w:val="00CA3AFE"/>
+    <w:rsid w:val="00F852D0"/>
     <w:pPr>
       <w:numPr>
         <w:ilvl w:val="1"/>
@@ -16810,7 +17057,7 @@
     <w:basedOn w:val="Fontepargpadro"/>
     <w:link w:val="Subttulo"/>
     <w:uiPriority w:val="11"/>
-    <w:rsid w:val="00CA3AFE"/>
+    <w:rsid w:val="00F852D0"/>
     <w:rPr>
       <w:rFonts w:eastAsiaTheme="majorEastAsia" w:cstheme="majorBidi"/>
       <w:color w:val="595959" w:themeColor="text1" w:themeTint="A6"/>
@@ -16826,7 +17073,7 @@
     <w:link w:val="CitaoChar"/>
     <w:uiPriority w:val="29"/>
     <w:qFormat/>
-    <w:rsid w:val="00CA3AFE"/>
+    <w:rsid w:val="00F852D0"/>
     <w:pPr>
       <w:spacing w:before="160"/>
       <w:jc w:val="center"/>
@@ -16842,7 +17089,7 @@
     <w:basedOn w:val="Fontepargpadro"/>
     <w:link w:val="Citao"/>
     <w:uiPriority w:val="29"/>
-    <w:rsid w:val="00CA3AFE"/>
+    <w:rsid w:val="00F852D0"/>
     <w:rPr>
       <w:i/>
       <w:iCs/>
@@ -16854,7 +17101,7 @@
     <w:basedOn w:val="Normal"/>
     <w:uiPriority w:val="34"/>
     <w:qFormat/>
-    <w:rsid w:val="00CA3AFE"/>
+    <w:rsid w:val="00F852D0"/>
     <w:pPr>
       <w:ind w:left="720"/>
       <w:contextualSpacing/>
@@ -16865,7 +17112,7 @@
     <w:basedOn w:val="Fontepargpadro"/>
     <w:uiPriority w:val="21"/>
     <w:qFormat/>
-    <w:rsid w:val="00CA3AFE"/>
+    <w:rsid w:val="00F852D0"/>
     <w:rPr>
       <w:i/>
       <w:iCs/>
@@ -16879,7 +17126,7 @@
     <w:link w:val="CitaoIntensaChar"/>
     <w:uiPriority w:val="30"/>
     <w:qFormat/>
-    <w:rsid w:val="00CA3AFE"/>
+    <w:rsid w:val="00F852D0"/>
     <w:pPr>
       <w:pBdr>
         <w:top w:val="single" w:sz="4" w:space="10" w:color="0F4761" w:themeColor="accent1" w:themeShade="BF"/>
@@ -16900,7 +17147,7 @@
     <w:basedOn w:val="Fontepargpadro"/>
     <w:link w:val="CitaoIntensa"/>
     <w:uiPriority w:val="30"/>
-    <w:rsid w:val="00CA3AFE"/>
+    <w:rsid w:val="00F852D0"/>
     <w:rPr>
       <w:i/>
       <w:iCs/>
@@ -16912,7 +17159,7 @@
     <w:basedOn w:val="Fontepargpadro"/>
     <w:uiPriority w:val="32"/>
     <w:qFormat/>
-    <w:rsid w:val="00CA3AFE"/>
+    <w:rsid w:val="00F852D0"/>
     <w:rPr>
       <w:b/>
       <w:bCs/>
@@ -16927,7 +17174,7 @@
     <w:link w:val="CabealhoChar"/>
     <w:uiPriority w:val="99"/>
     <w:unhideWhenUsed/>
-    <w:rsid w:val="00CA3AFE"/>
+    <w:rsid w:val="00F852D0"/>
     <w:pPr>
       <w:tabs>
         <w:tab w:val="center" w:pos="4252"/>
@@ -16941,7 +17188,7 @@
     <w:basedOn w:val="Fontepargpadro"/>
     <w:link w:val="Cabealho"/>
     <w:uiPriority w:val="99"/>
-    <w:rsid w:val="00CA3AFE"/>
+    <w:rsid w:val="00F852D0"/>
   </w:style>
   <w:style w:type="paragraph" w:styleId="Rodap">
     <w:name w:val="footer"/>
@@ -16949,7 +17196,7 @@
     <w:link w:val="RodapChar"/>
     <w:uiPriority w:val="99"/>
     <w:unhideWhenUsed/>
-    <w:rsid w:val="00CA3AFE"/>
+    <w:rsid w:val="00F852D0"/>
     <w:pPr>
       <w:tabs>
         <w:tab w:val="center" w:pos="4252"/>
@@ -16963,7 +17210,7 @@
     <w:basedOn w:val="Fontepargpadro"/>
     <w:link w:val="Rodap"/>
     <w:uiPriority w:val="99"/>
-    <w:rsid w:val="00CA3AFE"/>
+    <w:rsid w:val="00F852D0"/>
   </w:style>
   <w:style w:type="paragraph" w:styleId="Sumrio1">
     <w:name w:val="toc 1"/>
@@ -16972,7 +17219,7 @@
     <w:autoRedefine/>
     <w:uiPriority w:val="39"/>
     <w:unhideWhenUsed/>
-    <w:rsid w:val="00CA3AFE"/>
+    <w:rsid w:val="00F852D0"/>
     <w:pPr>
       <w:spacing w:after="100"/>
     </w:pPr>
@@ -16984,7 +17231,7 @@
     <w:autoRedefine/>
     <w:uiPriority w:val="39"/>
     <w:unhideWhenUsed/>
-    <w:rsid w:val="00CA3AFE"/>
+    <w:rsid w:val="00F852D0"/>
     <w:pPr>
       <w:spacing w:after="100"/>
       <w:ind w:left="240"/>

</xml_diff>

<commit_message>
Adiciona Resultados alcancados ao Relatorio de Situacao (Reporte de Resultados D06.5)
Novo cartao no Relatorio de Situacao (FORALF11) registra indicadores,
entregas e beneficios de fato alcancados frente ao planejado, atendendo
o Reporte de Resultados (D06.5) sem exigir um 13o formulario separado.
Integrado ao versionamento historico e exportacao CSV ja existentes.

Atualiza o Manual de Uso para v2.8 com a documentacao da funcionalidade,
incluindo a tabela de artefatos (secao 8) que antes listava o Reporte de
Resultados como "a construir".

Co-Authored-By: Claude Sonnet 5 <noreply@anthropic.com>
</commit_message>
<xml_diff>
--- a/Manual de Uso - Ferramenta de Gestao de Projetos.docx
+++ b/Manual de Uso - Ferramenta de Gestao de Projetos.docx
@@ -129,7 +129,7 @@
           <w:color w:val="6A6A70"/>
           <w:sz w:val="22"/>
         </w:rPr>
-        <w:t>Versao 2.7 - 01 de agosto de 2026 (substitui a versao 2.6 de 30/07/2026)</w:t>
+        <w:t>Versao 2.8 - 01 de agosto de 2026 (substitui a versao 2.7 de 01/08/2026)</w:t>
       </w:r>
     </w:p>
     <w:p>
@@ -229,7 +229,7 @@
         <w:rPr>
           <w:noProof/>
         </w:rPr>
-        <w:instrText xml:space="preserve"> PAGEREF _Toc236511097 \h </w:instrText>
+        <w:instrText xml:space="preserve"> PAGEREF _Toc236512812 \h </w:instrText>
       </w:r>
       <w:r>
         <w:rPr>
@@ -290,7 +290,7 @@
         <w:rPr>
           <w:noProof/>
         </w:rPr>
-        <w:instrText xml:space="preserve"> PAGEREF _Toc236511098 \h </w:instrText>
+        <w:instrText xml:space="preserve"> PAGEREF _Toc236512813 \h </w:instrText>
       </w:r>
       <w:r>
         <w:rPr>
@@ -351,7 +351,7 @@
         <w:rPr>
           <w:noProof/>
         </w:rPr>
-        <w:instrText xml:space="preserve"> PAGEREF _Toc236511099 \h </w:instrText>
+        <w:instrText xml:space="preserve"> PAGEREF _Toc236512814 \h </w:instrText>
       </w:r>
       <w:r>
         <w:rPr>
@@ -412,7 +412,7 @@
         <w:rPr>
           <w:noProof/>
         </w:rPr>
-        <w:instrText xml:space="preserve"> PAGEREF _Toc236511100 \h </w:instrText>
+        <w:instrText xml:space="preserve"> PAGEREF _Toc236512815 \h </w:instrText>
       </w:r>
       <w:r>
         <w:rPr>
@@ -473,7 +473,7 @@
         <w:rPr>
           <w:noProof/>
         </w:rPr>
-        <w:instrText xml:space="preserve"> PAGEREF _Toc236511101 \h </w:instrText>
+        <w:instrText xml:space="preserve"> PAGEREF _Toc236512816 \h </w:instrText>
       </w:r>
       <w:r>
         <w:rPr>
@@ -534,7 +534,7 @@
         <w:rPr>
           <w:noProof/>
         </w:rPr>
-        <w:instrText xml:space="preserve"> PAGEREF _Toc236511102 \h </w:instrText>
+        <w:instrText xml:space="preserve"> PAGEREF _Toc236512817 \h </w:instrText>
       </w:r>
       <w:r>
         <w:rPr>
@@ -595,7 +595,7 @@
         <w:rPr>
           <w:noProof/>
         </w:rPr>
-        <w:instrText xml:space="preserve"> PAGEREF _Toc236511103 \h </w:instrText>
+        <w:instrText xml:space="preserve"> PAGEREF _Toc236512818 \h </w:instrText>
       </w:r>
       <w:r>
         <w:rPr>
@@ -656,7 +656,7 @@
         <w:rPr>
           <w:noProof/>
         </w:rPr>
-        <w:instrText xml:space="preserve"> PAGEREF _Toc236511104 \h </w:instrText>
+        <w:instrText xml:space="preserve"> PAGEREF _Toc236512819 \h </w:instrText>
       </w:r>
       <w:r>
         <w:rPr>
@@ -717,7 +717,7 @@
         <w:rPr>
           <w:noProof/>
         </w:rPr>
-        <w:instrText xml:space="preserve"> PAGEREF _Toc236511105 \h </w:instrText>
+        <w:instrText xml:space="preserve"> PAGEREF _Toc236512820 \h </w:instrText>
       </w:r>
       <w:r>
         <w:rPr>
@@ -778,7 +778,7 @@
         <w:rPr>
           <w:noProof/>
         </w:rPr>
-        <w:instrText xml:space="preserve"> PAGEREF _Toc236511106 \h </w:instrText>
+        <w:instrText xml:space="preserve"> PAGEREF _Toc236512821 \h </w:instrText>
       </w:r>
       <w:r>
         <w:rPr>
@@ -839,7 +839,7 @@
         <w:rPr>
           <w:noProof/>
         </w:rPr>
-        <w:instrText xml:space="preserve"> PAGEREF _Toc236511107 \h </w:instrText>
+        <w:instrText xml:space="preserve"> PAGEREF _Toc236512822 \h </w:instrText>
       </w:r>
       <w:r>
         <w:rPr>
@@ -900,7 +900,7 @@
         <w:rPr>
           <w:noProof/>
         </w:rPr>
-        <w:instrText xml:space="preserve"> PAGEREF _Toc236511108 \h </w:instrText>
+        <w:instrText xml:space="preserve"> PAGEREF _Toc236512823 \h </w:instrText>
       </w:r>
       <w:r>
         <w:rPr>
@@ -961,7 +961,7 @@
         <w:rPr>
           <w:noProof/>
         </w:rPr>
-        <w:instrText xml:space="preserve"> PAGEREF _Toc236511109 \h </w:instrText>
+        <w:instrText xml:space="preserve"> PAGEREF _Toc236512824 \h </w:instrText>
       </w:r>
       <w:r>
         <w:rPr>
@@ -1022,7 +1022,7 @@
         <w:rPr>
           <w:noProof/>
         </w:rPr>
-        <w:instrText xml:space="preserve"> PAGEREF _Toc236511110 \h </w:instrText>
+        <w:instrText xml:space="preserve"> PAGEREF _Toc236512825 \h </w:instrText>
       </w:r>
       <w:r>
         <w:rPr>
@@ -1083,7 +1083,7 @@
         <w:rPr>
           <w:noProof/>
         </w:rPr>
-        <w:instrText xml:space="preserve"> PAGEREF _Toc236511111 \h </w:instrText>
+        <w:instrText xml:space="preserve"> PAGEREF _Toc236512826 \h </w:instrText>
       </w:r>
       <w:r>
         <w:rPr>
@@ -1144,7 +1144,7 @@
         <w:rPr>
           <w:noProof/>
         </w:rPr>
-        <w:instrText xml:space="preserve"> PAGEREF _Toc236511112 \h </w:instrText>
+        <w:instrText xml:space="preserve"> PAGEREF _Toc236512827 \h </w:instrText>
       </w:r>
       <w:r>
         <w:rPr>
@@ -1205,7 +1205,7 @@
         <w:rPr>
           <w:noProof/>
         </w:rPr>
-        <w:instrText xml:space="preserve"> PAGEREF _Toc236511113 \h </w:instrText>
+        <w:instrText xml:space="preserve"> PAGEREF _Toc236512828 \h </w:instrText>
       </w:r>
       <w:r>
         <w:rPr>
@@ -1266,7 +1266,7 @@
         <w:rPr>
           <w:noProof/>
         </w:rPr>
-        <w:instrText xml:space="preserve"> PAGEREF _Toc236511114 \h </w:instrText>
+        <w:instrText xml:space="preserve"> PAGEREF _Toc236512829 \h </w:instrText>
       </w:r>
       <w:r>
         <w:rPr>
@@ -1327,7 +1327,7 @@
         <w:rPr>
           <w:noProof/>
         </w:rPr>
-        <w:instrText xml:space="preserve"> PAGEREF _Toc236511115 \h </w:instrText>
+        <w:instrText xml:space="preserve"> PAGEREF _Toc236512830 \h </w:instrText>
       </w:r>
       <w:r>
         <w:rPr>
@@ -1388,7 +1388,7 @@
         <w:rPr>
           <w:noProof/>
         </w:rPr>
-        <w:instrText xml:space="preserve"> PAGEREF _Toc236511116 \h </w:instrText>
+        <w:instrText xml:space="preserve"> PAGEREF _Toc236512831 \h </w:instrText>
       </w:r>
       <w:r>
         <w:rPr>
@@ -1449,7 +1449,7 @@
         <w:rPr>
           <w:noProof/>
         </w:rPr>
-        <w:instrText xml:space="preserve"> PAGEREF _Toc236511117 \h </w:instrText>
+        <w:instrText xml:space="preserve"> PAGEREF _Toc236512832 \h </w:instrText>
       </w:r>
       <w:r>
         <w:rPr>
@@ -1510,7 +1510,7 @@
         <w:rPr>
           <w:noProof/>
         </w:rPr>
-        <w:instrText xml:space="preserve"> PAGEREF _Toc236511118 \h </w:instrText>
+        <w:instrText xml:space="preserve"> PAGEREF _Toc236512833 \h </w:instrText>
       </w:r>
       <w:r>
         <w:rPr>
@@ -1571,7 +1571,7 @@
         <w:rPr>
           <w:noProof/>
         </w:rPr>
-        <w:instrText xml:space="preserve"> PAGEREF _Toc236511119 \h </w:instrText>
+        <w:instrText xml:space="preserve"> PAGEREF _Toc236512834 \h </w:instrText>
       </w:r>
       <w:r>
         <w:rPr>
@@ -1632,7 +1632,7 @@
         <w:rPr>
           <w:noProof/>
         </w:rPr>
-        <w:instrText xml:space="preserve"> PAGEREF _Toc236511120 \h </w:instrText>
+        <w:instrText xml:space="preserve"> PAGEREF _Toc236512835 \h </w:instrText>
       </w:r>
       <w:r>
         <w:rPr>
@@ -1670,7 +1670,10 @@
       </w:pPr>
       <w:r>
         <w:rPr>
-          <w:noProof/>
+          <w:rFonts w:ascii="Montserrat" w:hAnsi="Montserrat"/>
+          <w:b/>
+          <w:noProof/>
+          <w:color w:val="1A1A1A"/>
         </w:rPr>
         <w:t>4. Gerando os relatorios finais</w:t>
       </w:r>
@@ -1690,7 +1693,7 @@
         <w:rPr>
           <w:noProof/>
         </w:rPr>
-        <w:instrText xml:space="preserve"> PAGEREF _Toc236511121 \h </w:instrText>
+        <w:instrText xml:space="preserve"> PAGEREF _Toc236512836 \h </w:instrText>
       </w:r>
       <w:r>
         <w:rPr>
@@ -1751,7 +1754,7 @@
         <w:rPr>
           <w:noProof/>
         </w:rPr>
-        <w:instrText xml:space="preserve"> PAGEREF _Toc236511122 \h </w:instrText>
+        <w:instrText xml:space="preserve"> PAGEREF _Toc236512837 \h </w:instrText>
       </w:r>
       <w:r>
         <w:rPr>
@@ -1813,7 +1816,7 @@
         <w:rPr>
           <w:noProof/>
         </w:rPr>
-        <w:instrText xml:space="preserve"> PAGEREF _Toc236511123 \h </w:instrText>
+        <w:instrText xml:space="preserve"> PAGEREF _Toc236512838 \h </w:instrText>
       </w:r>
       <w:r>
         <w:rPr>
@@ -1830,7 +1833,7 @@
         <w:rPr>
           <w:noProof/>
         </w:rPr>
-        <w:t>44</w:t>
+        <w:t>45</w:t>
       </w:r>
       <w:r>
         <w:rPr>
@@ -1874,7 +1877,7 @@
         <w:rPr>
           <w:noProof/>
         </w:rPr>
-        <w:instrText xml:space="preserve"> PAGEREF _Toc236511124 \h </w:instrText>
+        <w:instrText xml:space="preserve"> PAGEREF _Toc236512839 \h </w:instrText>
       </w:r>
       <w:r>
         <w:rPr>
@@ -1935,7 +1938,7 @@
         <w:rPr>
           <w:noProof/>
         </w:rPr>
-        <w:instrText xml:space="preserve"> PAGEREF _Toc236511125 \h </w:instrText>
+        <w:instrText xml:space="preserve"> PAGEREF _Toc236512840 \h </w:instrText>
       </w:r>
       <w:r>
         <w:rPr>
@@ -1996,7 +1999,7 @@
         <w:rPr>
           <w:noProof/>
         </w:rPr>
-        <w:instrText xml:space="preserve"> PAGEREF _Toc236511126 \h </w:instrText>
+        <w:instrText xml:space="preserve"> PAGEREF _Toc236512841 \h </w:instrText>
       </w:r>
       <w:r>
         <w:rPr>
@@ -2057,7 +2060,7 @@
         <w:rPr>
           <w:noProof/>
         </w:rPr>
-        <w:instrText xml:space="preserve"> PAGEREF _Toc236511127 \h </w:instrText>
+        <w:instrText xml:space="preserve"> PAGEREF _Toc236512842 \h </w:instrText>
       </w:r>
       <w:r>
         <w:rPr>
@@ -2118,7 +2121,7 @@
         <w:rPr>
           <w:noProof/>
         </w:rPr>
-        <w:instrText xml:space="preserve"> PAGEREF _Toc236511128 \h </w:instrText>
+        <w:instrText xml:space="preserve"> PAGEREF _Toc236512843 \h </w:instrText>
       </w:r>
       <w:r>
         <w:rPr>
@@ -2179,7 +2182,7 @@
         <w:rPr>
           <w:noProof/>
         </w:rPr>
-        <w:instrText xml:space="preserve"> PAGEREF _Toc236511129 \h </w:instrText>
+        <w:instrText xml:space="preserve"> PAGEREF _Toc236512844 \h </w:instrText>
       </w:r>
       <w:r>
         <w:rPr>
@@ -2240,7 +2243,7 @@
         <w:rPr>
           <w:noProof/>
         </w:rPr>
-        <w:instrText xml:space="preserve"> PAGEREF _Toc236511130 \h </w:instrText>
+        <w:instrText xml:space="preserve"> PAGEREF _Toc236512845 \h </w:instrText>
       </w:r>
       <w:r>
         <w:rPr>
@@ -2301,7 +2304,7 @@
         <w:rPr>
           <w:noProof/>
         </w:rPr>
-        <w:instrText xml:space="preserve"> PAGEREF _Toc236511131 \h </w:instrText>
+        <w:instrText xml:space="preserve"> PAGEREF _Toc236512846 \h </w:instrText>
       </w:r>
       <w:r>
         <w:rPr>
@@ -2362,7 +2365,7 @@
         <w:rPr>
           <w:noProof/>
         </w:rPr>
-        <w:instrText xml:space="preserve"> PAGEREF _Toc236511132 \h </w:instrText>
+        <w:instrText xml:space="preserve"> PAGEREF _Toc236512847 \h </w:instrText>
       </w:r>
       <w:r>
         <w:rPr>
@@ -2423,7 +2426,7 @@
         <w:rPr>
           <w:noProof/>
         </w:rPr>
-        <w:instrText xml:space="preserve"> PAGEREF _Toc236511133 \h </w:instrText>
+        <w:instrText xml:space="preserve"> PAGEREF _Toc236512848 \h </w:instrText>
       </w:r>
       <w:r>
         <w:rPr>
@@ -2499,7 +2502,7 @@
           <w:sz w:val="34"/>
         </w:rPr>
       </w:pPr>
-      <w:bookmarkStart w:id="0" w:name="_Toc236511097"/>
+      <w:bookmarkStart w:id="0" w:name="_Toc236512812"/>
       <w:r>
         <w:rPr>
           <w:rFonts w:ascii="Montserrat" w:hAnsi="Montserrat"/>
@@ -2523,7 +2526,7 @@
           <w:sz w:val="27"/>
         </w:rPr>
       </w:pPr>
-      <w:bookmarkStart w:id="1" w:name="_Toc236511098"/>
+      <w:bookmarkStart w:id="1" w:name="_Toc236512813"/>
       <w:r>
         <w:rPr>
           <w:rFonts w:ascii="Montserrat" w:hAnsi="Montserrat"/>
@@ -2721,6 +2724,24 @@
           <w:color w:val="1A1A1A"/>
           <w:sz w:val="22"/>
         </w:rPr>
+        <w:t>Esta e a versao 2.8 do manual. Em relacao a versao 2.7 (01/08/2026), foi adicionado o cartao Resultados alcancados ao Relatorio de Situacao (secao 4.1): registra indicadores, entregas e beneficios de fato alcancados frente ao planejado, atendendo o Reporte de Resultados (D06.5) sem exigir um 13o formulario separado. A tabela de artefatos (secao 8) e o texto sobre cobertura das Diretrizes (secao 1.4) foram atualizados de acordo.</w:t>
+      </w:r>
+    </w:p>
+    <w:p>
+      <w:pPr>
+        <w:spacing w:line="280" w:lineRule="auto"/>
+        <w:rPr>
+          <w:rFonts w:ascii="Montserrat" w:hAnsi="Montserrat"/>
+          <w:color w:val="1A1A1A"/>
+          <w:sz w:val="22"/>
+        </w:rPr>
+      </w:pPr>
+      <w:r>
+        <w:rPr>
+          <w:rFonts w:ascii="Montserrat" w:hAnsi="Montserrat"/>
+          <w:color w:val="1A1A1A"/>
+          <w:sz w:val="22"/>
+        </w:rPr>
         <w:t>O manual nao substitui as Diretrizes para a Gestao de Projetos da UNIALFA (documento institucional que define o framework D01 a D07) nem o documento Regras de Acesso e Permissoes (que detalha cada regra de controle de acesso); ele e o guia operacional de como usar cada ferramenta na pratica.</w:t>
       </w:r>
     </w:p>
@@ -2735,7 +2756,7 @@
           <w:sz w:val="27"/>
         </w:rPr>
       </w:pPr>
-      <w:bookmarkStart w:id="2" w:name="_Toc236511099"/>
+      <w:bookmarkStart w:id="2" w:name="_Toc236512814"/>
       <w:r>
         <w:rPr>
           <w:rFonts w:ascii="Montserrat" w:hAnsi="Montserrat"/>
@@ -2870,6 +2891,7 @@
           <w:color w:val="1A1A1A"/>
           <w:sz w:val="22"/>
         </w:rPr>
+        <w:lastRenderedPageBreak/>
         <w:t>O Mapa de Diretrizes (pagina inicial) apresenta visualmente as 7 diretrizes (D01 a D07) e mostra, para cada etapa do processo, quais ferramentas usar. E o ponto de partida recomendado para quem quer entender o processo antes de preencher os formularios - e a unica pagina, junto com o Validador de Projetos, que nao exige login.</w:t>
       </w:r>
     </w:p>
@@ -2882,18 +2904,17 @@
         <w:rPr>
           <w:noProof/>
         </w:rPr>
-        <w:lastRenderedPageBreak/>
         <w:drawing>
-          <wp:inline distT="0" distB="0" distL="0" distR="0" wp14:anchorId="70D6D41B" wp14:editId="6A117A6D">
+          <wp:inline distT="0" distB="0" distL="0" distR="0" wp14:anchorId="2FB01246" wp14:editId="39B35738">
             <wp:extent cx="5303520" cy="4792851"/>
             <wp:effectExtent l="19050" t="19050" r="11430" b="27305"/>
-            <wp:docPr id="2099678175" name="Imagem 1"/>
+            <wp:docPr id="843266764" name="Imagem 1"/>
             <wp:cNvGraphicFramePr/>
             <a:graphic xmlns:a="http://schemas.openxmlformats.org/drawingml/2006/main">
               <a:graphicData uri="http://schemas.openxmlformats.org/drawingml/2006/picture">
                 <pic:pic xmlns:pic="http://schemas.openxmlformats.org/drawingml/2006/picture">
                   <pic:nvPicPr>
-                    <pic:cNvPr id="2099678175" name=""/>
+                    <pic:cNvPr id="843266764" name=""/>
                     <pic:cNvPicPr/>
                   </pic:nvPicPr>
                   <pic:blipFill>
@@ -2961,7 +2982,7 @@
           <w:sz w:val="27"/>
         </w:rPr>
       </w:pPr>
-      <w:bookmarkStart w:id="3" w:name="_Toc236511100"/>
+      <w:bookmarkStart w:id="3" w:name="_Toc236512815"/>
       <w:r>
         <w:rPr>
           <w:rFonts w:ascii="Montserrat" w:hAnsi="Montserrat"/>
@@ -3002,16 +3023,16 @@
         </w:rPr>
         <w:lastRenderedPageBreak/>
         <w:drawing>
-          <wp:inline distT="0" distB="0" distL="0" distR="0" wp14:anchorId="67923563" wp14:editId="38562B6C">
+          <wp:inline distT="0" distB="0" distL="0" distR="0" wp14:anchorId="741C22FF" wp14:editId="42055DAE">
             <wp:extent cx="4206240" cy="3801227"/>
             <wp:effectExtent l="19050" t="19050" r="22860" b="27940"/>
-            <wp:docPr id="1511548509" name="Imagem 2"/>
+            <wp:docPr id="1770784136" name="Imagem 2"/>
             <wp:cNvGraphicFramePr/>
             <a:graphic xmlns:a="http://schemas.openxmlformats.org/drawingml/2006/main">
               <a:graphicData uri="http://schemas.openxmlformats.org/drawingml/2006/picture">
                 <pic:pic xmlns:pic="http://schemas.openxmlformats.org/drawingml/2006/picture">
                   <pic:nvPicPr>
-                    <pic:cNvPr id="1511548509" name=""/>
+                    <pic:cNvPr id="1770784136" name=""/>
                     <pic:cNvPicPr/>
                   </pic:nvPicPr>
                   <pic:blipFill>
@@ -3184,7 +3205,7 @@
           <w:sz w:val="27"/>
         </w:rPr>
       </w:pPr>
-      <w:bookmarkStart w:id="4" w:name="_Toc236511101"/>
+      <w:bookmarkStart w:id="4" w:name="_Toc236512816"/>
       <w:r>
         <w:rPr>
           <w:rFonts w:ascii="Montserrat" w:hAnsi="Montserrat"/>
@@ -3211,7 +3232,7 @@
           <w:color w:val="1A1A1A"/>
           <w:sz w:val="22"/>
         </w:rPr>
-        <w:t>Os 12 formularios cobrem 12 dos 13 artefatos previstos nas Diretrizes. Apenas o Reporte de Resultados ainda nao tem formulario eletronico proprio.</w:t>
+        <w:t>Os 12 formularios cobrem os 13 artefatos previstos nas Diretrizes. O Reporte de Resultados (D06.5) nao tem um formulario proprio - e atendido pela secao Resultados alcancados do Relatorio de Situacao (FORALF11, secao 4.1).</w:t>
       </w:r>
     </w:p>
     <w:tbl>
@@ -4333,7 +4354,7 @@
           <w:sz w:val="34"/>
         </w:rPr>
       </w:pPr>
-      <w:bookmarkStart w:id="5" w:name="_Toc236511102"/>
+      <w:bookmarkStart w:id="5" w:name="_Toc236512817"/>
       <w:r>
         <w:rPr>
           <w:rFonts w:ascii="Montserrat" w:hAnsi="Montserrat"/>
@@ -4357,7 +4378,7 @@
           <w:sz w:val="27"/>
         </w:rPr>
       </w:pPr>
-      <w:bookmarkStart w:id="6" w:name="_Toc236511103"/>
+      <w:bookmarkStart w:id="6" w:name="_Toc236512818"/>
       <w:r>
         <w:rPr>
           <w:rFonts w:ascii="Montserrat" w:hAnsi="Montserrat"/>
@@ -4398,7 +4419,7 @@
           <w:sz w:val="27"/>
         </w:rPr>
       </w:pPr>
-      <w:bookmarkStart w:id="7" w:name="_Toc236511104"/>
+      <w:bookmarkStart w:id="7" w:name="_Toc236512819"/>
       <w:r>
         <w:rPr>
           <w:rFonts w:ascii="Montserrat" w:hAnsi="Montserrat"/>
@@ -4517,7 +4538,7 @@
           <w:sz w:val="27"/>
         </w:rPr>
       </w:pPr>
-      <w:bookmarkStart w:id="8" w:name="_Toc236511105"/>
+      <w:bookmarkStart w:id="8" w:name="_Toc236512820"/>
       <w:r>
         <w:rPr>
           <w:rFonts w:ascii="Montserrat" w:hAnsi="Montserrat"/>
@@ -5088,7 +5109,7 @@
           <w:sz w:val="27"/>
         </w:rPr>
       </w:pPr>
-      <w:bookmarkStart w:id="9" w:name="_Toc236511106"/>
+      <w:bookmarkStart w:id="9" w:name="_Toc236512821"/>
       <w:r>
         <w:rPr>
           <w:rFonts w:ascii="Montserrat" w:hAnsi="Montserrat"/>
@@ -5177,16 +5198,16 @@
         </w:rPr>
         <w:lastRenderedPageBreak/>
         <w:drawing>
-          <wp:inline distT="0" distB="0" distL="0" distR="0" wp14:anchorId="1667312D" wp14:editId="2EBACD6B">
+          <wp:inline distT="0" distB="0" distL="0" distR="0" wp14:anchorId="4CFFE3BE" wp14:editId="60057973">
             <wp:extent cx="4937760" cy="4462310"/>
             <wp:effectExtent l="19050" t="19050" r="15240" b="14605"/>
-            <wp:docPr id="1230606325" name="Imagem 3"/>
+            <wp:docPr id="1292479499" name="Imagem 3"/>
             <wp:cNvGraphicFramePr/>
             <a:graphic xmlns:a="http://schemas.openxmlformats.org/drawingml/2006/main">
               <a:graphicData uri="http://schemas.openxmlformats.org/drawingml/2006/picture">
                 <pic:pic xmlns:pic="http://schemas.openxmlformats.org/drawingml/2006/picture">
                   <pic:nvPicPr>
-                    <pic:cNvPr id="1230606325" name=""/>
+                    <pic:cNvPr id="1292479499" name=""/>
                     <pic:cNvPicPr/>
                   </pic:nvPicPr>
                   <pic:blipFill>
@@ -5254,7 +5275,7 @@
           <w:sz w:val="27"/>
         </w:rPr>
       </w:pPr>
-      <w:bookmarkStart w:id="10" w:name="_Toc236511107"/>
+      <w:bookmarkStart w:id="10" w:name="_Toc236512822"/>
       <w:r>
         <w:rPr>
           <w:rFonts w:ascii="Montserrat" w:hAnsi="Montserrat"/>
@@ -5295,16 +5316,16 @@
         </w:rPr>
         <w:lastRenderedPageBreak/>
         <w:drawing>
-          <wp:inline distT="0" distB="0" distL="0" distR="0" wp14:anchorId="0372AA51" wp14:editId="6ACD0E56">
+          <wp:inline distT="0" distB="0" distL="0" distR="0" wp14:anchorId="5E84B143" wp14:editId="72350340">
             <wp:extent cx="5120640" cy="4627581"/>
             <wp:effectExtent l="19050" t="19050" r="22860" b="20955"/>
-            <wp:docPr id="1437198999" name="Imagem 4"/>
+            <wp:docPr id="794968222" name="Imagem 4"/>
             <wp:cNvGraphicFramePr/>
             <a:graphic xmlns:a="http://schemas.openxmlformats.org/drawingml/2006/main">
               <a:graphicData uri="http://schemas.openxmlformats.org/drawingml/2006/picture">
                 <pic:pic xmlns:pic="http://schemas.openxmlformats.org/drawingml/2006/picture">
                   <pic:nvPicPr>
-                    <pic:cNvPr id="1437198999" name=""/>
+                    <pic:cNvPr id="794968222" name=""/>
                     <pic:cNvPicPr/>
                   </pic:nvPicPr>
                   <pic:blipFill>
@@ -5441,7 +5462,7 @@
           <w:sz w:val="27"/>
         </w:rPr>
       </w:pPr>
-      <w:bookmarkStart w:id="11" w:name="_Toc236511108"/>
+      <w:bookmarkStart w:id="11" w:name="_Toc236512823"/>
       <w:r>
         <w:rPr>
           <w:rFonts w:ascii="Montserrat" w:hAnsi="Montserrat"/>
@@ -5482,16 +5503,16 @@
           <w:noProof/>
         </w:rPr>
         <w:drawing>
-          <wp:inline distT="0" distB="0" distL="0" distR="0" wp14:anchorId="78E834B3" wp14:editId="1BCA3B6B">
+          <wp:inline distT="0" distB="0" distL="0" distR="0" wp14:anchorId="66496087" wp14:editId="0941F29E">
             <wp:extent cx="4206240" cy="3801227"/>
             <wp:effectExtent l="19050" t="19050" r="22860" b="27940"/>
-            <wp:docPr id="1491991102" name="Imagem 5"/>
+            <wp:docPr id="835269032" name="Imagem 5"/>
             <wp:cNvGraphicFramePr/>
             <a:graphic xmlns:a="http://schemas.openxmlformats.org/drawingml/2006/main">
               <a:graphicData uri="http://schemas.openxmlformats.org/drawingml/2006/picture">
                 <pic:pic xmlns:pic="http://schemas.openxmlformats.org/drawingml/2006/picture">
                   <pic:nvPicPr>
-                    <pic:cNvPr id="1491991102" name=""/>
+                    <pic:cNvPr id="835269032" name=""/>
                     <pic:cNvPicPr/>
                   </pic:nvPicPr>
                   <pic:blipFill>
@@ -5559,16 +5580,16 @@
         </w:rPr>
         <w:lastRenderedPageBreak/>
         <w:drawing>
-          <wp:inline distT="0" distB="0" distL="0" distR="0" wp14:anchorId="7B791435" wp14:editId="39B2CF5F">
+          <wp:inline distT="0" distB="0" distL="0" distR="0" wp14:anchorId="21B48E77" wp14:editId="3A34738E">
             <wp:extent cx="4206240" cy="3801227"/>
             <wp:effectExtent l="19050" t="19050" r="22860" b="27940"/>
-            <wp:docPr id="530681054" name="Imagem 6"/>
+            <wp:docPr id="1016602309" name="Imagem 6"/>
             <wp:cNvGraphicFramePr/>
             <a:graphic xmlns:a="http://schemas.openxmlformats.org/drawingml/2006/main">
               <a:graphicData uri="http://schemas.openxmlformats.org/drawingml/2006/picture">
                 <pic:pic xmlns:pic="http://schemas.openxmlformats.org/drawingml/2006/picture">
                   <pic:nvPicPr>
-                    <pic:cNvPr id="530681054" name=""/>
+                    <pic:cNvPr id="1016602309" name=""/>
                     <pic:cNvPicPr/>
                   </pic:nvPicPr>
                   <pic:blipFill>
@@ -5684,7 +5705,7 @@
           <w:sz w:val="27"/>
         </w:rPr>
       </w:pPr>
-      <w:bookmarkStart w:id="12" w:name="_Toc236511109"/>
+      <w:bookmarkStart w:id="12" w:name="_Toc236512824"/>
       <w:r>
         <w:rPr>
           <w:rFonts w:ascii="Montserrat" w:hAnsi="Montserrat"/>
@@ -5756,7 +5777,7 @@
           <w:sz w:val="34"/>
         </w:rPr>
       </w:pPr>
-      <w:bookmarkStart w:id="13" w:name="_Toc236511110"/>
+      <w:bookmarkStart w:id="13" w:name="_Toc236512825"/>
       <w:r>
         <w:rPr>
           <w:rFonts w:ascii="Montserrat" w:hAnsi="Montserrat"/>
@@ -5798,7 +5819,7 @@
           <w:sz w:val="27"/>
         </w:rPr>
       </w:pPr>
-      <w:bookmarkStart w:id="14" w:name="_Toc236511111"/>
+      <w:bookmarkStart w:id="14" w:name="_Toc236512826"/>
       <w:r>
         <w:rPr>
           <w:rFonts w:ascii="Montserrat" w:hAnsi="Montserrat"/>
@@ -6658,16 +6679,16 @@
         </w:rPr>
         <w:lastRenderedPageBreak/>
         <w:drawing>
-          <wp:inline distT="0" distB="0" distL="0" distR="0" wp14:anchorId="618DA915" wp14:editId="0D0052FA">
+          <wp:inline distT="0" distB="0" distL="0" distR="0" wp14:anchorId="3692179F" wp14:editId="00B71E68">
             <wp:extent cx="5120640" cy="4627581"/>
             <wp:effectExtent l="19050" t="19050" r="22860" b="20955"/>
-            <wp:docPr id="636608589" name="Imagem 7"/>
+            <wp:docPr id="322259972" name="Imagem 7"/>
             <wp:cNvGraphicFramePr/>
             <a:graphic xmlns:a="http://schemas.openxmlformats.org/drawingml/2006/main">
               <a:graphicData uri="http://schemas.openxmlformats.org/drawingml/2006/picture">
                 <pic:pic xmlns:pic="http://schemas.openxmlformats.org/drawingml/2006/picture">
                   <pic:nvPicPr>
-                    <pic:cNvPr id="636608589" name=""/>
+                    <pic:cNvPr id="322259972" name=""/>
                     <pic:cNvPicPr/>
                   </pic:nvPicPr>
                   <pic:blipFill>
@@ -6735,16 +6756,16 @@
         </w:rPr>
         <w:lastRenderedPageBreak/>
         <w:drawing>
-          <wp:inline distT="0" distB="0" distL="0" distR="0" wp14:anchorId="41D7ECE0" wp14:editId="2062B453">
+          <wp:inline distT="0" distB="0" distL="0" distR="0" wp14:anchorId="21F28B52" wp14:editId="34F12632">
             <wp:extent cx="5120640" cy="4627581"/>
             <wp:effectExtent l="19050" t="19050" r="22860" b="20955"/>
-            <wp:docPr id="1978908522" name="Imagem 8"/>
+            <wp:docPr id="696401795" name="Imagem 8"/>
             <wp:cNvGraphicFramePr/>
             <a:graphic xmlns:a="http://schemas.openxmlformats.org/drawingml/2006/main">
               <a:graphicData uri="http://schemas.openxmlformats.org/drawingml/2006/picture">
                 <pic:pic xmlns:pic="http://schemas.openxmlformats.org/drawingml/2006/picture">
                   <pic:nvPicPr>
-                    <pic:cNvPr id="1978908522" name=""/>
+                    <pic:cNvPr id="696401795" name=""/>
                     <pic:cNvPicPr/>
                   </pic:nvPicPr>
                   <pic:blipFill>
@@ -6879,7 +6900,7 @@
           <w:sz w:val="27"/>
         </w:rPr>
       </w:pPr>
-      <w:bookmarkStart w:id="15" w:name="_Toc236511112"/>
+      <w:bookmarkStart w:id="15" w:name="_Toc236512827"/>
       <w:r>
         <w:rPr>
           <w:rFonts w:ascii="Montserrat" w:hAnsi="Montserrat"/>
@@ -7748,16 +7769,16 @@
         </w:rPr>
         <w:lastRenderedPageBreak/>
         <w:drawing>
-          <wp:inline distT="0" distB="0" distL="0" distR="0" wp14:anchorId="71FCA247" wp14:editId="055E2CAD">
+          <wp:inline distT="0" distB="0" distL="0" distR="0" wp14:anchorId="1A73D948" wp14:editId="0E491637">
             <wp:extent cx="5120640" cy="4627581"/>
             <wp:effectExtent l="19050" t="19050" r="22860" b="20955"/>
-            <wp:docPr id="1312888058" name="Imagem 9"/>
+            <wp:docPr id="1342412055" name="Imagem 9"/>
             <wp:cNvGraphicFramePr/>
             <a:graphic xmlns:a="http://schemas.openxmlformats.org/drawingml/2006/main">
               <a:graphicData uri="http://schemas.openxmlformats.org/drawingml/2006/picture">
                 <pic:pic xmlns:pic="http://schemas.openxmlformats.org/drawingml/2006/picture">
                   <pic:nvPicPr>
-                    <pic:cNvPr id="1312888058" name=""/>
+                    <pic:cNvPr id="1342412055" name=""/>
                     <pic:cNvPicPr/>
                   </pic:nvPicPr>
                   <pic:blipFill>
@@ -7825,16 +7846,16 @@
         </w:rPr>
         <w:lastRenderedPageBreak/>
         <w:drawing>
-          <wp:inline distT="0" distB="0" distL="0" distR="0" wp14:anchorId="33646D38" wp14:editId="1F24D4D7">
+          <wp:inline distT="0" distB="0" distL="0" distR="0" wp14:anchorId="3AF38502" wp14:editId="7E058D1D">
             <wp:extent cx="5120640" cy="4627581"/>
             <wp:effectExtent l="19050" t="19050" r="22860" b="20955"/>
-            <wp:docPr id="1115990706" name="Imagem 10"/>
+            <wp:docPr id="659664012" name="Imagem 10"/>
             <wp:cNvGraphicFramePr/>
             <a:graphic xmlns:a="http://schemas.openxmlformats.org/drawingml/2006/main">
               <a:graphicData uri="http://schemas.openxmlformats.org/drawingml/2006/picture">
                 <pic:pic xmlns:pic="http://schemas.openxmlformats.org/drawingml/2006/picture">
                   <pic:nvPicPr>
-                    <pic:cNvPr id="1115990706" name=""/>
+                    <pic:cNvPr id="659664012" name=""/>
                     <pic:cNvPicPr/>
                   </pic:nvPicPr>
                   <pic:blipFill>
@@ -7920,7 +7941,7 @@
           <w:sz w:val="27"/>
         </w:rPr>
       </w:pPr>
-      <w:bookmarkStart w:id="16" w:name="_Toc236511113"/>
+      <w:bookmarkStart w:id="16" w:name="_Toc236512828"/>
       <w:r>
         <w:rPr>
           <w:rFonts w:ascii="Montserrat" w:hAnsi="Montserrat"/>
@@ -8888,16 +8909,16 @@
         </w:rPr>
         <w:lastRenderedPageBreak/>
         <w:drawing>
-          <wp:inline distT="0" distB="0" distL="0" distR="0" wp14:anchorId="0D910258" wp14:editId="4E10AA7D">
+          <wp:inline distT="0" distB="0" distL="0" distR="0" wp14:anchorId="7F0211D8" wp14:editId="65376379">
             <wp:extent cx="5120640" cy="3282818"/>
             <wp:effectExtent l="19050" t="19050" r="22860" b="13335"/>
-            <wp:docPr id="368459567" name="Imagem 11"/>
+            <wp:docPr id="74114546" name="Imagem 11"/>
             <wp:cNvGraphicFramePr/>
             <a:graphic xmlns:a="http://schemas.openxmlformats.org/drawingml/2006/main">
               <a:graphicData uri="http://schemas.openxmlformats.org/drawingml/2006/picture">
                 <pic:pic xmlns:pic="http://schemas.openxmlformats.org/drawingml/2006/picture">
                   <pic:nvPicPr>
-                    <pic:cNvPr id="368459567" name=""/>
+                    <pic:cNvPr id="74114546" name=""/>
                     <pic:cNvPicPr/>
                   </pic:nvPicPr>
                   <pic:blipFill>
@@ -8965,16 +8986,16 @@
         </w:rPr>
         <w:lastRenderedPageBreak/>
         <w:drawing>
-          <wp:inline distT="0" distB="0" distL="0" distR="0" wp14:anchorId="19311F6B" wp14:editId="00A9577C">
+          <wp:inline distT="0" distB="0" distL="0" distR="0" wp14:anchorId="57EDAA2C" wp14:editId="08A0C18A">
             <wp:extent cx="5120640" cy="4627581"/>
             <wp:effectExtent l="19050" t="19050" r="22860" b="20955"/>
-            <wp:docPr id="1300422615" name="Imagem 12"/>
+            <wp:docPr id="1651350280" name="Imagem 12"/>
             <wp:cNvGraphicFramePr/>
             <a:graphic xmlns:a="http://schemas.openxmlformats.org/drawingml/2006/main">
               <a:graphicData uri="http://schemas.openxmlformats.org/drawingml/2006/picture">
                 <pic:pic xmlns:pic="http://schemas.openxmlformats.org/drawingml/2006/picture">
                   <pic:nvPicPr>
-                    <pic:cNvPr id="1300422615" name=""/>
+                    <pic:cNvPr id="1651350280" name=""/>
                     <pic:cNvPicPr/>
                   </pic:nvPicPr>
                   <pic:blipFill>
@@ -9060,7 +9081,7 @@
           <w:sz w:val="27"/>
         </w:rPr>
       </w:pPr>
-      <w:bookmarkStart w:id="17" w:name="_Toc236511114"/>
+      <w:bookmarkStart w:id="17" w:name="_Toc236512829"/>
       <w:r>
         <w:rPr>
           <w:rFonts w:ascii="Montserrat" w:hAnsi="Montserrat"/>
@@ -9567,16 +9588,16 @@
           <w:noProof/>
         </w:rPr>
         <w:drawing>
-          <wp:inline distT="0" distB="0" distL="0" distR="0" wp14:anchorId="7D7CE771" wp14:editId="39A27447">
+          <wp:inline distT="0" distB="0" distL="0" distR="0" wp14:anchorId="7AC14E4F" wp14:editId="20C0781C">
             <wp:extent cx="5120640" cy="4627581"/>
             <wp:effectExtent l="19050" t="19050" r="22860" b="20955"/>
-            <wp:docPr id="997461225" name="Imagem 13"/>
+            <wp:docPr id="985223439" name="Imagem 13"/>
             <wp:cNvGraphicFramePr/>
             <a:graphic xmlns:a="http://schemas.openxmlformats.org/drawingml/2006/main">
               <a:graphicData uri="http://schemas.openxmlformats.org/drawingml/2006/picture">
                 <pic:pic xmlns:pic="http://schemas.openxmlformats.org/drawingml/2006/picture">
                   <pic:nvPicPr>
-                    <pic:cNvPr id="997461225" name=""/>
+                    <pic:cNvPr id="985223439" name=""/>
                     <pic:cNvPicPr/>
                   </pic:nvPicPr>
                   <pic:blipFill>
@@ -9644,16 +9665,16 @@
         </w:rPr>
         <w:lastRenderedPageBreak/>
         <w:drawing>
-          <wp:inline distT="0" distB="0" distL="0" distR="0" wp14:anchorId="45C763EC" wp14:editId="32FB4D24">
+          <wp:inline distT="0" distB="0" distL="0" distR="0" wp14:anchorId="782F6213" wp14:editId="7B380789">
             <wp:extent cx="5120640" cy="4627581"/>
             <wp:effectExtent l="19050" t="19050" r="22860" b="20955"/>
-            <wp:docPr id="1222134703" name="Imagem 14"/>
+            <wp:docPr id="625339925" name="Imagem 14"/>
             <wp:cNvGraphicFramePr/>
             <a:graphic xmlns:a="http://schemas.openxmlformats.org/drawingml/2006/main">
               <a:graphicData uri="http://schemas.openxmlformats.org/drawingml/2006/picture">
                 <pic:pic xmlns:pic="http://schemas.openxmlformats.org/drawingml/2006/picture">
                   <pic:nvPicPr>
-                    <pic:cNvPr id="1222134703" name=""/>
+                    <pic:cNvPr id="625339925" name=""/>
                     <pic:cNvPicPr/>
                   </pic:nvPicPr>
                   <pic:blipFill>
@@ -9739,7 +9760,7 @@
           <w:sz w:val="27"/>
         </w:rPr>
       </w:pPr>
-      <w:bookmarkStart w:id="18" w:name="_Toc236511115"/>
+      <w:bookmarkStart w:id="18" w:name="_Toc236512830"/>
       <w:r>
         <w:rPr>
           <w:rFonts w:ascii="Montserrat" w:hAnsi="Montserrat"/>
@@ -9780,16 +9801,16 @@
         </w:rPr>
         <w:lastRenderedPageBreak/>
         <w:drawing>
-          <wp:inline distT="0" distB="0" distL="0" distR="0" wp14:anchorId="4889B943" wp14:editId="30376BCC">
+          <wp:inline distT="0" distB="0" distL="0" distR="0" wp14:anchorId="45D8E7C4" wp14:editId="66D9D9AC">
             <wp:extent cx="5120640" cy="4627581"/>
             <wp:effectExtent l="19050" t="19050" r="22860" b="20955"/>
-            <wp:docPr id="1247498815" name="Imagem 15"/>
+            <wp:docPr id="1237516450" name="Imagem 15"/>
             <wp:cNvGraphicFramePr/>
             <a:graphic xmlns:a="http://schemas.openxmlformats.org/drawingml/2006/main">
               <a:graphicData uri="http://schemas.openxmlformats.org/drawingml/2006/picture">
                 <pic:pic xmlns:pic="http://schemas.openxmlformats.org/drawingml/2006/picture">
                   <pic:nvPicPr>
-                    <pic:cNvPr id="1247498815" name=""/>
+                    <pic:cNvPr id="1237516450" name=""/>
                     <pic:cNvPicPr/>
                   </pic:nvPicPr>
                   <pic:blipFill>
@@ -9857,16 +9878,16 @@
         </w:rPr>
         <w:lastRenderedPageBreak/>
         <w:drawing>
-          <wp:inline distT="0" distB="0" distL="0" distR="0" wp14:anchorId="4BC5FB6B" wp14:editId="7DB9BC68">
+          <wp:inline distT="0" distB="0" distL="0" distR="0" wp14:anchorId="6C7D7B74" wp14:editId="27CD380C">
             <wp:extent cx="5120640" cy="4627581"/>
             <wp:effectExtent l="19050" t="19050" r="22860" b="20955"/>
-            <wp:docPr id="1453063592" name="Imagem 16"/>
+            <wp:docPr id="1225807528" name="Imagem 16"/>
             <wp:cNvGraphicFramePr/>
             <a:graphic xmlns:a="http://schemas.openxmlformats.org/drawingml/2006/main">
               <a:graphicData uri="http://schemas.openxmlformats.org/drawingml/2006/picture">
                 <pic:pic xmlns:pic="http://schemas.openxmlformats.org/drawingml/2006/picture">
                   <pic:nvPicPr>
-                    <pic:cNvPr id="1453063592" name=""/>
+                    <pic:cNvPr id="1225807528" name=""/>
                     <pic:cNvPicPr/>
                   </pic:nvPicPr>
                   <pic:blipFill>
@@ -10030,16 +10051,16 @@
         </w:rPr>
         <w:lastRenderedPageBreak/>
         <w:drawing>
-          <wp:inline distT="0" distB="0" distL="0" distR="0" wp14:anchorId="628A03DD" wp14:editId="23D06EC9">
+          <wp:inline distT="0" distB="0" distL="0" distR="0" wp14:anchorId="3A6CAD16" wp14:editId="7AFF5790">
             <wp:extent cx="5120640" cy="3282818"/>
             <wp:effectExtent l="19050" t="19050" r="22860" b="13335"/>
-            <wp:docPr id="947166769" name="Imagem 17"/>
+            <wp:docPr id="1619345943" name="Imagem 17"/>
             <wp:cNvGraphicFramePr/>
             <a:graphic xmlns:a="http://schemas.openxmlformats.org/drawingml/2006/main">
               <a:graphicData uri="http://schemas.openxmlformats.org/drawingml/2006/picture">
                 <pic:pic xmlns:pic="http://schemas.openxmlformats.org/drawingml/2006/picture">
                   <pic:nvPicPr>
-                    <pic:cNvPr id="947166769" name=""/>
+                    <pic:cNvPr id="1619345943" name=""/>
                     <pic:cNvPicPr/>
                   </pic:nvPicPr>
                   <pic:blipFill>
@@ -10125,7 +10146,7 @@
           <w:sz w:val="27"/>
         </w:rPr>
       </w:pPr>
-      <w:bookmarkStart w:id="19" w:name="_Toc236511116"/>
+      <w:bookmarkStart w:id="19" w:name="_Toc236512831"/>
       <w:r>
         <w:rPr>
           <w:rFonts w:ascii="Montserrat" w:hAnsi="Montserrat"/>
@@ -10166,16 +10187,16 @@
         </w:rPr>
         <w:lastRenderedPageBreak/>
         <w:drawing>
-          <wp:inline distT="0" distB="0" distL="0" distR="0" wp14:anchorId="6386F95B" wp14:editId="1C883B75">
+          <wp:inline distT="0" distB="0" distL="0" distR="0" wp14:anchorId="38B70556" wp14:editId="2F21544C">
             <wp:extent cx="5120640" cy="4627581"/>
             <wp:effectExtent l="19050" t="19050" r="22860" b="20955"/>
-            <wp:docPr id="135312255" name="Imagem 18"/>
+            <wp:docPr id="612909206" name="Imagem 18"/>
             <wp:cNvGraphicFramePr/>
             <a:graphic xmlns:a="http://schemas.openxmlformats.org/drawingml/2006/main">
               <a:graphicData uri="http://schemas.openxmlformats.org/drawingml/2006/picture">
                 <pic:pic xmlns:pic="http://schemas.openxmlformats.org/drawingml/2006/picture">
                   <pic:nvPicPr>
-                    <pic:cNvPr id="135312255" name=""/>
+                    <pic:cNvPr id="612909206" name=""/>
                     <pic:cNvPicPr/>
                   </pic:nvPicPr>
                   <pic:blipFill>
@@ -10243,16 +10264,16 @@
         </w:rPr>
         <w:lastRenderedPageBreak/>
         <w:drawing>
-          <wp:inline distT="0" distB="0" distL="0" distR="0" wp14:anchorId="26A83E0F" wp14:editId="745B57D1">
+          <wp:inline distT="0" distB="0" distL="0" distR="0" wp14:anchorId="71F57173" wp14:editId="49608813">
             <wp:extent cx="5120640" cy="4627581"/>
             <wp:effectExtent l="19050" t="19050" r="22860" b="20955"/>
-            <wp:docPr id="53034778" name="Imagem 19"/>
+            <wp:docPr id="593680714" name="Imagem 19"/>
             <wp:cNvGraphicFramePr/>
             <a:graphic xmlns:a="http://schemas.openxmlformats.org/drawingml/2006/main">
               <a:graphicData uri="http://schemas.openxmlformats.org/drawingml/2006/picture">
                 <pic:pic xmlns:pic="http://schemas.openxmlformats.org/drawingml/2006/picture">
                   <pic:nvPicPr>
-                    <pic:cNvPr id="53034778" name=""/>
+                    <pic:cNvPr id="593680714" name=""/>
                     <pic:cNvPicPr/>
                   </pic:nvPicPr>
                   <pic:blipFill>
@@ -10386,7 +10407,7 @@
           <w:sz w:val="27"/>
         </w:rPr>
       </w:pPr>
-      <w:bookmarkStart w:id="20" w:name="_Toc236511117"/>
+      <w:bookmarkStart w:id="20" w:name="_Toc236512832"/>
       <w:r>
         <w:rPr>
           <w:rFonts w:ascii="Montserrat" w:hAnsi="Montserrat"/>
@@ -10427,16 +10448,16 @@
         </w:rPr>
         <w:lastRenderedPageBreak/>
         <w:drawing>
-          <wp:inline distT="0" distB="0" distL="0" distR="0" wp14:anchorId="121128F0" wp14:editId="65C575C8">
+          <wp:inline distT="0" distB="0" distL="0" distR="0" wp14:anchorId="42A53382" wp14:editId="6B824780">
             <wp:extent cx="5120640" cy="4627581"/>
             <wp:effectExtent l="19050" t="19050" r="22860" b="20955"/>
-            <wp:docPr id="1448338968" name="Imagem 20"/>
+            <wp:docPr id="1525050554" name="Imagem 20"/>
             <wp:cNvGraphicFramePr/>
             <a:graphic xmlns:a="http://schemas.openxmlformats.org/drawingml/2006/main">
               <a:graphicData uri="http://schemas.openxmlformats.org/drawingml/2006/picture">
                 <pic:pic xmlns:pic="http://schemas.openxmlformats.org/drawingml/2006/picture">
                   <pic:nvPicPr>
-                    <pic:cNvPr id="1448338968" name=""/>
+                    <pic:cNvPr id="1525050554" name=""/>
                     <pic:cNvPicPr/>
                   </pic:nvPicPr>
                   <pic:blipFill>
@@ -10504,16 +10525,16 @@
         </w:rPr>
         <w:lastRenderedPageBreak/>
         <w:drawing>
-          <wp:inline distT="0" distB="0" distL="0" distR="0" wp14:anchorId="0AF9F074" wp14:editId="5AD39CFE">
+          <wp:inline distT="0" distB="0" distL="0" distR="0" wp14:anchorId="02123FA8" wp14:editId="006C757E">
             <wp:extent cx="5120640" cy="4627581"/>
             <wp:effectExtent l="19050" t="19050" r="22860" b="20955"/>
-            <wp:docPr id="1440783318" name="Imagem 21"/>
+            <wp:docPr id="844476249" name="Imagem 21"/>
             <wp:cNvGraphicFramePr/>
             <a:graphic xmlns:a="http://schemas.openxmlformats.org/drawingml/2006/main">
               <a:graphicData uri="http://schemas.openxmlformats.org/drawingml/2006/picture">
                 <pic:pic xmlns:pic="http://schemas.openxmlformats.org/drawingml/2006/picture">
                   <pic:nvPicPr>
-                    <pic:cNvPr id="1440783318" name=""/>
+                    <pic:cNvPr id="844476249" name=""/>
                     <pic:cNvPicPr/>
                   </pic:nvPicPr>
                   <pic:blipFill>
@@ -10702,7 +10723,7 @@
           <w:sz w:val="27"/>
         </w:rPr>
       </w:pPr>
-      <w:bookmarkStart w:id="21" w:name="_Toc236511118"/>
+      <w:bookmarkStart w:id="21" w:name="_Toc236512833"/>
       <w:r>
         <w:rPr>
           <w:rFonts w:ascii="Montserrat" w:hAnsi="Montserrat"/>
@@ -10742,16 +10763,16 @@
           <w:noProof/>
         </w:rPr>
         <w:drawing>
-          <wp:inline distT="0" distB="0" distL="0" distR="0" wp14:anchorId="786E8D24" wp14:editId="5F5CFBB8">
+          <wp:inline distT="0" distB="0" distL="0" distR="0" wp14:anchorId="5332DCE1" wp14:editId="25F3A1B4">
             <wp:extent cx="5120640" cy="4627581"/>
             <wp:effectExtent l="19050" t="19050" r="22860" b="20955"/>
-            <wp:docPr id="1835121377" name="Imagem 22"/>
+            <wp:docPr id="25091806" name="Imagem 22"/>
             <wp:cNvGraphicFramePr/>
             <a:graphic xmlns:a="http://schemas.openxmlformats.org/drawingml/2006/main">
               <a:graphicData uri="http://schemas.openxmlformats.org/drawingml/2006/picture">
                 <pic:pic xmlns:pic="http://schemas.openxmlformats.org/drawingml/2006/picture">
                   <pic:nvPicPr>
-                    <pic:cNvPr id="1835121377" name=""/>
+                    <pic:cNvPr id="25091806" name=""/>
                     <pic:cNvPicPr/>
                   </pic:nvPicPr>
                   <pic:blipFill>
@@ -10819,16 +10840,16 @@
         </w:rPr>
         <w:lastRenderedPageBreak/>
         <w:drawing>
-          <wp:inline distT="0" distB="0" distL="0" distR="0" wp14:anchorId="79701EE1" wp14:editId="071B174E">
+          <wp:inline distT="0" distB="0" distL="0" distR="0" wp14:anchorId="2F75ACC6" wp14:editId="26D4999F">
             <wp:extent cx="5120640" cy="4627581"/>
             <wp:effectExtent l="19050" t="19050" r="22860" b="20955"/>
-            <wp:docPr id="1769195559" name="Imagem 23"/>
+            <wp:docPr id="1381072656" name="Imagem 23"/>
             <wp:cNvGraphicFramePr/>
             <a:graphic xmlns:a="http://schemas.openxmlformats.org/drawingml/2006/main">
               <a:graphicData uri="http://schemas.openxmlformats.org/drawingml/2006/picture">
                 <pic:pic xmlns:pic="http://schemas.openxmlformats.org/drawingml/2006/picture">
                   <pic:nvPicPr>
-                    <pic:cNvPr id="1769195559" name=""/>
+                    <pic:cNvPr id="1381072656" name=""/>
                     <pic:cNvPicPr/>
                   </pic:nvPicPr>
                   <pic:blipFill>
@@ -10986,7 +11007,7 @@
           <w:sz w:val="27"/>
         </w:rPr>
       </w:pPr>
-      <w:bookmarkStart w:id="22" w:name="_Toc236511119"/>
+      <w:bookmarkStart w:id="22" w:name="_Toc236512834"/>
       <w:r>
         <w:rPr>
           <w:rFonts w:ascii="Montserrat" w:hAnsi="Montserrat"/>
@@ -11027,16 +11048,16 @@
         </w:rPr>
         <w:lastRenderedPageBreak/>
         <w:drawing>
-          <wp:inline distT="0" distB="0" distL="0" distR="0" wp14:anchorId="3D53AC5A" wp14:editId="3706424F">
+          <wp:inline distT="0" distB="0" distL="0" distR="0" wp14:anchorId="234D311A" wp14:editId="6515FD76">
             <wp:extent cx="5120640" cy="4627581"/>
             <wp:effectExtent l="19050" t="19050" r="22860" b="20955"/>
-            <wp:docPr id="740126184" name="Imagem 24"/>
+            <wp:docPr id="1533476161" name="Imagem 24"/>
             <wp:cNvGraphicFramePr/>
             <a:graphic xmlns:a="http://schemas.openxmlformats.org/drawingml/2006/main">
               <a:graphicData uri="http://schemas.openxmlformats.org/drawingml/2006/picture">
                 <pic:pic xmlns:pic="http://schemas.openxmlformats.org/drawingml/2006/picture">
                   <pic:nvPicPr>
-                    <pic:cNvPr id="740126184" name=""/>
+                    <pic:cNvPr id="1533476161" name=""/>
                     <pic:cNvPicPr/>
                   </pic:nvPicPr>
                   <pic:blipFill>
@@ -11104,16 +11125,16 @@
         </w:rPr>
         <w:lastRenderedPageBreak/>
         <w:drawing>
-          <wp:inline distT="0" distB="0" distL="0" distR="0" wp14:anchorId="5312EFF9" wp14:editId="427657CF">
+          <wp:inline distT="0" distB="0" distL="0" distR="0" wp14:anchorId="10DAEF6D" wp14:editId="1C790056">
             <wp:extent cx="5120640" cy="4627581"/>
             <wp:effectExtent l="19050" t="19050" r="22860" b="20955"/>
-            <wp:docPr id="559092173" name="Imagem 25"/>
+            <wp:docPr id="1521653188" name="Imagem 25"/>
             <wp:cNvGraphicFramePr/>
             <a:graphic xmlns:a="http://schemas.openxmlformats.org/drawingml/2006/main">
               <a:graphicData uri="http://schemas.openxmlformats.org/drawingml/2006/picture">
                 <pic:pic xmlns:pic="http://schemas.openxmlformats.org/drawingml/2006/picture">
                   <pic:nvPicPr>
-                    <pic:cNvPr id="559092173" name=""/>
+                    <pic:cNvPr id="1521653188" name=""/>
                     <pic:cNvPicPr/>
                   </pic:nvPicPr>
                   <pic:blipFill>
@@ -11247,7 +11268,7 @@
           <w:sz w:val="27"/>
         </w:rPr>
       </w:pPr>
-      <w:bookmarkStart w:id="23" w:name="_Toc236511120"/>
+      <w:bookmarkStart w:id="23" w:name="_Toc236512835"/>
       <w:r>
         <w:rPr>
           <w:rFonts w:ascii="Montserrat" w:hAnsi="Montserrat"/>
@@ -11288,16 +11309,16 @@
         </w:rPr>
         <w:lastRenderedPageBreak/>
         <w:drawing>
-          <wp:inline distT="0" distB="0" distL="0" distR="0" wp14:anchorId="015C7230" wp14:editId="427E41F9">
+          <wp:inline distT="0" distB="0" distL="0" distR="0" wp14:anchorId="496CE83D" wp14:editId="56686879">
             <wp:extent cx="5120640" cy="4627581"/>
             <wp:effectExtent l="19050" t="19050" r="22860" b="20955"/>
-            <wp:docPr id="1680865952" name="Imagem 26"/>
+            <wp:docPr id="1593424722" name="Imagem 26"/>
             <wp:cNvGraphicFramePr/>
             <a:graphic xmlns:a="http://schemas.openxmlformats.org/drawingml/2006/main">
               <a:graphicData uri="http://schemas.openxmlformats.org/drawingml/2006/picture">
                 <pic:pic xmlns:pic="http://schemas.openxmlformats.org/drawingml/2006/picture">
                   <pic:nvPicPr>
-                    <pic:cNvPr id="1680865952" name=""/>
+                    <pic:cNvPr id="1593424722" name=""/>
                     <pic:cNvPicPr/>
                   </pic:nvPicPr>
                   <pic:blipFill>
@@ -11380,9 +11401,21 @@
           <w:bottom w:val="single" w:sz="4" w:space="0" w:color="E4E4E7"/>
         </w:pBdr>
         <w:spacing w:before="80" w:after="200"/>
-      </w:pPr>
-      <w:bookmarkStart w:id="24" w:name="_Toc236511121"/>
-      <w:r>
+        <w:rPr>
+          <w:rFonts w:ascii="Montserrat" w:hAnsi="Montserrat"/>
+          <w:b/>
+          <w:color w:val="1A1A1A"/>
+          <w:sz w:val="34"/>
+        </w:rPr>
+      </w:pPr>
+      <w:bookmarkStart w:id="24" w:name="_Toc236512836"/>
+      <w:r>
+        <w:rPr>
+          <w:rFonts w:ascii="Montserrat" w:hAnsi="Montserrat"/>
+          <w:b/>
+          <w:color w:val="1A1A1A"/>
+          <w:sz w:val="34"/>
+        </w:rPr>
         <w:lastRenderedPageBreak/>
         <w:t>4. Gerando os relatorios finais</w:t>
       </w:r>
@@ -11417,7 +11450,7 @@
           <w:sz w:val="27"/>
         </w:rPr>
       </w:pPr>
-      <w:bookmarkStart w:id="25" w:name="_Toc236511122"/>
+      <w:bookmarkStart w:id="25" w:name="_Toc236512837"/>
       <w:r>
         <w:rPr>
           <w:rFonts w:ascii="Montserrat" w:hAnsi="Montserrat"/>
@@ -11457,16 +11490,16 @@
           <w:noProof/>
         </w:rPr>
         <w:drawing>
-          <wp:inline distT="0" distB="0" distL="0" distR="0" wp14:anchorId="100D8185" wp14:editId="1E6721D0">
+          <wp:inline distT="0" distB="0" distL="0" distR="0" wp14:anchorId="6923B590" wp14:editId="15BFB8A9">
             <wp:extent cx="5120640" cy="4627581"/>
             <wp:effectExtent l="19050" t="19050" r="22860" b="20955"/>
-            <wp:docPr id="328892465" name="Imagem 27"/>
+            <wp:docPr id="951021129" name="Imagem 27"/>
             <wp:cNvGraphicFramePr/>
             <a:graphic xmlns:a="http://schemas.openxmlformats.org/drawingml/2006/main">
               <a:graphicData uri="http://schemas.openxmlformats.org/drawingml/2006/picture">
                 <pic:pic xmlns:pic="http://schemas.openxmlformats.org/drawingml/2006/picture">
                   <pic:nvPicPr>
-                    <pic:cNvPr id="328892465" name=""/>
+                    <pic:cNvPr id="951021129" name=""/>
                     <pic:cNvPicPr/>
                   </pic:nvPicPr>
                   <pic:blipFill>
@@ -11534,16 +11567,16 @@
         </w:rPr>
         <w:lastRenderedPageBreak/>
         <w:drawing>
-          <wp:inline distT="0" distB="0" distL="0" distR="0" wp14:anchorId="7EDD9662" wp14:editId="09A173C6">
+          <wp:inline distT="0" distB="0" distL="0" distR="0" wp14:anchorId="5490406B" wp14:editId="393A7A52">
             <wp:extent cx="5120640" cy="4627581"/>
             <wp:effectExtent l="19050" t="19050" r="22860" b="20955"/>
-            <wp:docPr id="786958400" name="Imagem 28"/>
+            <wp:docPr id="508117085" name="Imagem 28"/>
             <wp:cNvGraphicFramePr/>
             <a:graphic xmlns:a="http://schemas.openxmlformats.org/drawingml/2006/main">
               <a:graphicData uri="http://schemas.openxmlformats.org/drawingml/2006/picture">
                 <pic:pic xmlns:pic="http://schemas.openxmlformats.org/drawingml/2006/picture">
                   <pic:nvPicPr>
-                    <pic:cNvPr id="786958400" name=""/>
+                    <pic:cNvPr id="508117085" name=""/>
                     <pic:cNvPicPr/>
                   </pic:nvPicPr>
                   <pic:blipFill>
@@ -11611,16 +11644,16 @@
         </w:rPr>
         <w:lastRenderedPageBreak/>
         <w:drawing>
-          <wp:inline distT="0" distB="0" distL="0" distR="0" wp14:anchorId="736003CF" wp14:editId="79AFE39C">
+          <wp:inline distT="0" distB="0" distL="0" distR="0" wp14:anchorId="1E3A9A9D" wp14:editId="6D9DA61B">
             <wp:extent cx="5120640" cy="4627581"/>
             <wp:effectExtent l="19050" t="19050" r="22860" b="20955"/>
-            <wp:docPr id="1303706007" name="Imagem 29"/>
+            <wp:docPr id="1486857146" name="Imagem 29"/>
             <wp:cNvGraphicFramePr/>
             <a:graphic xmlns:a="http://schemas.openxmlformats.org/drawingml/2006/main">
               <a:graphicData uri="http://schemas.openxmlformats.org/drawingml/2006/picture">
                 <pic:pic xmlns:pic="http://schemas.openxmlformats.org/drawingml/2006/picture">
                   <pic:nvPicPr>
-                    <pic:cNvPr id="1303706007" name=""/>
+                    <pic:cNvPr id="1486857146" name=""/>
                     <pic:cNvPicPr/>
                   </pic:nvPicPr>
                   <pic:blipFill>
@@ -11757,16 +11790,16 @@
         </w:rPr>
         <w:lastRenderedPageBreak/>
         <w:drawing>
-          <wp:inline distT="0" distB="0" distL="0" distR="0" wp14:anchorId="42A410E8" wp14:editId="7DB70BE7">
+          <wp:inline distT="0" distB="0" distL="0" distR="0" wp14:anchorId="2BDF34BC" wp14:editId="2216A3E3">
             <wp:extent cx="5120640" cy="1715571"/>
             <wp:effectExtent l="19050" t="19050" r="22860" b="18415"/>
-            <wp:docPr id="1732945975" name="Imagem 30"/>
+            <wp:docPr id="920220010" name="Imagem 30"/>
             <wp:cNvGraphicFramePr/>
             <a:graphic xmlns:a="http://schemas.openxmlformats.org/drawingml/2006/main">
               <a:graphicData uri="http://schemas.openxmlformats.org/drawingml/2006/picture">
                 <pic:pic xmlns:pic="http://schemas.openxmlformats.org/drawingml/2006/picture">
                   <pic:nvPicPr>
-                    <pic:cNvPr id="1732945975" name=""/>
+                    <pic:cNvPr id="920220010" name=""/>
                     <pic:cNvPicPr/>
                   </pic:nvPicPr>
                   <pic:blipFill>
@@ -11903,16 +11936,16 @@
         </w:rPr>
         <w:lastRenderedPageBreak/>
         <w:drawing>
-          <wp:inline distT="0" distB="0" distL="0" distR="0" wp14:anchorId="1F3F68AF" wp14:editId="5AFDCABF">
+          <wp:inline distT="0" distB="0" distL="0" distR="0" wp14:anchorId="50202647" wp14:editId="5C239D50">
             <wp:extent cx="5120640" cy="3282818"/>
             <wp:effectExtent l="19050" t="19050" r="22860" b="13335"/>
-            <wp:docPr id="1191652161" name="Imagem 31"/>
+            <wp:docPr id="1320279574" name="Imagem 31"/>
             <wp:cNvGraphicFramePr/>
             <a:graphic xmlns:a="http://schemas.openxmlformats.org/drawingml/2006/main">
               <a:graphicData uri="http://schemas.openxmlformats.org/drawingml/2006/picture">
                 <pic:pic xmlns:pic="http://schemas.openxmlformats.org/drawingml/2006/picture">
                   <pic:nvPicPr>
-                    <pic:cNvPr id="1191652161" name=""/>
+                    <pic:cNvPr id="1320279574" name=""/>
                     <pic:cNvPicPr/>
                   </pic:nvPicPr>
                   <pic:blipFill>
@@ -12024,16 +12057,16 @@
           <w:noProof/>
         </w:rPr>
         <w:drawing>
-          <wp:inline distT="0" distB="0" distL="0" distR="0" wp14:anchorId="04BE5741" wp14:editId="249F437E">
+          <wp:inline distT="0" distB="0" distL="0" distR="0" wp14:anchorId="367865F7" wp14:editId="7B3BE62D">
             <wp:extent cx="5120640" cy="1515102"/>
             <wp:effectExtent l="19050" t="19050" r="22860" b="28575"/>
-            <wp:docPr id="985594203" name="Imagem 32"/>
+            <wp:docPr id="1395541216" name="Imagem 32"/>
             <wp:cNvGraphicFramePr/>
             <a:graphic xmlns:a="http://schemas.openxmlformats.org/drawingml/2006/main">
               <a:graphicData uri="http://schemas.openxmlformats.org/drawingml/2006/picture">
                 <pic:pic xmlns:pic="http://schemas.openxmlformats.org/drawingml/2006/picture">
                   <pic:nvPicPr>
-                    <pic:cNvPr id="985594203" name=""/>
+                    <pic:cNvPr id="1395541216" name=""/>
                     <pic:cNvPicPr/>
                   </pic:nvPicPr>
                   <pic:blipFill>
@@ -12112,7 +12145,7 @@
           <w:sz w:val="22"/>
         </w:rPr>
         <w:lastRenderedPageBreak/>
-        <w:t>No rodape do Painel, o botao Historico de versoes mostra todas as vezes que este relatorio foi salvo, com data/hora e quem salvou.</w:t>
+        <w:t>Ainda em Editar dados, o cartao Resultados alcancados registra o desempenho real do portfolio: Descricao, Tipo (Indicador / Entrega / Beneficio), Planejado e Alcancado.</w:t>
       </w:r>
     </w:p>
     <w:p>
@@ -12133,7 +12166,7 @@
           <w:color w:val="6A6A70"/>
           <w:sz w:val="21"/>
         </w:rPr>
-        <w:t>Versionamento: toda vez que o relatorio e salvo (Salvar e ver painel), o sistema arquiva uma copia completa dos dados daquele momento, alem de atualizar a versao atual. Isso preserva as referencias mensais anteriores, que antes eram sobrescritas a cada novo salvamento. Ao clicar em Visualizar numa versao antiga, o Painel passa a mostrar aquele instantaneo, com um aviso amarelo no topo (Visualizando versao... - somente leitura) e um botao Voltar a versao atual. Enquanto uma versao antiga esta sendo visualizada, as abas Editar dados e Importar Project ficam bloqueadas - e preciso voltar a versao atual antes de editar.</w:t>
+        <w:t>Reporte de Resultados (D06.5): este cartao e a base do momento em que o Gerente de Projetos e o Dono do Negocio apresentam as instancias de decisao no que o projeto foi alcancado - nao so o que foi planejado, mas indicadores, entregas e beneficios de fato realizados, lado a lado com a meta original. E uma lista simples, independente dos projetos cadastrados, com o mesmo comportamento de Entraves e Encaminhamentos: continua visivel no Painel mesmo sem nenhum projeto informado, e sai no CSV exportado. Junto com os Entraves e Encaminhamentos (D06.6/D06.7), completa os tres artefatos de governanca da Diretriz D06 sem exigir um 13o formulario separado - o Reporte de Resultados e atendido dentro do proprio Relatorio de Situacao.</w:t>
       </w:r>
     </w:p>
     <w:p>
@@ -12146,20 +12179,141 @@
           <w:noProof/>
         </w:rPr>
         <w:drawing>
-          <wp:inline distT="0" distB="0" distL="0" distR="0" wp14:anchorId="379BA851" wp14:editId="4DFEEEE8">
-            <wp:extent cx="5120640" cy="1125174"/>
-            <wp:effectExtent l="19050" t="19050" r="22860" b="18415"/>
-            <wp:docPr id="308139623" name="Imagem 33"/>
+          <wp:inline distT="0" distB="0" distL="0" distR="0" wp14:anchorId="5D647BE4" wp14:editId="1CFEF80E">
+            <wp:extent cx="5120640" cy="1391113"/>
+            <wp:effectExtent l="19050" t="19050" r="22860" b="19050"/>
+            <wp:docPr id="157540070" name="Imagem 33"/>
             <wp:cNvGraphicFramePr/>
             <a:graphic xmlns:a="http://schemas.openxmlformats.org/drawingml/2006/main">
               <a:graphicData uri="http://schemas.openxmlformats.org/drawingml/2006/picture">
                 <pic:pic xmlns:pic="http://schemas.openxmlformats.org/drawingml/2006/picture">
                   <pic:nvPicPr>
-                    <pic:cNvPr id="308139623" name=""/>
+                    <pic:cNvPr id="157540070" name=""/>
                     <pic:cNvPicPr/>
                   </pic:nvPicPr>
                   <pic:blipFill>
                     <a:blip r:embed="rId39">
+                      <a:extLst>
+                        <a:ext uri="{28A0092B-C50C-407E-A947-70E740481C1C}">
+                          <a14:useLocalDpi xmlns:a14="http://schemas.microsoft.com/office/drawing/2010/main" val="0"/>
+                        </a:ext>
+                      </a:extLst>
+                    </a:blip>
+                    <a:stretch>
+                      <a:fillRect/>
+                    </a:stretch>
+                  </pic:blipFill>
+                  <pic:spPr>
+                    <a:xfrm>
+                      <a:off x="0" y="0"/>
+                      <a:ext cx="5120640" cy="1391113"/>
+                    </a:xfrm>
+                    <a:prstGeom prst="rect">
+                      <a:avLst/>
+                    </a:prstGeom>
+                    <a:ln w="9525">
+                      <a:solidFill>
+                        <a:srgbClr val="D1D5DB"/>
+                      </a:solidFill>
+                    </a:ln>
+                  </pic:spPr>
+                </pic:pic>
+              </a:graphicData>
+            </a:graphic>
+          </wp:inline>
+        </w:drawing>
+      </w:r>
+    </w:p>
+    <w:p>
+      <w:pPr>
+        <w:spacing w:before="120" w:after="280"/>
+        <w:jc w:val="center"/>
+        <w:rPr>
+          <w:rFonts w:ascii="Montserrat" w:hAnsi="Montserrat"/>
+          <w:i/>
+          <w:color w:val="6A6A70"/>
+          <w:sz w:val="19"/>
+        </w:rPr>
+      </w:pPr>
+      <w:r>
+        <w:rPr>
+          <w:rFonts w:ascii="Montserrat" w:hAnsi="Montserrat"/>
+          <w:i/>
+          <w:color w:val="6A6A70"/>
+          <w:sz w:val="19"/>
+        </w:rPr>
+        <w:t>Secao Resultados alcancados no Painel, com selos coloridos por Indicador, Entrega e Beneficio.</w:t>
+      </w:r>
+    </w:p>
+    <w:p>
+      <w:pPr>
+        <w:pStyle w:val="PargrafodaLista"/>
+        <w:numPr>
+          <w:ilvl w:val="0"/>
+          <w:numId w:val="15"/>
+        </w:numPr>
+        <w:spacing w:after="80" w:line="260" w:lineRule="auto"/>
+        <w:ind w:left="700"/>
+        <w:rPr>
+          <w:rFonts w:ascii="Montserrat" w:hAnsi="Montserrat"/>
+          <w:color w:val="1A1A1A"/>
+          <w:sz w:val="22"/>
+        </w:rPr>
+      </w:pPr>
+      <w:r>
+        <w:rPr>
+          <w:rFonts w:ascii="Montserrat" w:hAnsi="Montserrat"/>
+          <w:color w:val="1A1A1A"/>
+          <w:sz w:val="22"/>
+        </w:rPr>
+        <w:t>No rodape do Painel, o botao Historico de versoes mostra todas as vezes que este relatorio foi salvo, com data/hora e quem salvou.</w:t>
+      </w:r>
+    </w:p>
+    <w:p>
+      <w:pPr>
+        <w:spacing w:before="160" w:after="200"/>
+        <w:ind w:left="283"/>
+        <w:rPr>
+          <w:rFonts w:ascii="Montserrat" w:hAnsi="Montserrat"/>
+          <w:i/>
+          <w:color w:val="6A6A70"/>
+          <w:sz w:val="21"/>
+        </w:rPr>
+      </w:pPr>
+      <w:r>
+        <w:rPr>
+          <w:rFonts w:ascii="Montserrat" w:hAnsi="Montserrat"/>
+          <w:i/>
+          <w:color w:val="6A6A70"/>
+          <w:sz w:val="21"/>
+        </w:rPr>
+        <w:t>Versionamento: toda vez que o relatorio e salvo (Salvar e ver painel), o sistema arquiva uma copia completa dos dados daquele momento, alem de atualizar a versao atual. Isso preserva as referencias mensais anteriores, que antes eram sobrescritas a cada novo salvamento. Ao clicar em Visualizar numa versao antiga, o Painel passa a mostrar aquele instantaneo, com um aviso amarelo no topo (Visualizando versao... - somente leitura) e um botao Voltar a versao atual. Enquanto uma versao antiga esta sendo visualizada, as abas Editar dados e Importar Project ficam bloqueadas - e preciso voltar a versao atual antes de editar.</w:t>
+      </w:r>
+    </w:p>
+    <w:p>
+      <w:pPr>
+        <w:spacing w:before="120" w:after="40"/>
+        <w:jc w:val="center"/>
+      </w:pPr>
+      <w:r>
+        <w:rPr>
+          <w:noProof/>
+        </w:rPr>
+        <w:drawing>
+          <wp:inline distT="0" distB="0" distL="0" distR="0" wp14:anchorId="7C037930" wp14:editId="0B6B8147">
+            <wp:extent cx="5120640" cy="1125174"/>
+            <wp:effectExtent l="19050" t="19050" r="22860" b="18415"/>
+            <wp:docPr id="173184135" name="Imagem 34"/>
+            <wp:cNvGraphicFramePr/>
+            <a:graphic xmlns:a="http://schemas.openxmlformats.org/drawingml/2006/main">
+              <a:graphicData uri="http://schemas.openxmlformats.org/drawingml/2006/picture">
+                <pic:pic xmlns:pic="http://schemas.openxmlformats.org/drawingml/2006/picture">
+                  <pic:nvPicPr>
+                    <pic:cNvPr id="173184135" name=""/>
+                    <pic:cNvPicPr/>
+                  </pic:nvPicPr>
+                  <pic:blipFill>
+                    <a:blip r:embed="rId40">
                       <a:extLst>
                         <a:ext uri="{28A0092B-C50C-407E-A947-70E740481C1C}">
                           <a14:useLocalDpi xmlns:a14="http://schemas.microsoft.com/office/drawing/2010/main" val="0"/>
@@ -12209,6 +12363,7 @@
           <w:color w:val="6A6A70"/>
           <w:sz w:val="19"/>
         </w:rPr>
+        <w:lastRenderedPageBreak/>
         <w:t>Aviso de versao historica (somente leitura), com o botao para voltar a versao atual.</w:t>
       </w:r>
     </w:p>
@@ -12244,7 +12399,7 @@
           <w:sz w:val="27"/>
         </w:rPr>
       </w:pPr>
-      <w:bookmarkStart w:id="26" w:name="_Toc236511123"/>
+      <w:bookmarkStart w:id="26" w:name="_Toc236512838"/>
       <w:r>
         <w:rPr>
           <w:rFonts w:ascii="Montserrat" w:hAnsi="Montserrat"/>
@@ -12283,95 +12438,17 @@
         <w:rPr>
           <w:noProof/>
         </w:rPr>
-        <w:lastRenderedPageBreak/>
         <w:drawing>
-          <wp:inline distT="0" distB="0" distL="0" distR="0" wp14:anchorId="73F753AD" wp14:editId="030CF945">
+          <wp:inline distT="0" distB="0" distL="0" distR="0" wp14:anchorId="7314BFFB" wp14:editId="3011E1B5">
             <wp:extent cx="5120640" cy="4627581"/>
             <wp:effectExtent l="19050" t="19050" r="22860" b="20955"/>
-            <wp:docPr id="921193366" name="Imagem 34"/>
+            <wp:docPr id="530269832" name="Imagem 35"/>
             <wp:cNvGraphicFramePr/>
             <a:graphic xmlns:a="http://schemas.openxmlformats.org/drawingml/2006/main">
               <a:graphicData uri="http://schemas.openxmlformats.org/drawingml/2006/picture">
                 <pic:pic xmlns:pic="http://schemas.openxmlformats.org/drawingml/2006/picture">
                   <pic:nvPicPr>
-                    <pic:cNvPr id="921193366" name=""/>
-                    <pic:cNvPicPr/>
-                  </pic:nvPicPr>
-                  <pic:blipFill>
-                    <a:blip r:embed="rId40">
-                      <a:extLst>
-                        <a:ext uri="{28A0092B-C50C-407E-A947-70E740481C1C}">
-                          <a14:useLocalDpi xmlns:a14="http://schemas.microsoft.com/office/drawing/2010/main" val="0"/>
-                        </a:ext>
-                      </a:extLst>
-                    </a:blip>
-                    <a:stretch>
-                      <a:fillRect/>
-                    </a:stretch>
-                  </pic:blipFill>
-                  <pic:spPr>
-                    <a:xfrm>
-                      <a:off x="0" y="0"/>
-                      <a:ext cx="5120640" cy="4627581"/>
-                    </a:xfrm>
-                    <a:prstGeom prst="rect">
-                      <a:avLst/>
-                    </a:prstGeom>
-                    <a:ln w="9525">
-                      <a:solidFill>
-                        <a:srgbClr val="D1D5DB"/>
-                      </a:solidFill>
-                    </a:ln>
-                  </pic:spPr>
-                </pic:pic>
-              </a:graphicData>
-            </a:graphic>
-          </wp:inline>
-        </w:drawing>
-      </w:r>
-    </w:p>
-    <w:p>
-      <w:pPr>
-        <w:spacing w:before="120" w:after="280"/>
-        <w:jc w:val="center"/>
-        <w:rPr>
-          <w:rFonts w:ascii="Montserrat" w:hAnsi="Montserrat"/>
-          <w:i/>
-          <w:color w:val="6A6A70"/>
-          <w:sz w:val="19"/>
-        </w:rPr>
-      </w:pPr>
-      <w:r>
-        <w:rPr>
-          <w:rFonts w:ascii="Montserrat" w:hAnsi="Montserrat"/>
-          <w:i/>
-          <w:color w:val="6A6A70"/>
-          <w:sz w:val="19"/>
-        </w:rPr>
-        <w:t>Painel do Relatorio de Entregas e Beneficios (estado vazio).</w:t>
-      </w:r>
-    </w:p>
-    <w:p>
-      <w:pPr>
-        <w:spacing w:before="120" w:after="40"/>
-        <w:jc w:val="center"/>
-      </w:pPr>
-      <w:r>
-        <w:rPr>
-          <w:noProof/>
-        </w:rPr>
-        <w:lastRenderedPageBreak/>
-        <w:drawing>
-          <wp:inline distT="0" distB="0" distL="0" distR="0" wp14:anchorId="5FF01478" wp14:editId="089AE60E">
-            <wp:extent cx="5120640" cy="4627581"/>
-            <wp:effectExtent l="19050" t="19050" r="22860" b="20955"/>
-            <wp:docPr id="1757701604" name="Imagem 35"/>
-            <wp:cNvGraphicFramePr/>
-            <a:graphic xmlns:a="http://schemas.openxmlformats.org/drawingml/2006/main">
-              <a:graphicData uri="http://schemas.openxmlformats.org/drawingml/2006/picture">
-                <pic:pic xmlns:pic="http://schemas.openxmlformats.org/drawingml/2006/picture">
-                  <pic:nvPicPr>
-                    <pic:cNvPr id="1757701604" name=""/>
+                    <pic:cNvPr id="530269832" name=""/>
                     <pic:cNvPicPr/>
                   </pic:nvPicPr>
                   <pic:blipFill>
@@ -12425,6 +12502,83 @@
           <w:color w:val="6A6A70"/>
           <w:sz w:val="19"/>
         </w:rPr>
+        <w:t>Painel do Relatorio de Entregas e Beneficios (estado vazio).</w:t>
+      </w:r>
+    </w:p>
+    <w:p>
+      <w:pPr>
+        <w:spacing w:before="120" w:after="40"/>
+        <w:jc w:val="center"/>
+      </w:pPr>
+      <w:r>
+        <w:rPr>
+          <w:noProof/>
+        </w:rPr>
+        <w:lastRenderedPageBreak/>
+        <w:drawing>
+          <wp:inline distT="0" distB="0" distL="0" distR="0" wp14:anchorId="274EF7E1" wp14:editId="265BE8D9">
+            <wp:extent cx="5120640" cy="4627581"/>
+            <wp:effectExtent l="19050" t="19050" r="22860" b="20955"/>
+            <wp:docPr id="222500388" name="Imagem 36"/>
+            <wp:cNvGraphicFramePr/>
+            <a:graphic xmlns:a="http://schemas.openxmlformats.org/drawingml/2006/main">
+              <a:graphicData uri="http://schemas.openxmlformats.org/drawingml/2006/picture">
+                <pic:pic xmlns:pic="http://schemas.openxmlformats.org/drawingml/2006/picture">
+                  <pic:nvPicPr>
+                    <pic:cNvPr id="222500388" name=""/>
+                    <pic:cNvPicPr/>
+                  </pic:nvPicPr>
+                  <pic:blipFill>
+                    <a:blip r:embed="rId42">
+                      <a:extLst>
+                        <a:ext uri="{28A0092B-C50C-407E-A947-70E740481C1C}">
+                          <a14:useLocalDpi xmlns:a14="http://schemas.microsoft.com/office/drawing/2010/main" val="0"/>
+                        </a:ext>
+                      </a:extLst>
+                    </a:blip>
+                    <a:stretch>
+                      <a:fillRect/>
+                    </a:stretch>
+                  </pic:blipFill>
+                  <pic:spPr>
+                    <a:xfrm>
+                      <a:off x="0" y="0"/>
+                      <a:ext cx="5120640" cy="4627581"/>
+                    </a:xfrm>
+                    <a:prstGeom prst="rect">
+                      <a:avLst/>
+                    </a:prstGeom>
+                    <a:ln w="9525">
+                      <a:solidFill>
+                        <a:srgbClr val="D1D5DB"/>
+                      </a:solidFill>
+                    </a:ln>
+                  </pic:spPr>
+                </pic:pic>
+              </a:graphicData>
+            </a:graphic>
+          </wp:inline>
+        </w:drawing>
+      </w:r>
+    </w:p>
+    <w:p>
+      <w:pPr>
+        <w:spacing w:before="120" w:after="280"/>
+        <w:jc w:val="center"/>
+        <w:rPr>
+          <w:rFonts w:ascii="Montserrat" w:hAnsi="Montserrat"/>
+          <w:i/>
+          <w:color w:val="6A6A70"/>
+          <w:sz w:val="19"/>
+        </w:rPr>
+      </w:pPr>
+      <w:r>
+        <w:rPr>
+          <w:rFonts w:ascii="Montserrat" w:hAnsi="Montserrat"/>
+          <w:i/>
+          <w:color w:val="6A6A70"/>
+          <w:sz w:val="19"/>
+        </w:rPr>
         <w:t>Aba Editar dados: Ficha do Programa, o primeiro bloco a preencher.</w:t>
       </w:r>
     </w:p>
@@ -12508,20 +12662,20 @@
         </w:rPr>
         <w:lastRenderedPageBreak/>
         <w:drawing>
-          <wp:inline distT="0" distB="0" distL="0" distR="0" wp14:anchorId="1B60A27A" wp14:editId="4C147EA1">
+          <wp:inline distT="0" distB="0" distL="0" distR="0" wp14:anchorId="7143E304" wp14:editId="3F0F99B1">
             <wp:extent cx="5120640" cy="2144319"/>
             <wp:effectExtent l="19050" t="19050" r="22860" b="27940"/>
-            <wp:docPr id="1690166023" name="Imagem 36"/>
+            <wp:docPr id="743042476" name="Imagem 37"/>
             <wp:cNvGraphicFramePr/>
             <a:graphic xmlns:a="http://schemas.openxmlformats.org/drawingml/2006/main">
               <a:graphicData uri="http://schemas.openxmlformats.org/drawingml/2006/picture">
                 <pic:pic xmlns:pic="http://schemas.openxmlformats.org/drawingml/2006/picture">
                   <pic:nvPicPr>
-                    <pic:cNvPr id="1690166023" name=""/>
+                    <pic:cNvPr id="743042476" name=""/>
                     <pic:cNvPicPr/>
                   </pic:nvPicPr>
                   <pic:blipFill>
-                    <a:blip r:embed="rId42">
+                    <a:blip r:embed="rId43">
                       <a:extLst>
                         <a:ext uri="{28A0092B-C50C-407E-A947-70E740481C1C}">
                           <a14:useLocalDpi xmlns:a14="http://schemas.microsoft.com/office/drawing/2010/main" val="0"/>
@@ -12605,20 +12759,20 @@
           <w:noProof/>
         </w:rPr>
         <w:drawing>
-          <wp:inline distT="0" distB="0" distL="0" distR="0" wp14:anchorId="045A2235" wp14:editId="571AF9F0">
+          <wp:inline distT="0" distB="0" distL="0" distR="0" wp14:anchorId="7E1221C7" wp14:editId="44B7D14A">
             <wp:extent cx="5120640" cy="1055647"/>
             <wp:effectExtent l="19050" t="19050" r="22860" b="11430"/>
-            <wp:docPr id="1750319268" name="Imagem 37"/>
+            <wp:docPr id="1457280980" name="Imagem 38"/>
             <wp:cNvGraphicFramePr/>
             <a:graphic xmlns:a="http://schemas.openxmlformats.org/drawingml/2006/main">
               <a:graphicData uri="http://schemas.openxmlformats.org/drawingml/2006/picture">
                 <pic:pic xmlns:pic="http://schemas.openxmlformats.org/drawingml/2006/picture">
                   <pic:nvPicPr>
-                    <pic:cNvPr id="1750319268" name=""/>
+                    <pic:cNvPr id="1457280980" name=""/>
                     <pic:cNvPicPr/>
                   </pic:nvPicPr>
                   <pic:blipFill>
-                    <a:blip r:embed="rId43">
+                    <a:blip r:embed="rId44">
                       <a:extLst>
                         <a:ext uri="{28A0092B-C50C-407E-A947-70E740481C1C}">
                           <a14:useLocalDpi xmlns:a14="http://schemas.microsoft.com/office/drawing/2010/main" val="0"/>
@@ -12727,20 +12881,20 @@
         </w:rPr>
         <w:lastRenderedPageBreak/>
         <w:drawing>
-          <wp:inline distT="0" distB="0" distL="0" distR="0" wp14:anchorId="29CFC777" wp14:editId="4E2F8FD7">
+          <wp:inline distT="0" distB="0" distL="0" distR="0" wp14:anchorId="318726CD" wp14:editId="1FF7A3CD">
             <wp:extent cx="5120640" cy="3282818"/>
             <wp:effectExtent l="19050" t="19050" r="22860" b="13335"/>
-            <wp:docPr id="616034951" name="Imagem 38"/>
+            <wp:docPr id="1700471269" name="Imagem 39"/>
             <wp:cNvGraphicFramePr/>
             <a:graphic xmlns:a="http://schemas.openxmlformats.org/drawingml/2006/main">
               <a:graphicData uri="http://schemas.openxmlformats.org/drawingml/2006/picture">
                 <pic:pic xmlns:pic="http://schemas.openxmlformats.org/drawingml/2006/picture">
                   <pic:nvPicPr>
-                    <pic:cNvPr id="616034951" name=""/>
+                    <pic:cNvPr id="1700471269" name=""/>
                     <pic:cNvPicPr/>
                   </pic:nvPicPr>
                   <pic:blipFill>
-                    <a:blip r:embed="rId44">
+                    <a:blip r:embed="rId45">
                       <a:extLst>
                         <a:ext uri="{28A0092B-C50C-407E-A947-70E740481C1C}">
                           <a14:useLocalDpi xmlns:a14="http://schemas.microsoft.com/office/drawing/2010/main" val="0"/>
@@ -12869,20 +13023,20 @@
           <w:noProof/>
         </w:rPr>
         <w:drawing>
-          <wp:inline distT="0" distB="0" distL="0" distR="0" wp14:anchorId="0763DD1D" wp14:editId="05856D00">
+          <wp:inline distT="0" distB="0" distL="0" distR="0" wp14:anchorId="46DCF64B" wp14:editId="0E873A27">
             <wp:extent cx="5120640" cy="1978034"/>
             <wp:effectExtent l="19050" t="19050" r="22860" b="22225"/>
-            <wp:docPr id="82539887" name="Imagem 39"/>
+            <wp:docPr id="508670002" name="Imagem 40"/>
             <wp:cNvGraphicFramePr/>
             <a:graphic xmlns:a="http://schemas.openxmlformats.org/drawingml/2006/main">
               <a:graphicData uri="http://schemas.openxmlformats.org/drawingml/2006/picture">
                 <pic:pic xmlns:pic="http://schemas.openxmlformats.org/drawingml/2006/picture">
                   <pic:nvPicPr>
-                    <pic:cNvPr id="82539887" name=""/>
+                    <pic:cNvPr id="508670002" name=""/>
                     <pic:cNvPicPr/>
                   </pic:nvPicPr>
                   <pic:blipFill>
-                    <a:blip r:embed="rId45">
+                    <a:blip r:embed="rId46">
                       <a:extLst>
                         <a:ext uri="{28A0092B-C50C-407E-A947-70E740481C1C}">
                           <a14:useLocalDpi xmlns:a14="http://schemas.microsoft.com/office/drawing/2010/main" val="0"/>
@@ -12951,7 +13105,7 @@
           <w:sz w:val="34"/>
         </w:rPr>
       </w:pPr>
-      <w:bookmarkStart w:id="27" w:name="_Toc236511124"/>
+      <w:bookmarkStart w:id="27" w:name="_Toc236512839"/>
       <w:r>
         <w:rPr>
           <w:rFonts w:ascii="Montserrat" w:hAnsi="Montserrat"/>
@@ -13011,7 +13165,7 @@
           <w:sz w:val="27"/>
         </w:rPr>
       </w:pPr>
-      <w:bookmarkStart w:id="28" w:name="_Toc236511125"/>
+      <w:bookmarkStart w:id="28" w:name="_Toc236512840"/>
       <w:r>
         <w:rPr>
           <w:rFonts w:ascii="Montserrat" w:hAnsi="Montserrat"/>
@@ -13051,134 +13205,16 @@
           <w:noProof/>
         </w:rPr>
         <w:drawing>
-          <wp:inline distT="0" distB="0" distL="0" distR="0" wp14:anchorId="50D6FB74" wp14:editId="3D28B67F">
+          <wp:inline distT="0" distB="0" distL="0" distR="0" wp14:anchorId="39974CF8" wp14:editId="6C163B57">
             <wp:extent cx="5303520" cy="4792851"/>
             <wp:effectExtent l="19050" t="19050" r="11430" b="27305"/>
-            <wp:docPr id="363052747" name="Imagem 40"/>
+            <wp:docPr id="1877327523" name="Imagem 41"/>
             <wp:cNvGraphicFramePr/>
             <a:graphic xmlns:a="http://schemas.openxmlformats.org/drawingml/2006/main">
               <a:graphicData uri="http://schemas.openxmlformats.org/drawingml/2006/picture">
                 <pic:pic xmlns:pic="http://schemas.openxmlformats.org/drawingml/2006/picture">
                   <pic:nvPicPr>
-                    <pic:cNvPr id="363052747" name=""/>
-                    <pic:cNvPicPr/>
-                  </pic:nvPicPr>
-                  <pic:blipFill>
-                    <a:blip r:embed="rId46">
-                      <a:extLst>
-                        <a:ext uri="{28A0092B-C50C-407E-A947-70E740481C1C}">
-                          <a14:useLocalDpi xmlns:a14="http://schemas.microsoft.com/office/drawing/2010/main" val="0"/>
-                        </a:ext>
-                      </a:extLst>
-                    </a:blip>
-                    <a:stretch>
-                      <a:fillRect/>
-                    </a:stretch>
-                  </pic:blipFill>
-                  <pic:spPr>
-                    <a:xfrm>
-                      <a:off x="0" y="0"/>
-                      <a:ext cx="5303520" cy="4792851"/>
-                    </a:xfrm>
-                    <a:prstGeom prst="rect">
-                      <a:avLst/>
-                    </a:prstGeom>
-                    <a:ln w="9525">
-                      <a:solidFill>
-                        <a:srgbClr val="D1D5DB"/>
-                      </a:solidFill>
-                    </a:ln>
-                  </pic:spPr>
-                </pic:pic>
-              </a:graphicData>
-            </a:graphic>
-          </wp:inline>
-        </w:drawing>
-      </w:r>
-    </w:p>
-    <w:p>
-      <w:pPr>
-        <w:spacing w:before="120" w:after="280"/>
-        <w:jc w:val="center"/>
-        <w:rPr>
-          <w:rFonts w:ascii="Montserrat" w:hAnsi="Montserrat"/>
-          <w:i/>
-          <w:color w:val="6A6A70"/>
-          <w:sz w:val="19"/>
-        </w:rPr>
-      </w:pPr>
-      <w:r>
-        <w:rPr>
-          <w:rFonts w:ascii="Montserrat" w:hAnsi="Montserrat"/>
-          <w:i/>
-          <w:color w:val="6A6A70"/>
-          <w:sz w:val="19"/>
-        </w:rPr>
-        <w:lastRenderedPageBreak/>
-        <w:t>Quadro de conexoes com o fator F1 selecionado - o painel a direita mostra os beneficios que ele habilita.</w:t>
-      </w:r>
-    </w:p>
-    <w:p>
-      <w:pPr>
-        <w:pStyle w:val="Ttulo2"/>
-        <w:spacing w:before="320" w:after="120"/>
-        <w:rPr>
-          <w:rFonts w:ascii="Montserrat" w:hAnsi="Montserrat"/>
-          <w:b/>
-          <w:color w:val="B91D2E"/>
-          <w:sz w:val="27"/>
-        </w:rPr>
-      </w:pPr>
-      <w:bookmarkStart w:id="29" w:name="_Toc236511126"/>
-      <w:r>
-        <w:rPr>
-          <w:rFonts w:ascii="Montserrat" w:hAnsi="Montserrat"/>
-          <w:b/>
-          <w:color w:val="B91D2E"/>
-          <w:sz w:val="27"/>
-        </w:rPr>
-        <w:t>5.2 Simulador - e se...?</w:t>
-      </w:r>
-      <w:bookmarkEnd w:id="29"/>
-    </w:p>
-    <w:p>
-      <w:pPr>
-        <w:spacing w:line="280" w:lineRule="auto"/>
-        <w:rPr>
-          <w:rFonts w:ascii="Montserrat" w:hAnsi="Montserrat"/>
-          <w:color w:val="1A1A1A"/>
-          <w:sz w:val="22"/>
-        </w:rPr>
-      </w:pPr>
-      <w:r>
-        <w:rPr>
-          <w:rFonts w:ascii="Montserrat" w:hAnsi="Montserrat"/>
-          <w:color w:val="1A1A1A"/>
-          <w:sz w:val="22"/>
-        </w:rPr>
-        <w:t>Ajuste o quanto cada fator esta presente no seu projeto (0-100%) e veja o potencial estimado de cada dimensao de beneficio recalcular em tempo real.</w:t>
-      </w:r>
-    </w:p>
-    <w:p>
-      <w:pPr>
-        <w:spacing w:before="120" w:after="40"/>
-        <w:jc w:val="center"/>
-      </w:pPr>
-      <w:r>
-        <w:rPr>
-          <w:noProof/>
-        </w:rPr>
-        <w:drawing>
-          <wp:inline distT="0" distB="0" distL="0" distR="0" wp14:anchorId="7684348F" wp14:editId="0AAFDC45">
-            <wp:extent cx="5303520" cy="4792851"/>
-            <wp:effectExtent l="19050" t="19050" r="11430" b="27305"/>
-            <wp:docPr id="1900262563" name="Imagem 41"/>
-            <wp:cNvGraphicFramePr/>
-            <a:graphic xmlns:a="http://schemas.openxmlformats.org/drawingml/2006/main">
-              <a:graphicData uri="http://schemas.openxmlformats.org/drawingml/2006/picture">
-                <pic:pic xmlns:pic="http://schemas.openxmlformats.org/drawingml/2006/picture">
-                  <pic:nvPicPr>
-                    <pic:cNvPr id="1900262563" name=""/>
+                    <pic:cNvPr id="1877327523" name=""/>
                     <pic:cNvPicPr/>
                   </pic:nvPicPr>
                   <pic:blipFill>
@@ -13232,7 +13268,8 @@
           <w:color w:val="6A6A70"/>
           <w:sz w:val="19"/>
         </w:rPr>
-        <w:t>Simulador de fatores x beneficios. Abaixo dele, o aviso de login para quem quiser vincular a um projeto.</w:t>
+        <w:lastRenderedPageBreak/>
+        <w:t>Quadro de conexoes com o fator F1 selecionado - o painel a direita mostra os beneficios que ele habilita.</w:t>
       </w:r>
     </w:p>
     <w:p>
@@ -13246,7 +13283,7 @@
           <w:sz w:val="27"/>
         </w:rPr>
       </w:pPr>
-      <w:bookmarkStart w:id="30" w:name="_Toc236511127"/>
+      <w:bookmarkStart w:id="29" w:name="_Toc236512841"/>
       <w:r>
         <w:rPr>
           <w:rFonts w:ascii="Montserrat" w:hAnsi="Montserrat"/>
@@ -13254,9 +13291,9 @@
           <w:color w:val="B91D2E"/>
           <w:sz w:val="27"/>
         </w:rPr>
-        <w:t>5.3 Assistente de decisao em 8 perguntas</w:t>
-      </w:r>
-      <w:bookmarkEnd w:id="30"/>
+        <w:t>5.2 Simulador - e se...?</w:t>
+      </w:r>
+      <w:bookmarkEnd w:id="29"/>
     </w:p>
     <w:p>
       <w:pPr>
@@ -13273,7 +13310,7 @@
           <w:color w:val="1A1A1A"/>
           <w:sz w:val="22"/>
         </w:rPr>
-        <w:t>Responda a oito perguntas do semaforo de decisao, uma de cada vez. Ao final, o painel devolve um veredito com a regra aplicada.</w:t>
+        <w:t>Ajuste o quanto cada fator esta presente no seu projeto (0-100%) e veja o potencial estimado de cada dimensao de beneficio recalcular em tempo real.</w:t>
       </w:r>
     </w:p>
     <w:p>
@@ -13285,18 +13322,17 @@
         <w:rPr>
           <w:noProof/>
         </w:rPr>
-        <w:lastRenderedPageBreak/>
         <w:drawing>
-          <wp:inline distT="0" distB="0" distL="0" distR="0" wp14:anchorId="478D08C7" wp14:editId="0B295757">
+          <wp:inline distT="0" distB="0" distL="0" distR="0" wp14:anchorId="6A4D033B" wp14:editId="2D785E45">
             <wp:extent cx="5303520" cy="4792851"/>
             <wp:effectExtent l="19050" t="19050" r="11430" b="27305"/>
-            <wp:docPr id="912074100" name="Imagem 42"/>
+            <wp:docPr id="914841337" name="Imagem 42"/>
             <wp:cNvGraphicFramePr/>
             <a:graphic xmlns:a="http://schemas.openxmlformats.org/drawingml/2006/main">
               <a:graphicData uri="http://schemas.openxmlformats.org/drawingml/2006/picture">
                 <pic:pic xmlns:pic="http://schemas.openxmlformats.org/drawingml/2006/picture">
                   <pic:nvPicPr>
-                    <pic:cNvPr id="912074100" name=""/>
+                    <pic:cNvPr id="914841337" name=""/>
                     <pic:cNvPicPr/>
                   </pic:nvPicPr>
                   <pic:blipFill>
@@ -13350,7 +13386,48 @@
           <w:color w:val="6A6A70"/>
           <w:sz w:val="19"/>
         </w:rPr>
-        <w:t>Primeira pergunta do assistente de decisao.</w:t>
+        <w:t>Simulador de fatores x beneficios. Abaixo dele, o aviso de login para quem quiser vincular a um projeto.</w:t>
+      </w:r>
+    </w:p>
+    <w:p>
+      <w:pPr>
+        <w:pStyle w:val="Ttulo2"/>
+        <w:spacing w:before="320" w:after="120"/>
+        <w:rPr>
+          <w:rFonts w:ascii="Montserrat" w:hAnsi="Montserrat"/>
+          <w:b/>
+          <w:color w:val="B91D2E"/>
+          <w:sz w:val="27"/>
+        </w:rPr>
+      </w:pPr>
+      <w:bookmarkStart w:id="30" w:name="_Toc236512842"/>
+      <w:r>
+        <w:rPr>
+          <w:rFonts w:ascii="Montserrat" w:hAnsi="Montserrat"/>
+          <w:b/>
+          <w:color w:val="B91D2E"/>
+          <w:sz w:val="27"/>
+        </w:rPr>
+        <w:t>5.3 Assistente de decisao em 8 perguntas</w:t>
+      </w:r>
+      <w:bookmarkEnd w:id="30"/>
+    </w:p>
+    <w:p>
+      <w:pPr>
+        <w:spacing w:line="280" w:lineRule="auto"/>
+        <w:rPr>
+          <w:rFonts w:ascii="Montserrat" w:hAnsi="Montserrat"/>
+          <w:color w:val="1A1A1A"/>
+          <w:sz w:val="22"/>
+        </w:rPr>
+      </w:pPr>
+      <w:r>
+        <w:rPr>
+          <w:rFonts w:ascii="Montserrat" w:hAnsi="Montserrat"/>
+          <w:color w:val="1A1A1A"/>
+          <w:sz w:val="22"/>
+        </w:rPr>
+        <w:t>Responda a oito perguntas do semaforo de decisao, uma de cada vez. Ao final, o painel devolve um veredito com a regra aplicada.</w:t>
       </w:r>
     </w:p>
     <w:p>
@@ -13364,16 +13441,16 @@
         </w:rPr>
         <w:lastRenderedPageBreak/>
         <w:drawing>
-          <wp:inline distT="0" distB="0" distL="0" distR="0" wp14:anchorId="19675495" wp14:editId="4FC567C9">
+          <wp:inline distT="0" distB="0" distL="0" distR="0" wp14:anchorId="4982C1A2" wp14:editId="12B563E0">
             <wp:extent cx="5303520" cy="4792851"/>
             <wp:effectExtent l="19050" t="19050" r="11430" b="27305"/>
-            <wp:docPr id="1753261299" name="Imagem 43"/>
+            <wp:docPr id="509536228" name="Imagem 43"/>
             <wp:cNvGraphicFramePr/>
             <a:graphic xmlns:a="http://schemas.openxmlformats.org/drawingml/2006/main">
               <a:graphicData uri="http://schemas.openxmlformats.org/drawingml/2006/picture">
                 <pic:pic xmlns:pic="http://schemas.openxmlformats.org/drawingml/2006/picture">
                   <pic:nvPicPr>
-                    <pic:cNvPr id="1753261299" name=""/>
+                    <pic:cNvPr id="509536228" name=""/>
                     <pic:cNvPicPr/>
                   </pic:nvPicPr>
                   <pic:blipFill>
@@ -13427,115 +13504,7 @@
           <w:color w:val="6A6A70"/>
           <w:sz w:val="19"/>
         </w:rPr>
-        <w:t>Veredito final, com o placar de respostas verdes/amarelas/vermelhas.</w:t>
-      </w:r>
-    </w:p>
-    <w:p>
-      <w:pPr>
-        <w:spacing w:before="160" w:after="200"/>
-        <w:ind w:left="283"/>
-        <w:rPr>
-          <w:rFonts w:ascii="Montserrat" w:hAnsi="Montserrat"/>
-          <w:i/>
-          <w:color w:val="6A6A70"/>
-          <w:sz w:val="21"/>
-        </w:rPr>
-      </w:pPr>
-      <w:r>
-        <w:rPr>
-          <w:rFonts w:ascii="Montserrat" w:hAnsi="Montserrat"/>
-          <w:i/>
-          <w:color w:val="6A6A70"/>
-          <w:sz w:val="21"/>
-        </w:rPr>
-        <w:t>Regra aplicada: qualquer resposta vermelha leva a encerrar/repactuar; tres ou mais amarelas levam a replanejar; caso contrario, o veredito e concluir.</w:t>
-      </w:r>
-    </w:p>
-    <w:p>
-      <w:pPr>
-        <w:pStyle w:val="Ttulo1"/>
-        <w:pageBreakBefore/>
-        <w:pBdr>
-          <w:bottom w:val="single" w:sz="4" w:space="0" w:color="E4E4E7"/>
-        </w:pBdr>
-        <w:spacing w:before="80" w:after="200"/>
-        <w:rPr>
-          <w:rFonts w:ascii="Montserrat" w:hAnsi="Montserrat"/>
-          <w:b/>
-          <w:color w:val="1A1A1A"/>
-          <w:sz w:val="34"/>
-        </w:rPr>
-      </w:pPr>
-      <w:bookmarkStart w:id="31" w:name="_Toc236511128"/>
-      <w:r>
-        <w:rPr>
-          <w:rFonts w:ascii="Montserrat" w:hAnsi="Montserrat"/>
-          <w:b/>
-          <w:color w:val="1A1A1A"/>
-          <w:sz w:val="34"/>
-        </w:rPr>
-        <w:lastRenderedPageBreak/>
-        <w:t>6. Administracao do sistema</w:t>
-      </w:r>
-      <w:bookmarkEnd w:id="31"/>
-    </w:p>
-    <w:p>
-      <w:pPr>
-        <w:spacing w:line="280" w:lineRule="auto"/>
-        <w:rPr>
-          <w:rFonts w:ascii="Montserrat" w:hAnsi="Montserrat"/>
-          <w:color w:val="1A1A1A"/>
-          <w:sz w:val="22"/>
-        </w:rPr>
-      </w:pPr>
-      <w:r>
-        <w:rPr>
-          <w:rFonts w:ascii="Montserrat" w:hAnsi="Montserrat"/>
-          <w:color w:val="1A1A1A"/>
-          <w:sz w:val="22"/>
-        </w:rPr>
-        <w:t>Pagina restrita a usuarios com papel Admin (secao 2.3). Reune tres abas: Usuarios, Equipes e Configuracoes.</w:t>
-      </w:r>
-    </w:p>
-    <w:p>
-      <w:pPr>
-        <w:pStyle w:val="Ttulo2"/>
-        <w:spacing w:before="320" w:after="120"/>
-        <w:rPr>
-          <w:rFonts w:ascii="Montserrat" w:hAnsi="Montserrat"/>
-          <w:b/>
-          <w:color w:val="B91D2E"/>
-          <w:sz w:val="27"/>
-        </w:rPr>
-      </w:pPr>
-      <w:bookmarkStart w:id="32" w:name="_Toc236511129"/>
-      <w:r>
-        <w:rPr>
-          <w:rFonts w:ascii="Montserrat" w:hAnsi="Montserrat"/>
-          <w:b/>
-          <w:color w:val="B91D2E"/>
-          <w:sz w:val="27"/>
-        </w:rPr>
-        <w:t>6.1 Usuarios</w:t>
-      </w:r>
-      <w:bookmarkEnd w:id="32"/>
-    </w:p>
-    <w:p>
-      <w:pPr>
-        <w:spacing w:line="280" w:lineRule="auto"/>
-        <w:rPr>
-          <w:rFonts w:ascii="Montserrat" w:hAnsi="Montserrat"/>
-          <w:color w:val="1A1A1A"/>
-          <w:sz w:val="22"/>
-        </w:rPr>
-      </w:pPr>
-      <w:r>
-        <w:rPr>
-          <w:rFonts w:ascii="Montserrat" w:hAnsi="Montserrat"/>
-          <w:color w:val="1A1A1A"/>
-          <w:sz w:val="22"/>
-        </w:rPr>
-        <w:t>Lista todos os usuarios que ja fizeram login pelo menos uma vez, com o papel atual e um seletor para altera-lo.</w:t>
+        <w:t>Primeira pergunta do assistente de decisao.</w:t>
       </w:r>
     </w:p>
     <w:p>
@@ -13547,17 +13516,18 @@
         <w:rPr>
           <w:noProof/>
         </w:rPr>
+        <w:lastRenderedPageBreak/>
         <w:drawing>
-          <wp:inline distT="0" distB="0" distL="0" distR="0" wp14:anchorId="6C6002F8" wp14:editId="6EF65FC6">
+          <wp:inline distT="0" distB="0" distL="0" distR="0" wp14:anchorId="3DE6F62D" wp14:editId="232C3ED2">
             <wp:extent cx="5303520" cy="4792851"/>
             <wp:effectExtent l="19050" t="19050" r="11430" b="27305"/>
-            <wp:docPr id="1338903026" name="Imagem 44"/>
+            <wp:docPr id="1281735162" name="Imagem 44"/>
             <wp:cNvGraphicFramePr/>
             <a:graphic xmlns:a="http://schemas.openxmlformats.org/drawingml/2006/main">
               <a:graphicData uri="http://schemas.openxmlformats.org/drawingml/2006/picture">
                 <pic:pic xmlns:pic="http://schemas.openxmlformats.org/drawingml/2006/picture">
                   <pic:nvPicPr>
-                    <pic:cNvPr id="1338903026" name=""/>
+                    <pic:cNvPr id="1281735162" name=""/>
                     <pic:cNvPicPr/>
                   </pic:nvPicPr>
                   <pic:blipFill>
@@ -13611,7 +13581,74 @@
           <w:color w:val="6A6A70"/>
           <w:sz w:val="19"/>
         </w:rPr>
-        <w:t>Aba Usuarios: papel atual e seletor de alteracao de papel por usuario.</w:t>
+        <w:t>Veredito final, com o placar de respostas verdes/amarelas/vermelhas.</w:t>
+      </w:r>
+    </w:p>
+    <w:p>
+      <w:pPr>
+        <w:spacing w:before="160" w:after="200"/>
+        <w:ind w:left="283"/>
+        <w:rPr>
+          <w:rFonts w:ascii="Montserrat" w:hAnsi="Montserrat"/>
+          <w:i/>
+          <w:color w:val="6A6A70"/>
+          <w:sz w:val="21"/>
+        </w:rPr>
+      </w:pPr>
+      <w:r>
+        <w:rPr>
+          <w:rFonts w:ascii="Montserrat" w:hAnsi="Montserrat"/>
+          <w:i/>
+          <w:color w:val="6A6A70"/>
+          <w:sz w:val="21"/>
+        </w:rPr>
+        <w:t>Regra aplicada: qualquer resposta vermelha leva a encerrar/repactuar; tres ou mais amarelas levam a replanejar; caso contrario, o veredito e concluir.</w:t>
+      </w:r>
+    </w:p>
+    <w:p>
+      <w:pPr>
+        <w:pStyle w:val="Ttulo1"/>
+        <w:pageBreakBefore/>
+        <w:pBdr>
+          <w:bottom w:val="single" w:sz="4" w:space="0" w:color="E4E4E7"/>
+        </w:pBdr>
+        <w:spacing w:before="80" w:after="200"/>
+        <w:rPr>
+          <w:rFonts w:ascii="Montserrat" w:hAnsi="Montserrat"/>
+          <w:b/>
+          <w:color w:val="1A1A1A"/>
+          <w:sz w:val="34"/>
+        </w:rPr>
+      </w:pPr>
+      <w:bookmarkStart w:id="31" w:name="_Toc236512843"/>
+      <w:r>
+        <w:rPr>
+          <w:rFonts w:ascii="Montserrat" w:hAnsi="Montserrat"/>
+          <w:b/>
+          <w:color w:val="1A1A1A"/>
+          <w:sz w:val="34"/>
+        </w:rPr>
+        <w:lastRenderedPageBreak/>
+        <w:t>6. Administracao do sistema</w:t>
+      </w:r>
+      <w:bookmarkEnd w:id="31"/>
+    </w:p>
+    <w:p>
+      <w:pPr>
+        <w:spacing w:line="280" w:lineRule="auto"/>
+        <w:rPr>
+          <w:rFonts w:ascii="Montserrat" w:hAnsi="Montserrat"/>
+          <w:color w:val="1A1A1A"/>
+          <w:sz w:val="22"/>
+        </w:rPr>
+      </w:pPr>
+      <w:r>
+        <w:rPr>
+          <w:rFonts w:ascii="Montserrat" w:hAnsi="Montserrat"/>
+          <w:color w:val="1A1A1A"/>
+          <w:sz w:val="22"/>
+        </w:rPr>
+        <w:t>Pagina restrita a usuarios com papel Admin (secao 2.3). Reune tres abas: Usuarios, Equipes e Configuracoes.</w:t>
       </w:r>
     </w:p>
     <w:p>
@@ -13625,7 +13662,7 @@
           <w:sz w:val="27"/>
         </w:rPr>
       </w:pPr>
-      <w:bookmarkStart w:id="33" w:name="_Toc236511130"/>
+      <w:bookmarkStart w:id="32" w:name="_Toc236512844"/>
       <w:r>
         <w:rPr>
           <w:rFonts w:ascii="Montserrat" w:hAnsi="Montserrat"/>
@@ -13633,9 +13670,9 @@
           <w:color w:val="B91D2E"/>
           <w:sz w:val="27"/>
         </w:rPr>
-        <w:t>6.2 Equipes</w:t>
-      </w:r>
-      <w:bookmarkEnd w:id="33"/>
+        <w:t>6.1 Usuarios</w:t>
+      </w:r>
+      <w:bookmarkEnd w:id="32"/>
     </w:p>
     <w:p>
       <w:pPr>
@@ -13652,7 +13689,7 @@
           <w:color w:val="1A1A1A"/>
           <w:sz w:val="22"/>
         </w:rPr>
-        <w:t>Define quem faz parte da equipe de cada projeto - a base da restricao por equipe descrita na secao 2.5. Selecione um projeto, escolha um papel e clique em + Adicionar a equipe.</w:t>
+        <w:t>Lista todos os usuarios que ja fizeram login pelo menos uma vez, com o papel atual e um seletor para altera-lo.</w:t>
       </w:r>
     </w:p>
     <w:p>
@@ -13664,18 +13701,17 @@
         <w:rPr>
           <w:noProof/>
         </w:rPr>
-        <w:lastRenderedPageBreak/>
         <w:drawing>
-          <wp:inline distT="0" distB="0" distL="0" distR="0" wp14:anchorId="7B01DCE8" wp14:editId="6AF06448">
+          <wp:inline distT="0" distB="0" distL="0" distR="0" wp14:anchorId="2524EBFC" wp14:editId="6B750BEC">
             <wp:extent cx="5303520" cy="4792851"/>
             <wp:effectExtent l="19050" t="19050" r="11430" b="27305"/>
-            <wp:docPr id="330431392" name="Imagem 45"/>
+            <wp:docPr id="1569544393" name="Imagem 45"/>
             <wp:cNvGraphicFramePr/>
             <a:graphic xmlns:a="http://schemas.openxmlformats.org/drawingml/2006/main">
               <a:graphicData uri="http://schemas.openxmlformats.org/drawingml/2006/picture">
                 <pic:pic xmlns:pic="http://schemas.openxmlformats.org/drawingml/2006/picture">
                   <pic:nvPicPr>
-                    <pic:cNvPr id="330431392" name=""/>
+                    <pic:cNvPr id="1569544393" name=""/>
                     <pic:cNvPicPr/>
                   </pic:nvPicPr>
                   <pic:blipFill>
@@ -13729,7 +13765,7 @@
           <w:color w:val="6A6A70"/>
           <w:sz w:val="19"/>
         </w:rPr>
-        <w:t>Aba Equipes, com um projeto selecionado e um membro ja cadastrado.</w:t>
+        <w:t>Aba Usuarios: papel atual e seletor de alteracao de papel por usuario.</w:t>
       </w:r>
     </w:p>
     <w:p>
@@ -13743,7 +13779,7 @@
           <w:sz w:val="27"/>
         </w:rPr>
       </w:pPr>
-      <w:bookmarkStart w:id="34" w:name="_Toc236511131"/>
+      <w:bookmarkStart w:id="33" w:name="_Toc236512845"/>
       <w:r>
         <w:rPr>
           <w:rFonts w:ascii="Montserrat" w:hAnsi="Montserrat"/>
@@ -13751,9 +13787,9 @@
           <w:color w:val="B91D2E"/>
           <w:sz w:val="27"/>
         </w:rPr>
-        <w:t>6.3 Configuracoes</w:t>
-      </w:r>
-      <w:bookmarkEnd w:id="34"/>
+        <w:t>6.2 Equipes</w:t>
+      </w:r>
+      <w:bookmarkEnd w:id="33"/>
     </w:p>
     <w:p>
       <w:pPr>
@@ -13770,7 +13806,7 @@
           <w:color w:val="1A1A1A"/>
           <w:sz w:val="22"/>
         </w:rPr>
-        <w:t>Controla os dois interruptores de acesso sem login (Solicitacao de Demanda e Ata de Reuniao), descritos na secao 2.6.</w:t>
+        <w:t>Define quem faz parte da equipe de cada projeto - a base da restricao por equipe descrita na secao 2.5. Selecione um projeto, escolha um papel e clique em + Adicionar a equipe.</w:t>
       </w:r>
     </w:p>
     <w:p>
@@ -13784,16 +13820,16 @@
         </w:rPr>
         <w:lastRenderedPageBreak/>
         <w:drawing>
-          <wp:inline distT="0" distB="0" distL="0" distR="0" wp14:anchorId="3D7EC2AB" wp14:editId="58451934">
+          <wp:inline distT="0" distB="0" distL="0" distR="0" wp14:anchorId="4F034244" wp14:editId="5C2BB31D">
             <wp:extent cx="5303520" cy="4792851"/>
             <wp:effectExtent l="19050" t="19050" r="11430" b="27305"/>
-            <wp:docPr id="1537532181" name="Imagem 46"/>
+            <wp:docPr id="648561537" name="Imagem 46"/>
             <wp:cNvGraphicFramePr/>
             <a:graphic xmlns:a="http://schemas.openxmlformats.org/drawingml/2006/main">
               <a:graphicData uri="http://schemas.openxmlformats.org/drawingml/2006/picture">
                 <pic:pic xmlns:pic="http://schemas.openxmlformats.org/drawingml/2006/picture">
                   <pic:nvPicPr>
-                    <pic:cNvPr id="1537532181" name=""/>
+                    <pic:cNvPr id="648561537" name=""/>
                     <pic:cNvPicPr/>
                   </pic:nvPicPr>
                   <pic:blipFill>
@@ -13847,6 +13883,124 @@
           <w:color w:val="6A6A70"/>
           <w:sz w:val="19"/>
         </w:rPr>
+        <w:t>Aba Equipes, com um projeto selecionado e um membro ja cadastrado.</w:t>
+      </w:r>
+    </w:p>
+    <w:p>
+      <w:pPr>
+        <w:pStyle w:val="Ttulo2"/>
+        <w:spacing w:before="320" w:after="120"/>
+        <w:rPr>
+          <w:rFonts w:ascii="Montserrat" w:hAnsi="Montserrat"/>
+          <w:b/>
+          <w:color w:val="B91D2E"/>
+          <w:sz w:val="27"/>
+        </w:rPr>
+      </w:pPr>
+      <w:bookmarkStart w:id="34" w:name="_Toc236512846"/>
+      <w:r>
+        <w:rPr>
+          <w:rFonts w:ascii="Montserrat" w:hAnsi="Montserrat"/>
+          <w:b/>
+          <w:color w:val="B91D2E"/>
+          <w:sz w:val="27"/>
+        </w:rPr>
+        <w:t>6.3 Configuracoes</w:t>
+      </w:r>
+      <w:bookmarkEnd w:id="34"/>
+    </w:p>
+    <w:p>
+      <w:pPr>
+        <w:spacing w:line="280" w:lineRule="auto"/>
+        <w:rPr>
+          <w:rFonts w:ascii="Montserrat" w:hAnsi="Montserrat"/>
+          <w:color w:val="1A1A1A"/>
+          <w:sz w:val="22"/>
+        </w:rPr>
+      </w:pPr>
+      <w:r>
+        <w:rPr>
+          <w:rFonts w:ascii="Montserrat" w:hAnsi="Montserrat"/>
+          <w:color w:val="1A1A1A"/>
+          <w:sz w:val="22"/>
+        </w:rPr>
+        <w:t>Controla os dois interruptores de acesso sem login (Solicitacao de Demanda e Ata de Reuniao), descritos na secao 2.6.</w:t>
+      </w:r>
+    </w:p>
+    <w:p>
+      <w:pPr>
+        <w:spacing w:before="120" w:after="40"/>
+        <w:jc w:val="center"/>
+      </w:pPr>
+      <w:r>
+        <w:rPr>
+          <w:noProof/>
+        </w:rPr>
+        <w:lastRenderedPageBreak/>
+        <w:drawing>
+          <wp:inline distT="0" distB="0" distL="0" distR="0" wp14:anchorId="55644E23" wp14:editId="04BC3F91">
+            <wp:extent cx="5303520" cy="4792851"/>
+            <wp:effectExtent l="19050" t="19050" r="11430" b="27305"/>
+            <wp:docPr id="1194762295" name="Imagem 47"/>
+            <wp:cNvGraphicFramePr/>
+            <a:graphic xmlns:a="http://schemas.openxmlformats.org/drawingml/2006/main">
+              <a:graphicData uri="http://schemas.openxmlformats.org/drawingml/2006/picture">
+                <pic:pic xmlns:pic="http://schemas.openxmlformats.org/drawingml/2006/picture">
+                  <pic:nvPicPr>
+                    <pic:cNvPr id="1194762295" name=""/>
+                    <pic:cNvPicPr/>
+                  </pic:nvPicPr>
+                  <pic:blipFill>
+                    <a:blip r:embed="rId53">
+                      <a:extLst>
+                        <a:ext uri="{28A0092B-C50C-407E-A947-70E740481C1C}">
+                          <a14:useLocalDpi xmlns:a14="http://schemas.microsoft.com/office/drawing/2010/main" val="0"/>
+                        </a:ext>
+                      </a:extLst>
+                    </a:blip>
+                    <a:stretch>
+                      <a:fillRect/>
+                    </a:stretch>
+                  </pic:blipFill>
+                  <pic:spPr>
+                    <a:xfrm>
+                      <a:off x="0" y="0"/>
+                      <a:ext cx="5303520" cy="4792851"/>
+                    </a:xfrm>
+                    <a:prstGeom prst="rect">
+                      <a:avLst/>
+                    </a:prstGeom>
+                    <a:ln w="9525">
+                      <a:solidFill>
+                        <a:srgbClr val="D1D5DB"/>
+                      </a:solidFill>
+                    </a:ln>
+                  </pic:spPr>
+                </pic:pic>
+              </a:graphicData>
+            </a:graphic>
+          </wp:inline>
+        </w:drawing>
+      </w:r>
+    </w:p>
+    <w:p>
+      <w:pPr>
+        <w:spacing w:before="120" w:after="280"/>
+        <w:jc w:val="center"/>
+        <w:rPr>
+          <w:rFonts w:ascii="Montserrat" w:hAnsi="Montserrat"/>
+          <w:i/>
+          <w:color w:val="6A6A70"/>
+          <w:sz w:val="19"/>
+        </w:rPr>
+      </w:pPr>
+      <w:r>
+        <w:rPr>
+          <w:rFonts w:ascii="Montserrat" w:hAnsi="Montserrat"/>
+          <w:i/>
+          <w:color w:val="6A6A70"/>
+          <w:sz w:val="19"/>
+        </w:rPr>
         <w:t>Aba Configuracoes: os dois interruptores de acesso sem login, hoje desativados.</w:t>
       </w:r>
     </w:p>
@@ -13865,7 +14019,7 @@
           <w:sz w:val="34"/>
         </w:rPr>
       </w:pPr>
-      <w:bookmarkStart w:id="35" w:name="_Toc236511132"/>
+      <w:bookmarkStart w:id="35" w:name="_Toc236512847"/>
       <w:r>
         <w:rPr>
           <w:rFonts w:ascii="Montserrat" w:hAnsi="Montserrat"/>
@@ -14109,7 +14263,7 @@
           <w:sz w:val="34"/>
         </w:rPr>
       </w:pPr>
-      <w:bookmarkStart w:id="36" w:name="_Toc236511133"/>
+      <w:bookmarkStart w:id="36" w:name="_Toc236512848"/>
       <w:r>
         <w:rPr>
           <w:rFonts w:ascii="Montserrat" w:hAnsi="Montserrat"/>
@@ -15479,7 +15633,7 @@
                 <w:color w:val="1A1A1A"/>
                 <w:sz w:val="19"/>
               </w:rPr>
-              <w:t>D04.3</w:t>
+              <w:t>D04.3 / D06.5-D06.7</w:t>
             </w:r>
           </w:p>
         </w:tc>
@@ -15614,118 +15768,6 @@
                 <w:sz w:val="19"/>
               </w:rPr>
               <w:t>Nao</w:t>
-            </w:r>
-          </w:p>
-        </w:tc>
-      </w:tr>
-      <w:tr>
-        <w:tc>
-          <w:tcPr>
-            <w:tcW w:w="567" w:type="dxa"/>
-          </w:tcPr>
-          <w:p>
-            <w:pPr>
-              <w:rPr>
-                <w:rFonts w:ascii="Montserrat" w:hAnsi="Montserrat"/>
-                <w:color w:val="1A1A1A"/>
-                <w:sz w:val="19"/>
-              </w:rPr>
-            </w:pPr>
-            <w:r>
-              <w:rPr>
-                <w:rFonts w:ascii="Montserrat" w:hAnsi="Montserrat"/>
-                <w:color w:val="1A1A1A"/>
-                <w:sz w:val="19"/>
-              </w:rPr>
-              <w:t>-</w:t>
-            </w:r>
-          </w:p>
-        </w:tc>
-        <w:tc>
-          <w:tcPr>
-            <w:tcW w:w="2948" w:type="dxa"/>
-          </w:tcPr>
-          <w:p>
-            <w:pPr>
-              <w:rPr>
-                <w:rFonts w:ascii="Montserrat" w:hAnsi="Montserrat"/>
-                <w:color w:val="1A1A1A"/>
-                <w:sz w:val="19"/>
-              </w:rPr>
-            </w:pPr>
-            <w:r>
-              <w:rPr>
-                <w:rFonts w:ascii="Montserrat" w:hAnsi="Montserrat"/>
-                <w:color w:val="1A1A1A"/>
-                <w:sz w:val="19"/>
-              </w:rPr>
-              <w:t>Reporte de Resultados</w:t>
-            </w:r>
-          </w:p>
-        </w:tc>
-        <w:tc>
-          <w:tcPr>
-            <w:tcW w:w="1814" w:type="dxa"/>
-          </w:tcPr>
-          <w:p>
-            <w:pPr>
-              <w:rPr>
-                <w:rFonts w:ascii="Montserrat" w:hAnsi="Montserrat"/>
-                <w:color w:val="1A1A1A"/>
-                <w:sz w:val="19"/>
-              </w:rPr>
-            </w:pPr>
-            <w:r>
-              <w:rPr>
-                <w:rFonts w:ascii="Montserrat" w:hAnsi="Montserrat"/>
-                <w:color w:val="1A1A1A"/>
-                <w:sz w:val="19"/>
-              </w:rPr>
-              <w:t>a construir</w:t>
-            </w:r>
-          </w:p>
-        </w:tc>
-        <w:tc>
-          <w:tcPr>
-            <w:tcW w:w="2608" w:type="dxa"/>
-          </w:tcPr>
-          <w:p>
-            <w:pPr>
-              <w:rPr>
-                <w:rFonts w:ascii="Montserrat" w:hAnsi="Montserrat"/>
-                <w:color w:val="1A1A1A"/>
-                <w:sz w:val="19"/>
-              </w:rPr>
-            </w:pPr>
-            <w:r>
-              <w:rPr>
-                <w:rFonts w:ascii="Montserrat" w:hAnsi="Montserrat"/>
-                <w:color w:val="1A1A1A"/>
-                <w:sz w:val="19"/>
-              </w:rPr>
-              <w:t>D06.5-D06.7 (sem formulario ainda)</w:t>
-            </w:r>
-          </w:p>
-        </w:tc>
-        <w:tc>
-          <w:tcPr>
-            <w:tcW w:w="1134" w:type="dxa"/>
-          </w:tcPr>
-          <w:p>
-            <w:pPr>
-              <w:rPr>
-                <w:rFonts w:ascii="Montserrat" w:hAnsi="Montserrat"/>
-                <w:color w:val="1A1A1A"/>
-                <w:sz w:val="19"/>
-              </w:rPr>
-            </w:pPr>
-            <w:r>
-              <w:rPr>
-                <w:rFonts w:ascii="Montserrat" w:hAnsi="Montserrat"/>
-                <w:color w:val="1A1A1A"/>
-                <w:sz w:val="19"/>
-              </w:rPr>
-              <w:t>-</w:t>
             </w:r>
           </w:p>
         </w:tc>
@@ -15767,12 +15809,12 @@
       </w:pPr>
     </w:p>
     <w:sectPr>
-      <w:headerReference w:type="even" r:id="rId53"/>
-      <w:headerReference w:type="default" r:id="rId54"/>
-      <w:footerReference w:type="even" r:id="rId55"/>
-      <w:footerReference w:type="default" r:id="rId56"/>
-      <w:headerReference w:type="first" r:id="rId57"/>
-      <w:footerReference w:type="first" r:id="rId58"/>
+      <w:headerReference w:type="even" r:id="rId54"/>
+      <w:headerReference w:type="default" r:id="rId55"/>
+      <w:footerReference w:type="even" r:id="rId56"/>
+      <w:footerReference w:type="default" r:id="rId57"/>
+      <w:headerReference w:type="first" r:id="rId58"/>
+      <w:footerReference w:type="first" r:id="rId59"/>
       <w:pgSz w:w="12240" w:h="15840"/>
       <w:pgMar w:top="1417" w:right="1701" w:bottom="1417" w:left="1701" w:header="708" w:footer="708" w:gutter="0"/>
       <w:cols w:space="708"/>
@@ -15931,7 +15973,7 @@
 <file path=word/numbering.xml><?xml version="1.0" encoding="utf-8"?>
 <w:numbering xmlns:wpc="http://schemas.microsoft.com/office/word/2010/wordprocessingCanvas" xmlns:cx="http://schemas.microsoft.com/office/drawing/2014/chartex" xmlns:cx1="http://schemas.microsoft.com/office/drawing/2015/9/8/chartex" xmlns:cx2="http://schemas.microsoft.com/office/drawing/2015/10/21/chartex" xmlns:cx3="http://schemas.microsoft.com/office/drawing/2016/5/9/chartex" xmlns:cx4="http://schemas.microsoft.com/office/drawing/2016/5/10/chartex" xmlns:cx5="http://schemas.microsoft.com/office/drawing/2016/5/11/chartex" xmlns:cx6="http://schemas.microsoft.com/office/drawing/2016/5/12/chartex" xmlns:cx7="http://schemas.microsoft.com/office/drawing/2016/5/13/chartex" xmlns:cx8="http://schemas.microsoft.com/office/drawing/2016/5/14/chartex" xmlns:mc="http://schemas.openxmlformats.org/markup-compatibility/2006" xmlns:aink="http://schemas.microsoft.com/office/drawing/2016/ink" xmlns:am3d="http://schemas.microsoft.com/office/drawing/2017/model3d" xmlns:o="urn:schemas-microsoft-com:office:office" xmlns:oel="http://schemas.microsoft.com/office/2019/extlst" xmlns:r="http://schemas.openxmlformats.org/officeDocument/2006/relationships" xmlns:m="http://schemas.openxmlformats.org/officeDocument/2006/math" xmlns:v="urn:schemas-microsoft-com:vml" xmlns:wp14="http://schemas.microsoft.com/office/word/2010/wordprocessingDrawing" xmlns:wp="http://schemas.openxmlformats.org/drawingml/2006/wordprocessingDrawing" xmlns:w10="urn:schemas-microsoft-com:office:word" xmlns:w="http://schemas.openxmlformats.org/wordprocessingml/2006/main" xmlns:w14="http://schemas.microsoft.com/office/word/2010/wordml" xmlns:w15="http://schemas.microsoft.com/office/word/2012/wordml" xmlns:w16cei="http://schemas.microsoft.com/office/word/2026/wordml/cei" xmlns:w16cex="http://schemas.microsoft.com/office/word/2018/wordml/cex" xmlns:w16cid="http://schemas.microsoft.com/office/word/2016/wordml/cid" xmlns:w16="http://schemas.microsoft.com/office/word/2018/wordml" xmlns:w16du="http://schemas.microsoft.com/office/word/2023/wordml/word16du" xmlns:w16sdtdh="http://schemas.microsoft.com/office/word/2020/wordml/sdtdatahash" xmlns:w16sdtfl="http://schemas.microsoft.com/office/word/2024/wordml/sdtformatlock" xmlns:w16se="http://schemas.microsoft.com/office/word/2015/wordml/symex" xmlns:wpg="http://schemas.microsoft.com/office/word/2010/wordprocessingGroup" xmlns:wpi="http://schemas.microsoft.com/office/word/2010/wordprocessingInk" xmlns:wne="http://schemas.microsoft.com/office/word/2006/wordml" xmlns:wps="http://schemas.microsoft.com/office/word/2010/wordprocessingShape" mc:Ignorable="w14 w15 w16se w16cid w16 w16cex w16sdtdh w16sdtfl w16du wp14">
   <w:abstractNum w:abstractNumId="0" w15:restartNumberingAfterBreak="0">
-    <w:nsid w:val="08D349CD"/>
+    <w:nsid w:val="01A7135D"/>
     <w:multiLevelType w:val="singleLevel"/>
     <w:tmpl w:val="04160001"/>
     <w:lvl w:ilvl="0">
@@ -15948,7 +15990,7 @@
     </w:lvl>
   </w:abstractNum>
   <w:abstractNum w:abstractNumId="1" w15:restartNumberingAfterBreak="0">
-    <w:nsid w:val="127D0BCB"/>
+    <w:nsid w:val="041E1D87"/>
     <w:multiLevelType w:val="singleLevel"/>
     <w:tmpl w:val="04160001"/>
     <w:lvl w:ilvl="0">
@@ -15965,7 +16007,7 @@
     </w:lvl>
   </w:abstractNum>
   <w:abstractNum w:abstractNumId="2" w15:restartNumberingAfterBreak="0">
-    <w:nsid w:val="1C715332"/>
+    <w:nsid w:val="0D726D88"/>
     <w:multiLevelType w:val="singleLevel"/>
     <w:tmpl w:val="04160001"/>
     <w:lvl w:ilvl="0">
@@ -15982,7 +16024,7 @@
     </w:lvl>
   </w:abstractNum>
   <w:abstractNum w:abstractNumId="3" w15:restartNumberingAfterBreak="0">
-    <w:nsid w:val="1F3432C5"/>
+    <w:nsid w:val="0D78729B"/>
     <w:multiLevelType w:val="singleLevel"/>
     <w:tmpl w:val="04160001"/>
     <w:lvl w:ilvl="0">
@@ -15999,7 +16041,7 @@
     </w:lvl>
   </w:abstractNum>
   <w:abstractNum w:abstractNumId="4" w15:restartNumberingAfterBreak="0">
-    <w:nsid w:val="283D53F2"/>
+    <w:nsid w:val="0F7C3F9F"/>
     <w:multiLevelType w:val="singleLevel"/>
     <w:tmpl w:val="04160001"/>
     <w:lvl w:ilvl="0">
@@ -16016,7 +16058,7 @@
     </w:lvl>
   </w:abstractNum>
   <w:abstractNum w:abstractNumId="5" w15:restartNumberingAfterBreak="0">
-    <w:nsid w:val="386952CC"/>
+    <w:nsid w:val="140F2D91"/>
     <w:multiLevelType w:val="singleLevel"/>
     <w:tmpl w:val="04160001"/>
     <w:lvl w:ilvl="0">
@@ -16033,7 +16075,7 @@
     </w:lvl>
   </w:abstractNum>
   <w:abstractNum w:abstractNumId="6" w15:restartNumberingAfterBreak="0">
-    <w:nsid w:val="38E26C36"/>
+    <w:nsid w:val="16853111"/>
     <w:multiLevelType w:val="singleLevel"/>
     <w:tmpl w:val="04160001"/>
     <w:lvl w:ilvl="0">
@@ -16050,7 +16092,7 @@
     </w:lvl>
   </w:abstractNum>
   <w:abstractNum w:abstractNumId="7" w15:restartNumberingAfterBreak="0">
-    <w:nsid w:val="43D87C18"/>
+    <w:nsid w:val="179A17AE"/>
     <w:multiLevelType w:val="singleLevel"/>
     <w:tmpl w:val="04160001"/>
     <w:lvl w:ilvl="0">
@@ -16067,7 +16109,7 @@
     </w:lvl>
   </w:abstractNum>
   <w:abstractNum w:abstractNumId="8" w15:restartNumberingAfterBreak="0">
-    <w:nsid w:val="46E626B8"/>
+    <w:nsid w:val="1A932106"/>
     <w:multiLevelType w:val="singleLevel"/>
     <w:tmpl w:val="04160001"/>
     <w:lvl w:ilvl="0">
@@ -16084,7 +16126,7 @@
     </w:lvl>
   </w:abstractNum>
   <w:abstractNum w:abstractNumId="9" w15:restartNumberingAfterBreak="0">
-    <w:nsid w:val="48343B13"/>
+    <w:nsid w:val="2AFA0514"/>
     <w:multiLevelType w:val="singleLevel"/>
     <w:tmpl w:val="04160001"/>
     <w:lvl w:ilvl="0">
@@ -16101,7 +16143,7 @@
     </w:lvl>
   </w:abstractNum>
   <w:abstractNum w:abstractNumId="10" w15:restartNumberingAfterBreak="0">
-    <w:nsid w:val="4E1672E6"/>
+    <w:nsid w:val="3545675E"/>
     <w:multiLevelType w:val="singleLevel"/>
     <w:tmpl w:val="04160001"/>
     <w:lvl w:ilvl="0">
@@ -16118,7 +16160,7 @@
     </w:lvl>
   </w:abstractNum>
   <w:abstractNum w:abstractNumId="11" w15:restartNumberingAfterBreak="0">
-    <w:nsid w:val="5C6B37A9"/>
+    <w:nsid w:val="3EFC0B3E"/>
     <w:multiLevelType w:val="singleLevel"/>
     <w:tmpl w:val="04160001"/>
     <w:lvl w:ilvl="0">
@@ -16135,7 +16177,7 @@
     </w:lvl>
   </w:abstractNum>
   <w:abstractNum w:abstractNumId="12" w15:restartNumberingAfterBreak="0">
-    <w:nsid w:val="6BE756C0"/>
+    <w:nsid w:val="3F7821A4"/>
     <w:multiLevelType w:val="singleLevel"/>
     <w:tmpl w:val="04160001"/>
     <w:lvl w:ilvl="0">
@@ -16152,7 +16194,7 @@
     </w:lvl>
   </w:abstractNum>
   <w:abstractNum w:abstractNumId="13" w15:restartNumberingAfterBreak="0">
-    <w:nsid w:val="77136DC6"/>
+    <w:nsid w:val="449B2939"/>
     <w:multiLevelType w:val="singleLevel"/>
     <w:tmpl w:val="04160001"/>
     <w:lvl w:ilvl="0">
@@ -16169,7 +16211,7 @@
     </w:lvl>
   </w:abstractNum>
   <w:abstractNum w:abstractNumId="14" w15:restartNumberingAfterBreak="0">
-    <w:nsid w:val="78DD0166"/>
+    <w:nsid w:val="5B726EF4"/>
     <w:multiLevelType w:val="singleLevel"/>
     <w:tmpl w:val="04160001"/>
     <w:lvl w:ilvl="0">
@@ -16186,7 +16228,7 @@
     </w:lvl>
   </w:abstractNum>
   <w:abstractNum w:abstractNumId="15" w15:restartNumberingAfterBreak="0">
-    <w:nsid w:val="799643C2"/>
+    <w:nsid w:val="7FA81901"/>
     <w:multiLevelType w:val="singleLevel"/>
     <w:tmpl w:val="04160001"/>
     <w:lvl w:ilvl="0">
@@ -16202,53 +16244,53 @@
       </w:rPr>
     </w:lvl>
   </w:abstractNum>
-  <w:num w:numId="1" w16cid:durableId="603998475">
+  <w:num w:numId="1" w16cid:durableId="990869215">
+    <w:abstractNumId w:val="5"/>
+  </w:num>
+  <w:num w:numId="2" w16cid:durableId="60756428">
+    <w:abstractNumId w:val="15"/>
+  </w:num>
+  <w:num w:numId="3" w16cid:durableId="516697055">
+    <w:abstractNumId w:val="10"/>
+  </w:num>
+  <w:num w:numId="4" w16cid:durableId="1565293183">
+    <w:abstractNumId w:val="8"/>
+  </w:num>
+  <w:num w:numId="5" w16cid:durableId="772088293">
+    <w:abstractNumId w:val="6"/>
+  </w:num>
+  <w:num w:numId="6" w16cid:durableId="421418401">
+    <w:abstractNumId w:val="11"/>
+  </w:num>
+  <w:num w:numId="7" w16cid:durableId="1392801953">
+    <w:abstractNumId w:val="1"/>
+  </w:num>
+  <w:num w:numId="8" w16cid:durableId="1291396521">
+    <w:abstractNumId w:val="4"/>
+  </w:num>
+  <w:num w:numId="9" w16cid:durableId="638271078">
+    <w:abstractNumId w:val="0"/>
+  </w:num>
+  <w:num w:numId="10" w16cid:durableId="1486974243">
+    <w:abstractNumId w:val="9"/>
+  </w:num>
+  <w:num w:numId="11" w16cid:durableId="1676105679">
+    <w:abstractNumId w:val="14"/>
+  </w:num>
+  <w:num w:numId="12" w16cid:durableId="181673585">
+    <w:abstractNumId w:val="3"/>
+  </w:num>
+  <w:num w:numId="13" w16cid:durableId="831217130">
+    <w:abstractNumId w:val="7"/>
+  </w:num>
+  <w:num w:numId="14" w16cid:durableId="468787740">
     <w:abstractNumId w:val="12"/>
   </w:num>
-  <w:num w:numId="2" w16cid:durableId="1885751955">
-    <w:abstractNumId w:val="3"/>
-  </w:num>
-  <w:num w:numId="3" w16cid:durableId="988749318">
-    <w:abstractNumId w:val="14"/>
-  </w:num>
-  <w:num w:numId="4" w16cid:durableId="1695614973">
-    <w:abstractNumId w:val="4"/>
-  </w:num>
-  <w:num w:numId="5" w16cid:durableId="828980209">
-    <w:abstractNumId w:val="11"/>
-  </w:num>
-  <w:num w:numId="6" w16cid:durableId="1893925379">
-    <w:abstractNumId w:val="10"/>
-  </w:num>
-  <w:num w:numId="7" w16cid:durableId="909659097">
-    <w:abstractNumId w:val="1"/>
-  </w:num>
-  <w:num w:numId="8" w16cid:durableId="1252424605">
-    <w:abstractNumId w:val="0"/>
-  </w:num>
-  <w:num w:numId="9" w16cid:durableId="22902112">
-    <w:abstractNumId w:val="6"/>
-  </w:num>
-  <w:num w:numId="10" w16cid:durableId="1975523279">
-    <w:abstractNumId w:val="2"/>
-  </w:num>
-  <w:num w:numId="11" w16cid:durableId="314458064">
-    <w:abstractNumId w:val="7"/>
-  </w:num>
-  <w:num w:numId="12" w16cid:durableId="888105281">
-    <w:abstractNumId w:val="5"/>
-  </w:num>
-  <w:num w:numId="13" w16cid:durableId="869994836">
+  <w:num w:numId="15" w16cid:durableId="2121799512">
     <w:abstractNumId w:val="13"/>
   </w:num>
-  <w:num w:numId="14" w16cid:durableId="1779330957">
-    <w:abstractNumId w:val="8"/>
-  </w:num>
-  <w:num w:numId="15" w16cid:durableId="757559593">
-    <w:abstractNumId w:val="15"/>
-  </w:num>
-  <w:num w:numId="16" w16cid:durableId="567768740">
-    <w:abstractNumId w:val="9"/>
+  <w:num w:numId="16" w16cid:durableId="1578435603">
+    <w:abstractNumId w:val="2"/>
   </w:num>
 </w:numbering>
 </file>
@@ -16661,7 +16703,7 @@
     <w:link w:val="Ttulo1Char"/>
     <w:uiPriority w:val="9"/>
     <w:qFormat/>
-    <w:rsid w:val="00F852D0"/>
+    <w:rsid w:val="00E07461"/>
     <w:pPr>
       <w:keepNext/>
       <w:keepLines/>
@@ -16683,7 +16725,7 @@
     <w:uiPriority w:val="9"/>
     <w:unhideWhenUsed/>
     <w:qFormat/>
-    <w:rsid w:val="00F852D0"/>
+    <w:rsid w:val="00E07461"/>
     <w:pPr>
       <w:keepNext/>
       <w:keepLines/>
@@ -16706,7 +16748,7 @@
     <w:semiHidden/>
     <w:unhideWhenUsed/>
     <w:qFormat/>
-    <w:rsid w:val="00F852D0"/>
+    <w:rsid w:val="00E07461"/>
     <w:pPr>
       <w:keepNext/>
       <w:keepLines/>
@@ -16729,7 +16771,7 @@
     <w:semiHidden/>
     <w:unhideWhenUsed/>
     <w:qFormat/>
-    <w:rsid w:val="00F852D0"/>
+    <w:rsid w:val="00E07461"/>
     <w:pPr>
       <w:keepNext/>
       <w:keepLines/>
@@ -16752,7 +16794,7 @@
     <w:semiHidden/>
     <w:unhideWhenUsed/>
     <w:qFormat/>
-    <w:rsid w:val="00F852D0"/>
+    <w:rsid w:val="00E07461"/>
     <w:pPr>
       <w:keepNext/>
       <w:keepLines/>
@@ -16773,7 +16815,7 @@
     <w:semiHidden/>
     <w:unhideWhenUsed/>
     <w:qFormat/>
-    <w:rsid w:val="00F852D0"/>
+    <w:rsid w:val="00E07461"/>
     <w:pPr>
       <w:keepNext/>
       <w:keepLines/>
@@ -16796,7 +16838,7 @@
     <w:semiHidden/>
     <w:unhideWhenUsed/>
     <w:qFormat/>
-    <w:rsid w:val="00F852D0"/>
+    <w:rsid w:val="00E07461"/>
     <w:pPr>
       <w:keepNext/>
       <w:keepLines/>
@@ -16817,7 +16859,7 @@
     <w:semiHidden/>
     <w:unhideWhenUsed/>
     <w:qFormat/>
-    <w:rsid w:val="00F852D0"/>
+    <w:rsid w:val="00E07461"/>
     <w:pPr>
       <w:keepNext/>
       <w:keepLines/>
@@ -16840,7 +16882,7 @@
     <w:semiHidden/>
     <w:unhideWhenUsed/>
     <w:qFormat/>
-    <w:rsid w:val="00F852D0"/>
+    <w:rsid w:val="00E07461"/>
     <w:pPr>
       <w:keepNext/>
       <w:keepLines/>
@@ -16884,7 +16926,7 @@
     <w:basedOn w:val="Fontepargpadro"/>
     <w:link w:val="Ttulo1"/>
     <w:uiPriority w:val="9"/>
-    <w:rsid w:val="00F852D0"/>
+    <w:rsid w:val="00E07461"/>
     <w:rPr>
       <w:rFonts w:asciiTheme="majorHAnsi" w:eastAsiaTheme="majorEastAsia" w:hAnsiTheme="majorHAnsi" w:cstheme="majorBidi"/>
       <w:color w:val="0F4761" w:themeColor="accent1" w:themeShade="BF"/>
@@ -16897,7 +16939,7 @@
     <w:basedOn w:val="Fontepargpadro"/>
     <w:link w:val="Ttulo2"/>
     <w:uiPriority w:val="9"/>
-    <w:rsid w:val="00F852D0"/>
+    <w:rsid w:val="00E07461"/>
     <w:rPr>
       <w:rFonts w:asciiTheme="majorHAnsi" w:eastAsiaTheme="majorEastAsia" w:hAnsiTheme="majorHAnsi" w:cstheme="majorBidi"/>
       <w:color w:val="0F4761" w:themeColor="accent1" w:themeShade="BF"/>
@@ -16911,7 +16953,7 @@
     <w:link w:val="Ttulo3"/>
     <w:uiPriority w:val="9"/>
     <w:semiHidden/>
-    <w:rsid w:val="00F852D0"/>
+    <w:rsid w:val="00E07461"/>
     <w:rPr>
       <w:rFonts w:eastAsiaTheme="majorEastAsia" w:cstheme="majorBidi"/>
       <w:color w:val="0F4761" w:themeColor="accent1" w:themeShade="BF"/>
@@ -16925,7 +16967,7 @@
     <w:link w:val="Ttulo4"/>
     <w:uiPriority w:val="9"/>
     <w:semiHidden/>
-    <w:rsid w:val="00F852D0"/>
+    <w:rsid w:val="00E07461"/>
     <w:rPr>
       <w:rFonts w:eastAsiaTheme="majorEastAsia" w:cstheme="majorBidi"/>
       <w:i/>
@@ -16939,7 +16981,7 @@
     <w:link w:val="Ttulo5"/>
     <w:uiPriority w:val="9"/>
     <w:semiHidden/>
-    <w:rsid w:val="00F852D0"/>
+    <w:rsid w:val="00E07461"/>
     <w:rPr>
       <w:rFonts w:eastAsiaTheme="majorEastAsia" w:cstheme="majorBidi"/>
       <w:color w:val="0F4761" w:themeColor="accent1" w:themeShade="BF"/>
@@ -16951,7 +16993,7 @@
     <w:link w:val="Ttulo6"/>
     <w:uiPriority w:val="9"/>
     <w:semiHidden/>
-    <w:rsid w:val="00F852D0"/>
+    <w:rsid w:val="00E07461"/>
     <w:rPr>
       <w:rFonts w:eastAsiaTheme="majorEastAsia" w:cstheme="majorBidi"/>
       <w:i/>
@@ -16965,7 +17007,7 @@
     <w:link w:val="Ttulo7"/>
     <w:uiPriority w:val="9"/>
     <w:semiHidden/>
-    <w:rsid w:val="00F852D0"/>
+    <w:rsid w:val="00E07461"/>
     <w:rPr>
       <w:rFonts w:eastAsiaTheme="majorEastAsia" w:cstheme="majorBidi"/>
       <w:color w:val="595959" w:themeColor="text1" w:themeTint="A6"/>
@@ -16977,7 +17019,7 @@
     <w:link w:val="Ttulo8"/>
     <w:uiPriority w:val="9"/>
     <w:semiHidden/>
-    <w:rsid w:val="00F852D0"/>
+    <w:rsid w:val="00E07461"/>
     <w:rPr>
       <w:rFonts w:eastAsiaTheme="majorEastAsia" w:cstheme="majorBidi"/>
       <w:i/>
@@ -16991,7 +17033,7 @@
     <w:link w:val="Ttulo9"/>
     <w:uiPriority w:val="9"/>
     <w:semiHidden/>
-    <w:rsid w:val="00F852D0"/>
+    <w:rsid w:val="00E07461"/>
     <w:rPr>
       <w:rFonts w:eastAsiaTheme="majorEastAsia" w:cstheme="majorBidi"/>
       <w:color w:val="272727" w:themeColor="text1" w:themeTint="D8"/>
@@ -17004,7 +17046,7 @@
     <w:link w:val="TtuloChar"/>
     <w:uiPriority w:val="10"/>
     <w:qFormat/>
-    <w:rsid w:val="00F852D0"/>
+    <w:rsid w:val="00E07461"/>
     <w:pPr>
       <w:spacing w:after="80" w:line="240" w:lineRule="auto"/>
       <w:contextualSpacing/>
@@ -17022,7 +17064,7 @@
     <w:basedOn w:val="Fontepargpadro"/>
     <w:link w:val="Ttulo"/>
     <w:uiPriority w:val="10"/>
-    <w:rsid w:val="00F852D0"/>
+    <w:rsid w:val="00E07461"/>
     <w:rPr>
       <w:rFonts w:asciiTheme="majorHAnsi" w:eastAsiaTheme="majorEastAsia" w:hAnsiTheme="majorHAnsi" w:cstheme="majorBidi"/>
       <w:spacing w:val="-10"/>
@@ -17038,7 +17080,7 @@
     <w:link w:val="SubttuloChar"/>
     <w:uiPriority w:val="11"/>
     <w:qFormat/>
-    <w:rsid w:val="00F852D0"/>
+    <w:rsid w:val="00E07461"/>
     <w:pPr>
       <w:numPr>
         <w:ilvl w:val="1"/>
@@ -17057,7 +17099,7 @@
     <w:basedOn w:val="Fontepargpadro"/>
     <w:link w:val="Subttulo"/>
     <w:uiPriority w:val="11"/>
-    <w:rsid w:val="00F852D0"/>
+    <w:rsid w:val="00E07461"/>
     <w:rPr>
       <w:rFonts w:eastAsiaTheme="majorEastAsia" w:cstheme="majorBidi"/>
       <w:color w:val="595959" w:themeColor="text1" w:themeTint="A6"/>
@@ -17073,7 +17115,7 @@
     <w:link w:val="CitaoChar"/>
     <w:uiPriority w:val="29"/>
     <w:qFormat/>
-    <w:rsid w:val="00F852D0"/>
+    <w:rsid w:val="00E07461"/>
     <w:pPr>
       <w:spacing w:before="160"/>
       <w:jc w:val="center"/>
@@ -17089,7 +17131,7 @@
     <w:basedOn w:val="Fontepargpadro"/>
     <w:link w:val="Citao"/>
     <w:uiPriority w:val="29"/>
-    <w:rsid w:val="00F852D0"/>
+    <w:rsid w:val="00E07461"/>
     <w:rPr>
       <w:i/>
       <w:iCs/>
@@ -17101,7 +17143,7 @@
     <w:basedOn w:val="Normal"/>
     <w:uiPriority w:val="34"/>
     <w:qFormat/>
-    <w:rsid w:val="00F852D0"/>
+    <w:rsid w:val="00E07461"/>
     <w:pPr>
       <w:ind w:left="720"/>
       <w:contextualSpacing/>
@@ -17112,7 +17154,7 @@
     <w:basedOn w:val="Fontepargpadro"/>
     <w:uiPriority w:val="21"/>
     <w:qFormat/>
-    <w:rsid w:val="00F852D0"/>
+    <w:rsid w:val="00E07461"/>
     <w:rPr>
       <w:i/>
       <w:iCs/>
@@ -17126,7 +17168,7 @@
     <w:link w:val="CitaoIntensaChar"/>
     <w:uiPriority w:val="30"/>
     <w:qFormat/>
-    <w:rsid w:val="00F852D0"/>
+    <w:rsid w:val="00E07461"/>
     <w:pPr>
       <w:pBdr>
         <w:top w:val="single" w:sz="4" w:space="10" w:color="0F4761" w:themeColor="accent1" w:themeShade="BF"/>
@@ -17147,7 +17189,7 @@
     <w:basedOn w:val="Fontepargpadro"/>
     <w:link w:val="CitaoIntensa"/>
     <w:uiPriority w:val="30"/>
-    <w:rsid w:val="00F852D0"/>
+    <w:rsid w:val="00E07461"/>
     <w:rPr>
       <w:i/>
       <w:iCs/>
@@ -17159,7 +17201,7 @@
     <w:basedOn w:val="Fontepargpadro"/>
     <w:uiPriority w:val="32"/>
     <w:qFormat/>
-    <w:rsid w:val="00F852D0"/>
+    <w:rsid w:val="00E07461"/>
     <w:rPr>
       <w:b/>
       <w:bCs/>
@@ -17174,7 +17216,7 @@
     <w:link w:val="CabealhoChar"/>
     <w:uiPriority w:val="99"/>
     <w:unhideWhenUsed/>
-    <w:rsid w:val="00F852D0"/>
+    <w:rsid w:val="00E07461"/>
     <w:pPr>
       <w:tabs>
         <w:tab w:val="center" w:pos="4252"/>
@@ -17188,7 +17230,7 @@
     <w:basedOn w:val="Fontepargpadro"/>
     <w:link w:val="Cabealho"/>
     <w:uiPriority w:val="99"/>
-    <w:rsid w:val="00F852D0"/>
+    <w:rsid w:val="00E07461"/>
   </w:style>
   <w:style w:type="paragraph" w:styleId="Rodap">
     <w:name w:val="footer"/>
@@ -17196,7 +17238,7 @@
     <w:link w:val="RodapChar"/>
     <w:uiPriority w:val="99"/>
     <w:unhideWhenUsed/>
-    <w:rsid w:val="00F852D0"/>
+    <w:rsid w:val="00E07461"/>
     <w:pPr>
       <w:tabs>
         <w:tab w:val="center" w:pos="4252"/>
@@ -17210,7 +17252,7 @@
     <w:basedOn w:val="Fontepargpadro"/>
     <w:link w:val="Rodap"/>
     <w:uiPriority w:val="99"/>
-    <w:rsid w:val="00F852D0"/>
+    <w:rsid w:val="00E07461"/>
   </w:style>
   <w:style w:type="paragraph" w:styleId="Sumrio1">
     <w:name w:val="toc 1"/>
@@ -17219,7 +17261,7 @@
     <w:autoRedefine/>
     <w:uiPriority w:val="39"/>
     <w:unhideWhenUsed/>
-    <w:rsid w:val="00F852D0"/>
+    <w:rsid w:val="00E07461"/>
     <w:pPr>
       <w:spacing w:after="100"/>
     </w:pPr>
@@ -17231,7 +17273,7 @@
     <w:autoRedefine/>
     <w:uiPriority w:val="39"/>
     <w:unhideWhenUsed/>
-    <w:rsid w:val="00F852D0"/>
+    <w:rsid w:val="00E07461"/>
     <w:pPr>
       <w:spacing w:after="100"/>
       <w:ind w:left="240"/>

</xml_diff>

<commit_message>
Adiciona notificacoes por e-mail em transicoes de estado (via Resend)
Seis transicoes de decisao agora disparam e-mail automaticamente para
quem criou o registro, a equipe do projeto vinculado e os Admins:
Gate 1 (Solicitacao de Demanda), Canvas aprovado, TAP aprovado, decisao
da SMP, registro de TEP e Gate 2 pactuado (Relatorio de Entregas).

O envio e feito por uma Supabase Edge Function (supabase/functions/
send-notification) que guarda a chave do Resend no servidor - o
navegador nunca tem acesso a ela. Falha no envio nao bloqueia o
salvamento do registro.

Atualiza o Manual de Uso para v2.9 com a nova secao 2.8 e notas nos
pontos de gatilho. Sem mudanca de regra de acesso.

Co-Authored-By: Claude Sonnet 5 <noreply@anthropic.com>
</commit_message>
<xml_diff>
--- a/Manual de Uso - Ferramenta de Gestao de Projetos.docx
+++ b/Manual de Uso - Ferramenta de Gestao de Projetos.docx
@@ -129,7 +129,7 @@
           <w:color w:val="6A6A70"/>
           <w:sz w:val="22"/>
         </w:rPr>
-        <w:t>Versao 2.8 - 01 de agosto de 2026 (substitui a versao 2.7 de 01/08/2026)</w:t>
+        <w:t>Versao 2.9 - 01 de agosto de 2026 (substitui a versao 2.8 de 01/08/2026)</w:t>
       </w:r>
     </w:p>
     <w:p>
@@ -229,7 +229,7 @@
         <w:rPr>
           <w:noProof/>
         </w:rPr>
-        <w:instrText xml:space="preserve"> PAGEREF _Toc236512812 \h </w:instrText>
+        <w:instrText xml:space="preserve"> PAGEREF _Toc236515570 \h </w:instrText>
       </w:r>
       <w:r>
         <w:rPr>
@@ -290,7 +290,7 @@
         <w:rPr>
           <w:noProof/>
         </w:rPr>
-        <w:instrText xml:space="preserve"> PAGEREF _Toc236512813 \h </w:instrText>
+        <w:instrText xml:space="preserve"> PAGEREF _Toc236515571 \h </w:instrText>
       </w:r>
       <w:r>
         <w:rPr>
@@ -351,7 +351,7 @@
         <w:rPr>
           <w:noProof/>
         </w:rPr>
-        <w:instrText xml:space="preserve"> PAGEREF _Toc236512814 \h </w:instrText>
+        <w:instrText xml:space="preserve"> PAGEREF _Toc236515572 \h </w:instrText>
       </w:r>
       <w:r>
         <w:rPr>
@@ -412,7 +412,7 @@
         <w:rPr>
           <w:noProof/>
         </w:rPr>
-        <w:instrText xml:space="preserve"> PAGEREF _Toc236512815 \h </w:instrText>
+        <w:instrText xml:space="preserve"> PAGEREF _Toc236515573 \h </w:instrText>
       </w:r>
       <w:r>
         <w:rPr>
@@ -429,7 +429,7 @@
         <w:rPr>
           <w:noProof/>
         </w:rPr>
-        <w:t>6</w:t>
+        <w:t>7</w:t>
       </w:r>
       <w:r>
         <w:rPr>
@@ -473,7 +473,7 @@
         <w:rPr>
           <w:noProof/>
         </w:rPr>
-        <w:instrText xml:space="preserve"> PAGEREF _Toc236512816 \h </w:instrText>
+        <w:instrText xml:space="preserve"> PAGEREF _Toc236515574 \h </w:instrText>
       </w:r>
       <w:r>
         <w:rPr>
@@ -490,7 +490,7 @@
         <w:rPr>
           <w:noProof/>
         </w:rPr>
-        <w:t>7</w:t>
+        <w:t>8</w:t>
       </w:r>
       <w:r>
         <w:rPr>
@@ -534,7 +534,7 @@
         <w:rPr>
           <w:noProof/>
         </w:rPr>
-        <w:instrText xml:space="preserve"> PAGEREF _Toc236512817 \h </w:instrText>
+        <w:instrText xml:space="preserve"> PAGEREF _Toc236515575 \h </w:instrText>
       </w:r>
       <w:r>
         <w:rPr>
@@ -595,7 +595,7 @@
         <w:rPr>
           <w:noProof/>
         </w:rPr>
-        <w:instrText xml:space="preserve"> PAGEREF _Toc236512818 \h </w:instrText>
+        <w:instrText xml:space="preserve"> PAGEREF _Toc236515576 \h </w:instrText>
       </w:r>
       <w:r>
         <w:rPr>
@@ -656,7 +656,7 @@
         <w:rPr>
           <w:noProof/>
         </w:rPr>
-        <w:instrText xml:space="preserve"> PAGEREF _Toc236512819 \h </w:instrText>
+        <w:instrText xml:space="preserve"> PAGEREF _Toc236515577 \h </w:instrText>
       </w:r>
       <w:r>
         <w:rPr>
@@ -717,7 +717,7 @@
         <w:rPr>
           <w:noProof/>
         </w:rPr>
-        <w:instrText xml:space="preserve"> PAGEREF _Toc236512820 \h </w:instrText>
+        <w:instrText xml:space="preserve"> PAGEREF _Toc236515578 \h </w:instrText>
       </w:r>
       <w:r>
         <w:rPr>
@@ -778,7 +778,7 @@
         <w:rPr>
           <w:noProof/>
         </w:rPr>
-        <w:instrText xml:space="preserve"> PAGEREF _Toc236512821 \h </w:instrText>
+        <w:instrText xml:space="preserve"> PAGEREF _Toc236515579 \h </w:instrText>
       </w:r>
       <w:r>
         <w:rPr>
@@ -839,7 +839,7 @@
         <w:rPr>
           <w:noProof/>
         </w:rPr>
-        <w:instrText xml:space="preserve"> PAGEREF _Toc236512822 \h </w:instrText>
+        <w:instrText xml:space="preserve"> PAGEREF _Toc236515580 \h </w:instrText>
       </w:r>
       <w:r>
         <w:rPr>
@@ -900,7 +900,7 @@
         <w:rPr>
           <w:noProof/>
         </w:rPr>
-        <w:instrText xml:space="preserve"> PAGEREF _Toc236512823 \h </w:instrText>
+        <w:instrText xml:space="preserve"> PAGEREF _Toc236515581 \h </w:instrText>
       </w:r>
       <w:r>
         <w:rPr>
@@ -961,7 +961,7 @@
         <w:rPr>
           <w:noProof/>
         </w:rPr>
-        <w:instrText xml:space="preserve"> PAGEREF _Toc236512824 \h </w:instrText>
+        <w:instrText xml:space="preserve"> PAGEREF _Toc236515582 \h </w:instrText>
       </w:r>
       <w:r>
         <w:rPr>
@@ -979,6 +979,67 @@
           <w:noProof/>
         </w:rPr>
         <w:t>14</w:t>
+      </w:r>
+      <w:r>
+        <w:rPr>
+          <w:noProof/>
+        </w:rPr>
+        <w:fldChar w:fldCharType="end"/>
+      </w:r>
+    </w:p>
+    <w:p>
+      <w:pPr>
+        <w:pStyle w:val="Sumrio2"/>
+        <w:tabs>
+          <w:tab w:val="right" w:leader="dot" w:pos="8828"/>
+        </w:tabs>
+        <w:rPr>
+          <w:noProof/>
+        </w:rPr>
+      </w:pPr>
+      <w:r>
+        <w:rPr>
+          <w:rFonts w:ascii="Montserrat" w:hAnsi="Montserrat"/>
+          <w:b/>
+          <w:noProof/>
+          <w:color w:val="B91D2E"/>
+        </w:rPr>
+        <w:t>2.8 Notificacoes por e-mail em transicoes de estado</w:t>
+      </w:r>
+      <w:r>
+        <w:rPr>
+          <w:noProof/>
+        </w:rPr>
+        <w:tab/>
+      </w:r>
+      <w:r>
+        <w:rPr>
+          <w:noProof/>
+        </w:rPr>
+        <w:fldChar w:fldCharType="begin"/>
+      </w:r>
+      <w:r>
+        <w:rPr>
+          <w:noProof/>
+        </w:rPr>
+        <w:instrText xml:space="preserve"> PAGEREF _Toc236515583 \h </w:instrText>
+      </w:r>
+      <w:r>
+        <w:rPr>
+          <w:noProof/>
+        </w:rPr>
+      </w:r>
+      <w:r>
+        <w:rPr>
+          <w:noProof/>
+        </w:rPr>
+        <w:fldChar w:fldCharType="separate"/>
+      </w:r>
+      <w:r>
+        <w:rPr>
+          <w:noProof/>
+        </w:rPr>
+        <w:t>15</w:t>
       </w:r>
       <w:r>
         <w:rPr>
@@ -1022,7 +1083,7 @@
         <w:rPr>
           <w:noProof/>
         </w:rPr>
-        <w:instrText xml:space="preserve"> PAGEREF _Toc236512825 \h </w:instrText>
+        <w:instrText xml:space="preserve"> PAGEREF _Toc236515584 \h </w:instrText>
       </w:r>
       <w:r>
         <w:rPr>
@@ -1083,7 +1144,7 @@
         <w:rPr>
           <w:noProof/>
         </w:rPr>
-        <w:instrText xml:space="preserve"> PAGEREF _Toc236512826 \h </w:instrText>
+        <w:instrText xml:space="preserve"> PAGEREF _Toc236515585 \h </w:instrText>
       </w:r>
       <w:r>
         <w:rPr>
@@ -1144,7 +1205,7 @@
         <w:rPr>
           <w:noProof/>
         </w:rPr>
-        <w:instrText xml:space="preserve"> PAGEREF _Toc236512827 \h </w:instrText>
+        <w:instrText xml:space="preserve"> PAGEREF _Toc236515586 \h </w:instrText>
       </w:r>
       <w:r>
         <w:rPr>
@@ -1161,7 +1222,7 @@
         <w:rPr>
           <w:noProof/>
         </w:rPr>
-        <w:t>18</w:t>
+        <w:t>19</w:t>
       </w:r>
       <w:r>
         <w:rPr>
@@ -1205,7 +1266,7 @@
         <w:rPr>
           <w:noProof/>
         </w:rPr>
-        <w:instrText xml:space="preserve"> PAGEREF _Toc236512828 \h </w:instrText>
+        <w:instrText xml:space="preserve"> PAGEREF _Toc236515587 \h </w:instrText>
       </w:r>
       <w:r>
         <w:rPr>
@@ -1266,7 +1327,7 @@
         <w:rPr>
           <w:noProof/>
         </w:rPr>
-        <w:instrText xml:space="preserve"> PAGEREF _Toc236512829 \h </w:instrText>
+        <w:instrText xml:space="preserve"> PAGEREF _Toc236515588 \h </w:instrText>
       </w:r>
       <w:r>
         <w:rPr>
@@ -1327,7 +1388,7 @@
         <w:rPr>
           <w:noProof/>
         </w:rPr>
-        <w:instrText xml:space="preserve"> PAGEREF _Toc236512830 \h </w:instrText>
+        <w:instrText xml:space="preserve"> PAGEREF _Toc236515589 \h </w:instrText>
       </w:r>
       <w:r>
         <w:rPr>
@@ -1388,7 +1449,7 @@
         <w:rPr>
           <w:noProof/>
         </w:rPr>
-        <w:instrText xml:space="preserve"> PAGEREF _Toc236512831 \h </w:instrText>
+        <w:instrText xml:space="preserve"> PAGEREF _Toc236515590 \h </w:instrText>
       </w:r>
       <w:r>
         <w:rPr>
@@ -1449,7 +1510,7 @@
         <w:rPr>
           <w:noProof/>
         </w:rPr>
-        <w:instrText xml:space="preserve"> PAGEREF _Toc236512832 \h </w:instrText>
+        <w:instrText xml:space="preserve"> PAGEREF _Toc236515591 \h </w:instrText>
       </w:r>
       <w:r>
         <w:rPr>
@@ -1510,7 +1571,7 @@
         <w:rPr>
           <w:noProof/>
         </w:rPr>
-        <w:instrText xml:space="preserve"> PAGEREF _Toc236512833 \h </w:instrText>
+        <w:instrText xml:space="preserve"> PAGEREF _Toc236515592 \h </w:instrText>
       </w:r>
       <w:r>
         <w:rPr>
@@ -1571,7 +1632,7 @@
         <w:rPr>
           <w:noProof/>
         </w:rPr>
-        <w:instrText xml:space="preserve"> PAGEREF _Toc236512834 \h </w:instrText>
+        <w:instrText xml:space="preserve"> PAGEREF _Toc236515593 \h </w:instrText>
       </w:r>
       <w:r>
         <w:rPr>
@@ -1632,7 +1693,7 @@
         <w:rPr>
           <w:noProof/>
         </w:rPr>
-        <w:instrText xml:space="preserve"> PAGEREF _Toc236512835 \h </w:instrText>
+        <w:instrText xml:space="preserve"> PAGEREF _Toc236515594 \h </w:instrText>
       </w:r>
       <w:r>
         <w:rPr>
@@ -1693,7 +1754,7 @@
         <w:rPr>
           <w:noProof/>
         </w:rPr>
-        <w:instrText xml:space="preserve"> PAGEREF _Toc236512836 \h </w:instrText>
+        <w:instrText xml:space="preserve"> PAGEREF _Toc236515595 \h </w:instrText>
       </w:r>
       <w:r>
         <w:rPr>
@@ -1736,6 +1797,7 @@
           <w:noProof/>
           <w:color w:val="B91D2E"/>
         </w:rPr>
+        <w:lastRenderedPageBreak/>
         <w:t>4.1 Relatorio de Situacao de Projetos (FORALF11)</w:t>
       </w:r>
       <w:r>
@@ -1754,7 +1816,7 @@
         <w:rPr>
           <w:noProof/>
         </w:rPr>
-        <w:instrText xml:space="preserve"> PAGEREF _Toc236512837 \h </w:instrText>
+        <w:instrText xml:space="preserve"> PAGEREF _Toc236515596 \h </w:instrText>
       </w:r>
       <w:r>
         <w:rPr>
@@ -1797,7 +1859,6 @@
           <w:noProof/>
           <w:color w:val="B91D2E"/>
         </w:rPr>
-        <w:lastRenderedPageBreak/>
         <w:t>4.2 Relatorio de Entregas e Beneficios (FORALF12)</w:t>
       </w:r>
       <w:r>
@@ -1816,7 +1877,7 @@
         <w:rPr>
           <w:noProof/>
         </w:rPr>
-        <w:instrText xml:space="preserve"> PAGEREF _Toc236512838 \h </w:instrText>
+        <w:instrText xml:space="preserve"> PAGEREF _Toc236515597 \h </w:instrText>
       </w:r>
       <w:r>
         <w:rPr>
@@ -1877,7 +1938,7 @@
         <w:rPr>
           <w:noProof/>
         </w:rPr>
-        <w:instrText xml:space="preserve"> PAGEREF _Toc236512839 \h </w:instrText>
+        <w:instrText xml:space="preserve"> PAGEREF _Toc236515598 \h </w:instrText>
       </w:r>
       <w:r>
         <w:rPr>
@@ -1938,7 +1999,7 @@
         <w:rPr>
           <w:noProof/>
         </w:rPr>
-        <w:instrText xml:space="preserve"> PAGEREF _Toc236512840 \h </w:instrText>
+        <w:instrText xml:space="preserve"> PAGEREF _Toc236515599 \h </w:instrText>
       </w:r>
       <w:r>
         <w:rPr>
@@ -1999,7 +2060,7 @@
         <w:rPr>
           <w:noProof/>
         </w:rPr>
-        <w:instrText xml:space="preserve"> PAGEREF _Toc236512841 \h </w:instrText>
+        <w:instrText xml:space="preserve"> PAGEREF _Toc236515600 \h </w:instrText>
       </w:r>
       <w:r>
         <w:rPr>
@@ -2060,7 +2121,7 @@
         <w:rPr>
           <w:noProof/>
         </w:rPr>
-        <w:instrText xml:space="preserve"> PAGEREF _Toc236512842 \h </w:instrText>
+        <w:instrText xml:space="preserve"> PAGEREF _Toc236515601 \h </w:instrText>
       </w:r>
       <w:r>
         <w:rPr>
@@ -2121,7 +2182,7 @@
         <w:rPr>
           <w:noProof/>
         </w:rPr>
-        <w:instrText xml:space="preserve"> PAGEREF _Toc236512843 \h </w:instrText>
+        <w:instrText xml:space="preserve"> PAGEREF _Toc236515602 \h </w:instrText>
       </w:r>
       <w:r>
         <w:rPr>
@@ -2182,7 +2243,7 @@
         <w:rPr>
           <w:noProof/>
         </w:rPr>
-        <w:instrText xml:space="preserve"> PAGEREF _Toc236512844 \h </w:instrText>
+        <w:instrText xml:space="preserve"> PAGEREF _Toc236515603 \h </w:instrText>
       </w:r>
       <w:r>
         <w:rPr>
@@ -2243,7 +2304,7 @@
         <w:rPr>
           <w:noProof/>
         </w:rPr>
-        <w:instrText xml:space="preserve"> PAGEREF _Toc236512845 \h </w:instrText>
+        <w:instrText xml:space="preserve"> PAGEREF _Toc236515604 \h </w:instrText>
       </w:r>
       <w:r>
         <w:rPr>
@@ -2304,7 +2365,7 @@
         <w:rPr>
           <w:noProof/>
         </w:rPr>
-        <w:instrText xml:space="preserve"> PAGEREF _Toc236512846 \h </w:instrText>
+        <w:instrText xml:space="preserve"> PAGEREF _Toc236515605 \h </w:instrText>
       </w:r>
       <w:r>
         <w:rPr>
@@ -2365,7 +2426,7 @@
         <w:rPr>
           <w:noProof/>
         </w:rPr>
-        <w:instrText xml:space="preserve"> PAGEREF _Toc236512847 \h </w:instrText>
+        <w:instrText xml:space="preserve"> PAGEREF _Toc236515606 \h </w:instrText>
       </w:r>
       <w:r>
         <w:rPr>
@@ -2426,7 +2487,7 @@
         <w:rPr>
           <w:noProof/>
         </w:rPr>
-        <w:instrText xml:space="preserve"> PAGEREF _Toc236512848 \h </w:instrText>
+        <w:instrText xml:space="preserve"> PAGEREF _Toc236515607 \h </w:instrText>
       </w:r>
       <w:r>
         <w:rPr>
@@ -2502,7 +2563,7 @@
           <w:sz w:val="34"/>
         </w:rPr>
       </w:pPr>
-      <w:bookmarkStart w:id="0" w:name="_Toc236512812"/>
+      <w:bookmarkStart w:id="0" w:name="_Toc236515570"/>
       <w:r>
         <w:rPr>
           <w:rFonts w:ascii="Montserrat" w:hAnsi="Montserrat"/>
@@ -2526,7 +2587,7 @@
           <w:sz w:val="27"/>
         </w:rPr>
       </w:pPr>
-      <w:bookmarkStart w:id="1" w:name="_Toc236512813"/>
+      <w:bookmarkStart w:id="1" w:name="_Toc236515571"/>
       <w:r>
         <w:rPr>
           <w:rFonts w:ascii="Montserrat" w:hAnsi="Montserrat"/>
@@ -2742,6 +2803,24 @@
           <w:color w:val="1A1A1A"/>
           <w:sz w:val="22"/>
         </w:rPr>
+        <w:t>Esta e a versao 2.9 do manual. Em relacao a versao 2.8 (01/08/2026), foi adicionada a nova secao 2.8 - Notificacoes por e-mail em transicoes de estado: seis transicoes (Gate 1, Canvas aprovado, TAP aprovado, decisao da SMP, registro de TEP e Gate 2 pactuado) agora disparam automaticamente um e-mail via Resend para quem criou o registro, a equipe do projeto vinculado e os Admins.</w:t>
+      </w:r>
+    </w:p>
+    <w:p>
+      <w:pPr>
+        <w:spacing w:line="280" w:lineRule="auto"/>
+        <w:rPr>
+          <w:rFonts w:ascii="Montserrat" w:hAnsi="Montserrat"/>
+          <w:color w:val="1A1A1A"/>
+          <w:sz w:val="22"/>
+        </w:rPr>
+      </w:pPr>
+      <w:r>
+        <w:rPr>
+          <w:rFonts w:ascii="Montserrat" w:hAnsi="Montserrat"/>
+          <w:color w:val="1A1A1A"/>
+          <w:sz w:val="22"/>
+        </w:rPr>
         <w:t>O manual nao substitui as Diretrizes para a Gestao de Projetos da UNIALFA (documento institucional que define o framework D01 a D07) nem o documento Regras de Acesso e Permissoes (que detalha cada regra de controle de acesso); ele e o guia operacional de como usar cada ferramenta na pratica.</w:t>
       </w:r>
     </w:p>
@@ -2756,7 +2835,7 @@
           <w:sz w:val="27"/>
         </w:rPr>
       </w:pPr>
-      <w:bookmarkStart w:id="2" w:name="_Toc236512814"/>
+      <w:bookmarkStart w:id="2" w:name="_Toc236515572"/>
       <w:r>
         <w:rPr>
           <w:rFonts w:ascii="Montserrat" w:hAnsi="Montserrat"/>
@@ -2855,6 +2934,7 @@
           <w:color w:val="1A1A1A"/>
           <w:sz w:val="22"/>
         </w:rPr>
+        <w:lastRenderedPageBreak/>
         <w:t>1 pagina de Administracao, restrita a Admin, para gerenciar usuarios, equipes e configuracoes do sistema.</w:t>
       </w:r>
     </w:p>
@@ -2891,7 +2971,6 @@
           <w:color w:val="1A1A1A"/>
           <w:sz w:val="22"/>
         </w:rPr>
-        <w:lastRenderedPageBreak/>
         <w:t>O Mapa de Diretrizes (pagina inicial) apresenta visualmente as 7 diretrizes (D01 a D07) e mostra, para cada etapa do processo, quais ferramentas usar. E o ponto de partida recomendado para quem quer entender o processo antes de preencher os formularios - e a unica pagina, junto com o Validador de Projetos, que nao exige login.</w:t>
       </w:r>
     </w:p>
@@ -2905,16 +2984,16 @@
           <w:noProof/>
         </w:rPr>
         <w:drawing>
-          <wp:inline distT="0" distB="0" distL="0" distR="0" wp14:anchorId="2FB01246" wp14:editId="39B35738">
+          <wp:inline distT="0" distB="0" distL="0" distR="0" wp14:anchorId="4567582A" wp14:editId="2AAAA7EE">
             <wp:extent cx="5303520" cy="4792851"/>
             <wp:effectExtent l="19050" t="19050" r="11430" b="27305"/>
-            <wp:docPr id="843266764" name="Imagem 1"/>
+            <wp:docPr id="1930247828" name="Imagem 1"/>
             <wp:cNvGraphicFramePr/>
             <a:graphic xmlns:a="http://schemas.openxmlformats.org/drawingml/2006/main">
               <a:graphicData uri="http://schemas.openxmlformats.org/drawingml/2006/picture">
                 <pic:pic xmlns:pic="http://schemas.openxmlformats.org/drawingml/2006/picture">
                   <pic:nvPicPr>
-                    <pic:cNvPr id="843266764" name=""/>
+                    <pic:cNvPr id="1930247828" name=""/>
                     <pic:cNvPicPr/>
                   </pic:nvPicPr>
                   <pic:blipFill>
@@ -2982,7 +3061,7 @@
           <w:sz w:val="27"/>
         </w:rPr>
       </w:pPr>
-      <w:bookmarkStart w:id="3" w:name="_Toc236512815"/>
+      <w:bookmarkStart w:id="3" w:name="_Toc236515573"/>
       <w:r>
         <w:rPr>
           <w:rFonts w:ascii="Montserrat" w:hAnsi="Montserrat"/>
@@ -2990,6 +3069,7 @@
           <w:color w:val="B91D2E"/>
           <w:sz w:val="27"/>
         </w:rPr>
+        <w:lastRenderedPageBreak/>
         <w:t>1.3 Como acessar e fazer login</w:t>
       </w:r>
       <w:bookmarkEnd w:id="3"/>
@@ -3021,18 +3101,17 @@
         <w:rPr>
           <w:noProof/>
         </w:rPr>
-        <w:lastRenderedPageBreak/>
         <w:drawing>
-          <wp:inline distT="0" distB="0" distL="0" distR="0" wp14:anchorId="741C22FF" wp14:editId="42055DAE">
+          <wp:inline distT="0" distB="0" distL="0" distR="0" wp14:anchorId="2DB46300" wp14:editId="72F5776E">
             <wp:extent cx="4206240" cy="3801227"/>
             <wp:effectExtent l="19050" t="19050" r="22860" b="27940"/>
-            <wp:docPr id="1770784136" name="Imagem 2"/>
+            <wp:docPr id="1270871972" name="Imagem 2"/>
             <wp:cNvGraphicFramePr/>
             <a:graphic xmlns:a="http://schemas.openxmlformats.org/drawingml/2006/main">
               <a:graphicData uri="http://schemas.openxmlformats.org/drawingml/2006/picture">
                 <pic:pic xmlns:pic="http://schemas.openxmlformats.org/drawingml/2006/picture">
                   <pic:nvPicPr>
-                    <pic:cNvPr id="1770784136" name=""/>
+                    <pic:cNvPr id="1270871972" name=""/>
                     <pic:cNvPicPr/>
                   </pic:nvPicPr>
                   <pic:blipFill>
@@ -3205,7 +3284,7 @@
           <w:sz w:val="27"/>
         </w:rPr>
       </w:pPr>
-      <w:bookmarkStart w:id="4" w:name="_Toc236512816"/>
+      <w:bookmarkStart w:id="4" w:name="_Toc236515574"/>
       <w:r>
         <w:rPr>
           <w:rFonts w:ascii="Montserrat" w:hAnsi="Montserrat"/>
@@ -3213,6 +3292,7 @@
           <w:color w:val="B91D2E"/>
           <w:sz w:val="27"/>
         </w:rPr>
+        <w:lastRenderedPageBreak/>
         <w:t>1.4 Como a ferramenta se relaciona com as Diretrizes (D01-D07)</w:t>
       </w:r>
       <w:bookmarkEnd w:id="4"/>
@@ -3281,7 +3361,6 @@
                 <w:color w:val="FFFFFF"/>
                 <w:sz w:val="19"/>
               </w:rPr>
-              <w:lastRenderedPageBreak/>
               <w:t>Passo</w:t>
             </w:r>
           </w:p>
@@ -4354,7 +4433,7 @@
           <w:sz w:val="34"/>
         </w:rPr>
       </w:pPr>
-      <w:bookmarkStart w:id="5" w:name="_Toc236512817"/>
+      <w:bookmarkStart w:id="5" w:name="_Toc236515575"/>
       <w:r>
         <w:rPr>
           <w:rFonts w:ascii="Montserrat" w:hAnsi="Montserrat"/>
@@ -4378,7 +4457,7 @@
           <w:sz w:val="27"/>
         </w:rPr>
       </w:pPr>
-      <w:bookmarkStart w:id="6" w:name="_Toc236512818"/>
+      <w:bookmarkStart w:id="6" w:name="_Toc236515576"/>
       <w:r>
         <w:rPr>
           <w:rFonts w:ascii="Montserrat" w:hAnsi="Montserrat"/>
@@ -4419,7 +4498,7 @@
           <w:sz w:val="27"/>
         </w:rPr>
       </w:pPr>
-      <w:bookmarkStart w:id="7" w:name="_Toc236512819"/>
+      <w:bookmarkStart w:id="7" w:name="_Toc236515577"/>
       <w:r>
         <w:rPr>
           <w:rFonts w:ascii="Montserrat" w:hAnsi="Montserrat"/>
@@ -4538,7 +4617,7 @@
           <w:sz w:val="27"/>
         </w:rPr>
       </w:pPr>
-      <w:bookmarkStart w:id="8" w:name="_Toc236512820"/>
+      <w:bookmarkStart w:id="8" w:name="_Toc236515578"/>
       <w:r>
         <w:rPr>
           <w:rFonts w:ascii="Montserrat" w:hAnsi="Montserrat"/>
@@ -5109,7 +5188,7 @@
           <w:sz w:val="27"/>
         </w:rPr>
       </w:pPr>
-      <w:bookmarkStart w:id="9" w:name="_Toc236512821"/>
+      <w:bookmarkStart w:id="9" w:name="_Toc236515579"/>
       <w:r>
         <w:rPr>
           <w:rFonts w:ascii="Montserrat" w:hAnsi="Montserrat"/>
@@ -5198,16 +5277,16 @@
         </w:rPr>
         <w:lastRenderedPageBreak/>
         <w:drawing>
-          <wp:inline distT="0" distB="0" distL="0" distR="0" wp14:anchorId="4CFFE3BE" wp14:editId="60057973">
+          <wp:inline distT="0" distB="0" distL="0" distR="0" wp14:anchorId="09625AFD" wp14:editId="09474D89">
             <wp:extent cx="4937760" cy="4462310"/>
             <wp:effectExtent l="19050" t="19050" r="15240" b="14605"/>
-            <wp:docPr id="1292479499" name="Imagem 3"/>
+            <wp:docPr id="1280245017" name="Imagem 3"/>
             <wp:cNvGraphicFramePr/>
             <a:graphic xmlns:a="http://schemas.openxmlformats.org/drawingml/2006/main">
               <a:graphicData uri="http://schemas.openxmlformats.org/drawingml/2006/picture">
                 <pic:pic xmlns:pic="http://schemas.openxmlformats.org/drawingml/2006/picture">
                   <pic:nvPicPr>
-                    <pic:cNvPr id="1292479499" name=""/>
+                    <pic:cNvPr id="1280245017" name=""/>
                     <pic:cNvPicPr/>
                   </pic:nvPicPr>
                   <pic:blipFill>
@@ -5275,7 +5354,7 @@
           <w:sz w:val="27"/>
         </w:rPr>
       </w:pPr>
-      <w:bookmarkStart w:id="10" w:name="_Toc236512822"/>
+      <w:bookmarkStart w:id="10" w:name="_Toc236515580"/>
       <w:r>
         <w:rPr>
           <w:rFonts w:ascii="Montserrat" w:hAnsi="Montserrat"/>
@@ -5316,16 +5395,16 @@
         </w:rPr>
         <w:lastRenderedPageBreak/>
         <w:drawing>
-          <wp:inline distT="0" distB="0" distL="0" distR="0" wp14:anchorId="5E84B143" wp14:editId="72350340">
+          <wp:inline distT="0" distB="0" distL="0" distR="0" wp14:anchorId="3FD2EDA8" wp14:editId="06A6B476">
             <wp:extent cx="5120640" cy="4627581"/>
             <wp:effectExtent l="19050" t="19050" r="22860" b="20955"/>
-            <wp:docPr id="794968222" name="Imagem 4"/>
+            <wp:docPr id="1708522870" name="Imagem 4"/>
             <wp:cNvGraphicFramePr/>
             <a:graphic xmlns:a="http://schemas.openxmlformats.org/drawingml/2006/main">
               <a:graphicData uri="http://schemas.openxmlformats.org/drawingml/2006/picture">
                 <pic:pic xmlns:pic="http://schemas.openxmlformats.org/drawingml/2006/picture">
                   <pic:nvPicPr>
-                    <pic:cNvPr id="794968222" name=""/>
+                    <pic:cNvPr id="1708522870" name=""/>
                     <pic:cNvPicPr/>
                   </pic:nvPicPr>
                   <pic:blipFill>
@@ -5462,7 +5541,7 @@
           <w:sz w:val="27"/>
         </w:rPr>
       </w:pPr>
-      <w:bookmarkStart w:id="11" w:name="_Toc236512823"/>
+      <w:bookmarkStart w:id="11" w:name="_Toc236515581"/>
       <w:r>
         <w:rPr>
           <w:rFonts w:ascii="Montserrat" w:hAnsi="Montserrat"/>
@@ -5503,16 +5582,16 @@
           <w:noProof/>
         </w:rPr>
         <w:drawing>
-          <wp:inline distT="0" distB="0" distL="0" distR="0" wp14:anchorId="66496087" wp14:editId="0941F29E">
+          <wp:inline distT="0" distB="0" distL="0" distR="0" wp14:anchorId="0F70C177" wp14:editId="2A2F484D">
             <wp:extent cx="4206240" cy="3801227"/>
             <wp:effectExtent l="19050" t="19050" r="22860" b="27940"/>
-            <wp:docPr id="835269032" name="Imagem 5"/>
+            <wp:docPr id="2117034350" name="Imagem 5"/>
             <wp:cNvGraphicFramePr/>
             <a:graphic xmlns:a="http://schemas.openxmlformats.org/drawingml/2006/main">
               <a:graphicData uri="http://schemas.openxmlformats.org/drawingml/2006/picture">
                 <pic:pic xmlns:pic="http://schemas.openxmlformats.org/drawingml/2006/picture">
                   <pic:nvPicPr>
-                    <pic:cNvPr id="835269032" name=""/>
+                    <pic:cNvPr id="2117034350" name=""/>
                     <pic:cNvPicPr/>
                   </pic:nvPicPr>
                   <pic:blipFill>
@@ -5580,16 +5659,16 @@
         </w:rPr>
         <w:lastRenderedPageBreak/>
         <w:drawing>
-          <wp:inline distT="0" distB="0" distL="0" distR="0" wp14:anchorId="21B48E77" wp14:editId="3A34738E">
+          <wp:inline distT="0" distB="0" distL="0" distR="0" wp14:anchorId="714CF057" wp14:editId="29512CC5">
             <wp:extent cx="4206240" cy="3801227"/>
             <wp:effectExtent l="19050" t="19050" r="22860" b="27940"/>
-            <wp:docPr id="1016602309" name="Imagem 6"/>
+            <wp:docPr id="1049003719" name="Imagem 6"/>
             <wp:cNvGraphicFramePr/>
             <a:graphic xmlns:a="http://schemas.openxmlformats.org/drawingml/2006/main">
               <a:graphicData uri="http://schemas.openxmlformats.org/drawingml/2006/picture">
                 <pic:pic xmlns:pic="http://schemas.openxmlformats.org/drawingml/2006/picture">
                   <pic:nvPicPr>
-                    <pic:cNvPr id="1016602309" name=""/>
+                    <pic:cNvPr id="1049003719" name=""/>
                     <pic:cNvPicPr/>
                   </pic:nvPicPr>
                   <pic:blipFill>
@@ -5705,7 +5784,7 @@
           <w:sz w:val="27"/>
         </w:rPr>
       </w:pPr>
-      <w:bookmarkStart w:id="12" w:name="_Toc236512824"/>
+      <w:bookmarkStart w:id="12" w:name="_Toc236515582"/>
       <w:r>
         <w:rPr>
           <w:rFonts w:ascii="Montserrat" w:hAnsi="Montserrat"/>
@@ -5760,6 +5839,209 @@
         </w:rPr>
         <w:lastRenderedPageBreak/>
         <w:t>forma em todos os formularios de um mesmo projeto, para manter a rastreabilidade entre eles.</w:t>
+      </w:r>
+    </w:p>
+    <w:p>
+      <w:pPr>
+        <w:pStyle w:val="Ttulo2"/>
+        <w:spacing w:before="320" w:after="120"/>
+        <w:rPr>
+          <w:rFonts w:ascii="Montserrat" w:hAnsi="Montserrat"/>
+          <w:b/>
+          <w:color w:val="B91D2E"/>
+          <w:sz w:val="27"/>
+        </w:rPr>
+      </w:pPr>
+      <w:bookmarkStart w:id="13" w:name="_Toc236515583"/>
+      <w:r>
+        <w:rPr>
+          <w:rFonts w:ascii="Montserrat" w:hAnsi="Montserrat"/>
+          <w:b/>
+          <w:color w:val="B91D2E"/>
+          <w:sz w:val="27"/>
+        </w:rPr>
+        <w:t>2.8 Notificacoes por e-mail em transicoes de estado</w:t>
+      </w:r>
+      <w:bookmarkEnd w:id="13"/>
+    </w:p>
+    <w:p>
+      <w:pPr>
+        <w:spacing w:line="280" w:lineRule="auto"/>
+        <w:rPr>
+          <w:rFonts w:ascii="Montserrat" w:hAnsi="Montserrat"/>
+          <w:color w:val="1A1A1A"/>
+          <w:sz w:val="22"/>
+        </w:rPr>
+      </w:pPr>
+      <w:r>
+        <w:rPr>
+          <w:rFonts w:ascii="Montserrat" w:hAnsi="Montserrat"/>
+          <w:color w:val="1A1A1A"/>
+          <w:sz w:val="22"/>
+        </w:rPr>
+        <w:t>Seis momentos de decisao do sistema disparam automaticamente um e-mail de notificacao, enviado via Resend por uma Supabase Edge Function (a chave da API fica guardada no servidor, nunca no navegador):</w:t>
+      </w:r>
+    </w:p>
+    <w:p>
+      <w:pPr>
+        <w:pStyle w:val="PargrafodaLista"/>
+        <w:numPr>
+          <w:ilvl w:val="0"/>
+          <w:numId w:val="8"/>
+        </w:numPr>
+        <w:spacing w:after="80" w:line="260" w:lineRule="auto"/>
+        <w:ind w:left="700"/>
+        <w:rPr>
+          <w:rFonts w:ascii="Montserrat" w:hAnsi="Montserrat"/>
+          <w:color w:val="1A1A1A"/>
+          <w:sz w:val="22"/>
+        </w:rPr>
+      </w:pPr>
+      <w:r>
+        <w:rPr>
+          <w:rFonts w:ascii="Montserrat" w:hAnsi="Montserrat"/>
+          <w:color w:val="1A1A1A"/>
+          <w:sz w:val="22"/>
+        </w:rPr>
+        <w:t>Gate 1 - Solicitacao de Demanda: quando o Admin muda o status para Aprovada ou Reprovada.</w:t>
+      </w:r>
+    </w:p>
+    <w:p>
+      <w:pPr>
+        <w:pStyle w:val="PargrafodaLista"/>
+        <w:numPr>
+          <w:ilvl w:val="0"/>
+          <w:numId w:val="8"/>
+        </w:numPr>
+        <w:spacing w:after="80" w:line="260" w:lineRule="auto"/>
+        <w:ind w:left="700"/>
+        <w:rPr>
+          <w:rFonts w:ascii="Montserrat" w:hAnsi="Montserrat"/>
+          <w:color w:val="1A1A1A"/>
+          <w:sz w:val="22"/>
+        </w:rPr>
+      </w:pPr>
+      <w:r>
+        <w:rPr>
+          <w:rFonts w:ascii="Montserrat" w:hAnsi="Montserrat"/>
+          <w:color w:val="1A1A1A"/>
+          <w:sz w:val="22"/>
+        </w:rPr>
+        <w:t>Canvas de Projeto: quando o status muda para Aprovado.</w:t>
+      </w:r>
+    </w:p>
+    <w:p>
+      <w:pPr>
+        <w:pStyle w:val="PargrafodaLista"/>
+        <w:numPr>
+          <w:ilvl w:val="0"/>
+          <w:numId w:val="8"/>
+        </w:numPr>
+        <w:spacing w:after="80" w:line="260" w:lineRule="auto"/>
+        <w:ind w:left="700"/>
+        <w:rPr>
+          <w:rFonts w:ascii="Montserrat" w:hAnsi="Montserrat"/>
+          <w:color w:val="1A1A1A"/>
+          <w:sz w:val="22"/>
+        </w:rPr>
+      </w:pPr>
+      <w:r>
+        <w:rPr>
+          <w:rFonts w:ascii="Montserrat" w:hAnsi="Montserrat"/>
+          <w:color w:val="1A1A1A"/>
+          <w:sz w:val="22"/>
+        </w:rPr>
+        <w:t>TAP: quando o status muda para Aprovado.</w:t>
+      </w:r>
+    </w:p>
+    <w:p>
+      <w:pPr>
+        <w:pStyle w:val="PargrafodaLista"/>
+        <w:numPr>
+          <w:ilvl w:val="0"/>
+          <w:numId w:val="8"/>
+        </w:numPr>
+        <w:spacing w:after="80" w:line="260" w:lineRule="auto"/>
+        <w:ind w:left="700"/>
+        <w:rPr>
+          <w:rFonts w:ascii="Montserrat" w:hAnsi="Montserrat"/>
+          <w:color w:val="1A1A1A"/>
+          <w:sz w:val="22"/>
+        </w:rPr>
+      </w:pPr>
+      <w:r>
+        <w:rPr>
+          <w:rFonts w:ascii="Montserrat" w:hAnsi="Montserrat"/>
+          <w:color w:val="1A1A1A"/>
+          <w:sz w:val="22"/>
+        </w:rPr>
+        <w:t>SMP: quando a decisao e finalizada como Aprovada ou Nao aprovada.</w:t>
+      </w:r>
+    </w:p>
+    <w:p>
+      <w:pPr>
+        <w:pStyle w:val="PargrafodaLista"/>
+        <w:numPr>
+          <w:ilvl w:val="0"/>
+          <w:numId w:val="8"/>
+        </w:numPr>
+        <w:spacing w:after="80" w:line="260" w:lineRule="auto"/>
+        <w:ind w:left="700"/>
+        <w:rPr>
+          <w:rFonts w:ascii="Montserrat" w:hAnsi="Montserrat"/>
+          <w:color w:val="1A1A1A"/>
+          <w:sz w:val="22"/>
+        </w:rPr>
+      </w:pPr>
+      <w:r>
+        <w:rPr>
+          <w:rFonts w:ascii="Montserrat" w:hAnsi="Montserrat"/>
+          <w:color w:val="1A1A1A"/>
+          <w:sz w:val="22"/>
+        </w:rPr>
+        <w:t>TEP: ao registrar um novo Termo de Encerramento.</w:t>
+      </w:r>
+    </w:p>
+    <w:p>
+      <w:pPr>
+        <w:pStyle w:val="PargrafodaLista"/>
+        <w:numPr>
+          <w:ilvl w:val="0"/>
+          <w:numId w:val="8"/>
+        </w:numPr>
+        <w:spacing w:after="80" w:line="260" w:lineRule="auto"/>
+        <w:ind w:left="700"/>
+        <w:rPr>
+          <w:rFonts w:ascii="Montserrat" w:hAnsi="Montserrat"/>
+          <w:color w:val="1A1A1A"/>
+          <w:sz w:val="22"/>
+        </w:rPr>
+      </w:pPr>
+      <w:r>
+        <w:rPr>
+          <w:rFonts w:ascii="Montserrat" w:hAnsi="Montserrat"/>
+          <w:color w:val="1A1A1A"/>
+          <w:sz w:val="22"/>
+        </w:rPr>
+        <w:t>Gate 2 - Relatorio de Entregas: quando o status muda para Pactuado.</w:t>
+      </w:r>
+    </w:p>
+    <w:p>
+      <w:pPr>
+        <w:spacing w:line="280" w:lineRule="auto"/>
+        <w:rPr>
+          <w:rFonts w:ascii="Montserrat" w:hAnsi="Montserrat"/>
+          <w:color w:val="1A1A1A"/>
+          <w:sz w:val="22"/>
+        </w:rPr>
+      </w:pPr>
+      <w:r>
+        <w:rPr>
+          <w:rFonts w:ascii="Montserrat" w:hAnsi="Montserrat"/>
+          <w:color w:val="1A1A1A"/>
+          <w:sz w:val="22"/>
+        </w:rPr>
+        <w:t>Em todos os casos, os destinatarios sao: quem criou o registro (e-mail capturado no login, ou informado no registro sem login), todos os e-mails cadastrados na equipe do Projeto vinculado (Administracao &gt; Equipes) e todos os usuarios com papel Admin. Se o envio falhar por qualquer motivo (ex.: instabilidade do provedor de e-mail), o registro e salvo normalmente mesmo assim - a notificacao nunca bloqueia o fluxo de trabalho.</w:t>
       </w:r>
     </w:p>
     <w:p>
@@ -5777,7 +6059,7 @@
           <w:sz w:val="34"/>
         </w:rPr>
       </w:pPr>
-      <w:bookmarkStart w:id="13" w:name="_Toc236512825"/>
+      <w:bookmarkStart w:id="14" w:name="_Toc236515584"/>
       <w:r>
         <w:rPr>
           <w:rFonts w:ascii="Montserrat" w:hAnsi="Montserrat"/>
@@ -5788,7 +6070,7 @@
         <w:lastRenderedPageBreak/>
         <w:t>3. Passo a passo do fluxo de um projeto</w:t>
       </w:r>
-      <w:bookmarkEnd w:id="13"/>
+      <w:bookmarkEnd w:id="14"/>
     </w:p>
     <w:p>
       <w:pPr>
@@ -5819,7 +6101,7 @@
           <w:sz w:val="27"/>
         </w:rPr>
       </w:pPr>
-      <w:bookmarkStart w:id="14" w:name="_Toc236512826"/>
+      <w:bookmarkStart w:id="15" w:name="_Toc236515585"/>
       <w:r>
         <w:rPr>
           <w:rFonts w:ascii="Montserrat" w:hAnsi="Montserrat"/>
@@ -5829,7 +6111,7 @@
         </w:rPr>
         <w:t>Passo 1 - Solicitacao de Demanda (FORALF00339)</w:t>
       </w:r>
-      <w:bookmarkEnd w:id="14"/>
+      <w:bookmarkEnd w:id="15"/>
     </w:p>
     <w:p>
       <w:pPr>
@@ -6679,16 +6961,16 @@
         </w:rPr>
         <w:lastRenderedPageBreak/>
         <w:drawing>
-          <wp:inline distT="0" distB="0" distL="0" distR="0" wp14:anchorId="3692179F" wp14:editId="00B71E68">
+          <wp:inline distT="0" distB="0" distL="0" distR="0" wp14:anchorId="56A6C27B" wp14:editId="6123A775">
             <wp:extent cx="5120640" cy="4627581"/>
             <wp:effectExtent l="19050" t="19050" r="22860" b="20955"/>
-            <wp:docPr id="322259972" name="Imagem 7"/>
+            <wp:docPr id="2094115796" name="Imagem 7"/>
             <wp:cNvGraphicFramePr/>
             <a:graphic xmlns:a="http://schemas.openxmlformats.org/drawingml/2006/main">
               <a:graphicData uri="http://schemas.openxmlformats.org/drawingml/2006/picture">
                 <pic:pic xmlns:pic="http://schemas.openxmlformats.org/drawingml/2006/picture">
                   <pic:nvPicPr>
-                    <pic:cNvPr id="322259972" name=""/>
+                    <pic:cNvPr id="2094115796" name=""/>
                     <pic:cNvPicPr/>
                   </pic:nvPicPr>
                   <pic:blipFill>
@@ -6756,16 +7038,16 @@
         </w:rPr>
         <w:lastRenderedPageBreak/>
         <w:drawing>
-          <wp:inline distT="0" distB="0" distL="0" distR="0" wp14:anchorId="21F28B52" wp14:editId="34F12632">
+          <wp:inline distT="0" distB="0" distL="0" distR="0" wp14:anchorId="55110B2A" wp14:editId="24845534">
             <wp:extent cx="5120640" cy="4627581"/>
             <wp:effectExtent l="19050" t="19050" r="22860" b="20955"/>
-            <wp:docPr id="696401795" name="Imagem 8"/>
+            <wp:docPr id="740215593" name="Imagem 8"/>
             <wp:cNvGraphicFramePr/>
             <a:graphic xmlns:a="http://schemas.openxmlformats.org/drawingml/2006/main">
               <a:graphicData uri="http://schemas.openxmlformats.org/drawingml/2006/picture">
                 <pic:pic xmlns:pic="http://schemas.openxmlformats.org/drawingml/2006/picture">
                   <pic:nvPicPr>
-                    <pic:cNvPr id="696401795" name=""/>
+                    <pic:cNvPr id="740215593" name=""/>
                     <pic:cNvPicPr/>
                   </pic:nvPicPr>
                   <pic:blipFill>
@@ -6886,7 +7168,7 @@
           <w:color w:val="6A6A70"/>
           <w:sz w:val="21"/>
         </w:rPr>
-        <w:t>E neste ponto que ocorre o Gate 1 - Triagem: so um Admin pode mudar o status para Aprovada ou Reprovada (secao 2.4). So avance para o Passo 2 depois que o status estiver Aprovada.</w:t>
+        <w:t>E neste ponto que ocorre o Gate 1 - Triagem: so um Admin pode mudar o status para Aprovada ou Reprovada (secao 2.4). So avance para o Passo 2 depois que o status estiver Aprovada. Essa mudanca de status dispara um e-mail de notificacao (secao 2.8).</w:t>
       </w:r>
     </w:p>
     <w:p>
@@ -6900,7 +7182,7 @@
           <w:sz w:val="27"/>
         </w:rPr>
       </w:pPr>
-      <w:bookmarkStart w:id="15" w:name="_Toc236512827"/>
+      <w:bookmarkStart w:id="16" w:name="_Toc236515586"/>
       <w:r>
         <w:rPr>
           <w:rFonts w:ascii="Montserrat" w:hAnsi="Montserrat"/>
@@ -6908,9 +7190,10 @@
           <w:color w:val="B91D2E"/>
           <w:sz w:val="27"/>
         </w:rPr>
+        <w:lastRenderedPageBreak/>
         <w:t>Passo 2 - Canvas de Projeto (FORALF00344)</w:t>
       </w:r>
-      <w:bookmarkEnd w:id="15"/>
+      <w:bookmarkEnd w:id="16"/>
     </w:p>
     <w:p>
       <w:pPr>
@@ -6927,16 +7210,7 @@
           <w:color w:val="1A1A1A"/>
           <w:sz w:val="22"/>
         </w:rPr>
-        <w:t xml:space="preserve">Quando usar: assim que a demanda for aprovada. O Canvas e o primeiro documento estruturado do projeto - reune, em uma unica tela, a motivacao, o </w:t>
-      </w:r>
-      <w:r>
-        <w:rPr>
-          <w:rFonts w:ascii="Montserrat" w:hAnsi="Montserrat"/>
-          <w:color w:val="1A1A1A"/>
-          <w:sz w:val="22"/>
-        </w:rPr>
-        <w:lastRenderedPageBreak/>
-        <w:t>produto, os parceiros, as entregas, os riscos e os custos. Exige selecionar um Projeto vinculado ja Aprovado no Gate 1, e so membros da equipe daquele projeto (ou Admin) podem registrar (secao 2.5).</w:t>
+        <w:t>Quando usar: assim que a demanda for aprovada. O Canvas e o primeiro documento estruturado do projeto - reune, em uma unica tela, a motivacao, o produto, os parceiros, as entregas, os riscos e os custos. Exige selecionar um Projeto vinculado ja Aprovado no Gate 1, e so membros da equipe daquele projeto (ou Admin) podem registrar (secao 2.5).</w:t>
       </w:r>
     </w:p>
     <w:tbl>
@@ -7769,16 +8043,16 @@
         </w:rPr>
         <w:lastRenderedPageBreak/>
         <w:drawing>
-          <wp:inline distT="0" distB="0" distL="0" distR="0" wp14:anchorId="1A73D948" wp14:editId="0E491637">
+          <wp:inline distT="0" distB="0" distL="0" distR="0" wp14:anchorId="3020F122" wp14:editId="50F0627F">
             <wp:extent cx="5120640" cy="4627581"/>
             <wp:effectExtent l="19050" t="19050" r="22860" b="20955"/>
-            <wp:docPr id="1342412055" name="Imagem 9"/>
+            <wp:docPr id="1889833876" name="Imagem 9"/>
             <wp:cNvGraphicFramePr/>
             <a:graphic xmlns:a="http://schemas.openxmlformats.org/drawingml/2006/main">
               <a:graphicData uri="http://schemas.openxmlformats.org/drawingml/2006/picture">
                 <pic:pic xmlns:pic="http://schemas.openxmlformats.org/drawingml/2006/picture">
                   <pic:nvPicPr>
-                    <pic:cNvPr id="1342412055" name=""/>
+                    <pic:cNvPr id="1889833876" name=""/>
                     <pic:cNvPicPr/>
                   </pic:nvPicPr>
                   <pic:blipFill>
@@ -7846,16 +8120,16 @@
         </w:rPr>
         <w:lastRenderedPageBreak/>
         <w:drawing>
-          <wp:inline distT="0" distB="0" distL="0" distR="0" wp14:anchorId="3AF38502" wp14:editId="7E058D1D">
+          <wp:inline distT="0" distB="0" distL="0" distR="0" wp14:anchorId="696BF258" wp14:editId="4A51577D">
             <wp:extent cx="5120640" cy="4627581"/>
             <wp:effectExtent l="19050" t="19050" r="22860" b="20955"/>
-            <wp:docPr id="659664012" name="Imagem 10"/>
+            <wp:docPr id="546788025" name="Imagem 10"/>
             <wp:cNvGraphicFramePr/>
             <a:graphic xmlns:a="http://schemas.openxmlformats.org/drawingml/2006/main">
               <a:graphicData uri="http://schemas.openxmlformats.org/drawingml/2006/picture">
                 <pic:pic xmlns:pic="http://schemas.openxmlformats.org/drawingml/2006/picture">
                   <pic:nvPicPr>
-                    <pic:cNvPr id="659664012" name=""/>
+                    <pic:cNvPr id="546788025" name=""/>
                     <pic:cNvPicPr/>
                   </pic:nvPicPr>
                   <pic:blipFill>
@@ -7927,7 +8201,7 @@
           <w:color w:val="1A1A1A"/>
           <w:sz w:val="22"/>
         </w:rPr>
-        <w:t>Como salvar: clique em Registrar canvas. O status inicial e Pendente de aprovacao; altere para Aprovado ao validar o Canvas com o Dono do Negocio e o Gerente de Projetos.</w:t>
+        <w:t>Como salvar: clique em Registrar canvas. O status inicial e Pendente de aprovacao; altere para Aprovado ao validar o Canvas com o Dono do Negocio e o Gerente de Projetos. Ao marcar Aprovado, um e-mail de notificacao e disparado automaticamente (secao 2.8).</w:t>
       </w:r>
     </w:p>
     <w:p>
@@ -7941,7 +8215,7 @@
           <w:sz w:val="27"/>
         </w:rPr>
       </w:pPr>
-      <w:bookmarkStart w:id="16" w:name="_Toc236512828"/>
+      <w:bookmarkStart w:id="17" w:name="_Toc236515587"/>
       <w:r>
         <w:rPr>
           <w:rFonts w:ascii="Montserrat" w:hAnsi="Montserrat"/>
@@ -7951,7 +8225,7 @@
         </w:rPr>
         <w:t>Passo 3 - TAP, Termo de Abertura de Projeto (FORALF00338)</w:t>
       </w:r>
-      <w:bookmarkEnd w:id="16"/>
+      <w:bookmarkEnd w:id="17"/>
     </w:p>
     <w:p>
       <w:pPr>
@@ -8909,16 +9183,16 @@
         </w:rPr>
         <w:lastRenderedPageBreak/>
         <w:drawing>
-          <wp:inline distT="0" distB="0" distL="0" distR="0" wp14:anchorId="7F0211D8" wp14:editId="65376379">
+          <wp:inline distT="0" distB="0" distL="0" distR="0" wp14:anchorId="0445EACF" wp14:editId="24B2E7B1">
             <wp:extent cx="5120640" cy="3282818"/>
             <wp:effectExtent l="19050" t="19050" r="22860" b="13335"/>
-            <wp:docPr id="74114546" name="Imagem 11"/>
+            <wp:docPr id="694589432" name="Imagem 11"/>
             <wp:cNvGraphicFramePr/>
             <a:graphic xmlns:a="http://schemas.openxmlformats.org/drawingml/2006/main">
               <a:graphicData uri="http://schemas.openxmlformats.org/drawingml/2006/picture">
                 <pic:pic xmlns:pic="http://schemas.openxmlformats.org/drawingml/2006/picture">
                   <pic:nvPicPr>
-                    <pic:cNvPr id="74114546" name=""/>
+                    <pic:cNvPr id="694589432" name=""/>
                     <pic:cNvPicPr/>
                   </pic:nvPicPr>
                   <pic:blipFill>
@@ -8986,16 +9260,16 @@
         </w:rPr>
         <w:lastRenderedPageBreak/>
         <w:drawing>
-          <wp:inline distT="0" distB="0" distL="0" distR="0" wp14:anchorId="57EDAA2C" wp14:editId="08A0C18A">
+          <wp:inline distT="0" distB="0" distL="0" distR="0" wp14:anchorId="271F3BCC" wp14:editId="0280A067">
             <wp:extent cx="5120640" cy="4627581"/>
             <wp:effectExtent l="19050" t="19050" r="22860" b="20955"/>
-            <wp:docPr id="1651350280" name="Imagem 12"/>
+            <wp:docPr id="1902203333" name="Imagem 12"/>
             <wp:cNvGraphicFramePr/>
             <a:graphic xmlns:a="http://schemas.openxmlformats.org/drawingml/2006/main">
               <a:graphicData uri="http://schemas.openxmlformats.org/drawingml/2006/picture">
                 <pic:pic xmlns:pic="http://schemas.openxmlformats.org/drawingml/2006/picture">
                   <pic:nvPicPr>
-                    <pic:cNvPr id="1651350280" name=""/>
+                    <pic:cNvPr id="1902203333" name=""/>
                     <pic:cNvPicPr/>
                   </pic:nvPicPr>
                   <pic:blipFill>
@@ -9067,7 +9341,7 @@
           <w:color w:val="1A1A1A"/>
           <w:sz w:val="22"/>
         </w:rPr>
-        <w:t>Como salvar: clique em Registrar TAP. Um projeto sem TAP aprovado nao deve avancar para a execucao.</w:t>
+        <w:t>Como salvar: clique em Registrar TAP. Um projeto sem TAP aprovado nao deve avancar para a execucao. Ao marcar Aprovado, um e-mail de notificacao e disparado automaticamente (secao 2.8).</w:t>
       </w:r>
     </w:p>
     <w:p>
@@ -9081,7 +9355,7 @@
           <w:sz w:val="27"/>
         </w:rPr>
       </w:pPr>
-      <w:bookmarkStart w:id="17" w:name="_Toc236512829"/>
+      <w:bookmarkStart w:id="18" w:name="_Toc236515588"/>
       <w:r>
         <w:rPr>
           <w:rFonts w:ascii="Montserrat" w:hAnsi="Montserrat"/>
@@ -9091,7 +9365,7 @@
         </w:rPr>
         <w:t>Passo 4 - Planejamento e Desenvolvimento de Projeto (FORALF00325)</w:t>
       </w:r>
-      <w:bookmarkEnd w:id="17"/>
+      <w:bookmarkEnd w:id="18"/>
     </w:p>
     <w:p>
       <w:pPr>
@@ -9255,6 +9529,7 @@
                 <w:color w:val="1A1A1A"/>
                 <w:sz w:val="19"/>
               </w:rPr>
+              <w:lastRenderedPageBreak/>
               <w:t>2. Viabilidade</w:t>
             </w:r>
           </w:p>
@@ -9303,7 +9578,6 @@
                 <w:color w:val="1A1A1A"/>
                 <w:sz w:val="19"/>
               </w:rPr>
-              <w:lastRenderedPageBreak/>
               <w:t>3. Cronograma</w:t>
             </w:r>
           </w:p>
@@ -9588,16 +9862,16 @@
           <w:noProof/>
         </w:rPr>
         <w:drawing>
-          <wp:inline distT="0" distB="0" distL="0" distR="0" wp14:anchorId="7AC14E4F" wp14:editId="20C0781C">
+          <wp:inline distT="0" distB="0" distL="0" distR="0" wp14:anchorId="70DF9B0D" wp14:editId="1F592E81">
             <wp:extent cx="5120640" cy="4627581"/>
             <wp:effectExtent l="19050" t="19050" r="22860" b="20955"/>
-            <wp:docPr id="985223439" name="Imagem 13"/>
+            <wp:docPr id="1179680120" name="Imagem 13"/>
             <wp:cNvGraphicFramePr/>
             <a:graphic xmlns:a="http://schemas.openxmlformats.org/drawingml/2006/main">
               <a:graphicData uri="http://schemas.openxmlformats.org/drawingml/2006/picture">
                 <pic:pic xmlns:pic="http://schemas.openxmlformats.org/drawingml/2006/picture">
                   <pic:nvPicPr>
-                    <pic:cNvPr id="985223439" name=""/>
+                    <pic:cNvPr id="1179680120" name=""/>
                     <pic:cNvPicPr/>
                   </pic:nvPicPr>
                   <pic:blipFill>
@@ -9665,16 +9939,16 @@
         </w:rPr>
         <w:lastRenderedPageBreak/>
         <w:drawing>
-          <wp:inline distT="0" distB="0" distL="0" distR="0" wp14:anchorId="782F6213" wp14:editId="7B380789">
+          <wp:inline distT="0" distB="0" distL="0" distR="0" wp14:anchorId="446AC7DB" wp14:editId="4F4BA6D1">
             <wp:extent cx="5120640" cy="4627581"/>
             <wp:effectExtent l="19050" t="19050" r="22860" b="20955"/>
-            <wp:docPr id="625339925" name="Imagem 14"/>
+            <wp:docPr id="1093303392" name="Imagem 14"/>
             <wp:cNvGraphicFramePr/>
             <a:graphic xmlns:a="http://schemas.openxmlformats.org/drawingml/2006/main">
               <a:graphicData uri="http://schemas.openxmlformats.org/drawingml/2006/picture">
                 <pic:pic xmlns:pic="http://schemas.openxmlformats.org/drawingml/2006/picture">
                   <pic:nvPicPr>
-                    <pic:cNvPr id="625339925" name=""/>
+                    <pic:cNvPr id="1093303392" name=""/>
                     <pic:cNvPicPr/>
                   </pic:nvPicPr>
                   <pic:blipFill>
@@ -9760,7 +10034,7 @@
           <w:sz w:val="27"/>
         </w:rPr>
       </w:pPr>
-      <w:bookmarkStart w:id="18" w:name="_Toc236512830"/>
+      <w:bookmarkStart w:id="19" w:name="_Toc236515589"/>
       <w:r>
         <w:rPr>
           <w:rFonts w:ascii="Montserrat" w:hAnsi="Montserrat"/>
@@ -9770,7 +10044,7 @@
         </w:rPr>
         <w:t>Passo 5 - EAP, Estrutura Analitica do Projeto</w:t>
       </w:r>
-      <w:bookmarkEnd w:id="18"/>
+      <w:bookmarkEnd w:id="19"/>
     </w:p>
     <w:p>
       <w:pPr>
@@ -9801,16 +10075,16 @@
         </w:rPr>
         <w:lastRenderedPageBreak/>
         <w:drawing>
-          <wp:inline distT="0" distB="0" distL="0" distR="0" wp14:anchorId="45D8E7C4" wp14:editId="66D9D9AC">
+          <wp:inline distT="0" distB="0" distL="0" distR="0" wp14:anchorId="165452A7" wp14:editId="0DBF7904">
             <wp:extent cx="5120640" cy="4627581"/>
             <wp:effectExtent l="19050" t="19050" r="22860" b="20955"/>
-            <wp:docPr id="1237516450" name="Imagem 15"/>
+            <wp:docPr id="83021562" name="Imagem 15"/>
             <wp:cNvGraphicFramePr/>
             <a:graphic xmlns:a="http://schemas.openxmlformats.org/drawingml/2006/main">
               <a:graphicData uri="http://schemas.openxmlformats.org/drawingml/2006/picture">
                 <pic:pic xmlns:pic="http://schemas.openxmlformats.org/drawingml/2006/picture">
                   <pic:nvPicPr>
-                    <pic:cNvPr id="1237516450" name=""/>
+                    <pic:cNvPr id="83021562" name=""/>
                     <pic:cNvPicPr/>
                   </pic:nvPicPr>
                   <pic:blipFill>
@@ -9878,16 +10152,16 @@
         </w:rPr>
         <w:lastRenderedPageBreak/>
         <w:drawing>
-          <wp:inline distT="0" distB="0" distL="0" distR="0" wp14:anchorId="6C7D7B74" wp14:editId="27CD380C">
+          <wp:inline distT="0" distB="0" distL="0" distR="0" wp14:anchorId="126FAF5F" wp14:editId="50C6C643">
             <wp:extent cx="5120640" cy="4627581"/>
             <wp:effectExtent l="19050" t="19050" r="22860" b="20955"/>
-            <wp:docPr id="1225807528" name="Imagem 16"/>
+            <wp:docPr id="1774559944" name="Imagem 16"/>
             <wp:cNvGraphicFramePr/>
             <a:graphic xmlns:a="http://schemas.openxmlformats.org/drawingml/2006/main">
               <a:graphicData uri="http://schemas.openxmlformats.org/drawingml/2006/picture">
                 <pic:pic xmlns:pic="http://schemas.openxmlformats.org/drawingml/2006/picture">
                   <pic:nvPicPr>
-                    <pic:cNvPr id="1225807528" name=""/>
+                    <pic:cNvPr id="1774559944" name=""/>
                     <pic:cNvPicPr/>
                   </pic:nvPicPr>
                   <pic:blipFill>
@@ -9949,7 +10223,7 @@
         <w:pStyle w:val="PargrafodaLista"/>
         <w:numPr>
           <w:ilvl w:val="0"/>
-          <w:numId w:val="8"/>
+          <w:numId w:val="9"/>
         </w:numPr>
         <w:spacing w:after="80" w:line="260" w:lineRule="auto"/>
         <w:ind w:left="700"/>
@@ -9973,7 +10247,7 @@
         <w:pStyle w:val="PargrafodaLista"/>
         <w:numPr>
           <w:ilvl w:val="0"/>
-          <w:numId w:val="8"/>
+          <w:numId w:val="9"/>
         </w:numPr>
         <w:spacing w:after="80" w:line="260" w:lineRule="auto"/>
         <w:ind w:left="700"/>
@@ -9997,7 +10271,7 @@
         <w:pStyle w:val="PargrafodaLista"/>
         <w:numPr>
           <w:ilvl w:val="0"/>
-          <w:numId w:val="8"/>
+          <w:numId w:val="9"/>
         </w:numPr>
         <w:spacing w:after="80" w:line="260" w:lineRule="auto"/>
         <w:ind w:left="700"/>
@@ -10021,7 +10295,7 @@
         <w:pStyle w:val="PargrafodaLista"/>
         <w:numPr>
           <w:ilvl w:val="0"/>
-          <w:numId w:val="8"/>
+          <w:numId w:val="9"/>
         </w:numPr>
         <w:spacing w:after="80" w:line="260" w:lineRule="auto"/>
         <w:ind w:left="700"/>
@@ -10051,16 +10325,16 @@
         </w:rPr>
         <w:lastRenderedPageBreak/>
         <w:drawing>
-          <wp:inline distT="0" distB="0" distL="0" distR="0" wp14:anchorId="3A6CAD16" wp14:editId="7AFF5790">
+          <wp:inline distT="0" distB="0" distL="0" distR="0" wp14:anchorId="7168A7EE" wp14:editId="571CB73F">
             <wp:extent cx="5120640" cy="3282818"/>
             <wp:effectExtent l="19050" t="19050" r="22860" b="13335"/>
-            <wp:docPr id="1619345943" name="Imagem 17"/>
+            <wp:docPr id="464815589" name="Imagem 17"/>
             <wp:cNvGraphicFramePr/>
             <a:graphic xmlns:a="http://schemas.openxmlformats.org/drawingml/2006/main">
               <a:graphicData uri="http://schemas.openxmlformats.org/drawingml/2006/picture">
                 <pic:pic xmlns:pic="http://schemas.openxmlformats.org/drawingml/2006/picture">
                   <pic:nvPicPr>
-                    <pic:cNvPr id="1619345943" name=""/>
+                    <pic:cNvPr id="464815589" name=""/>
                     <pic:cNvPicPr/>
                   </pic:nvPicPr>
                   <pic:blipFill>
@@ -10146,7 +10420,7 @@
           <w:sz w:val="27"/>
         </w:rPr>
       </w:pPr>
-      <w:bookmarkStart w:id="19" w:name="_Toc236512831"/>
+      <w:bookmarkStart w:id="20" w:name="_Toc236515590"/>
       <w:r>
         <w:rPr>
           <w:rFonts w:ascii="Montserrat" w:hAnsi="Montserrat"/>
@@ -10156,7 +10430,7 @@
         </w:rPr>
         <w:t>Passo 6 - Ata de Reuniao (FORALF00340) - uso recorrente</w:t>
       </w:r>
-      <w:bookmarkEnd w:id="19"/>
+      <w:bookmarkEnd w:id="20"/>
     </w:p>
     <w:p>
       <w:pPr>
@@ -10187,16 +10461,16 @@
         </w:rPr>
         <w:lastRenderedPageBreak/>
         <w:drawing>
-          <wp:inline distT="0" distB="0" distL="0" distR="0" wp14:anchorId="38B70556" wp14:editId="2F21544C">
+          <wp:inline distT="0" distB="0" distL="0" distR="0" wp14:anchorId="7A57607E" wp14:editId="6DA603AE">
             <wp:extent cx="5120640" cy="4627581"/>
             <wp:effectExtent l="19050" t="19050" r="22860" b="20955"/>
-            <wp:docPr id="612909206" name="Imagem 18"/>
+            <wp:docPr id="1879980549" name="Imagem 18"/>
             <wp:cNvGraphicFramePr/>
             <a:graphic xmlns:a="http://schemas.openxmlformats.org/drawingml/2006/main">
               <a:graphicData uri="http://schemas.openxmlformats.org/drawingml/2006/picture">
                 <pic:pic xmlns:pic="http://schemas.openxmlformats.org/drawingml/2006/picture">
                   <pic:nvPicPr>
-                    <pic:cNvPr id="612909206" name=""/>
+                    <pic:cNvPr id="1879980549" name=""/>
                     <pic:cNvPicPr/>
                   </pic:nvPicPr>
                   <pic:blipFill>
@@ -10264,16 +10538,16 @@
         </w:rPr>
         <w:lastRenderedPageBreak/>
         <w:drawing>
-          <wp:inline distT="0" distB="0" distL="0" distR="0" wp14:anchorId="71F57173" wp14:editId="49608813">
+          <wp:inline distT="0" distB="0" distL="0" distR="0" wp14:anchorId="08C89754" wp14:editId="0529D707">
             <wp:extent cx="5120640" cy="4627581"/>
             <wp:effectExtent l="19050" t="19050" r="22860" b="20955"/>
-            <wp:docPr id="593680714" name="Imagem 19"/>
+            <wp:docPr id="836083508" name="Imagem 19"/>
             <wp:cNvGraphicFramePr/>
             <a:graphic xmlns:a="http://schemas.openxmlformats.org/drawingml/2006/main">
               <a:graphicData uri="http://schemas.openxmlformats.org/drawingml/2006/picture">
                 <pic:pic xmlns:pic="http://schemas.openxmlformats.org/drawingml/2006/picture">
                   <pic:nvPicPr>
-                    <pic:cNvPr id="593680714" name=""/>
+                    <pic:cNvPr id="836083508" name=""/>
                     <pic:cNvPicPr/>
                   </pic:nvPicPr>
                   <pic:blipFill>
@@ -10335,7 +10609,7 @@
         <w:pStyle w:val="PargrafodaLista"/>
         <w:numPr>
           <w:ilvl w:val="0"/>
-          <w:numId w:val="9"/>
+          <w:numId w:val="10"/>
         </w:numPr>
         <w:spacing w:after="80" w:line="260" w:lineRule="auto"/>
         <w:ind w:left="700"/>
@@ -10359,7 +10633,7 @@
         <w:pStyle w:val="PargrafodaLista"/>
         <w:numPr>
           <w:ilvl w:val="0"/>
-          <w:numId w:val="9"/>
+          <w:numId w:val="10"/>
         </w:numPr>
         <w:spacing w:after="80" w:line="260" w:lineRule="auto"/>
         <w:ind w:left="700"/>
@@ -10407,7 +10681,7 @@
           <w:sz w:val="27"/>
         </w:rPr>
       </w:pPr>
-      <w:bookmarkStart w:id="20" w:name="_Toc236512832"/>
+      <w:bookmarkStart w:id="21" w:name="_Toc236515591"/>
       <w:r>
         <w:rPr>
           <w:rFonts w:ascii="Montserrat" w:hAnsi="Montserrat"/>
@@ -10417,7 +10691,7 @@
         </w:rPr>
         <w:t>Passo 7 - SMP, Solicitacao de Mudanca de Projeto (FORALF00343) - uso condicional</w:t>
       </w:r>
-      <w:bookmarkEnd w:id="20"/>
+      <w:bookmarkEnd w:id="21"/>
     </w:p>
     <w:p>
       <w:pPr>
@@ -10448,16 +10722,16 @@
         </w:rPr>
         <w:lastRenderedPageBreak/>
         <w:drawing>
-          <wp:inline distT="0" distB="0" distL="0" distR="0" wp14:anchorId="42A53382" wp14:editId="6B824780">
+          <wp:inline distT="0" distB="0" distL="0" distR="0" wp14:anchorId="76BC3CFA" wp14:editId="0B85A9B7">
             <wp:extent cx="5120640" cy="4627581"/>
             <wp:effectExtent l="19050" t="19050" r="22860" b="20955"/>
-            <wp:docPr id="1525050554" name="Imagem 20"/>
+            <wp:docPr id="1128554941" name="Imagem 20"/>
             <wp:cNvGraphicFramePr/>
             <a:graphic xmlns:a="http://schemas.openxmlformats.org/drawingml/2006/main">
               <a:graphicData uri="http://schemas.openxmlformats.org/drawingml/2006/picture">
                 <pic:pic xmlns:pic="http://schemas.openxmlformats.org/drawingml/2006/picture">
                   <pic:nvPicPr>
-                    <pic:cNvPr id="1525050554" name=""/>
+                    <pic:cNvPr id="1128554941" name=""/>
                     <pic:cNvPicPr/>
                   </pic:nvPicPr>
                   <pic:blipFill>
@@ -10525,16 +10799,16 @@
         </w:rPr>
         <w:lastRenderedPageBreak/>
         <w:drawing>
-          <wp:inline distT="0" distB="0" distL="0" distR="0" wp14:anchorId="02123FA8" wp14:editId="006C757E">
+          <wp:inline distT="0" distB="0" distL="0" distR="0" wp14:anchorId="484F54AD" wp14:editId="121B329D">
             <wp:extent cx="5120640" cy="4627581"/>
             <wp:effectExtent l="19050" t="19050" r="22860" b="20955"/>
-            <wp:docPr id="844476249" name="Imagem 21"/>
+            <wp:docPr id="218946682" name="Imagem 21"/>
             <wp:cNvGraphicFramePr/>
             <a:graphic xmlns:a="http://schemas.openxmlformats.org/drawingml/2006/main">
               <a:graphicData uri="http://schemas.openxmlformats.org/drawingml/2006/picture">
                 <pic:pic xmlns:pic="http://schemas.openxmlformats.org/drawingml/2006/picture">
                   <pic:nvPicPr>
-                    <pic:cNvPr id="844476249" name=""/>
+                    <pic:cNvPr id="218946682" name=""/>
                     <pic:cNvPicPr/>
                   </pic:nvPicPr>
                   <pic:blipFill>
@@ -10596,7 +10870,7 @@
         <w:pStyle w:val="PargrafodaLista"/>
         <w:numPr>
           <w:ilvl w:val="0"/>
-          <w:numId w:val="10"/>
+          <w:numId w:val="11"/>
         </w:numPr>
         <w:spacing w:after="80" w:line="260" w:lineRule="auto"/>
         <w:ind w:left="700"/>
@@ -10620,7 +10894,7 @@
         <w:pStyle w:val="PargrafodaLista"/>
         <w:numPr>
           <w:ilvl w:val="0"/>
-          <w:numId w:val="10"/>
+          <w:numId w:val="11"/>
         </w:numPr>
         <w:spacing w:after="80" w:line="260" w:lineRule="auto"/>
         <w:ind w:left="700"/>
@@ -10644,7 +10918,7 @@
         <w:pStyle w:val="PargrafodaLista"/>
         <w:numPr>
           <w:ilvl w:val="0"/>
-          <w:numId w:val="10"/>
+          <w:numId w:val="11"/>
         </w:numPr>
         <w:spacing w:after="80" w:line="260" w:lineRule="auto"/>
         <w:ind w:left="700"/>
@@ -10709,7 +10983,7 @@
           <w:sz w:val="21"/>
         </w:rPr>
         <w:lastRenderedPageBreak/>
-        <w:t>Canvas, TAP, Planejamento, EAP, TEP ou RLA daquele projeto, sem precisar abrir a SMP. Essa propagacao apenas registra o evento no historico - ela nao altera o Status do projeto usado no Gate 1 (Aprovado/Reprovado).</w:t>
+        <w:t>Canvas, TAP, Planejamento, EAP, TEP ou RLA daquele projeto, sem precisar abrir a SMP. Essa propagacao apenas registra o evento no historico - ela nao altera o Status do projeto usado no Gate 1 (Aprovado/Reprovado). A mesma decisao (Aprovada ou Nao aprovada) tambem dispara um e-mail de notificacao (secao 2.8).</w:t>
       </w:r>
     </w:p>
     <w:p>
@@ -10723,7 +10997,7 @@
           <w:sz w:val="27"/>
         </w:rPr>
       </w:pPr>
-      <w:bookmarkStart w:id="21" w:name="_Toc236512833"/>
+      <w:bookmarkStart w:id="22" w:name="_Toc236515592"/>
       <w:r>
         <w:rPr>
           <w:rFonts w:ascii="Montserrat" w:hAnsi="Montserrat"/>
@@ -10733,7 +11007,7 @@
         </w:rPr>
         <w:t>Passo 8 - TEP, Termo de Encerramento de Projeto (FORALF00341)</w:t>
       </w:r>
-      <w:bookmarkEnd w:id="21"/>
+      <w:bookmarkEnd w:id="22"/>
     </w:p>
     <w:p>
       <w:pPr>
@@ -10763,16 +11037,16 @@
           <w:noProof/>
         </w:rPr>
         <w:drawing>
-          <wp:inline distT="0" distB="0" distL="0" distR="0" wp14:anchorId="5332DCE1" wp14:editId="25F3A1B4">
+          <wp:inline distT="0" distB="0" distL="0" distR="0" wp14:anchorId="1B7305CD" wp14:editId="788A17A5">
             <wp:extent cx="5120640" cy="4627581"/>
             <wp:effectExtent l="19050" t="19050" r="22860" b="20955"/>
-            <wp:docPr id="25091806" name="Imagem 22"/>
+            <wp:docPr id="1270079188" name="Imagem 22"/>
             <wp:cNvGraphicFramePr/>
             <a:graphic xmlns:a="http://schemas.openxmlformats.org/drawingml/2006/main">
               <a:graphicData uri="http://schemas.openxmlformats.org/drawingml/2006/picture">
                 <pic:pic xmlns:pic="http://schemas.openxmlformats.org/drawingml/2006/picture">
                   <pic:nvPicPr>
-                    <pic:cNvPr id="25091806" name=""/>
+                    <pic:cNvPr id="1270079188" name=""/>
                     <pic:cNvPicPr/>
                   </pic:nvPicPr>
                   <pic:blipFill>
@@ -10840,16 +11114,16 @@
         </w:rPr>
         <w:lastRenderedPageBreak/>
         <w:drawing>
-          <wp:inline distT="0" distB="0" distL="0" distR="0" wp14:anchorId="2F75ACC6" wp14:editId="26D4999F">
+          <wp:inline distT="0" distB="0" distL="0" distR="0" wp14:anchorId="5CF5A0E5" wp14:editId="6DFABDAC">
             <wp:extent cx="5120640" cy="4627581"/>
             <wp:effectExtent l="19050" t="19050" r="22860" b="20955"/>
-            <wp:docPr id="1381072656" name="Imagem 23"/>
+            <wp:docPr id="1472191689" name="Imagem 23"/>
             <wp:cNvGraphicFramePr/>
             <a:graphic xmlns:a="http://schemas.openxmlformats.org/drawingml/2006/main">
               <a:graphicData uri="http://schemas.openxmlformats.org/drawingml/2006/picture">
                 <pic:pic xmlns:pic="http://schemas.openxmlformats.org/drawingml/2006/picture">
                   <pic:nvPicPr>
-                    <pic:cNvPr id="1381072656" name=""/>
+                    <pic:cNvPr id="1472191689" name=""/>
                     <pic:cNvPicPr/>
                   </pic:nvPicPr>
                   <pic:blipFill>
@@ -10911,7 +11185,7 @@
         <w:pStyle w:val="PargrafodaLista"/>
         <w:numPr>
           <w:ilvl w:val="0"/>
-          <w:numId w:val="11"/>
+          <w:numId w:val="12"/>
         </w:numPr>
         <w:spacing w:after="80" w:line="260" w:lineRule="auto"/>
         <w:ind w:left="700"/>
@@ -10935,7 +11209,7 @@
         <w:pStyle w:val="PargrafodaLista"/>
         <w:numPr>
           <w:ilvl w:val="0"/>
-          <w:numId w:val="11"/>
+          <w:numId w:val="12"/>
         </w:numPr>
         <w:spacing w:after="80" w:line="260" w:lineRule="auto"/>
         <w:ind w:left="700"/>
@@ -10959,7 +11233,7 @@
         <w:pStyle w:val="PargrafodaLista"/>
         <w:numPr>
           <w:ilvl w:val="0"/>
-          <w:numId w:val="11"/>
+          <w:numId w:val="12"/>
         </w:numPr>
         <w:spacing w:after="80" w:line="260" w:lineRule="auto"/>
         <w:ind w:left="700"/>
@@ -10993,7 +11267,7 @@
           <w:color w:val="1A1A1A"/>
           <w:sz w:val="22"/>
         </w:rPr>
-        <w:t>Clique em Registrar TEP para gerar o protocolo.</w:t>
+        <w:t>Clique em Registrar TEP para gerar o protocolo. O registro de um novo TEP dispara um e-mail de notificacao (secao 2.8).</w:t>
       </w:r>
     </w:p>
     <w:p>
@@ -11007,7 +11281,7 @@
           <w:sz w:val="27"/>
         </w:rPr>
       </w:pPr>
-      <w:bookmarkStart w:id="22" w:name="_Toc236512834"/>
+      <w:bookmarkStart w:id="23" w:name="_Toc236515593"/>
       <w:r>
         <w:rPr>
           <w:rFonts w:ascii="Montserrat" w:hAnsi="Montserrat"/>
@@ -11017,7 +11291,7 @@
         </w:rPr>
         <w:t>Passo 9 - RLA, Registro de Licoes Aprendidas (FORALF00342)</w:t>
       </w:r>
-      <w:bookmarkEnd w:id="22"/>
+      <w:bookmarkEnd w:id="23"/>
     </w:p>
     <w:p>
       <w:pPr>
@@ -11048,16 +11322,16 @@
         </w:rPr>
         <w:lastRenderedPageBreak/>
         <w:drawing>
-          <wp:inline distT="0" distB="0" distL="0" distR="0" wp14:anchorId="234D311A" wp14:editId="6515FD76">
+          <wp:inline distT="0" distB="0" distL="0" distR="0" wp14:anchorId="0D0369C9" wp14:editId="48930ED1">
             <wp:extent cx="5120640" cy="4627581"/>
             <wp:effectExtent l="19050" t="19050" r="22860" b="20955"/>
-            <wp:docPr id="1533476161" name="Imagem 24"/>
+            <wp:docPr id="1869030861" name="Imagem 24"/>
             <wp:cNvGraphicFramePr/>
             <a:graphic xmlns:a="http://schemas.openxmlformats.org/drawingml/2006/main">
               <a:graphicData uri="http://schemas.openxmlformats.org/drawingml/2006/picture">
                 <pic:pic xmlns:pic="http://schemas.openxmlformats.org/drawingml/2006/picture">
                   <pic:nvPicPr>
-                    <pic:cNvPr id="1533476161" name=""/>
+                    <pic:cNvPr id="1869030861" name=""/>
                     <pic:cNvPicPr/>
                   </pic:nvPicPr>
                   <pic:blipFill>
@@ -11125,16 +11399,16 @@
         </w:rPr>
         <w:lastRenderedPageBreak/>
         <w:drawing>
-          <wp:inline distT="0" distB="0" distL="0" distR="0" wp14:anchorId="10DAEF6D" wp14:editId="1C790056">
+          <wp:inline distT="0" distB="0" distL="0" distR="0" wp14:anchorId="42ECF375" wp14:editId="52E6762F">
             <wp:extent cx="5120640" cy="4627581"/>
             <wp:effectExtent l="19050" t="19050" r="22860" b="20955"/>
-            <wp:docPr id="1521653188" name="Imagem 25"/>
+            <wp:docPr id="70241329" name="Imagem 25"/>
             <wp:cNvGraphicFramePr/>
             <a:graphic xmlns:a="http://schemas.openxmlformats.org/drawingml/2006/main">
               <a:graphicData uri="http://schemas.openxmlformats.org/drawingml/2006/picture">
                 <pic:pic xmlns:pic="http://schemas.openxmlformats.org/drawingml/2006/picture">
                   <pic:nvPicPr>
-                    <pic:cNvPr id="1521653188" name=""/>
+                    <pic:cNvPr id="70241329" name=""/>
                     <pic:cNvPicPr/>
                   </pic:nvPicPr>
                   <pic:blipFill>
@@ -11196,7 +11470,7 @@
         <w:pStyle w:val="PargrafodaLista"/>
         <w:numPr>
           <w:ilvl w:val="0"/>
-          <w:numId w:val="12"/>
+          <w:numId w:val="13"/>
         </w:numPr>
         <w:spacing w:after="80" w:line="260" w:lineRule="auto"/>
         <w:ind w:left="700"/>
@@ -11220,7 +11494,7 @@
         <w:pStyle w:val="PargrafodaLista"/>
         <w:numPr>
           <w:ilvl w:val="0"/>
-          <w:numId w:val="12"/>
+          <w:numId w:val="13"/>
         </w:numPr>
         <w:spacing w:after="80" w:line="260" w:lineRule="auto"/>
         <w:ind w:left="700"/>
@@ -11268,7 +11542,7 @@
           <w:sz w:val="27"/>
         </w:rPr>
       </w:pPr>
-      <w:bookmarkStart w:id="23" w:name="_Toc236512835"/>
+      <w:bookmarkStart w:id="24" w:name="_Toc236515594"/>
       <w:r>
         <w:rPr>
           <w:rFonts w:ascii="Montserrat" w:hAnsi="Montserrat"/>
@@ -11278,7 +11552,7 @@
         </w:rPr>
         <w:t>Passo 10 - Plano de Comunicacao de Projeto (FORALF00308)</w:t>
       </w:r>
-      <w:bookmarkEnd w:id="23"/>
+      <w:bookmarkEnd w:id="24"/>
     </w:p>
     <w:p>
       <w:pPr>
@@ -11309,16 +11583,16 @@
         </w:rPr>
         <w:lastRenderedPageBreak/>
         <w:drawing>
-          <wp:inline distT="0" distB="0" distL="0" distR="0" wp14:anchorId="496CE83D" wp14:editId="56686879">
+          <wp:inline distT="0" distB="0" distL="0" distR="0" wp14:anchorId="69B8C0BE" wp14:editId="2C615875">
             <wp:extent cx="5120640" cy="4627581"/>
             <wp:effectExtent l="19050" t="19050" r="22860" b="20955"/>
-            <wp:docPr id="1593424722" name="Imagem 26"/>
+            <wp:docPr id="1810578065" name="Imagem 26"/>
             <wp:cNvGraphicFramePr/>
             <a:graphic xmlns:a="http://schemas.openxmlformats.org/drawingml/2006/main">
               <a:graphicData uri="http://schemas.openxmlformats.org/drawingml/2006/picture">
                 <pic:pic xmlns:pic="http://schemas.openxmlformats.org/drawingml/2006/picture">
                   <pic:nvPicPr>
-                    <pic:cNvPr id="1593424722" name=""/>
+                    <pic:cNvPr id="1810578065" name=""/>
                     <pic:cNvPicPr/>
                   </pic:nvPicPr>
                   <pic:blipFill>
@@ -11408,7 +11682,7 @@
           <w:sz w:val="34"/>
         </w:rPr>
       </w:pPr>
-      <w:bookmarkStart w:id="24" w:name="_Toc236512836"/>
+      <w:bookmarkStart w:id="25" w:name="_Toc236515595"/>
       <w:r>
         <w:rPr>
           <w:rFonts w:ascii="Montserrat" w:hAnsi="Montserrat"/>
@@ -11419,7 +11693,7 @@
         <w:lastRenderedPageBreak/>
         <w:t>4. Gerando os relatorios finais</w:t>
       </w:r>
-      <w:bookmarkEnd w:id="24"/>
+      <w:bookmarkEnd w:id="25"/>
     </w:p>
     <w:p>
       <w:pPr>
@@ -11450,7 +11724,7 @@
           <w:sz w:val="27"/>
         </w:rPr>
       </w:pPr>
-      <w:bookmarkStart w:id="25" w:name="_Toc236512837"/>
+      <w:bookmarkStart w:id="26" w:name="_Toc236515596"/>
       <w:r>
         <w:rPr>
           <w:rFonts w:ascii="Montserrat" w:hAnsi="Montserrat"/>
@@ -11460,7 +11734,7 @@
         </w:rPr>
         <w:t>4.1 Relatorio de Situacao de Projetos (FORALF11)</w:t>
       </w:r>
-      <w:bookmarkEnd w:id="25"/>
+      <w:bookmarkEnd w:id="26"/>
     </w:p>
     <w:p>
       <w:pPr>
@@ -11490,16 +11764,16 @@
           <w:noProof/>
         </w:rPr>
         <w:drawing>
-          <wp:inline distT="0" distB="0" distL="0" distR="0" wp14:anchorId="6923B590" wp14:editId="15BFB8A9">
+          <wp:inline distT="0" distB="0" distL="0" distR="0" wp14:anchorId="3E04BEF6" wp14:editId="603FD785">
             <wp:extent cx="5120640" cy="4627581"/>
             <wp:effectExtent l="19050" t="19050" r="22860" b="20955"/>
-            <wp:docPr id="951021129" name="Imagem 27"/>
+            <wp:docPr id="692295446" name="Imagem 27"/>
             <wp:cNvGraphicFramePr/>
             <a:graphic xmlns:a="http://schemas.openxmlformats.org/drawingml/2006/main">
               <a:graphicData uri="http://schemas.openxmlformats.org/drawingml/2006/picture">
                 <pic:pic xmlns:pic="http://schemas.openxmlformats.org/drawingml/2006/picture">
                   <pic:nvPicPr>
-                    <pic:cNvPr id="951021129" name=""/>
+                    <pic:cNvPr id="692295446" name=""/>
                     <pic:cNvPicPr/>
                   </pic:nvPicPr>
                   <pic:blipFill>
@@ -11567,16 +11841,16 @@
         </w:rPr>
         <w:lastRenderedPageBreak/>
         <w:drawing>
-          <wp:inline distT="0" distB="0" distL="0" distR="0" wp14:anchorId="5490406B" wp14:editId="393A7A52">
+          <wp:inline distT="0" distB="0" distL="0" distR="0" wp14:anchorId="1E98D25C" wp14:editId="018C778A">
             <wp:extent cx="5120640" cy="4627581"/>
             <wp:effectExtent l="19050" t="19050" r="22860" b="20955"/>
-            <wp:docPr id="508117085" name="Imagem 28"/>
+            <wp:docPr id="49221014" name="Imagem 28"/>
             <wp:cNvGraphicFramePr/>
             <a:graphic xmlns:a="http://schemas.openxmlformats.org/drawingml/2006/main">
               <a:graphicData uri="http://schemas.openxmlformats.org/drawingml/2006/picture">
                 <pic:pic xmlns:pic="http://schemas.openxmlformats.org/drawingml/2006/picture">
                   <pic:nvPicPr>
-                    <pic:cNvPr id="508117085" name=""/>
+                    <pic:cNvPr id="49221014" name=""/>
                     <pic:cNvPicPr/>
                   </pic:nvPicPr>
                   <pic:blipFill>
@@ -11644,16 +11918,16 @@
         </w:rPr>
         <w:lastRenderedPageBreak/>
         <w:drawing>
-          <wp:inline distT="0" distB="0" distL="0" distR="0" wp14:anchorId="1E3A9A9D" wp14:editId="6D9DA61B">
+          <wp:inline distT="0" distB="0" distL="0" distR="0" wp14:anchorId="54C0733C" wp14:editId="7E6CA6FC">
             <wp:extent cx="5120640" cy="4627581"/>
             <wp:effectExtent l="19050" t="19050" r="22860" b="20955"/>
-            <wp:docPr id="1486857146" name="Imagem 29"/>
+            <wp:docPr id="114064821" name="Imagem 29"/>
             <wp:cNvGraphicFramePr/>
             <a:graphic xmlns:a="http://schemas.openxmlformats.org/drawingml/2006/main">
               <a:graphicData uri="http://schemas.openxmlformats.org/drawingml/2006/picture">
                 <pic:pic xmlns:pic="http://schemas.openxmlformats.org/drawingml/2006/picture">
                   <pic:nvPicPr>
-                    <pic:cNvPr id="1486857146" name=""/>
+                    <pic:cNvPr id="114064821" name=""/>
                     <pic:cNvPicPr/>
                   </pic:nvPicPr>
                   <pic:blipFill>
@@ -11715,7 +11989,7 @@
         <w:pStyle w:val="PargrafodaLista"/>
         <w:numPr>
           <w:ilvl w:val="0"/>
-          <w:numId w:val="13"/>
+          <w:numId w:val="14"/>
         </w:numPr>
         <w:spacing w:after="80" w:line="260" w:lineRule="auto"/>
         <w:ind w:left="700"/>
@@ -11739,7 +12013,7 @@
         <w:pStyle w:val="PargrafodaLista"/>
         <w:numPr>
           <w:ilvl w:val="0"/>
-          <w:numId w:val="13"/>
+          <w:numId w:val="14"/>
         </w:numPr>
         <w:spacing w:after="80" w:line="260" w:lineRule="auto"/>
         <w:ind w:left="700"/>
@@ -11790,16 +12064,16 @@
         </w:rPr>
         <w:lastRenderedPageBreak/>
         <w:drawing>
-          <wp:inline distT="0" distB="0" distL="0" distR="0" wp14:anchorId="2BDF34BC" wp14:editId="2216A3E3">
+          <wp:inline distT="0" distB="0" distL="0" distR="0" wp14:anchorId="61347FA2" wp14:editId="405F58F8">
             <wp:extent cx="5120640" cy="1715571"/>
             <wp:effectExtent l="19050" t="19050" r="22860" b="18415"/>
-            <wp:docPr id="920220010" name="Imagem 30"/>
+            <wp:docPr id="857440459" name="Imagem 30"/>
             <wp:cNvGraphicFramePr/>
             <a:graphic xmlns:a="http://schemas.openxmlformats.org/drawingml/2006/main">
               <a:graphicData uri="http://schemas.openxmlformats.org/drawingml/2006/picture">
                 <pic:pic xmlns:pic="http://schemas.openxmlformats.org/drawingml/2006/picture">
                   <pic:nvPicPr>
-                    <pic:cNvPr id="920220010" name=""/>
+                    <pic:cNvPr id="857440459" name=""/>
                     <pic:cNvPicPr/>
                   </pic:nvPicPr>
                   <pic:blipFill>
@@ -11861,7 +12135,7 @@
         <w:pStyle w:val="PargrafodaLista"/>
         <w:numPr>
           <w:ilvl w:val="0"/>
-          <w:numId w:val="14"/>
+          <w:numId w:val="15"/>
         </w:numPr>
         <w:spacing w:after="80" w:line="260" w:lineRule="auto"/>
         <w:ind w:left="700"/>
@@ -11885,7 +12159,7 @@
         <w:pStyle w:val="PargrafodaLista"/>
         <w:numPr>
           <w:ilvl w:val="0"/>
-          <w:numId w:val="14"/>
+          <w:numId w:val="15"/>
         </w:numPr>
         <w:spacing w:after="80" w:line="260" w:lineRule="auto"/>
         <w:ind w:left="700"/>
@@ -11936,16 +12210,16 @@
         </w:rPr>
         <w:lastRenderedPageBreak/>
         <w:drawing>
-          <wp:inline distT="0" distB="0" distL="0" distR="0" wp14:anchorId="50202647" wp14:editId="5C239D50">
+          <wp:inline distT="0" distB="0" distL="0" distR="0" wp14:anchorId="6596D382" wp14:editId="424FA5E1">
             <wp:extent cx="5120640" cy="3282818"/>
             <wp:effectExtent l="19050" t="19050" r="22860" b="13335"/>
-            <wp:docPr id="1320279574" name="Imagem 31"/>
+            <wp:docPr id="1747766965" name="Imagem 31"/>
             <wp:cNvGraphicFramePr/>
             <a:graphic xmlns:a="http://schemas.openxmlformats.org/drawingml/2006/main">
               <a:graphicData uri="http://schemas.openxmlformats.org/drawingml/2006/picture">
                 <pic:pic xmlns:pic="http://schemas.openxmlformats.org/drawingml/2006/picture">
                   <pic:nvPicPr>
-                    <pic:cNvPr id="1320279574" name=""/>
+                    <pic:cNvPr id="1747766965" name=""/>
                     <pic:cNvPicPr/>
                   </pic:nvPicPr>
                   <pic:blipFill>
@@ -12007,7 +12281,7 @@
         <w:pStyle w:val="PargrafodaLista"/>
         <w:numPr>
           <w:ilvl w:val="0"/>
-          <w:numId w:val="15"/>
+          <w:numId w:val="16"/>
         </w:numPr>
         <w:spacing w:after="80" w:line="260" w:lineRule="auto"/>
         <w:ind w:left="700"/>
@@ -12057,16 +12331,16 @@
           <w:noProof/>
         </w:rPr>
         <w:drawing>
-          <wp:inline distT="0" distB="0" distL="0" distR="0" wp14:anchorId="367865F7" wp14:editId="7B3BE62D">
+          <wp:inline distT="0" distB="0" distL="0" distR="0" wp14:anchorId="3B6DCA5D" wp14:editId="0362267F">
             <wp:extent cx="5120640" cy="1515102"/>
             <wp:effectExtent l="19050" t="19050" r="22860" b="28575"/>
-            <wp:docPr id="1395541216" name="Imagem 32"/>
+            <wp:docPr id="1734471553" name="Imagem 32"/>
             <wp:cNvGraphicFramePr/>
             <a:graphic xmlns:a="http://schemas.openxmlformats.org/drawingml/2006/main">
               <a:graphicData uri="http://schemas.openxmlformats.org/drawingml/2006/picture">
                 <pic:pic xmlns:pic="http://schemas.openxmlformats.org/drawingml/2006/picture">
                   <pic:nvPicPr>
-                    <pic:cNvPr id="1395541216" name=""/>
+                    <pic:cNvPr id="1734471553" name=""/>
                     <pic:cNvPicPr/>
                   </pic:nvPicPr>
                   <pic:blipFill>
@@ -12128,7 +12402,7 @@
         <w:pStyle w:val="PargrafodaLista"/>
         <w:numPr>
           <w:ilvl w:val="0"/>
-          <w:numId w:val="15"/>
+          <w:numId w:val="16"/>
         </w:numPr>
         <w:spacing w:after="80" w:line="260" w:lineRule="auto"/>
         <w:ind w:left="700"/>
@@ -12179,16 +12453,16 @@
           <w:noProof/>
         </w:rPr>
         <w:drawing>
-          <wp:inline distT="0" distB="0" distL="0" distR="0" wp14:anchorId="5D647BE4" wp14:editId="1CFEF80E">
+          <wp:inline distT="0" distB="0" distL="0" distR="0" wp14:anchorId="371BF2D1" wp14:editId="6A7E77FD">
             <wp:extent cx="5120640" cy="1391113"/>
             <wp:effectExtent l="19050" t="19050" r="22860" b="19050"/>
-            <wp:docPr id="157540070" name="Imagem 33"/>
+            <wp:docPr id="940058579" name="Imagem 33"/>
             <wp:cNvGraphicFramePr/>
             <a:graphic xmlns:a="http://schemas.openxmlformats.org/drawingml/2006/main">
               <a:graphicData uri="http://schemas.openxmlformats.org/drawingml/2006/picture">
                 <pic:pic xmlns:pic="http://schemas.openxmlformats.org/drawingml/2006/picture">
                   <pic:nvPicPr>
-                    <pic:cNvPr id="157540070" name=""/>
+                    <pic:cNvPr id="940058579" name=""/>
                     <pic:cNvPicPr/>
                   </pic:nvPicPr>
                   <pic:blipFill>
@@ -12250,7 +12524,7 @@
         <w:pStyle w:val="PargrafodaLista"/>
         <w:numPr>
           <w:ilvl w:val="0"/>
-          <w:numId w:val="15"/>
+          <w:numId w:val="16"/>
         </w:numPr>
         <w:spacing w:after="80" w:line="260" w:lineRule="auto"/>
         <w:ind w:left="700"/>
@@ -12300,16 +12574,16 @@
           <w:noProof/>
         </w:rPr>
         <w:drawing>
-          <wp:inline distT="0" distB="0" distL="0" distR="0" wp14:anchorId="7C037930" wp14:editId="0B6B8147">
+          <wp:inline distT="0" distB="0" distL="0" distR="0" wp14:anchorId="2E56CAFE" wp14:editId="087F2445">
             <wp:extent cx="5120640" cy="1125174"/>
             <wp:effectExtent l="19050" t="19050" r="22860" b="18415"/>
-            <wp:docPr id="173184135" name="Imagem 34"/>
+            <wp:docPr id="1636170185" name="Imagem 34"/>
             <wp:cNvGraphicFramePr/>
             <a:graphic xmlns:a="http://schemas.openxmlformats.org/drawingml/2006/main">
               <a:graphicData uri="http://schemas.openxmlformats.org/drawingml/2006/picture">
                 <pic:pic xmlns:pic="http://schemas.openxmlformats.org/drawingml/2006/picture">
                   <pic:nvPicPr>
-                    <pic:cNvPr id="173184135" name=""/>
+                    <pic:cNvPr id="1636170185" name=""/>
                     <pic:cNvPicPr/>
                   </pic:nvPicPr>
                   <pic:blipFill>
@@ -12399,7 +12673,7 @@
           <w:sz w:val="27"/>
         </w:rPr>
       </w:pPr>
-      <w:bookmarkStart w:id="26" w:name="_Toc236512838"/>
+      <w:bookmarkStart w:id="27" w:name="_Toc236515597"/>
       <w:r>
         <w:rPr>
           <w:rFonts w:ascii="Montserrat" w:hAnsi="Montserrat"/>
@@ -12409,7 +12683,7 @@
         </w:rPr>
         <w:t>4.2 Relatorio de Entregas e Beneficios (FORALF12)</w:t>
       </w:r>
-      <w:bookmarkEnd w:id="26"/>
+      <w:bookmarkEnd w:id="27"/>
     </w:p>
     <w:p>
       <w:pPr>
@@ -12439,16 +12713,16 @@
           <w:noProof/>
         </w:rPr>
         <w:drawing>
-          <wp:inline distT="0" distB="0" distL="0" distR="0" wp14:anchorId="7314BFFB" wp14:editId="3011E1B5">
+          <wp:inline distT="0" distB="0" distL="0" distR="0" wp14:anchorId="429EE1D4" wp14:editId="0D0446F6">
             <wp:extent cx="5120640" cy="4627581"/>
             <wp:effectExtent l="19050" t="19050" r="22860" b="20955"/>
-            <wp:docPr id="530269832" name="Imagem 35"/>
+            <wp:docPr id="1703206303" name="Imagem 35"/>
             <wp:cNvGraphicFramePr/>
             <a:graphic xmlns:a="http://schemas.openxmlformats.org/drawingml/2006/main">
               <a:graphicData uri="http://schemas.openxmlformats.org/drawingml/2006/picture">
                 <pic:pic xmlns:pic="http://schemas.openxmlformats.org/drawingml/2006/picture">
                   <pic:nvPicPr>
-                    <pic:cNvPr id="530269832" name=""/>
+                    <pic:cNvPr id="1703206303" name=""/>
                     <pic:cNvPicPr/>
                   </pic:nvPicPr>
                   <pic:blipFill>
@@ -12516,16 +12790,16 @@
         </w:rPr>
         <w:lastRenderedPageBreak/>
         <w:drawing>
-          <wp:inline distT="0" distB="0" distL="0" distR="0" wp14:anchorId="274EF7E1" wp14:editId="265BE8D9">
+          <wp:inline distT="0" distB="0" distL="0" distR="0" wp14:anchorId="5B9F493E" wp14:editId="160DBCA8">
             <wp:extent cx="5120640" cy="4627581"/>
             <wp:effectExtent l="19050" t="19050" r="22860" b="20955"/>
-            <wp:docPr id="222500388" name="Imagem 36"/>
+            <wp:docPr id="1010981722" name="Imagem 36"/>
             <wp:cNvGraphicFramePr/>
             <a:graphic xmlns:a="http://schemas.openxmlformats.org/drawingml/2006/main">
               <a:graphicData uri="http://schemas.openxmlformats.org/drawingml/2006/picture">
                 <pic:pic xmlns:pic="http://schemas.openxmlformats.org/drawingml/2006/picture">
                   <pic:nvPicPr>
-                    <pic:cNvPr id="222500388" name=""/>
+                    <pic:cNvPr id="1010981722" name=""/>
                     <pic:cNvPicPr/>
                   </pic:nvPicPr>
                   <pic:blipFill>
@@ -12587,7 +12861,7 @@
         <w:pStyle w:val="PargrafodaLista"/>
         <w:numPr>
           <w:ilvl w:val="0"/>
-          <w:numId w:val="15"/>
+          <w:numId w:val="16"/>
         </w:numPr>
         <w:spacing w:after="80" w:line="260" w:lineRule="auto"/>
         <w:ind w:left="700"/>
@@ -12611,7 +12885,7 @@
         <w:pStyle w:val="PargrafodaLista"/>
         <w:numPr>
           <w:ilvl w:val="0"/>
-          <w:numId w:val="15"/>
+          <w:numId w:val="16"/>
         </w:numPr>
         <w:spacing w:after="80" w:line="260" w:lineRule="auto"/>
         <w:ind w:left="700"/>
@@ -12662,16 +12936,16 @@
         </w:rPr>
         <w:lastRenderedPageBreak/>
         <w:drawing>
-          <wp:inline distT="0" distB="0" distL="0" distR="0" wp14:anchorId="7143E304" wp14:editId="3F0F99B1">
+          <wp:inline distT="0" distB="0" distL="0" distR="0" wp14:anchorId="4ED557C2" wp14:editId="6DBDBFF0">
             <wp:extent cx="5120640" cy="2144319"/>
             <wp:effectExtent l="19050" t="19050" r="22860" b="27940"/>
-            <wp:docPr id="743042476" name="Imagem 37"/>
+            <wp:docPr id="1529153541" name="Imagem 37"/>
             <wp:cNvGraphicFramePr/>
             <a:graphic xmlns:a="http://schemas.openxmlformats.org/drawingml/2006/main">
               <a:graphicData uri="http://schemas.openxmlformats.org/drawingml/2006/picture">
                 <pic:pic xmlns:pic="http://schemas.openxmlformats.org/drawingml/2006/picture">
                   <pic:nvPicPr>
-                    <pic:cNvPr id="743042476" name=""/>
+                    <pic:cNvPr id="1529153541" name=""/>
                     <pic:cNvPicPr/>
                   </pic:nvPicPr>
                   <pic:blipFill>
@@ -12759,16 +13033,16 @@
           <w:noProof/>
         </w:rPr>
         <w:drawing>
-          <wp:inline distT="0" distB="0" distL="0" distR="0" wp14:anchorId="7E1221C7" wp14:editId="44B7D14A">
+          <wp:inline distT="0" distB="0" distL="0" distR="0" wp14:anchorId="3E2EF3E9" wp14:editId="6839FC9D">
             <wp:extent cx="5120640" cy="1055647"/>
             <wp:effectExtent l="19050" t="19050" r="22860" b="11430"/>
-            <wp:docPr id="1457280980" name="Imagem 38"/>
+            <wp:docPr id="1459901723" name="Imagem 38"/>
             <wp:cNvGraphicFramePr/>
             <a:graphic xmlns:a="http://schemas.openxmlformats.org/drawingml/2006/main">
               <a:graphicData uri="http://schemas.openxmlformats.org/drawingml/2006/picture">
                 <pic:pic xmlns:pic="http://schemas.openxmlformats.org/drawingml/2006/picture">
                   <pic:nvPicPr>
-                    <pic:cNvPr id="1457280980" name=""/>
+                    <pic:cNvPr id="1459901723" name=""/>
                     <pic:cNvPicPr/>
                   </pic:nvPicPr>
                   <pic:blipFill>
@@ -12830,7 +13104,7 @@
         <w:pStyle w:val="PargrafodaLista"/>
         <w:numPr>
           <w:ilvl w:val="0"/>
-          <w:numId w:val="16"/>
+          <w:numId w:val="17"/>
         </w:numPr>
         <w:spacing w:after="80" w:line="260" w:lineRule="auto"/>
         <w:ind w:left="700"/>
@@ -12881,16 +13155,16 @@
         </w:rPr>
         <w:lastRenderedPageBreak/>
         <w:drawing>
-          <wp:inline distT="0" distB="0" distL="0" distR="0" wp14:anchorId="318726CD" wp14:editId="1FF7A3CD">
+          <wp:inline distT="0" distB="0" distL="0" distR="0" wp14:anchorId="25625E66" wp14:editId="66F189BE">
             <wp:extent cx="5120640" cy="3282818"/>
             <wp:effectExtent l="19050" t="19050" r="22860" b="13335"/>
-            <wp:docPr id="1700471269" name="Imagem 39"/>
+            <wp:docPr id="1222088237" name="Imagem 39"/>
             <wp:cNvGraphicFramePr/>
             <a:graphic xmlns:a="http://schemas.openxmlformats.org/drawingml/2006/main">
               <a:graphicData uri="http://schemas.openxmlformats.org/drawingml/2006/picture">
                 <pic:pic xmlns:pic="http://schemas.openxmlformats.org/drawingml/2006/picture">
                   <pic:nvPicPr>
-                    <pic:cNvPr id="1700471269" name=""/>
+                    <pic:cNvPr id="1222088237" name=""/>
                     <pic:cNvPicPr/>
                   </pic:nvPicPr>
                   <pic:blipFill>
@@ -12965,7 +13239,7 @@
           <w:color w:val="6A6A70"/>
           <w:sz w:val="21"/>
         </w:rPr>
-        <w:t>So depois do Gate 2 pactuado o projeto deve avancar para a execucao. Um projeto que comeca a ser executado sem essa pactuacao corre o risco de ser questionado ou desautorizado em momentos criticos.</w:t>
+        <w:t>So depois do Gate 2 pactuado o projeto deve avancar para a execucao. Um projeto que comeca a ser executado sem essa pactuacao corre o risco de ser questionado ou desautorizado em momentos criticos. Ao marcar Pactuado, um e-mail de notificacao e disparado automaticamente (secao 2.8).</w:t>
       </w:r>
     </w:p>
     <w:p>
@@ -12973,7 +13247,7 @@
         <w:pStyle w:val="PargrafodaLista"/>
         <w:numPr>
           <w:ilvl w:val="0"/>
-          <w:numId w:val="16"/>
+          <w:numId w:val="17"/>
         </w:numPr>
         <w:spacing w:after="80" w:line="260" w:lineRule="auto"/>
         <w:ind w:left="700"/>
@@ -13023,16 +13297,16 @@
           <w:noProof/>
         </w:rPr>
         <w:drawing>
-          <wp:inline distT="0" distB="0" distL="0" distR="0" wp14:anchorId="46DCF64B" wp14:editId="0E873A27">
+          <wp:inline distT="0" distB="0" distL="0" distR="0" wp14:anchorId="777165AC" wp14:editId="7C0D9074">
             <wp:extent cx="5120640" cy="1978034"/>
             <wp:effectExtent l="19050" t="19050" r="22860" b="22225"/>
-            <wp:docPr id="508670002" name="Imagem 40"/>
+            <wp:docPr id="1030248636" name="Imagem 40"/>
             <wp:cNvGraphicFramePr/>
             <a:graphic xmlns:a="http://schemas.openxmlformats.org/drawingml/2006/main">
               <a:graphicData uri="http://schemas.openxmlformats.org/drawingml/2006/picture">
                 <pic:pic xmlns:pic="http://schemas.openxmlformats.org/drawingml/2006/picture">
                   <pic:nvPicPr>
-                    <pic:cNvPr id="508670002" name=""/>
+                    <pic:cNvPr id="1030248636" name=""/>
                     <pic:cNvPicPr/>
                   </pic:nvPicPr>
                   <pic:blipFill>
@@ -13105,7 +13379,7 @@
           <w:sz w:val="34"/>
         </w:rPr>
       </w:pPr>
-      <w:bookmarkStart w:id="27" w:name="_Toc236512839"/>
+      <w:bookmarkStart w:id="28" w:name="_Toc236515598"/>
       <w:r>
         <w:rPr>
           <w:rFonts w:ascii="Montserrat" w:hAnsi="Montserrat"/>
@@ -13116,7 +13390,7 @@
         <w:lastRenderedPageBreak/>
         <w:t>5. Validador de Projetos</w:t>
       </w:r>
-      <w:bookmarkEnd w:id="27"/>
+      <w:bookmarkEnd w:id="28"/>
     </w:p>
     <w:p>
       <w:pPr>
@@ -13165,7 +13439,7 @@
           <w:sz w:val="27"/>
         </w:rPr>
       </w:pPr>
-      <w:bookmarkStart w:id="28" w:name="_Toc236512840"/>
+      <w:bookmarkStart w:id="29" w:name="_Toc236515599"/>
       <w:r>
         <w:rPr>
           <w:rFonts w:ascii="Montserrat" w:hAnsi="Montserrat"/>
@@ -13175,7 +13449,7 @@
         </w:rPr>
         <w:t>5.1 Quadro de conexoes</w:t>
       </w:r>
-      <w:bookmarkEnd w:id="28"/>
+      <w:bookmarkEnd w:id="29"/>
     </w:p>
     <w:p>
       <w:pPr>
@@ -13205,16 +13479,16 @@
           <w:noProof/>
         </w:rPr>
         <w:drawing>
-          <wp:inline distT="0" distB="0" distL="0" distR="0" wp14:anchorId="39974CF8" wp14:editId="6C163B57">
+          <wp:inline distT="0" distB="0" distL="0" distR="0" wp14:anchorId="634B0437" wp14:editId="67E5BC4B">
             <wp:extent cx="5303520" cy="4792851"/>
             <wp:effectExtent l="19050" t="19050" r="11430" b="27305"/>
-            <wp:docPr id="1877327523" name="Imagem 41"/>
+            <wp:docPr id="1467019279" name="Imagem 41"/>
             <wp:cNvGraphicFramePr/>
             <a:graphic xmlns:a="http://schemas.openxmlformats.org/drawingml/2006/main">
               <a:graphicData uri="http://schemas.openxmlformats.org/drawingml/2006/picture">
                 <pic:pic xmlns:pic="http://schemas.openxmlformats.org/drawingml/2006/picture">
                   <pic:nvPicPr>
-                    <pic:cNvPr id="1877327523" name=""/>
+                    <pic:cNvPr id="1467019279" name=""/>
                     <pic:cNvPicPr/>
                   </pic:nvPicPr>
                   <pic:blipFill>
@@ -13283,7 +13557,7 @@
           <w:sz w:val="27"/>
         </w:rPr>
       </w:pPr>
-      <w:bookmarkStart w:id="29" w:name="_Toc236512841"/>
+      <w:bookmarkStart w:id="30" w:name="_Toc236515600"/>
       <w:r>
         <w:rPr>
           <w:rFonts w:ascii="Montserrat" w:hAnsi="Montserrat"/>
@@ -13293,7 +13567,7 @@
         </w:rPr>
         <w:t>5.2 Simulador - e se...?</w:t>
       </w:r>
-      <w:bookmarkEnd w:id="29"/>
+      <w:bookmarkEnd w:id="30"/>
     </w:p>
     <w:p>
       <w:pPr>
@@ -13323,16 +13597,16 @@
           <w:noProof/>
         </w:rPr>
         <w:drawing>
-          <wp:inline distT="0" distB="0" distL="0" distR="0" wp14:anchorId="6A4D033B" wp14:editId="2D785E45">
+          <wp:inline distT="0" distB="0" distL="0" distR="0" wp14:anchorId="19D46882" wp14:editId="440913EC">
             <wp:extent cx="5303520" cy="4792851"/>
             <wp:effectExtent l="19050" t="19050" r="11430" b="27305"/>
-            <wp:docPr id="914841337" name="Imagem 42"/>
+            <wp:docPr id="938386139" name="Imagem 42"/>
             <wp:cNvGraphicFramePr/>
             <a:graphic xmlns:a="http://schemas.openxmlformats.org/drawingml/2006/main">
               <a:graphicData uri="http://schemas.openxmlformats.org/drawingml/2006/picture">
                 <pic:pic xmlns:pic="http://schemas.openxmlformats.org/drawingml/2006/picture">
                   <pic:nvPicPr>
-                    <pic:cNvPr id="914841337" name=""/>
+                    <pic:cNvPr id="938386139" name=""/>
                     <pic:cNvPicPr/>
                   </pic:nvPicPr>
                   <pic:blipFill>
@@ -13400,7 +13674,7 @@
           <w:sz w:val="27"/>
         </w:rPr>
       </w:pPr>
-      <w:bookmarkStart w:id="30" w:name="_Toc236512842"/>
+      <w:bookmarkStart w:id="31" w:name="_Toc236515601"/>
       <w:r>
         <w:rPr>
           <w:rFonts w:ascii="Montserrat" w:hAnsi="Montserrat"/>
@@ -13410,7 +13684,7 @@
         </w:rPr>
         <w:t>5.3 Assistente de decisao em 8 perguntas</w:t>
       </w:r>
-      <w:bookmarkEnd w:id="30"/>
+      <w:bookmarkEnd w:id="31"/>
     </w:p>
     <w:p>
       <w:pPr>
@@ -13441,16 +13715,16 @@
         </w:rPr>
         <w:lastRenderedPageBreak/>
         <w:drawing>
-          <wp:inline distT="0" distB="0" distL="0" distR="0" wp14:anchorId="4982C1A2" wp14:editId="12B563E0">
+          <wp:inline distT="0" distB="0" distL="0" distR="0" wp14:anchorId="242A5F08" wp14:editId="4C106594">
             <wp:extent cx="5303520" cy="4792851"/>
             <wp:effectExtent l="19050" t="19050" r="11430" b="27305"/>
-            <wp:docPr id="509536228" name="Imagem 43"/>
+            <wp:docPr id="270762339" name="Imagem 43"/>
             <wp:cNvGraphicFramePr/>
             <a:graphic xmlns:a="http://schemas.openxmlformats.org/drawingml/2006/main">
               <a:graphicData uri="http://schemas.openxmlformats.org/drawingml/2006/picture">
                 <pic:pic xmlns:pic="http://schemas.openxmlformats.org/drawingml/2006/picture">
                   <pic:nvPicPr>
-                    <pic:cNvPr id="509536228" name=""/>
+                    <pic:cNvPr id="270762339" name=""/>
                     <pic:cNvPicPr/>
                   </pic:nvPicPr>
                   <pic:blipFill>
@@ -13518,16 +13792,16 @@
         </w:rPr>
         <w:lastRenderedPageBreak/>
         <w:drawing>
-          <wp:inline distT="0" distB="0" distL="0" distR="0" wp14:anchorId="3DE6F62D" wp14:editId="232C3ED2">
+          <wp:inline distT="0" distB="0" distL="0" distR="0" wp14:anchorId="179E60F7" wp14:editId="45D5A52D">
             <wp:extent cx="5303520" cy="4792851"/>
             <wp:effectExtent l="19050" t="19050" r="11430" b="27305"/>
-            <wp:docPr id="1281735162" name="Imagem 44"/>
+            <wp:docPr id="1865913886" name="Imagem 44"/>
             <wp:cNvGraphicFramePr/>
             <a:graphic xmlns:a="http://schemas.openxmlformats.org/drawingml/2006/main">
               <a:graphicData uri="http://schemas.openxmlformats.org/drawingml/2006/picture">
                 <pic:pic xmlns:pic="http://schemas.openxmlformats.org/drawingml/2006/picture">
                   <pic:nvPicPr>
-                    <pic:cNvPr id="1281735162" name=""/>
+                    <pic:cNvPr id="1865913886" name=""/>
                     <pic:cNvPicPr/>
                   </pic:nvPicPr>
                   <pic:blipFill>
@@ -13620,7 +13894,7 @@
           <w:sz w:val="34"/>
         </w:rPr>
       </w:pPr>
-      <w:bookmarkStart w:id="31" w:name="_Toc236512843"/>
+      <w:bookmarkStart w:id="32" w:name="_Toc236515602"/>
       <w:r>
         <w:rPr>
           <w:rFonts w:ascii="Montserrat" w:hAnsi="Montserrat"/>
@@ -13631,7 +13905,7 @@
         <w:lastRenderedPageBreak/>
         <w:t>6. Administracao do sistema</w:t>
       </w:r>
-      <w:bookmarkEnd w:id="31"/>
+      <w:bookmarkEnd w:id="32"/>
     </w:p>
     <w:p>
       <w:pPr>
@@ -13662,7 +13936,7 @@
           <w:sz w:val="27"/>
         </w:rPr>
       </w:pPr>
-      <w:bookmarkStart w:id="32" w:name="_Toc236512844"/>
+      <w:bookmarkStart w:id="33" w:name="_Toc236515603"/>
       <w:r>
         <w:rPr>
           <w:rFonts w:ascii="Montserrat" w:hAnsi="Montserrat"/>
@@ -13672,7 +13946,7 @@
         </w:rPr>
         <w:t>6.1 Usuarios</w:t>
       </w:r>
-      <w:bookmarkEnd w:id="32"/>
+      <w:bookmarkEnd w:id="33"/>
     </w:p>
     <w:p>
       <w:pPr>
@@ -13702,16 +13976,16 @@
           <w:noProof/>
         </w:rPr>
         <w:drawing>
-          <wp:inline distT="0" distB="0" distL="0" distR="0" wp14:anchorId="2524EBFC" wp14:editId="6B750BEC">
+          <wp:inline distT="0" distB="0" distL="0" distR="0" wp14:anchorId="74578443" wp14:editId="69D24C55">
             <wp:extent cx="5303520" cy="4792851"/>
             <wp:effectExtent l="19050" t="19050" r="11430" b="27305"/>
-            <wp:docPr id="1569544393" name="Imagem 45"/>
+            <wp:docPr id="1914188933" name="Imagem 45"/>
             <wp:cNvGraphicFramePr/>
             <a:graphic xmlns:a="http://schemas.openxmlformats.org/drawingml/2006/main">
               <a:graphicData uri="http://schemas.openxmlformats.org/drawingml/2006/picture">
                 <pic:pic xmlns:pic="http://schemas.openxmlformats.org/drawingml/2006/picture">
                   <pic:nvPicPr>
-                    <pic:cNvPr id="1569544393" name=""/>
+                    <pic:cNvPr id="1914188933" name=""/>
                     <pic:cNvPicPr/>
                   </pic:nvPicPr>
                   <pic:blipFill>
@@ -13779,7 +14053,7 @@
           <w:sz w:val="27"/>
         </w:rPr>
       </w:pPr>
-      <w:bookmarkStart w:id="33" w:name="_Toc236512845"/>
+      <w:bookmarkStart w:id="34" w:name="_Toc236515604"/>
       <w:r>
         <w:rPr>
           <w:rFonts w:ascii="Montserrat" w:hAnsi="Montserrat"/>
@@ -13789,7 +14063,7 @@
         </w:rPr>
         <w:t>6.2 Equipes</w:t>
       </w:r>
-      <w:bookmarkEnd w:id="33"/>
+      <w:bookmarkEnd w:id="34"/>
     </w:p>
     <w:p>
       <w:pPr>
@@ -13820,16 +14094,16 @@
         </w:rPr>
         <w:lastRenderedPageBreak/>
         <w:drawing>
-          <wp:inline distT="0" distB="0" distL="0" distR="0" wp14:anchorId="4F034244" wp14:editId="5C2BB31D">
+          <wp:inline distT="0" distB="0" distL="0" distR="0" wp14:anchorId="37CFEE99" wp14:editId="7BA6D40D">
             <wp:extent cx="5303520" cy="4792851"/>
             <wp:effectExtent l="19050" t="19050" r="11430" b="27305"/>
-            <wp:docPr id="648561537" name="Imagem 46"/>
+            <wp:docPr id="1429128015" name="Imagem 46"/>
             <wp:cNvGraphicFramePr/>
             <a:graphic xmlns:a="http://schemas.openxmlformats.org/drawingml/2006/main">
               <a:graphicData uri="http://schemas.openxmlformats.org/drawingml/2006/picture">
                 <pic:pic xmlns:pic="http://schemas.openxmlformats.org/drawingml/2006/picture">
                   <pic:nvPicPr>
-                    <pic:cNvPr id="648561537" name=""/>
+                    <pic:cNvPr id="1429128015" name=""/>
                     <pic:cNvPicPr/>
                   </pic:nvPicPr>
                   <pic:blipFill>
@@ -13897,7 +14171,7 @@
           <w:sz w:val="27"/>
         </w:rPr>
       </w:pPr>
-      <w:bookmarkStart w:id="34" w:name="_Toc236512846"/>
+      <w:bookmarkStart w:id="35" w:name="_Toc236515605"/>
       <w:r>
         <w:rPr>
           <w:rFonts w:ascii="Montserrat" w:hAnsi="Montserrat"/>
@@ -13907,7 +14181,7 @@
         </w:rPr>
         <w:t>6.3 Configuracoes</w:t>
       </w:r>
-      <w:bookmarkEnd w:id="34"/>
+      <w:bookmarkEnd w:id="35"/>
     </w:p>
     <w:p>
       <w:pPr>
@@ -13938,16 +14212,16 @@
         </w:rPr>
         <w:lastRenderedPageBreak/>
         <w:drawing>
-          <wp:inline distT="0" distB="0" distL="0" distR="0" wp14:anchorId="55644E23" wp14:editId="04BC3F91">
+          <wp:inline distT="0" distB="0" distL="0" distR="0" wp14:anchorId="4E8F5BCC" wp14:editId="45011CDF">
             <wp:extent cx="5303520" cy="4792851"/>
             <wp:effectExtent l="19050" t="19050" r="11430" b="27305"/>
-            <wp:docPr id="1194762295" name="Imagem 47"/>
+            <wp:docPr id="523644764" name="Imagem 47"/>
             <wp:cNvGraphicFramePr/>
             <a:graphic xmlns:a="http://schemas.openxmlformats.org/drawingml/2006/main">
               <a:graphicData uri="http://schemas.openxmlformats.org/drawingml/2006/picture">
                 <pic:pic xmlns:pic="http://schemas.openxmlformats.org/drawingml/2006/picture">
                   <pic:nvPicPr>
-                    <pic:cNvPr id="1194762295" name=""/>
+                    <pic:cNvPr id="523644764" name=""/>
                     <pic:cNvPicPr/>
                   </pic:nvPicPr>
                   <pic:blipFill>
@@ -14019,7 +14293,7 @@
           <w:sz w:val="34"/>
         </w:rPr>
       </w:pPr>
-      <w:bookmarkStart w:id="35" w:name="_Toc236512847"/>
+      <w:bookmarkStart w:id="36" w:name="_Toc236515606"/>
       <w:r>
         <w:rPr>
           <w:rFonts w:ascii="Montserrat" w:hAnsi="Montserrat"/>
@@ -14030,7 +14304,7 @@
         <w:lastRenderedPageBreak/>
         <w:t>7. Perguntas frequentes</w:t>
       </w:r>
-      <w:bookmarkEnd w:id="35"/>
+      <w:bookmarkEnd w:id="36"/>
     </w:p>
     <w:p>
       <w:pPr>
@@ -14263,7 +14537,7 @@
           <w:sz w:val="34"/>
         </w:rPr>
       </w:pPr>
-      <w:bookmarkStart w:id="36" w:name="_Toc236512848"/>
+      <w:bookmarkStart w:id="37" w:name="_Toc236515607"/>
       <w:r>
         <w:rPr>
           <w:rFonts w:ascii="Montserrat" w:hAnsi="Montserrat"/>
@@ -14274,7 +14548,7 @@
         <w:lastRenderedPageBreak/>
         <w:t>8. Anexo - Tabela de artefatos</w:t>
       </w:r>
-      <w:bookmarkEnd w:id="36"/>
+      <w:bookmarkEnd w:id="37"/>
     </w:p>
     <w:tbl>
       <w:tblPr>
@@ -15973,7 +16247,7 @@
 <file path=word/numbering.xml><?xml version="1.0" encoding="utf-8"?>
 <w:numbering xmlns:wpc="http://schemas.microsoft.com/office/word/2010/wordprocessingCanvas" xmlns:cx="http://schemas.microsoft.com/office/drawing/2014/chartex" xmlns:cx1="http://schemas.microsoft.com/office/drawing/2015/9/8/chartex" xmlns:cx2="http://schemas.microsoft.com/office/drawing/2015/10/21/chartex" xmlns:cx3="http://schemas.microsoft.com/office/drawing/2016/5/9/chartex" xmlns:cx4="http://schemas.microsoft.com/office/drawing/2016/5/10/chartex" xmlns:cx5="http://schemas.microsoft.com/office/drawing/2016/5/11/chartex" xmlns:cx6="http://schemas.microsoft.com/office/drawing/2016/5/12/chartex" xmlns:cx7="http://schemas.microsoft.com/office/drawing/2016/5/13/chartex" xmlns:cx8="http://schemas.microsoft.com/office/drawing/2016/5/14/chartex" xmlns:mc="http://schemas.openxmlformats.org/markup-compatibility/2006" xmlns:aink="http://schemas.microsoft.com/office/drawing/2016/ink" xmlns:am3d="http://schemas.microsoft.com/office/drawing/2017/model3d" xmlns:o="urn:schemas-microsoft-com:office:office" xmlns:oel="http://schemas.microsoft.com/office/2019/extlst" xmlns:r="http://schemas.openxmlformats.org/officeDocument/2006/relationships" xmlns:m="http://schemas.openxmlformats.org/officeDocument/2006/math" xmlns:v="urn:schemas-microsoft-com:vml" xmlns:wp14="http://schemas.microsoft.com/office/word/2010/wordprocessingDrawing" xmlns:wp="http://schemas.openxmlformats.org/drawingml/2006/wordprocessingDrawing" xmlns:w10="urn:schemas-microsoft-com:office:word" xmlns:w="http://schemas.openxmlformats.org/wordprocessingml/2006/main" xmlns:w14="http://schemas.microsoft.com/office/word/2010/wordml" xmlns:w15="http://schemas.microsoft.com/office/word/2012/wordml" xmlns:w16cei="http://schemas.microsoft.com/office/word/2026/wordml/cei" xmlns:w16cex="http://schemas.microsoft.com/office/word/2018/wordml/cex" xmlns:w16cid="http://schemas.microsoft.com/office/word/2016/wordml/cid" xmlns:w16="http://schemas.microsoft.com/office/word/2018/wordml" xmlns:w16du="http://schemas.microsoft.com/office/word/2023/wordml/word16du" xmlns:w16sdtdh="http://schemas.microsoft.com/office/word/2020/wordml/sdtdatahash" xmlns:w16sdtfl="http://schemas.microsoft.com/office/word/2024/wordml/sdtformatlock" xmlns:w16se="http://schemas.microsoft.com/office/word/2015/wordml/symex" xmlns:wpg="http://schemas.microsoft.com/office/word/2010/wordprocessingGroup" xmlns:wpi="http://schemas.microsoft.com/office/word/2010/wordprocessingInk" xmlns:wne="http://schemas.microsoft.com/office/word/2006/wordml" xmlns:wps="http://schemas.microsoft.com/office/word/2010/wordprocessingShape" mc:Ignorable="w14 w15 w16se w16cid w16 w16cex w16sdtdh w16sdtfl w16du wp14">
   <w:abstractNum w:abstractNumId="0" w15:restartNumberingAfterBreak="0">
-    <w:nsid w:val="01A7135D"/>
+    <w:nsid w:val="03062C05"/>
     <w:multiLevelType w:val="singleLevel"/>
     <w:tmpl w:val="04160001"/>
     <w:lvl w:ilvl="0">
@@ -15990,7 +16264,7 @@
     </w:lvl>
   </w:abstractNum>
   <w:abstractNum w:abstractNumId="1" w15:restartNumberingAfterBreak="0">
-    <w:nsid w:val="041E1D87"/>
+    <w:nsid w:val="06E94EE9"/>
     <w:multiLevelType w:val="singleLevel"/>
     <w:tmpl w:val="04160001"/>
     <w:lvl w:ilvl="0">
@@ -16007,7 +16281,7 @@
     </w:lvl>
   </w:abstractNum>
   <w:abstractNum w:abstractNumId="2" w15:restartNumberingAfterBreak="0">
-    <w:nsid w:val="0D726D88"/>
+    <w:nsid w:val="08C04BB1"/>
     <w:multiLevelType w:val="singleLevel"/>
     <w:tmpl w:val="04160001"/>
     <w:lvl w:ilvl="0">
@@ -16024,7 +16298,7 @@
     </w:lvl>
   </w:abstractNum>
   <w:abstractNum w:abstractNumId="3" w15:restartNumberingAfterBreak="0">
-    <w:nsid w:val="0D78729B"/>
+    <w:nsid w:val="0BBB2CED"/>
     <w:multiLevelType w:val="singleLevel"/>
     <w:tmpl w:val="04160001"/>
     <w:lvl w:ilvl="0">
@@ -16041,7 +16315,7 @@
     </w:lvl>
   </w:abstractNum>
   <w:abstractNum w:abstractNumId="4" w15:restartNumberingAfterBreak="0">
-    <w:nsid w:val="0F7C3F9F"/>
+    <w:nsid w:val="0DD13D28"/>
     <w:multiLevelType w:val="singleLevel"/>
     <w:tmpl w:val="04160001"/>
     <w:lvl w:ilvl="0">
@@ -16058,7 +16332,7 @@
     </w:lvl>
   </w:abstractNum>
   <w:abstractNum w:abstractNumId="5" w15:restartNumberingAfterBreak="0">
-    <w:nsid w:val="140F2D91"/>
+    <w:nsid w:val="11FA4DFC"/>
     <w:multiLevelType w:val="singleLevel"/>
     <w:tmpl w:val="04160001"/>
     <w:lvl w:ilvl="0">
@@ -16075,7 +16349,7 @@
     </w:lvl>
   </w:abstractNum>
   <w:abstractNum w:abstractNumId="6" w15:restartNumberingAfterBreak="0">
-    <w:nsid w:val="16853111"/>
+    <w:nsid w:val="162F4EE9"/>
     <w:multiLevelType w:val="singleLevel"/>
     <w:tmpl w:val="04160001"/>
     <w:lvl w:ilvl="0">
@@ -16092,7 +16366,7 @@
     </w:lvl>
   </w:abstractNum>
   <w:abstractNum w:abstractNumId="7" w15:restartNumberingAfterBreak="0">
-    <w:nsid w:val="179A17AE"/>
+    <w:nsid w:val="1CC265E2"/>
     <w:multiLevelType w:val="singleLevel"/>
     <w:tmpl w:val="04160001"/>
     <w:lvl w:ilvl="0">
@@ -16109,7 +16383,7 @@
     </w:lvl>
   </w:abstractNum>
   <w:abstractNum w:abstractNumId="8" w15:restartNumberingAfterBreak="0">
-    <w:nsid w:val="1A932106"/>
+    <w:nsid w:val="24D70424"/>
     <w:multiLevelType w:val="singleLevel"/>
     <w:tmpl w:val="04160001"/>
     <w:lvl w:ilvl="0">
@@ -16126,7 +16400,7 @@
     </w:lvl>
   </w:abstractNum>
   <w:abstractNum w:abstractNumId="9" w15:restartNumberingAfterBreak="0">
-    <w:nsid w:val="2AFA0514"/>
+    <w:nsid w:val="3D8970F2"/>
     <w:multiLevelType w:val="singleLevel"/>
     <w:tmpl w:val="04160001"/>
     <w:lvl w:ilvl="0">
@@ -16143,7 +16417,7 @@
     </w:lvl>
   </w:abstractNum>
   <w:abstractNum w:abstractNumId="10" w15:restartNumberingAfterBreak="0">
-    <w:nsid w:val="3545675E"/>
+    <w:nsid w:val="416A4438"/>
     <w:multiLevelType w:val="singleLevel"/>
     <w:tmpl w:val="04160001"/>
     <w:lvl w:ilvl="0">
@@ -16160,7 +16434,7 @@
     </w:lvl>
   </w:abstractNum>
   <w:abstractNum w:abstractNumId="11" w15:restartNumberingAfterBreak="0">
-    <w:nsid w:val="3EFC0B3E"/>
+    <w:nsid w:val="47C17801"/>
     <w:multiLevelType w:val="singleLevel"/>
     <w:tmpl w:val="04160001"/>
     <w:lvl w:ilvl="0">
@@ -16177,7 +16451,7 @@
     </w:lvl>
   </w:abstractNum>
   <w:abstractNum w:abstractNumId="12" w15:restartNumberingAfterBreak="0">
-    <w:nsid w:val="3F7821A4"/>
+    <w:nsid w:val="51FA1DBE"/>
     <w:multiLevelType w:val="singleLevel"/>
     <w:tmpl w:val="04160001"/>
     <w:lvl w:ilvl="0">
@@ -16194,7 +16468,7 @@
     </w:lvl>
   </w:abstractNum>
   <w:abstractNum w:abstractNumId="13" w15:restartNumberingAfterBreak="0">
-    <w:nsid w:val="449B2939"/>
+    <w:nsid w:val="5BA93CAF"/>
     <w:multiLevelType w:val="singleLevel"/>
     <w:tmpl w:val="04160001"/>
     <w:lvl w:ilvl="0">
@@ -16211,7 +16485,7 @@
     </w:lvl>
   </w:abstractNum>
   <w:abstractNum w:abstractNumId="14" w15:restartNumberingAfterBreak="0">
-    <w:nsid w:val="5B726EF4"/>
+    <w:nsid w:val="6906509F"/>
     <w:multiLevelType w:val="singleLevel"/>
     <w:tmpl w:val="04160001"/>
     <w:lvl w:ilvl="0">
@@ -16228,7 +16502,7 @@
     </w:lvl>
   </w:abstractNum>
   <w:abstractNum w:abstractNumId="15" w15:restartNumberingAfterBreak="0">
-    <w:nsid w:val="7FA81901"/>
+    <w:nsid w:val="75B97AC3"/>
     <w:multiLevelType w:val="singleLevel"/>
     <w:tmpl w:val="04160001"/>
     <w:lvl w:ilvl="0">
@@ -16244,53 +16518,73 @@
       </w:rPr>
     </w:lvl>
   </w:abstractNum>
-  <w:num w:numId="1" w16cid:durableId="990869215">
+  <w:abstractNum w:abstractNumId="16" w15:restartNumberingAfterBreak="0">
+    <w:nsid w:val="765A1EF7"/>
+    <w:multiLevelType w:val="singleLevel"/>
+    <w:tmpl w:val="04160001"/>
+    <w:lvl w:ilvl="0">
+      <w:start w:val="1"/>
+      <w:numFmt w:val="bullet"/>
+      <w:lvlText w:val=""/>
+      <w:lvlJc w:val="left"/>
+      <w:pPr>
+        <w:ind w:left="720" w:hanging="360"/>
+      </w:pPr>
+      <w:rPr>
+        <w:rFonts w:ascii="Symbol" w:hAnsi="Symbol" w:hint="default"/>
+      </w:rPr>
+    </w:lvl>
+  </w:abstractNum>
+  <w:num w:numId="1" w16cid:durableId="1673491884">
+    <w:abstractNumId w:val="4"/>
+  </w:num>
+  <w:num w:numId="2" w16cid:durableId="1663317033">
+    <w:abstractNumId w:val="10"/>
+  </w:num>
+  <w:num w:numId="3" w16cid:durableId="1777283295">
+    <w:abstractNumId w:val="8"/>
+  </w:num>
+  <w:num w:numId="4" w16cid:durableId="742220853">
+    <w:abstractNumId w:val="7"/>
+  </w:num>
+  <w:num w:numId="5" w16cid:durableId="1879468148">
+    <w:abstractNumId w:val="14"/>
+  </w:num>
+  <w:num w:numId="6" w16cid:durableId="465590927">
+    <w:abstractNumId w:val="13"/>
+  </w:num>
+  <w:num w:numId="7" w16cid:durableId="202910999">
+    <w:abstractNumId w:val="16"/>
+  </w:num>
+  <w:num w:numId="8" w16cid:durableId="1602684331">
     <w:abstractNumId w:val="5"/>
   </w:num>
-  <w:num w:numId="2" w16cid:durableId="60756428">
+  <w:num w:numId="9" w16cid:durableId="726995591">
+    <w:abstractNumId w:val="1"/>
+  </w:num>
+  <w:num w:numId="10" w16cid:durableId="365107037">
+    <w:abstractNumId w:val="0"/>
+  </w:num>
+  <w:num w:numId="11" w16cid:durableId="210268780">
     <w:abstractNumId w:val="15"/>
   </w:num>
-  <w:num w:numId="3" w16cid:durableId="516697055">
-    <w:abstractNumId w:val="10"/>
+  <w:num w:numId="12" w16cid:durableId="1533103841">
+    <w:abstractNumId w:val="12"/>
   </w:num>
-  <w:num w:numId="4" w16cid:durableId="1565293183">
-    <w:abstractNumId w:val="8"/>
+  <w:num w:numId="13" w16cid:durableId="837773145">
+    <w:abstractNumId w:val="2"/>
   </w:num>
-  <w:num w:numId="5" w16cid:durableId="772088293">
+  <w:num w:numId="14" w16cid:durableId="2086223727">
+    <w:abstractNumId w:val="11"/>
+  </w:num>
+  <w:num w:numId="15" w16cid:durableId="2111853541">
+    <w:abstractNumId w:val="9"/>
+  </w:num>
+  <w:num w:numId="16" w16cid:durableId="1015153724">
     <w:abstractNumId w:val="6"/>
   </w:num>
-  <w:num w:numId="6" w16cid:durableId="421418401">
-    <w:abstractNumId w:val="11"/>
-  </w:num>
-  <w:num w:numId="7" w16cid:durableId="1392801953">
-    <w:abstractNumId w:val="1"/>
-  </w:num>
-  <w:num w:numId="8" w16cid:durableId="1291396521">
-    <w:abstractNumId w:val="4"/>
-  </w:num>
-  <w:num w:numId="9" w16cid:durableId="638271078">
-    <w:abstractNumId w:val="0"/>
-  </w:num>
-  <w:num w:numId="10" w16cid:durableId="1486974243">
-    <w:abstractNumId w:val="9"/>
-  </w:num>
-  <w:num w:numId="11" w16cid:durableId="1676105679">
-    <w:abstractNumId w:val="14"/>
-  </w:num>
-  <w:num w:numId="12" w16cid:durableId="181673585">
+  <w:num w:numId="17" w16cid:durableId="326055469">
     <w:abstractNumId w:val="3"/>
-  </w:num>
-  <w:num w:numId="13" w16cid:durableId="831217130">
-    <w:abstractNumId w:val="7"/>
-  </w:num>
-  <w:num w:numId="14" w16cid:durableId="468787740">
-    <w:abstractNumId w:val="12"/>
-  </w:num>
-  <w:num w:numId="15" w16cid:durableId="2121799512">
-    <w:abstractNumId w:val="13"/>
-  </w:num>
-  <w:num w:numId="16" w16cid:durableId="1578435603">
-    <w:abstractNumId w:val="2"/>
   </w:num>
 </w:numbering>
 </file>
@@ -16703,7 +16997,7 @@
     <w:link w:val="Ttulo1Char"/>
     <w:uiPriority w:val="9"/>
     <w:qFormat/>
-    <w:rsid w:val="00E07461"/>
+    <w:rsid w:val="001A6CAA"/>
     <w:pPr>
       <w:keepNext/>
       <w:keepLines/>
@@ -16725,7 +17019,7 @@
     <w:uiPriority w:val="9"/>
     <w:unhideWhenUsed/>
     <w:qFormat/>
-    <w:rsid w:val="00E07461"/>
+    <w:rsid w:val="001A6CAA"/>
     <w:pPr>
       <w:keepNext/>
       <w:keepLines/>
@@ -16748,7 +17042,7 @@
     <w:semiHidden/>
     <w:unhideWhenUsed/>
     <w:qFormat/>
-    <w:rsid w:val="00E07461"/>
+    <w:rsid w:val="001A6CAA"/>
     <w:pPr>
       <w:keepNext/>
       <w:keepLines/>
@@ -16771,7 +17065,7 @@
     <w:semiHidden/>
     <w:unhideWhenUsed/>
     <w:qFormat/>
-    <w:rsid w:val="00E07461"/>
+    <w:rsid w:val="001A6CAA"/>
     <w:pPr>
       <w:keepNext/>
       <w:keepLines/>
@@ -16794,7 +17088,7 @@
     <w:semiHidden/>
     <w:unhideWhenUsed/>
     <w:qFormat/>
-    <w:rsid w:val="00E07461"/>
+    <w:rsid w:val="001A6CAA"/>
     <w:pPr>
       <w:keepNext/>
       <w:keepLines/>
@@ -16815,7 +17109,7 @@
     <w:semiHidden/>
     <w:unhideWhenUsed/>
     <w:qFormat/>
-    <w:rsid w:val="00E07461"/>
+    <w:rsid w:val="001A6CAA"/>
     <w:pPr>
       <w:keepNext/>
       <w:keepLines/>
@@ -16838,7 +17132,7 @@
     <w:semiHidden/>
     <w:unhideWhenUsed/>
     <w:qFormat/>
-    <w:rsid w:val="00E07461"/>
+    <w:rsid w:val="001A6CAA"/>
     <w:pPr>
       <w:keepNext/>
       <w:keepLines/>
@@ -16859,7 +17153,7 @@
     <w:semiHidden/>
     <w:unhideWhenUsed/>
     <w:qFormat/>
-    <w:rsid w:val="00E07461"/>
+    <w:rsid w:val="001A6CAA"/>
     <w:pPr>
       <w:keepNext/>
       <w:keepLines/>
@@ -16882,7 +17176,7 @@
     <w:semiHidden/>
     <w:unhideWhenUsed/>
     <w:qFormat/>
-    <w:rsid w:val="00E07461"/>
+    <w:rsid w:val="001A6CAA"/>
     <w:pPr>
       <w:keepNext/>
       <w:keepLines/>
@@ -16926,7 +17220,7 @@
     <w:basedOn w:val="Fontepargpadro"/>
     <w:link w:val="Ttulo1"/>
     <w:uiPriority w:val="9"/>
-    <w:rsid w:val="00E07461"/>
+    <w:rsid w:val="001A6CAA"/>
     <w:rPr>
       <w:rFonts w:asciiTheme="majorHAnsi" w:eastAsiaTheme="majorEastAsia" w:hAnsiTheme="majorHAnsi" w:cstheme="majorBidi"/>
       <w:color w:val="0F4761" w:themeColor="accent1" w:themeShade="BF"/>
@@ -16939,7 +17233,7 @@
     <w:basedOn w:val="Fontepargpadro"/>
     <w:link w:val="Ttulo2"/>
     <w:uiPriority w:val="9"/>
-    <w:rsid w:val="00E07461"/>
+    <w:rsid w:val="001A6CAA"/>
     <w:rPr>
       <w:rFonts w:asciiTheme="majorHAnsi" w:eastAsiaTheme="majorEastAsia" w:hAnsiTheme="majorHAnsi" w:cstheme="majorBidi"/>
       <w:color w:val="0F4761" w:themeColor="accent1" w:themeShade="BF"/>
@@ -16953,7 +17247,7 @@
     <w:link w:val="Ttulo3"/>
     <w:uiPriority w:val="9"/>
     <w:semiHidden/>
-    <w:rsid w:val="00E07461"/>
+    <w:rsid w:val="001A6CAA"/>
     <w:rPr>
       <w:rFonts w:eastAsiaTheme="majorEastAsia" w:cstheme="majorBidi"/>
       <w:color w:val="0F4761" w:themeColor="accent1" w:themeShade="BF"/>
@@ -16967,7 +17261,7 @@
     <w:link w:val="Ttulo4"/>
     <w:uiPriority w:val="9"/>
     <w:semiHidden/>
-    <w:rsid w:val="00E07461"/>
+    <w:rsid w:val="001A6CAA"/>
     <w:rPr>
       <w:rFonts w:eastAsiaTheme="majorEastAsia" w:cstheme="majorBidi"/>
       <w:i/>
@@ -16981,7 +17275,7 @@
     <w:link w:val="Ttulo5"/>
     <w:uiPriority w:val="9"/>
     <w:semiHidden/>
-    <w:rsid w:val="00E07461"/>
+    <w:rsid w:val="001A6CAA"/>
     <w:rPr>
       <w:rFonts w:eastAsiaTheme="majorEastAsia" w:cstheme="majorBidi"/>
       <w:color w:val="0F4761" w:themeColor="accent1" w:themeShade="BF"/>
@@ -16993,7 +17287,7 @@
     <w:link w:val="Ttulo6"/>
     <w:uiPriority w:val="9"/>
     <w:semiHidden/>
-    <w:rsid w:val="00E07461"/>
+    <w:rsid w:val="001A6CAA"/>
     <w:rPr>
       <w:rFonts w:eastAsiaTheme="majorEastAsia" w:cstheme="majorBidi"/>
       <w:i/>
@@ -17007,7 +17301,7 @@
     <w:link w:val="Ttulo7"/>
     <w:uiPriority w:val="9"/>
     <w:semiHidden/>
-    <w:rsid w:val="00E07461"/>
+    <w:rsid w:val="001A6CAA"/>
     <w:rPr>
       <w:rFonts w:eastAsiaTheme="majorEastAsia" w:cstheme="majorBidi"/>
       <w:color w:val="595959" w:themeColor="text1" w:themeTint="A6"/>
@@ -17019,7 +17313,7 @@
     <w:link w:val="Ttulo8"/>
     <w:uiPriority w:val="9"/>
     <w:semiHidden/>
-    <w:rsid w:val="00E07461"/>
+    <w:rsid w:val="001A6CAA"/>
     <w:rPr>
       <w:rFonts w:eastAsiaTheme="majorEastAsia" w:cstheme="majorBidi"/>
       <w:i/>
@@ -17033,7 +17327,7 @@
     <w:link w:val="Ttulo9"/>
     <w:uiPriority w:val="9"/>
     <w:semiHidden/>
-    <w:rsid w:val="00E07461"/>
+    <w:rsid w:val="001A6CAA"/>
     <w:rPr>
       <w:rFonts w:eastAsiaTheme="majorEastAsia" w:cstheme="majorBidi"/>
       <w:color w:val="272727" w:themeColor="text1" w:themeTint="D8"/>
@@ -17046,7 +17340,7 @@
     <w:link w:val="TtuloChar"/>
     <w:uiPriority w:val="10"/>
     <w:qFormat/>
-    <w:rsid w:val="00E07461"/>
+    <w:rsid w:val="001A6CAA"/>
     <w:pPr>
       <w:spacing w:after="80" w:line="240" w:lineRule="auto"/>
       <w:contextualSpacing/>
@@ -17064,7 +17358,7 @@
     <w:basedOn w:val="Fontepargpadro"/>
     <w:link w:val="Ttulo"/>
     <w:uiPriority w:val="10"/>
-    <w:rsid w:val="00E07461"/>
+    <w:rsid w:val="001A6CAA"/>
     <w:rPr>
       <w:rFonts w:asciiTheme="majorHAnsi" w:eastAsiaTheme="majorEastAsia" w:hAnsiTheme="majorHAnsi" w:cstheme="majorBidi"/>
       <w:spacing w:val="-10"/>
@@ -17080,7 +17374,7 @@
     <w:link w:val="SubttuloChar"/>
     <w:uiPriority w:val="11"/>
     <w:qFormat/>
-    <w:rsid w:val="00E07461"/>
+    <w:rsid w:val="001A6CAA"/>
     <w:pPr>
       <w:numPr>
         <w:ilvl w:val="1"/>
@@ -17099,7 +17393,7 @@
     <w:basedOn w:val="Fontepargpadro"/>
     <w:link w:val="Subttulo"/>
     <w:uiPriority w:val="11"/>
-    <w:rsid w:val="00E07461"/>
+    <w:rsid w:val="001A6CAA"/>
     <w:rPr>
       <w:rFonts w:eastAsiaTheme="majorEastAsia" w:cstheme="majorBidi"/>
       <w:color w:val="595959" w:themeColor="text1" w:themeTint="A6"/>
@@ -17115,7 +17409,7 @@
     <w:link w:val="CitaoChar"/>
     <w:uiPriority w:val="29"/>
     <w:qFormat/>
-    <w:rsid w:val="00E07461"/>
+    <w:rsid w:val="001A6CAA"/>
     <w:pPr>
       <w:spacing w:before="160"/>
       <w:jc w:val="center"/>
@@ -17131,7 +17425,7 @@
     <w:basedOn w:val="Fontepargpadro"/>
     <w:link w:val="Citao"/>
     <w:uiPriority w:val="29"/>
-    <w:rsid w:val="00E07461"/>
+    <w:rsid w:val="001A6CAA"/>
     <w:rPr>
       <w:i/>
       <w:iCs/>
@@ -17143,7 +17437,7 @@
     <w:basedOn w:val="Normal"/>
     <w:uiPriority w:val="34"/>
     <w:qFormat/>
-    <w:rsid w:val="00E07461"/>
+    <w:rsid w:val="001A6CAA"/>
     <w:pPr>
       <w:ind w:left="720"/>
       <w:contextualSpacing/>
@@ -17154,7 +17448,7 @@
     <w:basedOn w:val="Fontepargpadro"/>
     <w:uiPriority w:val="21"/>
     <w:qFormat/>
-    <w:rsid w:val="00E07461"/>
+    <w:rsid w:val="001A6CAA"/>
     <w:rPr>
       <w:i/>
       <w:iCs/>
@@ -17168,7 +17462,7 @@
     <w:link w:val="CitaoIntensaChar"/>
     <w:uiPriority w:val="30"/>
     <w:qFormat/>
-    <w:rsid w:val="00E07461"/>
+    <w:rsid w:val="001A6CAA"/>
     <w:pPr>
       <w:pBdr>
         <w:top w:val="single" w:sz="4" w:space="10" w:color="0F4761" w:themeColor="accent1" w:themeShade="BF"/>
@@ -17189,7 +17483,7 @@
     <w:basedOn w:val="Fontepargpadro"/>
     <w:link w:val="CitaoIntensa"/>
     <w:uiPriority w:val="30"/>
-    <w:rsid w:val="00E07461"/>
+    <w:rsid w:val="001A6CAA"/>
     <w:rPr>
       <w:i/>
       <w:iCs/>
@@ -17201,7 +17495,7 @@
     <w:basedOn w:val="Fontepargpadro"/>
     <w:uiPriority w:val="32"/>
     <w:qFormat/>
-    <w:rsid w:val="00E07461"/>
+    <w:rsid w:val="001A6CAA"/>
     <w:rPr>
       <w:b/>
       <w:bCs/>
@@ -17216,7 +17510,7 @@
     <w:link w:val="CabealhoChar"/>
     <w:uiPriority w:val="99"/>
     <w:unhideWhenUsed/>
-    <w:rsid w:val="00E07461"/>
+    <w:rsid w:val="001A6CAA"/>
     <w:pPr>
       <w:tabs>
         <w:tab w:val="center" w:pos="4252"/>
@@ -17230,7 +17524,7 @@
     <w:basedOn w:val="Fontepargpadro"/>
     <w:link w:val="Cabealho"/>
     <w:uiPriority w:val="99"/>
-    <w:rsid w:val="00E07461"/>
+    <w:rsid w:val="001A6CAA"/>
   </w:style>
   <w:style w:type="paragraph" w:styleId="Rodap">
     <w:name w:val="footer"/>
@@ -17238,7 +17532,7 @@
     <w:link w:val="RodapChar"/>
     <w:uiPriority w:val="99"/>
     <w:unhideWhenUsed/>
-    <w:rsid w:val="00E07461"/>
+    <w:rsid w:val="001A6CAA"/>
     <w:pPr>
       <w:tabs>
         <w:tab w:val="center" w:pos="4252"/>
@@ -17252,7 +17546,7 @@
     <w:basedOn w:val="Fontepargpadro"/>
     <w:link w:val="Rodap"/>
     <w:uiPriority w:val="99"/>
-    <w:rsid w:val="00E07461"/>
+    <w:rsid w:val="001A6CAA"/>
   </w:style>
   <w:style w:type="paragraph" w:styleId="Sumrio1">
     <w:name w:val="toc 1"/>
@@ -17261,7 +17555,7 @@
     <w:autoRedefine/>
     <w:uiPriority w:val="39"/>
     <w:unhideWhenUsed/>
-    <w:rsid w:val="00E07461"/>
+    <w:rsid w:val="001A6CAA"/>
     <w:pPr>
       <w:spacing w:after="100"/>
     </w:pPr>
@@ -17273,7 +17567,7 @@
     <w:autoRedefine/>
     <w:uiPriority w:val="39"/>
     <w:unhideWhenUsed/>
-    <w:rsid w:val="00E07461"/>
+    <w:rsid w:val="001A6CAA"/>
     <w:pPr>
       <w:spacing w:after="100"/>
       <w:ind w:left="240"/>

</xml_diff>

<commit_message>
Adiciona Painel Executivo (Admin/PMO) com visão consolidada do sistema
Nova página 16 - painel-executivo.html, restrita a Admin, agregando Gates 1/2,
contagem por status de cada formulário, entraves/encaminhamentos em aberto e
resultados alcançados. Link adicionado ao menu lateral. Regras de Acesso e
Manual de Uso atualizados para refletir a nova página (v2.10).

Co-Authored-By: Claude Sonnet 5 <noreply@anthropic.com>
</commit_message>
<xml_diff>
--- a/Manual de Uso - Ferramenta de Gestao de Projetos.docx
+++ b/Manual de Uso - Ferramenta de Gestao de Projetos.docx
@@ -129,7 +129,7 @@
           <w:color w:val="6A6A70"/>
           <w:sz w:val="22"/>
         </w:rPr>
-        <w:t>Versao 2.9 - 01 de agosto de 2026 (substitui a versao 2.8 de 01/08/2026)</w:t>
+        <w:t>Versao 2.10 - 03 de agosto de 2026 (substitui a versao 2.9 de 01/08/2026)</w:t>
       </w:r>
     </w:p>
     <w:p>
@@ -229,7 +229,7 @@
         <w:rPr>
           <w:noProof/>
         </w:rPr>
-        <w:instrText xml:space="preserve"> PAGEREF _Toc236515570 \h </w:instrText>
+        <w:instrText xml:space="preserve"> PAGEREF _Toc236645664 \h </w:instrText>
       </w:r>
       <w:r>
         <w:rPr>
@@ -290,7 +290,7 @@
         <w:rPr>
           <w:noProof/>
         </w:rPr>
-        <w:instrText xml:space="preserve"> PAGEREF _Toc236515571 \h </w:instrText>
+        <w:instrText xml:space="preserve"> PAGEREF _Toc236645665 \h </w:instrText>
       </w:r>
       <w:r>
         <w:rPr>
@@ -351,7 +351,7 @@
         <w:rPr>
           <w:noProof/>
         </w:rPr>
-        <w:instrText xml:space="preserve"> PAGEREF _Toc236515572 \h </w:instrText>
+        <w:instrText xml:space="preserve"> PAGEREF _Toc236645666 \h </w:instrText>
       </w:r>
       <w:r>
         <w:rPr>
@@ -412,7 +412,7 @@
         <w:rPr>
           <w:noProof/>
         </w:rPr>
-        <w:instrText xml:space="preserve"> PAGEREF _Toc236515573 \h </w:instrText>
+        <w:instrText xml:space="preserve"> PAGEREF _Toc236645667 \h </w:instrText>
       </w:r>
       <w:r>
         <w:rPr>
@@ -473,7 +473,7 @@
         <w:rPr>
           <w:noProof/>
         </w:rPr>
-        <w:instrText xml:space="preserve"> PAGEREF _Toc236515574 \h </w:instrText>
+        <w:instrText xml:space="preserve"> PAGEREF _Toc236645668 \h </w:instrText>
       </w:r>
       <w:r>
         <w:rPr>
@@ -534,7 +534,7 @@
         <w:rPr>
           <w:noProof/>
         </w:rPr>
-        <w:instrText xml:space="preserve"> PAGEREF _Toc236515575 \h </w:instrText>
+        <w:instrText xml:space="preserve"> PAGEREF _Toc236645669 \h </w:instrText>
       </w:r>
       <w:r>
         <w:rPr>
@@ -551,7 +551,7 @@
         <w:rPr>
           <w:noProof/>
         </w:rPr>
-        <w:t>9</w:t>
+        <w:t>10</w:t>
       </w:r>
       <w:r>
         <w:rPr>
@@ -595,7 +595,7 @@
         <w:rPr>
           <w:noProof/>
         </w:rPr>
-        <w:instrText xml:space="preserve"> PAGEREF _Toc236515576 \h </w:instrText>
+        <w:instrText xml:space="preserve"> PAGEREF _Toc236645670 \h </w:instrText>
       </w:r>
       <w:r>
         <w:rPr>
@@ -612,7 +612,7 @@
         <w:rPr>
           <w:noProof/>
         </w:rPr>
-        <w:t>9</w:t>
+        <w:t>10</w:t>
       </w:r>
       <w:r>
         <w:rPr>
@@ -656,7 +656,7 @@
         <w:rPr>
           <w:noProof/>
         </w:rPr>
-        <w:instrText xml:space="preserve"> PAGEREF _Toc236515577 \h </w:instrText>
+        <w:instrText xml:space="preserve"> PAGEREF _Toc236645671 \h </w:instrText>
       </w:r>
       <w:r>
         <w:rPr>
@@ -673,7 +673,7 @@
         <w:rPr>
           <w:noProof/>
         </w:rPr>
-        <w:t>9</w:t>
+        <w:t>10</w:t>
       </w:r>
       <w:r>
         <w:rPr>
@@ -717,7 +717,7 @@
         <w:rPr>
           <w:noProof/>
         </w:rPr>
-        <w:instrText xml:space="preserve"> PAGEREF _Toc236515578 \h </w:instrText>
+        <w:instrText xml:space="preserve"> PAGEREF _Toc236645672 \h </w:instrText>
       </w:r>
       <w:r>
         <w:rPr>
@@ -734,7 +734,7 @@
         <w:rPr>
           <w:noProof/>
         </w:rPr>
-        <w:t>9</w:t>
+        <w:t>10</w:t>
       </w:r>
       <w:r>
         <w:rPr>
@@ -778,7 +778,7 @@
         <w:rPr>
           <w:noProof/>
         </w:rPr>
-        <w:instrText xml:space="preserve"> PAGEREF _Toc236515579 \h </w:instrText>
+        <w:instrText xml:space="preserve"> PAGEREF _Toc236645673 \h </w:instrText>
       </w:r>
       <w:r>
         <w:rPr>
@@ -795,7 +795,7 @@
         <w:rPr>
           <w:noProof/>
         </w:rPr>
-        <w:t>10</w:t>
+        <w:t>11</w:t>
       </w:r>
       <w:r>
         <w:rPr>
@@ -839,7 +839,7 @@
         <w:rPr>
           <w:noProof/>
         </w:rPr>
-        <w:instrText xml:space="preserve"> PAGEREF _Toc236515580 \h </w:instrText>
+        <w:instrText xml:space="preserve"> PAGEREF _Toc236645674 \h </w:instrText>
       </w:r>
       <w:r>
         <w:rPr>
@@ -856,7 +856,7 @@
         <w:rPr>
           <w:noProof/>
         </w:rPr>
-        <w:t>11</w:t>
+        <w:t>12</w:t>
       </w:r>
       <w:r>
         <w:rPr>
@@ -900,7 +900,7 @@
         <w:rPr>
           <w:noProof/>
         </w:rPr>
-        <w:instrText xml:space="preserve"> PAGEREF _Toc236515581 \h </w:instrText>
+        <w:instrText xml:space="preserve"> PAGEREF _Toc236645675 \h </w:instrText>
       </w:r>
       <w:r>
         <w:rPr>
@@ -917,7 +917,7 @@
         <w:rPr>
           <w:noProof/>
         </w:rPr>
-        <w:t>13</w:t>
+        <w:t>14</w:t>
       </w:r>
       <w:r>
         <w:rPr>
@@ -961,7 +961,7 @@
         <w:rPr>
           <w:noProof/>
         </w:rPr>
-        <w:instrText xml:space="preserve"> PAGEREF _Toc236515582 \h </w:instrText>
+        <w:instrText xml:space="preserve"> PAGEREF _Toc236645676 \h </w:instrText>
       </w:r>
       <w:r>
         <w:rPr>
@@ -978,7 +978,7 @@
         <w:rPr>
           <w:noProof/>
         </w:rPr>
-        <w:t>14</w:t>
+        <w:t>15</w:t>
       </w:r>
       <w:r>
         <w:rPr>
@@ -1022,7 +1022,7 @@
         <w:rPr>
           <w:noProof/>
         </w:rPr>
-        <w:instrText xml:space="preserve"> PAGEREF _Toc236515583 \h </w:instrText>
+        <w:instrText xml:space="preserve"> PAGEREF _Toc236645677 \h </w:instrText>
       </w:r>
       <w:r>
         <w:rPr>
@@ -1039,7 +1039,7 @@
         <w:rPr>
           <w:noProof/>
         </w:rPr>
-        <w:t>15</w:t>
+        <w:t>16</w:t>
       </w:r>
       <w:r>
         <w:rPr>
@@ -1083,7 +1083,7 @@
         <w:rPr>
           <w:noProof/>
         </w:rPr>
-        <w:instrText xml:space="preserve"> PAGEREF _Toc236515584 \h </w:instrText>
+        <w:instrText xml:space="preserve"> PAGEREF _Toc236645678 \h </w:instrText>
       </w:r>
       <w:r>
         <w:rPr>
@@ -1100,7 +1100,7 @@
         <w:rPr>
           <w:noProof/>
         </w:rPr>
-        <w:t>16</w:t>
+        <w:t>17</w:t>
       </w:r>
       <w:r>
         <w:rPr>
@@ -1144,7 +1144,7 @@
         <w:rPr>
           <w:noProof/>
         </w:rPr>
-        <w:instrText xml:space="preserve"> PAGEREF _Toc236515585 \h </w:instrText>
+        <w:instrText xml:space="preserve"> PAGEREF _Toc236645679 \h </w:instrText>
       </w:r>
       <w:r>
         <w:rPr>
@@ -1161,7 +1161,7 @@
         <w:rPr>
           <w:noProof/>
         </w:rPr>
-        <w:t>16</w:t>
+        <w:t>17</w:t>
       </w:r>
       <w:r>
         <w:rPr>
@@ -1205,7 +1205,7 @@
         <w:rPr>
           <w:noProof/>
         </w:rPr>
-        <w:instrText xml:space="preserve"> PAGEREF _Toc236515586 \h </w:instrText>
+        <w:instrText xml:space="preserve"> PAGEREF _Toc236645680 \h </w:instrText>
       </w:r>
       <w:r>
         <w:rPr>
@@ -1222,7 +1222,7 @@
         <w:rPr>
           <w:noProof/>
         </w:rPr>
-        <w:t>19</w:t>
+        <w:t>20</w:t>
       </w:r>
       <w:r>
         <w:rPr>
@@ -1266,7 +1266,7 @@
         <w:rPr>
           <w:noProof/>
         </w:rPr>
-        <w:instrText xml:space="preserve"> PAGEREF _Toc236515587 \h </w:instrText>
+        <w:instrText xml:space="preserve"> PAGEREF _Toc236645681 \h </w:instrText>
       </w:r>
       <w:r>
         <w:rPr>
@@ -1283,7 +1283,7 @@
         <w:rPr>
           <w:noProof/>
         </w:rPr>
-        <w:t>21</w:t>
+        <w:t>22</w:t>
       </w:r>
       <w:r>
         <w:rPr>
@@ -1327,7 +1327,7 @@
         <w:rPr>
           <w:noProof/>
         </w:rPr>
-        <w:instrText xml:space="preserve"> PAGEREF _Toc236515588 \h </w:instrText>
+        <w:instrText xml:space="preserve"> PAGEREF _Toc236645682 \h </w:instrText>
       </w:r>
       <w:r>
         <w:rPr>
@@ -1344,7 +1344,7 @@
         <w:rPr>
           <w:noProof/>
         </w:rPr>
-        <w:t>24</w:t>
+        <w:t>25</w:t>
       </w:r>
       <w:r>
         <w:rPr>
@@ -1388,7 +1388,7 @@
         <w:rPr>
           <w:noProof/>
         </w:rPr>
-        <w:instrText xml:space="preserve"> PAGEREF _Toc236515589 \h </w:instrText>
+        <w:instrText xml:space="preserve"> PAGEREF _Toc236645683 \h </w:instrText>
       </w:r>
       <w:r>
         <w:rPr>
@@ -1405,7 +1405,7 @@
         <w:rPr>
           <w:noProof/>
         </w:rPr>
-        <w:t>26</w:t>
+        <w:t>27</w:t>
       </w:r>
       <w:r>
         <w:rPr>
@@ -1449,7 +1449,7 @@
         <w:rPr>
           <w:noProof/>
         </w:rPr>
-        <w:instrText xml:space="preserve"> PAGEREF _Toc236515590 \h </w:instrText>
+        <w:instrText xml:space="preserve"> PAGEREF _Toc236645684 \h </w:instrText>
       </w:r>
       <w:r>
         <w:rPr>
@@ -1466,7 +1466,7 @@
         <w:rPr>
           <w:noProof/>
         </w:rPr>
-        <w:t>29</w:t>
+        <w:t>30</w:t>
       </w:r>
       <w:r>
         <w:rPr>
@@ -1510,7 +1510,7 @@
         <w:rPr>
           <w:noProof/>
         </w:rPr>
-        <w:instrText xml:space="preserve"> PAGEREF _Toc236515591 \h </w:instrText>
+        <w:instrText xml:space="preserve"> PAGEREF _Toc236645685 \h </w:instrText>
       </w:r>
       <w:r>
         <w:rPr>
@@ -1527,7 +1527,7 @@
         <w:rPr>
           <w:noProof/>
         </w:rPr>
-        <w:t>31</w:t>
+        <w:t>32</w:t>
       </w:r>
       <w:r>
         <w:rPr>
@@ -1571,7 +1571,7 @@
         <w:rPr>
           <w:noProof/>
         </w:rPr>
-        <w:instrText xml:space="preserve"> PAGEREF _Toc236515592 \h </w:instrText>
+        <w:instrText xml:space="preserve"> PAGEREF _Toc236645686 \h </w:instrText>
       </w:r>
       <w:r>
         <w:rPr>
@@ -1588,7 +1588,7 @@
         <w:rPr>
           <w:noProof/>
         </w:rPr>
-        <w:t>34</w:t>
+        <w:t>35</w:t>
       </w:r>
       <w:r>
         <w:rPr>
@@ -1632,7 +1632,7 @@
         <w:rPr>
           <w:noProof/>
         </w:rPr>
-        <w:instrText xml:space="preserve"> PAGEREF _Toc236515593 \h </w:instrText>
+        <w:instrText xml:space="preserve"> PAGEREF _Toc236645687 \h </w:instrText>
       </w:r>
       <w:r>
         <w:rPr>
@@ -1649,7 +1649,7 @@
         <w:rPr>
           <w:noProof/>
         </w:rPr>
-        <w:t>35</w:t>
+        <w:t>36</w:t>
       </w:r>
       <w:r>
         <w:rPr>
@@ -1693,7 +1693,7 @@
         <w:rPr>
           <w:noProof/>
         </w:rPr>
-        <w:instrText xml:space="preserve"> PAGEREF _Toc236515594 \h </w:instrText>
+        <w:instrText xml:space="preserve"> PAGEREF _Toc236645688 \h </w:instrText>
       </w:r>
       <w:r>
         <w:rPr>
@@ -1710,7 +1710,7 @@
         <w:rPr>
           <w:noProof/>
         </w:rPr>
-        <w:t>37</w:t>
+        <w:t>38</w:t>
       </w:r>
       <w:r>
         <w:rPr>
@@ -1754,7 +1754,7 @@
         <w:rPr>
           <w:noProof/>
         </w:rPr>
-        <w:instrText xml:space="preserve"> PAGEREF _Toc236515595 \h </w:instrText>
+        <w:instrText xml:space="preserve"> PAGEREF _Toc236645689 \h </w:instrText>
       </w:r>
       <w:r>
         <w:rPr>
@@ -1771,7 +1771,7 @@
         <w:rPr>
           <w:noProof/>
         </w:rPr>
-        <w:t>39</w:t>
+        <w:t>40</w:t>
       </w:r>
       <w:r>
         <w:rPr>
@@ -1816,7 +1816,7 @@
         <w:rPr>
           <w:noProof/>
         </w:rPr>
-        <w:instrText xml:space="preserve"> PAGEREF _Toc236515596 \h </w:instrText>
+        <w:instrText xml:space="preserve"> PAGEREF _Toc236645690 \h </w:instrText>
       </w:r>
       <w:r>
         <w:rPr>
@@ -1833,7 +1833,7 @@
         <w:rPr>
           <w:noProof/>
         </w:rPr>
-        <w:t>39</w:t>
+        <w:t>40</w:t>
       </w:r>
       <w:r>
         <w:rPr>
@@ -1877,7 +1877,7 @@
         <w:rPr>
           <w:noProof/>
         </w:rPr>
-        <w:instrText xml:space="preserve"> PAGEREF _Toc236515597 \h </w:instrText>
+        <w:instrText xml:space="preserve"> PAGEREF _Toc236645691 \h </w:instrText>
       </w:r>
       <w:r>
         <w:rPr>
@@ -1894,7 +1894,7 @@
         <w:rPr>
           <w:noProof/>
         </w:rPr>
-        <w:t>45</w:t>
+        <w:t>46</w:t>
       </w:r>
       <w:r>
         <w:rPr>
@@ -1938,7 +1938,7 @@
         <w:rPr>
           <w:noProof/>
         </w:rPr>
-        <w:instrText xml:space="preserve"> PAGEREF _Toc236515598 \h </w:instrText>
+        <w:instrText xml:space="preserve"> PAGEREF _Toc236645692 \h </w:instrText>
       </w:r>
       <w:r>
         <w:rPr>
@@ -1955,7 +1955,7 @@
         <w:rPr>
           <w:noProof/>
         </w:rPr>
-        <w:t>50</w:t>
+        <w:t>51</w:t>
       </w:r>
       <w:r>
         <w:rPr>
@@ -1999,7 +1999,7 @@
         <w:rPr>
           <w:noProof/>
         </w:rPr>
-        <w:instrText xml:space="preserve"> PAGEREF _Toc236515599 \h </w:instrText>
+        <w:instrText xml:space="preserve"> PAGEREF _Toc236645693 \h </w:instrText>
       </w:r>
       <w:r>
         <w:rPr>
@@ -2016,7 +2016,7 @@
         <w:rPr>
           <w:noProof/>
         </w:rPr>
-        <w:t>50</w:t>
+        <w:t>51</w:t>
       </w:r>
       <w:r>
         <w:rPr>
@@ -2060,7 +2060,7 @@
         <w:rPr>
           <w:noProof/>
         </w:rPr>
-        <w:instrText xml:space="preserve"> PAGEREF _Toc236515600 \h </w:instrText>
+        <w:instrText xml:space="preserve"> PAGEREF _Toc236645694 \h </w:instrText>
       </w:r>
       <w:r>
         <w:rPr>
@@ -2077,7 +2077,7 @@
         <w:rPr>
           <w:noProof/>
         </w:rPr>
-        <w:t>51</w:t>
+        <w:t>52</w:t>
       </w:r>
       <w:r>
         <w:rPr>
@@ -2121,7 +2121,7 @@
         <w:rPr>
           <w:noProof/>
         </w:rPr>
-        <w:instrText xml:space="preserve"> PAGEREF _Toc236515601 \h </w:instrText>
+        <w:instrText xml:space="preserve"> PAGEREF _Toc236645695 \h </w:instrText>
       </w:r>
       <w:r>
         <w:rPr>
@@ -2138,7 +2138,7 @@
         <w:rPr>
           <w:noProof/>
         </w:rPr>
-        <w:t>51</w:t>
+        <w:t>52</w:t>
       </w:r>
       <w:r>
         <w:rPr>
@@ -2164,7 +2164,7 @@
           <w:noProof/>
           <w:color w:val="1A1A1A"/>
         </w:rPr>
-        <w:t>6. Administracao do sistema</w:t>
+        <w:t>6. Administracao e Painel Executivo</w:t>
       </w:r>
       <w:r>
         <w:rPr>
@@ -2182,7 +2182,7 @@
         <w:rPr>
           <w:noProof/>
         </w:rPr>
-        <w:instrText xml:space="preserve"> PAGEREF _Toc236515602 \h </w:instrText>
+        <w:instrText xml:space="preserve"> PAGEREF _Toc236645696 \h </w:instrText>
       </w:r>
       <w:r>
         <w:rPr>
@@ -2199,7 +2199,7 @@
         <w:rPr>
           <w:noProof/>
         </w:rPr>
-        <w:t>54</w:t>
+        <w:t>55</w:t>
       </w:r>
       <w:r>
         <w:rPr>
@@ -2243,7 +2243,7 @@
         <w:rPr>
           <w:noProof/>
         </w:rPr>
-        <w:instrText xml:space="preserve"> PAGEREF _Toc236515603 \h </w:instrText>
+        <w:instrText xml:space="preserve"> PAGEREF _Toc236645697 \h </w:instrText>
       </w:r>
       <w:r>
         <w:rPr>
@@ -2260,7 +2260,7 @@
         <w:rPr>
           <w:noProof/>
         </w:rPr>
-        <w:t>54</w:t>
+        <w:t>55</w:t>
       </w:r>
       <w:r>
         <w:rPr>
@@ -2304,7 +2304,7 @@
         <w:rPr>
           <w:noProof/>
         </w:rPr>
-        <w:instrText xml:space="preserve"> PAGEREF _Toc236515604 \h </w:instrText>
+        <w:instrText xml:space="preserve"> PAGEREF _Toc236645698 \h </w:instrText>
       </w:r>
       <w:r>
         <w:rPr>
@@ -2321,7 +2321,7 @@
         <w:rPr>
           <w:noProof/>
         </w:rPr>
-        <w:t>54</w:t>
+        <w:t>56</w:t>
       </w:r>
       <w:r>
         <w:rPr>
@@ -2365,7 +2365,7 @@
         <w:rPr>
           <w:noProof/>
         </w:rPr>
-        <w:instrText xml:space="preserve"> PAGEREF _Toc236515605 \h </w:instrText>
+        <w:instrText xml:space="preserve"> PAGEREF _Toc236645699 \h </w:instrText>
       </w:r>
       <w:r>
         <w:rPr>
@@ -2382,7 +2382,68 @@
         <w:rPr>
           <w:noProof/>
         </w:rPr>
-        <w:t>55</w:t>
+        <w:t>56</w:t>
+      </w:r>
+      <w:r>
+        <w:rPr>
+          <w:noProof/>
+        </w:rPr>
+        <w:fldChar w:fldCharType="end"/>
+      </w:r>
+    </w:p>
+    <w:p>
+      <w:pPr>
+        <w:pStyle w:val="Sumrio2"/>
+        <w:tabs>
+          <w:tab w:val="right" w:leader="dot" w:pos="8828"/>
+        </w:tabs>
+        <w:rPr>
+          <w:noProof/>
+        </w:rPr>
+      </w:pPr>
+      <w:r>
+        <w:rPr>
+          <w:rFonts w:ascii="Montserrat" w:hAnsi="Montserrat"/>
+          <w:b/>
+          <w:noProof/>
+          <w:color w:val="B91D2E"/>
+        </w:rPr>
+        <w:t>6.4 Painel Executivo</w:t>
+      </w:r>
+      <w:r>
+        <w:rPr>
+          <w:noProof/>
+        </w:rPr>
+        <w:tab/>
+      </w:r>
+      <w:r>
+        <w:rPr>
+          <w:noProof/>
+        </w:rPr>
+        <w:fldChar w:fldCharType="begin"/>
+      </w:r>
+      <w:r>
+        <w:rPr>
+          <w:noProof/>
+        </w:rPr>
+        <w:instrText xml:space="preserve"> PAGEREF _Toc236645700 \h </w:instrText>
+      </w:r>
+      <w:r>
+        <w:rPr>
+          <w:noProof/>
+        </w:rPr>
+      </w:r>
+      <w:r>
+        <w:rPr>
+          <w:noProof/>
+        </w:rPr>
+        <w:fldChar w:fldCharType="separate"/>
+      </w:r>
+      <w:r>
+        <w:rPr>
+          <w:noProof/>
+        </w:rPr>
+        <w:t>57</w:t>
       </w:r>
       <w:r>
         <w:rPr>
@@ -2426,7 +2487,7 @@
         <w:rPr>
           <w:noProof/>
         </w:rPr>
-        <w:instrText xml:space="preserve"> PAGEREF _Toc236515606 \h </w:instrText>
+        <w:instrText xml:space="preserve"> PAGEREF _Toc236645701 \h </w:instrText>
       </w:r>
       <w:r>
         <w:rPr>
@@ -2443,7 +2504,7 @@
         <w:rPr>
           <w:noProof/>
         </w:rPr>
-        <w:t>57</w:t>
+        <w:t>60</w:t>
       </w:r>
       <w:r>
         <w:rPr>
@@ -2487,7 +2548,7 @@
         <w:rPr>
           <w:noProof/>
         </w:rPr>
-        <w:instrText xml:space="preserve"> PAGEREF _Toc236515607 \h </w:instrText>
+        <w:instrText xml:space="preserve"> PAGEREF _Toc236645702 \h </w:instrText>
       </w:r>
       <w:r>
         <w:rPr>
@@ -2504,7 +2565,7 @@
         <w:rPr>
           <w:noProof/>
         </w:rPr>
-        <w:t>58</w:t>
+        <w:t>61</w:t>
       </w:r>
       <w:r>
         <w:rPr>
@@ -2563,7 +2624,7 @@
           <w:sz w:val="34"/>
         </w:rPr>
       </w:pPr>
-      <w:bookmarkStart w:id="0" w:name="_Toc236515570"/>
+      <w:bookmarkStart w:id="0" w:name="_Toc236645664"/>
       <w:r>
         <w:rPr>
           <w:rFonts w:ascii="Montserrat" w:hAnsi="Montserrat"/>
@@ -2587,7 +2648,7 @@
           <w:sz w:val="27"/>
         </w:rPr>
       </w:pPr>
-      <w:bookmarkStart w:id="1" w:name="_Toc236515571"/>
+      <w:bookmarkStart w:id="1" w:name="_Toc236645665"/>
       <w:r>
         <w:rPr>
           <w:rFonts w:ascii="Montserrat" w:hAnsi="Montserrat"/>
@@ -2821,6 +2882,24 @@
           <w:color w:val="1A1A1A"/>
           <w:sz w:val="22"/>
         </w:rPr>
+        <w:t>Esta e a versao 2.10 do manual. Em relacao a versao 2.9 (01/08/2026), foi adicionada a nova secao 6.4 - Painel Executivo: uma 15a pagina, restrita a Admin, que agrega em tempo real os 10 formularios de registro e os 2 relatorios numa unica tela (gates de aprovacao, entraves/encaminhamentos/resultados, contagem por formulario e portfolio de projetos), sem exigir nenhuma mudanca no banco de dados.</w:t>
+      </w:r>
+    </w:p>
+    <w:p>
+      <w:pPr>
+        <w:spacing w:line="280" w:lineRule="auto"/>
+        <w:rPr>
+          <w:rFonts w:ascii="Montserrat" w:hAnsi="Montserrat"/>
+          <w:color w:val="1A1A1A"/>
+          <w:sz w:val="22"/>
+        </w:rPr>
+      </w:pPr>
+      <w:r>
+        <w:rPr>
+          <w:rFonts w:ascii="Montserrat" w:hAnsi="Montserrat"/>
+          <w:color w:val="1A1A1A"/>
+          <w:sz w:val="22"/>
+        </w:rPr>
         <w:t>O manual nao substitui as Diretrizes para a Gestao de Projetos da UNIALFA (documento institucional que define o framework D01 a D07) nem o documento Regras de Acesso e Permissoes (que detalha cada regra de controle de acesso); ele e o guia operacional de como usar cada ferramenta na pratica.</w:t>
       </w:r>
     </w:p>
@@ -2835,7 +2914,7 @@
           <w:sz w:val="27"/>
         </w:rPr>
       </w:pPr>
-      <w:bookmarkStart w:id="2" w:name="_Toc236515572"/>
+      <w:bookmarkStart w:id="2" w:name="_Toc236645666"/>
       <w:r>
         <w:rPr>
           <w:rFonts w:ascii="Montserrat" w:hAnsi="Montserrat"/>
@@ -2862,7 +2941,7 @@
           <w:color w:val="1A1A1A"/>
           <w:sz w:val="22"/>
         </w:rPr>
-        <w:t>A ferramenta e composta por 14 paginas eletronicas independentes:</w:t>
+        <w:t>A ferramenta e composta por 15 paginas eletronicas independentes:</w:t>
       </w:r>
     </w:p>
     <w:p>
@@ -2886,6 +2965,7 @@
           <w:color w:val="1A1A1A"/>
           <w:sz w:val="22"/>
         </w:rPr>
+        <w:lastRenderedPageBreak/>
         <w:t>12 formularios de registro (codigo FORALF), cada um correspondendo a um artefato institucional - da Solicitacao de Demanda ao Relatorio de Entregas e Beneficios.</w:t>
       </w:r>
     </w:p>
@@ -2934,8 +3014,31 @@
           <w:color w:val="1A1A1A"/>
           <w:sz w:val="22"/>
         </w:rPr>
-        <w:lastRenderedPageBreak/>
         <w:t>1 pagina de Administracao, restrita a Admin, para gerenciar usuarios, equipes e configuracoes do sistema.</w:t>
+      </w:r>
+    </w:p>
+    <w:p>
+      <w:pPr>
+        <w:pStyle w:val="PargrafodaLista"/>
+        <w:numPr>
+          <w:ilvl w:val="0"/>
+          <w:numId w:val="1"/>
+        </w:numPr>
+        <w:spacing w:after="80" w:line="260" w:lineRule="auto"/>
+        <w:ind w:left="700"/>
+        <w:rPr>
+          <w:rFonts w:ascii="Montserrat" w:hAnsi="Montserrat"/>
+          <w:color w:val="1A1A1A"/>
+          <w:sz w:val="22"/>
+        </w:rPr>
+      </w:pPr>
+      <w:r>
+        <w:rPr>
+          <w:rFonts w:ascii="Montserrat" w:hAnsi="Montserrat"/>
+          <w:color w:val="1A1A1A"/>
+          <w:sz w:val="22"/>
+        </w:rPr>
+        <w:t>1 Painel Executivo, tambem restrito a Admin, com a visao agregada de todo o sistema (secao 6.4).</w:t>
       </w:r>
     </w:p>
     <w:p>
@@ -2983,17 +3086,18 @@
         <w:rPr>
           <w:noProof/>
         </w:rPr>
+        <w:lastRenderedPageBreak/>
         <w:drawing>
-          <wp:inline distT="0" distB="0" distL="0" distR="0" wp14:anchorId="4567582A" wp14:editId="2AAAA7EE">
+          <wp:inline distT="0" distB="0" distL="0" distR="0" wp14:anchorId="365AA1D2" wp14:editId="19085A4D">
             <wp:extent cx="5303520" cy="4792851"/>
             <wp:effectExtent l="19050" t="19050" r="11430" b="27305"/>
-            <wp:docPr id="1930247828" name="Imagem 1"/>
+            <wp:docPr id="2138412365" name="Imagem 1"/>
             <wp:cNvGraphicFramePr/>
             <a:graphic xmlns:a="http://schemas.openxmlformats.org/drawingml/2006/main">
               <a:graphicData uri="http://schemas.openxmlformats.org/drawingml/2006/picture">
                 <pic:pic xmlns:pic="http://schemas.openxmlformats.org/drawingml/2006/picture">
                   <pic:nvPicPr>
-                    <pic:cNvPr id="1930247828" name=""/>
+                    <pic:cNvPr id="2138412365" name=""/>
                     <pic:cNvPicPr/>
                   </pic:nvPicPr>
                   <pic:blipFill>
@@ -3061,7 +3165,7 @@
           <w:sz w:val="27"/>
         </w:rPr>
       </w:pPr>
-      <w:bookmarkStart w:id="3" w:name="_Toc236515573"/>
+      <w:bookmarkStart w:id="3" w:name="_Toc236645667"/>
       <w:r>
         <w:rPr>
           <w:rFonts w:ascii="Montserrat" w:hAnsi="Montserrat"/>
@@ -3069,7 +3173,6 @@
           <w:color w:val="B91D2E"/>
           <w:sz w:val="27"/>
         </w:rPr>
-        <w:lastRenderedPageBreak/>
         <w:t>1.3 Como acessar e fazer login</w:t>
       </w:r>
       <w:bookmarkEnd w:id="3"/>
@@ -3101,17 +3204,18 @@
         <w:rPr>
           <w:noProof/>
         </w:rPr>
+        <w:lastRenderedPageBreak/>
         <w:drawing>
-          <wp:inline distT="0" distB="0" distL="0" distR="0" wp14:anchorId="2DB46300" wp14:editId="72F5776E">
+          <wp:inline distT="0" distB="0" distL="0" distR="0" wp14:anchorId="039D9ACB" wp14:editId="533BEA03">
             <wp:extent cx="4206240" cy="3801227"/>
             <wp:effectExtent l="19050" t="19050" r="22860" b="27940"/>
-            <wp:docPr id="1270871972" name="Imagem 2"/>
+            <wp:docPr id="1593864527" name="Imagem 2"/>
             <wp:cNvGraphicFramePr/>
             <a:graphic xmlns:a="http://schemas.openxmlformats.org/drawingml/2006/main">
               <a:graphicData uri="http://schemas.openxmlformats.org/drawingml/2006/picture">
                 <pic:pic xmlns:pic="http://schemas.openxmlformats.org/drawingml/2006/picture">
                   <pic:nvPicPr>
-                    <pic:cNvPr id="1270871972" name=""/>
+                    <pic:cNvPr id="1593864527" name=""/>
                     <pic:cNvPicPr/>
                   </pic:nvPicPr>
                   <pic:blipFill>
@@ -3284,7 +3388,7 @@
           <w:sz w:val="27"/>
         </w:rPr>
       </w:pPr>
-      <w:bookmarkStart w:id="4" w:name="_Toc236515574"/>
+      <w:bookmarkStart w:id="4" w:name="_Toc236645668"/>
       <w:r>
         <w:rPr>
           <w:rFonts w:ascii="Montserrat" w:hAnsi="Montserrat"/>
@@ -3292,7 +3396,6 @@
           <w:color w:val="B91D2E"/>
           <w:sz w:val="27"/>
         </w:rPr>
-        <w:lastRenderedPageBreak/>
         <w:t>1.4 Como a ferramenta se relaciona com as Diretrizes (D01-D07)</w:t>
       </w:r>
       <w:bookmarkEnd w:id="4"/>
@@ -3361,6 +3464,7 @@
                 <w:color w:val="FFFFFF"/>
                 <w:sz w:val="19"/>
               </w:rPr>
+              <w:lastRenderedPageBreak/>
               <w:t>Passo</w:t>
             </w:r>
           </w:p>
@@ -4433,7 +4537,7 @@
           <w:sz w:val="34"/>
         </w:rPr>
       </w:pPr>
-      <w:bookmarkStart w:id="5" w:name="_Toc236515575"/>
+      <w:bookmarkStart w:id="5" w:name="_Toc236645669"/>
       <w:r>
         <w:rPr>
           <w:rFonts w:ascii="Montserrat" w:hAnsi="Montserrat"/>
@@ -4457,7 +4561,7 @@
           <w:sz w:val="27"/>
         </w:rPr>
       </w:pPr>
-      <w:bookmarkStart w:id="6" w:name="_Toc236515576"/>
+      <w:bookmarkStart w:id="6" w:name="_Toc236645670"/>
       <w:r>
         <w:rPr>
           <w:rFonts w:ascii="Montserrat" w:hAnsi="Montserrat"/>
@@ -4498,7 +4602,7 @@
           <w:sz w:val="27"/>
         </w:rPr>
       </w:pPr>
-      <w:bookmarkStart w:id="7" w:name="_Toc236515577"/>
+      <w:bookmarkStart w:id="7" w:name="_Toc236645671"/>
       <w:r>
         <w:rPr>
           <w:rFonts w:ascii="Montserrat" w:hAnsi="Montserrat"/>
@@ -4617,7 +4721,7 @@
           <w:sz w:val="27"/>
         </w:rPr>
       </w:pPr>
-      <w:bookmarkStart w:id="8" w:name="_Toc236515578"/>
+      <w:bookmarkStart w:id="8" w:name="_Toc236645672"/>
       <w:r>
         <w:rPr>
           <w:rFonts w:ascii="Montserrat" w:hAnsi="Montserrat"/>
@@ -5188,7 +5292,7 @@
           <w:sz w:val="27"/>
         </w:rPr>
       </w:pPr>
-      <w:bookmarkStart w:id="9" w:name="_Toc236515579"/>
+      <w:bookmarkStart w:id="9" w:name="_Toc236645673"/>
       <w:r>
         <w:rPr>
           <w:rFonts w:ascii="Montserrat" w:hAnsi="Montserrat"/>
@@ -5277,16 +5381,16 @@
         </w:rPr>
         <w:lastRenderedPageBreak/>
         <w:drawing>
-          <wp:inline distT="0" distB="0" distL="0" distR="0" wp14:anchorId="09625AFD" wp14:editId="09474D89">
+          <wp:inline distT="0" distB="0" distL="0" distR="0" wp14:anchorId="73FFE82E" wp14:editId="26F96081">
             <wp:extent cx="4937760" cy="4462310"/>
             <wp:effectExtent l="19050" t="19050" r="15240" b="14605"/>
-            <wp:docPr id="1280245017" name="Imagem 3"/>
+            <wp:docPr id="263196523" name="Imagem 3"/>
             <wp:cNvGraphicFramePr/>
             <a:graphic xmlns:a="http://schemas.openxmlformats.org/drawingml/2006/main">
               <a:graphicData uri="http://schemas.openxmlformats.org/drawingml/2006/picture">
                 <pic:pic xmlns:pic="http://schemas.openxmlformats.org/drawingml/2006/picture">
                   <pic:nvPicPr>
-                    <pic:cNvPr id="1280245017" name=""/>
+                    <pic:cNvPr id="263196523" name=""/>
                     <pic:cNvPicPr/>
                   </pic:nvPicPr>
                   <pic:blipFill>
@@ -5354,7 +5458,7 @@
           <w:sz w:val="27"/>
         </w:rPr>
       </w:pPr>
-      <w:bookmarkStart w:id="10" w:name="_Toc236515580"/>
+      <w:bookmarkStart w:id="10" w:name="_Toc236645674"/>
       <w:r>
         <w:rPr>
           <w:rFonts w:ascii="Montserrat" w:hAnsi="Montserrat"/>
@@ -5395,16 +5499,16 @@
         </w:rPr>
         <w:lastRenderedPageBreak/>
         <w:drawing>
-          <wp:inline distT="0" distB="0" distL="0" distR="0" wp14:anchorId="3FD2EDA8" wp14:editId="06A6B476">
+          <wp:inline distT="0" distB="0" distL="0" distR="0" wp14:anchorId="6CF2E19E" wp14:editId="19E910FD">
             <wp:extent cx="5120640" cy="4627581"/>
             <wp:effectExtent l="19050" t="19050" r="22860" b="20955"/>
-            <wp:docPr id="1708522870" name="Imagem 4"/>
+            <wp:docPr id="601396218" name="Imagem 4"/>
             <wp:cNvGraphicFramePr/>
             <a:graphic xmlns:a="http://schemas.openxmlformats.org/drawingml/2006/main">
               <a:graphicData uri="http://schemas.openxmlformats.org/drawingml/2006/picture">
                 <pic:pic xmlns:pic="http://schemas.openxmlformats.org/drawingml/2006/picture">
                   <pic:nvPicPr>
-                    <pic:cNvPr id="1708522870" name=""/>
+                    <pic:cNvPr id="601396218" name=""/>
                     <pic:cNvPicPr/>
                   </pic:nvPicPr>
                   <pic:blipFill>
@@ -5541,7 +5645,7 @@
           <w:sz w:val="27"/>
         </w:rPr>
       </w:pPr>
-      <w:bookmarkStart w:id="11" w:name="_Toc236515581"/>
+      <w:bookmarkStart w:id="11" w:name="_Toc236645675"/>
       <w:r>
         <w:rPr>
           <w:rFonts w:ascii="Montserrat" w:hAnsi="Montserrat"/>
@@ -5582,16 +5686,16 @@
           <w:noProof/>
         </w:rPr>
         <w:drawing>
-          <wp:inline distT="0" distB="0" distL="0" distR="0" wp14:anchorId="0F70C177" wp14:editId="2A2F484D">
+          <wp:inline distT="0" distB="0" distL="0" distR="0" wp14:anchorId="5C59F4D8" wp14:editId="46FF8270">
             <wp:extent cx="4206240" cy="3801227"/>
             <wp:effectExtent l="19050" t="19050" r="22860" b="27940"/>
-            <wp:docPr id="2117034350" name="Imagem 5"/>
+            <wp:docPr id="1842096392" name="Imagem 5"/>
             <wp:cNvGraphicFramePr/>
             <a:graphic xmlns:a="http://schemas.openxmlformats.org/drawingml/2006/main">
               <a:graphicData uri="http://schemas.openxmlformats.org/drawingml/2006/picture">
                 <pic:pic xmlns:pic="http://schemas.openxmlformats.org/drawingml/2006/picture">
                   <pic:nvPicPr>
-                    <pic:cNvPr id="2117034350" name=""/>
+                    <pic:cNvPr id="1842096392" name=""/>
                     <pic:cNvPicPr/>
                   </pic:nvPicPr>
                   <pic:blipFill>
@@ -5659,16 +5763,16 @@
         </w:rPr>
         <w:lastRenderedPageBreak/>
         <w:drawing>
-          <wp:inline distT="0" distB="0" distL="0" distR="0" wp14:anchorId="714CF057" wp14:editId="29512CC5">
+          <wp:inline distT="0" distB="0" distL="0" distR="0" wp14:anchorId="130506CF" wp14:editId="06996D37">
             <wp:extent cx="4206240" cy="3801227"/>
             <wp:effectExtent l="19050" t="19050" r="22860" b="27940"/>
-            <wp:docPr id="1049003719" name="Imagem 6"/>
+            <wp:docPr id="39874830" name="Imagem 6"/>
             <wp:cNvGraphicFramePr/>
             <a:graphic xmlns:a="http://schemas.openxmlformats.org/drawingml/2006/main">
               <a:graphicData uri="http://schemas.openxmlformats.org/drawingml/2006/picture">
                 <pic:pic xmlns:pic="http://schemas.openxmlformats.org/drawingml/2006/picture">
                   <pic:nvPicPr>
-                    <pic:cNvPr id="1049003719" name=""/>
+                    <pic:cNvPr id="39874830" name=""/>
                     <pic:cNvPicPr/>
                   </pic:nvPicPr>
                   <pic:blipFill>
@@ -5784,7 +5888,7 @@
           <w:sz w:val="27"/>
         </w:rPr>
       </w:pPr>
-      <w:bookmarkStart w:id="12" w:name="_Toc236515582"/>
+      <w:bookmarkStart w:id="12" w:name="_Toc236645676"/>
       <w:r>
         <w:rPr>
           <w:rFonts w:ascii="Montserrat" w:hAnsi="Montserrat"/>
@@ -5852,7 +5956,7 @@
           <w:sz w:val="27"/>
         </w:rPr>
       </w:pPr>
-      <w:bookmarkStart w:id="13" w:name="_Toc236515583"/>
+      <w:bookmarkStart w:id="13" w:name="_Toc236645677"/>
       <w:r>
         <w:rPr>
           <w:rFonts w:ascii="Montserrat" w:hAnsi="Montserrat"/>
@@ -6059,7 +6163,7 @@
           <w:sz w:val="34"/>
         </w:rPr>
       </w:pPr>
-      <w:bookmarkStart w:id="14" w:name="_Toc236515584"/>
+      <w:bookmarkStart w:id="14" w:name="_Toc236645678"/>
       <w:r>
         <w:rPr>
           <w:rFonts w:ascii="Montserrat" w:hAnsi="Montserrat"/>
@@ -6101,7 +6205,7 @@
           <w:sz w:val="27"/>
         </w:rPr>
       </w:pPr>
-      <w:bookmarkStart w:id="15" w:name="_Toc236515585"/>
+      <w:bookmarkStart w:id="15" w:name="_Toc236645679"/>
       <w:r>
         <w:rPr>
           <w:rFonts w:ascii="Montserrat" w:hAnsi="Montserrat"/>
@@ -6961,16 +7065,16 @@
         </w:rPr>
         <w:lastRenderedPageBreak/>
         <w:drawing>
-          <wp:inline distT="0" distB="0" distL="0" distR="0" wp14:anchorId="56A6C27B" wp14:editId="6123A775">
+          <wp:inline distT="0" distB="0" distL="0" distR="0" wp14:anchorId="11DF4E22" wp14:editId="2148E94A">
             <wp:extent cx="5120640" cy="4627581"/>
             <wp:effectExtent l="19050" t="19050" r="22860" b="20955"/>
-            <wp:docPr id="2094115796" name="Imagem 7"/>
+            <wp:docPr id="42761739" name="Imagem 7"/>
             <wp:cNvGraphicFramePr/>
             <a:graphic xmlns:a="http://schemas.openxmlformats.org/drawingml/2006/main">
               <a:graphicData uri="http://schemas.openxmlformats.org/drawingml/2006/picture">
                 <pic:pic xmlns:pic="http://schemas.openxmlformats.org/drawingml/2006/picture">
                   <pic:nvPicPr>
-                    <pic:cNvPr id="2094115796" name=""/>
+                    <pic:cNvPr id="42761739" name=""/>
                     <pic:cNvPicPr/>
                   </pic:nvPicPr>
                   <pic:blipFill>
@@ -7038,16 +7142,16 @@
         </w:rPr>
         <w:lastRenderedPageBreak/>
         <w:drawing>
-          <wp:inline distT="0" distB="0" distL="0" distR="0" wp14:anchorId="55110B2A" wp14:editId="24845534">
+          <wp:inline distT="0" distB="0" distL="0" distR="0" wp14:anchorId="1E172DCD" wp14:editId="30CB0315">
             <wp:extent cx="5120640" cy="4627581"/>
             <wp:effectExtent l="19050" t="19050" r="22860" b="20955"/>
-            <wp:docPr id="740215593" name="Imagem 8"/>
+            <wp:docPr id="1847748819" name="Imagem 8"/>
             <wp:cNvGraphicFramePr/>
             <a:graphic xmlns:a="http://schemas.openxmlformats.org/drawingml/2006/main">
               <a:graphicData uri="http://schemas.openxmlformats.org/drawingml/2006/picture">
                 <pic:pic xmlns:pic="http://schemas.openxmlformats.org/drawingml/2006/picture">
                   <pic:nvPicPr>
-                    <pic:cNvPr id="740215593" name=""/>
+                    <pic:cNvPr id="1847748819" name=""/>
                     <pic:cNvPicPr/>
                   </pic:nvPicPr>
                   <pic:blipFill>
@@ -7182,7 +7286,7 @@
           <w:sz w:val="27"/>
         </w:rPr>
       </w:pPr>
-      <w:bookmarkStart w:id="16" w:name="_Toc236515586"/>
+      <w:bookmarkStart w:id="16" w:name="_Toc236645680"/>
       <w:r>
         <w:rPr>
           <w:rFonts w:ascii="Montserrat" w:hAnsi="Montserrat"/>
@@ -8043,16 +8147,16 @@
         </w:rPr>
         <w:lastRenderedPageBreak/>
         <w:drawing>
-          <wp:inline distT="0" distB="0" distL="0" distR="0" wp14:anchorId="3020F122" wp14:editId="50F0627F">
+          <wp:inline distT="0" distB="0" distL="0" distR="0" wp14:anchorId="5F2E0B42" wp14:editId="1C3B52B4">
             <wp:extent cx="5120640" cy="4627581"/>
             <wp:effectExtent l="19050" t="19050" r="22860" b="20955"/>
-            <wp:docPr id="1889833876" name="Imagem 9"/>
+            <wp:docPr id="612721388" name="Imagem 9"/>
             <wp:cNvGraphicFramePr/>
             <a:graphic xmlns:a="http://schemas.openxmlformats.org/drawingml/2006/main">
               <a:graphicData uri="http://schemas.openxmlformats.org/drawingml/2006/picture">
                 <pic:pic xmlns:pic="http://schemas.openxmlformats.org/drawingml/2006/picture">
                   <pic:nvPicPr>
-                    <pic:cNvPr id="1889833876" name=""/>
+                    <pic:cNvPr id="612721388" name=""/>
                     <pic:cNvPicPr/>
                   </pic:nvPicPr>
                   <pic:blipFill>
@@ -8120,16 +8224,16 @@
         </w:rPr>
         <w:lastRenderedPageBreak/>
         <w:drawing>
-          <wp:inline distT="0" distB="0" distL="0" distR="0" wp14:anchorId="696BF258" wp14:editId="4A51577D">
+          <wp:inline distT="0" distB="0" distL="0" distR="0" wp14:anchorId="0AA560ED" wp14:editId="6FD6E4AE">
             <wp:extent cx="5120640" cy="4627581"/>
             <wp:effectExtent l="19050" t="19050" r="22860" b="20955"/>
-            <wp:docPr id="546788025" name="Imagem 10"/>
+            <wp:docPr id="175429368" name="Imagem 10"/>
             <wp:cNvGraphicFramePr/>
             <a:graphic xmlns:a="http://schemas.openxmlformats.org/drawingml/2006/main">
               <a:graphicData uri="http://schemas.openxmlformats.org/drawingml/2006/picture">
                 <pic:pic xmlns:pic="http://schemas.openxmlformats.org/drawingml/2006/picture">
                   <pic:nvPicPr>
-                    <pic:cNvPr id="546788025" name=""/>
+                    <pic:cNvPr id="175429368" name=""/>
                     <pic:cNvPicPr/>
                   </pic:nvPicPr>
                   <pic:blipFill>
@@ -8215,7 +8319,7 @@
           <w:sz w:val="27"/>
         </w:rPr>
       </w:pPr>
-      <w:bookmarkStart w:id="17" w:name="_Toc236515587"/>
+      <w:bookmarkStart w:id="17" w:name="_Toc236645681"/>
       <w:r>
         <w:rPr>
           <w:rFonts w:ascii="Montserrat" w:hAnsi="Montserrat"/>
@@ -9183,16 +9287,16 @@
         </w:rPr>
         <w:lastRenderedPageBreak/>
         <w:drawing>
-          <wp:inline distT="0" distB="0" distL="0" distR="0" wp14:anchorId="0445EACF" wp14:editId="24B2E7B1">
+          <wp:inline distT="0" distB="0" distL="0" distR="0" wp14:anchorId="202874A3" wp14:editId="5FB9B5C4">
             <wp:extent cx="5120640" cy="3282818"/>
             <wp:effectExtent l="19050" t="19050" r="22860" b="13335"/>
-            <wp:docPr id="694589432" name="Imagem 11"/>
+            <wp:docPr id="762583330" name="Imagem 11"/>
             <wp:cNvGraphicFramePr/>
             <a:graphic xmlns:a="http://schemas.openxmlformats.org/drawingml/2006/main">
               <a:graphicData uri="http://schemas.openxmlformats.org/drawingml/2006/picture">
                 <pic:pic xmlns:pic="http://schemas.openxmlformats.org/drawingml/2006/picture">
                   <pic:nvPicPr>
-                    <pic:cNvPr id="694589432" name=""/>
+                    <pic:cNvPr id="762583330" name=""/>
                     <pic:cNvPicPr/>
                   </pic:nvPicPr>
                   <pic:blipFill>
@@ -9260,16 +9364,16 @@
         </w:rPr>
         <w:lastRenderedPageBreak/>
         <w:drawing>
-          <wp:inline distT="0" distB="0" distL="0" distR="0" wp14:anchorId="271F3BCC" wp14:editId="0280A067">
+          <wp:inline distT="0" distB="0" distL="0" distR="0" wp14:anchorId="5ADD43E8" wp14:editId="177BD9E9">
             <wp:extent cx="5120640" cy="4627581"/>
             <wp:effectExtent l="19050" t="19050" r="22860" b="20955"/>
-            <wp:docPr id="1902203333" name="Imagem 12"/>
+            <wp:docPr id="619475757" name="Imagem 12"/>
             <wp:cNvGraphicFramePr/>
             <a:graphic xmlns:a="http://schemas.openxmlformats.org/drawingml/2006/main">
               <a:graphicData uri="http://schemas.openxmlformats.org/drawingml/2006/picture">
                 <pic:pic xmlns:pic="http://schemas.openxmlformats.org/drawingml/2006/picture">
                   <pic:nvPicPr>
-                    <pic:cNvPr id="1902203333" name=""/>
+                    <pic:cNvPr id="619475757" name=""/>
                     <pic:cNvPicPr/>
                   </pic:nvPicPr>
                   <pic:blipFill>
@@ -9355,7 +9459,7 @@
           <w:sz w:val="27"/>
         </w:rPr>
       </w:pPr>
-      <w:bookmarkStart w:id="18" w:name="_Toc236515588"/>
+      <w:bookmarkStart w:id="18" w:name="_Toc236645682"/>
       <w:r>
         <w:rPr>
           <w:rFonts w:ascii="Montserrat" w:hAnsi="Montserrat"/>
@@ -9862,16 +9966,16 @@
           <w:noProof/>
         </w:rPr>
         <w:drawing>
-          <wp:inline distT="0" distB="0" distL="0" distR="0" wp14:anchorId="70DF9B0D" wp14:editId="1F592E81">
+          <wp:inline distT="0" distB="0" distL="0" distR="0" wp14:anchorId="0886CA70" wp14:editId="29851AE6">
             <wp:extent cx="5120640" cy="4627581"/>
             <wp:effectExtent l="19050" t="19050" r="22860" b="20955"/>
-            <wp:docPr id="1179680120" name="Imagem 13"/>
+            <wp:docPr id="2077874637" name="Imagem 13"/>
             <wp:cNvGraphicFramePr/>
             <a:graphic xmlns:a="http://schemas.openxmlformats.org/drawingml/2006/main">
               <a:graphicData uri="http://schemas.openxmlformats.org/drawingml/2006/picture">
                 <pic:pic xmlns:pic="http://schemas.openxmlformats.org/drawingml/2006/picture">
                   <pic:nvPicPr>
-                    <pic:cNvPr id="1179680120" name=""/>
+                    <pic:cNvPr id="2077874637" name=""/>
                     <pic:cNvPicPr/>
                   </pic:nvPicPr>
                   <pic:blipFill>
@@ -9939,16 +10043,16 @@
         </w:rPr>
         <w:lastRenderedPageBreak/>
         <w:drawing>
-          <wp:inline distT="0" distB="0" distL="0" distR="0" wp14:anchorId="446AC7DB" wp14:editId="4F4BA6D1">
+          <wp:inline distT="0" distB="0" distL="0" distR="0" wp14:anchorId="5471009E" wp14:editId="5CA6E9C3">
             <wp:extent cx="5120640" cy="4627581"/>
             <wp:effectExtent l="19050" t="19050" r="22860" b="20955"/>
-            <wp:docPr id="1093303392" name="Imagem 14"/>
+            <wp:docPr id="2084585221" name="Imagem 14"/>
             <wp:cNvGraphicFramePr/>
             <a:graphic xmlns:a="http://schemas.openxmlformats.org/drawingml/2006/main">
               <a:graphicData uri="http://schemas.openxmlformats.org/drawingml/2006/picture">
                 <pic:pic xmlns:pic="http://schemas.openxmlformats.org/drawingml/2006/picture">
                   <pic:nvPicPr>
-                    <pic:cNvPr id="1093303392" name=""/>
+                    <pic:cNvPr id="2084585221" name=""/>
                     <pic:cNvPicPr/>
                   </pic:nvPicPr>
                   <pic:blipFill>
@@ -10034,7 +10138,7 @@
           <w:sz w:val="27"/>
         </w:rPr>
       </w:pPr>
-      <w:bookmarkStart w:id="19" w:name="_Toc236515589"/>
+      <w:bookmarkStart w:id="19" w:name="_Toc236645683"/>
       <w:r>
         <w:rPr>
           <w:rFonts w:ascii="Montserrat" w:hAnsi="Montserrat"/>
@@ -10075,16 +10179,16 @@
         </w:rPr>
         <w:lastRenderedPageBreak/>
         <w:drawing>
-          <wp:inline distT="0" distB="0" distL="0" distR="0" wp14:anchorId="165452A7" wp14:editId="0DBF7904">
+          <wp:inline distT="0" distB="0" distL="0" distR="0" wp14:anchorId="0DEFEB14" wp14:editId="64F3C428">
             <wp:extent cx="5120640" cy="4627581"/>
             <wp:effectExtent l="19050" t="19050" r="22860" b="20955"/>
-            <wp:docPr id="83021562" name="Imagem 15"/>
+            <wp:docPr id="816220708" name="Imagem 15"/>
             <wp:cNvGraphicFramePr/>
             <a:graphic xmlns:a="http://schemas.openxmlformats.org/drawingml/2006/main">
               <a:graphicData uri="http://schemas.openxmlformats.org/drawingml/2006/picture">
                 <pic:pic xmlns:pic="http://schemas.openxmlformats.org/drawingml/2006/picture">
                   <pic:nvPicPr>
-                    <pic:cNvPr id="83021562" name=""/>
+                    <pic:cNvPr id="816220708" name=""/>
                     <pic:cNvPicPr/>
                   </pic:nvPicPr>
                   <pic:blipFill>
@@ -10152,16 +10256,16 @@
         </w:rPr>
         <w:lastRenderedPageBreak/>
         <w:drawing>
-          <wp:inline distT="0" distB="0" distL="0" distR="0" wp14:anchorId="126FAF5F" wp14:editId="50C6C643">
+          <wp:inline distT="0" distB="0" distL="0" distR="0" wp14:anchorId="56F356C9" wp14:editId="48A3A336">
             <wp:extent cx="5120640" cy="4627581"/>
             <wp:effectExtent l="19050" t="19050" r="22860" b="20955"/>
-            <wp:docPr id="1774559944" name="Imagem 16"/>
+            <wp:docPr id="36514758" name="Imagem 16"/>
             <wp:cNvGraphicFramePr/>
             <a:graphic xmlns:a="http://schemas.openxmlformats.org/drawingml/2006/main">
               <a:graphicData uri="http://schemas.openxmlformats.org/drawingml/2006/picture">
                 <pic:pic xmlns:pic="http://schemas.openxmlformats.org/drawingml/2006/picture">
                   <pic:nvPicPr>
-                    <pic:cNvPr id="1774559944" name=""/>
+                    <pic:cNvPr id="36514758" name=""/>
                     <pic:cNvPicPr/>
                   </pic:nvPicPr>
                   <pic:blipFill>
@@ -10325,16 +10429,16 @@
         </w:rPr>
         <w:lastRenderedPageBreak/>
         <w:drawing>
-          <wp:inline distT="0" distB="0" distL="0" distR="0" wp14:anchorId="7168A7EE" wp14:editId="571CB73F">
+          <wp:inline distT="0" distB="0" distL="0" distR="0" wp14:anchorId="06AD7F9A" wp14:editId="72A60410">
             <wp:extent cx="5120640" cy="3282818"/>
             <wp:effectExtent l="19050" t="19050" r="22860" b="13335"/>
-            <wp:docPr id="464815589" name="Imagem 17"/>
+            <wp:docPr id="195669334" name="Imagem 17"/>
             <wp:cNvGraphicFramePr/>
             <a:graphic xmlns:a="http://schemas.openxmlformats.org/drawingml/2006/main">
               <a:graphicData uri="http://schemas.openxmlformats.org/drawingml/2006/picture">
                 <pic:pic xmlns:pic="http://schemas.openxmlformats.org/drawingml/2006/picture">
                   <pic:nvPicPr>
-                    <pic:cNvPr id="464815589" name=""/>
+                    <pic:cNvPr id="195669334" name=""/>
                     <pic:cNvPicPr/>
                   </pic:nvPicPr>
                   <pic:blipFill>
@@ -10420,7 +10524,7 @@
           <w:sz w:val="27"/>
         </w:rPr>
       </w:pPr>
-      <w:bookmarkStart w:id="20" w:name="_Toc236515590"/>
+      <w:bookmarkStart w:id="20" w:name="_Toc236645684"/>
       <w:r>
         <w:rPr>
           <w:rFonts w:ascii="Montserrat" w:hAnsi="Montserrat"/>
@@ -10461,16 +10565,16 @@
         </w:rPr>
         <w:lastRenderedPageBreak/>
         <w:drawing>
-          <wp:inline distT="0" distB="0" distL="0" distR="0" wp14:anchorId="7A57607E" wp14:editId="6DA603AE">
+          <wp:inline distT="0" distB="0" distL="0" distR="0" wp14:anchorId="3CEF03B7" wp14:editId="5553E309">
             <wp:extent cx="5120640" cy="4627581"/>
             <wp:effectExtent l="19050" t="19050" r="22860" b="20955"/>
-            <wp:docPr id="1879980549" name="Imagem 18"/>
+            <wp:docPr id="988548812" name="Imagem 18"/>
             <wp:cNvGraphicFramePr/>
             <a:graphic xmlns:a="http://schemas.openxmlformats.org/drawingml/2006/main">
               <a:graphicData uri="http://schemas.openxmlformats.org/drawingml/2006/picture">
                 <pic:pic xmlns:pic="http://schemas.openxmlformats.org/drawingml/2006/picture">
                   <pic:nvPicPr>
-                    <pic:cNvPr id="1879980549" name=""/>
+                    <pic:cNvPr id="988548812" name=""/>
                     <pic:cNvPicPr/>
                   </pic:nvPicPr>
                   <pic:blipFill>
@@ -10538,16 +10642,16 @@
         </w:rPr>
         <w:lastRenderedPageBreak/>
         <w:drawing>
-          <wp:inline distT="0" distB="0" distL="0" distR="0" wp14:anchorId="08C89754" wp14:editId="0529D707">
+          <wp:inline distT="0" distB="0" distL="0" distR="0" wp14:anchorId="56E645C8" wp14:editId="6410AB81">
             <wp:extent cx="5120640" cy="4627581"/>
             <wp:effectExtent l="19050" t="19050" r="22860" b="20955"/>
-            <wp:docPr id="836083508" name="Imagem 19"/>
+            <wp:docPr id="1605064705" name="Imagem 19"/>
             <wp:cNvGraphicFramePr/>
             <a:graphic xmlns:a="http://schemas.openxmlformats.org/drawingml/2006/main">
               <a:graphicData uri="http://schemas.openxmlformats.org/drawingml/2006/picture">
                 <pic:pic xmlns:pic="http://schemas.openxmlformats.org/drawingml/2006/picture">
                   <pic:nvPicPr>
-                    <pic:cNvPr id="836083508" name=""/>
+                    <pic:cNvPr id="1605064705" name=""/>
                     <pic:cNvPicPr/>
                   </pic:nvPicPr>
                   <pic:blipFill>
@@ -10681,7 +10785,7 @@
           <w:sz w:val="27"/>
         </w:rPr>
       </w:pPr>
-      <w:bookmarkStart w:id="21" w:name="_Toc236515591"/>
+      <w:bookmarkStart w:id="21" w:name="_Toc236645685"/>
       <w:r>
         <w:rPr>
           <w:rFonts w:ascii="Montserrat" w:hAnsi="Montserrat"/>
@@ -10722,16 +10826,16 @@
         </w:rPr>
         <w:lastRenderedPageBreak/>
         <w:drawing>
-          <wp:inline distT="0" distB="0" distL="0" distR="0" wp14:anchorId="76BC3CFA" wp14:editId="0B85A9B7">
+          <wp:inline distT="0" distB="0" distL="0" distR="0" wp14:anchorId="2A4413E3" wp14:editId="24C94BB2">
             <wp:extent cx="5120640" cy="4627581"/>
             <wp:effectExtent l="19050" t="19050" r="22860" b="20955"/>
-            <wp:docPr id="1128554941" name="Imagem 20"/>
+            <wp:docPr id="663307416" name="Imagem 20"/>
             <wp:cNvGraphicFramePr/>
             <a:graphic xmlns:a="http://schemas.openxmlformats.org/drawingml/2006/main">
               <a:graphicData uri="http://schemas.openxmlformats.org/drawingml/2006/picture">
                 <pic:pic xmlns:pic="http://schemas.openxmlformats.org/drawingml/2006/picture">
                   <pic:nvPicPr>
-                    <pic:cNvPr id="1128554941" name=""/>
+                    <pic:cNvPr id="663307416" name=""/>
                     <pic:cNvPicPr/>
                   </pic:nvPicPr>
                   <pic:blipFill>
@@ -10799,16 +10903,16 @@
         </w:rPr>
         <w:lastRenderedPageBreak/>
         <w:drawing>
-          <wp:inline distT="0" distB="0" distL="0" distR="0" wp14:anchorId="484F54AD" wp14:editId="121B329D">
+          <wp:inline distT="0" distB="0" distL="0" distR="0" wp14:anchorId="6E3423AB" wp14:editId="084BC266">
             <wp:extent cx="5120640" cy="4627581"/>
             <wp:effectExtent l="19050" t="19050" r="22860" b="20955"/>
-            <wp:docPr id="218946682" name="Imagem 21"/>
+            <wp:docPr id="489292287" name="Imagem 21"/>
             <wp:cNvGraphicFramePr/>
             <a:graphic xmlns:a="http://schemas.openxmlformats.org/drawingml/2006/main">
               <a:graphicData uri="http://schemas.openxmlformats.org/drawingml/2006/picture">
                 <pic:pic xmlns:pic="http://schemas.openxmlformats.org/drawingml/2006/picture">
                   <pic:nvPicPr>
-                    <pic:cNvPr id="218946682" name=""/>
+                    <pic:cNvPr id="489292287" name=""/>
                     <pic:cNvPicPr/>
                   </pic:nvPicPr>
                   <pic:blipFill>
@@ -10997,7 +11101,7 @@
           <w:sz w:val="27"/>
         </w:rPr>
       </w:pPr>
-      <w:bookmarkStart w:id="22" w:name="_Toc236515592"/>
+      <w:bookmarkStart w:id="22" w:name="_Toc236645686"/>
       <w:r>
         <w:rPr>
           <w:rFonts w:ascii="Montserrat" w:hAnsi="Montserrat"/>
@@ -11037,16 +11141,16 @@
           <w:noProof/>
         </w:rPr>
         <w:drawing>
-          <wp:inline distT="0" distB="0" distL="0" distR="0" wp14:anchorId="1B7305CD" wp14:editId="788A17A5">
+          <wp:inline distT="0" distB="0" distL="0" distR="0" wp14:anchorId="0F9AA500" wp14:editId="45845E7E">
             <wp:extent cx="5120640" cy="4627581"/>
             <wp:effectExtent l="19050" t="19050" r="22860" b="20955"/>
-            <wp:docPr id="1270079188" name="Imagem 22"/>
+            <wp:docPr id="273693855" name="Imagem 22"/>
             <wp:cNvGraphicFramePr/>
             <a:graphic xmlns:a="http://schemas.openxmlformats.org/drawingml/2006/main">
               <a:graphicData uri="http://schemas.openxmlformats.org/drawingml/2006/picture">
                 <pic:pic xmlns:pic="http://schemas.openxmlformats.org/drawingml/2006/picture">
                   <pic:nvPicPr>
-                    <pic:cNvPr id="1270079188" name=""/>
+                    <pic:cNvPr id="273693855" name=""/>
                     <pic:cNvPicPr/>
                   </pic:nvPicPr>
                   <pic:blipFill>
@@ -11114,16 +11218,16 @@
         </w:rPr>
         <w:lastRenderedPageBreak/>
         <w:drawing>
-          <wp:inline distT="0" distB="0" distL="0" distR="0" wp14:anchorId="5CF5A0E5" wp14:editId="6DFABDAC">
+          <wp:inline distT="0" distB="0" distL="0" distR="0" wp14:anchorId="1B1DB61C" wp14:editId="0FBDD6C9">
             <wp:extent cx="5120640" cy="4627581"/>
             <wp:effectExtent l="19050" t="19050" r="22860" b="20955"/>
-            <wp:docPr id="1472191689" name="Imagem 23"/>
+            <wp:docPr id="513732600" name="Imagem 23"/>
             <wp:cNvGraphicFramePr/>
             <a:graphic xmlns:a="http://schemas.openxmlformats.org/drawingml/2006/main">
               <a:graphicData uri="http://schemas.openxmlformats.org/drawingml/2006/picture">
                 <pic:pic xmlns:pic="http://schemas.openxmlformats.org/drawingml/2006/picture">
                   <pic:nvPicPr>
-                    <pic:cNvPr id="1472191689" name=""/>
+                    <pic:cNvPr id="513732600" name=""/>
                     <pic:cNvPicPr/>
                   </pic:nvPicPr>
                   <pic:blipFill>
@@ -11281,7 +11385,7 @@
           <w:sz w:val="27"/>
         </w:rPr>
       </w:pPr>
-      <w:bookmarkStart w:id="23" w:name="_Toc236515593"/>
+      <w:bookmarkStart w:id="23" w:name="_Toc236645687"/>
       <w:r>
         <w:rPr>
           <w:rFonts w:ascii="Montserrat" w:hAnsi="Montserrat"/>
@@ -11322,16 +11426,16 @@
         </w:rPr>
         <w:lastRenderedPageBreak/>
         <w:drawing>
-          <wp:inline distT="0" distB="0" distL="0" distR="0" wp14:anchorId="0D0369C9" wp14:editId="48930ED1">
+          <wp:inline distT="0" distB="0" distL="0" distR="0" wp14:anchorId="681E1595" wp14:editId="7FA99AF7">
             <wp:extent cx="5120640" cy="4627581"/>
             <wp:effectExtent l="19050" t="19050" r="22860" b="20955"/>
-            <wp:docPr id="1869030861" name="Imagem 24"/>
+            <wp:docPr id="72764244" name="Imagem 24"/>
             <wp:cNvGraphicFramePr/>
             <a:graphic xmlns:a="http://schemas.openxmlformats.org/drawingml/2006/main">
               <a:graphicData uri="http://schemas.openxmlformats.org/drawingml/2006/picture">
                 <pic:pic xmlns:pic="http://schemas.openxmlformats.org/drawingml/2006/picture">
                   <pic:nvPicPr>
-                    <pic:cNvPr id="1869030861" name=""/>
+                    <pic:cNvPr id="72764244" name=""/>
                     <pic:cNvPicPr/>
                   </pic:nvPicPr>
                   <pic:blipFill>
@@ -11399,16 +11503,16 @@
         </w:rPr>
         <w:lastRenderedPageBreak/>
         <w:drawing>
-          <wp:inline distT="0" distB="0" distL="0" distR="0" wp14:anchorId="42ECF375" wp14:editId="52E6762F">
+          <wp:inline distT="0" distB="0" distL="0" distR="0" wp14:anchorId="3CE7AC64" wp14:editId="2F515300">
             <wp:extent cx="5120640" cy="4627581"/>
             <wp:effectExtent l="19050" t="19050" r="22860" b="20955"/>
-            <wp:docPr id="70241329" name="Imagem 25"/>
+            <wp:docPr id="1382257703" name="Imagem 25"/>
             <wp:cNvGraphicFramePr/>
             <a:graphic xmlns:a="http://schemas.openxmlformats.org/drawingml/2006/main">
               <a:graphicData uri="http://schemas.openxmlformats.org/drawingml/2006/picture">
                 <pic:pic xmlns:pic="http://schemas.openxmlformats.org/drawingml/2006/picture">
                   <pic:nvPicPr>
-                    <pic:cNvPr id="70241329" name=""/>
+                    <pic:cNvPr id="1382257703" name=""/>
                     <pic:cNvPicPr/>
                   </pic:nvPicPr>
                   <pic:blipFill>
@@ -11542,7 +11646,7 @@
           <w:sz w:val="27"/>
         </w:rPr>
       </w:pPr>
-      <w:bookmarkStart w:id="24" w:name="_Toc236515594"/>
+      <w:bookmarkStart w:id="24" w:name="_Toc236645688"/>
       <w:r>
         <w:rPr>
           <w:rFonts w:ascii="Montserrat" w:hAnsi="Montserrat"/>
@@ -11583,16 +11687,16 @@
         </w:rPr>
         <w:lastRenderedPageBreak/>
         <w:drawing>
-          <wp:inline distT="0" distB="0" distL="0" distR="0" wp14:anchorId="69B8C0BE" wp14:editId="2C615875">
+          <wp:inline distT="0" distB="0" distL="0" distR="0" wp14:anchorId="656D3685" wp14:editId="465973B6">
             <wp:extent cx="5120640" cy="4627581"/>
             <wp:effectExtent l="19050" t="19050" r="22860" b="20955"/>
-            <wp:docPr id="1810578065" name="Imagem 26"/>
+            <wp:docPr id="42712747" name="Imagem 26"/>
             <wp:cNvGraphicFramePr/>
             <a:graphic xmlns:a="http://schemas.openxmlformats.org/drawingml/2006/main">
               <a:graphicData uri="http://schemas.openxmlformats.org/drawingml/2006/picture">
                 <pic:pic xmlns:pic="http://schemas.openxmlformats.org/drawingml/2006/picture">
                   <pic:nvPicPr>
-                    <pic:cNvPr id="1810578065" name=""/>
+                    <pic:cNvPr id="42712747" name=""/>
                     <pic:cNvPicPr/>
                   </pic:nvPicPr>
                   <pic:blipFill>
@@ -11682,7 +11786,7 @@
           <w:sz w:val="34"/>
         </w:rPr>
       </w:pPr>
-      <w:bookmarkStart w:id="25" w:name="_Toc236515595"/>
+      <w:bookmarkStart w:id="25" w:name="_Toc236645689"/>
       <w:r>
         <w:rPr>
           <w:rFonts w:ascii="Montserrat" w:hAnsi="Montserrat"/>
@@ -11724,7 +11828,7 @@
           <w:sz w:val="27"/>
         </w:rPr>
       </w:pPr>
-      <w:bookmarkStart w:id="26" w:name="_Toc236515596"/>
+      <w:bookmarkStart w:id="26" w:name="_Toc236645690"/>
       <w:r>
         <w:rPr>
           <w:rFonts w:ascii="Montserrat" w:hAnsi="Montserrat"/>
@@ -11764,16 +11868,16 @@
           <w:noProof/>
         </w:rPr>
         <w:drawing>
-          <wp:inline distT="0" distB="0" distL="0" distR="0" wp14:anchorId="3E04BEF6" wp14:editId="603FD785">
+          <wp:inline distT="0" distB="0" distL="0" distR="0" wp14:anchorId="727DEB03" wp14:editId="76A02BC5">
             <wp:extent cx="5120640" cy="4627581"/>
             <wp:effectExtent l="19050" t="19050" r="22860" b="20955"/>
-            <wp:docPr id="692295446" name="Imagem 27"/>
+            <wp:docPr id="1738258247" name="Imagem 27"/>
             <wp:cNvGraphicFramePr/>
             <a:graphic xmlns:a="http://schemas.openxmlformats.org/drawingml/2006/main">
               <a:graphicData uri="http://schemas.openxmlformats.org/drawingml/2006/picture">
                 <pic:pic xmlns:pic="http://schemas.openxmlformats.org/drawingml/2006/picture">
                   <pic:nvPicPr>
-                    <pic:cNvPr id="692295446" name=""/>
+                    <pic:cNvPr id="1738258247" name=""/>
                     <pic:cNvPicPr/>
                   </pic:nvPicPr>
                   <pic:blipFill>
@@ -11841,16 +11945,16 @@
         </w:rPr>
         <w:lastRenderedPageBreak/>
         <w:drawing>
-          <wp:inline distT="0" distB="0" distL="0" distR="0" wp14:anchorId="1E98D25C" wp14:editId="018C778A">
+          <wp:inline distT="0" distB="0" distL="0" distR="0" wp14:anchorId="415478B2" wp14:editId="6DAEBB47">
             <wp:extent cx="5120640" cy="4627581"/>
             <wp:effectExtent l="19050" t="19050" r="22860" b="20955"/>
-            <wp:docPr id="49221014" name="Imagem 28"/>
+            <wp:docPr id="376094646" name="Imagem 28"/>
             <wp:cNvGraphicFramePr/>
             <a:graphic xmlns:a="http://schemas.openxmlformats.org/drawingml/2006/main">
               <a:graphicData uri="http://schemas.openxmlformats.org/drawingml/2006/picture">
                 <pic:pic xmlns:pic="http://schemas.openxmlformats.org/drawingml/2006/picture">
                   <pic:nvPicPr>
-                    <pic:cNvPr id="49221014" name=""/>
+                    <pic:cNvPr id="376094646" name=""/>
                     <pic:cNvPicPr/>
                   </pic:nvPicPr>
                   <pic:blipFill>
@@ -11918,16 +12022,16 @@
         </w:rPr>
         <w:lastRenderedPageBreak/>
         <w:drawing>
-          <wp:inline distT="0" distB="0" distL="0" distR="0" wp14:anchorId="54C0733C" wp14:editId="7E6CA6FC">
+          <wp:inline distT="0" distB="0" distL="0" distR="0" wp14:anchorId="55DEC80E" wp14:editId="196C2BCD">
             <wp:extent cx="5120640" cy="4627581"/>
             <wp:effectExtent l="19050" t="19050" r="22860" b="20955"/>
-            <wp:docPr id="114064821" name="Imagem 29"/>
+            <wp:docPr id="1187141844" name="Imagem 29"/>
             <wp:cNvGraphicFramePr/>
             <a:graphic xmlns:a="http://schemas.openxmlformats.org/drawingml/2006/main">
               <a:graphicData uri="http://schemas.openxmlformats.org/drawingml/2006/picture">
                 <pic:pic xmlns:pic="http://schemas.openxmlformats.org/drawingml/2006/picture">
                   <pic:nvPicPr>
-                    <pic:cNvPr id="114064821" name=""/>
+                    <pic:cNvPr id="1187141844" name=""/>
                     <pic:cNvPicPr/>
                   </pic:nvPicPr>
                   <pic:blipFill>
@@ -12064,16 +12168,16 @@
         </w:rPr>
         <w:lastRenderedPageBreak/>
         <w:drawing>
-          <wp:inline distT="0" distB="0" distL="0" distR="0" wp14:anchorId="61347FA2" wp14:editId="405F58F8">
+          <wp:inline distT="0" distB="0" distL="0" distR="0" wp14:anchorId="39DBEC58" wp14:editId="1B142238">
             <wp:extent cx="5120640" cy="1715571"/>
             <wp:effectExtent l="19050" t="19050" r="22860" b="18415"/>
-            <wp:docPr id="857440459" name="Imagem 30"/>
+            <wp:docPr id="293291954" name="Imagem 30"/>
             <wp:cNvGraphicFramePr/>
             <a:graphic xmlns:a="http://schemas.openxmlformats.org/drawingml/2006/main">
               <a:graphicData uri="http://schemas.openxmlformats.org/drawingml/2006/picture">
                 <pic:pic xmlns:pic="http://schemas.openxmlformats.org/drawingml/2006/picture">
                   <pic:nvPicPr>
-                    <pic:cNvPr id="857440459" name=""/>
+                    <pic:cNvPr id="293291954" name=""/>
                     <pic:cNvPicPr/>
                   </pic:nvPicPr>
                   <pic:blipFill>
@@ -12210,16 +12314,16 @@
         </w:rPr>
         <w:lastRenderedPageBreak/>
         <w:drawing>
-          <wp:inline distT="0" distB="0" distL="0" distR="0" wp14:anchorId="6596D382" wp14:editId="424FA5E1">
+          <wp:inline distT="0" distB="0" distL="0" distR="0" wp14:anchorId="3EBAA8D6" wp14:editId="20768736">
             <wp:extent cx="5120640" cy="3282818"/>
             <wp:effectExtent l="19050" t="19050" r="22860" b="13335"/>
-            <wp:docPr id="1747766965" name="Imagem 31"/>
+            <wp:docPr id="534684568" name="Imagem 31"/>
             <wp:cNvGraphicFramePr/>
             <a:graphic xmlns:a="http://schemas.openxmlformats.org/drawingml/2006/main">
               <a:graphicData uri="http://schemas.openxmlformats.org/drawingml/2006/picture">
                 <pic:pic xmlns:pic="http://schemas.openxmlformats.org/drawingml/2006/picture">
                   <pic:nvPicPr>
-                    <pic:cNvPr id="1747766965" name=""/>
+                    <pic:cNvPr id="534684568" name=""/>
                     <pic:cNvPicPr/>
                   </pic:nvPicPr>
                   <pic:blipFill>
@@ -12331,16 +12435,16 @@
           <w:noProof/>
         </w:rPr>
         <w:drawing>
-          <wp:inline distT="0" distB="0" distL="0" distR="0" wp14:anchorId="3B6DCA5D" wp14:editId="0362267F">
+          <wp:inline distT="0" distB="0" distL="0" distR="0" wp14:anchorId="4847E97A" wp14:editId="2E9D54A0">
             <wp:extent cx="5120640" cy="1515102"/>
             <wp:effectExtent l="19050" t="19050" r="22860" b="28575"/>
-            <wp:docPr id="1734471553" name="Imagem 32"/>
+            <wp:docPr id="1839647431" name="Imagem 32"/>
             <wp:cNvGraphicFramePr/>
             <a:graphic xmlns:a="http://schemas.openxmlformats.org/drawingml/2006/main">
               <a:graphicData uri="http://schemas.openxmlformats.org/drawingml/2006/picture">
                 <pic:pic xmlns:pic="http://schemas.openxmlformats.org/drawingml/2006/picture">
                   <pic:nvPicPr>
-                    <pic:cNvPr id="1734471553" name=""/>
+                    <pic:cNvPr id="1839647431" name=""/>
                     <pic:cNvPicPr/>
                   </pic:nvPicPr>
                   <pic:blipFill>
@@ -12453,16 +12557,16 @@
           <w:noProof/>
         </w:rPr>
         <w:drawing>
-          <wp:inline distT="0" distB="0" distL="0" distR="0" wp14:anchorId="371BF2D1" wp14:editId="6A7E77FD">
+          <wp:inline distT="0" distB="0" distL="0" distR="0" wp14:anchorId="216486A3" wp14:editId="67F09B66">
             <wp:extent cx="5120640" cy="1391113"/>
             <wp:effectExtent l="19050" t="19050" r="22860" b="19050"/>
-            <wp:docPr id="940058579" name="Imagem 33"/>
+            <wp:docPr id="1717107183" name="Imagem 33"/>
             <wp:cNvGraphicFramePr/>
             <a:graphic xmlns:a="http://schemas.openxmlformats.org/drawingml/2006/main">
               <a:graphicData uri="http://schemas.openxmlformats.org/drawingml/2006/picture">
                 <pic:pic xmlns:pic="http://schemas.openxmlformats.org/drawingml/2006/picture">
                   <pic:nvPicPr>
-                    <pic:cNvPr id="940058579" name=""/>
+                    <pic:cNvPr id="1717107183" name=""/>
                     <pic:cNvPicPr/>
                   </pic:nvPicPr>
                   <pic:blipFill>
@@ -12574,16 +12678,16 @@
           <w:noProof/>
         </w:rPr>
         <w:drawing>
-          <wp:inline distT="0" distB="0" distL="0" distR="0" wp14:anchorId="2E56CAFE" wp14:editId="087F2445">
+          <wp:inline distT="0" distB="0" distL="0" distR="0" wp14:anchorId="2585F49B" wp14:editId="51B16EF2">
             <wp:extent cx="5120640" cy="1125174"/>
             <wp:effectExtent l="19050" t="19050" r="22860" b="18415"/>
-            <wp:docPr id="1636170185" name="Imagem 34"/>
+            <wp:docPr id="1191144056" name="Imagem 34"/>
             <wp:cNvGraphicFramePr/>
             <a:graphic xmlns:a="http://schemas.openxmlformats.org/drawingml/2006/main">
               <a:graphicData uri="http://schemas.openxmlformats.org/drawingml/2006/picture">
                 <pic:pic xmlns:pic="http://schemas.openxmlformats.org/drawingml/2006/picture">
                   <pic:nvPicPr>
-                    <pic:cNvPr id="1636170185" name=""/>
+                    <pic:cNvPr id="1191144056" name=""/>
                     <pic:cNvPicPr/>
                   </pic:nvPicPr>
                   <pic:blipFill>
@@ -12673,7 +12777,7 @@
           <w:sz w:val="27"/>
         </w:rPr>
       </w:pPr>
-      <w:bookmarkStart w:id="27" w:name="_Toc236515597"/>
+      <w:bookmarkStart w:id="27" w:name="_Toc236645691"/>
       <w:r>
         <w:rPr>
           <w:rFonts w:ascii="Montserrat" w:hAnsi="Montserrat"/>
@@ -12713,16 +12817,16 @@
           <w:noProof/>
         </w:rPr>
         <w:drawing>
-          <wp:inline distT="0" distB="0" distL="0" distR="0" wp14:anchorId="429EE1D4" wp14:editId="0D0446F6">
+          <wp:inline distT="0" distB="0" distL="0" distR="0" wp14:anchorId="7CCC8ACF" wp14:editId="5E211BEE">
             <wp:extent cx="5120640" cy="4627581"/>
             <wp:effectExtent l="19050" t="19050" r="22860" b="20955"/>
-            <wp:docPr id="1703206303" name="Imagem 35"/>
+            <wp:docPr id="1530667169" name="Imagem 35"/>
             <wp:cNvGraphicFramePr/>
             <a:graphic xmlns:a="http://schemas.openxmlformats.org/drawingml/2006/main">
               <a:graphicData uri="http://schemas.openxmlformats.org/drawingml/2006/picture">
                 <pic:pic xmlns:pic="http://schemas.openxmlformats.org/drawingml/2006/picture">
                   <pic:nvPicPr>
-                    <pic:cNvPr id="1703206303" name=""/>
+                    <pic:cNvPr id="1530667169" name=""/>
                     <pic:cNvPicPr/>
                   </pic:nvPicPr>
                   <pic:blipFill>
@@ -12790,16 +12894,16 @@
         </w:rPr>
         <w:lastRenderedPageBreak/>
         <w:drawing>
-          <wp:inline distT="0" distB="0" distL="0" distR="0" wp14:anchorId="5B9F493E" wp14:editId="160DBCA8">
+          <wp:inline distT="0" distB="0" distL="0" distR="0" wp14:anchorId="1675D2A7" wp14:editId="28CCD22D">
             <wp:extent cx="5120640" cy="4627581"/>
             <wp:effectExtent l="19050" t="19050" r="22860" b="20955"/>
-            <wp:docPr id="1010981722" name="Imagem 36"/>
+            <wp:docPr id="1449534729" name="Imagem 36"/>
             <wp:cNvGraphicFramePr/>
             <a:graphic xmlns:a="http://schemas.openxmlformats.org/drawingml/2006/main">
               <a:graphicData uri="http://schemas.openxmlformats.org/drawingml/2006/picture">
                 <pic:pic xmlns:pic="http://schemas.openxmlformats.org/drawingml/2006/picture">
                   <pic:nvPicPr>
-                    <pic:cNvPr id="1010981722" name=""/>
+                    <pic:cNvPr id="1449534729" name=""/>
                     <pic:cNvPicPr/>
                   </pic:nvPicPr>
                   <pic:blipFill>
@@ -12936,16 +13040,16 @@
         </w:rPr>
         <w:lastRenderedPageBreak/>
         <w:drawing>
-          <wp:inline distT="0" distB="0" distL="0" distR="0" wp14:anchorId="4ED557C2" wp14:editId="6DBDBFF0">
+          <wp:inline distT="0" distB="0" distL="0" distR="0" wp14:anchorId="12CDF5E7" wp14:editId="7AD6F3EC">
             <wp:extent cx="5120640" cy="2144319"/>
             <wp:effectExtent l="19050" t="19050" r="22860" b="27940"/>
-            <wp:docPr id="1529153541" name="Imagem 37"/>
+            <wp:docPr id="1457341121" name="Imagem 37"/>
             <wp:cNvGraphicFramePr/>
             <a:graphic xmlns:a="http://schemas.openxmlformats.org/drawingml/2006/main">
               <a:graphicData uri="http://schemas.openxmlformats.org/drawingml/2006/picture">
                 <pic:pic xmlns:pic="http://schemas.openxmlformats.org/drawingml/2006/picture">
                   <pic:nvPicPr>
-                    <pic:cNvPr id="1529153541" name=""/>
+                    <pic:cNvPr id="1457341121" name=""/>
                     <pic:cNvPicPr/>
                   </pic:nvPicPr>
                   <pic:blipFill>
@@ -13033,16 +13137,16 @@
           <w:noProof/>
         </w:rPr>
         <w:drawing>
-          <wp:inline distT="0" distB="0" distL="0" distR="0" wp14:anchorId="3E2EF3E9" wp14:editId="6839FC9D">
+          <wp:inline distT="0" distB="0" distL="0" distR="0" wp14:anchorId="339F37E5" wp14:editId="1B9727FD">
             <wp:extent cx="5120640" cy="1055647"/>
             <wp:effectExtent l="19050" t="19050" r="22860" b="11430"/>
-            <wp:docPr id="1459901723" name="Imagem 38"/>
+            <wp:docPr id="1101258449" name="Imagem 38"/>
             <wp:cNvGraphicFramePr/>
             <a:graphic xmlns:a="http://schemas.openxmlformats.org/drawingml/2006/main">
               <a:graphicData uri="http://schemas.openxmlformats.org/drawingml/2006/picture">
                 <pic:pic xmlns:pic="http://schemas.openxmlformats.org/drawingml/2006/picture">
                   <pic:nvPicPr>
-                    <pic:cNvPr id="1459901723" name=""/>
+                    <pic:cNvPr id="1101258449" name=""/>
                     <pic:cNvPicPr/>
                   </pic:nvPicPr>
                   <pic:blipFill>
@@ -13155,16 +13259,16 @@
         </w:rPr>
         <w:lastRenderedPageBreak/>
         <w:drawing>
-          <wp:inline distT="0" distB="0" distL="0" distR="0" wp14:anchorId="25625E66" wp14:editId="66F189BE">
+          <wp:inline distT="0" distB="0" distL="0" distR="0" wp14:anchorId="17F9D6F1" wp14:editId="2CF42390">
             <wp:extent cx="5120640" cy="3282818"/>
             <wp:effectExtent l="19050" t="19050" r="22860" b="13335"/>
-            <wp:docPr id="1222088237" name="Imagem 39"/>
+            <wp:docPr id="1701006363" name="Imagem 39"/>
             <wp:cNvGraphicFramePr/>
             <a:graphic xmlns:a="http://schemas.openxmlformats.org/drawingml/2006/main">
               <a:graphicData uri="http://schemas.openxmlformats.org/drawingml/2006/picture">
                 <pic:pic xmlns:pic="http://schemas.openxmlformats.org/drawingml/2006/picture">
                   <pic:nvPicPr>
-                    <pic:cNvPr id="1222088237" name=""/>
+                    <pic:cNvPr id="1701006363" name=""/>
                     <pic:cNvPicPr/>
                   </pic:nvPicPr>
                   <pic:blipFill>
@@ -13297,16 +13401,16 @@
           <w:noProof/>
         </w:rPr>
         <w:drawing>
-          <wp:inline distT="0" distB="0" distL="0" distR="0" wp14:anchorId="777165AC" wp14:editId="7C0D9074">
+          <wp:inline distT="0" distB="0" distL="0" distR="0" wp14:anchorId="64A67755" wp14:editId="63DC08FA">
             <wp:extent cx="5120640" cy="1978034"/>
             <wp:effectExtent l="19050" t="19050" r="22860" b="22225"/>
-            <wp:docPr id="1030248636" name="Imagem 40"/>
+            <wp:docPr id="1996149483" name="Imagem 40"/>
             <wp:cNvGraphicFramePr/>
             <a:graphic xmlns:a="http://schemas.openxmlformats.org/drawingml/2006/main">
               <a:graphicData uri="http://schemas.openxmlformats.org/drawingml/2006/picture">
                 <pic:pic xmlns:pic="http://schemas.openxmlformats.org/drawingml/2006/picture">
                   <pic:nvPicPr>
-                    <pic:cNvPr id="1030248636" name=""/>
+                    <pic:cNvPr id="1996149483" name=""/>
                     <pic:cNvPicPr/>
                   </pic:nvPicPr>
                   <pic:blipFill>
@@ -13379,7 +13483,7 @@
           <w:sz w:val="34"/>
         </w:rPr>
       </w:pPr>
-      <w:bookmarkStart w:id="28" w:name="_Toc236515598"/>
+      <w:bookmarkStart w:id="28" w:name="_Toc236645692"/>
       <w:r>
         <w:rPr>
           <w:rFonts w:ascii="Montserrat" w:hAnsi="Montserrat"/>
@@ -13439,7 +13543,7 @@
           <w:sz w:val="27"/>
         </w:rPr>
       </w:pPr>
-      <w:bookmarkStart w:id="29" w:name="_Toc236515599"/>
+      <w:bookmarkStart w:id="29" w:name="_Toc236645693"/>
       <w:r>
         <w:rPr>
           <w:rFonts w:ascii="Montserrat" w:hAnsi="Montserrat"/>
@@ -13479,16 +13583,16 @@
           <w:noProof/>
         </w:rPr>
         <w:drawing>
-          <wp:inline distT="0" distB="0" distL="0" distR="0" wp14:anchorId="634B0437" wp14:editId="67E5BC4B">
+          <wp:inline distT="0" distB="0" distL="0" distR="0" wp14:anchorId="4FED56D0" wp14:editId="6C39240E">
             <wp:extent cx="5303520" cy="4792851"/>
             <wp:effectExtent l="19050" t="19050" r="11430" b="27305"/>
-            <wp:docPr id="1467019279" name="Imagem 41"/>
+            <wp:docPr id="1815110092" name="Imagem 41"/>
             <wp:cNvGraphicFramePr/>
             <a:graphic xmlns:a="http://schemas.openxmlformats.org/drawingml/2006/main">
               <a:graphicData uri="http://schemas.openxmlformats.org/drawingml/2006/picture">
                 <pic:pic xmlns:pic="http://schemas.openxmlformats.org/drawingml/2006/picture">
                   <pic:nvPicPr>
-                    <pic:cNvPr id="1467019279" name=""/>
+                    <pic:cNvPr id="1815110092" name=""/>
                     <pic:cNvPicPr/>
                   </pic:nvPicPr>
                   <pic:blipFill>
@@ -13557,7 +13661,7 @@
           <w:sz w:val="27"/>
         </w:rPr>
       </w:pPr>
-      <w:bookmarkStart w:id="30" w:name="_Toc236515600"/>
+      <w:bookmarkStart w:id="30" w:name="_Toc236645694"/>
       <w:r>
         <w:rPr>
           <w:rFonts w:ascii="Montserrat" w:hAnsi="Montserrat"/>
@@ -13597,16 +13701,16 @@
           <w:noProof/>
         </w:rPr>
         <w:drawing>
-          <wp:inline distT="0" distB="0" distL="0" distR="0" wp14:anchorId="19D46882" wp14:editId="440913EC">
+          <wp:inline distT="0" distB="0" distL="0" distR="0" wp14:anchorId="69F074CD" wp14:editId="7A039C56">
             <wp:extent cx="5303520" cy="4792851"/>
             <wp:effectExtent l="19050" t="19050" r="11430" b="27305"/>
-            <wp:docPr id="938386139" name="Imagem 42"/>
+            <wp:docPr id="729094641" name="Imagem 42"/>
             <wp:cNvGraphicFramePr/>
             <a:graphic xmlns:a="http://schemas.openxmlformats.org/drawingml/2006/main">
               <a:graphicData uri="http://schemas.openxmlformats.org/drawingml/2006/picture">
                 <pic:pic xmlns:pic="http://schemas.openxmlformats.org/drawingml/2006/picture">
                   <pic:nvPicPr>
-                    <pic:cNvPr id="938386139" name=""/>
+                    <pic:cNvPr id="729094641" name=""/>
                     <pic:cNvPicPr/>
                   </pic:nvPicPr>
                   <pic:blipFill>
@@ -13674,7 +13778,7 @@
           <w:sz w:val="27"/>
         </w:rPr>
       </w:pPr>
-      <w:bookmarkStart w:id="31" w:name="_Toc236515601"/>
+      <w:bookmarkStart w:id="31" w:name="_Toc236645695"/>
       <w:r>
         <w:rPr>
           <w:rFonts w:ascii="Montserrat" w:hAnsi="Montserrat"/>
@@ -13715,16 +13819,16 @@
         </w:rPr>
         <w:lastRenderedPageBreak/>
         <w:drawing>
-          <wp:inline distT="0" distB="0" distL="0" distR="0" wp14:anchorId="242A5F08" wp14:editId="4C106594">
+          <wp:inline distT="0" distB="0" distL="0" distR="0" wp14:anchorId="509AF536" wp14:editId="5E791418">
             <wp:extent cx="5303520" cy="4792851"/>
             <wp:effectExtent l="19050" t="19050" r="11430" b="27305"/>
-            <wp:docPr id="270762339" name="Imagem 43"/>
+            <wp:docPr id="889566365" name="Imagem 43"/>
             <wp:cNvGraphicFramePr/>
             <a:graphic xmlns:a="http://schemas.openxmlformats.org/drawingml/2006/main">
               <a:graphicData uri="http://schemas.openxmlformats.org/drawingml/2006/picture">
                 <pic:pic xmlns:pic="http://schemas.openxmlformats.org/drawingml/2006/picture">
                   <pic:nvPicPr>
-                    <pic:cNvPr id="270762339" name=""/>
+                    <pic:cNvPr id="889566365" name=""/>
                     <pic:cNvPicPr/>
                   </pic:nvPicPr>
                   <pic:blipFill>
@@ -13792,16 +13896,16 @@
         </w:rPr>
         <w:lastRenderedPageBreak/>
         <w:drawing>
-          <wp:inline distT="0" distB="0" distL="0" distR="0" wp14:anchorId="179E60F7" wp14:editId="45D5A52D">
+          <wp:inline distT="0" distB="0" distL="0" distR="0" wp14:anchorId="6E19B471" wp14:editId="0F004281">
             <wp:extent cx="5303520" cy="4792851"/>
             <wp:effectExtent l="19050" t="19050" r="11430" b="27305"/>
-            <wp:docPr id="1865913886" name="Imagem 44"/>
+            <wp:docPr id="752239484" name="Imagem 44"/>
             <wp:cNvGraphicFramePr/>
             <a:graphic xmlns:a="http://schemas.openxmlformats.org/drawingml/2006/main">
               <a:graphicData uri="http://schemas.openxmlformats.org/drawingml/2006/picture">
                 <pic:pic xmlns:pic="http://schemas.openxmlformats.org/drawingml/2006/picture">
                   <pic:nvPicPr>
-                    <pic:cNvPr id="1865913886" name=""/>
+                    <pic:cNvPr id="752239484" name=""/>
                     <pic:cNvPicPr/>
                   </pic:nvPicPr>
                   <pic:blipFill>
@@ -13894,7 +13998,7 @@
           <w:sz w:val="34"/>
         </w:rPr>
       </w:pPr>
-      <w:bookmarkStart w:id="32" w:name="_Toc236515602"/>
+      <w:bookmarkStart w:id="32" w:name="_Toc236645696"/>
       <w:r>
         <w:rPr>
           <w:rFonts w:ascii="Montserrat" w:hAnsi="Montserrat"/>
@@ -13903,7 +14007,7 @@
           <w:sz w:val="34"/>
         </w:rPr>
         <w:lastRenderedPageBreak/>
-        <w:t>6. Administracao do sistema</w:t>
+        <w:t>6. Administracao e Painel Executivo</w:t>
       </w:r>
       <w:bookmarkEnd w:id="32"/>
     </w:p>
@@ -13922,7 +14026,7 @@
           <w:color w:val="1A1A1A"/>
           <w:sz w:val="22"/>
         </w:rPr>
-        <w:t>Pagina restrita a usuarios com papel Admin (secao 2.3). Reune tres abas: Usuarios, Equipes e Configuracoes.</w:t>
+        <w:t>Duas paginas independentes, ambas restritas a usuarios com papel Admin (secao 2.3) e listadas no menu lateral em Gestao: a Administracao (gerencia usuarios, equipes e configuracoes) e o Painel Executivo (visao consolidada e agregada de todo o sistema).</w:t>
       </w:r>
     </w:p>
     <w:p>
@@ -13936,7 +14040,7 @@
           <w:sz w:val="27"/>
         </w:rPr>
       </w:pPr>
-      <w:bookmarkStart w:id="33" w:name="_Toc236515603"/>
+      <w:bookmarkStart w:id="33" w:name="_Toc236645697"/>
       <w:r>
         <w:rPr>
           <w:rFonts w:ascii="Montserrat" w:hAnsi="Montserrat"/>
@@ -13976,16 +14080,16 @@
           <w:noProof/>
         </w:rPr>
         <w:drawing>
-          <wp:inline distT="0" distB="0" distL="0" distR="0" wp14:anchorId="74578443" wp14:editId="69D24C55">
+          <wp:inline distT="0" distB="0" distL="0" distR="0" wp14:anchorId="25E163C8" wp14:editId="04CB85F6">
             <wp:extent cx="5303520" cy="4792851"/>
             <wp:effectExtent l="19050" t="19050" r="11430" b="27305"/>
-            <wp:docPr id="1914188933" name="Imagem 45"/>
+            <wp:docPr id="36855441" name="Imagem 45"/>
             <wp:cNvGraphicFramePr/>
             <a:graphic xmlns:a="http://schemas.openxmlformats.org/drawingml/2006/main">
               <a:graphicData uri="http://schemas.openxmlformats.org/drawingml/2006/picture">
                 <pic:pic xmlns:pic="http://schemas.openxmlformats.org/drawingml/2006/picture">
                   <pic:nvPicPr>
-                    <pic:cNvPr id="1914188933" name=""/>
+                    <pic:cNvPr id="36855441" name=""/>
                     <pic:cNvPicPr/>
                   </pic:nvPicPr>
                   <pic:blipFill>
@@ -14053,7 +14157,7 @@
           <w:sz w:val="27"/>
         </w:rPr>
       </w:pPr>
-      <w:bookmarkStart w:id="34" w:name="_Toc236515604"/>
+      <w:bookmarkStart w:id="34" w:name="_Toc236645698"/>
       <w:r>
         <w:rPr>
           <w:rFonts w:ascii="Montserrat" w:hAnsi="Montserrat"/>
@@ -14061,6 +14165,7 @@
           <w:color w:val="B91D2E"/>
           <w:sz w:val="27"/>
         </w:rPr>
+        <w:lastRenderedPageBreak/>
         <w:t>6.2 Equipes</w:t>
       </w:r>
       <w:bookmarkEnd w:id="34"/>
@@ -14092,18 +14197,17 @@
         <w:rPr>
           <w:noProof/>
         </w:rPr>
-        <w:lastRenderedPageBreak/>
         <w:drawing>
-          <wp:inline distT="0" distB="0" distL="0" distR="0" wp14:anchorId="37CFEE99" wp14:editId="7BA6D40D">
+          <wp:inline distT="0" distB="0" distL="0" distR="0" wp14:anchorId="107530DF" wp14:editId="061A972E">
             <wp:extent cx="5303520" cy="4792851"/>
             <wp:effectExtent l="19050" t="19050" r="11430" b="27305"/>
-            <wp:docPr id="1429128015" name="Imagem 46"/>
+            <wp:docPr id="771957072" name="Imagem 46"/>
             <wp:cNvGraphicFramePr/>
             <a:graphic xmlns:a="http://schemas.openxmlformats.org/drawingml/2006/main">
               <a:graphicData uri="http://schemas.openxmlformats.org/drawingml/2006/picture">
                 <pic:pic xmlns:pic="http://schemas.openxmlformats.org/drawingml/2006/picture">
                   <pic:nvPicPr>
-                    <pic:cNvPr id="1429128015" name=""/>
+                    <pic:cNvPr id="771957072" name=""/>
                     <pic:cNvPicPr/>
                   </pic:nvPicPr>
                   <pic:blipFill>
@@ -14171,7 +14275,7 @@
           <w:sz w:val="27"/>
         </w:rPr>
       </w:pPr>
-      <w:bookmarkStart w:id="35" w:name="_Toc236515605"/>
+      <w:bookmarkStart w:id="35" w:name="_Toc236645699"/>
       <w:r>
         <w:rPr>
           <w:rFonts w:ascii="Montserrat" w:hAnsi="Montserrat"/>
@@ -14212,16 +14316,16 @@
         </w:rPr>
         <w:lastRenderedPageBreak/>
         <w:drawing>
-          <wp:inline distT="0" distB="0" distL="0" distR="0" wp14:anchorId="4E8F5BCC" wp14:editId="45011CDF">
+          <wp:inline distT="0" distB="0" distL="0" distR="0" wp14:anchorId="2B63A9C7" wp14:editId="53A498B7">
             <wp:extent cx="5303520" cy="4792851"/>
             <wp:effectExtent l="19050" t="19050" r="11430" b="27305"/>
-            <wp:docPr id="523644764" name="Imagem 47"/>
+            <wp:docPr id="251727167" name="Imagem 47"/>
             <wp:cNvGraphicFramePr/>
             <a:graphic xmlns:a="http://schemas.openxmlformats.org/drawingml/2006/main">
               <a:graphicData uri="http://schemas.openxmlformats.org/drawingml/2006/picture">
                 <pic:pic xmlns:pic="http://schemas.openxmlformats.org/drawingml/2006/picture">
                   <pic:nvPicPr>
-                    <pic:cNvPr id="523644764" name=""/>
+                    <pic:cNvPr id="251727167" name=""/>
                     <pic:cNvPicPr/>
                   </pic:nvPicPr>
                   <pic:blipFill>
@@ -14280,6 +14384,326 @@
     </w:p>
     <w:p>
       <w:pPr>
+        <w:pStyle w:val="Ttulo2"/>
+        <w:spacing w:before="320" w:after="120"/>
+        <w:rPr>
+          <w:rFonts w:ascii="Montserrat" w:hAnsi="Montserrat"/>
+          <w:b/>
+          <w:color w:val="B91D2E"/>
+          <w:sz w:val="27"/>
+        </w:rPr>
+      </w:pPr>
+      <w:bookmarkStart w:id="36" w:name="_Toc236645700"/>
+      <w:r>
+        <w:rPr>
+          <w:rFonts w:ascii="Montserrat" w:hAnsi="Montserrat"/>
+          <w:b/>
+          <w:color w:val="B91D2E"/>
+          <w:sz w:val="27"/>
+        </w:rPr>
+        <w:t>6.4 Painel Executivo</w:t>
+      </w:r>
+      <w:bookmarkEnd w:id="36"/>
+    </w:p>
+    <w:p>
+      <w:pPr>
+        <w:spacing w:line="280" w:lineRule="auto"/>
+        <w:rPr>
+          <w:rFonts w:ascii="Montserrat" w:hAnsi="Montserrat"/>
+          <w:color w:val="1A1A1A"/>
+          <w:sz w:val="22"/>
+        </w:rPr>
+      </w:pPr>
+      <w:r>
+        <w:rPr>
+          <w:rFonts w:ascii="Montserrat" w:hAnsi="Montserrat"/>
+          <w:color w:val="1A1A1A"/>
+          <w:sz w:val="22"/>
+        </w:rPr>
+        <w:t>Pagina nova, tambem restrita a Admin, que agrega em tempo real dados de todos os 10 formularios de registro e dos 2 relatorios - sem exigir nenhuma mudanca no banco de dados, apenas consultando o que ja esta salvo. Pensada para dar ao PMO uma visao geral do sistema inteiro em uma unica tela, sem precisar abrir cada formulario individualmente.</w:t>
+      </w:r>
+    </w:p>
+    <w:p>
+      <w:pPr>
+        <w:pStyle w:val="PargrafodaLista"/>
+        <w:numPr>
+          <w:ilvl w:val="0"/>
+          <w:numId w:val="17"/>
+        </w:numPr>
+        <w:spacing w:after="80" w:line="260" w:lineRule="auto"/>
+        <w:ind w:left="700"/>
+        <w:rPr>
+          <w:rFonts w:ascii="Montserrat" w:hAnsi="Montserrat"/>
+          <w:color w:val="1A1A1A"/>
+          <w:sz w:val="22"/>
+        </w:rPr>
+      </w:pPr>
+      <w:r>
+        <w:rPr>
+          <w:rFonts w:ascii="Montserrat" w:hAnsi="Montserrat"/>
+          <w:color w:val="1A1A1A"/>
+          <w:sz w:val="22"/>
+        </w:rPr>
+        <w:t>Gates de aprovacao: contagem de Solicitacoes de Demanda por status (Gate 1) e o status atual do Relatorio de Entregas (Gate 2 - Pactuacao).</w:t>
+      </w:r>
+    </w:p>
+    <w:p>
+      <w:pPr>
+        <w:pStyle w:val="PargrafodaLista"/>
+        <w:numPr>
+          <w:ilvl w:val="0"/>
+          <w:numId w:val="17"/>
+        </w:numPr>
+        <w:spacing w:after="80" w:line="260" w:lineRule="auto"/>
+        <w:ind w:left="700"/>
+        <w:rPr>
+          <w:rFonts w:ascii="Montserrat" w:hAnsi="Montserrat"/>
+          <w:color w:val="1A1A1A"/>
+          <w:sz w:val="22"/>
+        </w:rPr>
+      </w:pPr>
+      <w:r>
+        <w:rPr>
+          <w:rFonts w:ascii="Montserrat" w:hAnsi="Montserrat"/>
+          <w:color w:val="1A1A1A"/>
+          <w:sz w:val="22"/>
+        </w:rPr>
+        <w:t>Governanca (dados do Relatorio de Situacao - secao 4.1): quantidade de Entraves e Encaminhamentos ainda Aberto, e quantos Resultados alcancados ja foram registrados.</w:t>
+      </w:r>
+    </w:p>
+    <w:p>
+      <w:pPr>
+        <w:pStyle w:val="PargrafodaLista"/>
+        <w:numPr>
+          <w:ilvl w:val="0"/>
+          <w:numId w:val="17"/>
+        </w:numPr>
+        <w:spacing w:after="80" w:line="260" w:lineRule="auto"/>
+        <w:ind w:left="700"/>
+        <w:rPr>
+          <w:rFonts w:ascii="Montserrat" w:hAnsi="Montserrat"/>
+          <w:color w:val="1A1A1A"/>
+          <w:sz w:val="22"/>
+        </w:rPr>
+      </w:pPr>
+      <w:r>
+        <w:rPr>
+          <w:rFonts w:ascii="Montserrat" w:hAnsi="Montserrat"/>
+          <w:color w:val="1A1A1A"/>
+          <w:sz w:val="22"/>
+        </w:rPr>
+        <w:t xml:space="preserve">Registros por formulario: uma linha por artefato (Canvas, TAP, Planejamento, EAP, SMP, Ata de Reuniao, TEP, RLA, alem da propria </w:t>
+      </w:r>
+      <w:r>
+        <w:rPr>
+          <w:rFonts w:ascii="Montserrat" w:hAnsi="Montserrat"/>
+          <w:color w:val="1A1A1A"/>
+          <w:sz w:val="22"/>
+        </w:rPr>
+        <w:lastRenderedPageBreak/>
+        <w:t>Solicitacao de Demanda), com o total e a contagem por status de cada um.</w:t>
+      </w:r>
+    </w:p>
+    <w:p>
+      <w:pPr>
+        <w:pStyle w:val="PargrafodaLista"/>
+        <w:numPr>
+          <w:ilvl w:val="0"/>
+          <w:numId w:val="17"/>
+        </w:numPr>
+        <w:spacing w:after="80" w:line="260" w:lineRule="auto"/>
+        <w:ind w:left="700"/>
+        <w:rPr>
+          <w:rFonts w:ascii="Montserrat" w:hAnsi="Montserrat"/>
+          <w:color w:val="1A1A1A"/>
+          <w:sz w:val="22"/>
+        </w:rPr>
+      </w:pPr>
+      <w:r>
+        <w:rPr>
+          <w:rFonts w:ascii="Montserrat" w:hAnsi="Montserrat"/>
+          <w:color w:val="1A1A1A"/>
+          <w:sz w:val="22"/>
+        </w:rPr>
+        <w:t>Portfolio de projetos: contagem de projetos Aprovados, Reprovados e em avaliacao no Gate 1, a partir do cadastro compartilhado (secao 2.5).</w:t>
+      </w:r>
+    </w:p>
+    <w:p>
+      <w:pPr>
+        <w:spacing w:before="120" w:after="40"/>
+        <w:jc w:val="center"/>
+      </w:pPr>
+      <w:r>
+        <w:rPr>
+          <w:noProof/>
+        </w:rPr>
+        <w:drawing>
+          <wp:inline distT="0" distB="0" distL="0" distR="0" wp14:anchorId="6868402A" wp14:editId="0B209DE0">
+            <wp:extent cx="5303520" cy="4267180"/>
+            <wp:effectExtent l="19050" t="19050" r="11430" b="19685"/>
+            <wp:docPr id="1243211353" name="Imagem 48"/>
+            <wp:cNvGraphicFramePr/>
+            <a:graphic xmlns:a="http://schemas.openxmlformats.org/drawingml/2006/main">
+              <a:graphicData uri="http://schemas.openxmlformats.org/drawingml/2006/picture">
+                <pic:pic xmlns:pic="http://schemas.openxmlformats.org/drawingml/2006/picture">
+                  <pic:nvPicPr>
+                    <pic:cNvPr id="1243211353" name=""/>
+                    <pic:cNvPicPr/>
+                  </pic:nvPicPr>
+                  <pic:blipFill>
+                    <a:blip r:embed="rId54">
+                      <a:extLst>
+                        <a:ext uri="{28A0092B-C50C-407E-A947-70E740481C1C}">
+                          <a14:useLocalDpi xmlns:a14="http://schemas.microsoft.com/office/drawing/2010/main" val="0"/>
+                        </a:ext>
+                      </a:extLst>
+                    </a:blip>
+                    <a:stretch>
+                      <a:fillRect/>
+                    </a:stretch>
+                  </pic:blipFill>
+                  <pic:spPr>
+                    <a:xfrm>
+                      <a:off x="0" y="0"/>
+                      <a:ext cx="5303520" cy="4267180"/>
+                    </a:xfrm>
+                    <a:prstGeom prst="rect">
+                      <a:avLst/>
+                    </a:prstGeom>
+                    <a:ln w="9525">
+                      <a:solidFill>
+                        <a:srgbClr val="D1D5DB"/>
+                      </a:solidFill>
+                    </a:ln>
+                  </pic:spPr>
+                </pic:pic>
+              </a:graphicData>
+            </a:graphic>
+          </wp:inline>
+        </w:drawing>
+      </w:r>
+    </w:p>
+    <w:p>
+      <w:pPr>
+        <w:spacing w:before="120" w:after="280"/>
+        <w:jc w:val="center"/>
+        <w:rPr>
+          <w:rFonts w:ascii="Montserrat" w:hAnsi="Montserrat"/>
+          <w:i/>
+          <w:color w:val="6A6A70"/>
+          <w:sz w:val="19"/>
+        </w:rPr>
+      </w:pPr>
+      <w:r>
+        <w:rPr>
+          <w:rFonts w:ascii="Montserrat" w:hAnsi="Montserrat"/>
+          <w:i/>
+          <w:color w:val="6A6A70"/>
+          <w:sz w:val="19"/>
+        </w:rPr>
+        <w:t>Painel Executivo: Gates de aprovacao e indicadores de governanca do Relatorio de Situacao.</w:t>
+      </w:r>
+    </w:p>
+    <w:p>
+      <w:pPr>
+        <w:spacing w:before="120" w:after="40"/>
+        <w:jc w:val="center"/>
+      </w:pPr>
+      <w:r>
+        <w:rPr>
+          <w:noProof/>
+        </w:rPr>
+        <w:lastRenderedPageBreak/>
+        <w:drawing>
+          <wp:inline distT="0" distB="0" distL="0" distR="0" wp14:anchorId="0A08B9D1" wp14:editId="422004D5">
+            <wp:extent cx="5303520" cy="3962338"/>
+            <wp:effectExtent l="19050" t="19050" r="11430" b="19685"/>
+            <wp:docPr id="918951862" name="Imagem 49"/>
+            <wp:cNvGraphicFramePr/>
+            <a:graphic xmlns:a="http://schemas.openxmlformats.org/drawingml/2006/main">
+              <a:graphicData uri="http://schemas.openxmlformats.org/drawingml/2006/picture">
+                <pic:pic xmlns:pic="http://schemas.openxmlformats.org/drawingml/2006/picture">
+                  <pic:nvPicPr>
+                    <pic:cNvPr id="918951862" name=""/>
+                    <pic:cNvPicPr/>
+                  </pic:nvPicPr>
+                  <pic:blipFill>
+                    <a:blip r:embed="rId55">
+                      <a:extLst>
+                        <a:ext uri="{28A0092B-C50C-407E-A947-70E740481C1C}">
+                          <a14:useLocalDpi xmlns:a14="http://schemas.microsoft.com/office/drawing/2010/main" val="0"/>
+                        </a:ext>
+                      </a:extLst>
+                    </a:blip>
+                    <a:stretch>
+                      <a:fillRect/>
+                    </a:stretch>
+                  </pic:blipFill>
+                  <pic:spPr>
+                    <a:xfrm>
+                      <a:off x="0" y="0"/>
+                      <a:ext cx="5303520" cy="3962338"/>
+                    </a:xfrm>
+                    <a:prstGeom prst="rect">
+                      <a:avLst/>
+                    </a:prstGeom>
+                    <a:ln w="9525">
+                      <a:solidFill>
+                        <a:srgbClr val="D1D5DB"/>
+                      </a:solidFill>
+                    </a:ln>
+                  </pic:spPr>
+                </pic:pic>
+              </a:graphicData>
+            </a:graphic>
+          </wp:inline>
+        </w:drawing>
+      </w:r>
+    </w:p>
+    <w:p>
+      <w:pPr>
+        <w:spacing w:before="120" w:after="280"/>
+        <w:jc w:val="center"/>
+        <w:rPr>
+          <w:rFonts w:ascii="Montserrat" w:hAnsi="Montserrat"/>
+          <w:i/>
+          <w:color w:val="6A6A70"/>
+          <w:sz w:val="19"/>
+        </w:rPr>
+      </w:pPr>
+      <w:r>
+        <w:rPr>
+          <w:rFonts w:ascii="Montserrat" w:hAnsi="Montserrat"/>
+          <w:i/>
+          <w:color w:val="6A6A70"/>
+          <w:sz w:val="19"/>
+        </w:rPr>
+        <w:t>Registros por formulario e portfolio de projetos, com contagem por status.</w:t>
+      </w:r>
+    </w:p>
+    <w:p>
+      <w:pPr>
+        <w:spacing w:before="160" w:after="200"/>
+        <w:ind w:left="283"/>
+        <w:rPr>
+          <w:rFonts w:ascii="Montserrat" w:hAnsi="Montserrat"/>
+          <w:i/>
+          <w:color w:val="6A6A70"/>
+          <w:sz w:val="21"/>
+        </w:rPr>
+      </w:pPr>
+      <w:r>
+        <w:rPr>
+          <w:rFonts w:ascii="Montserrat" w:hAnsi="Montserrat"/>
+          <w:i/>
+          <w:color w:val="6A6A70"/>
+          <w:sz w:val="21"/>
+        </w:rPr>
+        <w:t>Por reunir dados de varios formularios numa unica tela, o carregamento faz uma consulta para cada um dos 10 formularios de registro - pode levar alguns segundos a mais que os outros formularios da ferramenta. Clique em Atualizar para recarregar os numeros mais recentes a qualquer momento.</w:t>
+      </w:r>
+    </w:p>
+    <w:p>
+      <w:pPr>
         <w:pStyle w:val="Ttulo1"/>
         <w:pageBreakBefore/>
         <w:pBdr>
@@ -14293,7 +14717,7 @@
           <w:sz w:val="34"/>
         </w:rPr>
       </w:pPr>
-      <w:bookmarkStart w:id="36" w:name="_Toc236515606"/>
+      <w:bookmarkStart w:id="37" w:name="_Toc236645701"/>
       <w:r>
         <w:rPr>
           <w:rFonts w:ascii="Montserrat" w:hAnsi="Montserrat"/>
@@ -14304,7 +14728,7 @@
         <w:lastRenderedPageBreak/>
         <w:t>7. Perguntas frequentes</w:t>
       </w:r>
-      <w:bookmarkEnd w:id="36"/>
+      <w:bookmarkEnd w:id="37"/>
     </w:p>
     <w:p>
       <w:pPr>
@@ -14537,7 +14961,7 @@
           <w:sz w:val="34"/>
         </w:rPr>
       </w:pPr>
-      <w:bookmarkStart w:id="37" w:name="_Toc236515607"/>
+      <w:bookmarkStart w:id="38" w:name="_Toc236645702"/>
       <w:r>
         <w:rPr>
           <w:rFonts w:ascii="Montserrat" w:hAnsi="Montserrat"/>
@@ -14548,7 +14972,7 @@
         <w:lastRenderedPageBreak/>
         <w:t>8. Anexo - Tabela de artefatos</w:t>
       </w:r>
-      <w:bookmarkEnd w:id="37"/>
+      <w:bookmarkEnd w:id="38"/>
     </w:p>
     <w:tbl>
       <w:tblPr>
@@ -16083,12 +16507,12 @@
       </w:pPr>
     </w:p>
     <w:sectPr>
-      <w:headerReference w:type="even" r:id="rId54"/>
-      <w:headerReference w:type="default" r:id="rId55"/>
-      <w:footerReference w:type="even" r:id="rId56"/>
-      <w:footerReference w:type="default" r:id="rId57"/>
-      <w:headerReference w:type="first" r:id="rId58"/>
-      <w:footerReference w:type="first" r:id="rId59"/>
+      <w:headerReference w:type="even" r:id="rId56"/>
+      <w:headerReference w:type="default" r:id="rId57"/>
+      <w:footerReference w:type="even" r:id="rId58"/>
+      <w:footerReference w:type="default" r:id="rId59"/>
+      <w:headerReference w:type="first" r:id="rId60"/>
+      <w:footerReference w:type="first" r:id="rId61"/>
       <w:pgSz w:w="12240" w:h="15840"/>
       <w:pgMar w:top="1417" w:right="1701" w:bottom="1417" w:left="1701" w:header="708" w:footer="708" w:gutter="0"/>
       <w:cols w:space="708"/>
@@ -16247,7 +16671,7 @@
 <file path=word/numbering.xml><?xml version="1.0" encoding="utf-8"?>
 <w:numbering xmlns:wpc="http://schemas.microsoft.com/office/word/2010/wordprocessingCanvas" xmlns:cx="http://schemas.microsoft.com/office/drawing/2014/chartex" xmlns:cx1="http://schemas.microsoft.com/office/drawing/2015/9/8/chartex" xmlns:cx2="http://schemas.microsoft.com/office/drawing/2015/10/21/chartex" xmlns:cx3="http://schemas.microsoft.com/office/drawing/2016/5/9/chartex" xmlns:cx4="http://schemas.microsoft.com/office/drawing/2016/5/10/chartex" xmlns:cx5="http://schemas.microsoft.com/office/drawing/2016/5/11/chartex" xmlns:cx6="http://schemas.microsoft.com/office/drawing/2016/5/12/chartex" xmlns:cx7="http://schemas.microsoft.com/office/drawing/2016/5/13/chartex" xmlns:cx8="http://schemas.microsoft.com/office/drawing/2016/5/14/chartex" xmlns:mc="http://schemas.openxmlformats.org/markup-compatibility/2006" xmlns:aink="http://schemas.microsoft.com/office/drawing/2016/ink" xmlns:am3d="http://schemas.microsoft.com/office/drawing/2017/model3d" xmlns:o="urn:schemas-microsoft-com:office:office" xmlns:oel="http://schemas.microsoft.com/office/2019/extlst" xmlns:r="http://schemas.openxmlformats.org/officeDocument/2006/relationships" xmlns:m="http://schemas.openxmlformats.org/officeDocument/2006/math" xmlns:v="urn:schemas-microsoft-com:vml" xmlns:wp14="http://schemas.microsoft.com/office/word/2010/wordprocessingDrawing" xmlns:wp="http://schemas.openxmlformats.org/drawingml/2006/wordprocessingDrawing" xmlns:w10="urn:schemas-microsoft-com:office:word" xmlns:w="http://schemas.openxmlformats.org/wordprocessingml/2006/main" xmlns:w14="http://schemas.microsoft.com/office/word/2010/wordml" xmlns:w15="http://schemas.microsoft.com/office/word/2012/wordml" xmlns:w16cei="http://schemas.microsoft.com/office/word/2026/wordml/cei" xmlns:w16cex="http://schemas.microsoft.com/office/word/2018/wordml/cex" xmlns:w16cid="http://schemas.microsoft.com/office/word/2016/wordml/cid" xmlns:w16="http://schemas.microsoft.com/office/word/2018/wordml" xmlns:w16du="http://schemas.microsoft.com/office/word/2023/wordml/word16du" xmlns:w16sdtdh="http://schemas.microsoft.com/office/word/2020/wordml/sdtdatahash" xmlns:w16sdtfl="http://schemas.microsoft.com/office/word/2024/wordml/sdtformatlock" xmlns:w16se="http://schemas.microsoft.com/office/word/2015/wordml/symex" xmlns:wpg="http://schemas.microsoft.com/office/word/2010/wordprocessingGroup" xmlns:wpi="http://schemas.microsoft.com/office/word/2010/wordprocessingInk" xmlns:wne="http://schemas.microsoft.com/office/word/2006/wordml" xmlns:wps="http://schemas.microsoft.com/office/word/2010/wordprocessingShape" mc:Ignorable="w14 w15 w16se w16cid w16 w16cex w16sdtdh w16sdtfl w16du wp14">
   <w:abstractNum w:abstractNumId="0" w15:restartNumberingAfterBreak="0">
-    <w:nsid w:val="03062C05"/>
+    <w:nsid w:val="04450918"/>
     <w:multiLevelType w:val="singleLevel"/>
     <w:tmpl w:val="04160001"/>
     <w:lvl w:ilvl="0">
@@ -16264,7 +16688,7 @@
     </w:lvl>
   </w:abstractNum>
   <w:abstractNum w:abstractNumId="1" w15:restartNumberingAfterBreak="0">
-    <w:nsid w:val="06E94EE9"/>
+    <w:nsid w:val="07CB36C9"/>
     <w:multiLevelType w:val="singleLevel"/>
     <w:tmpl w:val="04160001"/>
     <w:lvl w:ilvl="0">
@@ -16281,7 +16705,7 @@
     </w:lvl>
   </w:abstractNum>
   <w:abstractNum w:abstractNumId="2" w15:restartNumberingAfterBreak="0">
-    <w:nsid w:val="08C04BB1"/>
+    <w:nsid w:val="0D9B2001"/>
     <w:multiLevelType w:val="singleLevel"/>
     <w:tmpl w:val="04160001"/>
     <w:lvl w:ilvl="0">
@@ -16298,7 +16722,7 @@
     </w:lvl>
   </w:abstractNum>
   <w:abstractNum w:abstractNumId="3" w15:restartNumberingAfterBreak="0">
-    <w:nsid w:val="0BBB2CED"/>
+    <w:nsid w:val="223D285E"/>
     <w:multiLevelType w:val="singleLevel"/>
     <w:tmpl w:val="04160001"/>
     <w:lvl w:ilvl="0">
@@ -16315,7 +16739,7 @@
     </w:lvl>
   </w:abstractNum>
   <w:abstractNum w:abstractNumId="4" w15:restartNumberingAfterBreak="0">
-    <w:nsid w:val="0DD13D28"/>
+    <w:nsid w:val="24371BC6"/>
     <w:multiLevelType w:val="singleLevel"/>
     <w:tmpl w:val="04160001"/>
     <w:lvl w:ilvl="0">
@@ -16332,7 +16756,7 @@
     </w:lvl>
   </w:abstractNum>
   <w:abstractNum w:abstractNumId="5" w15:restartNumberingAfterBreak="0">
-    <w:nsid w:val="11FA4DFC"/>
+    <w:nsid w:val="260C5CC2"/>
     <w:multiLevelType w:val="singleLevel"/>
     <w:tmpl w:val="04160001"/>
     <w:lvl w:ilvl="0">
@@ -16349,7 +16773,7 @@
     </w:lvl>
   </w:abstractNum>
   <w:abstractNum w:abstractNumId="6" w15:restartNumberingAfterBreak="0">
-    <w:nsid w:val="162F4EE9"/>
+    <w:nsid w:val="2C35344A"/>
     <w:multiLevelType w:val="singleLevel"/>
     <w:tmpl w:val="04160001"/>
     <w:lvl w:ilvl="0">
@@ -16366,7 +16790,7 @@
     </w:lvl>
   </w:abstractNum>
   <w:abstractNum w:abstractNumId="7" w15:restartNumberingAfterBreak="0">
-    <w:nsid w:val="1CC265E2"/>
+    <w:nsid w:val="304B75FE"/>
     <w:multiLevelType w:val="singleLevel"/>
     <w:tmpl w:val="04160001"/>
     <w:lvl w:ilvl="0">
@@ -16383,7 +16807,7 @@
     </w:lvl>
   </w:abstractNum>
   <w:abstractNum w:abstractNumId="8" w15:restartNumberingAfterBreak="0">
-    <w:nsid w:val="24D70424"/>
+    <w:nsid w:val="4D270BC7"/>
     <w:multiLevelType w:val="singleLevel"/>
     <w:tmpl w:val="04160001"/>
     <w:lvl w:ilvl="0">
@@ -16400,7 +16824,7 @@
     </w:lvl>
   </w:abstractNum>
   <w:abstractNum w:abstractNumId="9" w15:restartNumberingAfterBreak="0">
-    <w:nsid w:val="3D8970F2"/>
+    <w:nsid w:val="5CAA2A33"/>
     <w:multiLevelType w:val="singleLevel"/>
     <w:tmpl w:val="04160001"/>
     <w:lvl w:ilvl="0">
@@ -16417,7 +16841,7 @@
     </w:lvl>
   </w:abstractNum>
   <w:abstractNum w:abstractNumId="10" w15:restartNumberingAfterBreak="0">
-    <w:nsid w:val="416A4438"/>
+    <w:nsid w:val="664831C5"/>
     <w:multiLevelType w:val="singleLevel"/>
     <w:tmpl w:val="04160001"/>
     <w:lvl w:ilvl="0">
@@ -16434,7 +16858,7 @@
     </w:lvl>
   </w:abstractNum>
   <w:abstractNum w:abstractNumId="11" w15:restartNumberingAfterBreak="0">
-    <w:nsid w:val="47C17801"/>
+    <w:nsid w:val="6D5D5862"/>
     <w:multiLevelType w:val="singleLevel"/>
     <w:tmpl w:val="04160001"/>
     <w:lvl w:ilvl="0">
@@ -16451,7 +16875,7 @@
     </w:lvl>
   </w:abstractNum>
   <w:abstractNum w:abstractNumId="12" w15:restartNumberingAfterBreak="0">
-    <w:nsid w:val="51FA1DBE"/>
+    <w:nsid w:val="6E3B23BC"/>
     <w:multiLevelType w:val="singleLevel"/>
     <w:tmpl w:val="04160001"/>
     <w:lvl w:ilvl="0">
@@ -16468,7 +16892,7 @@
     </w:lvl>
   </w:abstractNum>
   <w:abstractNum w:abstractNumId="13" w15:restartNumberingAfterBreak="0">
-    <w:nsid w:val="5BA93CAF"/>
+    <w:nsid w:val="73A14108"/>
     <w:multiLevelType w:val="singleLevel"/>
     <w:tmpl w:val="04160001"/>
     <w:lvl w:ilvl="0">
@@ -16485,7 +16909,7 @@
     </w:lvl>
   </w:abstractNum>
   <w:abstractNum w:abstractNumId="14" w15:restartNumberingAfterBreak="0">
-    <w:nsid w:val="6906509F"/>
+    <w:nsid w:val="781E78AF"/>
     <w:multiLevelType w:val="singleLevel"/>
     <w:tmpl w:val="04160001"/>
     <w:lvl w:ilvl="0">
@@ -16502,7 +16926,7 @@
     </w:lvl>
   </w:abstractNum>
   <w:abstractNum w:abstractNumId="15" w15:restartNumberingAfterBreak="0">
-    <w:nsid w:val="75B97AC3"/>
+    <w:nsid w:val="78ED6F61"/>
     <w:multiLevelType w:val="singleLevel"/>
     <w:tmpl w:val="04160001"/>
     <w:lvl w:ilvl="0">
@@ -16519,7 +16943,7 @@
     </w:lvl>
   </w:abstractNum>
   <w:abstractNum w:abstractNumId="16" w15:restartNumberingAfterBreak="0">
-    <w:nsid w:val="765A1EF7"/>
+    <w:nsid w:val="7D127413"/>
     <w:multiLevelType w:val="singleLevel"/>
     <w:tmpl w:val="04160001"/>
     <w:lvl w:ilvl="0">
@@ -16535,56 +16959,56 @@
       </w:rPr>
     </w:lvl>
   </w:abstractNum>
-  <w:num w:numId="1" w16cid:durableId="1673491884">
+  <w:num w:numId="1" w16cid:durableId="675151897">
+    <w:abstractNumId w:val="9"/>
+  </w:num>
+  <w:num w:numId="2" w16cid:durableId="600065041">
+    <w:abstractNumId w:val="1"/>
+  </w:num>
+  <w:num w:numId="3" w16cid:durableId="2116316717">
+    <w:abstractNumId w:val="15"/>
+  </w:num>
+  <w:num w:numId="4" w16cid:durableId="895703023">
+    <w:abstractNumId w:val="3"/>
+  </w:num>
+  <w:num w:numId="5" w16cid:durableId="245892408">
+    <w:abstractNumId w:val="10"/>
+  </w:num>
+  <w:num w:numId="6" w16cid:durableId="1138453601">
     <w:abstractNumId w:val="4"/>
   </w:num>
-  <w:num w:numId="2" w16cid:durableId="1663317033">
-    <w:abstractNumId w:val="10"/>
+  <w:num w:numId="7" w16cid:durableId="474415615">
+    <w:abstractNumId w:val="7"/>
   </w:num>
-  <w:num w:numId="3" w16cid:durableId="1777283295">
+  <w:num w:numId="8" w16cid:durableId="1098795069">
+    <w:abstractNumId w:val="16"/>
+  </w:num>
+  <w:num w:numId="9" w16cid:durableId="1217472268">
+    <w:abstractNumId w:val="5"/>
+  </w:num>
+  <w:num w:numId="10" w16cid:durableId="1685546010">
+    <w:abstractNumId w:val="13"/>
+  </w:num>
+  <w:num w:numId="11" w16cid:durableId="898128834">
+    <w:abstractNumId w:val="11"/>
+  </w:num>
+  <w:num w:numId="12" w16cid:durableId="190729160">
+    <w:abstractNumId w:val="2"/>
+  </w:num>
+  <w:num w:numId="13" w16cid:durableId="1696232574">
     <w:abstractNumId w:val="8"/>
   </w:num>
-  <w:num w:numId="4" w16cid:durableId="742220853">
-    <w:abstractNumId w:val="7"/>
-  </w:num>
-  <w:num w:numId="5" w16cid:durableId="1879468148">
+  <w:num w:numId="14" w16cid:durableId="692803422">
     <w:abstractNumId w:val="14"/>
   </w:num>
-  <w:num w:numId="6" w16cid:durableId="465590927">
-    <w:abstractNumId w:val="13"/>
+  <w:num w:numId="15" w16cid:durableId="1025595829">
+    <w:abstractNumId w:val="6"/>
   </w:num>
-  <w:num w:numId="7" w16cid:durableId="202910999">
-    <w:abstractNumId w:val="16"/>
-  </w:num>
-  <w:num w:numId="8" w16cid:durableId="1602684331">
-    <w:abstractNumId w:val="5"/>
-  </w:num>
-  <w:num w:numId="9" w16cid:durableId="726995591">
-    <w:abstractNumId w:val="1"/>
-  </w:num>
-  <w:num w:numId="10" w16cid:durableId="365107037">
-    <w:abstractNumId w:val="0"/>
-  </w:num>
-  <w:num w:numId="11" w16cid:durableId="210268780">
-    <w:abstractNumId w:val="15"/>
-  </w:num>
-  <w:num w:numId="12" w16cid:durableId="1533103841">
+  <w:num w:numId="16" w16cid:durableId="727264771">
     <w:abstractNumId w:val="12"/>
   </w:num>
-  <w:num w:numId="13" w16cid:durableId="837773145">
-    <w:abstractNumId w:val="2"/>
-  </w:num>
-  <w:num w:numId="14" w16cid:durableId="2086223727">
-    <w:abstractNumId w:val="11"/>
-  </w:num>
-  <w:num w:numId="15" w16cid:durableId="2111853541">
-    <w:abstractNumId w:val="9"/>
-  </w:num>
-  <w:num w:numId="16" w16cid:durableId="1015153724">
-    <w:abstractNumId w:val="6"/>
-  </w:num>
-  <w:num w:numId="17" w16cid:durableId="326055469">
-    <w:abstractNumId w:val="3"/>
+  <w:num w:numId="17" w16cid:durableId="1470245403">
+    <w:abstractNumId w:val="0"/>
   </w:num>
 </w:numbering>
 </file>
@@ -16997,7 +17421,7 @@
     <w:link w:val="Ttulo1Char"/>
     <w:uiPriority w:val="9"/>
     <w:qFormat/>
-    <w:rsid w:val="001A6CAA"/>
+    <w:rsid w:val="00F50859"/>
     <w:pPr>
       <w:keepNext/>
       <w:keepLines/>
@@ -17019,7 +17443,7 @@
     <w:uiPriority w:val="9"/>
     <w:unhideWhenUsed/>
     <w:qFormat/>
-    <w:rsid w:val="001A6CAA"/>
+    <w:rsid w:val="00F50859"/>
     <w:pPr>
       <w:keepNext/>
       <w:keepLines/>
@@ -17042,7 +17466,7 @@
     <w:semiHidden/>
     <w:unhideWhenUsed/>
     <w:qFormat/>
-    <w:rsid w:val="001A6CAA"/>
+    <w:rsid w:val="00F50859"/>
     <w:pPr>
       <w:keepNext/>
       <w:keepLines/>
@@ -17065,7 +17489,7 @@
     <w:semiHidden/>
     <w:unhideWhenUsed/>
     <w:qFormat/>
-    <w:rsid w:val="001A6CAA"/>
+    <w:rsid w:val="00F50859"/>
     <w:pPr>
       <w:keepNext/>
       <w:keepLines/>
@@ -17088,7 +17512,7 @@
     <w:semiHidden/>
     <w:unhideWhenUsed/>
     <w:qFormat/>
-    <w:rsid w:val="001A6CAA"/>
+    <w:rsid w:val="00F50859"/>
     <w:pPr>
       <w:keepNext/>
       <w:keepLines/>
@@ -17109,7 +17533,7 @@
     <w:semiHidden/>
     <w:unhideWhenUsed/>
     <w:qFormat/>
-    <w:rsid w:val="001A6CAA"/>
+    <w:rsid w:val="00F50859"/>
     <w:pPr>
       <w:keepNext/>
       <w:keepLines/>
@@ -17132,7 +17556,7 @@
     <w:semiHidden/>
     <w:unhideWhenUsed/>
     <w:qFormat/>
-    <w:rsid w:val="001A6CAA"/>
+    <w:rsid w:val="00F50859"/>
     <w:pPr>
       <w:keepNext/>
       <w:keepLines/>
@@ -17153,7 +17577,7 @@
     <w:semiHidden/>
     <w:unhideWhenUsed/>
     <w:qFormat/>
-    <w:rsid w:val="001A6CAA"/>
+    <w:rsid w:val="00F50859"/>
     <w:pPr>
       <w:keepNext/>
       <w:keepLines/>
@@ -17176,7 +17600,7 @@
     <w:semiHidden/>
     <w:unhideWhenUsed/>
     <w:qFormat/>
-    <w:rsid w:val="001A6CAA"/>
+    <w:rsid w:val="00F50859"/>
     <w:pPr>
       <w:keepNext/>
       <w:keepLines/>
@@ -17220,7 +17644,7 @@
     <w:basedOn w:val="Fontepargpadro"/>
     <w:link w:val="Ttulo1"/>
     <w:uiPriority w:val="9"/>
-    <w:rsid w:val="001A6CAA"/>
+    <w:rsid w:val="00F50859"/>
     <w:rPr>
       <w:rFonts w:asciiTheme="majorHAnsi" w:eastAsiaTheme="majorEastAsia" w:hAnsiTheme="majorHAnsi" w:cstheme="majorBidi"/>
       <w:color w:val="0F4761" w:themeColor="accent1" w:themeShade="BF"/>
@@ -17233,7 +17657,7 @@
     <w:basedOn w:val="Fontepargpadro"/>
     <w:link w:val="Ttulo2"/>
     <w:uiPriority w:val="9"/>
-    <w:rsid w:val="001A6CAA"/>
+    <w:rsid w:val="00F50859"/>
     <w:rPr>
       <w:rFonts w:asciiTheme="majorHAnsi" w:eastAsiaTheme="majorEastAsia" w:hAnsiTheme="majorHAnsi" w:cstheme="majorBidi"/>
       <w:color w:val="0F4761" w:themeColor="accent1" w:themeShade="BF"/>
@@ -17247,7 +17671,7 @@
     <w:link w:val="Ttulo3"/>
     <w:uiPriority w:val="9"/>
     <w:semiHidden/>
-    <w:rsid w:val="001A6CAA"/>
+    <w:rsid w:val="00F50859"/>
     <w:rPr>
       <w:rFonts w:eastAsiaTheme="majorEastAsia" w:cstheme="majorBidi"/>
       <w:color w:val="0F4761" w:themeColor="accent1" w:themeShade="BF"/>
@@ -17261,7 +17685,7 @@
     <w:link w:val="Ttulo4"/>
     <w:uiPriority w:val="9"/>
     <w:semiHidden/>
-    <w:rsid w:val="001A6CAA"/>
+    <w:rsid w:val="00F50859"/>
     <w:rPr>
       <w:rFonts w:eastAsiaTheme="majorEastAsia" w:cstheme="majorBidi"/>
       <w:i/>
@@ -17275,7 +17699,7 @@
     <w:link w:val="Ttulo5"/>
     <w:uiPriority w:val="9"/>
     <w:semiHidden/>
-    <w:rsid w:val="001A6CAA"/>
+    <w:rsid w:val="00F50859"/>
     <w:rPr>
       <w:rFonts w:eastAsiaTheme="majorEastAsia" w:cstheme="majorBidi"/>
       <w:color w:val="0F4761" w:themeColor="accent1" w:themeShade="BF"/>
@@ -17287,7 +17711,7 @@
     <w:link w:val="Ttulo6"/>
     <w:uiPriority w:val="9"/>
     <w:semiHidden/>
-    <w:rsid w:val="001A6CAA"/>
+    <w:rsid w:val="00F50859"/>
     <w:rPr>
       <w:rFonts w:eastAsiaTheme="majorEastAsia" w:cstheme="majorBidi"/>
       <w:i/>
@@ -17301,7 +17725,7 @@
     <w:link w:val="Ttulo7"/>
     <w:uiPriority w:val="9"/>
     <w:semiHidden/>
-    <w:rsid w:val="001A6CAA"/>
+    <w:rsid w:val="00F50859"/>
     <w:rPr>
       <w:rFonts w:eastAsiaTheme="majorEastAsia" w:cstheme="majorBidi"/>
       <w:color w:val="595959" w:themeColor="text1" w:themeTint="A6"/>
@@ -17313,7 +17737,7 @@
     <w:link w:val="Ttulo8"/>
     <w:uiPriority w:val="9"/>
     <w:semiHidden/>
-    <w:rsid w:val="001A6CAA"/>
+    <w:rsid w:val="00F50859"/>
     <w:rPr>
       <w:rFonts w:eastAsiaTheme="majorEastAsia" w:cstheme="majorBidi"/>
       <w:i/>
@@ -17327,7 +17751,7 @@
     <w:link w:val="Ttulo9"/>
     <w:uiPriority w:val="9"/>
     <w:semiHidden/>
-    <w:rsid w:val="001A6CAA"/>
+    <w:rsid w:val="00F50859"/>
     <w:rPr>
       <w:rFonts w:eastAsiaTheme="majorEastAsia" w:cstheme="majorBidi"/>
       <w:color w:val="272727" w:themeColor="text1" w:themeTint="D8"/>
@@ -17340,7 +17764,7 @@
     <w:link w:val="TtuloChar"/>
     <w:uiPriority w:val="10"/>
     <w:qFormat/>
-    <w:rsid w:val="001A6CAA"/>
+    <w:rsid w:val="00F50859"/>
     <w:pPr>
       <w:spacing w:after="80" w:line="240" w:lineRule="auto"/>
       <w:contextualSpacing/>
@@ -17358,7 +17782,7 @@
     <w:basedOn w:val="Fontepargpadro"/>
     <w:link w:val="Ttulo"/>
     <w:uiPriority w:val="10"/>
-    <w:rsid w:val="001A6CAA"/>
+    <w:rsid w:val="00F50859"/>
     <w:rPr>
       <w:rFonts w:asciiTheme="majorHAnsi" w:eastAsiaTheme="majorEastAsia" w:hAnsiTheme="majorHAnsi" w:cstheme="majorBidi"/>
       <w:spacing w:val="-10"/>
@@ -17374,7 +17798,7 @@
     <w:link w:val="SubttuloChar"/>
     <w:uiPriority w:val="11"/>
     <w:qFormat/>
-    <w:rsid w:val="001A6CAA"/>
+    <w:rsid w:val="00F50859"/>
     <w:pPr>
       <w:numPr>
         <w:ilvl w:val="1"/>
@@ -17393,7 +17817,7 @@
     <w:basedOn w:val="Fontepargpadro"/>
     <w:link w:val="Subttulo"/>
     <w:uiPriority w:val="11"/>
-    <w:rsid w:val="001A6CAA"/>
+    <w:rsid w:val="00F50859"/>
     <w:rPr>
       <w:rFonts w:eastAsiaTheme="majorEastAsia" w:cstheme="majorBidi"/>
       <w:color w:val="595959" w:themeColor="text1" w:themeTint="A6"/>
@@ -17409,7 +17833,7 @@
     <w:link w:val="CitaoChar"/>
     <w:uiPriority w:val="29"/>
     <w:qFormat/>
-    <w:rsid w:val="001A6CAA"/>
+    <w:rsid w:val="00F50859"/>
     <w:pPr>
       <w:spacing w:before="160"/>
       <w:jc w:val="center"/>
@@ -17425,7 +17849,7 @@
     <w:basedOn w:val="Fontepargpadro"/>
     <w:link w:val="Citao"/>
     <w:uiPriority w:val="29"/>
-    <w:rsid w:val="001A6CAA"/>
+    <w:rsid w:val="00F50859"/>
     <w:rPr>
       <w:i/>
       <w:iCs/>
@@ -17437,7 +17861,7 @@
     <w:basedOn w:val="Normal"/>
     <w:uiPriority w:val="34"/>
     <w:qFormat/>
-    <w:rsid w:val="001A6CAA"/>
+    <w:rsid w:val="00F50859"/>
     <w:pPr>
       <w:ind w:left="720"/>
       <w:contextualSpacing/>
@@ -17448,7 +17872,7 @@
     <w:basedOn w:val="Fontepargpadro"/>
     <w:uiPriority w:val="21"/>
     <w:qFormat/>
-    <w:rsid w:val="001A6CAA"/>
+    <w:rsid w:val="00F50859"/>
     <w:rPr>
       <w:i/>
       <w:iCs/>
@@ -17462,7 +17886,7 @@
     <w:link w:val="CitaoIntensaChar"/>
     <w:uiPriority w:val="30"/>
     <w:qFormat/>
-    <w:rsid w:val="001A6CAA"/>
+    <w:rsid w:val="00F50859"/>
     <w:pPr>
       <w:pBdr>
         <w:top w:val="single" w:sz="4" w:space="10" w:color="0F4761" w:themeColor="accent1" w:themeShade="BF"/>
@@ -17483,7 +17907,7 @@
     <w:basedOn w:val="Fontepargpadro"/>
     <w:link w:val="CitaoIntensa"/>
     <w:uiPriority w:val="30"/>
-    <w:rsid w:val="001A6CAA"/>
+    <w:rsid w:val="00F50859"/>
     <w:rPr>
       <w:i/>
       <w:iCs/>
@@ -17495,7 +17919,7 @@
     <w:basedOn w:val="Fontepargpadro"/>
     <w:uiPriority w:val="32"/>
     <w:qFormat/>
-    <w:rsid w:val="001A6CAA"/>
+    <w:rsid w:val="00F50859"/>
     <w:rPr>
       <w:b/>
       <w:bCs/>
@@ -17510,7 +17934,7 @@
     <w:link w:val="CabealhoChar"/>
     <w:uiPriority w:val="99"/>
     <w:unhideWhenUsed/>
-    <w:rsid w:val="001A6CAA"/>
+    <w:rsid w:val="00F50859"/>
     <w:pPr>
       <w:tabs>
         <w:tab w:val="center" w:pos="4252"/>
@@ -17524,7 +17948,7 @@
     <w:basedOn w:val="Fontepargpadro"/>
     <w:link w:val="Cabealho"/>
     <w:uiPriority w:val="99"/>
-    <w:rsid w:val="001A6CAA"/>
+    <w:rsid w:val="00F50859"/>
   </w:style>
   <w:style w:type="paragraph" w:styleId="Rodap">
     <w:name w:val="footer"/>
@@ -17532,7 +17956,7 @@
     <w:link w:val="RodapChar"/>
     <w:uiPriority w:val="99"/>
     <w:unhideWhenUsed/>
-    <w:rsid w:val="001A6CAA"/>
+    <w:rsid w:val="00F50859"/>
     <w:pPr>
       <w:tabs>
         <w:tab w:val="center" w:pos="4252"/>
@@ -17546,7 +17970,7 @@
     <w:basedOn w:val="Fontepargpadro"/>
     <w:link w:val="Rodap"/>
     <w:uiPriority w:val="99"/>
-    <w:rsid w:val="001A6CAA"/>
+    <w:rsid w:val="00F50859"/>
   </w:style>
   <w:style w:type="paragraph" w:styleId="Sumrio1">
     <w:name w:val="toc 1"/>
@@ -17555,7 +17979,7 @@
     <w:autoRedefine/>
     <w:uiPriority w:val="39"/>
     <w:unhideWhenUsed/>
-    <w:rsid w:val="001A6CAA"/>
+    <w:rsid w:val="00F50859"/>
     <w:pPr>
       <w:spacing w:after="100"/>
     </w:pPr>
@@ -17567,7 +17991,7 @@
     <w:autoRedefine/>
     <w:uiPriority w:val="39"/>
     <w:unhideWhenUsed/>
-    <w:rsid w:val="001A6CAA"/>
+    <w:rsid w:val="00F50859"/>
     <w:pPr>
       <w:spacing w:after="100"/>
       <w:ind w:left="240"/>

</xml_diff>

<commit_message>
Documenta os lembretes por notificação push no Manual de Uso (v2.11)
Nova seção 2.9 explica onde ativar, o comportamento do botão e a limitação
do iPhone (exige adicionar à Tela de Início antes de ativar).

Co-Authored-By: Claude Sonnet 5 <noreply@anthropic.com>
</commit_message>
<xml_diff>
--- a/Manual de Uso - Ferramenta de Gestao de Projetos.docx
+++ b/Manual de Uso - Ferramenta de Gestao de Projetos.docx
@@ -129,7 +129,7 @@
           <w:color w:val="6A6A70"/>
           <w:sz w:val="22"/>
         </w:rPr>
-        <w:t>Versao 2.10 - 03 de agosto de 2026 (substitui a versao 2.9 de 01/08/2026)</w:t>
+        <w:t>Versao 2.11 - 04 de agosto de 2026 (substitui a versao 2.10 de 03/08/2026)</w:t>
       </w:r>
     </w:p>
     <w:p>
@@ -229,7 +229,7 @@
         <w:rPr>
           <w:noProof/>
         </w:rPr>
-        <w:instrText xml:space="preserve"> PAGEREF _Toc236645664 \h </w:instrText>
+        <w:instrText xml:space="preserve"> PAGEREF _Toc236755232 \h </w:instrText>
       </w:r>
       <w:r>
         <w:rPr>
@@ -290,7 +290,7 @@
         <w:rPr>
           <w:noProof/>
         </w:rPr>
-        <w:instrText xml:space="preserve"> PAGEREF _Toc236645665 \h </w:instrText>
+        <w:instrText xml:space="preserve"> PAGEREF _Toc236755233 \h </w:instrText>
       </w:r>
       <w:r>
         <w:rPr>
@@ -351,7 +351,7 @@
         <w:rPr>
           <w:noProof/>
         </w:rPr>
-        <w:instrText xml:space="preserve"> PAGEREF _Toc236645666 \h </w:instrText>
+        <w:instrText xml:space="preserve"> PAGEREF _Toc236755234 \h </w:instrText>
       </w:r>
       <w:r>
         <w:rPr>
@@ -368,7 +368,7 @@
         <w:rPr>
           <w:noProof/>
         </w:rPr>
-        <w:t>5</w:t>
+        <w:t>6</w:t>
       </w:r>
       <w:r>
         <w:rPr>
@@ -412,7 +412,7 @@
         <w:rPr>
           <w:noProof/>
         </w:rPr>
-        <w:instrText xml:space="preserve"> PAGEREF _Toc236645667 \h </w:instrText>
+        <w:instrText xml:space="preserve"> PAGEREF _Toc236755235 \h </w:instrText>
       </w:r>
       <w:r>
         <w:rPr>
@@ -473,7 +473,7 @@
         <w:rPr>
           <w:noProof/>
         </w:rPr>
-        <w:instrText xml:space="preserve"> PAGEREF _Toc236645668 \h </w:instrText>
+        <w:instrText xml:space="preserve"> PAGEREF _Toc236755236 \h </w:instrText>
       </w:r>
       <w:r>
         <w:rPr>
@@ -534,7 +534,7 @@
         <w:rPr>
           <w:noProof/>
         </w:rPr>
-        <w:instrText xml:space="preserve"> PAGEREF _Toc236645669 \h </w:instrText>
+        <w:instrText xml:space="preserve"> PAGEREF _Toc236755237 \h </w:instrText>
       </w:r>
       <w:r>
         <w:rPr>
@@ -595,7 +595,7 @@
         <w:rPr>
           <w:noProof/>
         </w:rPr>
-        <w:instrText xml:space="preserve"> PAGEREF _Toc236645670 \h </w:instrText>
+        <w:instrText xml:space="preserve"> PAGEREF _Toc236755238 \h </w:instrText>
       </w:r>
       <w:r>
         <w:rPr>
@@ -656,7 +656,7 @@
         <w:rPr>
           <w:noProof/>
         </w:rPr>
-        <w:instrText xml:space="preserve"> PAGEREF _Toc236645671 \h </w:instrText>
+        <w:instrText xml:space="preserve"> PAGEREF _Toc236755239 \h </w:instrText>
       </w:r>
       <w:r>
         <w:rPr>
@@ -717,7 +717,7 @@
         <w:rPr>
           <w:noProof/>
         </w:rPr>
-        <w:instrText xml:space="preserve"> PAGEREF _Toc236645672 \h </w:instrText>
+        <w:instrText xml:space="preserve"> PAGEREF _Toc236755240 \h </w:instrText>
       </w:r>
       <w:r>
         <w:rPr>
@@ -778,7 +778,7 @@
         <w:rPr>
           <w:noProof/>
         </w:rPr>
-        <w:instrText xml:space="preserve"> PAGEREF _Toc236645673 \h </w:instrText>
+        <w:instrText xml:space="preserve"> PAGEREF _Toc236755241 \h </w:instrText>
       </w:r>
       <w:r>
         <w:rPr>
@@ -839,7 +839,7 @@
         <w:rPr>
           <w:noProof/>
         </w:rPr>
-        <w:instrText xml:space="preserve"> PAGEREF _Toc236645674 \h </w:instrText>
+        <w:instrText xml:space="preserve"> PAGEREF _Toc236755242 \h </w:instrText>
       </w:r>
       <w:r>
         <w:rPr>
@@ -900,7 +900,7 @@
         <w:rPr>
           <w:noProof/>
         </w:rPr>
-        <w:instrText xml:space="preserve"> PAGEREF _Toc236645675 \h </w:instrText>
+        <w:instrText xml:space="preserve"> PAGEREF _Toc236755243 \h </w:instrText>
       </w:r>
       <w:r>
         <w:rPr>
@@ -961,7 +961,7 @@
         <w:rPr>
           <w:noProof/>
         </w:rPr>
-        <w:instrText xml:space="preserve"> PAGEREF _Toc236645676 \h </w:instrText>
+        <w:instrText xml:space="preserve"> PAGEREF _Toc236755244 \h </w:instrText>
       </w:r>
       <w:r>
         <w:rPr>
@@ -1022,7 +1022,68 @@
         <w:rPr>
           <w:noProof/>
         </w:rPr>
-        <w:instrText xml:space="preserve"> PAGEREF _Toc236645677 \h </w:instrText>
+        <w:instrText xml:space="preserve"> PAGEREF _Toc236755245 \h </w:instrText>
+      </w:r>
+      <w:r>
+        <w:rPr>
+          <w:noProof/>
+        </w:rPr>
+      </w:r>
+      <w:r>
+        <w:rPr>
+          <w:noProof/>
+        </w:rPr>
+        <w:fldChar w:fldCharType="separate"/>
+      </w:r>
+      <w:r>
+        <w:rPr>
+          <w:noProof/>
+        </w:rPr>
+        <w:t>16</w:t>
+      </w:r>
+      <w:r>
+        <w:rPr>
+          <w:noProof/>
+        </w:rPr>
+        <w:fldChar w:fldCharType="end"/>
+      </w:r>
+    </w:p>
+    <w:p>
+      <w:pPr>
+        <w:pStyle w:val="Sumrio2"/>
+        <w:tabs>
+          <w:tab w:val="right" w:leader="dot" w:pos="8828"/>
+        </w:tabs>
+        <w:rPr>
+          <w:noProof/>
+        </w:rPr>
+      </w:pPr>
+      <w:r>
+        <w:rPr>
+          <w:rFonts w:ascii="Montserrat" w:hAnsi="Montserrat"/>
+          <w:b/>
+          <w:noProof/>
+          <w:color w:val="B91D2E"/>
+        </w:rPr>
+        <w:t>2.9 Lembretes por notificacao push no celular</w:t>
+      </w:r>
+      <w:r>
+        <w:rPr>
+          <w:noProof/>
+        </w:rPr>
+        <w:tab/>
+      </w:r>
+      <w:r>
+        <w:rPr>
+          <w:noProof/>
+        </w:rPr>
+        <w:fldChar w:fldCharType="begin"/>
+      </w:r>
+      <w:r>
+        <w:rPr>
+          <w:noProof/>
+        </w:rPr>
+        <w:instrText xml:space="preserve"> PAGEREF _Toc236755246 \h </w:instrText>
       </w:r>
       <w:r>
         <w:rPr>
@@ -1083,7 +1144,7 @@
         <w:rPr>
           <w:noProof/>
         </w:rPr>
-        <w:instrText xml:space="preserve"> PAGEREF _Toc236645678 \h </w:instrText>
+        <w:instrText xml:space="preserve"> PAGEREF _Toc236755247 \h </w:instrText>
       </w:r>
       <w:r>
         <w:rPr>
@@ -1100,7 +1161,7 @@
         <w:rPr>
           <w:noProof/>
         </w:rPr>
-        <w:t>17</w:t>
+        <w:t>18</w:t>
       </w:r>
       <w:r>
         <w:rPr>
@@ -1144,7 +1205,7 @@
         <w:rPr>
           <w:noProof/>
         </w:rPr>
-        <w:instrText xml:space="preserve"> PAGEREF _Toc236645679 \h </w:instrText>
+        <w:instrText xml:space="preserve"> PAGEREF _Toc236755248 \h </w:instrText>
       </w:r>
       <w:r>
         <w:rPr>
@@ -1161,7 +1222,7 @@
         <w:rPr>
           <w:noProof/>
         </w:rPr>
-        <w:t>17</w:t>
+        <w:t>18</w:t>
       </w:r>
       <w:r>
         <w:rPr>
@@ -1205,7 +1266,7 @@
         <w:rPr>
           <w:noProof/>
         </w:rPr>
-        <w:instrText xml:space="preserve"> PAGEREF _Toc236645680 \h </w:instrText>
+        <w:instrText xml:space="preserve"> PAGEREF _Toc236755249 \h </w:instrText>
       </w:r>
       <w:r>
         <w:rPr>
@@ -1222,7 +1283,7 @@
         <w:rPr>
           <w:noProof/>
         </w:rPr>
-        <w:t>20</w:t>
+        <w:t>21</w:t>
       </w:r>
       <w:r>
         <w:rPr>
@@ -1266,7 +1327,7 @@
         <w:rPr>
           <w:noProof/>
         </w:rPr>
-        <w:instrText xml:space="preserve"> PAGEREF _Toc236645681 \h </w:instrText>
+        <w:instrText xml:space="preserve"> PAGEREF _Toc236755250 \h </w:instrText>
       </w:r>
       <w:r>
         <w:rPr>
@@ -1283,7 +1344,7 @@
         <w:rPr>
           <w:noProof/>
         </w:rPr>
-        <w:t>22</w:t>
+        <w:t>23</w:t>
       </w:r>
       <w:r>
         <w:rPr>
@@ -1327,7 +1388,7 @@
         <w:rPr>
           <w:noProof/>
         </w:rPr>
-        <w:instrText xml:space="preserve"> PAGEREF _Toc236645682 \h </w:instrText>
+        <w:instrText xml:space="preserve"> PAGEREF _Toc236755251 \h </w:instrText>
       </w:r>
       <w:r>
         <w:rPr>
@@ -1344,7 +1405,7 @@
         <w:rPr>
           <w:noProof/>
         </w:rPr>
-        <w:t>25</w:t>
+        <w:t>26</w:t>
       </w:r>
       <w:r>
         <w:rPr>
@@ -1388,7 +1449,7 @@
         <w:rPr>
           <w:noProof/>
         </w:rPr>
-        <w:instrText xml:space="preserve"> PAGEREF _Toc236645683 \h </w:instrText>
+        <w:instrText xml:space="preserve"> PAGEREF _Toc236755252 \h </w:instrText>
       </w:r>
       <w:r>
         <w:rPr>
@@ -1405,7 +1466,7 @@
         <w:rPr>
           <w:noProof/>
         </w:rPr>
-        <w:t>27</w:t>
+        <w:t>28</w:t>
       </w:r>
       <w:r>
         <w:rPr>
@@ -1449,7 +1510,7 @@
         <w:rPr>
           <w:noProof/>
         </w:rPr>
-        <w:instrText xml:space="preserve"> PAGEREF _Toc236645684 \h </w:instrText>
+        <w:instrText xml:space="preserve"> PAGEREF _Toc236755253 \h </w:instrText>
       </w:r>
       <w:r>
         <w:rPr>
@@ -1466,7 +1527,7 @@
         <w:rPr>
           <w:noProof/>
         </w:rPr>
-        <w:t>30</w:t>
+        <w:t>31</w:t>
       </w:r>
       <w:r>
         <w:rPr>
@@ -1510,7 +1571,7 @@
         <w:rPr>
           <w:noProof/>
         </w:rPr>
-        <w:instrText xml:space="preserve"> PAGEREF _Toc236645685 \h </w:instrText>
+        <w:instrText xml:space="preserve"> PAGEREF _Toc236755254 \h </w:instrText>
       </w:r>
       <w:r>
         <w:rPr>
@@ -1527,7 +1588,7 @@
         <w:rPr>
           <w:noProof/>
         </w:rPr>
-        <w:t>32</w:t>
+        <w:t>33</w:t>
       </w:r>
       <w:r>
         <w:rPr>
@@ -1571,7 +1632,7 @@
         <w:rPr>
           <w:noProof/>
         </w:rPr>
-        <w:instrText xml:space="preserve"> PAGEREF _Toc236645686 \h </w:instrText>
+        <w:instrText xml:space="preserve"> PAGEREF _Toc236755255 \h </w:instrText>
       </w:r>
       <w:r>
         <w:rPr>
@@ -1588,7 +1649,7 @@
         <w:rPr>
           <w:noProof/>
         </w:rPr>
-        <w:t>35</w:t>
+        <w:t>36</w:t>
       </w:r>
       <w:r>
         <w:rPr>
@@ -1632,7 +1693,7 @@
         <w:rPr>
           <w:noProof/>
         </w:rPr>
-        <w:instrText xml:space="preserve"> PAGEREF _Toc236645687 \h </w:instrText>
+        <w:instrText xml:space="preserve"> PAGEREF _Toc236755256 \h </w:instrText>
       </w:r>
       <w:r>
         <w:rPr>
@@ -1649,7 +1710,7 @@
         <w:rPr>
           <w:noProof/>
         </w:rPr>
-        <w:t>36</w:t>
+        <w:t>37</w:t>
       </w:r>
       <w:r>
         <w:rPr>
@@ -1693,7 +1754,7 @@
         <w:rPr>
           <w:noProof/>
         </w:rPr>
-        <w:instrText xml:space="preserve"> PAGEREF _Toc236645688 \h </w:instrText>
+        <w:instrText xml:space="preserve"> PAGEREF _Toc236755257 \h </w:instrText>
       </w:r>
       <w:r>
         <w:rPr>
@@ -1710,7 +1771,7 @@
         <w:rPr>
           <w:noProof/>
         </w:rPr>
-        <w:t>38</w:t>
+        <w:t>39</w:t>
       </w:r>
       <w:r>
         <w:rPr>
@@ -1736,6 +1797,7 @@
           <w:noProof/>
           <w:color w:val="1A1A1A"/>
         </w:rPr>
+        <w:lastRenderedPageBreak/>
         <w:t>4. Gerando os relatorios finais</w:t>
       </w:r>
       <w:r>
@@ -1754,7 +1816,7 @@
         <w:rPr>
           <w:noProof/>
         </w:rPr>
-        <w:instrText xml:space="preserve"> PAGEREF _Toc236645689 \h </w:instrText>
+        <w:instrText xml:space="preserve"> PAGEREF _Toc236755258 \h </w:instrText>
       </w:r>
       <w:r>
         <w:rPr>
@@ -1771,7 +1833,7 @@
         <w:rPr>
           <w:noProof/>
         </w:rPr>
-        <w:t>40</w:t>
+        <w:t>41</w:t>
       </w:r>
       <w:r>
         <w:rPr>
@@ -1797,7 +1859,6 @@
           <w:noProof/>
           <w:color w:val="B91D2E"/>
         </w:rPr>
-        <w:lastRenderedPageBreak/>
         <w:t>4.1 Relatorio de Situacao de Projetos (FORALF11)</w:t>
       </w:r>
       <w:r>
@@ -1816,7 +1877,7 @@
         <w:rPr>
           <w:noProof/>
         </w:rPr>
-        <w:instrText xml:space="preserve"> PAGEREF _Toc236645690 \h </w:instrText>
+        <w:instrText xml:space="preserve"> PAGEREF _Toc236755259 \h </w:instrText>
       </w:r>
       <w:r>
         <w:rPr>
@@ -1833,7 +1894,7 @@
         <w:rPr>
           <w:noProof/>
         </w:rPr>
-        <w:t>40</w:t>
+        <w:t>41</w:t>
       </w:r>
       <w:r>
         <w:rPr>
@@ -1877,7 +1938,7 @@
         <w:rPr>
           <w:noProof/>
         </w:rPr>
-        <w:instrText xml:space="preserve"> PAGEREF _Toc236645691 \h </w:instrText>
+        <w:instrText xml:space="preserve"> PAGEREF _Toc236755260 \h </w:instrText>
       </w:r>
       <w:r>
         <w:rPr>
@@ -1894,7 +1955,7 @@
         <w:rPr>
           <w:noProof/>
         </w:rPr>
-        <w:t>46</w:t>
+        <w:t>47</w:t>
       </w:r>
       <w:r>
         <w:rPr>
@@ -1938,7 +1999,7 @@
         <w:rPr>
           <w:noProof/>
         </w:rPr>
-        <w:instrText xml:space="preserve"> PAGEREF _Toc236645692 \h </w:instrText>
+        <w:instrText xml:space="preserve"> PAGEREF _Toc236755261 \h </w:instrText>
       </w:r>
       <w:r>
         <w:rPr>
@@ -1955,7 +2016,7 @@
         <w:rPr>
           <w:noProof/>
         </w:rPr>
-        <w:t>51</w:t>
+        <w:t>52</w:t>
       </w:r>
       <w:r>
         <w:rPr>
@@ -1999,7 +2060,7 @@
         <w:rPr>
           <w:noProof/>
         </w:rPr>
-        <w:instrText xml:space="preserve"> PAGEREF _Toc236645693 \h </w:instrText>
+        <w:instrText xml:space="preserve"> PAGEREF _Toc236755262 \h </w:instrText>
       </w:r>
       <w:r>
         <w:rPr>
@@ -2016,7 +2077,7 @@
         <w:rPr>
           <w:noProof/>
         </w:rPr>
-        <w:t>51</w:t>
+        <w:t>52</w:t>
       </w:r>
       <w:r>
         <w:rPr>
@@ -2060,7 +2121,7 @@
         <w:rPr>
           <w:noProof/>
         </w:rPr>
-        <w:instrText xml:space="preserve"> PAGEREF _Toc236645694 \h </w:instrText>
+        <w:instrText xml:space="preserve"> PAGEREF _Toc236755263 \h </w:instrText>
       </w:r>
       <w:r>
         <w:rPr>
@@ -2077,7 +2138,7 @@
         <w:rPr>
           <w:noProof/>
         </w:rPr>
-        <w:t>52</w:t>
+        <w:t>53</w:t>
       </w:r>
       <w:r>
         <w:rPr>
@@ -2121,7 +2182,7 @@
         <w:rPr>
           <w:noProof/>
         </w:rPr>
-        <w:instrText xml:space="preserve"> PAGEREF _Toc236645695 \h </w:instrText>
+        <w:instrText xml:space="preserve"> PAGEREF _Toc236755264 \h </w:instrText>
       </w:r>
       <w:r>
         <w:rPr>
@@ -2138,7 +2199,7 @@
         <w:rPr>
           <w:noProof/>
         </w:rPr>
-        <w:t>52</w:t>
+        <w:t>53</w:t>
       </w:r>
       <w:r>
         <w:rPr>
@@ -2182,7 +2243,7 @@
         <w:rPr>
           <w:noProof/>
         </w:rPr>
-        <w:instrText xml:space="preserve"> PAGEREF _Toc236645696 \h </w:instrText>
+        <w:instrText xml:space="preserve"> PAGEREF _Toc236755265 \h </w:instrText>
       </w:r>
       <w:r>
         <w:rPr>
@@ -2199,7 +2260,7 @@
         <w:rPr>
           <w:noProof/>
         </w:rPr>
-        <w:t>55</w:t>
+        <w:t>56</w:t>
       </w:r>
       <w:r>
         <w:rPr>
@@ -2243,7 +2304,7 @@
         <w:rPr>
           <w:noProof/>
         </w:rPr>
-        <w:instrText xml:space="preserve"> PAGEREF _Toc236645697 \h </w:instrText>
+        <w:instrText xml:space="preserve"> PAGEREF _Toc236755266 \h </w:instrText>
       </w:r>
       <w:r>
         <w:rPr>
@@ -2260,7 +2321,7 @@
         <w:rPr>
           <w:noProof/>
         </w:rPr>
-        <w:t>55</w:t>
+        <w:t>56</w:t>
       </w:r>
       <w:r>
         <w:rPr>
@@ -2304,7 +2365,7 @@
         <w:rPr>
           <w:noProof/>
         </w:rPr>
-        <w:instrText xml:space="preserve"> PAGEREF _Toc236645698 \h </w:instrText>
+        <w:instrText xml:space="preserve"> PAGEREF _Toc236755267 \h </w:instrText>
       </w:r>
       <w:r>
         <w:rPr>
@@ -2321,7 +2382,7 @@
         <w:rPr>
           <w:noProof/>
         </w:rPr>
-        <w:t>56</w:t>
+        <w:t>57</w:t>
       </w:r>
       <w:r>
         <w:rPr>
@@ -2365,7 +2426,7 @@
         <w:rPr>
           <w:noProof/>
         </w:rPr>
-        <w:instrText xml:space="preserve"> PAGEREF _Toc236645699 \h </w:instrText>
+        <w:instrText xml:space="preserve"> PAGEREF _Toc236755268 \h </w:instrText>
       </w:r>
       <w:r>
         <w:rPr>
@@ -2382,7 +2443,7 @@
         <w:rPr>
           <w:noProof/>
         </w:rPr>
-        <w:t>56</w:t>
+        <w:t>57</w:t>
       </w:r>
       <w:r>
         <w:rPr>
@@ -2426,7 +2487,7 @@
         <w:rPr>
           <w:noProof/>
         </w:rPr>
-        <w:instrText xml:space="preserve"> PAGEREF _Toc236645700 \h </w:instrText>
+        <w:instrText xml:space="preserve"> PAGEREF _Toc236755269 \h </w:instrText>
       </w:r>
       <w:r>
         <w:rPr>
@@ -2443,7 +2504,7 @@
         <w:rPr>
           <w:noProof/>
         </w:rPr>
-        <w:t>57</w:t>
+        <w:t>58</w:t>
       </w:r>
       <w:r>
         <w:rPr>
@@ -2487,7 +2548,7 @@
         <w:rPr>
           <w:noProof/>
         </w:rPr>
-        <w:instrText xml:space="preserve"> PAGEREF _Toc236645701 \h </w:instrText>
+        <w:instrText xml:space="preserve"> PAGEREF _Toc236755270 \h </w:instrText>
       </w:r>
       <w:r>
         <w:rPr>
@@ -2504,7 +2565,7 @@
         <w:rPr>
           <w:noProof/>
         </w:rPr>
-        <w:t>60</w:t>
+        <w:t>61</w:t>
       </w:r>
       <w:r>
         <w:rPr>
@@ -2548,7 +2609,7 @@
         <w:rPr>
           <w:noProof/>
         </w:rPr>
-        <w:instrText xml:space="preserve"> PAGEREF _Toc236645702 \h </w:instrText>
+        <w:instrText xml:space="preserve"> PAGEREF _Toc236755271 \h </w:instrText>
       </w:r>
       <w:r>
         <w:rPr>
@@ -2565,7 +2626,7 @@
         <w:rPr>
           <w:noProof/>
         </w:rPr>
-        <w:t>61</w:t>
+        <w:t>62</w:t>
       </w:r>
       <w:r>
         <w:rPr>
@@ -2624,7 +2685,7 @@
           <w:sz w:val="34"/>
         </w:rPr>
       </w:pPr>
-      <w:bookmarkStart w:id="0" w:name="_Toc236645664"/>
+      <w:bookmarkStart w:id="0" w:name="_Toc236755232"/>
       <w:r>
         <w:rPr>
           <w:rFonts w:ascii="Montserrat" w:hAnsi="Montserrat"/>
@@ -2648,7 +2709,7 @@
           <w:sz w:val="27"/>
         </w:rPr>
       </w:pPr>
-      <w:bookmarkStart w:id="1" w:name="_Toc236645665"/>
+      <w:bookmarkStart w:id="1" w:name="_Toc236755233"/>
       <w:r>
         <w:rPr>
           <w:rFonts w:ascii="Montserrat" w:hAnsi="Montserrat"/>
@@ -2900,7 +2961,34 @@
           <w:color w:val="1A1A1A"/>
           <w:sz w:val="22"/>
         </w:rPr>
-        <w:t>O manual nao substitui as Diretrizes para a Gestao de Projetos da UNIALFA (documento institucional que define o framework D01 a D07) nem o documento Regras de Acesso e Permissoes (que detalha cada regra de controle de acesso); ele e o guia operacional de como usar cada ferramenta na pratica.</w:t>
+        <w:t>Esta e a versao 2.11 do manual. Em relacao a versao 2.10 (03/08/2026), foi adicionada a nova secao 2.9 - Lembretes por notificacao push no celular: um segundo canal de aviso, alem do e-mail, ativado por cada usuario individualmente na pagina inicial. Dispara nos mesmos seis momentos de decisao ja descritos na secao 2.8.</w:t>
+      </w:r>
+    </w:p>
+    <w:p>
+      <w:pPr>
+        <w:spacing w:line="280" w:lineRule="auto"/>
+        <w:rPr>
+          <w:rFonts w:ascii="Montserrat" w:hAnsi="Montserrat"/>
+          <w:color w:val="1A1A1A"/>
+          <w:sz w:val="22"/>
+        </w:rPr>
+      </w:pPr>
+      <w:r>
+        <w:rPr>
+          <w:rFonts w:ascii="Montserrat" w:hAnsi="Montserrat"/>
+          <w:color w:val="1A1A1A"/>
+          <w:sz w:val="22"/>
+        </w:rPr>
+        <w:t xml:space="preserve">O manual nao substitui as Diretrizes para a Gestao de Projetos da UNIALFA (documento institucional que define o framework D01 a D07) nem o </w:t>
+      </w:r>
+      <w:r>
+        <w:rPr>
+          <w:rFonts w:ascii="Montserrat" w:hAnsi="Montserrat"/>
+          <w:color w:val="1A1A1A"/>
+          <w:sz w:val="22"/>
+        </w:rPr>
+        <w:lastRenderedPageBreak/>
+        <w:t>documento Regras de Acesso e Permissoes (que detalha cada regra de controle de acesso); ele e o guia operacional de como usar cada ferramenta na pratica.</w:t>
       </w:r>
     </w:p>
     <w:p>
@@ -2914,7 +3002,7 @@
           <w:sz w:val="27"/>
         </w:rPr>
       </w:pPr>
-      <w:bookmarkStart w:id="2" w:name="_Toc236645666"/>
+      <w:bookmarkStart w:id="2" w:name="_Toc236755234"/>
       <w:r>
         <w:rPr>
           <w:rFonts w:ascii="Montserrat" w:hAnsi="Montserrat"/>
@@ -2965,7 +3053,6 @@
           <w:color w:val="1A1A1A"/>
           <w:sz w:val="22"/>
         </w:rPr>
-        <w:lastRenderedPageBreak/>
         <w:t>12 formularios de registro (codigo FORALF), cada um correspondendo a um artefato institucional - da Solicitacao de Demanda ao Relatorio de Entregas e Beneficios.</w:t>
       </w:r>
     </w:p>
@@ -3088,16 +3175,16 @@
         </w:rPr>
         <w:lastRenderedPageBreak/>
         <w:drawing>
-          <wp:inline distT="0" distB="0" distL="0" distR="0" wp14:anchorId="365AA1D2" wp14:editId="19085A4D">
+          <wp:inline distT="0" distB="0" distL="0" distR="0" wp14:anchorId="0E81297E" wp14:editId="6CA9F1C5">
             <wp:extent cx="5303520" cy="4792851"/>
             <wp:effectExtent l="19050" t="19050" r="11430" b="27305"/>
-            <wp:docPr id="2138412365" name="Imagem 1"/>
+            <wp:docPr id="1782462826" name="Imagem 1"/>
             <wp:cNvGraphicFramePr/>
             <a:graphic xmlns:a="http://schemas.openxmlformats.org/drawingml/2006/main">
               <a:graphicData uri="http://schemas.openxmlformats.org/drawingml/2006/picture">
                 <pic:pic xmlns:pic="http://schemas.openxmlformats.org/drawingml/2006/picture">
                   <pic:nvPicPr>
-                    <pic:cNvPr id="2138412365" name=""/>
+                    <pic:cNvPr id="1782462826" name=""/>
                     <pic:cNvPicPr/>
                   </pic:nvPicPr>
                   <pic:blipFill>
@@ -3165,7 +3252,7 @@
           <w:sz w:val="27"/>
         </w:rPr>
       </w:pPr>
-      <w:bookmarkStart w:id="3" w:name="_Toc236645667"/>
+      <w:bookmarkStart w:id="3" w:name="_Toc236755235"/>
       <w:r>
         <w:rPr>
           <w:rFonts w:ascii="Montserrat" w:hAnsi="Montserrat"/>
@@ -3206,16 +3293,16 @@
         </w:rPr>
         <w:lastRenderedPageBreak/>
         <w:drawing>
-          <wp:inline distT="0" distB="0" distL="0" distR="0" wp14:anchorId="039D9ACB" wp14:editId="533BEA03">
+          <wp:inline distT="0" distB="0" distL="0" distR="0" wp14:anchorId="0EE0787C" wp14:editId="37D18A05">
             <wp:extent cx="4206240" cy="3801227"/>
             <wp:effectExtent l="19050" t="19050" r="22860" b="27940"/>
-            <wp:docPr id="1593864527" name="Imagem 2"/>
+            <wp:docPr id="533662649" name="Imagem 2"/>
             <wp:cNvGraphicFramePr/>
             <a:graphic xmlns:a="http://schemas.openxmlformats.org/drawingml/2006/main">
               <a:graphicData uri="http://schemas.openxmlformats.org/drawingml/2006/picture">
                 <pic:pic xmlns:pic="http://schemas.openxmlformats.org/drawingml/2006/picture">
                   <pic:nvPicPr>
-                    <pic:cNvPr id="1593864527" name=""/>
+                    <pic:cNvPr id="533662649" name=""/>
                     <pic:cNvPicPr/>
                   </pic:nvPicPr>
                   <pic:blipFill>
@@ -3388,7 +3475,7 @@
           <w:sz w:val="27"/>
         </w:rPr>
       </w:pPr>
-      <w:bookmarkStart w:id="4" w:name="_Toc236645668"/>
+      <w:bookmarkStart w:id="4" w:name="_Toc236755236"/>
       <w:r>
         <w:rPr>
           <w:rFonts w:ascii="Montserrat" w:hAnsi="Montserrat"/>
@@ -4537,7 +4624,7 @@
           <w:sz w:val="34"/>
         </w:rPr>
       </w:pPr>
-      <w:bookmarkStart w:id="5" w:name="_Toc236645669"/>
+      <w:bookmarkStart w:id="5" w:name="_Toc236755237"/>
       <w:r>
         <w:rPr>
           <w:rFonts w:ascii="Montserrat" w:hAnsi="Montserrat"/>
@@ -4561,7 +4648,7 @@
           <w:sz w:val="27"/>
         </w:rPr>
       </w:pPr>
-      <w:bookmarkStart w:id="6" w:name="_Toc236645670"/>
+      <w:bookmarkStart w:id="6" w:name="_Toc236755238"/>
       <w:r>
         <w:rPr>
           <w:rFonts w:ascii="Montserrat" w:hAnsi="Montserrat"/>
@@ -4602,7 +4689,7 @@
           <w:sz w:val="27"/>
         </w:rPr>
       </w:pPr>
-      <w:bookmarkStart w:id="7" w:name="_Toc236645671"/>
+      <w:bookmarkStart w:id="7" w:name="_Toc236755239"/>
       <w:r>
         <w:rPr>
           <w:rFonts w:ascii="Montserrat" w:hAnsi="Montserrat"/>
@@ -4721,7 +4808,7 @@
           <w:sz w:val="27"/>
         </w:rPr>
       </w:pPr>
-      <w:bookmarkStart w:id="8" w:name="_Toc236645672"/>
+      <w:bookmarkStart w:id="8" w:name="_Toc236755240"/>
       <w:r>
         <w:rPr>
           <w:rFonts w:ascii="Montserrat" w:hAnsi="Montserrat"/>
@@ -5292,7 +5379,7 @@
           <w:sz w:val="27"/>
         </w:rPr>
       </w:pPr>
-      <w:bookmarkStart w:id="9" w:name="_Toc236645673"/>
+      <w:bookmarkStart w:id="9" w:name="_Toc236755241"/>
       <w:r>
         <w:rPr>
           <w:rFonts w:ascii="Montserrat" w:hAnsi="Montserrat"/>
@@ -5381,16 +5468,16 @@
         </w:rPr>
         <w:lastRenderedPageBreak/>
         <w:drawing>
-          <wp:inline distT="0" distB="0" distL="0" distR="0" wp14:anchorId="73FFE82E" wp14:editId="26F96081">
+          <wp:inline distT="0" distB="0" distL="0" distR="0" wp14:anchorId="7A1817EC" wp14:editId="79E3B023">
             <wp:extent cx="4937760" cy="4462310"/>
             <wp:effectExtent l="19050" t="19050" r="15240" b="14605"/>
-            <wp:docPr id="263196523" name="Imagem 3"/>
+            <wp:docPr id="1334530168" name="Imagem 3"/>
             <wp:cNvGraphicFramePr/>
             <a:graphic xmlns:a="http://schemas.openxmlformats.org/drawingml/2006/main">
               <a:graphicData uri="http://schemas.openxmlformats.org/drawingml/2006/picture">
                 <pic:pic xmlns:pic="http://schemas.openxmlformats.org/drawingml/2006/picture">
                   <pic:nvPicPr>
-                    <pic:cNvPr id="263196523" name=""/>
+                    <pic:cNvPr id="1334530168" name=""/>
                     <pic:cNvPicPr/>
                   </pic:nvPicPr>
                   <pic:blipFill>
@@ -5458,7 +5545,7 @@
           <w:sz w:val="27"/>
         </w:rPr>
       </w:pPr>
-      <w:bookmarkStart w:id="10" w:name="_Toc236645674"/>
+      <w:bookmarkStart w:id="10" w:name="_Toc236755242"/>
       <w:r>
         <w:rPr>
           <w:rFonts w:ascii="Montserrat" w:hAnsi="Montserrat"/>
@@ -5499,16 +5586,16 @@
         </w:rPr>
         <w:lastRenderedPageBreak/>
         <w:drawing>
-          <wp:inline distT="0" distB="0" distL="0" distR="0" wp14:anchorId="6CF2E19E" wp14:editId="19E910FD">
+          <wp:inline distT="0" distB="0" distL="0" distR="0" wp14:anchorId="476E1A65" wp14:editId="2B4E68F4">
             <wp:extent cx="5120640" cy="4627581"/>
             <wp:effectExtent l="19050" t="19050" r="22860" b="20955"/>
-            <wp:docPr id="601396218" name="Imagem 4"/>
+            <wp:docPr id="314442110" name="Imagem 4"/>
             <wp:cNvGraphicFramePr/>
             <a:graphic xmlns:a="http://schemas.openxmlformats.org/drawingml/2006/main">
               <a:graphicData uri="http://schemas.openxmlformats.org/drawingml/2006/picture">
                 <pic:pic xmlns:pic="http://schemas.openxmlformats.org/drawingml/2006/picture">
                   <pic:nvPicPr>
-                    <pic:cNvPr id="601396218" name=""/>
+                    <pic:cNvPr id="314442110" name=""/>
                     <pic:cNvPicPr/>
                   </pic:nvPicPr>
                   <pic:blipFill>
@@ -5645,7 +5732,7 @@
           <w:sz w:val="27"/>
         </w:rPr>
       </w:pPr>
-      <w:bookmarkStart w:id="11" w:name="_Toc236645675"/>
+      <w:bookmarkStart w:id="11" w:name="_Toc236755243"/>
       <w:r>
         <w:rPr>
           <w:rFonts w:ascii="Montserrat" w:hAnsi="Montserrat"/>
@@ -5686,16 +5773,16 @@
           <w:noProof/>
         </w:rPr>
         <w:drawing>
-          <wp:inline distT="0" distB="0" distL="0" distR="0" wp14:anchorId="5C59F4D8" wp14:editId="46FF8270">
+          <wp:inline distT="0" distB="0" distL="0" distR="0" wp14:anchorId="75EA7559" wp14:editId="1C45AB83">
             <wp:extent cx="4206240" cy="3801227"/>
             <wp:effectExtent l="19050" t="19050" r="22860" b="27940"/>
-            <wp:docPr id="1842096392" name="Imagem 5"/>
+            <wp:docPr id="30176145" name="Imagem 5"/>
             <wp:cNvGraphicFramePr/>
             <a:graphic xmlns:a="http://schemas.openxmlformats.org/drawingml/2006/main">
               <a:graphicData uri="http://schemas.openxmlformats.org/drawingml/2006/picture">
                 <pic:pic xmlns:pic="http://schemas.openxmlformats.org/drawingml/2006/picture">
                   <pic:nvPicPr>
-                    <pic:cNvPr id="1842096392" name=""/>
+                    <pic:cNvPr id="30176145" name=""/>
                     <pic:cNvPicPr/>
                   </pic:nvPicPr>
                   <pic:blipFill>
@@ -5763,16 +5850,16 @@
         </w:rPr>
         <w:lastRenderedPageBreak/>
         <w:drawing>
-          <wp:inline distT="0" distB="0" distL="0" distR="0" wp14:anchorId="130506CF" wp14:editId="06996D37">
+          <wp:inline distT="0" distB="0" distL="0" distR="0" wp14:anchorId="7911BA7C" wp14:editId="28889EED">
             <wp:extent cx="4206240" cy="3801227"/>
             <wp:effectExtent l="19050" t="19050" r="22860" b="27940"/>
-            <wp:docPr id="39874830" name="Imagem 6"/>
+            <wp:docPr id="162277376" name="Imagem 6"/>
             <wp:cNvGraphicFramePr/>
             <a:graphic xmlns:a="http://schemas.openxmlformats.org/drawingml/2006/main">
               <a:graphicData uri="http://schemas.openxmlformats.org/drawingml/2006/picture">
                 <pic:pic xmlns:pic="http://schemas.openxmlformats.org/drawingml/2006/picture">
                   <pic:nvPicPr>
-                    <pic:cNvPr id="39874830" name=""/>
+                    <pic:cNvPr id="162277376" name=""/>
                     <pic:cNvPicPr/>
                   </pic:nvPicPr>
                   <pic:blipFill>
@@ -5888,7 +5975,7 @@
           <w:sz w:val="27"/>
         </w:rPr>
       </w:pPr>
-      <w:bookmarkStart w:id="12" w:name="_Toc236645676"/>
+      <w:bookmarkStart w:id="12" w:name="_Toc236755244"/>
       <w:r>
         <w:rPr>
           <w:rFonts w:ascii="Montserrat" w:hAnsi="Montserrat"/>
@@ -5956,7 +6043,7 @@
           <w:sz w:val="27"/>
         </w:rPr>
       </w:pPr>
-      <w:bookmarkStart w:id="13" w:name="_Toc236645677"/>
+      <w:bookmarkStart w:id="13" w:name="_Toc236755245"/>
       <w:r>
         <w:rPr>
           <w:rFonts w:ascii="Montserrat" w:hAnsi="Montserrat"/>
@@ -6150,6 +6237,174 @@
     </w:p>
     <w:p>
       <w:pPr>
+        <w:pStyle w:val="Ttulo2"/>
+        <w:spacing w:before="320" w:after="120"/>
+        <w:rPr>
+          <w:rFonts w:ascii="Montserrat" w:hAnsi="Montserrat"/>
+          <w:b/>
+          <w:color w:val="B91D2E"/>
+          <w:sz w:val="27"/>
+        </w:rPr>
+      </w:pPr>
+      <w:bookmarkStart w:id="14" w:name="_Toc236755246"/>
+      <w:r>
+        <w:rPr>
+          <w:rFonts w:ascii="Montserrat" w:hAnsi="Montserrat"/>
+          <w:b/>
+          <w:color w:val="B91D2E"/>
+          <w:sz w:val="27"/>
+        </w:rPr>
+        <w:t>2.9 Lembretes por notificacao push no celular</w:t>
+      </w:r>
+      <w:bookmarkEnd w:id="14"/>
+    </w:p>
+    <w:p>
+      <w:pPr>
+        <w:spacing w:line="280" w:lineRule="auto"/>
+        <w:rPr>
+          <w:rFonts w:ascii="Montserrat" w:hAnsi="Montserrat"/>
+          <w:color w:val="1A1A1A"/>
+          <w:sz w:val="22"/>
+        </w:rPr>
+      </w:pPr>
+      <w:r>
+        <w:rPr>
+          <w:rFonts w:ascii="Montserrat" w:hAnsi="Montserrat"/>
+          <w:color w:val="1A1A1A"/>
+          <w:sz w:val="22"/>
+        </w:rPr>
+        <w:t>Alem do e-mail (secao 2.8), o sistema oferece um segundo canal de aviso: uma notificacao push, que aparece no celular ou no computador mesmo com o navegador fechado, igual a uma notificacao de aplicativo. E opcional e ativada individualmente por cada usuario - nao existe um interruptor geral do Admin para isso.</w:t>
+      </w:r>
+    </w:p>
+    <w:p>
+      <w:pPr>
+        <w:pStyle w:val="PargrafodaLista"/>
+        <w:numPr>
+          <w:ilvl w:val="0"/>
+          <w:numId w:val="9"/>
+        </w:numPr>
+        <w:spacing w:after="80" w:line="260" w:lineRule="auto"/>
+        <w:ind w:left="700"/>
+        <w:rPr>
+          <w:rFonts w:ascii="Montserrat" w:hAnsi="Montserrat"/>
+          <w:color w:val="1A1A1A"/>
+          <w:sz w:val="22"/>
+        </w:rPr>
+      </w:pPr>
+      <w:r>
+        <w:rPr>
+          <w:rFonts w:ascii="Montserrat" w:hAnsi="Montserrat"/>
+          <w:color w:val="1A1A1A"/>
+          <w:sz w:val="22"/>
+        </w:rPr>
+        <w:t>Onde ativar: na pagina inicial (mapa de diretrizes), logado, aparece o botao Ativar lembretes no celular na barra preta do topo.</w:t>
+      </w:r>
+    </w:p>
+    <w:p>
+      <w:pPr>
+        <w:pStyle w:val="PargrafodaLista"/>
+        <w:numPr>
+          <w:ilvl w:val="0"/>
+          <w:numId w:val="9"/>
+        </w:numPr>
+        <w:spacing w:after="80" w:line="260" w:lineRule="auto"/>
+        <w:ind w:left="700"/>
+        <w:rPr>
+          <w:rFonts w:ascii="Montserrat" w:hAnsi="Montserrat"/>
+          <w:color w:val="1A1A1A"/>
+          <w:sz w:val="22"/>
+        </w:rPr>
+      </w:pPr>
+      <w:r>
+        <w:rPr>
+          <w:rFonts w:ascii="Montserrat" w:hAnsi="Montserrat"/>
+          <w:color w:val="1A1A1A"/>
+          <w:sz w:val="22"/>
+        </w:rPr>
+        <w:t>Ao tocar no botao, o navegador pede permissao para mostrar notificacoes - aceite para concluir a ativacao. O botao muda para Lembretes ativos.</w:t>
+      </w:r>
+    </w:p>
+    <w:p>
+      <w:pPr>
+        <w:pStyle w:val="PargrafodaLista"/>
+        <w:numPr>
+          <w:ilvl w:val="0"/>
+          <w:numId w:val="9"/>
+        </w:numPr>
+        <w:spacing w:after="80" w:line="260" w:lineRule="auto"/>
+        <w:ind w:left="700"/>
+        <w:rPr>
+          <w:rFonts w:ascii="Montserrat" w:hAnsi="Montserrat"/>
+          <w:color w:val="1A1A1A"/>
+          <w:sz w:val="22"/>
+        </w:rPr>
+      </w:pPr>
+      <w:r>
+        <w:rPr>
+          <w:rFonts w:ascii="Montserrat" w:hAnsi="Montserrat"/>
+          <w:color w:val="1A1A1A"/>
+          <w:sz w:val="22"/>
+        </w:rPr>
+        <w:t>Para desativar, basta tocar novamente no botao ja ativo.</w:t>
+      </w:r>
+    </w:p>
+    <w:p>
+      <w:pPr>
+        <w:pStyle w:val="PargrafodaLista"/>
+        <w:numPr>
+          <w:ilvl w:val="0"/>
+          <w:numId w:val="9"/>
+        </w:numPr>
+        <w:spacing w:after="80" w:line="260" w:lineRule="auto"/>
+        <w:ind w:left="700"/>
+        <w:rPr>
+          <w:rFonts w:ascii="Montserrat" w:hAnsi="Montserrat"/>
+          <w:color w:val="1A1A1A"/>
+          <w:sz w:val="22"/>
+        </w:rPr>
+      </w:pPr>
+      <w:r>
+        <w:rPr>
+          <w:rFonts w:ascii="Montserrat" w:hAnsi="Montserrat"/>
+          <w:color w:val="1A1A1A"/>
+          <w:sz w:val="22"/>
+        </w:rPr>
+        <w:t>Dispara nos mesmos seis momentos de decisao da secao 2.8 (Gate 1, Canvas aprovado, TAP aprovado, decisao da SMP, registro de TEP e Gate 2 pactuado), para os mesmos destinatarios - mas so quem tiver ativado o push naquele navegador/celular recebe a notificacao.</w:t>
+      </w:r>
+    </w:p>
+    <w:p>
+      <w:pPr>
+        <w:spacing w:before="160" w:after="200"/>
+        <w:ind w:left="283"/>
+        <w:rPr>
+          <w:rFonts w:ascii="Montserrat" w:hAnsi="Montserrat"/>
+          <w:i/>
+          <w:color w:val="6A6A70"/>
+          <w:sz w:val="21"/>
+        </w:rPr>
+      </w:pPr>
+      <w:r>
+        <w:rPr>
+          <w:rFonts w:ascii="Montserrat" w:hAnsi="Montserrat"/>
+          <w:i/>
+          <w:color w:val="6A6A70"/>
+          <w:sz w:val="21"/>
+        </w:rPr>
+        <w:t xml:space="preserve">No iPhone/iPad, a Apple so libera notificacao push para sites adicionados a Tela de Inicio. Antes de tocar em Ativar lembretes no celular, va em Compartilhar &gt; </w:t>
+      </w:r>
+      <w:r>
+        <w:rPr>
+          <w:rFonts w:ascii="Montserrat" w:hAnsi="Montserrat"/>
+          <w:i/>
+          <w:color w:val="6A6A70"/>
+          <w:sz w:val="21"/>
+        </w:rPr>
+        <w:lastRenderedPageBreak/>
+        <w:t>Adicionar a Tela de Inicio no Safari, abra o sistema pelo icone criado, e so entao ative - num navegador comum (aba do Safari) o botao explica essa limitacao em vez de ativar direto. Em Android e computador nao ha essa exigencia.</w:t>
+      </w:r>
+    </w:p>
+    <w:p>
+      <w:pPr>
         <w:pStyle w:val="Ttulo1"/>
         <w:pageBreakBefore/>
         <w:pBdr>
@@ -6163,7 +6418,7 @@
           <w:sz w:val="34"/>
         </w:rPr>
       </w:pPr>
-      <w:bookmarkStart w:id="14" w:name="_Toc236645678"/>
+      <w:bookmarkStart w:id="15" w:name="_Toc236755247"/>
       <w:r>
         <w:rPr>
           <w:rFonts w:ascii="Montserrat" w:hAnsi="Montserrat"/>
@@ -6174,7 +6429,7 @@
         <w:lastRenderedPageBreak/>
         <w:t>3. Passo a passo do fluxo de um projeto</w:t>
       </w:r>
-      <w:bookmarkEnd w:id="14"/>
+      <w:bookmarkEnd w:id="15"/>
     </w:p>
     <w:p>
       <w:pPr>
@@ -6205,7 +6460,7 @@
           <w:sz w:val="27"/>
         </w:rPr>
       </w:pPr>
-      <w:bookmarkStart w:id="15" w:name="_Toc236645679"/>
+      <w:bookmarkStart w:id="16" w:name="_Toc236755248"/>
       <w:r>
         <w:rPr>
           <w:rFonts w:ascii="Montserrat" w:hAnsi="Montserrat"/>
@@ -6215,7 +6470,7 @@
         </w:rPr>
         <w:t>Passo 1 - Solicitacao de Demanda (FORALF00339)</w:t>
       </w:r>
-      <w:bookmarkEnd w:id="15"/>
+      <w:bookmarkEnd w:id="16"/>
     </w:p>
     <w:p>
       <w:pPr>
@@ -7065,16 +7320,16 @@
         </w:rPr>
         <w:lastRenderedPageBreak/>
         <w:drawing>
-          <wp:inline distT="0" distB="0" distL="0" distR="0" wp14:anchorId="11DF4E22" wp14:editId="2148E94A">
+          <wp:inline distT="0" distB="0" distL="0" distR="0" wp14:anchorId="66AB2FFC" wp14:editId="663FF2F0">
             <wp:extent cx="5120640" cy="4627581"/>
             <wp:effectExtent l="19050" t="19050" r="22860" b="20955"/>
-            <wp:docPr id="42761739" name="Imagem 7"/>
+            <wp:docPr id="329107318" name="Imagem 7"/>
             <wp:cNvGraphicFramePr/>
             <a:graphic xmlns:a="http://schemas.openxmlformats.org/drawingml/2006/main">
               <a:graphicData uri="http://schemas.openxmlformats.org/drawingml/2006/picture">
                 <pic:pic xmlns:pic="http://schemas.openxmlformats.org/drawingml/2006/picture">
                   <pic:nvPicPr>
-                    <pic:cNvPr id="42761739" name=""/>
+                    <pic:cNvPr id="329107318" name=""/>
                     <pic:cNvPicPr/>
                   </pic:nvPicPr>
                   <pic:blipFill>
@@ -7142,16 +7397,16 @@
         </w:rPr>
         <w:lastRenderedPageBreak/>
         <w:drawing>
-          <wp:inline distT="0" distB="0" distL="0" distR="0" wp14:anchorId="1E172DCD" wp14:editId="30CB0315">
+          <wp:inline distT="0" distB="0" distL="0" distR="0" wp14:anchorId="0B5B2364" wp14:editId="28F0DE03">
             <wp:extent cx="5120640" cy="4627581"/>
             <wp:effectExtent l="19050" t="19050" r="22860" b="20955"/>
-            <wp:docPr id="1847748819" name="Imagem 8"/>
+            <wp:docPr id="661486452" name="Imagem 8"/>
             <wp:cNvGraphicFramePr/>
             <a:graphic xmlns:a="http://schemas.openxmlformats.org/drawingml/2006/main">
               <a:graphicData uri="http://schemas.openxmlformats.org/drawingml/2006/picture">
                 <pic:pic xmlns:pic="http://schemas.openxmlformats.org/drawingml/2006/picture">
                   <pic:nvPicPr>
-                    <pic:cNvPr id="1847748819" name=""/>
+                    <pic:cNvPr id="661486452" name=""/>
                     <pic:cNvPicPr/>
                   </pic:nvPicPr>
                   <pic:blipFill>
@@ -7286,7 +7541,7 @@
           <w:sz w:val="27"/>
         </w:rPr>
       </w:pPr>
-      <w:bookmarkStart w:id="16" w:name="_Toc236645680"/>
+      <w:bookmarkStart w:id="17" w:name="_Toc236755249"/>
       <w:r>
         <w:rPr>
           <w:rFonts w:ascii="Montserrat" w:hAnsi="Montserrat"/>
@@ -7297,7 +7552,7 @@
         <w:lastRenderedPageBreak/>
         <w:t>Passo 2 - Canvas de Projeto (FORALF00344)</w:t>
       </w:r>
-      <w:bookmarkEnd w:id="16"/>
+      <w:bookmarkEnd w:id="17"/>
     </w:p>
     <w:p>
       <w:pPr>
@@ -8147,16 +8402,16 @@
         </w:rPr>
         <w:lastRenderedPageBreak/>
         <w:drawing>
-          <wp:inline distT="0" distB="0" distL="0" distR="0" wp14:anchorId="5F2E0B42" wp14:editId="1C3B52B4">
+          <wp:inline distT="0" distB="0" distL="0" distR="0" wp14:anchorId="7BCE64E4" wp14:editId="05CA0B7E">
             <wp:extent cx="5120640" cy="4627581"/>
             <wp:effectExtent l="19050" t="19050" r="22860" b="20955"/>
-            <wp:docPr id="612721388" name="Imagem 9"/>
+            <wp:docPr id="1262189924" name="Imagem 9"/>
             <wp:cNvGraphicFramePr/>
             <a:graphic xmlns:a="http://schemas.openxmlformats.org/drawingml/2006/main">
               <a:graphicData uri="http://schemas.openxmlformats.org/drawingml/2006/picture">
                 <pic:pic xmlns:pic="http://schemas.openxmlformats.org/drawingml/2006/picture">
                   <pic:nvPicPr>
-                    <pic:cNvPr id="612721388" name=""/>
+                    <pic:cNvPr id="1262189924" name=""/>
                     <pic:cNvPicPr/>
                   </pic:nvPicPr>
                   <pic:blipFill>
@@ -8224,16 +8479,16 @@
         </w:rPr>
         <w:lastRenderedPageBreak/>
         <w:drawing>
-          <wp:inline distT="0" distB="0" distL="0" distR="0" wp14:anchorId="0AA560ED" wp14:editId="6FD6E4AE">
+          <wp:inline distT="0" distB="0" distL="0" distR="0" wp14:anchorId="0E62AA18" wp14:editId="0D0EF05B">
             <wp:extent cx="5120640" cy="4627581"/>
             <wp:effectExtent l="19050" t="19050" r="22860" b="20955"/>
-            <wp:docPr id="175429368" name="Imagem 10"/>
+            <wp:docPr id="1543699069" name="Imagem 10"/>
             <wp:cNvGraphicFramePr/>
             <a:graphic xmlns:a="http://schemas.openxmlformats.org/drawingml/2006/main">
               <a:graphicData uri="http://schemas.openxmlformats.org/drawingml/2006/picture">
                 <pic:pic xmlns:pic="http://schemas.openxmlformats.org/drawingml/2006/picture">
                   <pic:nvPicPr>
-                    <pic:cNvPr id="175429368" name=""/>
+                    <pic:cNvPr id="1543699069" name=""/>
                     <pic:cNvPicPr/>
                   </pic:nvPicPr>
                   <pic:blipFill>
@@ -8319,7 +8574,7 @@
           <w:sz w:val="27"/>
         </w:rPr>
       </w:pPr>
-      <w:bookmarkStart w:id="17" w:name="_Toc236645681"/>
+      <w:bookmarkStart w:id="18" w:name="_Toc236755250"/>
       <w:r>
         <w:rPr>
           <w:rFonts w:ascii="Montserrat" w:hAnsi="Montserrat"/>
@@ -8329,7 +8584,7 @@
         </w:rPr>
         <w:t>Passo 3 - TAP, Termo de Abertura de Projeto (FORALF00338)</w:t>
       </w:r>
-      <w:bookmarkEnd w:id="17"/>
+      <w:bookmarkEnd w:id="18"/>
     </w:p>
     <w:p>
       <w:pPr>
@@ -9287,16 +9542,16 @@
         </w:rPr>
         <w:lastRenderedPageBreak/>
         <w:drawing>
-          <wp:inline distT="0" distB="0" distL="0" distR="0" wp14:anchorId="202874A3" wp14:editId="5FB9B5C4">
+          <wp:inline distT="0" distB="0" distL="0" distR="0" wp14:anchorId="30EF5F20" wp14:editId="3FDDA8BC">
             <wp:extent cx="5120640" cy="3282818"/>
             <wp:effectExtent l="19050" t="19050" r="22860" b="13335"/>
-            <wp:docPr id="762583330" name="Imagem 11"/>
+            <wp:docPr id="1578921696" name="Imagem 11"/>
             <wp:cNvGraphicFramePr/>
             <a:graphic xmlns:a="http://schemas.openxmlformats.org/drawingml/2006/main">
               <a:graphicData uri="http://schemas.openxmlformats.org/drawingml/2006/picture">
                 <pic:pic xmlns:pic="http://schemas.openxmlformats.org/drawingml/2006/picture">
                   <pic:nvPicPr>
-                    <pic:cNvPr id="762583330" name=""/>
+                    <pic:cNvPr id="1578921696" name=""/>
                     <pic:cNvPicPr/>
                   </pic:nvPicPr>
                   <pic:blipFill>
@@ -9364,16 +9619,16 @@
         </w:rPr>
         <w:lastRenderedPageBreak/>
         <w:drawing>
-          <wp:inline distT="0" distB="0" distL="0" distR="0" wp14:anchorId="5ADD43E8" wp14:editId="177BD9E9">
+          <wp:inline distT="0" distB="0" distL="0" distR="0" wp14:anchorId="73B96480" wp14:editId="4E341E89">
             <wp:extent cx="5120640" cy="4627581"/>
             <wp:effectExtent l="19050" t="19050" r="22860" b="20955"/>
-            <wp:docPr id="619475757" name="Imagem 12"/>
+            <wp:docPr id="289698430" name="Imagem 12"/>
             <wp:cNvGraphicFramePr/>
             <a:graphic xmlns:a="http://schemas.openxmlformats.org/drawingml/2006/main">
               <a:graphicData uri="http://schemas.openxmlformats.org/drawingml/2006/picture">
                 <pic:pic xmlns:pic="http://schemas.openxmlformats.org/drawingml/2006/picture">
                   <pic:nvPicPr>
-                    <pic:cNvPr id="619475757" name=""/>
+                    <pic:cNvPr id="289698430" name=""/>
                     <pic:cNvPicPr/>
                   </pic:nvPicPr>
                   <pic:blipFill>
@@ -9459,7 +9714,7 @@
           <w:sz w:val="27"/>
         </w:rPr>
       </w:pPr>
-      <w:bookmarkStart w:id="18" w:name="_Toc236645682"/>
+      <w:bookmarkStart w:id="19" w:name="_Toc236755251"/>
       <w:r>
         <w:rPr>
           <w:rFonts w:ascii="Montserrat" w:hAnsi="Montserrat"/>
@@ -9469,7 +9724,7 @@
         </w:rPr>
         <w:t>Passo 4 - Planejamento e Desenvolvimento de Projeto (FORALF00325)</w:t>
       </w:r>
-      <w:bookmarkEnd w:id="18"/>
+      <w:bookmarkEnd w:id="19"/>
     </w:p>
     <w:p>
       <w:pPr>
@@ -9966,16 +10221,16 @@
           <w:noProof/>
         </w:rPr>
         <w:drawing>
-          <wp:inline distT="0" distB="0" distL="0" distR="0" wp14:anchorId="0886CA70" wp14:editId="29851AE6">
+          <wp:inline distT="0" distB="0" distL="0" distR="0" wp14:anchorId="7F1E0525" wp14:editId="7F917806">
             <wp:extent cx="5120640" cy="4627581"/>
             <wp:effectExtent l="19050" t="19050" r="22860" b="20955"/>
-            <wp:docPr id="2077874637" name="Imagem 13"/>
+            <wp:docPr id="234254345" name="Imagem 13"/>
             <wp:cNvGraphicFramePr/>
             <a:graphic xmlns:a="http://schemas.openxmlformats.org/drawingml/2006/main">
               <a:graphicData uri="http://schemas.openxmlformats.org/drawingml/2006/picture">
                 <pic:pic xmlns:pic="http://schemas.openxmlformats.org/drawingml/2006/picture">
                   <pic:nvPicPr>
-                    <pic:cNvPr id="2077874637" name=""/>
+                    <pic:cNvPr id="234254345" name=""/>
                     <pic:cNvPicPr/>
                   </pic:nvPicPr>
                   <pic:blipFill>
@@ -10043,16 +10298,16 @@
         </w:rPr>
         <w:lastRenderedPageBreak/>
         <w:drawing>
-          <wp:inline distT="0" distB="0" distL="0" distR="0" wp14:anchorId="5471009E" wp14:editId="5CA6E9C3">
+          <wp:inline distT="0" distB="0" distL="0" distR="0" wp14:anchorId="65319EC3" wp14:editId="6755C270">
             <wp:extent cx="5120640" cy="4627581"/>
             <wp:effectExtent l="19050" t="19050" r="22860" b="20955"/>
-            <wp:docPr id="2084585221" name="Imagem 14"/>
+            <wp:docPr id="1213370470" name="Imagem 14"/>
             <wp:cNvGraphicFramePr/>
             <a:graphic xmlns:a="http://schemas.openxmlformats.org/drawingml/2006/main">
               <a:graphicData uri="http://schemas.openxmlformats.org/drawingml/2006/picture">
                 <pic:pic xmlns:pic="http://schemas.openxmlformats.org/drawingml/2006/picture">
                   <pic:nvPicPr>
-                    <pic:cNvPr id="2084585221" name=""/>
+                    <pic:cNvPr id="1213370470" name=""/>
                     <pic:cNvPicPr/>
                   </pic:nvPicPr>
                   <pic:blipFill>
@@ -10138,7 +10393,7 @@
           <w:sz w:val="27"/>
         </w:rPr>
       </w:pPr>
-      <w:bookmarkStart w:id="19" w:name="_Toc236645683"/>
+      <w:bookmarkStart w:id="20" w:name="_Toc236755252"/>
       <w:r>
         <w:rPr>
           <w:rFonts w:ascii="Montserrat" w:hAnsi="Montserrat"/>
@@ -10148,7 +10403,7 @@
         </w:rPr>
         <w:t>Passo 5 - EAP, Estrutura Analitica do Projeto</w:t>
       </w:r>
-      <w:bookmarkEnd w:id="19"/>
+      <w:bookmarkEnd w:id="20"/>
     </w:p>
     <w:p>
       <w:pPr>
@@ -10179,16 +10434,16 @@
         </w:rPr>
         <w:lastRenderedPageBreak/>
         <w:drawing>
-          <wp:inline distT="0" distB="0" distL="0" distR="0" wp14:anchorId="0DEFEB14" wp14:editId="64F3C428">
+          <wp:inline distT="0" distB="0" distL="0" distR="0" wp14:anchorId="0BE4FB94" wp14:editId="6EA40D68">
             <wp:extent cx="5120640" cy="4627581"/>
             <wp:effectExtent l="19050" t="19050" r="22860" b="20955"/>
-            <wp:docPr id="816220708" name="Imagem 15"/>
+            <wp:docPr id="730948485" name="Imagem 15"/>
             <wp:cNvGraphicFramePr/>
             <a:graphic xmlns:a="http://schemas.openxmlformats.org/drawingml/2006/main">
               <a:graphicData uri="http://schemas.openxmlformats.org/drawingml/2006/picture">
                 <pic:pic xmlns:pic="http://schemas.openxmlformats.org/drawingml/2006/picture">
                   <pic:nvPicPr>
-                    <pic:cNvPr id="816220708" name=""/>
+                    <pic:cNvPr id="730948485" name=""/>
                     <pic:cNvPicPr/>
                   </pic:nvPicPr>
                   <pic:blipFill>
@@ -10256,16 +10511,16 @@
         </w:rPr>
         <w:lastRenderedPageBreak/>
         <w:drawing>
-          <wp:inline distT="0" distB="0" distL="0" distR="0" wp14:anchorId="56F356C9" wp14:editId="48A3A336">
+          <wp:inline distT="0" distB="0" distL="0" distR="0" wp14:anchorId="089D872D" wp14:editId="63232CAF">
             <wp:extent cx="5120640" cy="4627581"/>
             <wp:effectExtent l="19050" t="19050" r="22860" b="20955"/>
-            <wp:docPr id="36514758" name="Imagem 16"/>
+            <wp:docPr id="109874335" name="Imagem 16"/>
             <wp:cNvGraphicFramePr/>
             <a:graphic xmlns:a="http://schemas.openxmlformats.org/drawingml/2006/main">
               <a:graphicData uri="http://schemas.openxmlformats.org/drawingml/2006/picture">
                 <pic:pic xmlns:pic="http://schemas.openxmlformats.org/drawingml/2006/picture">
                   <pic:nvPicPr>
-                    <pic:cNvPr id="36514758" name=""/>
+                    <pic:cNvPr id="109874335" name=""/>
                     <pic:cNvPicPr/>
                   </pic:nvPicPr>
                   <pic:blipFill>
@@ -10327,7 +10582,7 @@
         <w:pStyle w:val="PargrafodaLista"/>
         <w:numPr>
           <w:ilvl w:val="0"/>
-          <w:numId w:val="9"/>
+          <w:numId w:val="10"/>
         </w:numPr>
         <w:spacing w:after="80" w:line="260" w:lineRule="auto"/>
         <w:ind w:left="700"/>
@@ -10351,7 +10606,7 @@
         <w:pStyle w:val="PargrafodaLista"/>
         <w:numPr>
           <w:ilvl w:val="0"/>
-          <w:numId w:val="9"/>
+          <w:numId w:val="10"/>
         </w:numPr>
         <w:spacing w:after="80" w:line="260" w:lineRule="auto"/>
         <w:ind w:left="700"/>
@@ -10375,7 +10630,7 @@
         <w:pStyle w:val="PargrafodaLista"/>
         <w:numPr>
           <w:ilvl w:val="0"/>
-          <w:numId w:val="9"/>
+          <w:numId w:val="10"/>
         </w:numPr>
         <w:spacing w:after="80" w:line="260" w:lineRule="auto"/>
         <w:ind w:left="700"/>
@@ -10399,7 +10654,7 @@
         <w:pStyle w:val="PargrafodaLista"/>
         <w:numPr>
           <w:ilvl w:val="0"/>
-          <w:numId w:val="9"/>
+          <w:numId w:val="10"/>
         </w:numPr>
         <w:spacing w:after="80" w:line="260" w:lineRule="auto"/>
         <w:ind w:left="700"/>
@@ -10429,16 +10684,16 @@
         </w:rPr>
         <w:lastRenderedPageBreak/>
         <w:drawing>
-          <wp:inline distT="0" distB="0" distL="0" distR="0" wp14:anchorId="06AD7F9A" wp14:editId="72A60410">
+          <wp:inline distT="0" distB="0" distL="0" distR="0" wp14:anchorId="6A70CBFA" wp14:editId="0DF3409D">
             <wp:extent cx="5120640" cy="3282818"/>
             <wp:effectExtent l="19050" t="19050" r="22860" b="13335"/>
-            <wp:docPr id="195669334" name="Imagem 17"/>
+            <wp:docPr id="185318608" name="Imagem 17"/>
             <wp:cNvGraphicFramePr/>
             <a:graphic xmlns:a="http://schemas.openxmlformats.org/drawingml/2006/main">
               <a:graphicData uri="http://schemas.openxmlformats.org/drawingml/2006/picture">
                 <pic:pic xmlns:pic="http://schemas.openxmlformats.org/drawingml/2006/picture">
                   <pic:nvPicPr>
-                    <pic:cNvPr id="195669334" name=""/>
+                    <pic:cNvPr id="185318608" name=""/>
                     <pic:cNvPicPr/>
                   </pic:nvPicPr>
                   <pic:blipFill>
@@ -10524,7 +10779,7 @@
           <w:sz w:val="27"/>
         </w:rPr>
       </w:pPr>
-      <w:bookmarkStart w:id="20" w:name="_Toc236645684"/>
+      <w:bookmarkStart w:id="21" w:name="_Toc236755253"/>
       <w:r>
         <w:rPr>
           <w:rFonts w:ascii="Montserrat" w:hAnsi="Montserrat"/>
@@ -10534,7 +10789,7 @@
         </w:rPr>
         <w:t>Passo 6 - Ata de Reuniao (FORALF00340) - uso recorrente</w:t>
       </w:r>
-      <w:bookmarkEnd w:id="20"/>
+      <w:bookmarkEnd w:id="21"/>
     </w:p>
     <w:p>
       <w:pPr>
@@ -10565,16 +10820,16 @@
         </w:rPr>
         <w:lastRenderedPageBreak/>
         <w:drawing>
-          <wp:inline distT="0" distB="0" distL="0" distR="0" wp14:anchorId="3CEF03B7" wp14:editId="5553E309">
+          <wp:inline distT="0" distB="0" distL="0" distR="0" wp14:anchorId="47431A9E" wp14:editId="55ECE065">
             <wp:extent cx="5120640" cy="4627581"/>
             <wp:effectExtent l="19050" t="19050" r="22860" b="20955"/>
-            <wp:docPr id="988548812" name="Imagem 18"/>
+            <wp:docPr id="2091374221" name="Imagem 18"/>
             <wp:cNvGraphicFramePr/>
             <a:graphic xmlns:a="http://schemas.openxmlformats.org/drawingml/2006/main">
               <a:graphicData uri="http://schemas.openxmlformats.org/drawingml/2006/picture">
                 <pic:pic xmlns:pic="http://schemas.openxmlformats.org/drawingml/2006/picture">
                   <pic:nvPicPr>
-                    <pic:cNvPr id="988548812" name=""/>
+                    <pic:cNvPr id="2091374221" name=""/>
                     <pic:cNvPicPr/>
                   </pic:nvPicPr>
                   <pic:blipFill>
@@ -10642,16 +10897,16 @@
         </w:rPr>
         <w:lastRenderedPageBreak/>
         <w:drawing>
-          <wp:inline distT="0" distB="0" distL="0" distR="0" wp14:anchorId="56E645C8" wp14:editId="6410AB81">
+          <wp:inline distT="0" distB="0" distL="0" distR="0" wp14:anchorId="0DDC2481" wp14:editId="14876C3F">
             <wp:extent cx="5120640" cy="4627581"/>
             <wp:effectExtent l="19050" t="19050" r="22860" b="20955"/>
-            <wp:docPr id="1605064705" name="Imagem 19"/>
+            <wp:docPr id="881622260" name="Imagem 19"/>
             <wp:cNvGraphicFramePr/>
             <a:graphic xmlns:a="http://schemas.openxmlformats.org/drawingml/2006/main">
               <a:graphicData uri="http://schemas.openxmlformats.org/drawingml/2006/picture">
                 <pic:pic xmlns:pic="http://schemas.openxmlformats.org/drawingml/2006/picture">
                   <pic:nvPicPr>
-                    <pic:cNvPr id="1605064705" name=""/>
+                    <pic:cNvPr id="881622260" name=""/>
                     <pic:cNvPicPr/>
                   </pic:nvPicPr>
                   <pic:blipFill>
@@ -10713,7 +10968,7 @@
         <w:pStyle w:val="PargrafodaLista"/>
         <w:numPr>
           <w:ilvl w:val="0"/>
-          <w:numId w:val="10"/>
+          <w:numId w:val="11"/>
         </w:numPr>
         <w:spacing w:after="80" w:line="260" w:lineRule="auto"/>
         <w:ind w:left="700"/>
@@ -10737,7 +10992,7 @@
         <w:pStyle w:val="PargrafodaLista"/>
         <w:numPr>
           <w:ilvl w:val="0"/>
-          <w:numId w:val="10"/>
+          <w:numId w:val="11"/>
         </w:numPr>
         <w:spacing w:after="80" w:line="260" w:lineRule="auto"/>
         <w:ind w:left="700"/>
@@ -10785,7 +11040,7 @@
           <w:sz w:val="27"/>
         </w:rPr>
       </w:pPr>
-      <w:bookmarkStart w:id="21" w:name="_Toc236645685"/>
+      <w:bookmarkStart w:id="22" w:name="_Toc236755254"/>
       <w:r>
         <w:rPr>
           <w:rFonts w:ascii="Montserrat" w:hAnsi="Montserrat"/>
@@ -10795,7 +11050,7 @@
         </w:rPr>
         <w:t>Passo 7 - SMP, Solicitacao de Mudanca de Projeto (FORALF00343) - uso condicional</w:t>
       </w:r>
-      <w:bookmarkEnd w:id="21"/>
+      <w:bookmarkEnd w:id="22"/>
     </w:p>
     <w:p>
       <w:pPr>
@@ -10826,16 +11081,16 @@
         </w:rPr>
         <w:lastRenderedPageBreak/>
         <w:drawing>
-          <wp:inline distT="0" distB="0" distL="0" distR="0" wp14:anchorId="2A4413E3" wp14:editId="24C94BB2">
+          <wp:inline distT="0" distB="0" distL="0" distR="0" wp14:anchorId="43204BE1" wp14:editId="35A22DF2">
             <wp:extent cx="5120640" cy="4627581"/>
             <wp:effectExtent l="19050" t="19050" r="22860" b="20955"/>
-            <wp:docPr id="663307416" name="Imagem 20"/>
+            <wp:docPr id="1464696850" name="Imagem 20"/>
             <wp:cNvGraphicFramePr/>
             <a:graphic xmlns:a="http://schemas.openxmlformats.org/drawingml/2006/main">
               <a:graphicData uri="http://schemas.openxmlformats.org/drawingml/2006/picture">
                 <pic:pic xmlns:pic="http://schemas.openxmlformats.org/drawingml/2006/picture">
                   <pic:nvPicPr>
-                    <pic:cNvPr id="663307416" name=""/>
+                    <pic:cNvPr id="1464696850" name=""/>
                     <pic:cNvPicPr/>
                   </pic:nvPicPr>
                   <pic:blipFill>
@@ -10903,16 +11158,16 @@
         </w:rPr>
         <w:lastRenderedPageBreak/>
         <w:drawing>
-          <wp:inline distT="0" distB="0" distL="0" distR="0" wp14:anchorId="6E3423AB" wp14:editId="084BC266">
+          <wp:inline distT="0" distB="0" distL="0" distR="0" wp14:anchorId="056CF550" wp14:editId="70C0C5EA">
             <wp:extent cx="5120640" cy="4627581"/>
             <wp:effectExtent l="19050" t="19050" r="22860" b="20955"/>
-            <wp:docPr id="489292287" name="Imagem 21"/>
+            <wp:docPr id="1557900929" name="Imagem 21"/>
             <wp:cNvGraphicFramePr/>
             <a:graphic xmlns:a="http://schemas.openxmlformats.org/drawingml/2006/main">
               <a:graphicData uri="http://schemas.openxmlformats.org/drawingml/2006/picture">
                 <pic:pic xmlns:pic="http://schemas.openxmlformats.org/drawingml/2006/picture">
                   <pic:nvPicPr>
-                    <pic:cNvPr id="489292287" name=""/>
+                    <pic:cNvPr id="1557900929" name=""/>
                     <pic:cNvPicPr/>
                   </pic:nvPicPr>
                   <pic:blipFill>
@@ -10974,7 +11229,7 @@
         <w:pStyle w:val="PargrafodaLista"/>
         <w:numPr>
           <w:ilvl w:val="0"/>
-          <w:numId w:val="11"/>
+          <w:numId w:val="12"/>
         </w:numPr>
         <w:spacing w:after="80" w:line="260" w:lineRule="auto"/>
         <w:ind w:left="700"/>
@@ -10998,7 +11253,7 @@
         <w:pStyle w:val="PargrafodaLista"/>
         <w:numPr>
           <w:ilvl w:val="0"/>
-          <w:numId w:val="11"/>
+          <w:numId w:val="12"/>
         </w:numPr>
         <w:spacing w:after="80" w:line="260" w:lineRule="auto"/>
         <w:ind w:left="700"/>
@@ -11022,7 +11277,7 @@
         <w:pStyle w:val="PargrafodaLista"/>
         <w:numPr>
           <w:ilvl w:val="0"/>
-          <w:numId w:val="11"/>
+          <w:numId w:val="12"/>
         </w:numPr>
         <w:spacing w:after="80" w:line="260" w:lineRule="auto"/>
         <w:ind w:left="700"/>
@@ -11101,7 +11356,7 @@
           <w:sz w:val="27"/>
         </w:rPr>
       </w:pPr>
-      <w:bookmarkStart w:id="22" w:name="_Toc236645686"/>
+      <w:bookmarkStart w:id="23" w:name="_Toc236755255"/>
       <w:r>
         <w:rPr>
           <w:rFonts w:ascii="Montserrat" w:hAnsi="Montserrat"/>
@@ -11111,7 +11366,7 @@
         </w:rPr>
         <w:t>Passo 8 - TEP, Termo de Encerramento de Projeto (FORALF00341)</w:t>
       </w:r>
-      <w:bookmarkEnd w:id="22"/>
+      <w:bookmarkEnd w:id="23"/>
     </w:p>
     <w:p>
       <w:pPr>
@@ -11141,16 +11396,16 @@
           <w:noProof/>
         </w:rPr>
         <w:drawing>
-          <wp:inline distT="0" distB="0" distL="0" distR="0" wp14:anchorId="0F9AA500" wp14:editId="45845E7E">
+          <wp:inline distT="0" distB="0" distL="0" distR="0" wp14:anchorId="2E3A8CC2" wp14:editId="08D34EF9">
             <wp:extent cx="5120640" cy="4627581"/>
             <wp:effectExtent l="19050" t="19050" r="22860" b="20955"/>
-            <wp:docPr id="273693855" name="Imagem 22"/>
+            <wp:docPr id="1684138538" name="Imagem 22"/>
             <wp:cNvGraphicFramePr/>
             <a:graphic xmlns:a="http://schemas.openxmlformats.org/drawingml/2006/main">
               <a:graphicData uri="http://schemas.openxmlformats.org/drawingml/2006/picture">
                 <pic:pic xmlns:pic="http://schemas.openxmlformats.org/drawingml/2006/picture">
                   <pic:nvPicPr>
-                    <pic:cNvPr id="273693855" name=""/>
+                    <pic:cNvPr id="1684138538" name=""/>
                     <pic:cNvPicPr/>
                   </pic:nvPicPr>
                   <pic:blipFill>
@@ -11218,16 +11473,16 @@
         </w:rPr>
         <w:lastRenderedPageBreak/>
         <w:drawing>
-          <wp:inline distT="0" distB="0" distL="0" distR="0" wp14:anchorId="1B1DB61C" wp14:editId="0FBDD6C9">
+          <wp:inline distT="0" distB="0" distL="0" distR="0" wp14:anchorId="6301FE64" wp14:editId="7FEFBCE7">
             <wp:extent cx="5120640" cy="4627581"/>
             <wp:effectExtent l="19050" t="19050" r="22860" b="20955"/>
-            <wp:docPr id="513732600" name="Imagem 23"/>
+            <wp:docPr id="948810405" name="Imagem 23"/>
             <wp:cNvGraphicFramePr/>
             <a:graphic xmlns:a="http://schemas.openxmlformats.org/drawingml/2006/main">
               <a:graphicData uri="http://schemas.openxmlformats.org/drawingml/2006/picture">
                 <pic:pic xmlns:pic="http://schemas.openxmlformats.org/drawingml/2006/picture">
                   <pic:nvPicPr>
-                    <pic:cNvPr id="513732600" name=""/>
+                    <pic:cNvPr id="948810405" name=""/>
                     <pic:cNvPicPr/>
                   </pic:nvPicPr>
                   <pic:blipFill>
@@ -11289,7 +11544,7 @@
         <w:pStyle w:val="PargrafodaLista"/>
         <w:numPr>
           <w:ilvl w:val="0"/>
-          <w:numId w:val="12"/>
+          <w:numId w:val="13"/>
         </w:numPr>
         <w:spacing w:after="80" w:line="260" w:lineRule="auto"/>
         <w:ind w:left="700"/>
@@ -11313,7 +11568,7 @@
         <w:pStyle w:val="PargrafodaLista"/>
         <w:numPr>
           <w:ilvl w:val="0"/>
-          <w:numId w:val="12"/>
+          <w:numId w:val="13"/>
         </w:numPr>
         <w:spacing w:after="80" w:line="260" w:lineRule="auto"/>
         <w:ind w:left="700"/>
@@ -11337,7 +11592,7 @@
         <w:pStyle w:val="PargrafodaLista"/>
         <w:numPr>
           <w:ilvl w:val="0"/>
-          <w:numId w:val="12"/>
+          <w:numId w:val="13"/>
         </w:numPr>
         <w:spacing w:after="80" w:line="260" w:lineRule="auto"/>
         <w:ind w:left="700"/>
@@ -11385,7 +11640,7 @@
           <w:sz w:val="27"/>
         </w:rPr>
       </w:pPr>
-      <w:bookmarkStart w:id="23" w:name="_Toc236645687"/>
+      <w:bookmarkStart w:id="24" w:name="_Toc236755256"/>
       <w:r>
         <w:rPr>
           <w:rFonts w:ascii="Montserrat" w:hAnsi="Montserrat"/>
@@ -11395,7 +11650,7 @@
         </w:rPr>
         <w:t>Passo 9 - RLA, Registro de Licoes Aprendidas (FORALF00342)</w:t>
       </w:r>
-      <w:bookmarkEnd w:id="23"/>
+      <w:bookmarkEnd w:id="24"/>
     </w:p>
     <w:p>
       <w:pPr>
@@ -11426,16 +11681,16 @@
         </w:rPr>
         <w:lastRenderedPageBreak/>
         <w:drawing>
-          <wp:inline distT="0" distB="0" distL="0" distR="0" wp14:anchorId="681E1595" wp14:editId="7FA99AF7">
+          <wp:inline distT="0" distB="0" distL="0" distR="0" wp14:anchorId="27AE23BD" wp14:editId="4C30319A">
             <wp:extent cx="5120640" cy="4627581"/>
             <wp:effectExtent l="19050" t="19050" r="22860" b="20955"/>
-            <wp:docPr id="72764244" name="Imagem 24"/>
+            <wp:docPr id="1684266874" name="Imagem 24"/>
             <wp:cNvGraphicFramePr/>
             <a:graphic xmlns:a="http://schemas.openxmlformats.org/drawingml/2006/main">
               <a:graphicData uri="http://schemas.openxmlformats.org/drawingml/2006/picture">
                 <pic:pic xmlns:pic="http://schemas.openxmlformats.org/drawingml/2006/picture">
                   <pic:nvPicPr>
-                    <pic:cNvPr id="72764244" name=""/>
+                    <pic:cNvPr id="1684266874" name=""/>
                     <pic:cNvPicPr/>
                   </pic:nvPicPr>
                   <pic:blipFill>
@@ -11503,16 +11758,16 @@
         </w:rPr>
         <w:lastRenderedPageBreak/>
         <w:drawing>
-          <wp:inline distT="0" distB="0" distL="0" distR="0" wp14:anchorId="3CE7AC64" wp14:editId="2F515300">
+          <wp:inline distT="0" distB="0" distL="0" distR="0" wp14:anchorId="6F8A1F61" wp14:editId="09987129">
             <wp:extent cx="5120640" cy="4627581"/>
             <wp:effectExtent l="19050" t="19050" r="22860" b="20955"/>
-            <wp:docPr id="1382257703" name="Imagem 25"/>
+            <wp:docPr id="2140384373" name="Imagem 25"/>
             <wp:cNvGraphicFramePr/>
             <a:graphic xmlns:a="http://schemas.openxmlformats.org/drawingml/2006/main">
               <a:graphicData uri="http://schemas.openxmlformats.org/drawingml/2006/picture">
                 <pic:pic xmlns:pic="http://schemas.openxmlformats.org/drawingml/2006/picture">
                   <pic:nvPicPr>
-                    <pic:cNvPr id="1382257703" name=""/>
+                    <pic:cNvPr id="2140384373" name=""/>
                     <pic:cNvPicPr/>
                   </pic:nvPicPr>
                   <pic:blipFill>
@@ -11574,7 +11829,7 @@
         <w:pStyle w:val="PargrafodaLista"/>
         <w:numPr>
           <w:ilvl w:val="0"/>
-          <w:numId w:val="13"/>
+          <w:numId w:val="14"/>
         </w:numPr>
         <w:spacing w:after="80" w:line="260" w:lineRule="auto"/>
         <w:ind w:left="700"/>
@@ -11598,7 +11853,7 @@
         <w:pStyle w:val="PargrafodaLista"/>
         <w:numPr>
           <w:ilvl w:val="0"/>
-          <w:numId w:val="13"/>
+          <w:numId w:val="14"/>
         </w:numPr>
         <w:spacing w:after="80" w:line="260" w:lineRule="auto"/>
         <w:ind w:left="700"/>
@@ -11646,7 +11901,7 @@
           <w:sz w:val="27"/>
         </w:rPr>
       </w:pPr>
-      <w:bookmarkStart w:id="24" w:name="_Toc236645688"/>
+      <w:bookmarkStart w:id="25" w:name="_Toc236755257"/>
       <w:r>
         <w:rPr>
           <w:rFonts w:ascii="Montserrat" w:hAnsi="Montserrat"/>
@@ -11656,7 +11911,7 @@
         </w:rPr>
         <w:t>Passo 10 - Plano de Comunicacao de Projeto (FORALF00308)</w:t>
       </w:r>
-      <w:bookmarkEnd w:id="24"/>
+      <w:bookmarkEnd w:id="25"/>
     </w:p>
     <w:p>
       <w:pPr>
@@ -11687,16 +11942,16 @@
         </w:rPr>
         <w:lastRenderedPageBreak/>
         <w:drawing>
-          <wp:inline distT="0" distB="0" distL="0" distR="0" wp14:anchorId="656D3685" wp14:editId="465973B6">
+          <wp:inline distT="0" distB="0" distL="0" distR="0" wp14:anchorId="74FE77D4" wp14:editId="09A3A908">
             <wp:extent cx="5120640" cy="4627581"/>
             <wp:effectExtent l="19050" t="19050" r="22860" b="20955"/>
-            <wp:docPr id="42712747" name="Imagem 26"/>
+            <wp:docPr id="1623827336" name="Imagem 26"/>
             <wp:cNvGraphicFramePr/>
             <a:graphic xmlns:a="http://schemas.openxmlformats.org/drawingml/2006/main">
               <a:graphicData uri="http://schemas.openxmlformats.org/drawingml/2006/picture">
                 <pic:pic xmlns:pic="http://schemas.openxmlformats.org/drawingml/2006/picture">
                   <pic:nvPicPr>
-                    <pic:cNvPr id="42712747" name=""/>
+                    <pic:cNvPr id="1623827336" name=""/>
                     <pic:cNvPicPr/>
                   </pic:nvPicPr>
                   <pic:blipFill>
@@ -11786,7 +12041,7 @@
           <w:sz w:val="34"/>
         </w:rPr>
       </w:pPr>
-      <w:bookmarkStart w:id="25" w:name="_Toc236645689"/>
+      <w:bookmarkStart w:id="26" w:name="_Toc236755258"/>
       <w:r>
         <w:rPr>
           <w:rFonts w:ascii="Montserrat" w:hAnsi="Montserrat"/>
@@ -11797,7 +12052,7 @@
         <w:lastRenderedPageBreak/>
         <w:t>4. Gerando os relatorios finais</w:t>
       </w:r>
-      <w:bookmarkEnd w:id="25"/>
+      <w:bookmarkEnd w:id="26"/>
     </w:p>
     <w:p>
       <w:pPr>
@@ -11828,7 +12083,7 @@
           <w:sz w:val="27"/>
         </w:rPr>
       </w:pPr>
-      <w:bookmarkStart w:id="26" w:name="_Toc236645690"/>
+      <w:bookmarkStart w:id="27" w:name="_Toc236755259"/>
       <w:r>
         <w:rPr>
           <w:rFonts w:ascii="Montserrat" w:hAnsi="Montserrat"/>
@@ -11838,7 +12093,7 @@
         </w:rPr>
         <w:t>4.1 Relatorio de Situacao de Projetos (FORALF11)</w:t>
       </w:r>
-      <w:bookmarkEnd w:id="26"/>
+      <w:bookmarkEnd w:id="27"/>
     </w:p>
     <w:p>
       <w:pPr>
@@ -11868,16 +12123,16 @@
           <w:noProof/>
         </w:rPr>
         <w:drawing>
-          <wp:inline distT="0" distB="0" distL="0" distR="0" wp14:anchorId="727DEB03" wp14:editId="76A02BC5">
+          <wp:inline distT="0" distB="0" distL="0" distR="0" wp14:anchorId="6DBAC3EC" wp14:editId="2631ED6E">
             <wp:extent cx="5120640" cy="4627581"/>
             <wp:effectExtent l="19050" t="19050" r="22860" b="20955"/>
-            <wp:docPr id="1738258247" name="Imagem 27"/>
+            <wp:docPr id="19130386" name="Imagem 27"/>
             <wp:cNvGraphicFramePr/>
             <a:graphic xmlns:a="http://schemas.openxmlformats.org/drawingml/2006/main">
               <a:graphicData uri="http://schemas.openxmlformats.org/drawingml/2006/picture">
                 <pic:pic xmlns:pic="http://schemas.openxmlformats.org/drawingml/2006/picture">
                   <pic:nvPicPr>
-                    <pic:cNvPr id="1738258247" name=""/>
+                    <pic:cNvPr id="19130386" name=""/>
                     <pic:cNvPicPr/>
                   </pic:nvPicPr>
                   <pic:blipFill>
@@ -11945,16 +12200,16 @@
         </w:rPr>
         <w:lastRenderedPageBreak/>
         <w:drawing>
-          <wp:inline distT="0" distB="0" distL="0" distR="0" wp14:anchorId="415478B2" wp14:editId="6DAEBB47">
+          <wp:inline distT="0" distB="0" distL="0" distR="0" wp14:anchorId="3ED8CEAE" wp14:editId="7A2D2E81">
             <wp:extent cx="5120640" cy="4627581"/>
             <wp:effectExtent l="19050" t="19050" r="22860" b="20955"/>
-            <wp:docPr id="376094646" name="Imagem 28"/>
+            <wp:docPr id="713515033" name="Imagem 28"/>
             <wp:cNvGraphicFramePr/>
             <a:graphic xmlns:a="http://schemas.openxmlformats.org/drawingml/2006/main">
               <a:graphicData uri="http://schemas.openxmlformats.org/drawingml/2006/picture">
                 <pic:pic xmlns:pic="http://schemas.openxmlformats.org/drawingml/2006/picture">
                   <pic:nvPicPr>
-                    <pic:cNvPr id="376094646" name=""/>
+                    <pic:cNvPr id="713515033" name=""/>
                     <pic:cNvPicPr/>
                   </pic:nvPicPr>
                   <pic:blipFill>
@@ -12022,16 +12277,16 @@
         </w:rPr>
         <w:lastRenderedPageBreak/>
         <w:drawing>
-          <wp:inline distT="0" distB="0" distL="0" distR="0" wp14:anchorId="55DEC80E" wp14:editId="196C2BCD">
+          <wp:inline distT="0" distB="0" distL="0" distR="0" wp14:anchorId="33382343" wp14:editId="218B2851">
             <wp:extent cx="5120640" cy="4627581"/>
             <wp:effectExtent l="19050" t="19050" r="22860" b="20955"/>
-            <wp:docPr id="1187141844" name="Imagem 29"/>
+            <wp:docPr id="504263831" name="Imagem 29"/>
             <wp:cNvGraphicFramePr/>
             <a:graphic xmlns:a="http://schemas.openxmlformats.org/drawingml/2006/main">
               <a:graphicData uri="http://schemas.openxmlformats.org/drawingml/2006/picture">
                 <pic:pic xmlns:pic="http://schemas.openxmlformats.org/drawingml/2006/picture">
                   <pic:nvPicPr>
-                    <pic:cNvPr id="1187141844" name=""/>
+                    <pic:cNvPr id="504263831" name=""/>
                     <pic:cNvPicPr/>
                   </pic:nvPicPr>
                   <pic:blipFill>
@@ -12093,7 +12348,7 @@
         <w:pStyle w:val="PargrafodaLista"/>
         <w:numPr>
           <w:ilvl w:val="0"/>
-          <w:numId w:val="14"/>
+          <w:numId w:val="15"/>
         </w:numPr>
         <w:spacing w:after="80" w:line="260" w:lineRule="auto"/>
         <w:ind w:left="700"/>
@@ -12117,7 +12372,7 @@
         <w:pStyle w:val="PargrafodaLista"/>
         <w:numPr>
           <w:ilvl w:val="0"/>
-          <w:numId w:val="14"/>
+          <w:numId w:val="15"/>
         </w:numPr>
         <w:spacing w:after="80" w:line="260" w:lineRule="auto"/>
         <w:ind w:left="700"/>
@@ -12168,16 +12423,16 @@
         </w:rPr>
         <w:lastRenderedPageBreak/>
         <w:drawing>
-          <wp:inline distT="0" distB="0" distL="0" distR="0" wp14:anchorId="39DBEC58" wp14:editId="1B142238">
+          <wp:inline distT="0" distB="0" distL="0" distR="0" wp14:anchorId="23383132" wp14:editId="365E0865">
             <wp:extent cx="5120640" cy="1715571"/>
             <wp:effectExtent l="19050" t="19050" r="22860" b="18415"/>
-            <wp:docPr id="293291954" name="Imagem 30"/>
+            <wp:docPr id="408894492" name="Imagem 30"/>
             <wp:cNvGraphicFramePr/>
             <a:graphic xmlns:a="http://schemas.openxmlformats.org/drawingml/2006/main">
               <a:graphicData uri="http://schemas.openxmlformats.org/drawingml/2006/picture">
                 <pic:pic xmlns:pic="http://schemas.openxmlformats.org/drawingml/2006/picture">
                   <pic:nvPicPr>
-                    <pic:cNvPr id="293291954" name=""/>
+                    <pic:cNvPr id="408894492" name=""/>
                     <pic:cNvPicPr/>
                   </pic:nvPicPr>
                   <pic:blipFill>
@@ -12239,7 +12494,7 @@
         <w:pStyle w:val="PargrafodaLista"/>
         <w:numPr>
           <w:ilvl w:val="0"/>
-          <w:numId w:val="15"/>
+          <w:numId w:val="16"/>
         </w:numPr>
         <w:spacing w:after="80" w:line="260" w:lineRule="auto"/>
         <w:ind w:left="700"/>
@@ -12263,7 +12518,7 @@
         <w:pStyle w:val="PargrafodaLista"/>
         <w:numPr>
           <w:ilvl w:val="0"/>
-          <w:numId w:val="15"/>
+          <w:numId w:val="16"/>
         </w:numPr>
         <w:spacing w:after="80" w:line="260" w:lineRule="auto"/>
         <w:ind w:left="700"/>
@@ -12314,16 +12569,16 @@
         </w:rPr>
         <w:lastRenderedPageBreak/>
         <w:drawing>
-          <wp:inline distT="0" distB="0" distL="0" distR="0" wp14:anchorId="3EBAA8D6" wp14:editId="20768736">
+          <wp:inline distT="0" distB="0" distL="0" distR="0" wp14:anchorId="67F73288" wp14:editId="3ED0CAE2">
             <wp:extent cx="5120640" cy="3282818"/>
             <wp:effectExtent l="19050" t="19050" r="22860" b="13335"/>
-            <wp:docPr id="534684568" name="Imagem 31"/>
+            <wp:docPr id="132600627" name="Imagem 31"/>
             <wp:cNvGraphicFramePr/>
             <a:graphic xmlns:a="http://schemas.openxmlformats.org/drawingml/2006/main">
               <a:graphicData uri="http://schemas.openxmlformats.org/drawingml/2006/picture">
                 <pic:pic xmlns:pic="http://schemas.openxmlformats.org/drawingml/2006/picture">
                   <pic:nvPicPr>
-                    <pic:cNvPr id="534684568" name=""/>
+                    <pic:cNvPr id="132600627" name=""/>
                     <pic:cNvPicPr/>
                   </pic:nvPicPr>
                   <pic:blipFill>
@@ -12385,7 +12640,7 @@
         <w:pStyle w:val="PargrafodaLista"/>
         <w:numPr>
           <w:ilvl w:val="0"/>
-          <w:numId w:val="16"/>
+          <w:numId w:val="17"/>
         </w:numPr>
         <w:spacing w:after="80" w:line="260" w:lineRule="auto"/>
         <w:ind w:left="700"/>
@@ -12435,16 +12690,16 @@
           <w:noProof/>
         </w:rPr>
         <w:drawing>
-          <wp:inline distT="0" distB="0" distL="0" distR="0" wp14:anchorId="4847E97A" wp14:editId="2E9D54A0">
+          <wp:inline distT="0" distB="0" distL="0" distR="0" wp14:anchorId="477EAF7A" wp14:editId="7BB1C674">
             <wp:extent cx="5120640" cy="1515102"/>
             <wp:effectExtent l="19050" t="19050" r="22860" b="28575"/>
-            <wp:docPr id="1839647431" name="Imagem 32"/>
+            <wp:docPr id="1240838460" name="Imagem 32"/>
             <wp:cNvGraphicFramePr/>
             <a:graphic xmlns:a="http://schemas.openxmlformats.org/drawingml/2006/main">
               <a:graphicData uri="http://schemas.openxmlformats.org/drawingml/2006/picture">
                 <pic:pic xmlns:pic="http://schemas.openxmlformats.org/drawingml/2006/picture">
                   <pic:nvPicPr>
-                    <pic:cNvPr id="1839647431" name=""/>
+                    <pic:cNvPr id="1240838460" name=""/>
                     <pic:cNvPicPr/>
                   </pic:nvPicPr>
                   <pic:blipFill>
@@ -12506,7 +12761,7 @@
         <w:pStyle w:val="PargrafodaLista"/>
         <w:numPr>
           <w:ilvl w:val="0"/>
-          <w:numId w:val="16"/>
+          <w:numId w:val="17"/>
         </w:numPr>
         <w:spacing w:after="80" w:line="260" w:lineRule="auto"/>
         <w:ind w:left="700"/>
@@ -12557,16 +12812,16 @@
           <w:noProof/>
         </w:rPr>
         <w:drawing>
-          <wp:inline distT="0" distB="0" distL="0" distR="0" wp14:anchorId="216486A3" wp14:editId="67F09B66">
+          <wp:inline distT="0" distB="0" distL="0" distR="0" wp14:anchorId="7CFD3598" wp14:editId="15ECF61D">
             <wp:extent cx="5120640" cy="1391113"/>
             <wp:effectExtent l="19050" t="19050" r="22860" b="19050"/>
-            <wp:docPr id="1717107183" name="Imagem 33"/>
+            <wp:docPr id="1560750837" name="Imagem 33"/>
             <wp:cNvGraphicFramePr/>
             <a:graphic xmlns:a="http://schemas.openxmlformats.org/drawingml/2006/main">
               <a:graphicData uri="http://schemas.openxmlformats.org/drawingml/2006/picture">
                 <pic:pic xmlns:pic="http://schemas.openxmlformats.org/drawingml/2006/picture">
                   <pic:nvPicPr>
-                    <pic:cNvPr id="1717107183" name=""/>
+                    <pic:cNvPr id="1560750837" name=""/>
                     <pic:cNvPicPr/>
                   </pic:nvPicPr>
                   <pic:blipFill>
@@ -12628,7 +12883,7 @@
         <w:pStyle w:val="PargrafodaLista"/>
         <w:numPr>
           <w:ilvl w:val="0"/>
-          <w:numId w:val="16"/>
+          <w:numId w:val="17"/>
         </w:numPr>
         <w:spacing w:after="80" w:line="260" w:lineRule="auto"/>
         <w:ind w:left="700"/>
@@ -12678,16 +12933,16 @@
           <w:noProof/>
         </w:rPr>
         <w:drawing>
-          <wp:inline distT="0" distB="0" distL="0" distR="0" wp14:anchorId="2585F49B" wp14:editId="51B16EF2">
+          <wp:inline distT="0" distB="0" distL="0" distR="0" wp14:anchorId="4857AC3E" wp14:editId="5B3FEAF8">
             <wp:extent cx="5120640" cy="1125174"/>
             <wp:effectExtent l="19050" t="19050" r="22860" b="18415"/>
-            <wp:docPr id="1191144056" name="Imagem 34"/>
+            <wp:docPr id="2118743633" name="Imagem 34"/>
             <wp:cNvGraphicFramePr/>
             <a:graphic xmlns:a="http://schemas.openxmlformats.org/drawingml/2006/main">
               <a:graphicData uri="http://schemas.openxmlformats.org/drawingml/2006/picture">
                 <pic:pic xmlns:pic="http://schemas.openxmlformats.org/drawingml/2006/picture">
                   <pic:nvPicPr>
-                    <pic:cNvPr id="1191144056" name=""/>
+                    <pic:cNvPr id="2118743633" name=""/>
                     <pic:cNvPicPr/>
                   </pic:nvPicPr>
                   <pic:blipFill>
@@ -12777,7 +13032,7 @@
           <w:sz w:val="27"/>
         </w:rPr>
       </w:pPr>
-      <w:bookmarkStart w:id="27" w:name="_Toc236645691"/>
+      <w:bookmarkStart w:id="28" w:name="_Toc236755260"/>
       <w:r>
         <w:rPr>
           <w:rFonts w:ascii="Montserrat" w:hAnsi="Montserrat"/>
@@ -12787,7 +13042,7 @@
         </w:rPr>
         <w:t>4.2 Relatorio de Entregas e Beneficios (FORALF12)</w:t>
       </w:r>
-      <w:bookmarkEnd w:id="27"/>
+      <w:bookmarkEnd w:id="28"/>
     </w:p>
     <w:p>
       <w:pPr>
@@ -12817,16 +13072,16 @@
           <w:noProof/>
         </w:rPr>
         <w:drawing>
-          <wp:inline distT="0" distB="0" distL="0" distR="0" wp14:anchorId="7CCC8ACF" wp14:editId="5E211BEE">
+          <wp:inline distT="0" distB="0" distL="0" distR="0" wp14:anchorId="00F35FE1" wp14:editId="168AB9FE">
             <wp:extent cx="5120640" cy="4627581"/>
             <wp:effectExtent l="19050" t="19050" r="22860" b="20955"/>
-            <wp:docPr id="1530667169" name="Imagem 35"/>
+            <wp:docPr id="1488977639" name="Imagem 35"/>
             <wp:cNvGraphicFramePr/>
             <a:graphic xmlns:a="http://schemas.openxmlformats.org/drawingml/2006/main">
               <a:graphicData uri="http://schemas.openxmlformats.org/drawingml/2006/picture">
                 <pic:pic xmlns:pic="http://schemas.openxmlformats.org/drawingml/2006/picture">
                   <pic:nvPicPr>
-                    <pic:cNvPr id="1530667169" name=""/>
+                    <pic:cNvPr id="1488977639" name=""/>
                     <pic:cNvPicPr/>
                   </pic:nvPicPr>
                   <pic:blipFill>
@@ -12894,16 +13149,16 @@
         </w:rPr>
         <w:lastRenderedPageBreak/>
         <w:drawing>
-          <wp:inline distT="0" distB="0" distL="0" distR="0" wp14:anchorId="1675D2A7" wp14:editId="28CCD22D">
+          <wp:inline distT="0" distB="0" distL="0" distR="0" wp14:anchorId="49661BED" wp14:editId="15EB21EC">
             <wp:extent cx="5120640" cy="4627581"/>
             <wp:effectExtent l="19050" t="19050" r="22860" b="20955"/>
-            <wp:docPr id="1449534729" name="Imagem 36"/>
+            <wp:docPr id="2139399380" name="Imagem 36"/>
             <wp:cNvGraphicFramePr/>
             <a:graphic xmlns:a="http://schemas.openxmlformats.org/drawingml/2006/main">
               <a:graphicData uri="http://schemas.openxmlformats.org/drawingml/2006/picture">
                 <pic:pic xmlns:pic="http://schemas.openxmlformats.org/drawingml/2006/picture">
                   <pic:nvPicPr>
-                    <pic:cNvPr id="1449534729" name=""/>
+                    <pic:cNvPr id="2139399380" name=""/>
                     <pic:cNvPicPr/>
                   </pic:nvPicPr>
                   <pic:blipFill>
@@ -12965,7 +13220,7 @@
         <w:pStyle w:val="PargrafodaLista"/>
         <w:numPr>
           <w:ilvl w:val="0"/>
-          <w:numId w:val="16"/>
+          <w:numId w:val="17"/>
         </w:numPr>
         <w:spacing w:after="80" w:line="260" w:lineRule="auto"/>
         <w:ind w:left="700"/>
@@ -12989,7 +13244,7 @@
         <w:pStyle w:val="PargrafodaLista"/>
         <w:numPr>
           <w:ilvl w:val="0"/>
-          <w:numId w:val="16"/>
+          <w:numId w:val="17"/>
         </w:numPr>
         <w:spacing w:after="80" w:line="260" w:lineRule="auto"/>
         <w:ind w:left="700"/>
@@ -13040,16 +13295,16 @@
         </w:rPr>
         <w:lastRenderedPageBreak/>
         <w:drawing>
-          <wp:inline distT="0" distB="0" distL="0" distR="0" wp14:anchorId="12CDF5E7" wp14:editId="7AD6F3EC">
+          <wp:inline distT="0" distB="0" distL="0" distR="0" wp14:anchorId="15EDD9D4" wp14:editId="4B574F72">
             <wp:extent cx="5120640" cy="2144319"/>
             <wp:effectExtent l="19050" t="19050" r="22860" b="27940"/>
-            <wp:docPr id="1457341121" name="Imagem 37"/>
+            <wp:docPr id="515996753" name="Imagem 37"/>
             <wp:cNvGraphicFramePr/>
             <a:graphic xmlns:a="http://schemas.openxmlformats.org/drawingml/2006/main">
               <a:graphicData uri="http://schemas.openxmlformats.org/drawingml/2006/picture">
                 <pic:pic xmlns:pic="http://schemas.openxmlformats.org/drawingml/2006/picture">
                   <pic:nvPicPr>
-                    <pic:cNvPr id="1457341121" name=""/>
+                    <pic:cNvPr id="515996753" name=""/>
                     <pic:cNvPicPr/>
                   </pic:nvPicPr>
                   <pic:blipFill>
@@ -13137,16 +13392,16 @@
           <w:noProof/>
         </w:rPr>
         <w:drawing>
-          <wp:inline distT="0" distB="0" distL="0" distR="0" wp14:anchorId="339F37E5" wp14:editId="1B9727FD">
+          <wp:inline distT="0" distB="0" distL="0" distR="0" wp14:anchorId="31555FDB" wp14:editId="0C2BF800">
             <wp:extent cx="5120640" cy="1055647"/>
             <wp:effectExtent l="19050" t="19050" r="22860" b="11430"/>
-            <wp:docPr id="1101258449" name="Imagem 38"/>
+            <wp:docPr id="2072825888" name="Imagem 38"/>
             <wp:cNvGraphicFramePr/>
             <a:graphic xmlns:a="http://schemas.openxmlformats.org/drawingml/2006/main">
               <a:graphicData uri="http://schemas.openxmlformats.org/drawingml/2006/picture">
                 <pic:pic xmlns:pic="http://schemas.openxmlformats.org/drawingml/2006/picture">
                   <pic:nvPicPr>
-                    <pic:cNvPr id="1101258449" name=""/>
+                    <pic:cNvPr id="2072825888" name=""/>
                     <pic:cNvPicPr/>
                   </pic:nvPicPr>
                   <pic:blipFill>
@@ -13208,7 +13463,7 @@
         <w:pStyle w:val="PargrafodaLista"/>
         <w:numPr>
           <w:ilvl w:val="0"/>
-          <w:numId w:val="17"/>
+          <w:numId w:val="18"/>
         </w:numPr>
         <w:spacing w:after="80" w:line="260" w:lineRule="auto"/>
         <w:ind w:left="700"/>
@@ -13259,16 +13514,16 @@
         </w:rPr>
         <w:lastRenderedPageBreak/>
         <w:drawing>
-          <wp:inline distT="0" distB="0" distL="0" distR="0" wp14:anchorId="17F9D6F1" wp14:editId="2CF42390">
+          <wp:inline distT="0" distB="0" distL="0" distR="0" wp14:anchorId="2545D6E3" wp14:editId="27BFB715">
             <wp:extent cx="5120640" cy="3282818"/>
             <wp:effectExtent l="19050" t="19050" r="22860" b="13335"/>
-            <wp:docPr id="1701006363" name="Imagem 39"/>
+            <wp:docPr id="469200211" name="Imagem 39"/>
             <wp:cNvGraphicFramePr/>
             <a:graphic xmlns:a="http://schemas.openxmlformats.org/drawingml/2006/main">
               <a:graphicData uri="http://schemas.openxmlformats.org/drawingml/2006/picture">
                 <pic:pic xmlns:pic="http://schemas.openxmlformats.org/drawingml/2006/picture">
                   <pic:nvPicPr>
-                    <pic:cNvPr id="1701006363" name=""/>
+                    <pic:cNvPr id="469200211" name=""/>
                     <pic:cNvPicPr/>
                   </pic:nvPicPr>
                   <pic:blipFill>
@@ -13351,7 +13606,7 @@
         <w:pStyle w:val="PargrafodaLista"/>
         <w:numPr>
           <w:ilvl w:val="0"/>
-          <w:numId w:val="17"/>
+          <w:numId w:val="18"/>
         </w:numPr>
         <w:spacing w:after="80" w:line="260" w:lineRule="auto"/>
         <w:ind w:left="700"/>
@@ -13401,16 +13656,16 @@
           <w:noProof/>
         </w:rPr>
         <w:drawing>
-          <wp:inline distT="0" distB="0" distL="0" distR="0" wp14:anchorId="64A67755" wp14:editId="63DC08FA">
+          <wp:inline distT="0" distB="0" distL="0" distR="0" wp14:anchorId="609E941F" wp14:editId="312D25E9">
             <wp:extent cx="5120640" cy="1978034"/>
             <wp:effectExtent l="19050" t="19050" r="22860" b="22225"/>
-            <wp:docPr id="1996149483" name="Imagem 40"/>
+            <wp:docPr id="186003311" name="Imagem 40"/>
             <wp:cNvGraphicFramePr/>
             <a:graphic xmlns:a="http://schemas.openxmlformats.org/drawingml/2006/main">
               <a:graphicData uri="http://schemas.openxmlformats.org/drawingml/2006/picture">
                 <pic:pic xmlns:pic="http://schemas.openxmlformats.org/drawingml/2006/picture">
                   <pic:nvPicPr>
-                    <pic:cNvPr id="1996149483" name=""/>
+                    <pic:cNvPr id="186003311" name=""/>
                     <pic:cNvPicPr/>
                   </pic:nvPicPr>
                   <pic:blipFill>
@@ -13483,7 +13738,7 @@
           <w:sz w:val="34"/>
         </w:rPr>
       </w:pPr>
-      <w:bookmarkStart w:id="28" w:name="_Toc236645692"/>
+      <w:bookmarkStart w:id="29" w:name="_Toc236755261"/>
       <w:r>
         <w:rPr>
           <w:rFonts w:ascii="Montserrat" w:hAnsi="Montserrat"/>
@@ -13494,7 +13749,7 @@
         <w:lastRenderedPageBreak/>
         <w:t>5. Validador de Projetos</w:t>
       </w:r>
-      <w:bookmarkEnd w:id="28"/>
+      <w:bookmarkEnd w:id="29"/>
     </w:p>
     <w:p>
       <w:pPr>
@@ -13543,7 +13798,7 @@
           <w:sz w:val="27"/>
         </w:rPr>
       </w:pPr>
-      <w:bookmarkStart w:id="29" w:name="_Toc236645693"/>
+      <w:bookmarkStart w:id="30" w:name="_Toc236755262"/>
       <w:r>
         <w:rPr>
           <w:rFonts w:ascii="Montserrat" w:hAnsi="Montserrat"/>
@@ -13553,7 +13808,7 @@
         </w:rPr>
         <w:t>5.1 Quadro de conexoes</w:t>
       </w:r>
-      <w:bookmarkEnd w:id="29"/>
+      <w:bookmarkEnd w:id="30"/>
     </w:p>
     <w:p>
       <w:pPr>
@@ -13583,16 +13838,16 @@
           <w:noProof/>
         </w:rPr>
         <w:drawing>
-          <wp:inline distT="0" distB="0" distL="0" distR="0" wp14:anchorId="4FED56D0" wp14:editId="6C39240E">
+          <wp:inline distT="0" distB="0" distL="0" distR="0" wp14:anchorId="6973A162" wp14:editId="410F9D33">
             <wp:extent cx="5303520" cy="4792851"/>
             <wp:effectExtent l="19050" t="19050" r="11430" b="27305"/>
-            <wp:docPr id="1815110092" name="Imagem 41"/>
+            <wp:docPr id="400443034" name="Imagem 41"/>
             <wp:cNvGraphicFramePr/>
             <a:graphic xmlns:a="http://schemas.openxmlformats.org/drawingml/2006/main">
               <a:graphicData uri="http://schemas.openxmlformats.org/drawingml/2006/picture">
                 <pic:pic xmlns:pic="http://schemas.openxmlformats.org/drawingml/2006/picture">
                   <pic:nvPicPr>
-                    <pic:cNvPr id="1815110092" name=""/>
+                    <pic:cNvPr id="400443034" name=""/>
                     <pic:cNvPicPr/>
                   </pic:nvPicPr>
                   <pic:blipFill>
@@ -13661,7 +13916,7 @@
           <w:sz w:val="27"/>
         </w:rPr>
       </w:pPr>
-      <w:bookmarkStart w:id="30" w:name="_Toc236645694"/>
+      <w:bookmarkStart w:id="31" w:name="_Toc236755263"/>
       <w:r>
         <w:rPr>
           <w:rFonts w:ascii="Montserrat" w:hAnsi="Montserrat"/>
@@ -13671,7 +13926,7 @@
         </w:rPr>
         <w:t>5.2 Simulador - e se...?</w:t>
       </w:r>
-      <w:bookmarkEnd w:id="30"/>
+      <w:bookmarkEnd w:id="31"/>
     </w:p>
     <w:p>
       <w:pPr>
@@ -13701,16 +13956,16 @@
           <w:noProof/>
         </w:rPr>
         <w:drawing>
-          <wp:inline distT="0" distB="0" distL="0" distR="0" wp14:anchorId="69F074CD" wp14:editId="7A039C56">
+          <wp:inline distT="0" distB="0" distL="0" distR="0" wp14:anchorId="371392B1" wp14:editId="44A03FC1">
             <wp:extent cx="5303520" cy="4792851"/>
             <wp:effectExtent l="19050" t="19050" r="11430" b="27305"/>
-            <wp:docPr id="729094641" name="Imagem 42"/>
+            <wp:docPr id="1253729113" name="Imagem 42"/>
             <wp:cNvGraphicFramePr/>
             <a:graphic xmlns:a="http://schemas.openxmlformats.org/drawingml/2006/main">
               <a:graphicData uri="http://schemas.openxmlformats.org/drawingml/2006/picture">
                 <pic:pic xmlns:pic="http://schemas.openxmlformats.org/drawingml/2006/picture">
                   <pic:nvPicPr>
-                    <pic:cNvPr id="729094641" name=""/>
+                    <pic:cNvPr id="1253729113" name=""/>
                     <pic:cNvPicPr/>
                   </pic:nvPicPr>
                   <pic:blipFill>
@@ -13778,7 +14033,7 @@
           <w:sz w:val="27"/>
         </w:rPr>
       </w:pPr>
-      <w:bookmarkStart w:id="31" w:name="_Toc236645695"/>
+      <w:bookmarkStart w:id="32" w:name="_Toc236755264"/>
       <w:r>
         <w:rPr>
           <w:rFonts w:ascii="Montserrat" w:hAnsi="Montserrat"/>
@@ -13788,7 +14043,7 @@
         </w:rPr>
         <w:t>5.3 Assistente de decisao em 8 perguntas</w:t>
       </w:r>
-      <w:bookmarkEnd w:id="31"/>
+      <w:bookmarkEnd w:id="32"/>
     </w:p>
     <w:p>
       <w:pPr>
@@ -13819,16 +14074,16 @@
         </w:rPr>
         <w:lastRenderedPageBreak/>
         <w:drawing>
-          <wp:inline distT="0" distB="0" distL="0" distR="0" wp14:anchorId="509AF536" wp14:editId="5E791418">
+          <wp:inline distT="0" distB="0" distL="0" distR="0" wp14:anchorId="268E290B" wp14:editId="1A7D2562">
             <wp:extent cx="5303520" cy="4792851"/>
             <wp:effectExtent l="19050" t="19050" r="11430" b="27305"/>
-            <wp:docPr id="889566365" name="Imagem 43"/>
+            <wp:docPr id="1840192641" name="Imagem 43"/>
             <wp:cNvGraphicFramePr/>
             <a:graphic xmlns:a="http://schemas.openxmlformats.org/drawingml/2006/main">
               <a:graphicData uri="http://schemas.openxmlformats.org/drawingml/2006/picture">
                 <pic:pic xmlns:pic="http://schemas.openxmlformats.org/drawingml/2006/picture">
                   <pic:nvPicPr>
-                    <pic:cNvPr id="889566365" name=""/>
+                    <pic:cNvPr id="1840192641" name=""/>
                     <pic:cNvPicPr/>
                   </pic:nvPicPr>
                   <pic:blipFill>
@@ -13896,16 +14151,16 @@
         </w:rPr>
         <w:lastRenderedPageBreak/>
         <w:drawing>
-          <wp:inline distT="0" distB="0" distL="0" distR="0" wp14:anchorId="6E19B471" wp14:editId="0F004281">
+          <wp:inline distT="0" distB="0" distL="0" distR="0" wp14:anchorId="1B788FDE" wp14:editId="0C78C4E6">
             <wp:extent cx="5303520" cy="4792851"/>
             <wp:effectExtent l="19050" t="19050" r="11430" b="27305"/>
-            <wp:docPr id="752239484" name="Imagem 44"/>
+            <wp:docPr id="1652018062" name="Imagem 44"/>
             <wp:cNvGraphicFramePr/>
             <a:graphic xmlns:a="http://schemas.openxmlformats.org/drawingml/2006/main">
               <a:graphicData uri="http://schemas.openxmlformats.org/drawingml/2006/picture">
                 <pic:pic xmlns:pic="http://schemas.openxmlformats.org/drawingml/2006/picture">
                   <pic:nvPicPr>
-                    <pic:cNvPr id="752239484" name=""/>
+                    <pic:cNvPr id="1652018062" name=""/>
                     <pic:cNvPicPr/>
                   </pic:nvPicPr>
                   <pic:blipFill>
@@ -13998,7 +14253,7 @@
           <w:sz w:val="34"/>
         </w:rPr>
       </w:pPr>
-      <w:bookmarkStart w:id="32" w:name="_Toc236645696"/>
+      <w:bookmarkStart w:id="33" w:name="_Toc236755265"/>
       <w:r>
         <w:rPr>
           <w:rFonts w:ascii="Montserrat" w:hAnsi="Montserrat"/>
@@ -14009,7 +14264,7 @@
         <w:lastRenderedPageBreak/>
         <w:t>6. Administracao e Painel Executivo</w:t>
       </w:r>
-      <w:bookmarkEnd w:id="32"/>
+      <w:bookmarkEnd w:id="33"/>
     </w:p>
     <w:p>
       <w:pPr>
@@ -14040,7 +14295,7 @@
           <w:sz w:val="27"/>
         </w:rPr>
       </w:pPr>
-      <w:bookmarkStart w:id="33" w:name="_Toc236645697"/>
+      <w:bookmarkStart w:id="34" w:name="_Toc236755266"/>
       <w:r>
         <w:rPr>
           <w:rFonts w:ascii="Montserrat" w:hAnsi="Montserrat"/>
@@ -14050,7 +14305,7 @@
         </w:rPr>
         <w:t>6.1 Usuarios</w:t>
       </w:r>
-      <w:bookmarkEnd w:id="33"/>
+      <w:bookmarkEnd w:id="34"/>
     </w:p>
     <w:p>
       <w:pPr>
@@ -14080,16 +14335,16 @@
           <w:noProof/>
         </w:rPr>
         <w:drawing>
-          <wp:inline distT="0" distB="0" distL="0" distR="0" wp14:anchorId="25E163C8" wp14:editId="04CB85F6">
+          <wp:inline distT="0" distB="0" distL="0" distR="0" wp14:anchorId="431CDA23" wp14:editId="7EB4E7E9">
             <wp:extent cx="5303520" cy="4792851"/>
             <wp:effectExtent l="19050" t="19050" r="11430" b="27305"/>
-            <wp:docPr id="36855441" name="Imagem 45"/>
+            <wp:docPr id="1807283137" name="Imagem 45"/>
             <wp:cNvGraphicFramePr/>
             <a:graphic xmlns:a="http://schemas.openxmlformats.org/drawingml/2006/main">
               <a:graphicData uri="http://schemas.openxmlformats.org/drawingml/2006/picture">
                 <pic:pic xmlns:pic="http://schemas.openxmlformats.org/drawingml/2006/picture">
                   <pic:nvPicPr>
-                    <pic:cNvPr id="36855441" name=""/>
+                    <pic:cNvPr id="1807283137" name=""/>
                     <pic:cNvPicPr/>
                   </pic:nvPicPr>
                   <pic:blipFill>
@@ -14157,7 +14412,7 @@
           <w:sz w:val="27"/>
         </w:rPr>
       </w:pPr>
-      <w:bookmarkStart w:id="34" w:name="_Toc236645698"/>
+      <w:bookmarkStart w:id="35" w:name="_Toc236755267"/>
       <w:r>
         <w:rPr>
           <w:rFonts w:ascii="Montserrat" w:hAnsi="Montserrat"/>
@@ -14168,7 +14423,7 @@
         <w:lastRenderedPageBreak/>
         <w:t>6.2 Equipes</w:t>
       </w:r>
-      <w:bookmarkEnd w:id="34"/>
+      <w:bookmarkEnd w:id="35"/>
     </w:p>
     <w:p>
       <w:pPr>
@@ -14198,16 +14453,16 @@
           <w:noProof/>
         </w:rPr>
         <w:drawing>
-          <wp:inline distT="0" distB="0" distL="0" distR="0" wp14:anchorId="107530DF" wp14:editId="061A972E">
+          <wp:inline distT="0" distB="0" distL="0" distR="0" wp14:anchorId="49BBBD94" wp14:editId="27003ACC">
             <wp:extent cx="5303520" cy="4792851"/>
             <wp:effectExtent l="19050" t="19050" r="11430" b="27305"/>
-            <wp:docPr id="771957072" name="Imagem 46"/>
+            <wp:docPr id="870950388" name="Imagem 46"/>
             <wp:cNvGraphicFramePr/>
             <a:graphic xmlns:a="http://schemas.openxmlformats.org/drawingml/2006/main">
               <a:graphicData uri="http://schemas.openxmlformats.org/drawingml/2006/picture">
                 <pic:pic xmlns:pic="http://schemas.openxmlformats.org/drawingml/2006/picture">
                   <pic:nvPicPr>
-                    <pic:cNvPr id="771957072" name=""/>
+                    <pic:cNvPr id="870950388" name=""/>
                     <pic:cNvPicPr/>
                   </pic:nvPicPr>
                   <pic:blipFill>
@@ -14275,7 +14530,7 @@
           <w:sz w:val="27"/>
         </w:rPr>
       </w:pPr>
-      <w:bookmarkStart w:id="35" w:name="_Toc236645699"/>
+      <w:bookmarkStart w:id="36" w:name="_Toc236755268"/>
       <w:r>
         <w:rPr>
           <w:rFonts w:ascii="Montserrat" w:hAnsi="Montserrat"/>
@@ -14285,7 +14540,7 @@
         </w:rPr>
         <w:t>6.3 Configuracoes</w:t>
       </w:r>
-      <w:bookmarkEnd w:id="35"/>
+      <w:bookmarkEnd w:id="36"/>
     </w:p>
     <w:p>
       <w:pPr>
@@ -14316,16 +14571,16 @@
         </w:rPr>
         <w:lastRenderedPageBreak/>
         <w:drawing>
-          <wp:inline distT="0" distB="0" distL="0" distR="0" wp14:anchorId="2B63A9C7" wp14:editId="53A498B7">
+          <wp:inline distT="0" distB="0" distL="0" distR="0" wp14:anchorId="7F5BBD51" wp14:editId="22C46C11">
             <wp:extent cx="5303520" cy="4792851"/>
             <wp:effectExtent l="19050" t="19050" r="11430" b="27305"/>
-            <wp:docPr id="251727167" name="Imagem 47"/>
+            <wp:docPr id="1924843684" name="Imagem 47"/>
             <wp:cNvGraphicFramePr/>
             <a:graphic xmlns:a="http://schemas.openxmlformats.org/drawingml/2006/main">
               <a:graphicData uri="http://schemas.openxmlformats.org/drawingml/2006/picture">
                 <pic:pic xmlns:pic="http://schemas.openxmlformats.org/drawingml/2006/picture">
                   <pic:nvPicPr>
-                    <pic:cNvPr id="251727167" name=""/>
+                    <pic:cNvPr id="1924843684" name=""/>
                     <pic:cNvPicPr/>
                   </pic:nvPicPr>
                   <pic:blipFill>
@@ -14393,7 +14648,7 @@
           <w:sz w:val="27"/>
         </w:rPr>
       </w:pPr>
-      <w:bookmarkStart w:id="36" w:name="_Toc236645700"/>
+      <w:bookmarkStart w:id="37" w:name="_Toc236755269"/>
       <w:r>
         <w:rPr>
           <w:rFonts w:ascii="Montserrat" w:hAnsi="Montserrat"/>
@@ -14403,7 +14658,7 @@
         </w:rPr>
         <w:t>6.4 Painel Executivo</w:t>
       </w:r>
-      <w:bookmarkEnd w:id="36"/>
+      <w:bookmarkEnd w:id="37"/>
     </w:p>
     <w:p>
       <w:pPr>
@@ -14428,7 +14683,7 @@
         <w:pStyle w:val="PargrafodaLista"/>
         <w:numPr>
           <w:ilvl w:val="0"/>
-          <w:numId w:val="17"/>
+          <w:numId w:val="18"/>
         </w:numPr>
         <w:spacing w:after="80" w:line="260" w:lineRule="auto"/>
         <w:ind w:left="700"/>
@@ -14452,7 +14707,7 @@
         <w:pStyle w:val="PargrafodaLista"/>
         <w:numPr>
           <w:ilvl w:val="0"/>
-          <w:numId w:val="17"/>
+          <w:numId w:val="18"/>
         </w:numPr>
         <w:spacing w:after="80" w:line="260" w:lineRule="auto"/>
         <w:ind w:left="700"/>
@@ -14476,7 +14731,7 @@
         <w:pStyle w:val="PargrafodaLista"/>
         <w:numPr>
           <w:ilvl w:val="0"/>
-          <w:numId w:val="17"/>
+          <w:numId w:val="18"/>
         </w:numPr>
         <w:spacing w:after="80" w:line="260" w:lineRule="auto"/>
         <w:ind w:left="700"/>
@@ -14509,7 +14764,7 @@
         <w:pStyle w:val="PargrafodaLista"/>
         <w:numPr>
           <w:ilvl w:val="0"/>
-          <w:numId w:val="17"/>
+          <w:numId w:val="18"/>
         </w:numPr>
         <w:spacing w:after="80" w:line="260" w:lineRule="auto"/>
         <w:ind w:left="700"/>
@@ -14538,16 +14793,16 @@
           <w:noProof/>
         </w:rPr>
         <w:drawing>
-          <wp:inline distT="0" distB="0" distL="0" distR="0" wp14:anchorId="6868402A" wp14:editId="0B209DE0">
+          <wp:inline distT="0" distB="0" distL="0" distR="0" wp14:anchorId="2E4CF06B" wp14:editId="7F7E4FBF">
             <wp:extent cx="5303520" cy="4267180"/>
             <wp:effectExtent l="19050" t="19050" r="11430" b="19685"/>
-            <wp:docPr id="1243211353" name="Imagem 48"/>
+            <wp:docPr id="1062881747" name="Imagem 48"/>
             <wp:cNvGraphicFramePr/>
             <a:graphic xmlns:a="http://schemas.openxmlformats.org/drawingml/2006/main">
               <a:graphicData uri="http://schemas.openxmlformats.org/drawingml/2006/picture">
                 <pic:pic xmlns:pic="http://schemas.openxmlformats.org/drawingml/2006/picture">
                   <pic:nvPicPr>
-                    <pic:cNvPr id="1243211353" name=""/>
+                    <pic:cNvPr id="1062881747" name=""/>
                     <pic:cNvPicPr/>
                   </pic:nvPicPr>
                   <pic:blipFill>
@@ -14615,16 +14870,16 @@
         </w:rPr>
         <w:lastRenderedPageBreak/>
         <w:drawing>
-          <wp:inline distT="0" distB="0" distL="0" distR="0" wp14:anchorId="0A08B9D1" wp14:editId="422004D5">
+          <wp:inline distT="0" distB="0" distL="0" distR="0" wp14:anchorId="21562566" wp14:editId="6C1A5AB9">
             <wp:extent cx="5303520" cy="3962338"/>
             <wp:effectExtent l="19050" t="19050" r="11430" b="19685"/>
-            <wp:docPr id="918951862" name="Imagem 49"/>
+            <wp:docPr id="1569867397" name="Imagem 49"/>
             <wp:cNvGraphicFramePr/>
             <a:graphic xmlns:a="http://schemas.openxmlformats.org/drawingml/2006/main">
               <a:graphicData uri="http://schemas.openxmlformats.org/drawingml/2006/picture">
                 <pic:pic xmlns:pic="http://schemas.openxmlformats.org/drawingml/2006/picture">
                   <pic:nvPicPr>
-                    <pic:cNvPr id="918951862" name=""/>
+                    <pic:cNvPr id="1569867397" name=""/>
                     <pic:cNvPicPr/>
                   </pic:nvPicPr>
                   <pic:blipFill>
@@ -14717,7 +14972,7 @@
           <w:sz w:val="34"/>
         </w:rPr>
       </w:pPr>
-      <w:bookmarkStart w:id="37" w:name="_Toc236645701"/>
+      <w:bookmarkStart w:id="38" w:name="_Toc236755270"/>
       <w:r>
         <w:rPr>
           <w:rFonts w:ascii="Montserrat" w:hAnsi="Montserrat"/>
@@ -14728,7 +14983,7 @@
         <w:lastRenderedPageBreak/>
         <w:t>7. Perguntas frequentes</w:t>
       </w:r>
-      <w:bookmarkEnd w:id="37"/>
+      <w:bookmarkEnd w:id="38"/>
     </w:p>
     <w:p>
       <w:pPr>
@@ -14961,7 +15216,7 @@
           <w:sz w:val="34"/>
         </w:rPr>
       </w:pPr>
-      <w:bookmarkStart w:id="38" w:name="_Toc236645702"/>
+      <w:bookmarkStart w:id="39" w:name="_Toc236755271"/>
       <w:r>
         <w:rPr>
           <w:rFonts w:ascii="Montserrat" w:hAnsi="Montserrat"/>
@@ -14972,7 +15227,7 @@
         <w:lastRenderedPageBreak/>
         <w:t>8. Anexo - Tabela de artefatos</w:t>
       </w:r>
-      <w:bookmarkEnd w:id="38"/>
+      <w:bookmarkEnd w:id="39"/>
     </w:p>
     <w:tbl>
       <w:tblPr>
@@ -16671,7 +16926,7 @@
 <file path=word/numbering.xml><?xml version="1.0" encoding="utf-8"?>
 <w:numbering xmlns:wpc="http://schemas.microsoft.com/office/word/2010/wordprocessingCanvas" xmlns:cx="http://schemas.microsoft.com/office/drawing/2014/chartex" xmlns:cx1="http://schemas.microsoft.com/office/drawing/2015/9/8/chartex" xmlns:cx2="http://schemas.microsoft.com/office/drawing/2015/10/21/chartex" xmlns:cx3="http://schemas.microsoft.com/office/drawing/2016/5/9/chartex" xmlns:cx4="http://schemas.microsoft.com/office/drawing/2016/5/10/chartex" xmlns:cx5="http://schemas.microsoft.com/office/drawing/2016/5/11/chartex" xmlns:cx6="http://schemas.microsoft.com/office/drawing/2016/5/12/chartex" xmlns:cx7="http://schemas.microsoft.com/office/drawing/2016/5/13/chartex" xmlns:cx8="http://schemas.microsoft.com/office/drawing/2016/5/14/chartex" xmlns:mc="http://schemas.openxmlformats.org/markup-compatibility/2006" xmlns:aink="http://schemas.microsoft.com/office/drawing/2016/ink" xmlns:am3d="http://schemas.microsoft.com/office/drawing/2017/model3d" xmlns:o="urn:schemas-microsoft-com:office:office" xmlns:oel="http://schemas.microsoft.com/office/2019/extlst" xmlns:r="http://schemas.openxmlformats.org/officeDocument/2006/relationships" xmlns:m="http://schemas.openxmlformats.org/officeDocument/2006/math" xmlns:v="urn:schemas-microsoft-com:vml" xmlns:wp14="http://schemas.microsoft.com/office/word/2010/wordprocessingDrawing" xmlns:wp="http://schemas.openxmlformats.org/drawingml/2006/wordprocessingDrawing" xmlns:w10="urn:schemas-microsoft-com:office:word" xmlns:w="http://schemas.openxmlformats.org/wordprocessingml/2006/main" xmlns:w14="http://schemas.microsoft.com/office/word/2010/wordml" xmlns:w15="http://schemas.microsoft.com/office/word/2012/wordml" xmlns:w16cei="http://schemas.microsoft.com/office/word/2026/wordml/cei" xmlns:w16cex="http://schemas.microsoft.com/office/word/2018/wordml/cex" xmlns:w16cid="http://schemas.microsoft.com/office/word/2016/wordml/cid" xmlns:w16="http://schemas.microsoft.com/office/word/2018/wordml" xmlns:w16du="http://schemas.microsoft.com/office/word/2023/wordml/word16du" xmlns:w16sdtdh="http://schemas.microsoft.com/office/word/2020/wordml/sdtdatahash" xmlns:w16sdtfl="http://schemas.microsoft.com/office/word/2024/wordml/sdtformatlock" xmlns:w16se="http://schemas.microsoft.com/office/word/2015/wordml/symex" xmlns:wpg="http://schemas.microsoft.com/office/word/2010/wordprocessingGroup" xmlns:wpi="http://schemas.microsoft.com/office/word/2010/wordprocessingInk" xmlns:wne="http://schemas.microsoft.com/office/word/2006/wordml" xmlns:wps="http://schemas.microsoft.com/office/word/2010/wordprocessingShape" mc:Ignorable="w14 w15 w16se w16cid w16 w16cex w16sdtdh w16sdtfl w16du wp14">
   <w:abstractNum w:abstractNumId="0" w15:restartNumberingAfterBreak="0">
-    <w:nsid w:val="04450918"/>
+    <w:nsid w:val="066E4F8C"/>
     <w:multiLevelType w:val="singleLevel"/>
     <w:tmpl w:val="04160001"/>
     <w:lvl w:ilvl="0">
@@ -16688,7 +16943,7 @@
     </w:lvl>
   </w:abstractNum>
   <w:abstractNum w:abstractNumId="1" w15:restartNumberingAfterBreak="0">
-    <w:nsid w:val="07CB36C9"/>
+    <w:nsid w:val="084D2A2A"/>
     <w:multiLevelType w:val="singleLevel"/>
     <w:tmpl w:val="04160001"/>
     <w:lvl w:ilvl="0">
@@ -16705,7 +16960,7 @@
     </w:lvl>
   </w:abstractNum>
   <w:abstractNum w:abstractNumId="2" w15:restartNumberingAfterBreak="0">
-    <w:nsid w:val="0D9B2001"/>
+    <w:nsid w:val="116C1BBE"/>
     <w:multiLevelType w:val="singleLevel"/>
     <w:tmpl w:val="04160001"/>
     <w:lvl w:ilvl="0">
@@ -16722,7 +16977,7 @@
     </w:lvl>
   </w:abstractNum>
   <w:abstractNum w:abstractNumId="3" w15:restartNumberingAfterBreak="0">
-    <w:nsid w:val="223D285E"/>
+    <w:nsid w:val="20AF0018"/>
     <w:multiLevelType w:val="singleLevel"/>
     <w:tmpl w:val="04160001"/>
     <w:lvl w:ilvl="0">
@@ -16739,7 +16994,7 @@
     </w:lvl>
   </w:abstractNum>
   <w:abstractNum w:abstractNumId="4" w15:restartNumberingAfterBreak="0">
-    <w:nsid w:val="24371BC6"/>
+    <w:nsid w:val="30463CA3"/>
     <w:multiLevelType w:val="singleLevel"/>
     <w:tmpl w:val="04160001"/>
     <w:lvl w:ilvl="0">
@@ -16756,7 +17011,7 @@
     </w:lvl>
   </w:abstractNum>
   <w:abstractNum w:abstractNumId="5" w15:restartNumberingAfterBreak="0">
-    <w:nsid w:val="260C5CC2"/>
+    <w:nsid w:val="31FC483A"/>
     <w:multiLevelType w:val="singleLevel"/>
     <w:tmpl w:val="04160001"/>
     <w:lvl w:ilvl="0">
@@ -16773,7 +17028,7 @@
     </w:lvl>
   </w:abstractNum>
   <w:abstractNum w:abstractNumId="6" w15:restartNumberingAfterBreak="0">
-    <w:nsid w:val="2C35344A"/>
+    <w:nsid w:val="3D7F7DDC"/>
     <w:multiLevelType w:val="singleLevel"/>
     <w:tmpl w:val="04160001"/>
     <w:lvl w:ilvl="0">
@@ -16790,7 +17045,7 @@
     </w:lvl>
   </w:abstractNum>
   <w:abstractNum w:abstractNumId="7" w15:restartNumberingAfterBreak="0">
-    <w:nsid w:val="304B75FE"/>
+    <w:nsid w:val="48AC3725"/>
     <w:multiLevelType w:val="singleLevel"/>
     <w:tmpl w:val="04160001"/>
     <w:lvl w:ilvl="0">
@@ -16807,7 +17062,7 @@
     </w:lvl>
   </w:abstractNum>
   <w:abstractNum w:abstractNumId="8" w15:restartNumberingAfterBreak="0">
-    <w:nsid w:val="4D270BC7"/>
+    <w:nsid w:val="4ADA40CF"/>
     <w:multiLevelType w:val="singleLevel"/>
     <w:tmpl w:val="04160001"/>
     <w:lvl w:ilvl="0">
@@ -16824,7 +17079,7 @@
     </w:lvl>
   </w:abstractNum>
   <w:abstractNum w:abstractNumId="9" w15:restartNumberingAfterBreak="0">
-    <w:nsid w:val="5CAA2A33"/>
+    <w:nsid w:val="53D303FD"/>
     <w:multiLevelType w:val="singleLevel"/>
     <w:tmpl w:val="04160001"/>
     <w:lvl w:ilvl="0">
@@ -16841,7 +17096,7 @@
     </w:lvl>
   </w:abstractNum>
   <w:abstractNum w:abstractNumId="10" w15:restartNumberingAfterBreak="0">
-    <w:nsid w:val="664831C5"/>
+    <w:nsid w:val="5A5B1154"/>
     <w:multiLevelType w:val="singleLevel"/>
     <w:tmpl w:val="04160001"/>
     <w:lvl w:ilvl="0">
@@ -16858,7 +17113,7 @@
     </w:lvl>
   </w:abstractNum>
   <w:abstractNum w:abstractNumId="11" w15:restartNumberingAfterBreak="0">
-    <w:nsid w:val="6D5D5862"/>
+    <w:nsid w:val="5B2F5F16"/>
     <w:multiLevelType w:val="singleLevel"/>
     <w:tmpl w:val="04160001"/>
     <w:lvl w:ilvl="0">
@@ -16875,7 +17130,7 @@
     </w:lvl>
   </w:abstractNum>
   <w:abstractNum w:abstractNumId="12" w15:restartNumberingAfterBreak="0">
-    <w:nsid w:val="6E3B23BC"/>
+    <w:nsid w:val="5D735000"/>
     <w:multiLevelType w:val="singleLevel"/>
     <w:tmpl w:val="04160001"/>
     <w:lvl w:ilvl="0">
@@ -16892,7 +17147,7 @@
     </w:lvl>
   </w:abstractNum>
   <w:abstractNum w:abstractNumId="13" w15:restartNumberingAfterBreak="0">
-    <w:nsid w:val="73A14108"/>
+    <w:nsid w:val="5E995F89"/>
     <w:multiLevelType w:val="singleLevel"/>
     <w:tmpl w:val="04160001"/>
     <w:lvl w:ilvl="0">
@@ -16909,7 +17164,7 @@
     </w:lvl>
   </w:abstractNum>
   <w:abstractNum w:abstractNumId="14" w15:restartNumberingAfterBreak="0">
-    <w:nsid w:val="781E78AF"/>
+    <w:nsid w:val="6ABE4AF5"/>
     <w:multiLevelType w:val="singleLevel"/>
     <w:tmpl w:val="04160001"/>
     <w:lvl w:ilvl="0">
@@ -16926,7 +17181,7 @@
     </w:lvl>
   </w:abstractNum>
   <w:abstractNum w:abstractNumId="15" w15:restartNumberingAfterBreak="0">
-    <w:nsid w:val="78ED6F61"/>
+    <w:nsid w:val="70484B78"/>
     <w:multiLevelType w:val="singleLevel"/>
     <w:tmpl w:val="04160001"/>
     <w:lvl w:ilvl="0">
@@ -16943,7 +17198,7 @@
     </w:lvl>
   </w:abstractNum>
   <w:abstractNum w:abstractNumId="16" w15:restartNumberingAfterBreak="0">
-    <w:nsid w:val="7D127413"/>
+    <w:nsid w:val="766975B0"/>
     <w:multiLevelType w:val="singleLevel"/>
     <w:tmpl w:val="04160001"/>
     <w:lvl w:ilvl="0">
@@ -16959,56 +17214,76 @@
       </w:rPr>
     </w:lvl>
   </w:abstractNum>
-  <w:num w:numId="1" w16cid:durableId="675151897">
+  <w:abstractNum w:abstractNumId="17" w15:restartNumberingAfterBreak="0">
+    <w:nsid w:val="7BAC4804"/>
+    <w:multiLevelType w:val="singleLevel"/>
+    <w:tmpl w:val="04160001"/>
+    <w:lvl w:ilvl="0">
+      <w:start w:val="1"/>
+      <w:numFmt w:val="bullet"/>
+      <w:lvlText w:val=""/>
+      <w:lvlJc w:val="left"/>
+      <w:pPr>
+        <w:ind w:left="720" w:hanging="360"/>
+      </w:pPr>
+      <w:rPr>
+        <w:rFonts w:ascii="Symbol" w:hAnsi="Symbol" w:hint="default"/>
+      </w:rPr>
+    </w:lvl>
+  </w:abstractNum>
+  <w:num w:numId="1" w16cid:durableId="383067080">
+    <w:abstractNumId w:val="17"/>
+  </w:num>
+  <w:num w:numId="2" w16cid:durableId="92013621">
+    <w:abstractNumId w:val="2"/>
+  </w:num>
+  <w:num w:numId="3" w16cid:durableId="2115130411">
+    <w:abstractNumId w:val="7"/>
+  </w:num>
+  <w:num w:numId="4" w16cid:durableId="1091587299">
+    <w:abstractNumId w:val="16"/>
+  </w:num>
+  <w:num w:numId="5" w16cid:durableId="2079857726">
+    <w:abstractNumId w:val="6"/>
+  </w:num>
+  <w:num w:numId="6" w16cid:durableId="14889434">
+    <w:abstractNumId w:val="4"/>
+  </w:num>
+  <w:num w:numId="7" w16cid:durableId="545026972">
+    <w:abstractNumId w:val="15"/>
+  </w:num>
+  <w:num w:numId="8" w16cid:durableId="1630240298">
+    <w:abstractNumId w:val="10"/>
+  </w:num>
+  <w:num w:numId="9" w16cid:durableId="1786654360">
+    <w:abstractNumId w:val="8"/>
+  </w:num>
+  <w:num w:numId="10" w16cid:durableId="645823575">
+    <w:abstractNumId w:val="12"/>
+  </w:num>
+  <w:num w:numId="11" w16cid:durableId="1109740285">
+    <w:abstractNumId w:val="1"/>
+  </w:num>
+  <w:num w:numId="12" w16cid:durableId="1683436613">
+    <w:abstractNumId w:val="0"/>
+  </w:num>
+  <w:num w:numId="13" w16cid:durableId="429662540">
+    <w:abstractNumId w:val="3"/>
+  </w:num>
+  <w:num w:numId="14" w16cid:durableId="927541768">
+    <w:abstractNumId w:val="5"/>
+  </w:num>
+  <w:num w:numId="15" w16cid:durableId="1320385863">
+    <w:abstractNumId w:val="13"/>
+  </w:num>
+  <w:num w:numId="16" w16cid:durableId="1541553357">
     <w:abstractNumId w:val="9"/>
   </w:num>
-  <w:num w:numId="2" w16cid:durableId="600065041">
-    <w:abstractNumId w:val="1"/>
-  </w:num>
-  <w:num w:numId="3" w16cid:durableId="2116316717">
-    <w:abstractNumId w:val="15"/>
-  </w:num>
-  <w:num w:numId="4" w16cid:durableId="895703023">
-    <w:abstractNumId w:val="3"/>
-  </w:num>
-  <w:num w:numId="5" w16cid:durableId="245892408">
-    <w:abstractNumId w:val="10"/>
-  </w:num>
-  <w:num w:numId="6" w16cid:durableId="1138453601">
-    <w:abstractNumId w:val="4"/>
-  </w:num>
-  <w:num w:numId="7" w16cid:durableId="474415615">
-    <w:abstractNumId w:val="7"/>
-  </w:num>
-  <w:num w:numId="8" w16cid:durableId="1098795069">
-    <w:abstractNumId w:val="16"/>
-  </w:num>
-  <w:num w:numId="9" w16cid:durableId="1217472268">
-    <w:abstractNumId w:val="5"/>
-  </w:num>
-  <w:num w:numId="10" w16cid:durableId="1685546010">
-    <w:abstractNumId w:val="13"/>
-  </w:num>
-  <w:num w:numId="11" w16cid:durableId="898128834">
+  <w:num w:numId="17" w16cid:durableId="937563382">
     <w:abstractNumId w:val="11"/>
   </w:num>
-  <w:num w:numId="12" w16cid:durableId="190729160">
-    <w:abstractNumId w:val="2"/>
-  </w:num>
-  <w:num w:numId="13" w16cid:durableId="1696232574">
-    <w:abstractNumId w:val="8"/>
-  </w:num>
-  <w:num w:numId="14" w16cid:durableId="692803422">
+  <w:num w:numId="18" w16cid:durableId="1238780628">
     <w:abstractNumId w:val="14"/>
-  </w:num>
-  <w:num w:numId="15" w16cid:durableId="1025595829">
-    <w:abstractNumId w:val="6"/>
-  </w:num>
-  <w:num w:numId="16" w16cid:durableId="727264771">
-    <w:abstractNumId w:val="12"/>
-  </w:num>
-  <w:num w:numId="17" w16cid:durableId="1470245403">
-    <w:abstractNumId w:val="0"/>
   </w:num>
 </w:numbering>
 </file>
@@ -17421,7 +17696,7 @@
     <w:link w:val="Ttulo1Char"/>
     <w:uiPriority w:val="9"/>
     <w:qFormat/>
-    <w:rsid w:val="00F50859"/>
+    <w:rsid w:val="009906F7"/>
     <w:pPr>
       <w:keepNext/>
       <w:keepLines/>
@@ -17443,7 +17718,7 @@
     <w:uiPriority w:val="9"/>
     <w:unhideWhenUsed/>
     <w:qFormat/>
-    <w:rsid w:val="00F50859"/>
+    <w:rsid w:val="009906F7"/>
     <w:pPr>
       <w:keepNext/>
       <w:keepLines/>
@@ -17466,7 +17741,7 @@
     <w:semiHidden/>
     <w:unhideWhenUsed/>
     <w:qFormat/>
-    <w:rsid w:val="00F50859"/>
+    <w:rsid w:val="009906F7"/>
     <w:pPr>
       <w:keepNext/>
       <w:keepLines/>
@@ -17489,7 +17764,7 @@
     <w:semiHidden/>
     <w:unhideWhenUsed/>
     <w:qFormat/>
-    <w:rsid w:val="00F50859"/>
+    <w:rsid w:val="009906F7"/>
     <w:pPr>
       <w:keepNext/>
       <w:keepLines/>
@@ -17512,7 +17787,7 @@
     <w:semiHidden/>
     <w:unhideWhenUsed/>
     <w:qFormat/>
-    <w:rsid w:val="00F50859"/>
+    <w:rsid w:val="009906F7"/>
     <w:pPr>
       <w:keepNext/>
       <w:keepLines/>
@@ -17533,7 +17808,7 @@
     <w:semiHidden/>
     <w:unhideWhenUsed/>
     <w:qFormat/>
-    <w:rsid w:val="00F50859"/>
+    <w:rsid w:val="009906F7"/>
     <w:pPr>
       <w:keepNext/>
       <w:keepLines/>
@@ -17556,7 +17831,7 @@
     <w:semiHidden/>
     <w:unhideWhenUsed/>
     <w:qFormat/>
-    <w:rsid w:val="00F50859"/>
+    <w:rsid w:val="009906F7"/>
     <w:pPr>
       <w:keepNext/>
       <w:keepLines/>
@@ -17577,7 +17852,7 @@
     <w:semiHidden/>
     <w:unhideWhenUsed/>
     <w:qFormat/>
-    <w:rsid w:val="00F50859"/>
+    <w:rsid w:val="009906F7"/>
     <w:pPr>
       <w:keepNext/>
       <w:keepLines/>
@@ -17600,7 +17875,7 @@
     <w:semiHidden/>
     <w:unhideWhenUsed/>
     <w:qFormat/>
-    <w:rsid w:val="00F50859"/>
+    <w:rsid w:val="009906F7"/>
     <w:pPr>
       <w:keepNext/>
       <w:keepLines/>
@@ -17644,7 +17919,7 @@
     <w:basedOn w:val="Fontepargpadro"/>
     <w:link w:val="Ttulo1"/>
     <w:uiPriority w:val="9"/>
-    <w:rsid w:val="00F50859"/>
+    <w:rsid w:val="009906F7"/>
     <w:rPr>
       <w:rFonts w:asciiTheme="majorHAnsi" w:eastAsiaTheme="majorEastAsia" w:hAnsiTheme="majorHAnsi" w:cstheme="majorBidi"/>
       <w:color w:val="0F4761" w:themeColor="accent1" w:themeShade="BF"/>
@@ -17657,7 +17932,7 @@
     <w:basedOn w:val="Fontepargpadro"/>
     <w:link w:val="Ttulo2"/>
     <w:uiPriority w:val="9"/>
-    <w:rsid w:val="00F50859"/>
+    <w:rsid w:val="009906F7"/>
     <w:rPr>
       <w:rFonts w:asciiTheme="majorHAnsi" w:eastAsiaTheme="majorEastAsia" w:hAnsiTheme="majorHAnsi" w:cstheme="majorBidi"/>
       <w:color w:val="0F4761" w:themeColor="accent1" w:themeShade="BF"/>
@@ -17671,7 +17946,7 @@
     <w:link w:val="Ttulo3"/>
     <w:uiPriority w:val="9"/>
     <w:semiHidden/>
-    <w:rsid w:val="00F50859"/>
+    <w:rsid w:val="009906F7"/>
     <w:rPr>
       <w:rFonts w:eastAsiaTheme="majorEastAsia" w:cstheme="majorBidi"/>
       <w:color w:val="0F4761" w:themeColor="accent1" w:themeShade="BF"/>
@@ -17685,7 +17960,7 @@
     <w:link w:val="Ttulo4"/>
     <w:uiPriority w:val="9"/>
     <w:semiHidden/>
-    <w:rsid w:val="00F50859"/>
+    <w:rsid w:val="009906F7"/>
     <w:rPr>
       <w:rFonts w:eastAsiaTheme="majorEastAsia" w:cstheme="majorBidi"/>
       <w:i/>
@@ -17699,7 +17974,7 @@
     <w:link w:val="Ttulo5"/>
     <w:uiPriority w:val="9"/>
     <w:semiHidden/>
-    <w:rsid w:val="00F50859"/>
+    <w:rsid w:val="009906F7"/>
     <w:rPr>
       <w:rFonts w:eastAsiaTheme="majorEastAsia" w:cstheme="majorBidi"/>
       <w:color w:val="0F4761" w:themeColor="accent1" w:themeShade="BF"/>
@@ -17711,7 +17986,7 @@
     <w:link w:val="Ttulo6"/>
     <w:uiPriority w:val="9"/>
     <w:semiHidden/>
-    <w:rsid w:val="00F50859"/>
+    <w:rsid w:val="009906F7"/>
     <w:rPr>
       <w:rFonts w:eastAsiaTheme="majorEastAsia" w:cstheme="majorBidi"/>
       <w:i/>
@@ -17725,7 +18000,7 @@
     <w:link w:val="Ttulo7"/>
     <w:uiPriority w:val="9"/>
     <w:semiHidden/>
-    <w:rsid w:val="00F50859"/>
+    <w:rsid w:val="009906F7"/>
     <w:rPr>
       <w:rFonts w:eastAsiaTheme="majorEastAsia" w:cstheme="majorBidi"/>
       <w:color w:val="595959" w:themeColor="text1" w:themeTint="A6"/>
@@ -17737,7 +18012,7 @@
     <w:link w:val="Ttulo8"/>
     <w:uiPriority w:val="9"/>
     <w:semiHidden/>
-    <w:rsid w:val="00F50859"/>
+    <w:rsid w:val="009906F7"/>
     <w:rPr>
       <w:rFonts w:eastAsiaTheme="majorEastAsia" w:cstheme="majorBidi"/>
       <w:i/>
@@ -17751,7 +18026,7 @@
     <w:link w:val="Ttulo9"/>
     <w:uiPriority w:val="9"/>
     <w:semiHidden/>
-    <w:rsid w:val="00F50859"/>
+    <w:rsid w:val="009906F7"/>
     <w:rPr>
       <w:rFonts w:eastAsiaTheme="majorEastAsia" w:cstheme="majorBidi"/>
       <w:color w:val="272727" w:themeColor="text1" w:themeTint="D8"/>
@@ -17764,7 +18039,7 @@
     <w:link w:val="TtuloChar"/>
     <w:uiPriority w:val="10"/>
     <w:qFormat/>
-    <w:rsid w:val="00F50859"/>
+    <w:rsid w:val="009906F7"/>
     <w:pPr>
       <w:spacing w:after="80" w:line="240" w:lineRule="auto"/>
       <w:contextualSpacing/>
@@ -17782,7 +18057,7 @@
     <w:basedOn w:val="Fontepargpadro"/>
     <w:link w:val="Ttulo"/>
     <w:uiPriority w:val="10"/>
-    <w:rsid w:val="00F50859"/>
+    <w:rsid w:val="009906F7"/>
     <w:rPr>
       <w:rFonts w:asciiTheme="majorHAnsi" w:eastAsiaTheme="majorEastAsia" w:hAnsiTheme="majorHAnsi" w:cstheme="majorBidi"/>
       <w:spacing w:val="-10"/>
@@ -17798,7 +18073,7 @@
     <w:link w:val="SubttuloChar"/>
     <w:uiPriority w:val="11"/>
     <w:qFormat/>
-    <w:rsid w:val="00F50859"/>
+    <w:rsid w:val="009906F7"/>
     <w:pPr>
       <w:numPr>
         <w:ilvl w:val="1"/>
@@ -17817,7 +18092,7 @@
     <w:basedOn w:val="Fontepargpadro"/>
     <w:link w:val="Subttulo"/>
     <w:uiPriority w:val="11"/>
-    <w:rsid w:val="00F50859"/>
+    <w:rsid w:val="009906F7"/>
     <w:rPr>
       <w:rFonts w:eastAsiaTheme="majorEastAsia" w:cstheme="majorBidi"/>
       <w:color w:val="595959" w:themeColor="text1" w:themeTint="A6"/>
@@ -17833,7 +18108,7 @@
     <w:link w:val="CitaoChar"/>
     <w:uiPriority w:val="29"/>
     <w:qFormat/>
-    <w:rsid w:val="00F50859"/>
+    <w:rsid w:val="009906F7"/>
     <w:pPr>
       <w:spacing w:before="160"/>
       <w:jc w:val="center"/>
@@ -17849,7 +18124,7 @@
     <w:basedOn w:val="Fontepargpadro"/>
     <w:link w:val="Citao"/>
     <w:uiPriority w:val="29"/>
-    <w:rsid w:val="00F50859"/>
+    <w:rsid w:val="009906F7"/>
     <w:rPr>
       <w:i/>
       <w:iCs/>
@@ -17861,7 +18136,7 @@
     <w:basedOn w:val="Normal"/>
     <w:uiPriority w:val="34"/>
     <w:qFormat/>
-    <w:rsid w:val="00F50859"/>
+    <w:rsid w:val="009906F7"/>
     <w:pPr>
       <w:ind w:left="720"/>
       <w:contextualSpacing/>
@@ -17872,7 +18147,7 @@
     <w:basedOn w:val="Fontepargpadro"/>
     <w:uiPriority w:val="21"/>
     <w:qFormat/>
-    <w:rsid w:val="00F50859"/>
+    <w:rsid w:val="009906F7"/>
     <w:rPr>
       <w:i/>
       <w:iCs/>
@@ -17886,7 +18161,7 @@
     <w:link w:val="CitaoIntensaChar"/>
     <w:uiPriority w:val="30"/>
     <w:qFormat/>
-    <w:rsid w:val="00F50859"/>
+    <w:rsid w:val="009906F7"/>
     <w:pPr>
       <w:pBdr>
         <w:top w:val="single" w:sz="4" w:space="10" w:color="0F4761" w:themeColor="accent1" w:themeShade="BF"/>
@@ -17907,7 +18182,7 @@
     <w:basedOn w:val="Fontepargpadro"/>
     <w:link w:val="CitaoIntensa"/>
     <w:uiPriority w:val="30"/>
-    <w:rsid w:val="00F50859"/>
+    <w:rsid w:val="009906F7"/>
     <w:rPr>
       <w:i/>
       <w:iCs/>
@@ -17919,7 +18194,7 @@
     <w:basedOn w:val="Fontepargpadro"/>
     <w:uiPriority w:val="32"/>
     <w:qFormat/>
-    <w:rsid w:val="00F50859"/>
+    <w:rsid w:val="009906F7"/>
     <w:rPr>
       <w:b/>
       <w:bCs/>
@@ -17934,7 +18209,7 @@
     <w:link w:val="CabealhoChar"/>
     <w:uiPriority w:val="99"/>
     <w:unhideWhenUsed/>
-    <w:rsid w:val="00F50859"/>
+    <w:rsid w:val="009906F7"/>
     <w:pPr>
       <w:tabs>
         <w:tab w:val="center" w:pos="4252"/>
@@ -17948,7 +18223,7 @@
     <w:basedOn w:val="Fontepargpadro"/>
     <w:link w:val="Cabealho"/>
     <w:uiPriority w:val="99"/>
-    <w:rsid w:val="00F50859"/>
+    <w:rsid w:val="009906F7"/>
   </w:style>
   <w:style w:type="paragraph" w:styleId="Rodap">
     <w:name w:val="footer"/>
@@ -17956,7 +18231,7 @@
     <w:link w:val="RodapChar"/>
     <w:uiPriority w:val="99"/>
     <w:unhideWhenUsed/>
-    <w:rsid w:val="00F50859"/>
+    <w:rsid w:val="009906F7"/>
     <w:pPr>
       <w:tabs>
         <w:tab w:val="center" w:pos="4252"/>
@@ -17970,7 +18245,7 @@
     <w:basedOn w:val="Fontepargpadro"/>
     <w:link w:val="Rodap"/>
     <w:uiPriority w:val="99"/>
-    <w:rsid w:val="00F50859"/>
+    <w:rsid w:val="009906F7"/>
   </w:style>
   <w:style w:type="paragraph" w:styleId="Sumrio1">
     <w:name w:val="toc 1"/>
@@ -17979,7 +18254,7 @@
     <w:autoRedefine/>
     <w:uiPriority w:val="39"/>
     <w:unhideWhenUsed/>
-    <w:rsid w:val="00F50859"/>
+    <w:rsid w:val="009906F7"/>
     <w:pPr>
       <w:spacing w:after="100"/>
     </w:pPr>
@@ -17991,7 +18266,7 @@
     <w:autoRedefine/>
     <w:uiPriority w:val="39"/>
     <w:unhideWhenUsed/>
-    <w:rsid w:val="00F50859"/>
+    <w:rsid w:val="009906F7"/>
     <w:pPr>
       <w:spacing w:after="100"/>
       <w:ind w:left="240"/>

</xml_diff>

<commit_message>
Adiciona aviso imediato aos Admins ao registrar nova demanda
Até agora, o e-mail/push de notificação só disparava quando o Admin
mudava o status da Solicitação de Demanda (aprovando/reprovando o Gate 1)
— ou seja, avisava depois da decisão, nunca antes dela. Nenhum aviso
existia para sinalizar que uma nova demanda precisava de triagem, o Admin
só descobria checando a lista manualmente ou o Painel Executivo.

Agora, ao salvar uma nova Solicitação de Demanda, todos os Admins recebem
um aviso (e-mail e push) de que há um Gate 1 pendente de análise. Reaproveita
a mesma Edge Function/shim já existentes, sem alterar os outros 6 gatilhos.
Manual de Uso atualizado para v2.12.

Co-Authored-By: Claude Sonnet 5 <noreply@anthropic.com>
</commit_message>
<xml_diff>
--- a/Manual de Uso - Ferramenta de Gestao de Projetos.docx
+++ b/Manual de Uso - Ferramenta de Gestao de Projetos.docx
@@ -129,7 +129,7 @@
           <w:color w:val="6A6A70"/>
           <w:sz w:val="22"/>
         </w:rPr>
-        <w:t>Versao 2.11 - 04 de agosto de 2026 (substitui a versao 2.10 de 03/08/2026)</w:t>
+        <w:t>Versao 2.12 - 06 de agosto de 2026 (substitui a versao 2.11 de 04/08/2026)</w:t>
       </w:r>
     </w:p>
     <w:p>
@@ -229,7 +229,7 @@
         <w:rPr>
           <w:noProof/>
         </w:rPr>
-        <w:instrText xml:space="preserve"> PAGEREF _Toc236755232 \h </w:instrText>
+        <w:instrText xml:space="preserve"> PAGEREF _Toc236922997 \h </w:instrText>
       </w:r>
       <w:r>
         <w:rPr>
@@ -290,7 +290,7 @@
         <w:rPr>
           <w:noProof/>
         </w:rPr>
-        <w:instrText xml:space="preserve"> PAGEREF _Toc236755233 \h </w:instrText>
+        <w:instrText xml:space="preserve"> PAGEREF _Toc236922998 \h </w:instrText>
       </w:r>
       <w:r>
         <w:rPr>
@@ -351,7 +351,7 @@
         <w:rPr>
           <w:noProof/>
         </w:rPr>
-        <w:instrText xml:space="preserve"> PAGEREF _Toc236755234 \h </w:instrText>
+        <w:instrText xml:space="preserve"> PAGEREF _Toc236922999 \h </w:instrText>
       </w:r>
       <w:r>
         <w:rPr>
@@ -412,7 +412,7 @@
         <w:rPr>
           <w:noProof/>
         </w:rPr>
-        <w:instrText xml:space="preserve"> PAGEREF _Toc236755235 \h </w:instrText>
+        <w:instrText xml:space="preserve"> PAGEREF _Toc236923000 \h </w:instrText>
       </w:r>
       <w:r>
         <w:rPr>
@@ -473,7 +473,7 @@
         <w:rPr>
           <w:noProof/>
         </w:rPr>
-        <w:instrText xml:space="preserve"> PAGEREF _Toc236755236 \h </w:instrText>
+        <w:instrText xml:space="preserve"> PAGEREF _Toc236923001 \h </w:instrText>
       </w:r>
       <w:r>
         <w:rPr>
@@ -534,7 +534,7 @@
         <w:rPr>
           <w:noProof/>
         </w:rPr>
-        <w:instrText xml:space="preserve"> PAGEREF _Toc236755237 \h </w:instrText>
+        <w:instrText xml:space="preserve"> PAGEREF _Toc236923002 \h </w:instrText>
       </w:r>
       <w:r>
         <w:rPr>
@@ -595,7 +595,7 @@
         <w:rPr>
           <w:noProof/>
         </w:rPr>
-        <w:instrText xml:space="preserve"> PAGEREF _Toc236755238 \h </w:instrText>
+        <w:instrText xml:space="preserve"> PAGEREF _Toc236923003 \h </w:instrText>
       </w:r>
       <w:r>
         <w:rPr>
@@ -656,7 +656,7 @@
         <w:rPr>
           <w:noProof/>
         </w:rPr>
-        <w:instrText xml:space="preserve"> PAGEREF _Toc236755239 \h </w:instrText>
+        <w:instrText xml:space="preserve"> PAGEREF _Toc236923004 \h </w:instrText>
       </w:r>
       <w:r>
         <w:rPr>
@@ -717,7 +717,7 @@
         <w:rPr>
           <w:noProof/>
         </w:rPr>
-        <w:instrText xml:space="preserve"> PAGEREF _Toc236755240 \h </w:instrText>
+        <w:instrText xml:space="preserve"> PAGEREF _Toc236923005 \h </w:instrText>
       </w:r>
       <w:r>
         <w:rPr>
@@ -778,7 +778,7 @@
         <w:rPr>
           <w:noProof/>
         </w:rPr>
-        <w:instrText xml:space="preserve"> PAGEREF _Toc236755241 \h </w:instrText>
+        <w:instrText xml:space="preserve"> PAGEREF _Toc236923006 \h </w:instrText>
       </w:r>
       <w:r>
         <w:rPr>
@@ -839,7 +839,7 @@
         <w:rPr>
           <w:noProof/>
         </w:rPr>
-        <w:instrText xml:space="preserve"> PAGEREF _Toc236755242 \h </w:instrText>
+        <w:instrText xml:space="preserve"> PAGEREF _Toc236923007 \h </w:instrText>
       </w:r>
       <w:r>
         <w:rPr>
@@ -900,7 +900,7 @@
         <w:rPr>
           <w:noProof/>
         </w:rPr>
-        <w:instrText xml:space="preserve"> PAGEREF _Toc236755243 \h </w:instrText>
+        <w:instrText xml:space="preserve"> PAGEREF _Toc236923008 \h </w:instrText>
       </w:r>
       <w:r>
         <w:rPr>
@@ -961,7 +961,7 @@
         <w:rPr>
           <w:noProof/>
         </w:rPr>
-        <w:instrText xml:space="preserve"> PAGEREF _Toc236755244 \h </w:instrText>
+        <w:instrText xml:space="preserve"> PAGEREF _Toc236923009 \h </w:instrText>
       </w:r>
       <w:r>
         <w:rPr>
@@ -1022,7 +1022,7 @@
         <w:rPr>
           <w:noProof/>
         </w:rPr>
-        <w:instrText xml:space="preserve"> PAGEREF _Toc236755245 \h </w:instrText>
+        <w:instrText xml:space="preserve"> PAGEREF _Toc236923010 \h </w:instrText>
       </w:r>
       <w:r>
         <w:rPr>
@@ -1083,7 +1083,7 @@
         <w:rPr>
           <w:noProof/>
         </w:rPr>
-        <w:instrText xml:space="preserve"> PAGEREF _Toc236755246 \h </w:instrText>
+        <w:instrText xml:space="preserve"> PAGEREF _Toc236923011 \h </w:instrText>
       </w:r>
       <w:r>
         <w:rPr>
@@ -1144,7 +1144,7 @@
         <w:rPr>
           <w:noProof/>
         </w:rPr>
-        <w:instrText xml:space="preserve"> PAGEREF _Toc236755247 \h </w:instrText>
+        <w:instrText xml:space="preserve"> PAGEREF _Toc236923012 \h </w:instrText>
       </w:r>
       <w:r>
         <w:rPr>
@@ -1205,7 +1205,7 @@
         <w:rPr>
           <w:noProof/>
         </w:rPr>
-        <w:instrText xml:space="preserve"> PAGEREF _Toc236755248 \h </w:instrText>
+        <w:instrText xml:space="preserve"> PAGEREF _Toc236923013 \h </w:instrText>
       </w:r>
       <w:r>
         <w:rPr>
@@ -1266,7 +1266,7 @@
         <w:rPr>
           <w:noProof/>
         </w:rPr>
-        <w:instrText xml:space="preserve"> PAGEREF _Toc236755249 \h </w:instrText>
+        <w:instrText xml:space="preserve"> PAGEREF _Toc236923014 \h </w:instrText>
       </w:r>
       <w:r>
         <w:rPr>
@@ -1327,7 +1327,7 @@
         <w:rPr>
           <w:noProof/>
         </w:rPr>
-        <w:instrText xml:space="preserve"> PAGEREF _Toc236755250 \h </w:instrText>
+        <w:instrText xml:space="preserve"> PAGEREF _Toc236923015 \h </w:instrText>
       </w:r>
       <w:r>
         <w:rPr>
@@ -1388,7 +1388,7 @@
         <w:rPr>
           <w:noProof/>
         </w:rPr>
-        <w:instrText xml:space="preserve"> PAGEREF _Toc236755251 \h </w:instrText>
+        <w:instrText xml:space="preserve"> PAGEREF _Toc236923016 \h </w:instrText>
       </w:r>
       <w:r>
         <w:rPr>
@@ -1449,7 +1449,7 @@
         <w:rPr>
           <w:noProof/>
         </w:rPr>
-        <w:instrText xml:space="preserve"> PAGEREF _Toc236755252 \h </w:instrText>
+        <w:instrText xml:space="preserve"> PAGEREF _Toc236923017 \h </w:instrText>
       </w:r>
       <w:r>
         <w:rPr>
@@ -1510,7 +1510,7 @@
         <w:rPr>
           <w:noProof/>
         </w:rPr>
-        <w:instrText xml:space="preserve"> PAGEREF _Toc236755253 \h </w:instrText>
+        <w:instrText xml:space="preserve"> PAGEREF _Toc236923018 \h </w:instrText>
       </w:r>
       <w:r>
         <w:rPr>
@@ -1571,7 +1571,7 @@
         <w:rPr>
           <w:noProof/>
         </w:rPr>
-        <w:instrText xml:space="preserve"> PAGEREF _Toc236755254 \h </w:instrText>
+        <w:instrText xml:space="preserve"> PAGEREF _Toc236923019 \h </w:instrText>
       </w:r>
       <w:r>
         <w:rPr>
@@ -1632,7 +1632,7 @@
         <w:rPr>
           <w:noProof/>
         </w:rPr>
-        <w:instrText xml:space="preserve"> PAGEREF _Toc236755255 \h </w:instrText>
+        <w:instrText xml:space="preserve"> PAGEREF _Toc236923020 \h </w:instrText>
       </w:r>
       <w:r>
         <w:rPr>
@@ -1693,7 +1693,7 @@
         <w:rPr>
           <w:noProof/>
         </w:rPr>
-        <w:instrText xml:space="preserve"> PAGEREF _Toc236755256 \h </w:instrText>
+        <w:instrText xml:space="preserve"> PAGEREF _Toc236923021 \h </w:instrText>
       </w:r>
       <w:r>
         <w:rPr>
@@ -1754,7 +1754,7 @@
         <w:rPr>
           <w:noProof/>
         </w:rPr>
-        <w:instrText xml:space="preserve"> PAGEREF _Toc236755257 \h </w:instrText>
+        <w:instrText xml:space="preserve"> PAGEREF _Toc236923022 \h </w:instrText>
       </w:r>
       <w:r>
         <w:rPr>
@@ -1816,7 +1816,7 @@
         <w:rPr>
           <w:noProof/>
         </w:rPr>
-        <w:instrText xml:space="preserve"> PAGEREF _Toc236755258 \h </w:instrText>
+        <w:instrText xml:space="preserve"> PAGEREF _Toc236923023 \h </w:instrText>
       </w:r>
       <w:r>
         <w:rPr>
@@ -1877,7 +1877,7 @@
         <w:rPr>
           <w:noProof/>
         </w:rPr>
-        <w:instrText xml:space="preserve"> PAGEREF _Toc236755259 \h </w:instrText>
+        <w:instrText xml:space="preserve"> PAGEREF _Toc236923024 \h </w:instrText>
       </w:r>
       <w:r>
         <w:rPr>
@@ -1938,7 +1938,7 @@
         <w:rPr>
           <w:noProof/>
         </w:rPr>
-        <w:instrText xml:space="preserve"> PAGEREF _Toc236755260 \h </w:instrText>
+        <w:instrText xml:space="preserve"> PAGEREF _Toc236923025 \h </w:instrText>
       </w:r>
       <w:r>
         <w:rPr>
@@ -1999,7 +1999,7 @@
         <w:rPr>
           <w:noProof/>
         </w:rPr>
-        <w:instrText xml:space="preserve"> PAGEREF _Toc236755261 \h </w:instrText>
+        <w:instrText xml:space="preserve"> PAGEREF _Toc236923026 \h </w:instrText>
       </w:r>
       <w:r>
         <w:rPr>
@@ -2060,7 +2060,7 @@
         <w:rPr>
           <w:noProof/>
         </w:rPr>
-        <w:instrText xml:space="preserve"> PAGEREF _Toc236755262 \h </w:instrText>
+        <w:instrText xml:space="preserve"> PAGEREF _Toc236923027 \h </w:instrText>
       </w:r>
       <w:r>
         <w:rPr>
@@ -2121,7 +2121,7 @@
         <w:rPr>
           <w:noProof/>
         </w:rPr>
-        <w:instrText xml:space="preserve"> PAGEREF _Toc236755263 \h </w:instrText>
+        <w:instrText xml:space="preserve"> PAGEREF _Toc236923028 \h </w:instrText>
       </w:r>
       <w:r>
         <w:rPr>
@@ -2182,7 +2182,7 @@
         <w:rPr>
           <w:noProof/>
         </w:rPr>
-        <w:instrText xml:space="preserve"> PAGEREF _Toc236755264 \h </w:instrText>
+        <w:instrText xml:space="preserve"> PAGEREF _Toc236923029 \h </w:instrText>
       </w:r>
       <w:r>
         <w:rPr>
@@ -2243,7 +2243,7 @@
         <w:rPr>
           <w:noProof/>
         </w:rPr>
-        <w:instrText xml:space="preserve"> PAGEREF _Toc236755265 \h </w:instrText>
+        <w:instrText xml:space="preserve"> PAGEREF _Toc236923030 \h </w:instrText>
       </w:r>
       <w:r>
         <w:rPr>
@@ -2304,7 +2304,7 @@
         <w:rPr>
           <w:noProof/>
         </w:rPr>
-        <w:instrText xml:space="preserve"> PAGEREF _Toc236755266 \h </w:instrText>
+        <w:instrText xml:space="preserve"> PAGEREF _Toc236923031 \h </w:instrText>
       </w:r>
       <w:r>
         <w:rPr>
@@ -2365,7 +2365,7 @@
         <w:rPr>
           <w:noProof/>
         </w:rPr>
-        <w:instrText xml:space="preserve"> PAGEREF _Toc236755267 \h </w:instrText>
+        <w:instrText xml:space="preserve"> PAGEREF _Toc236923032 \h </w:instrText>
       </w:r>
       <w:r>
         <w:rPr>
@@ -2426,7 +2426,7 @@
         <w:rPr>
           <w:noProof/>
         </w:rPr>
-        <w:instrText xml:space="preserve"> PAGEREF _Toc236755268 \h </w:instrText>
+        <w:instrText xml:space="preserve"> PAGEREF _Toc236923033 \h </w:instrText>
       </w:r>
       <w:r>
         <w:rPr>
@@ -2487,7 +2487,7 @@
         <w:rPr>
           <w:noProof/>
         </w:rPr>
-        <w:instrText xml:space="preserve"> PAGEREF _Toc236755269 \h </w:instrText>
+        <w:instrText xml:space="preserve"> PAGEREF _Toc236923034 \h </w:instrText>
       </w:r>
       <w:r>
         <w:rPr>
@@ -2548,7 +2548,7 @@
         <w:rPr>
           <w:noProof/>
         </w:rPr>
-        <w:instrText xml:space="preserve"> PAGEREF _Toc236755270 \h </w:instrText>
+        <w:instrText xml:space="preserve"> PAGEREF _Toc236923035 \h </w:instrText>
       </w:r>
       <w:r>
         <w:rPr>
@@ -2609,7 +2609,7 @@
         <w:rPr>
           <w:noProof/>
         </w:rPr>
-        <w:instrText xml:space="preserve"> PAGEREF _Toc236755271 \h </w:instrText>
+        <w:instrText xml:space="preserve"> PAGEREF _Toc236923036 \h </w:instrText>
       </w:r>
       <w:r>
         <w:rPr>
@@ -2685,7 +2685,7 @@
           <w:sz w:val="34"/>
         </w:rPr>
       </w:pPr>
-      <w:bookmarkStart w:id="0" w:name="_Toc236755232"/>
+      <w:bookmarkStart w:id="0" w:name="_Toc236922997"/>
       <w:r>
         <w:rPr>
           <w:rFonts w:ascii="Montserrat" w:hAnsi="Montserrat"/>
@@ -2709,7 +2709,7 @@
           <w:sz w:val="27"/>
         </w:rPr>
       </w:pPr>
-      <w:bookmarkStart w:id="1" w:name="_Toc236755233"/>
+      <w:bookmarkStart w:id="1" w:name="_Toc236922998"/>
       <w:r>
         <w:rPr>
           <w:rFonts w:ascii="Montserrat" w:hAnsi="Montserrat"/>
@@ -2979,7 +2979,7 @@
           <w:color w:val="1A1A1A"/>
           <w:sz w:val="22"/>
         </w:rPr>
-        <w:t xml:space="preserve">O manual nao substitui as Diretrizes para a Gestao de Projetos da UNIALFA (documento institucional que define o framework D01 a D07) nem o </w:t>
+        <w:t xml:space="preserve">Esta e a versao 2.12 do manual. Em relacao a versao 2.11 (04/08/2026), foi adicionado um setimo momento de notificacao (secao 2.8): ao registrar uma </w:t>
       </w:r>
       <w:r>
         <w:rPr>
@@ -2988,7 +2988,25 @@
           <w:sz w:val="22"/>
         </w:rPr>
         <w:lastRenderedPageBreak/>
-        <w:t>documento Regras de Acesso e Permissoes (que detalha cada regra de controle de acesso); ele e o guia operacional de como usar cada ferramenta na pratica.</w:t>
+        <w:t>nova Solicitacao de Demanda, os Admins agora recebem um aviso imediato (e-mail e push) de que ha um Gate 1 - Triagem pendente, em vez de depender de alguem checar a lista manualmente.</w:t>
+      </w:r>
+    </w:p>
+    <w:p>
+      <w:pPr>
+        <w:spacing w:line="280" w:lineRule="auto"/>
+        <w:rPr>
+          <w:rFonts w:ascii="Montserrat" w:hAnsi="Montserrat"/>
+          <w:color w:val="1A1A1A"/>
+          <w:sz w:val="22"/>
+        </w:rPr>
+      </w:pPr>
+      <w:r>
+        <w:rPr>
+          <w:rFonts w:ascii="Montserrat" w:hAnsi="Montserrat"/>
+          <w:color w:val="1A1A1A"/>
+          <w:sz w:val="22"/>
+        </w:rPr>
+        <w:t>O manual nao substitui as Diretrizes para a Gestao de Projetos da UNIALFA (documento institucional que define o framework D01 a D07) nem o documento Regras de Acesso e Permissoes (que detalha cada regra de controle de acesso); ele e o guia operacional de como usar cada ferramenta na pratica.</w:t>
       </w:r>
     </w:p>
     <w:p>
@@ -3002,7 +3020,7 @@
           <w:sz w:val="27"/>
         </w:rPr>
       </w:pPr>
-      <w:bookmarkStart w:id="2" w:name="_Toc236755234"/>
+      <w:bookmarkStart w:id="2" w:name="_Toc236922999"/>
       <w:r>
         <w:rPr>
           <w:rFonts w:ascii="Montserrat" w:hAnsi="Montserrat"/>
@@ -3175,16 +3193,16 @@
         </w:rPr>
         <w:lastRenderedPageBreak/>
         <w:drawing>
-          <wp:inline distT="0" distB="0" distL="0" distR="0" wp14:anchorId="0E81297E" wp14:editId="6CA9F1C5">
+          <wp:inline distT="0" distB="0" distL="0" distR="0" wp14:anchorId="17CA2EB6" wp14:editId="1FFA22AC">
             <wp:extent cx="5303520" cy="4792851"/>
             <wp:effectExtent l="19050" t="19050" r="11430" b="27305"/>
-            <wp:docPr id="1782462826" name="Imagem 1"/>
+            <wp:docPr id="2025906612" name="Imagem 1"/>
             <wp:cNvGraphicFramePr/>
             <a:graphic xmlns:a="http://schemas.openxmlformats.org/drawingml/2006/main">
               <a:graphicData uri="http://schemas.openxmlformats.org/drawingml/2006/picture">
                 <pic:pic xmlns:pic="http://schemas.openxmlformats.org/drawingml/2006/picture">
                   <pic:nvPicPr>
-                    <pic:cNvPr id="1782462826" name=""/>
+                    <pic:cNvPr id="2025906612" name=""/>
                     <pic:cNvPicPr/>
                   </pic:nvPicPr>
                   <pic:blipFill>
@@ -3252,7 +3270,7 @@
           <w:sz w:val="27"/>
         </w:rPr>
       </w:pPr>
-      <w:bookmarkStart w:id="3" w:name="_Toc236755235"/>
+      <w:bookmarkStart w:id="3" w:name="_Toc236923000"/>
       <w:r>
         <w:rPr>
           <w:rFonts w:ascii="Montserrat" w:hAnsi="Montserrat"/>
@@ -3293,16 +3311,16 @@
         </w:rPr>
         <w:lastRenderedPageBreak/>
         <w:drawing>
-          <wp:inline distT="0" distB="0" distL="0" distR="0" wp14:anchorId="0EE0787C" wp14:editId="37D18A05">
+          <wp:inline distT="0" distB="0" distL="0" distR="0" wp14:anchorId="1CE8170D" wp14:editId="1FB54782">
             <wp:extent cx="4206240" cy="3801227"/>
             <wp:effectExtent l="19050" t="19050" r="22860" b="27940"/>
-            <wp:docPr id="533662649" name="Imagem 2"/>
+            <wp:docPr id="1213683885" name="Imagem 2"/>
             <wp:cNvGraphicFramePr/>
             <a:graphic xmlns:a="http://schemas.openxmlformats.org/drawingml/2006/main">
               <a:graphicData uri="http://schemas.openxmlformats.org/drawingml/2006/picture">
                 <pic:pic xmlns:pic="http://schemas.openxmlformats.org/drawingml/2006/picture">
                   <pic:nvPicPr>
-                    <pic:cNvPr id="533662649" name=""/>
+                    <pic:cNvPr id="1213683885" name=""/>
                     <pic:cNvPicPr/>
                   </pic:nvPicPr>
                   <pic:blipFill>
@@ -3475,7 +3493,7 @@
           <w:sz w:val="27"/>
         </w:rPr>
       </w:pPr>
-      <w:bookmarkStart w:id="4" w:name="_Toc236755236"/>
+      <w:bookmarkStart w:id="4" w:name="_Toc236923001"/>
       <w:r>
         <w:rPr>
           <w:rFonts w:ascii="Montserrat" w:hAnsi="Montserrat"/>
@@ -4624,7 +4642,7 @@
           <w:sz w:val="34"/>
         </w:rPr>
       </w:pPr>
-      <w:bookmarkStart w:id="5" w:name="_Toc236755237"/>
+      <w:bookmarkStart w:id="5" w:name="_Toc236923002"/>
       <w:r>
         <w:rPr>
           <w:rFonts w:ascii="Montserrat" w:hAnsi="Montserrat"/>
@@ -4648,7 +4666,7 @@
           <w:sz w:val="27"/>
         </w:rPr>
       </w:pPr>
-      <w:bookmarkStart w:id="6" w:name="_Toc236755238"/>
+      <w:bookmarkStart w:id="6" w:name="_Toc236923003"/>
       <w:r>
         <w:rPr>
           <w:rFonts w:ascii="Montserrat" w:hAnsi="Montserrat"/>
@@ -4689,7 +4707,7 @@
           <w:sz w:val="27"/>
         </w:rPr>
       </w:pPr>
-      <w:bookmarkStart w:id="7" w:name="_Toc236755239"/>
+      <w:bookmarkStart w:id="7" w:name="_Toc236923004"/>
       <w:r>
         <w:rPr>
           <w:rFonts w:ascii="Montserrat" w:hAnsi="Montserrat"/>
@@ -4808,7 +4826,7 @@
           <w:sz w:val="27"/>
         </w:rPr>
       </w:pPr>
-      <w:bookmarkStart w:id="8" w:name="_Toc236755240"/>
+      <w:bookmarkStart w:id="8" w:name="_Toc236923005"/>
       <w:r>
         <w:rPr>
           <w:rFonts w:ascii="Montserrat" w:hAnsi="Montserrat"/>
@@ -5379,7 +5397,7 @@
           <w:sz w:val="27"/>
         </w:rPr>
       </w:pPr>
-      <w:bookmarkStart w:id="9" w:name="_Toc236755241"/>
+      <w:bookmarkStart w:id="9" w:name="_Toc236923006"/>
       <w:r>
         <w:rPr>
           <w:rFonts w:ascii="Montserrat" w:hAnsi="Montserrat"/>
@@ -5468,16 +5486,16 @@
         </w:rPr>
         <w:lastRenderedPageBreak/>
         <w:drawing>
-          <wp:inline distT="0" distB="0" distL="0" distR="0" wp14:anchorId="7A1817EC" wp14:editId="79E3B023">
+          <wp:inline distT="0" distB="0" distL="0" distR="0" wp14:anchorId="6FADEF01" wp14:editId="7C93285B">
             <wp:extent cx="4937760" cy="4462310"/>
             <wp:effectExtent l="19050" t="19050" r="15240" b="14605"/>
-            <wp:docPr id="1334530168" name="Imagem 3"/>
+            <wp:docPr id="1347190305" name="Imagem 3"/>
             <wp:cNvGraphicFramePr/>
             <a:graphic xmlns:a="http://schemas.openxmlformats.org/drawingml/2006/main">
               <a:graphicData uri="http://schemas.openxmlformats.org/drawingml/2006/picture">
                 <pic:pic xmlns:pic="http://schemas.openxmlformats.org/drawingml/2006/picture">
                   <pic:nvPicPr>
-                    <pic:cNvPr id="1334530168" name=""/>
+                    <pic:cNvPr id="1347190305" name=""/>
                     <pic:cNvPicPr/>
                   </pic:nvPicPr>
                   <pic:blipFill>
@@ -5545,7 +5563,7 @@
           <w:sz w:val="27"/>
         </w:rPr>
       </w:pPr>
-      <w:bookmarkStart w:id="10" w:name="_Toc236755242"/>
+      <w:bookmarkStart w:id="10" w:name="_Toc236923007"/>
       <w:r>
         <w:rPr>
           <w:rFonts w:ascii="Montserrat" w:hAnsi="Montserrat"/>
@@ -5586,16 +5604,16 @@
         </w:rPr>
         <w:lastRenderedPageBreak/>
         <w:drawing>
-          <wp:inline distT="0" distB="0" distL="0" distR="0" wp14:anchorId="476E1A65" wp14:editId="2B4E68F4">
+          <wp:inline distT="0" distB="0" distL="0" distR="0" wp14:anchorId="23841A52" wp14:editId="21F47640">
             <wp:extent cx="5120640" cy="4627581"/>
             <wp:effectExtent l="19050" t="19050" r="22860" b="20955"/>
-            <wp:docPr id="314442110" name="Imagem 4"/>
+            <wp:docPr id="1014639596" name="Imagem 4"/>
             <wp:cNvGraphicFramePr/>
             <a:graphic xmlns:a="http://schemas.openxmlformats.org/drawingml/2006/main">
               <a:graphicData uri="http://schemas.openxmlformats.org/drawingml/2006/picture">
                 <pic:pic xmlns:pic="http://schemas.openxmlformats.org/drawingml/2006/picture">
                   <pic:nvPicPr>
-                    <pic:cNvPr id="314442110" name=""/>
+                    <pic:cNvPr id="1014639596" name=""/>
                     <pic:cNvPicPr/>
                   </pic:nvPicPr>
                   <pic:blipFill>
@@ -5732,7 +5750,7 @@
           <w:sz w:val="27"/>
         </w:rPr>
       </w:pPr>
-      <w:bookmarkStart w:id="11" w:name="_Toc236755243"/>
+      <w:bookmarkStart w:id="11" w:name="_Toc236923008"/>
       <w:r>
         <w:rPr>
           <w:rFonts w:ascii="Montserrat" w:hAnsi="Montserrat"/>
@@ -5773,16 +5791,16 @@
           <w:noProof/>
         </w:rPr>
         <w:drawing>
-          <wp:inline distT="0" distB="0" distL="0" distR="0" wp14:anchorId="75EA7559" wp14:editId="1C45AB83">
+          <wp:inline distT="0" distB="0" distL="0" distR="0" wp14:anchorId="7C6B0248" wp14:editId="7F2A9579">
             <wp:extent cx="4206240" cy="3801227"/>
             <wp:effectExtent l="19050" t="19050" r="22860" b="27940"/>
-            <wp:docPr id="30176145" name="Imagem 5"/>
+            <wp:docPr id="648515267" name="Imagem 5"/>
             <wp:cNvGraphicFramePr/>
             <a:graphic xmlns:a="http://schemas.openxmlformats.org/drawingml/2006/main">
               <a:graphicData uri="http://schemas.openxmlformats.org/drawingml/2006/picture">
                 <pic:pic xmlns:pic="http://schemas.openxmlformats.org/drawingml/2006/picture">
                   <pic:nvPicPr>
-                    <pic:cNvPr id="30176145" name=""/>
+                    <pic:cNvPr id="648515267" name=""/>
                     <pic:cNvPicPr/>
                   </pic:nvPicPr>
                   <pic:blipFill>
@@ -5850,16 +5868,16 @@
         </w:rPr>
         <w:lastRenderedPageBreak/>
         <w:drawing>
-          <wp:inline distT="0" distB="0" distL="0" distR="0" wp14:anchorId="7911BA7C" wp14:editId="28889EED">
+          <wp:inline distT="0" distB="0" distL="0" distR="0" wp14:anchorId="2B459F16" wp14:editId="2F0F75E5">
             <wp:extent cx="4206240" cy="3801227"/>
             <wp:effectExtent l="19050" t="19050" r="22860" b="27940"/>
-            <wp:docPr id="162277376" name="Imagem 6"/>
+            <wp:docPr id="641161182" name="Imagem 6"/>
             <wp:cNvGraphicFramePr/>
             <a:graphic xmlns:a="http://schemas.openxmlformats.org/drawingml/2006/main">
               <a:graphicData uri="http://schemas.openxmlformats.org/drawingml/2006/picture">
                 <pic:pic xmlns:pic="http://schemas.openxmlformats.org/drawingml/2006/picture">
                   <pic:nvPicPr>
-                    <pic:cNvPr id="162277376" name=""/>
+                    <pic:cNvPr id="641161182" name=""/>
                     <pic:cNvPicPr/>
                   </pic:nvPicPr>
                   <pic:blipFill>
@@ -5975,7 +5993,7 @@
           <w:sz w:val="27"/>
         </w:rPr>
       </w:pPr>
-      <w:bookmarkStart w:id="12" w:name="_Toc236755244"/>
+      <w:bookmarkStart w:id="12" w:name="_Toc236923009"/>
       <w:r>
         <w:rPr>
           <w:rFonts w:ascii="Montserrat" w:hAnsi="Montserrat"/>
@@ -6043,7 +6061,7 @@
           <w:sz w:val="27"/>
         </w:rPr>
       </w:pPr>
-      <w:bookmarkStart w:id="13" w:name="_Toc236755245"/>
+      <w:bookmarkStart w:id="13" w:name="_Toc236923010"/>
       <w:r>
         <w:rPr>
           <w:rFonts w:ascii="Montserrat" w:hAnsi="Montserrat"/>
@@ -6070,7 +6088,7 @@
           <w:color w:val="1A1A1A"/>
           <w:sz w:val="22"/>
         </w:rPr>
-        <w:t>Seis momentos de decisao do sistema disparam automaticamente um e-mail de notificacao, enviado via Resend por uma Supabase Edge Function (a chave da API fica guardada no servidor, nunca no navegador):</w:t>
+        <w:t>Sete momentos do sistema disparam automaticamente um e-mail de notificacao, enviado via Resend por uma Supabase Edge Function (a chave da API fica guardada no servidor, nunca no navegador):</w:t>
       </w:r>
     </w:p>
     <w:p>
@@ -6094,7 +6112,7 @@
           <w:color w:val="1A1A1A"/>
           <w:sz w:val="22"/>
         </w:rPr>
-        <w:t>Gate 1 - Solicitacao de Demanda: quando o Admin muda o status para Aprovada ou Reprovada.</w:t>
+        <w:t>Registro de nova Solicitacao de Demanda: assim que a demanda e salva, antes de qualquer decisao - avisa os Admins que ha um Gate 1 - Triagem pendente de analise.</w:t>
       </w:r>
     </w:p>
     <w:p>
@@ -6118,7 +6136,7 @@
           <w:color w:val="1A1A1A"/>
           <w:sz w:val="22"/>
         </w:rPr>
-        <w:t>Canvas de Projeto: quando o status muda para Aprovado.</w:t>
+        <w:t>Gate 1 - Solicitacao de Demanda: quando o Admin muda o status para Aprovada ou Reprovada.</w:t>
       </w:r>
     </w:p>
     <w:p>
@@ -6142,7 +6160,7 @@
           <w:color w:val="1A1A1A"/>
           <w:sz w:val="22"/>
         </w:rPr>
-        <w:t>TAP: quando o status muda para Aprovado.</w:t>
+        <w:t>Canvas de Projeto: quando o status muda para Aprovado.</w:t>
       </w:r>
     </w:p>
     <w:p>
@@ -6166,7 +6184,7 @@
           <w:color w:val="1A1A1A"/>
           <w:sz w:val="22"/>
         </w:rPr>
-        <w:t>SMP: quando a decisao e finalizada como Aprovada ou Nao aprovada.</w:t>
+        <w:t>TAP: quando o status muda para Aprovado.</w:t>
       </w:r>
     </w:p>
     <w:p>
@@ -6190,7 +6208,7 @@
           <w:color w:val="1A1A1A"/>
           <w:sz w:val="22"/>
         </w:rPr>
-        <w:t>TEP: ao registrar um novo Termo de Encerramento.</w:t>
+        <w:t>SMP: quando a decisao e finalizada como Aprovada ou Nao aprovada.</w:t>
       </w:r>
     </w:p>
     <w:p>
@@ -6214,6 +6232,30 @@
           <w:color w:val="1A1A1A"/>
           <w:sz w:val="22"/>
         </w:rPr>
+        <w:t>TEP: ao registrar um novo Termo de Encerramento.</w:t>
+      </w:r>
+    </w:p>
+    <w:p>
+      <w:pPr>
+        <w:pStyle w:val="PargrafodaLista"/>
+        <w:numPr>
+          <w:ilvl w:val="0"/>
+          <w:numId w:val="8"/>
+        </w:numPr>
+        <w:spacing w:after="80" w:line="260" w:lineRule="auto"/>
+        <w:ind w:left="700"/>
+        <w:rPr>
+          <w:rFonts w:ascii="Montserrat" w:hAnsi="Montserrat"/>
+          <w:color w:val="1A1A1A"/>
+          <w:sz w:val="22"/>
+        </w:rPr>
+      </w:pPr>
+      <w:r>
+        <w:rPr>
+          <w:rFonts w:ascii="Montserrat" w:hAnsi="Montserrat"/>
+          <w:color w:val="1A1A1A"/>
+          <w:sz w:val="22"/>
+        </w:rPr>
         <w:t>Gate 2 - Relatorio de Entregas: quando o status muda para Pactuado.</w:t>
       </w:r>
     </w:p>
@@ -6232,7 +6274,7 @@
           <w:color w:val="1A1A1A"/>
           <w:sz w:val="22"/>
         </w:rPr>
-        <w:t>Em todos os casos, os destinatarios sao: quem criou o registro (e-mail capturado no login, ou informado no registro sem login), todos os e-mails cadastrados na equipe do Projeto vinculado (Administracao &gt; Equipes) e todos os usuarios com papel Admin. Se o envio falhar por qualquer motivo (ex.: instabilidade do provedor de e-mail), o registro e salvo normalmente mesmo assim - a notificacao nunca bloqueia o fluxo de trabalho.</w:t>
+        <w:t>Nos seis momentos de decisao (todos exceto o registro de nova demanda), os destinatarios sao: quem criou o registro (e-mail capturado no login, ou informado no registro sem login), todos os e-mails cadastrados na equipe do Projeto vinculado (Administracao &gt; Equipes) e todos os usuarios com papel Admin. Ja o aviso de registro de nova demanda vai somente para os Admins, ja que ainda nao ha Gate 1 aprovado nem equipe designada nesse momento. Se o envio falhar por qualquer motivo (ex.: instabilidade do provedor de e-mail), o registro e salvo normalmente mesmo assim - a notificacao nunca bloqueia o fluxo de trabalho.</w:t>
       </w:r>
     </w:p>
     <w:p>
@@ -6246,7 +6288,7 @@
           <w:sz w:val="27"/>
         </w:rPr>
       </w:pPr>
-      <w:bookmarkStart w:id="14" w:name="_Toc236755246"/>
+      <w:bookmarkStart w:id="14" w:name="_Toc236923011"/>
       <w:r>
         <w:rPr>
           <w:rFonts w:ascii="Montserrat" w:hAnsi="Montserrat"/>
@@ -6369,7 +6411,8 @@
           <w:color w:val="1A1A1A"/>
           <w:sz w:val="22"/>
         </w:rPr>
-        <w:t>Dispara nos mesmos seis momentos de decisao da secao 2.8 (Gate 1, Canvas aprovado, TAP aprovado, decisao da SMP, registro de TEP e Gate 2 pactuado), para os mesmos destinatarios - mas so quem tiver ativado o push naquele navegador/celular recebe a notificacao.</w:t>
+        <w:lastRenderedPageBreak/>
+        <w:t>Dispara nos mesmos sete momentos da secao 2.8 (registro de nova demanda, Gate 1, Canvas aprovado, TAP aprovado, decisao da SMP, registro de TEP e Gate 2 pactuado), para os mesmos destinatarios - mas so quem tiver ativado o push naquele navegador/celular recebe a notificacao.</w:t>
       </w:r>
     </w:p>
     <w:p>
@@ -6390,17 +6433,7 @@
           <w:color w:val="6A6A70"/>
           <w:sz w:val="21"/>
         </w:rPr>
-        <w:t xml:space="preserve">No iPhone/iPad, a Apple so libera notificacao push para sites adicionados a Tela de Inicio. Antes de tocar em Ativar lembretes no celular, va em Compartilhar &gt; </w:t>
-      </w:r>
-      <w:r>
-        <w:rPr>
-          <w:rFonts w:ascii="Montserrat" w:hAnsi="Montserrat"/>
-          <w:i/>
-          <w:color w:val="6A6A70"/>
-          <w:sz w:val="21"/>
-        </w:rPr>
-        <w:lastRenderedPageBreak/>
-        <w:t>Adicionar a Tela de Inicio no Safari, abra o sistema pelo icone criado, e so entao ative - num navegador comum (aba do Safari) o botao explica essa limitacao em vez de ativar direto. Em Android e computador nao ha essa exigencia.</w:t>
+        <w:t>No iPhone/iPad, a Apple so libera notificacao push para sites adicionados a Tela de Inicio. Antes de tocar em Ativar lembretes no celular, va em Compartilhar &gt; Adicionar a Tela de Inicio no Safari, abra o sistema pelo icone criado, e so entao ative - num navegador comum (aba do Safari) o botao explica essa limitacao em vez de ativar direto. Em Android e computador nao ha essa exigencia.</w:t>
       </w:r>
     </w:p>
     <w:p>
@@ -6418,7 +6451,7 @@
           <w:sz w:val="34"/>
         </w:rPr>
       </w:pPr>
-      <w:bookmarkStart w:id="15" w:name="_Toc236755247"/>
+      <w:bookmarkStart w:id="15" w:name="_Toc236923012"/>
       <w:r>
         <w:rPr>
           <w:rFonts w:ascii="Montserrat" w:hAnsi="Montserrat"/>
@@ -6460,7 +6493,7 @@
           <w:sz w:val="27"/>
         </w:rPr>
       </w:pPr>
-      <w:bookmarkStart w:id="16" w:name="_Toc236755248"/>
+      <w:bookmarkStart w:id="16" w:name="_Toc236923013"/>
       <w:r>
         <w:rPr>
           <w:rFonts w:ascii="Montserrat" w:hAnsi="Montserrat"/>
@@ -7320,16 +7353,16 @@
         </w:rPr>
         <w:lastRenderedPageBreak/>
         <w:drawing>
-          <wp:inline distT="0" distB="0" distL="0" distR="0" wp14:anchorId="66AB2FFC" wp14:editId="663FF2F0">
+          <wp:inline distT="0" distB="0" distL="0" distR="0" wp14:anchorId="4D015BBC" wp14:editId="17756847">
             <wp:extent cx="5120640" cy="4627581"/>
             <wp:effectExtent l="19050" t="19050" r="22860" b="20955"/>
-            <wp:docPr id="329107318" name="Imagem 7"/>
+            <wp:docPr id="1993388346" name="Imagem 7"/>
             <wp:cNvGraphicFramePr/>
             <a:graphic xmlns:a="http://schemas.openxmlformats.org/drawingml/2006/main">
               <a:graphicData uri="http://schemas.openxmlformats.org/drawingml/2006/picture">
                 <pic:pic xmlns:pic="http://schemas.openxmlformats.org/drawingml/2006/picture">
                   <pic:nvPicPr>
-                    <pic:cNvPr id="329107318" name=""/>
+                    <pic:cNvPr id="1993388346" name=""/>
                     <pic:cNvPicPr/>
                   </pic:nvPicPr>
                   <pic:blipFill>
@@ -7397,16 +7430,16 @@
         </w:rPr>
         <w:lastRenderedPageBreak/>
         <w:drawing>
-          <wp:inline distT="0" distB="0" distL="0" distR="0" wp14:anchorId="0B5B2364" wp14:editId="28F0DE03">
+          <wp:inline distT="0" distB="0" distL="0" distR="0" wp14:anchorId="55E01978" wp14:editId="5B605572">
             <wp:extent cx="5120640" cy="4627581"/>
             <wp:effectExtent l="19050" t="19050" r="22860" b="20955"/>
-            <wp:docPr id="661486452" name="Imagem 8"/>
+            <wp:docPr id="581959230" name="Imagem 8"/>
             <wp:cNvGraphicFramePr/>
             <a:graphic xmlns:a="http://schemas.openxmlformats.org/drawingml/2006/main">
               <a:graphicData uri="http://schemas.openxmlformats.org/drawingml/2006/picture">
                 <pic:pic xmlns:pic="http://schemas.openxmlformats.org/drawingml/2006/picture">
                   <pic:nvPicPr>
-                    <pic:cNvPr id="661486452" name=""/>
+                    <pic:cNvPr id="581959230" name=""/>
                     <pic:cNvPicPr/>
                   </pic:nvPicPr>
                   <pic:blipFill>
@@ -7506,7 +7539,7 @@
           <w:color w:val="1A1A1A"/>
           <w:sz w:val="22"/>
         </w:rPr>
-        <w:t>Como salvar: clique em Registrar solicitacao. O sistema gera o protocolo e leva voce para Demandas cadastradas. Clique em qualquer linha da tabela para abrir o registro e revisar os dados.</w:t>
+        <w:t>Como salvar: clique em Registrar solicitacao. O sistema gera o protocolo e leva voce para Demandas cadastradas. Clique em qualquer linha da tabela para abrir o registro e revisar os dados. Ao salvar, todos os Admins recebem um aviso automatico (e-mail e, se ativado, push) de que ha um Gate 1 pendente de analise (secao 2.8).</w:t>
       </w:r>
     </w:p>
     <w:p>
@@ -7541,7 +7574,7 @@
           <w:sz w:val="27"/>
         </w:rPr>
       </w:pPr>
-      <w:bookmarkStart w:id="17" w:name="_Toc236755249"/>
+      <w:bookmarkStart w:id="17" w:name="_Toc236923014"/>
       <w:r>
         <w:rPr>
           <w:rFonts w:ascii="Montserrat" w:hAnsi="Montserrat"/>
@@ -8402,16 +8435,16 @@
         </w:rPr>
         <w:lastRenderedPageBreak/>
         <w:drawing>
-          <wp:inline distT="0" distB="0" distL="0" distR="0" wp14:anchorId="7BCE64E4" wp14:editId="05CA0B7E">
+          <wp:inline distT="0" distB="0" distL="0" distR="0" wp14:anchorId="1A3BB281" wp14:editId="4057EA6C">
             <wp:extent cx="5120640" cy="4627581"/>
             <wp:effectExtent l="19050" t="19050" r="22860" b="20955"/>
-            <wp:docPr id="1262189924" name="Imagem 9"/>
+            <wp:docPr id="911850526" name="Imagem 9"/>
             <wp:cNvGraphicFramePr/>
             <a:graphic xmlns:a="http://schemas.openxmlformats.org/drawingml/2006/main">
               <a:graphicData uri="http://schemas.openxmlformats.org/drawingml/2006/picture">
                 <pic:pic xmlns:pic="http://schemas.openxmlformats.org/drawingml/2006/picture">
                   <pic:nvPicPr>
-                    <pic:cNvPr id="1262189924" name=""/>
+                    <pic:cNvPr id="911850526" name=""/>
                     <pic:cNvPicPr/>
                   </pic:nvPicPr>
                   <pic:blipFill>
@@ -8479,16 +8512,16 @@
         </w:rPr>
         <w:lastRenderedPageBreak/>
         <w:drawing>
-          <wp:inline distT="0" distB="0" distL="0" distR="0" wp14:anchorId="0E62AA18" wp14:editId="0D0EF05B">
+          <wp:inline distT="0" distB="0" distL="0" distR="0" wp14:anchorId="0E393431" wp14:editId="61864EC6">
             <wp:extent cx="5120640" cy="4627581"/>
             <wp:effectExtent l="19050" t="19050" r="22860" b="20955"/>
-            <wp:docPr id="1543699069" name="Imagem 10"/>
+            <wp:docPr id="1567862089" name="Imagem 10"/>
             <wp:cNvGraphicFramePr/>
             <a:graphic xmlns:a="http://schemas.openxmlformats.org/drawingml/2006/main">
               <a:graphicData uri="http://schemas.openxmlformats.org/drawingml/2006/picture">
                 <pic:pic xmlns:pic="http://schemas.openxmlformats.org/drawingml/2006/picture">
                   <pic:nvPicPr>
-                    <pic:cNvPr id="1543699069" name=""/>
+                    <pic:cNvPr id="1567862089" name=""/>
                     <pic:cNvPicPr/>
                   </pic:nvPicPr>
                   <pic:blipFill>
@@ -8574,7 +8607,7 @@
           <w:sz w:val="27"/>
         </w:rPr>
       </w:pPr>
-      <w:bookmarkStart w:id="18" w:name="_Toc236755250"/>
+      <w:bookmarkStart w:id="18" w:name="_Toc236923015"/>
       <w:r>
         <w:rPr>
           <w:rFonts w:ascii="Montserrat" w:hAnsi="Montserrat"/>
@@ -9542,16 +9575,16 @@
         </w:rPr>
         <w:lastRenderedPageBreak/>
         <w:drawing>
-          <wp:inline distT="0" distB="0" distL="0" distR="0" wp14:anchorId="30EF5F20" wp14:editId="3FDDA8BC">
+          <wp:inline distT="0" distB="0" distL="0" distR="0" wp14:anchorId="12FC1BBB" wp14:editId="27D33414">
             <wp:extent cx="5120640" cy="3282818"/>
             <wp:effectExtent l="19050" t="19050" r="22860" b="13335"/>
-            <wp:docPr id="1578921696" name="Imagem 11"/>
+            <wp:docPr id="656655448" name="Imagem 11"/>
             <wp:cNvGraphicFramePr/>
             <a:graphic xmlns:a="http://schemas.openxmlformats.org/drawingml/2006/main">
               <a:graphicData uri="http://schemas.openxmlformats.org/drawingml/2006/picture">
                 <pic:pic xmlns:pic="http://schemas.openxmlformats.org/drawingml/2006/picture">
                   <pic:nvPicPr>
-                    <pic:cNvPr id="1578921696" name=""/>
+                    <pic:cNvPr id="656655448" name=""/>
                     <pic:cNvPicPr/>
                   </pic:nvPicPr>
                   <pic:blipFill>
@@ -9619,16 +9652,16 @@
         </w:rPr>
         <w:lastRenderedPageBreak/>
         <w:drawing>
-          <wp:inline distT="0" distB="0" distL="0" distR="0" wp14:anchorId="73B96480" wp14:editId="4E341E89">
+          <wp:inline distT="0" distB="0" distL="0" distR="0" wp14:anchorId="6D53A224" wp14:editId="0200CF7D">
             <wp:extent cx="5120640" cy="4627581"/>
             <wp:effectExtent l="19050" t="19050" r="22860" b="20955"/>
-            <wp:docPr id="289698430" name="Imagem 12"/>
+            <wp:docPr id="1737658665" name="Imagem 12"/>
             <wp:cNvGraphicFramePr/>
             <a:graphic xmlns:a="http://schemas.openxmlformats.org/drawingml/2006/main">
               <a:graphicData uri="http://schemas.openxmlformats.org/drawingml/2006/picture">
                 <pic:pic xmlns:pic="http://schemas.openxmlformats.org/drawingml/2006/picture">
                   <pic:nvPicPr>
-                    <pic:cNvPr id="289698430" name=""/>
+                    <pic:cNvPr id="1737658665" name=""/>
                     <pic:cNvPicPr/>
                   </pic:nvPicPr>
                   <pic:blipFill>
@@ -9714,7 +9747,7 @@
           <w:sz w:val="27"/>
         </w:rPr>
       </w:pPr>
-      <w:bookmarkStart w:id="19" w:name="_Toc236755251"/>
+      <w:bookmarkStart w:id="19" w:name="_Toc236923016"/>
       <w:r>
         <w:rPr>
           <w:rFonts w:ascii="Montserrat" w:hAnsi="Montserrat"/>
@@ -10221,16 +10254,16 @@
           <w:noProof/>
         </w:rPr>
         <w:drawing>
-          <wp:inline distT="0" distB="0" distL="0" distR="0" wp14:anchorId="7F1E0525" wp14:editId="7F917806">
+          <wp:inline distT="0" distB="0" distL="0" distR="0" wp14:anchorId="0C78A8A0" wp14:editId="13B0B12E">
             <wp:extent cx="5120640" cy="4627581"/>
             <wp:effectExtent l="19050" t="19050" r="22860" b="20955"/>
-            <wp:docPr id="234254345" name="Imagem 13"/>
+            <wp:docPr id="1831335021" name="Imagem 13"/>
             <wp:cNvGraphicFramePr/>
             <a:graphic xmlns:a="http://schemas.openxmlformats.org/drawingml/2006/main">
               <a:graphicData uri="http://schemas.openxmlformats.org/drawingml/2006/picture">
                 <pic:pic xmlns:pic="http://schemas.openxmlformats.org/drawingml/2006/picture">
                   <pic:nvPicPr>
-                    <pic:cNvPr id="234254345" name=""/>
+                    <pic:cNvPr id="1831335021" name=""/>
                     <pic:cNvPicPr/>
                   </pic:nvPicPr>
                   <pic:blipFill>
@@ -10298,16 +10331,16 @@
         </w:rPr>
         <w:lastRenderedPageBreak/>
         <w:drawing>
-          <wp:inline distT="0" distB="0" distL="0" distR="0" wp14:anchorId="65319EC3" wp14:editId="6755C270">
+          <wp:inline distT="0" distB="0" distL="0" distR="0" wp14:anchorId="4899108B" wp14:editId="07FBCE36">
             <wp:extent cx="5120640" cy="4627581"/>
             <wp:effectExtent l="19050" t="19050" r="22860" b="20955"/>
-            <wp:docPr id="1213370470" name="Imagem 14"/>
+            <wp:docPr id="1302269653" name="Imagem 14"/>
             <wp:cNvGraphicFramePr/>
             <a:graphic xmlns:a="http://schemas.openxmlformats.org/drawingml/2006/main">
               <a:graphicData uri="http://schemas.openxmlformats.org/drawingml/2006/picture">
                 <pic:pic xmlns:pic="http://schemas.openxmlformats.org/drawingml/2006/picture">
                   <pic:nvPicPr>
-                    <pic:cNvPr id="1213370470" name=""/>
+                    <pic:cNvPr id="1302269653" name=""/>
                     <pic:cNvPicPr/>
                   </pic:nvPicPr>
                   <pic:blipFill>
@@ -10393,7 +10426,7 @@
           <w:sz w:val="27"/>
         </w:rPr>
       </w:pPr>
-      <w:bookmarkStart w:id="20" w:name="_Toc236755252"/>
+      <w:bookmarkStart w:id="20" w:name="_Toc236923017"/>
       <w:r>
         <w:rPr>
           <w:rFonts w:ascii="Montserrat" w:hAnsi="Montserrat"/>
@@ -10434,16 +10467,16 @@
         </w:rPr>
         <w:lastRenderedPageBreak/>
         <w:drawing>
-          <wp:inline distT="0" distB="0" distL="0" distR="0" wp14:anchorId="0BE4FB94" wp14:editId="6EA40D68">
+          <wp:inline distT="0" distB="0" distL="0" distR="0" wp14:anchorId="72A61514" wp14:editId="0434CF82">
             <wp:extent cx="5120640" cy="4627581"/>
             <wp:effectExtent l="19050" t="19050" r="22860" b="20955"/>
-            <wp:docPr id="730948485" name="Imagem 15"/>
+            <wp:docPr id="1660534597" name="Imagem 15"/>
             <wp:cNvGraphicFramePr/>
             <a:graphic xmlns:a="http://schemas.openxmlformats.org/drawingml/2006/main">
               <a:graphicData uri="http://schemas.openxmlformats.org/drawingml/2006/picture">
                 <pic:pic xmlns:pic="http://schemas.openxmlformats.org/drawingml/2006/picture">
                   <pic:nvPicPr>
-                    <pic:cNvPr id="730948485" name=""/>
+                    <pic:cNvPr id="1660534597" name=""/>
                     <pic:cNvPicPr/>
                   </pic:nvPicPr>
                   <pic:blipFill>
@@ -10511,16 +10544,16 @@
         </w:rPr>
         <w:lastRenderedPageBreak/>
         <w:drawing>
-          <wp:inline distT="0" distB="0" distL="0" distR="0" wp14:anchorId="089D872D" wp14:editId="63232CAF">
+          <wp:inline distT="0" distB="0" distL="0" distR="0" wp14:anchorId="4A411538" wp14:editId="11A57534">
             <wp:extent cx="5120640" cy="4627581"/>
             <wp:effectExtent l="19050" t="19050" r="22860" b="20955"/>
-            <wp:docPr id="109874335" name="Imagem 16"/>
+            <wp:docPr id="1258117012" name="Imagem 16"/>
             <wp:cNvGraphicFramePr/>
             <a:graphic xmlns:a="http://schemas.openxmlformats.org/drawingml/2006/main">
               <a:graphicData uri="http://schemas.openxmlformats.org/drawingml/2006/picture">
                 <pic:pic xmlns:pic="http://schemas.openxmlformats.org/drawingml/2006/picture">
                   <pic:nvPicPr>
-                    <pic:cNvPr id="109874335" name=""/>
+                    <pic:cNvPr id="1258117012" name=""/>
                     <pic:cNvPicPr/>
                   </pic:nvPicPr>
                   <pic:blipFill>
@@ -10684,16 +10717,16 @@
         </w:rPr>
         <w:lastRenderedPageBreak/>
         <w:drawing>
-          <wp:inline distT="0" distB="0" distL="0" distR="0" wp14:anchorId="6A70CBFA" wp14:editId="0DF3409D">
+          <wp:inline distT="0" distB="0" distL="0" distR="0" wp14:anchorId="4B732EF9" wp14:editId="49AA9B5D">
             <wp:extent cx="5120640" cy="3282818"/>
             <wp:effectExtent l="19050" t="19050" r="22860" b="13335"/>
-            <wp:docPr id="185318608" name="Imagem 17"/>
+            <wp:docPr id="1664291323" name="Imagem 17"/>
             <wp:cNvGraphicFramePr/>
             <a:graphic xmlns:a="http://schemas.openxmlformats.org/drawingml/2006/main">
               <a:graphicData uri="http://schemas.openxmlformats.org/drawingml/2006/picture">
                 <pic:pic xmlns:pic="http://schemas.openxmlformats.org/drawingml/2006/picture">
                   <pic:nvPicPr>
-                    <pic:cNvPr id="185318608" name=""/>
+                    <pic:cNvPr id="1664291323" name=""/>
                     <pic:cNvPicPr/>
                   </pic:nvPicPr>
                   <pic:blipFill>
@@ -10779,7 +10812,7 @@
           <w:sz w:val="27"/>
         </w:rPr>
       </w:pPr>
-      <w:bookmarkStart w:id="21" w:name="_Toc236755253"/>
+      <w:bookmarkStart w:id="21" w:name="_Toc236923018"/>
       <w:r>
         <w:rPr>
           <w:rFonts w:ascii="Montserrat" w:hAnsi="Montserrat"/>
@@ -10820,16 +10853,16 @@
         </w:rPr>
         <w:lastRenderedPageBreak/>
         <w:drawing>
-          <wp:inline distT="0" distB="0" distL="0" distR="0" wp14:anchorId="47431A9E" wp14:editId="55ECE065">
+          <wp:inline distT="0" distB="0" distL="0" distR="0" wp14:anchorId="3EC49994" wp14:editId="7DE79684">
             <wp:extent cx="5120640" cy="4627581"/>
             <wp:effectExtent l="19050" t="19050" r="22860" b="20955"/>
-            <wp:docPr id="2091374221" name="Imagem 18"/>
+            <wp:docPr id="2111940494" name="Imagem 18"/>
             <wp:cNvGraphicFramePr/>
             <a:graphic xmlns:a="http://schemas.openxmlformats.org/drawingml/2006/main">
               <a:graphicData uri="http://schemas.openxmlformats.org/drawingml/2006/picture">
                 <pic:pic xmlns:pic="http://schemas.openxmlformats.org/drawingml/2006/picture">
                   <pic:nvPicPr>
-                    <pic:cNvPr id="2091374221" name=""/>
+                    <pic:cNvPr id="2111940494" name=""/>
                     <pic:cNvPicPr/>
                   </pic:nvPicPr>
                   <pic:blipFill>
@@ -10897,16 +10930,16 @@
         </w:rPr>
         <w:lastRenderedPageBreak/>
         <w:drawing>
-          <wp:inline distT="0" distB="0" distL="0" distR="0" wp14:anchorId="0DDC2481" wp14:editId="14876C3F">
+          <wp:inline distT="0" distB="0" distL="0" distR="0" wp14:anchorId="0B319F76" wp14:editId="5107515A">
             <wp:extent cx="5120640" cy="4627581"/>
             <wp:effectExtent l="19050" t="19050" r="22860" b="20955"/>
-            <wp:docPr id="881622260" name="Imagem 19"/>
+            <wp:docPr id="408979621" name="Imagem 19"/>
             <wp:cNvGraphicFramePr/>
             <a:graphic xmlns:a="http://schemas.openxmlformats.org/drawingml/2006/main">
               <a:graphicData uri="http://schemas.openxmlformats.org/drawingml/2006/picture">
                 <pic:pic xmlns:pic="http://schemas.openxmlformats.org/drawingml/2006/picture">
                   <pic:nvPicPr>
-                    <pic:cNvPr id="881622260" name=""/>
+                    <pic:cNvPr id="408979621" name=""/>
                     <pic:cNvPicPr/>
                   </pic:nvPicPr>
                   <pic:blipFill>
@@ -11040,7 +11073,7 @@
           <w:sz w:val="27"/>
         </w:rPr>
       </w:pPr>
-      <w:bookmarkStart w:id="22" w:name="_Toc236755254"/>
+      <w:bookmarkStart w:id="22" w:name="_Toc236923019"/>
       <w:r>
         <w:rPr>
           <w:rFonts w:ascii="Montserrat" w:hAnsi="Montserrat"/>
@@ -11081,16 +11114,16 @@
         </w:rPr>
         <w:lastRenderedPageBreak/>
         <w:drawing>
-          <wp:inline distT="0" distB="0" distL="0" distR="0" wp14:anchorId="43204BE1" wp14:editId="35A22DF2">
+          <wp:inline distT="0" distB="0" distL="0" distR="0" wp14:anchorId="37C75D47" wp14:editId="7D977F4F">
             <wp:extent cx="5120640" cy="4627581"/>
             <wp:effectExtent l="19050" t="19050" r="22860" b="20955"/>
-            <wp:docPr id="1464696850" name="Imagem 20"/>
+            <wp:docPr id="2013874841" name="Imagem 20"/>
             <wp:cNvGraphicFramePr/>
             <a:graphic xmlns:a="http://schemas.openxmlformats.org/drawingml/2006/main">
               <a:graphicData uri="http://schemas.openxmlformats.org/drawingml/2006/picture">
                 <pic:pic xmlns:pic="http://schemas.openxmlformats.org/drawingml/2006/picture">
                   <pic:nvPicPr>
-                    <pic:cNvPr id="1464696850" name=""/>
+                    <pic:cNvPr id="2013874841" name=""/>
                     <pic:cNvPicPr/>
                   </pic:nvPicPr>
                   <pic:blipFill>
@@ -11158,16 +11191,16 @@
         </w:rPr>
         <w:lastRenderedPageBreak/>
         <w:drawing>
-          <wp:inline distT="0" distB="0" distL="0" distR="0" wp14:anchorId="056CF550" wp14:editId="70C0C5EA">
+          <wp:inline distT="0" distB="0" distL="0" distR="0" wp14:anchorId="02C17482" wp14:editId="46A1B895">
             <wp:extent cx="5120640" cy="4627581"/>
             <wp:effectExtent l="19050" t="19050" r="22860" b="20955"/>
-            <wp:docPr id="1557900929" name="Imagem 21"/>
+            <wp:docPr id="938101931" name="Imagem 21"/>
             <wp:cNvGraphicFramePr/>
             <a:graphic xmlns:a="http://schemas.openxmlformats.org/drawingml/2006/main">
               <a:graphicData uri="http://schemas.openxmlformats.org/drawingml/2006/picture">
                 <pic:pic xmlns:pic="http://schemas.openxmlformats.org/drawingml/2006/picture">
                   <pic:nvPicPr>
-                    <pic:cNvPr id="1557900929" name=""/>
+                    <pic:cNvPr id="938101931" name=""/>
                     <pic:cNvPicPr/>
                   </pic:nvPicPr>
                   <pic:blipFill>
@@ -11356,7 +11389,7 @@
           <w:sz w:val="27"/>
         </w:rPr>
       </w:pPr>
-      <w:bookmarkStart w:id="23" w:name="_Toc236755255"/>
+      <w:bookmarkStart w:id="23" w:name="_Toc236923020"/>
       <w:r>
         <w:rPr>
           <w:rFonts w:ascii="Montserrat" w:hAnsi="Montserrat"/>
@@ -11396,16 +11429,16 @@
           <w:noProof/>
         </w:rPr>
         <w:drawing>
-          <wp:inline distT="0" distB="0" distL="0" distR="0" wp14:anchorId="2E3A8CC2" wp14:editId="08D34EF9">
+          <wp:inline distT="0" distB="0" distL="0" distR="0" wp14:anchorId="659FF5E2" wp14:editId="24BD2D2B">
             <wp:extent cx="5120640" cy="4627581"/>
             <wp:effectExtent l="19050" t="19050" r="22860" b="20955"/>
-            <wp:docPr id="1684138538" name="Imagem 22"/>
+            <wp:docPr id="790858510" name="Imagem 22"/>
             <wp:cNvGraphicFramePr/>
             <a:graphic xmlns:a="http://schemas.openxmlformats.org/drawingml/2006/main">
               <a:graphicData uri="http://schemas.openxmlformats.org/drawingml/2006/picture">
                 <pic:pic xmlns:pic="http://schemas.openxmlformats.org/drawingml/2006/picture">
                   <pic:nvPicPr>
-                    <pic:cNvPr id="1684138538" name=""/>
+                    <pic:cNvPr id="790858510" name=""/>
                     <pic:cNvPicPr/>
                   </pic:nvPicPr>
                   <pic:blipFill>
@@ -11473,16 +11506,16 @@
         </w:rPr>
         <w:lastRenderedPageBreak/>
         <w:drawing>
-          <wp:inline distT="0" distB="0" distL="0" distR="0" wp14:anchorId="6301FE64" wp14:editId="7FEFBCE7">
+          <wp:inline distT="0" distB="0" distL="0" distR="0" wp14:anchorId="5995F3D9" wp14:editId="3335DA07">
             <wp:extent cx="5120640" cy="4627581"/>
             <wp:effectExtent l="19050" t="19050" r="22860" b="20955"/>
-            <wp:docPr id="948810405" name="Imagem 23"/>
+            <wp:docPr id="1589147038" name="Imagem 23"/>
             <wp:cNvGraphicFramePr/>
             <a:graphic xmlns:a="http://schemas.openxmlformats.org/drawingml/2006/main">
               <a:graphicData uri="http://schemas.openxmlformats.org/drawingml/2006/picture">
                 <pic:pic xmlns:pic="http://schemas.openxmlformats.org/drawingml/2006/picture">
                   <pic:nvPicPr>
-                    <pic:cNvPr id="948810405" name=""/>
+                    <pic:cNvPr id="1589147038" name=""/>
                     <pic:cNvPicPr/>
                   </pic:nvPicPr>
                   <pic:blipFill>
@@ -11640,7 +11673,7 @@
           <w:sz w:val="27"/>
         </w:rPr>
       </w:pPr>
-      <w:bookmarkStart w:id="24" w:name="_Toc236755256"/>
+      <w:bookmarkStart w:id="24" w:name="_Toc236923021"/>
       <w:r>
         <w:rPr>
           <w:rFonts w:ascii="Montserrat" w:hAnsi="Montserrat"/>
@@ -11681,16 +11714,16 @@
         </w:rPr>
         <w:lastRenderedPageBreak/>
         <w:drawing>
-          <wp:inline distT="0" distB="0" distL="0" distR="0" wp14:anchorId="27AE23BD" wp14:editId="4C30319A">
+          <wp:inline distT="0" distB="0" distL="0" distR="0" wp14:anchorId="4A691923" wp14:editId="2900F262">
             <wp:extent cx="5120640" cy="4627581"/>
             <wp:effectExtent l="19050" t="19050" r="22860" b="20955"/>
-            <wp:docPr id="1684266874" name="Imagem 24"/>
+            <wp:docPr id="1288411292" name="Imagem 24"/>
             <wp:cNvGraphicFramePr/>
             <a:graphic xmlns:a="http://schemas.openxmlformats.org/drawingml/2006/main">
               <a:graphicData uri="http://schemas.openxmlformats.org/drawingml/2006/picture">
                 <pic:pic xmlns:pic="http://schemas.openxmlformats.org/drawingml/2006/picture">
                   <pic:nvPicPr>
-                    <pic:cNvPr id="1684266874" name=""/>
+                    <pic:cNvPr id="1288411292" name=""/>
                     <pic:cNvPicPr/>
                   </pic:nvPicPr>
                   <pic:blipFill>
@@ -11758,16 +11791,16 @@
         </w:rPr>
         <w:lastRenderedPageBreak/>
         <w:drawing>
-          <wp:inline distT="0" distB="0" distL="0" distR="0" wp14:anchorId="6F8A1F61" wp14:editId="09987129">
+          <wp:inline distT="0" distB="0" distL="0" distR="0" wp14:anchorId="005FDBA7" wp14:editId="09337CE9">
             <wp:extent cx="5120640" cy="4627581"/>
             <wp:effectExtent l="19050" t="19050" r="22860" b="20955"/>
-            <wp:docPr id="2140384373" name="Imagem 25"/>
+            <wp:docPr id="92424518" name="Imagem 25"/>
             <wp:cNvGraphicFramePr/>
             <a:graphic xmlns:a="http://schemas.openxmlformats.org/drawingml/2006/main">
               <a:graphicData uri="http://schemas.openxmlformats.org/drawingml/2006/picture">
                 <pic:pic xmlns:pic="http://schemas.openxmlformats.org/drawingml/2006/picture">
                   <pic:nvPicPr>
-                    <pic:cNvPr id="2140384373" name=""/>
+                    <pic:cNvPr id="92424518" name=""/>
                     <pic:cNvPicPr/>
                   </pic:nvPicPr>
                   <pic:blipFill>
@@ -11901,7 +11934,7 @@
           <w:sz w:val="27"/>
         </w:rPr>
       </w:pPr>
-      <w:bookmarkStart w:id="25" w:name="_Toc236755257"/>
+      <w:bookmarkStart w:id="25" w:name="_Toc236923022"/>
       <w:r>
         <w:rPr>
           <w:rFonts w:ascii="Montserrat" w:hAnsi="Montserrat"/>
@@ -11942,16 +11975,16 @@
         </w:rPr>
         <w:lastRenderedPageBreak/>
         <w:drawing>
-          <wp:inline distT="0" distB="0" distL="0" distR="0" wp14:anchorId="74FE77D4" wp14:editId="09A3A908">
+          <wp:inline distT="0" distB="0" distL="0" distR="0" wp14:anchorId="4968D9DA" wp14:editId="3846EE40">
             <wp:extent cx="5120640" cy="4627581"/>
             <wp:effectExtent l="19050" t="19050" r="22860" b="20955"/>
-            <wp:docPr id="1623827336" name="Imagem 26"/>
+            <wp:docPr id="564076423" name="Imagem 26"/>
             <wp:cNvGraphicFramePr/>
             <a:graphic xmlns:a="http://schemas.openxmlformats.org/drawingml/2006/main">
               <a:graphicData uri="http://schemas.openxmlformats.org/drawingml/2006/picture">
                 <pic:pic xmlns:pic="http://schemas.openxmlformats.org/drawingml/2006/picture">
                   <pic:nvPicPr>
-                    <pic:cNvPr id="1623827336" name=""/>
+                    <pic:cNvPr id="564076423" name=""/>
                     <pic:cNvPicPr/>
                   </pic:nvPicPr>
                   <pic:blipFill>
@@ -12041,7 +12074,7 @@
           <w:sz w:val="34"/>
         </w:rPr>
       </w:pPr>
-      <w:bookmarkStart w:id="26" w:name="_Toc236755258"/>
+      <w:bookmarkStart w:id="26" w:name="_Toc236923023"/>
       <w:r>
         <w:rPr>
           <w:rFonts w:ascii="Montserrat" w:hAnsi="Montserrat"/>
@@ -12083,7 +12116,7 @@
           <w:sz w:val="27"/>
         </w:rPr>
       </w:pPr>
-      <w:bookmarkStart w:id="27" w:name="_Toc236755259"/>
+      <w:bookmarkStart w:id="27" w:name="_Toc236923024"/>
       <w:r>
         <w:rPr>
           <w:rFonts w:ascii="Montserrat" w:hAnsi="Montserrat"/>
@@ -12123,16 +12156,16 @@
           <w:noProof/>
         </w:rPr>
         <w:drawing>
-          <wp:inline distT="0" distB="0" distL="0" distR="0" wp14:anchorId="6DBAC3EC" wp14:editId="2631ED6E">
+          <wp:inline distT="0" distB="0" distL="0" distR="0" wp14:anchorId="6D7397D3" wp14:editId="25C3FC09">
             <wp:extent cx="5120640" cy="4627581"/>
             <wp:effectExtent l="19050" t="19050" r="22860" b="20955"/>
-            <wp:docPr id="19130386" name="Imagem 27"/>
+            <wp:docPr id="569341560" name="Imagem 27"/>
             <wp:cNvGraphicFramePr/>
             <a:graphic xmlns:a="http://schemas.openxmlformats.org/drawingml/2006/main">
               <a:graphicData uri="http://schemas.openxmlformats.org/drawingml/2006/picture">
                 <pic:pic xmlns:pic="http://schemas.openxmlformats.org/drawingml/2006/picture">
                   <pic:nvPicPr>
-                    <pic:cNvPr id="19130386" name=""/>
+                    <pic:cNvPr id="569341560" name=""/>
                     <pic:cNvPicPr/>
                   </pic:nvPicPr>
                   <pic:blipFill>
@@ -12200,16 +12233,16 @@
         </w:rPr>
         <w:lastRenderedPageBreak/>
         <w:drawing>
-          <wp:inline distT="0" distB="0" distL="0" distR="0" wp14:anchorId="3ED8CEAE" wp14:editId="7A2D2E81">
+          <wp:inline distT="0" distB="0" distL="0" distR="0" wp14:anchorId="70ABA43A" wp14:editId="22A6AEAB">
             <wp:extent cx="5120640" cy="4627581"/>
             <wp:effectExtent l="19050" t="19050" r="22860" b="20955"/>
-            <wp:docPr id="713515033" name="Imagem 28"/>
+            <wp:docPr id="1961392881" name="Imagem 28"/>
             <wp:cNvGraphicFramePr/>
             <a:graphic xmlns:a="http://schemas.openxmlformats.org/drawingml/2006/main">
               <a:graphicData uri="http://schemas.openxmlformats.org/drawingml/2006/picture">
                 <pic:pic xmlns:pic="http://schemas.openxmlformats.org/drawingml/2006/picture">
                   <pic:nvPicPr>
-                    <pic:cNvPr id="713515033" name=""/>
+                    <pic:cNvPr id="1961392881" name=""/>
                     <pic:cNvPicPr/>
                   </pic:nvPicPr>
                   <pic:blipFill>
@@ -12277,16 +12310,16 @@
         </w:rPr>
         <w:lastRenderedPageBreak/>
         <w:drawing>
-          <wp:inline distT="0" distB="0" distL="0" distR="0" wp14:anchorId="33382343" wp14:editId="218B2851">
+          <wp:inline distT="0" distB="0" distL="0" distR="0" wp14:anchorId="082757A4" wp14:editId="042AE7E4">
             <wp:extent cx="5120640" cy="4627581"/>
             <wp:effectExtent l="19050" t="19050" r="22860" b="20955"/>
-            <wp:docPr id="504263831" name="Imagem 29"/>
+            <wp:docPr id="8475255" name="Imagem 29"/>
             <wp:cNvGraphicFramePr/>
             <a:graphic xmlns:a="http://schemas.openxmlformats.org/drawingml/2006/main">
               <a:graphicData uri="http://schemas.openxmlformats.org/drawingml/2006/picture">
                 <pic:pic xmlns:pic="http://schemas.openxmlformats.org/drawingml/2006/picture">
                   <pic:nvPicPr>
-                    <pic:cNvPr id="504263831" name=""/>
+                    <pic:cNvPr id="8475255" name=""/>
                     <pic:cNvPicPr/>
                   </pic:nvPicPr>
                   <pic:blipFill>
@@ -12423,16 +12456,16 @@
         </w:rPr>
         <w:lastRenderedPageBreak/>
         <w:drawing>
-          <wp:inline distT="0" distB="0" distL="0" distR="0" wp14:anchorId="23383132" wp14:editId="365E0865">
+          <wp:inline distT="0" distB="0" distL="0" distR="0" wp14:anchorId="727C5CF8" wp14:editId="17DB2408">
             <wp:extent cx="5120640" cy="1715571"/>
             <wp:effectExtent l="19050" t="19050" r="22860" b="18415"/>
-            <wp:docPr id="408894492" name="Imagem 30"/>
+            <wp:docPr id="1418037065" name="Imagem 30"/>
             <wp:cNvGraphicFramePr/>
             <a:graphic xmlns:a="http://schemas.openxmlformats.org/drawingml/2006/main">
               <a:graphicData uri="http://schemas.openxmlformats.org/drawingml/2006/picture">
                 <pic:pic xmlns:pic="http://schemas.openxmlformats.org/drawingml/2006/picture">
                   <pic:nvPicPr>
-                    <pic:cNvPr id="408894492" name=""/>
+                    <pic:cNvPr id="1418037065" name=""/>
                     <pic:cNvPicPr/>
                   </pic:nvPicPr>
                   <pic:blipFill>
@@ -12569,16 +12602,16 @@
         </w:rPr>
         <w:lastRenderedPageBreak/>
         <w:drawing>
-          <wp:inline distT="0" distB="0" distL="0" distR="0" wp14:anchorId="67F73288" wp14:editId="3ED0CAE2">
+          <wp:inline distT="0" distB="0" distL="0" distR="0" wp14:anchorId="1E30513E" wp14:editId="44B1B9A7">
             <wp:extent cx="5120640" cy="3282818"/>
             <wp:effectExtent l="19050" t="19050" r="22860" b="13335"/>
-            <wp:docPr id="132600627" name="Imagem 31"/>
+            <wp:docPr id="2113745998" name="Imagem 31"/>
             <wp:cNvGraphicFramePr/>
             <a:graphic xmlns:a="http://schemas.openxmlformats.org/drawingml/2006/main">
               <a:graphicData uri="http://schemas.openxmlformats.org/drawingml/2006/picture">
                 <pic:pic xmlns:pic="http://schemas.openxmlformats.org/drawingml/2006/picture">
                   <pic:nvPicPr>
-                    <pic:cNvPr id="132600627" name=""/>
+                    <pic:cNvPr id="2113745998" name=""/>
                     <pic:cNvPicPr/>
                   </pic:nvPicPr>
                   <pic:blipFill>
@@ -12690,16 +12723,16 @@
           <w:noProof/>
         </w:rPr>
         <w:drawing>
-          <wp:inline distT="0" distB="0" distL="0" distR="0" wp14:anchorId="477EAF7A" wp14:editId="7BB1C674">
+          <wp:inline distT="0" distB="0" distL="0" distR="0" wp14:anchorId="3F2D26E4" wp14:editId="2ABC2B6A">
             <wp:extent cx="5120640" cy="1515102"/>
             <wp:effectExtent l="19050" t="19050" r="22860" b="28575"/>
-            <wp:docPr id="1240838460" name="Imagem 32"/>
+            <wp:docPr id="30382576" name="Imagem 32"/>
             <wp:cNvGraphicFramePr/>
             <a:graphic xmlns:a="http://schemas.openxmlformats.org/drawingml/2006/main">
               <a:graphicData uri="http://schemas.openxmlformats.org/drawingml/2006/picture">
                 <pic:pic xmlns:pic="http://schemas.openxmlformats.org/drawingml/2006/picture">
                   <pic:nvPicPr>
-                    <pic:cNvPr id="1240838460" name=""/>
+                    <pic:cNvPr id="30382576" name=""/>
                     <pic:cNvPicPr/>
                   </pic:nvPicPr>
                   <pic:blipFill>
@@ -12812,16 +12845,16 @@
           <w:noProof/>
         </w:rPr>
         <w:drawing>
-          <wp:inline distT="0" distB="0" distL="0" distR="0" wp14:anchorId="7CFD3598" wp14:editId="15ECF61D">
+          <wp:inline distT="0" distB="0" distL="0" distR="0" wp14:anchorId="66DD2127" wp14:editId="61182244">
             <wp:extent cx="5120640" cy="1391113"/>
             <wp:effectExtent l="19050" t="19050" r="22860" b="19050"/>
-            <wp:docPr id="1560750837" name="Imagem 33"/>
+            <wp:docPr id="519179682" name="Imagem 33"/>
             <wp:cNvGraphicFramePr/>
             <a:graphic xmlns:a="http://schemas.openxmlformats.org/drawingml/2006/main">
               <a:graphicData uri="http://schemas.openxmlformats.org/drawingml/2006/picture">
                 <pic:pic xmlns:pic="http://schemas.openxmlformats.org/drawingml/2006/picture">
                   <pic:nvPicPr>
-                    <pic:cNvPr id="1560750837" name=""/>
+                    <pic:cNvPr id="519179682" name=""/>
                     <pic:cNvPicPr/>
                   </pic:nvPicPr>
                   <pic:blipFill>
@@ -12933,16 +12966,16 @@
           <w:noProof/>
         </w:rPr>
         <w:drawing>
-          <wp:inline distT="0" distB="0" distL="0" distR="0" wp14:anchorId="4857AC3E" wp14:editId="5B3FEAF8">
+          <wp:inline distT="0" distB="0" distL="0" distR="0" wp14:anchorId="13AC5E86" wp14:editId="36A9B9DF">
             <wp:extent cx="5120640" cy="1125174"/>
             <wp:effectExtent l="19050" t="19050" r="22860" b="18415"/>
-            <wp:docPr id="2118743633" name="Imagem 34"/>
+            <wp:docPr id="2084194871" name="Imagem 34"/>
             <wp:cNvGraphicFramePr/>
             <a:graphic xmlns:a="http://schemas.openxmlformats.org/drawingml/2006/main">
               <a:graphicData uri="http://schemas.openxmlformats.org/drawingml/2006/picture">
                 <pic:pic xmlns:pic="http://schemas.openxmlformats.org/drawingml/2006/picture">
                   <pic:nvPicPr>
-                    <pic:cNvPr id="2118743633" name=""/>
+                    <pic:cNvPr id="2084194871" name=""/>
                     <pic:cNvPicPr/>
                   </pic:nvPicPr>
                   <pic:blipFill>
@@ -13032,7 +13065,7 @@
           <w:sz w:val="27"/>
         </w:rPr>
       </w:pPr>
-      <w:bookmarkStart w:id="28" w:name="_Toc236755260"/>
+      <w:bookmarkStart w:id="28" w:name="_Toc236923025"/>
       <w:r>
         <w:rPr>
           <w:rFonts w:ascii="Montserrat" w:hAnsi="Montserrat"/>
@@ -13072,16 +13105,16 @@
           <w:noProof/>
         </w:rPr>
         <w:drawing>
-          <wp:inline distT="0" distB="0" distL="0" distR="0" wp14:anchorId="00F35FE1" wp14:editId="168AB9FE">
+          <wp:inline distT="0" distB="0" distL="0" distR="0" wp14:anchorId="3D54E5A7" wp14:editId="47DB04C5">
             <wp:extent cx="5120640" cy="4627581"/>
             <wp:effectExtent l="19050" t="19050" r="22860" b="20955"/>
-            <wp:docPr id="1488977639" name="Imagem 35"/>
+            <wp:docPr id="334124001" name="Imagem 35"/>
             <wp:cNvGraphicFramePr/>
             <a:graphic xmlns:a="http://schemas.openxmlformats.org/drawingml/2006/main">
               <a:graphicData uri="http://schemas.openxmlformats.org/drawingml/2006/picture">
                 <pic:pic xmlns:pic="http://schemas.openxmlformats.org/drawingml/2006/picture">
                   <pic:nvPicPr>
-                    <pic:cNvPr id="1488977639" name=""/>
+                    <pic:cNvPr id="334124001" name=""/>
                     <pic:cNvPicPr/>
                   </pic:nvPicPr>
                   <pic:blipFill>
@@ -13149,16 +13182,16 @@
         </w:rPr>
         <w:lastRenderedPageBreak/>
         <w:drawing>
-          <wp:inline distT="0" distB="0" distL="0" distR="0" wp14:anchorId="49661BED" wp14:editId="15EB21EC">
+          <wp:inline distT="0" distB="0" distL="0" distR="0" wp14:anchorId="2F0849DD" wp14:editId="7735DDFC">
             <wp:extent cx="5120640" cy="4627581"/>
             <wp:effectExtent l="19050" t="19050" r="22860" b="20955"/>
-            <wp:docPr id="2139399380" name="Imagem 36"/>
+            <wp:docPr id="388399663" name="Imagem 36"/>
             <wp:cNvGraphicFramePr/>
             <a:graphic xmlns:a="http://schemas.openxmlformats.org/drawingml/2006/main">
               <a:graphicData uri="http://schemas.openxmlformats.org/drawingml/2006/picture">
                 <pic:pic xmlns:pic="http://schemas.openxmlformats.org/drawingml/2006/picture">
                   <pic:nvPicPr>
-                    <pic:cNvPr id="2139399380" name=""/>
+                    <pic:cNvPr id="388399663" name=""/>
                     <pic:cNvPicPr/>
                   </pic:nvPicPr>
                   <pic:blipFill>
@@ -13295,16 +13328,16 @@
         </w:rPr>
         <w:lastRenderedPageBreak/>
         <w:drawing>
-          <wp:inline distT="0" distB="0" distL="0" distR="0" wp14:anchorId="15EDD9D4" wp14:editId="4B574F72">
+          <wp:inline distT="0" distB="0" distL="0" distR="0" wp14:anchorId="4AE668FF" wp14:editId="06C0EAE5">
             <wp:extent cx="5120640" cy="2144319"/>
             <wp:effectExtent l="19050" t="19050" r="22860" b="27940"/>
-            <wp:docPr id="515996753" name="Imagem 37"/>
+            <wp:docPr id="2089053169" name="Imagem 37"/>
             <wp:cNvGraphicFramePr/>
             <a:graphic xmlns:a="http://schemas.openxmlformats.org/drawingml/2006/main">
               <a:graphicData uri="http://schemas.openxmlformats.org/drawingml/2006/picture">
                 <pic:pic xmlns:pic="http://schemas.openxmlformats.org/drawingml/2006/picture">
                   <pic:nvPicPr>
-                    <pic:cNvPr id="515996753" name=""/>
+                    <pic:cNvPr id="2089053169" name=""/>
                     <pic:cNvPicPr/>
                   </pic:nvPicPr>
                   <pic:blipFill>
@@ -13392,16 +13425,16 @@
           <w:noProof/>
         </w:rPr>
         <w:drawing>
-          <wp:inline distT="0" distB="0" distL="0" distR="0" wp14:anchorId="31555FDB" wp14:editId="0C2BF800">
+          <wp:inline distT="0" distB="0" distL="0" distR="0" wp14:anchorId="61998D56" wp14:editId="7B254216">
             <wp:extent cx="5120640" cy="1055647"/>
             <wp:effectExtent l="19050" t="19050" r="22860" b="11430"/>
-            <wp:docPr id="2072825888" name="Imagem 38"/>
+            <wp:docPr id="54600226" name="Imagem 38"/>
             <wp:cNvGraphicFramePr/>
             <a:graphic xmlns:a="http://schemas.openxmlformats.org/drawingml/2006/main">
               <a:graphicData uri="http://schemas.openxmlformats.org/drawingml/2006/picture">
                 <pic:pic xmlns:pic="http://schemas.openxmlformats.org/drawingml/2006/picture">
                   <pic:nvPicPr>
-                    <pic:cNvPr id="2072825888" name=""/>
+                    <pic:cNvPr id="54600226" name=""/>
                     <pic:cNvPicPr/>
                   </pic:nvPicPr>
                   <pic:blipFill>
@@ -13514,16 +13547,16 @@
         </w:rPr>
         <w:lastRenderedPageBreak/>
         <w:drawing>
-          <wp:inline distT="0" distB="0" distL="0" distR="0" wp14:anchorId="2545D6E3" wp14:editId="27BFB715">
+          <wp:inline distT="0" distB="0" distL="0" distR="0" wp14:anchorId="2F8981CB" wp14:editId="6779CABA">
             <wp:extent cx="5120640" cy="3282818"/>
             <wp:effectExtent l="19050" t="19050" r="22860" b="13335"/>
-            <wp:docPr id="469200211" name="Imagem 39"/>
+            <wp:docPr id="174589653" name="Imagem 39"/>
             <wp:cNvGraphicFramePr/>
             <a:graphic xmlns:a="http://schemas.openxmlformats.org/drawingml/2006/main">
               <a:graphicData uri="http://schemas.openxmlformats.org/drawingml/2006/picture">
                 <pic:pic xmlns:pic="http://schemas.openxmlformats.org/drawingml/2006/picture">
                   <pic:nvPicPr>
-                    <pic:cNvPr id="469200211" name=""/>
+                    <pic:cNvPr id="174589653" name=""/>
                     <pic:cNvPicPr/>
                   </pic:nvPicPr>
                   <pic:blipFill>
@@ -13656,16 +13689,16 @@
           <w:noProof/>
         </w:rPr>
         <w:drawing>
-          <wp:inline distT="0" distB="0" distL="0" distR="0" wp14:anchorId="609E941F" wp14:editId="312D25E9">
+          <wp:inline distT="0" distB="0" distL="0" distR="0" wp14:anchorId="1CA6EA16" wp14:editId="04BFA02D">
             <wp:extent cx="5120640" cy="1978034"/>
             <wp:effectExtent l="19050" t="19050" r="22860" b="22225"/>
-            <wp:docPr id="186003311" name="Imagem 40"/>
+            <wp:docPr id="994523856" name="Imagem 40"/>
             <wp:cNvGraphicFramePr/>
             <a:graphic xmlns:a="http://schemas.openxmlformats.org/drawingml/2006/main">
               <a:graphicData uri="http://schemas.openxmlformats.org/drawingml/2006/picture">
                 <pic:pic xmlns:pic="http://schemas.openxmlformats.org/drawingml/2006/picture">
                   <pic:nvPicPr>
-                    <pic:cNvPr id="186003311" name=""/>
+                    <pic:cNvPr id="994523856" name=""/>
                     <pic:cNvPicPr/>
                   </pic:nvPicPr>
                   <pic:blipFill>
@@ -13738,7 +13771,7 @@
           <w:sz w:val="34"/>
         </w:rPr>
       </w:pPr>
-      <w:bookmarkStart w:id="29" w:name="_Toc236755261"/>
+      <w:bookmarkStart w:id="29" w:name="_Toc236923026"/>
       <w:r>
         <w:rPr>
           <w:rFonts w:ascii="Montserrat" w:hAnsi="Montserrat"/>
@@ -13798,7 +13831,7 @@
           <w:sz w:val="27"/>
         </w:rPr>
       </w:pPr>
-      <w:bookmarkStart w:id="30" w:name="_Toc236755262"/>
+      <w:bookmarkStart w:id="30" w:name="_Toc236923027"/>
       <w:r>
         <w:rPr>
           <w:rFonts w:ascii="Montserrat" w:hAnsi="Montserrat"/>
@@ -13838,16 +13871,16 @@
           <w:noProof/>
         </w:rPr>
         <w:drawing>
-          <wp:inline distT="0" distB="0" distL="0" distR="0" wp14:anchorId="6973A162" wp14:editId="410F9D33">
+          <wp:inline distT="0" distB="0" distL="0" distR="0" wp14:anchorId="01F77452" wp14:editId="303BBBFD">
             <wp:extent cx="5303520" cy="4792851"/>
             <wp:effectExtent l="19050" t="19050" r="11430" b="27305"/>
-            <wp:docPr id="400443034" name="Imagem 41"/>
+            <wp:docPr id="1397080074" name="Imagem 41"/>
             <wp:cNvGraphicFramePr/>
             <a:graphic xmlns:a="http://schemas.openxmlformats.org/drawingml/2006/main">
               <a:graphicData uri="http://schemas.openxmlformats.org/drawingml/2006/picture">
                 <pic:pic xmlns:pic="http://schemas.openxmlformats.org/drawingml/2006/picture">
                   <pic:nvPicPr>
-                    <pic:cNvPr id="400443034" name=""/>
+                    <pic:cNvPr id="1397080074" name=""/>
                     <pic:cNvPicPr/>
                   </pic:nvPicPr>
                   <pic:blipFill>
@@ -13916,7 +13949,7 @@
           <w:sz w:val="27"/>
         </w:rPr>
       </w:pPr>
-      <w:bookmarkStart w:id="31" w:name="_Toc236755263"/>
+      <w:bookmarkStart w:id="31" w:name="_Toc236923028"/>
       <w:r>
         <w:rPr>
           <w:rFonts w:ascii="Montserrat" w:hAnsi="Montserrat"/>
@@ -13956,16 +13989,16 @@
           <w:noProof/>
         </w:rPr>
         <w:drawing>
-          <wp:inline distT="0" distB="0" distL="0" distR="0" wp14:anchorId="371392B1" wp14:editId="44A03FC1">
+          <wp:inline distT="0" distB="0" distL="0" distR="0" wp14:anchorId="23E2F863" wp14:editId="3A35BB48">
             <wp:extent cx="5303520" cy="4792851"/>
             <wp:effectExtent l="19050" t="19050" r="11430" b="27305"/>
-            <wp:docPr id="1253729113" name="Imagem 42"/>
+            <wp:docPr id="912024814" name="Imagem 42"/>
             <wp:cNvGraphicFramePr/>
             <a:graphic xmlns:a="http://schemas.openxmlformats.org/drawingml/2006/main">
               <a:graphicData uri="http://schemas.openxmlformats.org/drawingml/2006/picture">
                 <pic:pic xmlns:pic="http://schemas.openxmlformats.org/drawingml/2006/picture">
                   <pic:nvPicPr>
-                    <pic:cNvPr id="1253729113" name=""/>
+                    <pic:cNvPr id="912024814" name=""/>
                     <pic:cNvPicPr/>
                   </pic:nvPicPr>
                   <pic:blipFill>
@@ -14033,7 +14066,7 @@
           <w:sz w:val="27"/>
         </w:rPr>
       </w:pPr>
-      <w:bookmarkStart w:id="32" w:name="_Toc236755264"/>
+      <w:bookmarkStart w:id="32" w:name="_Toc236923029"/>
       <w:r>
         <w:rPr>
           <w:rFonts w:ascii="Montserrat" w:hAnsi="Montserrat"/>
@@ -14074,16 +14107,16 @@
         </w:rPr>
         <w:lastRenderedPageBreak/>
         <w:drawing>
-          <wp:inline distT="0" distB="0" distL="0" distR="0" wp14:anchorId="268E290B" wp14:editId="1A7D2562">
+          <wp:inline distT="0" distB="0" distL="0" distR="0" wp14:anchorId="57BAFDF3" wp14:editId="4DEAB8FD">
             <wp:extent cx="5303520" cy="4792851"/>
             <wp:effectExtent l="19050" t="19050" r="11430" b="27305"/>
-            <wp:docPr id="1840192641" name="Imagem 43"/>
+            <wp:docPr id="1023587571" name="Imagem 43"/>
             <wp:cNvGraphicFramePr/>
             <a:graphic xmlns:a="http://schemas.openxmlformats.org/drawingml/2006/main">
               <a:graphicData uri="http://schemas.openxmlformats.org/drawingml/2006/picture">
                 <pic:pic xmlns:pic="http://schemas.openxmlformats.org/drawingml/2006/picture">
                   <pic:nvPicPr>
-                    <pic:cNvPr id="1840192641" name=""/>
+                    <pic:cNvPr id="1023587571" name=""/>
                     <pic:cNvPicPr/>
                   </pic:nvPicPr>
                   <pic:blipFill>
@@ -14151,16 +14184,16 @@
         </w:rPr>
         <w:lastRenderedPageBreak/>
         <w:drawing>
-          <wp:inline distT="0" distB="0" distL="0" distR="0" wp14:anchorId="1B788FDE" wp14:editId="0C78C4E6">
+          <wp:inline distT="0" distB="0" distL="0" distR="0" wp14:anchorId="5D025914" wp14:editId="3460D166">
             <wp:extent cx="5303520" cy="4792851"/>
             <wp:effectExtent l="19050" t="19050" r="11430" b="27305"/>
-            <wp:docPr id="1652018062" name="Imagem 44"/>
+            <wp:docPr id="1531424208" name="Imagem 44"/>
             <wp:cNvGraphicFramePr/>
             <a:graphic xmlns:a="http://schemas.openxmlformats.org/drawingml/2006/main">
               <a:graphicData uri="http://schemas.openxmlformats.org/drawingml/2006/picture">
                 <pic:pic xmlns:pic="http://schemas.openxmlformats.org/drawingml/2006/picture">
                   <pic:nvPicPr>
-                    <pic:cNvPr id="1652018062" name=""/>
+                    <pic:cNvPr id="1531424208" name=""/>
                     <pic:cNvPicPr/>
                   </pic:nvPicPr>
                   <pic:blipFill>
@@ -14253,7 +14286,7 @@
           <w:sz w:val="34"/>
         </w:rPr>
       </w:pPr>
-      <w:bookmarkStart w:id="33" w:name="_Toc236755265"/>
+      <w:bookmarkStart w:id="33" w:name="_Toc236923030"/>
       <w:r>
         <w:rPr>
           <w:rFonts w:ascii="Montserrat" w:hAnsi="Montserrat"/>
@@ -14295,7 +14328,7 @@
           <w:sz w:val="27"/>
         </w:rPr>
       </w:pPr>
-      <w:bookmarkStart w:id="34" w:name="_Toc236755266"/>
+      <w:bookmarkStart w:id="34" w:name="_Toc236923031"/>
       <w:r>
         <w:rPr>
           <w:rFonts w:ascii="Montserrat" w:hAnsi="Montserrat"/>
@@ -14335,16 +14368,16 @@
           <w:noProof/>
         </w:rPr>
         <w:drawing>
-          <wp:inline distT="0" distB="0" distL="0" distR="0" wp14:anchorId="431CDA23" wp14:editId="7EB4E7E9">
+          <wp:inline distT="0" distB="0" distL="0" distR="0" wp14:anchorId="733EF4B8" wp14:editId="6256D526">
             <wp:extent cx="5303520" cy="4792851"/>
             <wp:effectExtent l="19050" t="19050" r="11430" b="27305"/>
-            <wp:docPr id="1807283137" name="Imagem 45"/>
+            <wp:docPr id="1585202713" name="Imagem 45"/>
             <wp:cNvGraphicFramePr/>
             <a:graphic xmlns:a="http://schemas.openxmlformats.org/drawingml/2006/main">
               <a:graphicData uri="http://schemas.openxmlformats.org/drawingml/2006/picture">
                 <pic:pic xmlns:pic="http://schemas.openxmlformats.org/drawingml/2006/picture">
                   <pic:nvPicPr>
-                    <pic:cNvPr id="1807283137" name=""/>
+                    <pic:cNvPr id="1585202713" name=""/>
                     <pic:cNvPicPr/>
                   </pic:nvPicPr>
                   <pic:blipFill>
@@ -14412,7 +14445,7 @@
           <w:sz w:val="27"/>
         </w:rPr>
       </w:pPr>
-      <w:bookmarkStart w:id="35" w:name="_Toc236755267"/>
+      <w:bookmarkStart w:id="35" w:name="_Toc236923032"/>
       <w:r>
         <w:rPr>
           <w:rFonts w:ascii="Montserrat" w:hAnsi="Montserrat"/>
@@ -14453,16 +14486,16 @@
           <w:noProof/>
         </w:rPr>
         <w:drawing>
-          <wp:inline distT="0" distB="0" distL="0" distR="0" wp14:anchorId="49BBBD94" wp14:editId="27003ACC">
+          <wp:inline distT="0" distB="0" distL="0" distR="0" wp14:anchorId="700E4B30" wp14:editId="7B1CA0CB">
             <wp:extent cx="5303520" cy="4792851"/>
             <wp:effectExtent l="19050" t="19050" r="11430" b="27305"/>
-            <wp:docPr id="870950388" name="Imagem 46"/>
+            <wp:docPr id="1931557355" name="Imagem 46"/>
             <wp:cNvGraphicFramePr/>
             <a:graphic xmlns:a="http://schemas.openxmlformats.org/drawingml/2006/main">
               <a:graphicData uri="http://schemas.openxmlformats.org/drawingml/2006/picture">
                 <pic:pic xmlns:pic="http://schemas.openxmlformats.org/drawingml/2006/picture">
                   <pic:nvPicPr>
-                    <pic:cNvPr id="870950388" name=""/>
+                    <pic:cNvPr id="1931557355" name=""/>
                     <pic:cNvPicPr/>
                   </pic:nvPicPr>
                   <pic:blipFill>
@@ -14530,7 +14563,7 @@
           <w:sz w:val="27"/>
         </w:rPr>
       </w:pPr>
-      <w:bookmarkStart w:id="36" w:name="_Toc236755268"/>
+      <w:bookmarkStart w:id="36" w:name="_Toc236923033"/>
       <w:r>
         <w:rPr>
           <w:rFonts w:ascii="Montserrat" w:hAnsi="Montserrat"/>
@@ -14571,16 +14604,16 @@
         </w:rPr>
         <w:lastRenderedPageBreak/>
         <w:drawing>
-          <wp:inline distT="0" distB="0" distL="0" distR="0" wp14:anchorId="7F5BBD51" wp14:editId="22C46C11">
+          <wp:inline distT="0" distB="0" distL="0" distR="0" wp14:anchorId="7AF8134D" wp14:editId="03845105">
             <wp:extent cx="5303520" cy="4792851"/>
             <wp:effectExtent l="19050" t="19050" r="11430" b="27305"/>
-            <wp:docPr id="1924843684" name="Imagem 47"/>
+            <wp:docPr id="2103614788" name="Imagem 47"/>
             <wp:cNvGraphicFramePr/>
             <a:graphic xmlns:a="http://schemas.openxmlformats.org/drawingml/2006/main">
               <a:graphicData uri="http://schemas.openxmlformats.org/drawingml/2006/picture">
                 <pic:pic xmlns:pic="http://schemas.openxmlformats.org/drawingml/2006/picture">
                   <pic:nvPicPr>
-                    <pic:cNvPr id="1924843684" name=""/>
+                    <pic:cNvPr id="2103614788" name=""/>
                     <pic:cNvPicPr/>
                   </pic:nvPicPr>
                   <pic:blipFill>
@@ -14648,7 +14681,7 @@
           <w:sz w:val="27"/>
         </w:rPr>
       </w:pPr>
-      <w:bookmarkStart w:id="37" w:name="_Toc236755269"/>
+      <w:bookmarkStart w:id="37" w:name="_Toc236923034"/>
       <w:r>
         <w:rPr>
           <w:rFonts w:ascii="Montserrat" w:hAnsi="Montserrat"/>
@@ -14793,16 +14826,16 @@
           <w:noProof/>
         </w:rPr>
         <w:drawing>
-          <wp:inline distT="0" distB="0" distL="0" distR="0" wp14:anchorId="2E4CF06B" wp14:editId="7F7E4FBF">
+          <wp:inline distT="0" distB="0" distL="0" distR="0" wp14:anchorId="72F60B89" wp14:editId="27ED47D1">
             <wp:extent cx="5303520" cy="4267180"/>
             <wp:effectExtent l="19050" t="19050" r="11430" b="19685"/>
-            <wp:docPr id="1062881747" name="Imagem 48"/>
+            <wp:docPr id="165357508" name="Imagem 48"/>
             <wp:cNvGraphicFramePr/>
             <a:graphic xmlns:a="http://schemas.openxmlformats.org/drawingml/2006/main">
               <a:graphicData uri="http://schemas.openxmlformats.org/drawingml/2006/picture">
                 <pic:pic xmlns:pic="http://schemas.openxmlformats.org/drawingml/2006/picture">
                   <pic:nvPicPr>
-                    <pic:cNvPr id="1062881747" name=""/>
+                    <pic:cNvPr id="165357508" name=""/>
                     <pic:cNvPicPr/>
                   </pic:nvPicPr>
                   <pic:blipFill>
@@ -14870,16 +14903,16 @@
         </w:rPr>
         <w:lastRenderedPageBreak/>
         <w:drawing>
-          <wp:inline distT="0" distB="0" distL="0" distR="0" wp14:anchorId="21562566" wp14:editId="6C1A5AB9">
+          <wp:inline distT="0" distB="0" distL="0" distR="0" wp14:anchorId="25F9002C" wp14:editId="0A3184E3">
             <wp:extent cx="5303520" cy="3962338"/>
             <wp:effectExtent l="19050" t="19050" r="11430" b="19685"/>
-            <wp:docPr id="1569867397" name="Imagem 49"/>
+            <wp:docPr id="576386447" name="Imagem 49"/>
             <wp:cNvGraphicFramePr/>
             <a:graphic xmlns:a="http://schemas.openxmlformats.org/drawingml/2006/main">
               <a:graphicData uri="http://schemas.openxmlformats.org/drawingml/2006/picture">
                 <pic:pic xmlns:pic="http://schemas.openxmlformats.org/drawingml/2006/picture">
                   <pic:nvPicPr>
-                    <pic:cNvPr id="1569867397" name=""/>
+                    <pic:cNvPr id="576386447" name=""/>
                     <pic:cNvPicPr/>
                   </pic:nvPicPr>
                   <pic:blipFill>
@@ -14972,7 +15005,7 @@
           <w:sz w:val="34"/>
         </w:rPr>
       </w:pPr>
-      <w:bookmarkStart w:id="38" w:name="_Toc236755270"/>
+      <w:bookmarkStart w:id="38" w:name="_Toc236923035"/>
       <w:r>
         <w:rPr>
           <w:rFonts w:ascii="Montserrat" w:hAnsi="Montserrat"/>
@@ -15216,7 +15249,7 @@
           <w:sz w:val="34"/>
         </w:rPr>
       </w:pPr>
-      <w:bookmarkStart w:id="39" w:name="_Toc236755271"/>
+      <w:bookmarkStart w:id="39" w:name="_Toc236923036"/>
       <w:r>
         <w:rPr>
           <w:rFonts w:ascii="Montserrat" w:hAnsi="Montserrat"/>
@@ -16926,7 +16959,7 @@
 <file path=word/numbering.xml><?xml version="1.0" encoding="utf-8"?>
 <w:numbering xmlns:wpc="http://schemas.microsoft.com/office/word/2010/wordprocessingCanvas" xmlns:cx="http://schemas.microsoft.com/office/drawing/2014/chartex" xmlns:cx1="http://schemas.microsoft.com/office/drawing/2015/9/8/chartex" xmlns:cx2="http://schemas.microsoft.com/office/drawing/2015/10/21/chartex" xmlns:cx3="http://schemas.microsoft.com/office/drawing/2016/5/9/chartex" xmlns:cx4="http://schemas.microsoft.com/office/drawing/2016/5/10/chartex" xmlns:cx5="http://schemas.microsoft.com/office/drawing/2016/5/11/chartex" xmlns:cx6="http://schemas.microsoft.com/office/drawing/2016/5/12/chartex" xmlns:cx7="http://schemas.microsoft.com/office/drawing/2016/5/13/chartex" xmlns:cx8="http://schemas.microsoft.com/office/drawing/2016/5/14/chartex" xmlns:mc="http://schemas.openxmlformats.org/markup-compatibility/2006" xmlns:aink="http://schemas.microsoft.com/office/drawing/2016/ink" xmlns:am3d="http://schemas.microsoft.com/office/drawing/2017/model3d" xmlns:o="urn:schemas-microsoft-com:office:office" xmlns:oel="http://schemas.microsoft.com/office/2019/extlst" xmlns:r="http://schemas.openxmlformats.org/officeDocument/2006/relationships" xmlns:m="http://schemas.openxmlformats.org/officeDocument/2006/math" xmlns:v="urn:schemas-microsoft-com:vml" xmlns:wp14="http://schemas.microsoft.com/office/word/2010/wordprocessingDrawing" xmlns:wp="http://schemas.openxmlformats.org/drawingml/2006/wordprocessingDrawing" xmlns:w10="urn:schemas-microsoft-com:office:word" xmlns:w="http://schemas.openxmlformats.org/wordprocessingml/2006/main" xmlns:w14="http://schemas.microsoft.com/office/word/2010/wordml" xmlns:w15="http://schemas.microsoft.com/office/word/2012/wordml" xmlns:w16cei="http://schemas.microsoft.com/office/word/2026/wordml/cei" xmlns:w16cex="http://schemas.microsoft.com/office/word/2018/wordml/cex" xmlns:w16cid="http://schemas.microsoft.com/office/word/2016/wordml/cid" xmlns:w16="http://schemas.microsoft.com/office/word/2018/wordml" xmlns:w16du="http://schemas.microsoft.com/office/word/2023/wordml/word16du" xmlns:w16sdtdh="http://schemas.microsoft.com/office/word/2020/wordml/sdtdatahash" xmlns:w16sdtfl="http://schemas.microsoft.com/office/word/2024/wordml/sdtformatlock" xmlns:w16se="http://schemas.microsoft.com/office/word/2015/wordml/symex" xmlns:wpg="http://schemas.microsoft.com/office/word/2010/wordprocessingGroup" xmlns:wpi="http://schemas.microsoft.com/office/word/2010/wordprocessingInk" xmlns:wne="http://schemas.microsoft.com/office/word/2006/wordml" xmlns:wps="http://schemas.microsoft.com/office/word/2010/wordprocessingShape" mc:Ignorable="w14 w15 w16se w16cid w16 w16cex w16sdtdh w16sdtfl w16du wp14">
   <w:abstractNum w:abstractNumId="0" w15:restartNumberingAfterBreak="0">
-    <w:nsid w:val="066E4F8C"/>
+    <w:nsid w:val="08F1251E"/>
     <w:multiLevelType w:val="singleLevel"/>
     <w:tmpl w:val="04160001"/>
     <w:lvl w:ilvl="0">
@@ -16943,7 +16976,7 @@
     </w:lvl>
   </w:abstractNum>
   <w:abstractNum w:abstractNumId="1" w15:restartNumberingAfterBreak="0">
-    <w:nsid w:val="084D2A2A"/>
+    <w:nsid w:val="11DF4B83"/>
     <w:multiLevelType w:val="singleLevel"/>
     <w:tmpl w:val="04160001"/>
     <w:lvl w:ilvl="0">
@@ -16960,7 +16993,7 @@
     </w:lvl>
   </w:abstractNum>
   <w:abstractNum w:abstractNumId="2" w15:restartNumberingAfterBreak="0">
-    <w:nsid w:val="116C1BBE"/>
+    <w:nsid w:val="211D0ACB"/>
     <w:multiLevelType w:val="singleLevel"/>
     <w:tmpl w:val="04160001"/>
     <w:lvl w:ilvl="0">
@@ -16977,7 +17010,7 @@
     </w:lvl>
   </w:abstractNum>
   <w:abstractNum w:abstractNumId="3" w15:restartNumberingAfterBreak="0">
-    <w:nsid w:val="20AF0018"/>
+    <w:nsid w:val="27244CDB"/>
     <w:multiLevelType w:val="singleLevel"/>
     <w:tmpl w:val="04160001"/>
     <w:lvl w:ilvl="0">
@@ -16994,7 +17027,7 @@
     </w:lvl>
   </w:abstractNum>
   <w:abstractNum w:abstractNumId="4" w15:restartNumberingAfterBreak="0">
-    <w:nsid w:val="30463CA3"/>
+    <w:nsid w:val="2DFA15CD"/>
     <w:multiLevelType w:val="singleLevel"/>
     <w:tmpl w:val="04160001"/>
     <w:lvl w:ilvl="0">
@@ -17011,7 +17044,7 @@
     </w:lvl>
   </w:abstractNum>
   <w:abstractNum w:abstractNumId="5" w15:restartNumberingAfterBreak="0">
-    <w:nsid w:val="31FC483A"/>
+    <w:nsid w:val="33C67247"/>
     <w:multiLevelType w:val="singleLevel"/>
     <w:tmpl w:val="04160001"/>
     <w:lvl w:ilvl="0">
@@ -17028,7 +17061,7 @@
     </w:lvl>
   </w:abstractNum>
   <w:abstractNum w:abstractNumId="6" w15:restartNumberingAfterBreak="0">
-    <w:nsid w:val="3D7F7DDC"/>
+    <w:nsid w:val="35BE03B0"/>
     <w:multiLevelType w:val="singleLevel"/>
     <w:tmpl w:val="04160001"/>
     <w:lvl w:ilvl="0">
@@ -17045,7 +17078,7 @@
     </w:lvl>
   </w:abstractNum>
   <w:abstractNum w:abstractNumId="7" w15:restartNumberingAfterBreak="0">
-    <w:nsid w:val="48AC3725"/>
+    <w:nsid w:val="42027980"/>
     <w:multiLevelType w:val="singleLevel"/>
     <w:tmpl w:val="04160001"/>
     <w:lvl w:ilvl="0">
@@ -17062,7 +17095,7 @@
     </w:lvl>
   </w:abstractNum>
   <w:abstractNum w:abstractNumId="8" w15:restartNumberingAfterBreak="0">
-    <w:nsid w:val="4ADA40CF"/>
+    <w:nsid w:val="4A92198A"/>
     <w:multiLevelType w:val="singleLevel"/>
     <w:tmpl w:val="04160001"/>
     <w:lvl w:ilvl="0">
@@ -17079,7 +17112,7 @@
     </w:lvl>
   </w:abstractNum>
   <w:abstractNum w:abstractNumId="9" w15:restartNumberingAfterBreak="0">
-    <w:nsid w:val="53D303FD"/>
+    <w:nsid w:val="4F7D4176"/>
     <w:multiLevelType w:val="singleLevel"/>
     <w:tmpl w:val="04160001"/>
     <w:lvl w:ilvl="0">
@@ -17096,7 +17129,7 @@
     </w:lvl>
   </w:abstractNum>
   <w:abstractNum w:abstractNumId="10" w15:restartNumberingAfterBreak="0">
-    <w:nsid w:val="5A5B1154"/>
+    <w:nsid w:val="54632A26"/>
     <w:multiLevelType w:val="singleLevel"/>
     <w:tmpl w:val="04160001"/>
     <w:lvl w:ilvl="0">
@@ -17113,7 +17146,7 @@
     </w:lvl>
   </w:abstractNum>
   <w:abstractNum w:abstractNumId="11" w15:restartNumberingAfterBreak="0">
-    <w:nsid w:val="5B2F5F16"/>
+    <w:nsid w:val="55363D33"/>
     <w:multiLevelType w:val="singleLevel"/>
     <w:tmpl w:val="04160001"/>
     <w:lvl w:ilvl="0">
@@ -17130,7 +17163,7 @@
     </w:lvl>
   </w:abstractNum>
   <w:abstractNum w:abstractNumId="12" w15:restartNumberingAfterBreak="0">
-    <w:nsid w:val="5D735000"/>
+    <w:nsid w:val="57841C65"/>
     <w:multiLevelType w:val="singleLevel"/>
     <w:tmpl w:val="04160001"/>
     <w:lvl w:ilvl="0">
@@ -17147,7 +17180,7 @@
     </w:lvl>
   </w:abstractNum>
   <w:abstractNum w:abstractNumId="13" w15:restartNumberingAfterBreak="0">
-    <w:nsid w:val="5E995F89"/>
+    <w:nsid w:val="5ECD298A"/>
     <w:multiLevelType w:val="singleLevel"/>
     <w:tmpl w:val="04160001"/>
     <w:lvl w:ilvl="0">
@@ -17164,7 +17197,7 @@
     </w:lvl>
   </w:abstractNum>
   <w:abstractNum w:abstractNumId="14" w15:restartNumberingAfterBreak="0">
-    <w:nsid w:val="6ABE4AF5"/>
+    <w:nsid w:val="76364582"/>
     <w:multiLevelType w:val="singleLevel"/>
     <w:tmpl w:val="04160001"/>
     <w:lvl w:ilvl="0">
@@ -17181,7 +17214,7 @@
     </w:lvl>
   </w:abstractNum>
   <w:abstractNum w:abstractNumId="15" w15:restartNumberingAfterBreak="0">
-    <w:nsid w:val="70484B78"/>
+    <w:nsid w:val="7C4A6D91"/>
     <w:multiLevelType w:val="singleLevel"/>
     <w:tmpl w:val="04160001"/>
     <w:lvl w:ilvl="0">
@@ -17198,7 +17231,7 @@
     </w:lvl>
   </w:abstractNum>
   <w:abstractNum w:abstractNumId="16" w15:restartNumberingAfterBreak="0">
-    <w:nsid w:val="766975B0"/>
+    <w:nsid w:val="7E8F1091"/>
     <w:multiLevelType w:val="singleLevel"/>
     <w:tmpl w:val="04160001"/>
     <w:lvl w:ilvl="0">
@@ -17215,7 +17248,7 @@
     </w:lvl>
   </w:abstractNum>
   <w:abstractNum w:abstractNumId="17" w15:restartNumberingAfterBreak="0">
-    <w:nsid w:val="7BAC4804"/>
+    <w:nsid w:val="7F250797"/>
     <w:multiLevelType w:val="singleLevel"/>
     <w:tmpl w:val="04160001"/>
     <w:lvl w:ilvl="0">
@@ -17231,59 +17264,59 @@
       </w:rPr>
     </w:lvl>
   </w:abstractNum>
-  <w:num w:numId="1" w16cid:durableId="383067080">
+  <w:num w:numId="1" w16cid:durableId="1855268338">
+    <w:abstractNumId w:val="15"/>
+  </w:num>
+  <w:num w:numId="2" w16cid:durableId="1816333939">
+    <w:abstractNumId w:val="16"/>
+  </w:num>
+  <w:num w:numId="3" w16cid:durableId="1155494678">
+    <w:abstractNumId w:val="12"/>
+  </w:num>
+  <w:num w:numId="4" w16cid:durableId="1946501126">
+    <w:abstractNumId w:val="14"/>
+  </w:num>
+  <w:num w:numId="5" w16cid:durableId="328674585">
+    <w:abstractNumId w:val="11"/>
+  </w:num>
+  <w:num w:numId="6" w16cid:durableId="491331033">
+    <w:abstractNumId w:val="7"/>
+  </w:num>
+  <w:num w:numId="7" w16cid:durableId="1910379551">
+    <w:abstractNumId w:val="4"/>
+  </w:num>
+  <w:num w:numId="8" w16cid:durableId="255023011">
+    <w:abstractNumId w:val="10"/>
+  </w:num>
+  <w:num w:numId="9" w16cid:durableId="1200439023">
+    <w:abstractNumId w:val="0"/>
+  </w:num>
+  <w:num w:numId="10" w16cid:durableId="505874186">
+    <w:abstractNumId w:val="6"/>
+  </w:num>
+  <w:num w:numId="11" w16cid:durableId="1004013349">
+    <w:abstractNumId w:val="9"/>
+  </w:num>
+  <w:num w:numId="12" w16cid:durableId="1382441880">
+    <w:abstractNumId w:val="1"/>
+  </w:num>
+  <w:num w:numId="13" w16cid:durableId="919674644">
     <w:abstractNumId w:val="17"/>
   </w:num>
-  <w:num w:numId="2" w16cid:durableId="92013621">
+  <w:num w:numId="14" w16cid:durableId="1443960300">
+    <w:abstractNumId w:val="3"/>
+  </w:num>
+  <w:num w:numId="15" w16cid:durableId="172383512">
     <w:abstractNumId w:val="2"/>
   </w:num>
-  <w:num w:numId="3" w16cid:durableId="2115130411">
-    <w:abstractNumId w:val="7"/>
-  </w:num>
-  <w:num w:numId="4" w16cid:durableId="1091587299">
-    <w:abstractNumId w:val="16"/>
-  </w:num>
-  <w:num w:numId="5" w16cid:durableId="2079857726">
-    <w:abstractNumId w:val="6"/>
-  </w:num>
-  <w:num w:numId="6" w16cid:durableId="14889434">
-    <w:abstractNumId w:val="4"/>
-  </w:num>
-  <w:num w:numId="7" w16cid:durableId="545026972">
-    <w:abstractNumId w:val="15"/>
-  </w:num>
-  <w:num w:numId="8" w16cid:durableId="1630240298">
-    <w:abstractNumId w:val="10"/>
-  </w:num>
-  <w:num w:numId="9" w16cid:durableId="1786654360">
-    <w:abstractNumId w:val="8"/>
-  </w:num>
-  <w:num w:numId="10" w16cid:durableId="645823575">
-    <w:abstractNumId w:val="12"/>
-  </w:num>
-  <w:num w:numId="11" w16cid:durableId="1109740285">
-    <w:abstractNumId w:val="1"/>
-  </w:num>
-  <w:num w:numId="12" w16cid:durableId="1683436613">
-    <w:abstractNumId w:val="0"/>
-  </w:num>
-  <w:num w:numId="13" w16cid:durableId="429662540">
-    <w:abstractNumId w:val="3"/>
-  </w:num>
-  <w:num w:numId="14" w16cid:durableId="927541768">
+  <w:num w:numId="16" w16cid:durableId="1443647581">
     <w:abstractNumId w:val="5"/>
   </w:num>
-  <w:num w:numId="15" w16cid:durableId="1320385863">
+  <w:num w:numId="17" w16cid:durableId="578904149">
     <w:abstractNumId w:val="13"/>
   </w:num>
-  <w:num w:numId="16" w16cid:durableId="1541553357">
-    <w:abstractNumId w:val="9"/>
-  </w:num>
-  <w:num w:numId="17" w16cid:durableId="937563382">
-    <w:abstractNumId w:val="11"/>
-  </w:num>
-  <w:num w:numId="18" w16cid:durableId="1238780628">
-    <w:abstractNumId w:val="14"/>
+  <w:num w:numId="18" w16cid:durableId="2051226088">
+    <w:abstractNumId w:val="8"/>
   </w:num>
 </w:numbering>
 </file>
@@ -17696,7 +17729,7 @@
     <w:link w:val="Ttulo1Char"/>
     <w:uiPriority w:val="9"/>
     <w:qFormat/>
-    <w:rsid w:val="009906F7"/>
+    <w:rsid w:val="00A51A5C"/>
     <w:pPr>
       <w:keepNext/>
       <w:keepLines/>
@@ -17718,7 +17751,7 @@
     <w:uiPriority w:val="9"/>
     <w:unhideWhenUsed/>
     <w:qFormat/>
-    <w:rsid w:val="009906F7"/>
+    <w:rsid w:val="00A51A5C"/>
     <w:pPr>
       <w:keepNext/>
       <w:keepLines/>
@@ -17741,7 +17774,7 @@
     <w:semiHidden/>
     <w:unhideWhenUsed/>
     <w:qFormat/>
-    <w:rsid w:val="009906F7"/>
+    <w:rsid w:val="00A51A5C"/>
     <w:pPr>
       <w:keepNext/>
       <w:keepLines/>
@@ -17764,7 +17797,7 @@
     <w:semiHidden/>
     <w:unhideWhenUsed/>
     <w:qFormat/>
-    <w:rsid w:val="009906F7"/>
+    <w:rsid w:val="00A51A5C"/>
     <w:pPr>
       <w:keepNext/>
       <w:keepLines/>
@@ -17787,7 +17820,7 @@
     <w:semiHidden/>
     <w:unhideWhenUsed/>
     <w:qFormat/>
-    <w:rsid w:val="009906F7"/>
+    <w:rsid w:val="00A51A5C"/>
     <w:pPr>
       <w:keepNext/>
       <w:keepLines/>
@@ -17808,7 +17841,7 @@
     <w:semiHidden/>
     <w:unhideWhenUsed/>
     <w:qFormat/>
-    <w:rsid w:val="009906F7"/>
+    <w:rsid w:val="00A51A5C"/>
     <w:pPr>
       <w:keepNext/>
       <w:keepLines/>
@@ -17831,7 +17864,7 @@
     <w:semiHidden/>
     <w:unhideWhenUsed/>
     <w:qFormat/>
-    <w:rsid w:val="009906F7"/>
+    <w:rsid w:val="00A51A5C"/>
     <w:pPr>
       <w:keepNext/>
       <w:keepLines/>
@@ -17852,7 +17885,7 @@
     <w:semiHidden/>
     <w:unhideWhenUsed/>
     <w:qFormat/>
-    <w:rsid w:val="009906F7"/>
+    <w:rsid w:val="00A51A5C"/>
     <w:pPr>
       <w:keepNext/>
       <w:keepLines/>
@@ -17875,7 +17908,7 @@
     <w:semiHidden/>
     <w:unhideWhenUsed/>
     <w:qFormat/>
-    <w:rsid w:val="009906F7"/>
+    <w:rsid w:val="00A51A5C"/>
     <w:pPr>
       <w:keepNext/>
       <w:keepLines/>
@@ -17919,7 +17952,7 @@
     <w:basedOn w:val="Fontepargpadro"/>
     <w:link w:val="Ttulo1"/>
     <w:uiPriority w:val="9"/>
-    <w:rsid w:val="009906F7"/>
+    <w:rsid w:val="00A51A5C"/>
     <w:rPr>
       <w:rFonts w:asciiTheme="majorHAnsi" w:eastAsiaTheme="majorEastAsia" w:hAnsiTheme="majorHAnsi" w:cstheme="majorBidi"/>
       <w:color w:val="0F4761" w:themeColor="accent1" w:themeShade="BF"/>
@@ -17932,7 +17965,7 @@
     <w:basedOn w:val="Fontepargpadro"/>
     <w:link w:val="Ttulo2"/>
     <w:uiPriority w:val="9"/>
-    <w:rsid w:val="009906F7"/>
+    <w:rsid w:val="00A51A5C"/>
     <w:rPr>
       <w:rFonts w:asciiTheme="majorHAnsi" w:eastAsiaTheme="majorEastAsia" w:hAnsiTheme="majorHAnsi" w:cstheme="majorBidi"/>
       <w:color w:val="0F4761" w:themeColor="accent1" w:themeShade="BF"/>
@@ -17946,7 +17979,7 @@
     <w:link w:val="Ttulo3"/>
     <w:uiPriority w:val="9"/>
     <w:semiHidden/>
-    <w:rsid w:val="009906F7"/>
+    <w:rsid w:val="00A51A5C"/>
     <w:rPr>
       <w:rFonts w:eastAsiaTheme="majorEastAsia" w:cstheme="majorBidi"/>
       <w:color w:val="0F4761" w:themeColor="accent1" w:themeShade="BF"/>
@@ -17960,7 +17993,7 @@
     <w:link w:val="Ttulo4"/>
     <w:uiPriority w:val="9"/>
     <w:semiHidden/>
-    <w:rsid w:val="009906F7"/>
+    <w:rsid w:val="00A51A5C"/>
     <w:rPr>
       <w:rFonts w:eastAsiaTheme="majorEastAsia" w:cstheme="majorBidi"/>
       <w:i/>
@@ -17974,7 +18007,7 @@
     <w:link w:val="Ttulo5"/>
     <w:uiPriority w:val="9"/>
     <w:semiHidden/>
-    <w:rsid w:val="009906F7"/>
+    <w:rsid w:val="00A51A5C"/>
     <w:rPr>
       <w:rFonts w:eastAsiaTheme="majorEastAsia" w:cstheme="majorBidi"/>
       <w:color w:val="0F4761" w:themeColor="accent1" w:themeShade="BF"/>
@@ -17986,7 +18019,7 @@
     <w:link w:val="Ttulo6"/>
     <w:uiPriority w:val="9"/>
     <w:semiHidden/>
-    <w:rsid w:val="009906F7"/>
+    <w:rsid w:val="00A51A5C"/>
     <w:rPr>
       <w:rFonts w:eastAsiaTheme="majorEastAsia" w:cstheme="majorBidi"/>
       <w:i/>
@@ -18000,7 +18033,7 @@
     <w:link w:val="Ttulo7"/>
     <w:uiPriority w:val="9"/>
     <w:semiHidden/>
-    <w:rsid w:val="009906F7"/>
+    <w:rsid w:val="00A51A5C"/>
     <w:rPr>
       <w:rFonts w:eastAsiaTheme="majorEastAsia" w:cstheme="majorBidi"/>
       <w:color w:val="595959" w:themeColor="text1" w:themeTint="A6"/>
@@ -18012,7 +18045,7 @@
     <w:link w:val="Ttulo8"/>
     <w:uiPriority w:val="9"/>
     <w:semiHidden/>
-    <w:rsid w:val="009906F7"/>
+    <w:rsid w:val="00A51A5C"/>
     <w:rPr>
       <w:rFonts w:eastAsiaTheme="majorEastAsia" w:cstheme="majorBidi"/>
       <w:i/>
@@ -18026,7 +18059,7 @@
     <w:link w:val="Ttulo9"/>
     <w:uiPriority w:val="9"/>
     <w:semiHidden/>
-    <w:rsid w:val="009906F7"/>
+    <w:rsid w:val="00A51A5C"/>
     <w:rPr>
       <w:rFonts w:eastAsiaTheme="majorEastAsia" w:cstheme="majorBidi"/>
       <w:color w:val="272727" w:themeColor="text1" w:themeTint="D8"/>
@@ -18039,7 +18072,7 @@
     <w:link w:val="TtuloChar"/>
     <w:uiPriority w:val="10"/>
     <w:qFormat/>
-    <w:rsid w:val="009906F7"/>
+    <w:rsid w:val="00A51A5C"/>
     <w:pPr>
       <w:spacing w:after="80" w:line="240" w:lineRule="auto"/>
       <w:contextualSpacing/>
@@ -18057,7 +18090,7 @@
     <w:basedOn w:val="Fontepargpadro"/>
     <w:link w:val="Ttulo"/>
     <w:uiPriority w:val="10"/>
-    <w:rsid w:val="009906F7"/>
+    <w:rsid w:val="00A51A5C"/>
     <w:rPr>
       <w:rFonts w:asciiTheme="majorHAnsi" w:eastAsiaTheme="majorEastAsia" w:hAnsiTheme="majorHAnsi" w:cstheme="majorBidi"/>
       <w:spacing w:val="-10"/>
@@ -18073,7 +18106,7 @@
     <w:link w:val="SubttuloChar"/>
     <w:uiPriority w:val="11"/>
     <w:qFormat/>
-    <w:rsid w:val="009906F7"/>
+    <w:rsid w:val="00A51A5C"/>
     <w:pPr>
       <w:numPr>
         <w:ilvl w:val="1"/>
@@ -18092,7 +18125,7 @@
     <w:basedOn w:val="Fontepargpadro"/>
     <w:link w:val="Subttulo"/>
     <w:uiPriority w:val="11"/>
-    <w:rsid w:val="009906F7"/>
+    <w:rsid w:val="00A51A5C"/>
     <w:rPr>
       <w:rFonts w:eastAsiaTheme="majorEastAsia" w:cstheme="majorBidi"/>
       <w:color w:val="595959" w:themeColor="text1" w:themeTint="A6"/>
@@ -18108,7 +18141,7 @@
     <w:link w:val="CitaoChar"/>
     <w:uiPriority w:val="29"/>
     <w:qFormat/>
-    <w:rsid w:val="009906F7"/>
+    <w:rsid w:val="00A51A5C"/>
     <w:pPr>
       <w:spacing w:before="160"/>
       <w:jc w:val="center"/>
@@ -18124,7 +18157,7 @@
     <w:basedOn w:val="Fontepargpadro"/>
     <w:link w:val="Citao"/>
     <w:uiPriority w:val="29"/>
-    <w:rsid w:val="009906F7"/>
+    <w:rsid w:val="00A51A5C"/>
     <w:rPr>
       <w:i/>
       <w:iCs/>
@@ -18136,7 +18169,7 @@
     <w:basedOn w:val="Normal"/>
     <w:uiPriority w:val="34"/>
     <w:qFormat/>
-    <w:rsid w:val="009906F7"/>
+    <w:rsid w:val="00A51A5C"/>
     <w:pPr>
       <w:ind w:left="720"/>
       <w:contextualSpacing/>
@@ -18147,7 +18180,7 @@
     <w:basedOn w:val="Fontepargpadro"/>
     <w:uiPriority w:val="21"/>
     <w:qFormat/>
-    <w:rsid w:val="009906F7"/>
+    <w:rsid w:val="00A51A5C"/>
     <w:rPr>
       <w:i/>
       <w:iCs/>
@@ -18161,7 +18194,7 @@
     <w:link w:val="CitaoIntensaChar"/>
     <w:uiPriority w:val="30"/>
     <w:qFormat/>
-    <w:rsid w:val="009906F7"/>
+    <w:rsid w:val="00A51A5C"/>
     <w:pPr>
       <w:pBdr>
         <w:top w:val="single" w:sz="4" w:space="10" w:color="0F4761" w:themeColor="accent1" w:themeShade="BF"/>
@@ -18182,7 +18215,7 @@
     <w:basedOn w:val="Fontepargpadro"/>
     <w:link w:val="CitaoIntensa"/>
     <w:uiPriority w:val="30"/>
-    <w:rsid w:val="009906F7"/>
+    <w:rsid w:val="00A51A5C"/>
     <w:rPr>
       <w:i/>
       <w:iCs/>
@@ -18194,7 +18227,7 @@
     <w:basedOn w:val="Fontepargpadro"/>
     <w:uiPriority w:val="32"/>
     <w:qFormat/>
-    <w:rsid w:val="009906F7"/>
+    <w:rsid w:val="00A51A5C"/>
     <w:rPr>
       <w:b/>
       <w:bCs/>
@@ -18209,7 +18242,7 @@
     <w:link w:val="CabealhoChar"/>
     <w:uiPriority w:val="99"/>
     <w:unhideWhenUsed/>
-    <w:rsid w:val="009906F7"/>
+    <w:rsid w:val="00A51A5C"/>
     <w:pPr>
       <w:tabs>
         <w:tab w:val="center" w:pos="4252"/>
@@ -18223,7 +18256,7 @@
     <w:basedOn w:val="Fontepargpadro"/>
     <w:link w:val="Cabealho"/>
     <w:uiPriority w:val="99"/>
-    <w:rsid w:val="009906F7"/>
+    <w:rsid w:val="00A51A5C"/>
   </w:style>
   <w:style w:type="paragraph" w:styleId="Rodap">
     <w:name w:val="footer"/>
@@ -18231,7 +18264,7 @@
     <w:link w:val="RodapChar"/>
     <w:uiPriority w:val="99"/>
     <w:unhideWhenUsed/>
-    <w:rsid w:val="009906F7"/>
+    <w:rsid w:val="00A51A5C"/>
     <w:pPr>
       <w:tabs>
         <w:tab w:val="center" w:pos="4252"/>
@@ -18245,7 +18278,7 @@
     <w:basedOn w:val="Fontepargpadro"/>
     <w:link w:val="Rodap"/>
     <w:uiPriority w:val="99"/>
-    <w:rsid w:val="009906F7"/>
+    <w:rsid w:val="00A51A5C"/>
   </w:style>
   <w:style w:type="paragraph" w:styleId="Sumrio1">
     <w:name w:val="toc 1"/>
@@ -18254,7 +18287,7 @@
     <w:autoRedefine/>
     <w:uiPriority w:val="39"/>
     <w:unhideWhenUsed/>
-    <w:rsid w:val="009906F7"/>
+    <w:rsid w:val="00A51A5C"/>
     <w:pPr>
       <w:spacing w:after="100"/>
     </w:pPr>
@@ -18266,7 +18299,7 @@
     <w:autoRedefine/>
     <w:uiPriority w:val="39"/>
     <w:unhideWhenUsed/>
-    <w:rsid w:val="009906F7"/>
+    <w:rsid w:val="00A51A5C"/>
     <w:pPr>
       <w:spacing w:after="100"/>
       <w:ind w:left="240"/>

</xml_diff>

<commit_message>
Adiciona campo Prioridade à Solicitação de Demanda
Novo campo obrigatório (Crítica/Alta/Média/Baixa) que ajuda o Admin a
priorizar a triagem do Gate 1, exibido como selo colorido na lista de
demandas e no detalhe do registro. Manual de Uso (v2.13) e Central de
Ajuda atualizados; cache-busting da Central de Ajuda incrementado para
v=2 em todos os 15 links, já que o conteúdo dela mudou de novo.

Co-Authored-By: Claude Sonnet 5 <noreply@anthropic.com>
</commit_message>
<xml_diff>
--- a/Manual de Uso - Ferramenta de Gestao de Projetos.docx
+++ b/Manual de Uso - Ferramenta de Gestao de Projetos.docx
@@ -129,7 +129,7 @@
           <w:color w:val="6A6A70"/>
           <w:sz w:val="22"/>
         </w:rPr>
-        <w:t>Versao 2.12 - 06 de agosto de 2026 (substitui a versao 2.11 de 04/08/2026)</w:t>
+        <w:t>Versao 2.13 - 06 de agosto de 2026 (substitui a versao 2.12 de 06/08/2026)</w:t>
       </w:r>
     </w:p>
     <w:p>
@@ -229,7 +229,7 @@
         <w:rPr>
           <w:noProof/>
         </w:rPr>
-        <w:instrText xml:space="preserve"> PAGEREF _Toc236922997 \h </w:instrText>
+        <w:instrText xml:space="preserve"> PAGEREF _Toc236924284 \h </w:instrText>
       </w:r>
       <w:r>
         <w:rPr>
@@ -290,7 +290,7 @@
         <w:rPr>
           <w:noProof/>
         </w:rPr>
-        <w:instrText xml:space="preserve"> PAGEREF _Toc236922998 \h </w:instrText>
+        <w:instrText xml:space="preserve"> PAGEREF _Toc236924285 \h </w:instrText>
       </w:r>
       <w:r>
         <w:rPr>
@@ -351,7 +351,7 @@
         <w:rPr>
           <w:noProof/>
         </w:rPr>
-        <w:instrText xml:space="preserve"> PAGEREF _Toc236922999 \h </w:instrText>
+        <w:instrText xml:space="preserve"> PAGEREF _Toc236924286 \h </w:instrText>
       </w:r>
       <w:r>
         <w:rPr>
@@ -412,7 +412,7 @@
         <w:rPr>
           <w:noProof/>
         </w:rPr>
-        <w:instrText xml:space="preserve"> PAGEREF _Toc236923000 \h </w:instrText>
+        <w:instrText xml:space="preserve"> PAGEREF _Toc236924287 \h </w:instrText>
       </w:r>
       <w:r>
         <w:rPr>
@@ -473,7 +473,7 @@
         <w:rPr>
           <w:noProof/>
         </w:rPr>
-        <w:instrText xml:space="preserve"> PAGEREF _Toc236923001 \h </w:instrText>
+        <w:instrText xml:space="preserve"> PAGEREF _Toc236924288 \h </w:instrText>
       </w:r>
       <w:r>
         <w:rPr>
@@ -534,7 +534,7 @@
         <w:rPr>
           <w:noProof/>
         </w:rPr>
-        <w:instrText xml:space="preserve"> PAGEREF _Toc236923002 \h </w:instrText>
+        <w:instrText xml:space="preserve"> PAGEREF _Toc236924289 \h </w:instrText>
       </w:r>
       <w:r>
         <w:rPr>
@@ -595,7 +595,7 @@
         <w:rPr>
           <w:noProof/>
         </w:rPr>
-        <w:instrText xml:space="preserve"> PAGEREF _Toc236923003 \h </w:instrText>
+        <w:instrText xml:space="preserve"> PAGEREF _Toc236924290 \h </w:instrText>
       </w:r>
       <w:r>
         <w:rPr>
@@ -656,7 +656,7 @@
         <w:rPr>
           <w:noProof/>
         </w:rPr>
-        <w:instrText xml:space="preserve"> PAGEREF _Toc236923004 \h </w:instrText>
+        <w:instrText xml:space="preserve"> PAGEREF _Toc236924291 \h </w:instrText>
       </w:r>
       <w:r>
         <w:rPr>
@@ -717,7 +717,7 @@
         <w:rPr>
           <w:noProof/>
         </w:rPr>
-        <w:instrText xml:space="preserve"> PAGEREF _Toc236923005 \h </w:instrText>
+        <w:instrText xml:space="preserve"> PAGEREF _Toc236924292 \h </w:instrText>
       </w:r>
       <w:r>
         <w:rPr>
@@ -778,7 +778,7 @@
         <w:rPr>
           <w:noProof/>
         </w:rPr>
-        <w:instrText xml:space="preserve"> PAGEREF _Toc236923006 \h </w:instrText>
+        <w:instrText xml:space="preserve"> PAGEREF _Toc236924293 \h </w:instrText>
       </w:r>
       <w:r>
         <w:rPr>
@@ -839,7 +839,7 @@
         <w:rPr>
           <w:noProof/>
         </w:rPr>
-        <w:instrText xml:space="preserve"> PAGEREF _Toc236923007 \h </w:instrText>
+        <w:instrText xml:space="preserve"> PAGEREF _Toc236924294 \h </w:instrText>
       </w:r>
       <w:r>
         <w:rPr>
@@ -900,7 +900,7 @@
         <w:rPr>
           <w:noProof/>
         </w:rPr>
-        <w:instrText xml:space="preserve"> PAGEREF _Toc236923008 \h </w:instrText>
+        <w:instrText xml:space="preserve"> PAGEREF _Toc236924295 \h </w:instrText>
       </w:r>
       <w:r>
         <w:rPr>
@@ -961,7 +961,7 @@
         <w:rPr>
           <w:noProof/>
         </w:rPr>
-        <w:instrText xml:space="preserve"> PAGEREF _Toc236923009 \h </w:instrText>
+        <w:instrText xml:space="preserve"> PAGEREF _Toc236924296 \h </w:instrText>
       </w:r>
       <w:r>
         <w:rPr>
@@ -1022,7 +1022,7 @@
         <w:rPr>
           <w:noProof/>
         </w:rPr>
-        <w:instrText xml:space="preserve"> PAGEREF _Toc236923010 \h </w:instrText>
+        <w:instrText xml:space="preserve"> PAGEREF _Toc236924297 \h </w:instrText>
       </w:r>
       <w:r>
         <w:rPr>
@@ -1083,7 +1083,7 @@
         <w:rPr>
           <w:noProof/>
         </w:rPr>
-        <w:instrText xml:space="preserve"> PAGEREF _Toc236923011 \h </w:instrText>
+        <w:instrText xml:space="preserve"> PAGEREF _Toc236924298 \h </w:instrText>
       </w:r>
       <w:r>
         <w:rPr>
@@ -1144,7 +1144,7 @@
         <w:rPr>
           <w:noProof/>
         </w:rPr>
-        <w:instrText xml:space="preserve"> PAGEREF _Toc236923012 \h </w:instrText>
+        <w:instrText xml:space="preserve"> PAGEREF _Toc236924299 \h </w:instrText>
       </w:r>
       <w:r>
         <w:rPr>
@@ -1205,7 +1205,7 @@
         <w:rPr>
           <w:noProof/>
         </w:rPr>
-        <w:instrText xml:space="preserve"> PAGEREF _Toc236923013 \h </w:instrText>
+        <w:instrText xml:space="preserve"> PAGEREF _Toc236924300 \h </w:instrText>
       </w:r>
       <w:r>
         <w:rPr>
@@ -1266,7 +1266,7 @@
         <w:rPr>
           <w:noProof/>
         </w:rPr>
-        <w:instrText xml:space="preserve"> PAGEREF _Toc236923014 \h </w:instrText>
+        <w:instrText xml:space="preserve"> PAGEREF _Toc236924301 \h </w:instrText>
       </w:r>
       <w:r>
         <w:rPr>
@@ -1327,7 +1327,7 @@
         <w:rPr>
           <w:noProof/>
         </w:rPr>
-        <w:instrText xml:space="preserve"> PAGEREF _Toc236923015 \h </w:instrText>
+        <w:instrText xml:space="preserve"> PAGEREF _Toc236924302 \h </w:instrText>
       </w:r>
       <w:r>
         <w:rPr>
@@ -1388,7 +1388,7 @@
         <w:rPr>
           <w:noProof/>
         </w:rPr>
-        <w:instrText xml:space="preserve"> PAGEREF _Toc236923016 \h </w:instrText>
+        <w:instrText xml:space="preserve"> PAGEREF _Toc236924303 \h </w:instrText>
       </w:r>
       <w:r>
         <w:rPr>
@@ -1449,7 +1449,7 @@
         <w:rPr>
           <w:noProof/>
         </w:rPr>
-        <w:instrText xml:space="preserve"> PAGEREF _Toc236923017 \h </w:instrText>
+        <w:instrText xml:space="preserve"> PAGEREF _Toc236924304 \h </w:instrText>
       </w:r>
       <w:r>
         <w:rPr>
@@ -1510,7 +1510,7 @@
         <w:rPr>
           <w:noProof/>
         </w:rPr>
-        <w:instrText xml:space="preserve"> PAGEREF _Toc236923018 \h </w:instrText>
+        <w:instrText xml:space="preserve"> PAGEREF _Toc236924305 \h </w:instrText>
       </w:r>
       <w:r>
         <w:rPr>
@@ -1571,7 +1571,7 @@
         <w:rPr>
           <w:noProof/>
         </w:rPr>
-        <w:instrText xml:space="preserve"> PAGEREF _Toc236923019 \h </w:instrText>
+        <w:instrText xml:space="preserve"> PAGEREF _Toc236924306 \h </w:instrText>
       </w:r>
       <w:r>
         <w:rPr>
@@ -1632,7 +1632,7 @@
         <w:rPr>
           <w:noProof/>
         </w:rPr>
-        <w:instrText xml:space="preserve"> PAGEREF _Toc236923020 \h </w:instrText>
+        <w:instrText xml:space="preserve"> PAGEREF _Toc236924307 \h </w:instrText>
       </w:r>
       <w:r>
         <w:rPr>
@@ -1693,7 +1693,7 @@
         <w:rPr>
           <w:noProof/>
         </w:rPr>
-        <w:instrText xml:space="preserve"> PAGEREF _Toc236923021 \h </w:instrText>
+        <w:instrText xml:space="preserve"> PAGEREF _Toc236924308 \h </w:instrText>
       </w:r>
       <w:r>
         <w:rPr>
@@ -1754,7 +1754,7 @@
         <w:rPr>
           <w:noProof/>
         </w:rPr>
-        <w:instrText xml:space="preserve"> PAGEREF _Toc236923022 \h </w:instrText>
+        <w:instrText xml:space="preserve"> PAGEREF _Toc236924309 \h </w:instrText>
       </w:r>
       <w:r>
         <w:rPr>
@@ -1816,7 +1816,7 @@
         <w:rPr>
           <w:noProof/>
         </w:rPr>
-        <w:instrText xml:space="preserve"> PAGEREF _Toc236923023 \h </w:instrText>
+        <w:instrText xml:space="preserve"> PAGEREF _Toc236924310 \h </w:instrText>
       </w:r>
       <w:r>
         <w:rPr>
@@ -1877,7 +1877,7 @@
         <w:rPr>
           <w:noProof/>
         </w:rPr>
-        <w:instrText xml:space="preserve"> PAGEREF _Toc236923024 \h </w:instrText>
+        <w:instrText xml:space="preserve"> PAGEREF _Toc236924311 \h </w:instrText>
       </w:r>
       <w:r>
         <w:rPr>
@@ -1938,7 +1938,7 @@
         <w:rPr>
           <w:noProof/>
         </w:rPr>
-        <w:instrText xml:space="preserve"> PAGEREF _Toc236923025 \h </w:instrText>
+        <w:instrText xml:space="preserve"> PAGEREF _Toc236924312 \h </w:instrText>
       </w:r>
       <w:r>
         <w:rPr>
@@ -1999,7 +1999,7 @@
         <w:rPr>
           <w:noProof/>
         </w:rPr>
-        <w:instrText xml:space="preserve"> PAGEREF _Toc236923026 \h </w:instrText>
+        <w:instrText xml:space="preserve"> PAGEREF _Toc236924313 \h </w:instrText>
       </w:r>
       <w:r>
         <w:rPr>
@@ -2060,7 +2060,7 @@
         <w:rPr>
           <w:noProof/>
         </w:rPr>
-        <w:instrText xml:space="preserve"> PAGEREF _Toc236923027 \h </w:instrText>
+        <w:instrText xml:space="preserve"> PAGEREF _Toc236924314 \h </w:instrText>
       </w:r>
       <w:r>
         <w:rPr>
@@ -2121,7 +2121,7 @@
         <w:rPr>
           <w:noProof/>
         </w:rPr>
-        <w:instrText xml:space="preserve"> PAGEREF _Toc236923028 \h </w:instrText>
+        <w:instrText xml:space="preserve"> PAGEREF _Toc236924315 \h </w:instrText>
       </w:r>
       <w:r>
         <w:rPr>
@@ -2182,7 +2182,7 @@
         <w:rPr>
           <w:noProof/>
         </w:rPr>
-        <w:instrText xml:space="preserve"> PAGEREF _Toc236923029 \h </w:instrText>
+        <w:instrText xml:space="preserve"> PAGEREF _Toc236924316 \h </w:instrText>
       </w:r>
       <w:r>
         <w:rPr>
@@ -2243,7 +2243,7 @@
         <w:rPr>
           <w:noProof/>
         </w:rPr>
-        <w:instrText xml:space="preserve"> PAGEREF _Toc236923030 \h </w:instrText>
+        <w:instrText xml:space="preserve"> PAGEREF _Toc236924317 \h </w:instrText>
       </w:r>
       <w:r>
         <w:rPr>
@@ -2304,7 +2304,7 @@
         <w:rPr>
           <w:noProof/>
         </w:rPr>
-        <w:instrText xml:space="preserve"> PAGEREF _Toc236923031 \h </w:instrText>
+        <w:instrText xml:space="preserve"> PAGEREF _Toc236924318 \h </w:instrText>
       </w:r>
       <w:r>
         <w:rPr>
@@ -2365,7 +2365,7 @@
         <w:rPr>
           <w:noProof/>
         </w:rPr>
-        <w:instrText xml:space="preserve"> PAGEREF _Toc236923032 \h </w:instrText>
+        <w:instrText xml:space="preserve"> PAGEREF _Toc236924319 \h </w:instrText>
       </w:r>
       <w:r>
         <w:rPr>
@@ -2426,7 +2426,7 @@
         <w:rPr>
           <w:noProof/>
         </w:rPr>
-        <w:instrText xml:space="preserve"> PAGEREF _Toc236923033 \h </w:instrText>
+        <w:instrText xml:space="preserve"> PAGEREF _Toc236924320 \h </w:instrText>
       </w:r>
       <w:r>
         <w:rPr>
@@ -2487,7 +2487,7 @@
         <w:rPr>
           <w:noProof/>
         </w:rPr>
-        <w:instrText xml:space="preserve"> PAGEREF _Toc236923034 \h </w:instrText>
+        <w:instrText xml:space="preserve"> PAGEREF _Toc236924321 \h </w:instrText>
       </w:r>
       <w:r>
         <w:rPr>
@@ -2548,7 +2548,7 @@
         <w:rPr>
           <w:noProof/>
         </w:rPr>
-        <w:instrText xml:space="preserve"> PAGEREF _Toc236923035 \h </w:instrText>
+        <w:instrText xml:space="preserve"> PAGEREF _Toc236924322 \h </w:instrText>
       </w:r>
       <w:r>
         <w:rPr>
@@ -2609,7 +2609,7 @@
         <w:rPr>
           <w:noProof/>
         </w:rPr>
-        <w:instrText xml:space="preserve"> PAGEREF _Toc236923036 \h </w:instrText>
+        <w:instrText xml:space="preserve"> PAGEREF _Toc236924323 \h </w:instrText>
       </w:r>
       <w:r>
         <w:rPr>
@@ -2685,7 +2685,7 @@
           <w:sz w:val="34"/>
         </w:rPr>
       </w:pPr>
-      <w:bookmarkStart w:id="0" w:name="_Toc236922997"/>
+      <w:bookmarkStart w:id="0" w:name="_Toc236924284"/>
       <w:r>
         <w:rPr>
           <w:rFonts w:ascii="Montserrat" w:hAnsi="Montserrat"/>
@@ -2709,7 +2709,7 @@
           <w:sz w:val="27"/>
         </w:rPr>
       </w:pPr>
-      <w:bookmarkStart w:id="1" w:name="_Toc236922998"/>
+      <w:bookmarkStart w:id="1" w:name="_Toc236924285"/>
       <w:r>
         <w:rPr>
           <w:rFonts w:ascii="Montserrat" w:hAnsi="Montserrat"/>
@@ -3006,6 +3006,24 @@
           <w:color w:val="1A1A1A"/>
           <w:sz w:val="22"/>
         </w:rPr>
+        <w:t>Esta e a versao 2.13 do manual. Em relacao a versao 2.12 (06/08/2026), foi adicionado o campo obrigatorio Prioridade (Critica/Alta/Media/Baixa) a Solicitacao de Demanda (Passo 1): exibido como selo colorido na lista de demandas cadastradas e no detalhe do registro, ajudando o Admin a priorizar a triagem do Gate 1.</w:t>
+      </w:r>
+    </w:p>
+    <w:p>
+      <w:pPr>
+        <w:spacing w:line="280" w:lineRule="auto"/>
+        <w:rPr>
+          <w:rFonts w:ascii="Montserrat" w:hAnsi="Montserrat"/>
+          <w:color w:val="1A1A1A"/>
+          <w:sz w:val="22"/>
+        </w:rPr>
+      </w:pPr>
+      <w:r>
+        <w:rPr>
+          <w:rFonts w:ascii="Montserrat" w:hAnsi="Montserrat"/>
+          <w:color w:val="1A1A1A"/>
+          <w:sz w:val="22"/>
+        </w:rPr>
         <w:t>O manual nao substitui as Diretrizes para a Gestao de Projetos da UNIALFA (documento institucional que define o framework D01 a D07) nem o documento Regras de Acesso e Permissoes (que detalha cada regra de controle de acesso); ele e o guia operacional de como usar cada ferramenta na pratica.</w:t>
       </w:r>
     </w:p>
@@ -3020,7 +3038,7 @@
           <w:sz w:val="27"/>
         </w:rPr>
       </w:pPr>
-      <w:bookmarkStart w:id="2" w:name="_Toc236922999"/>
+      <w:bookmarkStart w:id="2" w:name="_Toc236924286"/>
       <w:r>
         <w:rPr>
           <w:rFonts w:ascii="Montserrat" w:hAnsi="Montserrat"/>
@@ -3193,16 +3211,16 @@
         </w:rPr>
         <w:lastRenderedPageBreak/>
         <w:drawing>
-          <wp:inline distT="0" distB="0" distL="0" distR="0" wp14:anchorId="17CA2EB6" wp14:editId="1FFA22AC">
+          <wp:inline distT="0" distB="0" distL="0" distR="0" wp14:anchorId="26C245B1" wp14:editId="4B0ED675">
             <wp:extent cx="5303520" cy="4792851"/>
             <wp:effectExtent l="19050" t="19050" r="11430" b="27305"/>
-            <wp:docPr id="2025906612" name="Imagem 1"/>
+            <wp:docPr id="113019303" name="Imagem 1"/>
             <wp:cNvGraphicFramePr/>
             <a:graphic xmlns:a="http://schemas.openxmlformats.org/drawingml/2006/main">
               <a:graphicData uri="http://schemas.openxmlformats.org/drawingml/2006/picture">
                 <pic:pic xmlns:pic="http://schemas.openxmlformats.org/drawingml/2006/picture">
                   <pic:nvPicPr>
-                    <pic:cNvPr id="2025906612" name=""/>
+                    <pic:cNvPr id="113019303" name=""/>
                     <pic:cNvPicPr/>
                   </pic:nvPicPr>
                   <pic:blipFill>
@@ -3270,7 +3288,7 @@
           <w:sz w:val="27"/>
         </w:rPr>
       </w:pPr>
-      <w:bookmarkStart w:id="3" w:name="_Toc236923000"/>
+      <w:bookmarkStart w:id="3" w:name="_Toc236924287"/>
       <w:r>
         <w:rPr>
           <w:rFonts w:ascii="Montserrat" w:hAnsi="Montserrat"/>
@@ -3311,16 +3329,16 @@
         </w:rPr>
         <w:lastRenderedPageBreak/>
         <w:drawing>
-          <wp:inline distT="0" distB="0" distL="0" distR="0" wp14:anchorId="1CE8170D" wp14:editId="1FB54782">
+          <wp:inline distT="0" distB="0" distL="0" distR="0" wp14:anchorId="20D9C5AC" wp14:editId="7FA4A307">
             <wp:extent cx="4206240" cy="3801227"/>
             <wp:effectExtent l="19050" t="19050" r="22860" b="27940"/>
-            <wp:docPr id="1213683885" name="Imagem 2"/>
+            <wp:docPr id="1957231999" name="Imagem 2"/>
             <wp:cNvGraphicFramePr/>
             <a:graphic xmlns:a="http://schemas.openxmlformats.org/drawingml/2006/main">
               <a:graphicData uri="http://schemas.openxmlformats.org/drawingml/2006/picture">
                 <pic:pic xmlns:pic="http://schemas.openxmlformats.org/drawingml/2006/picture">
                   <pic:nvPicPr>
-                    <pic:cNvPr id="1213683885" name=""/>
+                    <pic:cNvPr id="1957231999" name=""/>
                     <pic:cNvPicPr/>
                   </pic:nvPicPr>
                   <pic:blipFill>
@@ -3493,7 +3511,7 @@
           <w:sz w:val="27"/>
         </w:rPr>
       </w:pPr>
-      <w:bookmarkStart w:id="4" w:name="_Toc236923001"/>
+      <w:bookmarkStart w:id="4" w:name="_Toc236924288"/>
       <w:r>
         <w:rPr>
           <w:rFonts w:ascii="Montserrat" w:hAnsi="Montserrat"/>
@@ -4642,7 +4660,7 @@
           <w:sz w:val="34"/>
         </w:rPr>
       </w:pPr>
-      <w:bookmarkStart w:id="5" w:name="_Toc236923002"/>
+      <w:bookmarkStart w:id="5" w:name="_Toc236924289"/>
       <w:r>
         <w:rPr>
           <w:rFonts w:ascii="Montserrat" w:hAnsi="Montserrat"/>
@@ -4666,7 +4684,7 @@
           <w:sz w:val="27"/>
         </w:rPr>
       </w:pPr>
-      <w:bookmarkStart w:id="6" w:name="_Toc236923003"/>
+      <w:bookmarkStart w:id="6" w:name="_Toc236924290"/>
       <w:r>
         <w:rPr>
           <w:rFonts w:ascii="Montserrat" w:hAnsi="Montserrat"/>
@@ -4707,7 +4725,7 @@
           <w:sz w:val="27"/>
         </w:rPr>
       </w:pPr>
-      <w:bookmarkStart w:id="7" w:name="_Toc236923004"/>
+      <w:bookmarkStart w:id="7" w:name="_Toc236924291"/>
       <w:r>
         <w:rPr>
           <w:rFonts w:ascii="Montserrat" w:hAnsi="Montserrat"/>
@@ -4826,7 +4844,7 @@
           <w:sz w:val="27"/>
         </w:rPr>
       </w:pPr>
-      <w:bookmarkStart w:id="8" w:name="_Toc236923005"/>
+      <w:bookmarkStart w:id="8" w:name="_Toc236924292"/>
       <w:r>
         <w:rPr>
           <w:rFonts w:ascii="Montserrat" w:hAnsi="Montserrat"/>
@@ -5397,7 +5415,7 @@
           <w:sz w:val="27"/>
         </w:rPr>
       </w:pPr>
-      <w:bookmarkStart w:id="9" w:name="_Toc236923006"/>
+      <w:bookmarkStart w:id="9" w:name="_Toc236924293"/>
       <w:r>
         <w:rPr>
           <w:rFonts w:ascii="Montserrat" w:hAnsi="Montserrat"/>
@@ -5486,16 +5504,16 @@
         </w:rPr>
         <w:lastRenderedPageBreak/>
         <w:drawing>
-          <wp:inline distT="0" distB="0" distL="0" distR="0" wp14:anchorId="6FADEF01" wp14:editId="7C93285B">
+          <wp:inline distT="0" distB="0" distL="0" distR="0" wp14:anchorId="3FC40BB2" wp14:editId="3A9654F4">
             <wp:extent cx="4937760" cy="4462310"/>
             <wp:effectExtent l="19050" t="19050" r="15240" b="14605"/>
-            <wp:docPr id="1347190305" name="Imagem 3"/>
+            <wp:docPr id="1901089460" name="Imagem 3"/>
             <wp:cNvGraphicFramePr/>
             <a:graphic xmlns:a="http://schemas.openxmlformats.org/drawingml/2006/main">
               <a:graphicData uri="http://schemas.openxmlformats.org/drawingml/2006/picture">
                 <pic:pic xmlns:pic="http://schemas.openxmlformats.org/drawingml/2006/picture">
                   <pic:nvPicPr>
-                    <pic:cNvPr id="1347190305" name=""/>
+                    <pic:cNvPr id="1901089460" name=""/>
                     <pic:cNvPicPr/>
                   </pic:nvPicPr>
                   <pic:blipFill>
@@ -5563,7 +5581,7 @@
           <w:sz w:val="27"/>
         </w:rPr>
       </w:pPr>
-      <w:bookmarkStart w:id="10" w:name="_Toc236923007"/>
+      <w:bookmarkStart w:id="10" w:name="_Toc236924294"/>
       <w:r>
         <w:rPr>
           <w:rFonts w:ascii="Montserrat" w:hAnsi="Montserrat"/>
@@ -5604,16 +5622,16 @@
         </w:rPr>
         <w:lastRenderedPageBreak/>
         <w:drawing>
-          <wp:inline distT="0" distB="0" distL="0" distR="0" wp14:anchorId="23841A52" wp14:editId="21F47640">
+          <wp:inline distT="0" distB="0" distL="0" distR="0" wp14:anchorId="5A9A57B4" wp14:editId="757AC317">
             <wp:extent cx="5120640" cy="4627581"/>
             <wp:effectExtent l="19050" t="19050" r="22860" b="20955"/>
-            <wp:docPr id="1014639596" name="Imagem 4"/>
+            <wp:docPr id="194595130" name="Imagem 4"/>
             <wp:cNvGraphicFramePr/>
             <a:graphic xmlns:a="http://schemas.openxmlformats.org/drawingml/2006/main">
               <a:graphicData uri="http://schemas.openxmlformats.org/drawingml/2006/picture">
                 <pic:pic xmlns:pic="http://schemas.openxmlformats.org/drawingml/2006/picture">
                   <pic:nvPicPr>
-                    <pic:cNvPr id="1014639596" name=""/>
+                    <pic:cNvPr id="194595130" name=""/>
                     <pic:cNvPicPr/>
                   </pic:nvPicPr>
                   <pic:blipFill>
@@ -5750,7 +5768,7 @@
           <w:sz w:val="27"/>
         </w:rPr>
       </w:pPr>
-      <w:bookmarkStart w:id="11" w:name="_Toc236923008"/>
+      <w:bookmarkStart w:id="11" w:name="_Toc236924295"/>
       <w:r>
         <w:rPr>
           <w:rFonts w:ascii="Montserrat" w:hAnsi="Montserrat"/>
@@ -5791,16 +5809,16 @@
           <w:noProof/>
         </w:rPr>
         <w:drawing>
-          <wp:inline distT="0" distB="0" distL="0" distR="0" wp14:anchorId="7C6B0248" wp14:editId="7F2A9579">
+          <wp:inline distT="0" distB="0" distL="0" distR="0" wp14:anchorId="26CECB75" wp14:editId="59893434">
             <wp:extent cx="4206240" cy="3801227"/>
             <wp:effectExtent l="19050" t="19050" r="22860" b="27940"/>
-            <wp:docPr id="648515267" name="Imagem 5"/>
+            <wp:docPr id="2007985837" name="Imagem 5"/>
             <wp:cNvGraphicFramePr/>
             <a:graphic xmlns:a="http://schemas.openxmlformats.org/drawingml/2006/main">
               <a:graphicData uri="http://schemas.openxmlformats.org/drawingml/2006/picture">
                 <pic:pic xmlns:pic="http://schemas.openxmlformats.org/drawingml/2006/picture">
                   <pic:nvPicPr>
-                    <pic:cNvPr id="648515267" name=""/>
+                    <pic:cNvPr id="2007985837" name=""/>
                     <pic:cNvPicPr/>
                   </pic:nvPicPr>
                   <pic:blipFill>
@@ -5868,16 +5886,16 @@
         </w:rPr>
         <w:lastRenderedPageBreak/>
         <w:drawing>
-          <wp:inline distT="0" distB="0" distL="0" distR="0" wp14:anchorId="2B459F16" wp14:editId="2F0F75E5">
+          <wp:inline distT="0" distB="0" distL="0" distR="0" wp14:anchorId="0ABE504D" wp14:editId="691EB16B">
             <wp:extent cx="4206240" cy="3801227"/>
             <wp:effectExtent l="19050" t="19050" r="22860" b="27940"/>
-            <wp:docPr id="641161182" name="Imagem 6"/>
+            <wp:docPr id="1984567311" name="Imagem 6"/>
             <wp:cNvGraphicFramePr/>
             <a:graphic xmlns:a="http://schemas.openxmlformats.org/drawingml/2006/main">
               <a:graphicData uri="http://schemas.openxmlformats.org/drawingml/2006/picture">
                 <pic:pic xmlns:pic="http://schemas.openxmlformats.org/drawingml/2006/picture">
                   <pic:nvPicPr>
-                    <pic:cNvPr id="641161182" name=""/>
+                    <pic:cNvPr id="1984567311" name=""/>
                     <pic:cNvPicPr/>
                   </pic:nvPicPr>
                   <pic:blipFill>
@@ -5993,7 +6011,7 @@
           <w:sz w:val="27"/>
         </w:rPr>
       </w:pPr>
-      <w:bookmarkStart w:id="12" w:name="_Toc236923009"/>
+      <w:bookmarkStart w:id="12" w:name="_Toc236924296"/>
       <w:r>
         <w:rPr>
           <w:rFonts w:ascii="Montserrat" w:hAnsi="Montserrat"/>
@@ -6061,7 +6079,7 @@
           <w:sz w:val="27"/>
         </w:rPr>
       </w:pPr>
-      <w:bookmarkStart w:id="13" w:name="_Toc236923010"/>
+      <w:bookmarkStart w:id="13" w:name="_Toc236924297"/>
       <w:r>
         <w:rPr>
           <w:rFonts w:ascii="Montserrat" w:hAnsi="Montserrat"/>
@@ -6288,7 +6306,7 @@
           <w:sz w:val="27"/>
         </w:rPr>
       </w:pPr>
-      <w:bookmarkStart w:id="14" w:name="_Toc236923011"/>
+      <w:bookmarkStart w:id="14" w:name="_Toc236924298"/>
       <w:r>
         <w:rPr>
           <w:rFonts w:ascii="Montserrat" w:hAnsi="Montserrat"/>
@@ -6451,7 +6469,7 @@
           <w:sz w:val="34"/>
         </w:rPr>
       </w:pPr>
-      <w:bookmarkStart w:id="15" w:name="_Toc236923012"/>
+      <w:bookmarkStart w:id="15" w:name="_Toc236924299"/>
       <w:r>
         <w:rPr>
           <w:rFonts w:ascii="Montserrat" w:hAnsi="Montserrat"/>
@@ -6493,7 +6511,7 @@
           <w:sz w:val="27"/>
         </w:rPr>
       </w:pPr>
-      <w:bookmarkStart w:id="16" w:name="_Toc236923013"/>
+      <w:bookmarkStart w:id="16" w:name="_Toc236924300"/>
       <w:r>
         <w:rPr>
           <w:rFonts w:ascii="Montserrat" w:hAnsi="Montserrat"/>
@@ -7143,7 +7161,7 @@
                 <w:color w:val="1A1A1A"/>
                 <w:sz w:val="19"/>
               </w:rPr>
-              <w:t>Orcamento estimado</w:t>
+              <w:t>Prioridade</w:t>
             </w:r>
           </w:p>
         </w:tc>
@@ -7166,7 +7184,7 @@
                 <w:color w:val="1A1A1A"/>
                 <w:sz w:val="19"/>
               </w:rPr>
-              <w:t>Nao</w:t>
+              <w:t>Sim</w:t>
             </w:r>
           </w:p>
         </w:tc>
@@ -7189,7 +7207,7 @@
                 <w:color w:val="1A1A1A"/>
                 <w:sz w:val="19"/>
               </w:rPr>
-              <w:t>Valor aproximado, se ja houver</w:t>
+              <w:t>Critica, Alta, Media ou Baixa - urgencia da demanda, ajuda o Admin a priorizar a triagem do Gate 1</w:t>
             </w:r>
           </w:p>
         </w:tc>
@@ -7214,7 +7232,7 @@
                 <w:color w:val="1A1A1A"/>
                 <w:sz w:val="19"/>
               </w:rPr>
-              <w:t>Partes interessadas</w:t>
+              <w:t>Orcamento estimado</w:t>
             </w:r>
           </w:p>
         </w:tc>
@@ -7237,7 +7255,7 @@
                 <w:color w:val="1A1A1A"/>
                 <w:sz w:val="19"/>
               </w:rPr>
-              <w:t>Sim</w:t>
+              <w:t>Nao</w:t>
             </w:r>
           </w:p>
         </w:tc>
@@ -7260,7 +7278,7 @@
                 <w:color w:val="1A1A1A"/>
                 <w:sz w:val="19"/>
               </w:rPr>
-              <w:t>Areas, equipes ou pessoas impactadas</w:t>
+              <w:t>Valor aproximado, se ja houver</w:t>
             </w:r>
           </w:p>
         </w:tc>
@@ -7285,6 +7303,77 @@
                 <w:color w:val="1A1A1A"/>
                 <w:sz w:val="19"/>
               </w:rPr>
+              <w:t>Partes interessadas</w:t>
+            </w:r>
+          </w:p>
+        </w:tc>
+        <w:tc>
+          <w:tcPr>
+            <w:tcW w:w="1020" w:type="dxa"/>
+          </w:tcPr>
+          <w:p>
+            <w:pPr>
+              <w:spacing w:line="280" w:lineRule="auto"/>
+              <w:rPr>
+                <w:rFonts w:ascii="Montserrat" w:hAnsi="Montserrat"/>
+                <w:color w:val="1A1A1A"/>
+                <w:sz w:val="19"/>
+              </w:rPr>
+            </w:pPr>
+            <w:r>
+              <w:rPr>
+                <w:rFonts w:ascii="Montserrat" w:hAnsi="Montserrat"/>
+                <w:color w:val="1A1A1A"/>
+                <w:sz w:val="19"/>
+              </w:rPr>
+              <w:t>Sim</w:t>
+            </w:r>
+          </w:p>
+        </w:tc>
+        <w:tc>
+          <w:tcPr>
+            <w:tcW w:w="5216" w:type="dxa"/>
+          </w:tcPr>
+          <w:p>
+            <w:pPr>
+              <w:spacing w:line="280" w:lineRule="auto"/>
+              <w:rPr>
+                <w:rFonts w:ascii="Montserrat" w:hAnsi="Montserrat"/>
+                <w:color w:val="1A1A1A"/>
+                <w:sz w:val="19"/>
+              </w:rPr>
+            </w:pPr>
+            <w:r>
+              <w:rPr>
+                <w:rFonts w:ascii="Montserrat" w:hAnsi="Montserrat"/>
+                <w:color w:val="1A1A1A"/>
+                <w:sz w:val="19"/>
+              </w:rPr>
+              <w:t>Areas, equipes ou pessoas impactadas</w:t>
+            </w:r>
+          </w:p>
+        </w:tc>
+      </w:tr>
+      <w:tr>
+        <w:tc>
+          <w:tcPr>
+            <w:tcW w:w="2835" w:type="dxa"/>
+          </w:tcPr>
+          <w:p>
+            <w:pPr>
+              <w:spacing w:line="280" w:lineRule="auto"/>
+              <w:rPr>
+                <w:rFonts w:ascii="Montserrat" w:hAnsi="Montserrat"/>
+                <w:color w:val="1A1A1A"/>
+                <w:sz w:val="19"/>
+              </w:rPr>
+            </w:pPr>
+            <w:r>
+              <w:rPr>
+                <w:rFonts w:ascii="Montserrat" w:hAnsi="Montserrat"/>
+                <w:color w:val="1A1A1A"/>
+                <w:sz w:val="19"/>
+              </w:rPr>
               <w:t>Anexos</w:t>
             </w:r>
           </w:p>
@@ -7353,16 +7442,16 @@
         </w:rPr>
         <w:lastRenderedPageBreak/>
         <w:drawing>
-          <wp:inline distT="0" distB="0" distL="0" distR="0" wp14:anchorId="4D015BBC" wp14:editId="17756847">
+          <wp:inline distT="0" distB="0" distL="0" distR="0" wp14:anchorId="22DA1B58" wp14:editId="1903B1EE">
             <wp:extent cx="5120640" cy="4627581"/>
             <wp:effectExtent l="19050" t="19050" r="22860" b="20955"/>
-            <wp:docPr id="1993388346" name="Imagem 7"/>
+            <wp:docPr id="509089634" name="Imagem 7"/>
             <wp:cNvGraphicFramePr/>
             <a:graphic xmlns:a="http://schemas.openxmlformats.org/drawingml/2006/main">
               <a:graphicData uri="http://schemas.openxmlformats.org/drawingml/2006/picture">
                 <pic:pic xmlns:pic="http://schemas.openxmlformats.org/drawingml/2006/picture">
                   <pic:nvPicPr>
-                    <pic:cNvPr id="1993388346" name=""/>
+                    <pic:cNvPr id="509089634" name=""/>
                     <pic:cNvPicPr/>
                   </pic:nvPicPr>
                   <pic:blipFill>
@@ -7430,16 +7519,16 @@
         </w:rPr>
         <w:lastRenderedPageBreak/>
         <w:drawing>
-          <wp:inline distT="0" distB="0" distL="0" distR="0" wp14:anchorId="55E01978" wp14:editId="5B605572">
+          <wp:inline distT="0" distB="0" distL="0" distR="0" wp14:anchorId="583AC06A" wp14:editId="50732CB7">
             <wp:extent cx="5120640" cy="4627581"/>
             <wp:effectExtent l="19050" t="19050" r="22860" b="20955"/>
-            <wp:docPr id="581959230" name="Imagem 8"/>
+            <wp:docPr id="30642210" name="Imagem 8"/>
             <wp:cNvGraphicFramePr/>
             <a:graphic xmlns:a="http://schemas.openxmlformats.org/drawingml/2006/main">
               <a:graphicData uri="http://schemas.openxmlformats.org/drawingml/2006/picture">
                 <pic:pic xmlns:pic="http://schemas.openxmlformats.org/drawingml/2006/picture">
                   <pic:nvPicPr>
-                    <pic:cNvPr id="581959230" name=""/>
+                    <pic:cNvPr id="30642210" name=""/>
                     <pic:cNvPicPr/>
                   </pic:nvPicPr>
                   <pic:blipFill>
@@ -7574,7 +7663,7 @@
           <w:sz w:val="27"/>
         </w:rPr>
       </w:pPr>
-      <w:bookmarkStart w:id="17" w:name="_Toc236923014"/>
+      <w:bookmarkStart w:id="17" w:name="_Toc236924301"/>
       <w:r>
         <w:rPr>
           <w:rFonts w:ascii="Montserrat" w:hAnsi="Montserrat"/>
@@ -8435,16 +8524,16 @@
         </w:rPr>
         <w:lastRenderedPageBreak/>
         <w:drawing>
-          <wp:inline distT="0" distB="0" distL="0" distR="0" wp14:anchorId="1A3BB281" wp14:editId="4057EA6C">
+          <wp:inline distT="0" distB="0" distL="0" distR="0" wp14:anchorId="15D9FEFF" wp14:editId="2F2F38F4">
             <wp:extent cx="5120640" cy="4627581"/>
             <wp:effectExtent l="19050" t="19050" r="22860" b="20955"/>
-            <wp:docPr id="911850526" name="Imagem 9"/>
+            <wp:docPr id="533768074" name="Imagem 9"/>
             <wp:cNvGraphicFramePr/>
             <a:graphic xmlns:a="http://schemas.openxmlformats.org/drawingml/2006/main">
               <a:graphicData uri="http://schemas.openxmlformats.org/drawingml/2006/picture">
                 <pic:pic xmlns:pic="http://schemas.openxmlformats.org/drawingml/2006/picture">
                   <pic:nvPicPr>
-                    <pic:cNvPr id="911850526" name=""/>
+                    <pic:cNvPr id="533768074" name=""/>
                     <pic:cNvPicPr/>
                   </pic:nvPicPr>
                   <pic:blipFill>
@@ -8512,16 +8601,16 @@
         </w:rPr>
         <w:lastRenderedPageBreak/>
         <w:drawing>
-          <wp:inline distT="0" distB="0" distL="0" distR="0" wp14:anchorId="0E393431" wp14:editId="61864EC6">
+          <wp:inline distT="0" distB="0" distL="0" distR="0" wp14:anchorId="7A4C69BC" wp14:editId="55A3C443">
             <wp:extent cx="5120640" cy="4627581"/>
             <wp:effectExtent l="19050" t="19050" r="22860" b="20955"/>
-            <wp:docPr id="1567862089" name="Imagem 10"/>
+            <wp:docPr id="1166982388" name="Imagem 10"/>
             <wp:cNvGraphicFramePr/>
             <a:graphic xmlns:a="http://schemas.openxmlformats.org/drawingml/2006/main">
               <a:graphicData uri="http://schemas.openxmlformats.org/drawingml/2006/picture">
                 <pic:pic xmlns:pic="http://schemas.openxmlformats.org/drawingml/2006/picture">
                   <pic:nvPicPr>
-                    <pic:cNvPr id="1567862089" name=""/>
+                    <pic:cNvPr id="1166982388" name=""/>
                     <pic:cNvPicPr/>
                   </pic:nvPicPr>
                   <pic:blipFill>
@@ -8607,7 +8696,7 @@
           <w:sz w:val="27"/>
         </w:rPr>
       </w:pPr>
-      <w:bookmarkStart w:id="18" w:name="_Toc236923015"/>
+      <w:bookmarkStart w:id="18" w:name="_Toc236924302"/>
       <w:r>
         <w:rPr>
           <w:rFonts w:ascii="Montserrat" w:hAnsi="Montserrat"/>
@@ -9575,16 +9664,16 @@
         </w:rPr>
         <w:lastRenderedPageBreak/>
         <w:drawing>
-          <wp:inline distT="0" distB="0" distL="0" distR="0" wp14:anchorId="12FC1BBB" wp14:editId="27D33414">
+          <wp:inline distT="0" distB="0" distL="0" distR="0" wp14:anchorId="26CC735E" wp14:editId="0A860414">
             <wp:extent cx="5120640" cy="3282818"/>
             <wp:effectExtent l="19050" t="19050" r="22860" b="13335"/>
-            <wp:docPr id="656655448" name="Imagem 11"/>
+            <wp:docPr id="2139016090" name="Imagem 11"/>
             <wp:cNvGraphicFramePr/>
             <a:graphic xmlns:a="http://schemas.openxmlformats.org/drawingml/2006/main">
               <a:graphicData uri="http://schemas.openxmlformats.org/drawingml/2006/picture">
                 <pic:pic xmlns:pic="http://schemas.openxmlformats.org/drawingml/2006/picture">
                   <pic:nvPicPr>
-                    <pic:cNvPr id="656655448" name=""/>
+                    <pic:cNvPr id="2139016090" name=""/>
                     <pic:cNvPicPr/>
                   </pic:nvPicPr>
                   <pic:blipFill>
@@ -9652,16 +9741,16 @@
         </w:rPr>
         <w:lastRenderedPageBreak/>
         <w:drawing>
-          <wp:inline distT="0" distB="0" distL="0" distR="0" wp14:anchorId="6D53A224" wp14:editId="0200CF7D">
+          <wp:inline distT="0" distB="0" distL="0" distR="0" wp14:anchorId="0B075E14" wp14:editId="0AE9E364">
             <wp:extent cx="5120640" cy="4627581"/>
             <wp:effectExtent l="19050" t="19050" r="22860" b="20955"/>
-            <wp:docPr id="1737658665" name="Imagem 12"/>
+            <wp:docPr id="1894274118" name="Imagem 12"/>
             <wp:cNvGraphicFramePr/>
             <a:graphic xmlns:a="http://schemas.openxmlformats.org/drawingml/2006/main">
               <a:graphicData uri="http://schemas.openxmlformats.org/drawingml/2006/picture">
                 <pic:pic xmlns:pic="http://schemas.openxmlformats.org/drawingml/2006/picture">
                   <pic:nvPicPr>
-                    <pic:cNvPr id="1737658665" name=""/>
+                    <pic:cNvPr id="1894274118" name=""/>
                     <pic:cNvPicPr/>
                   </pic:nvPicPr>
                   <pic:blipFill>
@@ -9747,7 +9836,7 @@
           <w:sz w:val="27"/>
         </w:rPr>
       </w:pPr>
-      <w:bookmarkStart w:id="19" w:name="_Toc236923016"/>
+      <w:bookmarkStart w:id="19" w:name="_Toc236924303"/>
       <w:r>
         <w:rPr>
           <w:rFonts w:ascii="Montserrat" w:hAnsi="Montserrat"/>
@@ -10254,16 +10343,16 @@
           <w:noProof/>
         </w:rPr>
         <w:drawing>
-          <wp:inline distT="0" distB="0" distL="0" distR="0" wp14:anchorId="0C78A8A0" wp14:editId="13B0B12E">
+          <wp:inline distT="0" distB="0" distL="0" distR="0" wp14:anchorId="559924C0" wp14:editId="6F2E9943">
             <wp:extent cx="5120640" cy="4627581"/>
             <wp:effectExtent l="19050" t="19050" r="22860" b="20955"/>
-            <wp:docPr id="1831335021" name="Imagem 13"/>
+            <wp:docPr id="2070168519" name="Imagem 13"/>
             <wp:cNvGraphicFramePr/>
             <a:graphic xmlns:a="http://schemas.openxmlformats.org/drawingml/2006/main">
               <a:graphicData uri="http://schemas.openxmlformats.org/drawingml/2006/picture">
                 <pic:pic xmlns:pic="http://schemas.openxmlformats.org/drawingml/2006/picture">
                   <pic:nvPicPr>
-                    <pic:cNvPr id="1831335021" name=""/>
+                    <pic:cNvPr id="2070168519" name=""/>
                     <pic:cNvPicPr/>
                   </pic:nvPicPr>
                   <pic:blipFill>
@@ -10331,16 +10420,16 @@
         </w:rPr>
         <w:lastRenderedPageBreak/>
         <w:drawing>
-          <wp:inline distT="0" distB="0" distL="0" distR="0" wp14:anchorId="4899108B" wp14:editId="07FBCE36">
+          <wp:inline distT="0" distB="0" distL="0" distR="0" wp14:anchorId="01A17DE1" wp14:editId="209B0BAB">
             <wp:extent cx="5120640" cy="4627581"/>
             <wp:effectExtent l="19050" t="19050" r="22860" b="20955"/>
-            <wp:docPr id="1302269653" name="Imagem 14"/>
+            <wp:docPr id="1103882191" name="Imagem 14"/>
             <wp:cNvGraphicFramePr/>
             <a:graphic xmlns:a="http://schemas.openxmlformats.org/drawingml/2006/main">
               <a:graphicData uri="http://schemas.openxmlformats.org/drawingml/2006/picture">
                 <pic:pic xmlns:pic="http://schemas.openxmlformats.org/drawingml/2006/picture">
                   <pic:nvPicPr>
-                    <pic:cNvPr id="1302269653" name=""/>
+                    <pic:cNvPr id="1103882191" name=""/>
                     <pic:cNvPicPr/>
                   </pic:nvPicPr>
                   <pic:blipFill>
@@ -10426,7 +10515,7 @@
           <w:sz w:val="27"/>
         </w:rPr>
       </w:pPr>
-      <w:bookmarkStart w:id="20" w:name="_Toc236923017"/>
+      <w:bookmarkStart w:id="20" w:name="_Toc236924304"/>
       <w:r>
         <w:rPr>
           <w:rFonts w:ascii="Montserrat" w:hAnsi="Montserrat"/>
@@ -10467,16 +10556,16 @@
         </w:rPr>
         <w:lastRenderedPageBreak/>
         <w:drawing>
-          <wp:inline distT="0" distB="0" distL="0" distR="0" wp14:anchorId="72A61514" wp14:editId="0434CF82">
+          <wp:inline distT="0" distB="0" distL="0" distR="0" wp14:anchorId="794B8B07" wp14:editId="1B252785">
             <wp:extent cx="5120640" cy="4627581"/>
             <wp:effectExtent l="19050" t="19050" r="22860" b="20955"/>
-            <wp:docPr id="1660534597" name="Imagem 15"/>
+            <wp:docPr id="2041563013" name="Imagem 15"/>
             <wp:cNvGraphicFramePr/>
             <a:graphic xmlns:a="http://schemas.openxmlformats.org/drawingml/2006/main">
               <a:graphicData uri="http://schemas.openxmlformats.org/drawingml/2006/picture">
                 <pic:pic xmlns:pic="http://schemas.openxmlformats.org/drawingml/2006/picture">
                   <pic:nvPicPr>
-                    <pic:cNvPr id="1660534597" name=""/>
+                    <pic:cNvPr id="2041563013" name=""/>
                     <pic:cNvPicPr/>
                   </pic:nvPicPr>
                   <pic:blipFill>
@@ -10544,16 +10633,16 @@
         </w:rPr>
         <w:lastRenderedPageBreak/>
         <w:drawing>
-          <wp:inline distT="0" distB="0" distL="0" distR="0" wp14:anchorId="4A411538" wp14:editId="11A57534">
+          <wp:inline distT="0" distB="0" distL="0" distR="0" wp14:anchorId="31606537" wp14:editId="12E5D4BB">
             <wp:extent cx="5120640" cy="4627581"/>
             <wp:effectExtent l="19050" t="19050" r="22860" b="20955"/>
-            <wp:docPr id="1258117012" name="Imagem 16"/>
+            <wp:docPr id="794410389" name="Imagem 16"/>
             <wp:cNvGraphicFramePr/>
             <a:graphic xmlns:a="http://schemas.openxmlformats.org/drawingml/2006/main">
               <a:graphicData uri="http://schemas.openxmlformats.org/drawingml/2006/picture">
                 <pic:pic xmlns:pic="http://schemas.openxmlformats.org/drawingml/2006/picture">
                   <pic:nvPicPr>
-                    <pic:cNvPr id="1258117012" name=""/>
+                    <pic:cNvPr id="794410389" name=""/>
                     <pic:cNvPicPr/>
                   </pic:nvPicPr>
                   <pic:blipFill>
@@ -10717,16 +10806,16 @@
         </w:rPr>
         <w:lastRenderedPageBreak/>
         <w:drawing>
-          <wp:inline distT="0" distB="0" distL="0" distR="0" wp14:anchorId="4B732EF9" wp14:editId="49AA9B5D">
+          <wp:inline distT="0" distB="0" distL="0" distR="0" wp14:anchorId="7A557614" wp14:editId="48DBA4DD">
             <wp:extent cx="5120640" cy="3282818"/>
             <wp:effectExtent l="19050" t="19050" r="22860" b="13335"/>
-            <wp:docPr id="1664291323" name="Imagem 17"/>
+            <wp:docPr id="1754512764" name="Imagem 17"/>
             <wp:cNvGraphicFramePr/>
             <a:graphic xmlns:a="http://schemas.openxmlformats.org/drawingml/2006/main">
               <a:graphicData uri="http://schemas.openxmlformats.org/drawingml/2006/picture">
                 <pic:pic xmlns:pic="http://schemas.openxmlformats.org/drawingml/2006/picture">
                   <pic:nvPicPr>
-                    <pic:cNvPr id="1664291323" name=""/>
+                    <pic:cNvPr id="1754512764" name=""/>
                     <pic:cNvPicPr/>
                   </pic:nvPicPr>
                   <pic:blipFill>
@@ -10812,7 +10901,7 @@
           <w:sz w:val="27"/>
         </w:rPr>
       </w:pPr>
-      <w:bookmarkStart w:id="21" w:name="_Toc236923018"/>
+      <w:bookmarkStart w:id="21" w:name="_Toc236924305"/>
       <w:r>
         <w:rPr>
           <w:rFonts w:ascii="Montserrat" w:hAnsi="Montserrat"/>
@@ -10853,16 +10942,16 @@
         </w:rPr>
         <w:lastRenderedPageBreak/>
         <w:drawing>
-          <wp:inline distT="0" distB="0" distL="0" distR="0" wp14:anchorId="3EC49994" wp14:editId="7DE79684">
+          <wp:inline distT="0" distB="0" distL="0" distR="0" wp14:anchorId="59A7DEA8" wp14:editId="5E2E25E3">
             <wp:extent cx="5120640" cy="4627581"/>
             <wp:effectExtent l="19050" t="19050" r="22860" b="20955"/>
-            <wp:docPr id="2111940494" name="Imagem 18"/>
+            <wp:docPr id="351984850" name="Imagem 18"/>
             <wp:cNvGraphicFramePr/>
             <a:graphic xmlns:a="http://schemas.openxmlformats.org/drawingml/2006/main">
               <a:graphicData uri="http://schemas.openxmlformats.org/drawingml/2006/picture">
                 <pic:pic xmlns:pic="http://schemas.openxmlformats.org/drawingml/2006/picture">
                   <pic:nvPicPr>
-                    <pic:cNvPr id="2111940494" name=""/>
+                    <pic:cNvPr id="351984850" name=""/>
                     <pic:cNvPicPr/>
                   </pic:nvPicPr>
                   <pic:blipFill>
@@ -10930,16 +11019,16 @@
         </w:rPr>
         <w:lastRenderedPageBreak/>
         <w:drawing>
-          <wp:inline distT="0" distB="0" distL="0" distR="0" wp14:anchorId="0B319F76" wp14:editId="5107515A">
+          <wp:inline distT="0" distB="0" distL="0" distR="0" wp14:anchorId="38948FD5" wp14:editId="30031FA1">
             <wp:extent cx="5120640" cy="4627581"/>
             <wp:effectExtent l="19050" t="19050" r="22860" b="20955"/>
-            <wp:docPr id="408979621" name="Imagem 19"/>
+            <wp:docPr id="705755051" name="Imagem 19"/>
             <wp:cNvGraphicFramePr/>
             <a:graphic xmlns:a="http://schemas.openxmlformats.org/drawingml/2006/main">
               <a:graphicData uri="http://schemas.openxmlformats.org/drawingml/2006/picture">
                 <pic:pic xmlns:pic="http://schemas.openxmlformats.org/drawingml/2006/picture">
                   <pic:nvPicPr>
-                    <pic:cNvPr id="408979621" name=""/>
+                    <pic:cNvPr id="705755051" name=""/>
                     <pic:cNvPicPr/>
                   </pic:nvPicPr>
                   <pic:blipFill>
@@ -11073,7 +11162,7 @@
           <w:sz w:val="27"/>
         </w:rPr>
       </w:pPr>
-      <w:bookmarkStart w:id="22" w:name="_Toc236923019"/>
+      <w:bookmarkStart w:id="22" w:name="_Toc236924306"/>
       <w:r>
         <w:rPr>
           <w:rFonts w:ascii="Montserrat" w:hAnsi="Montserrat"/>
@@ -11114,16 +11203,16 @@
         </w:rPr>
         <w:lastRenderedPageBreak/>
         <w:drawing>
-          <wp:inline distT="0" distB="0" distL="0" distR="0" wp14:anchorId="37C75D47" wp14:editId="7D977F4F">
+          <wp:inline distT="0" distB="0" distL="0" distR="0" wp14:anchorId="63AE4920" wp14:editId="04AEB17E">
             <wp:extent cx="5120640" cy="4627581"/>
             <wp:effectExtent l="19050" t="19050" r="22860" b="20955"/>
-            <wp:docPr id="2013874841" name="Imagem 20"/>
+            <wp:docPr id="873542164" name="Imagem 20"/>
             <wp:cNvGraphicFramePr/>
             <a:graphic xmlns:a="http://schemas.openxmlformats.org/drawingml/2006/main">
               <a:graphicData uri="http://schemas.openxmlformats.org/drawingml/2006/picture">
                 <pic:pic xmlns:pic="http://schemas.openxmlformats.org/drawingml/2006/picture">
                   <pic:nvPicPr>
-                    <pic:cNvPr id="2013874841" name=""/>
+                    <pic:cNvPr id="873542164" name=""/>
                     <pic:cNvPicPr/>
                   </pic:nvPicPr>
                   <pic:blipFill>
@@ -11191,16 +11280,16 @@
         </w:rPr>
         <w:lastRenderedPageBreak/>
         <w:drawing>
-          <wp:inline distT="0" distB="0" distL="0" distR="0" wp14:anchorId="02C17482" wp14:editId="46A1B895">
+          <wp:inline distT="0" distB="0" distL="0" distR="0" wp14:anchorId="12D0D24A" wp14:editId="6D1B39E1">
             <wp:extent cx="5120640" cy="4627581"/>
             <wp:effectExtent l="19050" t="19050" r="22860" b="20955"/>
-            <wp:docPr id="938101931" name="Imagem 21"/>
+            <wp:docPr id="971467320" name="Imagem 21"/>
             <wp:cNvGraphicFramePr/>
             <a:graphic xmlns:a="http://schemas.openxmlformats.org/drawingml/2006/main">
               <a:graphicData uri="http://schemas.openxmlformats.org/drawingml/2006/picture">
                 <pic:pic xmlns:pic="http://schemas.openxmlformats.org/drawingml/2006/picture">
                   <pic:nvPicPr>
-                    <pic:cNvPr id="938101931" name=""/>
+                    <pic:cNvPr id="971467320" name=""/>
                     <pic:cNvPicPr/>
                   </pic:nvPicPr>
                   <pic:blipFill>
@@ -11389,7 +11478,7 @@
           <w:sz w:val="27"/>
         </w:rPr>
       </w:pPr>
-      <w:bookmarkStart w:id="23" w:name="_Toc236923020"/>
+      <w:bookmarkStart w:id="23" w:name="_Toc236924307"/>
       <w:r>
         <w:rPr>
           <w:rFonts w:ascii="Montserrat" w:hAnsi="Montserrat"/>
@@ -11429,16 +11518,16 @@
           <w:noProof/>
         </w:rPr>
         <w:drawing>
-          <wp:inline distT="0" distB="0" distL="0" distR="0" wp14:anchorId="659FF5E2" wp14:editId="24BD2D2B">
+          <wp:inline distT="0" distB="0" distL="0" distR="0" wp14:anchorId="4BE36F26" wp14:editId="7351A4DC">
             <wp:extent cx="5120640" cy="4627581"/>
             <wp:effectExtent l="19050" t="19050" r="22860" b="20955"/>
-            <wp:docPr id="790858510" name="Imagem 22"/>
+            <wp:docPr id="1647372924" name="Imagem 22"/>
             <wp:cNvGraphicFramePr/>
             <a:graphic xmlns:a="http://schemas.openxmlformats.org/drawingml/2006/main">
               <a:graphicData uri="http://schemas.openxmlformats.org/drawingml/2006/picture">
                 <pic:pic xmlns:pic="http://schemas.openxmlformats.org/drawingml/2006/picture">
                   <pic:nvPicPr>
-                    <pic:cNvPr id="790858510" name=""/>
+                    <pic:cNvPr id="1647372924" name=""/>
                     <pic:cNvPicPr/>
                   </pic:nvPicPr>
                   <pic:blipFill>
@@ -11506,16 +11595,16 @@
         </w:rPr>
         <w:lastRenderedPageBreak/>
         <w:drawing>
-          <wp:inline distT="0" distB="0" distL="0" distR="0" wp14:anchorId="5995F3D9" wp14:editId="3335DA07">
+          <wp:inline distT="0" distB="0" distL="0" distR="0" wp14:anchorId="19A94EC2" wp14:editId="2B79AACC">
             <wp:extent cx="5120640" cy="4627581"/>
             <wp:effectExtent l="19050" t="19050" r="22860" b="20955"/>
-            <wp:docPr id="1589147038" name="Imagem 23"/>
+            <wp:docPr id="370574196" name="Imagem 23"/>
             <wp:cNvGraphicFramePr/>
             <a:graphic xmlns:a="http://schemas.openxmlformats.org/drawingml/2006/main">
               <a:graphicData uri="http://schemas.openxmlformats.org/drawingml/2006/picture">
                 <pic:pic xmlns:pic="http://schemas.openxmlformats.org/drawingml/2006/picture">
                   <pic:nvPicPr>
-                    <pic:cNvPr id="1589147038" name=""/>
+                    <pic:cNvPr id="370574196" name=""/>
                     <pic:cNvPicPr/>
                   </pic:nvPicPr>
                   <pic:blipFill>
@@ -11673,7 +11762,7 @@
           <w:sz w:val="27"/>
         </w:rPr>
       </w:pPr>
-      <w:bookmarkStart w:id="24" w:name="_Toc236923021"/>
+      <w:bookmarkStart w:id="24" w:name="_Toc236924308"/>
       <w:r>
         <w:rPr>
           <w:rFonts w:ascii="Montserrat" w:hAnsi="Montserrat"/>
@@ -11714,16 +11803,16 @@
         </w:rPr>
         <w:lastRenderedPageBreak/>
         <w:drawing>
-          <wp:inline distT="0" distB="0" distL="0" distR="0" wp14:anchorId="4A691923" wp14:editId="2900F262">
+          <wp:inline distT="0" distB="0" distL="0" distR="0" wp14:anchorId="190AF66F" wp14:editId="05931CE6">
             <wp:extent cx="5120640" cy="4627581"/>
             <wp:effectExtent l="19050" t="19050" r="22860" b="20955"/>
-            <wp:docPr id="1288411292" name="Imagem 24"/>
+            <wp:docPr id="359455072" name="Imagem 24"/>
             <wp:cNvGraphicFramePr/>
             <a:graphic xmlns:a="http://schemas.openxmlformats.org/drawingml/2006/main">
               <a:graphicData uri="http://schemas.openxmlformats.org/drawingml/2006/picture">
                 <pic:pic xmlns:pic="http://schemas.openxmlformats.org/drawingml/2006/picture">
                   <pic:nvPicPr>
-                    <pic:cNvPr id="1288411292" name=""/>
+                    <pic:cNvPr id="359455072" name=""/>
                     <pic:cNvPicPr/>
                   </pic:nvPicPr>
                   <pic:blipFill>
@@ -11791,16 +11880,16 @@
         </w:rPr>
         <w:lastRenderedPageBreak/>
         <w:drawing>
-          <wp:inline distT="0" distB="0" distL="0" distR="0" wp14:anchorId="005FDBA7" wp14:editId="09337CE9">
+          <wp:inline distT="0" distB="0" distL="0" distR="0" wp14:anchorId="4CABBA20" wp14:editId="14741BEF">
             <wp:extent cx="5120640" cy="4627581"/>
             <wp:effectExtent l="19050" t="19050" r="22860" b="20955"/>
-            <wp:docPr id="92424518" name="Imagem 25"/>
+            <wp:docPr id="339032892" name="Imagem 25"/>
             <wp:cNvGraphicFramePr/>
             <a:graphic xmlns:a="http://schemas.openxmlformats.org/drawingml/2006/main">
               <a:graphicData uri="http://schemas.openxmlformats.org/drawingml/2006/picture">
                 <pic:pic xmlns:pic="http://schemas.openxmlformats.org/drawingml/2006/picture">
                   <pic:nvPicPr>
-                    <pic:cNvPr id="92424518" name=""/>
+                    <pic:cNvPr id="339032892" name=""/>
                     <pic:cNvPicPr/>
                   </pic:nvPicPr>
                   <pic:blipFill>
@@ -11934,7 +12023,7 @@
           <w:sz w:val="27"/>
         </w:rPr>
       </w:pPr>
-      <w:bookmarkStart w:id="25" w:name="_Toc236923022"/>
+      <w:bookmarkStart w:id="25" w:name="_Toc236924309"/>
       <w:r>
         <w:rPr>
           <w:rFonts w:ascii="Montserrat" w:hAnsi="Montserrat"/>
@@ -11975,16 +12064,16 @@
         </w:rPr>
         <w:lastRenderedPageBreak/>
         <w:drawing>
-          <wp:inline distT="0" distB="0" distL="0" distR="0" wp14:anchorId="4968D9DA" wp14:editId="3846EE40">
+          <wp:inline distT="0" distB="0" distL="0" distR="0" wp14:anchorId="57570237" wp14:editId="2D1E6A64">
             <wp:extent cx="5120640" cy="4627581"/>
             <wp:effectExtent l="19050" t="19050" r="22860" b="20955"/>
-            <wp:docPr id="564076423" name="Imagem 26"/>
+            <wp:docPr id="1303876140" name="Imagem 26"/>
             <wp:cNvGraphicFramePr/>
             <a:graphic xmlns:a="http://schemas.openxmlformats.org/drawingml/2006/main">
               <a:graphicData uri="http://schemas.openxmlformats.org/drawingml/2006/picture">
                 <pic:pic xmlns:pic="http://schemas.openxmlformats.org/drawingml/2006/picture">
                   <pic:nvPicPr>
-                    <pic:cNvPr id="564076423" name=""/>
+                    <pic:cNvPr id="1303876140" name=""/>
                     <pic:cNvPicPr/>
                   </pic:nvPicPr>
                   <pic:blipFill>
@@ -12074,7 +12163,7 @@
           <w:sz w:val="34"/>
         </w:rPr>
       </w:pPr>
-      <w:bookmarkStart w:id="26" w:name="_Toc236923023"/>
+      <w:bookmarkStart w:id="26" w:name="_Toc236924310"/>
       <w:r>
         <w:rPr>
           <w:rFonts w:ascii="Montserrat" w:hAnsi="Montserrat"/>
@@ -12116,7 +12205,7 @@
           <w:sz w:val="27"/>
         </w:rPr>
       </w:pPr>
-      <w:bookmarkStart w:id="27" w:name="_Toc236923024"/>
+      <w:bookmarkStart w:id="27" w:name="_Toc236924311"/>
       <w:r>
         <w:rPr>
           <w:rFonts w:ascii="Montserrat" w:hAnsi="Montserrat"/>
@@ -12156,16 +12245,16 @@
           <w:noProof/>
         </w:rPr>
         <w:drawing>
-          <wp:inline distT="0" distB="0" distL="0" distR="0" wp14:anchorId="6D7397D3" wp14:editId="25C3FC09">
+          <wp:inline distT="0" distB="0" distL="0" distR="0" wp14:anchorId="27D1E454" wp14:editId="2CB42086">
             <wp:extent cx="5120640" cy="4627581"/>
             <wp:effectExtent l="19050" t="19050" r="22860" b="20955"/>
-            <wp:docPr id="569341560" name="Imagem 27"/>
+            <wp:docPr id="357163952" name="Imagem 27"/>
             <wp:cNvGraphicFramePr/>
             <a:graphic xmlns:a="http://schemas.openxmlformats.org/drawingml/2006/main">
               <a:graphicData uri="http://schemas.openxmlformats.org/drawingml/2006/picture">
                 <pic:pic xmlns:pic="http://schemas.openxmlformats.org/drawingml/2006/picture">
                   <pic:nvPicPr>
-                    <pic:cNvPr id="569341560" name=""/>
+                    <pic:cNvPr id="357163952" name=""/>
                     <pic:cNvPicPr/>
                   </pic:nvPicPr>
                   <pic:blipFill>
@@ -12233,16 +12322,16 @@
         </w:rPr>
         <w:lastRenderedPageBreak/>
         <w:drawing>
-          <wp:inline distT="0" distB="0" distL="0" distR="0" wp14:anchorId="70ABA43A" wp14:editId="22A6AEAB">
+          <wp:inline distT="0" distB="0" distL="0" distR="0" wp14:anchorId="5C11756F" wp14:editId="21DE49D3">
             <wp:extent cx="5120640" cy="4627581"/>
             <wp:effectExtent l="19050" t="19050" r="22860" b="20955"/>
-            <wp:docPr id="1961392881" name="Imagem 28"/>
+            <wp:docPr id="1636013877" name="Imagem 28"/>
             <wp:cNvGraphicFramePr/>
             <a:graphic xmlns:a="http://schemas.openxmlformats.org/drawingml/2006/main">
               <a:graphicData uri="http://schemas.openxmlformats.org/drawingml/2006/picture">
                 <pic:pic xmlns:pic="http://schemas.openxmlformats.org/drawingml/2006/picture">
                   <pic:nvPicPr>
-                    <pic:cNvPr id="1961392881" name=""/>
+                    <pic:cNvPr id="1636013877" name=""/>
                     <pic:cNvPicPr/>
                   </pic:nvPicPr>
                   <pic:blipFill>
@@ -12310,16 +12399,16 @@
         </w:rPr>
         <w:lastRenderedPageBreak/>
         <w:drawing>
-          <wp:inline distT="0" distB="0" distL="0" distR="0" wp14:anchorId="082757A4" wp14:editId="042AE7E4">
+          <wp:inline distT="0" distB="0" distL="0" distR="0" wp14:anchorId="3C052D9B" wp14:editId="43890F49">
             <wp:extent cx="5120640" cy="4627581"/>
             <wp:effectExtent l="19050" t="19050" r="22860" b="20955"/>
-            <wp:docPr id="8475255" name="Imagem 29"/>
+            <wp:docPr id="1458362475" name="Imagem 29"/>
             <wp:cNvGraphicFramePr/>
             <a:graphic xmlns:a="http://schemas.openxmlformats.org/drawingml/2006/main">
               <a:graphicData uri="http://schemas.openxmlformats.org/drawingml/2006/picture">
                 <pic:pic xmlns:pic="http://schemas.openxmlformats.org/drawingml/2006/picture">
                   <pic:nvPicPr>
-                    <pic:cNvPr id="8475255" name=""/>
+                    <pic:cNvPr id="1458362475" name=""/>
                     <pic:cNvPicPr/>
                   </pic:nvPicPr>
                   <pic:blipFill>
@@ -12456,16 +12545,16 @@
         </w:rPr>
         <w:lastRenderedPageBreak/>
         <w:drawing>
-          <wp:inline distT="0" distB="0" distL="0" distR="0" wp14:anchorId="727C5CF8" wp14:editId="17DB2408">
+          <wp:inline distT="0" distB="0" distL="0" distR="0" wp14:anchorId="2D8E2A8C" wp14:editId="42B8D893">
             <wp:extent cx="5120640" cy="1715571"/>
             <wp:effectExtent l="19050" t="19050" r="22860" b="18415"/>
-            <wp:docPr id="1418037065" name="Imagem 30"/>
+            <wp:docPr id="1434461021" name="Imagem 30"/>
             <wp:cNvGraphicFramePr/>
             <a:graphic xmlns:a="http://schemas.openxmlformats.org/drawingml/2006/main">
               <a:graphicData uri="http://schemas.openxmlformats.org/drawingml/2006/picture">
                 <pic:pic xmlns:pic="http://schemas.openxmlformats.org/drawingml/2006/picture">
                   <pic:nvPicPr>
-                    <pic:cNvPr id="1418037065" name=""/>
+                    <pic:cNvPr id="1434461021" name=""/>
                     <pic:cNvPicPr/>
                   </pic:nvPicPr>
                   <pic:blipFill>
@@ -12602,16 +12691,16 @@
         </w:rPr>
         <w:lastRenderedPageBreak/>
         <w:drawing>
-          <wp:inline distT="0" distB="0" distL="0" distR="0" wp14:anchorId="1E30513E" wp14:editId="44B1B9A7">
+          <wp:inline distT="0" distB="0" distL="0" distR="0" wp14:anchorId="46901057" wp14:editId="5B1BC318">
             <wp:extent cx="5120640" cy="3282818"/>
             <wp:effectExtent l="19050" t="19050" r="22860" b="13335"/>
-            <wp:docPr id="2113745998" name="Imagem 31"/>
+            <wp:docPr id="177821863" name="Imagem 31"/>
             <wp:cNvGraphicFramePr/>
             <a:graphic xmlns:a="http://schemas.openxmlformats.org/drawingml/2006/main">
               <a:graphicData uri="http://schemas.openxmlformats.org/drawingml/2006/picture">
                 <pic:pic xmlns:pic="http://schemas.openxmlformats.org/drawingml/2006/picture">
                   <pic:nvPicPr>
-                    <pic:cNvPr id="2113745998" name=""/>
+                    <pic:cNvPr id="177821863" name=""/>
                     <pic:cNvPicPr/>
                   </pic:nvPicPr>
                   <pic:blipFill>
@@ -12723,16 +12812,16 @@
           <w:noProof/>
         </w:rPr>
         <w:drawing>
-          <wp:inline distT="0" distB="0" distL="0" distR="0" wp14:anchorId="3F2D26E4" wp14:editId="2ABC2B6A">
+          <wp:inline distT="0" distB="0" distL="0" distR="0" wp14:anchorId="07CCA8E3" wp14:editId="5725177C">
             <wp:extent cx="5120640" cy="1515102"/>
             <wp:effectExtent l="19050" t="19050" r="22860" b="28575"/>
-            <wp:docPr id="30382576" name="Imagem 32"/>
+            <wp:docPr id="1829598173" name="Imagem 32"/>
             <wp:cNvGraphicFramePr/>
             <a:graphic xmlns:a="http://schemas.openxmlformats.org/drawingml/2006/main">
               <a:graphicData uri="http://schemas.openxmlformats.org/drawingml/2006/picture">
                 <pic:pic xmlns:pic="http://schemas.openxmlformats.org/drawingml/2006/picture">
                   <pic:nvPicPr>
-                    <pic:cNvPr id="30382576" name=""/>
+                    <pic:cNvPr id="1829598173" name=""/>
                     <pic:cNvPicPr/>
                   </pic:nvPicPr>
                   <pic:blipFill>
@@ -12845,16 +12934,16 @@
           <w:noProof/>
         </w:rPr>
         <w:drawing>
-          <wp:inline distT="0" distB="0" distL="0" distR="0" wp14:anchorId="66DD2127" wp14:editId="61182244">
+          <wp:inline distT="0" distB="0" distL="0" distR="0" wp14:anchorId="2F071B04" wp14:editId="73CBB329">
             <wp:extent cx="5120640" cy="1391113"/>
             <wp:effectExtent l="19050" t="19050" r="22860" b="19050"/>
-            <wp:docPr id="519179682" name="Imagem 33"/>
+            <wp:docPr id="1735962514" name="Imagem 33"/>
             <wp:cNvGraphicFramePr/>
             <a:graphic xmlns:a="http://schemas.openxmlformats.org/drawingml/2006/main">
               <a:graphicData uri="http://schemas.openxmlformats.org/drawingml/2006/picture">
                 <pic:pic xmlns:pic="http://schemas.openxmlformats.org/drawingml/2006/picture">
                   <pic:nvPicPr>
-                    <pic:cNvPr id="519179682" name=""/>
+                    <pic:cNvPr id="1735962514" name=""/>
                     <pic:cNvPicPr/>
                   </pic:nvPicPr>
                   <pic:blipFill>
@@ -12966,16 +13055,16 @@
           <w:noProof/>
         </w:rPr>
         <w:drawing>
-          <wp:inline distT="0" distB="0" distL="0" distR="0" wp14:anchorId="13AC5E86" wp14:editId="36A9B9DF">
+          <wp:inline distT="0" distB="0" distL="0" distR="0" wp14:anchorId="6269ED3E" wp14:editId="3A29A819">
             <wp:extent cx="5120640" cy="1125174"/>
             <wp:effectExtent l="19050" t="19050" r="22860" b="18415"/>
-            <wp:docPr id="2084194871" name="Imagem 34"/>
+            <wp:docPr id="1627925245" name="Imagem 34"/>
             <wp:cNvGraphicFramePr/>
             <a:graphic xmlns:a="http://schemas.openxmlformats.org/drawingml/2006/main">
               <a:graphicData uri="http://schemas.openxmlformats.org/drawingml/2006/picture">
                 <pic:pic xmlns:pic="http://schemas.openxmlformats.org/drawingml/2006/picture">
                   <pic:nvPicPr>
-                    <pic:cNvPr id="2084194871" name=""/>
+                    <pic:cNvPr id="1627925245" name=""/>
                     <pic:cNvPicPr/>
                   </pic:nvPicPr>
                   <pic:blipFill>
@@ -13065,7 +13154,7 @@
           <w:sz w:val="27"/>
         </w:rPr>
       </w:pPr>
-      <w:bookmarkStart w:id="28" w:name="_Toc236923025"/>
+      <w:bookmarkStart w:id="28" w:name="_Toc236924312"/>
       <w:r>
         <w:rPr>
           <w:rFonts w:ascii="Montserrat" w:hAnsi="Montserrat"/>
@@ -13105,16 +13194,16 @@
           <w:noProof/>
         </w:rPr>
         <w:drawing>
-          <wp:inline distT="0" distB="0" distL="0" distR="0" wp14:anchorId="3D54E5A7" wp14:editId="47DB04C5">
+          <wp:inline distT="0" distB="0" distL="0" distR="0" wp14:anchorId="3767046D" wp14:editId="46D09575">
             <wp:extent cx="5120640" cy="4627581"/>
             <wp:effectExtent l="19050" t="19050" r="22860" b="20955"/>
-            <wp:docPr id="334124001" name="Imagem 35"/>
+            <wp:docPr id="649843979" name="Imagem 35"/>
             <wp:cNvGraphicFramePr/>
             <a:graphic xmlns:a="http://schemas.openxmlformats.org/drawingml/2006/main">
               <a:graphicData uri="http://schemas.openxmlformats.org/drawingml/2006/picture">
                 <pic:pic xmlns:pic="http://schemas.openxmlformats.org/drawingml/2006/picture">
                   <pic:nvPicPr>
-                    <pic:cNvPr id="334124001" name=""/>
+                    <pic:cNvPr id="649843979" name=""/>
                     <pic:cNvPicPr/>
                   </pic:nvPicPr>
                   <pic:blipFill>
@@ -13182,16 +13271,16 @@
         </w:rPr>
         <w:lastRenderedPageBreak/>
         <w:drawing>
-          <wp:inline distT="0" distB="0" distL="0" distR="0" wp14:anchorId="2F0849DD" wp14:editId="7735DDFC">
+          <wp:inline distT="0" distB="0" distL="0" distR="0" wp14:anchorId="3B1ABCDB" wp14:editId="70FDAF0F">
             <wp:extent cx="5120640" cy="4627581"/>
             <wp:effectExtent l="19050" t="19050" r="22860" b="20955"/>
-            <wp:docPr id="388399663" name="Imagem 36"/>
+            <wp:docPr id="1630499968" name="Imagem 36"/>
             <wp:cNvGraphicFramePr/>
             <a:graphic xmlns:a="http://schemas.openxmlformats.org/drawingml/2006/main">
               <a:graphicData uri="http://schemas.openxmlformats.org/drawingml/2006/picture">
                 <pic:pic xmlns:pic="http://schemas.openxmlformats.org/drawingml/2006/picture">
                   <pic:nvPicPr>
-                    <pic:cNvPr id="388399663" name=""/>
+                    <pic:cNvPr id="1630499968" name=""/>
                     <pic:cNvPicPr/>
                   </pic:nvPicPr>
                   <pic:blipFill>
@@ -13328,16 +13417,16 @@
         </w:rPr>
         <w:lastRenderedPageBreak/>
         <w:drawing>
-          <wp:inline distT="0" distB="0" distL="0" distR="0" wp14:anchorId="4AE668FF" wp14:editId="06C0EAE5">
+          <wp:inline distT="0" distB="0" distL="0" distR="0" wp14:anchorId="3944F1B5" wp14:editId="511E04FE">
             <wp:extent cx="5120640" cy="2144319"/>
             <wp:effectExtent l="19050" t="19050" r="22860" b="27940"/>
-            <wp:docPr id="2089053169" name="Imagem 37"/>
+            <wp:docPr id="285588999" name="Imagem 37"/>
             <wp:cNvGraphicFramePr/>
             <a:graphic xmlns:a="http://schemas.openxmlformats.org/drawingml/2006/main">
               <a:graphicData uri="http://schemas.openxmlformats.org/drawingml/2006/picture">
                 <pic:pic xmlns:pic="http://schemas.openxmlformats.org/drawingml/2006/picture">
                   <pic:nvPicPr>
-                    <pic:cNvPr id="2089053169" name=""/>
+                    <pic:cNvPr id="285588999" name=""/>
                     <pic:cNvPicPr/>
                   </pic:nvPicPr>
                   <pic:blipFill>
@@ -13425,16 +13514,16 @@
           <w:noProof/>
         </w:rPr>
         <w:drawing>
-          <wp:inline distT="0" distB="0" distL="0" distR="0" wp14:anchorId="61998D56" wp14:editId="7B254216">
+          <wp:inline distT="0" distB="0" distL="0" distR="0" wp14:anchorId="7A5E6451" wp14:editId="39D82B47">
             <wp:extent cx="5120640" cy="1055647"/>
             <wp:effectExtent l="19050" t="19050" r="22860" b="11430"/>
-            <wp:docPr id="54600226" name="Imagem 38"/>
+            <wp:docPr id="1691948675" name="Imagem 38"/>
             <wp:cNvGraphicFramePr/>
             <a:graphic xmlns:a="http://schemas.openxmlformats.org/drawingml/2006/main">
               <a:graphicData uri="http://schemas.openxmlformats.org/drawingml/2006/picture">
                 <pic:pic xmlns:pic="http://schemas.openxmlformats.org/drawingml/2006/picture">
                   <pic:nvPicPr>
-                    <pic:cNvPr id="54600226" name=""/>
+                    <pic:cNvPr id="1691948675" name=""/>
                     <pic:cNvPicPr/>
                   </pic:nvPicPr>
                   <pic:blipFill>
@@ -13547,16 +13636,16 @@
         </w:rPr>
         <w:lastRenderedPageBreak/>
         <w:drawing>
-          <wp:inline distT="0" distB="0" distL="0" distR="0" wp14:anchorId="2F8981CB" wp14:editId="6779CABA">
+          <wp:inline distT="0" distB="0" distL="0" distR="0" wp14:anchorId="47BA78AA" wp14:editId="22C295FF">
             <wp:extent cx="5120640" cy="3282818"/>
             <wp:effectExtent l="19050" t="19050" r="22860" b="13335"/>
-            <wp:docPr id="174589653" name="Imagem 39"/>
+            <wp:docPr id="515823066" name="Imagem 39"/>
             <wp:cNvGraphicFramePr/>
             <a:graphic xmlns:a="http://schemas.openxmlformats.org/drawingml/2006/main">
               <a:graphicData uri="http://schemas.openxmlformats.org/drawingml/2006/picture">
                 <pic:pic xmlns:pic="http://schemas.openxmlformats.org/drawingml/2006/picture">
                   <pic:nvPicPr>
-                    <pic:cNvPr id="174589653" name=""/>
+                    <pic:cNvPr id="515823066" name=""/>
                     <pic:cNvPicPr/>
                   </pic:nvPicPr>
                   <pic:blipFill>
@@ -13689,16 +13778,16 @@
           <w:noProof/>
         </w:rPr>
         <w:drawing>
-          <wp:inline distT="0" distB="0" distL="0" distR="0" wp14:anchorId="1CA6EA16" wp14:editId="04BFA02D">
+          <wp:inline distT="0" distB="0" distL="0" distR="0" wp14:anchorId="7919F5CF" wp14:editId="43463D04">
             <wp:extent cx="5120640" cy="1978034"/>
             <wp:effectExtent l="19050" t="19050" r="22860" b="22225"/>
-            <wp:docPr id="994523856" name="Imagem 40"/>
+            <wp:docPr id="1580544993" name="Imagem 40"/>
             <wp:cNvGraphicFramePr/>
             <a:graphic xmlns:a="http://schemas.openxmlformats.org/drawingml/2006/main">
               <a:graphicData uri="http://schemas.openxmlformats.org/drawingml/2006/picture">
                 <pic:pic xmlns:pic="http://schemas.openxmlformats.org/drawingml/2006/picture">
                   <pic:nvPicPr>
-                    <pic:cNvPr id="994523856" name=""/>
+                    <pic:cNvPr id="1580544993" name=""/>
                     <pic:cNvPicPr/>
                   </pic:nvPicPr>
                   <pic:blipFill>
@@ -13771,7 +13860,7 @@
           <w:sz w:val="34"/>
         </w:rPr>
       </w:pPr>
-      <w:bookmarkStart w:id="29" w:name="_Toc236923026"/>
+      <w:bookmarkStart w:id="29" w:name="_Toc236924313"/>
       <w:r>
         <w:rPr>
           <w:rFonts w:ascii="Montserrat" w:hAnsi="Montserrat"/>
@@ -13831,7 +13920,7 @@
           <w:sz w:val="27"/>
         </w:rPr>
       </w:pPr>
-      <w:bookmarkStart w:id="30" w:name="_Toc236923027"/>
+      <w:bookmarkStart w:id="30" w:name="_Toc236924314"/>
       <w:r>
         <w:rPr>
           <w:rFonts w:ascii="Montserrat" w:hAnsi="Montserrat"/>
@@ -13871,16 +13960,16 @@
           <w:noProof/>
         </w:rPr>
         <w:drawing>
-          <wp:inline distT="0" distB="0" distL="0" distR="0" wp14:anchorId="01F77452" wp14:editId="303BBBFD">
+          <wp:inline distT="0" distB="0" distL="0" distR="0" wp14:anchorId="338A89A6" wp14:editId="5F465EC2">
             <wp:extent cx="5303520" cy="4792851"/>
             <wp:effectExtent l="19050" t="19050" r="11430" b="27305"/>
-            <wp:docPr id="1397080074" name="Imagem 41"/>
+            <wp:docPr id="2118714833" name="Imagem 41"/>
             <wp:cNvGraphicFramePr/>
             <a:graphic xmlns:a="http://schemas.openxmlformats.org/drawingml/2006/main">
               <a:graphicData uri="http://schemas.openxmlformats.org/drawingml/2006/picture">
                 <pic:pic xmlns:pic="http://schemas.openxmlformats.org/drawingml/2006/picture">
                   <pic:nvPicPr>
-                    <pic:cNvPr id="1397080074" name=""/>
+                    <pic:cNvPr id="2118714833" name=""/>
                     <pic:cNvPicPr/>
                   </pic:nvPicPr>
                   <pic:blipFill>
@@ -13949,7 +14038,7 @@
           <w:sz w:val="27"/>
         </w:rPr>
       </w:pPr>
-      <w:bookmarkStart w:id="31" w:name="_Toc236923028"/>
+      <w:bookmarkStart w:id="31" w:name="_Toc236924315"/>
       <w:r>
         <w:rPr>
           <w:rFonts w:ascii="Montserrat" w:hAnsi="Montserrat"/>
@@ -13989,16 +14078,16 @@
           <w:noProof/>
         </w:rPr>
         <w:drawing>
-          <wp:inline distT="0" distB="0" distL="0" distR="0" wp14:anchorId="23E2F863" wp14:editId="3A35BB48">
+          <wp:inline distT="0" distB="0" distL="0" distR="0" wp14:anchorId="4ECEC551" wp14:editId="2BD6B423">
             <wp:extent cx="5303520" cy="4792851"/>
             <wp:effectExtent l="19050" t="19050" r="11430" b="27305"/>
-            <wp:docPr id="912024814" name="Imagem 42"/>
+            <wp:docPr id="1522153434" name="Imagem 42"/>
             <wp:cNvGraphicFramePr/>
             <a:graphic xmlns:a="http://schemas.openxmlformats.org/drawingml/2006/main">
               <a:graphicData uri="http://schemas.openxmlformats.org/drawingml/2006/picture">
                 <pic:pic xmlns:pic="http://schemas.openxmlformats.org/drawingml/2006/picture">
                   <pic:nvPicPr>
-                    <pic:cNvPr id="912024814" name=""/>
+                    <pic:cNvPr id="1522153434" name=""/>
                     <pic:cNvPicPr/>
                   </pic:nvPicPr>
                   <pic:blipFill>
@@ -14066,7 +14155,7 @@
           <w:sz w:val="27"/>
         </w:rPr>
       </w:pPr>
-      <w:bookmarkStart w:id="32" w:name="_Toc236923029"/>
+      <w:bookmarkStart w:id="32" w:name="_Toc236924316"/>
       <w:r>
         <w:rPr>
           <w:rFonts w:ascii="Montserrat" w:hAnsi="Montserrat"/>
@@ -14107,16 +14196,16 @@
         </w:rPr>
         <w:lastRenderedPageBreak/>
         <w:drawing>
-          <wp:inline distT="0" distB="0" distL="0" distR="0" wp14:anchorId="57BAFDF3" wp14:editId="4DEAB8FD">
+          <wp:inline distT="0" distB="0" distL="0" distR="0" wp14:anchorId="49AF3207" wp14:editId="33F788D4">
             <wp:extent cx="5303520" cy="4792851"/>
             <wp:effectExtent l="19050" t="19050" r="11430" b="27305"/>
-            <wp:docPr id="1023587571" name="Imagem 43"/>
+            <wp:docPr id="73872892" name="Imagem 43"/>
             <wp:cNvGraphicFramePr/>
             <a:graphic xmlns:a="http://schemas.openxmlformats.org/drawingml/2006/main">
               <a:graphicData uri="http://schemas.openxmlformats.org/drawingml/2006/picture">
                 <pic:pic xmlns:pic="http://schemas.openxmlformats.org/drawingml/2006/picture">
                   <pic:nvPicPr>
-                    <pic:cNvPr id="1023587571" name=""/>
+                    <pic:cNvPr id="73872892" name=""/>
                     <pic:cNvPicPr/>
                   </pic:nvPicPr>
                   <pic:blipFill>
@@ -14184,16 +14273,16 @@
         </w:rPr>
         <w:lastRenderedPageBreak/>
         <w:drawing>
-          <wp:inline distT="0" distB="0" distL="0" distR="0" wp14:anchorId="5D025914" wp14:editId="3460D166">
+          <wp:inline distT="0" distB="0" distL="0" distR="0" wp14:anchorId="79C9ECD4" wp14:editId="11A63F62">
             <wp:extent cx="5303520" cy="4792851"/>
             <wp:effectExtent l="19050" t="19050" r="11430" b="27305"/>
-            <wp:docPr id="1531424208" name="Imagem 44"/>
+            <wp:docPr id="629276945" name="Imagem 44"/>
             <wp:cNvGraphicFramePr/>
             <a:graphic xmlns:a="http://schemas.openxmlformats.org/drawingml/2006/main">
               <a:graphicData uri="http://schemas.openxmlformats.org/drawingml/2006/picture">
                 <pic:pic xmlns:pic="http://schemas.openxmlformats.org/drawingml/2006/picture">
                   <pic:nvPicPr>
-                    <pic:cNvPr id="1531424208" name=""/>
+                    <pic:cNvPr id="629276945" name=""/>
                     <pic:cNvPicPr/>
                   </pic:nvPicPr>
                   <pic:blipFill>
@@ -14286,7 +14375,7 @@
           <w:sz w:val="34"/>
         </w:rPr>
       </w:pPr>
-      <w:bookmarkStart w:id="33" w:name="_Toc236923030"/>
+      <w:bookmarkStart w:id="33" w:name="_Toc236924317"/>
       <w:r>
         <w:rPr>
           <w:rFonts w:ascii="Montserrat" w:hAnsi="Montserrat"/>
@@ -14328,7 +14417,7 @@
           <w:sz w:val="27"/>
         </w:rPr>
       </w:pPr>
-      <w:bookmarkStart w:id="34" w:name="_Toc236923031"/>
+      <w:bookmarkStart w:id="34" w:name="_Toc236924318"/>
       <w:r>
         <w:rPr>
           <w:rFonts w:ascii="Montserrat" w:hAnsi="Montserrat"/>
@@ -14368,16 +14457,16 @@
           <w:noProof/>
         </w:rPr>
         <w:drawing>
-          <wp:inline distT="0" distB="0" distL="0" distR="0" wp14:anchorId="733EF4B8" wp14:editId="6256D526">
+          <wp:inline distT="0" distB="0" distL="0" distR="0" wp14:anchorId="151844E7" wp14:editId="6C3A0816">
             <wp:extent cx="5303520" cy="4792851"/>
             <wp:effectExtent l="19050" t="19050" r="11430" b="27305"/>
-            <wp:docPr id="1585202713" name="Imagem 45"/>
+            <wp:docPr id="783430045" name="Imagem 45"/>
             <wp:cNvGraphicFramePr/>
             <a:graphic xmlns:a="http://schemas.openxmlformats.org/drawingml/2006/main">
               <a:graphicData uri="http://schemas.openxmlformats.org/drawingml/2006/picture">
                 <pic:pic xmlns:pic="http://schemas.openxmlformats.org/drawingml/2006/picture">
                   <pic:nvPicPr>
-                    <pic:cNvPr id="1585202713" name=""/>
+                    <pic:cNvPr id="783430045" name=""/>
                     <pic:cNvPicPr/>
                   </pic:nvPicPr>
                   <pic:blipFill>
@@ -14445,7 +14534,7 @@
           <w:sz w:val="27"/>
         </w:rPr>
       </w:pPr>
-      <w:bookmarkStart w:id="35" w:name="_Toc236923032"/>
+      <w:bookmarkStart w:id="35" w:name="_Toc236924319"/>
       <w:r>
         <w:rPr>
           <w:rFonts w:ascii="Montserrat" w:hAnsi="Montserrat"/>
@@ -14486,16 +14575,16 @@
           <w:noProof/>
         </w:rPr>
         <w:drawing>
-          <wp:inline distT="0" distB="0" distL="0" distR="0" wp14:anchorId="700E4B30" wp14:editId="7B1CA0CB">
+          <wp:inline distT="0" distB="0" distL="0" distR="0" wp14:anchorId="32677F43" wp14:editId="32CBFE8E">
             <wp:extent cx="5303520" cy="4792851"/>
             <wp:effectExtent l="19050" t="19050" r="11430" b="27305"/>
-            <wp:docPr id="1931557355" name="Imagem 46"/>
+            <wp:docPr id="1607038398" name="Imagem 46"/>
             <wp:cNvGraphicFramePr/>
             <a:graphic xmlns:a="http://schemas.openxmlformats.org/drawingml/2006/main">
               <a:graphicData uri="http://schemas.openxmlformats.org/drawingml/2006/picture">
                 <pic:pic xmlns:pic="http://schemas.openxmlformats.org/drawingml/2006/picture">
                   <pic:nvPicPr>
-                    <pic:cNvPr id="1931557355" name=""/>
+                    <pic:cNvPr id="1607038398" name=""/>
                     <pic:cNvPicPr/>
                   </pic:nvPicPr>
                   <pic:blipFill>
@@ -14563,7 +14652,7 @@
           <w:sz w:val="27"/>
         </w:rPr>
       </w:pPr>
-      <w:bookmarkStart w:id="36" w:name="_Toc236923033"/>
+      <w:bookmarkStart w:id="36" w:name="_Toc236924320"/>
       <w:r>
         <w:rPr>
           <w:rFonts w:ascii="Montserrat" w:hAnsi="Montserrat"/>
@@ -14604,16 +14693,16 @@
         </w:rPr>
         <w:lastRenderedPageBreak/>
         <w:drawing>
-          <wp:inline distT="0" distB="0" distL="0" distR="0" wp14:anchorId="7AF8134D" wp14:editId="03845105">
+          <wp:inline distT="0" distB="0" distL="0" distR="0" wp14:anchorId="136981B0" wp14:editId="1A678F21">
             <wp:extent cx="5303520" cy="4792851"/>
             <wp:effectExtent l="19050" t="19050" r="11430" b="27305"/>
-            <wp:docPr id="2103614788" name="Imagem 47"/>
+            <wp:docPr id="1076214154" name="Imagem 47"/>
             <wp:cNvGraphicFramePr/>
             <a:graphic xmlns:a="http://schemas.openxmlformats.org/drawingml/2006/main">
               <a:graphicData uri="http://schemas.openxmlformats.org/drawingml/2006/picture">
                 <pic:pic xmlns:pic="http://schemas.openxmlformats.org/drawingml/2006/picture">
                   <pic:nvPicPr>
-                    <pic:cNvPr id="2103614788" name=""/>
+                    <pic:cNvPr id="1076214154" name=""/>
                     <pic:cNvPicPr/>
                   </pic:nvPicPr>
                   <pic:blipFill>
@@ -14681,7 +14770,7 @@
           <w:sz w:val="27"/>
         </w:rPr>
       </w:pPr>
-      <w:bookmarkStart w:id="37" w:name="_Toc236923034"/>
+      <w:bookmarkStart w:id="37" w:name="_Toc236924321"/>
       <w:r>
         <w:rPr>
           <w:rFonts w:ascii="Montserrat" w:hAnsi="Montserrat"/>
@@ -14826,16 +14915,16 @@
           <w:noProof/>
         </w:rPr>
         <w:drawing>
-          <wp:inline distT="0" distB="0" distL="0" distR="0" wp14:anchorId="72F60B89" wp14:editId="27ED47D1">
+          <wp:inline distT="0" distB="0" distL="0" distR="0" wp14:anchorId="32357871" wp14:editId="498A903B">
             <wp:extent cx="5303520" cy="4267180"/>
             <wp:effectExtent l="19050" t="19050" r="11430" b="19685"/>
-            <wp:docPr id="165357508" name="Imagem 48"/>
+            <wp:docPr id="459114914" name="Imagem 48"/>
             <wp:cNvGraphicFramePr/>
             <a:graphic xmlns:a="http://schemas.openxmlformats.org/drawingml/2006/main">
               <a:graphicData uri="http://schemas.openxmlformats.org/drawingml/2006/picture">
                 <pic:pic xmlns:pic="http://schemas.openxmlformats.org/drawingml/2006/picture">
                   <pic:nvPicPr>
-                    <pic:cNvPr id="165357508" name=""/>
+                    <pic:cNvPr id="459114914" name=""/>
                     <pic:cNvPicPr/>
                   </pic:nvPicPr>
                   <pic:blipFill>
@@ -14903,16 +14992,16 @@
         </w:rPr>
         <w:lastRenderedPageBreak/>
         <w:drawing>
-          <wp:inline distT="0" distB="0" distL="0" distR="0" wp14:anchorId="25F9002C" wp14:editId="0A3184E3">
+          <wp:inline distT="0" distB="0" distL="0" distR="0" wp14:anchorId="383FE8EB" wp14:editId="53F38C76">
             <wp:extent cx="5303520" cy="3962338"/>
             <wp:effectExtent l="19050" t="19050" r="11430" b="19685"/>
-            <wp:docPr id="576386447" name="Imagem 49"/>
+            <wp:docPr id="1786085165" name="Imagem 49"/>
             <wp:cNvGraphicFramePr/>
             <a:graphic xmlns:a="http://schemas.openxmlformats.org/drawingml/2006/main">
               <a:graphicData uri="http://schemas.openxmlformats.org/drawingml/2006/picture">
                 <pic:pic xmlns:pic="http://schemas.openxmlformats.org/drawingml/2006/picture">
                   <pic:nvPicPr>
-                    <pic:cNvPr id="576386447" name=""/>
+                    <pic:cNvPr id="1786085165" name=""/>
                     <pic:cNvPicPr/>
                   </pic:nvPicPr>
                   <pic:blipFill>
@@ -15005,7 +15094,7 @@
           <w:sz w:val="34"/>
         </w:rPr>
       </w:pPr>
-      <w:bookmarkStart w:id="38" w:name="_Toc236923035"/>
+      <w:bookmarkStart w:id="38" w:name="_Toc236924322"/>
       <w:r>
         <w:rPr>
           <w:rFonts w:ascii="Montserrat" w:hAnsi="Montserrat"/>
@@ -15249,7 +15338,7 @@
           <w:sz w:val="34"/>
         </w:rPr>
       </w:pPr>
-      <w:bookmarkStart w:id="39" w:name="_Toc236923036"/>
+      <w:bookmarkStart w:id="39" w:name="_Toc236924323"/>
       <w:r>
         <w:rPr>
           <w:rFonts w:ascii="Montserrat" w:hAnsi="Montserrat"/>
@@ -16959,7 +17048,7 @@
 <file path=word/numbering.xml><?xml version="1.0" encoding="utf-8"?>
 <w:numbering xmlns:wpc="http://schemas.microsoft.com/office/word/2010/wordprocessingCanvas" xmlns:cx="http://schemas.microsoft.com/office/drawing/2014/chartex" xmlns:cx1="http://schemas.microsoft.com/office/drawing/2015/9/8/chartex" xmlns:cx2="http://schemas.microsoft.com/office/drawing/2015/10/21/chartex" xmlns:cx3="http://schemas.microsoft.com/office/drawing/2016/5/9/chartex" xmlns:cx4="http://schemas.microsoft.com/office/drawing/2016/5/10/chartex" xmlns:cx5="http://schemas.microsoft.com/office/drawing/2016/5/11/chartex" xmlns:cx6="http://schemas.microsoft.com/office/drawing/2016/5/12/chartex" xmlns:cx7="http://schemas.microsoft.com/office/drawing/2016/5/13/chartex" xmlns:cx8="http://schemas.microsoft.com/office/drawing/2016/5/14/chartex" xmlns:mc="http://schemas.openxmlformats.org/markup-compatibility/2006" xmlns:aink="http://schemas.microsoft.com/office/drawing/2016/ink" xmlns:am3d="http://schemas.microsoft.com/office/drawing/2017/model3d" xmlns:o="urn:schemas-microsoft-com:office:office" xmlns:oel="http://schemas.microsoft.com/office/2019/extlst" xmlns:r="http://schemas.openxmlformats.org/officeDocument/2006/relationships" xmlns:m="http://schemas.openxmlformats.org/officeDocument/2006/math" xmlns:v="urn:schemas-microsoft-com:vml" xmlns:wp14="http://schemas.microsoft.com/office/word/2010/wordprocessingDrawing" xmlns:wp="http://schemas.openxmlformats.org/drawingml/2006/wordprocessingDrawing" xmlns:w10="urn:schemas-microsoft-com:office:word" xmlns:w="http://schemas.openxmlformats.org/wordprocessingml/2006/main" xmlns:w14="http://schemas.microsoft.com/office/word/2010/wordml" xmlns:w15="http://schemas.microsoft.com/office/word/2012/wordml" xmlns:w16cei="http://schemas.microsoft.com/office/word/2026/wordml/cei" xmlns:w16cex="http://schemas.microsoft.com/office/word/2018/wordml/cex" xmlns:w16cid="http://schemas.microsoft.com/office/word/2016/wordml/cid" xmlns:w16="http://schemas.microsoft.com/office/word/2018/wordml" xmlns:w16du="http://schemas.microsoft.com/office/word/2023/wordml/word16du" xmlns:w16sdtdh="http://schemas.microsoft.com/office/word/2020/wordml/sdtdatahash" xmlns:w16sdtfl="http://schemas.microsoft.com/office/word/2024/wordml/sdtformatlock" xmlns:w16se="http://schemas.microsoft.com/office/word/2015/wordml/symex" xmlns:wpg="http://schemas.microsoft.com/office/word/2010/wordprocessingGroup" xmlns:wpi="http://schemas.microsoft.com/office/word/2010/wordprocessingInk" xmlns:wne="http://schemas.microsoft.com/office/word/2006/wordml" xmlns:wps="http://schemas.microsoft.com/office/word/2010/wordprocessingShape" mc:Ignorable="w14 w15 w16se w16cid w16 w16cex w16sdtdh w16sdtfl w16du wp14">
   <w:abstractNum w:abstractNumId="0" w15:restartNumberingAfterBreak="0">
-    <w:nsid w:val="08F1251E"/>
+    <w:nsid w:val="0AC4253C"/>
     <w:multiLevelType w:val="singleLevel"/>
     <w:tmpl w:val="04160001"/>
     <w:lvl w:ilvl="0">
@@ -16976,7 +17065,7 @@
     </w:lvl>
   </w:abstractNum>
   <w:abstractNum w:abstractNumId="1" w15:restartNumberingAfterBreak="0">
-    <w:nsid w:val="11DF4B83"/>
+    <w:nsid w:val="0C8867D8"/>
     <w:multiLevelType w:val="singleLevel"/>
     <w:tmpl w:val="04160001"/>
     <w:lvl w:ilvl="0">
@@ -16993,7 +17082,7 @@
     </w:lvl>
   </w:abstractNum>
   <w:abstractNum w:abstractNumId="2" w15:restartNumberingAfterBreak="0">
-    <w:nsid w:val="211D0ACB"/>
+    <w:nsid w:val="1DA4469F"/>
     <w:multiLevelType w:val="singleLevel"/>
     <w:tmpl w:val="04160001"/>
     <w:lvl w:ilvl="0">
@@ -17010,7 +17099,7 @@
     </w:lvl>
   </w:abstractNum>
   <w:abstractNum w:abstractNumId="3" w15:restartNumberingAfterBreak="0">
-    <w:nsid w:val="27244CDB"/>
+    <w:nsid w:val="1F0067D0"/>
     <w:multiLevelType w:val="singleLevel"/>
     <w:tmpl w:val="04160001"/>
     <w:lvl w:ilvl="0">
@@ -17027,7 +17116,7 @@
     </w:lvl>
   </w:abstractNum>
   <w:abstractNum w:abstractNumId="4" w15:restartNumberingAfterBreak="0">
-    <w:nsid w:val="2DFA15CD"/>
+    <w:nsid w:val="234D7B1D"/>
     <w:multiLevelType w:val="singleLevel"/>
     <w:tmpl w:val="04160001"/>
     <w:lvl w:ilvl="0">
@@ -17044,7 +17133,7 @@
     </w:lvl>
   </w:abstractNum>
   <w:abstractNum w:abstractNumId="5" w15:restartNumberingAfterBreak="0">
-    <w:nsid w:val="33C67247"/>
+    <w:nsid w:val="25E57311"/>
     <w:multiLevelType w:val="singleLevel"/>
     <w:tmpl w:val="04160001"/>
     <w:lvl w:ilvl="0">
@@ -17061,7 +17150,7 @@
     </w:lvl>
   </w:abstractNum>
   <w:abstractNum w:abstractNumId="6" w15:restartNumberingAfterBreak="0">
-    <w:nsid w:val="35BE03B0"/>
+    <w:nsid w:val="2E651BC7"/>
     <w:multiLevelType w:val="singleLevel"/>
     <w:tmpl w:val="04160001"/>
     <w:lvl w:ilvl="0">
@@ -17078,7 +17167,7 @@
     </w:lvl>
   </w:abstractNum>
   <w:abstractNum w:abstractNumId="7" w15:restartNumberingAfterBreak="0">
-    <w:nsid w:val="42027980"/>
+    <w:nsid w:val="3B893382"/>
     <w:multiLevelType w:val="singleLevel"/>
     <w:tmpl w:val="04160001"/>
     <w:lvl w:ilvl="0">
@@ -17095,7 +17184,7 @@
     </w:lvl>
   </w:abstractNum>
   <w:abstractNum w:abstractNumId="8" w15:restartNumberingAfterBreak="0">
-    <w:nsid w:val="4A92198A"/>
+    <w:nsid w:val="3FFC6D0B"/>
     <w:multiLevelType w:val="singleLevel"/>
     <w:tmpl w:val="04160001"/>
     <w:lvl w:ilvl="0">
@@ -17112,7 +17201,7 @@
     </w:lvl>
   </w:abstractNum>
   <w:abstractNum w:abstractNumId="9" w15:restartNumberingAfterBreak="0">
-    <w:nsid w:val="4F7D4176"/>
+    <w:nsid w:val="464B64EA"/>
     <w:multiLevelType w:val="singleLevel"/>
     <w:tmpl w:val="04160001"/>
     <w:lvl w:ilvl="0">
@@ -17129,7 +17218,7 @@
     </w:lvl>
   </w:abstractNum>
   <w:abstractNum w:abstractNumId="10" w15:restartNumberingAfterBreak="0">
-    <w:nsid w:val="54632A26"/>
+    <w:nsid w:val="4C355CB0"/>
     <w:multiLevelType w:val="singleLevel"/>
     <w:tmpl w:val="04160001"/>
     <w:lvl w:ilvl="0">
@@ -17146,7 +17235,7 @@
     </w:lvl>
   </w:abstractNum>
   <w:abstractNum w:abstractNumId="11" w15:restartNumberingAfterBreak="0">
-    <w:nsid w:val="55363D33"/>
+    <w:nsid w:val="4EDC259B"/>
     <w:multiLevelType w:val="singleLevel"/>
     <w:tmpl w:val="04160001"/>
     <w:lvl w:ilvl="0">
@@ -17163,7 +17252,7 @@
     </w:lvl>
   </w:abstractNum>
   <w:abstractNum w:abstractNumId="12" w15:restartNumberingAfterBreak="0">
-    <w:nsid w:val="57841C65"/>
+    <w:nsid w:val="56106D5D"/>
     <w:multiLevelType w:val="singleLevel"/>
     <w:tmpl w:val="04160001"/>
     <w:lvl w:ilvl="0">
@@ -17180,7 +17269,7 @@
     </w:lvl>
   </w:abstractNum>
   <w:abstractNum w:abstractNumId="13" w15:restartNumberingAfterBreak="0">
-    <w:nsid w:val="5ECD298A"/>
+    <w:nsid w:val="5CDB019B"/>
     <w:multiLevelType w:val="singleLevel"/>
     <w:tmpl w:val="04160001"/>
     <w:lvl w:ilvl="0">
@@ -17197,7 +17286,7 @@
     </w:lvl>
   </w:abstractNum>
   <w:abstractNum w:abstractNumId="14" w15:restartNumberingAfterBreak="0">
-    <w:nsid w:val="76364582"/>
+    <w:nsid w:val="62F354A8"/>
     <w:multiLevelType w:val="singleLevel"/>
     <w:tmpl w:val="04160001"/>
     <w:lvl w:ilvl="0">
@@ -17214,7 +17303,7 @@
     </w:lvl>
   </w:abstractNum>
   <w:abstractNum w:abstractNumId="15" w15:restartNumberingAfterBreak="0">
-    <w:nsid w:val="7C4A6D91"/>
+    <w:nsid w:val="6C902186"/>
     <w:multiLevelType w:val="singleLevel"/>
     <w:tmpl w:val="04160001"/>
     <w:lvl w:ilvl="0">
@@ -17231,7 +17320,7 @@
     </w:lvl>
   </w:abstractNum>
   <w:abstractNum w:abstractNumId="16" w15:restartNumberingAfterBreak="0">
-    <w:nsid w:val="7E8F1091"/>
+    <w:nsid w:val="7B4A128E"/>
     <w:multiLevelType w:val="singleLevel"/>
     <w:tmpl w:val="04160001"/>
     <w:lvl w:ilvl="0">
@@ -17248,7 +17337,7 @@
     </w:lvl>
   </w:abstractNum>
   <w:abstractNum w:abstractNumId="17" w15:restartNumberingAfterBreak="0">
-    <w:nsid w:val="7F250797"/>
+    <w:nsid w:val="7EDC1AC1"/>
     <w:multiLevelType w:val="singleLevel"/>
     <w:tmpl w:val="04160001"/>
     <w:lvl w:ilvl="0">
@@ -17264,59 +17353,59 @@
       </w:rPr>
     </w:lvl>
   </w:abstractNum>
-  <w:num w:numId="1" w16cid:durableId="1855268338">
+  <w:num w:numId="1" w16cid:durableId="417749786">
+    <w:abstractNumId w:val="7"/>
+  </w:num>
+  <w:num w:numId="2" w16cid:durableId="598489722">
+    <w:abstractNumId w:val="4"/>
+  </w:num>
+  <w:num w:numId="3" w16cid:durableId="1579711244">
+    <w:abstractNumId w:val="10"/>
+  </w:num>
+  <w:num w:numId="4" w16cid:durableId="1721201299">
+    <w:abstractNumId w:val="9"/>
+  </w:num>
+  <w:num w:numId="5" w16cid:durableId="1383754485">
+    <w:abstractNumId w:val="0"/>
+  </w:num>
+  <w:num w:numId="6" w16cid:durableId="1597788834">
+    <w:abstractNumId w:val="11"/>
+  </w:num>
+  <w:num w:numId="7" w16cid:durableId="1224369908">
+    <w:abstractNumId w:val="13"/>
+  </w:num>
+  <w:num w:numId="8" w16cid:durableId="519515582">
+    <w:abstractNumId w:val="2"/>
+  </w:num>
+  <w:num w:numId="9" w16cid:durableId="527987383">
+    <w:abstractNumId w:val="5"/>
+  </w:num>
+  <w:num w:numId="10" w16cid:durableId="1094784295">
+    <w:abstractNumId w:val="3"/>
+  </w:num>
+  <w:num w:numId="11" w16cid:durableId="532155388">
     <w:abstractNumId w:val="15"/>
   </w:num>
-  <w:num w:numId="2" w16cid:durableId="1816333939">
+  <w:num w:numId="12" w16cid:durableId="449974337">
+    <w:abstractNumId w:val="8"/>
+  </w:num>
+  <w:num w:numId="13" w16cid:durableId="1665742465">
+    <w:abstractNumId w:val="6"/>
+  </w:num>
+  <w:num w:numId="14" w16cid:durableId="413163985">
+    <w:abstractNumId w:val="14"/>
+  </w:num>
+  <w:num w:numId="15" w16cid:durableId="92210949">
+    <w:abstractNumId w:val="17"/>
+  </w:num>
+  <w:num w:numId="16" w16cid:durableId="1957055762">
     <w:abstractNumId w:val="16"/>
   </w:num>
-  <w:num w:numId="3" w16cid:durableId="1155494678">
+  <w:num w:numId="17" w16cid:durableId="2133475597">
     <w:abstractNumId w:val="12"/>
   </w:num>
-  <w:num w:numId="4" w16cid:durableId="1946501126">
-    <w:abstractNumId w:val="14"/>
-  </w:num>
-  <w:num w:numId="5" w16cid:durableId="328674585">
-    <w:abstractNumId w:val="11"/>
-  </w:num>
-  <w:num w:numId="6" w16cid:durableId="491331033">
-    <w:abstractNumId w:val="7"/>
-  </w:num>
-  <w:num w:numId="7" w16cid:durableId="1910379551">
-    <w:abstractNumId w:val="4"/>
-  </w:num>
-  <w:num w:numId="8" w16cid:durableId="255023011">
-    <w:abstractNumId w:val="10"/>
-  </w:num>
-  <w:num w:numId="9" w16cid:durableId="1200439023">
-    <w:abstractNumId w:val="0"/>
-  </w:num>
-  <w:num w:numId="10" w16cid:durableId="505874186">
-    <w:abstractNumId w:val="6"/>
-  </w:num>
-  <w:num w:numId="11" w16cid:durableId="1004013349">
-    <w:abstractNumId w:val="9"/>
-  </w:num>
-  <w:num w:numId="12" w16cid:durableId="1382441880">
+  <w:num w:numId="18" w16cid:durableId="704328563">
     <w:abstractNumId w:val="1"/>
-  </w:num>
-  <w:num w:numId="13" w16cid:durableId="919674644">
-    <w:abstractNumId w:val="17"/>
-  </w:num>
-  <w:num w:numId="14" w16cid:durableId="1443960300">
-    <w:abstractNumId w:val="3"/>
-  </w:num>
-  <w:num w:numId="15" w16cid:durableId="172383512">
-    <w:abstractNumId w:val="2"/>
-  </w:num>
-  <w:num w:numId="16" w16cid:durableId="1443647581">
-    <w:abstractNumId w:val="5"/>
-  </w:num>
-  <w:num w:numId="17" w16cid:durableId="578904149">
-    <w:abstractNumId w:val="13"/>
-  </w:num>
-  <w:num w:numId="18" w16cid:durableId="2051226088">
-    <w:abstractNumId w:val="8"/>
   </w:num>
 </w:numbering>
 </file>
@@ -17729,7 +17818,7 @@
     <w:link w:val="Ttulo1Char"/>
     <w:uiPriority w:val="9"/>
     <w:qFormat/>
-    <w:rsid w:val="00A51A5C"/>
+    <w:rsid w:val="00D8080E"/>
     <w:pPr>
       <w:keepNext/>
       <w:keepLines/>
@@ -17751,7 +17840,7 @@
     <w:uiPriority w:val="9"/>
     <w:unhideWhenUsed/>
     <w:qFormat/>
-    <w:rsid w:val="00A51A5C"/>
+    <w:rsid w:val="00D8080E"/>
     <w:pPr>
       <w:keepNext/>
       <w:keepLines/>
@@ -17774,7 +17863,7 @@
     <w:semiHidden/>
     <w:unhideWhenUsed/>
     <w:qFormat/>
-    <w:rsid w:val="00A51A5C"/>
+    <w:rsid w:val="00D8080E"/>
     <w:pPr>
       <w:keepNext/>
       <w:keepLines/>
@@ -17797,7 +17886,7 @@
     <w:semiHidden/>
     <w:unhideWhenUsed/>
     <w:qFormat/>
-    <w:rsid w:val="00A51A5C"/>
+    <w:rsid w:val="00D8080E"/>
     <w:pPr>
       <w:keepNext/>
       <w:keepLines/>
@@ -17820,7 +17909,7 @@
     <w:semiHidden/>
     <w:unhideWhenUsed/>
     <w:qFormat/>
-    <w:rsid w:val="00A51A5C"/>
+    <w:rsid w:val="00D8080E"/>
     <w:pPr>
       <w:keepNext/>
       <w:keepLines/>
@@ -17841,7 +17930,7 @@
     <w:semiHidden/>
     <w:unhideWhenUsed/>
     <w:qFormat/>
-    <w:rsid w:val="00A51A5C"/>
+    <w:rsid w:val="00D8080E"/>
     <w:pPr>
       <w:keepNext/>
       <w:keepLines/>
@@ -17864,7 +17953,7 @@
     <w:semiHidden/>
     <w:unhideWhenUsed/>
     <w:qFormat/>
-    <w:rsid w:val="00A51A5C"/>
+    <w:rsid w:val="00D8080E"/>
     <w:pPr>
       <w:keepNext/>
       <w:keepLines/>
@@ -17885,7 +17974,7 @@
     <w:semiHidden/>
     <w:unhideWhenUsed/>
     <w:qFormat/>
-    <w:rsid w:val="00A51A5C"/>
+    <w:rsid w:val="00D8080E"/>
     <w:pPr>
       <w:keepNext/>
       <w:keepLines/>
@@ -17908,7 +17997,7 @@
     <w:semiHidden/>
     <w:unhideWhenUsed/>
     <w:qFormat/>
-    <w:rsid w:val="00A51A5C"/>
+    <w:rsid w:val="00D8080E"/>
     <w:pPr>
       <w:keepNext/>
       <w:keepLines/>
@@ -17952,7 +18041,7 @@
     <w:basedOn w:val="Fontepargpadro"/>
     <w:link w:val="Ttulo1"/>
     <w:uiPriority w:val="9"/>
-    <w:rsid w:val="00A51A5C"/>
+    <w:rsid w:val="00D8080E"/>
     <w:rPr>
       <w:rFonts w:asciiTheme="majorHAnsi" w:eastAsiaTheme="majorEastAsia" w:hAnsiTheme="majorHAnsi" w:cstheme="majorBidi"/>
       <w:color w:val="0F4761" w:themeColor="accent1" w:themeShade="BF"/>
@@ -17965,7 +18054,7 @@
     <w:basedOn w:val="Fontepargpadro"/>
     <w:link w:val="Ttulo2"/>
     <w:uiPriority w:val="9"/>
-    <w:rsid w:val="00A51A5C"/>
+    <w:rsid w:val="00D8080E"/>
     <w:rPr>
       <w:rFonts w:asciiTheme="majorHAnsi" w:eastAsiaTheme="majorEastAsia" w:hAnsiTheme="majorHAnsi" w:cstheme="majorBidi"/>
       <w:color w:val="0F4761" w:themeColor="accent1" w:themeShade="BF"/>
@@ -17979,7 +18068,7 @@
     <w:link w:val="Ttulo3"/>
     <w:uiPriority w:val="9"/>
     <w:semiHidden/>
-    <w:rsid w:val="00A51A5C"/>
+    <w:rsid w:val="00D8080E"/>
     <w:rPr>
       <w:rFonts w:eastAsiaTheme="majorEastAsia" w:cstheme="majorBidi"/>
       <w:color w:val="0F4761" w:themeColor="accent1" w:themeShade="BF"/>
@@ -17993,7 +18082,7 @@
     <w:link w:val="Ttulo4"/>
     <w:uiPriority w:val="9"/>
     <w:semiHidden/>
-    <w:rsid w:val="00A51A5C"/>
+    <w:rsid w:val="00D8080E"/>
     <w:rPr>
       <w:rFonts w:eastAsiaTheme="majorEastAsia" w:cstheme="majorBidi"/>
       <w:i/>
@@ -18007,7 +18096,7 @@
     <w:link w:val="Ttulo5"/>
     <w:uiPriority w:val="9"/>
     <w:semiHidden/>
-    <w:rsid w:val="00A51A5C"/>
+    <w:rsid w:val="00D8080E"/>
     <w:rPr>
       <w:rFonts w:eastAsiaTheme="majorEastAsia" w:cstheme="majorBidi"/>
       <w:color w:val="0F4761" w:themeColor="accent1" w:themeShade="BF"/>
@@ -18019,7 +18108,7 @@
     <w:link w:val="Ttulo6"/>
     <w:uiPriority w:val="9"/>
     <w:semiHidden/>
-    <w:rsid w:val="00A51A5C"/>
+    <w:rsid w:val="00D8080E"/>
     <w:rPr>
       <w:rFonts w:eastAsiaTheme="majorEastAsia" w:cstheme="majorBidi"/>
       <w:i/>
@@ -18033,7 +18122,7 @@
     <w:link w:val="Ttulo7"/>
     <w:uiPriority w:val="9"/>
     <w:semiHidden/>
-    <w:rsid w:val="00A51A5C"/>
+    <w:rsid w:val="00D8080E"/>
     <w:rPr>
       <w:rFonts w:eastAsiaTheme="majorEastAsia" w:cstheme="majorBidi"/>
       <w:color w:val="595959" w:themeColor="text1" w:themeTint="A6"/>
@@ -18045,7 +18134,7 @@
     <w:link w:val="Ttulo8"/>
     <w:uiPriority w:val="9"/>
     <w:semiHidden/>
-    <w:rsid w:val="00A51A5C"/>
+    <w:rsid w:val="00D8080E"/>
     <w:rPr>
       <w:rFonts w:eastAsiaTheme="majorEastAsia" w:cstheme="majorBidi"/>
       <w:i/>
@@ -18059,7 +18148,7 @@
     <w:link w:val="Ttulo9"/>
     <w:uiPriority w:val="9"/>
     <w:semiHidden/>
-    <w:rsid w:val="00A51A5C"/>
+    <w:rsid w:val="00D8080E"/>
     <w:rPr>
       <w:rFonts w:eastAsiaTheme="majorEastAsia" w:cstheme="majorBidi"/>
       <w:color w:val="272727" w:themeColor="text1" w:themeTint="D8"/>
@@ -18072,7 +18161,7 @@
     <w:link w:val="TtuloChar"/>
     <w:uiPriority w:val="10"/>
     <w:qFormat/>
-    <w:rsid w:val="00A51A5C"/>
+    <w:rsid w:val="00D8080E"/>
     <w:pPr>
       <w:spacing w:after="80" w:line="240" w:lineRule="auto"/>
       <w:contextualSpacing/>
@@ -18090,7 +18179,7 @@
     <w:basedOn w:val="Fontepargpadro"/>
     <w:link w:val="Ttulo"/>
     <w:uiPriority w:val="10"/>
-    <w:rsid w:val="00A51A5C"/>
+    <w:rsid w:val="00D8080E"/>
     <w:rPr>
       <w:rFonts w:asciiTheme="majorHAnsi" w:eastAsiaTheme="majorEastAsia" w:hAnsiTheme="majorHAnsi" w:cstheme="majorBidi"/>
       <w:spacing w:val="-10"/>
@@ -18106,7 +18195,7 @@
     <w:link w:val="SubttuloChar"/>
     <w:uiPriority w:val="11"/>
     <w:qFormat/>
-    <w:rsid w:val="00A51A5C"/>
+    <w:rsid w:val="00D8080E"/>
     <w:pPr>
       <w:numPr>
         <w:ilvl w:val="1"/>
@@ -18125,7 +18214,7 @@
     <w:basedOn w:val="Fontepargpadro"/>
     <w:link w:val="Subttulo"/>
     <w:uiPriority w:val="11"/>
-    <w:rsid w:val="00A51A5C"/>
+    <w:rsid w:val="00D8080E"/>
     <w:rPr>
       <w:rFonts w:eastAsiaTheme="majorEastAsia" w:cstheme="majorBidi"/>
       <w:color w:val="595959" w:themeColor="text1" w:themeTint="A6"/>
@@ -18141,7 +18230,7 @@
     <w:link w:val="CitaoChar"/>
     <w:uiPriority w:val="29"/>
     <w:qFormat/>
-    <w:rsid w:val="00A51A5C"/>
+    <w:rsid w:val="00D8080E"/>
     <w:pPr>
       <w:spacing w:before="160"/>
       <w:jc w:val="center"/>
@@ -18157,7 +18246,7 @@
     <w:basedOn w:val="Fontepargpadro"/>
     <w:link w:val="Citao"/>
     <w:uiPriority w:val="29"/>
-    <w:rsid w:val="00A51A5C"/>
+    <w:rsid w:val="00D8080E"/>
     <w:rPr>
       <w:i/>
       <w:iCs/>
@@ -18169,7 +18258,7 @@
     <w:basedOn w:val="Normal"/>
     <w:uiPriority w:val="34"/>
     <w:qFormat/>
-    <w:rsid w:val="00A51A5C"/>
+    <w:rsid w:val="00D8080E"/>
     <w:pPr>
       <w:ind w:left="720"/>
       <w:contextualSpacing/>
@@ -18180,7 +18269,7 @@
     <w:basedOn w:val="Fontepargpadro"/>
     <w:uiPriority w:val="21"/>
     <w:qFormat/>
-    <w:rsid w:val="00A51A5C"/>
+    <w:rsid w:val="00D8080E"/>
     <w:rPr>
       <w:i/>
       <w:iCs/>
@@ -18194,7 +18283,7 @@
     <w:link w:val="CitaoIntensaChar"/>
     <w:uiPriority w:val="30"/>
     <w:qFormat/>
-    <w:rsid w:val="00A51A5C"/>
+    <w:rsid w:val="00D8080E"/>
     <w:pPr>
       <w:pBdr>
         <w:top w:val="single" w:sz="4" w:space="10" w:color="0F4761" w:themeColor="accent1" w:themeShade="BF"/>
@@ -18215,7 +18304,7 @@
     <w:basedOn w:val="Fontepargpadro"/>
     <w:link w:val="CitaoIntensa"/>
     <w:uiPriority w:val="30"/>
-    <w:rsid w:val="00A51A5C"/>
+    <w:rsid w:val="00D8080E"/>
     <w:rPr>
       <w:i/>
       <w:iCs/>
@@ -18227,7 +18316,7 @@
     <w:basedOn w:val="Fontepargpadro"/>
     <w:uiPriority w:val="32"/>
     <w:qFormat/>
-    <w:rsid w:val="00A51A5C"/>
+    <w:rsid w:val="00D8080E"/>
     <w:rPr>
       <w:b/>
       <w:bCs/>
@@ -18242,7 +18331,7 @@
     <w:link w:val="CabealhoChar"/>
     <w:uiPriority w:val="99"/>
     <w:unhideWhenUsed/>
-    <w:rsid w:val="00A51A5C"/>
+    <w:rsid w:val="00D8080E"/>
     <w:pPr>
       <w:tabs>
         <w:tab w:val="center" w:pos="4252"/>
@@ -18256,7 +18345,7 @@
     <w:basedOn w:val="Fontepargpadro"/>
     <w:link w:val="Cabealho"/>
     <w:uiPriority w:val="99"/>
-    <w:rsid w:val="00A51A5C"/>
+    <w:rsid w:val="00D8080E"/>
   </w:style>
   <w:style w:type="paragraph" w:styleId="Rodap">
     <w:name w:val="footer"/>
@@ -18264,7 +18353,7 @@
     <w:link w:val="RodapChar"/>
     <w:uiPriority w:val="99"/>
     <w:unhideWhenUsed/>
-    <w:rsid w:val="00A51A5C"/>
+    <w:rsid w:val="00D8080E"/>
     <w:pPr>
       <w:tabs>
         <w:tab w:val="center" w:pos="4252"/>
@@ -18278,7 +18367,7 @@
     <w:basedOn w:val="Fontepargpadro"/>
     <w:link w:val="Rodap"/>
     <w:uiPriority w:val="99"/>
-    <w:rsid w:val="00A51A5C"/>
+    <w:rsid w:val="00D8080E"/>
   </w:style>
   <w:style w:type="paragraph" w:styleId="Sumrio1">
     <w:name w:val="toc 1"/>
@@ -18287,7 +18376,7 @@
     <w:autoRedefine/>
     <w:uiPriority w:val="39"/>
     <w:unhideWhenUsed/>
-    <w:rsid w:val="00A51A5C"/>
+    <w:rsid w:val="00D8080E"/>
     <w:pPr>
       <w:spacing w:after="100"/>
     </w:pPr>
@@ -18299,7 +18388,7 @@
     <w:autoRedefine/>
     <w:uiPriority w:val="39"/>
     <w:unhideWhenUsed/>
-    <w:rsid w:val="00A51A5C"/>
+    <w:rsid w:val="00D8080E"/>
     <w:pPr>
       <w:spacing w:after="100"/>
       <w:ind w:left="240"/>

</xml_diff>

<commit_message>
Adiciona pré-cadastro de usuário (nome, telefone, e-mail, papel) na Administração
Permite ao Admin cadastrar uma pessoa antes do primeiro login dela, informando
nome, telefone, e-mail e papel. A pessoa aparece na aba Usuários com o selo
"Pendente — 1º login"; ao logar pela primeira vez, esses dados são aplicados
automaticamente ao perfil recém-criado (tabela perfis_pendentes, com RLS
restringindo criação/edição a Admin e leitura/remoção ao próprio e-mail).
Também adiciona o campo Telefone, editável, aos usuários já cadastrados.

Corrige a nota de arquitetura no CLAUDE.md: quase todas as tabelas já tinham
RLS habilitado (não apenas push_subscriptions, como estava documentado).

Co-Authored-By: Claude Sonnet 5 <noreply@anthropic.com>
</commit_message>
<xml_diff>
--- a/Manual de Uso - Ferramenta de Gestao de Projetos.docx
+++ b/Manual de Uso - Ferramenta de Gestao de Projetos.docx
@@ -129,7 +129,7 @@
           <w:color w:val="6A6A70"/>
           <w:sz w:val="22"/>
         </w:rPr>
-        <w:t>Versao 2.13 - 06 de agosto de 2026 (substitui a versao 2.12 de 06/08/2026)</w:t>
+        <w:t>Versao 2.14 - 10 de agosto de 2026 (substitui a versao 2.13 de 06/08/2026)</w:t>
       </w:r>
     </w:p>
     <w:p>
@@ -229,7 +229,7 @@
         <w:rPr>
           <w:noProof/>
         </w:rPr>
-        <w:instrText xml:space="preserve"> PAGEREF _Toc236924284 \h </w:instrText>
+        <w:instrText xml:space="preserve"> PAGEREF _Toc237269524 \h </w:instrText>
       </w:r>
       <w:r>
         <w:rPr>
@@ -290,7 +290,7 @@
         <w:rPr>
           <w:noProof/>
         </w:rPr>
-        <w:instrText xml:space="preserve"> PAGEREF _Toc236924285 \h </w:instrText>
+        <w:instrText xml:space="preserve"> PAGEREF _Toc237269525 \h </w:instrText>
       </w:r>
       <w:r>
         <w:rPr>
@@ -351,7 +351,7 @@
         <w:rPr>
           <w:noProof/>
         </w:rPr>
-        <w:instrText xml:space="preserve"> PAGEREF _Toc236924286 \h </w:instrText>
+        <w:instrText xml:space="preserve"> PAGEREF _Toc237269526 \h </w:instrText>
       </w:r>
       <w:r>
         <w:rPr>
@@ -412,7 +412,7 @@
         <w:rPr>
           <w:noProof/>
         </w:rPr>
-        <w:instrText xml:space="preserve"> PAGEREF _Toc236924287 \h </w:instrText>
+        <w:instrText xml:space="preserve"> PAGEREF _Toc237269527 \h </w:instrText>
       </w:r>
       <w:r>
         <w:rPr>
@@ -473,7 +473,7 @@
         <w:rPr>
           <w:noProof/>
         </w:rPr>
-        <w:instrText xml:space="preserve"> PAGEREF _Toc236924288 \h </w:instrText>
+        <w:instrText xml:space="preserve"> PAGEREF _Toc237269528 \h </w:instrText>
       </w:r>
       <w:r>
         <w:rPr>
@@ -534,7 +534,7 @@
         <w:rPr>
           <w:noProof/>
         </w:rPr>
-        <w:instrText xml:space="preserve"> PAGEREF _Toc236924289 \h </w:instrText>
+        <w:instrText xml:space="preserve"> PAGEREF _Toc237269529 \h </w:instrText>
       </w:r>
       <w:r>
         <w:rPr>
@@ -595,7 +595,7 @@
         <w:rPr>
           <w:noProof/>
         </w:rPr>
-        <w:instrText xml:space="preserve"> PAGEREF _Toc236924290 \h </w:instrText>
+        <w:instrText xml:space="preserve"> PAGEREF _Toc237269530 \h </w:instrText>
       </w:r>
       <w:r>
         <w:rPr>
@@ -656,7 +656,7 @@
         <w:rPr>
           <w:noProof/>
         </w:rPr>
-        <w:instrText xml:space="preserve"> PAGEREF _Toc236924291 \h </w:instrText>
+        <w:instrText xml:space="preserve"> PAGEREF _Toc237269531 \h </w:instrText>
       </w:r>
       <w:r>
         <w:rPr>
@@ -717,7 +717,7 @@
         <w:rPr>
           <w:noProof/>
         </w:rPr>
-        <w:instrText xml:space="preserve"> PAGEREF _Toc236924292 \h </w:instrText>
+        <w:instrText xml:space="preserve"> PAGEREF _Toc237269532 \h </w:instrText>
       </w:r>
       <w:r>
         <w:rPr>
@@ -778,7 +778,7 @@
         <w:rPr>
           <w:noProof/>
         </w:rPr>
-        <w:instrText xml:space="preserve"> PAGEREF _Toc236924293 \h </w:instrText>
+        <w:instrText xml:space="preserve"> PAGEREF _Toc237269533 \h </w:instrText>
       </w:r>
       <w:r>
         <w:rPr>
@@ -839,7 +839,7 @@
         <w:rPr>
           <w:noProof/>
         </w:rPr>
-        <w:instrText xml:space="preserve"> PAGEREF _Toc236924294 \h </w:instrText>
+        <w:instrText xml:space="preserve"> PAGEREF _Toc237269534 \h </w:instrText>
       </w:r>
       <w:r>
         <w:rPr>
@@ -900,7 +900,7 @@
         <w:rPr>
           <w:noProof/>
         </w:rPr>
-        <w:instrText xml:space="preserve"> PAGEREF _Toc236924295 \h </w:instrText>
+        <w:instrText xml:space="preserve"> PAGEREF _Toc237269535 \h </w:instrText>
       </w:r>
       <w:r>
         <w:rPr>
@@ -961,7 +961,7 @@
         <w:rPr>
           <w:noProof/>
         </w:rPr>
-        <w:instrText xml:space="preserve"> PAGEREF _Toc236924296 \h </w:instrText>
+        <w:instrText xml:space="preserve"> PAGEREF _Toc237269536 \h </w:instrText>
       </w:r>
       <w:r>
         <w:rPr>
@@ -1022,7 +1022,7 @@
         <w:rPr>
           <w:noProof/>
         </w:rPr>
-        <w:instrText xml:space="preserve"> PAGEREF _Toc236924297 \h </w:instrText>
+        <w:instrText xml:space="preserve"> PAGEREF _Toc237269537 \h </w:instrText>
       </w:r>
       <w:r>
         <w:rPr>
@@ -1083,7 +1083,7 @@
         <w:rPr>
           <w:noProof/>
         </w:rPr>
-        <w:instrText xml:space="preserve"> PAGEREF _Toc236924298 \h </w:instrText>
+        <w:instrText xml:space="preserve"> PAGEREF _Toc237269538 \h </w:instrText>
       </w:r>
       <w:r>
         <w:rPr>
@@ -1144,7 +1144,7 @@
         <w:rPr>
           <w:noProof/>
         </w:rPr>
-        <w:instrText xml:space="preserve"> PAGEREF _Toc236924299 \h </w:instrText>
+        <w:instrText xml:space="preserve"> PAGEREF _Toc237269539 \h </w:instrText>
       </w:r>
       <w:r>
         <w:rPr>
@@ -1205,7 +1205,7 @@
         <w:rPr>
           <w:noProof/>
         </w:rPr>
-        <w:instrText xml:space="preserve"> PAGEREF _Toc236924300 \h </w:instrText>
+        <w:instrText xml:space="preserve"> PAGEREF _Toc237269540 \h </w:instrText>
       </w:r>
       <w:r>
         <w:rPr>
@@ -1266,7 +1266,7 @@
         <w:rPr>
           <w:noProof/>
         </w:rPr>
-        <w:instrText xml:space="preserve"> PAGEREF _Toc236924301 \h </w:instrText>
+        <w:instrText xml:space="preserve"> PAGEREF _Toc237269541 \h </w:instrText>
       </w:r>
       <w:r>
         <w:rPr>
@@ -1327,7 +1327,7 @@
         <w:rPr>
           <w:noProof/>
         </w:rPr>
-        <w:instrText xml:space="preserve"> PAGEREF _Toc236924302 \h </w:instrText>
+        <w:instrText xml:space="preserve"> PAGEREF _Toc237269542 \h </w:instrText>
       </w:r>
       <w:r>
         <w:rPr>
@@ -1388,7 +1388,7 @@
         <w:rPr>
           <w:noProof/>
         </w:rPr>
-        <w:instrText xml:space="preserve"> PAGEREF _Toc236924303 \h </w:instrText>
+        <w:instrText xml:space="preserve"> PAGEREF _Toc237269543 \h </w:instrText>
       </w:r>
       <w:r>
         <w:rPr>
@@ -1449,7 +1449,7 @@
         <w:rPr>
           <w:noProof/>
         </w:rPr>
-        <w:instrText xml:space="preserve"> PAGEREF _Toc236924304 \h </w:instrText>
+        <w:instrText xml:space="preserve"> PAGEREF _Toc237269544 \h </w:instrText>
       </w:r>
       <w:r>
         <w:rPr>
@@ -1510,7 +1510,7 @@
         <w:rPr>
           <w:noProof/>
         </w:rPr>
-        <w:instrText xml:space="preserve"> PAGEREF _Toc236924305 \h </w:instrText>
+        <w:instrText xml:space="preserve"> PAGEREF _Toc237269545 \h </w:instrText>
       </w:r>
       <w:r>
         <w:rPr>
@@ -1571,7 +1571,7 @@
         <w:rPr>
           <w:noProof/>
         </w:rPr>
-        <w:instrText xml:space="preserve"> PAGEREF _Toc236924306 \h </w:instrText>
+        <w:instrText xml:space="preserve"> PAGEREF _Toc237269546 \h </w:instrText>
       </w:r>
       <w:r>
         <w:rPr>
@@ -1632,7 +1632,7 @@
         <w:rPr>
           <w:noProof/>
         </w:rPr>
-        <w:instrText xml:space="preserve"> PAGEREF _Toc236924307 \h </w:instrText>
+        <w:instrText xml:space="preserve"> PAGEREF _Toc237269547 \h </w:instrText>
       </w:r>
       <w:r>
         <w:rPr>
@@ -1693,7 +1693,7 @@
         <w:rPr>
           <w:noProof/>
         </w:rPr>
-        <w:instrText xml:space="preserve"> PAGEREF _Toc236924308 \h </w:instrText>
+        <w:instrText xml:space="preserve"> PAGEREF _Toc237269548 \h </w:instrText>
       </w:r>
       <w:r>
         <w:rPr>
@@ -1754,7 +1754,7 @@
         <w:rPr>
           <w:noProof/>
         </w:rPr>
-        <w:instrText xml:space="preserve"> PAGEREF _Toc236924309 \h </w:instrText>
+        <w:instrText xml:space="preserve"> PAGEREF _Toc237269549 \h </w:instrText>
       </w:r>
       <w:r>
         <w:rPr>
@@ -1816,7 +1816,7 @@
         <w:rPr>
           <w:noProof/>
         </w:rPr>
-        <w:instrText xml:space="preserve"> PAGEREF _Toc236924310 \h </w:instrText>
+        <w:instrText xml:space="preserve"> PAGEREF _Toc237269550 \h </w:instrText>
       </w:r>
       <w:r>
         <w:rPr>
@@ -1877,7 +1877,7 @@
         <w:rPr>
           <w:noProof/>
         </w:rPr>
-        <w:instrText xml:space="preserve"> PAGEREF _Toc236924311 \h </w:instrText>
+        <w:instrText xml:space="preserve"> PAGEREF _Toc237269551 \h </w:instrText>
       </w:r>
       <w:r>
         <w:rPr>
@@ -1938,7 +1938,7 @@
         <w:rPr>
           <w:noProof/>
         </w:rPr>
-        <w:instrText xml:space="preserve"> PAGEREF _Toc236924312 \h </w:instrText>
+        <w:instrText xml:space="preserve"> PAGEREF _Toc237269552 \h </w:instrText>
       </w:r>
       <w:r>
         <w:rPr>
@@ -1999,7 +1999,7 @@
         <w:rPr>
           <w:noProof/>
         </w:rPr>
-        <w:instrText xml:space="preserve"> PAGEREF _Toc236924313 \h </w:instrText>
+        <w:instrText xml:space="preserve"> PAGEREF _Toc237269553 \h </w:instrText>
       </w:r>
       <w:r>
         <w:rPr>
@@ -2060,7 +2060,7 @@
         <w:rPr>
           <w:noProof/>
         </w:rPr>
-        <w:instrText xml:space="preserve"> PAGEREF _Toc236924314 \h </w:instrText>
+        <w:instrText xml:space="preserve"> PAGEREF _Toc237269554 \h </w:instrText>
       </w:r>
       <w:r>
         <w:rPr>
@@ -2121,7 +2121,7 @@
         <w:rPr>
           <w:noProof/>
         </w:rPr>
-        <w:instrText xml:space="preserve"> PAGEREF _Toc236924315 \h </w:instrText>
+        <w:instrText xml:space="preserve"> PAGEREF _Toc237269555 \h </w:instrText>
       </w:r>
       <w:r>
         <w:rPr>
@@ -2182,7 +2182,7 @@
         <w:rPr>
           <w:noProof/>
         </w:rPr>
-        <w:instrText xml:space="preserve"> PAGEREF _Toc236924316 \h </w:instrText>
+        <w:instrText xml:space="preserve"> PAGEREF _Toc237269556 \h </w:instrText>
       </w:r>
       <w:r>
         <w:rPr>
@@ -2243,7 +2243,7 @@
         <w:rPr>
           <w:noProof/>
         </w:rPr>
-        <w:instrText xml:space="preserve"> PAGEREF _Toc236924317 \h </w:instrText>
+        <w:instrText xml:space="preserve"> PAGEREF _Toc237269557 \h </w:instrText>
       </w:r>
       <w:r>
         <w:rPr>
@@ -2304,7 +2304,7 @@
         <w:rPr>
           <w:noProof/>
         </w:rPr>
-        <w:instrText xml:space="preserve"> PAGEREF _Toc236924318 \h </w:instrText>
+        <w:instrText xml:space="preserve"> PAGEREF _Toc237269558 \h </w:instrText>
       </w:r>
       <w:r>
         <w:rPr>
@@ -2365,7 +2365,7 @@
         <w:rPr>
           <w:noProof/>
         </w:rPr>
-        <w:instrText xml:space="preserve"> PAGEREF _Toc236924319 \h </w:instrText>
+        <w:instrText xml:space="preserve"> PAGEREF _Toc237269559 \h </w:instrText>
       </w:r>
       <w:r>
         <w:rPr>
@@ -2426,7 +2426,7 @@
         <w:rPr>
           <w:noProof/>
         </w:rPr>
-        <w:instrText xml:space="preserve"> PAGEREF _Toc236924320 \h </w:instrText>
+        <w:instrText xml:space="preserve"> PAGEREF _Toc237269560 \h </w:instrText>
       </w:r>
       <w:r>
         <w:rPr>
@@ -2443,7 +2443,7 @@
         <w:rPr>
           <w:noProof/>
         </w:rPr>
-        <w:t>57</w:t>
+        <w:t>58</w:t>
       </w:r>
       <w:r>
         <w:rPr>
@@ -2487,7 +2487,7 @@
         <w:rPr>
           <w:noProof/>
         </w:rPr>
-        <w:instrText xml:space="preserve"> PAGEREF _Toc236924321 \h </w:instrText>
+        <w:instrText xml:space="preserve"> PAGEREF _Toc237269561 \h </w:instrText>
       </w:r>
       <w:r>
         <w:rPr>
@@ -2548,7 +2548,7 @@
         <w:rPr>
           <w:noProof/>
         </w:rPr>
-        <w:instrText xml:space="preserve"> PAGEREF _Toc236924322 \h </w:instrText>
+        <w:instrText xml:space="preserve"> PAGEREF _Toc237269562 \h </w:instrText>
       </w:r>
       <w:r>
         <w:rPr>
@@ -2609,7 +2609,7 @@
         <w:rPr>
           <w:noProof/>
         </w:rPr>
-        <w:instrText xml:space="preserve"> PAGEREF _Toc236924323 \h </w:instrText>
+        <w:instrText xml:space="preserve"> PAGEREF _Toc237269563 \h </w:instrText>
       </w:r>
       <w:r>
         <w:rPr>
@@ -2685,7 +2685,7 @@
           <w:sz w:val="34"/>
         </w:rPr>
       </w:pPr>
-      <w:bookmarkStart w:id="0" w:name="_Toc236924284"/>
+      <w:bookmarkStart w:id="0" w:name="_Toc237269524"/>
       <w:r>
         <w:rPr>
           <w:rFonts w:ascii="Montserrat" w:hAnsi="Montserrat"/>
@@ -2709,7 +2709,7 @@
           <w:sz w:val="27"/>
         </w:rPr>
       </w:pPr>
-      <w:bookmarkStart w:id="1" w:name="_Toc236924285"/>
+      <w:bookmarkStart w:id="1" w:name="_Toc237269525"/>
       <w:r>
         <w:rPr>
           <w:rFonts w:ascii="Montserrat" w:hAnsi="Montserrat"/>
@@ -3024,6 +3024,24 @@
           <w:color w:val="1A1A1A"/>
           <w:sz w:val="22"/>
         </w:rPr>
+        <w:t>Esta e a versao 2.14 do manual. Em relacao a versao 2.13 (06/08/2026), foi adicionado o pre-cadastro de usuario e o campo Telefone a aba Usuarios da Administracao (secao 6.1 e 3.2 das Regras de Acesso): o Admin pode informar nome, telefone, e-mail e papel de uma pessoa antes do primeiro login dela, e os dados sao aplicados automaticamente ao perfil assim que ela loga pela primeira vez.</w:t>
+      </w:r>
+    </w:p>
+    <w:p>
+      <w:pPr>
+        <w:spacing w:line="280" w:lineRule="auto"/>
+        <w:rPr>
+          <w:rFonts w:ascii="Montserrat" w:hAnsi="Montserrat"/>
+          <w:color w:val="1A1A1A"/>
+          <w:sz w:val="22"/>
+        </w:rPr>
+      </w:pPr>
+      <w:r>
+        <w:rPr>
+          <w:rFonts w:ascii="Montserrat" w:hAnsi="Montserrat"/>
+          <w:color w:val="1A1A1A"/>
+          <w:sz w:val="22"/>
+        </w:rPr>
         <w:t>O manual nao substitui as Diretrizes para a Gestao de Projetos da UNIALFA (documento institucional que define o framework D01 a D07) nem o documento Regras de Acesso e Permissoes (que detalha cada regra de controle de acesso); ele e o guia operacional de como usar cada ferramenta na pratica.</w:t>
       </w:r>
     </w:p>
@@ -3038,7 +3056,7 @@
           <w:sz w:val="27"/>
         </w:rPr>
       </w:pPr>
-      <w:bookmarkStart w:id="2" w:name="_Toc236924286"/>
+      <w:bookmarkStart w:id="2" w:name="_Toc237269526"/>
       <w:r>
         <w:rPr>
           <w:rFonts w:ascii="Montserrat" w:hAnsi="Montserrat"/>
@@ -3211,16 +3229,16 @@
         </w:rPr>
         <w:lastRenderedPageBreak/>
         <w:drawing>
-          <wp:inline distT="0" distB="0" distL="0" distR="0" wp14:anchorId="26C245B1" wp14:editId="4B0ED675">
+          <wp:inline distT="0" distB="0" distL="0" distR="0" wp14:anchorId="2CEDE39C" wp14:editId="7DDA8DF2">
             <wp:extent cx="5303520" cy="4792851"/>
             <wp:effectExtent l="19050" t="19050" r="11430" b="27305"/>
-            <wp:docPr id="113019303" name="Imagem 1"/>
+            <wp:docPr id="1487482928" name="Imagem 1"/>
             <wp:cNvGraphicFramePr/>
             <a:graphic xmlns:a="http://schemas.openxmlformats.org/drawingml/2006/main">
               <a:graphicData uri="http://schemas.openxmlformats.org/drawingml/2006/picture">
                 <pic:pic xmlns:pic="http://schemas.openxmlformats.org/drawingml/2006/picture">
                   <pic:nvPicPr>
-                    <pic:cNvPr id="113019303" name=""/>
+                    <pic:cNvPr id="1487482928" name=""/>
                     <pic:cNvPicPr/>
                   </pic:nvPicPr>
                   <pic:blipFill>
@@ -3288,7 +3306,7 @@
           <w:sz w:val="27"/>
         </w:rPr>
       </w:pPr>
-      <w:bookmarkStart w:id="3" w:name="_Toc236924287"/>
+      <w:bookmarkStart w:id="3" w:name="_Toc237269527"/>
       <w:r>
         <w:rPr>
           <w:rFonts w:ascii="Montserrat" w:hAnsi="Montserrat"/>
@@ -3329,16 +3347,16 @@
         </w:rPr>
         <w:lastRenderedPageBreak/>
         <w:drawing>
-          <wp:inline distT="0" distB="0" distL="0" distR="0" wp14:anchorId="20D9C5AC" wp14:editId="7FA4A307">
+          <wp:inline distT="0" distB="0" distL="0" distR="0" wp14:anchorId="10E00E47" wp14:editId="0C3AFAEC">
             <wp:extent cx="4206240" cy="3801227"/>
             <wp:effectExtent l="19050" t="19050" r="22860" b="27940"/>
-            <wp:docPr id="1957231999" name="Imagem 2"/>
+            <wp:docPr id="106496076" name="Imagem 2"/>
             <wp:cNvGraphicFramePr/>
             <a:graphic xmlns:a="http://schemas.openxmlformats.org/drawingml/2006/main">
               <a:graphicData uri="http://schemas.openxmlformats.org/drawingml/2006/picture">
                 <pic:pic xmlns:pic="http://schemas.openxmlformats.org/drawingml/2006/picture">
                   <pic:nvPicPr>
-                    <pic:cNvPr id="1957231999" name=""/>
+                    <pic:cNvPr id="106496076" name=""/>
                     <pic:cNvPicPr/>
                   </pic:nvPicPr>
                   <pic:blipFill>
@@ -3511,7 +3529,7 @@
           <w:sz w:val="27"/>
         </w:rPr>
       </w:pPr>
-      <w:bookmarkStart w:id="4" w:name="_Toc236924288"/>
+      <w:bookmarkStart w:id="4" w:name="_Toc237269528"/>
       <w:r>
         <w:rPr>
           <w:rFonts w:ascii="Montserrat" w:hAnsi="Montserrat"/>
@@ -3565,6 +3583,12 @@
         <w:gridCol w:w="3969"/>
       </w:tblGrid>
       <w:tr>
+        <w:tblPrEx>
+          <w:tblCellMar>
+            <w:top w:w="0" w:type="dxa"/>
+            <w:bottom w:w="0" w:type="dxa"/>
+          </w:tblCellMar>
+        </w:tblPrEx>
         <w:tc>
           <w:tcPr>
             <w:tcW w:w="850" w:type="dxa"/>
@@ -3646,6 +3670,12 @@
         </w:tc>
       </w:tr>
       <w:tr>
+        <w:tblPrEx>
+          <w:tblCellMar>
+            <w:top w:w="0" w:type="dxa"/>
+            <w:bottom w:w="0" w:type="dxa"/>
+          </w:tblCellMar>
+        </w:tblPrEx>
         <w:tc>
           <w:tcPr>
             <w:tcW w:w="850" w:type="dxa"/>
@@ -3717,6 +3747,12 @@
         </w:tc>
       </w:tr>
       <w:tr>
+        <w:tblPrEx>
+          <w:tblCellMar>
+            <w:top w:w="0" w:type="dxa"/>
+            <w:bottom w:w="0" w:type="dxa"/>
+          </w:tblCellMar>
+        </w:tblPrEx>
         <w:tc>
           <w:tcPr>
             <w:tcW w:w="850" w:type="dxa"/>
@@ -3788,6 +3824,12 @@
         </w:tc>
       </w:tr>
       <w:tr>
+        <w:tblPrEx>
+          <w:tblCellMar>
+            <w:top w:w="0" w:type="dxa"/>
+            <w:bottom w:w="0" w:type="dxa"/>
+          </w:tblCellMar>
+        </w:tblPrEx>
         <w:tc>
           <w:tcPr>
             <w:tcW w:w="850" w:type="dxa"/>
@@ -3859,6 +3901,12 @@
         </w:tc>
       </w:tr>
       <w:tr>
+        <w:tblPrEx>
+          <w:tblCellMar>
+            <w:top w:w="0" w:type="dxa"/>
+            <w:bottom w:w="0" w:type="dxa"/>
+          </w:tblCellMar>
+        </w:tblPrEx>
         <w:tc>
           <w:tcPr>
             <w:tcW w:w="850" w:type="dxa"/>
@@ -3930,6 +3978,12 @@
         </w:tc>
       </w:tr>
       <w:tr>
+        <w:tblPrEx>
+          <w:tblCellMar>
+            <w:top w:w="0" w:type="dxa"/>
+            <w:bottom w:w="0" w:type="dxa"/>
+          </w:tblCellMar>
+        </w:tblPrEx>
         <w:tc>
           <w:tcPr>
             <w:tcW w:w="850" w:type="dxa"/>
@@ -4001,6 +4055,12 @@
         </w:tc>
       </w:tr>
       <w:tr>
+        <w:tblPrEx>
+          <w:tblCellMar>
+            <w:top w:w="0" w:type="dxa"/>
+            <w:bottom w:w="0" w:type="dxa"/>
+          </w:tblCellMar>
+        </w:tblPrEx>
         <w:tc>
           <w:tcPr>
             <w:tcW w:w="850" w:type="dxa"/>
@@ -4072,6 +4132,12 @@
         </w:tc>
       </w:tr>
       <w:tr>
+        <w:tblPrEx>
+          <w:tblCellMar>
+            <w:top w:w="0" w:type="dxa"/>
+            <w:bottom w:w="0" w:type="dxa"/>
+          </w:tblCellMar>
+        </w:tblPrEx>
         <w:tc>
           <w:tcPr>
             <w:tcW w:w="850" w:type="dxa"/>
@@ -4143,6 +4209,12 @@
         </w:tc>
       </w:tr>
       <w:tr>
+        <w:tblPrEx>
+          <w:tblCellMar>
+            <w:top w:w="0" w:type="dxa"/>
+            <w:bottom w:w="0" w:type="dxa"/>
+          </w:tblCellMar>
+        </w:tblPrEx>
         <w:tc>
           <w:tcPr>
             <w:tcW w:w="850" w:type="dxa"/>
@@ -4214,6 +4286,12 @@
         </w:tc>
       </w:tr>
       <w:tr>
+        <w:tblPrEx>
+          <w:tblCellMar>
+            <w:top w:w="0" w:type="dxa"/>
+            <w:bottom w:w="0" w:type="dxa"/>
+          </w:tblCellMar>
+        </w:tblPrEx>
         <w:tc>
           <w:tcPr>
             <w:tcW w:w="850" w:type="dxa"/>
@@ -4285,6 +4363,12 @@
         </w:tc>
       </w:tr>
       <w:tr>
+        <w:tblPrEx>
+          <w:tblCellMar>
+            <w:top w:w="0" w:type="dxa"/>
+            <w:bottom w:w="0" w:type="dxa"/>
+          </w:tblCellMar>
+        </w:tblPrEx>
         <w:tc>
           <w:tcPr>
             <w:tcW w:w="850" w:type="dxa"/>
@@ -4356,6 +4440,12 @@
         </w:tc>
       </w:tr>
       <w:tr>
+        <w:tblPrEx>
+          <w:tblCellMar>
+            <w:top w:w="0" w:type="dxa"/>
+            <w:bottom w:w="0" w:type="dxa"/>
+          </w:tblCellMar>
+        </w:tblPrEx>
         <w:tc>
           <w:tcPr>
             <w:tcW w:w="850" w:type="dxa"/>
@@ -4427,6 +4517,12 @@
         </w:tc>
       </w:tr>
       <w:tr>
+        <w:tblPrEx>
+          <w:tblCellMar>
+            <w:top w:w="0" w:type="dxa"/>
+            <w:bottom w:w="0" w:type="dxa"/>
+          </w:tblCellMar>
+        </w:tblPrEx>
         <w:tc>
           <w:tcPr>
             <w:tcW w:w="850" w:type="dxa"/>
@@ -4498,6 +4594,12 @@
         </w:tc>
       </w:tr>
       <w:tr>
+        <w:tblPrEx>
+          <w:tblCellMar>
+            <w:top w:w="0" w:type="dxa"/>
+            <w:bottom w:w="0" w:type="dxa"/>
+          </w:tblCellMar>
+        </w:tblPrEx>
         <w:tc>
           <w:tcPr>
             <w:tcW w:w="850" w:type="dxa"/>
@@ -4569,6 +4671,12 @@
         </w:tc>
       </w:tr>
       <w:tr>
+        <w:tblPrEx>
+          <w:tblCellMar>
+            <w:top w:w="0" w:type="dxa"/>
+            <w:bottom w:w="0" w:type="dxa"/>
+          </w:tblCellMar>
+        </w:tblPrEx>
         <w:tc>
           <w:tcPr>
             <w:tcW w:w="850" w:type="dxa"/>
@@ -4660,7 +4768,7 @@
           <w:sz w:val="34"/>
         </w:rPr>
       </w:pPr>
-      <w:bookmarkStart w:id="5" w:name="_Toc236924289"/>
+      <w:bookmarkStart w:id="5" w:name="_Toc237269529"/>
       <w:r>
         <w:rPr>
           <w:rFonts w:ascii="Montserrat" w:hAnsi="Montserrat"/>
@@ -4684,7 +4792,7 @@
           <w:sz w:val="27"/>
         </w:rPr>
       </w:pPr>
-      <w:bookmarkStart w:id="6" w:name="_Toc236924290"/>
+      <w:bookmarkStart w:id="6" w:name="_Toc237269530"/>
       <w:r>
         <w:rPr>
           <w:rFonts w:ascii="Montserrat" w:hAnsi="Montserrat"/>
@@ -4725,7 +4833,7 @@
           <w:sz w:val="27"/>
         </w:rPr>
       </w:pPr>
-      <w:bookmarkStart w:id="7" w:name="_Toc236924291"/>
+      <w:bookmarkStart w:id="7" w:name="_Toc237269531"/>
       <w:r>
         <w:rPr>
           <w:rFonts w:ascii="Montserrat" w:hAnsi="Montserrat"/>
@@ -4844,7 +4952,7 @@
           <w:sz w:val="27"/>
         </w:rPr>
       </w:pPr>
-      <w:bookmarkStart w:id="8" w:name="_Toc236924292"/>
+      <w:bookmarkStart w:id="8" w:name="_Toc237269532"/>
       <w:r>
         <w:rPr>
           <w:rFonts w:ascii="Montserrat" w:hAnsi="Montserrat"/>
@@ -4897,6 +5005,12 @@
         <w:gridCol w:w="6236"/>
       </w:tblGrid>
       <w:tr>
+        <w:tblPrEx>
+          <w:tblCellMar>
+            <w:top w:w="0" w:type="dxa"/>
+            <w:bottom w:w="0" w:type="dxa"/>
+          </w:tblCellMar>
+        </w:tblPrEx>
         <w:tc>
           <w:tcPr>
             <w:tcW w:w="2835" w:type="dxa"/>
@@ -4951,6 +5065,12 @@
         </w:tc>
       </w:tr>
       <w:tr>
+        <w:tblPrEx>
+          <w:tblCellMar>
+            <w:top w:w="0" w:type="dxa"/>
+            <w:bottom w:w="0" w:type="dxa"/>
+          </w:tblCellMar>
+        </w:tblPrEx>
         <w:tc>
           <w:tcPr>
             <w:tcW w:w="2835" w:type="dxa"/>
@@ -4999,6 +5119,12 @@
         </w:tc>
       </w:tr>
       <w:tr>
+        <w:tblPrEx>
+          <w:tblCellMar>
+            <w:top w:w="0" w:type="dxa"/>
+            <w:bottom w:w="0" w:type="dxa"/>
+          </w:tblCellMar>
+        </w:tblPrEx>
         <w:tc>
           <w:tcPr>
             <w:tcW w:w="2835" w:type="dxa"/>
@@ -5047,6 +5173,12 @@
         </w:tc>
       </w:tr>
       <w:tr>
+        <w:tblPrEx>
+          <w:tblCellMar>
+            <w:top w:w="0" w:type="dxa"/>
+            <w:bottom w:w="0" w:type="dxa"/>
+          </w:tblCellMar>
+        </w:tblPrEx>
         <w:tc>
           <w:tcPr>
             <w:tcW w:w="2835" w:type="dxa"/>
@@ -5095,6 +5227,12 @@
         </w:tc>
       </w:tr>
       <w:tr>
+        <w:tblPrEx>
+          <w:tblCellMar>
+            <w:top w:w="0" w:type="dxa"/>
+            <w:bottom w:w="0" w:type="dxa"/>
+          </w:tblCellMar>
+        </w:tblPrEx>
         <w:tc>
           <w:tcPr>
             <w:tcW w:w="2835" w:type="dxa"/>
@@ -5143,6 +5281,12 @@
         </w:tc>
       </w:tr>
       <w:tr>
+        <w:tblPrEx>
+          <w:tblCellMar>
+            <w:top w:w="0" w:type="dxa"/>
+            <w:bottom w:w="0" w:type="dxa"/>
+          </w:tblCellMar>
+        </w:tblPrEx>
         <w:tc>
           <w:tcPr>
             <w:tcW w:w="2835" w:type="dxa"/>
@@ -5191,6 +5335,12 @@
         </w:tc>
       </w:tr>
       <w:tr>
+        <w:tblPrEx>
+          <w:tblCellMar>
+            <w:top w:w="0" w:type="dxa"/>
+            <w:bottom w:w="0" w:type="dxa"/>
+          </w:tblCellMar>
+        </w:tblPrEx>
         <w:tc>
           <w:tcPr>
             <w:tcW w:w="2835" w:type="dxa"/>
@@ -5415,7 +5565,7 @@
           <w:sz w:val="27"/>
         </w:rPr>
       </w:pPr>
-      <w:bookmarkStart w:id="9" w:name="_Toc236924293"/>
+      <w:bookmarkStart w:id="9" w:name="_Toc237269533"/>
       <w:r>
         <w:rPr>
           <w:rFonts w:ascii="Montserrat" w:hAnsi="Montserrat"/>
@@ -5504,16 +5654,16 @@
         </w:rPr>
         <w:lastRenderedPageBreak/>
         <w:drawing>
-          <wp:inline distT="0" distB="0" distL="0" distR="0" wp14:anchorId="3FC40BB2" wp14:editId="3A9654F4">
+          <wp:inline distT="0" distB="0" distL="0" distR="0" wp14:anchorId="58C50A4A" wp14:editId="76B2726A">
             <wp:extent cx="4937760" cy="4462310"/>
             <wp:effectExtent l="19050" t="19050" r="15240" b="14605"/>
-            <wp:docPr id="1901089460" name="Imagem 3"/>
+            <wp:docPr id="26609960" name="Imagem 3"/>
             <wp:cNvGraphicFramePr/>
             <a:graphic xmlns:a="http://schemas.openxmlformats.org/drawingml/2006/main">
               <a:graphicData uri="http://schemas.openxmlformats.org/drawingml/2006/picture">
                 <pic:pic xmlns:pic="http://schemas.openxmlformats.org/drawingml/2006/picture">
                   <pic:nvPicPr>
-                    <pic:cNvPr id="1901089460" name=""/>
+                    <pic:cNvPr id="26609960" name=""/>
                     <pic:cNvPicPr/>
                   </pic:nvPicPr>
                   <pic:blipFill>
@@ -5581,7 +5731,7 @@
           <w:sz w:val="27"/>
         </w:rPr>
       </w:pPr>
-      <w:bookmarkStart w:id="10" w:name="_Toc236924294"/>
+      <w:bookmarkStart w:id="10" w:name="_Toc237269534"/>
       <w:r>
         <w:rPr>
           <w:rFonts w:ascii="Montserrat" w:hAnsi="Montserrat"/>
@@ -5622,16 +5772,16 @@
         </w:rPr>
         <w:lastRenderedPageBreak/>
         <w:drawing>
-          <wp:inline distT="0" distB="0" distL="0" distR="0" wp14:anchorId="5A9A57B4" wp14:editId="757AC317">
+          <wp:inline distT="0" distB="0" distL="0" distR="0" wp14:anchorId="25B34FBF" wp14:editId="0A47CCF2">
             <wp:extent cx="5120640" cy="4627581"/>
             <wp:effectExtent l="19050" t="19050" r="22860" b="20955"/>
-            <wp:docPr id="194595130" name="Imagem 4"/>
+            <wp:docPr id="1542225641" name="Imagem 4"/>
             <wp:cNvGraphicFramePr/>
             <a:graphic xmlns:a="http://schemas.openxmlformats.org/drawingml/2006/main">
               <a:graphicData uri="http://schemas.openxmlformats.org/drawingml/2006/picture">
                 <pic:pic xmlns:pic="http://schemas.openxmlformats.org/drawingml/2006/picture">
                   <pic:nvPicPr>
-                    <pic:cNvPr id="194595130" name=""/>
+                    <pic:cNvPr id="1542225641" name=""/>
                     <pic:cNvPicPr/>
                   </pic:nvPicPr>
                   <pic:blipFill>
@@ -5768,7 +5918,7 @@
           <w:sz w:val="27"/>
         </w:rPr>
       </w:pPr>
-      <w:bookmarkStart w:id="11" w:name="_Toc236924295"/>
+      <w:bookmarkStart w:id="11" w:name="_Toc237269535"/>
       <w:r>
         <w:rPr>
           <w:rFonts w:ascii="Montserrat" w:hAnsi="Montserrat"/>
@@ -5809,16 +5959,16 @@
           <w:noProof/>
         </w:rPr>
         <w:drawing>
-          <wp:inline distT="0" distB="0" distL="0" distR="0" wp14:anchorId="26CECB75" wp14:editId="59893434">
+          <wp:inline distT="0" distB="0" distL="0" distR="0" wp14:anchorId="3B5AEFC6" wp14:editId="3201DAFD">
             <wp:extent cx="4206240" cy="3801227"/>
             <wp:effectExtent l="19050" t="19050" r="22860" b="27940"/>
-            <wp:docPr id="2007985837" name="Imagem 5"/>
+            <wp:docPr id="1428944469" name="Imagem 5"/>
             <wp:cNvGraphicFramePr/>
             <a:graphic xmlns:a="http://schemas.openxmlformats.org/drawingml/2006/main">
               <a:graphicData uri="http://schemas.openxmlformats.org/drawingml/2006/picture">
                 <pic:pic xmlns:pic="http://schemas.openxmlformats.org/drawingml/2006/picture">
                   <pic:nvPicPr>
-                    <pic:cNvPr id="2007985837" name=""/>
+                    <pic:cNvPr id="1428944469" name=""/>
                     <pic:cNvPicPr/>
                   </pic:nvPicPr>
                   <pic:blipFill>
@@ -5886,16 +6036,16 @@
         </w:rPr>
         <w:lastRenderedPageBreak/>
         <w:drawing>
-          <wp:inline distT="0" distB="0" distL="0" distR="0" wp14:anchorId="0ABE504D" wp14:editId="691EB16B">
+          <wp:inline distT="0" distB="0" distL="0" distR="0" wp14:anchorId="70871FAF" wp14:editId="42076D88">
             <wp:extent cx="4206240" cy="3801227"/>
             <wp:effectExtent l="19050" t="19050" r="22860" b="27940"/>
-            <wp:docPr id="1984567311" name="Imagem 6"/>
+            <wp:docPr id="1529715849" name="Imagem 6"/>
             <wp:cNvGraphicFramePr/>
             <a:graphic xmlns:a="http://schemas.openxmlformats.org/drawingml/2006/main">
               <a:graphicData uri="http://schemas.openxmlformats.org/drawingml/2006/picture">
                 <pic:pic xmlns:pic="http://schemas.openxmlformats.org/drawingml/2006/picture">
                   <pic:nvPicPr>
-                    <pic:cNvPr id="1984567311" name=""/>
+                    <pic:cNvPr id="1529715849" name=""/>
                     <pic:cNvPicPr/>
                   </pic:nvPicPr>
                   <pic:blipFill>
@@ -6011,7 +6161,7 @@
           <w:sz w:val="27"/>
         </w:rPr>
       </w:pPr>
-      <w:bookmarkStart w:id="12" w:name="_Toc236924296"/>
+      <w:bookmarkStart w:id="12" w:name="_Toc237269536"/>
       <w:r>
         <w:rPr>
           <w:rFonts w:ascii="Montserrat" w:hAnsi="Montserrat"/>
@@ -6079,7 +6229,7 @@
           <w:sz w:val="27"/>
         </w:rPr>
       </w:pPr>
-      <w:bookmarkStart w:id="13" w:name="_Toc236924297"/>
+      <w:bookmarkStart w:id="13" w:name="_Toc237269537"/>
       <w:r>
         <w:rPr>
           <w:rFonts w:ascii="Montserrat" w:hAnsi="Montserrat"/>
@@ -6306,7 +6456,7 @@
           <w:sz w:val="27"/>
         </w:rPr>
       </w:pPr>
-      <w:bookmarkStart w:id="14" w:name="_Toc236924298"/>
+      <w:bookmarkStart w:id="14" w:name="_Toc237269538"/>
       <w:r>
         <w:rPr>
           <w:rFonts w:ascii="Montserrat" w:hAnsi="Montserrat"/>
@@ -6469,7 +6619,7 @@
           <w:sz w:val="34"/>
         </w:rPr>
       </w:pPr>
-      <w:bookmarkStart w:id="15" w:name="_Toc236924299"/>
+      <w:bookmarkStart w:id="15" w:name="_Toc237269539"/>
       <w:r>
         <w:rPr>
           <w:rFonts w:ascii="Montserrat" w:hAnsi="Montserrat"/>
@@ -6511,7 +6661,7 @@
           <w:sz w:val="27"/>
         </w:rPr>
       </w:pPr>
-      <w:bookmarkStart w:id="16" w:name="_Toc236924300"/>
+      <w:bookmarkStart w:id="16" w:name="_Toc237269540"/>
       <w:r>
         <w:rPr>
           <w:rFonts w:ascii="Montserrat" w:hAnsi="Montserrat"/>
@@ -6565,6 +6715,12 @@
         <w:gridCol w:w="5216"/>
       </w:tblGrid>
       <w:tr>
+        <w:tblPrEx>
+          <w:tblCellMar>
+            <w:top w:w="0" w:type="dxa"/>
+            <w:bottom w:w="0" w:type="dxa"/>
+          </w:tblCellMar>
+        </w:tblPrEx>
         <w:tc>
           <w:tcPr>
             <w:tcW w:w="2835" w:type="dxa"/>
@@ -6645,6 +6801,12 @@
         </w:tc>
       </w:tr>
       <w:tr>
+        <w:tblPrEx>
+          <w:tblCellMar>
+            <w:top w:w="0" w:type="dxa"/>
+            <w:bottom w:w="0" w:type="dxa"/>
+          </w:tblCellMar>
+        </w:tblPrEx>
         <w:tc>
           <w:tcPr>
             <w:tcW w:w="2835" w:type="dxa"/>
@@ -6716,6 +6878,12 @@
         </w:tc>
       </w:tr>
       <w:tr>
+        <w:tblPrEx>
+          <w:tblCellMar>
+            <w:top w:w="0" w:type="dxa"/>
+            <w:bottom w:w="0" w:type="dxa"/>
+          </w:tblCellMar>
+        </w:tblPrEx>
         <w:tc>
           <w:tcPr>
             <w:tcW w:w="2835" w:type="dxa"/>
@@ -6787,6 +6955,12 @@
         </w:tc>
       </w:tr>
       <w:tr>
+        <w:tblPrEx>
+          <w:tblCellMar>
+            <w:top w:w="0" w:type="dxa"/>
+            <w:bottom w:w="0" w:type="dxa"/>
+          </w:tblCellMar>
+        </w:tblPrEx>
         <w:tc>
           <w:tcPr>
             <w:tcW w:w="2835" w:type="dxa"/>
@@ -6858,6 +7032,12 @@
         </w:tc>
       </w:tr>
       <w:tr>
+        <w:tblPrEx>
+          <w:tblCellMar>
+            <w:top w:w="0" w:type="dxa"/>
+            <w:bottom w:w="0" w:type="dxa"/>
+          </w:tblCellMar>
+        </w:tblPrEx>
         <w:tc>
           <w:tcPr>
             <w:tcW w:w="2835" w:type="dxa"/>
@@ -6929,6 +7109,12 @@
         </w:tc>
       </w:tr>
       <w:tr>
+        <w:tblPrEx>
+          <w:tblCellMar>
+            <w:top w:w="0" w:type="dxa"/>
+            <w:bottom w:w="0" w:type="dxa"/>
+          </w:tblCellMar>
+        </w:tblPrEx>
         <w:tc>
           <w:tcPr>
             <w:tcW w:w="2835" w:type="dxa"/>
@@ -7000,6 +7186,12 @@
         </w:tc>
       </w:tr>
       <w:tr>
+        <w:tblPrEx>
+          <w:tblCellMar>
+            <w:top w:w="0" w:type="dxa"/>
+            <w:bottom w:w="0" w:type="dxa"/>
+          </w:tblCellMar>
+        </w:tblPrEx>
         <w:tc>
           <w:tcPr>
             <w:tcW w:w="2835" w:type="dxa"/>
@@ -7071,6 +7263,12 @@
         </w:tc>
       </w:tr>
       <w:tr>
+        <w:tblPrEx>
+          <w:tblCellMar>
+            <w:top w:w="0" w:type="dxa"/>
+            <w:bottom w:w="0" w:type="dxa"/>
+          </w:tblCellMar>
+        </w:tblPrEx>
         <w:tc>
           <w:tcPr>
             <w:tcW w:w="2835" w:type="dxa"/>
@@ -7142,6 +7340,12 @@
         </w:tc>
       </w:tr>
       <w:tr>
+        <w:tblPrEx>
+          <w:tblCellMar>
+            <w:top w:w="0" w:type="dxa"/>
+            <w:bottom w:w="0" w:type="dxa"/>
+          </w:tblCellMar>
+        </w:tblPrEx>
         <w:tc>
           <w:tcPr>
             <w:tcW w:w="2835" w:type="dxa"/>
@@ -7213,6 +7417,12 @@
         </w:tc>
       </w:tr>
       <w:tr>
+        <w:tblPrEx>
+          <w:tblCellMar>
+            <w:top w:w="0" w:type="dxa"/>
+            <w:bottom w:w="0" w:type="dxa"/>
+          </w:tblCellMar>
+        </w:tblPrEx>
         <w:tc>
           <w:tcPr>
             <w:tcW w:w="2835" w:type="dxa"/>
@@ -7284,6 +7494,12 @@
         </w:tc>
       </w:tr>
       <w:tr>
+        <w:tblPrEx>
+          <w:tblCellMar>
+            <w:top w:w="0" w:type="dxa"/>
+            <w:bottom w:w="0" w:type="dxa"/>
+          </w:tblCellMar>
+        </w:tblPrEx>
         <w:tc>
           <w:tcPr>
             <w:tcW w:w="2835" w:type="dxa"/>
@@ -7355,6 +7571,12 @@
         </w:tc>
       </w:tr>
       <w:tr>
+        <w:tblPrEx>
+          <w:tblCellMar>
+            <w:top w:w="0" w:type="dxa"/>
+            <w:bottom w:w="0" w:type="dxa"/>
+          </w:tblCellMar>
+        </w:tblPrEx>
         <w:tc>
           <w:tcPr>
             <w:tcW w:w="2835" w:type="dxa"/>
@@ -7442,16 +7664,16 @@
         </w:rPr>
         <w:lastRenderedPageBreak/>
         <w:drawing>
-          <wp:inline distT="0" distB="0" distL="0" distR="0" wp14:anchorId="22DA1B58" wp14:editId="1903B1EE">
+          <wp:inline distT="0" distB="0" distL="0" distR="0" wp14:anchorId="23FE595E" wp14:editId="1BB1993B">
             <wp:extent cx="5120640" cy="4627581"/>
             <wp:effectExtent l="19050" t="19050" r="22860" b="20955"/>
-            <wp:docPr id="509089634" name="Imagem 7"/>
+            <wp:docPr id="506306313" name="Imagem 7"/>
             <wp:cNvGraphicFramePr/>
             <a:graphic xmlns:a="http://schemas.openxmlformats.org/drawingml/2006/main">
               <a:graphicData uri="http://schemas.openxmlformats.org/drawingml/2006/picture">
                 <pic:pic xmlns:pic="http://schemas.openxmlformats.org/drawingml/2006/picture">
                   <pic:nvPicPr>
-                    <pic:cNvPr id="509089634" name=""/>
+                    <pic:cNvPr id="506306313" name=""/>
                     <pic:cNvPicPr/>
                   </pic:nvPicPr>
                   <pic:blipFill>
@@ -7519,16 +7741,16 @@
         </w:rPr>
         <w:lastRenderedPageBreak/>
         <w:drawing>
-          <wp:inline distT="0" distB="0" distL="0" distR="0" wp14:anchorId="583AC06A" wp14:editId="50732CB7">
+          <wp:inline distT="0" distB="0" distL="0" distR="0" wp14:anchorId="2AD1CE38" wp14:editId="72AFD798">
             <wp:extent cx="5120640" cy="4627581"/>
             <wp:effectExtent l="19050" t="19050" r="22860" b="20955"/>
-            <wp:docPr id="30642210" name="Imagem 8"/>
+            <wp:docPr id="1620684089" name="Imagem 8"/>
             <wp:cNvGraphicFramePr/>
             <a:graphic xmlns:a="http://schemas.openxmlformats.org/drawingml/2006/main">
               <a:graphicData uri="http://schemas.openxmlformats.org/drawingml/2006/picture">
                 <pic:pic xmlns:pic="http://schemas.openxmlformats.org/drawingml/2006/picture">
                   <pic:nvPicPr>
-                    <pic:cNvPr id="30642210" name=""/>
+                    <pic:cNvPr id="1620684089" name=""/>
                     <pic:cNvPicPr/>
                   </pic:nvPicPr>
                   <pic:blipFill>
@@ -7663,7 +7885,7 @@
           <w:sz w:val="27"/>
         </w:rPr>
       </w:pPr>
-      <w:bookmarkStart w:id="17" w:name="_Toc236924301"/>
+      <w:bookmarkStart w:id="17" w:name="_Toc237269541"/>
       <w:r>
         <w:rPr>
           <w:rFonts w:ascii="Montserrat" w:hAnsi="Montserrat"/>
@@ -7718,6 +7940,12 @@
         <w:gridCol w:w="5216"/>
       </w:tblGrid>
       <w:tr>
+        <w:tblPrEx>
+          <w:tblCellMar>
+            <w:top w:w="0" w:type="dxa"/>
+            <w:bottom w:w="0" w:type="dxa"/>
+          </w:tblCellMar>
+        </w:tblPrEx>
         <w:tc>
           <w:tcPr>
             <w:tcW w:w="2835" w:type="dxa"/>
@@ -7798,6 +8026,12 @@
         </w:tc>
       </w:tr>
       <w:tr>
+        <w:tblPrEx>
+          <w:tblCellMar>
+            <w:top w:w="0" w:type="dxa"/>
+            <w:bottom w:w="0" w:type="dxa"/>
+          </w:tblCellMar>
+        </w:tblPrEx>
         <w:tc>
           <w:tcPr>
             <w:tcW w:w="2835" w:type="dxa"/>
@@ -7869,6 +8103,12 @@
         </w:tc>
       </w:tr>
       <w:tr>
+        <w:tblPrEx>
+          <w:tblCellMar>
+            <w:top w:w="0" w:type="dxa"/>
+            <w:bottom w:w="0" w:type="dxa"/>
+          </w:tblCellMar>
+        </w:tblPrEx>
         <w:tc>
           <w:tcPr>
             <w:tcW w:w="2835" w:type="dxa"/>
@@ -7940,6 +8180,12 @@
         </w:tc>
       </w:tr>
       <w:tr>
+        <w:tblPrEx>
+          <w:tblCellMar>
+            <w:top w:w="0" w:type="dxa"/>
+            <w:bottom w:w="0" w:type="dxa"/>
+          </w:tblCellMar>
+        </w:tblPrEx>
         <w:tc>
           <w:tcPr>
             <w:tcW w:w="2835" w:type="dxa"/>
@@ -8011,6 +8257,12 @@
         </w:tc>
       </w:tr>
       <w:tr>
+        <w:tblPrEx>
+          <w:tblCellMar>
+            <w:top w:w="0" w:type="dxa"/>
+            <w:bottom w:w="0" w:type="dxa"/>
+          </w:tblCellMar>
+        </w:tblPrEx>
         <w:tc>
           <w:tcPr>
             <w:tcW w:w="2835" w:type="dxa"/>
@@ -8082,6 +8334,12 @@
         </w:tc>
       </w:tr>
       <w:tr>
+        <w:tblPrEx>
+          <w:tblCellMar>
+            <w:top w:w="0" w:type="dxa"/>
+            <w:bottom w:w="0" w:type="dxa"/>
+          </w:tblCellMar>
+        </w:tblPrEx>
         <w:tc>
           <w:tcPr>
             <w:tcW w:w="2835" w:type="dxa"/>
@@ -8153,6 +8411,12 @@
         </w:tc>
       </w:tr>
       <w:tr>
+        <w:tblPrEx>
+          <w:tblCellMar>
+            <w:top w:w="0" w:type="dxa"/>
+            <w:bottom w:w="0" w:type="dxa"/>
+          </w:tblCellMar>
+        </w:tblPrEx>
         <w:tc>
           <w:tcPr>
             <w:tcW w:w="2835" w:type="dxa"/>
@@ -8224,6 +8488,12 @@
         </w:tc>
       </w:tr>
       <w:tr>
+        <w:tblPrEx>
+          <w:tblCellMar>
+            <w:top w:w="0" w:type="dxa"/>
+            <w:bottom w:w="0" w:type="dxa"/>
+          </w:tblCellMar>
+        </w:tblPrEx>
         <w:tc>
           <w:tcPr>
             <w:tcW w:w="2835" w:type="dxa"/>
@@ -8295,6 +8565,12 @@
         </w:tc>
       </w:tr>
       <w:tr>
+        <w:tblPrEx>
+          <w:tblCellMar>
+            <w:top w:w="0" w:type="dxa"/>
+            <w:bottom w:w="0" w:type="dxa"/>
+          </w:tblCellMar>
+        </w:tblPrEx>
         <w:tc>
           <w:tcPr>
             <w:tcW w:w="2835" w:type="dxa"/>
@@ -8366,6 +8642,12 @@
         </w:tc>
       </w:tr>
       <w:tr>
+        <w:tblPrEx>
+          <w:tblCellMar>
+            <w:top w:w="0" w:type="dxa"/>
+            <w:bottom w:w="0" w:type="dxa"/>
+          </w:tblCellMar>
+        </w:tblPrEx>
         <w:tc>
           <w:tcPr>
             <w:tcW w:w="2835" w:type="dxa"/>
@@ -8437,6 +8719,12 @@
         </w:tc>
       </w:tr>
       <w:tr>
+        <w:tblPrEx>
+          <w:tblCellMar>
+            <w:top w:w="0" w:type="dxa"/>
+            <w:bottom w:w="0" w:type="dxa"/>
+          </w:tblCellMar>
+        </w:tblPrEx>
         <w:tc>
           <w:tcPr>
             <w:tcW w:w="2835" w:type="dxa"/>
@@ -8524,16 +8812,16 @@
         </w:rPr>
         <w:lastRenderedPageBreak/>
         <w:drawing>
-          <wp:inline distT="0" distB="0" distL="0" distR="0" wp14:anchorId="15D9FEFF" wp14:editId="2F2F38F4">
+          <wp:inline distT="0" distB="0" distL="0" distR="0" wp14:anchorId="6D56E299" wp14:editId="488DEAB7">
             <wp:extent cx="5120640" cy="4627581"/>
             <wp:effectExtent l="19050" t="19050" r="22860" b="20955"/>
-            <wp:docPr id="533768074" name="Imagem 9"/>
+            <wp:docPr id="308350400" name="Imagem 9"/>
             <wp:cNvGraphicFramePr/>
             <a:graphic xmlns:a="http://schemas.openxmlformats.org/drawingml/2006/main">
               <a:graphicData uri="http://schemas.openxmlformats.org/drawingml/2006/picture">
                 <pic:pic xmlns:pic="http://schemas.openxmlformats.org/drawingml/2006/picture">
                   <pic:nvPicPr>
-                    <pic:cNvPr id="533768074" name=""/>
+                    <pic:cNvPr id="308350400" name=""/>
                     <pic:cNvPicPr/>
                   </pic:nvPicPr>
                   <pic:blipFill>
@@ -8601,16 +8889,16 @@
         </w:rPr>
         <w:lastRenderedPageBreak/>
         <w:drawing>
-          <wp:inline distT="0" distB="0" distL="0" distR="0" wp14:anchorId="7A4C69BC" wp14:editId="55A3C443">
+          <wp:inline distT="0" distB="0" distL="0" distR="0" wp14:anchorId="33A810B2" wp14:editId="68790DCE">
             <wp:extent cx="5120640" cy="4627581"/>
             <wp:effectExtent l="19050" t="19050" r="22860" b="20955"/>
-            <wp:docPr id="1166982388" name="Imagem 10"/>
+            <wp:docPr id="1839195909" name="Imagem 10"/>
             <wp:cNvGraphicFramePr/>
             <a:graphic xmlns:a="http://schemas.openxmlformats.org/drawingml/2006/main">
               <a:graphicData uri="http://schemas.openxmlformats.org/drawingml/2006/picture">
                 <pic:pic xmlns:pic="http://schemas.openxmlformats.org/drawingml/2006/picture">
                   <pic:nvPicPr>
-                    <pic:cNvPr id="1166982388" name=""/>
+                    <pic:cNvPr id="1839195909" name=""/>
                     <pic:cNvPicPr/>
                   </pic:nvPicPr>
                   <pic:blipFill>
@@ -8696,7 +8984,7 @@
           <w:sz w:val="27"/>
         </w:rPr>
       </w:pPr>
-      <w:bookmarkStart w:id="18" w:name="_Toc236924302"/>
+      <w:bookmarkStart w:id="18" w:name="_Toc237269542"/>
       <w:r>
         <w:rPr>
           <w:rFonts w:ascii="Montserrat" w:hAnsi="Montserrat"/>
@@ -8750,6 +9038,12 @@
         <w:gridCol w:w="4989"/>
       </w:tblGrid>
       <w:tr>
+        <w:tblPrEx>
+          <w:tblCellMar>
+            <w:top w:w="0" w:type="dxa"/>
+            <w:bottom w:w="0" w:type="dxa"/>
+          </w:tblCellMar>
+        </w:tblPrEx>
         <w:tc>
           <w:tcPr>
             <w:tcW w:w="3175" w:type="dxa"/>
@@ -8830,6 +9124,12 @@
         </w:tc>
       </w:tr>
       <w:tr>
+        <w:tblPrEx>
+          <w:tblCellMar>
+            <w:top w:w="0" w:type="dxa"/>
+            <w:bottom w:w="0" w:type="dxa"/>
+          </w:tblCellMar>
+        </w:tblPrEx>
         <w:tc>
           <w:tcPr>
             <w:tcW w:w="3175" w:type="dxa"/>
@@ -8901,6 +9201,12 @@
         </w:tc>
       </w:tr>
       <w:tr>
+        <w:tblPrEx>
+          <w:tblCellMar>
+            <w:top w:w="0" w:type="dxa"/>
+            <w:bottom w:w="0" w:type="dxa"/>
+          </w:tblCellMar>
+        </w:tblPrEx>
         <w:tc>
           <w:tcPr>
             <w:tcW w:w="3175" w:type="dxa"/>
@@ -8973,6 +9279,12 @@
         </w:tc>
       </w:tr>
       <w:tr>
+        <w:tblPrEx>
+          <w:tblCellMar>
+            <w:top w:w="0" w:type="dxa"/>
+            <w:bottom w:w="0" w:type="dxa"/>
+          </w:tblCellMar>
+        </w:tblPrEx>
         <w:tc>
           <w:tcPr>
             <w:tcW w:w="3175" w:type="dxa"/>
@@ -9044,6 +9356,12 @@
         </w:tc>
       </w:tr>
       <w:tr>
+        <w:tblPrEx>
+          <w:tblCellMar>
+            <w:top w:w="0" w:type="dxa"/>
+            <w:bottom w:w="0" w:type="dxa"/>
+          </w:tblCellMar>
+        </w:tblPrEx>
         <w:tc>
           <w:tcPr>
             <w:tcW w:w="3175" w:type="dxa"/>
@@ -9115,6 +9433,12 @@
         </w:tc>
       </w:tr>
       <w:tr>
+        <w:tblPrEx>
+          <w:tblCellMar>
+            <w:top w:w="0" w:type="dxa"/>
+            <w:bottom w:w="0" w:type="dxa"/>
+          </w:tblCellMar>
+        </w:tblPrEx>
         <w:tc>
           <w:tcPr>
             <w:tcW w:w="3175" w:type="dxa"/>
@@ -9186,6 +9510,12 @@
         </w:tc>
       </w:tr>
       <w:tr>
+        <w:tblPrEx>
+          <w:tblCellMar>
+            <w:top w:w="0" w:type="dxa"/>
+            <w:bottom w:w="0" w:type="dxa"/>
+          </w:tblCellMar>
+        </w:tblPrEx>
         <w:tc>
           <w:tcPr>
             <w:tcW w:w="3175" w:type="dxa"/>
@@ -9257,6 +9587,12 @@
         </w:tc>
       </w:tr>
       <w:tr>
+        <w:tblPrEx>
+          <w:tblCellMar>
+            <w:top w:w="0" w:type="dxa"/>
+            <w:bottom w:w="0" w:type="dxa"/>
+          </w:tblCellMar>
+        </w:tblPrEx>
         <w:tc>
           <w:tcPr>
             <w:tcW w:w="3175" w:type="dxa"/>
@@ -9328,6 +9664,12 @@
         </w:tc>
       </w:tr>
       <w:tr>
+        <w:tblPrEx>
+          <w:tblCellMar>
+            <w:top w:w="0" w:type="dxa"/>
+            <w:bottom w:w="0" w:type="dxa"/>
+          </w:tblCellMar>
+        </w:tblPrEx>
         <w:tc>
           <w:tcPr>
             <w:tcW w:w="3175" w:type="dxa"/>
@@ -9399,6 +9741,12 @@
         </w:tc>
       </w:tr>
       <w:tr>
+        <w:tblPrEx>
+          <w:tblCellMar>
+            <w:top w:w="0" w:type="dxa"/>
+            <w:bottom w:w="0" w:type="dxa"/>
+          </w:tblCellMar>
+        </w:tblPrEx>
         <w:tc>
           <w:tcPr>
             <w:tcW w:w="3175" w:type="dxa"/>
@@ -9470,6 +9818,12 @@
         </w:tc>
       </w:tr>
       <w:tr>
+        <w:tblPrEx>
+          <w:tblCellMar>
+            <w:top w:w="0" w:type="dxa"/>
+            <w:bottom w:w="0" w:type="dxa"/>
+          </w:tblCellMar>
+        </w:tblPrEx>
         <w:tc>
           <w:tcPr>
             <w:tcW w:w="3175" w:type="dxa"/>
@@ -9541,6 +9895,12 @@
         </w:tc>
       </w:tr>
       <w:tr>
+        <w:tblPrEx>
+          <w:tblCellMar>
+            <w:top w:w="0" w:type="dxa"/>
+            <w:bottom w:w="0" w:type="dxa"/>
+          </w:tblCellMar>
+        </w:tblPrEx>
         <w:tc>
           <w:tcPr>
             <w:tcW w:w="3175" w:type="dxa"/>
@@ -9664,16 +10024,16 @@
         </w:rPr>
         <w:lastRenderedPageBreak/>
         <w:drawing>
-          <wp:inline distT="0" distB="0" distL="0" distR="0" wp14:anchorId="26CC735E" wp14:editId="0A860414">
+          <wp:inline distT="0" distB="0" distL="0" distR="0" wp14:anchorId="0A427A8C" wp14:editId="3048530E">
             <wp:extent cx="5120640" cy="3282818"/>
             <wp:effectExtent l="19050" t="19050" r="22860" b="13335"/>
-            <wp:docPr id="2139016090" name="Imagem 11"/>
+            <wp:docPr id="610872516" name="Imagem 11"/>
             <wp:cNvGraphicFramePr/>
             <a:graphic xmlns:a="http://schemas.openxmlformats.org/drawingml/2006/main">
               <a:graphicData uri="http://schemas.openxmlformats.org/drawingml/2006/picture">
                 <pic:pic xmlns:pic="http://schemas.openxmlformats.org/drawingml/2006/picture">
                   <pic:nvPicPr>
-                    <pic:cNvPr id="2139016090" name=""/>
+                    <pic:cNvPr id="610872516" name=""/>
                     <pic:cNvPicPr/>
                   </pic:nvPicPr>
                   <pic:blipFill>
@@ -9741,16 +10101,16 @@
         </w:rPr>
         <w:lastRenderedPageBreak/>
         <w:drawing>
-          <wp:inline distT="0" distB="0" distL="0" distR="0" wp14:anchorId="0B075E14" wp14:editId="0AE9E364">
+          <wp:inline distT="0" distB="0" distL="0" distR="0" wp14:anchorId="57C16838" wp14:editId="5BAB4C87">
             <wp:extent cx="5120640" cy="4627581"/>
             <wp:effectExtent l="19050" t="19050" r="22860" b="20955"/>
-            <wp:docPr id="1894274118" name="Imagem 12"/>
+            <wp:docPr id="534062080" name="Imagem 12"/>
             <wp:cNvGraphicFramePr/>
             <a:graphic xmlns:a="http://schemas.openxmlformats.org/drawingml/2006/main">
               <a:graphicData uri="http://schemas.openxmlformats.org/drawingml/2006/picture">
                 <pic:pic xmlns:pic="http://schemas.openxmlformats.org/drawingml/2006/picture">
                   <pic:nvPicPr>
-                    <pic:cNvPr id="1894274118" name=""/>
+                    <pic:cNvPr id="534062080" name=""/>
                     <pic:cNvPicPr/>
                   </pic:nvPicPr>
                   <pic:blipFill>
@@ -9836,7 +10196,7 @@
           <w:sz w:val="27"/>
         </w:rPr>
       </w:pPr>
-      <w:bookmarkStart w:id="19" w:name="_Toc236924303"/>
+      <w:bookmarkStart w:id="19" w:name="_Toc237269543"/>
       <w:r>
         <w:rPr>
           <w:rFonts w:ascii="Montserrat" w:hAnsi="Montserrat"/>
@@ -9889,6 +10249,12 @@
         <w:gridCol w:w="7370"/>
       </w:tblGrid>
       <w:tr>
+        <w:tblPrEx>
+          <w:tblCellMar>
+            <w:top w:w="0" w:type="dxa"/>
+            <w:bottom w:w="0" w:type="dxa"/>
+          </w:tblCellMar>
+        </w:tblPrEx>
         <w:tc>
           <w:tcPr>
             <w:tcW w:w="1701" w:type="dxa"/>
@@ -9943,6 +10309,12 @@
         </w:tc>
       </w:tr>
       <w:tr>
+        <w:tblPrEx>
+          <w:tblCellMar>
+            <w:top w:w="0" w:type="dxa"/>
+            <w:bottom w:w="0" w:type="dxa"/>
+          </w:tblCellMar>
+        </w:tblPrEx>
         <w:tc>
           <w:tcPr>
             <w:tcW w:w="1701" w:type="dxa"/>
@@ -9991,6 +10363,12 @@
         </w:tc>
       </w:tr>
       <w:tr>
+        <w:tblPrEx>
+          <w:tblCellMar>
+            <w:top w:w="0" w:type="dxa"/>
+            <w:bottom w:w="0" w:type="dxa"/>
+          </w:tblCellMar>
+        </w:tblPrEx>
         <w:tc>
           <w:tcPr>
             <w:tcW w:w="1701" w:type="dxa"/>
@@ -10040,6 +10418,12 @@
         </w:tc>
       </w:tr>
       <w:tr>
+        <w:tblPrEx>
+          <w:tblCellMar>
+            <w:top w:w="0" w:type="dxa"/>
+            <w:bottom w:w="0" w:type="dxa"/>
+          </w:tblCellMar>
+        </w:tblPrEx>
         <w:tc>
           <w:tcPr>
             <w:tcW w:w="1701" w:type="dxa"/>
@@ -10088,6 +10472,12 @@
         </w:tc>
       </w:tr>
       <w:tr>
+        <w:tblPrEx>
+          <w:tblCellMar>
+            <w:top w:w="0" w:type="dxa"/>
+            <w:bottom w:w="0" w:type="dxa"/>
+          </w:tblCellMar>
+        </w:tblPrEx>
         <w:tc>
           <w:tcPr>
             <w:tcW w:w="1701" w:type="dxa"/>
@@ -10136,6 +10526,12 @@
         </w:tc>
       </w:tr>
       <w:tr>
+        <w:tblPrEx>
+          <w:tblCellMar>
+            <w:top w:w="0" w:type="dxa"/>
+            <w:bottom w:w="0" w:type="dxa"/>
+          </w:tblCellMar>
+        </w:tblPrEx>
         <w:tc>
           <w:tcPr>
             <w:tcW w:w="1701" w:type="dxa"/>
@@ -10184,6 +10580,12 @@
         </w:tc>
       </w:tr>
       <w:tr>
+        <w:tblPrEx>
+          <w:tblCellMar>
+            <w:top w:w="0" w:type="dxa"/>
+            <w:bottom w:w="0" w:type="dxa"/>
+          </w:tblCellMar>
+        </w:tblPrEx>
         <w:tc>
           <w:tcPr>
             <w:tcW w:w="1701" w:type="dxa"/>
@@ -10232,6 +10634,12 @@
         </w:tc>
       </w:tr>
       <w:tr>
+        <w:tblPrEx>
+          <w:tblCellMar>
+            <w:top w:w="0" w:type="dxa"/>
+            <w:bottom w:w="0" w:type="dxa"/>
+          </w:tblCellMar>
+        </w:tblPrEx>
         <w:tc>
           <w:tcPr>
             <w:tcW w:w="1701" w:type="dxa"/>
@@ -10280,6 +10688,12 @@
         </w:tc>
       </w:tr>
       <w:tr>
+        <w:tblPrEx>
+          <w:tblCellMar>
+            <w:top w:w="0" w:type="dxa"/>
+            <w:bottom w:w="0" w:type="dxa"/>
+          </w:tblCellMar>
+        </w:tblPrEx>
         <w:tc>
           <w:tcPr>
             <w:tcW w:w="1701" w:type="dxa"/>
@@ -10343,16 +10757,16 @@
           <w:noProof/>
         </w:rPr>
         <w:drawing>
-          <wp:inline distT="0" distB="0" distL="0" distR="0" wp14:anchorId="559924C0" wp14:editId="6F2E9943">
+          <wp:inline distT="0" distB="0" distL="0" distR="0" wp14:anchorId="190E89BF" wp14:editId="142BE8EC">
             <wp:extent cx="5120640" cy="4627581"/>
             <wp:effectExtent l="19050" t="19050" r="22860" b="20955"/>
-            <wp:docPr id="2070168519" name="Imagem 13"/>
+            <wp:docPr id="1103321023" name="Imagem 13"/>
             <wp:cNvGraphicFramePr/>
             <a:graphic xmlns:a="http://schemas.openxmlformats.org/drawingml/2006/main">
               <a:graphicData uri="http://schemas.openxmlformats.org/drawingml/2006/picture">
                 <pic:pic xmlns:pic="http://schemas.openxmlformats.org/drawingml/2006/picture">
                   <pic:nvPicPr>
-                    <pic:cNvPr id="2070168519" name=""/>
+                    <pic:cNvPr id="1103321023" name=""/>
                     <pic:cNvPicPr/>
                   </pic:nvPicPr>
                   <pic:blipFill>
@@ -10420,16 +10834,16 @@
         </w:rPr>
         <w:lastRenderedPageBreak/>
         <w:drawing>
-          <wp:inline distT="0" distB="0" distL="0" distR="0" wp14:anchorId="01A17DE1" wp14:editId="209B0BAB">
+          <wp:inline distT="0" distB="0" distL="0" distR="0" wp14:anchorId="35A87255" wp14:editId="7A230732">
             <wp:extent cx="5120640" cy="4627581"/>
             <wp:effectExtent l="19050" t="19050" r="22860" b="20955"/>
-            <wp:docPr id="1103882191" name="Imagem 14"/>
+            <wp:docPr id="145034732" name="Imagem 14"/>
             <wp:cNvGraphicFramePr/>
             <a:graphic xmlns:a="http://schemas.openxmlformats.org/drawingml/2006/main">
               <a:graphicData uri="http://schemas.openxmlformats.org/drawingml/2006/picture">
                 <pic:pic xmlns:pic="http://schemas.openxmlformats.org/drawingml/2006/picture">
                   <pic:nvPicPr>
-                    <pic:cNvPr id="1103882191" name=""/>
+                    <pic:cNvPr id="145034732" name=""/>
                     <pic:cNvPicPr/>
                   </pic:nvPicPr>
                   <pic:blipFill>
@@ -10515,7 +10929,7 @@
           <w:sz w:val="27"/>
         </w:rPr>
       </w:pPr>
-      <w:bookmarkStart w:id="20" w:name="_Toc236924304"/>
+      <w:bookmarkStart w:id="20" w:name="_Toc237269544"/>
       <w:r>
         <w:rPr>
           <w:rFonts w:ascii="Montserrat" w:hAnsi="Montserrat"/>
@@ -10556,16 +10970,16 @@
         </w:rPr>
         <w:lastRenderedPageBreak/>
         <w:drawing>
-          <wp:inline distT="0" distB="0" distL="0" distR="0" wp14:anchorId="794B8B07" wp14:editId="1B252785">
+          <wp:inline distT="0" distB="0" distL="0" distR="0" wp14:anchorId="44E3D596" wp14:editId="50854316">
             <wp:extent cx="5120640" cy="4627581"/>
             <wp:effectExtent l="19050" t="19050" r="22860" b="20955"/>
-            <wp:docPr id="2041563013" name="Imagem 15"/>
+            <wp:docPr id="1168251946" name="Imagem 15"/>
             <wp:cNvGraphicFramePr/>
             <a:graphic xmlns:a="http://schemas.openxmlformats.org/drawingml/2006/main">
               <a:graphicData uri="http://schemas.openxmlformats.org/drawingml/2006/picture">
                 <pic:pic xmlns:pic="http://schemas.openxmlformats.org/drawingml/2006/picture">
                   <pic:nvPicPr>
-                    <pic:cNvPr id="2041563013" name=""/>
+                    <pic:cNvPr id="1168251946" name=""/>
                     <pic:cNvPicPr/>
                   </pic:nvPicPr>
                   <pic:blipFill>
@@ -10633,16 +11047,16 @@
         </w:rPr>
         <w:lastRenderedPageBreak/>
         <w:drawing>
-          <wp:inline distT="0" distB="0" distL="0" distR="0" wp14:anchorId="31606537" wp14:editId="12E5D4BB">
+          <wp:inline distT="0" distB="0" distL="0" distR="0" wp14:anchorId="3086BA2A" wp14:editId="6940DA7A">
             <wp:extent cx="5120640" cy="4627581"/>
             <wp:effectExtent l="19050" t="19050" r="22860" b="20955"/>
-            <wp:docPr id="794410389" name="Imagem 16"/>
+            <wp:docPr id="317164600" name="Imagem 16"/>
             <wp:cNvGraphicFramePr/>
             <a:graphic xmlns:a="http://schemas.openxmlformats.org/drawingml/2006/main">
               <a:graphicData uri="http://schemas.openxmlformats.org/drawingml/2006/picture">
                 <pic:pic xmlns:pic="http://schemas.openxmlformats.org/drawingml/2006/picture">
                   <pic:nvPicPr>
-                    <pic:cNvPr id="794410389" name=""/>
+                    <pic:cNvPr id="317164600" name=""/>
                     <pic:cNvPicPr/>
                   </pic:nvPicPr>
                   <pic:blipFill>
@@ -10806,16 +11220,16 @@
         </w:rPr>
         <w:lastRenderedPageBreak/>
         <w:drawing>
-          <wp:inline distT="0" distB="0" distL="0" distR="0" wp14:anchorId="7A557614" wp14:editId="48DBA4DD">
+          <wp:inline distT="0" distB="0" distL="0" distR="0" wp14:anchorId="2F14D3FA" wp14:editId="1E6AEA7C">
             <wp:extent cx="5120640" cy="3282818"/>
             <wp:effectExtent l="19050" t="19050" r="22860" b="13335"/>
-            <wp:docPr id="1754512764" name="Imagem 17"/>
+            <wp:docPr id="261391798" name="Imagem 17"/>
             <wp:cNvGraphicFramePr/>
             <a:graphic xmlns:a="http://schemas.openxmlformats.org/drawingml/2006/main">
               <a:graphicData uri="http://schemas.openxmlformats.org/drawingml/2006/picture">
                 <pic:pic xmlns:pic="http://schemas.openxmlformats.org/drawingml/2006/picture">
                   <pic:nvPicPr>
-                    <pic:cNvPr id="1754512764" name=""/>
+                    <pic:cNvPr id="261391798" name=""/>
                     <pic:cNvPicPr/>
                   </pic:nvPicPr>
                   <pic:blipFill>
@@ -10901,7 +11315,7 @@
           <w:sz w:val="27"/>
         </w:rPr>
       </w:pPr>
-      <w:bookmarkStart w:id="21" w:name="_Toc236924305"/>
+      <w:bookmarkStart w:id="21" w:name="_Toc237269545"/>
       <w:r>
         <w:rPr>
           <w:rFonts w:ascii="Montserrat" w:hAnsi="Montserrat"/>
@@ -10942,16 +11356,16 @@
         </w:rPr>
         <w:lastRenderedPageBreak/>
         <w:drawing>
-          <wp:inline distT="0" distB="0" distL="0" distR="0" wp14:anchorId="59A7DEA8" wp14:editId="5E2E25E3">
+          <wp:inline distT="0" distB="0" distL="0" distR="0" wp14:anchorId="09C102D5" wp14:editId="7898CB3E">
             <wp:extent cx="5120640" cy="4627581"/>
             <wp:effectExtent l="19050" t="19050" r="22860" b="20955"/>
-            <wp:docPr id="351984850" name="Imagem 18"/>
+            <wp:docPr id="295347721" name="Imagem 18"/>
             <wp:cNvGraphicFramePr/>
             <a:graphic xmlns:a="http://schemas.openxmlformats.org/drawingml/2006/main">
               <a:graphicData uri="http://schemas.openxmlformats.org/drawingml/2006/picture">
                 <pic:pic xmlns:pic="http://schemas.openxmlformats.org/drawingml/2006/picture">
                   <pic:nvPicPr>
-                    <pic:cNvPr id="351984850" name=""/>
+                    <pic:cNvPr id="295347721" name=""/>
                     <pic:cNvPicPr/>
                   </pic:nvPicPr>
                   <pic:blipFill>
@@ -11019,16 +11433,16 @@
         </w:rPr>
         <w:lastRenderedPageBreak/>
         <w:drawing>
-          <wp:inline distT="0" distB="0" distL="0" distR="0" wp14:anchorId="38948FD5" wp14:editId="30031FA1">
+          <wp:inline distT="0" distB="0" distL="0" distR="0" wp14:anchorId="0D98E226" wp14:editId="006173F3">
             <wp:extent cx="5120640" cy="4627581"/>
             <wp:effectExtent l="19050" t="19050" r="22860" b="20955"/>
-            <wp:docPr id="705755051" name="Imagem 19"/>
+            <wp:docPr id="260949505" name="Imagem 19"/>
             <wp:cNvGraphicFramePr/>
             <a:graphic xmlns:a="http://schemas.openxmlformats.org/drawingml/2006/main">
               <a:graphicData uri="http://schemas.openxmlformats.org/drawingml/2006/picture">
                 <pic:pic xmlns:pic="http://schemas.openxmlformats.org/drawingml/2006/picture">
                   <pic:nvPicPr>
-                    <pic:cNvPr id="705755051" name=""/>
+                    <pic:cNvPr id="260949505" name=""/>
                     <pic:cNvPicPr/>
                   </pic:nvPicPr>
                   <pic:blipFill>
@@ -11162,7 +11576,7 @@
           <w:sz w:val="27"/>
         </w:rPr>
       </w:pPr>
-      <w:bookmarkStart w:id="22" w:name="_Toc236924306"/>
+      <w:bookmarkStart w:id="22" w:name="_Toc237269546"/>
       <w:r>
         <w:rPr>
           <w:rFonts w:ascii="Montserrat" w:hAnsi="Montserrat"/>
@@ -11203,16 +11617,16 @@
         </w:rPr>
         <w:lastRenderedPageBreak/>
         <w:drawing>
-          <wp:inline distT="0" distB="0" distL="0" distR="0" wp14:anchorId="63AE4920" wp14:editId="04AEB17E">
+          <wp:inline distT="0" distB="0" distL="0" distR="0" wp14:anchorId="568F38C3" wp14:editId="67380D7F">
             <wp:extent cx="5120640" cy="4627581"/>
             <wp:effectExtent l="19050" t="19050" r="22860" b="20955"/>
-            <wp:docPr id="873542164" name="Imagem 20"/>
+            <wp:docPr id="48459277" name="Imagem 20"/>
             <wp:cNvGraphicFramePr/>
             <a:graphic xmlns:a="http://schemas.openxmlformats.org/drawingml/2006/main">
               <a:graphicData uri="http://schemas.openxmlformats.org/drawingml/2006/picture">
                 <pic:pic xmlns:pic="http://schemas.openxmlformats.org/drawingml/2006/picture">
                   <pic:nvPicPr>
-                    <pic:cNvPr id="873542164" name=""/>
+                    <pic:cNvPr id="48459277" name=""/>
                     <pic:cNvPicPr/>
                   </pic:nvPicPr>
                   <pic:blipFill>
@@ -11280,16 +11694,16 @@
         </w:rPr>
         <w:lastRenderedPageBreak/>
         <w:drawing>
-          <wp:inline distT="0" distB="0" distL="0" distR="0" wp14:anchorId="12D0D24A" wp14:editId="6D1B39E1">
+          <wp:inline distT="0" distB="0" distL="0" distR="0" wp14:anchorId="613EFB06" wp14:editId="2A5728C7">
             <wp:extent cx="5120640" cy="4627581"/>
             <wp:effectExtent l="19050" t="19050" r="22860" b="20955"/>
-            <wp:docPr id="971467320" name="Imagem 21"/>
+            <wp:docPr id="666270392" name="Imagem 21"/>
             <wp:cNvGraphicFramePr/>
             <a:graphic xmlns:a="http://schemas.openxmlformats.org/drawingml/2006/main">
               <a:graphicData uri="http://schemas.openxmlformats.org/drawingml/2006/picture">
                 <pic:pic xmlns:pic="http://schemas.openxmlformats.org/drawingml/2006/picture">
                   <pic:nvPicPr>
-                    <pic:cNvPr id="971467320" name=""/>
+                    <pic:cNvPr id="666270392" name=""/>
                     <pic:cNvPicPr/>
                   </pic:nvPicPr>
                   <pic:blipFill>
@@ -11478,7 +11892,7 @@
           <w:sz w:val="27"/>
         </w:rPr>
       </w:pPr>
-      <w:bookmarkStart w:id="23" w:name="_Toc236924307"/>
+      <w:bookmarkStart w:id="23" w:name="_Toc237269547"/>
       <w:r>
         <w:rPr>
           <w:rFonts w:ascii="Montserrat" w:hAnsi="Montserrat"/>
@@ -11518,16 +11932,16 @@
           <w:noProof/>
         </w:rPr>
         <w:drawing>
-          <wp:inline distT="0" distB="0" distL="0" distR="0" wp14:anchorId="4BE36F26" wp14:editId="7351A4DC">
+          <wp:inline distT="0" distB="0" distL="0" distR="0" wp14:anchorId="3DE31C59" wp14:editId="19A11309">
             <wp:extent cx="5120640" cy="4627581"/>
             <wp:effectExtent l="19050" t="19050" r="22860" b="20955"/>
-            <wp:docPr id="1647372924" name="Imagem 22"/>
+            <wp:docPr id="1318230761" name="Imagem 22"/>
             <wp:cNvGraphicFramePr/>
             <a:graphic xmlns:a="http://schemas.openxmlformats.org/drawingml/2006/main">
               <a:graphicData uri="http://schemas.openxmlformats.org/drawingml/2006/picture">
                 <pic:pic xmlns:pic="http://schemas.openxmlformats.org/drawingml/2006/picture">
                   <pic:nvPicPr>
-                    <pic:cNvPr id="1647372924" name=""/>
+                    <pic:cNvPr id="1318230761" name=""/>
                     <pic:cNvPicPr/>
                   </pic:nvPicPr>
                   <pic:blipFill>
@@ -11595,16 +12009,16 @@
         </w:rPr>
         <w:lastRenderedPageBreak/>
         <w:drawing>
-          <wp:inline distT="0" distB="0" distL="0" distR="0" wp14:anchorId="19A94EC2" wp14:editId="2B79AACC">
+          <wp:inline distT="0" distB="0" distL="0" distR="0" wp14:anchorId="28C1BE51" wp14:editId="237B6EDF">
             <wp:extent cx="5120640" cy="4627581"/>
             <wp:effectExtent l="19050" t="19050" r="22860" b="20955"/>
-            <wp:docPr id="370574196" name="Imagem 23"/>
+            <wp:docPr id="1223220446" name="Imagem 23"/>
             <wp:cNvGraphicFramePr/>
             <a:graphic xmlns:a="http://schemas.openxmlformats.org/drawingml/2006/main">
               <a:graphicData uri="http://schemas.openxmlformats.org/drawingml/2006/picture">
                 <pic:pic xmlns:pic="http://schemas.openxmlformats.org/drawingml/2006/picture">
                   <pic:nvPicPr>
-                    <pic:cNvPr id="370574196" name=""/>
+                    <pic:cNvPr id="1223220446" name=""/>
                     <pic:cNvPicPr/>
                   </pic:nvPicPr>
                   <pic:blipFill>
@@ -11762,7 +12176,7 @@
           <w:sz w:val="27"/>
         </w:rPr>
       </w:pPr>
-      <w:bookmarkStart w:id="24" w:name="_Toc236924308"/>
+      <w:bookmarkStart w:id="24" w:name="_Toc237269548"/>
       <w:r>
         <w:rPr>
           <w:rFonts w:ascii="Montserrat" w:hAnsi="Montserrat"/>
@@ -11803,16 +12217,16 @@
         </w:rPr>
         <w:lastRenderedPageBreak/>
         <w:drawing>
-          <wp:inline distT="0" distB="0" distL="0" distR="0" wp14:anchorId="190AF66F" wp14:editId="05931CE6">
+          <wp:inline distT="0" distB="0" distL="0" distR="0" wp14:anchorId="7E72B823" wp14:editId="01CF3713">
             <wp:extent cx="5120640" cy="4627581"/>
             <wp:effectExtent l="19050" t="19050" r="22860" b="20955"/>
-            <wp:docPr id="359455072" name="Imagem 24"/>
+            <wp:docPr id="448641003" name="Imagem 24"/>
             <wp:cNvGraphicFramePr/>
             <a:graphic xmlns:a="http://schemas.openxmlformats.org/drawingml/2006/main">
               <a:graphicData uri="http://schemas.openxmlformats.org/drawingml/2006/picture">
                 <pic:pic xmlns:pic="http://schemas.openxmlformats.org/drawingml/2006/picture">
                   <pic:nvPicPr>
-                    <pic:cNvPr id="359455072" name=""/>
+                    <pic:cNvPr id="448641003" name=""/>
                     <pic:cNvPicPr/>
                   </pic:nvPicPr>
                   <pic:blipFill>
@@ -11880,16 +12294,16 @@
         </w:rPr>
         <w:lastRenderedPageBreak/>
         <w:drawing>
-          <wp:inline distT="0" distB="0" distL="0" distR="0" wp14:anchorId="4CABBA20" wp14:editId="14741BEF">
+          <wp:inline distT="0" distB="0" distL="0" distR="0" wp14:anchorId="7C2A2E8F" wp14:editId="399AC5E3">
             <wp:extent cx="5120640" cy="4627581"/>
             <wp:effectExtent l="19050" t="19050" r="22860" b="20955"/>
-            <wp:docPr id="339032892" name="Imagem 25"/>
+            <wp:docPr id="1928003139" name="Imagem 25"/>
             <wp:cNvGraphicFramePr/>
             <a:graphic xmlns:a="http://schemas.openxmlformats.org/drawingml/2006/main">
               <a:graphicData uri="http://schemas.openxmlformats.org/drawingml/2006/picture">
                 <pic:pic xmlns:pic="http://schemas.openxmlformats.org/drawingml/2006/picture">
                   <pic:nvPicPr>
-                    <pic:cNvPr id="339032892" name=""/>
+                    <pic:cNvPr id="1928003139" name=""/>
                     <pic:cNvPicPr/>
                   </pic:nvPicPr>
                   <pic:blipFill>
@@ -12023,7 +12437,7 @@
           <w:sz w:val="27"/>
         </w:rPr>
       </w:pPr>
-      <w:bookmarkStart w:id="25" w:name="_Toc236924309"/>
+      <w:bookmarkStart w:id="25" w:name="_Toc237269549"/>
       <w:r>
         <w:rPr>
           <w:rFonts w:ascii="Montserrat" w:hAnsi="Montserrat"/>
@@ -12064,16 +12478,16 @@
         </w:rPr>
         <w:lastRenderedPageBreak/>
         <w:drawing>
-          <wp:inline distT="0" distB="0" distL="0" distR="0" wp14:anchorId="57570237" wp14:editId="2D1E6A64">
+          <wp:inline distT="0" distB="0" distL="0" distR="0" wp14:anchorId="2AF174BF" wp14:editId="4A9BEBFF">
             <wp:extent cx="5120640" cy="4627581"/>
             <wp:effectExtent l="19050" t="19050" r="22860" b="20955"/>
-            <wp:docPr id="1303876140" name="Imagem 26"/>
+            <wp:docPr id="1005929642" name="Imagem 26"/>
             <wp:cNvGraphicFramePr/>
             <a:graphic xmlns:a="http://schemas.openxmlformats.org/drawingml/2006/main">
               <a:graphicData uri="http://schemas.openxmlformats.org/drawingml/2006/picture">
                 <pic:pic xmlns:pic="http://schemas.openxmlformats.org/drawingml/2006/picture">
                   <pic:nvPicPr>
-                    <pic:cNvPr id="1303876140" name=""/>
+                    <pic:cNvPr id="1005929642" name=""/>
                     <pic:cNvPicPr/>
                   </pic:nvPicPr>
                   <pic:blipFill>
@@ -12163,7 +12577,7 @@
           <w:sz w:val="34"/>
         </w:rPr>
       </w:pPr>
-      <w:bookmarkStart w:id="26" w:name="_Toc236924310"/>
+      <w:bookmarkStart w:id="26" w:name="_Toc237269550"/>
       <w:r>
         <w:rPr>
           <w:rFonts w:ascii="Montserrat" w:hAnsi="Montserrat"/>
@@ -12205,7 +12619,7 @@
           <w:sz w:val="27"/>
         </w:rPr>
       </w:pPr>
-      <w:bookmarkStart w:id="27" w:name="_Toc236924311"/>
+      <w:bookmarkStart w:id="27" w:name="_Toc237269551"/>
       <w:r>
         <w:rPr>
           <w:rFonts w:ascii="Montserrat" w:hAnsi="Montserrat"/>
@@ -12245,16 +12659,16 @@
           <w:noProof/>
         </w:rPr>
         <w:drawing>
-          <wp:inline distT="0" distB="0" distL="0" distR="0" wp14:anchorId="27D1E454" wp14:editId="2CB42086">
+          <wp:inline distT="0" distB="0" distL="0" distR="0" wp14:anchorId="7459CD25" wp14:editId="69DBA5BE">
             <wp:extent cx="5120640" cy="4627581"/>
             <wp:effectExtent l="19050" t="19050" r="22860" b="20955"/>
-            <wp:docPr id="357163952" name="Imagem 27"/>
+            <wp:docPr id="1024270441" name="Imagem 27"/>
             <wp:cNvGraphicFramePr/>
             <a:graphic xmlns:a="http://schemas.openxmlformats.org/drawingml/2006/main">
               <a:graphicData uri="http://schemas.openxmlformats.org/drawingml/2006/picture">
                 <pic:pic xmlns:pic="http://schemas.openxmlformats.org/drawingml/2006/picture">
                   <pic:nvPicPr>
-                    <pic:cNvPr id="357163952" name=""/>
+                    <pic:cNvPr id="1024270441" name=""/>
                     <pic:cNvPicPr/>
                   </pic:nvPicPr>
                   <pic:blipFill>
@@ -12322,16 +12736,16 @@
         </w:rPr>
         <w:lastRenderedPageBreak/>
         <w:drawing>
-          <wp:inline distT="0" distB="0" distL="0" distR="0" wp14:anchorId="5C11756F" wp14:editId="21DE49D3">
+          <wp:inline distT="0" distB="0" distL="0" distR="0" wp14:anchorId="1045E653" wp14:editId="52A4A366">
             <wp:extent cx="5120640" cy="4627581"/>
             <wp:effectExtent l="19050" t="19050" r="22860" b="20955"/>
-            <wp:docPr id="1636013877" name="Imagem 28"/>
+            <wp:docPr id="406719742" name="Imagem 28"/>
             <wp:cNvGraphicFramePr/>
             <a:graphic xmlns:a="http://schemas.openxmlformats.org/drawingml/2006/main">
               <a:graphicData uri="http://schemas.openxmlformats.org/drawingml/2006/picture">
                 <pic:pic xmlns:pic="http://schemas.openxmlformats.org/drawingml/2006/picture">
                   <pic:nvPicPr>
-                    <pic:cNvPr id="1636013877" name=""/>
+                    <pic:cNvPr id="406719742" name=""/>
                     <pic:cNvPicPr/>
                   </pic:nvPicPr>
                   <pic:blipFill>
@@ -12399,16 +12813,16 @@
         </w:rPr>
         <w:lastRenderedPageBreak/>
         <w:drawing>
-          <wp:inline distT="0" distB="0" distL="0" distR="0" wp14:anchorId="3C052D9B" wp14:editId="43890F49">
+          <wp:inline distT="0" distB="0" distL="0" distR="0" wp14:anchorId="2145EB25" wp14:editId="6FD7D2D8">
             <wp:extent cx="5120640" cy="4627581"/>
             <wp:effectExtent l="19050" t="19050" r="22860" b="20955"/>
-            <wp:docPr id="1458362475" name="Imagem 29"/>
+            <wp:docPr id="618197166" name="Imagem 29"/>
             <wp:cNvGraphicFramePr/>
             <a:graphic xmlns:a="http://schemas.openxmlformats.org/drawingml/2006/main">
               <a:graphicData uri="http://schemas.openxmlformats.org/drawingml/2006/picture">
                 <pic:pic xmlns:pic="http://schemas.openxmlformats.org/drawingml/2006/picture">
                   <pic:nvPicPr>
-                    <pic:cNvPr id="1458362475" name=""/>
+                    <pic:cNvPr id="618197166" name=""/>
                     <pic:cNvPicPr/>
                   </pic:nvPicPr>
                   <pic:blipFill>
@@ -12545,16 +12959,16 @@
         </w:rPr>
         <w:lastRenderedPageBreak/>
         <w:drawing>
-          <wp:inline distT="0" distB="0" distL="0" distR="0" wp14:anchorId="2D8E2A8C" wp14:editId="42B8D893">
+          <wp:inline distT="0" distB="0" distL="0" distR="0" wp14:anchorId="2E91DE62" wp14:editId="5CE991DB">
             <wp:extent cx="5120640" cy="1715571"/>
             <wp:effectExtent l="19050" t="19050" r="22860" b="18415"/>
-            <wp:docPr id="1434461021" name="Imagem 30"/>
+            <wp:docPr id="1575964484" name="Imagem 30"/>
             <wp:cNvGraphicFramePr/>
             <a:graphic xmlns:a="http://schemas.openxmlformats.org/drawingml/2006/main">
               <a:graphicData uri="http://schemas.openxmlformats.org/drawingml/2006/picture">
                 <pic:pic xmlns:pic="http://schemas.openxmlformats.org/drawingml/2006/picture">
                   <pic:nvPicPr>
-                    <pic:cNvPr id="1434461021" name=""/>
+                    <pic:cNvPr id="1575964484" name=""/>
                     <pic:cNvPicPr/>
                   </pic:nvPicPr>
                   <pic:blipFill>
@@ -12691,16 +13105,16 @@
         </w:rPr>
         <w:lastRenderedPageBreak/>
         <w:drawing>
-          <wp:inline distT="0" distB="0" distL="0" distR="0" wp14:anchorId="46901057" wp14:editId="5B1BC318">
+          <wp:inline distT="0" distB="0" distL="0" distR="0" wp14:anchorId="1B636BB8" wp14:editId="34416550">
             <wp:extent cx="5120640" cy="3282818"/>
             <wp:effectExtent l="19050" t="19050" r="22860" b="13335"/>
-            <wp:docPr id="177821863" name="Imagem 31"/>
+            <wp:docPr id="2009121306" name="Imagem 31"/>
             <wp:cNvGraphicFramePr/>
             <a:graphic xmlns:a="http://schemas.openxmlformats.org/drawingml/2006/main">
               <a:graphicData uri="http://schemas.openxmlformats.org/drawingml/2006/picture">
                 <pic:pic xmlns:pic="http://schemas.openxmlformats.org/drawingml/2006/picture">
                   <pic:nvPicPr>
-                    <pic:cNvPr id="177821863" name=""/>
+                    <pic:cNvPr id="2009121306" name=""/>
                     <pic:cNvPicPr/>
                   </pic:nvPicPr>
                   <pic:blipFill>
@@ -12812,16 +13226,16 @@
           <w:noProof/>
         </w:rPr>
         <w:drawing>
-          <wp:inline distT="0" distB="0" distL="0" distR="0" wp14:anchorId="07CCA8E3" wp14:editId="5725177C">
+          <wp:inline distT="0" distB="0" distL="0" distR="0" wp14:anchorId="07D66FE0" wp14:editId="7F371E3A">
             <wp:extent cx="5120640" cy="1515102"/>
             <wp:effectExtent l="19050" t="19050" r="22860" b="28575"/>
-            <wp:docPr id="1829598173" name="Imagem 32"/>
+            <wp:docPr id="576398589" name="Imagem 32"/>
             <wp:cNvGraphicFramePr/>
             <a:graphic xmlns:a="http://schemas.openxmlformats.org/drawingml/2006/main">
               <a:graphicData uri="http://schemas.openxmlformats.org/drawingml/2006/picture">
                 <pic:pic xmlns:pic="http://schemas.openxmlformats.org/drawingml/2006/picture">
                   <pic:nvPicPr>
-                    <pic:cNvPr id="1829598173" name=""/>
+                    <pic:cNvPr id="576398589" name=""/>
                     <pic:cNvPicPr/>
                   </pic:nvPicPr>
                   <pic:blipFill>
@@ -12934,16 +13348,16 @@
           <w:noProof/>
         </w:rPr>
         <w:drawing>
-          <wp:inline distT="0" distB="0" distL="0" distR="0" wp14:anchorId="2F071B04" wp14:editId="73CBB329">
+          <wp:inline distT="0" distB="0" distL="0" distR="0" wp14:anchorId="7848C946" wp14:editId="075EEB78">
             <wp:extent cx="5120640" cy="1391113"/>
             <wp:effectExtent l="19050" t="19050" r="22860" b="19050"/>
-            <wp:docPr id="1735962514" name="Imagem 33"/>
+            <wp:docPr id="697830920" name="Imagem 33"/>
             <wp:cNvGraphicFramePr/>
             <a:graphic xmlns:a="http://schemas.openxmlformats.org/drawingml/2006/main">
               <a:graphicData uri="http://schemas.openxmlformats.org/drawingml/2006/picture">
                 <pic:pic xmlns:pic="http://schemas.openxmlformats.org/drawingml/2006/picture">
                   <pic:nvPicPr>
-                    <pic:cNvPr id="1735962514" name=""/>
+                    <pic:cNvPr id="697830920" name=""/>
                     <pic:cNvPicPr/>
                   </pic:nvPicPr>
                   <pic:blipFill>
@@ -13055,16 +13469,16 @@
           <w:noProof/>
         </w:rPr>
         <w:drawing>
-          <wp:inline distT="0" distB="0" distL="0" distR="0" wp14:anchorId="6269ED3E" wp14:editId="3A29A819">
+          <wp:inline distT="0" distB="0" distL="0" distR="0" wp14:anchorId="227D0874" wp14:editId="3B7ED10B">
             <wp:extent cx="5120640" cy="1125174"/>
             <wp:effectExtent l="19050" t="19050" r="22860" b="18415"/>
-            <wp:docPr id="1627925245" name="Imagem 34"/>
+            <wp:docPr id="668544686" name="Imagem 34"/>
             <wp:cNvGraphicFramePr/>
             <a:graphic xmlns:a="http://schemas.openxmlformats.org/drawingml/2006/main">
               <a:graphicData uri="http://schemas.openxmlformats.org/drawingml/2006/picture">
                 <pic:pic xmlns:pic="http://schemas.openxmlformats.org/drawingml/2006/picture">
                   <pic:nvPicPr>
-                    <pic:cNvPr id="1627925245" name=""/>
+                    <pic:cNvPr id="668544686" name=""/>
                     <pic:cNvPicPr/>
                   </pic:nvPicPr>
                   <pic:blipFill>
@@ -13154,7 +13568,7 @@
           <w:sz w:val="27"/>
         </w:rPr>
       </w:pPr>
-      <w:bookmarkStart w:id="28" w:name="_Toc236924312"/>
+      <w:bookmarkStart w:id="28" w:name="_Toc237269552"/>
       <w:r>
         <w:rPr>
           <w:rFonts w:ascii="Montserrat" w:hAnsi="Montserrat"/>
@@ -13194,16 +13608,16 @@
           <w:noProof/>
         </w:rPr>
         <w:drawing>
-          <wp:inline distT="0" distB="0" distL="0" distR="0" wp14:anchorId="3767046D" wp14:editId="46D09575">
+          <wp:inline distT="0" distB="0" distL="0" distR="0" wp14:anchorId="5F075D99" wp14:editId="788ECB7A">
             <wp:extent cx="5120640" cy="4627581"/>
             <wp:effectExtent l="19050" t="19050" r="22860" b="20955"/>
-            <wp:docPr id="649843979" name="Imagem 35"/>
+            <wp:docPr id="677951976" name="Imagem 35"/>
             <wp:cNvGraphicFramePr/>
             <a:graphic xmlns:a="http://schemas.openxmlformats.org/drawingml/2006/main">
               <a:graphicData uri="http://schemas.openxmlformats.org/drawingml/2006/picture">
                 <pic:pic xmlns:pic="http://schemas.openxmlformats.org/drawingml/2006/picture">
                   <pic:nvPicPr>
-                    <pic:cNvPr id="649843979" name=""/>
+                    <pic:cNvPr id="677951976" name=""/>
                     <pic:cNvPicPr/>
                   </pic:nvPicPr>
                   <pic:blipFill>
@@ -13271,16 +13685,16 @@
         </w:rPr>
         <w:lastRenderedPageBreak/>
         <w:drawing>
-          <wp:inline distT="0" distB="0" distL="0" distR="0" wp14:anchorId="3B1ABCDB" wp14:editId="70FDAF0F">
+          <wp:inline distT="0" distB="0" distL="0" distR="0" wp14:anchorId="17DD60A0" wp14:editId="7CF22958">
             <wp:extent cx="5120640" cy="4627581"/>
             <wp:effectExtent l="19050" t="19050" r="22860" b="20955"/>
-            <wp:docPr id="1630499968" name="Imagem 36"/>
+            <wp:docPr id="1098404359" name="Imagem 36"/>
             <wp:cNvGraphicFramePr/>
             <a:graphic xmlns:a="http://schemas.openxmlformats.org/drawingml/2006/main">
               <a:graphicData uri="http://schemas.openxmlformats.org/drawingml/2006/picture">
                 <pic:pic xmlns:pic="http://schemas.openxmlformats.org/drawingml/2006/picture">
                   <pic:nvPicPr>
-                    <pic:cNvPr id="1630499968" name=""/>
+                    <pic:cNvPr id="1098404359" name=""/>
                     <pic:cNvPicPr/>
                   </pic:nvPicPr>
                   <pic:blipFill>
@@ -13417,16 +13831,16 @@
         </w:rPr>
         <w:lastRenderedPageBreak/>
         <w:drawing>
-          <wp:inline distT="0" distB="0" distL="0" distR="0" wp14:anchorId="3944F1B5" wp14:editId="511E04FE">
+          <wp:inline distT="0" distB="0" distL="0" distR="0" wp14:anchorId="297519A0" wp14:editId="4D77465C">
             <wp:extent cx="5120640" cy="2144319"/>
             <wp:effectExtent l="19050" t="19050" r="22860" b="27940"/>
-            <wp:docPr id="285588999" name="Imagem 37"/>
+            <wp:docPr id="1394465070" name="Imagem 37"/>
             <wp:cNvGraphicFramePr/>
             <a:graphic xmlns:a="http://schemas.openxmlformats.org/drawingml/2006/main">
               <a:graphicData uri="http://schemas.openxmlformats.org/drawingml/2006/picture">
                 <pic:pic xmlns:pic="http://schemas.openxmlformats.org/drawingml/2006/picture">
                   <pic:nvPicPr>
-                    <pic:cNvPr id="285588999" name=""/>
+                    <pic:cNvPr id="1394465070" name=""/>
                     <pic:cNvPicPr/>
                   </pic:nvPicPr>
                   <pic:blipFill>
@@ -13514,16 +13928,16 @@
           <w:noProof/>
         </w:rPr>
         <w:drawing>
-          <wp:inline distT="0" distB="0" distL="0" distR="0" wp14:anchorId="7A5E6451" wp14:editId="39D82B47">
+          <wp:inline distT="0" distB="0" distL="0" distR="0" wp14:anchorId="0840A7E5" wp14:editId="01116E63">
             <wp:extent cx="5120640" cy="1055647"/>
             <wp:effectExtent l="19050" t="19050" r="22860" b="11430"/>
-            <wp:docPr id="1691948675" name="Imagem 38"/>
+            <wp:docPr id="1433165822" name="Imagem 38"/>
             <wp:cNvGraphicFramePr/>
             <a:graphic xmlns:a="http://schemas.openxmlformats.org/drawingml/2006/main">
               <a:graphicData uri="http://schemas.openxmlformats.org/drawingml/2006/picture">
                 <pic:pic xmlns:pic="http://schemas.openxmlformats.org/drawingml/2006/picture">
                   <pic:nvPicPr>
-                    <pic:cNvPr id="1691948675" name=""/>
+                    <pic:cNvPr id="1433165822" name=""/>
                     <pic:cNvPicPr/>
                   </pic:nvPicPr>
                   <pic:blipFill>
@@ -13636,16 +14050,16 @@
         </w:rPr>
         <w:lastRenderedPageBreak/>
         <w:drawing>
-          <wp:inline distT="0" distB="0" distL="0" distR="0" wp14:anchorId="47BA78AA" wp14:editId="22C295FF">
+          <wp:inline distT="0" distB="0" distL="0" distR="0" wp14:anchorId="489BA316" wp14:editId="3197C9E1">
             <wp:extent cx="5120640" cy="3282818"/>
             <wp:effectExtent l="19050" t="19050" r="22860" b="13335"/>
-            <wp:docPr id="515823066" name="Imagem 39"/>
+            <wp:docPr id="749480491" name="Imagem 39"/>
             <wp:cNvGraphicFramePr/>
             <a:graphic xmlns:a="http://schemas.openxmlformats.org/drawingml/2006/main">
               <a:graphicData uri="http://schemas.openxmlformats.org/drawingml/2006/picture">
                 <pic:pic xmlns:pic="http://schemas.openxmlformats.org/drawingml/2006/picture">
                   <pic:nvPicPr>
-                    <pic:cNvPr id="515823066" name=""/>
+                    <pic:cNvPr id="749480491" name=""/>
                     <pic:cNvPicPr/>
                   </pic:nvPicPr>
                   <pic:blipFill>
@@ -13778,16 +14192,16 @@
           <w:noProof/>
         </w:rPr>
         <w:drawing>
-          <wp:inline distT="0" distB="0" distL="0" distR="0" wp14:anchorId="7919F5CF" wp14:editId="43463D04">
+          <wp:inline distT="0" distB="0" distL="0" distR="0" wp14:anchorId="3E151A02" wp14:editId="03C5A6F6">
             <wp:extent cx="5120640" cy="1978034"/>
             <wp:effectExtent l="19050" t="19050" r="22860" b="22225"/>
-            <wp:docPr id="1580544993" name="Imagem 40"/>
+            <wp:docPr id="238851978" name="Imagem 40"/>
             <wp:cNvGraphicFramePr/>
             <a:graphic xmlns:a="http://schemas.openxmlformats.org/drawingml/2006/main">
               <a:graphicData uri="http://schemas.openxmlformats.org/drawingml/2006/picture">
                 <pic:pic xmlns:pic="http://schemas.openxmlformats.org/drawingml/2006/picture">
                   <pic:nvPicPr>
-                    <pic:cNvPr id="1580544993" name=""/>
+                    <pic:cNvPr id="238851978" name=""/>
                     <pic:cNvPicPr/>
                   </pic:nvPicPr>
                   <pic:blipFill>
@@ -13860,7 +14274,7 @@
           <w:sz w:val="34"/>
         </w:rPr>
       </w:pPr>
-      <w:bookmarkStart w:id="29" w:name="_Toc236924313"/>
+      <w:bookmarkStart w:id="29" w:name="_Toc237269553"/>
       <w:r>
         <w:rPr>
           <w:rFonts w:ascii="Montserrat" w:hAnsi="Montserrat"/>
@@ -13920,7 +14334,7 @@
           <w:sz w:val="27"/>
         </w:rPr>
       </w:pPr>
-      <w:bookmarkStart w:id="30" w:name="_Toc236924314"/>
+      <w:bookmarkStart w:id="30" w:name="_Toc237269554"/>
       <w:r>
         <w:rPr>
           <w:rFonts w:ascii="Montserrat" w:hAnsi="Montserrat"/>
@@ -13960,16 +14374,16 @@
           <w:noProof/>
         </w:rPr>
         <w:drawing>
-          <wp:inline distT="0" distB="0" distL="0" distR="0" wp14:anchorId="338A89A6" wp14:editId="5F465EC2">
+          <wp:inline distT="0" distB="0" distL="0" distR="0" wp14:anchorId="07BEED8F" wp14:editId="56EA1EDB">
             <wp:extent cx="5303520" cy="4792851"/>
             <wp:effectExtent l="19050" t="19050" r="11430" b="27305"/>
-            <wp:docPr id="2118714833" name="Imagem 41"/>
+            <wp:docPr id="1919948799" name="Imagem 41"/>
             <wp:cNvGraphicFramePr/>
             <a:graphic xmlns:a="http://schemas.openxmlformats.org/drawingml/2006/main">
               <a:graphicData uri="http://schemas.openxmlformats.org/drawingml/2006/picture">
                 <pic:pic xmlns:pic="http://schemas.openxmlformats.org/drawingml/2006/picture">
                   <pic:nvPicPr>
-                    <pic:cNvPr id="2118714833" name=""/>
+                    <pic:cNvPr id="1919948799" name=""/>
                     <pic:cNvPicPr/>
                   </pic:nvPicPr>
                   <pic:blipFill>
@@ -14038,7 +14452,7 @@
           <w:sz w:val="27"/>
         </w:rPr>
       </w:pPr>
-      <w:bookmarkStart w:id="31" w:name="_Toc236924315"/>
+      <w:bookmarkStart w:id="31" w:name="_Toc237269555"/>
       <w:r>
         <w:rPr>
           <w:rFonts w:ascii="Montserrat" w:hAnsi="Montserrat"/>
@@ -14078,16 +14492,16 @@
           <w:noProof/>
         </w:rPr>
         <w:drawing>
-          <wp:inline distT="0" distB="0" distL="0" distR="0" wp14:anchorId="4ECEC551" wp14:editId="2BD6B423">
+          <wp:inline distT="0" distB="0" distL="0" distR="0" wp14:anchorId="5A7AFAFF" wp14:editId="4337DF4A">
             <wp:extent cx="5303520" cy="4792851"/>
             <wp:effectExtent l="19050" t="19050" r="11430" b="27305"/>
-            <wp:docPr id="1522153434" name="Imagem 42"/>
+            <wp:docPr id="1648439038" name="Imagem 42"/>
             <wp:cNvGraphicFramePr/>
             <a:graphic xmlns:a="http://schemas.openxmlformats.org/drawingml/2006/main">
               <a:graphicData uri="http://schemas.openxmlformats.org/drawingml/2006/picture">
                 <pic:pic xmlns:pic="http://schemas.openxmlformats.org/drawingml/2006/picture">
                   <pic:nvPicPr>
-                    <pic:cNvPr id="1522153434" name=""/>
+                    <pic:cNvPr id="1648439038" name=""/>
                     <pic:cNvPicPr/>
                   </pic:nvPicPr>
                   <pic:blipFill>
@@ -14155,7 +14569,7 @@
           <w:sz w:val="27"/>
         </w:rPr>
       </w:pPr>
-      <w:bookmarkStart w:id="32" w:name="_Toc236924316"/>
+      <w:bookmarkStart w:id="32" w:name="_Toc237269556"/>
       <w:r>
         <w:rPr>
           <w:rFonts w:ascii="Montserrat" w:hAnsi="Montserrat"/>
@@ -14196,16 +14610,16 @@
         </w:rPr>
         <w:lastRenderedPageBreak/>
         <w:drawing>
-          <wp:inline distT="0" distB="0" distL="0" distR="0" wp14:anchorId="49AF3207" wp14:editId="33F788D4">
+          <wp:inline distT="0" distB="0" distL="0" distR="0" wp14:anchorId="010E6D85" wp14:editId="691EE7B4">
             <wp:extent cx="5303520" cy="4792851"/>
             <wp:effectExtent l="19050" t="19050" r="11430" b="27305"/>
-            <wp:docPr id="73872892" name="Imagem 43"/>
+            <wp:docPr id="1682749042" name="Imagem 43"/>
             <wp:cNvGraphicFramePr/>
             <a:graphic xmlns:a="http://schemas.openxmlformats.org/drawingml/2006/main">
               <a:graphicData uri="http://schemas.openxmlformats.org/drawingml/2006/picture">
                 <pic:pic xmlns:pic="http://schemas.openxmlformats.org/drawingml/2006/picture">
                   <pic:nvPicPr>
-                    <pic:cNvPr id="73872892" name=""/>
+                    <pic:cNvPr id="1682749042" name=""/>
                     <pic:cNvPicPr/>
                   </pic:nvPicPr>
                   <pic:blipFill>
@@ -14273,16 +14687,16 @@
         </w:rPr>
         <w:lastRenderedPageBreak/>
         <w:drawing>
-          <wp:inline distT="0" distB="0" distL="0" distR="0" wp14:anchorId="79C9ECD4" wp14:editId="11A63F62">
+          <wp:inline distT="0" distB="0" distL="0" distR="0" wp14:anchorId="1B06DE7B" wp14:editId="33994076">
             <wp:extent cx="5303520" cy="4792851"/>
             <wp:effectExtent l="19050" t="19050" r="11430" b="27305"/>
-            <wp:docPr id="629276945" name="Imagem 44"/>
+            <wp:docPr id="132401071" name="Imagem 44"/>
             <wp:cNvGraphicFramePr/>
             <a:graphic xmlns:a="http://schemas.openxmlformats.org/drawingml/2006/main">
               <a:graphicData uri="http://schemas.openxmlformats.org/drawingml/2006/picture">
                 <pic:pic xmlns:pic="http://schemas.openxmlformats.org/drawingml/2006/picture">
                   <pic:nvPicPr>
-                    <pic:cNvPr id="629276945" name=""/>
+                    <pic:cNvPr id="132401071" name=""/>
                     <pic:cNvPicPr/>
                   </pic:nvPicPr>
                   <pic:blipFill>
@@ -14375,7 +14789,7 @@
           <w:sz w:val="34"/>
         </w:rPr>
       </w:pPr>
-      <w:bookmarkStart w:id="33" w:name="_Toc236924317"/>
+      <w:bookmarkStart w:id="33" w:name="_Toc237269557"/>
       <w:r>
         <w:rPr>
           <w:rFonts w:ascii="Montserrat" w:hAnsi="Montserrat"/>
@@ -14417,7 +14831,7 @@
           <w:sz w:val="27"/>
         </w:rPr>
       </w:pPr>
-      <w:bookmarkStart w:id="34" w:name="_Toc236924318"/>
+      <w:bookmarkStart w:id="34" w:name="_Toc237269558"/>
       <w:r>
         <w:rPr>
           <w:rFonts w:ascii="Montserrat" w:hAnsi="Montserrat"/>
@@ -14444,7 +14858,7 @@
           <w:color w:val="1A1A1A"/>
           <w:sz w:val="22"/>
         </w:rPr>
-        <w:t>Lista todos os usuarios que ja fizeram login pelo menos uma vez, com o papel atual e um seletor para altera-lo.</w:t>
+        <w:t>Lista todos os usuarios que ja fizeram login pelo menos uma vez, com nome, telefone (editavel diretamente na lista) e um seletor para alterar o papel.</w:t>
       </w:r>
     </w:p>
     <w:p>
@@ -14457,16 +14871,16 @@
           <w:noProof/>
         </w:rPr>
         <w:drawing>
-          <wp:inline distT="0" distB="0" distL="0" distR="0" wp14:anchorId="151844E7" wp14:editId="6C3A0816">
+          <wp:inline distT="0" distB="0" distL="0" distR="0" wp14:anchorId="674F415A" wp14:editId="321C9DFF">
             <wp:extent cx="5303520" cy="4792851"/>
             <wp:effectExtent l="19050" t="19050" r="11430" b="27305"/>
-            <wp:docPr id="783430045" name="Imagem 45"/>
+            <wp:docPr id="848120981" name="Imagem 45"/>
             <wp:cNvGraphicFramePr/>
             <a:graphic xmlns:a="http://schemas.openxmlformats.org/drawingml/2006/main">
               <a:graphicData uri="http://schemas.openxmlformats.org/drawingml/2006/picture">
                 <pic:pic xmlns:pic="http://schemas.openxmlformats.org/drawingml/2006/picture">
                   <pic:nvPicPr>
-                    <pic:cNvPr id="783430045" name=""/>
+                    <pic:cNvPr id="848120981" name=""/>
                     <pic:cNvPicPr/>
                   </pic:nvPicPr>
                   <pic:blipFill>
@@ -14520,7 +14934,55 @@
           <w:color w:val="6A6A70"/>
           <w:sz w:val="19"/>
         </w:rPr>
-        <w:t>Aba Usuarios: papel atual e seletor de alteracao de papel por usuario.</w:t>
+        <w:t>Aba Usuarios: nome, telefone, papel atual e seletor de alteracao de papel por usuario.</w:t>
+      </w:r>
+    </w:p>
+    <w:p>
+      <w:pPr>
+        <w:spacing w:line="280" w:lineRule="auto"/>
+        <w:rPr>
+          <w:rFonts w:ascii="Montserrat" w:hAnsi="Montserrat"/>
+          <w:color w:val="1A1A1A"/>
+          <w:sz w:val="22"/>
+        </w:rPr>
+      </w:pPr>
+      <w:r>
+        <w:rPr>
+          <w:rFonts w:ascii="Montserrat" w:hAnsi="Montserrat"/>
+          <w:color w:val="1A1A1A"/>
+          <w:sz w:val="22"/>
+        </w:rPr>
+        <w:t xml:space="preserve">No topo da lista, o Admin pode pre-cadastrar uma pessoa que ainda nao fez login, preenchendo nome, telefone (opcional), e-mail e papel e clicando em + Adicionar usuario. Enquanto a pessoa nao faz o primeiro login, ela aparece na </w:t>
+      </w:r>
+      <w:r>
+        <w:rPr>
+          <w:rFonts w:ascii="Montserrat" w:hAnsi="Montserrat"/>
+          <w:color w:val="1A1A1A"/>
+          <w:sz w:val="22"/>
+        </w:rPr>
+        <w:lastRenderedPageBreak/>
+        <w:t>lista com o selo Pendente - 1o login, e o Admin ainda pode ajustar telefone e papel ou remover o pre-cadastro pelo botao Remover.</w:t>
+      </w:r>
+    </w:p>
+    <w:p>
+      <w:pPr>
+        <w:spacing w:before="160" w:after="200"/>
+        <w:ind w:left="283"/>
+        <w:rPr>
+          <w:rFonts w:ascii="Montserrat" w:hAnsi="Montserrat"/>
+          <w:i/>
+          <w:color w:val="6A6A70"/>
+          <w:sz w:val="21"/>
+        </w:rPr>
+      </w:pPr>
+      <w:r>
+        <w:rPr>
+          <w:rFonts w:ascii="Montserrat" w:hAnsi="Montserrat"/>
+          <w:i/>
+          <w:color w:val="6A6A70"/>
+          <w:sz w:val="21"/>
+        </w:rPr>
+        <w:t>Quando a pessoa pre-cadastrada faz o primeiro login, o sistema aplica automaticamente o nome, telefone e papel definidos pelo Admin ao perfil recem-criado - ela nao entra mais como Solicitante por padrao, e o pre-cadastro pendente desaparece da lista.</w:t>
       </w:r>
     </w:p>
     <w:p>
@@ -14534,7 +14996,7 @@
           <w:sz w:val="27"/>
         </w:rPr>
       </w:pPr>
-      <w:bookmarkStart w:id="35" w:name="_Toc236924319"/>
+      <w:bookmarkStart w:id="35" w:name="_Toc237269559"/>
       <w:r>
         <w:rPr>
           <w:rFonts w:ascii="Montserrat" w:hAnsi="Montserrat"/>
@@ -14542,7 +15004,6 @@
           <w:color w:val="B91D2E"/>
           <w:sz w:val="27"/>
         </w:rPr>
-        <w:lastRenderedPageBreak/>
         <w:t>6.2 Equipes</w:t>
       </w:r>
       <w:bookmarkEnd w:id="35"/>
@@ -14575,16 +15036,16 @@
           <w:noProof/>
         </w:rPr>
         <w:drawing>
-          <wp:inline distT="0" distB="0" distL="0" distR="0" wp14:anchorId="32677F43" wp14:editId="32CBFE8E">
+          <wp:inline distT="0" distB="0" distL="0" distR="0" wp14:anchorId="0A493F12" wp14:editId="7DAEA38C">
             <wp:extent cx="5303520" cy="4792851"/>
             <wp:effectExtent l="19050" t="19050" r="11430" b="27305"/>
-            <wp:docPr id="1607038398" name="Imagem 46"/>
+            <wp:docPr id="2076261799" name="Imagem 46"/>
             <wp:cNvGraphicFramePr/>
             <a:graphic xmlns:a="http://schemas.openxmlformats.org/drawingml/2006/main">
               <a:graphicData uri="http://schemas.openxmlformats.org/drawingml/2006/picture">
                 <pic:pic xmlns:pic="http://schemas.openxmlformats.org/drawingml/2006/picture">
                   <pic:nvPicPr>
-                    <pic:cNvPr id="1607038398" name=""/>
+                    <pic:cNvPr id="2076261799" name=""/>
                     <pic:cNvPicPr/>
                   </pic:nvPicPr>
                   <pic:blipFill>
@@ -14652,7 +15113,7 @@
           <w:sz w:val="27"/>
         </w:rPr>
       </w:pPr>
-      <w:bookmarkStart w:id="36" w:name="_Toc236924320"/>
+      <w:bookmarkStart w:id="36" w:name="_Toc237269560"/>
       <w:r>
         <w:rPr>
           <w:rFonts w:ascii="Montserrat" w:hAnsi="Montserrat"/>
@@ -14660,6 +15121,7 @@
           <w:color w:val="B91D2E"/>
           <w:sz w:val="27"/>
         </w:rPr>
+        <w:lastRenderedPageBreak/>
         <w:t>6.3 Configuracoes</w:t>
       </w:r>
       <w:bookmarkEnd w:id="36"/>
@@ -14691,18 +15153,17 @@
         <w:rPr>
           <w:noProof/>
         </w:rPr>
-        <w:lastRenderedPageBreak/>
         <w:drawing>
-          <wp:inline distT="0" distB="0" distL="0" distR="0" wp14:anchorId="136981B0" wp14:editId="1A678F21">
+          <wp:inline distT="0" distB="0" distL="0" distR="0" wp14:anchorId="437F52BE" wp14:editId="28B92363">
             <wp:extent cx="5303520" cy="4792851"/>
             <wp:effectExtent l="19050" t="19050" r="11430" b="27305"/>
-            <wp:docPr id="1076214154" name="Imagem 47"/>
+            <wp:docPr id="1115473101" name="Imagem 47"/>
             <wp:cNvGraphicFramePr/>
             <a:graphic xmlns:a="http://schemas.openxmlformats.org/drawingml/2006/main">
               <a:graphicData uri="http://schemas.openxmlformats.org/drawingml/2006/picture">
                 <pic:pic xmlns:pic="http://schemas.openxmlformats.org/drawingml/2006/picture">
                   <pic:nvPicPr>
-                    <pic:cNvPr id="1076214154" name=""/>
+                    <pic:cNvPr id="1115473101" name=""/>
                     <pic:cNvPicPr/>
                   </pic:nvPicPr>
                   <pic:blipFill>
@@ -14770,7 +15231,7 @@
           <w:sz w:val="27"/>
         </w:rPr>
       </w:pPr>
-      <w:bookmarkStart w:id="37" w:name="_Toc236924321"/>
+      <w:bookmarkStart w:id="37" w:name="_Toc237269561"/>
       <w:r>
         <w:rPr>
           <w:rFonts w:ascii="Montserrat" w:hAnsi="Montserrat"/>
@@ -14845,6 +15306,7 @@
           <w:color w:val="1A1A1A"/>
           <w:sz w:val="22"/>
         </w:rPr>
+        <w:lastRenderedPageBreak/>
         <w:t>Governanca (dados do Relatorio de Situacao - secao 4.1): quantidade de Entraves e Encaminhamentos ainda Aberto, e quantos Resultados alcancados ja foram registrados.</w:t>
       </w:r>
     </w:p>
@@ -14869,16 +15331,7 @@
           <w:color w:val="1A1A1A"/>
           <w:sz w:val="22"/>
         </w:rPr>
-        <w:t xml:space="preserve">Registros por formulario: uma linha por artefato (Canvas, TAP, Planejamento, EAP, SMP, Ata de Reuniao, TEP, RLA, alem da propria </w:t>
-      </w:r>
-      <w:r>
-        <w:rPr>
-          <w:rFonts w:ascii="Montserrat" w:hAnsi="Montserrat"/>
-          <w:color w:val="1A1A1A"/>
-          <w:sz w:val="22"/>
-        </w:rPr>
-        <w:lastRenderedPageBreak/>
-        <w:t>Solicitacao de Demanda), com o total e a contagem por status de cada um.</w:t>
+        <w:t>Registros por formulario: uma linha por artefato (Canvas, TAP, Planejamento, EAP, SMP, Ata de Reuniao, TEP, RLA, alem da propria Solicitacao de Demanda), com o total e a contagem por status de cada um.</w:t>
       </w:r>
     </w:p>
     <w:p>
@@ -14915,16 +15368,16 @@
           <w:noProof/>
         </w:rPr>
         <w:drawing>
-          <wp:inline distT="0" distB="0" distL="0" distR="0" wp14:anchorId="32357871" wp14:editId="498A903B">
+          <wp:inline distT="0" distB="0" distL="0" distR="0" wp14:anchorId="759072D0" wp14:editId="06A0D548">
             <wp:extent cx="5303520" cy="4267180"/>
             <wp:effectExtent l="19050" t="19050" r="11430" b="19685"/>
-            <wp:docPr id="459114914" name="Imagem 48"/>
+            <wp:docPr id="1132561298" name="Imagem 48"/>
             <wp:cNvGraphicFramePr/>
             <a:graphic xmlns:a="http://schemas.openxmlformats.org/drawingml/2006/main">
               <a:graphicData uri="http://schemas.openxmlformats.org/drawingml/2006/picture">
                 <pic:pic xmlns:pic="http://schemas.openxmlformats.org/drawingml/2006/picture">
                   <pic:nvPicPr>
-                    <pic:cNvPr id="459114914" name=""/>
+                    <pic:cNvPr id="1132561298" name=""/>
                     <pic:cNvPicPr/>
                   </pic:nvPicPr>
                   <pic:blipFill>
@@ -14992,16 +15445,16 @@
         </w:rPr>
         <w:lastRenderedPageBreak/>
         <w:drawing>
-          <wp:inline distT="0" distB="0" distL="0" distR="0" wp14:anchorId="383FE8EB" wp14:editId="53F38C76">
+          <wp:inline distT="0" distB="0" distL="0" distR="0" wp14:anchorId="53CE758D" wp14:editId="3613F39F">
             <wp:extent cx="5303520" cy="3962338"/>
             <wp:effectExtent l="19050" t="19050" r="11430" b="19685"/>
-            <wp:docPr id="1786085165" name="Imagem 49"/>
+            <wp:docPr id="551644405" name="Imagem 49"/>
             <wp:cNvGraphicFramePr/>
             <a:graphic xmlns:a="http://schemas.openxmlformats.org/drawingml/2006/main">
               <a:graphicData uri="http://schemas.openxmlformats.org/drawingml/2006/picture">
                 <pic:pic xmlns:pic="http://schemas.openxmlformats.org/drawingml/2006/picture">
                   <pic:nvPicPr>
-                    <pic:cNvPr id="1786085165" name=""/>
+                    <pic:cNvPr id="551644405" name=""/>
                     <pic:cNvPicPr/>
                   </pic:nvPicPr>
                   <pic:blipFill>
@@ -15094,7 +15547,7 @@
           <w:sz w:val="34"/>
         </w:rPr>
       </w:pPr>
-      <w:bookmarkStart w:id="38" w:name="_Toc236924322"/>
+      <w:bookmarkStart w:id="38" w:name="_Toc237269562"/>
       <w:r>
         <w:rPr>
           <w:rFonts w:ascii="Montserrat" w:hAnsi="Montserrat"/>
@@ -15338,7 +15791,7 @@
           <w:sz w:val="34"/>
         </w:rPr>
       </w:pPr>
-      <w:bookmarkStart w:id="39" w:name="_Toc236924323"/>
+      <w:bookmarkStart w:id="39" w:name="_Toc237269563"/>
       <w:r>
         <w:rPr>
           <w:rFonts w:ascii="Montserrat" w:hAnsi="Montserrat"/>
@@ -15377,6 +15830,12 @@
         <w:gridCol w:w="1134"/>
       </w:tblGrid>
       <w:tr>
+        <w:tblPrEx>
+          <w:tblCellMar>
+            <w:top w:w="0" w:type="dxa"/>
+            <w:bottom w:w="0" w:type="dxa"/>
+          </w:tblCellMar>
+        </w:tblPrEx>
         <w:tc>
           <w:tcPr>
             <w:tcW w:w="567" w:type="dxa"/>
@@ -15504,6 +15963,12 @@
         </w:tc>
       </w:tr>
       <w:tr>
+        <w:tblPrEx>
+          <w:tblCellMar>
+            <w:top w:w="0" w:type="dxa"/>
+            <w:bottom w:w="0" w:type="dxa"/>
+          </w:tblCellMar>
+        </w:tblPrEx>
         <w:tc>
           <w:tcPr>
             <w:tcW w:w="567" w:type="dxa"/>
@@ -15616,6 +16081,12 @@
         </w:tc>
       </w:tr>
       <w:tr>
+        <w:tblPrEx>
+          <w:tblCellMar>
+            <w:top w:w="0" w:type="dxa"/>
+            <w:bottom w:w="0" w:type="dxa"/>
+          </w:tblCellMar>
+        </w:tblPrEx>
         <w:tc>
           <w:tcPr>
             <w:tcW w:w="567" w:type="dxa"/>
@@ -15728,6 +16199,12 @@
         </w:tc>
       </w:tr>
       <w:tr>
+        <w:tblPrEx>
+          <w:tblCellMar>
+            <w:top w:w="0" w:type="dxa"/>
+            <w:bottom w:w="0" w:type="dxa"/>
+          </w:tblCellMar>
+        </w:tblPrEx>
         <w:tc>
           <w:tcPr>
             <w:tcW w:w="567" w:type="dxa"/>
@@ -15840,6 +16317,12 @@
         </w:tc>
       </w:tr>
       <w:tr>
+        <w:tblPrEx>
+          <w:tblCellMar>
+            <w:top w:w="0" w:type="dxa"/>
+            <w:bottom w:w="0" w:type="dxa"/>
+          </w:tblCellMar>
+        </w:tblPrEx>
         <w:tc>
           <w:tcPr>
             <w:tcW w:w="567" w:type="dxa"/>
@@ -15952,6 +16435,12 @@
         </w:tc>
       </w:tr>
       <w:tr>
+        <w:tblPrEx>
+          <w:tblCellMar>
+            <w:top w:w="0" w:type="dxa"/>
+            <w:bottom w:w="0" w:type="dxa"/>
+          </w:tblCellMar>
+        </w:tblPrEx>
         <w:tc>
           <w:tcPr>
             <w:tcW w:w="567" w:type="dxa"/>
@@ -16064,6 +16553,12 @@
         </w:tc>
       </w:tr>
       <w:tr>
+        <w:tblPrEx>
+          <w:tblCellMar>
+            <w:top w:w="0" w:type="dxa"/>
+            <w:bottom w:w="0" w:type="dxa"/>
+          </w:tblCellMar>
+        </w:tblPrEx>
         <w:tc>
           <w:tcPr>
             <w:tcW w:w="567" w:type="dxa"/>
@@ -16176,6 +16671,12 @@
         </w:tc>
       </w:tr>
       <w:tr>
+        <w:tblPrEx>
+          <w:tblCellMar>
+            <w:top w:w="0" w:type="dxa"/>
+            <w:bottom w:w="0" w:type="dxa"/>
+          </w:tblCellMar>
+        </w:tblPrEx>
         <w:tc>
           <w:tcPr>
             <w:tcW w:w="567" w:type="dxa"/>
@@ -16288,6 +16789,12 @@
         </w:tc>
       </w:tr>
       <w:tr>
+        <w:tblPrEx>
+          <w:tblCellMar>
+            <w:top w:w="0" w:type="dxa"/>
+            <w:bottom w:w="0" w:type="dxa"/>
+          </w:tblCellMar>
+        </w:tblPrEx>
         <w:tc>
           <w:tcPr>
             <w:tcW w:w="567" w:type="dxa"/>
@@ -16400,6 +16907,12 @@
         </w:tc>
       </w:tr>
       <w:tr>
+        <w:tblPrEx>
+          <w:tblCellMar>
+            <w:top w:w="0" w:type="dxa"/>
+            <w:bottom w:w="0" w:type="dxa"/>
+          </w:tblCellMar>
+        </w:tblPrEx>
         <w:tc>
           <w:tcPr>
             <w:tcW w:w="567" w:type="dxa"/>
@@ -16512,6 +17025,12 @@
         </w:tc>
       </w:tr>
       <w:tr>
+        <w:tblPrEx>
+          <w:tblCellMar>
+            <w:top w:w="0" w:type="dxa"/>
+            <w:bottom w:w="0" w:type="dxa"/>
+          </w:tblCellMar>
+        </w:tblPrEx>
         <w:tc>
           <w:tcPr>
             <w:tcW w:w="567" w:type="dxa"/>
@@ -16624,6 +17143,12 @@
         </w:tc>
       </w:tr>
       <w:tr>
+        <w:tblPrEx>
+          <w:tblCellMar>
+            <w:top w:w="0" w:type="dxa"/>
+            <w:bottom w:w="0" w:type="dxa"/>
+          </w:tblCellMar>
+        </w:tblPrEx>
         <w:tc>
           <w:tcPr>
             <w:tcW w:w="567" w:type="dxa"/>
@@ -16736,6 +17261,12 @@
         </w:tc>
       </w:tr>
       <w:tr>
+        <w:tblPrEx>
+          <w:tblCellMar>
+            <w:top w:w="0" w:type="dxa"/>
+            <w:bottom w:w="0" w:type="dxa"/>
+          </w:tblCellMar>
+        </w:tblPrEx>
         <w:tc>
           <w:tcPr>
             <w:tcW w:w="567" w:type="dxa"/>
@@ -17048,7 +17579,7 @@
 <file path=word/numbering.xml><?xml version="1.0" encoding="utf-8"?>
 <w:numbering xmlns:wpc="http://schemas.microsoft.com/office/word/2010/wordprocessingCanvas" xmlns:cx="http://schemas.microsoft.com/office/drawing/2014/chartex" xmlns:cx1="http://schemas.microsoft.com/office/drawing/2015/9/8/chartex" xmlns:cx2="http://schemas.microsoft.com/office/drawing/2015/10/21/chartex" xmlns:cx3="http://schemas.microsoft.com/office/drawing/2016/5/9/chartex" xmlns:cx4="http://schemas.microsoft.com/office/drawing/2016/5/10/chartex" xmlns:cx5="http://schemas.microsoft.com/office/drawing/2016/5/11/chartex" xmlns:cx6="http://schemas.microsoft.com/office/drawing/2016/5/12/chartex" xmlns:cx7="http://schemas.microsoft.com/office/drawing/2016/5/13/chartex" xmlns:cx8="http://schemas.microsoft.com/office/drawing/2016/5/14/chartex" xmlns:mc="http://schemas.openxmlformats.org/markup-compatibility/2006" xmlns:aink="http://schemas.microsoft.com/office/drawing/2016/ink" xmlns:am3d="http://schemas.microsoft.com/office/drawing/2017/model3d" xmlns:o="urn:schemas-microsoft-com:office:office" xmlns:oel="http://schemas.microsoft.com/office/2019/extlst" xmlns:r="http://schemas.openxmlformats.org/officeDocument/2006/relationships" xmlns:m="http://schemas.openxmlformats.org/officeDocument/2006/math" xmlns:v="urn:schemas-microsoft-com:vml" xmlns:wp14="http://schemas.microsoft.com/office/word/2010/wordprocessingDrawing" xmlns:wp="http://schemas.openxmlformats.org/drawingml/2006/wordprocessingDrawing" xmlns:w10="urn:schemas-microsoft-com:office:word" xmlns:w="http://schemas.openxmlformats.org/wordprocessingml/2006/main" xmlns:w14="http://schemas.microsoft.com/office/word/2010/wordml" xmlns:w15="http://schemas.microsoft.com/office/word/2012/wordml" xmlns:w16cei="http://schemas.microsoft.com/office/word/2026/wordml/cei" xmlns:w16cex="http://schemas.microsoft.com/office/word/2018/wordml/cex" xmlns:w16cid="http://schemas.microsoft.com/office/word/2016/wordml/cid" xmlns:w16="http://schemas.microsoft.com/office/word/2018/wordml" xmlns:w16du="http://schemas.microsoft.com/office/word/2023/wordml/word16du" xmlns:w16sdtdh="http://schemas.microsoft.com/office/word/2020/wordml/sdtdatahash" xmlns:w16sdtfl="http://schemas.microsoft.com/office/word/2024/wordml/sdtformatlock" xmlns:w16se="http://schemas.microsoft.com/office/word/2015/wordml/symex" xmlns:wpg="http://schemas.microsoft.com/office/word/2010/wordprocessingGroup" xmlns:wpi="http://schemas.microsoft.com/office/word/2010/wordprocessingInk" xmlns:wne="http://schemas.microsoft.com/office/word/2006/wordml" xmlns:wps="http://schemas.microsoft.com/office/word/2010/wordprocessingShape" mc:Ignorable="w14 w15 w16se w16cid w16 w16cex w16sdtdh w16sdtfl w16du wp14">
   <w:abstractNum w:abstractNumId="0" w15:restartNumberingAfterBreak="0">
-    <w:nsid w:val="0AC4253C"/>
+    <w:nsid w:val="048C276A"/>
     <w:multiLevelType w:val="singleLevel"/>
     <w:tmpl w:val="04160001"/>
     <w:lvl w:ilvl="0">
@@ -17065,7 +17596,7 @@
     </w:lvl>
   </w:abstractNum>
   <w:abstractNum w:abstractNumId="1" w15:restartNumberingAfterBreak="0">
-    <w:nsid w:val="0C8867D8"/>
+    <w:nsid w:val="05705C61"/>
     <w:multiLevelType w:val="singleLevel"/>
     <w:tmpl w:val="04160001"/>
     <w:lvl w:ilvl="0">
@@ -17082,7 +17613,7 @@
     </w:lvl>
   </w:abstractNum>
   <w:abstractNum w:abstractNumId="2" w15:restartNumberingAfterBreak="0">
-    <w:nsid w:val="1DA4469F"/>
+    <w:nsid w:val="0BB42FB8"/>
     <w:multiLevelType w:val="singleLevel"/>
     <w:tmpl w:val="04160001"/>
     <w:lvl w:ilvl="0">
@@ -17099,7 +17630,7 @@
     </w:lvl>
   </w:abstractNum>
   <w:abstractNum w:abstractNumId="3" w15:restartNumberingAfterBreak="0">
-    <w:nsid w:val="1F0067D0"/>
+    <w:nsid w:val="145F266C"/>
     <w:multiLevelType w:val="singleLevel"/>
     <w:tmpl w:val="04160001"/>
     <w:lvl w:ilvl="0">
@@ -17116,7 +17647,7 @@
     </w:lvl>
   </w:abstractNum>
   <w:abstractNum w:abstractNumId="4" w15:restartNumberingAfterBreak="0">
-    <w:nsid w:val="234D7B1D"/>
+    <w:nsid w:val="209D6914"/>
     <w:multiLevelType w:val="singleLevel"/>
     <w:tmpl w:val="04160001"/>
     <w:lvl w:ilvl="0">
@@ -17133,7 +17664,7 @@
     </w:lvl>
   </w:abstractNum>
   <w:abstractNum w:abstractNumId="5" w15:restartNumberingAfterBreak="0">
-    <w:nsid w:val="25E57311"/>
+    <w:nsid w:val="21BC60E6"/>
     <w:multiLevelType w:val="singleLevel"/>
     <w:tmpl w:val="04160001"/>
     <w:lvl w:ilvl="0">
@@ -17150,7 +17681,7 @@
     </w:lvl>
   </w:abstractNum>
   <w:abstractNum w:abstractNumId="6" w15:restartNumberingAfterBreak="0">
-    <w:nsid w:val="2E651BC7"/>
+    <w:nsid w:val="21D400A6"/>
     <w:multiLevelType w:val="singleLevel"/>
     <w:tmpl w:val="04160001"/>
     <w:lvl w:ilvl="0">
@@ -17167,7 +17698,7 @@
     </w:lvl>
   </w:abstractNum>
   <w:abstractNum w:abstractNumId="7" w15:restartNumberingAfterBreak="0">
-    <w:nsid w:val="3B893382"/>
+    <w:nsid w:val="2CF313AE"/>
     <w:multiLevelType w:val="singleLevel"/>
     <w:tmpl w:val="04160001"/>
     <w:lvl w:ilvl="0">
@@ -17184,7 +17715,7 @@
     </w:lvl>
   </w:abstractNum>
   <w:abstractNum w:abstractNumId="8" w15:restartNumberingAfterBreak="0">
-    <w:nsid w:val="3FFC6D0B"/>
+    <w:nsid w:val="3D6C2357"/>
     <w:multiLevelType w:val="singleLevel"/>
     <w:tmpl w:val="04160001"/>
     <w:lvl w:ilvl="0">
@@ -17201,7 +17732,7 @@
     </w:lvl>
   </w:abstractNum>
   <w:abstractNum w:abstractNumId="9" w15:restartNumberingAfterBreak="0">
-    <w:nsid w:val="464B64EA"/>
+    <w:nsid w:val="45E06D26"/>
     <w:multiLevelType w:val="singleLevel"/>
     <w:tmpl w:val="04160001"/>
     <w:lvl w:ilvl="0">
@@ -17218,7 +17749,7 @@
     </w:lvl>
   </w:abstractNum>
   <w:abstractNum w:abstractNumId="10" w15:restartNumberingAfterBreak="0">
-    <w:nsid w:val="4C355CB0"/>
+    <w:nsid w:val="4F2C1F15"/>
     <w:multiLevelType w:val="singleLevel"/>
     <w:tmpl w:val="04160001"/>
     <w:lvl w:ilvl="0">
@@ -17235,7 +17766,7 @@
     </w:lvl>
   </w:abstractNum>
   <w:abstractNum w:abstractNumId="11" w15:restartNumberingAfterBreak="0">
-    <w:nsid w:val="4EDC259B"/>
+    <w:nsid w:val="4FA536A5"/>
     <w:multiLevelType w:val="singleLevel"/>
     <w:tmpl w:val="04160001"/>
     <w:lvl w:ilvl="0">
@@ -17252,7 +17783,7 @@
     </w:lvl>
   </w:abstractNum>
   <w:abstractNum w:abstractNumId="12" w15:restartNumberingAfterBreak="0">
-    <w:nsid w:val="56106D5D"/>
+    <w:nsid w:val="50093186"/>
     <w:multiLevelType w:val="singleLevel"/>
     <w:tmpl w:val="04160001"/>
     <w:lvl w:ilvl="0">
@@ -17269,7 +17800,7 @@
     </w:lvl>
   </w:abstractNum>
   <w:abstractNum w:abstractNumId="13" w15:restartNumberingAfterBreak="0">
-    <w:nsid w:val="5CDB019B"/>
+    <w:nsid w:val="586316F0"/>
     <w:multiLevelType w:val="singleLevel"/>
     <w:tmpl w:val="04160001"/>
     <w:lvl w:ilvl="0">
@@ -17286,7 +17817,7 @@
     </w:lvl>
   </w:abstractNum>
   <w:abstractNum w:abstractNumId="14" w15:restartNumberingAfterBreak="0">
-    <w:nsid w:val="62F354A8"/>
+    <w:nsid w:val="5B017720"/>
     <w:multiLevelType w:val="singleLevel"/>
     <w:tmpl w:val="04160001"/>
     <w:lvl w:ilvl="0">
@@ -17303,7 +17834,7 @@
     </w:lvl>
   </w:abstractNum>
   <w:abstractNum w:abstractNumId="15" w15:restartNumberingAfterBreak="0">
-    <w:nsid w:val="6C902186"/>
+    <w:nsid w:val="641B2C97"/>
     <w:multiLevelType w:val="singleLevel"/>
     <w:tmpl w:val="04160001"/>
     <w:lvl w:ilvl="0">
@@ -17320,7 +17851,7 @@
     </w:lvl>
   </w:abstractNum>
   <w:abstractNum w:abstractNumId="16" w15:restartNumberingAfterBreak="0">
-    <w:nsid w:val="7B4A128E"/>
+    <w:nsid w:val="67352CD7"/>
     <w:multiLevelType w:val="singleLevel"/>
     <w:tmpl w:val="04160001"/>
     <w:lvl w:ilvl="0">
@@ -17337,7 +17868,7 @@
     </w:lvl>
   </w:abstractNum>
   <w:abstractNum w:abstractNumId="17" w15:restartNumberingAfterBreak="0">
-    <w:nsid w:val="7EDC1AC1"/>
+    <w:nsid w:val="74791087"/>
     <w:multiLevelType w:val="singleLevel"/>
     <w:tmpl w:val="04160001"/>
     <w:lvl w:ilvl="0">
@@ -17353,59 +17884,59 @@
       </w:rPr>
     </w:lvl>
   </w:abstractNum>
-  <w:num w:numId="1" w16cid:durableId="417749786">
+  <w:num w:numId="1" w16cid:durableId="1940134904">
     <w:abstractNumId w:val="7"/>
   </w:num>
-  <w:num w:numId="2" w16cid:durableId="598489722">
+  <w:num w:numId="2" w16cid:durableId="309140785">
+    <w:abstractNumId w:val="3"/>
+  </w:num>
+  <w:num w:numId="3" w16cid:durableId="54670809">
+    <w:abstractNumId w:val="0"/>
+  </w:num>
+  <w:num w:numId="4" w16cid:durableId="2078354316">
+    <w:abstractNumId w:val="14"/>
+  </w:num>
+  <w:num w:numId="5" w16cid:durableId="117573213">
+    <w:abstractNumId w:val="12"/>
+  </w:num>
+  <w:num w:numId="6" w16cid:durableId="1164513014">
     <w:abstractNumId w:val="4"/>
   </w:num>
-  <w:num w:numId="3" w16cid:durableId="1579711244">
+  <w:num w:numId="7" w16cid:durableId="1316300471">
+    <w:abstractNumId w:val="17"/>
+  </w:num>
+  <w:num w:numId="8" w16cid:durableId="1094588119">
+    <w:abstractNumId w:val="15"/>
+  </w:num>
+  <w:num w:numId="9" w16cid:durableId="210657565">
+    <w:abstractNumId w:val="16"/>
+  </w:num>
+  <w:num w:numId="10" w16cid:durableId="1412892013">
+    <w:abstractNumId w:val="13"/>
+  </w:num>
+  <w:num w:numId="11" w16cid:durableId="2058698202">
+    <w:abstractNumId w:val="5"/>
+  </w:num>
+  <w:num w:numId="12" w16cid:durableId="521748368">
+    <w:abstractNumId w:val="8"/>
+  </w:num>
+  <w:num w:numId="13" w16cid:durableId="1300458706">
+    <w:abstractNumId w:val="2"/>
+  </w:num>
+  <w:num w:numId="14" w16cid:durableId="62265695">
+    <w:abstractNumId w:val="1"/>
+  </w:num>
+  <w:num w:numId="15" w16cid:durableId="1179856490">
     <w:abstractNumId w:val="10"/>
   </w:num>
-  <w:num w:numId="4" w16cid:durableId="1721201299">
+  <w:num w:numId="16" w16cid:durableId="297230324">
+    <w:abstractNumId w:val="11"/>
+  </w:num>
+  <w:num w:numId="17" w16cid:durableId="1752197071">
     <w:abstractNumId w:val="9"/>
   </w:num>
-  <w:num w:numId="5" w16cid:durableId="1383754485">
-    <w:abstractNumId w:val="0"/>
-  </w:num>
-  <w:num w:numId="6" w16cid:durableId="1597788834">
-    <w:abstractNumId w:val="11"/>
-  </w:num>
-  <w:num w:numId="7" w16cid:durableId="1224369908">
-    <w:abstractNumId w:val="13"/>
-  </w:num>
-  <w:num w:numId="8" w16cid:durableId="519515582">
-    <w:abstractNumId w:val="2"/>
-  </w:num>
-  <w:num w:numId="9" w16cid:durableId="527987383">
-    <w:abstractNumId w:val="5"/>
-  </w:num>
-  <w:num w:numId="10" w16cid:durableId="1094784295">
-    <w:abstractNumId w:val="3"/>
-  </w:num>
-  <w:num w:numId="11" w16cid:durableId="532155388">
-    <w:abstractNumId w:val="15"/>
-  </w:num>
-  <w:num w:numId="12" w16cid:durableId="449974337">
-    <w:abstractNumId w:val="8"/>
-  </w:num>
-  <w:num w:numId="13" w16cid:durableId="1665742465">
+  <w:num w:numId="18" w16cid:durableId="1089041473">
     <w:abstractNumId w:val="6"/>
-  </w:num>
-  <w:num w:numId="14" w16cid:durableId="413163985">
-    <w:abstractNumId w:val="14"/>
-  </w:num>
-  <w:num w:numId="15" w16cid:durableId="92210949">
-    <w:abstractNumId w:val="17"/>
-  </w:num>
-  <w:num w:numId="16" w16cid:durableId="1957055762">
-    <w:abstractNumId w:val="16"/>
-  </w:num>
-  <w:num w:numId="17" w16cid:durableId="2133475597">
-    <w:abstractNumId w:val="12"/>
-  </w:num>
-  <w:num w:numId="18" w16cid:durableId="704328563">
-    <w:abstractNumId w:val="1"/>
   </w:num>
 </w:numbering>
 </file>
@@ -17818,7 +18349,7 @@
     <w:link w:val="Ttulo1Char"/>
     <w:uiPriority w:val="9"/>
     <w:qFormat/>
-    <w:rsid w:val="00D8080E"/>
+    <w:rsid w:val="00FE3247"/>
     <w:pPr>
       <w:keepNext/>
       <w:keepLines/>
@@ -17840,7 +18371,7 @@
     <w:uiPriority w:val="9"/>
     <w:unhideWhenUsed/>
     <w:qFormat/>
-    <w:rsid w:val="00D8080E"/>
+    <w:rsid w:val="00FE3247"/>
     <w:pPr>
       <w:keepNext/>
       <w:keepLines/>
@@ -17863,7 +18394,7 @@
     <w:semiHidden/>
     <w:unhideWhenUsed/>
     <w:qFormat/>
-    <w:rsid w:val="00D8080E"/>
+    <w:rsid w:val="00FE3247"/>
     <w:pPr>
       <w:keepNext/>
       <w:keepLines/>
@@ -17886,7 +18417,7 @@
     <w:semiHidden/>
     <w:unhideWhenUsed/>
     <w:qFormat/>
-    <w:rsid w:val="00D8080E"/>
+    <w:rsid w:val="00FE3247"/>
     <w:pPr>
       <w:keepNext/>
       <w:keepLines/>
@@ -17909,7 +18440,7 @@
     <w:semiHidden/>
     <w:unhideWhenUsed/>
     <w:qFormat/>
-    <w:rsid w:val="00D8080E"/>
+    <w:rsid w:val="00FE3247"/>
     <w:pPr>
       <w:keepNext/>
       <w:keepLines/>
@@ -17930,7 +18461,7 @@
     <w:semiHidden/>
     <w:unhideWhenUsed/>
     <w:qFormat/>
-    <w:rsid w:val="00D8080E"/>
+    <w:rsid w:val="00FE3247"/>
     <w:pPr>
       <w:keepNext/>
       <w:keepLines/>
@@ -17953,7 +18484,7 @@
     <w:semiHidden/>
     <w:unhideWhenUsed/>
     <w:qFormat/>
-    <w:rsid w:val="00D8080E"/>
+    <w:rsid w:val="00FE3247"/>
     <w:pPr>
       <w:keepNext/>
       <w:keepLines/>
@@ -17974,7 +18505,7 @@
     <w:semiHidden/>
     <w:unhideWhenUsed/>
     <w:qFormat/>
-    <w:rsid w:val="00D8080E"/>
+    <w:rsid w:val="00FE3247"/>
     <w:pPr>
       <w:keepNext/>
       <w:keepLines/>
@@ -17997,7 +18528,7 @@
     <w:semiHidden/>
     <w:unhideWhenUsed/>
     <w:qFormat/>
-    <w:rsid w:val="00D8080E"/>
+    <w:rsid w:val="00FE3247"/>
     <w:pPr>
       <w:keepNext/>
       <w:keepLines/>
@@ -18041,7 +18572,7 @@
     <w:basedOn w:val="Fontepargpadro"/>
     <w:link w:val="Ttulo1"/>
     <w:uiPriority w:val="9"/>
-    <w:rsid w:val="00D8080E"/>
+    <w:rsid w:val="00FE3247"/>
     <w:rPr>
       <w:rFonts w:asciiTheme="majorHAnsi" w:eastAsiaTheme="majorEastAsia" w:hAnsiTheme="majorHAnsi" w:cstheme="majorBidi"/>
       <w:color w:val="0F4761" w:themeColor="accent1" w:themeShade="BF"/>
@@ -18054,7 +18585,7 @@
     <w:basedOn w:val="Fontepargpadro"/>
     <w:link w:val="Ttulo2"/>
     <w:uiPriority w:val="9"/>
-    <w:rsid w:val="00D8080E"/>
+    <w:rsid w:val="00FE3247"/>
     <w:rPr>
       <w:rFonts w:asciiTheme="majorHAnsi" w:eastAsiaTheme="majorEastAsia" w:hAnsiTheme="majorHAnsi" w:cstheme="majorBidi"/>
       <w:color w:val="0F4761" w:themeColor="accent1" w:themeShade="BF"/>
@@ -18068,7 +18599,7 @@
     <w:link w:val="Ttulo3"/>
     <w:uiPriority w:val="9"/>
     <w:semiHidden/>
-    <w:rsid w:val="00D8080E"/>
+    <w:rsid w:val="00FE3247"/>
     <w:rPr>
       <w:rFonts w:eastAsiaTheme="majorEastAsia" w:cstheme="majorBidi"/>
       <w:color w:val="0F4761" w:themeColor="accent1" w:themeShade="BF"/>
@@ -18082,7 +18613,7 @@
     <w:link w:val="Ttulo4"/>
     <w:uiPriority w:val="9"/>
     <w:semiHidden/>
-    <w:rsid w:val="00D8080E"/>
+    <w:rsid w:val="00FE3247"/>
     <w:rPr>
       <w:rFonts w:eastAsiaTheme="majorEastAsia" w:cstheme="majorBidi"/>
       <w:i/>
@@ -18096,7 +18627,7 @@
     <w:link w:val="Ttulo5"/>
     <w:uiPriority w:val="9"/>
     <w:semiHidden/>
-    <w:rsid w:val="00D8080E"/>
+    <w:rsid w:val="00FE3247"/>
     <w:rPr>
       <w:rFonts w:eastAsiaTheme="majorEastAsia" w:cstheme="majorBidi"/>
       <w:color w:val="0F4761" w:themeColor="accent1" w:themeShade="BF"/>
@@ -18108,7 +18639,7 @@
     <w:link w:val="Ttulo6"/>
     <w:uiPriority w:val="9"/>
     <w:semiHidden/>
-    <w:rsid w:val="00D8080E"/>
+    <w:rsid w:val="00FE3247"/>
     <w:rPr>
       <w:rFonts w:eastAsiaTheme="majorEastAsia" w:cstheme="majorBidi"/>
       <w:i/>
@@ -18122,7 +18653,7 @@
     <w:link w:val="Ttulo7"/>
     <w:uiPriority w:val="9"/>
     <w:semiHidden/>
-    <w:rsid w:val="00D8080E"/>
+    <w:rsid w:val="00FE3247"/>
     <w:rPr>
       <w:rFonts w:eastAsiaTheme="majorEastAsia" w:cstheme="majorBidi"/>
       <w:color w:val="595959" w:themeColor="text1" w:themeTint="A6"/>
@@ -18134,7 +18665,7 @@
     <w:link w:val="Ttulo8"/>
     <w:uiPriority w:val="9"/>
     <w:semiHidden/>
-    <w:rsid w:val="00D8080E"/>
+    <w:rsid w:val="00FE3247"/>
     <w:rPr>
       <w:rFonts w:eastAsiaTheme="majorEastAsia" w:cstheme="majorBidi"/>
       <w:i/>
@@ -18148,7 +18679,7 @@
     <w:link w:val="Ttulo9"/>
     <w:uiPriority w:val="9"/>
     <w:semiHidden/>
-    <w:rsid w:val="00D8080E"/>
+    <w:rsid w:val="00FE3247"/>
     <w:rPr>
       <w:rFonts w:eastAsiaTheme="majorEastAsia" w:cstheme="majorBidi"/>
       <w:color w:val="272727" w:themeColor="text1" w:themeTint="D8"/>
@@ -18161,7 +18692,7 @@
     <w:link w:val="TtuloChar"/>
     <w:uiPriority w:val="10"/>
     <w:qFormat/>
-    <w:rsid w:val="00D8080E"/>
+    <w:rsid w:val="00FE3247"/>
     <w:pPr>
       <w:spacing w:after="80" w:line="240" w:lineRule="auto"/>
       <w:contextualSpacing/>
@@ -18179,7 +18710,7 @@
     <w:basedOn w:val="Fontepargpadro"/>
     <w:link w:val="Ttulo"/>
     <w:uiPriority w:val="10"/>
-    <w:rsid w:val="00D8080E"/>
+    <w:rsid w:val="00FE3247"/>
     <w:rPr>
       <w:rFonts w:asciiTheme="majorHAnsi" w:eastAsiaTheme="majorEastAsia" w:hAnsiTheme="majorHAnsi" w:cstheme="majorBidi"/>
       <w:spacing w:val="-10"/>
@@ -18195,7 +18726,7 @@
     <w:link w:val="SubttuloChar"/>
     <w:uiPriority w:val="11"/>
     <w:qFormat/>
-    <w:rsid w:val="00D8080E"/>
+    <w:rsid w:val="00FE3247"/>
     <w:pPr>
       <w:numPr>
         <w:ilvl w:val="1"/>
@@ -18214,7 +18745,7 @@
     <w:basedOn w:val="Fontepargpadro"/>
     <w:link w:val="Subttulo"/>
     <w:uiPriority w:val="11"/>
-    <w:rsid w:val="00D8080E"/>
+    <w:rsid w:val="00FE3247"/>
     <w:rPr>
       <w:rFonts w:eastAsiaTheme="majorEastAsia" w:cstheme="majorBidi"/>
       <w:color w:val="595959" w:themeColor="text1" w:themeTint="A6"/>
@@ -18230,7 +18761,7 @@
     <w:link w:val="CitaoChar"/>
     <w:uiPriority w:val="29"/>
     <w:qFormat/>
-    <w:rsid w:val="00D8080E"/>
+    <w:rsid w:val="00FE3247"/>
     <w:pPr>
       <w:spacing w:before="160"/>
       <w:jc w:val="center"/>
@@ -18246,7 +18777,7 @@
     <w:basedOn w:val="Fontepargpadro"/>
     <w:link w:val="Citao"/>
     <w:uiPriority w:val="29"/>
-    <w:rsid w:val="00D8080E"/>
+    <w:rsid w:val="00FE3247"/>
     <w:rPr>
       <w:i/>
       <w:iCs/>
@@ -18258,7 +18789,7 @@
     <w:basedOn w:val="Normal"/>
     <w:uiPriority w:val="34"/>
     <w:qFormat/>
-    <w:rsid w:val="00D8080E"/>
+    <w:rsid w:val="00FE3247"/>
     <w:pPr>
       <w:ind w:left="720"/>
       <w:contextualSpacing/>
@@ -18269,7 +18800,7 @@
     <w:basedOn w:val="Fontepargpadro"/>
     <w:uiPriority w:val="21"/>
     <w:qFormat/>
-    <w:rsid w:val="00D8080E"/>
+    <w:rsid w:val="00FE3247"/>
     <w:rPr>
       <w:i/>
       <w:iCs/>
@@ -18283,7 +18814,7 @@
     <w:link w:val="CitaoIntensaChar"/>
     <w:uiPriority w:val="30"/>
     <w:qFormat/>
-    <w:rsid w:val="00D8080E"/>
+    <w:rsid w:val="00FE3247"/>
     <w:pPr>
       <w:pBdr>
         <w:top w:val="single" w:sz="4" w:space="10" w:color="0F4761" w:themeColor="accent1" w:themeShade="BF"/>
@@ -18304,7 +18835,7 @@
     <w:basedOn w:val="Fontepargpadro"/>
     <w:link w:val="CitaoIntensa"/>
     <w:uiPriority w:val="30"/>
-    <w:rsid w:val="00D8080E"/>
+    <w:rsid w:val="00FE3247"/>
     <w:rPr>
       <w:i/>
       <w:iCs/>
@@ -18316,7 +18847,7 @@
     <w:basedOn w:val="Fontepargpadro"/>
     <w:uiPriority w:val="32"/>
     <w:qFormat/>
-    <w:rsid w:val="00D8080E"/>
+    <w:rsid w:val="00FE3247"/>
     <w:rPr>
       <w:b/>
       <w:bCs/>
@@ -18331,7 +18862,7 @@
     <w:link w:val="CabealhoChar"/>
     <w:uiPriority w:val="99"/>
     <w:unhideWhenUsed/>
-    <w:rsid w:val="00D8080E"/>
+    <w:rsid w:val="00FE3247"/>
     <w:pPr>
       <w:tabs>
         <w:tab w:val="center" w:pos="4252"/>
@@ -18345,7 +18876,7 @@
     <w:basedOn w:val="Fontepargpadro"/>
     <w:link w:val="Cabealho"/>
     <w:uiPriority w:val="99"/>
-    <w:rsid w:val="00D8080E"/>
+    <w:rsid w:val="00FE3247"/>
   </w:style>
   <w:style w:type="paragraph" w:styleId="Rodap">
     <w:name w:val="footer"/>
@@ -18353,7 +18884,7 @@
     <w:link w:val="RodapChar"/>
     <w:uiPriority w:val="99"/>
     <w:unhideWhenUsed/>
-    <w:rsid w:val="00D8080E"/>
+    <w:rsid w:val="00FE3247"/>
     <w:pPr>
       <w:tabs>
         <w:tab w:val="center" w:pos="4252"/>
@@ -18367,7 +18898,7 @@
     <w:basedOn w:val="Fontepargpadro"/>
     <w:link w:val="Rodap"/>
     <w:uiPriority w:val="99"/>
-    <w:rsid w:val="00D8080E"/>
+    <w:rsid w:val="00FE3247"/>
   </w:style>
   <w:style w:type="paragraph" w:styleId="Sumrio1">
     <w:name w:val="toc 1"/>
@@ -18376,7 +18907,7 @@
     <w:autoRedefine/>
     <w:uiPriority w:val="39"/>
     <w:unhideWhenUsed/>
-    <w:rsid w:val="00D8080E"/>
+    <w:rsid w:val="00FE3247"/>
     <w:pPr>
       <w:spacing w:after="100"/>
     </w:pPr>
@@ -18388,7 +18919,7 @@
     <w:autoRedefine/>
     <w:uiPriority w:val="39"/>
     <w:unhideWhenUsed/>
-    <w:rsid w:val="00D8080E"/>
+    <w:rsid w:val="00FE3247"/>
     <w:pPr>
       <w:spacing w:after="100"/>
       <w:ind w:left="240"/>

</xml_diff>

<commit_message>
Permite ao Admin remover usuário sem vínculo com projetos ou registros
Adiciona botão "Remover" na aba Usuários da Administração, que só
funciona se a pessoa não estiver em equipe de nenhum projeto, não tiver
criado nenhum projeto, e não tiver registro criado em seu nome em
nenhum dos 9 formulários que rastreiam autoria (campo criadoPorEmail,
agora também gravado em Planejamento, EAP, Ata de Reunião e RLA, que
ainda não tinham). A checagem roda antes de confirmar a exclusão e
lista os motivos quando bloqueia.

Adiciona a política de RLS perfis_delete_admin (só Admin pode excluir
um perfil) — antes não havia nenhuma política de DELETE em perfis.

Co-Authored-By: Claude Sonnet 5 <noreply@anthropic.com>
</commit_message>
<xml_diff>
--- a/Manual de Uso - Ferramenta de Gestao de Projetos.docx
+++ b/Manual de Uso - Ferramenta de Gestao de Projetos.docx
@@ -129,7 +129,7 @@
           <w:color w:val="6A6A70"/>
           <w:sz w:val="22"/>
         </w:rPr>
-        <w:t>Versao 2.14 - 10 de agosto de 2026 (substitui a versao 2.13 de 06/08/2026)</w:t>
+        <w:t>Versao 2.15 - 10 de agosto de 2026 (substitui a versao 2.14 de 10/08/2026)</w:t>
       </w:r>
     </w:p>
     <w:p>
@@ -229,7 +229,7 @@
         <w:rPr>
           <w:noProof/>
         </w:rPr>
-        <w:instrText xml:space="preserve"> PAGEREF _Toc237269524 \h </w:instrText>
+        <w:instrText xml:space="preserve"> PAGEREF _Toc237275156 \h </w:instrText>
       </w:r>
       <w:r>
         <w:rPr>
@@ -290,7 +290,7 @@
         <w:rPr>
           <w:noProof/>
         </w:rPr>
-        <w:instrText xml:space="preserve"> PAGEREF _Toc237269525 \h </w:instrText>
+        <w:instrText xml:space="preserve"> PAGEREF _Toc237275157 \h </w:instrText>
       </w:r>
       <w:r>
         <w:rPr>
@@ -351,7 +351,7 @@
         <w:rPr>
           <w:noProof/>
         </w:rPr>
-        <w:instrText xml:space="preserve"> PAGEREF _Toc237269526 \h </w:instrText>
+        <w:instrText xml:space="preserve"> PAGEREF _Toc237275158 \h </w:instrText>
       </w:r>
       <w:r>
         <w:rPr>
@@ -412,7 +412,7 @@
         <w:rPr>
           <w:noProof/>
         </w:rPr>
-        <w:instrText xml:space="preserve"> PAGEREF _Toc237269527 \h </w:instrText>
+        <w:instrText xml:space="preserve"> PAGEREF _Toc237275159 \h </w:instrText>
       </w:r>
       <w:r>
         <w:rPr>
@@ -473,7 +473,7 @@
         <w:rPr>
           <w:noProof/>
         </w:rPr>
-        <w:instrText xml:space="preserve"> PAGEREF _Toc237269528 \h </w:instrText>
+        <w:instrText xml:space="preserve"> PAGEREF _Toc237275160 \h </w:instrText>
       </w:r>
       <w:r>
         <w:rPr>
@@ -534,7 +534,7 @@
         <w:rPr>
           <w:noProof/>
         </w:rPr>
-        <w:instrText xml:space="preserve"> PAGEREF _Toc237269529 \h </w:instrText>
+        <w:instrText xml:space="preserve"> PAGEREF _Toc237275161 \h </w:instrText>
       </w:r>
       <w:r>
         <w:rPr>
@@ -595,7 +595,7 @@
         <w:rPr>
           <w:noProof/>
         </w:rPr>
-        <w:instrText xml:space="preserve"> PAGEREF _Toc237269530 \h </w:instrText>
+        <w:instrText xml:space="preserve"> PAGEREF _Toc237275162 \h </w:instrText>
       </w:r>
       <w:r>
         <w:rPr>
@@ -656,7 +656,7 @@
         <w:rPr>
           <w:noProof/>
         </w:rPr>
-        <w:instrText xml:space="preserve"> PAGEREF _Toc237269531 \h </w:instrText>
+        <w:instrText xml:space="preserve"> PAGEREF _Toc237275163 \h </w:instrText>
       </w:r>
       <w:r>
         <w:rPr>
@@ -717,7 +717,7 @@
         <w:rPr>
           <w:noProof/>
         </w:rPr>
-        <w:instrText xml:space="preserve"> PAGEREF _Toc237269532 \h </w:instrText>
+        <w:instrText xml:space="preserve"> PAGEREF _Toc237275164 \h </w:instrText>
       </w:r>
       <w:r>
         <w:rPr>
@@ -778,7 +778,7 @@
         <w:rPr>
           <w:noProof/>
         </w:rPr>
-        <w:instrText xml:space="preserve"> PAGEREF _Toc237269533 \h </w:instrText>
+        <w:instrText xml:space="preserve"> PAGEREF _Toc237275165 \h </w:instrText>
       </w:r>
       <w:r>
         <w:rPr>
@@ -839,7 +839,7 @@
         <w:rPr>
           <w:noProof/>
         </w:rPr>
-        <w:instrText xml:space="preserve"> PAGEREF _Toc237269534 \h </w:instrText>
+        <w:instrText xml:space="preserve"> PAGEREF _Toc237275166 \h </w:instrText>
       </w:r>
       <w:r>
         <w:rPr>
@@ -900,7 +900,7 @@
         <w:rPr>
           <w:noProof/>
         </w:rPr>
-        <w:instrText xml:space="preserve"> PAGEREF _Toc237269535 \h </w:instrText>
+        <w:instrText xml:space="preserve"> PAGEREF _Toc237275167 \h </w:instrText>
       </w:r>
       <w:r>
         <w:rPr>
@@ -961,7 +961,7 @@
         <w:rPr>
           <w:noProof/>
         </w:rPr>
-        <w:instrText xml:space="preserve"> PAGEREF _Toc237269536 \h </w:instrText>
+        <w:instrText xml:space="preserve"> PAGEREF _Toc237275168 \h </w:instrText>
       </w:r>
       <w:r>
         <w:rPr>
@@ -1022,7 +1022,7 @@
         <w:rPr>
           <w:noProof/>
         </w:rPr>
-        <w:instrText xml:space="preserve"> PAGEREF _Toc237269537 \h </w:instrText>
+        <w:instrText xml:space="preserve"> PAGEREF _Toc237275169 \h </w:instrText>
       </w:r>
       <w:r>
         <w:rPr>
@@ -1083,7 +1083,7 @@
         <w:rPr>
           <w:noProof/>
         </w:rPr>
-        <w:instrText xml:space="preserve"> PAGEREF _Toc237269538 \h </w:instrText>
+        <w:instrText xml:space="preserve"> PAGEREF _Toc237275170 \h </w:instrText>
       </w:r>
       <w:r>
         <w:rPr>
@@ -1144,7 +1144,7 @@
         <w:rPr>
           <w:noProof/>
         </w:rPr>
-        <w:instrText xml:space="preserve"> PAGEREF _Toc237269539 \h </w:instrText>
+        <w:instrText xml:space="preserve"> PAGEREF _Toc237275171 \h </w:instrText>
       </w:r>
       <w:r>
         <w:rPr>
@@ -1205,7 +1205,7 @@
         <w:rPr>
           <w:noProof/>
         </w:rPr>
-        <w:instrText xml:space="preserve"> PAGEREF _Toc237269540 \h </w:instrText>
+        <w:instrText xml:space="preserve"> PAGEREF _Toc237275172 \h </w:instrText>
       </w:r>
       <w:r>
         <w:rPr>
@@ -1266,7 +1266,7 @@
         <w:rPr>
           <w:noProof/>
         </w:rPr>
-        <w:instrText xml:space="preserve"> PAGEREF _Toc237269541 \h </w:instrText>
+        <w:instrText xml:space="preserve"> PAGEREF _Toc237275173 \h </w:instrText>
       </w:r>
       <w:r>
         <w:rPr>
@@ -1327,7 +1327,7 @@
         <w:rPr>
           <w:noProof/>
         </w:rPr>
-        <w:instrText xml:space="preserve"> PAGEREF _Toc237269542 \h </w:instrText>
+        <w:instrText xml:space="preserve"> PAGEREF _Toc237275174 \h </w:instrText>
       </w:r>
       <w:r>
         <w:rPr>
@@ -1388,7 +1388,7 @@
         <w:rPr>
           <w:noProof/>
         </w:rPr>
-        <w:instrText xml:space="preserve"> PAGEREF _Toc237269543 \h </w:instrText>
+        <w:instrText xml:space="preserve"> PAGEREF _Toc237275175 \h </w:instrText>
       </w:r>
       <w:r>
         <w:rPr>
@@ -1449,7 +1449,7 @@
         <w:rPr>
           <w:noProof/>
         </w:rPr>
-        <w:instrText xml:space="preserve"> PAGEREF _Toc237269544 \h </w:instrText>
+        <w:instrText xml:space="preserve"> PAGEREF _Toc237275176 \h </w:instrText>
       </w:r>
       <w:r>
         <w:rPr>
@@ -1510,7 +1510,7 @@
         <w:rPr>
           <w:noProof/>
         </w:rPr>
-        <w:instrText xml:space="preserve"> PAGEREF _Toc237269545 \h </w:instrText>
+        <w:instrText xml:space="preserve"> PAGEREF _Toc237275177 \h </w:instrText>
       </w:r>
       <w:r>
         <w:rPr>
@@ -1571,7 +1571,7 @@
         <w:rPr>
           <w:noProof/>
         </w:rPr>
-        <w:instrText xml:space="preserve"> PAGEREF _Toc237269546 \h </w:instrText>
+        <w:instrText xml:space="preserve"> PAGEREF _Toc237275178 \h </w:instrText>
       </w:r>
       <w:r>
         <w:rPr>
@@ -1632,7 +1632,7 @@
         <w:rPr>
           <w:noProof/>
         </w:rPr>
-        <w:instrText xml:space="preserve"> PAGEREF _Toc237269547 \h </w:instrText>
+        <w:instrText xml:space="preserve"> PAGEREF _Toc237275179 \h </w:instrText>
       </w:r>
       <w:r>
         <w:rPr>
@@ -1693,7 +1693,7 @@
         <w:rPr>
           <w:noProof/>
         </w:rPr>
-        <w:instrText xml:space="preserve"> PAGEREF _Toc237269548 \h </w:instrText>
+        <w:instrText xml:space="preserve"> PAGEREF _Toc237275180 \h </w:instrText>
       </w:r>
       <w:r>
         <w:rPr>
@@ -1754,7 +1754,7 @@
         <w:rPr>
           <w:noProof/>
         </w:rPr>
-        <w:instrText xml:space="preserve"> PAGEREF _Toc237269549 \h </w:instrText>
+        <w:instrText xml:space="preserve"> PAGEREF _Toc237275181 \h </w:instrText>
       </w:r>
       <w:r>
         <w:rPr>
@@ -1816,7 +1816,7 @@
         <w:rPr>
           <w:noProof/>
         </w:rPr>
-        <w:instrText xml:space="preserve"> PAGEREF _Toc237269550 \h </w:instrText>
+        <w:instrText xml:space="preserve"> PAGEREF _Toc237275182 \h </w:instrText>
       </w:r>
       <w:r>
         <w:rPr>
@@ -1877,7 +1877,7 @@
         <w:rPr>
           <w:noProof/>
         </w:rPr>
-        <w:instrText xml:space="preserve"> PAGEREF _Toc237269551 \h </w:instrText>
+        <w:instrText xml:space="preserve"> PAGEREF _Toc237275183 \h </w:instrText>
       </w:r>
       <w:r>
         <w:rPr>
@@ -1938,7 +1938,7 @@
         <w:rPr>
           <w:noProof/>
         </w:rPr>
-        <w:instrText xml:space="preserve"> PAGEREF _Toc237269552 \h </w:instrText>
+        <w:instrText xml:space="preserve"> PAGEREF _Toc237275184 \h </w:instrText>
       </w:r>
       <w:r>
         <w:rPr>
@@ -1999,7 +1999,7 @@
         <w:rPr>
           <w:noProof/>
         </w:rPr>
-        <w:instrText xml:space="preserve"> PAGEREF _Toc237269553 \h </w:instrText>
+        <w:instrText xml:space="preserve"> PAGEREF _Toc237275185 \h </w:instrText>
       </w:r>
       <w:r>
         <w:rPr>
@@ -2060,7 +2060,7 @@
         <w:rPr>
           <w:noProof/>
         </w:rPr>
-        <w:instrText xml:space="preserve"> PAGEREF _Toc237269554 \h </w:instrText>
+        <w:instrText xml:space="preserve"> PAGEREF _Toc237275186 \h </w:instrText>
       </w:r>
       <w:r>
         <w:rPr>
@@ -2121,7 +2121,7 @@
         <w:rPr>
           <w:noProof/>
         </w:rPr>
-        <w:instrText xml:space="preserve"> PAGEREF _Toc237269555 \h </w:instrText>
+        <w:instrText xml:space="preserve"> PAGEREF _Toc237275187 \h </w:instrText>
       </w:r>
       <w:r>
         <w:rPr>
@@ -2182,7 +2182,7 @@
         <w:rPr>
           <w:noProof/>
         </w:rPr>
-        <w:instrText xml:space="preserve"> PAGEREF _Toc237269556 \h </w:instrText>
+        <w:instrText xml:space="preserve"> PAGEREF _Toc237275188 \h </w:instrText>
       </w:r>
       <w:r>
         <w:rPr>
@@ -2243,7 +2243,7 @@
         <w:rPr>
           <w:noProof/>
         </w:rPr>
-        <w:instrText xml:space="preserve"> PAGEREF _Toc237269557 \h </w:instrText>
+        <w:instrText xml:space="preserve"> PAGEREF _Toc237275189 \h </w:instrText>
       </w:r>
       <w:r>
         <w:rPr>
@@ -2304,7 +2304,7 @@
         <w:rPr>
           <w:noProof/>
         </w:rPr>
-        <w:instrText xml:space="preserve"> PAGEREF _Toc237269558 \h </w:instrText>
+        <w:instrText xml:space="preserve"> PAGEREF _Toc237275190 \h </w:instrText>
       </w:r>
       <w:r>
         <w:rPr>
@@ -2365,7 +2365,7 @@
         <w:rPr>
           <w:noProof/>
         </w:rPr>
-        <w:instrText xml:space="preserve"> PAGEREF _Toc237269559 \h </w:instrText>
+        <w:instrText xml:space="preserve"> PAGEREF _Toc237275191 \h </w:instrText>
       </w:r>
       <w:r>
         <w:rPr>
@@ -2426,7 +2426,7 @@
         <w:rPr>
           <w:noProof/>
         </w:rPr>
-        <w:instrText xml:space="preserve"> PAGEREF _Toc237269560 \h </w:instrText>
+        <w:instrText xml:space="preserve"> PAGEREF _Toc237275192 \h </w:instrText>
       </w:r>
       <w:r>
         <w:rPr>
@@ -2487,7 +2487,7 @@
         <w:rPr>
           <w:noProof/>
         </w:rPr>
-        <w:instrText xml:space="preserve"> PAGEREF _Toc237269561 \h </w:instrText>
+        <w:instrText xml:space="preserve"> PAGEREF _Toc237275193 \h </w:instrText>
       </w:r>
       <w:r>
         <w:rPr>
@@ -2504,7 +2504,7 @@
         <w:rPr>
           <w:noProof/>
         </w:rPr>
-        <w:t>58</w:t>
+        <w:t>59</w:t>
       </w:r>
       <w:r>
         <w:rPr>
@@ -2548,7 +2548,7 @@
         <w:rPr>
           <w:noProof/>
         </w:rPr>
-        <w:instrText xml:space="preserve"> PAGEREF _Toc237269562 \h </w:instrText>
+        <w:instrText xml:space="preserve"> PAGEREF _Toc237275194 \h </w:instrText>
       </w:r>
       <w:r>
         <w:rPr>
@@ -2565,7 +2565,7 @@
         <w:rPr>
           <w:noProof/>
         </w:rPr>
-        <w:t>61</w:t>
+        <w:t>62</w:t>
       </w:r>
       <w:r>
         <w:rPr>
@@ -2609,7 +2609,7 @@
         <w:rPr>
           <w:noProof/>
         </w:rPr>
-        <w:instrText xml:space="preserve"> PAGEREF _Toc237269563 \h </w:instrText>
+        <w:instrText xml:space="preserve"> PAGEREF _Toc237275195 \h </w:instrText>
       </w:r>
       <w:r>
         <w:rPr>
@@ -2626,7 +2626,7 @@
         <w:rPr>
           <w:noProof/>
         </w:rPr>
-        <w:t>62</w:t>
+        <w:t>63</w:t>
       </w:r>
       <w:r>
         <w:rPr>
@@ -2685,7 +2685,7 @@
           <w:sz w:val="34"/>
         </w:rPr>
       </w:pPr>
-      <w:bookmarkStart w:id="0" w:name="_Toc237269524"/>
+      <w:bookmarkStart w:id="0" w:name="_Toc237275156"/>
       <w:r>
         <w:rPr>
           <w:rFonts w:ascii="Montserrat" w:hAnsi="Montserrat"/>
@@ -2709,7 +2709,7 @@
           <w:sz w:val="27"/>
         </w:rPr>
       </w:pPr>
-      <w:bookmarkStart w:id="1" w:name="_Toc237269525"/>
+      <w:bookmarkStart w:id="1" w:name="_Toc237275157"/>
       <w:r>
         <w:rPr>
           <w:rFonts w:ascii="Montserrat" w:hAnsi="Montserrat"/>
@@ -3042,6 +3042,24 @@
           <w:color w:val="1A1A1A"/>
           <w:sz w:val="22"/>
         </w:rPr>
+        <w:t>Esta e a versao 2.15 do manual. Em relacao a versao 2.14 (10/08/2026), foi adicionado o botao Remover a aba Usuarios da Administracao (secao 6.1 e 3.3 das Regras de Acesso): o Admin so consegue excluir um usuario que nao tenha nenhum vinculo com projetos ou registros no sistema, checado automaticamente antes de confirmar a remocao.</w:t>
+      </w:r>
+    </w:p>
+    <w:p>
+      <w:pPr>
+        <w:spacing w:line="280" w:lineRule="auto"/>
+        <w:rPr>
+          <w:rFonts w:ascii="Montserrat" w:hAnsi="Montserrat"/>
+          <w:color w:val="1A1A1A"/>
+          <w:sz w:val="22"/>
+        </w:rPr>
+      </w:pPr>
+      <w:r>
+        <w:rPr>
+          <w:rFonts w:ascii="Montserrat" w:hAnsi="Montserrat"/>
+          <w:color w:val="1A1A1A"/>
+          <w:sz w:val="22"/>
+        </w:rPr>
         <w:t>O manual nao substitui as Diretrizes para a Gestao de Projetos da UNIALFA (documento institucional que define o framework D01 a D07) nem o documento Regras de Acesso e Permissoes (que detalha cada regra de controle de acesso); ele e o guia operacional de como usar cada ferramenta na pratica.</w:t>
       </w:r>
     </w:p>
@@ -3056,7 +3074,7 @@
           <w:sz w:val="27"/>
         </w:rPr>
       </w:pPr>
-      <w:bookmarkStart w:id="2" w:name="_Toc237269526"/>
+      <w:bookmarkStart w:id="2" w:name="_Toc237275158"/>
       <w:r>
         <w:rPr>
           <w:rFonts w:ascii="Montserrat" w:hAnsi="Montserrat"/>
@@ -3215,6 +3233,7 @@
           <w:color w:val="1A1A1A"/>
           <w:sz w:val="22"/>
         </w:rPr>
+        <w:lastRenderedPageBreak/>
         <w:t>O Mapa de Diretrizes (pagina inicial) apresenta visualmente as 7 diretrizes (D01 a D07) e mostra, para cada etapa do processo, quais ferramentas usar. E o ponto de partida recomendado para quem quer entender o processo antes de preencher os formularios - e a unica pagina, junto com o Validador de Projetos, que nao exige login.</w:t>
       </w:r>
     </w:p>
@@ -3227,18 +3246,17 @@
         <w:rPr>
           <w:noProof/>
         </w:rPr>
-        <w:lastRenderedPageBreak/>
         <w:drawing>
-          <wp:inline distT="0" distB="0" distL="0" distR="0" wp14:anchorId="2CEDE39C" wp14:editId="7DDA8DF2">
+          <wp:inline distT="0" distB="0" distL="0" distR="0" wp14:anchorId="78DF4976" wp14:editId="34C9DCA2">
             <wp:extent cx="5303520" cy="4792851"/>
             <wp:effectExtent l="19050" t="19050" r="11430" b="27305"/>
-            <wp:docPr id="1487482928" name="Imagem 1"/>
+            <wp:docPr id="723493030" name="Imagem 1"/>
             <wp:cNvGraphicFramePr/>
             <a:graphic xmlns:a="http://schemas.openxmlformats.org/drawingml/2006/main">
               <a:graphicData uri="http://schemas.openxmlformats.org/drawingml/2006/picture">
                 <pic:pic xmlns:pic="http://schemas.openxmlformats.org/drawingml/2006/picture">
                   <pic:nvPicPr>
-                    <pic:cNvPr id="1487482928" name=""/>
+                    <pic:cNvPr id="723493030" name=""/>
                     <pic:cNvPicPr/>
                   </pic:nvPicPr>
                   <pic:blipFill>
@@ -3306,7 +3324,7 @@
           <w:sz w:val="27"/>
         </w:rPr>
       </w:pPr>
-      <w:bookmarkStart w:id="3" w:name="_Toc237269527"/>
+      <w:bookmarkStart w:id="3" w:name="_Toc237275159"/>
       <w:r>
         <w:rPr>
           <w:rFonts w:ascii="Montserrat" w:hAnsi="Montserrat"/>
@@ -3347,16 +3365,16 @@
         </w:rPr>
         <w:lastRenderedPageBreak/>
         <w:drawing>
-          <wp:inline distT="0" distB="0" distL="0" distR="0" wp14:anchorId="10E00E47" wp14:editId="0C3AFAEC">
+          <wp:inline distT="0" distB="0" distL="0" distR="0" wp14:anchorId="44DFED23" wp14:editId="13563E0C">
             <wp:extent cx="4206240" cy="3801227"/>
             <wp:effectExtent l="19050" t="19050" r="22860" b="27940"/>
-            <wp:docPr id="106496076" name="Imagem 2"/>
+            <wp:docPr id="984427382" name="Imagem 2"/>
             <wp:cNvGraphicFramePr/>
             <a:graphic xmlns:a="http://schemas.openxmlformats.org/drawingml/2006/main">
               <a:graphicData uri="http://schemas.openxmlformats.org/drawingml/2006/picture">
                 <pic:pic xmlns:pic="http://schemas.openxmlformats.org/drawingml/2006/picture">
                   <pic:nvPicPr>
-                    <pic:cNvPr id="106496076" name=""/>
+                    <pic:cNvPr id="984427382" name=""/>
                     <pic:cNvPicPr/>
                   </pic:nvPicPr>
                   <pic:blipFill>
@@ -3529,7 +3547,7 @@
           <w:sz w:val="27"/>
         </w:rPr>
       </w:pPr>
-      <w:bookmarkStart w:id="4" w:name="_Toc237269528"/>
+      <w:bookmarkStart w:id="4" w:name="_Toc237275160"/>
       <w:r>
         <w:rPr>
           <w:rFonts w:ascii="Montserrat" w:hAnsi="Montserrat"/>
@@ -4768,7 +4786,7 @@
           <w:sz w:val="34"/>
         </w:rPr>
       </w:pPr>
-      <w:bookmarkStart w:id="5" w:name="_Toc237269529"/>
+      <w:bookmarkStart w:id="5" w:name="_Toc237275161"/>
       <w:r>
         <w:rPr>
           <w:rFonts w:ascii="Montserrat" w:hAnsi="Montserrat"/>
@@ -4792,7 +4810,7 @@
           <w:sz w:val="27"/>
         </w:rPr>
       </w:pPr>
-      <w:bookmarkStart w:id="6" w:name="_Toc237269530"/>
+      <w:bookmarkStart w:id="6" w:name="_Toc237275162"/>
       <w:r>
         <w:rPr>
           <w:rFonts w:ascii="Montserrat" w:hAnsi="Montserrat"/>
@@ -4833,7 +4851,7 @@
           <w:sz w:val="27"/>
         </w:rPr>
       </w:pPr>
-      <w:bookmarkStart w:id="7" w:name="_Toc237269531"/>
+      <w:bookmarkStart w:id="7" w:name="_Toc237275163"/>
       <w:r>
         <w:rPr>
           <w:rFonts w:ascii="Montserrat" w:hAnsi="Montserrat"/>
@@ -4952,7 +4970,7 @@
           <w:sz w:val="27"/>
         </w:rPr>
       </w:pPr>
-      <w:bookmarkStart w:id="8" w:name="_Toc237269532"/>
+      <w:bookmarkStart w:id="8" w:name="_Toc237275164"/>
       <w:r>
         <w:rPr>
           <w:rFonts w:ascii="Montserrat" w:hAnsi="Montserrat"/>
@@ -5565,7 +5583,7 @@
           <w:sz w:val="27"/>
         </w:rPr>
       </w:pPr>
-      <w:bookmarkStart w:id="9" w:name="_Toc237269533"/>
+      <w:bookmarkStart w:id="9" w:name="_Toc237275165"/>
       <w:r>
         <w:rPr>
           <w:rFonts w:ascii="Montserrat" w:hAnsi="Montserrat"/>
@@ -5654,16 +5672,16 @@
         </w:rPr>
         <w:lastRenderedPageBreak/>
         <w:drawing>
-          <wp:inline distT="0" distB="0" distL="0" distR="0" wp14:anchorId="58C50A4A" wp14:editId="76B2726A">
+          <wp:inline distT="0" distB="0" distL="0" distR="0" wp14:anchorId="5A4290B7" wp14:editId="1C9BD724">
             <wp:extent cx="4937760" cy="4462310"/>
             <wp:effectExtent l="19050" t="19050" r="15240" b="14605"/>
-            <wp:docPr id="26609960" name="Imagem 3"/>
+            <wp:docPr id="2143593811" name="Imagem 3"/>
             <wp:cNvGraphicFramePr/>
             <a:graphic xmlns:a="http://schemas.openxmlformats.org/drawingml/2006/main">
               <a:graphicData uri="http://schemas.openxmlformats.org/drawingml/2006/picture">
                 <pic:pic xmlns:pic="http://schemas.openxmlformats.org/drawingml/2006/picture">
                   <pic:nvPicPr>
-                    <pic:cNvPr id="26609960" name=""/>
+                    <pic:cNvPr id="2143593811" name=""/>
                     <pic:cNvPicPr/>
                   </pic:nvPicPr>
                   <pic:blipFill>
@@ -5731,7 +5749,7 @@
           <w:sz w:val="27"/>
         </w:rPr>
       </w:pPr>
-      <w:bookmarkStart w:id="10" w:name="_Toc237269534"/>
+      <w:bookmarkStart w:id="10" w:name="_Toc237275166"/>
       <w:r>
         <w:rPr>
           <w:rFonts w:ascii="Montserrat" w:hAnsi="Montserrat"/>
@@ -5772,16 +5790,16 @@
         </w:rPr>
         <w:lastRenderedPageBreak/>
         <w:drawing>
-          <wp:inline distT="0" distB="0" distL="0" distR="0" wp14:anchorId="25B34FBF" wp14:editId="0A47CCF2">
+          <wp:inline distT="0" distB="0" distL="0" distR="0" wp14:anchorId="4F269567" wp14:editId="2171FA17">
             <wp:extent cx="5120640" cy="4627581"/>
             <wp:effectExtent l="19050" t="19050" r="22860" b="20955"/>
-            <wp:docPr id="1542225641" name="Imagem 4"/>
+            <wp:docPr id="425743565" name="Imagem 4"/>
             <wp:cNvGraphicFramePr/>
             <a:graphic xmlns:a="http://schemas.openxmlformats.org/drawingml/2006/main">
               <a:graphicData uri="http://schemas.openxmlformats.org/drawingml/2006/picture">
                 <pic:pic xmlns:pic="http://schemas.openxmlformats.org/drawingml/2006/picture">
                   <pic:nvPicPr>
-                    <pic:cNvPr id="1542225641" name=""/>
+                    <pic:cNvPr id="425743565" name=""/>
                     <pic:cNvPicPr/>
                   </pic:nvPicPr>
                   <pic:blipFill>
@@ -5918,7 +5936,7 @@
           <w:sz w:val="27"/>
         </w:rPr>
       </w:pPr>
-      <w:bookmarkStart w:id="11" w:name="_Toc237269535"/>
+      <w:bookmarkStart w:id="11" w:name="_Toc237275167"/>
       <w:r>
         <w:rPr>
           <w:rFonts w:ascii="Montserrat" w:hAnsi="Montserrat"/>
@@ -5959,16 +5977,16 @@
           <w:noProof/>
         </w:rPr>
         <w:drawing>
-          <wp:inline distT="0" distB="0" distL="0" distR="0" wp14:anchorId="3B5AEFC6" wp14:editId="3201DAFD">
+          <wp:inline distT="0" distB="0" distL="0" distR="0" wp14:anchorId="17C9EA47" wp14:editId="46E67D00">
             <wp:extent cx="4206240" cy="3801227"/>
             <wp:effectExtent l="19050" t="19050" r="22860" b="27940"/>
-            <wp:docPr id="1428944469" name="Imagem 5"/>
+            <wp:docPr id="721260102" name="Imagem 5"/>
             <wp:cNvGraphicFramePr/>
             <a:graphic xmlns:a="http://schemas.openxmlformats.org/drawingml/2006/main">
               <a:graphicData uri="http://schemas.openxmlformats.org/drawingml/2006/picture">
                 <pic:pic xmlns:pic="http://schemas.openxmlformats.org/drawingml/2006/picture">
                   <pic:nvPicPr>
-                    <pic:cNvPr id="1428944469" name=""/>
+                    <pic:cNvPr id="721260102" name=""/>
                     <pic:cNvPicPr/>
                   </pic:nvPicPr>
                   <pic:blipFill>
@@ -6036,16 +6054,16 @@
         </w:rPr>
         <w:lastRenderedPageBreak/>
         <w:drawing>
-          <wp:inline distT="0" distB="0" distL="0" distR="0" wp14:anchorId="70871FAF" wp14:editId="42076D88">
+          <wp:inline distT="0" distB="0" distL="0" distR="0" wp14:anchorId="0D4F8111" wp14:editId="73380360">
             <wp:extent cx="4206240" cy="3801227"/>
             <wp:effectExtent l="19050" t="19050" r="22860" b="27940"/>
-            <wp:docPr id="1529715849" name="Imagem 6"/>
+            <wp:docPr id="1253669152" name="Imagem 6"/>
             <wp:cNvGraphicFramePr/>
             <a:graphic xmlns:a="http://schemas.openxmlformats.org/drawingml/2006/main">
               <a:graphicData uri="http://schemas.openxmlformats.org/drawingml/2006/picture">
                 <pic:pic xmlns:pic="http://schemas.openxmlformats.org/drawingml/2006/picture">
                   <pic:nvPicPr>
-                    <pic:cNvPr id="1529715849" name=""/>
+                    <pic:cNvPr id="1253669152" name=""/>
                     <pic:cNvPicPr/>
                   </pic:nvPicPr>
                   <pic:blipFill>
@@ -6161,7 +6179,7 @@
           <w:sz w:val="27"/>
         </w:rPr>
       </w:pPr>
-      <w:bookmarkStart w:id="12" w:name="_Toc237269536"/>
+      <w:bookmarkStart w:id="12" w:name="_Toc237275168"/>
       <w:r>
         <w:rPr>
           <w:rFonts w:ascii="Montserrat" w:hAnsi="Montserrat"/>
@@ -6229,7 +6247,7 @@
           <w:sz w:val="27"/>
         </w:rPr>
       </w:pPr>
-      <w:bookmarkStart w:id="13" w:name="_Toc237269537"/>
+      <w:bookmarkStart w:id="13" w:name="_Toc237275169"/>
       <w:r>
         <w:rPr>
           <w:rFonts w:ascii="Montserrat" w:hAnsi="Montserrat"/>
@@ -6456,7 +6474,7 @@
           <w:sz w:val="27"/>
         </w:rPr>
       </w:pPr>
-      <w:bookmarkStart w:id="14" w:name="_Toc237269538"/>
+      <w:bookmarkStart w:id="14" w:name="_Toc237275170"/>
       <w:r>
         <w:rPr>
           <w:rFonts w:ascii="Montserrat" w:hAnsi="Montserrat"/>
@@ -6619,7 +6637,7 @@
           <w:sz w:val="34"/>
         </w:rPr>
       </w:pPr>
-      <w:bookmarkStart w:id="15" w:name="_Toc237269539"/>
+      <w:bookmarkStart w:id="15" w:name="_Toc237275171"/>
       <w:r>
         <w:rPr>
           <w:rFonts w:ascii="Montserrat" w:hAnsi="Montserrat"/>
@@ -6661,7 +6679,7 @@
           <w:sz w:val="27"/>
         </w:rPr>
       </w:pPr>
-      <w:bookmarkStart w:id="16" w:name="_Toc237269540"/>
+      <w:bookmarkStart w:id="16" w:name="_Toc237275172"/>
       <w:r>
         <w:rPr>
           <w:rFonts w:ascii="Montserrat" w:hAnsi="Montserrat"/>
@@ -7664,16 +7682,16 @@
         </w:rPr>
         <w:lastRenderedPageBreak/>
         <w:drawing>
-          <wp:inline distT="0" distB="0" distL="0" distR="0" wp14:anchorId="23FE595E" wp14:editId="1BB1993B">
+          <wp:inline distT="0" distB="0" distL="0" distR="0" wp14:anchorId="2ABCB68A" wp14:editId="5A4AABF4">
             <wp:extent cx="5120640" cy="4627581"/>
             <wp:effectExtent l="19050" t="19050" r="22860" b="20955"/>
-            <wp:docPr id="506306313" name="Imagem 7"/>
+            <wp:docPr id="1204965718" name="Imagem 7"/>
             <wp:cNvGraphicFramePr/>
             <a:graphic xmlns:a="http://schemas.openxmlformats.org/drawingml/2006/main">
               <a:graphicData uri="http://schemas.openxmlformats.org/drawingml/2006/picture">
                 <pic:pic xmlns:pic="http://schemas.openxmlformats.org/drawingml/2006/picture">
                   <pic:nvPicPr>
-                    <pic:cNvPr id="506306313" name=""/>
+                    <pic:cNvPr id="1204965718" name=""/>
                     <pic:cNvPicPr/>
                   </pic:nvPicPr>
                   <pic:blipFill>
@@ -7741,16 +7759,16 @@
         </w:rPr>
         <w:lastRenderedPageBreak/>
         <w:drawing>
-          <wp:inline distT="0" distB="0" distL="0" distR="0" wp14:anchorId="2AD1CE38" wp14:editId="72AFD798">
+          <wp:inline distT="0" distB="0" distL="0" distR="0" wp14:anchorId="0EF27A8C" wp14:editId="051A58E0">
             <wp:extent cx="5120640" cy="4627581"/>
             <wp:effectExtent l="19050" t="19050" r="22860" b="20955"/>
-            <wp:docPr id="1620684089" name="Imagem 8"/>
+            <wp:docPr id="1577170724" name="Imagem 8"/>
             <wp:cNvGraphicFramePr/>
             <a:graphic xmlns:a="http://schemas.openxmlformats.org/drawingml/2006/main">
               <a:graphicData uri="http://schemas.openxmlformats.org/drawingml/2006/picture">
                 <pic:pic xmlns:pic="http://schemas.openxmlformats.org/drawingml/2006/picture">
                   <pic:nvPicPr>
-                    <pic:cNvPr id="1620684089" name=""/>
+                    <pic:cNvPr id="1577170724" name=""/>
                     <pic:cNvPicPr/>
                   </pic:nvPicPr>
                   <pic:blipFill>
@@ -7885,7 +7903,7 @@
           <w:sz w:val="27"/>
         </w:rPr>
       </w:pPr>
-      <w:bookmarkStart w:id="17" w:name="_Toc237269541"/>
+      <w:bookmarkStart w:id="17" w:name="_Toc237275173"/>
       <w:r>
         <w:rPr>
           <w:rFonts w:ascii="Montserrat" w:hAnsi="Montserrat"/>
@@ -8812,16 +8830,16 @@
         </w:rPr>
         <w:lastRenderedPageBreak/>
         <w:drawing>
-          <wp:inline distT="0" distB="0" distL="0" distR="0" wp14:anchorId="6D56E299" wp14:editId="488DEAB7">
+          <wp:inline distT="0" distB="0" distL="0" distR="0" wp14:anchorId="6D5F4801" wp14:editId="1FAF5BDE">
             <wp:extent cx="5120640" cy="4627581"/>
             <wp:effectExtent l="19050" t="19050" r="22860" b="20955"/>
-            <wp:docPr id="308350400" name="Imagem 9"/>
+            <wp:docPr id="1380975789" name="Imagem 9"/>
             <wp:cNvGraphicFramePr/>
             <a:graphic xmlns:a="http://schemas.openxmlformats.org/drawingml/2006/main">
               <a:graphicData uri="http://schemas.openxmlformats.org/drawingml/2006/picture">
                 <pic:pic xmlns:pic="http://schemas.openxmlformats.org/drawingml/2006/picture">
                   <pic:nvPicPr>
-                    <pic:cNvPr id="308350400" name=""/>
+                    <pic:cNvPr id="1380975789" name=""/>
                     <pic:cNvPicPr/>
                   </pic:nvPicPr>
                   <pic:blipFill>
@@ -8889,16 +8907,16 @@
         </w:rPr>
         <w:lastRenderedPageBreak/>
         <w:drawing>
-          <wp:inline distT="0" distB="0" distL="0" distR="0" wp14:anchorId="33A810B2" wp14:editId="68790DCE">
+          <wp:inline distT="0" distB="0" distL="0" distR="0" wp14:anchorId="05EFF416" wp14:editId="58471139">
             <wp:extent cx="5120640" cy="4627581"/>
             <wp:effectExtent l="19050" t="19050" r="22860" b="20955"/>
-            <wp:docPr id="1839195909" name="Imagem 10"/>
+            <wp:docPr id="987509218" name="Imagem 10"/>
             <wp:cNvGraphicFramePr/>
             <a:graphic xmlns:a="http://schemas.openxmlformats.org/drawingml/2006/main">
               <a:graphicData uri="http://schemas.openxmlformats.org/drawingml/2006/picture">
                 <pic:pic xmlns:pic="http://schemas.openxmlformats.org/drawingml/2006/picture">
                   <pic:nvPicPr>
-                    <pic:cNvPr id="1839195909" name=""/>
+                    <pic:cNvPr id="987509218" name=""/>
                     <pic:cNvPicPr/>
                   </pic:nvPicPr>
                   <pic:blipFill>
@@ -8984,7 +9002,7 @@
           <w:sz w:val="27"/>
         </w:rPr>
       </w:pPr>
-      <w:bookmarkStart w:id="18" w:name="_Toc237269542"/>
+      <w:bookmarkStart w:id="18" w:name="_Toc237275174"/>
       <w:r>
         <w:rPr>
           <w:rFonts w:ascii="Montserrat" w:hAnsi="Montserrat"/>
@@ -10024,16 +10042,16 @@
         </w:rPr>
         <w:lastRenderedPageBreak/>
         <w:drawing>
-          <wp:inline distT="0" distB="0" distL="0" distR="0" wp14:anchorId="0A427A8C" wp14:editId="3048530E">
+          <wp:inline distT="0" distB="0" distL="0" distR="0" wp14:anchorId="580AA777" wp14:editId="0A3C5005">
             <wp:extent cx="5120640" cy="3282818"/>
             <wp:effectExtent l="19050" t="19050" r="22860" b="13335"/>
-            <wp:docPr id="610872516" name="Imagem 11"/>
+            <wp:docPr id="1230634838" name="Imagem 11"/>
             <wp:cNvGraphicFramePr/>
             <a:graphic xmlns:a="http://schemas.openxmlformats.org/drawingml/2006/main">
               <a:graphicData uri="http://schemas.openxmlformats.org/drawingml/2006/picture">
                 <pic:pic xmlns:pic="http://schemas.openxmlformats.org/drawingml/2006/picture">
                   <pic:nvPicPr>
-                    <pic:cNvPr id="610872516" name=""/>
+                    <pic:cNvPr id="1230634838" name=""/>
                     <pic:cNvPicPr/>
                   </pic:nvPicPr>
                   <pic:blipFill>
@@ -10101,16 +10119,16 @@
         </w:rPr>
         <w:lastRenderedPageBreak/>
         <w:drawing>
-          <wp:inline distT="0" distB="0" distL="0" distR="0" wp14:anchorId="57C16838" wp14:editId="5BAB4C87">
+          <wp:inline distT="0" distB="0" distL="0" distR="0" wp14:anchorId="71C2DE1F" wp14:editId="3C585490">
             <wp:extent cx="5120640" cy="4627581"/>
             <wp:effectExtent l="19050" t="19050" r="22860" b="20955"/>
-            <wp:docPr id="534062080" name="Imagem 12"/>
+            <wp:docPr id="763673509" name="Imagem 12"/>
             <wp:cNvGraphicFramePr/>
             <a:graphic xmlns:a="http://schemas.openxmlformats.org/drawingml/2006/main">
               <a:graphicData uri="http://schemas.openxmlformats.org/drawingml/2006/picture">
                 <pic:pic xmlns:pic="http://schemas.openxmlformats.org/drawingml/2006/picture">
                   <pic:nvPicPr>
-                    <pic:cNvPr id="534062080" name=""/>
+                    <pic:cNvPr id="763673509" name=""/>
                     <pic:cNvPicPr/>
                   </pic:nvPicPr>
                   <pic:blipFill>
@@ -10196,7 +10214,7 @@
           <w:sz w:val="27"/>
         </w:rPr>
       </w:pPr>
-      <w:bookmarkStart w:id="19" w:name="_Toc237269543"/>
+      <w:bookmarkStart w:id="19" w:name="_Toc237275175"/>
       <w:r>
         <w:rPr>
           <w:rFonts w:ascii="Montserrat" w:hAnsi="Montserrat"/>
@@ -10757,16 +10775,16 @@
           <w:noProof/>
         </w:rPr>
         <w:drawing>
-          <wp:inline distT="0" distB="0" distL="0" distR="0" wp14:anchorId="190E89BF" wp14:editId="142BE8EC">
+          <wp:inline distT="0" distB="0" distL="0" distR="0" wp14:anchorId="337D37DC" wp14:editId="088E90A7">
             <wp:extent cx="5120640" cy="4627581"/>
             <wp:effectExtent l="19050" t="19050" r="22860" b="20955"/>
-            <wp:docPr id="1103321023" name="Imagem 13"/>
+            <wp:docPr id="1779174288" name="Imagem 13"/>
             <wp:cNvGraphicFramePr/>
             <a:graphic xmlns:a="http://schemas.openxmlformats.org/drawingml/2006/main">
               <a:graphicData uri="http://schemas.openxmlformats.org/drawingml/2006/picture">
                 <pic:pic xmlns:pic="http://schemas.openxmlformats.org/drawingml/2006/picture">
                   <pic:nvPicPr>
-                    <pic:cNvPr id="1103321023" name=""/>
+                    <pic:cNvPr id="1779174288" name=""/>
                     <pic:cNvPicPr/>
                   </pic:nvPicPr>
                   <pic:blipFill>
@@ -10834,16 +10852,16 @@
         </w:rPr>
         <w:lastRenderedPageBreak/>
         <w:drawing>
-          <wp:inline distT="0" distB="0" distL="0" distR="0" wp14:anchorId="35A87255" wp14:editId="7A230732">
+          <wp:inline distT="0" distB="0" distL="0" distR="0" wp14:anchorId="5A862A5E" wp14:editId="4B1E6D10">
             <wp:extent cx="5120640" cy="4627581"/>
             <wp:effectExtent l="19050" t="19050" r="22860" b="20955"/>
-            <wp:docPr id="145034732" name="Imagem 14"/>
+            <wp:docPr id="1531061794" name="Imagem 14"/>
             <wp:cNvGraphicFramePr/>
             <a:graphic xmlns:a="http://schemas.openxmlformats.org/drawingml/2006/main">
               <a:graphicData uri="http://schemas.openxmlformats.org/drawingml/2006/picture">
                 <pic:pic xmlns:pic="http://schemas.openxmlformats.org/drawingml/2006/picture">
                   <pic:nvPicPr>
-                    <pic:cNvPr id="145034732" name=""/>
+                    <pic:cNvPr id="1531061794" name=""/>
                     <pic:cNvPicPr/>
                   </pic:nvPicPr>
                   <pic:blipFill>
@@ -10929,7 +10947,7 @@
           <w:sz w:val="27"/>
         </w:rPr>
       </w:pPr>
-      <w:bookmarkStart w:id="20" w:name="_Toc237269544"/>
+      <w:bookmarkStart w:id="20" w:name="_Toc237275176"/>
       <w:r>
         <w:rPr>
           <w:rFonts w:ascii="Montserrat" w:hAnsi="Montserrat"/>
@@ -10970,16 +10988,16 @@
         </w:rPr>
         <w:lastRenderedPageBreak/>
         <w:drawing>
-          <wp:inline distT="0" distB="0" distL="0" distR="0" wp14:anchorId="44E3D596" wp14:editId="50854316">
+          <wp:inline distT="0" distB="0" distL="0" distR="0" wp14:anchorId="7B9E697F" wp14:editId="7E5C4732">
             <wp:extent cx="5120640" cy="4627581"/>
             <wp:effectExtent l="19050" t="19050" r="22860" b="20955"/>
-            <wp:docPr id="1168251946" name="Imagem 15"/>
+            <wp:docPr id="771611524" name="Imagem 15"/>
             <wp:cNvGraphicFramePr/>
             <a:graphic xmlns:a="http://schemas.openxmlformats.org/drawingml/2006/main">
               <a:graphicData uri="http://schemas.openxmlformats.org/drawingml/2006/picture">
                 <pic:pic xmlns:pic="http://schemas.openxmlformats.org/drawingml/2006/picture">
                   <pic:nvPicPr>
-                    <pic:cNvPr id="1168251946" name=""/>
+                    <pic:cNvPr id="771611524" name=""/>
                     <pic:cNvPicPr/>
                   </pic:nvPicPr>
                   <pic:blipFill>
@@ -11047,16 +11065,16 @@
         </w:rPr>
         <w:lastRenderedPageBreak/>
         <w:drawing>
-          <wp:inline distT="0" distB="0" distL="0" distR="0" wp14:anchorId="3086BA2A" wp14:editId="6940DA7A">
+          <wp:inline distT="0" distB="0" distL="0" distR="0" wp14:anchorId="7688E01E" wp14:editId="4992D9E7">
             <wp:extent cx="5120640" cy="4627581"/>
             <wp:effectExtent l="19050" t="19050" r="22860" b="20955"/>
-            <wp:docPr id="317164600" name="Imagem 16"/>
+            <wp:docPr id="694277409" name="Imagem 16"/>
             <wp:cNvGraphicFramePr/>
             <a:graphic xmlns:a="http://schemas.openxmlformats.org/drawingml/2006/main">
               <a:graphicData uri="http://schemas.openxmlformats.org/drawingml/2006/picture">
                 <pic:pic xmlns:pic="http://schemas.openxmlformats.org/drawingml/2006/picture">
                   <pic:nvPicPr>
-                    <pic:cNvPr id="317164600" name=""/>
+                    <pic:cNvPr id="694277409" name=""/>
                     <pic:cNvPicPr/>
                   </pic:nvPicPr>
                   <pic:blipFill>
@@ -11220,16 +11238,16 @@
         </w:rPr>
         <w:lastRenderedPageBreak/>
         <w:drawing>
-          <wp:inline distT="0" distB="0" distL="0" distR="0" wp14:anchorId="2F14D3FA" wp14:editId="1E6AEA7C">
+          <wp:inline distT="0" distB="0" distL="0" distR="0" wp14:anchorId="00B31107" wp14:editId="2558435C">
             <wp:extent cx="5120640" cy="3282818"/>
             <wp:effectExtent l="19050" t="19050" r="22860" b="13335"/>
-            <wp:docPr id="261391798" name="Imagem 17"/>
+            <wp:docPr id="1658976478" name="Imagem 17"/>
             <wp:cNvGraphicFramePr/>
             <a:graphic xmlns:a="http://schemas.openxmlformats.org/drawingml/2006/main">
               <a:graphicData uri="http://schemas.openxmlformats.org/drawingml/2006/picture">
                 <pic:pic xmlns:pic="http://schemas.openxmlformats.org/drawingml/2006/picture">
                   <pic:nvPicPr>
-                    <pic:cNvPr id="261391798" name=""/>
+                    <pic:cNvPr id="1658976478" name=""/>
                     <pic:cNvPicPr/>
                   </pic:nvPicPr>
                   <pic:blipFill>
@@ -11315,7 +11333,7 @@
           <w:sz w:val="27"/>
         </w:rPr>
       </w:pPr>
-      <w:bookmarkStart w:id="21" w:name="_Toc237269545"/>
+      <w:bookmarkStart w:id="21" w:name="_Toc237275177"/>
       <w:r>
         <w:rPr>
           <w:rFonts w:ascii="Montserrat" w:hAnsi="Montserrat"/>
@@ -11356,16 +11374,16 @@
         </w:rPr>
         <w:lastRenderedPageBreak/>
         <w:drawing>
-          <wp:inline distT="0" distB="0" distL="0" distR="0" wp14:anchorId="09C102D5" wp14:editId="7898CB3E">
+          <wp:inline distT="0" distB="0" distL="0" distR="0" wp14:anchorId="3EA8AE7F" wp14:editId="3E68DFDB">
             <wp:extent cx="5120640" cy="4627581"/>
             <wp:effectExtent l="19050" t="19050" r="22860" b="20955"/>
-            <wp:docPr id="295347721" name="Imagem 18"/>
+            <wp:docPr id="1392814629" name="Imagem 18"/>
             <wp:cNvGraphicFramePr/>
             <a:graphic xmlns:a="http://schemas.openxmlformats.org/drawingml/2006/main">
               <a:graphicData uri="http://schemas.openxmlformats.org/drawingml/2006/picture">
                 <pic:pic xmlns:pic="http://schemas.openxmlformats.org/drawingml/2006/picture">
                   <pic:nvPicPr>
-                    <pic:cNvPr id="295347721" name=""/>
+                    <pic:cNvPr id="1392814629" name=""/>
                     <pic:cNvPicPr/>
                   </pic:nvPicPr>
                   <pic:blipFill>
@@ -11433,16 +11451,16 @@
         </w:rPr>
         <w:lastRenderedPageBreak/>
         <w:drawing>
-          <wp:inline distT="0" distB="0" distL="0" distR="0" wp14:anchorId="0D98E226" wp14:editId="006173F3">
+          <wp:inline distT="0" distB="0" distL="0" distR="0" wp14:anchorId="7425352F" wp14:editId="2922865B">
             <wp:extent cx="5120640" cy="4627581"/>
             <wp:effectExtent l="19050" t="19050" r="22860" b="20955"/>
-            <wp:docPr id="260949505" name="Imagem 19"/>
+            <wp:docPr id="1554920421" name="Imagem 19"/>
             <wp:cNvGraphicFramePr/>
             <a:graphic xmlns:a="http://schemas.openxmlformats.org/drawingml/2006/main">
               <a:graphicData uri="http://schemas.openxmlformats.org/drawingml/2006/picture">
                 <pic:pic xmlns:pic="http://schemas.openxmlformats.org/drawingml/2006/picture">
                   <pic:nvPicPr>
-                    <pic:cNvPr id="260949505" name=""/>
+                    <pic:cNvPr id="1554920421" name=""/>
                     <pic:cNvPicPr/>
                   </pic:nvPicPr>
                   <pic:blipFill>
@@ -11576,7 +11594,7 @@
           <w:sz w:val="27"/>
         </w:rPr>
       </w:pPr>
-      <w:bookmarkStart w:id="22" w:name="_Toc237269546"/>
+      <w:bookmarkStart w:id="22" w:name="_Toc237275178"/>
       <w:r>
         <w:rPr>
           <w:rFonts w:ascii="Montserrat" w:hAnsi="Montserrat"/>
@@ -11617,16 +11635,16 @@
         </w:rPr>
         <w:lastRenderedPageBreak/>
         <w:drawing>
-          <wp:inline distT="0" distB="0" distL="0" distR="0" wp14:anchorId="568F38C3" wp14:editId="67380D7F">
+          <wp:inline distT="0" distB="0" distL="0" distR="0" wp14:anchorId="67C64AF7" wp14:editId="4CFCF077">
             <wp:extent cx="5120640" cy="4627581"/>
             <wp:effectExtent l="19050" t="19050" r="22860" b="20955"/>
-            <wp:docPr id="48459277" name="Imagem 20"/>
+            <wp:docPr id="1006232859" name="Imagem 20"/>
             <wp:cNvGraphicFramePr/>
             <a:graphic xmlns:a="http://schemas.openxmlformats.org/drawingml/2006/main">
               <a:graphicData uri="http://schemas.openxmlformats.org/drawingml/2006/picture">
                 <pic:pic xmlns:pic="http://schemas.openxmlformats.org/drawingml/2006/picture">
                   <pic:nvPicPr>
-                    <pic:cNvPr id="48459277" name=""/>
+                    <pic:cNvPr id="1006232859" name=""/>
                     <pic:cNvPicPr/>
                   </pic:nvPicPr>
                   <pic:blipFill>
@@ -11694,16 +11712,16 @@
         </w:rPr>
         <w:lastRenderedPageBreak/>
         <w:drawing>
-          <wp:inline distT="0" distB="0" distL="0" distR="0" wp14:anchorId="613EFB06" wp14:editId="2A5728C7">
+          <wp:inline distT="0" distB="0" distL="0" distR="0" wp14:anchorId="14DAC70F" wp14:editId="5FFAA0A4">
             <wp:extent cx="5120640" cy="4627581"/>
             <wp:effectExtent l="19050" t="19050" r="22860" b="20955"/>
-            <wp:docPr id="666270392" name="Imagem 21"/>
+            <wp:docPr id="1354944979" name="Imagem 21"/>
             <wp:cNvGraphicFramePr/>
             <a:graphic xmlns:a="http://schemas.openxmlformats.org/drawingml/2006/main">
               <a:graphicData uri="http://schemas.openxmlformats.org/drawingml/2006/picture">
                 <pic:pic xmlns:pic="http://schemas.openxmlformats.org/drawingml/2006/picture">
                   <pic:nvPicPr>
-                    <pic:cNvPr id="666270392" name=""/>
+                    <pic:cNvPr id="1354944979" name=""/>
                     <pic:cNvPicPr/>
                   </pic:nvPicPr>
                   <pic:blipFill>
@@ -11892,7 +11910,7 @@
           <w:sz w:val="27"/>
         </w:rPr>
       </w:pPr>
-      <w:bookmarkStart w:id="23" w:name="_Toc237269547"/>
+      <w:bookmarkStart w:id="23" w:name="_Toc237275179"/>
       <w:r>
         <w:rPr>
           <w:rFonts w:ascii="Montserrat" w:hAnsi="Montserrat"/>
@@ -11932,16 +11950,16 @@
           <w:noProof/>
         </w:rPr>
         <w:drawing>
-          <wp:inline distT="0" distB="0" distL="0" distR="0" wp14:anchorId="3DE31C59" wp14:editId="19A11309">
+          <wp:inline distT="0" distB="0" distL="0" distR="0" wp14:anchorId="61DAF710" wp14:editId="241DACC0">
             <wp:extent cx="5120640" cy="4627581"/>
             <wp:effectExtent l="19050" t="19050" r="22860" b="20955"/>
-            <wp:docPr id="1318230761" name="Imagem 22"/>
+            <wp:docPr id="1249685156" name="Imagem 22"/>
             <wp:cNvGraphicFramePr/>
             <a:graphic xmlns:a="http://schemas.openxmlformats.org/drawingml/2006/main">
               <a:graphicData uri="http://schemas.openxmlformats.org/drawingml/2006/picture">
                 <pic:pic xmlns:pic="http://schemas.openxmlformats.org/drawingml/2006/picture">
                   <pic:nvPicPr>
-                    <pic:cNvPr id="1318230761" name=""/>
+                    <pic:cNvPr id="1249685156" name=""/>
                     <pic:cNvPicPr/>
                   </pic:nvPicPr>
                   <pic:blipFill>
@@ -12009,16 +12027,16 @@
         </w:rPr>
         <w:lastRenderedPageBreak/>
         <w:drawing>
-          <wp:inline distT="0" distB="0" distL="0" distR="0" wp14:anchorId="28C1BE51" wp14:editId="237B6EDF">
+          <wp:inline distT="0" distB="0" distL="0" distR="0" wp14:anchorId="2B2E4F45" wp14:editId="61846381">
             <wp:extent cx="5120640" cy="4627581"/>
             <wp:effectExtent l="19050" t="19050" r="22860" b="20955"/>
-            <wp:docPr id="1223220446" name="Imagem 23"/>
+            <wp:docPr id="878390458" name="Imagem 23"/>
             <wp:cNvGraphicFramePr/>
             <a:graphic xmlns:a="http://schemas.openxmlformats.org/drawingml/2006/main">
               <a:graphicData uri="http://schemas.openxmlformats.org/drawingml/2006/picture">
                 <pic:pic xmlns:pic="http://schemas.openxmlformats.org/drawingml/2006/picture">
                   <pic:nvPicPr>
-                    <pic:cNvPr id="1223220446" name=""/>
+                    <pic:cNvPr id="878390458" name=""/>
                     <pic:cNvPicPr/>
                   </pic:nvPicPr>
                   <pic:blipFill>
@@ -12176,7 +12194,7 @@
           <w:sz w:val="27"/>
         </w:rPr>
       </w:pPr>
-      <w:bookmarkStart w:id="24" w:name="_Toc237269548"/>
+      <w:bookmarkStart w:id="24" w:name="_Toc237275180"/>
       <w:r>
         <w:rPr>
           <w:rFonts w:ascii="Montserrat" w:hAnsi="Montserrat"/>
@@ -12217,16 +12235,16 @@
         </w:rPr>
         <w:lastRenderedPageBreak/>
         <w:drawing>
-          <wp:inline distT="0" distB="0" distL="0" distR="0" wp14:anchorId="7E72B823" wp14:editId="01CF3713">
+          <wp:inline distT="0" distB="0" distL="0" distR="0" wp14:anchorId="27F65AF2" wp14:editId="6FD533EE">
             <wp:extent cx="5120640" cy="4627581"/>
             <wp:effectExtent l="19050" t="19050" r="22860" b="20955"/>
-            <wp:docPr id="448641003" name="Imagem 24"/>
+            <wp:docPr id="1753339093" name="Imagem 24"/>
             <wp:cNvGraphicFramePr/>
             <a:graphic xmlns:a="http://schemas.openxmlformats.org/drawingml/2006/main">
               <a:graphicData uri="http://schemas.openxmlformats.org/drawingml/2006/picture">
                 <pic:pic xmlns:pic="http://schemas.openxmlformats.org/drawingml/2006/picture">
                   <pic:nvPicPr>
-                    <pic:cNvPr id="448641003" name=""/>
+                    <pic:cNvPr id="1753339093" name=""/>
                     <pic:cNvPicPr/>
                   </pic:nvPicPr>
                   <pic:blipFill>
@@ -12294,16 +12312,16 @@
         </w:rPr>
         <w:lastRenderedPageBreak/>
         <w:drawing>
-          <wp:inline distT="0" distB="0" distL="0" distR="0" wp14:anchorId="7C2A2E8F" wp14:editId="399AC5E3">
+          <wp:inline distT="0" distB="0" distL="0" distR="0" wp14:anchorId="71CAB096" wp14:editId="52A60F53">
             <wp:extent cx="5120640" cy="4627581"/>
             <wp:effectExtent l="19050" t="19050" r="22860" b="20955"/>
-            <wp:docPr id="1928003139" name="Imagem 25"/>
+            <wp:docPr id="1961711807" name="Imagem 25"/>
             <wp:cNvGraphicFramePr/>
             <a:graphic xmlns:a="http://schemas.openxmlformats.org/drawingml/2006/main">
               <a:graphicData uri="http://schemas.openxmlformats.org/drawingml/2006/picture">
                 <pic:pic xmlns:pic="http://schemas.openxmlformats.org/drawingml/2006/picture">
                   <pic:nvPicPr>
-                    <pic:cNvPr id="1928003139" name=""/>
+                    <pic:cNvPr id="1961711807" name=""/>
                     <pic:cNvPicPr/>
                   </pic:nvPicPr>
                   <pic:blipFill>
@@ -12437,7 +12455,7 @@
           <w:sz w:val="27"/>
         </w:rPr>
       </w:pPr>
-      <w:bookmarkStart w:id="25" w:name="_Toc237269549"/>
+      <w:bookmarkStart w:id="25" w:name="_Toc237275181"/>
       <w:r>
         <w:rPr>
           <w:rFonts w:ascii="Montserrat" w:hAnsi="Montserrat"/>
@@ -12478,16 +12496,16 @@
         </w:rPr>
         <w:lastRenderedPageBreak/>
         <w:drawing>
-          <wp:inline distT="0" distB="0" distL="0" distR="0" wp14:anchorId="2AF174BF" wp14:editId="4A9BEBFF">
+          <wp:inline distT="0" distB="0" distL="0" distR="0" wp14:anchorId="370F1F4F" wp14:editId="1A9DBF16">
             <wp:extent cx="5120640" cy="4627581"/>
             <wp:effectExtent l="19050" t="19050" r="22860" b="20955"/>
-            <wp:docPr id="1005929642" name="Imagem 26"/>
+            <wp:docPr id="1703603139" name="Imagem 26"/>
             <wp:cNvGraphicFramePr/>
             <a:graphic xmlns:a="http://schemas.openxmlformats.org/drawingml/2006/main">
               <a:graphicData uri="http://schemas.openxmlformats.org/drawingml/2006/picture">
                 <pic:pic xmlns:pic="http://schemas.openxmlformats.org/drawingml/2006/picture">
                   <pic:nvPicPr>
-                    <pic:cNvPr id="1005929642" name=""/>
+                    <pic:cNvPr id="1703603139" name=""/>
                     <pic:cNvPicPr/>
                   </pic:nvPicPr>
                   <pic:blipFill>
@@ -12577,7 +12595,7 @@
           <w:sz w:val="34"/>
         </w:rPr>
       </w:pPr>
-      <w:bookmarkStart w:id="26" w:name="_Toc237269550"/>
+      <w:bookmarkStart w:id="26" w:name="_Toc237275182"/>
       <w:r>
         <w:rPr>
           <w:rFonts w:ascii="Montserrat" w:hAnsi="Montserrat"/>
@@ -12619,7 +12637,7 @@
           <w:sz w:val="27"/>
         </w:rPr>
       </w:pPr>
-      <w:bookmarkStart w:id="27" w:name="_Toc237269551"/>
+      <w:bookmarkStart w:id="27" w:name="_Toc237275183"/>
       <w:r>
         <w:rPr>
           <w:rFonts w:ascii="Montserrat" w:hAnsi="Montserrat"/>
@@ -12659,16 +12677,16 @@
           <w:noProof/>
         </w:rPr>
         <w:drawing>
-          <wp:inline distT="0" distB="0" distL="0" distR="0" wp14:anchorId="7459CD25" wp14:editId="69DBA5BE">
+          <wp:inline distT="0" distB="0" distL="0" distR="0" wp14:anchorId="4F866604" wp14:editId="08F644B7">
             <wp:extent cx="5120640" cy="4627581"/>
             <wp:effectExtent l="19050" t="19050" r="22860" b="20955"/>
-            <wp:docPr id="1024270441" name="Imagem 27"/>
+            <wp:docPr id="153634901" name="Imagem 27"/>
             <wp:cNvGraphicFramePr/>
             <a:graphic xmlns:a="http://schemas.openxmlformats.org/drawingml/2006/main">
               <a:graphicData uri="http://schemas.openxmlformats.org/drawingml/2006/picture">
                 <pic:pic xmlns:pic="http://schemas.openxmlformats.org/drawingml/2006/picture">
                   <pic:nvPicPr>
-                    <pic:cNvPr id="1024270441" name=""/>
+                    <pic:cNvPr id="153634901" name=""/>
                     <pic:cNvPicPr/>
                   </pic:nvPicPr>
                   <pic:blipFill>
@@ -12736,16 +12754,16 @@
         </w:rPr>
         <w:lastRenderedPageBreak/>
         <w:drawing>
-          <wp:inline distT="0" distB="0" distL="0" distR="0" wp14:anchorId="1045E653" wp14:editId="52A4A366">
+          <wp:inline distT="0" distB="0" distL="0" distR="0" wp14:anchorId="2DD70D9A" wp14:editId="23316943">
             <wp:extent cx="5120640" cy="4627581"/>
             <wp:effectExtent l="19050" t="19050" r="22860" b="20955"/>
-            <wp:docPr id="406719742" name="Imagem 28"/>
+            <wp:docPr id="1023901457" name="Imagem 28"/>
             <wp:cNvGraphicFramePr/>
             <a:graphic xmlns:a="http://schemas.openxmlformats.org/drawingml/2006/main">
               <a:graphicData uri="http://schemas.openxmlformats.org/drawingml/2006/picture">
                 <pic:pic xmlns:pic="http://schemas.openxmlformats.org/drawingml/2006/picture">
                   <pic:nvPicPr>
-                    <pic:cNvPr id="406719742" name=""/>
+                    <pic:cNvPr id="1023901457" name=""/>
                     <pic:cNvPicPr/>
                   </pic:nvPicPr>
                   <pic:blipFill>
@@ -12813,16 +12831,16 @@
         </w:rPr>
         <w:lastRenderedPageBreak/>
         <w:drawing>
-          <wp:inline distT="0" distB="0" distL="0" distR="0" wp14:anchorId="2145EB25" wp14:editId="6FD7D2D8">
+          <wp:inline distT="0" distB="0" distL="0" distR="0" wp14:anchorId="602EB82C" wp14:editId="57994594">
             <wp:extent cx="5120640" cy="4627581"/>
             <wp:effectExtent l="19050" t="19050" r="22860" b="20955"/>
-            <wp:docPr id="618197166" name="Imagem 29"/>
+            <wp:docPr id="1186194034" name="Imagem 29"/>
             <wp:cNvGraphicFramePr/>
             <a:graphic xmlns:a="http://schemas.openxmlformats.org/drawingml/2006/main">
               <a:graphicData uri="http://schemas.openxmlformats.org/drawingml/2006/picture">
                 <pic:pic xmlns:pic="http://schemas.openxmlformats.org/drawingml/2006/picture">
                   <pic:nvPicPr>
-                    <pic:cNvPr id="618197166" name=""/>
+                    <pic:cNvPr id="1186194034" name=""/>
                     <pic:cNvPicPr/>
                   </pic:nvPicPr>
                   <pic:blipFill>
@@ -12959,16 +12977,16 @@
         </w:rPr>
         <w:lastRenderedPageBreak/>
         <w:drawing>
-          <wp:inline distT="0" distB="0" distL="0" distR="0" wp14:anchorId="2E91DE62" wp14:editId="5CE991DB">
+          <wp:inline distT="0" distB="0" distL="0" distR="0" wp14:anchorId="3E39E131" wp14:editId="523C50E2">
             <wp:extent cx="5120640" cy="1715571"/>
             <wp:effectExtent l="19050" t="19050" r="22860" b="18415"/>
-            <wp:docPr id="1575964484" name="Imagem 30"/>
+            <wp:docPr id="663568095" name="Imagem 30"/>
             <wp:cNvGraphicFramePr/>
             <a:graphic xmlns:a="http://schemas.openxmlformats.org/drawingml/2006/main">
               <a:graphicData uri="http://schemas.openxmlformats.org/drawingml/2006/picture">
                 <pic:pic xmlns:pic="http://schemas.openxmlformats.org/drawingml/2006/picture">
                   <pic:nvPicPr>
-                    <pic:cNvPr id="1575964484" name=""/>
+                    <pic:cNvPr id="663568095" name=""/>
                     <pic:cNvPicPr/>
                   </pic:nvPicPr>
                   <pic:blipFill>
@@ -13105,16 +13123,16 @@
         </w:rPr>
         <w:lastRenderedPageBreak/>
         <w:drawing>
-          <wp:inline distT="0" distB="0" distL="0" distR="0" wp14:anchorId="1B636BB8" wp14:editId="34416550">
+          <wp:inline distT="0" distB="0" distL="0" distR="0" wp14:anchorId="71E1679C" wp14:editId="4039332F">
             <wp:extent cx="5120640" cy="3282818"/>
             <wp:effectExtent l="19050" t="19050" r="22860" b="13335"/>
-            <wp:docPr id="2009121306" name="Imagem 31"/>
+            <wp:docPr id="1865590513" name="Imagem 31"/>
             <wp:cNvGraphicFramePr/>
             <a:graphic xmlns:a="http://schemas.openxmlformats.org/drawingml/2006/main">
               <a:graphicData uri="http://schemas.openxmlformats.org/drawingml/2006/picture">
                 <pic:pic xmlns:pic="http://schemas.openxmlformats.org/drawingml/2006/picture">
                   <pic:nvPicPr>
-                    <pic:cNvPr id="2009121306" name=""/>
+                    <pic:cNvPr id="1865590513" name=""/>
                     <pic:cNvPicPr/>
                   </pic:nvPicPr>
                   <pic:blipFill>
@@ -13226,16 +13244,16 @@
           <w:noProof/>
         </w:rPr>
         <w:drawing>
-          <wp:inline distT="0" distB="0" distL="0" distR="0" wp14:anchorId="07D66FE0" wp14:editId="7F371E3A">
+          <wp:inline distT="0" distB="0" distL="0" distR="0" wp14:anchorId="17B99F18" wp14:editId="088408A6">
             <wp:extent cx="5120640" cy="1515102"/>
             <wp:effectExtent l="19050" t="19050" r="22860" b="28575"/>
-            <wp:docPr id="576398589" name="Imagem 32"/>
+            <wp:docPr id="145062981" name="Imagem 32"/>
             <wp:cNvGraphicFramePr/>
             <a:graphic xmlns:a="http://schemas.openxmlformats.org/drawingml/2006/main">
               <a:graphicData uri="http://schemas.openxmlformats.org/drawingml/2006/picture">
                 <pic:pic xmlns:pic="http://schemas.openxmlformats.org/drawingml/2006/picture">
                   <pic:nvPicPr>
-                    <pic:cNvPr id="576398589" name=""/>
+                    <pic:cNvPr id="145062981" name=""/>
                     <pic:cNvPicPr/>
                   </pic:nvPicPr>
                   <pic:blipFill>
@@ -13348,16 +13366,16 @@
           <w:noProof/>
         </w:rPr>
         <w:drawing>
-          <wp:inline distT="0" distB="0" distL="0" distR="0" wp14:anchorId="7848C946" wp14:editId="075EEB78">
+          <wp:inline distT="0" distB="0" distL="0" distR="0" wp14:anchorId="5DE5E4D4" wp14:editId="0314A3B5">
             <wp:extent cx="5120640" cy="1391113"/>
             <wp:effectExtent l="19050" t="19050" r="22860" b="19050"/>
-            <wp:docPr id="697830920" name="Imagem 33"/>
+            <wp:docPr id="1328758642" name="Imagem 33"/>
             <wp:cNvGraphicFramePr/>
             <a:graphic xmlns:a="http://schemas.openxmlformats.org/drawingml/2006/main">
               <a:graphicData uri="http://schemas.openxmlformats.org/drawingml/2006/picture">
                 <pic:pic xmlns:pic="http://schemas.openxmlformats.org/drawingml/2006/picture">
                   <pic:nvPicPr>
-                    <pic:cNvPr id="697830920" name=""/>
+                    <pic:cNvPr id="1328758642" name=""/>
                     <pic:cNvPicPr/>
                   </pic:nvPicPr>
                   <pic:blipFill>
@@ -13469,16 +13487,16 @@
           <w:noProof/>
         </w:rPr>
         <w:drawing>
-          <wp:inline distT="0" distB="0" distL="0" distR="0" wp14:anchorId="227D0874" wp14:editId="3B7ED10B">
+          <wp:inline distT="0" distB="0" distL="0" distR="0" wp14:anchorId="719009EE" wp14:editId="30F88BBE">
             <wp:extent cx="5120640" cy="1125174"/>
             <wp:effectExtent l="19050" t="19050" r="22860" b="18415"/>
-            <wp:docPr id="668544686" name="Imagem 34"/>
+            <wp:docPr id="1225816750" name="Imagem 34"/>
             <wp:cNvGraphicFramePr/>
             <a:graphic xmlns:a="http://schemas.openxmlformats.org/drawingml/2006/main">
               <a:graphicData uri="http://schemas.openxmlformats.org/drawingml/2006/picture">
                 <pic:pic xmlns:pic="http://schemas.openxmlformats.org/drawingml/2006/picture">
                   <pic:nvPicPr>
-                    <pic:cNvPr id="668544686" name=""/>
+                    <pic:cNvPr id="1225816750" name=""/>
                     <pic:cNvPicPr/>
                   </pic:nvPicPr>
                   <pic:blipFill>
@@ -13568,7 +13586,7 @@
           <w:sz w:val="27"/>
         </w:rPr>
       </w:pPr>
-      <w:bookmarkStart w:id="28" w:name="_Toc237269552"/>
+      <w:bookmarkStart w:id="28" w:name="_Toc237275184"/>
       <w:r>
         <w:rPr>
           <w:rFonts w:ascii="Montserrat" w:hAnsi="Montserrat"/>
@@ -13608,16 +13626,16 @@
           <w:noProof/>
         </w:rPr>
         <w:drawing>
-          <wp:inline distT="0" distB="0" distL="0" distR="0" wp14:anchorId="5F075D99" wp14:editId="788ECB7A">
+          <wp:inline distT="0" distB="0" distL="0" distR="0" wp14:anchorId="34DC1B30" wp14:editId="2E5260D0">
             <wp:extent cx="5120640" cy="4627581"/>
             <wp:effectExtent l="19050" t="19050" r="22860" b="20955"/>
-            <wp:docPr id="677951976" name="Imagem 35"/>
+            <wp:docPr id="1624673106" name="Imagem 35"/>
             <wp:cNvGraphicFramePr/>
             <a:graphic xmlns:a="http://schemas.openxmlformats.org/drawingml/2006/main">
               <a:graphicData uri="http://schemas.openxmlformats.org/drawingml/2006/picture">
                 <pic:pic xmlns:pic="http://schemas.openxmlformats.org/drawingml/2006/picture">
                   <pic:nvPicPr>
-                    <pic:cNvPr id="677951976" name=""/>
+                    <pic:cNvPr id="1624673106" name=""/>
                     <pic:cNvPicPr/>
                   </pic:nvPicPr>
                   <pic:blipFill>
@@ -13685,16 +13703,16 @@
         </w:rPr>
         <w:lastRenderedPageBreak/>
         <w:drawing>
-          <wp:inline distT="0" distB="0" distL="0" distR="0" wp14:anchorId="17DD60A0" wp14:editId="7CF22958">
+          <wp:inline distT="0" distB="0" distL="0" distR="0" wp14:anchorId="2B5C0BA0" wp14:editId="2B2E7650">
             <wp:extent cx="5120640" cy="4627581"/>
             <wp:effectExtent l="19050" t="19050" r="22860" b="20955"/>
-            <wp:docPr id="1098404359" name="Imagem 36"/>
+            <wp:docPr id="994707303" name="Imagem 36"/>
             <wp:cNvGraphicFramePr/>
             <a:graphic xmlns:a="http://schemas.openxmlformats.org/drawingml/2006/main">
               <a:graphicData uri="http://schemas.openxmlformats.org/drawingml/2006/picture">
                 <pic:pic xmlns:pic="http://schemas.openxmlformats.org/drawingml/2006/picture">
                   <pic:nvPicPr>
-                    <pic:cNvPr id="1098404359" name=""/>
+                    <pic:cNvPr id="994707303" name=""/>
                     <pic:cNvPicPr/>
                   </pic:nvPicPr>
                   <pic:blipFill>
@@ -13831,16 +13849,16 @@
         </w:rPr>
         <w:lastRenderedPageBreak/>
         <w:drawing>
-          <wp:inline distT="0" distB="0" distL="0" distR="0" wp14:anchorId="297519A0" wp14:editId="4D77465C">
+          <wp:inline distT="0" distB="0" distL="0" distR="0" wp14:anchorId="2AD89D93" wp14:editId="69CFECD8">
             <wp:extent cx="5120640" cy="2144319"/>
             <wp:effectExtent l="19050" t="19050" r="22860" b="27940"/>
-            <wp:docPr id="1394465070" name="Imagem 37"/>
+            <wp:docPr id="96555122" name="Imagem 37"/>
             <wp:cNvGraphicFramePr/>
             <a:graphic xmlns:a="http://schemas.openxmlformats.org/drawingml/2006/main">
               <a:graphicData uri="http://schemas.openxmlformats.org/drawingml/2006/picture">
                 <pic:pic xmlns:pic="http://schemas.openxmlformats.org/drawingml/2006/picture">
                   <pic:nvPicPr>
-                    <pic:cNvPr id="1394465070" name=""/>
+                    <pic:cNvPr id="96555122" name=""/>
                     <pic:cNvPicPr/>
                   </pic:nvPicPr>
                   <pic:blipFill>
@@ -13928,16 +13946,16 @@
           <w:noProof/>
         </w:rPr>
         <w:drawing>
-          <wp:inline distT="0" distB="0" distL="0" distR="0" wp14:anchorId="0840A7E5" wp14:editId="01116E63">
+          <wp:inline distT="0" distB="0" distL="0" distR="0" wp14:anchorId="40D47599" wp14:editId="5FB10932">
             <wp:extent cx="5120640" cy="1055647"/>
             <wp:effectExtent l="19050" t="19050" r="22860" b="11430"/>
-            <wp:docPr id="1433165822" name="Imagem 38"/>
+            <wp:docPr id="1705268748" name="Imagem 38"/>
             <wp:cNvGraphicFramePr/>
             <a:graphic xmlns:a="http://schemas.openxmlformats.org/drawingml/2006/main">
               <a:graphicData uri="http://schemas.openxmlformats.org/drawingml/2006/picture">
                 <pic:pic xmlns:pic="http://schemas.openxmlformats.org/drawingml/2006/picture">
                   <pic:nvPicPr>
-                    <pic:cNvPr id="1433165822" name=""/>
+                    <pic:cNvPr id="1705268748" name=""/>
                     <pic:cNvPicPr/>
                   </pic:nvPicPr>
                   <pic:blipFill>
@@ -14050,16 +14068,16 @@
         </w:rPr>
         <w:lastRenderedPageBreak/>
         <w:drawing>
-          <wp:inline distT="0" distB="0" distL="0" distR="0" wp14:anchorId="489BA316" wp14:editId="3197C9E1">
+          <wp:inline distT="0" distB="0" distL="0" distR="0" wp14:anchorId="045A8F8E" wp14:editId="44AD68CE">
             <wp:extent cx="5120640" cy="3282818"/>
             <wp:effectExtent l="19050" t="19050" r="22860" b="13335"/>
-            <wp:docPr id="749480491" name="Imagem 39"/>
+            <wp:docPr id="605265271" name="Imagem 39"/>
             <wp:cNvGraphicFramePr/>
             <a:graphic xmlns:a="http://schemas.openxmlformats.org/drawingml/2006/main">
               <a:graphicData uri="http://schemas.openxmlformats.org/drawingml/2006/picture">
                 <pic:pic xmlns:pic="http://schemas.openxmlformats.org/drawingml/2006/picture">
                   <pic:nvPicPr>
-                    <pic:cNvPr id="749480491" name=""/>
+                    <pic:cNvPr id="605265271" name=""/>
                     <pic:cNvPicPr/>
                   </pic:nvPicPr>
                   <pic:blipFill>
@@ -14192,16 +14210,16 @@
           <w:noProof/>
         </w:rPr>
         <w:drawing>
-          <wp:inline distT="0" distB="0" distL="0" distR="0" wp14:anchorId="3E151A02" wp14:editId="03C5A6F6">
+          <wp:inline distT="0" distB="0" distL="0" distR="0" wp14:anchorId="6E8B897D" wp14:editId="723B8554">
             <wp:extent cx="5120640" cy="1978034"/>
             <wp:effectExtent l="19050" t="19050" r="22860" b="22225"/>
-            <wp:docPr id="238851978" name="Imagem 40"/>
+            <wp:docPr id="837855432" name="Imagem 40"/>
             <wp:cNvGraphicFramePr/>
             <a:graphic xmlns:a="http://schemas.openxmlformats.org/drawingml/2006/main">
               <a:graphicData uri="http://schemas.openxmlformats.org/drawingml/2006/picture">
                 <pic:pic xmlns:pic="http://schemas.openxmlformats.org/drawingml/2006/picture">
                   <pic:nvPicPr>
-                    <pic:cNvPr id="238851978" name=""/>
+                    <pic:cNvPr id="837855432" name=""/>
                     <pic:cNvPicPr/>
                   </pic:nvPicPr>
                   <pic:blipFill>
@@ -14274,7 +14292,7 @@
           <w:sz w:val="34"/>
         </w:rPr>
       </w:pPr>
-      <w:bookmarkStart w:id="29" w:name="_Toc237269553"/>
+      <w:bookmarkStart w:id="29" w:name="_Toc237275185"/>
       <w:r>
         <w:rPr>
           <w:rFonts w:ascii="Montserrat" w:hAnsi="Montserrat"/>
@@ -14334,7 +14352,7 @@
           <w:sz w:val="27"/>
         </w:rPr>
       </w:pPr>
-      <w:bookmarkStart w:id="30" w:name="_Toc237269554"/>
+      <w:bookmarkStart w:id="30" w:name="_Toc237275186"/>
       <w:r>
         <w:rPr>
           <w:rFonts w:ascii="Montserrat" w:hAnsi="Montserrat"/>
@@ -14374,16 +14392,16 @@
           <w:noProof/>
         </w:rPr>
         <w:drawing>
-          <wp:inline distT="0" distB="0" distL="0" distR="0" wp14:anchorId="07BEED8F" wp14:editId="56EA1EDB">
+          <wp:inline distT="0" distB="0" distL="0" distR="0" wp14:anchorId="33CB38C1" wp14:editId="45B106F9">
             <wp:extent cx="5303520" cy="4792851"/>
             <wp:effectExtent l="19050" t="19050" r="11430" b="27305"/>
-            <wp:docPr id="1919948799" name="Imagem 41"/>
+            <wp:docPr id="1608272457" name="Imagem 41"/>
             <wp:cNvGraphicFramePr/>
             <a:graphic xmlns:a="http://schemas.openxmlformats.org/drawingml/2006/main">
               <a:graphicData uri="http://schemas.openxmlformats.org/drawingml/2006/picture">
                 <pic:pic xmlns:pic="http://schemas.openxmlformats.org/drawingml/2006/picture">
                   <pic:nvPicPr>
-                    <pic:cNvPr id="1919948799" name=""/>
+                    <pic:cNvPr id="1608272457" name=""/>
                     <pic:cNvPicPr/>
                   </pic:nvPicPr>
                   <pic:blipFill>
@@ -14452,7 +14470,7 @@
           <w:sz w:val="27"/>
         </w:rPr>
       </w:pPr>
-      <w:bookmarkStart w:id="31" w:name="_Toc237269555"/>
+      <w:bookmarkStart w:id="31" w:name="_Toc237275187"/>
       <w:r>
         <w:rPr>
           <w:rFonts w:ascii="Montserrat" w:hAnsi="Montserrat"/>
@@ -14492,16 +14510,16 @@
           <w:noProof/>
         </w:rPr>
         <w:drawing>
-          <wp:inline distT="0" distB="0" distL="0" distR="0" wp14:anchorId="5A7AFAFF" wp14:editId="4337DF4A">
+          <wp:inline distT="0" distB="0" distL="0" distR="0" wp14:anchorId="66E4CA6C" wp14:editId="7E053D0B">
             <wp:extent cx="5303520" cy="4792851"/>
             <wp:effectExtent l="19050" t="19050" r="11430" b="27305"/>
-            <wp:docPr id="1648439038" name="Imagem 42"/>
+            <wp:docPr id="1793515334" name="Imagem 42"/>
             <wp:cNvGraphicFramePr/>
             <a:graphic xmlns:a="http://schemas.openxmlformats.org/drawingml/2006/main">
               <a:graphicData uri="http://schemas.openxmlformats.org/drawingml/2006/picture">
                 <pic:pic xmlns:pic="http://schemas.openxmlformats.org/drawingml/2006/picture">
                   <pic:nvPicPr>
-                    <pic:cNvPr id="1648439038" name=""/>
+                    <pic:cNvPr id="1793515334" name=""/>
                     <pic:cNvPicPr/>
                   </pic:nvPicPr>
                   <pic:blipFill>
@@ -14569,7 +14587,7 @@
           <w:sz w:val="27"/>
         </w:rPr>
       </w:pPr>
-      <w:bookmarkStart w:id="32" w:name="_Toc237269556"/>
+      <w:bookmarkStart w:id="32" w:name="_Toc237275188"/>
       <w:r>
         <w:rPr>
           <w:rFonts w:ascii="Montserrat" w:hAnsi="Montserrat"/>
@@ -14610,16 +14628,16 @@
         </w:rPr>
         <w:lastRenderedPageBreak/>
         <w:drawing>
-          <wp:inline distT="0" distB="0" distL="0" distR="0" wp14:anchorId="010E6D85" wp14:editId="691EE7B4">
+          <wp:inline distT="0" distB="0" distL="0" distR="0" wp14:anchorId="0C09951F" wp14:editId="1FDB2BD8">
             <wp:extent cx="5303520" cy="4792851"/>
             <wp:effectExtent l="19050" t="19050" r="11430" b="27305"/>
-            <wp:docPr id="1682749042" name="Imagem 43"/>
+            <wp:docPr id="2040952628" name="Imagem 43"/>
             <wp:cNvGraphicFramePr/>
             <a:graphic xmlns:a="http://schemas.openxmlformats.org/drawingml/2006/main">
               <a:graphicData uri="http://schemas.openxmlformats.org/drawingml/2006/picture">
                 <pic:pic xmlns:pic="http://schemas.openxmlformats.org/drawingml/2006/picture">
                   <pic:nvPicPr>
-                    <pic:cNvPr id="1682749042" name=""/>
+                    <pic:cNvPr id="2040952628" name=""/>
                     <pic:cNvPicPr/>
                   </pic:nvPicPr>
                   <pic:blipFill>
@@ -14687,16 +14705,16 @@
         </w:rPr>
         <w:lastRenderedPageBreak/>
         <w:drawing>
-          <wp:inline distT="0" distB="0" distL="0" distR="0" wp14:anchorId="1B06DE7B" wp14:editId="33994076">
+          <wp:inline distT="0" distB="0" distL="0" distR="0" wp14:anchorId="11149FC2" wp14:editId="08C98A11">
             <wp:extent cx="5303520" cy="4792851"/>
             <wp:effectExtent l="19050" t="19050" r="11430" b="27305"/>
-            <wp:docPr id="132401071" name="Imagem 44"/>
+            <wp:docPr id="774389935" name="Imagem 44"/>
             <wp:cNvGraphicFramePr/>
             <a:graphic xmlns:a="http://schemas.openxmlformats.org/drawingml/2006/main">
               <a:graphicData uri="http://schemas.openxmlformats.org/drawingml/2006/picture">
                 <pic:pic xmlns:pic="http://schemas.openxmlformats.org/drawingml/2006/picture">
                   <pic:nvPicPr>
-                    <pic:cNvPr id="132401071" name=""/>
+                    <pic:cNvPr id="774389935" name=""/>
                     <pic:cNvPicPr/>
                   </pic:nvPicPr>
                   <pic:blipFill>
@@ -14789,7 +14807,7 @@
           <w:sz w:val="34"/>
         </w:rPr>
       </w:pPr>
-      <w:bookmarkStart w:id="33" w:name="_Toc237269557"/>
+      <w:bookmarkStart w:id="33" w:name="_Toc237275189"/>
       <w:r>
         <w:rPr>
           <w:rFonts w:ascii="Montserrat" w:hAnsi="Montserrat"/>
@@ -14831,7 +14849,7 @@
           <w:sz w:val="27"/>
         </w:rPr>
       </w:pPr>
-      <w:bookmarkStart w:id="34" w:name="_Toc237269558"/>
+      <w:bookmarkStart w:id="34" w:name="_Toc237275190"/>
       <w:r>
         <w:rPr>
           <w:rFonts w:ascii="Montserrat" w:hAnsi="Montserrat"/>
@@ -14871,16 +14889,16 @@
           <w:noProof/>
         </w:rPr>
         <w:drawing>
-          <wp:inline distT="0" distB="0" distL="0" distR="0" wp14:anchorId="674F415A" wp14:editId="321C9DFF">
+          <wp:inline distT="0" distB="0" distL="0" distR="0" wp14:anchorId="7E5FBC4F" wp14:editId="52FE5EFF">
             <wp:extent cx="5303520" cy="4792851"/>
             <wp:effectExtent l="19050" t="19050" r="11430" b="27305"/>
-            <wp:docPr id="848120981" name="Imagem 45"/>
+            <wp:docPr id="1775686316" name="Imagem 45"/>
             <wp:cNvGraphicFramePr/>
             <a:graphic xmlns:a="http://schemas.openxmlformats.org/drawingml/2006/main">
               <a:graphicData uri="http://schemas.openxmlformats.org/drawingml/2006/picture">
                 <pic:pic xmlns:pic="http://schemas.openxmlformats.org/drawingml/2006/picture">
                   <pic:nvPicPr>
-                    <pic:cNvPr id="848120981" name=""/>
+                    <pic:cNvPr id="1775686316" name=""/>
                     <pic:cNvPicPr/>
                   </pic:nvPicPr>
                   <pic:blipFill>
@@ -14987,6 +15005,45 @@
     </w:p>
     <w:p>
       <w:pPr>
+        <w:spacing w:line="280" w:lineRule="auto"/>
+        <w:rPr>
+          <w:rFonts w:ascii="Montserrat" w:hAnsi="Montserrat"/>
+          <w:color w:val="1A1A1A"/>
+          <w:sz w:val="22"/>
+        </w:rPr>
+      </w:pPr>
+      <w:r>
+        <w:rPr>
+          <w:rFonts w:ascii="Montserrat" w:hAnsi="Montserrat"/>
+          <w:color w:val="1A1A1A"/>
+          <w:sz w:val="22"/>
+        </w:rPr>
+        <w:t>Cada usuario ja cadastrado (menos o proprio Admin logado) tem um botao Remover na ultima coluna. Ao clicar, o sistema checa na hora se a pessoa faz parte da equipe de algum projeto, criou algum projeto, ou tem registro criado em seu nome em algum dos 9 formularios que gravam essa informacao. Se algum desses vinculos existir, a remocao e recusada e o Admin ve exatamente qual foi o motivo; caso contrario, pede confirmacao final antes de excluir o perfil.</w:t>
+      </w:r>
+    </w:p>
+    <w:p>
+      <w:pPr>
+        <w:spacing w:before="160" w:after="200"/>
+        <w:ind w:left="283"/>
+        <w:rPr>
+          <w:rFonts w:ascii="Montserrat" w:hAnsi="Montserrat"/>
+          <w:i/>
+          <w:color w:val="6A6A70"/>
+          <w:sz w:val="21"/>
+        </w:rPr>
+      </w:pPr>
+      <w:r>
+        <w:rPr>
+          <w:rFonts w:ascii="Montserrat" w:hAnsi="Montserrat"/>
+          <w:i/>
+          <w:color w:val="6A6A70"/>
+          <w:sz w:val="21"/>
+        </w:rPr>
+        <w:t>Remover aqui apaga so o perfil (papel, nome, telefone) do sistema - nao impede a pessoa de logar de novo depois; se logar, um perfil novo e criado do zero, com o papel padrao Solicitante. Os tres formularios que sao documentos unicos e compartilhados (Plano de Comunicacao, Relatorio de Situacao e Relatorio de Entregas) nao entram na checagem automatica, por nao terem o conceito de quem criou o registro.</w:t>
+      </w:r>
+    </w:p>
+    <w:p>
+      <w:pPr>
         <w:pStyle w:val="Ttulo2"/>
         <w:spacing w:before="320" w:after="120"/>
         <w:rPr>
@@ -14996,7 +15053,7 @@
           <w:sz w:val="27"/>
         </w:rPr>
       </w:pPr>
-      <w:bookmarkStart w:id="35" w:name="_Toc237269559"/>
+      <w:bookmarkStart w:id="35" w:name="_Toc237275191"/>
       <w:r>
         <w:rPr>
           <w:rFonts w:ascii="Montserrat" w:hAnsi="Montserrat"/>
@@ -15035,17 +15092,18 @@
         <w:rPr>
           <w:noProof/>
         </w:rPr>
+        <w:lastRenderedPageBreak/>
         <w:drawing>
-          <wp:inline distT="0" distB="0" distL="0" distR="0" wp14:anchorId="0A493F12" wp14:editId="7DAEA38C">
+          <wp:inline distT="0" distB="0" distL="0" distR="0" wp14:anchorId="107D012D" wp14:editId="151D1A33">
             <wp:extent cx="5303520" cy="4792851"/>
             <wp:effectExtent l="19050" t="19050" r="11430" b="27305"/>
-            <wp:docPr id="2076261799" name="Imagem 46"/>
+            <wp:docPr id="1749534442" name="Imagem 46"/>
             <wp:cNvGraphicFramePr/>
             <a:graphic xmlns:a="http://schemas.openxmlformats.org/drawingml/2006/main">
               <a:graphicData uri="http://schemas.openxmlformats.org/drawingml/2006/picture">
                 <pic:pic xmlns:pic="http://schemas.openxmlformats.org/drawingml/2006/picture">
                   <pic:nvPicPr>
-                    <pic:cNvPr id="2076261799" name=""/>
+                    <pic:cNvPr id="1749534442" name=""/>
                     <pic:cNvPicPr/>
                   </pic:nvPicPr>
                   <pic:blipFill>
@@ -15113,7 +15171,7 @@
           <w:sz w:val="27"/>
         </w:rPr>
       </w:pPr>
-      <w:bookmarkStart w:id="36" w:name="_Toc237269560"/>
+      <w:bookmarkStart w:id="36" w:name="_Toc237275192"/>
       <w:r>
         <w:rPr>
           <w:rFonts w:ascii="Montserrat" w:hAnsi="Montserrat"/>
@@ -15121,7 +15179,6 @@
           <w:color w:val="B91D2E"/>
           <w:sz w:val="27"/>
         </w:rPr>
-        <w:lastRenderedPageBreak/>
         <w:t>6.3 Configuracoes</w:t>
       </w:r>
       <w:bookmarkEnd w:id="36"/>
@@ -15153,17 +15210,18 @@
         <w:rPr>
           <w:noProof/>
         </w:rPr>
+        <w:lastRenderedPageBreak/>
         <w:drawing>
-          <wp:inline distT="0" distB="0" distL="0" distR="0" wp14:anchorId="437F52BE" wp14:editId="28B92363">
+          <wp:inline distT="0" distB="0" distL="0" distR="0" wp14:anchorId="5C5519B6" wp14:editId="7879E0DA">
             <wp:extent cx="5303520" cy="4792851"/>
             <wp:effectExtent l="19050" t="19050" r="11430" b="27305"/>
-            <wp:docPr id="1115473101" name="Imagem 47"/>
+            <wp:docPr id="77838370" name="Imagem 47"/>
             <wp:cNvGraphicFramePr/>
             <a:graphic xmlns:a="http://schemas.openxmlformats.org/drawingml/2006/main">
               <a:graphicData uri="http://schemas.openxmlformats.org/drawingml/2006/picture">
                 <pic:pic xmlns:pic="http://schemas.openxmlformats.org/drawingml/2006/picture">
                   <pic:nvPicPr>
-                    <pic:cNvPr id="1115473101" name=""/>
+                    <pic:cNvPr id="77838370" name=""/>
                     <pic:cNvPicPr/>
                   </pic:nvPicPr>
                   <pic:blipFill>
@@ -15231,7 +15289,7 @@
           <w:sz w:val="27"/>
         </w:rPr>
       </w:pPr>
-      <w:bookmarkStart w:id="37" w:name="_Toc237269561"/>
+      <w:bookmarkStart w:id="37" w:name="_Toc237275193"/>
       <w:r>
         <w:rPr>
           <w:rFonts w:ascii="Montserrat" w:hAnsi="Montserrat"/>
@@ -15306,7 +15364,6 @@
           <w:color w:val="1A1A1A"/>
           <w:sz w:val="22"/>
         </w:rPr>
-        <w:lastRenderedPageBreak/>
         <w:t>Governanca (dados do Relatorio de Situacao - secao 4.1): quantidade de Entraves e Encaminhamentos ainda Aberto, e quantos Resultados alcancados ja foram registrados.</w:t>
       </w:r>
     </w:p>
@@ -15331,7 +15388,16 @@
           <w:color w:val="1A1A1A"/>
           <w:sz w:val="22"/>
         </w:rPr>
-        <w:t>Registros por formulario: uma linha por artefato (Canvas, TAP, Planejamento, EAP, SMP, Ata de Reuniao, TEP, RLA, alem da propria Solicitacao de Demanda), com o total e a contagem por status de cada um.</w:t>
+        <w:t xml:space="preserve">Registros por formulario: uma linha por artefato (Canvas, TAP, Planejamento, EAP, SMP, Ata de Reuniao, TEP, RLA, alem da propria </w:t>
+      </w:r>
+      <w:r>
+        <w:rPr>
+          <w:rFonts w:ascii="Montserrat" w:hAnsi="Montserrat"/>
+          <w:color w:val="1A1A1A"/>
+          <w:sz w:val="22"/>
+        </w:rPr>
+        <w:lastRenderedPageBreak/>
+        <w:t>Solicitacao de Demanda), com o total e a contagem por status de cada um.</w:t>
       </w:r>
     </w:p>
     <w:p>
@@ -15368,16 +15434,16 @@
           <w:noProof/>
         </w:rPr>
         <w:drawing>
-          <wp:inline distT="0" distB="0" distL="0" distR="0" wp14:anchorId="759072D0" wp14:editId="06A0D548">
+          <wp:inline distT="0" distB="0" distL="0" distR="0" wp14:anchorId="1EE7DC3C" wp14:editId="776099F6">
             <wp:extent cx="5303520" cy="4267180"/>
             <wp:effectExtent l="19050" t="19050" r="11430" b="19685"/>
-            <wp:docPr id="1132561298" name="Imagem 48"/>
+            <wp:docPr id="1195482328" name="Imagem 48"/>
             <wp:cNvGraphicFramePr/>
             <a:graphic xmlns:a="http://schemas.openxmlformats.org/drawingml/2006/main">
               <a:graphicData uri="http://schemas.openxmlformats.org/drawingml/2006/picture">
                 <pic:pic xmlns:pic="http://schemas.openxmlformats.org/drawingml/2006/picture">
                   <pic:nvPicPr>
-                    <pic:cNvPr id="1132561298" name=""/>
+                    <pic:cNvPr id="1195482328" name=""/>
                     <pic:cNvPicPr/>
                   </pic:nvPicPr>
                   <pic:blipFill>
@@ -15445,16 +15511,16 @@
         </w:rPr>
         <w:lastRenderedPageBreak/>
         <w:drawing>
-          <wp:inline distT="0" distB="0" distL="0" distR="0" wp14:anchorId="53CE758D" wp14:editId="3613F39F">
+          <wp:inline distT="0" distB="0" distL="0" distR="0" wp14:anchorId="40E1DF8A" wp14:editId="7793495D">
             <wp:extent cx="5303520" cy="3962338"/>
             <wp:effectExtent l="19050" t="19050" r="11430" b="19685"/>
-            <wp:docPr id="551644405" name="Imagem 49"/>
+            <wp:docPr id="1870823324" name="Imagem 49"/>
             <wp:cNvGraphicFramePr/>
             <a:graphic xmlns:a="http://schemas.openxmlformats.org/drawingml/2006/main">
               <a:graphicData uri="http://schemas.openxmlformats.org/drawingml/2006/picture">
                 <pic:pic xmlns:pic="http://schemas.openxmlformats.org/drawingml/2006/picture">
                   <pic:nvPicPr>
-                    <pic:cNvPr id="551644405" name=""/>
+                    <pic:cNvPr id="1870823324" name=""/>
                     <pic:cNvPicPr/>
                   </pic:nvPicPr>
                   <pic:blipFill>
@@ -15547,7 +15613,7 @@
           <w:sz w:val="34"/>
         </w:rPr>
       </w:pPr>
-      <w:bookmarkStart w:id="38" w:name="_Toc237269562"/>
+      <w:bookmarkStart w:id="38" w:name="_Toc237275194"/>
       <w:r>
         <w:rPr>
           <w:rFonts w:ascii="Montserrat" w:hAnsi="Montserrat"/>
@@ -15791,7 +15857,7 @@
           <w:sz w:val="34"/>
         </w:rPr>
       </w:pPr>
-      <w:bookmarkStart w:id="39" w:name="_Toc237269563"/>
+      <w:bookmarkStart w:id="39" w:name="_Toc237275195"/>
       <w:r>
         <w:rPr>
           <w:rFonts w:ascii="Montserrat" w:hAnsi="Montserrat"/>
@@ -17579,7 +17645,7 @@
 <file path=word/numbering.xml><?xml version="1.0" encoding="utf-8"?>
 <w:numbering xmlns:wpc="http://schemas.microsoft.com/office/word/2010/wordprocessingCanvas" xmlns:cx="http://schemas.microsoft.com/office/drawing/2014/chartex" xmlns:cx1="http://schemas.microsoft.com/office/drawing/2015/9/8/chartex" xmlns:cx2="http://schemas.microsoft.com/office/drawing/2015/10/21/chartex" xmlns:cx3="http://schemas.microsoft.com/office/drawing/2016/5/9/chartex" xmlns:cx4="http://schemas.microsoft.com/office/drawing/2016/5/10/chartex" xmlns:cx5="http://schemas.microsoft.com/office/drawing/2016/5/11/chartex" xmlns:cx6="http://schemas.microsoft.com/office/drawing/2016/5/12/chartex" xmlns:cx7="http://schemas.microsoft.com/office/drawing/2016/5/13/chartex" xmlns:cx8="http://schemas.microsoft.com/office/drawing/2016/5/14/chartex" xmlns:mc="http://schemas.openxmlformats.org/markup-compatibility/2006" xmlns:aink="http://schemas.microsoft.com/office/drawing/2016/ink" xmlns:am3d="http://schemas.microsoft.com/office/drawing/2017/model3d" xmlns:o="urn:schemas-microsoft-com:office:office" xmlns:oel="http://schemas.microsoft.com/office/2019/extlst" xmlns:r="http://schemas.openxmlformats.org/officeDocument/2006/relationships" xmlns:m="http://schemas.openxmlformats.org/officeDocument/2006/math" xmlns:v="urn:schemas-microsoft-com:vml" xmlns:wp14="http://schemas.microsoft.com/office/word/2010/wordprocessingDrawing" xmlns:wp="http://schemas.openxmlformats.org/drawingml/2006/wordprocessingDrawing" xmlns:w10="urn:schemas-microsoft-com:office:word" xmlns:w="http://schemas.openxmlformats.org/wordprocessingml/2006/main" xmlns:w14="http://schemas.microsoft.com/office/word/2010/wordml" xmlns:w15="http://schemas.microsoft.com/office/word/2012/wordml" xmlns:w16cei="http://schemas.microsoft.com/office/word/2026/wordml/cei" xmlns:w16cex="http://schemas.microsoft.com/office/word/2018/wordml/cex" xmlns:w16cid="http://schemas.microsoft.com/office/word/2016/wordml/cid" xmlns:w16="http://schemas.microsoft.com/office/word/2018/wordml" xmlns:w16du="http://schemas.microsoft.com/office/word/2023/wordml/word16du" xmlns:w16sdtdh="http://schemas.microsoft.com/office/word/2020/wordml/sdtdatahash" xmlns:w16sdtfl="http://schemas.microsoft.com/office/word/2024/wordml/sdtformatlock" xmlns:w16se="http://schemas.microsoft.com/office/word/2015/wordml/symex" xmlns:wpg="http://schemas.microsoft.com/office/word/2010/wordprocessingGroup" xmlns:wpi="http://schemas.microsoft.com/office/word/2010/wordprocessingInk" xmlns:wne="http://schemas.microsoft.com/office/word/2006/wordml" xmlns:wps="http://schemas.microsoft.com/office/word/2010/wordprocessingShape" mc:Ignorable="w14 w15 w16se w16cid w16 w16cex w16sdtdh w16sdtfl w16du wp14">
   <w:abstractNum w:abstractNumId="0" w15:restartNumberingAfterBreak="0">
-    <w:nsid w:val="048C276A"/>
+    <w:nsid w:val="06B63372"/>
     <w:multiLevelType w:val="singleLevel"/>
     <w:tmpl w:val="04160001"/>
     <w:lvl w:ilvl="0">
@@ -17596,7 +17662,7 @@
     </w:lvl>
   </w:abstractNum>
   <w:abstractNum w:abstractNumId="1" w15:restartNumberingAfterBreak="0">
-    <w:nsid w:val="05705C61"/>
+    <w:nsid w:val="09EA0BE9"/>
     <w:multiLevelType w:val="singleLevel"/>
     <w:tmpl w:val="04160001"/>
     <w:lvl w:ilvl="0">
@@ -17613,7 +17679,7 @@
     </w:lvl>
   </w:abstractNum>
   <w:abstractNum w:abstractNumId="2" w15:restartNumberingAfterBreak="0">
-    <w:nsid w:val="0BB42FB8"/>
+    <w:nsid w:val="0C8A4DD2"/>
     <w:multiLevelType w:val="singleLevel"/>
     <w:tmpl w:val="04160001"/>
     <w:lvl w:ilvl="0">
@@ -17630,7 +17696,7 @@
     </w:lvl>
   </w:abstractNum>
   <w:abstractNum w:abstractNumId="3" w15:restartNumberingAfterBreak="0">
-    <w:nsid w:val="145F266C"/>
+    <w:nsid w:val="0E1B4512"/>
     <w:multiLevelType w:val="singleLevel"/>
     <w:tmpl w:val="04160001"/>
     <w:lvl w:ilvl="0">
@@ -17647,7 +17713,7 @@
     </w:lvl>
   </w:abstractNum>
   <w:abstractNum w:abstractNumId="4" w15:restartNumberingAfterBreak="0">
-    <w:nsid w:val="209D6914"/>
+    <w:nsid w:val="1AA96B7D"/>
     <w:multiLevelType w:val="singleLevel"/>
     <w:tmpl w:val="04160001"/>
     <w:lvl w:ilvl="0">
@@ -17664,7 +17730,7 @@
     </w:lvl>
   </w:abstractNum>
   <w:abstractNum w:abstractNumId="5" w15:restartNumberingAfterBreak="0">
-    <w:nsid w:val="21BC60E6"/>
+    <w:nsid w:val="1DFB53E0"/>
     <w:multiLevelType w:val="singleLevel"/>
     <w:tmpl w:val="04160001"/>
     <w:lvl w:ilvl="0">
@@ -17681,7 +17747,7 @@
     </w:lvl>
   </w:abstractNum>
   <w:abstractNum w:abstractNumId="6" w15:restartNumberingAfterBreak="0">
-    <w:nsid w:val="21D400A6"/>
+    <w:nsid w:val="2C556752"/>
     <w:multiLevelType w:val="singleLevel"/>
     <w:tmpl w:val="04160001"/>
     <w:lvl w:ilvl="0">
@@ -17698,7 +17764,7 @@
     </w:lvl>
   </w:abstractNum>
   <w:abstractNum w:abstractNumId="7" w15:restartNumberingAfterBreak="0">
-    <w:nsid w:val="2CF313AE"/>
+    <w:nsid w:val="37835443"/>
     <w:multiLevelType w:val="singleLevel"/>
     <w:tmpl w:val="04160001"/>
     <w:lvl w:ilvl="0">
@@ -17715,7 +17781,7 @@
     </w:lvl>
   </w:abstractNum>
   <w:abstractNum w:abstractNumId="8" w15:restartNumberingAfterBreak="0">
-    <w:nsid w:val="3D6C2357"/>
+    <w:nsid w:val="3BA55EA0"/>
     <w:multiLevelType w:val="singleLevel"/>
     <w:tmpl w:val="04160001"/>
     <w:lvl w:ilvl="0">
@@ -17732,7 +17798,7 @@
     </w:lvl>
   </w:abstractNum>
   <w:abstractNum w:abstractNumId="9" w15:restartNumberingAfterBreak="0">
-    <w:nsid w:val="45E06D26"/>
+    <w:nsid w:val="3BD04CDF"/>
     <w:multiLevelType w:val="singleLevel"/>
     <w:tmpl w:val="04160001"/>
     <w:lvl w:ilvl="0">
@@ -17749,7 +17815,7 @@
     </w:lvl>
   </w:abstractNum>
   <w:abstractNum w:abstractNumId="10" w15:restartNumberingAfterBreak="0">
-    <w:nsid w:val="4F2C1F15"/>
+    <w:nsid w:val="54C723D5"/>
     <w:multiLevelType w:val="singleLevel"/>
     <w:tmpl w:val="04160001"/>
     <w:lvl w:ilvl="0">
@@ -17766,7 +17832,7 @@
     </w:lvl>
   </w:abstractNum>
   <w:abstractNum w:abstractNumId="11" w15:restartNumberingAfterBreak="0">
-    <w:nsid w:val="4FA536A5"/>
+    <w:nsid w:val="5D5F5B77"/>
     <w:multiLevelType w:val="singleLevel"/>
     <w:tmpl w:val="04160001"/>
     <w:lvl w:ilvl="0">
@@ -17783,7 +17849,7 @@
     </w:lvl>
   </w:abstractNum>
   <w:abstractNum w:abstractNumId="12" w15:restartNumberingAfterBreak="0">
-    <w:nsid w:val="50093186"/>
+    <w:nsid w:val="607354D9"/>
     <w:multiLevelType w:val="singleLevel"/>
     <w:tmpl w:val="04160001"/>
     <w:lvl w:ilvl="0">
@@ -17800,7 +17866,7 @@
     </w:lvl>
   </w:abstractNum>
   <w:abstractNum w:abstractNumId="13" w15:restartNumberingAfterBreak="0">
-    <w:nsid w:val="586316F0"/>
+    <w:nsid w:val="618A3B58"/>
     <w:multiLevelType w:val="singleLevel"/>
     <w:tmpl w:val="04160001"/>
     <w:lvl w:ilvl="0">
@@ -17817,7 +17883,7 @@
     </w:lvl>
   </w:abstractNum>
   <w:abstractNum w:abstractNumId="14" w15:restartNumberingAfterBreak="0">
-    <w:nsid w:val="5B017720"/>
+    <w:nsid w:val="639518BC"/>
     <w:multiLevelType w:val="singleLevel"/>
     <w:tmpl w:val="04160001"/>
     <w:lvl w:ilvl="0">
@@ -17834,7 +17900,7 @@
     </w:lvl>
   </w:abstractNum>
   <w:abstractNum w:abstractNumId="15" w15:restartNumberingAfterBreak="0">
-    <w:nsid w:val="641B2C97"/>
+    <w:nsid w:val="6EDB1AA8"/>
     <w:multiLevelType w:val="singleLevel"/>
     <w:tmpl w:val="04160001"/>
     <w:lvl w:ilvl="0">
@@ -17851,7 +17917,7 @@
     </w:lvl>
   </w:abstractNum>
   <w:abstractNum w:abstractNumId="16" w15:restartNumberingAfterBreak="0">
-    <w:nsid w:val="67352CD7"/>
+    <w:nsid w:val="72C53BC1"/>
     <w:multiLevelType w:val="singleLevel"/>
     <w:tmpl w:val="04160001"/>
     <w:lvl w:ilvl="0">
@@ -17868,7 +17934,7 @@
     </w:lvl>
   </w:abstractNum>
   <w:abstractNum w:abstractNumId="17" w15:restartNumberingAfterBreak="0">
-    <w:nsid w:val="74791087"/>
+    <w:nsid w:val="7E263B56"/>
     <w:multiLevelType w:val="singleLevel"/>
     <w:tmpl w:val="04160001"/>
     <w:lvl w:ilvl="0">
@@ -17884,59 +17950,59 @@
       </w:rPr>
     </w:lvl>
   </w:abstractNum>
-  <w:num w:numId="1" w16cid:durableId="1940134904">
+  <w:num w:numId="1" w16cid:durableId="1466461488">
+    <w:abstractNumId w:val="1"/>
+  </w:num>
+  <w:num w:numId="2" w16cid:durableId="1426728085">
+    <w:abstractNumId w:val="5"/>
+  </w:num>
+  <w:num w:numId="3" w16cid:durableId="142937348">
+    <w:abstractNumId w:val="16"/>
+  </w:num>
+  <w:num w:numId="4" w16cid:durableId="1473593845">
+    <w:abstractNumId w:val="4"/>
+  </w:num>
+  <w:num w:numId="5" w16cid:durableId="1091121227">
+    <w:abstractNumId w:val="15"/>
+  </w:num>
+  <w:num w:numId="6" w16cid:durableId="1068528703">
+    <w:abstractNumId w:val="14"/>
+  </w:num>
+  <w:num w:numId="7" w16cid:durableId="485249633">
+    <w:abstractNumId w:val="2"/>
+  </w:num>
+  <w:num w:numId="8" w16cid:durableId="1336958455">
+    <w:abstractNumId w:val="3"/>
+  </w:num>
+  <w:num w:numId="9" w16cid:durableId="2125733876">
+    <w:abstractNumId w:val="0"/>
+  </w:num>
+  <w:num w:numId="10" w16cid:durableId="1115951080">
+    <w:abstractNumId w:val="12"/>
+  </w:num>
+  <w:num w:numId="11" w16cid:durableId="2139494036">
+    <w:abstractNumId w:val="11"/>
+  </w:num>
+  <w:num w:numId="12" w16cid:durableId="775831248">
+    <w:abstractNumId w:val="17"/>
+  </w:num>
+  <w:num w:numId="13" w16cid:durableId="503476316">
+    <w:abstractNumId w:val="9"/>
+  </w:num>
+  <w:num w:numId="14" w16cid:durableId="595359138">
+    <w:abstractNumId w:val="6"/>
+  </w:num>
+  <w:num w:numId="15" w16cid:durableId="249051060">
     <w:abstractNumId w:val="7"/>
   </w:num>
-  <w:num w:numId="2" w16cid:durableId="309140785">
-    <w:abstractNumId w:val="3"/>
+  <w:num w:numId="16" w16cid:durableId="1624189195">
+    <w:abstractNumId w:val="10"/>
   </w:num>
-  <w:num w:numId="3" w16cid:durableId="54670809">
-    <w:abstractNumId w:val="0"/>
-  </w:num>
-  <w:num w:numId="4" w16cid:durableId="2078354316">
-    <w:abstractNumId w:val="14"/>
-  </w:num>
-  <w:num w:numId="5" w16cid:durableId="117573213">
-    <w:abstractNumId w:val="12"/>
-  </w:num>
-  <w:num w:numId="6" w16cid:durableId="1164513014">
-    <w:abstractNumId w:val="4"/>
-  </w:num>
-  <w:num w:numId="7" w16cid:durableId="1316300471">
-    <w:abstractNumId w:val="17"/>
-  </w:num>
-  <w:num w:numId="8" w16cid:durableId="1094588119">
-    <w:abstractNumId w:val="15"/>
-  </w:num>
-  <w:num w:numId="9" w16cid:durableId="210657565">
-    <w:abstractNumId w:val="16"/>
-  </w:num>
-  <w:num w:numId="10" w16cid:durableId="1412892013">
+  <w:num w:numId="17" w16cid:durableId="360208111">
     <w:abstractNumId w:val="13"/>
   </w:num>
-  <w:num w:numId="11" w16cid:durableId="2058698202">
-    <w:abstractNumId w:val="5"/>
-  </w:num>
-  <w:num w:numId="12" w16cid:durableId="521748368">
+  <w:num w:numId="18" w16cid:durableId="519776756">
     <w:abstractNumId w:val="8"/>
-  </w:num>
-  <w:num w:numId="13" w16cid:durableId="1300458706">
-    <w:abstractNumId w:val="2"/>
-  </w:num>
-  <w:num w:numId="14" w16cid:durableId="62265695">
-    <w:abstractNumId w:val="1"/>
-  </w:num>
-  <w:num w:numId="15" w16cid:durableId="1179856490">
-    <w:abstractNumId w:val="10"/>
-  </w:num>
-  <w:num w:numId="16" w16cid:durableId="297230324">
-    <w:abstractNumId w:val="11"/>
-  </w:num>
-  <w:num w:numId="17" w16cid:durableId="1752197071">
-    <w:abstractNumId w:val="9"/>
-  </w:num>
-  <w:num w:numId="18" w16cid:durableId="1089041473">
-    <w:abstractNumId w:val="6"/>
   </w:num>
 </w:numbering>
 </file>
@@ -18349,7 +18415,7 @@
     <w:link w:val="Ttulo1Char"/>
     <w:uiPriority w:val="9"/>
     <w:qFormat/>
-    <w:rsid w:val="00FE3247"/>
+    <w:rsid w:val="000B26D7"/>
     <w:pPr>
       <w:keepNext/>
       <w:keepLines/>
@@ -18371,7 +18437,7 @@
     <w:uiPriority w:val="9"/>
     <w:unhideWhenUsed/>
     <w:qFormat/>
-    <w:rsid w:val="00FE3247"/>
+    <w:rsid w:val="000B26D7"/>
     <w:pPr>
       <w:keepNext/>
       <w:keepLines/>
@@ -18394,7 +18460,7 @@
     <w:semiHidden/>
     <w:unhideWhenUsed/>
     <w:qFormat/>
-    <w:rsid w:val="00FE3247"/>
+    <w:rsid w:val="000B26D7"/>
     <w:pPr>
       <w:keepNext/>
       <w:keepLines/>
@@ -18417,7 +18483,7 @@
     <w:semiHidden/>
     <w:unhideWhenUsed/>
     <w:qFormat/>
-    <w:rsid w:val="00FE3247"/>
+    <w:rsid w:val="000B26D7"/>
     <w:pPr>
       <w:keepNext/>
       <w:keepLines/>
@@ -18440,7 +18506,7 @@
     <w:semiHidden/>
     <w:unhideWhenUsed/>
     <w:qFormat/>
-    <w:rsid w:val="00FE3247"/>
+    <w:rsid w:val="000B26D7"/>
     <w:pPr>
       <w:keepNext/>
       <w:keepLines/>
@@ -18461,7 +18527,7 @@
     <w:semiHidden/>
     <w:unhideWhenUsed/>
     <w:qFormat/>
-    <w:rsid w:val="00FE3247"/>
+    <w:rsid w:val="000B26D7"/>
     <w:pPr>
       <w:keepNext/>
       <w:keepLines/>
@@ -18484,7 +18550,7 @@
     <w:semiHidden/>
     <w:unhideWhenUsed/>
     <w:qFormat/>
-    <w:rsid w:val="00FE3247"/>
+    <w:rsid w:val="000B26D7"/>
     <w:pPr>
       <w:keepNext/>
       <w:keepLines/>
@@ -18505,7 +18571,7 @@
     <w:semiHidden/>
     <w:unhideWhenUsed/>
     <w:qFormat/>
-    <w:rsid w:val="00FE3247"/>
+    <w:rsid w:val="000B26D7"/>
     <w:pPr>
       <w:keepNext/>
       <w:keepLines/>
@@ -18528,7 +18594,7 @@
     <w:semiHidden/>
     <w:unhideWhenUsed/>
     <w:qFormat/>
-    <w:rsid w:val="00FE3247"/>
+    <w:rsid w:val="000B26D7"/>
     <w:pPr>
       <w:keepNext/>
       <w:keepLines/>
@@ -18572,7 +18638,7 @@
     <w:basedOn w:val="Fontepargpadro"/>
     <w:link w:val="Ttulo1"/>
     <w:uiPriority w:val="9"/>
-    <w:rsid w:val="00FE3247"/>
+    <w:rsid w:val="000B26D7"/>
     <w:rPr>
       <w:rFonts w:asciiTheme="majorHAnsi" w:eastAsiaTheme="majorEastAsia" w:hAnsiTheme="majorHAnsi" w:cstheme="majorBidi"/>
       <w:color w:val="0F4761" w:themeColor="accent1" w:themeShade="BF"/>
@@ -18585,7 +18651,7 @@
     <w:basedOn w:val="Fontepargpadro"/>
     <w:link w:val="Ttulo2"/>
     <w:uiPriority w:val="9"/>
-    <w:rsid w:val="00FE3247"/>
+    <w:rsid w:val="000B26D7"/>
     <w:rPr>
       <w:rFonts w:asciiTheme="majorHAnsi" w:eastAsiaTheme="majorEastAsia" w:hAnsiTheme="majorHAnsi" w:cstheme="majorBidi"/>
       <w:color w:val="0F4761" w:themeColor="accent1" w:themeShade="BF"/>
@@ -18599,7 +18665,7 @@
     <w:link w:val="Ttulo3"/>
     <w:uiPriority w:val="9"/>
     <w:semiHidden/>
-    <w:rsid w:val="00FE3247"/>
+    <w:rsid w:val="000B26D7"/>
     <w:rPr>
       <w:rFonts w:eastAsiaTheme="majorEastAsia" w:cstheme="majorBidi"/>
       <w:color w:val="0F4761" w:themeColor="accent1" w:themeShade="BF"/>
@@ -18613,7 +18679,7 @@
     <w:link w:val="Ttulo4"/>
     <w:uiPriority w:val="9"/>
     <w:semiHidden/>
-    <w:rsid w:val="00FE3247"/>
+    <w:rsid w:val="000B26D7"/>
     <w:rPr>
       <w:rFonts w:eastAsiaTheme="majorEastAsia" w:cstheme="majorBidi"/>
       <w:i/>
@@ -18627,7 +18693,7 @@
     <w:link w:val="Ttulo5"/>
     <w:uiPriority w:val="9"/>
     <w:semiHidden/>
-    <w:rsid w:val="00FE3247"/>
+    <w:rsid w:val="000B26D7"/>
     <w:rPr>
       <w:rFonts w:eastAsiaTheme="majorEastAsia" w:cstheme="majorBidi"/>
       <w:color w:val="0F4761" w:themeColor="accent1" w:themeShade="BF"/>
@@ -18639,7 +18705,7 @@
     <w:link w:val="Ttulo6"/>
     <w:uiPriority w:val="9"/>
     <w:semiHidden/>
-    <w:rsid w:val="00FE3247"/>
+    <w:rsid w:val="000B26D7"/>
     <w:rPr>
       <w:rFonts w:eastAsiaTheme="majorEastAsia" w:cstheme="majorBidi"/>
       <w:i/>
@@ -18653,7 +18719,7 @@
     <w:link w:val="Ttulo7"/>
     <w:uiPriority w:val="9"/>
     <w:semiHidden/>
-    <w:rsid w:val="00FE3247"/>
+    <w:rsid w:val="000B26D7"/>
     <w:rPr>
       <w:rFonts w:eastAsiaTheme="majorEastAsia" w:cstheme="majorBidi"/>
       <w:color w:val="595959" w:themeColor="text1" w:themeTint="A6"/>
@@ -18665,7 +18731,7 @@
     <w:link w:val="Ttulo8"/>
     <w:uiPriority w:val="9"/>
     <w:semiHidden/>
-    <w:rsid w:val="00FE3247"/>
+    <w:rsid w:val="000B26D7"/>
     <w:rPr>
       <w:rFonts w:eastAsiaTheme="majorEastAsia" w:cstheme="majorBidi"/>
       <w:i/>
@@ -18679,7 +18745,7 @@
     <w:link w:val="Ttulo9"/>
     <w:uiPriority w:val="9"/>
     <w:semiHidden/>
-    <w:rsid w:val="00FE3247"/>
+    <w:rsid w:val="000B26D7"/>
     <w:rPr>
       <w:rFonts w:eastAsiaTheme="majorEastAsia" w:cstheme="majorBidi"/>
       <w:color w:val="272727" w:themeColor="text1" w:themeTint="D8"/>
@@ -18692,7 +18758,7 @@
     <w:link w:val="TtuloChar"/>
     <w:uiPriority w:val="10"/>
     <w:qFormat/>
-    <w:rsid w:val="00FE3247"/>
+    <w:rsid w:val="000B26D7"/>
     <w:pPr>
       <w:spacing w:after="80" w:line="240" w:lineRule="auto"/>
       <w:contextualSpacing/>
@@ -18710,7 +18776,7 @@
     <w:basedOn w:val="Fontepargpadro"/>
     <w:link w:val="Ttulo"/>
     <w:uiPriority w:val="10"/>
-    <w:rsid w:val="00FE3247"/>
+    <w:rsid w:val="000B26D7"/>
     <w:rPr>
       <w:rFonts w:asciiTheme="majorHAnsi" w:eastAsiaTheme="majorEastAsia" w:hAnsiTheme="majorHAnsi" w:cstheme="majorBidi"/>
       <w:spacing w:val="-10"/>
@@ -18726,7 +18792,7 @@
     <w:link w:val="SubttuloChar"/>
     <w:uiPriority w:val="11"/>
     <w:qFormat/>
-    <w:rsid w:val="00FE3247"/>
+    <w:rsid w:val="000B26D7"/>
     <w:pPr>
       <w:numPr>
         <w:ilvl w:val="1"/>
@@ -18745,7 +18811,7 @@
     <w:basedOn w:val="Fontepargpadro"/>
     <w:link w:val="Subttulo"/>
     <w:uiPriority w:val="11"/>
-    <w:rsid w:val="00FE3247"/>
+    <w:rsid w:val="000B26D7"/>
     <w:rPr>
       <w:rFonts w:eastAsiaTheme="majorEastAsia" w:cstheme="majorBidi"/>
       <w:color w:val="595959" w:themeColor="text1" w:themeTint="A6"/>
@@ -18761,7 +18827,7 @@
     <w:link w:val="CitaoChar"/>
     <w:uiPriority w:val="29"/>
     <w:qFormat/>
-    <w:rsid w:val="00FE3247"/>
+    <w:rsid w:val="000B26D7"/>
     <w:pPr>
       <w:spacing w:before="160"/>
       <w:jc w:val="center"/>
@@ -18777,7 +18843,7 @@
     <w:basedOn w:val="Fontepargpadro"/>
     <w:link w:val="Citao"/>
     <w:uiPriority w:val="29"/>
-    <w:rsid w:val="00FE3247"/>
+    <w:rsid w:val="000B26D7"/>
     <w:rPr>
       <w:i/>
       <w:iCs/>
@@ -18789,7 +18855,7 @@
     <w:basedOn w:val="Normal"/>
     <w:uiPriority w:val="34"/>
     <w:qFormat/>
-    <w:rsid w:val="00FE3247"/>
+    <w:rsid w:val="000B26D7"/>
     <w:pPr>
       <w:ind w:left="720"/>
       <w:contextualSpacing/>
@@ -18800,7 +18866,7 @@
     <w:basedOn w:val="Fontepargpadro"/>
     <w:uiPriority w:val="21"/>
     <w:qFormat/>
-    <w:rsid w:val="00FE3247"/>
+    <w:rsid w:val="000B26D7"/>
     <w:rPr>
       <w:i/>
       <w:iCs/>
@@ -18814,7 +18880,7 @@
     <w:link w:val="CitaoIntensaChar"/>
     <w:uiPriority w:val="30"/>
     <w:qFormat/>
-    <w:rsid w:val="00FE3247"/>
+    <w:rsid w:val="000B26D7"/>
     <w:pPr>
       <w:pBdr>
         <w:top w:val="single" w:sz="4" w:space="10" w:color="0F4761" w:themeColor="accent1" w:themeShade="BF"/>
@@ -18835,7 +18901,7 @@
     <w:basedOn w:val="Fontepargpadro"/>
     <w:link w:val="CitaoIntensa"/>
     <w:uiPriority w:val="30"/>
-    <w:rsid w:val="00FE3247"/>
+    <w:rsid w:val="000B26D7"/>
     <w:rPr>
       <w:i/>
       <w:iCs/>
@@ -18847,7 +18913,7 @@
     <w:basedOn w:val="Fontepargpadro"/>
     <w:uiPriority w:val="32"/>
     <w:qFormat/>
-    <w:rsid w:val="00FE3247"/>
+    <w:rsid w:val="000B26D7"/>
     <w:rPr>
       <w:b/>
       <w:bCs/>
@@ -18862,7 +18928,7 @@
     <w:link w:val="CabealhoChar"/>
     <w:uiPriority w:val="99"/>
     <w:unhideWhenUsed/>
-    <w:rsid w:val="00FE3247"/>
+    <w:rsid w:val="000B26D7"/>
     <w:pPr>
       <w:tabs>
         <w:tab w:val="center" w:pos="4252"/>
@@ -18876,7 +18942,7 @@
     <w:basedOn w:val="Fontepargpadro"/>
     <w:link w:val="Cabealho"/>
     <w:uiPriority w:val="99"/>
-    <w:rsid w:val="00FE3247"/>
+    <w:rsid w:val="000B26D7"/>
   </w:style>
   <w:style w:type="paragraph" w:styleId="Rodap">
     <w:name w:val="footer"/>
@@ -18884,7 +18950,7 @@
     <w:link w:val="RodapChar"/>
     <w:uiPriority w:val="99"/>
     <w:unhideWhenUsed/>
-    <w:rsid w:val="00FE3247"/>
+    <w:rsid w:val="000B26D7"/>
     <w:pPr>
       <w:tabs>
         <w:tab w:val="center" w:pos="4252"/>
@@ -18898,7 +18964,7 @@
     <w:basedOn w:val="Fontepargpadro"/>
     <w:link w:val="Rodap"/>
     <w:uiPriority w:val="99"/>
-    <w:rsid w:val="00FE3247"/>
+    <w:rsid w:val="000B26D7"/>
   </w:style>
   <w:style w:type="paragraph" w:styleId="Sumrio1">
     <w:name w:val="toc 1"/>
@@ -18907,7 +18973,7 @@
     <w:autoRedefine/>
     <w:uiPriority w:val="39"/>
     <w:unhideWhenUsed/>
-    <w:rsid w:val="00FE3247"/>
+    <w:rsid w:val="000B26D7"/>
     <w:pPr>
       <w:spacing w:after="100"/>
     </w:pPr>
@@ -18919,7 +18985,7 @@
     <w:autoRedefine/>
     <w:uiPriority w:val="39"/>
     <w:unhideWhenUsed/>
-    <w:rsid w:val="00FE3247"/>
+    <w:rsid w:val="000B26D7"/>
     <w:pPr>
       <w:spacing w:after="100"/>
       <w:ind w:left="240"/>

</xml_diff>

<commit_message>
Permite ao Admin restringir por papel quem vê Painel Executivo e relatórios
Adiciona em Administração > Configurações três grupos de caixas de
seleção (multi-papel) controlando quem pode ver o Painel Executivo, o
Relatório de Situação de Projetos e o Relatório de Entregas e
Benefícios. Painel Executivo começa configurado só para Admin (mesmo
comportamento de antes); os dois relatórios começam com todos os
papéis marcados (acesso livre, também o comportamento de antes) — a
restrição só passa a valer se o Admin desmarcar algum papel. Admin
sempre tem acesso às três páginas, mesmo que fique desmarcado por
engano.

Configuração salva em configuracoes (chaves papeis_painel_executivo,
papeis_relatorio_situacao, papeis_relatorio_entregas), reaproveitando
a RLS já existente na tabela (leitura pública, escrita só Admin).

Co-Authored-By: Claude Sonnet 5 <noreply@anthropic.com>
</commit_message>
<xml_diff>
--- a/Manual de Uso - Ferramenta de Gestao de Projetos.docx
+++ b/Manual de Uso - Ferramenta de Gestao de Projetos.docx
@@ -129,7 +129,7 @@
           <w:color w:val="6A6A70"/>
           <w:sz w:val="22"/>
         </w:rPr>
-        <w:t>Versao 2.15 - 10 de agosto de 2026 (substitui a versao 2.14 de 10/08/2026)</w:t>
+        <w:t>Versao 2.16 - 11 de agosto de 2026 (substitui a versao 2.15 de 10/08/2026)</w:t>
       </w:r>
     </w:p>
     <w:p>
@@ -229,7 +229,7 @@
         <w:rPr>
           <w:noProof/>
         </w:rPr>
-        <w:instrText xml:space="preserve"> PAGEREF _Toc237275156 \h </w:instrText>
+        <w:instrText xml:space="preserve"> PAGEREF _Toc237333945 \h </w:instrText>
       </w:r>
       <w:r>
         <w:rPr>
@@ -290,7 +290,7 @@
         <w:rPr>
           <w:noProof/>
         </w:rPr>
-        <w:instrText xml:space="preserve"> PAGEREF _Toc237275157 \h </w:instrText>
+        <w:instrText xml:space="preserve"> PAGEREF _Toc237333946 \h </w:instrText>
       </w:r>
       <w:r>
         <w:rPr>
@@ -351,7 +351,7 @@
         <w:rPr>
           <w:noProof/>
         </w:rPr>
-        <w:instrText xml:space="preserve"> PAGEREF _Toc237275158 \h </w:instrText>
+        <w:instrText xml:space="preserve"> PAGEREF _Toc237333947 \h </w:instrText>
       </w:r>
       <w:r>
         <w:rPr>
@@ -412,7 +412,7 @@
         <w:rPr>
           <w:noProof/>
         </w:rPr>
-        <w:instrText xml:space="preserve"> PAGEREF _Toc237275159 \h </w:instrText>
+        <w:instrText xml:space="preserve"> PAGEREF _Toc237333948 \h </w:instrText>
       </w:r>
       <w:r>
         <w:rPr>
@@ -429,7 +429,7 @@
         <w:rPr>
           <w:noProof/>
         </w:rPr>
-        <w:t>7</w:t>
+        <w:t>8</w:t>
       </w:r>
       <w:r>
         <w:rPr>
@@ -473,7 +473,7 @@
         <w:rPr>
           <w:noProof/>
         </w:rPr>
-        <w:instrText xml:space="preserve"> PAGEREF _Toc237275160 \h </w:instrText>
+        <w:instrText xml:space="preserve"> PAGEREF _Toc237333949 \h </w:instrText>
       </w:r>
       <w:r>
         <w:rPr>
@@ -490,7 +490,7 @@
         <w:rPr>
           <w:noProof/>
         </w:rPr>
-        <w:t>8</w:t>
+        <w:t>9</w:t>
       </w:r>
       <w:r>
         <w:rPr>
@@ -534,7 +534,7 @@
         <w:rPr>
           <w:noProof/>
         </w:rPr>
-        <w:instrText xml:space="preserve"> PAGEREF _Toc237275161 \h </w:instrText>
+        <w:instrText xml:space="preserve"> PAGEREF _Toc237333950 \h </w:instrText>
       </w:r>
       <w:r>
         <w:rPr>
@@ -595,7 +595,7 @@
         <w:rPr>
           <w:noProof/>
         </w:rPr>
-        <w:instrText xml:space="preserve"> PAGEREF _Toc237275162 \h </w:instrText>
+        <w:instrText xml:space="preserve"> PAGEREF _Toc237333951 \h </w:instrText>
       </w:r>
       <w:r>
         <w:rPr>
@@ -656,7 +656,7 @@
         <w:rPr>
           <w:noProof/>
         </w:rPr>
-        <w:instrText xml:space="preserve"> PAGEREF _Toc237275163 \h </w:instrText>
+        <w:instrText xml:space="preserve"> PAGEREF _Toc237333952 \h </w:instrText>
       </w:r>
       <w:r>
         <w:rPr>
@@ -717,7 +717,7 @@
         <w:rPr>
           <w:noProof/>
         </w:rPr>
-        <w:instrText xml:space="preserve"> PAGEREF _Toc237275164 \h </w:instrText>
+        <w:instrText xml:space="preserve"> PAGEREF _Toc237333953 \h </w:instrText>
       </w:r>
       <w:r>
         <w:rPr>
@@ -778,7 +778,7 @@
         <w:rPr>
           <w:noProof/>
         </w:rPr>
-        <w:instrText xml:space="preserve"> PAGEREF _Toc237275165 \h </w:instrText>
+        <w:instrText xml:space="preserve"> PAGEREF _Toc237333954 \h </w:instrText>
       </w:r>
       <w:r>
         <w:rPr>
@@ -839,7 +839,7 @@
         <w:rPr>
           <w:noProof/>
         </w:rPr>
-        <w:instrText xml:space="preserve"> PAGEREF _Toc237275166 \h </w:instrText>
+        <w:instrText xml:space="preserve"> PAGEREF _Toc237333955 \h </w:instrText>
       </w:r>
       <w:r>
         <w:rPr>
@@ -900,7 +900,7 @@
         <w:rPr>
           <w:noProof/>
         </w:rPr>
-        <w:instrText xml:space="preserve"> PAGEREF _Toc237275167 \h </w:instrText>
+        <w:instrText xml:space="preserve"> PAGEREF _Toc237333956 \h </w:instrText>
       </w:r>
       <w:r>
         <w:rPr>
@@ -961,7 +961,7 @@
         <w:rPr>
           <w:noProof/>
         </w:rPr>
-        <w:instrText xml:space="preserve"> PAGEREF _Toc237275168 \h </w:instrText>
+        <w:instrText xml:space="preserve"> PAGEREF _Toc237333957 \h </w:instrText>
       </w:r>
       <w:r>
         <w:rPr>
@@ -1022,7 +1022,7 @@
         <w:rPr>
           <w:noProof/>
         </w:rPr>
-        <w:instrText xml:space="preserve"> PAGEREF _Toc237275169 \h </w:instrText>
+        <w:instrText xml:space="preserve"> PAGEREF _Toc237333958 \h </w:instrText>
       </w:r>
       <w:r>
         <w:rPr>
@@ -1083,7 +1083,7 @@
         <w:rPr>
           <w:noProof/>
         </w:rPr>
-        <w:instrText xml:space="preserve"> PAGEREF _Toc237275170 \h </w:instrText>
+        <w:instrText xml:space="preserve"> PAGEREF _Toc237333959 \h </w:instrText>
       </w:r>
       <w:r>
         <w:rPr>
@@ -1144,7 +1144,7 @@
         <w:rPr>
           <w:noProof/>
         </w:rPr>
-        <w:instrText xml:space="preserve"> PAGEREF _Toc237275171 \h </w:instrText>
+        <w:instrText xml:space="preserve"> PAGEREF _Toc237333960 \h </w:instrText>
       </w:r>
       <w:r>
         <w:rPr>
@@ -1205,7 +1205,7 @@
         <w:rPr>
           <w:noProof/>
         </w:rPr>
-        <w:instrText xml:space="preserve"> PAGEREF _Toc237275172 \h </w:instrText>
+        <w:instrText xml:space="preserve"> PAGEREF _Toc237333961 \h </w:instrText>
       </w:r>
       <w:r>
         <w:rPr>
@@ -1266,7 +1266,7 @@
         <w:rPr>
           <w:noProof/>
         </w:rPr>
-        <w:instrText xml:space="preserve"> PAGEREF _Toc237275173 \h </w:instrText>
+        <w:instrText xml:space="preserve"> PAGEREF _Toc237333962 \h </w:instrText>
       </w:r>
       <w:r>
         <w:rPr>
@@ -1327,7 +1327,7 @@
         <w:rPr>
           <w:noProof/>
         </w:rPr>
-        <w:instrText xml:space="preserve"> PAGEREF _Toc237275174 \h </w:instrText>
+        <w:instrText xml:space="preserve"> PAGEREF _Toc237333963 \h </w:instrText>
       </w:r>
       <w:r>
         <w:rPr>
@@ -1388,7 +1388,7 @@
         <w:rPr>
           <w:noProof/>
         </w:rPr>
-        <w:instrText xml:space="preserve"> PAGEREF _Toc237275175 \h </w:instrText>
+        <w:instrText xml:space="preserve"> PAGEREF _Toc237333964 \h </w:instrText>
       </w:r>
       <w:r>
         <w:rPr>
@@ -1449,7 +1449,7 @@
         <w:rPr>
           <w:noProof/>
         </w:rPr>
-        <w:instrText xml:space="preserve"> PAGEREF _Toc237275176 \h </w:instrText>
+        <w:instrText xml:space="preserve"> PAGEREF _Toc237333965 \h </w:instrText>
       </w:r>
       <w:r>
         <w:rPr>
@@ -1510,7 +1510,7 @@
         <w:rPr>
           <w:noProof/>
         </w:rPr>
-        <w:instrText xml:space="preserve"> PAGEREF _Toc237275177 \h </w:instrText>
+        <w:instrText xml:space="preserve"> PAGEREF _Toc237333966 \h </w:instrText>
       </w:r>
       <w:r>
         <w:rPr>
@@ -1571,7 +1571,7 @@
         <w:rPr>
           <w:noProof/>
         </w:rPr>
-        <w:instrText xml:space="preserve"> PAGEREF _Toc237275178 \h </w:instrText>
+        <w:instrText xml:space="preserve"> PAGEREF _Toc237333967 \h </w:instrText>
       </w:r>
       <w:r>
         <w:rPr>
@@ -1632,7 +1632,7 @@
         <w:rPr>
           <w:noProof/>
         </w:rPr>
-        <w:instrText xml:space="preserve"> PAGEREF _Toc237275179 \h </w:instrText>
+        <w:instrText xml:space="preserve"> PAGEREF _Toc237333968 \h </w:instrText>
       </w:r>
       <w:r>
         <w:rPr>
@@ -1693,7 +1693,7 @@
         <w:rPr>
           <w:noProof/>
         </w:rPr>
-        <w:instrText xml:space="preserve"> PAGEREF _Toc237275180 \h </w:instrText>
+        <w:instrText xml:space="preserve"> PAGEREF _Toc237333969 \h </w:instrText>
       </w:r>
       <w:r>
         <w:rPr>
@@ -1754,7 +1754,7 @@
         <w:rPr>
           <w:noProof/>
         </w:rPr>
-        <w:instrText xml:space="preserve"> PAGEREF _Toc237275181 \h </w:instrText>
+        <w:instrText xml:space="preserve"> PAGEREF _Toc237333970 \h </w:instrText>
       </w:r>
       <w:r>
         <w:rPr>
@@ -1816,7 +1816,7 @@
         <w:rPr>
           <w:noProof/>
         </w:rPr>
-        <w:instrText xml:space="preserve"> PAGEREF _Toc237275182 \h </w:instrText>
+        <w:instrText xml:space="preserve"> PAGEREF _Toc237333971 \h </w:instrText>
       </w:r>
       <w:r>
         <w:rPr>
@@ -1877,7 +1877,7 @@
         <w:rPr>
           <w:noProof/>
         </w:rPr>
-        <w:instrText xml:space="preserve"> PAGEREF _Toc237275183 \h </w:instrText>
+        <w:instrText xml:space="preserve"> PAGEREF _Toc237333972 \h </w:instrText>
       </w:r>
       <w:r>
         <w:rPr>
@@ -1938,7 +1938,7 @@
         <w:rPr>
           <w:noProof/>
         </w:rPr>
-        <w:instrText xml:space="preserve"> PAGEREF _Toc237275184 \h </w:instrText>
+        <w:instrText xml:space="preserve"> PAGEREF _Toc237333973 \h </w:instrText>
       </w:r>
       <w:r>
         <w:rPr>
@@ -1999,7 +1999,7 @@
         <w:rPr>
           <w:noProof/>
         </w:rPr>
-        <w:instrText xml:space="preserve"> PAGEREF _Toc237275185 \h </w:instrText>
+        <w:instrText xml:space="preserve"> PAGEREF _Toc237333974 \h </w:instrText>
       </w:r>
       <w:r>
         <w:rPr>
@@ -2060,7 +2060,7 @@
         <w:rPr>
           <w:noProof/>
         </w:rPr>
-        <w:instrText xml:space="preserve"> PAGEREF _Toc237275186 \h </w:instrText>
+        <w:instrText xml:space="preserve"> PAGEREF _Toc237333975 \h </w:instrText>
       </w:r>
       <w:r>
         <w:rPr>
@@ -2121,7 +2121,7 @@
         <w:rPr>
           <w:noProof/>
         </w:rPr>
-        <w:instrText xml:space="preserve"> PAGEREF _Toc237275187 \h </w:instrText>
+        <w:instrText xml:space="preserve"> PAGEREF _Toc237333976 \h </w:instrText>
       </w:r>
       <w:r>
         <w:rPr>
@@ -2182,7 +2182,7 @@
         <w:rPr>
           <w:noProof/>
         </w:rPr>
-        <w:instrText xml:space="preserve"> PAGEREF _Toc237275188 \h </w:instrText>
+        <w:instrText xml:space="preserve"> PAGEREF _Toc237333977 \h </w:instrText>
       </w:r>
       <w:r>
         <w:rPr>
@@ -2243,7 +2243,7 @@
         <w:rPr>
           <w:noProof/>
         </w:rPr>
-        <w:instrText xml:space="preserve"> PAGEREF _Toc237275189 \h </w:instrText>
+        <w:instrText xml:space="preserve"> PAGEREF _Toc237333978 \h </w:instrText>
       </w:r>
       <w:r>
         <w:rPr>
@@ -2304,7 +2304,7 @@
         <w:rPr>
           <w:noProof/>
         </w:rPr>
-        <w:instrText xml:space="preserve"> PAGEREF _Toc237275190 \h </w:instrText>
+        <w:instrText xml:space="preserve"> PAGEREF _Toc237333979 \h </w:instrText>
       </w:r>
       <w:r>
         <w:rPr>
@@ -2365,7 +2365,7 @@
         <w:rPr>
           <w:noProof/>
         </w:rPr>
-        <w:instrText xml:space="preserve"> PAGEREF _Toc237275191 \h </w:instrText>
+        <w:instrText xml:space="preserve"> PAGEREF _Toc237333980 \h </w:instrText>
       </w:r>
       <w:r>
         <w:rPr>
@@ -2426,7 +2426,7 @@
         <w:rPr>
           <w:noProof/>
         </w:rPr>
-        <w:instrText xml:space="preserve"> PAGEREF _Toc237275192 \h </w:instrText>
+        <w:instrText xml:space="preserve"> PAGEREF _Toc237333981 \h </w:instrText>
       </w:r>
       <w:r>
         <w:rPr>
@@ -2487,7 +2487,7 @@
         <w:rPr>
           <w:noProof/>
         </w:rPr>
-        <w:instrText xml:space="preserve"> PAGEREF _Toc237275193 \h </w:instrText>
+        <w:instrText xml:space="preserve"> PAGEREF _Toc237333982 \h </w:instrText>
       </w:r>
       <w:r>
         <w:rPr>
@@ -2504,7 +2504,7 @@
         <w:rPr>
           <w:noProof/>
         </w:rPr>
-        <w:t>59</w:t>
+        <w:t>60</w:t>
       </w:r>
       <w:r>
         <w:rPr>
@@ -2548,7 +2548,7 @@
         <w:rPr>
           <w:noProof/>
         </w:rPr>
-        <w:instrText xml:space="preserve"> PAGEREF _Toc237275194 \h </w:instrText>
+        <w:instrText xml:space="preserve"> PAGEREF _Toc237333983 \h </w:instrText>
       </w:r>
       <w:r>
         <w:rPr>
@@ -2609,7 +2609,7 @@
         <w:rPr>
           <w:noProof/>
         </w:rPr>
-        <w:instrText xml:space="preserve"> PAGEREF _Toc237275195 \h </w:instrText>
+        <w:instrText xml:space="preserve"> PAGEREF _Toc237333984 \h </w:instrText>
       </w:r>
       <w:r>
         <w:rPr>
@@ -2685,7 +2685,7 @@
           <w:sz w:val="34"/>
         </w:rPr>
       </w:pPr>
-      <w:bookmarkStart w:id="0" w:name="_Toc237275156"/>
+      <w:bookmarkStart w:id="0" w:name="_Toc237333945"/>
       <w:r>
         <w:rPr>
           <w:rFonts w:ascii="Montserrat" w:hAnsi="Montserrat"/>
@@ -2709,7 +2709,7 @@
           <w:sz w:val="27"/>
         </w:rPr>
       </w:pPr>
-      <w:bookmarkStart w:id="1" w:name="_Toc237275157"/>
+      <w:bookmarkStart w:id="1" w:name="_Toc237333946"/>
       <w:r>
         <w:rPr>
           <w:rFonts w:ascii="Montserrat" w:hAnsi="Montserrat"/>
@@ -3060,6 +3060,24 @@
           <w:color w:val="1A1A1A"/>
           <w:sz w:val="22"/>
         </w:rPr>
+        <w:t>Esta e a versao 2.16 do manual. Em relacao a versao 2.15 (10/08/2026), foi adicionada a restricao de acesso por papel ao Painel Executivo, ao Relatorio de Situacao e ao Relatorio de Entregas (secao 6.3 e 3.4 das Regras de Acesso): o Admin marca, por caixas de selecao, quais papeis podem ver cada uma dessas tres paginas, podendo marcar mais de um papel por pagina.</w:t>
+      </w:r>
+    </w:p>
+    <w:p>
+      <w:pPr>
+        <w:spacing w:line="280" w:lineRule="auto"/>
+        <w:rPr>
+          <w:rFonts w:ascii="Montserrat" w:hAnsi="Montserrat"/>
+          <w:color w:val="1A1A1A"/>
+          <w:sz w:val="22"/>
+        </w:rPr>
+      </w:pPr>
+      <w:r>
+        <w:rPr>
+          <w:rFonts w:ascii="Montserrat" w:hAnsi="Montserrat"/>
+          <w:color w:val="1A1A1A"/>
+          <w:sz w:val="22"/>
+        </w:rPr>
         <w:t>O manual nao substitui as Diretrizes para a Gestao de Projetos da UNIALFA (documento institucional que define o framework D01 a D07) nem o documento Regras de Acesso e Permissoes (que detalha cada regra de controle de acesso); ele e o guia operacional de como usar cada ferramenta na pratica.</w:t>
       </w:r>
     </w:p>
@@ -3074,7 +3092,7 @@
           <w:sz w:val="27"/>
         </w:rPr>
       </w:pPr>
-      <w:bookmarkStart w:id="2" w:name="_Toc237275158"/>
+      <w:bookmarkStart w:id="2" w:name="_Toc237333947"/>
       <w:r>
         <w:rPr>
           <w:rFonts w:ascii="Montserrat" w:hAnsi="Montserrat"/>
@@ -3197,6 +3215,7 @@
           <w:color w:val="1A1A1A"/>
           <w:sz w:val="22"/>
         </w:rPr>
+        <w:lastRenderedPageBreak/>
         <w:t>1 Painel Executivo, tambem restrito a Admin, com a visao agregada de todo o sistema (secao 6.4).</w:t>
       </w:r>
     </w:p>
@@ -3233,7 +3252,6 @@
           <w:color w:val="1A1A1A"/>
           <w:sz w:val="22"/>
         </w:rPr>
-        <w:lastRenderedPageBreak/>
         <w:t>O Mapa de Diretrizes (pagina inicial) apresenta visualmente as 7 diretrizes (D01 a D07) e mostra, para cada etapa do processo, quais ferramentas usar. E o ponto de partida recomendado para quem quer entender o processo antes de preencher os formularios - e a unica pagina, junto com o Validador de Projetos, que nao exige login.</w:t>
       </w:r>
     </w:p>
@@ -3247,16 +3265,16 @@
           <w:noProof/>
         </w:rPr>
         <w:drawing>
-          <wp:inline distT="0" distB="0" distL="0" distR="0" wp14:anchorId="78DF4976" wp14:editId="34C9DCA2">
+          <wp:inline distT="0" distB="0" distL="0" distR="0" wp14:anchorId="4FD933C8" wp14:editId="5C9E2DB6">
             <wp:extent cx="5303520" cy="4792851"/>
             <wp:effectExtent l="19050" t="19050" r="11430" b="27305"/>
-            <wp:docPr id="723493030" name="Imagem 1"/>
+            <wp:docPr id="1893775729" name="Imagem 1"/>
             <wp:cNvGraphicFramePr/>
             <a:graphic xmlns:a="http://schemas.openxmlformats.org/drawingml/2006/main">
               <a:graphicData uri="http://schemas.openxmlformats.org/drawingml/2006/picture">
                 <pic:pic xmlns:pic="http://schemas.openxmlformats.org/drawingml/2006/picture">
                   <pic:nvPicPr>
-                    <pic:cNvPr id="723493030" name=""/>
+                    <pic:cNvPr id="1893775729" name=""/>
                     <pic:cNvPicPr/>
                   </pic:nvPicPr>
                   <pic:blipFill>
@@ -3324,7 +3342,7 @@
           <w:sz w:val="27"/>
         </w:rPr>
       </w:pPr>
-      <w:bookmarkStart w:id="3" w:name="_Toc237275159"/>
+      <w:bookmarkStart w:id="3" w:name="_Toc237333948"/>
       <w:r>
         <w:rPr>
           <w:rFonts w:ascii="Montserrat" w:hAnsi="Montserrat"/>
@@ -3332,6 +3350,7 @@
           <w:color w:val="B91D2E"/>
           <w:sz w:val="27"/>
         </w:rPr>
+        <w:lastRenderedPageBreak/>
         <w:t>1.3 Como acessar e fazer login</w:t>
       </w:r>
       <w:bookmarkEnd w:id="3"/>
@@ -3363,18 +3382,17 @@
         <w:rPr>
           <w:noProof/>
         </w:rPr>
-        <w:lastRenderedPageBreak/>
         <w:drawing>
-          <wp:inline distT="0" distB="0" distL="0" distR="0" wp14:anchorId="44DFED23" wp14:editId="13563E0C">
+          <wp:inline distT="0" distB="0" distL="0" distR="0" wp14:anchorId="3F6A22E1" wp14:editId="5BB2FCCE">
             <wp:extent cx="4206240" cy="3801227"/>
             <wp:effectExtent l="19050" t="19050" r="22860" b="27940"/>
-            <wp:docPr id="984427382" name="Imagem 2"/>
+            <wp:docPr id="573021139" name="Imagem 2"/>
             <wp:cNvGraphicFramePr/>
             <a:graphic xmlns:a="http://schemas.openxmlformats.org/drawingml/2006/main">
               <a:graphicData uri="http://schemas.openxmlformats.org/drawingml/2006/picture">
                 <pic:pic xmlns:pic="http://schemas.openxmlformats.org/drawingml/2006/picture">
                   <pic:nvPicPr>
-                    <pic:cNvPr id="984427382" name=""/>
+                    <pic:cNvPr id="573021139" name=""/>
                     <pic:cNvPicPr/>
                   </pic:nvPicPr>
                   <pic:blipFill>
@@ -3547,7 +3565,7 @@
           <w:sz w:val="27"/>
         </w:rPr>
       </w:pPr>
-      <w:bookmarkStart w:id="4" w:name="_Toc237275160"/>
+      <w:bookmarkStart w:id="4" w:name="_Toc237333949"/>
       <w:r>
         <w:rPr>
           <w:rFonts w:ascii="Montserrat" w:hAnsi="Montserrat"/>
@@ -3555,6 +3573,7 @@
           <w:color w:val="B91D2E"/>
           <w:sz w:val="27"/>
         </w:rPr>
+        <w:lastRenderedPageBreak/>
         <w:t>1.4 Como a ferramenta se relaciona com as Diretrizes (D01-D07)</w:t>
       </w:r>
       <w:bookmarkEnd w:id="4"/>
@@ -3629,7 +3648,6 @@
                 <w:color w:val="FFFFFF"/>
                 <w:sz w:val="19"/>
               </w:rPr>
-              <w:lastRenderedPageBreak/>
               <w:t>Passo</w:t>
             </w:r>
           </w:p>
@@ -4786,7 +4804,7 @@
           <w:sz w:val="34"/>
         </w:rPr>
       </w:pPr>
-      <w:bookmarkStart w:id="5" w:name="_Toc237275161"/>
+      <w:bookmarkStart w:id="5" w:name="_Toc237333950"/>
       <w:r>
         <w:rPr>
           <w:rFonts w:ascii="Montserrat" w:hAnsi="Montserrat"/>
@@ -4810,7 +4828,7 @@
           <w:sz w:val="27"/>
         </w:rPr>
       </w:pPr>
-      <w:bookmarkStart w:id="6" w:name="_Toc237275162"/>
+      <w:bookmarkStart w:id="6" w:name="_Toc237333951"/>
       <w:r>
         <w:rPr>
           <w:rFonts w:ascii="Montserrat" w:hAnsi="Montserrat"/>
@@ -4851,7 +4869,7 @@
           <w:sz w:val="27"/>
         </w:rPr>
       </w:pPr>
-      <w:bookmarkStart w:id="7" w:name="_Toc237275163"/>
+      <w:bookmarkStart w:id="7" w:name="_Toc237333952"/>
       <w:r>
         <w:rPr>
           <w:rFonts w:ascii="Montserrat" w:hAnsi="Montserrat"/>
@@ -4970,7 +4988,7 @@
           <w:sz w:val="27"/>
         </w:rPr>
       </w:pPr>
-      <w:bookmarkStart w:id="8" w:name="_Toc237275164"/>
+      <w:bookmarkStart w:id="8" w:name="_Toc237333953"/>
       <w:r>
         <w:rPr>
           <w:rFonts w:ascii="Montserrat" w:hAnsi="Montserrat"/>
@@ -5583,7 +5601,7 @@
           <w:sz w:val="27"/>
         </w:rPr>
       </w:pPr>
-      <w:bookmarkStart w:id="9" w:name="_Toc237275165"/>
+      <w:bookmarkStart w:id="9" w:name="_Toc237333954"/>
       <w:r>
         <w:rPr>
           <w:rFonts w:ascii="Montserrat" w:hAnsi="Montserrat"/>
@@ -5672,16 +5690,16 @@
         </w:rPr>
         <w:lastRenderedPageBreak/>
         <w:drawing>
-          <wp:inline distT="0" distB="0" distL="0" distR="0" wp14:anchorId="5A4290B7" wp14:editId="1C9BD724">
+          <wp:inline distT="0" distB="0" distL="0" distR="0" wp14:anchorId="5EDC9623" wp14:editId="55A688D5">
             <wp:extent cx="4937760" cy="4462310"/>
             <wp:effectExtent l="19050" t="19050" r="15240" b="14605"/>
-            <wp:docPr id="2143593811" name="Imagem 3"/>
+            <wp:docPr id="1965004766" name="Imagem 3"/>
             <wp:cNvGraphicFramePr/>
             <a:graphic xmlns:a="http://schemas.openxmlformats.org/drawingml/2006/main">
               <a:graphicData uri="http://schemas.openxmlformats.org/drawingml/2006/picture">
                 <pic:pic xmlns:pic="http://schemas.openxmlformats.org/drawingml/2006/picture">
                   <pic:nvPicPr>
-                    <pic:cNvPr id="2143593811" name=""/>
+                    <pic:cNvPr id="1965004766" name=""/>
                     <pic:cNvPicPr/>
                   </pic:nvPicPr>
                   <pic:blipFill>
@@ -5749,7 +5767,7 @@
           <w:sz w:val="27"/>
         </w:rPr>
       </w:pPr>
-      <w:bookmarkStart w:id="10" w:name="_Toc237275166"/>
+      <w:bookmarkStart w:id="10" w:name="_Toc237333955"/>
       <w:r>
         <w:rPr>
           <w:rFonts w:ascii="Montserrat" w:hAnsi="Montserrat"/>
@@ -5790,16 +5808,16 @@
         </w:rPr>
         <w:lastRenderedPageBreak/>
         <w:drawing>
-          <wp:inline distT="0" distB="0" distL="0" distR="0" wp14:anchorId="4F269567" wp14:editId="2171FA17">
+          <wp:inline distT="0" distB="0" distL="0" distR="0" wp14:anchorId="1FD97CC2" wp14:editId="1AA2657A">
             <wp:extent cx="5120640" cy="4627581"/>
             <wp:effectExtent l="19050" t="19050" r="22860" b="20955"/>
-            <wp:docPr id="425743565" name="Imagem 4"/>
+            <wp:docPr id="1319267273" name="Imagem 4"/>
             <wp:cNvGraphicFramePr/>
             <a:graphic xmlns:a="http://schemas.openxmlformats.org/drawingml/2006/main">
               <a:graphicData uri="http://schemas.openxmlformats.org/drawingml/2006/picture">
                 <pic:pic xmlns:pic="http://schemas.openxmlformats.org/drawingml/2006/picture">
                   <pic:nvPicPr>
-                    <pic:cNvPr id="425743565" name=""/>
+                    <pic:cNvPr id="1319267273" name=""/>
                     <pic:cNvPicPr/>
                   </pic:nvPicPr>
                   <pic:blipFill>
@@ -5936,7 +5954,7 @@
           <w:sz w:val="27"/>
         </w:rPr>
       </w:pPr>
-      <w:bookmarkStart w:id="11" w:name="_Toc237275167"/>
+      <w:bookmarkStart w:id="11" w:name="_Toc237333956"/>
       <w:r>
         <w:rPr>
           <w:rFonts w:ascii="Montserrat" w:hAnsi="Montserrat"/>
@@ -5977,16 +5995,16 @@
           <w:noProof/>
         </w:rPr>
         <w:drawing>
-          <wp:inline distT="0" distB="0" distL="0" distR="0" wp14:anchorId="17C9EA47" wp14:editId="46E67D00">
+          <wp:inline distT="0" distB="0" distL="0" distR="0" wp14:anchorId="45A605D9" wp14:editId="77A6F932">
             <wp:extent cx="4206240" cy="3801227"/>
             <wp:effectExtent l="19050" t="19050" r="22860" b="27940"/>
-            <wp:docPr id="721260102" name="Imagem 5"/>
+            <wp:docPr id="135125658" name="Imagem 5"/>
             <wp:cNvGraphicFramePr/>
             <a:graphic xmlns:a="http://schemas.openxmlformats.org/drawingml/2006/main">
               <a:graphicData uri="http://schemas.openxmlformats.org/drawingml/2006/picture">
                 <pic:pic xmlns:pic="http://schemas.openxmlformats.org/drawingml/2006/picture">
                   <pic:nvPicPr>
-                    <pic:cNvPr id="721260102" name=""/>
+                    <pic:cNvPr id="135125658" name=""/>
                     <pic:cNvPicPr/>
                   </pic:nvPicPr>
                   <pic:blipFill>
@@ -6054,16 +6072,16 @@
         </w:rPr>
         <w:lastRenderedPageBreak/>
         <w:drawing>
-          <wp:inline distT="0" distB="0" distL="0" distR="0" wp14:anchorId="0D4F8111" wp14:editId="73380360">
+          <wp:inline distT="0" distB="0" distL="0" distR="0" wp14:anchorId="6564FDB7" wp14:editId="57EE9A6C">
             <wp:extent cx="4206240" cy="3801227"/>
             <wp:effectExtent l="19050" t="19050" r="22860" b="27940"/>
-            <wp:docPr id="1253669152" name="Imagem 6"/>
+            <wp:docPr id="15662596" name="Imagem 6"/>
             <wp:cNvGraphicFramePr/>
             <a:graphic xmlns:a="http://schemas.openxmlformats.org/drawingml/2006/main">
               <a:graphicData uri="http://schemas.openxmlformats.org/drawingml/2006/picture">
                 <pic:pic xmlns:pic="http://schemas.openxmlformats.org/drawingml/2006/picture">
                   <pic:nvPicPr>
-                    <pic:cNvPr id="1253669152" name=""/>
+                    <pic:cNvPr id="15662596" name=""/>
                     <pic:cNvPicPr/>
                   </pic:nvPicPr>
                   <pic:blipFill>
@@ -6179,7 +6197,7 @@
           <w:sz w:val="27"/>
         </w:rPr>
       </w:pPr>
-      <w:bookmarkStart w:id="12" w:name="_Toc237275168"/>
+      <w:bookmarkStart w:id="12" w:name="_Toc237333957"/>
       <w:r>
         <w:rPr>
           <w:rFonts w:ascii="Montserrat" w:hAnsi="Montserrat"/>
@@ -6247,7 +6265,7 @@
           <w:sz w:val="27"/>
         </w:rPr>
       </w:pPr>
-      <w:bookmarkStart w:id="13" w:name="_Toc237275169"/>
+      <w:bookmarkStart w:id="13" w:name="_Toc237333958"/>
       <w:r>
         <w:rPr>
           <w:rFonts w:ascii="Montserrat" w:hAnsi="Montserrat"/>
@@ -6474,7 +6492,7 @@
           <w:sz w:val="27"/>
         </w:rPr>
       </w:pPr>
-      <w:bookmarkStart w:id="14" w:name="_Toc237275170"/>
+      <w:bookmarkStart w:id="14" w:name="_Toc237333959"/>
       <w:r>
         <w:rPr>
           <w:rFonts w:ascii="Montserrat" w:hAnsi="Montserrat"/>
@@ -6637,7 +6655,7 @@
           <w:sz w:val="34"/>
         </w:rPr>
       </w:pPr>
-      <w:bookmarkStart w:id="15" w:name="_Toc237275171"/>
+      <w:bookmarkStart w:id="15" w:name="_Toc237333960"/>
       <w:r>
         <w:rPr>
           <w:rFonts w:ascii="Montserrat" w:hAnsi="Montserrat"/>
@@ -6679,7 +6697,7 @@
           <w:sz w:val="27"/>
         </w:rPr>
       </w:pPr>
-      <w:bookmarkStart w:id="16" w:name="_Toc237275172"/>
+      <w:bookmarkStart w:id="16" w:name="_Toc237333961"/>
       <w:r>
         <w:rPr>
           <w:rFonts w:ascii="Montserrat" w:hAnsi="Montserrat"/>
@@ -7682,16 +7700,16 @@
         </w:rPr>
         <w:lastRenderedPageBreak/>
         <w:drawing>
-          <wp:inline distT="0" distB="0" distL="0" distR="0" wp14:anchorId="2ABCB68A" wp14:editId="5A4AABF4">
+          <wp:inline distT="0" distB="0" distL="0" distR="0" wp14:anchorId="6092BE6E" wp14:editId="07FE8E4C">
             <wp:extent cx="5120640" cy="4627581"/>
             <wp:effectExtent l="19050" t="19050" r="22860" b="20955"/>
-            <wp:docPr id="1204965718" name="Imagem 7"/>
+            <wp:docPr id="1848939261" name="Imagem 7"/>
             <wp:cNvGraphicFramePr/>
             <a:graphic xmlns:a="http://schemas.openxmlformats.org/drawingml/2006/main">
               <a:graphicData uri="http://schemas.openxmlformats.org/drawingml/2006/picture">
                 <pic:pic xmlns:pic="http://schemas.openxmlformats.org/drawingml/2006/picture">
                   <pic:nvPicPr>
-                    <pic:cNvPr id="1204965718" name=""/>
+                    <pic:cNvPr id="1848939261" name=""/>
                     <pic:cNvPicPr/>
                   </pic:nvPicPr>
                   <pic:blipFill>
@@ -7759,16 +7777,16 @@
         </w:rPr>
         <w:lastRenderedPageBreak/>
         <w:drawing>
-          <wp:inline distT="0" distB="0" distL="0" distR="0" wp14:anchorId="0EF27A8C" wp14:editId="051A58E0">
+          <wp:inline distT="0" distB="0" distL="0" distR="0" wp14:anchorId="4D7C4756" wp14:editId="49BC71B0">
             <wp:extent cx="5120640" cy="4627581"/>
             <wp:effectExtent l="19050" t="19050" r="22860" b="20955"/>
-            <wp:docPr id="1577170724" name="Imagem 8"/>
+            <wp:docPr id="1272460808" name="Imagem 8"/>
             <wp:cNvGraphicFramePr/>
             <a:graphic xmlns:a="http://schemas.openxmlformats.org/drawingml/2006/main">
               <a:graphicData uri="http://schemas.openxmlformats.org/drawingml/2006/picture">
                 <pic:pic xmlns:pic="http://schemas.openxmlformats.org/drawingml/2006/picture">
                   <pic:nvPicPr>
-                    <pic:cNvPr id="1577170724" name=""/>
+                    <pic:cNvPr id="1272460808" name=""/>
                     <pic:cNvPicPr/>
                   </pic:nvPicPr>
                   <pic:blipFill>
@@ -7903,7 +7921,7 @@
           <w:sz w:val="27"/>
         </w:rPr>
       </w:pPr>
-      <w:bookmarkStart w:id="17" w:name="_Toc237275173"/>
+      <w:bookmarkStart w:id="17" w:name="_Toc237333962"/>
       <w:r>
         <w:rPr>
           <w:rFonts w:ascii="Montserrat" w:hAnsi="Montserrat"/>
@@ -8830,16 +8848,16 @@
         </w:rPr>
         <w:lastRenderedPageBreak/>
         <w:drawing>
-          <wp:inline distT="0" distB="0" distL="0" distR="0" wp14:anchorId="6D5F4801" wp14:editId="1FAF5BDE">
+          <wp:inline distT="0" distB="0" distL="0" distR="0" wp14:anchorId="5ADE04BD" wp14:editId="54E244B8">
             <wp:extent cx="5120640" cy="4627581"/>
             <wp:effectExtent l="19050" t="19050" r="22860" b="20955"/>
-            <wp:docPr id="1380975789" name="Imagem 9"/>
+            <wp:docPr id="1004546292" name="Imagem 9"/>
             <wp:cNvGraphicFramePr/>
             <a:graphic xmlns:a="http://schemas.openxmlformats.org/drawingml/2006/main">
               <a:graphicData uri="http://schemas.openxmlformats.org/drawingml/2006/picture">
                 <pic:pic xmlns:pic="http://schemas.openxmlformats.org/drawingml/2006/picture">
                   <pic:nvPicPr>
-                    <pic:cNvPr id="1380975789" name=""/>
+                    <pic:cNvPr id="1004546292" name=""/>
                     <pic:cNvPicPr/>
                   </pic:nvPicPr>
                   <pic:blipFill>
@@ -8907,16 +8925,16 @@
         </w:rPr>
         <w:lastRenderedPageBreak/>
         <w:drawing>
-          <wp:inline distT="0" distB="0" distL="0" distR="0" wp14:anchorId="05EFF416" wp14:editId="58471139">
+          <wp:inline distT="0" distB="0" distL="0" distR="0" wp14:anchorId="0B7F5560" wp14:editId="0D85D42A">
             <wp:extent cx="5120640" cy="4627581"/>
             <wp:effectExtent l="19050" t="19050" r="22860" b="20955"/>
-            <wp:docPr id="987509218" name="Imagem 10"/>
+            <wp:docPr id="970808148" name="Imagem 10"/>
             <wp:cNvGraphicFramePr/>
             <a:graphic xmlns:a="http://schemas.openxmlformats.org/drawingml/2006/main">
               <a:graphicData uri="http://schemas.openxmlformats.org/drawingml/2006/picture">
                 <pic:pic xmlns:pic="http://schemas.openxmlformats.org/drawingml/2006/picture">
                   <pic:nvPicPr>
-                    <pic:cNvPr id="987509218" name=""/>
+                    <pic:cNvPr id="970808148" name=""/>
                     <pic:cNvPicPr/>
                   </pic:nvPicPr>
                   <pic:blipFill>
@@ -9002,7 +9020,7 @@
           <w:sz w:val="27"/>
         </w:rPr>
       </w:pPr>
-      <w:bookmarkStart w:id="18" w:name="_Toc237275174"/>
+      <w:bookmarkStart w:id="18" w:name="_Toc237333963"/>
       <w:r>
         <w:rPr>
           <w:rFonts w:ascii="Montserrat" w:hAnsi="Montserrat"/>
@@ -10042,16 +10060,16 @@
         </w:rPr>
         <w:lastRenderedPageBreak/>
         <w:drawing>
-          <wp:inline distT="0" distB="0" distL="0" distR="0" wp14:anchorId="580AA777" wp14:editId="0A3C5005">
+          <wp:inline distT="0" distB="0" distL="0" distR="0" wp14:anchorId="20C2C6B5" wp14:editId="03CB066D">
             <wp:extent cx="5120640" cy="3282818"/>
             <wp:effectExtent l="19050" t="19050" r="22860" b="13335"/>
-            <wp:docPr id="1230634838" name="Imagem 11"/>
+            <wp:docPr id="1935908003" name="Imagem 11"/>
             <wp:cNvGraphicFramePr/>
             <a:graphic xmlns:a="http://schemas.openxmlformats.org/drawingml/2006/main">
               <a:graphicData uri="http://schemas.openxmlformats.org/drawingml/2006/picture">
                 <pic:pic xmlns:pic="http://schemas.openxmlformats.org/drawingml/2006/picture">
                   <pic:nvPicPr>
-                    <pic:cNvPr id="1230634838" name=""/>
+                    <pic:cNvPr id="1935908003" name=""/>
                     <pic:cNvPicPr/>
                   </pic:nvPicPr>
                   <pic:blipFill>
@@ -10119,16 +10137,16 @@
         </w:rPr>
         <w:lastRenderedPageBreak/>
         <w:drawing>
-          <wp:inline distT="0" distB="0" distL="0" distR="0" wp14:anchorId="71C2DE1F" wp14:editId="3C585490">
+          <wp:inline distT="0" distB="0" distL="0" distR="0" wp14:anchorId="37E5720B" wp14:editId="2A2D1DFD">
             <wp:extent cx="5120640" cy="4627581"/>
             <wp:effectExtent l="19050" t="19050" r="22860" b="20955"/>
-            <wp:docPr id="763673509" name="Imagem 12"/>
+            <wp:docPr id="549749550" name="Imagem 12"/>
             <wp:cNvGraphicFramePr/>
             <a:graphic xmlns:a="http://schemas.openxmlformats.org/drawingml/2006/main">
               <a:graphicData uri="http://schemas.openxmlformats.org/drawingml/2006/picture">
                 <pic:pic xmlns:pic="http://schemas.openxmlformats.org/drawingml/2006/picture">
                   <pic:nvPicPr>
-                    <pic:cNvPr id="763673509" name=""/>
+                    <pic:cNvPr id="549749550" name=""/>
                     <pic:cNvPicPr/>
                   </pic:nvPicPr>
                   <pic:blipFill>
@@ -10214,7 +10232,7 @@
           <w:sz w:val="27"/>
         </w:rPr>
       </w:pPr>
-      <w:bookmarkStart w:id="19" w:name="_Toc237275175"/>
+      <w:bookmarkStart w:id="19" w:name="_Toc237333964"/>
       <w:r>
         <w:rPr>
           <w:rFonts w:ascii="Montserrat" w:hAnsi="Montserrat"/>
@@ -10775,16 +10793,16 @@
           <w:noProof/>
         </w:rPr>
         <w:drawing>
-          <wp:inline distT="0" distB="0" distL="0" distR="0" wp14:anchorId="337D37DC" wp14:editId="088E90A7">
+          <wp:inline distT="0" distB="0" distL="0" distR="0" wp14:anchorId="6EE9A362" wp14:editId="5A2ABCE4">
             <wp:extent cx="5120640" cy="4627581"/>
             <wp:effectExtent l="19050" t="19050" r="22860" b="20955"/>
-            <wp:docPr id="1779174288" name="Imagem 13"/>
+            <wp:docPr id="1524937685" name="Imagem 13"/>
             <wp:cNvGraphicFramePr/>
             <a:graphic xmlns:a="http://schemas.openxmlformats.org/drawingml/2006/main">
               <a:graphicData uri="http://schemas.openxmlformats.org/drawingml/2006/picture">
                 <pic:pic xmlns:pic="http://schemas.openxmlformats.org/drawingml/2006/picture">
                   <pic:nvPicPr>
-                    <pic:cNvPr id="1779174288" name=""/>
+                    <pic:cNvPr id="1524937685" name=""/>
                     <pic:cNvPicPr/>
                   </pic:nvPicPr>
                   <pic:blipFill>
@@ -10852,16 +10870,16 @@
         </w:rPr>
         <w:lastRenderedPageBreak/>
         <w:drawing>
-          <wp:inline distT="0" distB="0" distL="0" distR="0" wp14:anchorId="5A862A5E" wp14:editId="4B1E6D10">
+          <wp:inline distT="0" distB="0" distL="0" distR="0" wp14:anchorId="33EE6248" wp14:editId="7B8ED9EB">
             <wp:extent cx="5120640" cy="4627581"/>
             <wp:effectExtent l="19050" t="19050" r="22860" b="20955"/>
-            <wp:docPr id="1531061794" name="Imagem 14"/>
+            <wp:docPr id="207421779" name="Imagem 14"/>
             <wp:cNvGraphicFramePr/>
             <a:graphic xmlns:a="http://schemas.openxmlformats.org/drawingml/2006/main">
               <a:graphicData uri="http://schemas.openxmlformats.org/drawingml/2006/picture">
                 <pic:pic xmlns:pic="http://schemas.openxmlformats.org/drawingml/2006/picture">
                   <pic:nvPicPr>
-                    <pic:cNvPr id="1531061794" name=""/>
+                    <pic:cNvPr id="207421779" name=""/>
                     <pic:cNvPicPr/>
                   </pic:nvPicPr>
                   <pic:blipFill>
@@ -10947,7 +10965,7 @@
           <w:sz w:val="27"/>
         </w:rPr>
       </w:pPr>
-      <w:bookmarkStart w:id="20" w:name="_Toc237275176"/>
+      <w:bookmarkStart w:id="20" w:name="_Toc237333965"/>
       <w:r>
         <w:rPr>
           <w:rFonts w:ascii="Montserrat" w:hAnsi="Montserrat"/>
@@ -10988,16 +11006,16 @@
         </w:rPr>
         <w:lastRenderedPageBreak/>
         <w:drawing>
-          <wp:inline distT="0" distB="0" distL="0" distR="0" wp14:anchorId="7B9E697F" wp14:editId="7E5C4732">
+          <wp:inline distT="0" distB="0" distL="0" distR="0" wp14:anchorId="340064CD" wp14:editId="46C6613D">
             <wp:extent cx="5120640" cy="4627581"/>
             <wp:effectExtent l="19050" t="19050" r="22860" b="20955"/>
-            <wp:docPr id="771611524" name="Imagem 15"/>
+            <wp:docPr id="953523064" name="Imagem 15"/>
             <wp:cNvGraphicFramePr/>
             <a:graphic xmlns:a="http://schemas.openxmlformats.org/drawingml/2006/main">
               <a:graphicData uri="http://schemas.openxmlformats.org/drawingml/2006/picture">
                 <pic:pic xmlns:pic="http://schemas.openxmlformats.org/drawingml/2006/picture">
                   <pic:nvPicPr>
-                    <pic:cNvPr id="771611524" name=""/>
+                    <pic:cNvPr id="953523064" name=""/>
                     <pic:cNvPicPr/>
                   </pic:nvPicPr>
                   <pic:blipFill>
@@ -11065,16 +11083,16 @@
         </w:rPr>
         <w:lastRenderedPageBreak/>
         <w:drawing>
-          <wp:inline distT="0" distB="0" distL="0" distR="0" wp14:anchorId="7688E01E" wp14:editId="4992D9E7">
+          <wp:inline distT="0" distB="0" distL="0" distR="0" wp14:anchorId="2F070475" wp14:editId="7C0B52A3">
             <wp:extent cx="5120640" cy="4627581"/>
             <wp:effectExtent l="19050" t="19050" r="22860" b="20955"/>
-            <wp:docPr id="694277409" name="Imagem 16"/>
+            <wp:docPr id="319242541" name="Imagem 16"/>
             <wp:cNvGraphicFramePr/>
             <a:graphic xmlns:a="http://schemas.openxmlformats.org/drawingml/2006/main">
               <a:graphicData uri="http://schemas.openxmlformats.org/drawingml/2006/picture">
                 <pic:pic xmlns:pic="http://schemas.openxmlformats.org/drawingml/2006/picture">
                   <pic:nvPicPr>
-                    <pic:cNvPr id="694277409" name=""/>
+                    <pic:cNvPr id="319242541" name=""/>
                     <pic:cNvPicPr/>
                   </pic:nvPicPr>
                   <pic:blipFill>
@@ -11238,16 +11256,16 @@
         </w:rPr>
         <w:lastRenderedPageBreak/>
         <w:drawing>
-          <wp:inline distT="0" distB="0" distL="0" distR="0" wp14:anchorId="00B31107" wp14:editId="2558435C">
+          <wp:inline distT="0" distB="0" distL="0" distR="0" wp14:anchorId="1AF7082E" wp14:editId="6C41E0ED">
             <wp:extent cx="5120640" cy="3282818"/>
             <wp:effectExtent l="19050" t="19050" r="22860" b="13335"/>
-            <wp:docPr id="1658976478" name="Imagem 17"/>
+            <wp:docPr id="674130757" name="Imagem 17"/>
             <wp:cNvGraphicFramePr/>
             <a:graphic xmlns:a="http://schemas.openxmlformats.org/drawingml/2006/main">
               <a:graphicData uri="http://schemas.openxmlformats.org/drawingml/2006/picture">
                 <pic:pic xmlns:pic="http://schemas.openxmlformats.org/drawingml/2006/picture">
                   <pic:nvPicPr>
-                    <pic:cNvPr id="1658976478" name=""/>
+                    <pic:cNvPr id="674130757" name=""/>
                     <pic:cNvPicPr/>
                   </pic:nvPicPr>
                   <pic:blipFill>
@@ -11333,7 +11351,7 @@
           <w:sz w:val="27"/>
         </w:rPr>
       </w:pPr>
-      <w:bookmarkStart w:id="21" w:name="_Toc237275177"/>
+      <w:bookmarkStart w:id="21" w:name="_Toc237333966"/>
       <w:r>
         <w:rPr>
           <w:rFonts w:ascii="Montserrat" w:hAnsi="Montserrat"/>
@@ -11374,16 +11392,16 @@
         </w:rPr>
         <w:lastRenderedPageBreak/>
         <w:drawing>
-          <wp:inline distT="0" distB="0" distL="0" distR="0" wp14:anchorId="3EA8AE7F" wp14:editId="3E68DFDB">
+          <wp:inline distT="0" distB="0" distL="0" distR="0" wp14:anchorId="6900966C" wp14:editId="5EB54AD8">
             <wp:extent cx="5120640" cy="4627581"/>
             <wp:effectExtent l="19050" t="19050" r="22860" b="20955"/>
-            <wp:docPr id="1392814629" name="Imagem 18"/>
+            <wp:docPr id="86194537" name="Imagem 18"/>
             <wp:cNvGraphicFramePr/>
             <a:graphic xmlns:a="http://schemas.openxmlformats.org/drawingml/2006/main">
               <a:graphicData uri="http://schemas.openxmlformats.org/drawingml/2006/picture">
                 <pic:pic xmlns:pic="http://schemas.openxmlformats.org/drawingml/2006/picture">
                   <pic:nvPicPr>
-                    <pic:cNvPr id="1392814629" name=""/>
+                    <pic:cNvPr id="86194537" name=""/>
                     <pic:cNvPicPr/>
                   </pic:nvPicPr>
                   <pic:blipFill>
@@ -11451,16 +11469,16 @@
         </w:rPr>
         <w:lastRenderedPageBreak/>
         <w:drawing>
-          <wp:inline distT="0" distB="0" distL="0" distR="0" wp14:anchorId="7425352F" wp14:editId="2922865B">
+          <wp:inline distT="0" distB="0" distL="0" distR="0" wp14:anchorId="27504BDD" wp14:editId="07E96E95">
             <wp:extent cx="5120640" cy="4627581"/>
             <wp:effectExtent l="19050" t="19050" r="22860" b="20955"/>
-            <wp:docPr id="1554920421" name="Imagem 19"/>
+            <wp:docPr id="1025779944" name="Imagem 19"/>
             <wp:cNvGraphicFramePr/>
             <a:graphic xmlns:a="http://schemas.openxmlformats.org/drawingml/2006/main">
               <a:graphicData uri="http://schemas.openxmlformats.org/drawingml/2006/picture">
                 <pic:pic xmlns:pic="http://schemas.openxmlformats.org/drawingml/2006/picture">
                   <pic:nvPicPr>
-                    <pic:cNvPr id="1554920421" name=""/>
+                    <pic:cNvPr id="1025779944" name=""/>
                     <pic:cNvPicPr/>
                   </pic:nvPicPr>
                   <pic:blipFill>
@@ -11594,7 +11612,7 @@
           <w:sz w:val="27"/>
         </w:rPr>
       </w:pPr>
-      <w:bookmarkStart w:id="22" w:name="_Toc237275178"/>
+      <w:bookmarkStart w:id="22" w:name="_Toc237333967"/>
       <w:r>
         <w:rPr>
           <w:rFonts w:ascii="Montserrat" w:hAnsi="Montserrat"/>
@@ -11635,16 +11653,16 @@
         </w:rPr>
         <w:lastRenderedPageBreak/>
         <w:drawing>
-          <wp:inline distT="0" distB="0" distL="0" distR="0" wp14:anchorId="67C64AF7" wp14:editId="4CFCF077">
+          <wp:inline distT="0" distB="0" distL="0" distR="0" wp14:anchorId="7B571CCB" wp14:editId="62B25E2B">
             <wp:extent cx="5120640" cy="4627581"/>
             <wp:effectExtent l="19050" t="19050" r="22860" b="20955"/>
-            <wp:docPr id="1006232859" name="Imagem 20"/>
+            <wp:docPr id="820190718" name="Imagem 20"/>
             <wp:cNvGraphicFramePr/>
             <a:graphic xmlns:a="http://schemas.openxmlformats.org/drawingml/2006/main">
               <a:graphicData uri="http://schemas.openxmlformats.org/drawingml/2006/picture">
                 <pic:pic xmlns:pic="http://schemas.openxmlformats.org/drawingml/2006/picture">
                   <pic:nvPicPr>
-                    <pic:cNvPr id="1006232859" name=""/>
+                    <pic:cNvPr id="820190718" name=""/>
                     <pic:cNvPicPr/>
                   </pic:nvPicPr>
                   <pic:blipFill>
@@ -11712,16 +11730,16 @@
         </w:rPr>
         <w:lastRenderedPageBreak/>
         <w:drawing>
-          <wp:inline distT="0" distB="0" distL="0" distR="0" wp14:anchorId="14DAC70F" wp14:editId="5FFAA0A4">
+          <wp:inline distT="0" distB="0" distL="0" distR="0" wp14:anchorId="69450341" wp14:editId="16BA2D83">
             <wp:extent cx="5120640" cy="4627581"/>
             <wp:effectExtent l="19050" t="19050" r="22860" b="20955"/>
-            <wp:docPr id="1354944979" name="Imagem 21"/>
+            <wp:docPr id="1678111760" name="Imagem 21"/>
             <wp:cNvGraphicFramePr/>
             <a:graphic xmlns:a="http://schemas.openxmlformats.org/drawingml/2006/main">
               <a:graphicData uri="http://schemas.openxmlformats.org/drawingml/2006/picture">
                 <pic:pic xmlns:pic="http://schemas.openxmlformats.org/drawingml/2006/picture">
                   <pic:nvPicPr>
-                    <pic:cNvPr id="1354944979" name=""/>
+                    <pic:cNvPr id="1678111760" name=""/>
                     <pic:cNvPicPr/>
                   </pic:nvPicPr>
                   <pic:blipFill>
@@ -11910,7 +11928,7 @@
           <w:sz w:val="27"/>
         </w:rPr>
       </w:pPr>
-      <w:bookmarkStart w:id="23" w:name="_Toc237275179"/>
+      <w:bookmarkStart w:id="23" w:name="_Toc237333968"/>
       <w:r>
         <w:rPr>
           <w:rFonts w:ascii="Montserrat" w:hAnsi="Montserrat"/>
@@ -11950,16 +11968,16 @@
           <w:noProof/>
         </w:rPr>
         <w:drawing>
-          <wp:inline distT="0" distB="0" distL="0" distR="0" wp14:anchorId="61DAF710" wp14:editId="241DACC0">
+          <wp:inline distT="0" distB="0" distL="0" distR="0" wp14:anchorId="2636321F" wp14:editId="0AA5AE4D">
             <wp:extent cx="5120640" cy="4627581"/>
             <wp:effectExtent l="19050" t="19050" r="22860" b="20955"/>
-            <wp:docPr id="1249685156" name="Imagem 22"/>
+            <wp:docPr id="855466093" name="Imagem 22"/>
             <wp:cNvGraphicFramePr/>
             <a:graphic xmlns:a="http://schemas.openxmlformats.org/drawingml/2006/main">
               <a:graphicData uri="http://schemas.openxmlformats.org/drawingml/2006/picture">
                 <pic:pic xmlns:pic="http://schemas.openxmlformats.org/drawingml/2006/picture">
                   <pic:nvPicPr>
-                    <pic:cNvPr id="1249685156" name=""/>
+                    <pic:cNvPr id="855466093" name=""/>
                     <pic:cNvPicPr/>
                   </pic:nvPicPr>
                   <pic:blipFill>
@@ -12027,16 +12045,16 @@
         </w:rPr>
         <w:lastRenderedPageBreak/>
         <w:drawing>
-          <wp:inline distT="0" distB="0" distL="0" distR="0" wp14:anchorId="2B2E4F45" wp14:editId="61846381">
+          <wp:inline distT="0" distB="0" distL="0" distR="0" wp14:anchorId="2CB41E87" wp14:editId="503A2425">
             <wp:extent cx="5120640" cy="4627581"/>
             <wp:effectExtent l="19050" t="19050" r="22860" b="20955"/>
-            <wp:docPr id="878390458" name="Imagem 23"/>
+            <wp:docPr id="150575528" name="Imagem 23"/>
             <wp:cNvGraphicFramePr/>
             <a:graphic xmlns:a="http://schemas.openxmlformats.org/drawingml/2006/main">
               <a:graphicData uri="http://schemas.openxmlformats.org/drawingml/2006/picture">
                 <pic:pic xmlns:pic="http://schemas.openxmlformats.org/drawingml/2006/picture">
                   <pic:nvPicPr>
-                    <pic:cNvPr id="878390458" name=""/>
+                    <pic:cNvPr id="150575528" name=""/>
                     <pic:cNvPicPr/>
                   </pic:nvPicPr>
                   <pic:blipFill>
@@ -12194,7 +12212,7 @@
           <w:sz w:val="27"/>
         </w:rPr>
       </w:pPr>
-      <w:bookmarkStart w:id="24" w:name="_Toc237275180"/>
+      <w:bookmarkStart w:id="24" w:name="_Toc237333969"/>
       <w:r>
         <w:rPr>
           <w:rFonts w:ascii="Montserrat" w:hAnsi="Montserrat"/>
@@ -12235,16 +12253,16 @@
         </w:rPr>
         <w:lastRenderedPageBreak/>
         <w:drawing>
-          <wp:inline distT="0" distB="0" distL="0" distR="0" wp14:anchorId="27F65AF2" wp14:editId="6FD533EE">
+          <wp:inline distT="0" distB="0" distL="0" distR="0" wp14:anchorId="4C6D0A3B" wp14:editId="49858C09">
             <wp:extent cx="5120640" cy="4627581"/>
             <wp:effectExtent l="19050" t="19050" r="22860" b="20955"/>
-            <wp:docPr id="1753339093" name="Imagem 24"/>
+            <wp:docPr id="234863958" name="Imagem 24"/>
             <wp:cNvGraphicFramePr/>
             <a:graphic xmlns:a="http://schemas.openxmlformats.org/drawingml/2006/main">
               <a:graphicData uri="http://schemas.openxmlformats.org/drawingml/2006/picture">
                 <pic:pic xmlns:pic="http://schemas.openxmlformats.org/drawingml/2006/picture">
                   <pic:nvPicPr>
-                    <pic:cNvPr id="1753339093" name=""/>
+                    <pic:cNvPr id="234863958" name=""/>
                     <pic:cNvPicPr/>
                   </pic:nvPicPr>
                   <pic:blipFill>
@@ -12312,16 +12330,16 @@
         </w:rPr>
         <w:lastRenderedPageBreak/>
         <w:drawing>
-          <wp:inline distT="0" distB="0" distL="0" distR="0" wp14:anchorId="71CAB096" wp14:editId="52A60F53">
+          <wp:inline distT="0" distB="0" distL="0" distR="0" wp14:anchorId="7E96B3A9" wp14:editId="1C96F4A1">
             <wp:extent cx="5120640" cy="4627581"/>
             <wp:effectExtent l="19050" t="19050" r="22860" b="20955"/>
-            <wp:docPr id="1961711807" name="Imagem 25"/>
+            <wp:docPr id="1596143425" name="Imagem 25"/>
             <wp:cNvGraphicFramePr/>
             <a:graphic xmlns:a="http://schemas.openxmlformats.org/drawingml/2006/main">
               <a:graphicData uri="http://schemas.openxmlformats.org/drawingml/2006/picture">
                 <pic:pic xmlns:pic="http://schemas.openxmlformats.org/drawingml/2006/picture">
                   <pic:nvPicPr>
-                    <pic:cNvPr id="1961711807" name=""/>
+                    <pic:cNvPr id="1596143425" name=""/>
                     <pic:cNvPicPr/>
                   </pic:nvPicPr>
                   <pic:blipFill>
@@ -12455,7 +12473,7 @@
           <w:sz w:val="27"/>
         </w:rPr>
       </w:pPr>
-      <w:bookmarkStart w:id="25" w:name="_Toc237275181"/>
+      <w:bookmarkStart w:id="25" w:name="_Toc237333970"/>
       <w:r>
         <w:rPr>
           <w:rFonts w:ascii="Montserrat" w:hAnsi="Montserrat"/>
@@ -12496,16 +12514,16 @@
         </w:rPr>
         <w:lastRenderedPageBreak/>
         <w:drawing>
-          <wp:inline distT="0" distB="0" distL="0" distR="0" wp14:anchorId="370F1F4F" wp14:editId="1A9DBF16">
+          <wp:inline distT="0" distB="0" distL="0" distR="0" wp14:anchorId="4F0900C3" wp14:editId="4DC4F00C">
             <wp:extent cx="5120640" cy="4627581"/>
             <wp:effectExtent l="19050" t="19050" r="22860" b="20955"/>
-            <wp:docPr id="1703603139" name="Imagem 26"/>
+            <wp:docPr id="347187608" name="Imagem 26"/>
             <wp:cNvGraphicFramePr/>
             <a:graphic xmlns:a="http://schemas.openxmlformats.org/drawingml/2006/main">
               <a:graphicData uri="http://schemas.openxmlformats.org/drawingml/2006/picture">
                 <pic:pic xmlns:pic="http://schemas.openxmlformats.org/drawingml/2006/picture">
                   <pic:nvPicPr>
-                    <pic:cNvPr id="1703603139" name=""/>
+                    <pic:cNvPr id="347187608" name=""/>
                     <pic:cNvPicPr/>
                   </pic:nvPicPr>
                   <pic:blipFill>
@@ -12595,7 +12613,7 @@
           <w:sz w:val="34"/>
         </w:rPr>
       </w:pPr>
-      <w:bookmarkStart w:id="26" w:name="_Toc237275182"/>
+      <w:bookmarkStart w:id="26" w:name="_Toc237333971"/>
       <w:r>
         <w:rPr>
           <w:rFonts w:ascii="Montserrat" w:hAnsi="Montserrat"/>
@@ -12637,7 +12655,7 @@
           <w:sz w:val="27"/>
         </w:rPr>
       </w:pPr>
-      <w:bookmarkStart w:id="27" w:name="_Toc237275183"/>
+      <w:bookmarkStart w:id="27" w:name="_Toc237333972"/>
       <w:r>
         <w:rPr>
           <w:rFonts w:ascii="Montserrat" w:hAnsi="Montserrat"/>
@@ -12677,16 +12695,16 @@
           <w:noProof/>
         </w:rPr>
         <w:drawing>
-          <wp:inline distT="0" distB="0" distL="0" distR="0" wp14:anchorId="4F866604" wp14:editId="08F644B7">
+          <wp:inline distT="0" distB="0" distL="0" distR="0" wp14:anchorId="1D5DAE16" wp14:editId="5E35F7AA">
             <wp:extent cx="5120640" cy="4627581"/>
             <wp:effectExtent l="19050" t="19050" r="22860" b="20955"/>
-            <wp:docPr id="153634901" name="Imagem 27"/>
+            <wp:docPr id="61654595" name="Imagem 27"/>
             <wp:cNvGraphicFramePr/>
             <a:graphic xmlns:a="http://schemas.openxmlformats.org/drawingml/2006/main">
               <a:graphicData uri="http://schemas.openxmlformats.org/drawingml/2006/picture">
                 <pic:pic xmlns:pic="http://schemas.openxmlformats.org/drawingml/2006/picture">
                   <pic:nvPicPr>
-                    <pic:cNvPr id="153634901" name=""/>
+                    <pic:cNvPr id="61654595" name=""/>
                     <pic:cNvPicPr/>
                   </pic:nvPicPr>
                   <pic:blipFill>
@@ -12754,16 +12772,16 @@
         </w:rPr>
         <w:lastRenderedPageBreak/>
         <w:drawing>
-          <wp:inline distT="0" distB="0" distL="0" distR="0" wp14:anchorId="2DD70D9A" wp14:editId="23316943">
+          <wp:inline distT="0" distB="0" distL="0" distR="0" wp14:anchorId="3E060064" wp14:editId="1098E40A">
             <wp:extent cx="5120640" cy="4627581"/>
             <wp:effectExtent l="19050" t="19050" r="22860" b="20955"/>
-            <wp:docPr id="1023901457" name="Imagem 28"/>
+            <wp:docPr id="253456820" name="Imagem 28"/>
             <wp:cNvGraphicFramePr/>
             <a:graphic xmlns:a="http://schemas.openxmlformats.org/drawingml/2006/main">
               <a:graphicData uri="http://schemas.openxmlformats.org/drawingml/2006/picture">
                 <pic:pic xmlns:pic="http://schemas.openxmlformats.org/drawingml/2006/picture">
                   <pic:nvPicPr>
-                    <pic:cNvPr id="1023901457" name=""/>
+                    <pic:cNvPr id="253456820" name=""/>
                     <pic:cNvPicPr/>
                   </pic:nvPicPr>
                   <pic:blipFill>
@@ -12831,16 +12849,16 @@
         </w:rPr>
         <w:lastRenderedPageBreak/>
         <w:drawing>
-          <wp:inline distT="0" distB="0" distL="0" distR="0" wp14:anchorId="602EB82C" wp14:editId="57994594">
+          <wp:inline distT="0" distB="0" distL="0" distR="0" wp14:anchorId="60E54C3F" wp14:editId="4AF65F1A">
             <wp:extent cx="5120640" cy="4627581"/>
             <wp:effectExtent l="19050" t="19050" r="22860" b="20955"/>
-            <wp:docPr id="1186194034" name="Imagem 29"/>
+            <wp:docPr id="1189025493" name="Imagem 29"/>
             <wp:cNvGraphicFramePr/>
             <a:graphic xmlns:a="http://schemas.openxmlformats.org/drawingml/2006/main">
               <a:graphicData uri="http://schemas.openxmlformats.org/drawingml/2006/picture">
                 <pic:pic xmlns:pic="http://schemas.openxmlformats.org/drawingml/2006/picture">
                   <pic:nvPicPr>
-                    <pic:cNvPr id="1186194034" name=""/>
+                    <pic:cNvPr id="1189025493" name=""/>
                     <pic:cNvPicPr/>
                   </pic:nvPicPr>
                   <pic:blipFill>
@@ -12977,16 +12995,16 @@
         </w:rPr>
         <w:lastRenderedPageBreak/>
         <w:drawing>
-          <wp:inline distT="0" distB="0" distL="0" distR="0" wp14:anchorId="3E39E131" wp14:editId="523C50E2">
+          <wp:inline distT="0" distB="0" distL="0" distR="0" wp14:anchorId="493B0422" wp14:editId="3C40E6A5">
             <wp:extent cx="5120640" cy="1715571"/>
             <wp:effectExtent l="19050" t="19050" r="22860" b="18415"/>
-            <wp:docPr id="663568095" name="Imagem 30"/>
+            <wp:docPr id="226911387" name="Imagem 30"/>
             <wp:cNvGraphicFramePr/>
             <a:graphic xmlns:a="http://schemas.openxmlformats.org/drawingml/2006/main">
               <a:graphicData uri="http://schemas.openxmlformats.org/drawingml/2006/picture">
                 <pic:pic xmlns:pic="http://schemas.openxmlformats.org/drawingml/2006/picture">
                   <pic:nvPicPr>
-                    <pic:cNvPr id="663568095" name=""/>
+                    <pic:cNvPr id="226911387" name=""/>
                     <pic:cNvPicPr/>
                   </pic:nvPicPr>
                   <pic:blipFill>
@@ -13123,16 +13141,16 @@
         </w:rPr>
         <w:lastRenderedPageBreak/>
         <w:drawing>
-          <wp:inline distT="0" distB="0" distL="0" distR="0" wp14:anchorId="71E1679C" wp14:editId="4039332F">
+          <wp:inline distT="0" distB="0" distL="0" distR="0" wp14:anchorId="491798CE" wp14:editId="160CF66D">
             <wp:extent cx="5120640" cy="3282818"/>
             <wp:effectExtent l="19050" t="19050" r="22860" b="13335"/>
-            <wp:docPr id="1865590513" name="Imagem 31"/>
+            <wp:docPr id="762084196" name="Imagem 31"/>
             <wp:cNvGraphicFramePr/>
             <a:graphic xmlns:a="http://schemas.openxmlformats.org/drawingml/2006/main">
               <a:graphicData uri="http://schemas.openxmlformats.org/drawingml/2006/picture">
                 <pic:pic xmlns:pic="http://schemas.openxmlformats.org/drawingml/2006/picture">
                   <pic:nvPicPr>
-                    <pic:cNvPr id="1865590513" name=""/>
+                    <pic:cNvPr id="762084196" name=""/>
                     <pic:cNvPicPr/>
                   </pic:nvPicPr>
                   <pic:blipFill>
@@ -13244,16 +13262,16 @@
           <w:noProof/>
         </w:rPr>
         <w:drawing>
-          <wp:inline distT="0" distB="0" distL="0" distR="0" wp14:anchorId="17B99F18" wp14:editId="088408A6">
+          <wp:inline distT="0" distB="0" distL="0" distR="0" wp14:anchorId="1B8A6072" wp14:editId="6557AD55">
             <wp:extent cx="5120640" cy="1515102"/>
             <wp:effectExtent l="19050" t="19050" r="22860" b="28575"/>
-            <wp:docPr id="145062981" name="Imagem 32"/>
+            <wp:docPr id="1761030322" name="Imagem 32"/>
             <wp:cNvGraphicFramePr/>
             <a:graphic xmlns:a="http://schemas.openxmlformats.org/drawingml/2006/main">
               <a:graphicData uri="http://schemas.openxmlformats.org/drawingml/2006/picture">
                 <pic:pic xmlns:pic="http://schemas.openxmlformats.org/drawingml/2006/picture">
                   <pic:nvPicPr>
-                    <pic:cNvPr id="145062981" name=""/>
+                    <pic:cNvPr id="1761030322" name=""/>
                     <pic:cNvPicPr/>
                   </pic:nvPicPr>
                   <pic:blipFill>
@@ -13366,16 +13384,16 @@
           <w:noProof/>
         </w:rPr>
         <w:drawing>
-          <wp:inline distT="0" distB="0" distL="0" distR="0" wp14:anchorId="5DE5E4D4" wp14:editId="0314A3B5">
+          <wp:inline distT="0" distB="0" distL="0" distR="0" wp14:anchorId="40C7C47A" wp14:editId="5F4183EB">
             <wp:extent cx="5120640" cy="1391113"/>
             <wp:effectExtent l="19050" t="19050" r="22860" b="19050"/>
-            <wp:docPr id="1328758642" name="Imagem 33"/>
+            <wp:docPr id="818086907" name="Imagem 33"/>
             <wp:cNvGraphicFramePr/>
             <a:graphic xmlns:a="http://schemas.openxmlformats.org/drawingml/2006/main">
               <a:graphicData uri="http://schemas.openxmlformats.org/drawingml/2006/picture">
                 <pic:pic xmlns:pic="http://schemas.openxmlformats.org/drawingml/2006/picture">
                   <pic:nvPicPr>
-                    <pic:cNvPr id="1328758642" name=""/>
+                    <pic:cNvPr id="818086907" name=""/>
                     <pic:cNvPicPr/>
                   </pic:nvPicPr>
                   <pic:blipFill>
@@ -13487,16 +13505,16 @@
           <w:noProof/>
         </w:rPr>
         <w:drawing>
-          <wp:inline distT="0" distB="0" distL="0" distR="0" wp14:anchorId="719009EE" wp14:editId="30F88BBE">
+          <wp:inline distT="0" distB="0" distL="0" distR="0" wp14:anchorId="65321A3A" wp14:editId="0B5CF2DA">
             <wp:extent cx="5120640" cy="1125174"/>
             <wp:effectExtent l="19050" t="19050" r="22860" b="18415"/>
-            <wp:docPr id="1225816750" name="Imagem 34"/>
+            <wp:docPr id="2038612877" name="Imagem 34"/>
             <wp:cNvGraphicFramePr/>
             <a:graphic xmlns:a="http://schemas.openxmlformats.org/drawingml/2006/main">
               <a:graphicData uri="http://schemas.openxmlformats.org/drawingml/2006/picture">
                 <pic:pic xmlns:pic="http://schemas.openxmlformats.org/drawingml/2006/picture">
                   <pic:nvPicPr>
-                    <pic:cNvPr id="1225816750" name=""/>
+                    <pic:cNvPr id="2038612877" name=""/>
                     <pic:cNvPicPr/>
                   </pic:nvPicPr>
                   <pic:blipFill>
@@ -13586,7 +13604,7 @@
           <w:sz w:val="27"/>
         </w:rPr>
       </w:pPr>
-      <w:bookmarkStart w:id="28" w:name="_Toc237275184"/>
+      <w:bookmarkStart w:id="28" w:name="_Toc237333973"/>
       <w:r>
         <w:rPr>
           <w:rFonts w:ascii="Montserrat" w:hAnsi="Montserrat"/>
@@ -13626,16 +13644,16 @@
           <w:noProof/>
         </w:rPr>
         <w:drawing>
-          <wp:inline distT="0" distB="0" distL="0" distR="0" wp14:anchorId="34DC1B30" wp14:editId="2E5260D0">
+          <wp:inline distT="0" distB="0" distL="0" distR="0" wp14:anchorId="2CB7A7A8" wp14:editId="67940A8B">
             <wp:extent cx="5120640" cy="4627581"/>
             <wp:effectExtent l="19050" t="19050" r="22860" b="20955"/>
-            <wp:docPr id="1624673106" name="Imagem 35"/>
+            <wp:docPr id="157872967" name="Imagem 35"/>
             <wp:cNvGraphicFramePr/>
             <a:graphic xmlns:a="http://schemas.openxmlformats.org/drawingml/2006/main">
               <a:graphicData uri="http://schemas.openxmlformats.org/drawingml/2006/picture">
                 <pic:pic xmlns:pic="http://schemas.openxmlformats.org/drawingml/2006/picture">
                   <pic:nvPicPr>
-                    <pic:cNvPr id="1624673106" name=""/>
+                    <pic:cNvPr id="157872967" name=""/>
                     <pic:cNvPicPr/>
                   </pic:nvPicPr>
                   <pic:blipFill>
@@ -13703,16 +13721,16 @@
         </w:rPr>
         <w:lastRenderedPageBreak/>
         <w:drawing>
-          <wp:inline distT="0" distB="0" distL="0" distR="0" wp14:anchorId="2B5C0BA0" wp14:editId="2B2E7650">
+          <wp:inline distT="0" distB="0" distL="0" distR="0" wp14:anchorId="4B3ABCAB" wp14:editId="078F2CFF">
             <wp:extent cx="5120640" cy="4627581"/>
             <wp:effectExtent l="19050" t="19050" r="22860" b="20955"/>
-            <wp:docPr id="994707303" name="Imagem 36"/>
+            <wp:docPr id="1104740061" name="Imagem 36"/>
             <wp:cNvGraphicFramePr/>
             <a:graphic xmlns:a="http://schemas.openxmlformats.org/drawingml/2006/main">
               <a:graphicData uri="http://schemas.openxmlformats.org/drawingml/2006/picture">
                 <pic:pic xmlns:pic="http://schemas.openxmlformats.org/drawingml/2006/picture">
                   <pic:nvPicPr>
-                    <pic:cNvPr id="994707303" name=""/>
+                    <pic:cNvPr id="1104740061" name=""/>
                     <pic:cNvPicPr/>
                   </pic:nvPicPr>
                   <pic:blipFill>
@@ -13849,16 +13867,16 @@
         </w:rPr>
         <w:lastRenderedPageBreak/>
         <w:drawing>
-          <wp:inline distT="0" distB="0" distL="0" distR="0" wp14:anchorId="2AD89D93" wp14:editId="69CFECD8">
+          <wp:inline distT="0" distB="0" distL="0" distR="0" wp14:anchorId="727CC825" wp14:editId="7493E978">
             <wp:extent cx="5120640" cy="2144319"/>
             <wp:effectExtent l="19050" t="19050" r="22860" b="27940"/>
-            <wp:docPr id="96555122" name="Imagem 37"/>
+            <wp:docPr id="336524750" name="Imagem 37"/>
             <wp:cNvGraphicFramePr/>
             <a:graphic xmlns:a="http://schemas.openxmlformats.org/drawingml/2006/main">
               <a:graphicData uri="http://schemas.openxmlformats.org/drawingml/2006/picture">
                 <pic:pic xmlns:pic="http://schemas.openxmlformats.org/drawingml/2006/picture">
                   <pic:nvPicPr>
-                    <pic:cNvPr id="96555122" name=""/>
+                    <pic:cNvPr id="336524750" name=""/>
                     <pic:cNvPicPr/>
                   </pic:nvPicPr>
                   <pic:blipFill>
@@ -13946,16 +13964,16 @@
           <w:noProof/>
         </w:rPr>
         <w:drawing>
-          <wp:inline distT="0" distB="0" distL="0" distR="0" wp14:anchorId="40D47599" wp14:editId="5FB10932">
+          <wp:inline distT="0" distB="0" distL="0" distR="0" wp14:anchorId="3F7199C1" wp14:editId="181E3603">
             <wp:extent cx="5120640" cy="1055647"/>
             <wp:effectExtent l="19050" t="19050" r="22860" b="11430"/>
-            <wp:docPr id="1705268748" name="Imagem 38"/>
+            <wp:docPr id="1432290300" name="Imagem 38"/>
             <wp:cNvGraphicFramePr/>
             <a:graphic xmlns:a="http://schemas.openxmlformats.org/drawingml/2006/main">
               <a:graphicData uri="http://schemas.openxmlformats.org/drawingml/2006/picture">
                 <pic:pic xmlns:pic="http://schemas.openxmlformats.org/drawingml/2006/picture">
                   <pic:nvPicPr>
-                    <pic:cNvPr id="1705268748" name=""/>
+                    <pic:cNvPr id="1432290300" name=""/>
                     <pic:cNvPicPr/>
                   </pic:nvPicPr>
                   <pic:blipFill>
@@ -14068,16 +14086,16 @@
         </w:rPr>
         <w:lastRenderedPageBreak/>
         <w:drawing>
-          <wp:inline distT="0" distB="0" distL="0" distR="0" wp14:anchorId="045A8F8E" wp14:editId="44AD68CE">
+          <wp:inline distT="0" distB="0" distL="0" distR="0" wp14:anchorId="18167BB1" wp14:editId="3312D8F1">
             <wp:extent cx="5120640" cy="3282818"/>
             <wp:effectExtent l="19050" t="19050" r="22860" b="13335"/>
-            <wp:docPr id="605265271" name="Imagem 39"/>
+            <wp:docPr id="347814586" name="Imagem 39"/>
             <wp:cNvGraphicFramePr/>
             <a:graphic xmlns:a="http://schemas.openxmlformats.org/drawingml/2006/main">
               <a:graphicData uri="http://schemas.openxmlformats.org/drawingml/2006/picture">
                 <pic:pic xmlns:pic="http://schemas.openxmlformats.org/drawingml/2006/picture">
                   <pic:nvPicPr>
-                    <pic:cNvPr id="605265271" name=""/>
+                    <pic:cNvPr id="347814586" name=""/>
                     <pic:cNvPicPr/>
                   </pic:nvPicPr>
                   <pic:blipFill>
@@ -14210,16 +14228,16 @@
           <w:noProof/>
         </w:rPr>
         <w:drawing>
-          <wp:inline distT="0" distB="0" distL="0" distR="0" wp14:anchorId="6E8B897D" wp14:editId="723B8554">
+          <wp:inline distT="0" distB="0" distL="0" distR="0" wp14:anchorId="5C6CC1DA" wp14:editId="33549D05">
             <wp:extent cx="5120640" cy="1978034"/>
             <wp:effectExtent l="19050" t="19050" r="22860" b="22225"/>
-            <wp:docPr id="837855432" name="Imagem 40"/>
+            <wp:docPr id="508313107" name="Imagem 40"/>
             <wp:cNvGraphicFramePr/>
             <a:graphic xmlns:a="http://schemas.openxmlformats.org/drawingml/2006/main">
               <a:graphicData uri="http://schemas.openxmlformats.org/drawingml/2006/picture">
                 <pic:pic xmlns:pic="http://schemas.openxmlformats.org/drawingml/2006/picture">
                   <pic:nvPicPr>
-                    <pic:cNvPr id="837855432" name=""/>
+                    <pic:cNvPr id="508313107" name=""/>
                     <pic:cNvPicPr/>
                   </pic:nvPicPr>
                   <pic:blipFill>
@@ -14292,7 +14310,7 @@
           <w:sz w:val="34"/>
         </w:rPr>
       </w:pPr>
-      <w:bookmarkStart w:id="29" w:name="_Toc237275185"/>
+      <w:bookmarkStart w:id="29" w:name="_Toc237333974"/>
       <w:r>
         <w:rPr>
           <w:rFonts w:ascii="Montserrat" w:hAnsi="Montserrat"/>
@@ -14352,7 +14370,7 @@
           <w:sz w:val="27"/>
         </w:rPr>
       </w:pPr>
-      <w:bookmarkStart w:id="30" w:name="_Toc237275186"/>
+      <w:bookmarkStart w:id="30" w:name="_Toc237333975"/>
       <w:r>
         <w:rPr>
           <w:rFonts w:ascii="Montserrat" w:hAnsi="Montserrat"/>
@@ -14392,16 +14410,16 @@
           <w:noProof/>
         </w:rPr>
         <w:drawing>
-          <wp:inline distT="0" distB="0" distL="0" distR="0" wp14:anchorId="33CB38C1" wp14:editId="45B106F9">
+          <wp:inline distT="0" distB="0" distL="0" distR="0" wp14:anchorId="3C1B5F04" wp14:editId="755C171C">
             <wp:extent cx="5303520" cy="4792851"/>
             <wp:effectExtent l="19050" t="19050" r="11430" b="27305"/>
-            <wp:docPr id="1608272457" name="Imagem 41"/>
+            <wp:docPr id="1088051119" name="Imagem 41"/>
             <wp:cNvGraphicFramePr/>
             <a:graphic xmlns:a="http://schemas.openxmlformats.org/drawingml/2006/main">
               <a:graphicData uri="http://schemas.openxmlformats.org/drawingml/2006/picture">
                 <pic:pic xmlns:pic="http://schemas.openxmlformats.org/drawingml/2006/picture">
                   <pic:nvPicPr>
-                    <pic:cNvPr id="1608272457" name=""/>
+                    <pic:cNvPr id="1088051119" name=""/>
                     <pic:cNvPicPr/>
                   </pic:nvPicPr>
                   <pic:blipFill>
@@ -14470,7 +14488,7 @@
           <w:sz w:val="27"/>
         </w:rPr>
       </w:pPr>
-      <w:bookmarkStart w:id="31" w:name="_Toc237275187"/>
+      <w:bookmarkStart w:id="31" w:name="_Toc237333976"/>
       <w:r>
         <w:rPr>
           <w:rFonts w:ascii="Montserrat" w:hAnsi="Montserrat"/>
@@ -14510,16 +14528,16 @@
           <w:noProof/>
         </w:rPr>
         <w:drawing>
-          <w